<commit_message>
added introduction to testing doc
</commit_message>
<xml_diff>
--- a/Testing.docx
+++ b/Testing.docx
@@ -6,6 +6,9 @@
       <w:pPr>
         <w:pStyle w:val="Heading1"/>
         <w:rPr>
+          <w:rFonts w:ascii="Aptos Display" w:eastAsia="Aptos Display" w:hAnsi="Aptos Display" w:cs="Aptos Display"/>
+          <w:b/>
+          <w:bCs/>
           <w:color w:val="A02B93" w:themeColor="accent5"/>
         </w:rPr>
       </w:pPr>
@@ -39,6 +42,59 @@
         <w:t>Testing</w:t>
       </w:r>
     </w:p>
+    <w:p>
+      <w:r>
+        <w:rPr>
+          <w:rFonts w:ascii="Aptos" w:eastAsia="Aptos" w:hAnsi="Aptos" w:cs="Aptos"/>
+        </w:rPr>
+        <w:t xml:space="preserve">This section sets out the plan for testing the finished </w:t>
+      </w:r>
+      <w:proofErr w:type="spellStart"/>
+      <w:r>
+        <w:rPr>
+          <w:rFonts w:ascii="Aptos" w:eastAsia="Aptos" w:hAnsi="Aptos" w:cs="Aptos"/>
+        </w:rPr>
+        <w:t>Filmtopia</w:t>
+      </w:r>
+      <w:proofErr w:type="spellEnd"/>
+      <w:r>
+        <w:rPr>
+          <w:rFonts w:ascii="Aptos" w:eastAsia="Aptos" w:hAnsi="Aptos" w:cs="Aptos"/>
+        </w:rPr>
+        <w:t xml:space="preserve"> system and, in the actual test runs that follow, shows the results of carrying that plan out. Testing is a vital part of the project because it is what proves that each objective has actually been met and that the system behaves correctly not only with sensible data but also when a user makes a mistake.</w:t>
+      </w:r>
+    </w:p>
+    <w:p>
+      <w:pPr>
+        <w:pStyle w:val="Heading2"/>
+      </w:pPr>
+      <w:r>
+        <w:rPr>
+          <w:rFonts w:ascii="Aptos Display" w:eastAsia="Aptos Display" w:hAnsi="Aptos Display" w:cs="Aptos Display"/>
+          <w:b/>
+          <w:bCs/>
+          <w:color w:val="000000"/>
+        </w:rPr>
+        <w:t>Introduction</w:t>
+      </w:r>
+    </w:p>
+    <w:p>
+      <w:r>
+        <w:rPr>
+          <w:rFonts w:ascii="Aptos" w:eastAsia="Aptos" w:hAnsi="Aptos" w:cs="Aptos"/>
+        </w:rPr>
+        <w:t>Each objective is tested using three different kinds of data wherever it is possible to do so. Normal data is ordinary, sensible data that a user would enter during normal use, and this should always be accepted. Erroneous data is data that is wrong in some way, such as a missing field or a letter where a number is expected, and this should always be rejected with a clear message. Boundary data is data that sits right at the edge of what is allowed, such as the smallest screen that can be created or the latest time of day that is valid, and this should be accepted because it is still within the rules. Testing all three kinds is important because a system that only works with perfect data is not reliable, and it is often the awkward data that reveals a problem.</w:t>
+      </w:r>
+    </w:p>
+    <w:p>
+      <w:r>
+        <w:rPr>
+          <w:rFonts w:ascii="Aptos" w:eastAsia="Aptos" w:hAnsi="Aptos" w:cs="Aptos"/>
+        </w:rPr>
+        <w:t>The plan is laid out with a table for each objective, and every test is given a number, a description of the exact data to be entered, the type of test and the expected result. The expected results are written using real values, for example an exact total in pounds, rather than vague statements, so that there can be no doubt about whether a test has passed. The objectives are tested in a logical order rather than in numerical order, because many of them depend on data created by others. For example films, screens and screenings all have to exist before a booking can be made, so those objectives are tested first. The tests also follow on from one another, so that data entered in an early test is then used and checked in a later one, for example three customers with the surname Smith are added and a search for Smith is later expected to return exactly those three.</w:t>
+      </w:r>
+    </w:p>
+    <w:p/>
     <w:sectPr>
       <w:headerReference w:type="even" r:id="rId7"/>
       <w:headerReference w:type="default" r:id="rId8"/>
@@ -149,7 +205,6 @@
         <w:docPartUnique/>
       </w:docPartObj>
     </w:sdtPr>
-    <w:sdtEndPr/>
     <w:sdtContent>
       <w:p>
         <w:pPr>

</xml_diff>

<commit_message>
added introduction to Test Plan
</commit_message>
<xml_diff>
--- a/Testing.docx
+++ b/Testing.docx
@@ -94,6 +94,28 @@
         <w:t>The plan is laid out with a table for each objective, and every test is given a number, a description of the exact data to be entered, the type of test and the expected result. The expected results are written using real values, for example an exact total in pounds, rather than vague statements, so that there can be no doubt about whether a test has passed. The objectives are tested in a logical order rather than in numerical order, because many of them depend on data created by others. For example films, screens and screenings all have to exist before a booking can be made, so those objectives are tested first. The tests also follow on from one another, so that data entered in an early test is then used and checked in a later one, for example three customers with the surname Smith are added and a search for Smith is later expected to return exactly those three.</w:t>
       </w:r>
     </w:p>
+    <w:p>
+      <w:pPr>
+        <w:pStyle w:val="Heading2"/>
+      </w:pPr>
+      <w:r>
+        <w:rPr>
+          <w:rFonts w:ascii="Aptos Display" w:eastAsia="Aptos Display" w:hAnsi="Aptos Display" w:cs="Aptos Display"/>
+          <w:b/>
+          <w:bCs/>
+          <w:color w:val="000000"/>
+        </w:rPr>
+        <w:t>Test Plan</w:t>
+      </w:r>
+    </w:p>
+    <w:p>
+      <w:r>
+        <w:rPr>
+          <w:rFonts w:ascii="Aptos" w:eastAsia="Aptos" w:hAnsi="Aptos" w:cs="Aptos"/>
+        </w:rPr>
+        <w:t>The test data used throughout the plan is as follows. Two screens are created, Screen 1 with a capacity of 50 and Screen 2 with a capacity of 30. Two films are used, Inception and Paddington 2, each with its own screening, and a small number of customers and food items are added as the tests require. The ticket prices and food prices given in the tests are used to work out the expected totals, so the figures in the expected results follow directly from the data that is entered.</w:t>
+      </w:r>
+    </w:p>
     <w:p/>
     <w:sectPr>
       <w:headerReference w:type="even" r:id="rId7"/>
@@ -205,6 +227,7 @@
         <w:docPartUnique/>
       </w:docPartObj>
     </w:sdtPr>
+    <w:sdtEndPr/>
     <w:sdtContent>
       <w:p>
         <w:pPr>

</xml_diff>

<commit_message>
added test plan for objective 6: adding new films.
</commit_message>
<xml_diff>
--- a/Testing.docx
+++ b/Testing.docx
@@ -116,6 +116,655 @@
         <w:t>The test data used throughout the plan is as follows. Two screens are created, Screen 1 with a capacity of 50 and Screen 2 with a capacity of 30. Two films are used, Inception and Paddington 2, each with its own screening, and a small number of customers and food items are added as the tests require. The ticket prices and food prices given in the tests are used to work out the expected totals, so the figures in the expected results follow directly from the data that is entered.</w:t>
       </w:r>
     </w:p>
+    <w:p>
+      <w:pPr>
+        <w:pStyle w:val="Heading3"/>
+      </w:pPr>
+      <w:r>
+        <w:rPr>
+          <w:rFonts w:ascii="Aptos Display" w:eastAsia="Aptos Display" w:hAnsi="Aptos Display" w:cs="Aptos Display"/>
+          <w:b/>
+          <w:bCs/>
+          <w:color w:val="000000"/>
+        </w:rPr>
+        <w:t>Objective 6: Adding New Films</w:t>
+      </w:r>
+    </w:p>
+    <w:p>
+      <w:r>
+        <w:rPr>
+          <w:rFonts w:ascii="Aptos" w:eastAsia="Aptos" w:hAnsi="Aptos" w:cs="Aptos"/>
+        </w:rPr>
+        <w:t>This objective is tested first because films sit at the bottom of the data that everything else depends on, so they need to exist before screenings and bookings can be tested.</w:t>
+      </w:r>
+    </w:p>
+    <w:tbl>
+      <w:tblPr>
+        <w:tblW w:w="5000" w:type="pct"/>
+        <w:tblBorders>
+          <w:top w:val="single" w:sz="4" w:space="0" w:color="808080"/>
+          <w:left w:val="single" w:sz="4" w:space="0" w:color="808080"/>
+          <w:bottom w:val="single" w:sz="4" w:space="0" w:color="808080"/>
+          <w:right w:val="single" w:sz="4" w:space="0" w:color="808080"/>
+          <w:insideH w:val="single" w:sz="4" w:space="0" w:color="808080"/>
+          <w:insideV w:val="single" w:sz="4" w:space="0" w:color="808080"/>
+        </w:tblBorders>
+        <w:tblCellMar>
+          <w:left w:w="10" w:type="dxa"/>
+          <w:right w:w="10" w:type="dxa"/>
+        </w:tblCellMar>
+        <w:tblLook w:val="0000" w:firstRow="0" w:lastRow="0" w:firstColumn="0" w:lastColumn="0" w:noHBand="0" w:noVBand="0"/>
+      </w:tblPr>
+      <w:tblGrid>
+        <w:gridCol w:w="554"/>
+        <w:gridCol w:w="3454"/>
+        <w:gridCol w:w="1047"/>
+        <w:gridCol w:w="4295"/>
+      </w:tblGrid>
+      <w:tr>
+        <w:tblPrEx>
+          <w:tblCellMar>
+            <w:top w:w="0" w:type="dxa"/>
+            <w:bottom w:w="0" w:type="dxa"/>
+          </w:tblCellMar>
+        </w:tblPrEx>
+        <w:trPr>
+          <w:cantSplit/>
+          <w:tblHeader/>
+        </w:trPr>
+        <w:tc>
+          <w:tcPr>
+            <w:tcW w:w="300" w:type="pct"/>
+            <w:shd w:val="clear" w:color="auto" w:fill="F2CEED" w:themeFill="accent5" w:themeFillTint="33"/>
+            <w:tcMar>
+              <w:top w:w="30" w:type="dxa"/>
+              <w:left w:w="80" w:type="dxa"/>
+              <w:bottom w:w="30" w:type="dxa"/>
+              <w:right w:w="80" w:type="dxa"/>
+            </w:tcMar>
+          </w:tcPr>
+          <w:p>
+            <w:r>
+              <w:rPr>
+                <w:rFonts w:ascii="Aptos" w:eastAsia="Aptos" w:hAnsi="Aptos" w:cs="Aptos"/>
+                <w:b/>
+                <w:bCs/>
+                <w:sz w:val="20"/>
+                <w:szCs w:val="20"/>
+              </w:rPr>
+              <w:lastRenderedPageBreak/>
+              <w:t>No.</w:t>
+            </w:r>
+          </w:p>
+        </w:tc>
+        <w:tc>
+          <w:tcPr>
+            <w:tcW w:w="1850" w:type="pct"/>
+            <w:shd w:val="clear" w:color="auto" w:fill="F2CEED" w:themeFill="accent5" w:themeFillTint="33"/>
+            <w:tcMar>
+              <w:top w:w="30" w:type="dxa"/>
+              <w:left w:w="80" w:type="dxa"/>
+              <w:bottom w:w="30" w:type="dxa"/>
+              <w:right w:w="80" w:type="dxa"/>
+            </w:tcMar>
+          </w:tcPr>
+          <w:p>
+            <w:r>
+              <w:rPr>
+                <w:rFonts w:ascii="Aptos" w:eastAsia="Aptos" w:hAnsi="Aptos" w:cs="Aptos"/>
+                <w:b/>
+                <w:bCs/>
+                <w:sz w:val="20"/>
+                <w:szCs w:val="20"/>
+              </w:rPr>
+              <w:t>Test</w:t>
+            </w:r>
+          </w:p>
+        </w:tc>
+        <w:tc>
+          <w:tcPr>
+            <w:tcW w:w="550" w:type="pct"/>
+            <w:shd w:val="clear" w:color="auto" w:fill="F2CEED" w:themeFill="accent5" w:themeFillTint="33"/>
+            <w:tcMar>
+              <w:top w:w="30" w:type="dxa"/>
+              <w:left w:w="80" w:type="dxa"/>
+              <w:bottom w:w="30" w:type="dxa"/>
+              <w:right w:w="80" w:type="dxa"/>
+            </w:tcMar>
+          </w:tcPr>
+          <w:p>
+            <w:r>
+              <w:rPr>
+                <w:rFonts w:ascii="Aptos" w:eastAsia="Aptos" w:hAnsi="Aptos" w:cs="Aptos"/>
+                <w:b/>
+                <w:bCs/>
+                <w:sz w:val="20"/>
+                <w:szCs w:val="20"/>
+              </w:rPr>
+              <w:t>Type</w:t>
+            </w:r>
+          </w:p>
+        </w:tc>
+        <w:tc>
+          <w:tcPr>
+            <w:tcW w:w="2300" w:type="pct"/>
+            <w:shd w:val="clear" w:color="auto" w:fill="F2CEED" w:themeFill="accent5" w:themeFillTint="33"/>
+            <w:tcMar>
+              <w:top w:w="30" w:type="dxa"/>
+              <w:left w:w="80" w:type="dxa"/>
+              <w:bottom w:w="30" w:type="dxa"/>
+              <w:right w:w="80" w:type="dxa"/>
+            </w:tcMar>
+          </w:tcPr>
+          <w:p>
+            <w:r>
+              <w:rPr>
+                <w:rFonts w:ascii="Aptos" w:eastAsia="Aptos" w:hAnsi="Aptos" w:cs="Aptos"/>
+                <w:b/>
+                <w:bCs/>
+                <w:sz w:val="20"/>
+                <w:szCs w:val="20"/>
+              </w:rPr>
+              <w:t>Expected Result</w:t>
+            </w:r>
+          </w:p>
+        </w:tc>
+      </w:tr>
+      <w:tr>
+        <w:tblPrEx>
+          <w:tblCellMar>
+            <w:top w:w="0" w:type="dxa"/>
+            <w:bottom w:w="0" w:type="dxa"/>
+          </w:tblCellMar>
+        </w:tblPrEx>
+        <w:trPr>
+          <w:cantSplit/>
+        </w:trPr>
+        <w:tc>
+          <w:tcPr>
+            <w:tcW w:w="300" w:type="pct"/>
+            <w:tcMar>
+              <w:top w:w="30" w:type="dxa"/>
+              <w:left w:w="80" w:type="dxa"/>
+              <w:bottom w:w="30" w:type="dxa"/>
+              <w:right w:w="80" w:type="dxa"/>
+            </w:tcMar>
+          </w:tcPr>
+          <w:p>
+            <w:r>
+              <w:rPr>
+                <w:rFonts w:ascii="Aptos" w:eastAsia="Aptos" w:hAnsi="Aptos" w:cs="Aptos"/>
+                <w:sz w:val="20"/>
+                <w:szCs w:val="20"/>
+              </w:rPr>
+              <w:t>1</w:t>
+            </w:r>
+          </w:p>
+        </w:tc>
+        <w:tc>
+          <w:tcPr>
+            <w:tcW w:w="1850" w:type="pct"/>
+            <w:tcMar>
+              <w:top w:w="30" w:type="dxa"/>
+              <w:left w:w="80" w:type="dxa"/>
+              <w:bottom w:w="30" w:type="dxa"/>
+              <w:right w:w="80" w:type="dxa"/>
+            </w:tcMar>
+          </w:tcPr>
+          <w:p>
+            <w:r>
+              <w:rPr>
+                <w:rFonts w:ascii="Aptos" w:eastAsia="Aptos" w:hAnsi="Aptos" w:cs="Aptos"/>
+                <w:sz w:val="20"/>
+                <w:szCs w:val="20"/>
+              </w:rPr>
+              <w:t>Leave the film title blank, enter an age rating of 12A and a duration of 148, then press Add</w:t>
+            </w:r>
+          </w:p>
+        </w:tc>
+        <w:tc>
+          <w:tcPr>
+            <w:tcW w:w="550" w:type="pct"/>
+            <w:tcMar>
+              <w:top w:w="30" w:type="dxa"/>
+              <w:left w:w="80" w:type="dxa"/>
+              <w:bottom w:w="30" w:type="dxa"/>
+              <w:right w:w="80" w:type="dxa"/>
+            </w:tcMar>
+          </w:tcPr>
+          <w:p>
+            <w:r>
+              <w:rPr>
+                <w:rFonts w:ascii="Aptos" w:eastAsia="Aptos" w:hAnsi="Aptos" w:cs="Aptos"/>
+                <w:sz w:val="20"/>
+                <w:szCs w:val="20"/>
+              </w:rPr>
+              <w:t>Erroneous</w:t>
+            </w:r>
+          </w:p>
+        </w:tc>
+        <w:tc>
+          <w:tcPr>
+            <w:tcW w:w="2300" w:type="pct"/>
+            <w:tcMar>
+              <w:top w:w="30" w:type="dxa"/>
+              <w:left w:w="80" w:type="dxa"/>
+              <w:bottom w:w="30" w:type="dxa"/>
+              <w:right w:w="80" w:type="dxa"/>
+            </w:tcMar>
+          </w:tcPr>
+          <w:p>
+            <w:r>
+              <w:rPr>
+                <w:rFonts w:ascii="Aptos" w:eastAsia="Aptos" w:hAnsi="Aptos" w:cs="Aptos"/>
+                <w:sz w:val="20"/>
+                <w:szCs w:val="20"/>
+              </w:rPr>
+              <w:t>The film is rejected and a message appears stating “Enter a film title”.</w:t>
+            </w:r>
+          </w:p>
+        </w:tc>
+      </w:tr>
+      <w:tr>
+        <w:tblPrEx>
+          <w:tblCellMar>
+            <w:top w:w="0" w:type="dxa"/>
+            <w:bottom w:w="0" w:type="dxa"/>
+          </w:tblCellMar>
+        </w:tblPrEx>
+        <w:trPr>
+          <w:cantSplit/>
+        </w:trPr>
+        <w:tc>
+          <w:tcPr>
+            <w:tcW w:w="300" w:type="pct"/>
+            <w:tcMar>
+              <w:top w:w="30" w:type="dxa"/>
+              <w:left w:w="80" w:type="dxa"/>
+              <w:bottom w:w="30" w:type="dxa"/>
+              <w:right w:w="80" w:type="dxa"/>
+            </w:tcMar>
+          </w:tcPr>
+          <w:p>
+            <w:r>
+              <w:rPr>
+                <w:rFonts w:ascii="Aptos" w:eastAsia="Aptos" w:hAnsi="Aptos" w:cs="Aptos"/>
+                <w:sz w:val="20"/>
+                <w:szCs w:val="20"/>
+              </w:rPr>
+              <w:t>2</w:t>
+            </w:r>
+          </w:p>
+        </w:tc>
+        <w:tc>
+          <w:tcPr>
+            <w:tcW w:w="1850" w:type="pct"/>
+            <w:tcMar>
+              <w:top w:w="30" w:type="dxa"/>
+              <w:left w:w="80" w:type="dxa"/>
+              <w:bottom w:w="30" w:type="dxa"/>
+              <w:right w:w="80" w:type="dxa"/>
+            </w:tcMar>
+          </w:tcPr>
+          <w:p>
+            <w:r>
+              <w:rPr>
+                <w:rFonts w:ascii="Aptos" w:eastAsia="Aptos" w:hAnsi="Aptos" w:cs="Aptos"/>
+                <w:sz w:val="20"/>
+                <w:szCs w:val="20"/>
+              </w:rPr>
+              <w:t>Enter the title Inception, leave the age rating blank, enter a duration of 148, then press Add</w:t>
+            </w:r>
+          </w:p>
+        </w:tc>
+        <w:tc>
+          <w:tcPr>
+            <w:tcW w:w="550" w:type="pct"/>
+            <w:tcMar>
+              <w:top w:w="30" w:type="dxa"/>
+              <w:left w:w="80" w:type="dxa"/>
+              <w:bottom w:w="30" w:type="dxa"/>
+              <w:right w:w="80" w:type="dxa"/>
+            </w:tcMar>
+          </w:tcPr>
+          <w:p>
+            <w:r>
+              <w:rPr>
+                <w:rFonts w:ascii="Aptos" w:eastAsia="Aptos" w:hAnsi="Aptos" w:cs="Aptos"/>
+                <w:sz w:val="20"/>
+                <w:szCs w:val="20"/>
+              </w:rPr>
+              <w:t>Erroneous</w:t>
+            </w:r>
+          </w:p>
+        </w:tc>
+        <w:tc>
+          <w:tcPr>
+            <w:tcW w:w="2300" w:type="pct"/>
+            <w:tcMar>
+              <w:top w:w="30" w:type="dxa"/>
+              <w:left w:w="80" w:type="dxa"/>
+              <w:bottom w:w="30" w:type="dxa"/>
+              <w:right w:w="80" w:type="dxa"/>
+            </w:tcMar>
+          </w:tcPr>
+          <w:p>
+            <w:r>
+              <w:rPr>
+                <w:rFonts w:ascii="Aptos" w:eastAsia="Aptos" w:hAnsi="Aptos" w:cs="Aptos"/>
+                <w:sz w:val="20"/>
+                <w:szCs w:val="20"/>
+              </w:rPr>
+              <w:t>The film is rejected and a message appears stating “Enter an age rating”.</w:t>
+            </w:r>
+          </w:p>
+        </w:tc>
+      </w:tr>
+      <w:tr>
+        <w:tblPrEx>
+          <w:tblCellMar>
+            <w:top w:w="0" w:type="dxa"/>
+            <w:bottom w:w="0" w:type="dxa"/>
+          </w:tblCellMar>
+        </w:tblPrEx>
+        <w:trPr>
+          <w:cantSplit/>
+        </w:trPr>
+        <w:tc>
+          <w:tcPr>
+            <w:tcW w:w="300" w:type="pct"/>
+            <w:tcMar>
+              <w:top w:w="30" w:type="dxa"/>
+              <w:left w:w="80" w:type="dxa"/>
+              <w:bottom w:w="30" w:type="dxa"/>
+              <w:right w:w="80" w:type="dxa"/>
+            </w:tcMar>
+          </w:tcPr>
+          <w:p>
+            <w:r>
+              <w:rPr>
+                <w:rFonts w:ascii="Aptos" w:eastAsia="Aptos" w:hAnsi="Aptos" w:cs="Aptos"/>
+                <w:sz w:val="20"/>
+                <w:szCs w:val="20"/>
+              </w:rPr>
+              <w:t>3</w:t>
+            </w:r>
+          </w:p>
+        </w:tc>
+        <w:tc>
+          <w:tcPr>
+            <w:tcW w:w="1850" w:type="pct"/>
+            <w:tcMar>
+              <w:top w:w="30" w:type="dxa"/>
+              <w:left w:w="80" w:type="dxa"/>
+              <w:bottom w:w="30" w:type="dxa"/>
+              <w:right w:w="80" w:type="dxa"/>
+            </w:tcMar>
+          </w:tcPr>
+          <w:p>
+            <w:r>
+              <w:rPr>
+                <w:rFonts w:ascii="Aptos" w:eastAsia="Aptos" w:hAnsi="Aptos" w:cs="Aptos"/>
+                <w:sz w:val="20"/>
+                <w:szCs w:val="20"/>
+              </w:rPr>
+              <w:t>Enter the title Inception, age rating 12A, and a duration of -20, then press Add</w:t>
+            </w:r>
+          </w:p>
+        </w:tc>
+        <w:tc>
+          <w:tcPr>
+            <w:tcW w:w="550" w:type="pct"/>
+            <w:tcMar>
+              <w:top w:w="30" w:type="dxa"/>
+              <w:left w:w="80" w:type="dxa"/>
+              <w:bottom w:w="30" w:type="dxa"/>
+              <w:right w:w="80" w:type="dxa"/>
+            </w:tcMar>
+          </w:tcPr>
+          <w:p>
+            <w:r>
+              <w:rPr>
+                <w:rFonts w:ascii="Aptos" w:eastAsia="Aptos" w:hAnsi="Aptos" w:cs="Aptos"/>
+                <w:sz w:val="20"/>
+                <w:szCs w:val="20"/>
+              </w:rPr>
+              <w:t>Erroneous</w:t>
+            </w:r>
+          </w:p>
+        </w:tc>
+        <w:tc>
+          <w:tcPr>
+            <w:tcW w:w="2300" w:type="pct"/>
+            <w:tcMar>
+              <w:top w:w="30" w:type="dxa"/>
+              <w:left w:w="80" w:type="dxa"/>
+              <w:bottom w:w="30" w:type="dxa"/>
+              <w:right w:w="80" w:type="dxa"/>
+            </w:tcMar>
+          </w:tcPr>
+          <w:p>
+            <w:r>
+              <w:rPr>
+                <w:rFonts w:ascii="Aptos" w:eastAsia="Aptos" w:hAnsi="Aptos" w:cs="Aptos"/>
+                <w:sz w:val="20"/>
+                <w:szCs w:val="20"/>
+              </w:rPr>
+              <w:t>The film is rejected and a message appears stating “Duration cannot be negative”.</w:t>
+            </w:r>
+          </w:p>
+        </w:tc>
+      </w:tr>
+      <w:tr>
+        <w:tblPrEx>
+          <w:tblCellMar>
+            <w:top w:w="0" w:type="dxa"/>
+            <w:bottom w:w="0" w:type="dxa"/>
+          </w:tblCellMar>
+        </w:tblPrEx>
+        <w:trPr>
+          <w:cantSplit/>
+        </w:trPr>
+        <w:tc>
+          <w:tcPr>
+            <w:tcW w:w="300" w:type="pct"/>
+            <w:tcMar>
+              <w:top w:w="30" w:type="dxa"/>
+              <w:left w:w="80" w:type="dxa"/>
+              <w:bottom w:w="30" w:type="dxa"/>
+              <w:right w:w="80" w:type="dxa"/>
+            </w:tcMar>
+          </w:tcPr>
+          <w:p>
+            <w:r>
+              <w:rPr>
+                <w:rFonts w:ascii="Aptos" w:eastAsia="Aptos" w:hAnsi="Aptos" w:cs="Aptos"/>
+                <w:sz w:val="20"/>
+                <w:szCs w:val="20"/>
+              </w:rPr>
+              <w:t>4</w:t>
+            </w:r>
+          </w:p>
+        </w:tc>
+        <w:tc>
+          <w:tcPr>
+            <w:tcW w:w="1850" w:type="pct"/>
+            <w:tcMar>
+              <w:top w:w="30" w:type="dxa"/>
+              <w:left w:w="80" w:type="dxa"/>
+              <w:bottom w:w="30" w:type="dxa"/>
+              <w:right w:w="80" w:type="dxa"/>
+            </w:tcMar>
+          </w:tcPr>
+          <w:p>
+            <w:r>
+              <w:rPr>
+                <w:rFonts w:ascii="Aptos" w:eastAsia="Aptos" w:hAnsi="Aptos" w:cs="Aptos"/>
+                <w:sz w:val="20"/>
+                <w:szCs w:val="20"/>
+              </w:rPr>
+              <w:t>Enter the title Inception, age rating 12A, duration 148 and a suitable description, then press Add</w:t>
+            </w:r>
+          </w:p>
+        </w:tc>
+        <w:tc>
+          <w:tcPr>
+            <w:tcW w:w="550" w:type="pct"/>
+            <w:tcMar>
+              <w:top w:w="30" w:type="dxa"/>
+              <w:left w:w="80" w:type="dxa"/>
+              <w:bottom w:w="30" w:type="dxa"/>
+              <w:right w:w="80" w:type="dxa"/>
+            </w:tcMar>
+          </w:tcPr>
+          <w:p>
+            <w:r>
+              <w:rPr>
+                <w:rFonts w:ascii="Aptos" w:eastAsia="Aptos" w:hAnsi="Aptos" w:cs="Aptos"/>
+                <w:sz w:val="20"/>
+                <w:szCs w:val="20"/>
+              </w:rPr>
+              <w:t>Normal</w:t>
+            </w:r>
+          </w:p>
+        </w:tc>
+        <w:tc>
+          <w:tcPr>
+            <w:tcW w:w="2300" w:type="pct"/>
+            <w:tcMar>
+              <w:top w:w="30" w:type="dxa"/>
+              <w:left w:w="80" w:type="dxa"/>
+              <w:bottom w:w="30" w:type="dxa"/>
+              <w:right w:w="80" w:type="dxa"/>
+            </w:tcMar>
+          </w:tcPr>
+          <w:p>
+            <w:r>
+              <w:rPr>
+                <w:rFonts w:ascii="Aptos" w:eastAsia="Aptos" w:hAnsi="Aptos" w:cs="Aptos"/>
+                <w:sz w:val="20"/>
+                <w:szCs w:val="20"/>
+              </w:rPr>
+              <w:t xml:space="preserve">The film Inception is saved to </w:t>
+            </w:r>
+            <w:proofErr w:type="spellStart"/>
+            <w:r>
+              <w:rPr>
+                <w:rFonts w:ascii="Aptos" w:eastAsia="Aptos" w:hAnsi="Aptos" w:cs="Aptos"/>
+                <w:sz w:val="20"/>
+                <w:szCs w:val="20"/>
+              </w:rPr>
+              <w:t>tblFilm</w:t>
+            </w:r>
+            <w:proofErr w:type="spellEnd"/>
+            <w:r>
+              <w:rPr>
+                <w:rFonts w:ascii="Aptos" w:eastAsia="Aptos" w:hAnsi="Aptos" w:cs="Aptos"/>
+                <w:sz w:val="20"/>
+                <w:szCs w:val="20"/>
+              </w:rPr>
+              <w:t xml:space="preserve"> and appears in the films grid.</w:t>
+            </w:r>
+          </w:p>
+        </w:tc>
+      </w:tr>
+      <w:tr>
+        <w:tblPrEx>
+          <w:tblCellMar>
+            <w:top w:w="0" w:type="dxa"/>
+            <w:bottom w:w="0" w:type="dxa"/>
+          </w:tblCellMar>
+        </w:tblPrEx>
+        <w:trPr>
+          <w:cantSplit/>
+        </w:trPr>
+        <w:tc>
+          <w:tcPr>
+            <w:tcW w:w="300" w:type="pct"/>
+            <w:tcMar>
+              <w:top w:w="30" w:type="dxa"/>
+              <w:left w:w="80" w:type="dxa"/>
+              <w:bottom w:w="30" w:type="dxa"/>
+              <w:right w:w="80" w:type="dxa"/>
+            </w:tcMar>
+          </w:tcPr>
+          <w:p>
+            <w:r>
+              <w:rPr>
+                <w:rFonts w:ascii="Aptos" w:eastAsia="Aptos" w:hAnsi="Aptos" w:cs="Aptos"/>
+                <w:sz w:val="20"/>
+                <w:szCs w:val="20"/>
+              </w:rPr>
+              <w:t>5</w:t>
+            </w:r>
+          </w:p>
+        </w:tc>
+        <w:tc>
+          <w:tcPr>
+            <w:tcW w:w="1850" w:type="pct"/>
+            <w:tcMar>
+              <w:top w:w="30" w:type="dxa"/>
+              <w:left w:w="80" w:type="dxa"/>
+              <w:bottom w:w="30" w:type="dxa"/>
+              <w:right w:w="80" w:type="dxa"/>
+            </w:tcMar>
+          </w:tcPr>
+          <w:p>
+            <w:r>
+              <w:rPr>
+                <w:rFonts w:ascii="Aptos" w:eastAsia="Aptos" w:hAnsi="Aptos" w:cs="Aptos"/>
+                <w:sz w:val="20"/>
+                <w:szCs w:val="20"/>
+              </w:rPr>
+              <w:t>Enter the title Paddington 2, age rating PG, duration 103 and a suitable description, then press Add</w:t>
+            </w:r>
+          </w:p>
+        </w:tc>
+        <w:tc>
+          <w:tcPr>
+            <w:tcW w:w="550" w:type="pct"/>
+            <w:tcMar>
+              <w:top w:w="30" w:type="dxa"/>
+              <w:left w:w="80" w:type="dxa"/>
+              <w:bottom w:w="30" w:type="dxa"/>
+              <w:right w:w="80" w:type="dxa"/>
+            </w:tcMar>
+          </w:tcPr>
+          <w:p>
+            <w:r>
+              <w:rPr>
+                <w:rFonts w:ascii="Aptos" w:eastAsia="Aptos" w:hAnsi="Aptos" w:cs="Aptos"/>
+                <w:sz w:val="20"/>
+                <w:szCs w:val="20"/>
+              </w:rPr>
+              <w:t>Normal</w:t>
+            </w:r>
+          </w:p>
+        </w:tc>
+        <w:tc>
+          <w:tcPr>
+            <w:tcW w:w="2300" w:type="pct"/>
+            <w:tcMar>
+              <w:top w:w="30" w:type="dxa"/>
+              <w:left w:w="80" w:type="dxa"/>
+              <w:bottom w:w="30" w:type="dxa"/>
+              <w:right w:w="80" w:type="dxa"/>
+            </w:tcMar>
+          </w:tcPr>
+          <w:p>
+            <w:r>
+              <w:rPr>
+                <w:rFonts w:ascii="Aptos" w:eastAsia="Aptos" w:hAnsi="Aptos" w:cs="Aptos"/>
+                <w:sz w:val="20"/>
+                <w:szCs w:val="20"/>
+              </w:rPr>
+              <w:t>The film Paddington 2 is saved and both films now appear in the grid.</w:t>
+            </w:r>
+          </w:p>
+        </w:tc>
+      </w:tr>
+    </w:tbl>
+    <w:p/>
     <w:p/>
     <w:sectPr>
       <w:headerReference w:type="even" r:id="rId7"/>

</xml_diff>

<commit_message>
added test plan for objective 16: creating a screen with automatic screen generation
</commit_message>
<xml_diff>
--- a/Testing.docx
+++ b/Testing.docx
@@ -759,6 +759,636 @@
                 <w:szCs w:val="20"/>
               </w:rPr>
               <w:t>The film Paddington 2 is saved and both films now appear in the grid.</w:t>
+            </w:r>
+          </w:p>
+        </w:tc>
+      </w:tr>
+    </w:tbl>
+    <w:p/>
+    <w:p>
+      <w:pPr>
+        <w:pStyle w:val="Heading3"/>
+      </w:pPr>
+      <w:r>
+        <w:rPr>
+          <w:rFonts w:ascii="Aptos Display" w:eastAsia="Aptos Display" w:hAnsi="Aptos Display" w:cs="Aptos Display"/>
+          <w:b/>
+          <w:bCs/>
+          <w:color w:val="000000"/>
+        </w:rPr>
+        <w:t>Objective 16: Creating a Screen with Automatic Seat Generation</w:t>
+      </w:r>
+    </w:p>
+    <w:p>
+      <w:r>
+        <w:rPr>
+          <w:rFonts w:ascii="Aptos" w:eastAsia="Aptos" w:hAnsi="Aptos" w:cs="Aptos"/>
+        </w:rPr>
+        <w:t>Screens are created next, since a screening cannot be scheduled without a screen and its seats to attach it to.</w:t>
+      </w:r>
+    </w:p>
+    <w:tbl>
+      <w:tblPr>
+        <w:tblW w:w="5000" w:type="pct"/>
+        <w:tblBorders>
+          <w:top w:val="single" w:sz="4" w:space="0" w:color="808080"/>
+          <w:left w:val="single" w:sz="4" w:space="0" w:color="808080"/>
+          <w:bottom w:val="single" w:sz="4" w:space="0" w:color="808080"/>
+          <w:right w:val="single" w:sz="4" w:space="0" w:color="808080"/>
+          <w:insideH w:val="single" w:sz="4" w:space="0" w:color="808080"/>
+          <w:insideV w:val="single" w:sz="4" w:space="0" w:color="808080"/>
+        </w:tblBorders>
+        <w:tblCellMar>
+          <w:left w:w="10" w:type="dxa"/>
+          <w:right w:w="10" w:type="dxa"/>
+        </w:tblCellMar>
+        <w:tblLook w:val="0000" w:firstRow="0" w:lastRow="0" w:firstColumn="0" w:lastColumn="0" w:noHBand="0" w:noVBand="0"/>
+      </w:tblPr>
+      <w:tblGrid>
+        <w:gridCol w:w="554"/>
+        <w:gridCol w:w="3454"/>
+        <w:gridCol w:w="1047"/>
+        <w:gridCol w:w="4295"/>
+      </w:tblGrid>
+      <w:tr>
+        <w:tblPrEx>
+          <w:tblCellMar>
+            <w:top w:w="0" w:type="dxa"/>
+            <w:bottom w:w="0" w:type="dxa"/>
+          </w:tblCellMar>
+        </w:tblPrEx>
+        <w:trPr>
+          <w:cantSplit/>
+          <w:tblHeader/>
+        </w:trPr>
+        <w:tc>
+          <w:tcPr>
+            <w:tcW w:w="300" w:type="pct"/>
+            <w:shd w:val="clear" w:color="auto" w:fill="F2CEED" w:themeFill="accent5" w:themeFillTint="33"/>
+            <w:tcMar>
+              <w:top w:w="30" w:type="dxa"/>
+              <w:left w:w="80" w:type="dxa"/>
+              <w:bottom w:w="30" w:type="dxa"/>
+              <w:right w:w="80" w:type="dxa"/>
+            </w:tcMar>
+          </w:tcPr>
+          <w:p>
+            <w:r>
+              <w:rPr>
+                <w:rFonts w:ascii="Aptos" w:eastAsia="Aptos" w:hAnsi="Aptos" w:cs="Aptos"/>
+                <w:b/>
+                <w:bCs/>
+                <w:sz w:val="20"/>
+                <w:szCs w:val="20"/>
+              </w:rPr>
+              <w:t>No.</w:t>
+            </w:r>
+          </w:p>
+        </w:tc>
+        <w:tc>
+          <w:tcPr>
+            <w:tcW w:w="1850" w:type="pct"/>
+            <w:shd w:val="clear" w:color="auto" w:fill="F2CEED" w:themeFill="accent5" w:themeFillTint="33"/>
+            <w:tcMar>
+              <w:top w:w="30" w:type="dxa"/>
+              <w:left w:w="80" w:type="dxa"/>
+              <w:bottom w:w="30" w:type="dxa"/>
+              <w:right w:w="80" w:type="dxa"/>
+            </w:tcMar>
+          </w:tcPr>
+          <w:p>
+            <w:r>
+              <w:rPr>
+                <w:rFonts w:ascii="Aptos" w:eastAsia="Aptos" w:hAnsi="Aptos" w:cs="Aptos"/>
+                <w:b/>
+                <w:bCs/>
+                <w:sz w:val="20"/>
+                <w:szCs w:val="20"/>
+              </w:rPr>
+              <w:t>Test</w:t>
+            </w:r>
+          </w:p>
+        </w:tc>
+        <w:tc>
+          <w:tcPr>
+            <w:tcW w:w="550" w:type="pct"/>
+            <w:shd w:val="clear" w:color="auto" w:fill="F2CEED" w:themeFill="accent5" w:themeFillTint="33"/>
+            <w:tcMar>
+              <w:top w:w="30" w:type="dxa"/>
+              <w:left w:w="80" w:type="dxa"/>
+              <w:bottom w:w="30" w:type="dxa"/>
+              <w:right w:w="80" w:type="dxa"/>
+            </w:tcMar>
+          </w:tcPr>
+          <w:p>
+            <w:r>
+              <w:rPr>
+                <w:rFonts w:ascii="Aptos" w:eastAsia="Aptos" w:hAnsi="Aptos" w:cs="Aptos"/>
+                <w:b/>
+                <w:bCs/>
+                <w:sz w:val="20"/>
+                <w:szCs w:val="20"/>
+              </w:rPr>
+              <w:t>Type</w:t>
+            </w:r>
+          </w:p>
+        </w:tc>
+        <w:tc>
+          <w:tcPr>
+            <w:tcW w:w="2300" w:type="pct"/>
+            <w:shd w:val="clear" w:color="auto" w:fill="F2CEED" w:themeFill="accent5" w:themeFillTint="33"/>
+            <w:tcMar>
+              <w:top w:w="30" w:type="dxa"/>
+              <w:left w:w="80" w:type="dxa"/>
+              <w:bottom w:w="30" w:type="dxa"/>
+              <w:right w:w="80" w:type="dxa"/>
+            </w:tcMar>
+          </w:tcPr>
+          <w:p>
+            <w:r>
+              <w:rPr>
+                <w:rFonts w:ascii="Aptos" w:eastAsia="Aptos" w:hAnsi="Aptos" w:cs="Aptos"/>
+                <w:b/>
+                <w:bCs/>
+                <w:sz w:val="20"/>
+                <w:szCs w:val="20"/>
+              </w:rPr>
+              <w:t>Expected Result</w:t>
+            </w:r>
+          </w:p>
+        </w:tc>
+      </w:tr>
+      <w:tr>
+        <w:tblPrEx>
+          <w:tblCellMar>
+            <w:top w:w="0" w:type="dxa"/>
+            <w:bottom w:w="0" w:type="dxa"/>
+          </w:tblCellMar>
+        </w:tblPrEx>
+        <w:trPr>
+          <w:cantSplit/>
+        </w:trPr>
+        <w:tc>
+          <w:tcPr>
+            <w:tcW w:w="300" w:type="pct"/>
+            <w:tcMar>
+              <w:top w:w="30" w:type="dxa"/>
+              <w:left w:w="80" w:type="dxa"/>
+              <w:bottom w:w="30" w:type="dxa"/>
+              <w:right w:w="80" w:type="dxa"/>
+            </w:tcMar>
+          </w:tcPr>
+          <w:p>
+            <w:r>
+              <w:rPr>
+                <w:rFonts w:ascii="Aptos" w:eastAsia="Aptos" w:hAnsi="Aptos" w:cs="Aptos"/>
+                <w:sz w:val="20"/>
+                <w:szCs w:val="20"/>
+              </w:rPr>
+              <w:t>6</w:t>
+            </w:r>
+          </w:p>
+        </w:tc>
+        <w:tc>
+          <w:tcPr>
+            <w:tcW w:w="1850" w:type="pct"/>
+            <w:tcMar>
+              <w:top w:w="30" w:type="dxa"/>
+              <w:left w:w="80" w:type="dxa"/>
+              <w:bottom w:w="30" w:type="dxa"/>
+              <w:right w:w="80" w:type="dxa"/>
+            </w:tcMar>
+          </w:tcPr>
+          <w:p>
+            <w:r>
+              <w:rPr>
+                <w:rFonts w:ascii="Aptos" w:eastAsia="Aptos" w:hAnsi="Aptos" w:cs="Aptos"/>
+                <w:sz w:val="20"/>
+                <w:szCs w:val="20"/>
+              </w:rPr>
+              <w:t>Leave the screen name blank, enter a capacity of 50, then press Add</w:t>
+            </w:r>
+          </w:p>
+        </w:tc>
+        <w:tc>
+          <w:tcPr>
+            <w:tcW w:w="550" w:type="pct"/>
+            <w:tcMar>
+              <w:top w:w="30" w:type="dxa"/>
+              <w:left w:w="80" w:type="dxa"/>
+              <w:bottom w:w="30" w:type="dxa"/>
+              <w:right w:w="80" w:type="dxa"/>
+            </w:tcMar>
+          </w:tcPr>
+          <w:p>
+            <w:r>
+              <w:rPr>
+                <w:rFonts w:ascii="Aptos" w:eastAsia="Aptos" w:hAnsi="Aptos" w:cs="Aptos"/>
+                <w:sz w:val="20"/>
+                <w:szCs w:val="20"/>
+              </w:rPr>
+              <w:t>Erroneous</w:t>
+            </w:r>
+          </w:p>
+        </w:tc>
+        <w:tc>
+          <w:tcPr>
+            <w:tcW w:w="2300" w:type="pct"/>
+            <w:tcMar>
+              <w:top w:w="30" w:type="dxa"/>
+              <w:left w:w="80" w:type="dxa"/>
+              <w:bottom w:w="30" w:type="dxa"/>
+              <w:right w:w="80" w:type="dxa"/>
+            </w:tcMar>
+          </w:tcPr>
+          <w:p>
+            <w:r>
+              <w:rPr>
+                <w:rFonts w:ascii="Aptos" w:eastAsia="Aptos" w:hAnsi="Aptos" w:cs="Aptos"/>
+                <w:sz w:val="20"/>
+                <w:szCs w:val="20"/>
+              </w:rPr>
+              <w:t>The screen is rejected and a message appears stating “Enter a screen name”.</w:t>
+            </w:r>
+          </w:p>
+        </w:tc>
+      </w:tr>
+      <w:tr>
+        <w:tblPrEx>
+          <w:tblCellMar>
+            <w:top w:w="0" w:type="dxa"/>
+            <w:bottom w:w="0" w:type="dxa"/>
+          </w:tblCellMar>
+        </w:tblPrEx>
+        <w:trPr>
+          <w:cantSplit/>
+        </w:trPr>
+        <w:tc>
+          <w:tcPr>
+            <w:tcW w:w="300" w:type="pct"/>
+            <w:tcMar>
+              <w:top w:w="30" w:type="dxa"/>
+              <w:left w:w="80" w:type="dxa"/>
+              <w:bottom w:w="30" w:type="dxa"/>
+              <w:right w:w="80" w:type="dxa"/>
+            </w:tcMar>
+          </w:tcPr>
+          <w:p>
+            <w:r>
+              <w:rPr>
+                <w:rFonts w:ascii="Aptos" w:eastAsia="Aptos" w:hAnsi="Aptos" w:cs="Aptos"/>
+                <w:sz w:val="20"/>
+                <w:szCs w:val="20"/>
+              </w:rPr>
+              <w:t>7</w:t>
+            </w:r>
+          </w:p>
+        </w:tc>
+        <w:tc>
+          <w:tcPr>
+            <w:tcW w:w="1850" w:type="pct"/>
+            <w:tcMar>
+              <w:top w:w="30" w:type="dxa"/>
+              <w:left w:w="80" w:type="dxa"/>
+              <w:bottom w:w="30" w:type="dxa"/>
+              <w:right w:w="80" w:type="dxa"/>
+            </w:tcMar>
+          </w:tcPr>
+          <w:p>
+            <w:r>
+              <w:rPr>
+                <w:rFonts w:ascii="Aptos" w:eastAsia="Aptos" w:hAnsi="Aptos" w:cs="Aptos"/>
+                <w:sz w:val="20"/>
+                <w:szCs w:val="20"/>
+              </w:rPr>
+              <w:t>Enter the name Screen 1 and a capacity of 25, then press Add</w:t>
+            </w:r>
+          </w:p>
+        </w:tc>
+        <w:tc>
+          <w:tcPr>
+            <w:tcW w:w="550" w:type="pct"/>
+            <w:tcMar>
+              <w:top w:w="30" w:type="dxa"/>
+              <w:left w:w="80" w:type="dxa"/>
+              <w:bottom w:w="30" w:type="dxa"/>
+              <w:right w:w="80" w:type="dxa"/>
+            </w:tcMar>
+          </w:tcPr>
+          <w:p>
+            <w:r>
+              <w:rPr>
+                <w:rFonts w:ascii="Aptos" w:eastAsia="Aptos" w:hAnsi="Aptos" w:cs="Aptos"/>
+                <w:sz w:val="20"/>
+                <w:szCs w:val="20"/>
+              </w:rPr>
+              <w:t>Erroneous</w:t>
+            </w:r>
+          </w:p>
+        </w:tc>
+        <w:tc>
+          <w:tcPr>
+            <w:tcW w:w="2300" w:type="pct"/>
+            <w:tcMar>
+              <w:top w:w="30" w:type="dxa"/>
+              <w:left w:w="80" w:type="dxa"/>
+              <w:bottom w:w="30" w:type="dxa"/>
+              <w:right w:w="80" w:type="dxa"/>
+            </w:tcMar>
+          </w:tcPr>
+          <w:p>
+            <w:r>
+              <w:rPr>
+                <w:rFonts w:ascii="Aptos" w:eastAsia="Aptos" w:hAnsi="Aptos" w:cs="Aptos"/>
+                <w:sz w:val="20"/>
+                <w:szCs w:val="20"/>
+              </w:rPr>
+              <w:t>The screen is rejected and a message appears stating “Screen capacity must be a multiple of 10 (e.g. 10, 20, 30...)”, because 25 is not a multiple of ten.</w:t>
+            </w:r>
+          </w:p>
+        </w:tc>
+      </w:tr>
+      <w:tr>
+        <w:tblPrEx>
+          <w:tblCellMar>
+            <w:top w:w="0" w:type="dxa"/>
+            <w:bottom w:w="0" w:type="dxa"/>
+          </w:tblCellMar>
+        </w:tblPrEx>
+        <w:trPr>
+          <w:cantSplit/>
+        </w:trPr>
+        <w:tc>
+          <w:tcPr>
+            <w:tcW w:w="300" w:type="pct"/>
+            <w:tcMar>
+              <w:top w:w="30" w:type="dxa"/>
+              <w:left w:w="80" w:type="dxa"/>
+              <w:bottom w:w="30" w:type="dxa"/>
+              <w:right w:w="80" w:type="dxa"/>
+            </w:tcMar>
+          </w:tcPr>
+          <w:p>
+            <w:r>
+              <w:rPr>
+                <w:rFonts w:ascii="Aptos" w:eastAsia="Aptos" w:hAnsi="Aptos" w:cs="Aptos"/>
+                <w:sz w:val="20"/>
+                <w:szCs w:val="20"/>
+              </w:rPr>
+              <w:t>8</w:t>
+            </w:r>
+          </w:p>
+        </w:tc>
+        <w:tc>
+          <w:tcPr>
+            <w:tcW w:w="1850" w:type="pct"/>
+            <w:tcMar>
+              <w:top w:w="30" w:type="dxa"/>
+              <w:left w:w="80" w:type="dxa"/>
+              <w:bottom w:w="30" w:type="dxa"/>
+              <w:right w:w="80" w:type="dxa"/>
+            </w:tcMar>
+          </w:tcPr>
+          <w:p>
+            <w:r>
+              <w:rPr>
+                <w:rFonts w:ascii="Aptos" w:eastAsia="Aptos" w:hAnsi="Aptos" w:cs="Aptos"/>
+                <w:sz w:val="20"/>
+                <w:szCs w:val="20"/>
+              </w:rPr>
+              <w:t>Enter the name Screen 1 and a capacity of 50, then press Add</w:t>
+            </w:r>
+          </w:p>
+        </w:tc>
+        <w:tc>
+          <w:tcPr>
+            <w:tcW w:w="550" w:type="pct"/>
+            <w:tcMar>
+              <w:top w:w="30" w:type="dxa"/>
+              <w:left w:w="80" w:type="dxa"/>
+              <w:bottom w:w="30" w:type="dxa"/>
+              <w:right w:w="80" w:type="dxa"/>
+            </w:tcMar>
+          </w:tcPr>
+          <w:p>
+            <w:r>
+              <w:rPr>
+                <w:rFonts w:ascii="Aptos" w:eastAsia="Aptos" w:hAnsi="Aptos" w:cs="Aptos"/>
+                <w:sz w:val="20"/>
+                <w:szCs w:val="20"/>
+              </w:rPr>
+              <w:t>Normal</w:t>
+            </w:r>
+          </w:p>
+        </w:tc>
+        <w:tc>
+          <w:tcPr>
+            <w:tcW w:w="2300" w:type="pct"/>
+            <w:tcMar>
+              <w:top w:w="30" w:type="dxa"/>
+              <w:left w:w="80" w:type="dxa"/>
+              <w:bottom w:w="30" w:type="dxa"/>
+              <w:right w:w="80" w:type="dxa"/>
+            </w:tcMar>
+          </w:tcPr>
+          <w:p>
+            <w:r>
+              <w:rPr>
+                <w:rFonts w:ascii="Aptos" w:eastAsia="Aptos" w:hAnsi="Aptos" w:cs="Aptos"/>
+                <w:sz w:val="20"/>
+                <w:szCs w:val="20"/>
+              </w:rPr>
+              <w:t>Screen 1 is saved and the system automatically generates 50 seats arranged as 5 rows lettered A to E, each holding seats 1 to 10.</w:t>
+            </w:r>
+          </w:p>
+        </w:tc>
+      </w:tr>
+      <w:tr>
+        <w:tblPrEx>
+          <w:tblCellMar>
+            <w:top w:w="0" w:type="dxa"/>
+            <w:bottom w:w="0" w:type="dxa"/>
+          </w:tblCellMar>
+        </w:tblPrEx>
+        <w:trPr>
+          <w:cantSplit/>
+        </w:trPr>
+        <w:tc>
+          <w:tcPr>
+            <w:tcW w:w="300" w:type="pct"/>
+            <w:tcMar>
+              <w:top w:w="30" w:type="dxa"/>
+              <w:left w:w="80" w:type="dxa"/>
+              <w:bottom w:w="30" w:type="dxa"/>
+              <w:right w:w="80" w:type="dxa"/>
+            </w:tcMar>
+          </w:tcPr>
+          <w:p>
+            <w:r>
+              <w:rPr>
+                <w:rFonts w:ascii="Aptos" w:eastAsia="Aptos" w:hAnsi="Aptos" w:cs="Aptos"/>
+                <w:sz w:val="20"/>
+                <w:szCs w:val="20"/>
+              </w:rPr>
+              <w:t>9</w:t>
+            </w:r>
+          </w:p>
+        </w:tc>
+        <w:tc>
+          <w:tcPr>
+            <w:tcW w:w="1850" w:type="pct"/>
+            <w:tcMar>
+              <w:top w:w="30" w:type="dxa"/>
+              <w:left w:w="80" w:type="dxa"/>
+              <w:bottom w:w="30" w:type="dxa"/>
+              <w:right w:w="80" w:type="dxa"/>
+            </w:tcMar>
+          </w:tcPr>
+          <w:p>
+            <w:r>
+              <w:rPr>
+                <w:rFonts w:ascii="Aptos" w:eastAsia="Aptos" w:hAnsi="Aptos" w:cs="Aptos"/>
+                <w:sz w:val="20"/>
+                <w:szCs w:val="20"/>
+              </w:rPr>
+              <w:t>Enter the name Screen 2 and a capacity of 30, then press Add</w:t>
+            </w:r>
+          </w:p>
+        </w:tc>
+        <w:tc>
+          <w:tcPr>
+            <w:tcW w:w="550" w:type="pct"/>
+            <w:tcMar>
+              <w:top w:w="30" w:type="dxa"/>
+              <w:left w:w="80" w:type="dxa"/>
+              <w:bottom w:w="30" w:type="dxa"/>
+              <w:right w:w="80" w:type="dxa"/>
+            </w:tcMar>
+          </w:tcPr>
+          <w:p>
+            <w:r>
+              <w:rPr>
+                <w:rFonts w:ascii="Aptos" w:eastAsia="Aptos" w:hAnsi="Aptos" w:cs="Aptos"/>
+                <w:sz w:val="20"/>
+                <w:szCs w:val="20"/>
+              </w:rPr>
+              <w:t>Normal</w:t>
+            </w:r>
+          </w:p>
+        </w:tc>
+        <w:tc>
+          <w:tcPr>
+            <w:tcW w:w="2300" w:type="pct"/>
+            <w:tcMar>
+              <w:top w:w="30" w:type="dxa"/>
+              <w:left w:w="80" w:type="dxa"/>
+              <w:bottom w:w="30" w:type="dxa"/>
+              <w:right w:w="80" w:type="dxa"/>
+            </w:tcMar>
+          </w:tcPr>
+          <w:p>
+            <w:r>
+              <w:rPr>
+                <w:rFonts w:ascii="Aptos" w:eastAsia="Aptos" w:hAnsi="Aptos" w:cs="Aptos"/>
+                <w:sz w:val="20"/>
+                <w:szCs w:val="20"/>
+              </w:rPr>
+              <w:t>Screen 2 is saved with 30 seats generated in rows A to C.</w:t>
+            </w:r>
+          </w:p>
+        </w:tc>
+      </w:tr>
+      <w:tr>
+        <w:tblPrEx>
+          <w:tblCellMar>
+            <w:top w:w="0" w:type="dxa"/>
+            <w:bottom w:w="0" w:type="dxa"/>
+          </w:tblCellMar>
+        </w:tblPrEx>
+        <w:trPr>
+          <w:cantSplit/>
+        </w:trPr>
+        <w:tc>
+          <w:tcPr>
+            <w:tcW w:w="300" w:type="pct"/>
+            <w:tcMar>
+              <w:top w:w="30" w:type="dxa"/>
+              <w:left w:w="80" w:type="dxa"/>
+              <w:bottom w:w="30" w:type="dxa"/>
+              <w:right w:w="80" w:type="dxa"/>
+            </w:tcMar>
+          </w:tcPr>
+          <w:p>
+            <w:r>
+              <w:rPr>
+                <w:rFonts w:ascii="Aptos" w:eastAsia="Aptos" w:hAnsi="Aptos" w:cs="Aptos"/>
+                <w:sz w:val="20"/>
+                <w:szCs w:val="20"/>
+              </w:rPr>
+              <w:t>10</w:t>
+            </w:r>
+          </w:p>
+        </w:tc>
+        <w:tc>
+          <w:tcPr>
+            <w:tcW w:w="1850" w:type="pct"/>
+            <w:tcMar>
+              <w:top w:w="30" w:type="dxa"/>
+              <w:left w:w="80" w:type="dxa"/>
+              <w:bottom w:w="30" w:type="dxa"/>
+              <w:right w:w="80" w:type="dxa"/>
+            </w:tcMar>
+          </w:tcPr>
+          <w:p>
+            <w:r>
+              <w:rPr>
+                <w:rFonts w:ascii="Aptos" w:eastAsia="Aptos" w:hAnsi="Aptos" w:cs="Aptos"/>
+                <w:sz w:val="20"/>
+                <w:szCs w:val="20"/>
+              </w:rPr>
+              <w:t>Enter the name Small Screen and a capacity of 10, then press Add</w:t>
+            </w:r>
+          </w:p>
+        </w:tc>
+        <w:tc>
+          <w:tcPr>
+            <w:tcW w:w="550" w:type="pct"/>
+            <w:tcMar>
+              <w:top w:w="30" w:type="dxa"/>
+              <w:left w:w="80" w:type="dxa"/>
+              <w:bottom w:w="30" w:type="dxa"/>
+              <w:right w:w="80" w:type="dxa"/>
+            </w:tcMar>
+          </w:tcPr>
+          <w:p>
+            <w:r>
+              <w:rPr>
+                <w:rFonts w:ascii="Aptos" w:eastAsia="Aptos" w:hAnsi="Aptos" w:cs="Aptos"/>
+                <w:sz w:val="20"/>
+                <w:szCs w:val="20"/>
+              </w:rPr>
+              <w:t>Boundary</w:t>
+            </w:r>
+          </w:p>
+        </w:tc>
+        <w:tc>
+          <w:tcPr>
+            <w:tcW w:w="2300" w:type="pct"/>
+            <w:tcMar>
+              <w:top w:w="30" w:type="dxa"/>
+              <w:left w:w="80" w:type="dxa"/>
+              <w:bottom w:w="30" w:type="dxa"/>
+              <w:right w:w="80" w:type="dxa"/>
+            </w:tcMar>
+          </w:tcPr>
+          <w:p>
+            <w:r>
+              <w:rPr>
+                <w:rFonts w:ascii="Aptos" w:eastAsia="Aptos" w:hAnsi="Aptos" w:cs="Aptos"/>
+                <w:sz w:val="20"/>
+                <w:szCs w:val="20"/>
+              </w:rPr>
+              <w:t>The screen is accepted at the smallest valid capacity and generates a single row A with seats 1 to 10.</w:t>
             </w:r>
           </w:p>
         </w:tc>

</xml_diff>

<commit_message>
added test plan for objective 7: adding new screenings
</commit_message>
<xml_diff>
--- a/Testing.docx
+++ b/Testing.docx
@@ -1395,6 +1395,845 @@
       </w:tr>
     </w:tbl>
     <w:p/>
+    <w:p>
+      <w:pPr>
+        <w:pStyle w:val="Heading3"/>
+      </w:pPr>
+      <w:r>
+        <w:rPr>
+          <w:rFonts w:ascii="Aptos Display" w:eastAsia="Aptos Display" w:hAnsi="Aptos Display" w:cs="Aptos Display"/>
+          <w:b/>
+          <w:bCs/>
+          <w:color w:val="000000"/>
+        </w:rPr>
+        <w:t>Objective 7: Adding New Screenings</w:t>
+      </w:r>
+    </w:p>
+    <w:p>
+      <w:r>
+        <w:rPr>
+          <w:rFonts w:ascii="Aptos" w:eastAsia="Aptos" w:hAnsi="Aptos" w:cs="Aptos"/>
+        </w:rPr>
+        <w:t>With films and screens in place, screenings can now be created and linked to them.</w:t>
+      </w:r>
+    </w:p>
+    <w:tbl>
+      <w:tblPr>
+        <w:tblW w:w="5000" w:type="pct"/>
+        <w:tblBorders>
+          <w:top w:val="single" w:sz="4" w:space="0" w:color="808080"/>
+          <w:left w:val="single" w:sz="4" w:space="0" w:color="808080"/>
+          <w:bottom w:val="single" w:sz="4" w:space="0" w:color="808080"/>
+          <w:right w:val="single" w:sz="4" w:space="0" w:color="808080"/>
+          <w:insideH w:val="single" w:sz="4" w:space="0" w:color="808080"/>
+          <w:insideV w:val="single" w:sz="4" w:space="0" w:color="808080"/>
+        </w:tblBorders>
+        <w:tblCellMar>
+          <w:left w:w="10" w:type="dxa"/>
+          <w:right w:w="10" w:type="dxa"/>
+        </w:tblCellMar>
+        <w:tblLook w:val="0000" w:firstRow="0" w:lastRow="0" w:firstColumn="0" w:lastColumn="0" w:noHBand="0" w:noVBand="0"/>
+      </w:tblPr>
+      <w:tblGrid>
+        <w:gridCol w:w="554"/>
+        <w:gridCol w:w="3454"/>
+        <w:gridCol w:w="1047"/>
+        <w:gridCol w:w="4295"/>
+      </w:tblGrid>
+      <w:tr>
+        <w:tblPrEx>
+          <w:tblCellMar>
+            <w:top w:w="0" w:type="dxa"/>
+            <w:bottom w:w="0" w:type="dxa"/>
+          </w:tblCellMar>
+        </w:tblPrEx>
+        <w:trPr>
+          <w:cantSplit/>
+          <w:tblHeader/>
+        </w:trPr>
+        <w:tc>
+          <w:tcPr>
+            <w:tcW w:w="300" w:type="pct"/>
+            <w:shd w:val="clear" w:color="auto" w:fill="F2CEED" w:themeFill="accent5" w:themeFillTint="33"/>
+            <w:tcMar>
+              <w:top w:w="30" w:type="dxa"/>
+              <w:left w:w="80" w:type="dxa"/>
+              <w:bottom w:w="30" w:type="dxa"/>
+              <w:right w:w="80" w:type="dxa"/>
+            </w:tcMar>
+          </w:tcPr>
+          <w:p>
+            <w:r>
+              <w:rPr>
+                <w:rFonts w:ascii="Aptos" w:eastAsia="Aptos" w:hAnsi="Aptos" w:cs="Aptos"/>
+                <w:b/>
+                <w:bCs/>
+                <w:sz w:val="20"/>
+                <w:szCs w:val="20"/>
+              </w:rPr>
+              <w:t>No.</w:t>
+            </w:r>
+          </w:p>
+        </w:tc>
+        <w:tc>
+          <w:tcPr>
+            <w:tcW w:w="1850" w:type="pct"/>
+            <w:shd w:val="clear" w:color="auto" w:fill="F2CEED" w:themeFill="accent5" w:themeFillTint="33"/>
+            <w:tcMar>
+              <w:top w:w="30" w:type="dxa"/>
+              <w:left w:w="80" w:type="dxa"/>
+              <w:bottom w:w="30" w:type="dxa"/>
+              <w:right w:w="80" w:type="dxa"/>
+            </w:tcMar>
+          </w:tcPr>
+          <w:p>
+            <w:r>
+              <w:rPr>
+                <w:rFonts w:ascii="Aptos" w:eastAsia="Aptos" w:hAnsi="Aptos" w:cs="Aptos"/>
+                <w:b/>
+                <w:bCs/>
+                <w:sz w:val="20"/>
+                <w:szCs w:val="20"/>
+              </w:rPr>
+              <w:t>Test</w:t>
+            </w:r>
+          </w:p>
+        </w:tc>
+        <w:tc>
+          <w:tcPr>
+            <w:tcW w:w="550" w:type="pct"/>
+            <w:shd w:val="clear" w:color="auto" w:fill="F2CEED" w:themeFill="accent5" w:themeFillTint="33"/>
+            <w:tcMar>
+              <w:top w:w="30" w:type="dxa"/>
+              <w:left w:w="80" w:type="dxa"/>
+              <w:bottom w:w="30" w:type="dxa"/>
+              <w:right w:w="80" w:type="dxa"/>
+            </w:tcMar>
+          </w:tcPr>
+          <w:p>
+            <w:r>
+              <w:rPr>
+                <w:rFonts w:ascii="Aptos" w:eastAsia="Aptos" w:hAnsi="Aptos" w:cs="Aptos"/>
+                <w:b/>
+                <w:bCs/>
+                <w:sz w:val="20"/>
+                <w:szCs w:val="20"/>
+              </w:rPr>
+              <w:t>Type</w:t>
+            </w:r>
+          </w:p>
+        </w:tc>
+        <w:tc>
+          <w:tcPr>
+            <w:tcW w:w="2300" w:type="pct"/>
+            <w:shd w:val="clear" w:color="auto" w:fill="F2CEED" w:themeFill="accent5" w:themeFillTint="33"/>
+            <w:tcMar>
+              <w:top w:w="30" w:type="dxa"/>
+              <w:left w:w="80" w:type="dxa"/>
+              <w:bottom w:w="30" w:type="dxa"/>
+              <w:right w:w="80" w:type="dxa"/>
+            </w:tcMar>
+          </w:tcPr>
+          <w:p>
+            <w:r>
+              <w:rPr>
+                <w:rFonts w:ascii="Aptos" w:eastAsia="Aptos" w:hAnsi="Aptos" w:cs="Aptos"/>
+                <w:b/>
+                <w:bCs/>
+                <w:sz w:val="20"/>
+                <w:szCs w:val="20"/>
+              </w:rPr>
+              <w:t>Expected Result</w:t>
+            </w:r>
+          </w:p>
+        </w:tc>
+      </w:tr>
+      <w:tr>
+        <w:tblPrEx>
+          <w:tblCellMar>
+            <w:top w:w="0" w:type="dxa"/>
+            <w:bottom w:w="0" w:type="dxa"/>
+          </w:tblCellMar>
+        </w:tblPrEx>
+        <w:trPr>
+          <w:cantSplit/>
+        </w:trPr>
+        <w:tc>
+          <w:tcPr>
+            <w:tcW w:w="300" w:type="pct"/>
+            <w:tcMar>
+              <w:top w:w="30" w:type="dxa"/>
+              <w:left w:w="80" w:type="dxa"/>
+              <w:bottom w:w="30" w:type="dxa"/>
+              <w:right w:w="80" w:type="dxa"/>
+            </w:tcMar>
+          </w:tcPr>
+          <w:p>
+            <w:r>
+              <w:rPr>
+                <w:rFonts w:ascii="Aptos" w:eastAsia="Aptos" w:hAnsi="Aptos" w:cs="Aptos"/>
+                <w:sz w:val="20"/>
+                <w:szCs w:val="20"/>
+              </w:rPr>
+              <w:t>11</w:t>
+            </w:r>
+          </w:p>
+        </w:tc>
+        <w:tc>
+          <w:tcPr>
+            <w:tcW w:w="1850" w:type="pct"/>
+            <w:tcMar>
+              <w:top w:w="30" w:type="dxa"/>
+              <w:left w:w="80" w:type="dxa"/>
+              <w:bottom w:w="30" w:type="dxa"/>
+              <w:right w:w="80" w:type="dxa"/>
+            </w:tcMar>
+          </w:tcPr>
+          <w:p>
+            <w:r>
+              <w:rPr>
+                <w:rFonts w:ascii="Aptos" w:eastAsia="Aptos" w:hAnsi="Aptos" w:cs="Aptos"/>
+                <w:sz w:val="20"/>
+                <w:szCs w:val="20"/>
+              </w:rPr>
+              <w:t>Without picking a film or a screen, press Add</w:t>
+            </w:r>
+          </w:p>
+        </w:tc>
+        <w:tc>
+          <w:tcPr>
+            <w:tcW w:w="550" w:type="pct"/>
+            <w:tcMar>
+              <w:top w:w="30" w:type="dxa"/>
+              <w:left w:w="80" w:type="dxa"/>
+              <w:bottom w:w="30" w:type="dxa"/>
+              <w:right w:w="80" w:type="dxa"/>
+            </w:tcMar>
+          </w:tcPr>
+          <w:p>
+            <w:r>
+              <w:rPr>
+                <w:rFonts w:ascii="Aptos" w:eastAsia="Aptos" w:hAnsi="Aptos" w:cs="Aptos"/>
+                <w:sz w:val="20"/>
+                <w:szCs w:val="20"/>
+              </w:rPr>
+              <w:t>Erroneous</w:t>
+            </w:r>
+          </w:p>
+        </w:tc>
+        <w:tc>
+          <w:tcPr>
+            <w:tcW w:w="2300" w:type="pct"/>
+            <w:tcMar>
+              <w:top w:w="30" w:type="dxa"/>
+              <w:left w:w="80" w:type="dxa"/>
+              <w:bottom w:w="30" w:type="dxa"/>
+              <w:right w:w="80" w:type="dxa"/>
+            </w:tcMar>
+          </w:tcPr>
+          <w:p>
+            <w:r>
+              <w:rPr>
+                <w:rFonts w:ascii="Aptos" w:eastAsia="Aptos" w:hAnsi="Aptos" w:cs="Aptos"/>
+                <w:sz w:val="20"/>
+                <w:szCs w:val="20"/>
+              </w:rPr>
+              <w:t>The screening is rejected and a message appears stating “Pick a film and a screen”.</w:t>
+            </w:r>
+          </w:p>
+        </w:tc>
+      </w:tr>
+      <w:tr>
+        <w:tblPrEx>
+          <w:tblCellMar>
+            <w:top w:w="0" w:type="dxa"/>
+            <w:bottom w:w="0" w:type="dxa"/>
+          </w:tblCellMar>
+        </w:tblPrEx>
+        <w:trPr>
+          <w:cantSplit/>
+        </w:trPr>
+        <w:tc>
+          <w:tcPr>
+            <w:tcW w:w="300" w:type="pct"/>
+            <w:tcMar>
+              <w:top w:w="30" w:type="dxa"/>
+              <w:left w:w="80" w:type="dxa"/>
+              <w:bottom w:w="30" w:type="dxa"/>
+              <w:right w:w="80" w:type="dxa"/>
+            </w:tcMar>
+          </w:tcPr>
+          <w:p>
+            <w:r>
+              <w:rPr>
+                <w:rFonts w:ascii="Aptos" w:eastAsia="Aptos" w:hAnsi="Aptos" w:cs="Aptos"/>
+                <w:sz w:val="20"/>
+                <w:szCs w:val="20"/>
+              </w:rPr>
+              <w:t>12</w:t>
+            </w:r>
+          </w:p>
+        </w:tc>
+        <w:tc>
+          <w:tcPr>
+            <w:tcW w:w="1850" w:type="pct"/>
+            <w:tcMar>
+              <w:top w:w="30" w:type="dxa"/>
+              <w:left w:w="80" w:type="dxa"/>
+              <w:bottom w:w="30" w:type="dxa"/>
+              <w:right w:w="80" w:type="dxa"/>
+            </w:tcMar>
+          </w:tcPr>
+          <w:p>
+            <w:r>
+              <w:rPr>
+                <w:rFonts w:ascii="Aptos" w:eastAsia="Aptos" w:hAnsi="Aptos" w:cs="Aptos"/>
+                <w:sz w:val="20"/>
+                <w:szCs w:val="20"/>
+              </w:rPr>
+              <w:t>Pick Inception and Screen 1, set the date to 01/01/2020, time 19:30 and price 9.00, then press Add</w:t>
+            </w:r>
+          </w:p>
+        </w:tc>
+        <w:tc>
+          <w:tcPr>
+            <w:tcW w:w="550" w:type="pct"/>
+            <w:tcMar>
+              <w:top w:w="30" w:type="dxa"/>
+              <w:left w:w="80" w:type="dxa"/>
+              <w:bottom w:w="30" w:type="dxa"/>
+              <w:right w:w="80" w:type="dxa"/>
+            </w:tcMar>
+          </w:tcPr>
+          <w:p>
+            <w:r>
+              <w:rPr>
+                <w:rFonts w:ascii="Aptos" w:eastAsia="Aptos" w:hAnsi="Aptos" w:cs="Aptos"/>
+                <w:sz w:val="20"/>
+                <w:szCs w:val="20"/>
+              </w:rPr>
+              <w:t>Erroneous</w:t>
+            </w:r>
+          </w:p>
+        </w:tc>
+        <w:tc>
+          <w:tcPr>
+            <w:tcW w:w="2300" w:type="pct"/>
+            <w:tcMar>
+              <w:top w:w="30" w:type="dxa"/>
+              <w:left w:w="80" w:type="dxa"/>
+              <w:bottom w:w="30" w:type="dxa"/>
+              <w:right w:w="80" w:type="dxa"/>
+            </w:tcMar>
+          </w:tcPr>
+          <w:p>
+            <w:r>
+              <w:rPr>
+                <w:rFonts w:ascii="Aptos" w:eastAsia="Aptos" w:hAnsi="Aptos" w:cs="Aptos"/>
+                <w:sz w:val="20"/>
+                <w:szCs w:val="20"/>
+              </w:rPr>
+              <w:t xml:space="preserve">The screening is rejected and a message appears stating “Screening date </w:t>
+            </w:r>
+            <w:proofErr w:type="spellStart"/>
+            <w:r>
+              <w:rPr>
+                <w:rFonts w:ascii="Aptos" w:eastAsia="Aptos" w:hAnsi="Aptos" w:cs="Aptos"/>
+                <w:sz w:val="20"/>
+                <w:szCs w:val="20"/>
+              </w:rPr>
+              <w:t>cant</w:t>
+            </w:r>
+            <w:proofErr w:type="spellEnd"/>
+            <w:r>
+              <w:rPr>
+                <w:rFonts w:ascii="Aptos" w:eastAsia="Aptos" w:hAnsi="Aptos" w:cs="Aptos"/>
+                <w:sz w:val="20"/>
+                <w:szCs w:val="20"/>
+              </w:rPr>
+              <w:t xml:space="preserve"> be in the past”.</w:t>
+            </w:r>
+          </w:p>
+        </w:tc>
+      </w:tr>
+      <w:tr>
+        <w:tblPrEx>
+          <w:tblCellMar>
+            <w:top w:w="0" w:type="dxa"/>
+            <w:bottom w:w="0" w:type="dxa"/>
+          </w:tblCellMar>
+        </w:tblPrEx>
+        <w:trPr>
+          <w:cantSplit/>
+        </w:trPr>
+        <w:tc>
+          <w:tcPr>
+            <w:tcW w:w="300" w:type="pct"/>
+            <w:tcMar>
+              <w:top w:w="30" w:type="dxa"/>
+              <w:left w:w="80" w:type="dxa"/>
+              <w:bottom w:w="30" w:type="dxa"/>
+              <w:right w:w="80" w:type="dxa"/>
+            </w:tcMar>
+          </w:tcPr>
+          <w:p>
+            <w:r>
+              <w:rPr>
+                <w:rFonts w:ascii="Aptos" w:eastAsia="Aptos" w:hAnsi="Aptos" w:cs="Aptos"/>
+                <w:sz w:val="20"/>
+                <w:szCs w:val="20"/>
+              </w:rPr>
+              <w:lastRenderedPageBreak/>
+              <w:t>13</w:t>
+            </w:r>
+          </w:p>
+        </w:tc>
+        <w:tc>
+          <w:tcPr>
+            <w:tcW w:w="1850" w:type="pct"/>
+            <w:tcMar>
+              <w:top w:w="30" w:type="dxa"/>
+              <w:left w:w="80" w:type="dxa"/>
+              <w:bottom w:w="30" w:type="dxa"/>
+              <w:right w:w="80" w:type="dxa"/>
+            </w:tcMar>
+          </w:tcPr>
+          <w:p>
+            <w:r>
+              <w:rPr>
+                <w:rFonts w:ascii="Aptos" w:eastAsia="Aptos" w:hAnsi="Aptos" w:cs="Aptos"/>
+                <w:sz w:val="20"/>
+                <w:szCs w:val="20"/>
+              </w:rPr>
+              <w:t>Pick Inception and Screen 1, set the date to 20/07/2026, enter the time as 25:00 and price 9.00, then press Add</w:t>
+            </w:r>
+          </w:p>
+        </w:tc>
+        <w:tc>
+          <w:tcPr>
+            <w:tcW w:w="550" w:type="pct"/>
+            <w:tcMar>
+              <w:top w:w="30" w:type="dxa"/>
+              <w:left w:w="80" w:type="dxa"/>
+              <w:bottom w:w="30" w:type="dxa"/>
+              <w:right w:w="80" w:type="dxa"/>
+            </w:tcMar>
+          </w:tcPr>
+          <w:p>
+            <w:r>
+              <w:rPr>
+                <w:rFonts w:ascii="Aptos" w:eastAsia="Aptos" w:hAnsi="Aptos" w:cs="Aptos"/>
+                <w:sz w:val="20"/>
+                <w:szCs w:val="20"/>
+              </w:rPr>
+              <w:t>Erroneous</w:t>
+            </w:r>
+          </w:p>
+        </w:tc>
+        <w:tc>
+          <w:tcPr>
+            <w:tcW w:w="2300" w:type="pct"/>
+            <w:tcMar>
+              <w:top w:w="30" w:type="dxa"/>
+              <w:left w:w="80" w:type="dxa"/>
+              <w:bottom w:w="30" w:type="dxa"/>
+              <w:right w:w="80" w:type="dxa"/>
+            </w:tcMar>
+          </w:tcPr>
+          <w:p>
+            <w:r>
+              <w:rPr>
+                <w:rFonts w:ascii="Aptos" w:eastAsia="Aptos" w:hAnsi="Aptos" w:cs="Aptos"/>
+                <w:sz w:val="20"/>
+                <w:szCs w:val="20"/>
+              </w:rPr>
+              <w:t>The screening is rejected and a message appears stating “Screening time must be in HH:MM format, e.g. 14:30”, because 25 is not a valid hour.</w:t>
+            </w:r>
+          </w:p>
+        </w:tc>
+      </w:tr>
+      <w:tr>
+        <w:tblPrEx>
+          <w:tblCellMar>
+            <w:top w:w="0" w:type="dxa"/>
+            <w:bottom w:w="0" w:type="dxa"/>
+          </w:tblCellMar>
+        </w:tblPrEx>
+        <w:trPr>
+          <w:cantSplit/>
+        </w:trPr>
+        <w:tc>
+          <w:tcPr>
+            <w:tcW w:w="300" w:type="pct"/>
+            <w:tcMar>
+              <w:top w:w="30" w:type="dxa"/>
+              <w:left w:w="80" w:type="dxa"/>
+              <w:bottom w:w="30" w:type="dxa"/>
+              <w:right w:w="80" w:type="dxa"/>
+            </w:tcMar>
+          </w:tcPr>
+          <w:p>
+            <w:r>
+              <w:rPr>
+                <w:rFonts w:ascii="Aptos" w:eastAsia="Aptos" w:hAnsi="Aptos" w:cs="Aptos"/>
+                <w:sz w:val="20"/>
+                <w:szCs w:val="20"/>
+              </w:rPr>
+              <w:t>14</w:t>
+            </w:r>
+          </w:p>
+        </w:tc>
+        <w:tc>
+          <w:tcPr>
+            <w:tcW w:w="1850" w:type="pct"/>
+            <w:tcMar>
+              <w:top w:w="30" w:type="dxa"/>
+              <w:left w:w="80" w:type="dxa"/>
+              <w:bottom w:w="30" w:type="dxa"/>
+              <w:right w:w="80" w:type="dxa"/>
+            </w:tcMar>
+          </w:tcPr>
+          <w:p>
+            <w:r>
+              <w:rPr>
+                <w:rFonts w:ascii="Aptos" w:eastAsia="Aptos" w:hAnsi="Aptos" w:cs="Aptos"/>
+                <w:sz w:val="20"/>
+                <w:szCs w:val="20"/>
+              </w:rPr>
+              <w:t>Pick Inception and Screen 1, date 20/07/2026, time 19:30, enter a price of 0, then press Add</w:t>
+            </w:r>
+          </w:p>
+        </w:tc>
+        <w:tc>
+          <w:tcPr>
+            <w:tcW w:w="550" w:type="pct"/>
+            <w:tcMar>
+              <w:top w:w="30" w:type="dxa"/>
+              <w:left w:w="80" w:type="dxa"/>
+              <w:bottom w:w="30" w:type="dxa"/>
+              <w:right w:w="80" w:type="dxa"/>
+            </w:tcMar>
+          </w:tcPr>
+          <w:p>
+            <w:r>
+              <w:rPr>
+                <w:rFonts w:ascii="Aptos" w:eastAsia="Aptos" w:hAnsi="Aptos" w:cs="Aptos"/>
+                <w:sz w:val="20"/>
+                <w:szCs w:val="20"/>
+              </w:rPr>
+              <w:t>Erroneous</w:t>
+            </w:r>
+          </w:p>
+        </w:tc>
+        <w:tc>
+          <w:tcPr>
+            <w:tcW w:w="2300" w:type="pct"/>
+            <w:tcMar>
+              <w:top w:w="30" w:type="dxa"/>
+              <w:left w:w="80" w:type="dxa"/>
+              <w:bottom w:w="30" w:type="dxa"/>
+              <w:right w:w="80" w:type="dxa"/>
+            </w:tcMar>
+          </w:tcPr>
+          <w:p>
+            <w:r>
+              <w:rPr>
+                <w:rFonts w:ascii="Aptos" w:eastAsia="Aptos" w:hAnsi="Aptos" w:cs="Aptos"/>
+                <w:sz w:val="20"/>
+                <w:szCs w:val="20"/>
+              </w:rPr>
+              <w:t>The screening is rejected and a message appears stating “Ticket price must be greater than 0”.</w:t>
+            </w:r>
+          </w:p>
+        </w:tc>
+      </w:tr>
+      <w:tr>
+        <w:tblPrEx>
+          <w:tblCellMar>
+            <w:top w:w="0" w:type="dxa"/>
+            <w:bottom w:w="0" w:type="dxa"/>
+          </w:tblCellMar>
+        </w:tblPrEx>
+        <w:trPr>
+          <w:cantSplit/>
+        </w:trPr>
+        <w:tc>
+          <w:tcPr>
+            <w:tcW w:w="300" w:type="pct"/>
+            <w:tcMar>
+              <w:top w:w="30" w:type="dxa"/>
+              <w:left w:w="80" w:type="dxa"/>
+              <w:bottom w:w="30" w:type="dxa"/>
+              <w:right w:w="80" w:type="dxa"/>
+            </w:tcMar>
+          </w:tcPr>
+          <w:p>
+            <w:r>
+              <w:rPr>
+                <w:rFonts w:ascii="Aptos" w:eastAsia="Aptos" w:hAnsi="Aptos" w:cs="Aptos"/>
+                <w:sz w:val="20"/>
+                <w:szCs w:val="20"/>
+              </w:rPr>
+              <w:t>15</w:t>
+            </w:r>
+          </w:p>
+        </w:tc>
+        <w:tc>
+          <w:tcPr>
+            <w:tcW w:w="1850" w:type="pct"/>
+            <w:tcMar>
+              <w:top w:w="30" w:type="dxa"/>
+              <w:left w:w="80" w:type="dxa"/>
+              <w:bottom w:w="30" w:type="dxa"/>
+              <w:right w:w="80" w:type="dxa"/>
+            </w:tcMar>
+          </w:tcPr>
+          <w:p>
+            <w:r>
+              <w:rPr>
+                <w:rFonts w:ascii="Aptos" w:eastAsia="Aptos" w:hAnsi="Aptos" w:cs="Aptos"/>
+                <w:sz w:val="20"/>
+                <w:szCs w:val="20"/>
+              </w:rPr>
+              <w:t>Pick Inception and Screen 1, date 20/07/2026, time 19:30, price 9.00, then press Add</w:t>
+            </w:r>
+          </w:p>
+        </w:tc>
+        <w:tc>
+          <w:tcPr>
+            <w:tcW w:w="550" w:type="pct"/>
+            <w:tcMar>
+              <w:top w:w="30" w:type="dxa"/>
+              <w:left w:w="80" w:type="dxa"/>
+              <w:bottom w:w="30" w:type="dxa"/>
+              <w:right w:w="80" w:type="dxa"/>
+            </w:tcMar>
+          </w:tcPr>
+          <w:p>
+            <w:r>
+              <w:rPr>
+                <w:rFonts w:ascii="Aptos" w:eastAsia="Aptos" w:hAnsi="Aptos" w:cs="Aptos"/>
+                <w:sz w:val="20"/>
+                <w:szCs w:val="20"/>
+              </w:rPr>
+              <w:t>Normal</w:t>
+            </w:r>
+          </w:p>
+        </w:tc>
+        <w:tc>
+          <w:tcPr>
+            <w:tcW w:w="2300" w:type="pct"/>
+            <w:tcMar>
+              <w:top w:w="30" w:type="dxa"/>
+              <w:left w:w="80" w:type="dxa"/>
+              <w:bottom w:w="30" w:type="dxa"/>
+              <w:right w:w="80" w:type="dxa"/>
+            </w:tcMar>
+          </w:tcPr>
+          <w:p>
+            <w:r>
+              <w:rPr>
+                <w:rFonts w:ascii="Aptos" w:eastAsia="Aptos" w:hAnsi="Aptos" w:cs="Aptos"/>
+                <w:sz w:val="20"/>
+                <w:szCs w:val="20"/>
+              </w:rPr>
+              <w:t>The screening is saved and appears in the grid showing Inception on Screen 1 at 19:30 priced at 9.00.</w:t>
+            </w:r>
+          </w:p>
+        </w:tc>
+      </w:tr>
+      <w:tr>
+        <w:tblPrEx>
+          <w:tblCellMar>
+            <w:top w:w="0" w:type="dxa"/>
+            <w:bottom w:w="0" w:type="dxa"/>
+          </w:tblCellMar>
+        </w:tblPrEx>
+        <w:trPr>
+          <w:cantSplit/>
+        </w:trPr>
+        <w:tc>
+          <w:tcPr>
+            <w:tcW w:w="300" w:type="pct"/>
+            <w:tcMar>
+              <w:top w:w="30" w:type="dxa"/>
+              <w:left w:w="80" w:type="dxa"/>
+              <w:bottom w:w="30" w:type="dxa"/>
+              <w:right w:w="80" w:type="dxa"/>
+            </w:tcMar>
+          </w:tcPr>
+          <w:p>
+            <w:r>
+              <w:rPr>
+                <w:rFonts w:ascii="Aptos" w:eastAsia="Aptos" w:hAnsi="Aptos" w:cs="Aptos"/>
+                <w:sz w:val="20"/>
+                <w:szCs w:val="20"/>
+              </w:rPr>
+              <w:t>16</w:t>
+            </w:r>
+          </w:p>
+        </w:tc>
+        <w:tc>
+          <w:tcPr>
+            <w:tcW w:w="1850" w:type="pct"/>
+            <w:tcMar>
+              <w:top w:w="30" w:type="dxa"/>
+              <w:left w:w="80" w:type="dxa"/>
+              <w:bottom w:w="30" w:type="dxa"/>
+              <w:right w:w="80" w:type="dxa"/>
+            </w:tcMar>
+          </w:tcPr>
+          <w:p>
+            <w:r>
+              <w:rPr>
+                <w:rFonts w:ascii="Aptos" w:eastAsia="Aptos" w:hAnsi="Aptos" w:cs="Aptos"/>
+                <w:sz w:val="20"/>
+                <w:szCs w:val="20"/>
+              </w:rPr>
+              <w:t>Pick Paddington 2 and Screen 2, date 21/07/2026, time 14:00, price 7.50, then press Add</w:t>
+            </w:r>
+          </w:p>
+        </w:tc>
+        <w:tc>
+          <w:tcPr>
+            <w:tcW w:w="550" w:type="pct"/>
+            <w:tcMar>
+              <w:top w:w="30" w:type="dxa"/>
+              <w:left w:w="80" w:type="dxa"/>
+              <w:bottom w:w="30" w:type="dxa"/>
+              <w:right w:w="80" w:type="dxa"/>
+            </w:tcMar>
+          </w:tcPr>
+          <w:p>
+            <w:r>
+              <w:rPr>
+                <w:rFonts w:ascii="Aptos" w:eastAsia="Aptos" w:hAnsi="Aptos" w:cs="Aptos"/>
+                <w:sz w:val="20"/>
+                <w:szCs w:val="20"/>
+              </w:rPr>
+              <w:t>Normal</w:t>
+            </w:r>
+          </w:p>
+        </w:tc>
+        <w:tc>
+          <w:tcPr>
+            <w:tcW w:w="2300" w:type="pct"/>
+            <w:tcMar>
+              <w:top w:w="30" w:type="dxa"/>
+              <w:left w:w="80" w:type="dxa"/>
+              <w:bottom w:w="30" w:type="dxa"/>
+              <w:right w:w="80" w:type="dxa"/>
+            </w:tcMar>
+          </w:tcPr>
+          <w:p>
+            <w:r>
+              <w:rPr>
+                <w:rFonts w:ascii="Aptos" w:eastAsia="Aptos" w:hAnsi="Aptos" w:cs="Aptos"/>
+                <w:sz w:val="20"/>
+                <w:szCs w:val="20"/>
+              </w:rPr>
+              <w:t>The screening is saved and appears in the grid showing Paddington 2 on Screen 2.</w:t>
+            </w:r>
+          </w:p>
+        </w:tc>
+      </w:tr>
+      <w:tr>
+        <w:tblPrEx>
+          <w:tblCellMar>
+            <w:top w:w="0" w:type="dxa"/>
+            <w:bottom w:w="0" w:type="dxa"/>
+          </w:tblCellMar>
+        </w:tblPrEx>
+        <w:trPr>
+          <w:cantSplit/>
+        </w:trPr>
+        <w:tc>
+          <w:tcPr>
+            <w:tcW w:w="300" w:type="pct"/>
+            <w:tcMar>
+              <w:top w:w="30" w:type="dxa"/>
+              <w:left w:w="80" w:type="dxa"/>
+              <w:bottom w:w="30" w:type="dxa"/>
+              <w:right w:w="80" w:type="dxa"/>
+            </w:tcMar>
+          </w:tcPr>
+          <w:p>
+            <w:r>
+              <w:rPr>
+                <w:rFonts w:ascii="Aptos" w:eastAsia="Aptos" w:hAnsi="Aptos" w:cs="Aptos"/>
+                <w:sz w:val="20"/>
+                <w:szCs w:val="20"/>
+              </w:rPr>
+              <w:t>17</w:t>
+            </w:r>
+          </w:p>
+        </w:tc>
+        <w:tc>
+          <w:tcPr>
+            <w:tcW w:w="1850" w:type="pct"/>
+            <w:tcMar>
+              <w:top w:w="30" w:type="dxa"/>
+              <w:left w:w="80" w:type="dxa"/>
+              <w:bottom w:w="30" w:type="dxa"/>
+              <w:right w:w="80" w:type="dxa"/>
+            </w:tcMar>
+          </w:tcPr>
+          <w:p>
+            <w:r>
+              <w:rPr>
+                <w:rFonts w:ascii="Aptos" w:eastAsia="Aptos" w:hAnsi="Aptos" w:cs="Aptos"/>
+                <w:sz w:val="20"/>
+                <w:szCs w:val="20"/>
+              </w:rPr>
+              <w:t>Pick Inception and Screen 1, date 20/07/2026, enter the time as 23:59, price 9.00, then press Add</w:t>
+            </w:r>
+          </w:p>
+        </w:tc>
+        <w:tc>
+          <w:tcPr>
+            <w:tcW w:w="550" w:type="pct"/>
+            <w:tcMar>
+              <w:top w:w="30" w:type="dxa"/>
+              <w:left w:w="80" w:type="dxa"/>
+              <w:bottom w:w="30" w:type="dxa"/>
+              <w:right w:w="80" w:type="dxa"/>
+            </w:tcMar>
+          </w:tcPr>
+          <w:p>
+            <w:r>
+              <w:rPr>
+                <w:rFonts w:ascii="Aptos" w:eastAsia="Aptos" w:hAnsi="Aptos" w:cs="Aptos"/>
+                <w:sz w:val="20"/>
+                <w:szCs w:val="20"/>
+              </w:rPr>
+              <w:t>Boundary</w:t>
+            </w:r>
+          </w:p>
+        </w:tc>
+        <w:tc>
+          <w:tcPr>
+            <w:tcW w:w="2300" w:type="pct"/>
+            <w:tcMar>
+              <w:top w:w="30" w:type="dxa"/>
+              <w:left w:w="80" w:type="dxa"/>
+              <w:bottom w:w="30" w:type="dxa"/>
+              <w:right w:w="80" w:type="dxa"/>
+            </w:tcMar>
+          </w:tcPr>
+          <w:p>
+            <w:r>
+              <w:rPr>
+                <w:rFonts w:ascii="Aptos" w:eastAsia="Aptos" w:hAnsi="Aptos" w:cs="Aptos"/>
+                <w:sz w:val="20"/>
+                <w:szCs w:val="20"/>
+              </w:rPr>
+              <w:t>The screening is accepted, because 23:59 is the latest time the HH:MM format allows.</w:t>
+            </w:r>
+          </w:p>
+        </w:tc>
+      </w:tr>
+    </w:tbl>
+    <w:p/>
     <w:p/>
     <w:sectPr>
       <w:headerReference w:type="even" r:id="rId7"/>
@@ -1506,7 +2345,6 @@
         <w:docPartUnique/>
       </w:docPartObj>
     </w:sdtPr>
-    <w:sdtEndPr/>
     <w:sdtContent>
       <w:p>
         <w:pPr>

</xml_diff>

<commit_message>
added test plan for objective 1: adding new customer bookings
</commit_message>
<xml_diff>
--- a/Testing.docx
+++ b/Testing.docx
@@ -2228,6 +2228,976 @@
                 <w:szCs w:val="20"/>
               </w:rPr>
               <w:t>The screening is accepted, because 23:59 is the latest time the HH:MM format allows.</w:t>
+            </w:r>
+          </w:p>
+        </w:tc>
+      </w:tr>
+    </w:tbl>
+    <w:p/>
+    <w:p>
+      <w:pPr>
+        <w:pStyle w:val="Heading3"/>
+      </w:pPr>
+      <w:r>
+        <w:rPr>
+          <w:rFonts w:ascii="Aptos Display" w:eastAsia="Aptos Display" w:hAnsi="Aptos Display" w:cs="Aptos Display"/>
+          <w:b/>
+          <w:bCs/>
+          <w:color w:val="000000"/>
+        </w:rPr>
+        <w:t>Objective 1: Adding New Customer Bookings</w:t>
+      </w:r>
+    </w:p>
+    <w:p>
+      <w:r>
+        <w:rPr>
+          <w:rFonts w:ascii="Aptos" w:eastAsia="Aptos" w:hAnsi="Aptos" w:cs="Aptos"/>
+        </w:rPr>
+        <w:t>Before bookings can be made the customers must exist, so a set of customers is added first and then the bookings are created against the Inception screening. Three customers share the surname Smith so that the search objective can be tested later.</w:t>
+      </w:r>
+    </w:p>
+    <w:tbl>
+      <w:tblPr>
+        <w:tblW w:w="5000" w:type="pct"/>
+        <w:tblBorders>
+          <w:top w:val="single" w:sz="4" w:space="0" w:color="808080"/>
+          <w:left w:val="single" w:sz="4" w:space="0" w:color="808080"/>
+          <w:bottom w:val="single" w:sz="4" w:space="0" w:color="808080"/>
+          <w:right w:val="single" w:sz="4" w:space="0" w:color="808080"/>
+          <w:insideH w:val="single" w:sz="4" w:space="0" w:color="808080"/>
+          <w:insideV w:val="single" w:sz="4" w:space="0" w:color="808080"/>
+        </w:tblBorders>
+        <w:tblCellMar>
+          <w:left w:w="10" w:type="dxa"/>
+          <w:right w:w="10" w:type="dxa"/>
+        </w:tblCellMar>
+        <w:tblLook w:val="0000" w:firstRow="0" w:lastRow="0" w:firstColumn="0" w:lastColumn="0" w:noHBand="0" w:noVBand="0"/>
+      </w:tblPr>
+      <w:tblGrid>
+        <w:gridCol w:w="554"/>
+        <w:gridCol w:w="3454"/>
+        <w:gridCol w:w="1047"/>
+        <w:gridCol w:w="4295"/>
+      </w:tblGrid>
+      <w:tr>
+        <w:tblPrEx>
+          <w:tblCellMar>
+            <w:top w:w="0" w:type="dxa"/>
+            <w:bottom w:w="0" w:type="dxa"/>
+          </w:tblCellMar>
+        </w:tblPrEx>
+        <w:trPr>
+          <w:cantSplit/>
+          <w:tblHeader/>
+        </w:trPr>
+        <w:tc>
+          <w:tcPr>
+            <w:tcW w:w="300" w:type="pct"/>
+            <w:shd w:val="clear" w:color="auto" w:fill="F2CEED" w:themeFill="accent5" w:themeFillTint="33"/>
+            <w:tcMar>
+              <w:top w:w="30" w:type="dxa"/>
+              <w:left w:w="80" w:type="dxa"/>
+              <w:bottom w:w="30" w:type="dxa"/>
+              <w:right w:w="80" w:type="dxa"/>
+            </w:tcMar>
+          </w:tcPr>
+          <w:p>
+            <w:r>
+              <w:rPr>
+                <w:rFonts w:ascii="Aptos" w:eastAsia="Aptos" w:hAnsi="Aptos" w:cs="Aptos"/>
+                <w:b/>
+                <w:bCs/>
+                <w:sz w:val="20"/>
+                <w:szCs w:val="20"/>
+              </w:rPr>
+              <w:t>No.</w:t>
+            </w:r>
+          </w:p>
+        </w:tc>
+        <w:tc>
+          <w:tcPr>
+            <w:tcW w:w="1850" w:type="pct"/>
+            <w:shd w:val="clear" w:color="auto" w:fill="F2CEED" w:themeFill="accent5" w:themeFillTint="33"/>
+            <w:tcMar>
+              <w:top w:w="30" w:type="dxa"/>
+              <w:left w:w="80" w:type="dxa"/>
+              <w:bottom w:w="30" w:type="dxa"/>
+              <w:right w:w="80" w:type="dxa"/>
+            </w:tcMar>
+          </w:tcPr>
+          <w:p>
+            <w:r>
+              <w:rPr>
+                <w:rFonts w:ascii="Aptos" w:eastAsia="Aptos" w:hAnsi="Aptos" w:cs="Aptos"/>
+                <w:b/>
+                <w:bCs/>
+                <w:sz w:val="20"/>
+                <w:szCs w:val="20"/>
+              </w:rPr>
+              <w:t>Test</w:t>
+            </w:r>
+          </w:p>
+        </w:tc>
+        <w:tc>
+          <w:tcPr>
+            <w:tcW w:w="550" w:type="pct"/>
+            <w:shd w:val="clear" w:color="auto" w:fill="F2CEED" w:themeFill="accent5" w:themeFillTint="33"/>
+            <w:tcMar>
+              <w:top w:w="30" w:type="dxa"/>
+              <w:left w:w="80" w:type="dxa"/>
+              <w:bottom w:w="30" w:type="dxa"/>
+              <w:right w:w="80" w:type="dxa"/>
+            </w:tcMar>
+          </w:tcPr>
+          <w:p>
+            <w:r>
+              <w:rPr>
+                <w:rFonts w:ascii="Aptos" w:eastAsia="Aptos" w:hAnsi="Aptos" w:cs="Aptos"/>
+                <w:b/>
+                <w:bCs/>
+                <w:sz w:val="20"/>
+                <w:szCs w:val="20"/>
+              </w:rPr>
+              <w:t>Type</w:t>
+            </w:r>
+          </w:p>
+        </w:tc>
+        <w:tc>
+          <w:tcPr>
+            <w:tcW w:w="2300" w:type="pct"/>
+            <w:shd w:val="clear" w:color="auto" w:fill="F2CEED" w:themeFill="accent5" w:themeFillTint="33"/>
+            <w:tcMar>
+              <w:top w:w="30" w:type="dxa"/>
+              <w:left w:w="80" w:type="dxa"/>
+              <w:bottom w:w="30" w:type="dxa"/>
+              <w:right w:w="80" w:type="dxa"/>
+            </w:tcMar>
+          </w:tcPr>
+          <w:p>
+            <w:r>
+              <w:rPr>
+                <w:rFonts w:ascii="Aptos" w:eastAsia="Aptos" w:hAnsi="Aptos" w:cs="Aptos"/>
+                <w:b/>
+                <w:bCs/>
+                <w:sz w:val="20"/>
+                <w:szCs w:val="20"/>
+              </w:rPr>
+              <w:t>Expected Result</w:t>
+            </w:r>
+          </w:p>
+        </w:tc>
+      </w:tr>
+      <w:tr>
+        <w:tblPrEx>
+          <w:tblCellMar>
+            <w:top w:w="0" w:type="dxa"/>
+            <w:bottom w:w="0" w:type="dxa"/>
+          </w:tblCellMar>
+        </w:tblPrEx>
+        <w:trPr>
+          <w:cantSplit/>
+        </w:trPr>
+        <w:tc>
+          <w:tcPr>
+            <w:tcW w:w="300" w:type="pct"/>
+            <w:tcMar>
+              <w:top w:w="30" w:type="dxa"/>
+              <w:left w:w="80" w:type="dxa"/>
+              <w:bottom w:w="30" w:type="dxa"/>
+              <w:right w:w="80" w:type="dxa"/>
+            </w:tcMar>
+          </w:tcPr>
+          <w:p>
+            <w:r>
+              <w:rPr>
+                <w:rFonts w:ascii="Aptos" w:eastAsia="Aptos" w:hAnsi="Aptos" w:cs="Aptos"/>
+                <w:sz w:val="20"/>
+                <w:szCs w:val="20"/>
+              </w:rPr>
+              <w:t>18</w:t>
+            </w:r>
+          </w:p>
+        </w:tc>
+        <w:tc>
+          <w:tcPr>
+            <w:tcW w:w="1850" w:type="pct"/>
+            <w:tcMar>
+              <w:top w:w="30" w:type="dxa"/>
+              <w:left w:w="80" w:type="dxa"/>
+              <w:bottom w:w="30" w:type="dxa"/>
+              <w:right w:w="80" w:type="dxa"/>
+            </w:tcMar>
+          </w:tcPr>
+          <w:p>
+            <w:r>
+              <w:rPr>
+                <w:rFonts w:ascii="Aptos" w:eastAsia="Aptos" w:hAnsi="Aptos" w:cs="Aptos"/>
+                <w:sz w:val="20"/>
+                <w:szCs w:val="20"/>
+              </w:rPr>
+              <w:t>On the Customers form, enter forename John, surname Smith, email john.smith@email.com, phone 07123456789, then press Add</w:t>
+            </w:r>
+          </w:p>
+        </w:tc>
+        <w:tc>
+          <w:tcPr>
+            <w:tcW w:w="550" w:type="pct"/>
+            <w:tcMar>
+              <w:top w:w="30" w:type="dxa"/>
+              <w:left w:w="80" w:type="dxa"/>
+              <w:bottom w:w="30" w:type="dxa"/>
+              <w:right w:w="80" w:type="dxa"/>
+            </w:tcMar>
+          </w:tcPr>
+          <w:p>
+            <w:r>
+              <w:rPr>
+                <w:rFonts w:ascii="Aptos" w:eastAsia="Aptos" w:hAnsi="Aptos" w:cs="Aptos"/>
+                <w:sz w:val="20"/>
+                <w:szCs w:val="20"/>
+              </w:rPr>
+              <w:t>Normal</w:t>
+            </w:r>
+          </w:p>
+        </w:tc>
+        <w:tc>
+          <w:tcPr>
+            <w:tcW w:w="2300" w:type="pct"/>
+            <w:tcMar>
+              <w:top w:w="30" w:type="dxa"/>
+              <w:left w:w="80" w:type="dxa"/>
+              <w:bottom w:w="30" w:type="dxa"/>
+              <w:right w:w="80" w:type="dxa"/>
+            </w:tcMar>
+          </w:tcPr>
+          <w:p>
+            <w:r>
+              <w:rPr>
+                <w:rFonts w:ascii="Aptos" w:eastAsia="Aptos" w:hAnsi="Aptos" w:cs="Aptos"/>
+                <w:sz w:val="20"/>
+                <w:szCs w:val="20"/>
+              </w:rPr>
+              <w:t xml:space="preserve">The customer John Smith is saved to </w:t>
+            </w:r>
+            <w:proofErr w:type="spellStart"/>
+            <w:r>
+              <w:rPr>
+                <w:rFonts w:ascii="Aptos" w:eastAsia="Aptos" w:hAnsi="Aptos" w:cs="Aptos"/>
+                <w:sz w:val="20"/>
+                <w:szCs w:val="20"/>
+              </w:rPr>
+              <w:t>tblCustomer</w:t>
+            </w:r>
+            <w:proofErr w:type="spellEnd"/>
+            <w:r>
+              <w:rPr>
+                <w:rFonts w:ascii="Aptos" w:eastAsia="Aptos" w:hAnsi="Aptos" w:cs="Aptos"/>
+                <w:sz w:val="20"/>
+                <w:szCs w:val="20"/>
+              </w:rPr>
+              <w:t>.</w:t>
+            </w:r>
+          </w:p>
+        </w:tc>
+      </w:tr>
+      <w:tr>
+        <w:tblPrEx>
+          <w:tblCellMar>
+            <w:top w:w="0" w:type="dxa"/>
+            <w:bottom w:w="0" w:type="dxa"/>
+          </w:tblCellMar>
+        </w:tblPrEx>
+        <w:trPr>
+          <w:cantSplit/>
+        </w:trPr>
+        <w:tc>
+          <w:tcPr>
+            <w:tcW w:w="300" w:type="pct"/>
+            <w:tcMar>
+              <w:top w:w="30" w:type="dxa"/>
+              <w:left w:w="80" w:type="dxa"/>
+              <w:bottom w:w="30" w:type="dxa"/>
+              <w:right w:w="80" w:type="dxa"/>
+            </w:tcMar>
+          </w:tcPr>
+          <w:p>
+            <w:r>
+              <w:rPr>
+                <w:rFonts w:ascii="Aptos" w:eastAsia="Aptos" w:hAnsi="Aptos" w:cs="Aptos"/>
+                <w:sz w:val="20"/>
+                <w:szCs w:val="20"/>
+              </w:rPr>
+              <w:t>19</w:t>
+            </w:r>
+          </w:p>
+        </w:tc>
+        <w:tc>
+          <w:tcPr>
+            <w:tcW w:w="1850" w:type="pct"/>
+            <w:tcMar>
+              <w:top w:w="30" w:type="dxa"/>
+              <w:left w:w="80" w:type="dxa"/>
+              <w:bottom w:w="30" w:type="dxa"/>
+              <w:right w:w="80" w:type="dxa"/>
+            </w:tcMar>
+          </w:tcPr>
+          <w:p>
+            <w:r>
+              <w:rPr>
+                <w:rFonts w:ascii="Aptos" w:eastAsia="Aptos" w:hAnsi="Aptos" w:cs="Aptos"/>
+                <w:sz w:val="20"/>
+                <w:szCs w:val="20"/>
+              </w:rPr>
+              <w:t>Add the customers Sarah Smith (sarah.s@email.com, 07222333444), David Smith (dsmith@email.com, 07555666777) and Emma Jones (emma.j@email.com, 07111222333) using typical data</w:t>
+            </w:r>
+          </w:p>
+        </w:tc>
+        <w:tc>
+          <w:tcPr>
+            <w:tcW w:w="550" w:type="pct"/>
+            <w:tcMar>
+              <w:top w:w="30" w:type="dxa"/>
+              <w:left w:w="80" w:type="dxa"/>
+              <w:bottom w:w="30" w:type="dxa"/>
+              <w:right w:w="80" w:type="dxa"/>
+            </w:tcMar>
+          </w:tcPr>
+          <w:p>
+            <w:r>
+              <w:rPr>
+                <w:rFonts w:ascii="Aptos" w:eastAsia="Aptos" w:hAnsi="Aptos" w:cs="Aptos"/>
+                <w:sz w:val="20"/>
+                <w:szCs w:val="20"/>
+              </w:rPr>
+              <w:t>Normal</w:t>
+            </w:r>
+          </w:p>
+        </w:tc>
+        <w:tc>
+          <w:tcPr>
+            <w:tcW w:w="2300" w:type="pct"/>
+            <w:tcMar>
+              <w:top w:w="30" w:type="dxa"/>
+              <w:left w:w="80" w:type="dxa"/>
+              <w:bottom w:w="30" w:type="dxa"/>
+              <w:right w:w="80" w:type="dxa"/>
+            </w:tcMar>
+          </w:tcPr>
+          <w:p>
+            <w:r>
+              <w:rPr>
+                <w:rFonts w:ascii="Aptos" w:eastAsia="Aptos" w:hAnsi="Aptos" w:cs="Aptos"/>
+                <w:sz w:val="20"/>
+                <w:szCs w:val="20"/>
+              </w:rPr>
+              <w:t>All three customers are saved, so there are now four customers, three of whom have the surname Smith.</w:t>
+            </w:r>
+          </w:p>
+        </w:tc>
+      </w:tr>
+      <w:tr>
+        <w:tblPrEx>
+          <w:tblCellMar>
+            <w:top w:w="0" w:type="dxa"/>
+            <w:bottom w:w="0" w:type="dxa"/>
+          </w:tblCellMar>
+        </w:tblPrEx>
+        <w:trPr>
+          <w:cantSplit/>
+        </w:trPr>
+        <w:tc>
+          <w:tcPr>
+            <w:tcW w:w="300" w:type="pct"/>
+            <w:tcMar>
+              <w:top w:w="30" w:type="dxa"/>
+              <w:left w:w="80" w:type="dxa"/>
+              <w:bottom w:w="30" w:type="dxa"/>
+              <w:right w:w="80" w:type="dxa"/>
+            </w:tcMar>
+          </w:tcPr>
+          <w:p>
+            <w:r>
+              <w:rPr>
+                <w:rFonts w:ascii="Aptos" w:eastAsia="Aptos" w:hAnsi="Aptos" w:cs="Aptos"/>
+                <w:sz w:val="20"/>
+                <w:szCs w:val="20"/>
+              </w:rPr>
+              <w:t>20</w:t>
+            </w:r>
+          </w:p>
+        </w:tc>
+        <w:tc>
+          <w:tcPr>
+            <w:tcW w:w="1850" w:type="pct"/>
+            <w:tcMar>
+              <w:top w:w="30" w:type="dxa"/>
+              <w:left w:w="80" w:type="dxa"/>
+              <w:bottom w:w="30" w:type="dxa"/>
+              <w:right w:w="80" w:type="dxa"/>
+            </w:tcMar>
+          </w:tcPr>
+          <w:p>
+            <w:r>
+              <w:rPr>
+                <w:rFonts w:ascii="Aptos" w:eastAsia="Aptos" w:hAnsi="Aptos" w:cs="Aptos"/>
+                <w:sz w:val="20"/>
+                <w:szCs w:val="20"/>
+              </w:rPr>
+              <w:t>On the Bookings form, without picking a screening, press Create Booking</w:t>
+            </w:r>
+          </w:p>
+        </w:tc>
+        <w:tc>
+          <w:tcPr>
+            <w:tcW w:w="550" w:type="pct"/>
+            <w:tcMar>
+              <w:top w:w="30" w:type="dxa"/>
+              <w:left w:w="80" w:type="dxa"/>
+              <w:bottom w:w="30" w:type="dxa"/>
+              <w:right w:w="80" w:type="dxa"/>
+            </w:tcMar>
+          </w:tcPr>
+          <w:p>
+            <w:r>
+              <w:rPr>
+                <w:rFonts w:ascii="Aptos" w:eastAsia="Aptos" w:hAnsi="Aptos" w:cs="Aptos"/>
+                <w:sz w:val="20"/>
+                <w:szCs w:val="20"/>
+              </w:rPr>
+              <w:t>Erroneous</w:t>
+            </w:r>
+          </w:p>
+        </w:tc>
+        <w:tc>
+          <w:tcPr>
+            <w:tcW w:w="2300" w:type="pct"/>
+            <w:tcMar>
+              <w:top w:w="30" w:type="dxa"/>
+              <w:left w:w="80" w:type="dxa"/>
+              <w:bottom w:w="30" w:type="dxa"/>
+              <w:right w:w="80" w:type="dxa"/>
+            </w:tcMar>
+          </w:tcPr>
+          <w:p>
+            <w:r>
+              <w:rPr>
+                <w:rFonts w:ascii="Aptos" w:eastAsia="Aptos" w:hAnsi="Aptos" w:cs="Aptos"/>
+                <w:sz w:val="20"/>
+                <w:szCs w:val="20"/>
+              </w:rPr>
+              <w:t>The booking is rejected and a message appears stating “Pick a screening first”.</w:t>
+            </w:r>
+          </w:p>
+        </w:tc>
+      </w:tr>
+      <w:tr>
+        <w:tblPrEx>
+          <w:tblCellMar>
+            <w:top w:w="0" w:type="dxa"/>
+            <w:bottom w:w="0" w:type="dxa"/>
+          </w:tblCellMar>
+        </w:tblPrEx>
+        <w:trPr>
+          <w:cantSplit/>
+        </w:trPr>
+        <w:tc>
+          <w:tcPr>
+            <w:tcW w:w="300" w:type="pct"/>
+            <w:tcMar>
+              <w:top w:w="30" w:type="dxa"/>
+              <w:left w:w="80" w:type="dxa"/>
+              <w:bottom w:w="30" w:type="dxa"/>
+              <w:right w:w="80" w:type="dxa"/>
+            </w:tcMar>
+          </w:tcPr>
+          <w:p>
+            <w:r>
+              <w:rPr>
+                <w:rFonts w:ascii="Aptos" w:eastAsia="Aptos" w:hAnsi="Aptos" w:cs="Aptos"/>
+                <w:sz w:val="20"/>
+                <w:szCs w:val="20"/>
+              </w:rPr>
+              <w:t>21</w:t>
+            </w:r>
+          </w:p>
+        </w:tc>
+        <w:tc>
+          <w:tcPr>
+            <w:tcW w:w="1850" w:type="pct"/>
+            <w:tcMar>
+              <w:top w:w="30" w:type="dxa"/>
+              <w:left w:w="80" w:type="dxa"/>
+              <w:bottom w:w="30" w:type="dxa"/>
+              <w:right w:w="80" w:type="dxa"/>
+            </w:tcMar>
+          </w:tcPr>
+          <w:p>
+            <w:r>
+              <w:rPr>
+                <w:rFonts w:ascii="Aptos" w:eastAsia="Aptos" w:hAnsi="Aptos" w:cs="Aptos"/>
+                <w:sz w:val="20"/>
+                <w:szCs w:val="20"/>
+              </w:rPr>
+              <w:t>Pick the Inception screening, then without selecting any seat, press Create Booking</w:t>
+            </w:r>
+          </w:p>
+        </w:tc>
+        <w:tc>
+          <w:tcPr>
+            <w:tcW w:w="550" w:type="pct"/>
+            <w:tcMar>
+              <w:top w:w="30" w:type="dxa"/>
+              <w:left w:w="80" w:type="dxa"/>
+              <w:bottom w:w="30" w:type="dxa"/>
+              <w:right w:w="80" w:type="dxa"/>
+            </w:tcMar>
+          </w:tcPr>
+          <w:p>
+            <w:r>
+              <w:rPr>
+                <w:rFonts w:ascii="Aptos" w:eastAsia="Aptos" w:hAnsi="Aptos" w:cs="Aptos"/>
+                <w:sz w:val="20"/>
+                <w:szCs w:val="20"/>
+              </w:rPr>
+              <w:t>Erroneous</w:t>
+            </w:r>
+          </w:p>
+        </w:tc>
+        <w:tc>
+          <w:tcPr>
+            <w:tcW w:w="2300" w:type="pct"/>
+            <w:tcMar>
+              <w:top w:w="30" w:type="dxa"/>
+              <w:left w:w="80" w:type="dxa"/>
+              <w:bottom w:w="30" w:type="dxa"/>
+              <w:right w:w="80" w:type="dxa"/>
+            </w:tcMar>
+          </w:tcPr>
+          <w:p>
+            <w:r>
+              <w:rPr>
+                <w:rFonts w:ascii="Aptos" w:eastAsia="Aptos" w:hAnsi="Aptos" w:cs="Aptos"/>
+                <w:sz w:val="20"/>
+                <w:szCs w:val="20"/>
+              </w:rPr>
+              <w:t>The booking is rejected and a message appears stating “Select at least one seat”.</w:t>
+            </w:r>
+          </w:p>
+        </w:tc>
+      </w:tr>
+      <w:tr>
+        <w:tblPrEx>
+          <w:tblCellMar>
+            <w:top w:w="0" w:type="dxa"/>
+            <w:bottom w:w="0" w:type="dxa"/>
+          </w:tblCellMar>
+        </w:tblPrEx>
+        <w:trPr>
+          <w:cantSplit/>
+        </w:trPr>
+        <w:tc>
+          <w:tcPr>
+            <w:tcW w:w="300" w:type="pct"/>
+            <w:tcMar>
+              <w:top w:w="30" w:type="dxa"/>
+              <w:left w:w="80" w:type="dxa"/>
+              <w:bottom w:w="30" w:type="dxa"/>
+              <w:right w:w="80" w:type="dxa"/>
+            </w:tcMar>
+          </w:tcPr>
+          <w:p>
+            <w:r>
+              <w:rPr>
+                <w:rFonts w:ascii="Aptos" w:eastAsia="Aptos" w:hAnsi="Aptos" w:cs="Aptos"/>
+                <w:sz w:val="20"/>
+                <w:szCs w:val="20"/>
+              </w:rPr>
+              <w:t>22</w:t>
+            </w:r>
+          </w:p>
+        </w:tc>
+        <w:tc>
+          <w:tcPr>
+            <w:tcW w:w="1850" w:type="pct"/>
+            <w:tcMar>
+              <w:top w:w="30" w:type="dxa"/>
+              <w:left w:w="80" w:type="dxa"/>
+              <w:bottom w:w="30" w:type="dxa"/>
+              <w:right w:w="80" w:type="dxa"/>
+            </w:tcMar>
+          </w:tcPr>
+          <w:p>
+            <w:r>
+              <w:rPr>
+                <w:rFonts w:ascii="Aptos" w:eastAsia="Aptos" w:hAnsi="Aptos" w:cs="Aptos"/>
+                <w:sz w:val="20"/>
+                <w:szCs w:val="20"/>
+              </w:rPr>
+              <w:t>Pick the Inception screening and customer John Smith, select seats A1 and A2, then press Create Booking</w:t>
+            </w:r>
+          </w:p>
+        </w:tc>
+        <w:tc>
+          <w:tcPr>
+            <w:tcW w:w="550" w:type="pct"/>
+            <w:tcMar>
+              <w:top w:w="30" w:type="dxa"/>
+              <w:left w:w="80" w:type="dxa"/>
+              <w:bottom w:w="30" w:type="dxa"/>
+              <w:right w:w="80" w:type="dxa"/>
+            </w:tcMar>
+          </w:tcPr>
+          <w:p>
+            <w:r>
+              <w:rPr>
+                <w:rFonts w:ascii="Aptos" w:eastAsia="Aptos" w:hAnsi="Aptos" w:cs="Aptos"/>
+                <w:sz w:val="20"/>
+                <w:szCs w:val="20"/>
+              </w:rPr>
+              <w:t>Normal</w:t>
+            </w:r>
+          </w:p>
+        </w:tc>
+        <w:tc>
+          <w:tcPr>
+            <w:tcW w:w="2300" w:type="pct"/>
+            <w:tcMar>
+              <w:top w:w="30" w:type="dxa"/>
+              <w:left w:w="80" w:type="dxa"/>
+              <w:bottom w:w="30" w:type="dxa"/>
+              <w:right w:w="80" w:type="dxa"/>
+            </w:tcMar>
+          </w:tcPr>
+          <w:p>
+            <w:r>
+              <w:rPr>
+                <w:rFonts w:ascii="Aptos" w:eastAsia="Aptos" w:hAnsi="Aptos" w:cs="Aptos"/>
+                <w:sz w:val="20"/>
+                <w:szCs w:val="20"/>
+              </w:rPr>
+              <w:t xml:space="preserve">A booking is created for John Smith with 2 seats, saved to </w:t>
+            </w:r>
+            <w:proofErr w:type="spellStart"/>
+            <w:r>
+              <w:rPr>
+                <w:rFonts w:ascii="Aptos" w:eastAsia="Aptos" w:hAnsi="Aptos" w:cs="Aptos"/>
+                <w:sz w:val="20"/>
+                <w:szCs w:val="20"/>
+              </w:rPr>
+              <w:t>tblBooking</w:t>
+            </w:r>
+            <w:proofErr w:type="spellEnd"/>
+            <w:r>
+              <w:rPr>
+                <w:rFonts w:ascii="Aptos" w:eastAsia="Aptos" w:hAnsi="Aptos" w:cs="Aptos"/>
+                <w:sz w:val="20"/>
+                <w:szCs w:val="20"/>
+              </w:rPr>
+              <w:t xml:space="preserve"> with a total cost of £18.00 (2 seats at £9.00), and both seats are saved to </w:t>
+            </w:r>
+            <w:proofErr w:type="spellStart"/>
+            <w:r>
+              <w:rPr>
+                <w:rFonts w:ascii="Aptos" w:eastAsia="Aptos" w:hAnsi="Aptos" w:cs="Aptos"/>
+                <w:sz w:val="20"/>
+                <w:szCs w:val="20"/>
+              </w:rPr>
+              <w:t>tblBookingSeat</w:t>
+            </w:r>
+            <w:proofErr w:type="spellEnd"/>
+            <w:r>
+              <w:rPr>
+                <w:rFonts w:ascii="Aptos" w:eastAsia="Aptos" w:hAnsi="Aptos" w:cs="Aptos"/>
+                <w:sz w:val="20"/>
+                <w:szCs w:val="20"/>
+              </w:rPr>
+              <w:t>.</w:t>
+            </w:r>
+          </w:p>
+        </w:tc>
+      </w:tr>
+      <w:tr>
+        <w:tblPrEx>
+          <w:tblCellMar>
+            <w:top w:w="0" w:type="dxa"/>
+            <w:bottom w:w="0" w:type="dxa"/>
+          </w:tblCellMar>
+        </w:tblPrEx>
+        <w:trPr>
+          <w:cantSplit/>
+        </w:trPr>
+        <w:tc>
+          <w:tcPr>
+            <w:tcW w:w="300" w:type="pct"/>
+            <w:tcMar>
+              <w:top w:w="30" w:type="dxa"/>
+              <w:left w:w="80" w:type="dxa"/>
+              <w:bottom w:w="30" w:type="dxa"/>
+              <w:right w:w="80" w:type="dxa"/>
+            </w:tcMar>
+          </w:tcPr>
+          <w:p>
+            <w:r>
+              <w:rPr>
+                <w:rFonts w:ascii="Aptos" w:eastAsia="Aptos" w:hAnsi="Aptos" w:cs="Aptos"/>
+                <w:sz w:val="20"/>
+                <w:szCs w:val="20"/>
+              </w:rPr>
+              <w:t>23</w:t>
+            </w:r>
+          </w:p>
+        </w:tc>
+        <w:tc>
+          <w:tcPr>
+            <w:tcW w:w="1850" w:type="pct"/>
+            <w:tcMar>
+              <w:top w:w="30" w:type="dxa"/>
+              <w:left w:w="80" w:type="dxa"/>
+              <w:bottom w:w="30" w:type="dxa"/>
+              <w:right w:w="80" w:type="dxa"/>
+            </w:tcMar>
+          </w:tcPr>
+          <w:p>
+            <w:r>
+              <w:rPr>
+                <w:rFonts w:ascii="Aptos" w:eastAsia="Aptos" w:hAnsi="Aptos" w:cs="Aptos"/>
+                <w:sz w:val="20"/>
+                <w:szCs w:val="20"/>
+              </w:rPr>
+              <w:t>Pick the Inception screening and customer Sarah Smith, select seat B1, then press Create Booking</w:t>
+            </w:r>
+          </w:p>
+        </w:tc>
+        <w:tc>
+          <w:tcPr>
+            <w:tcW w:w="550" w:type="pct"/>
+            <w:tcMar>
+              <w:top w:w="30" w:type="dxa"/>
+              <w:left w:w="80" w:type="dxa"/>
+              <w:bottom w:w="30" w:type="dxa"/>
+              <w:right w:w="80" w:type="dxa"/>
+            </w:tcMar>
+          </w:tcPr>
+          <w:p>
+            <w:r>
+              <w:rPr>
+                <w:rFonts w:ascii="Aptos" w:eastAsia="Aptos" w:hAnsi="Aptos" w:cs="Aptos"/>
+                <w:sz w:val="20"/>
+                <w:szCs w:val="20"/>
+              </w:rPr>
+              <w:t>Normal</w:t>
+            </w:r>
+          </w:p>
+        </w:tc>
+        <w:tc>
+          <w:tcPr>
+            <w:tcW w:w="2300" w:type="pct"/>
+            <w:tcMar>
+              <w:top w:w="30" w:type="dxa"/>
+              <w:left w:w="80" w:type="dxa"/>
+              <w:bottom w:w="30" w:type="dxa"/>
+              <w:right w:w="80" w:type="dxa"/>
+            </w:tcMar>
+          </w:tcPr>
+          <w:p>
+            <w:r>
+              <w:rPr>
+                <w:rFonts w:ascii="Aptos" w:eastAsia="Aptos" w:hAnsi="Aptos" w:cs="Aptos"/>
+                <w:sz w:val="20"/>
+                <w:szCs w:val="20"/>
+              </w:rPr>
+              <w:t>A booking is created for Sarah Smith with 1 seat and a total cost of £9.00.</w:t>
+            </w:r>
+          </w:p>
+        </w:tc>
+      </w:tr>
+      <w:tr>
+        <w:tblPrEx>
+          <w:tblCellMar>
+            <w:top w:w="0" w:type="dxa"/>
+            <w:bottom w:w="0" w:type="dxa"/>
+          </w:tblCellMar>
+        </w:tblPrEx>
+        <w:trPr>
+          <w:cantSplit/>
+        </w:trPr>
+        <w:tc>
+          <w:tcPr>
+            <w:tcW w:w="300" w:type="pct"/>
+            <w:tcMar>
+              <w:top w:w="30" w:type="dxa"/>
+              <w:left w:w="80" w:type="dxa"/>
+              <w:bottom w:w="30" w:type="dxa"/>
+              <w:right w:w="80" w:type="dxa"/>
+            </w:tcMar>
+          </w:tcPr>
+          <w:p>
+            <w:r>
+              <w:rPr>
+                <w:rFonts w:ascii="Aptos" w:eastAsia="Aptos" w:hAnsi="Aptos" w:cs="Aptos"/>
+                <w:sz w:val="20"/>
+                <w:szCs w:val="20"/>
+              </w:rPr>
+              <w:lastRenderedPageBreak/>
+              <w:t>24</w:t>
+            </w:r>
+          </w:p>
+        </w:tc>
+        <w:tc>
+          <w:tcPr>
+            <w:tcW w:w="1850" w:type="pct"/>
+            <w:tcMar>
+              <w:top w:w="30" w:type="dxa"/>
+              <w:left w:w="80" w:type="dxa"/>
+              <w:bottom w:w="30" w:type="dxa"/>
+              <w:right w:w="80" w:type="dxa"/>
+            </w:tcMar>
+          </w:tcPr>
+          <w:p>
+            <w:r>
+              <w:rPr>
+                <w:rFonts w:ascii="Aptos" w:eastAsia="Aptos" w:hAnsi="Aptos" w:cs="Aptos"/>
+                <w:sz w:val="20"/>
+                <w:szCs w:val="20"/>
+              </w:rPr>
+              <w:t>Pick the Inception screening and customer David Smith, select seat B2, then press Create Booking</w:t>
+            </w:r>
+          </w:p>
+        </w:tc>
+        <w:tc>
+          <w:tcPr>
+            <w:tcW w:w="550" w:type="pct"/>
+            <w:tcMar>
+              <w:top w:w="30" w:type="dxa"/>
+              <w:left w:w="80" w:type="dxa"/>
+              <w:bottom w:w="30" w:type="dxa"/>
+              <w:right w:w="80" w:type="dxa"/>
+            </w:tcMar>
+          </w:tcPr>
+          <w:p>
+            <w:r>
+              <w:rPr>
+                <w:rFonts w:ascii="Aptos" w:eastAsia="Aptos" w:hAnsi="Aptos" w:cs="Aptos"/>
+                <w:sz w:val="20"/>
+                <w:szCs w:val="20"/>
+              </w:rPr>
+              <w:t>Normal</w:t>
+            </w:r>
+          </w:p>
+        </w:tc>
+        <w:tc>
+          <w:tcPr>
+            <w:tcW w:w="2300" w:type="pct"/>
+            <w:tcMar>
+              <w:top w:w="30" w:type="dxa"/>
+              <w:left w:w="80" w:type="dxa"/>
+              <w:bottom w:w="30" w:type="dxa"/>
+              <w:right w:w="80" w:type="dxa"/>
+            </w:tcMar>
+          </w:tcPr>
+          <w:p>
+            <w:r>
+              <w:rPr>
+                <w:rFonts w:ascii="Aptos" w:eastAsia="Aptos" w:hAnsi="Aptos" w:cs="Aptos"/>
+                <w:sz w:val="20"/>
+                <w:szCs w:val="20"/>
+              </w:rPr>
+              <w:t>A booking is created for David Smith with 1 seat and a total cost of £9.00.</w:t>
+            </w:r>
+          </w:p>
+        </w:tc>
+      </w:tr>
+      <w:tr>
+        <w:tblPrEx>
+          <w:tblCellMar>
+            <w:top w:w="0" w:type="dxa"/>
+            <w:bottom w:w="0" w:type="dxa"/>
+          </w:tblCellMar>
+        </w:tblPrEx>
+        <w:trPr>
+          <w:cantSplit/>
+        </w:trPr>
+        <w:tc>
+          <w:tcPr>
+            <w:tcW w:w="300" w:type="pct"/>
+            <w:tcMar>
+              <w:top w:w="30" w:type="dxa"/>
+              <w:left w:w="80" w:type="dxa"/>
+              <w:bottom w:w="30" w:type="dxa"/>
+              <w:right w:w="80" w:type="dxa"/>
+            </w:tcMar>
+          </w:tcPr>
+          <w:p>
+            <w:r>
+              <w:rPr>
+                <w:rFonts w:ascii="Aptos" w:eastAsia="Aptos" w:hAnsi="Aptos" w:cs="Aptos"/>
+                <w:sz w:val="20"/>
+                <w:szCs w:val="20"/>
+              </w:rPr>
+              <w:t>25</w:t>
+            </w:r>
+          </w:p>
+        </w:tc>
+        <w:tc>
+          <w:tcPr>
+            <w:tcW w:w="1850" w:type="pct"/>
+            <w:tcMar>
+              <w:top w:w="30" w:type="dxa"/>
+              <w:left w:w="80" w:type="dxa"/>
+              <w:bottom w:w="30" w:type="dxa"/>
+              <w:right w:w="80" w:type="dxa"/>
+            </w:tcMar>
+          </w:tcPr>
+          <w:p>
+            <w:r>
+              <w:rPr>
+                <w:rFonts w:ascii="Aptos" w:eastAsia="Aptos" w:hAnsi="Aptos" w:cs="Aptos"/>
+                <w:sz w:val="20"/>
+                <w:szCs w:val="20"/>
+              </w:rPr>
+              <w:t>Pick the Paddington 2 screening and customer Emma Jones, select seat A1, then press Create Booking</w:t>
+            </w:r>
+          </w:p>
+        </w:tc>
+        <w:tc>
+          <w:tcPr>
+            <w:tcW w:w="550" w:type="pct"/>
+            <w:tcMar>
+              <w:top w:w="30" w:type="dxa"/>
+              <w:left w:w="80" w:type="dxa"/>
+              <w:bottom w:w="30" w:type="dxa"/>
+              <w:right w:w="80" w:type="dxa"/>
+            </w:tcMar>
+          </w:tcPr>
+          <w:p>
+            <w:r>
+              <w:rPr>
+                <w:rFonts w:ascii="Aptos" w:eastAsia="Aptos" w:hAnsi="Aptos" w:cs="Aptos"/>
+                <w:sz w:val="20"/>
+                <w:szCs w:val="20"/>
+              </w:rPr>
+              <w:t>Normal</w:t>
+            </w:r>
+          </w:p>
+        </w:tc>
+        <w:tc>
+          <w:tcPr>
+            <w:tcW w:w="2300" w:type="pct"/>
+            <w:tcMar>
+              <w:top w:w="30" w:type="dxa"/>
+              <w:left w:w="80" w:type="dxa"/>
+              <w:bottom w:w="30" w:type="dxa"/>
+              <w:right w:w="80" w:type="dxa"/>
+            </w:tcMar>
+          </w:tcPr>
+          <w:p>
+            <w:r>
+              <w:rPr>
+                <w:rFonts w:ascii="Aptos" w:eastAsia="Aptos" w:hAnsi="Aptos" w:cs="Aptos"/>
+                <w:sz w:val="20"/>
+                <w:szCs w:val="20"/>
+              </w:rPr>
+              <w:t>A booking is created for Emma Jones with 1 seat and a total cost of £7.50.</w:t>
             </w:r>
           </w:p>
         </w:tc>

</xml_diff>

<commit_message>
added a test plan for objective 2: preventing double bookings
</commit_message>
<xml_diff>
--- a/Testing.docx
+++ b/Testing.docx
@@ -3198,6 +3198,446 @@
                 <w:szCs w:val="20"/>
               </w:rPr>
               <w:t>A booking is created for Emma Jones with 1 seat and a total cost of £7.50.</w:t>
+            </w:r>
+          </w:p>
+        </w:tc>
+      </w:tr>
+    </w:tbl>
+    <w:p/>
+    <w:p>
+      <w:pPr>
+        <w:pStyle w:val="Heading3"/>
+      </w:pPr>
+      <w:r>
+        <w:rPr>
+          <w:rFonts w:ascii="Aptos Display" w:eastAsia="Aptos Display" w:hAnsi="Aptos Display" w:cs="Aptos Display"/>
+          <w:b/>
+          <w:bCs/>
+          <w:color w:val="000000"/>
+        </w:rPr>
+        <w:t>Objective 2: Preventing Double Bookings</w:t>
+      </w:r>
+    </w:p>
+    <w:p>
+      <w:r>
+        <w:rPr>
+          <w:rFonts w:ascii="Aptos" w:eastAsia="Aptos" w:hAnsi="Aptos" w:cs="Aptos"/>
+        </w:rPr>
+        <w:t>These tests check that seats already booked in the previous tests cannot be booked again for the same screening.</w:t>
+      </w:r>
+    </w:p>
+    <w:tbl>
+      <w:tblPr>
+        <w:tblW w:w="5000" w:type="pct"/>
+        <w:tblBorders>
+          <w:top w:val="single" w:sz="4" w:space="0" w:color="808080"/>
+          <w:left w:val="single" w:sz="4" w:space="0" w:color="808080"/>
+          <w:bottom w:val="single" w:sz="4" w:space="0" w:color="808080"/>
+          <w:right w:val="single" w:sz="4" w:space="0" w:color="808080"/>
+          <w:insideH w:val="single" w:sz="4" w:space="0" w:color="808080"/>
+          <w:insideV w:val="single" w:sz="4" w:space="0" w:color="808080"/>
+        </w:tblBorders>
+        <w:tblCellMar>
+          <w:left w:w="10" w:type="dxa"/>
+          <w:right w:w="10" w:type="dxa"/>
+        </w:tblCellMar>
+        <w:tblLook w:val="0000" w:firstRow="0" w:lastRow="0" w:firstColumn="0" w:lastColumn="0" w:noHBand="0" w:noVBand="0"/>
+      </w:tblPr>
+      <w:tblGrid>
+        <w:gridCol w:w="554"/>
+        <w:gridCol w:w="3454"/>
+        <w:gridCol w:w="1047"/>
+        <w:gridCol w:w="4295"/>
+      </w:tblGrid>
+      <w:tr>
+        <w:tblPrEx>
+          <w:tblCellMar>
+            <w:top w:w="0" w:type="dxa"/>
+            <w:bottom w:w="0" w:type="dxa"/>
+          </w:tblCellMar>
+        </w:tblPrEx>
+        <w:trPr>
+          <w:cantSplit/>
+          <w:tblHeader/>
+        </w:trPr>
+        <w:tc>
+          <w:tcPr>
+            <w:tcW w:w="300" w:type="pct"/>
+            <w:shd w:val="clear" w:color="auto" w:fill="F2CEED" w:themeFill="accent5" w:themeFillTint="33"/>
+            <w:tcMar>
+              <w:top w:w="30" w:type="dxa"/>
+              <w:left w:w="80" w:type="dxa"/>
+              <w:bottom w:w="30" w:type="dxa"/>
+              <w:right w:w="80" w:type="dxa"/>
+            </w:tcMar>
+          </w:tcPr>
+          <w:p>
+            <w:r>
+              <w:rPr>
+                <w:rFonts w:ascii="Aptos" w:eastAsia="Aptos" w:hAnsi="Aptos" w:cs="Aptos"/>
+                <w:b/>
+                <w:bCs/>
+                <w:sz w:val="20"/>
+                <w:szCs w:val="20"/>
+              </w:rPr>
+              <w:t>No.</w:t>
+            </w:r>
+          </w:p>
+        </w:tc>
+        <w:tc>
+          <w:tcPr>
+            <w:tcW w:w="1850" w:type="pct"/>
+            <w:shd w:val="clear" w:color="auto" w:fill="F2CEED" w:themeFill="accent5" w:themeFillTint="33"/>
+            <w:tcMar>
+              <w:top w:w="30" w:type="dxa"/>
+              <w:left w:w="80" w:type="dxa"/>
+              <w:bottom w:w="30" w:type="dxa"/>
+              <w:right w:w="80" w:type="dxa"/>
+            </w:tcMar>
+          </w:tcPr>
+          <w:p>
+            <w:r>
+              <w:rPr>
+                <w:rFonts w:ascii="Aptos" w:eastAsia="Aptos" w:hAnsi="Aptos" w:cs="Aptos"/>
+                <w:b/>
+                <w:bCs/>
+                <w:sz w:val="20"/>
+                <w:szCs w:val="20"/>
+              </w:rPr>
+              <w:t>Test</w:t>
+            </w:r>
+          </w:p>
+        </w:tc>
+        <w:tc>
+          <w:tcPr>
+            <w:tcW w:w="550" w:type="pct"/>
+            <w:shd w:val="clear" w:color="auto" w:fill="F2CEED" w:themeFill="accent5" w:themeFillTint="33"/>
+            <w:tcMar>
+              <w:top w:w="30" w:type="dxa"/>
+              <w:left w:w="80" w:type="dxa"/>
+              <w:bottom w:w="30" w:type="dxa"/>
+              <w:right w:w="80" w:type="dxa"/>
+            </w:tcMar>
+          </w:tcPr>
+          <w:p>
+            <w:r>
+              <w:rPr>
+                <w:rFonts w:ascii="Aptos" w:eastAsia="Aptos" w:hAnsi="Aptos" w:cs="Aptos"/>
+                <w:b/>
+                <w:bCs/>
+                <w:sz w:val="20"/>
+                <w:szCs w:val="20"/>
+              </w:rPr>
+              <w:t>Type</w:t>
+            </w:r>
+          </w:p>
+        </w:tc>
+        <w:tc>
+          <w:tcPr>
+            <w:tcW w:w="2300" w:type="pct"/>
+            <w:shd w:val="clear" w:color="auto" w:fill="F2CEED" w:themeFill="accent5" w:themeFillTint="33"/>
+            <w:tcMar>
+              <w:top w:w="30" w:type="dxa"/>
+              <w:left w:w="80" w:type="dxa"/>
+              <w:bottom w:w="30" w:type="dxa"/>
+              <w:right w:w="80" w:type="dxa"/>
+            </w:tcMar>
+          </w:tcPr>
+          <w:p>
+            <w:r>
+              <w:rPr>
+                <w:rFonts w:ascii="Aptos" w:eastAsia="Aptos" w:hAnsi="Aptos" w:cs="Aptos"/>
+                <w:b/>
+                <w:bCs/>
+                <w:sz w:val="20"/>
+                <w:szCs w:val="20"/>
+              </w:rPr>
+              <w:t>Expected Result</w:t>
+            </w:r>
+          </w:p>
+        </w:tc>
+      </w:tr>
+      <w:tr>
+        <w:tblPrEx>
+          <w:tblCellMar>
+            <w:top w:w="0" w:type="dxa"/>
+            <w:bottom w:w="0" w:type="dxa"/>
+          </w:tblCellMar>
+        </w:tblPrEx>
+        <w:trPr>
+          <w:cantSplit/>
+        </w:trPr>
+        <w:tc>
+          <w:tcPr>
+            <w:tcW w:w="300" w:type="pct"/>
+            <w:tcMar>
+              <w:top w:w="30" w:type="dxa"/>
+              <w:left w:w="80" w:type="dxa"/>
+              <w:bottom w:w="30" w:type="dxa"/>
+              <w:right w:w="80" w:type="dxa"/>
+            </w:tcMar>
+          </w:tcPr>
+          <w:p>
+            <w:r>
+              <w:rPr>
+                <w:rFonts w:ascii="Aptos" w:eastAsia="Aptos" w:hAnsi="Aptos" w:cs="Aptos"/>
+                <w:sz w:val="20"/>
+                <w:szCs w:val="20"/>
+              </w:rPr>
+              <w:t>26</w:t>
+            </w:r>
+          </w:p>
+        </w:tc>
+        <w:tc>
+          <w:tcPr>
+            <w:tcW w:w="1850" w:type="pct"/>
+            <w:tcMar>
+              <w:top w:w="30" w:type="dxa"/>
+              <w:left w:w="80" w:type="dxa"/>
+              <w:bottom w:w="30" w:type="dxa"/>
+              <w:right w:w="80" w:type="dxa"/>
+            </w:tcMar>
+          </w:tcPr>
+          <w:p>
+            <w:r>
+              <w:rPr>
+                <w:rFonts w:ascii="Aptos" w:eastAsia="Aptos" w:hAnsi="Aptos" w:cs="Aptos"/>
+                <w:sz w:val="20"/>
+                <w:szCs w:val="20"/>
+              </w:rPr>
+              <w:t>Open the Bookings form, pick the Inception screening and look at seats A1, A2, B1 and B2 on the seat map</w:t>
+            </w:r>
+          </w:p>
+        </w:tc>
+        <w:tc>
+          <w:tcPr>
+            <w:tcW w:w="550" w:type="pct"/>
+            <w:tcMar>
+              <w:top w:w="30" w:type="dxa"/>
+              <w:left w:w="80" w:type="dxa"/>
+              <w:bottom w:w="30" w:type="dxa"/>
+              <w:right w:w="80" w:type="dxa"/>
+            </w:tcMar>
+          </w:tcPr>
+          <w:p>
+            <w:r>
+              <w:rPr>
+                <w:rFonts w:ascii="Aptos" w:eastAsia="Aptos" w:hAnsi="Aptos" w:cs="Aptos"/>
+                <w:sz w:val="20"/>
+                <w:szCs w:val="20"/>
+              </w:rPr>
+              <w:t>Normal</w:t>
+            </w:r>
+          </w:p>
+        </w:tc>
+        <w:tc>
+          <w:tcPr>
+            <w:tcW w:w="2300" w:type="pct"/>
+            <w:tcMar>
+              <w:top w:w="30" w:type="dxa"/>
+              <w:left w:w="80" w:type="dxa"/>
+              <w:bottom w:w="30" w:type="dxa"/>
+              <w:right w:w="80" w:type="dxa"/>
+            </w:tcMar>
+          </w:tcPr>
+          <w:p>
+            <w:r>
+              <w:rPr>
+                <w:rFonts w:ascii="Aptos" w:eastAsia="Aptos" w:hAnsi="Aptos" w:cs="Aptos"/>
+                <w:sz w:val="20"/>
+                <w:szCs w:val="20"/>
+              </w:rPr>
+              <w:t>These four seats appear in the taken colour and are disabled, because they were booked in the tests for objective 1.</w:t>
+            </w:r>
+          </w:p>
+        </w:tc>
+      </w:tr>
+      <w:tr>
+        <w:tblPrEx>
+          <w:tblCellMar>
+            <w:top w:w="0" w:type="dxa"/>
+            <w:bottom w:w="0" w:type="dxa"/>
+          </w:tblCellMar>
+        </w:tblPrEx>
+        <w:trPr>
+          <w:cantSplit/>
+        </w:trPr>
+        <w:tc>
+          <w:tcPr>
+            <w:tcW w:w="300" w:type="pct"/>
+            <w:tcMar>
+              <w:top w:w="30" w:type="dxa"/>
+              <w:left w:w="80" w:type="dxa"/>
+              <w:bottom w:w="30" w:type="dxa"/>
+              <w:right w:w="80" w:type="dxa"/>
+            </w:tcMar>
+          </w:tcPr>
+          <w:p>
+            <w:r>
+              <w:rPr>
+                <w:rFonts w:ascii="Aptos" w:eastAsia="Aptos" w:hAnsi="Aptos" w:cs="Aptos"/>
+                <w:sz w:val="20"/>
+                <w:szCs w:val="20"/>
+              </w:rPr>
+              <w:t>27</w:t>
+            </w:r>
+          </w:p>
+        </w:tc>
+        <w:tc>
+          <w:tcPr>
+            <w:tcW w:w="1850" w:type="pct"/>
+            <w:tcMar>
+              <w:top w:w="30" w:type="dxa"/>
+              <w:left w:w="80" w:type="dxa"/>
+              <w:bottom w:w="30" w:type="dxa"/>
+              <w:right w:w="80" w:type="dxa"/>
+            </w:tcMar>
+          </w:tcPr>
+          <w:p>
+            <w:r>
+              <w:rPr>
+                <w:rFonts w:ascii="Aptos" w:eastAsia="Aptos" w:hAnsi="Aptos" w:cs="Aptos"/>
+                <w:sz w:val="20"/>
+                <w:szCs w:val="20"/>
+              </w:rPr>
+              <w:t>With the Inception screening selected, try to click seat A1 to select it</w:t>
+            </w:r>
+          </w:p>
+        </w:tc>
+        <w:tc>
+          <w:tcPr>
+            <w:tcW w:w="550" w:type="pct"/>
+            <w:tcMar>
+              <w:top w:w="30" w:type="dxa"/>
+              <w:left w:w="80" w:type="dxa"/>
+              <w:bottom w:w="30" w:type="dxa"/>
+              <w:right w:w="80" w:type="dxa"/>
+            </w:tcMar>
+          </w:tcPr>
+          <w:p>
+            <w:r>
+              <w:rPr>
+                <w:rFonts w:ascii="Aptos" w:eastAsia="Aptos" w:hAnsi="Aptos" w:cs="Aptos"/>
+                <w:sz w:val="20"/>
+                <w:szCs w:val="20"/>
+              </w:rPr>
+              <w:t>Erroneous</w:t>
+            </w:r>
+          </w:p>
+        </w:tc>
+        <w:tc>
+          <w:tcPr>
+            <w:tcW w:w="2300" w:type="pct"/>
+            <w:tcMar>
+              <w:top w:w="30" w:type="dxa"/>
+              <w:left w:w="80" w:type="dxa"/>
+              <w:bottom w:w="30" w:type="dxa"/>
+              <w:right w:w="80" w:type="dxa"/>
+            </w:tcMar>
+          </w:tcPr>
+          <w:p>
+            <w:r>
+              <w:rPr>
+                <w:rFonts w:ascii="Aptos" w:eastAsia="Aptos" w:hAnsi="Aptos" w:cs="Aptos"/>
+                <w:sz w:val="20"/>
+                <w:szCs w:val="20"/>
+              </w:rPr>
+              <w:t>Nothing happens, because the seat is disabled, so a seat that is already booked cannot be selected again for the same screening.</w:t>
+            </w:r>
+          </w:p>
+        </w:tc>
+      </w:tr>
+      <w:tr>
+        <w:tblPrEx>
+          <w:tblCellMar>
+            <w:top w:w="0" w:type="dxa"/>
+            <w:bottom w:w="0" w:type="dxa"/>
+          </w:tblCellMar>
+        </w:tblPrEx>
+        <w:trPr>
+          <w:cantSplit/>
+        </w:trPr>
+        <w:tc>
+          <w:tcPr>
+            <w:tcW w:w="300" w:type="pct"/>
+            <w:tcMar>
+              <w:top w:w="30" w:type="dxa"/>
+              <w:left w:w="80" w:type="dxa"/>
+              <w:bottom w:w="30" w:type="dxa"/>
+              <w:right w:w="80" w:type="dxa"/>
+            </w:tcMar>
+          </w:tcPr>
+          <w:p>
+            <w:r>
+              <w:rPr>
+                <w:rFonts w:ascii="Aptos" w:eastAsia="Aptos" w:hAnsi="Aptos" w:cs="Aptos"/>
+                <w:sz w:val="20"/>
+                <w:szCs w:val="20"/>
+              </w:rPr>
+              <w:t>28</w:t>
+            </w:r>
+          </w:p>
+        </w:tc>
+        <w:tc>
+          <w:tcPr>
+            <w:tcW w:w="1850" w:type="pct"/>
+            <w:tcMar>
+              <w:top w:w="30" w:type="dxa"/>
+              <w:left w:w="80" w:type="dxa"/>
+              <w:bottom w:w="30" w:type="dxa"/>
+              <w:right w:w="80" w:type="dxa"/>
+            </w:tcMar>
+          </w:tcPr>
+          <w:p>
+            <w:r>
+              <w:rPr>
+                <w:rFonts w:ascii="Aptos" w:eastAsia="Aptos" w:hAnsi="Aptos" w:cs="Aptos"/>
+                <w:sz w:val="20"/>
+                <w:szCs w:val="20"/>
+              </w:rPr>
+              <w:t>With the Inception screening selected, select an available seat such as C1 and create a booking for John Smith</w:t>
+            </w:r>
+          </w:p>
+        </w:tc>
+        <w:tc>
+          <w:tcPr>
+            <w:tcW w:w="550" w:type="pct"/>
+            <w:tcMar>
+              <w:top w:w="30" w:type="dxa"/>
+              <w:left w:w="80" w:type="dxa"/>
+              <w:bottom w:w="30" w:type="dxa"/>
+              <w:right w:w="80" w:type="dxa"/>
+            </w:tcMar>
+          </w:tcPr>
+          <w:p>
+            <w:r>
+              <w:rPr>
+                <w:rFonts w:ascii="Aptos" w:eastAsia="Aptos" w:hAnsi="Aptos" w:cs="Aptos"/>
+                <w:sz w:val="20"/>
+                <w:szCs w:val="20"/>
+              </w:rPr>
+              <w:t>Normal</w:t>
+            </w:r>
+          </w:p>
+        </w:tc>
+        <w:tc>
+          <w:tcPr>
+            <w:tcW w:w="2300" w:type="pct"/>
+            <w:tcMar>
+              <w:top w:w="30" w:type="dxa"/>
+              <w:left w:w="80" w:type="dxa"/>
+              <w:bottom w:w="30" w:type="dxa"/>
+              <w:right w:w="80" w:type="dxa"/>
+            </w:tcMar>
+          </w:tcPr>
+          <w:p>
+            <w:r>
+              <w:rPr>
+                <w:rFonts w:ascii="Aptos" w:eastAsia="Aptos" w:hAnsi="Aptos" w:cs="Aptos"/>
+                <w:sz w:val="20"/>
+                <w:szCs w:val="20"/>
+              </w:rPr>
+              <w:t>The booking succeeds, showing that only seats which are already taken are blocked and available seats can still be booked normally.</w:t>
             </w:r>
           </w:p>
         </w:tc>

</xml_diff>

<commit_message>
added test plan for objective 3: displaying the graphical seat map
</commit_message>
<xml_diff>
--- a/Testing.docx
+++ b/Testing.docx
@@ -3638,6 +3638,446 @@
                 <w:szCs w:val="20"/>
               </w:rPr>
               <w:t>The booking succeeds, showing that only seats which are already taken are blocked and available seats can still be booked normally.</w:t>
+            </w:r>
+          </w:p>
+        </w:tc>
+      </w:tr>
+    </w:tbl>
+    <w:p/>
+    <w:p>
+      <w:pPr>
+        <w:pStyle w:val="Heading3"/>
+      </w:pPr>
+      <w:r>
+        <w:rPr>
+          <w:rFonts w:ascii="Aptos Display" w:eastAsia="Aptos Display" w:hAnsi="Aptos Display" w:cs="Aptos Display"/>
+          <w:b/>
+          <w:bCs/>
+          <w:color w:val="000000"/>
+        </w:rPr>
+        <w:t>Objective 3: Displaying the Graphical Seat Map</w:t>
+      </w:r>
+    </w:p>
+    <w:p>
+      <w:r>
+        <w:rPr>
+          <w:rFonts w:ascii="Aptos" w:eastAsia="Aptos" w:hAnsi="Aptos" w:cs="Aptos"/>
+        </w:rPr>
+        <w:t>These tests check that the seat map is drawn correctly and quickly for a chosen screening.</w:t>
+      </w:r>
+    </w:p>
+    <w:tbl>
+      <w:tblPr>
+        <w:tblW w:w="5000" w:type="pct"/>
+        <w:tblBorders>
+          <w:top w:val="single" w:sz="4" w:space="0" w:color="808080"/>
+          <w:left w:val="single" w:sz="4" w:space="0" w:color="808080"/>
+          <w:bottom w:val="single" w:sz="4" w:space="0" w:color="808080"/>
+          <w:right w:val="single" w:sz="4" w:space="0" w:color="808080"/>
+          <w:insideH w:val="single" w:sz="4" w:space="0" w:color="808080"/>
+          <w:insideV w:val="single" w:sz="4" w:space="0" w:color="808080"/>
+        </w:tblBorders>
+        <w:tblCellMar>
+          <w:left w:w="10" w:type="dxa"/>
+          <w:right w:w="10" w:type="dxa"/>
+        </w:tblCellMar>
+        <w:tblLook w:val="0000" w:firstRow="0" w:lastRow="0" w:firstColumn="0" w:lastColumn="0" w:noHBand="0" w:noVBand="0"/>
+      </w:tblPr>
+      <w:tblGrid>
+        <w:gridCol w:w="560"/>
+        <w:gridCol w:w="3460"/>
+        <w:gridCol w:w="1029"/>
+        <w:gridCol w:w="4301"/>
+      </w:tblGrid>
+      <w:tr>
+        <w:tblPrEx>
+          <w:tblCellMar>
+            <w:top w:w="0" w:type="dxa"/>
+            <w:bottom w:w="0" w:type="dxa"/>
+          </w:tblCellMar>
+        </w:tblPrEx>
+        <w:trPr>
+          <w:cantSplit/>
+          <w:tblHeader/>
+        </w:trPr>
+        <w:tc>
+          <w:tcPr>
+            <w:tcW w:w="300" w:type="pct"/>
+            <w:shd w:val="clear" w:color="auto" w:fill="F2CEED" w:themeFill="accent5" w:themeFillTint="33"/>
+            <w:tcMar>
+              <w:top w:w="30" w:type="dxa"/>
+              <w:left w:w="80" w:type="dxa"/>
+              <w:bottom w:w="30" w:type="dxa"/>
+              <w:right w:w="80" w:type="dxa"/>
+            </w:tcMar>
+          </w:tcPr>
+          <w:p>
+            <w:r>
+              <w:rPr>
+                <w:rFonts w:ascii="Aptos" w:eastAsia="Aptos" w:hAnsi="Aptos" w:cs="Aptos"/>
+                <w:b/>
+                <w:bCs/>
+                <w:sz w:val="20"/>
+                <w:szCs w:val="20"/>
+              </w:rPr>
+              <w:t>No.</w:t>
+            </w:r>
+          </w:p>
+        </w:tc>
+        <w:tc>
+          <w:tcPr>
+            <w:tcW w:w="1850" w:type="pct"/>
+            <w:shd w:val="clear" w:color="auto" w:fill="F2CEED" w:themeFill="accent5" w:themeFillTint="33"/>
+            <w:tcMar>
+              <w:top w:w="30" w:type="dxa"/>
+              <w:left w:w="80" w:type="dxa"/>
+              <w:bottom w:w="30" w:type="dxa"/>
+              <w:right w:w="80" w:type="dxa"/>
+            </w:tcMar>
+          </w:tcPr>
+          <w:p>
+            <w:r>
+              <w:rPr>
+                <w:rFonts w:ascii="Aptos" w:eastAsia="Aptos" w:hAnsi="Aptos" w:cs="Aptos"/>
+                <w:b/>
+                <w:bCs/>
+                <w:sz w:val="20"/>
+                <w:szCs w:val="20"/>
+              </w:rPr>
+              <w:t>Test</w:t>
+            </w:r>
+          </w:p>
+        </w:tc>
+        <w:tc>
+          <w:tcPr>
+            <w:tcW w:w="550" w:type="pct"/>
+            <w:shd w:val="clear" w:color="auto" w:fill="F2CEED" w:themeFill="accent5" w:themeFillTint="33"/>
+            <w:tcMar>
+              <w:top w:w="30" w:type="dxa"/>
+              <w:left w:w="80" w:type="dxa"/>
+              <w:bottom w:w="30" w:type="dxa"/>
+              <w:right w:w="80" w:type="dxa"/>
+            </w:tcMar>
+          </w:tcPr>
+          <w:p>
+            <w:r>
+              <w:rPr>
+                <w:rFonts w:ascii="Aptos" w:eastAsia="Aptos" w:hAnsi="Aptos" w:cs="Aptos"/>
+                <w:b/>
+                <w:bCs/>
+                <w:sz w:val="20"/>
+                <w:szCs w:val="20"/>
+              </w:rPr>
+              <w:t>Type</w:t>
+            </w:r>
+          </w:p>
+        </w:tc>
+        <w:tc>
+          <w:tcPr>
+            <w:tcW w:w="2300" w:type="pct"/>
+            <w:shd w:val="clear" w:color="auto" w:fill="F2CEED" w:themeFill="accent5" w:themeFillTint="33"/>
+            <w:tcMar>
+              <w:top w:w="30" w:type="dxa"/>
+              <w:left w:w="80" w:type="dxa"/>
+              <w:bottom w:w="30" w:type="dxa"/>
+              <w:right w:w="80" w:type="dxa"/>
+            </w:tcMar>
+          </w:tcPr>
+          <w:p>
+            <w:r>
+              <w:rPr>
+                <w:rFonts w:ascii="Aptos" w:eastAsia="Aptos" w:hAnsi="Aptos" w:cs="Aptos"/>
+                <w:b/>
+                <w:bCs/>
+                <w:sz w:val="20"/>
+                <w:szCs w:val="20"/>
+              </w:rPr>
+              <w:t>Expected Result</w:t>
+            </w:r>
+          </w:p>
+        </w:tc>
+      </w:tr>
+      <w:tr>
+        <w:tblPrEx>
+          <w:tblCellMar>
+            <w:top w:w="0" w:type="dxa"/>
+            <w:bottom w:w="0" w:type="dxa"/>
+          </w:tblCellMar>
+        </w:tblPrEx>
+        <w:trPr>
+          <w:cantSplit/>
+        </w:trPr>
+        <w:tc>
+          <w:tcPr>
+            <w:tcW w:w="300" w:type="pct"/>
+            <w:tcMar>
+              <w:top w:w="30" w:type="dxa"/>
+              <w:left w:w="80" w:type="dxa"/>
+              <w:bottom w:w="30" w:type="dxa"/>
+              <w:right w:w="80" w:type="dxa"/>
+            </w:tcMar>
+          </w:tcPr>
+          <w:p>
+            <w:r>
+              <w:rPr>
+                <w:rFonts w:ascii="Aptos" w:eastAsia="Aptos" w:hAnsi="Aptos" w:cs="Aptos"/>
+                <w:sz w:val="20"/>
+                <w:szCs w:val="20"/>
+              </w:rPr>
+              <w:t>29</w:t>
+            </w:r>
+          </w:p>
+        </w:tc>
+        <w:tc>
+          <w:tcPr>
+            <w:tcW w:w="1850" w:type="pct"/>
+            <w:tcMar>
+              <w:top w:w="30" w:type="dxa"/>
+              <w:left w:w="80" w:type="dxa"/>
+              <w:bottom w:w="30" w:type="dxa"/>
+              <w:right w:w="80" w:type="dxa"/>
+            </w:tcMar>
+          </w:tcPr>
+          <w:p>
+            <w:r>
+              <w:rPr>
+                <w:rFonts w:ascii="Aptos" w:eastAsia="Aptos" w:hAnsi="Aptos" w:cs="Aptos"/>
+                <w:sz w:val="20"/>
+                <w:szCs w:val="20"/>
+              </w:rPr>
+              <w:t>Pick the Inception screening, which runs in Screen 1, on the Bookings form</w:t>
+            </w:r>
+          </w:p>
+        </w:tc>
+        <w:tc>
+          <w:tcPr>
+            <w:tcW w:w="550" w:type="pct"/>
+            <w:tcMar>
+              <w:top w:w="30" w:type="dxa"/>
+              <w:left w:w="80" w:type="dxa"/>
+              <w:bottom w:w="30" w:type="dxa"/>
+              <w:right w:w="80" w:type="dxa"/>
+            </w:tcMar>
+          </w:tcPr>
+          <w:p>
+            <w:r>
+              <w:rPr>
+                <w:rFonts w:ascii="Aptos" w:eastAsia="Aptos" w:hAnsi="Aptos" w:cs="Aptos"/>
+                <w:sz w:val="20"/>
+                <w:szCs w:val="20"/>
+              </w:rPr>
+              <w:t>Normal</w:t>
+            </w:r>
+          </w:p>
+        </w:tc>
+        <w:tc>
+          <w:tcPr>
+            <w:tcW w:w="2300" w:type="pct"/>
+            <w:tcMar>
+              <w:top w:w="30" w:type="dxa"/>
+              <w:left w:w="80" w:type="dxa"/>
+              <w:bottom w:w="30" w:type="dxa"/>
+              <w:right w:w="80" w:type="dxa"/>
+            </w:tcMar>
+          </w:tcPr>
+          <w:p>
+            <w:r>
+              <w:rPr>
+                <w:rFonts w:ascii="Aptos" w:eastAsia="Aptos" w:hAnsi="Aptos" w:cs="Aptos"/>
+                <w:sz w:val="20"/>
+                <w:szCs w:val="20"/>
+              </w:rPr>
+              <w:t>A graphical seat map is displayed showing 50 seats laid out as 5 rows A to E of 10 seats each, matching the capacity of Screen 1.</w:t>
+            </w:r>
+          </w:p>
+        </w:tc>
+      </w:tr>
+      <w:tr>
+        <w:tblPrEx>
+          <w:tblCellMar>
+            <w:top w:w="0" w:type="dxa"/>
+            <w:bottom w:w="0" w:type="dxa"/>
+          </w:tblCellMar>
+        </w:tblPrEx>
+        <w:trPr>
+          <w:cantSplit/>
+        </w:trPr>
+        <w:tc>
+          <w:tcPr>
+            <w:tcW w:w="300" w:type="pct"/>
+            <w:tcMar>
+              <w:top w:w="30" w:type="dxa"/>
+              <w:left w:w="80" w:type="dxa"/>
+              <w:bottom w:w="30" w:type="dxa"/>
+              <w:right w:w="80" w:type="dxa"/>
+            </w:tcMar>
+          </w:tcPr>
+          <w:p>
+            <w:r>
+              <w:rPr>
+                <w:rFonts w:ascii="Aptos" w:eastAsia="Aptos" w:hAnsi="Aptos" w:cs="Aptos"/>
+                <w:sz w:val="20"/>
+                <w:szCs w:val="20"/>
+              </w:rPr>
+              <w:t>30</w:t>
+            </w:r>
+          </w:p>
+        </w:tc>
+        <w:tc>
+          <w:tcPr>
+            <w:tcW w:w="1850" w:type="pct"/>
+            <w:tcMar>
+              <w:top w:w="30" w:type="dxa"/>
+              <w:left w:w="80" w:type="dxa"/>
+              <w:bottom w:w="30" w:type="dxa"/>
+              <w:right w:w="80" w:type="dxa"/>
+            </w:tcMar>
+          </w:tcPr>
+          <w:p>
+            <w:r>
+              <w:rPr>
+                <w:rFonts w:ascii="Aptos" w:eastAsia="Aptos" w:hAnsi="Aptos" w:cs="Aptos"/>
+                <w:sz w:val="20"/>
+                <w:szCs w:val="20"/>
+              </w:rPr>
+              <w:t>Look at the colours of the seats on the Inception seat map</w:t>
+            </w:r>
+          </w:p>
+        </w:tc>
+        <w:tc>
+          <w:tcPr>
+            <w:tcW w:w="550" w:type="pct"/>
+            <w:tcMar>
+              <w:top w:w="30" w:type="dxa"/>
+              <w:left w:w="80" w:type="dxa"/>
+              <w:bottom w:w="30" w:type="dxa"/>
+              <w:right w:w="80" w:type="dxa"/>
+            </w:tcMar>
+          </w:tcPr>
+          <w:p>
+            <w:r>
+              <w:rPr>
+                <w:rFonts w:ascii="Aptos" w:eastAsia="Aptos" w:hAnsi="Aptos" w:cs="Aptos"/>
+                <w:sz w:val="20"/>
+                <w:szCs w:val="20"/>
+              </w:rPr>
+              <w:t>Normal</w:t>
+            </w:r>
+          </w:p>
+        </w:tc>
+        <w:tc>
+          <w:tcPr>
+            <w:tcW w:w="2300" w:type="pct"/>
+            <w:tcMar>
+              <w:top w:w="30" w:type="dxa"/>
+              <w:left w:w="80" w:type="dxa"/>
+              <w:bottom w:w="30" w:type="dxa"/>
+              <w:right w:w="80" w:type="dxa"/>
+            </w:tcMar>
+          </w:tcPr>
+          <w:p>
+            <w:r>
+              <w:rPr>
+                <w:rFonts w:ascii="Aptos" w:eastAsia="Aptos" w:hAnsi="Aptos" w:cs="Aptos"/>
+                <w:sz w:val="20"/>
+                <w:szCs w:val="20"/>
+              </w:rPr>
+              <w:t>Available seats appear grey, already booked seats appear in the taken colour and are disabled, and a seat turns the selected colour when it is clicked.</w:t>
+            </w:r>
+          </w:p>
+        </w:tc>
+      </w:tr>
+      <w:tr>
+        <w:tblPrEx>
+          <w:tblCellMar>
+            <w:top w:w="0" w:type="dxa"/>
+            <w:bottom w:w="0" w:type="dxa"/>
+          </w:tblCellMar>
+        </w:tblPrEx>
+        <w:trPr>
+          <w:cantSplit/>
+        </w:trPr>
+        <w:tc>
+          <w:tcPr>
+            <w:tcW w:w="300" w:type="pct"/>
+            <w:tcMar>
+              <w:top w:w="30" w:type="dxa"/>
+              <w:left w:w="80" w:type="dxa"/>
+              <w:bottom w:w="30" w:type="dxa"/>
+              <w:right w:w="80" w:type="dxa"/>
+            </w:tcMar>
+          </w:tcPr>
+          <w:p>
+            <w:r>
+              <w:rPr>
+                <w:rFonts w:ascii="Aptos" w:eastAsia="Aptos" w:hAnsi="Aptos" w:cs="Aptos"/>
+                <w:sz w:val="20"/>
+                <w:szCs w:val="20"/>
+              </w:rPr>
+              <w:t>31</w:t>
+            </w:r>
+          </w:p>
+        </w:tc>
+        <w:tc>
+          <w:tcPr>
+            <w:tcW w:w="1850" w:type="pct"/>
+            <w:tcMar>
+              <w:top w:w="30" w:type="dxa"/>
+              <w:left w:w="80" w:type="dxa"/>
+              <w:bottom w:w="30" w:type="dxa"/>
+              <w:right w:w="80" w:type="dxa"/>
+            </w:tcMar>
+          </w:tcPr>
+          <w:p>
+            <w:r>
+              <w:rPr>
+                <w:rFonts w:ascii="Aptos" w:eastAsia="Aptos" w:hAnsi="Aptos" w:cs="Aptos"/>
+                <w:sz w:val="20"/>
+                <w:szCs w:val="20"/>
+              </w:rPr>
+              <w:t>Pick the Inception screening and time how long the seat map takes to appear</w:t>
+            </w:r>
+          </w:p>
+        </w:tc>
+        <w:tc>
+          <w:tcPr>
+            <w:tcW w:w="550" w:type="pct"/>
+            <w:tcMar>
+              <w:top w:w="30" w:type="dxa"/>
+              <w:left w:w="80" w:type="dxa"/>
+              <w:bottom w:w="30" w:type="dxa"/>
+              <w:right w:w="80" w:type="dxa"/>
+            </w:tcMar>
+          </w:tcPr>
+          <w:p>
+            <w:r>
+              <w:rPr>
+                <w:rFonts w:ascii="Aptos" w:eastAsia="Aptos" w:hAnsi="Aptos" w:cs="Aptos"/>
+                <w:sz w:val="20"/>
+                <w:szCs w:val="20"/>
+              </w:rPr>
+              <w:t>Normal</w:t>
+            </w:r>
+          </w:p>
+        </w:tc>
+        <w:tc>
+          <w:tcPr>
+            <w:tcW w:w="2300" w:type="pct"/>
+            <w:tcMar>
+              <w:top w:w="30" w:type="dxa"/>
+              <w:left w:w="80" w:type="dxa"/>
+              <w:bottom w:w="30" w:type="dxa"/>
+              <w:right w:w="80" w:type="dxa"/>
+            </w:tcMar>
+          </w:tcPr>
+          <w:p>
+            <w:r>
+              <w:rPr>
+                <w:rFonts w:ascii="Aptos" w:eastAsia="Aptos" w:hAnsi="Aptos" w:cs="Aptos"/>
+                <w:sz w:val="20"/>
+                <w:szCs w:val="20"/>
+              </w:rPr>
+              <w:t>The seat map finishes loading within 3 seconds of the screening being selected, meeting the success criterion set in the Investigation.</w:t>
             </w:r>
           </w:p>
         </w:tc>

</xml_diff>

<commit_message>
added test plan for objective 5: adding food and drink to an order
</commit_message>
<xml_diff>
--- a/Testing.docx
+++ b/Testing.docx
@@ -4078,6 +4078,940 @@
                 <w:szCs w:val="20"/>
               </w:rPr>
               <w:t>The seat map finishes loading within 3 seconds of the screening being selected, meeting the success criterion set in the Investigation.</w:t>
+            </w:r>
+          </w:p>
+        </w:tc>
+      </w:tr>
+    </w:tbl>
+    <w:p/>
+    <w:p>
+      <w:pPr>
+        <w:pStyle w:val="Heading3"/>
+      </w:pPr>
+      <w:r>
+        <w:rPr>
+          <w:rFonts w:ascii="Aptos Display" w:eastAsia="Aptos Display" w:hAnsi="Aptos Display" w:cs="Aptos Display"/>
+          <w:b/>
+          <w:bCs/>
+          <w:color w:val="000000"/>
+        </w:rPr>
+        <w:t>Objective 5: Adding Food and Drink to an Order</w:t>
+      </w:r>
+    </w:p>
+    <w:p>
+      <w:r>
+        <w:rPr>
+          <w:rFonts w:ascii="Aptos" w:eastAsia="Aptos" w:hAnsi="Aptos" w:cs="Aptos"/>
+        </w:rPr>
+        <w:t>Food items are added first and then ordered against John Smith's Inception booking, so that the order total can be checked and later included in the sales report.</w:t>
+      </w:r>
+    </w:p>
+    <w:tbl>
+      <w:tblPr>
+        <w:tblW w:w="5000" w:type="pct"/>
+        <w:tblBorders>
+          <w:top w:val="single" w:sz="4" w:space="0" w:color="808080"/>
+          <w:left w:val="single" w:sz="4" w:space="0" w:color="808080"/>
+          <w:bottom w:val="single" w:sz="4" w:space="0" w:color="808080"/>
+          <w:right w:val="single" w:sz="4" w:space="0" w:color="808080"/>
+          <w:insideH w:val="single" w:sz="4" w:space="0" w:color="808080"/>
+          <w:insideV w:val="single" w:sz="4" w:space="0" w:color="808080"/>
+        </w:tblBorders>
+        <w:tblCellMar>
+          <w:left w:w="10" w:type="dxa"/>
+          <w:right w:w="10" w:type="dxa"/>
+        </w:tblCellMar>
+        <w:tblLook w:val="0000" w:firstRow="0" w:lastRow="0" w:firstColumn="0" w:lastColumn="0" w:noHBand="0" w:noVBand="0"/>
+      </w:tblPr>
+      <w:tblGrid>
+        <w:gridCol w:w="554"/>
+        <w:gridCol w:w="3454"/>
+        <w:gridCol w:w="1047"/>
+        <w:gridCol w:w="4295"/>
+      </w:tblGrid>
+      <w:tr>
+        <w:tblPrEx>
+          <w:tblCellMar>
+            <w:top w:w="0" w:type="dxa"/>
+            <w:bottom w:w="0" w:type="dxa"/>
+          </w:tblCellMar>
+        </w:tblPrEx>
+        <w:trPr>
+          <w:cantSplit/>
+          <w:tblHeader/>
+        </w:trPr>
+        <w:tc>
+          <w:tcPr>
+            <w:tcW w:w="300" w:type="pct"/>
+            <w:shd w:val="clear" w:color="auto" w:fill="F2CEED" w:themeFill="accent5" w:themeFillTint="33"/>
+            <w:tcMar>
+              <w:top w:w="30" w:type="dxa"/>
+              <w:left w:w="80" w:type="dxa"/>
+              <w:bottom w:w="30" w:type="dxa"/>
+              <w:right w:w="80" w:type="dxa"/>
+            </w:tcMar>
+          </w:tcPr>
+          <w:p>
+            <w:r>
+              <w:rPr>
+                <w:rFonts w:ascii="Aptos" w:eastAsia="Aptos" w:hAnsi="Aptos" w:cs="Aptos"/>
+                <w:b/>
+                <w:bCs/>
+                <w:sz w:val="20"/>
+                <w:szCs w:val="20"/>
+              </w:rPr>
+              <w:lastRenderedPageBreak/>
+              <w:t>No.</w:t>
+            </w:r>
+          </w:p>
+        </w:tc>
+        <w:tc>
+          <w:tcPr>
+            <w:tcW w:w="1850" w:type="pct"/>
+            <w:shd w:val="clear" w:color="auto" w:fill="F2CEED" w:themeFill="accent5" w:themeFillTint="33"/>
+            <w:tcMar>
+              <w:top w:w="30" w:type="dxa"/>
+              <w:left w:w="80" w:type="dxa"/>
+              <w:bottom w:w="30" w:type="dxa"/>
+              <w:right w:w="80" w:type="dxa"/>
+            </w:tcMar>
+          </w:tcPr>
+          <w:p>
+            <w:r>
+              <w:rPr>
+                <w:rFonts w:ascii="Aptos" w:eastAsia="Aptos" w:hAnsi="Aptos" w:cs="Aptos"/>
+                <w:b/>
+                <w:bCs/>
+                <w:sz w:val="20"/>
+                <w:szCs w:val="20"/>
+              </w:rPr>
+              <w:t>Test</w:t>
+            </w:r>
+          </w:p>
+        </w:tc>
+        <w:tc>
+          <w:tcPr>
+            <w:tcW w:w="550" w:type="pct"/>
+            <w:shd w:val="clear" w:color="auto" w:fill="F2CEED" w:themeFill="accent5" w:themeFillTint="33"/>
+            <w:tcMar>
+              <w:top w:w="30" w:type="dxa"/>
+              <w:left w:w="80" w:type="dxa"/>
+              <w:bottom w:w="30" w:type="dxa"/>
+              <w:right w:w="80" w:type="dxa"/>
+            </w:tcMar>
+          </w:tcPr>
+          <w:p>
+            <w:r>
+              <w:rPr>
+                <w:rFonts w:ascii="Aptos" w:eastAsia="Aptos" w:hAnsi="Aptos" w:cs="Aptos"/>
+                <w:b/>
+                <w:bCs/>
+                <w:sz w:val="20"/>
+                <w:szCs w:val="20"/>
+              </w:rPr>
+              <w:t>Type</w:t>
+            </w:r>
+          </w:p>
+        </w:tc>
+        <w:tc>
+          <w:tcPr>
+            <w:tcW w:w="2300" w:type="pct"/>
+            <w:shd w:val="clear" w:color="auto" w:fill="F2CEED" w:themeFill="accent5" w:themeFillTint="33"/>
+            <w:tcMar>
+              <w:top w:w="30" w:type="dxa"/>
+              <w:left w:w="80" w:type="dxa"/>
+              <w:bottom w:w="30" w:type="dxa"/>
+              <w:right w:w="80" w:type="dxa"/>
+            </w:tcMar>
+          </w:tcPr>
+          <w:p>
+            <w:r>
+              <w:rPr>
+                <w:rFonts w:ascii="Aptos" w:eastAsia="Aptos" w:hAnsi="Aptos" w:cs="Aptos"/>
+                <w:b/>
+                <w:bCs/>
+                <w:sz w:val="20"/>
+                <w:szCs w:val="20"/>
+              </w:rPr>
+              <w:t>Expected Result</w:t>
+            </w:r>
+          </w:p>
+        </w:tc>
+      </w:tr>
+      <w:tr>
+        <w:tblPrEx>
+          <w:tblCellMar>
+            <w:top w:w="0" w:type="dxa"/>
+            <w:bottom w:w="0" w:type="dxa"/>
+          </w:tblCellMar>
+        </w:tblPrEx>
+        <w:trPr>
+          <w:cantSplit/>
+        </w:trPr>
+        <w:tc>
+          <w:tcPr>
+            <w:tcW w:w="300" w:type="pct"/>
+            <w:tcMar>
+              <w:top w:w="30" w:type="dxa"/>
+              <w:left w:w="80" w:type="dxa"/>
+              <w:bottom w:w="30" w:type="dxa"/>
+              <w:right w:w="80" w:type="dxa"/>
+            </w:tcMar>
+          </w:tcPr>
+          <w:p>
+            <w:r>
+              <w:rPr>
+                <w:rFonts w:ascii="Aptos" w:eastAsia="Aptos" w:hAnsi="Aptos" w:cs="Aptos"/>
+                <w:sz w:val="20"/>
+                <w:szCs w:val="20"/>
+              </w:rPr>
+              <w:t>32</w:t>
+            </w:r>
+          </w:p>
+        </w:tc>
+        <w:tc>
+          <w:tcPr>
+            <w:tcW w:w="1850" w:type="pct"/>
+            <w:tcMar>
+              <w:top w:w="30" w:type="dxa"/>
+              <w:left w:w="80" w:type="dxa"/>
+              <w:bottom w:w="30" w:type="dxa"/>
+              <w:right w:w="80" w:type="dxa"/>
+            </w:tcMar>
+          </w:tcPr>
+          <w:p>
+            <w:r>
+              <w:rPr>
+                <w:rFonts w:ascii="Aptos" w:eastAsia="Aptos" w:hAnsi="Aptos" w:cs="Aptos"/>
+                <w:sz w:val="20"/>
+                <w:szCs w:val="20"/>
+              </w:rPr>
+              <w:t>On the Food Items form, enter name Large Popcorn, price 4.50 and category Snacks, then press Add</w:t>
+            </w:r>
+          </w:p>
+        </w:tc>
+        <w:tc>
+          <w:tcPr>
+            <w:tcW w:w="550" w:type="pct"/>
+            <w:tcMar>
+              <w:top w:w="30" w:type="dxa"/>
+              <w:left w:w="80" w:type="dxa"/>
+              <w:bottom w:w="30" w:type="dxa"/>
+              <w:right w:w="80" w:type="dxa"/>
+            </w:tcMar>
+          </w:tcPr>
+          <w:p>
+            <w:r>
+              <w:rPr>
+                <w:rFonts w:ascii="Aptos" w:eastAsia="Aptos" w:hAnsi="Aptos" w:cs="Aptos"/>
+                <w:sz w:val="20"/>
+                <w:szCs w:val="20"/>
+              </w:rPr>
+              <w:t>Normal</w:t>
+            </w:r>
+          </w:p>
+        </w:tc>
+        <w:tc>
+          <w:tcPr>
+            <w:tcW w:w="2300" w:type="pct"/>
+            <w:tcMar>
+              <w:top w:w="30" w:type="dxa"/>
+              <w:left w:w="80" w:type="dxa"/>
+              <w:bottom w:w="30" w:type="dxa"/>
+              <w:right w:w="80" w:type="dxa"/>
+            </w:tcMar>
+          </w:tcPr>
+          <w:p>
+            <w:r>
+              <w:rPr>
+                <w:rFonts w:ascii="Aptos" w:eastAsia="Aptos" w:hAnsi="Aptos" w:cs="Aptos"/>
+                <w:sz w:val="20"/>
+                <w:szCs w:val="20"/>
+              </w:rPr>
+              <w:t xml:space="preserve">The food item Large Popcorn is saved to </w:t>
+            </w:r>
+            <w:proofErr w:type="spellStart"/>
+            <w:r>
+              <w:rPr>
+                <w:rFonts w:ascii="Aptos" w:eastAsia="Aptos" w:hAnsi="Aptos" w:cs="Aptos"/>
+                <w:sz w:val="20"/>
+                <w:szCs w:val="20"/>
+              </w:rPr>
+              <w:t>tblFoodItem</w:t>
+            </w:r>
+            <w:proofErr w:type="spellEnd"/>
+            <w:r>
+              <w:rPr>
+                <w:rFonts w:ascii="Aptos" w:eastAsia="Aptos" w:hAnsi="Aptos" w:cs="Aptos"/>
+                <w:sz w:val="20"/>
+                <w:szCs w:val="20"/>
+              </w:rPr>
+              <w:t>.</w:t>
+            </w:r>
+          </w:p>
+        </w:tc>
+      </w:tr>
+      <w:tr>
+        <w:tblPrEx>
+          <w:tblCellMar>
+            <w:top w:w="0" w:type="dxa"/>
+            <w:bottom w:w="0" w:type="dxa"/>
+          </w:tblCellMar>
+        </w:tblPrEx>
+        <w:trPr>
+          <w:cantSplit/>
+        </w:trPr>
+        <w:tc>
+          <w:tcPr>
+            <w:tcW w:w="300" w:type="pct"/>
+            <w:tcMar>
+              <w:top w:w="30" w:type="dxa"/>
+              <w:left w:w="80" w:type="dxa"/>
+              <w:bottom w:w="30" w:type="dxa"/>
+              <w:right w:w="80" w:type="dxa"/>
+            </w:tcMar>
+          </w:tcPr>
+          <w:p>
+            <w:r>
+              <w:rPr>
+                <w:rFonts w:ascii="Aptos" w:eastAsia="Aptos" w:hAnsi="Aptos" w:cs="Aptos"/>
+                <w:sz w:val="20"/>
+                <w:szCs w:val="20"/>
+              </w:rPr>
+              <w:t>33</w:t>
+            </w:r>
+          </w:p>
+        </w:tc>
+        <w:tc>
+          <w:tcPr>
+            <w:tcW w:w="1850" w:type="pct"/>
+            <w:tcMar>
+              <w:top w:w="30" w:type="dxa"/>
+              <w:left w:w="80" w:type="dxa"/>
+              <w:bottom w:w="30" w:type="dxa"/>
+              <w:right w:w="80" w:type="dxa"/>
+            </w:tcMar>
+          </w:tcPr>
+          <w:p>
+            <w:r>
+              <w:rPr>
+                <w:rFonts w:ascii="Aptos" w:eastAsia="Aptos" w:hAnsi="Aptos" w:cs="Aptos"/>
+                <w:sz w:val="20"/>
+                <w:szCs w:val="20"/>
+              </w:rPr>
+              <w:t>Add a food item named Cola with a price of 2.50 and category Drinks</w:t>
+            </w:r>
+          </w:p>
+        </w:tc>
+        <w:tc>
+          <w:tcPr>
+            <w:tcW w:w="550" w:type="pct"/>
+            <w:tcMar>
+              <w:top w:w="30" w:type="dxa"/>
+              <w:left w:w="80" w:type="dxa"/>
+              <w:bottom w:w="30" w:type="dxa"/>
+              <w:right w:w="80" w:type="dxa"/>
+            </w:tcMar>
+          </w:tcPr>
+          <w:p>
+            <w:r>
+              <w:rPr>
+                <w:rFonts w:ascii="Aptos" w:eastAsia="Aptos" w:hAnsi="Aptos" w:cs="Aptos"/>
+                <w:sz w:val="20"/>
+                <w:szCs w:val="20"/>
+              </w:rPr>
+              <w:t>Normal</w:t>
+            </w:r>
+          </w:p>
+        </w:tc>
+        <w:tc>
+          <w:tcPr>
+            <w:tcW w:w="2300" w:type="pct"/>
+            <w:tcMar>
+              <w:top w:w="30" w:type="dxa"/>
+              <w:left w:w="80" w:type="dxa"/>
+              <w:bottom w:w="30" w:type="dxa"/>
+              <w:right w:w="80" w:type="dxa"/>
+            </w:tcMar>
+          </w:tcPr>
+          <w:p>
+            <w:r>
+              <w:rPr>
+                <w:rFonts w:ascii="Aptos" w:eastAsia="Aptos" w:hAnsi="Aptos" w:cs="Aptos"/>
+                <w:sz w:val="20"/>
+                <w:szCs w:val="20"/>
+              </w:rPr>
+              <w:t>The food item Cola is saved.</w:t>
+            </w:r>
+          </w:p>
+        </w:tc>
+      </w:tr>
+      <w:tr>
+        <w:tblPrEx>
+          <w:tblCellMar>
+            <w:top w:w="0" w:type="dxa"/>
+            <w:bottom w:w="0" w:type="dxa"/>
+          </w:tblCellMar>
+        </w:tblPrEx>
+        <w:trPr>
+          <w:cantSplit/>
+        </w:trPr>
+        <w:tc>
+          <w:tcPr>
+            <w:tcW w:w="300" w:type="pct"/>
+            <w:tcMar>
+              <w:top w:w="30" w:type="dxa"/>
+              <w:left w:w="80" w:type="dxa"/>
+              <w:bottom w:w="30" w:type="dxa"/>
+              <w:right w:w="80" w:type="dxa"/>
+            </w:tcMar>
+          </w:tcPr>
+          <w:p>
+            <w:r>
+              <w:rPr>
+                <w:rFonts w:ascii="Aptos" w:eastAsia="Aptos" w:hAnsi="Aptos" w:cs="Aptos"/>
+                <w:sz w:val="20"/>
+                <w:szCs w:val="20"/>
+              </w:rPr>
+              <w:t>34</w:t>
+            </w:r>
+          </w:p>
+        </w:tc>
+        <w:tc>
+          <w:tcPr>
+            <w:tcW w:w="1850" w:type="pct"/>
+            <w:tcMar>
+              <w:top w:w="30" w:type="dxa"/>
+              <w:left w:w="80" w:type="dxa"/>
+              <w:bottom w:w="30" w:type="dxa"/>
+              <w:right w:w="80" w:type="dxa"/>
+            </w:tcMar>
+          </w:tcPr>
+          <w:p>
+            <w:r>
+              <w:rPr>
+                <w:rFonts w:ascii="Aptos" w:eastAsia="Aptos" w:hAnsi="Aptos" w:cs="Aptos"/>
+                <w:sz w:val="20"/>
+                <w:szCs w:val="20"/>
+              </w:rPr>
+              <w:t>On the Food Items form, enter name Water, enter a price of 0 and category Drinks, then press Add</w:t>
+            </w:r>
+          </w:p>
+        </w:tc>
+        <w:tc>
+          <w:tcPr>
+            <w:tcW w:w="550" w:type="pct"/>
+            <w:tcMar>
+              <w:top w:w="30" w:type="dxa"/>
+              <w:left w:w="80" w:type="dxa"/>
+              <w:bottom w:w="30" w:type="dxa"/>
+              <w:right w:w="80" w:type="dxa"/>
+            </w:tcMar>
+          </w:tcPr>
+          <w:p>
+            <w:r>
+              <w:rPr>
+                <w:rFonts w:ascii="Aptos" w:eastAsia="Aptos" w:hAnsi="Aptos" w:cs="Aptos"/>
+                <w:sz w:val="20"/>
+                <w:szCs w:val="20"/>
+              </w:rPr>
+              <w:t>Erroneous</w:t>
+            </w:r>
+          </w:p>
+        </w:tc>
+        <w:tc>
+          <w:tcPr>
+            <w:tcW w:w="2300" w:type="pct"/>
+            <w:tcMar>
+              <w:top w:w="30" w:type="dxa"/>
+              <w:left w:w="80" w:type="dxa"/>
+              <w:bottom w:w="30" w:type="dxa"/>
+              <w:right w:w="80" w:type="dxa"/>
+            </w:tcMar>
+          </w:tcPr>
+          <w:p>
+            <w:r>
+              <w:rPr>
+                <w:rFonts w:ascii="Aptos" w:eastAsia="Aptos" w:hAnsi="Aptos" w:cs="Aptos"/>
+                <w:sz w:val="20"/>
+                <w:szCs w:val="20"/>
+              </w:rPr>
+              <w:t>The item is rejected and a message appears stating “Price must be greater than 0”.</w:t>
+            </w:r>
+          </w:p>
+        </w:tc>
+      </w:tr>
+      <w:tr>
+        <w:tblPrEx>
+          <w:tblCellMar>
+            <w:top w:w="0" w:type="dxa"/>
+            <w:bottom w:w="0" w:type="dxa"/>
+          </w:tblCellMar>
+        </w:tblPrEx>
+        <w:trPr>
+          <w:cantSplit/>
+        </w:trPr>
+        <w:tc>
+          <w:tcPr>
+            <w:tcW w:w="300" w:type="pct"/>
+            <w:tcMar>
+              <w:top w:w="30" w:type="dxa"/>
+              <w:left w:w="80" w:type="dxa"/>
+              <w:bottom w:w="30" w:type="dxa"/>
+              <w:right w:w="80" w:type="dxa"/>
+            </w:tcMar>
+          </w:tcPr>
+          <w:p>
+            <w:r>
+              <w:rPr>
+                <w:rFonts w:ascii="Aptos" w:eastAsia="Aptos" w:hAnsi="Aptos" w:cs="Aptos"/>
+                <w:sz w:val="20"/>
+                <w:szCs w:val="20"/>
+              </w:rPr>
+              <w:t>35</w:t>
+            </w:r>
+          </w:p>
+        </w:tc>
+        <w:tc>
+          <w:tcPr>
+            <w:tcW w:w="1850" w:type="pct"/>
+            <w:tcMar>
+              <w:top w:w="30" w:type="dxa"/>
+              <w:left w:w="80" w:type="dxa"/>
+              <w:bottom w:w="30" w:type="dxa"/>
+              <w:right w:w="80" w:type="dxa"/>
+            </w:tcMar>
+          </w:tcPr>
+          <w:p>
+            <w:r>
+              <w:rPr>
+                <w:rFonts w:ascii="Aptos" w:eastAsia="Aptos" w:hAnsi="Aptos" w:cs="Aptos"/>
+                <w:sz w:val="20"/>
+                <w:szCs w:val="20"/>
+              </w:rPr>
+              <w:t>Open the food order for John Smith's Inception booking, pick Large Popcorn, enter a quantity of 2 and press Add</w:t>
+            </w:r>
+          </w:p>
+        </w:tc>
+        <w:tc>
+          <w:tcPr>
+            <w:tcW w:w="550" w:type="pct"/>
+            <w:tcMar>
+              <w:top w:w="30" w:type="dxa"/>
+              <w:left w:w="80" w:type="dxa"/>
+              <w:bottom w:w="30" w:type="dxa"/>
+              <w:right w:w="80" w:type="dxa"/>
+            </w:tcMar>
+          </w:tcPr>
+          <w:p>
+            <w:r>
+              <w:rPr>
+                <w:rFonts w:ascii="Aptos" w:eastAsia="Aptos" w:hAnsi="Aptos" w:cs="Aptos"/>
+                <w:sz w:val="20"/>
+                <w:szCs w:val="20"/>
+              </w:rPr>
+              <w:t>Normal</w:t>
+            </w:r>
+          </w:p>
+        </w:tc>
+        <w:tc>
+          <w:tcPr>
+            <w:tcW w:w="2300" w:type="pct"/>
+            <w:tcMar>
+              <w:top w:w="30" w:type="dxa"/>
+              <w:left w:w="80" w:type="dxa"/>
+              <w:bottom w:w="30" w:type="dxa"/>
+              <w:right w:w="80" w:type="dxa"/>
+            </w:tcMar>
+          </w:tcPr>
+          <w:p>
+            <w:r>
+              <w:rPr>
+                <w:rFonts w:ascii="Aptos" w:eastAsia="Aptos" w:hAnsi="Aptos" w:cs="Aptos"/>
+                <w:sz w:val="20"/>
+                <w:szCs w:val="20"/>
+              </w:rPr>
+              <w:t>2 Large Popcorn are added to the order and the running total shows £9.00.</w:t>
+            </w:r>
+          </w:p>
+        </w:tc>
+      </w:tr>
+      <w:tr>
+        <w:tblPrEx>
+          <w:tblCellMar>
+            <w:top w:w="0" w:type="dxa"/>
+            <w:bottom w:w="0" w:type="dxa"/>
+          </w:tblCellMar>
+        </w:tblPrEx>
+        <w:trPr>
+          <w:cantSplit/>
+        </w:trPr>
+        <w:tc>
+          <w:tcPr>
+            <w:tcW w:w="300" w:type="pct"/>
+            <w:tcMar>
+              <w:top w:w="30" w:type="dxa"/>
+              <w:left w:w="80" w:type="dxa"/>
+              <w:bottom w:w="30" w:type="dxa"/>
+              <w:right w:w="80" w:type="dxa"/>
+            </w:tcMar>
+          </w:tcPr>
+          <w:p>
+            <w:r>
+              <w:rPr>
+                <w:rFonts w:ascii="Aptos" w:eastAsia="Aptos" w:hAnsi="Aptos" w:cs="Aptos"/>
+                <w:sz w:val="20"/>
+                <w:szCs w:val="20"/>
+              </w:rPr>
+              <w:t>36</w:t>
+            </w:r>
+          </w:p>
+        </w:tc>
+        <w:tc>
+          <w:tcPr>
+            <w:tcW w:w="1850" w:type="pct"/>
+            <w:tcMar>
+              <w:top w:w="30" w:type="dxa"/>
+              <w:left w:w="80" w:type="dxa"/>
+              <w:bottom w:w="30" w:type="dxa"/>
+              <w:right w:w="80" w:type="dxa"/>
+            </w:tcMar>
+          </w:tcPr>
+          <w:p>
+            <w:r>
+              <w:rPr>
+                <w:rFonts w:ascii="Aptos" w:eastAsia="Aptos" w:hAnsi="Aptos" w:cs="Aptos"/>
+                <w:sz w:val="20"/>
+                <w:szCs w:val="20"/>
+              </w:rPr>
+              <w:t>On the same order, pick Cola, enter a quantity of 1 and press Add</w:t>
+            </w:r>
+          </w:p>
+        </w:tc>
+        <w:tc>
+          <w:tcPr>
+            <w:tcW w:w="550" w:type="pct"/>
+            <w:tcMar>
+              <w:top w:w="30" w:type="dxa"/>
+              <w:left w:w="80" w:type="dxa"/>
+              <w:bottom w:w="30" w:type="dxa"/>
+              <w:right w:w="80" w:type="dxa"/>
+            </w:tcMar>
+          </w:tcPr>
+          <w:p>
+            <w:r>
+              <w:rPr>
+                <w:rFonts w:ascii="Aptos" w:eastAsia="Aptos" w:hAnsi="Aptos" w:cs="Aptos"/>
+                <w:sz w:val="20"/>
+                <w:szCs w:val="20"/>
+              </w:rPr>
+              <w:t>Normal</w:t>
+            </w:r>
+          </w:p>
+        </w:tc>
+        <w:tc>
+          <w:tcPr>
+            <w:tcW w:w="2300" w:type="pct"/>
+            <w:tcMar>
+              <w:top w:w="30" w:type="dxa"/>
+              <w:left w:w="80" w:type="dxa"/>
+              <w:bottom w:w="30" w:type="dxa"/>
+              <w:right w:w="80" w:type="dxa"/>
+            </w:tcMar>
+          </w:tcPr>
+          <w:p>
+            <w:r>
+              <w:rPr>
+                <w:rFonts w:ascii="Aptos" w:eastAsia="Aptos" w:hAnsi="Aptos" w:cs="Aptos"/>
+                <w:sz w:val="20"/>
+                <w:szCs w:val="20"/>
+              </w:rPr>
+              <w:t>1 Cola is added and the running total updates to £11.50.</w:t>
+            </w:r>
+          </w:p>
+        </w:tc>
+      </w:tr>
+      <w:tr>
+        <w:tblPrEx>
+          <w:tblCellMar>
+            <w:top w:w="0" w:type="dxa"/>
+            <w:bottom w:w="0" w:type="dxa"/>
+          </w:tblCellMar>
+        </w:tblPrEx>
+        <w:trPr>
+          <w:cantSplit/>
+        </w:trPr>
+        <w:tc>
+          <w:tcPr>
+            <w:tcW w:w="300" w:type="pct"/>
+            <w:tcMar>
+              <w:top w:w="30" w:type="dxa"/>
+              <w:left w:w="80" w:type="dxa"/>
+              <w:bottom w:w="30" w:type="dxa"/>
+              <w:right w:w="80" w:type="dxa"/>
+            </w:tcMar>
+          </w:tcPr>
+          <w:p>
+            <w:r>
+              <w:rPr>
+                <w:rFonts w:ascii="Aptos" w:eastAsia="Aptos" w:hAnsi="Aptos" w:cs="Aptos"/>
+                <w:sz w:val="20"/>
+                <w:szCs w:val="20"/>
+              </w:rPr>
+              <w:t>37</w:t>
+            </w:r>
+          </w:p>
+        </w:tc>
+        <w:tc>
+          <w:tcPr>
+            <w:tcW w:w="1850" w:type="pct"/>
+            <w:tcMar>
+              <w:top w:w="30" w:type="dxa"/>
+              <w:left w:w="80" w:type="dxa"/>
+              <w:bottom w:w="30" w:type="dxa"/>
+              <w:right w:w="80" w:type="dxa"/>
+            </w:tcMar>
+          </w:tcPr>
+          <w:p>
+            <w:r>
+              <w:rPr>
+                <w:rFonts w:ascii="Aptos" w:eastAsia="Aptos" w:hAnsi="Aptos" w:cs="Aptos"/>
+                <w:sz w:val="20"/>
+                <w:szCs w:val="20"/>
+              </w:rPr>
+              <w:t>On the same order, enter a quantity of 0 for a food item and press Add</w:t>
+            </w:r>
+          </w:p>
+        </w:tc>
+        <w:tc>
+          <w:tcPr>
+            <w:tcW w:w="550" w:type="pct"/>
+            <w:tcMar>
+              <w:top w:w="30" w:type="dxa"/>
+              <w:left w:w="80" w:type="dxa"/>
+              <w:bottom w:w="30" w:type="dxa"/>
+              <w:right w:w="80" w:type="dxa"/>
+            </w:tcMar>
+          </w:tcPr>
+          <w:p>
+            <w:r>
+              <w:rPr>
+                <w:rFonts w:ascii="Aptos" w:eastAsia="Aptos" w:hAnsi="Aptos" w:cs="Aptos"/>
+                <w:sz w:val="20"/>
+                <w:szCs w:val="20"/>
+              </w:rPr>
+              <w:t>Erroneous</w:t>
+            </w:r>
+          </w:p>
+        </w:tc>
+        <w:tc>
+          <w:tcPr>
+            <w:tcW w:w="2300" w:type="pct"/>
+            <w:tcMar>
+              <w:top w:w="30" w:type="dxa"/>
+              <w:left w:w="80" w:type="dxa"/>
+              <w:bottom w:w="30" w:type="dxa"/>
+              <w:right w:w="80" w:type="dxa"/>
+            </w:tcMar>
+          </w:tcPr>
+          <w:p>
+            <w:r>
+              <w:rPr>
+                <w:rFonts w:ascii="Aptos" w:eastAsia="Aptos" w:hAnsi="Aptos" w:cs="Aptos"/>
+                <w:sz w:val="20"/>
+                <w:szCs w:val="20"/>
+              </w:rPr>
+              <w:t>The item is rejected and a message appears stating “Enter a quantity of 1 or more”.</w:t>
+            </w:r>
+          </w:p>
+        </w:tc>
+      </w:tr>
+      <w:tr>
+        <w:tblPrEx>
+          <w:tblCellMar>
+            <w:top w:w="0" w:type="dxa"/>
+            <w:bottom w:w="0" w:type="dxa"/>
+          </w:tblCellMar>
+        </w:tblPrEx>
+        <w:trPr>
+          <w:cantSplit/>
+        </w:trPr>
+        <w:tc>
+          <w:tcPr>
+            <w:tcW w:w="300" w:type="pct"/>
+            <w:tcMar>
+              <w:top w:w="30" w:type="dxa"/>
+              <w:left w:w="80" w:type="dxa"/>
+              <w:bottom w:w="30" w:type="dxa"/>
+              <w:right w:w="80" w:type="dxa"/>
+            </w:tcMar>
+          </w:tcPr>
+          <w:p>
+            <w:r>
+              <w:rPr>
+                <w:rFonts w:ascii="Aptos" w:eastAsia="Aptos" w:hAnsi="Aptos" w:cs="Aptos"/>
+                <w:sz w:val="20"/>
+                <w:szCs w:val="20"/>
+              </w:rPr>
+              <w:t>38</w:t>
+            </w:r>
+          </w:p>
+        </w:tc>
+        <w:tc>
+          <w:tcPr>
+            <w:tcW w:w="1850" w:type="pct"/>
+            <w:tcMar>
+              <w:top w:w="30" w:type="dxa"/>
+              <w:left w:w="80" w:type="dxa"/>
+              <w:bottom w:w="30" w:type="dxa"/>
+              <w:right w:w="80" w:type="dxa"/>
+            </w:tcMar>
+          </w:tcPr>
+          <w:p>
+            <w:r>
+              <w:rPr>
+                <w:rFonts w:ascii="Aptos" w:eastAsia="Aptos" w:hAnsi="Aptos" w:cs="Aptos"/>
+                <w:sz w:val="20"/>
+                <w:szCs w:val="20"/>
+              </w:rPr>
+              <w:t>Select the Cola line in the order and press Remove</w:t>
+            </w:r>
+          </w:p>
+        </w:tc>
+        <w:tc>
+          <w:tcPr>
+            <w:tcW w:w="550" w:type="pct"/>
+            <w:tcMar>
+              <w:top w:w="30" w:type="dxa"/>
+              <w:left w:w="80" w:type="dxa"/>
+              <w:bottom w:w="30" w:type="dxa"/>
+              <w:right w:w="80" w:type="dxa"/>
+            </w:tcMar>
+          </w:tcPr>
+          <w:p>
+            <w:r>
+              <w:rPr>
+                <w:rFonts w:ascii="Aptos" w:eastAsia="Aptos" w:hAnsi="Aptos" w:cs="Aptos"/>
+                <w:sz w:val="20"/>
+                <w:szCs w:val="20"/>
+              </w:rPr>
+              <w:t>Normal</w:t>
+            </w:r>
+          </w:p>
+        </w:tc>
+        <w:tc>
+          <w:tcPr>
+            <w:tcW w:w="2300" w:type="pct"/>
+            <w:tcMar>
+              <w:top w:w="30" w:type="dxa"/>
+              <w:left w:w="80" w:type="dxa"/>
+              <w:bottom w:w="30" w:type="dxa"/>
+              <w:right w:w="80" w:type="dxa"/>
+            </w:tcMar>
+          </w:tcPr>
+          <w:p>
+            <w:r>
+              <w:rPr>
+                <w:rFonts w:ascii="Aptos" w:eastAsia="Aptos" w:hAnsi="Aptos" w:cs="Aptos"/>
+                <w:sz w:val="20"/>
+                <w:szCs w:val="20"/>
+              </w:rPr>
+              <w:t>The Cola is removed and the running total drops to £9.00, showing that items can be removed and the total recalculates.</w:t>
+            </w:r>
+          </w:p>
+        </w:tc>
+      </w:tr>
+      <w:tr>
+        <w:tblPrEx>
+          <w:tblCellMar>
+            <w:top w:w="0" w:type="dxa"/>
+            <w:bottom w:w="0" w:type="dxa"/>
+          </w:tblCellMar>
+        </w:tblPrEx>
+        <w:trPr>
+          <w:cantSplit/>
+        </w:trPr>
+        <w:tc>
+          <w:tcPr>
+            <w:tcW w:w="300" w:type="pct"/>
+            <w:tcMar>
+              <w:top w:w="30" w:type="dxa"/>
+              <w:left w:w="80" w:type="dxa"/>
+              <w:bottom w:w="30" w:type="dxa"/>
+              <w:right w:w="80" w:type="dxa"/>
+            </w:tcMar>
+          </w:tcPr>
+          <w:p>
+            <w:r>
+              <w:rPr>
+                <w:rFonts w:ascii="Aptos" w:eastAsia="Aptos" w:hAnsi="Aptos" w:cs="Aptos"/>
+                <w:sz w:val="20"/>
+                <w:szCs w:val="20"/>
+              </w:rPr>
+              <w:t>39</w:t>
+            </w:r>
+          </w:p>
+        </w:tc>
+        <w:tc>
+          <w:tcPr>
+            <w:tcW w:w="1850" w:type="pct"/>
+            <w:tcMar>
+              <w:top w:w="30" w:type="dxa"/>
+              <w:left w:w="80" w:type="dxa"/>
+              <w:bottom w:w="30" w:type="dxa"/>
+              <w:right w:w="80" w:type="dxa"/>
+            </w:tcMar>
+          </w:tcPr>
+          <w:p>
+            <w:r>
+              <w:rPr>
+                <w:rFonts w:ascii="Aptos" w:eastAsia="Aptos" w:hAnsi="Aptos" w:cs="Aptos"/>
+                <w:sz w:val="20"/>
+                <w:szCs w:val="20"/>
+              </w:rPr>
+              <w:t>Pick Cola again, enter a quantity of 1 and press Add to restore the order</w:t>
+            </w:r>
+          </w:p>
+        </w:tc>
+        <w:tc>
+          <w:tcPr>
+            <w:tcW w:w="550" w:type="pct"/>
+            <w:tcMar>
+              <w:top w:w="30" w:type="dxa"/>
+              <w:left w:w="80" w:type="dxa"/>
+              <w:bottom w:w="30" w:type="dxa"/>
+              <w:right w:w="80" w:type="dxa"/>
+            </w:tcMar>
+          </w:tcPr>
+          <w:p>
+            <w:r>
+              <w:rPr>
+                <w:rFonts w:ascii="Aptos" w:eastAsia="Aptos" w:hAnsi="Aptos" w:cs="Aptos"/>
+                <w:sz w:val="20"/>
+                <w:szCs w:val="20"/>
+              </w:rPr>
+              <w:t>Normal</w:t>
+            </w:r>
+          </w:p>
+        </w:tc>
+        <w:tc>
+          <w:tcPr>
+            <w:tcW w:w="2300" w:type="pct"/>
+            <w:tcMar>
+              <w:top w:w="30" w:type="dxa"/>
+              <w:left w:w="80" w:type="dxa"/>
+              <w:bottom w:w="30" w:type="dxa"/>
+              <w:right w:w="80" w:type="dxa"/>
+            </w:tcMar>
+          </w:tcPr>
+          <w:p>
+            <w:r>
+              <w:rPr>
+                <w:rFonts w:ascii="Aptos" w:eastAsia="Aptos" w:hAnsi="Aptos" w:cs="Aptos"/>
+                <w:sz w:val="20"/>
+                <w:szCs w:val="20"/>
+              </w:rPr>
+              <w:t>The Cola is added back and the running total returns to £11.50.</w:t>
             </w:r>
           </w:p>
         </w:tc>

</xml_diff>

<commit_message>
added test plan for objective 11: searching for a booking
</commit_message>
<xml_diff>
--- a/Testing.docx
+++ b/Testing.docx
@@ -5012,6 +5012,541 @@
                 <w:szCs w:val="20"/>
               </w:rPr>
               <w:t>The Cola is added back and the running total returns to £11.50.</w:t>
+            </w:r>
+          </w:p>
+        </w:tc>
+      </w:tr>
+    </w:tbl>
+    <w:p/>
+    <w:p>
+      <w:pPr>
+        <w:pStyle w:val="Heading3"/>
+      </w:pPr>
+      <w:r>
+        <w:rPr>
+          <w:rFonts w:ascii="Aptos Display" w:eastAsia="Aptos Display" w:hAnsi="Aptos Display" w:cs="Aptos Display"/>
+          <w:b/>
+          <w:bCs/>
+          <w:color w:val="000000"/>
+        </w:rPr>
+        <w:t>Objective 11: Searching for a Booking</w:t>
+      </w:r>
+    </w:p>
+    <w:p>
+      <w:r>
+        <w:rPr>
+          <w:rFonts w:ascii="Aptos" w:eastAsia="Aptos" w:hAnsi="Aptos" w:cs="Aptos"/>
+        </w:rPr>
+        <w:t>These tests check the search, using the bookings created earlier. Three Smith bookings were made, so a search for Smith should return exactly three.</w:t>
+      </w:r>
+    </w:p>
+    <w:tbl>
+      <w:tblPr>
+        <w:tblW w:w="5000" w:type="pct"/>
+        <w:tblBorders>
+          <w:top w:val="single" w:sz="4" w:space="0" w:color="808080"/>
+          <w:left w:val="single" w:sz="4" w:space="0" w:color="808080"/>
+          <w:bottom w:val="single" w:sz="4" w:space="0" w:color="808080"/>
+          <w:right w:val="single" w:sz="4" w:space="0" w:color="808080"/>
+          <w:insideH w:val="single" w:sz="4" w:space="0" w:color="808080"/>
+          <w:insideV w:val="single" w:sz="4" w:space="0" w:color="808080"/>
+        </w:tblBorders>
+        <w:tblCellMar>
+          <w:left w:w="10" w:type="dxa"/>
+          <w:right w:w="10" w:type="dxa"/>
+        </w:tblCellMar>
+        <w:tblLook w:val="0000" w:firstRow="0" w:lastRow="0" w:firstColumn="0" w:lastColumn="0" w:noHBand="0" w:noVBand="0"/>
+      </w:tblPr>
+      <w:tblGrid>
+        <w:gridCol w:w="554"/>
+        <w:gridCol w:w="3454"/>
+        <w:gridCol w:w="1047"/>
+        <w:gridCol w:w="4295"/>
+      </w:tblGrid>
+      <w:tr>
+        <w:tblPrEx>
+          <w:tblCellMar>
+            <w:top w:w="0" w:type="dxa"/>
+            <w:bottom w:w="0" w:type="dxa"/>
+          </w:tblCellMar>
+        </w:tblPrEx>
+        <w:trPr>
+          <w:cantSplit/>
+          <w:tblHeader/>
+        </w:trPr>
+        <w:tc>
+          <w:tcPr>
+            <w:tcW w:w="300" w:type="pct"/>
+            <w:shd w:val="clear" w:color="auto" w:fill="F2CEED" w:themeFill="accent5" w:themeFillTint="33"/>
+            <w:tcMar>
+              <w:top w:w="30" w:type="dxa"/>
+              <w:left w:w="80" w:type="dxa"/>
+              <w:bottom w:w="30" w:type="dxa"/>
+              <w:right w:w="80" w:type="dxa"/>
+            </w:tcMar>
+          </w:tcPr>
+          <w:p>
+            <w:r>
+              <w:rPr>
+                <w:rFonts w:ascii="Aptos" w:eastAsia="Aptos" w:hAnsi="Aptos" w:cs="Aptos"/>
+                <w:b/>
+                <w:bCs/>
+                <w:sz w:val="20"/>
+                <w:szCs w:val="20"/>
+              </w:rPr>
+              <w:t>No.</w:t>
+            </w:r>
+          </w:p>
+        </w:tc>
+        <w:tc>
+          <w:tcPr>
+            <w:tcW w:w="1850" w:type="pct"/>
+            <w:shd w:val="clear" w:color="auto" w:fill="F2CEED" w:themeFill="accent5" w:themeFillTint="33"/>
+            <w:tcMar>
+              <w:top w:w="30" w:type="dxa"/>
+              <w:left w:w="80" w:type="dxa"/>
+              <w:bottom w:w="30" w:type="dxa"/>
+              <w:right w:w="80" w:type="dxa"/>
+            </w:tcMar>
+          </w:tcPr>
+          <w:p>
+            <w:r>
+              <w:rPr>
+                <w:rFonts w:ascii="Aptos" w:eastAsia="Aptos" w:hAnsi="Aptos" w:cs="Aptos"/>
+                <w:b/>
+                <w:bCs/>
+                <w:sz w:val="20"/>
+                <w:szCs w:val="20"/>
+              </w:rPr>
+              <w:t>Test</w:t>
+            </w:r>
+          </w:p>
+        </w:tc>
+        <w:tc>
+          <w:tcPr>
+            <w:tcW w:w="550" w:type="pct"/>
+            <w:shd w:val="clear" w:color="auto" w:fill="F2CEED" w:themeFill="accent5" w:themeFillTint="33"/>
+            <w:tcMar>
+              <w:top w:w="30" w:type="dxa"/>
+              <w:left w:w="80" w:type="dxa"/>
+              <w:bottom w:w="30" w:type="dxa"/>
+              <w:right w:w="80" w:type="dxa"/>
+            </w:tcMar>
+          </w:tcPr>
+          <w:p>
+            <w:r>
+              <w:rPr>
+                <w:rFonts w:ascii="Aptos" w:eastAsia="Aptos" w:hAnsi="Aptos" w:cs="Aptos"/>
+                <w:b/>
+                <w:bCs/>
+                <w:sz w:val="20"/>
+                <w:szCs w:val="20"/>
+              </w:rPr>
+              <w:t>Type</w:t>
+            </w:r>
+          </w:p>
+        </w:tc>
+        <w:tc>
+          <w:tcPr>
+            <w:tcW w:w="2300" w:type="pct"/>
+            <w:shd w:val="clear" w:color="auto" w:fill="F2CEED" w:themeFill="accent5" w:themeFillTint="33"/>
+            <w:tcMar>
+              <w:top w:w="30" w:type="dxa"/>
+              <w:left w:w="80" w:type="dxa"/>
+              <w:bottom w:w="30" w:type="dxa"/>
+              <w:right w:w="80" w:type="dxa"/>
+            </w:tcMar>
+          </w:tcPr>
+          <w:p>
+            <w:r>
+              <w:rPr>
+                <w:rFonts w:ascii="Aptos" w:eastAsia="Aptos" w:hAnsi="Aptos" w:cs="Aptos"/>
+                <w:b/>
+                <w:bCs/>
+                <w:sz w:val="20"/>
+                <w:szCs w:val="20"/>
+              </w:rPr>
+              <w:t>Expected Result</w:t>
+            </w:r>
+          </w:p>
+        </w:tc>
+      </w:tr>
+      <w:tr>
+        <w:tblPrEx>
+          <w:tblCellMar>
+            <w:top w:w="0" w:type="dxa"/>
+            <w:bottom w:w="0" w:type="dxa"/>
+          </w:tblCellMar>
+        </w:tblPrEx>
+        <w:trPr>
+          <w:cantSplit/>
+        </w:trPr>
+        <w:tc>
+          <w:tcPr>
+            <w:tcW w:w="300" w:type="pct"/>
+            <w:tcMar>
+              <w:top w:w="30" w:type="dxa"/>
+              <w:left w:w="80" w:type="dxa"/>
+              <w:bottom w:w="30" w:type="dxa"/>
+              <w:right w:w="80" w:type="dxa"/>
+            </w:tcMar>
+          </w:tcPr>
+          <w:p>
+            <w:r>
+              <w:rPr>
+                <w:rFonts w:ascii="Aptos" w:eastAsia="Aptos" w:hAnsi="Aptos" w:cs="Aptos"/>
+                <w:sz w:val="20"/>
+                <w:szCs w:val="20"/>
+              </w:rPr>
+              <w:t>40</w:t>
+            </w:r>
+          </w:p>
+        </w:tc>
+        <w:tc>
+          <w:tcPr>
+            <w:tcW w:w="1850" w:type="pct"/>
+            <w:tcMar>
+              <w:top w:w="30" w:type="dxa"/>
+              <w:left w:w="80" w:type="dxa"/>
+              <w:bottom w:w="30" w:type="dxa"/>
+              <w:right w:w="80" w:type="dxa"/>
+            </w:tcMar>
+          </w:tcPr>
+          <w:p>
+            <w:r>
+              <w:rPr>
+                <w:rFonts w:ascii="Aptos" w:eastAsia="Aptos" w:hAnsi="Aptos" w:cs="Aptos"/>
+                <w:sz w:val="20"/>
+                <w:szCs w:val="20"/>
+              </w:rPr>
+              <w:t>On the Booking Search form, type Smith into the search box and press Search</w:t>
+            </w:r>
+          </w:p>
+        </w:tc>
+        <w:tc>
+          <w:tcPr>
+            <w:tcW w:w="550" w:type="pct"/>
+            <w:tcMar>
+              <w:top w:w="30" w:type="dxa"/>
+              <w:left w:w="80" w:type="dxa"/>
+              <w:bottom w:w="30" w:type="dxa"/>
+              <w:right w:w="80" w:type="dxa"/>
+            </w:tcMar>
+          </w:tcPr>
+          <w:p>
+            <w:r>
+              <w:rPr>
+                <w:rFonts w:ascii="Aptos" w:eastAsia="Aptos" w:hAnsi="Aptos" w:cs="Aptos"/>
+                <w:sz w:val="20"/>
+                <w:szCs w:val="20"/>
+              </w:rPr>
+              <w:t>Normal</w:t>
+            </w:r>
+          </w:p>
+        </w:tc>
+        <w:tc>
+          <w:tcPr>
+            <w:tcW w:w="2300" w:type="pct"/>
+            <w:tcMar>
+              <w:top w:w="30" w:type="dxa"/>
+              <w:left w:w="80" w:type="dxa"/>
+              <w:bottom w:w="30" w:type="dxa"/>
+              <w:right w:w="80" w:type="dxa"/>
+            </w:tcMar>
+          </w:tcPr>
+          <w:p>
+            <w:r>
+              <w:rPr>
+                <w:rFonts w:ascii="Aptos" w:eastAsia="Aptos" w:hAnsi="Aptos" w:cs="Aptos"/>
+                <w:sz w:val="20"/>
+                <w:szCs w:val="20"/>
+              </w:rPr>
+              <w:t>The grid shows 3 bookings, for John Smith, Sarah Smith and David Smith, because all three have the surname Smith.</w:t>
+            </w:r>
+          </w:p>
+        </w:tc>
+      </w:tr>
+      <w:tr>
+        <w:tblPrEx>
+          <w:tblCellMar>
+            <w:top w:w="0" w:type="dxa"/>
+            <w:bottom w:w="0" w:type="dxa"/>
+          </w:tblCellMar>
+        </w:tblPrEx>
+        <w:trPr>
+          <w:cantSplit/>
+        </w:trPr>
+        <w:tc>
+          <w:tcPr>
+            <w:tcW w:w="300" w:type="pct"/>
+            <w:tcMar>
+              <w:top w:w="30" w:type="dxa"/>
+              <w:left w:w="80" w:type="dxa"/>
+              <w:bottom w:w="30" w:type="dxa"/>
+              <w:right w:w="80" w:type="dxa"/>
+            </w:tcMar>
+          </w:tcPr>
+          <w:p>
+            <w:r>
+              <w:rPr>
+                <w:rFonts w:ascii="Aptos" w:eastAsia="Aptos" w:hAnsi="Aptos" w:cs="Aptos"/>
+                <w:sz w:val="20"/>
+                <w:szCs w:val="20"/>
+              </w:rPr>
+              <w:t>41</w:t>
+            </w:r>
+          </w:p>
+        </w:tc>
+        <w:tc>
+          <w:tcPr>
+            <w:tcW w:w="1850" w:type="pct"/>
+            <w:tcMar>
+              <w:top w:w="30" w:type="dxa"/>
+              <w:left w:w="80" w:type="dxa"/>
+              <w:bottom w:w="30" w:type="dxa"/>
+              <w:right w:w="80" w:type="dxa"/>
+            </w:tcMar>
+          </w:tcPr>
+          <w:p>
+            <w:r>
+              <w:rPr>
+                <w:rFonts w:ascii="Aptos" w:eastAsia="Aptos" w:hAnsi="Aptos" w:cs="Aptos"/>
+                <w:sz w:val="20"/>
+                <w:szCs w:val="20"/>
+              </w:rPr>
+              <w:t>Type Jones into the search box and press Search</w:t>
+            </w:r>
+          </w:p>
+        </w:tc>
+        <w:tc>
+          <w:tcPr>
+            <w:tcW w:w="550" w:type="pct"/>
+            <w:tcMar>
+              <w:top w:w="30" w:type="dxa"/>
+              <w:left w:w="80" w:type="dxa"/>
+              <w:bottom w:w="30" w:type="dxa"/>
+              <w:right w:w="80" w:type="dxa"/>
+            </w:tcMar>
+          </w:tcPr>
+          <w:p>
+            <w:r>
+              <w:rPr>
+                <w:rFonts w:ascii="Aptos" w:eastAsia="Aptos" w:hAnsi="Aptos" w:cs="Aptos"/>
+                <w:sz w:val="20"/>
+                <w:szCs w:val="20"/>
+              </w:rPr>
+              <w:t>Normal</w:t>
+            </w:r>
+          </w:p>
+        </w:tc>
+        <w:tc>
+          <w:tcPr>
+            <w:tcW w:w="2300" w:type="pct"/>
+            <w:tcMar>
+              <w:top w:w="30" w:type="dxa"/>
+              <w:left w:w="80" w:type="dxa"/>
+              <w:bottom w:w="30" w:type="dxa"/>
+              <w:right w:w="80" w:type="dxa"/>
+            </w:tcMar>
+          </w:tcPr>
+          <w:p>
+            <w:r>
+              <w:rPr>
+                <w:rFonts w:ascii="Aptos" w:eastAsia="Aptos" w:hAnsi="Aptos" w:cs="Aptos"/>
+                <w:sz w:val="20"/>
+                <w:szCs w:val="20"/>
+              </w:rPr>
+              <w:t>The grid shows 1 booking, for Emma Jones.</w:t>
+            </w:r>
+          </w:p>
+        </w:tc>
+      </w:tr>
+      <w:tr>
+        <w:tblPrEx>
+          <w:tblCellMar>
+            <w:top w:w="0" w:type="dxa"/>
+            <w:bottom w:w="0" w:type="dxa"/>
+          </w:tblCellMar>
+        </w:tblPrEx>
+        <w:trPr>
+          <w:cantSplit/>
+        </w:trPr>
+        <w:tc>
+          <w:tcPr>
+            <w:tcW w:w="300" w:type="pct"/>
+            <w:tcMar>
+              <w:top w:w="30" w:type="dxa"/>
+              <w:left w:w="80" w:type="dxa"/>
+              <w:bottom w:w="30" w:type="dxa"/>
+              <w:right w:w="80" w:type="dxa"/>
+            </w:tcMar>
+          </w:tcPr>
+          <w:p>
+            <w:r>
+              <w:rPr>
+                <w:rFonts w:ascii="Aptos" w:eastAsia="Aptos" w:hAnsi="Aptos" w:cs="Aptos"/>
+                <w:sz w:val="20"/>
+                <w:szCs w:val="20"/>
+              </w:rPr>
+              <w:t>42</w:t>
+            </w:r>
+          </w:p>
+        </w:tc>
+        <w:tc>
+          <w:tcPr>
+            <w:tcW w:w="1850" w:type="pct"/>
+            <w:tcMar>
+              <w:top w:w="30" w:type="dxa"/>
+              <w:left w:w="80" w:type="dxa"/>
+              <w:bottom w:w="30" w:type="dxa"/>
+              <w:right w:w="80" w:type="dxa"/>
+            </w:tcMar>
+          </w:tcPr>
+          <w:p>
+            <w:r>
+              <w:rPr>
+                <w:rFonts w:ascii="Aptos" w:eastAsia="Aptos" w:hAnsi="Aptos" w:cs="Aptos"/>
+                <w:sz w:val="20"/>
+                <w:szCs w:val="20"/>
+              </w:rPr>
+              <w:t>Type the booking id of John Smith's booking (a number) into the search box and press Search</w:t>
+            </w:r>
+          </w:p>
+        </w:tc>
+        <w:tc>
+          <w:tcPr>
+            <w:tcW w:w="550" w:type="pct"/>
+            <w:tcMar>
+              <w:top w:w="30" w:type="dxa"/>
+              <w:left w:w="80" w:type="dxa"/>
+              <w:bottom w:w="30" w:type="dxa"/>
+              <w:right w:w="80" w:type="dxa"/>
+            </w:tcMar>
+          </w:tcPr>
+          <w:p>
+            <w:r>
+              <w:rPr>
+                <w:rFonts w:ascii="Aptos" w:eastAsia="Aptos" w:hAnsi="Aptos" w:cs="Aptos"/>
+                <w:sz w:val="20"/>
+                <w:szCs w:val="20"/>
+              </w:rPr>
+              <w:t>Normal</w:t>
+            </w:r>
+          </w:p>
+        </w:tc>
+        <w:tc>
+          <w:tcPr>
+            <w:tcW w:w="2300" w:type="pct"/>
+            <w:tcMar>
+              <w:top w:w="30" w:type="dxa"/>
+              <w:left w:w="80" w:type="dxa"/>
+              <w:bottom w:w="30" w:type="dxa"/>
+              <w:right w:w="80" w:type="dxa"/>
+            </w:tcMar>
+          </w:tcPr>
+          <w:p>
+            <w:r>
+              <w:rPr>
+                <w:rFonts w:ascii="Aptos" w:eastAsia="Aptos" w:hAnsi="Aptos" w:cs="Aptos"/>
+                <w:sz w:val="20"/>
+                <w:szCs w:val="20"/>
+              </w:rPr>
+              <w:t>The grid shows only that one booking, because a numeric search matches the booking id exactly rather than searching by name.</w:t>
+            </w:r>
+          </w:p>
+        </w:tc>
+      </w:tr>
+      <w:tr>
+        <w:tblPrEx>
+          <w:tblCellMar>
+            <w:top w:w="0" w:type="dxa"/>
+            <w:bottom w:w="0" w:type="dxa"/>
+          </w:tblCellMar>
+        </w:tblPrEx>
+        <w:trPr>
+          <w:cantSplit/>
+        </w:trPr>
+        <w:tc>
+          <w:tcPr>
+            <w:tcW w:w="300" w:type="pct"/>
+            <w:tcMar>
+              <w:top w:w="30" w:type="dxa"/>
+              <w:left w:w="80" w:type="dxa"/>
+              <w:bottom w:w="30" w:type="dxa"/>
+              <w:right w:w="80" w:type="dxa"/>
+            </w:tcMar>
+          </w:tcPr>
+          <w:p>
+            <w:r>
+              <w:rPr>
+                <w:rFonts w:ascii="Aptos" w:eastAsia="Aptos" w:hAnsi="Aptos" w:cs="Aptos"/>
+                <w:sz w:val="20"/>
+                <w:szCs w:val="20"/>
+              </w:rPr>
+              <w:t>43</w:t>
+            </w:r>
+          </w:p>
+        </w:tc>
+        <w:tc>
+          <w:tcPr>
+            <w:tcW w:w="1850" w:type="pct"/>
+            <w:tcMar>
+              <w:top w:w="30" w:type="dxa"/>
+              <w:left w:w="80" w:type="dxa"/>
+              <w:bottom w:w="30" w:type="dxa"/>
+              <w:right w:w="80" w:type="dxa"/>
+            </w:tcMar>
+          </w:tcPr>
+          <w:p>
+            <w:r>
+              <w:rPr>
+                <w:rFonts w:ascii="Aptos" w:eastAsia="Aptos" w:hAnsi="Aptos" w:cs="Aptos"/>
+                <w:sz w:val="20"/>
+                <w:szCs w:val="20"/>
+              </w:rPr>
+              <w:t>Type Xanadu into the search box and press Search</w:t>
+            </w:r>
+          </w:p>
+        </w:tc>
+        <w:tc>
+          <w:tcPr>
+            <w:tcW w:w="550" w:type="pct"/>
+            <w:tcMar>
+              <w:top w:w="30" w:type="dxa"/>
+              <w:left w:w="80" w:type="dxa"/>
+              <w:bottom w:w="30" w:type="dxa"/>
+              <w:right w:w="80" w:type="dxa"/>
+            </w:tcMar>
+          </w:tcPr>
+          <w:p>
+            <w:r>
+              <w:rPr>
+                <w:rFonts w:ascii="Aptos" w:eastAsia="Aptos" w:hAnsi="Aptos" w:cs="Aptos"/>
+                <w:sz w:val="20"/>
+                <w:szCs w:val="20"/>
+              </w:rPr>
+              <w:t>Erroneous</w:t>
+            </w:r>
+          </w:p>
+        </w:tc>
+        <w:tc>
+          <w:tcPr>
+            <w:tcW w:w="2300" w:type="pct"/>
+            <w:tcMar>
+              <w:top w:w="30" w:type="dxa"/>
+              <w:left w:w="80" w:type="dxa"/>
+              <w:bottom w:w="30" w:type="dxa"/>
+              <w:right w:w="80" w:type="dxa"/>
+            </w:tcMar>
+          </w:tcPr>
+          <w:p>
+            <w:r>
+              <w:rPr>
+                <w:rFonts w:ascii="Aptos" w:eastAsia="Aptos" w:hAnsi="Aptos" w:cs="Aptos"/>
+                <w:sz w:val="20"/>
+                <w:szCs w:val="20"/>
+              </w:rPr>
+              <w:t>The grid shows no bookings, because there is no customer whose name contains Xanadu.</w:t>
             </w:r>
           </w:p>
         </w:tc>

</xml_diff>

<commit_message>
added test plan for objective 9: viewing the booking register
</commit_message>
<xml_diff>
--- a/Testing.docx
+++ b/Testing.docx
@@ -5547,6 +5547,541 @@
                 <w:szCs w:val="20"/>
               </w:rPr>
               <w:t>The grid shows no bookings, because there is no customer whose name contains Xanadu.</w:t>
+            </w:r>
+          </w:p>
+        </w:tc>
+      </w:tr>
+    </w:tbl>
+    <w:p/>
+    <w:p>
+      <w:pPr>
+        <w:pStyle w:val="Heading3"/>
+      </w:pPr>
+      <w:r>
+        <w:rPr>
+          <w:rFonts w:ascii="Aptos Display" w:eastAsia="Aptos Display" w:hAnsi="Aptos Display" w:cs="Aptos Display"/>
+          <w:b/>
+          <w:bCs/>
+          <w:color w:val="000000"/>
+        </w:rPr>
+        <w:t>Objective 9: Viewing the Booking Register</w:t>
+      </w:r>
+    </w:p>
+    <w:p>
+      <w:r>
+        <w:rPr>
+          <w:rFonts w:ascii="Aptos" w:eastAsia="Aptos" w:hAnsi="Aptos" w:cs="Aptos"/>
+        </w:rPr>
+        <w:t>These tests check the register for a screening and its export. They are run before any booking is cancelled, so all of the Inception bookings are still present.</w:t>
+      </w:r>
+    </w:p>
+    <w:tbl>
+      <w:tblPr>
+        <w:tblW w:w="5000" w:type="pct"/>
+        <w:tblBorders>
+          <w:top w:val="single" w:sz="4" w:space="0" w:color="808080"/>
+          <w:left w:val="single" w:sz="4" w:space="0" w:color="808080"/>
+          <w:bottom w:val="single" w:sz="4" w:space="0" w:color="808080"/>
+          <w:right w:val="single" w:sz="4" w:space="0" w:color="808080"/>
+          <w:insideH w:val="single" w:sz="4" w:space="0" w:color="808080"/>
+          <w:insideV w:val="single" w:sz="4" w:space="0" w:color="808080"/>
+        </w:tblBorders>
+        <w:tblCellMar>
+          <w:left w:w="10" w:type="dxa"/>
+          <w:right w:w="10" w:type="dxa"/>
+        </w:tblCellMar>
+        <w:tblLook w:val="0000" w:firstRow="0" w:lastRow="0" w:firstColumn="0" w:lastColumn="0" w:noHBand="0" w:noVBand="0"/>
+      </w:tblPr>
+      <w:tblGrid>
+        <w:gridCol w:w="554"/>
+        <w:gridCol w:w="3454"/>
+        <w:gridCol w:w="1047"/>
+        <w:gridCol w:w="4295"/>
+      </w:tblGrid>
+      <w:tr>
+        <w:tblPrEx>
+          <w:tblCellMar>
+            <w:top w:w="0" w:type="dxa"/>
+            <w:bottom w:w="0" w:type="dxa"/>
+          </w:tblCellMar>
+        </w:tblPrEx>
+        <w:trPr>
+          <w:cantSplit/>
+          <w:tblHeader/>
+        </w:trPr>
+        <w:tc>
+          <w:tcPr>
+            <w:tcW w:w="300" w:type="pct"/>
+            <w:shd w:val="clear" w:color="auto" w:fill="F2CEED" w:themeFill="accent5" w:themeFillTint="33"/>
+            <w:tcMar>
+              <w:top w:w="30" w:type="dxa"/>
+              <w:left w:w="80" w:type="dxa"/>
+              <w:bottom w:w="30" w:type="dxa"/>
+              <w:right w:w="80" w:type="dxa"/>
+            </w:tcMar>
+          </w:tcPr>
+          <w:p>
+            <w:r>
+              <w:rPr>
+                <w:rFonts w:ascii="Aptos" w:eastAsia="Aptos" w:hAnsi="Aptos" w:cs="Aptos"/>
+                <w:b/>
+                <w:bCs/>
+                <w:sz w:val="20"/>
+                <w:szCs w:val="20"/>
+              </w:rPr>
+              <w:t>No.</w:t>
+            </w:r>
+          </w:p>
+        </w:tc>
+        <w:tc>
+          <w:tcPr>
+            <w:tcW w:w="1850" w:type="pct"/>
+            <w:shd w:val="clear" w:color="auto" w:fill="F2CEED" w:themeFill="accent5" w:themeFillTint="33"/>
+            <w:tcMar>
+              <w:top w:w="30" w:type="dxa"/>
+              <w:left w:w="80" w:type="dxa"/>
+              <w:bottom w:w="30" w:type="dxa"/>
+              <w:right w:w="80" w:type="dxa"/>
+            </w:tcMar>
+          </w:tcPr>
+          <w:p>
+            <w:r>
+              <w:rPr>
+                <w:rFonts w:ascii="Aptos" w:eastAsia="Aptos" w:hAnsi="Aptos" w:cs="Aptos"/>
+                <w:b/>
+                <w:bCs/>
+                <w:sz w:val="20"/>
+                <w:szCs w:val="20"/>
+              </w:rPr>
+              <w:t>Test</w:t>
+            </w:r>
+          </w:p>
+        </w:tc>
+        <w:tc>
+          <w:tcPr>
+            <w:tcW w:w="550" w:type="pct"/>
+            <w:shd w:val="clear" w:color="auto" w:fill="F2CEED" w:themeFill="accent5" w:themeFillTint="33"/>
+            <w:tcMar>
+              <w:top w:w="30" w:type="dxa"/>
+              <w:left w:w="80" w:type="dxa"/>
+              <w:bottom w:w="30" w:type="dxa"/>
+              <w:right w:w="80" w:type="dxa"/>
+            </w:tcMar>
+          </w:tcPr>
+          <w:p>
+            <w:r>
+              <w:rPr>
+                <w:rFonts w:ascii="Aptos" w:eastAsia="Aptos" w:hAnsi="Aptos" w:cs="Aptos"/>
+                <w:b/>
+                <w:bCs/>
+                <w:sz w:val="20"/>
+                <w:szCs w:val="20"/>
+              </w:rPr>
+              <w:t>Type</w:t>
+            </w:r>
+          </w:p>
+        </w:tc>
+        <w:tc>
+          <w:tcPr>
+            <w:tcW w:w="2300" w:type="pct"/>
+            <w:shd w:val="clear" w:color="auto" w:fill="F2CEED" w:themeFill="accent5" w:themeFillTint="33"/>
+            <w:tcMar>
+              <w:top w:w="30" w:type="dxa"/>
+              <w:left w:w="80" w:type="dxa"/>
+              <w:bottom w:w="30" w:type="dxa"/>
+              <w:right w:w="80" w:type="dxa"/>
+            </w:tcMar>
+          </w:tcPr>
+          <w:p>
+            <w:r>
+              <w:rPr>
+                <w:rFonts w:ascii="Aptos" w:eastAsia="Aptos" w:hAnsi="Aptos" w:cs="Aptos"/>
+                <w:b/>
+                <w:bCs/>
+                <w:sz w:val="20"/>
+                <w:szCs w:val="20"/>
+              </w:rPr>
+              <w:t>Expected Result</w:t>
+            </w:r>
+          </w:p>
+        </w:tc>
+      </w:tr>
+      <w:tr>
+        <w:tblPrEx>
+          <w:tblCellMar>
+            <w:top w:w="0" w:type="dxa"/>
+            <w:bottom w:w="0" w:type="dxa"/>
+          </w:tblCellMar>
+        </w:tblPrEx>
+        <w:trPr>
+          <w:cantSplit/>
+        </w:trPr>
+        <w:tc>
+          <w:tcPr>
+            <w:tcW w:w="300" w:type="pct"/>
+            <w:tcMar>
+              <w:top w:w="30" w:type="dxa"/>
+              <w:left w:w="80" w:type="dxa"/>
+              <w:bottom w:w="30" w:type="dxa"/>
+              <w:right w:w="80" w:type="dxa"/>
+            </w:tcMar>
+          </w:tcPr>
+          <w:p>
+            <w:r>
+              <w:rPr>
+                <w:rFonts w:ascii="Aptos" w:eastAsia="Aptos" w:hAnsi="Aptos" w:cs="Aptos"/>
+                <w:sz w:val="20"/>
+                <w:szCs w:val="20"/>
+              </w:rPr>
+              <w:t>44</w:t>
+            </w:r>
+          </w:p>
+        </w:tc>
+        <w:tc>
+          <w:tcPr>
+            <w:tcW w:w="1850" w:type="pct"/>
+            <w:tcMar>
+              <w:top w:w="30" w:type="dxa"/>
+              <w:left w:w="80" w:type="dxa"/>
+              <w:bottom w:w="30" w:type="dxa"/>
+              <w:right w:w="80" w:type="dxa"/>
+            </w:tcMar>
+          </w:tcPr>
+          <w:p>
+            <w:r>
+              <w:rPr>
+                <w:rFonts w:ascii="Aptos" w:eastAsia="Aptos" w:hAnsi="Aptos" w:cs="Aptos"/>
+                <w:sz w:val="20"/>
+                <w:szCs w:val="20"/>
+              </w:rPr>
+              <w:t>In the register section, pick the Inception screening and press Load Register</w:t>
+            </w:r>
+          </w:p>
+        </w:tc>
+        <w:tc>
+          <w:tcPr>
+            <w:tcW w:w="550" w:type="pct"/>
+            <w:tcMar>
+              <w:top w:w="30" w:type="dxa"/>
+              <w:left w:w="80" w:type="dxa"/>
+              <w:bottom w:w="30" w:type="dxa"/>
+              <w:right w:w="80" w:type="dxa"/>
+            </w:tcMar>
+          </w:tcPr>
+          <w:p>
+            <w:r>
+              <w:rPr>
+                <w:rFonts w:ascii="Aptos" w:eastAsia="Aptos" w:hAnsi="Aptos" w:cs="Aptos"/>
+                <w:sz w:val="20"/>
+                <w:szCs w:val="20"/>
+              </w:rPr>
+              <w:t>Normal</w:t>
+            </w:r>
+          </w:p>
+        </w:tc>
+        <w:tc>
+          <w:tcPr>
+            <w:tcW w:w="2300" w:type="pct"/>
+            <w:tcMar>
+              <w:top w:w="30" w:type="dxa"/>
+              <w:left w:w="80" w:type="dxa"/>
+              <w:bottom w:w="30" w:type="dxa"/>
+              <w:right w:w="80" w:type="dxa"/>
+            </w:tcMar>
+          </w:tcPr>
+          <w:p>
+            <w:r>
+              <w:rPr>
+                <w:rFonts w:ascii="Aptos" w:eastAsia="Aptos" w:hAnsi="Aptos" w:cs="Aptos"/>
+                <w:sz w:val="20"/>
+                <w:szCs w:val="20"/>
+              </w:rPr>
+              <w:t>The register grid shows 4 rows: John Smith in seats A1 and A2 (2 tickets), Sarah Smith in seat B1 (1 ticket) and David Smith in seat B2 (1 ticket).</w:t>
+            </w:r>
+          </w:p>
+        </w:tc>
+      </w:tr>
+      <w:tr>
+        <w:tblPrEx>
+          <w:tblCellMar>
+            <w:top w:w="0" w:type="dxa"/>
+            <w:bottom w:w="0" w:type="dxa"/>
+          </w:tblCellMar>
+        </w:tblPrEx>
+        <w:trPr>
+          <w:cantSplit/>
+        </w:trPr>
+        <w:tc>
+          <w:tcPr>
+            <w:tcW w:w="300" w:type="pct"/>
+            <w:tcMar>
+              <w:top w:w="30" w:type="dxa"/>
+              <w:left w:w="80" w:type="dxa"/>
+              <w:bottom w:w="30" w:type="dxa"/>
+              <w:right w:w="80" w:type="dxa"/>
+            </w:tcMar>
+          </w:tcPr>
+          <w:p>
+            <w:r>
+              <w:rPr>
+                <w:rFonts w:ascii="Aptos" w:eastAsia="Aptos" w:hAnsi="Aptos" w:cs="Aptos"/>
+                <w:sz w:val="20"/>
+                <w:szCs w:val="20"/>
+              </w:rPr>
+              <w:t>45</w:t>
+            </w:r>
+          </w:p>
+        </w:tc>
+        <w:tc>
+          <w:tcPr>
+            <w:tcW w:w="1850" w:type="pct"/>
+            <w:tcMar>
+              <w:top w:w="30" w:type="dxa"/>
+              <w:left w:w="80" w:type="dxa"/>
+              <w:bottom w:w="30" w:type="dxa"/>
+              <w:right w:w="80" w:type="dxa"/>
+            </w:tcMar>
+          </w:tcPr>
+          <w:p>
+            <w:r>
+              <w:rPr>
+                <w:rFonts w:ascii="Aptos" w:eastAsia="Aptos" w:hAnsi="Aptos" w:cs="Aptos"/>
+                <w:sz w:val="20"/>
+                <w:szCs w:val="20"/>
+              </w:rPr>
+              <w:t>Without picking a screening, press Load Register</w:t>
+            </w:r>
+          </w:p>
+        </w:tc>
+        <w:tc>
+          <w:tcPr>
+            <w:tcW w:w="550" w:type="pct"/>
+            <w:tcMar>
+              <w:top w:w="30" w:type="dxa"/>
+              <w:left w:w="80" w:type="dxa"/>
+              <w:bottom w:w="30" w:type="dxa"/>
+              <w:right w:w="80" w:type="dxa"/>
+            </w:tcMar>
+          </w:tcPr>
+          <w:p>
+            <w:r>
+              <w:rPr>
+                <w:rFonts w:ascii="Aptos" w:eastAsia="Aptos" w:hAnsi="Aptos" w:cs="Aptos"/>
+                <w:sz w:val="20"/>
+                <w:szCs w:val="20"/>
+              </w:rPr>
+              <w:t>Erroneous</w:t>
+            </w:r>
+          </w:p>
+        </w:tc>
+        <w:tc>
+          <w:tcPr>
+            <w:tcW w:w="2300" w:type="pct"/>
+            <w:tcMar>
+              <w:top w:w="30" w:type="dxa"/>
+              <w:left w:w="80" w:type="dxa"/>
+              <w:bottom w:w="30" w:type="dxa"/>
+              <w:right w:w="80" w:type="dxa"/>
+            </w:tcMar>
+          </w:tcPr>
+          <w:p>
+            <w:r>
+              <w:rPr>
+                <w:rFonts w:ascii="Aptos" w:eastAsia="Aptos" w:hAnsi="Aptos" w:cs="Aptos"/>
+                <w:sz w:val="20"/>
+                <w:szCs w:val="20"/>
+              </w:rPr>
+              <w:t>The register is not loaded and a message appears stating “Select a screening first”.</w:t>
+            </w:r>
+          </w:p>
+        </w:tc>
+      </w:tr>
+      <w:tr>
+        <w:tblPrEx>
+          <w:tblCellMar>
+            <w:top w:w="0" w:type="dxa"/>
+            <w:bottom w:w="0" w:type="dxa"/>
+          </w:tblCellMar>
+        </w:tblPrEx>
+        <w:trPr>
+          <w:cantSplit/>
+        </w:trPr>
+        <w:tc>
+          <w:tcPr>
+            <w:tcW w:w="300" w:type="pct"/>
+            <w:tcMar>
+              <w:top w:w="30" w:type="dxa"/>
+              <w:left w:w="80" w:type="dxa"/>
+              <w:bottom w:w="30" w:type="dxa"/>
+              <w:right w:w="80" w:type="dxa"/>
+            </w:tcMar>
+          </w:tcPr>
+          <w:p>
+            <w:r>
+              <w:rPr>
+                <w:rFonts w:ascii="Aptos" w:eastAsia="Aptos" w:hAnsi="Aptos" w:cs="Aptos"/>
+                <w:sz w:val="20"/>
+                <w:szCs w:val="20"/>
+              </w:rPr>
+              <w:t>46</w:t>
+            </w:r>
+          </w:p>
+        </w:tc>
+        <w:tc>
+          <w:tcPr>
+            <w:tcW w:w="1850" w:type="pct"/>
+            <w:tcMar>
+              <w:top w:w="30" w:type="dxa"/>
+              <w:left w:w="80" w:type="dxa"/>
+              <w:bottom w:w="30" w:type="dxa"/>
+              <w:right w:w="80" w:type="dxa"/>
+            </w:tcMar>
+          </w:tcPr>
+          <w:p>
+            <w:r>
+              <w:rPr>
+                <w:rFonts w:ascii="Aptos" w:eastAsia="Aptos" w:hAnsi="Aptos" w:cs="Aptos"/>
+                <w:sz w:val="20"/>
+                <w:szCs w:val="20"/>
+              </w:rPr>
+              <w:t>With the Inception register loaded, press Export Register and save the file</w:t>
+            </w:r>
+          </w:p>
+        </w:tc>
+        <w:tc>
+          <w:tcPr>
+            <w:tcW w:w="550" w:type="pct"/>
+            <w:tcMar>
+              <w:top w:w="30" w:type="dxa"/>
+              <w:left w:w="80" w:type="dxa"/>
+              <w:bottom w:w="30" w:type="dxa"/>
+              <w:right w:w="80" w:type="dxa"/>
+            </w:tcMar>
+          </w:tcPr>
+          <w:p>
+            <w:r>
+              <w:rPr>
+                <w:rFonts w:ascii="Aptos" w:eastAsia="Aptos" w:hAnsi="Aptos" w:cs="Aptos"/>
+                <w:sz w:val="20"/>
+                <w:szCs w:val="20"/>
+              </w:rPr>
+              <w:t>Normal</w:t>
+            </w:r>
+          </w:p>
+        </w:tc>
+        <w:tc>
+          <w:tcPr>
+            <w:tcW w:w="2300" w:type="pct"/>
+            <w:tcMar>
+              <w:top w:w="30" w:type="dxa"/>
+              <w:left w:w="80" w:type="dxa"/>
+              <w:bottom w:w="30" w:type="dxa"/>
+              <w:right w:w="80" w:type="dxa"/>
+            </w:tcMar>
+          </w:tcPr>
+          <w:p>
+            <w:r>
+              <w:rPr>
+                <w:rFonts w:ascii="Aptos" w:eastAsia="Aptos" w:hAnsi="Aptos" w:cs="Aptos"/>
+                <w:sz w:val="20"/>
+                <w:szCs w:val="20"/>
+              </w:rPr>
+              <w:t>A CSV file is created containing the header Customer Name, Seat, Tickets followed by one row for each seat on the register.</w:t>
+            </w:r>
+          </w:p>
+        </w:tc>
+      </w:tr>
+      <w:tr>
+        <w:tblPrEx>
+          <w:tblCellMar>
+            <w:top w:w="0" w:type="dxa"/>
+            <w:bottom w:w="0" w:type="dxa"/>
+          </w:tblCellMar>
+        </w:tblPrEx>
+        <w:trPr>
+          <w:cantSplit/>
+        </w:trPr>
+        <w:tc>
+          <w:tcPr>
+            <w:tcW w:w="300" w:type="pct"/>
+            <w:tcMar>
+              <w:top w:w="30" w:type="dxa"/>
+              <w:left w:w="80" w:type="dxa"/>
+              <w:bottom w:w="30" w:type="dxa"/>
+              <w:right w:w="80" w:type="dxa"/>
+            </w:tcMar>
+          </w:tcPr>
+          <w:p>
+            <w:r>
+              <w:rPr>
+                <w:rFonts w:ascii="Aptos" w:eastAsia="Aptos" w:hAnsi="Aptos" w:cs="Aptos"/>
+                <w:sz w:val="20"/>
+                <w:szCs w:val="20"/>
+              </w:rPr>
+              <w:t>47</w:t>
+            </w:r>
+          </w:p>
+        </w:tc>
+        <w:tc>
+          <w:tcPr>
+            <w:tcW w:w="1850" w:type="pct"/>
+            <w:tcMar>
+              <w:top w:w="30" w:type="dxa"/>
+              <w:left w:w="80" w:type="dxa"/>
+              <w:bottom w:w="30" w:type="dxa"/>
+              <w:right w:w="80" w:type="dxa"/>
+            </w:tcMar>
+          </w:tcPr>
+          <w:p>
+            <w:r>
+              <w:rPr>
+                <w:rFonts w:ascii="Aptos" w:eastAsia="Aptos" w:hAnsi="Aptos" w:cs="Aptos"/>
+                <w:sz w:val="20"/>
+                <w:szCs w:val="20"/>
+              </w:rPr>
+              <w:t>Without loading a register first, press Export Register</w:t>
+            </w:r>
+          </w:p>
+        </w:tc>
+        <w:tc>
+          <w:tcPr>
+            <w:tcW w:w="550" w:type="pct"/>
+            <w:tcMar>
+              <w:top w:w="30" w:type="dxa"/>
+              <w:left w:w="80" w:type="dxa"/>
+              <w:bottom w:w="30" w:type="dxa"/>
+              <w:right w:w="80" w:type="dxa"/>
+            </w:tcMar>
+          </w:tcPr>
+          <w:p>
+            <w:r>
+              <w:rPr>
+                <w:rFonts w:ascii="Aptos" w:eastAsia="Aptos" w:hAnsi="Aptos" w:cs="Aptos"/>
+                <w:sz w:val="20"/>
+                <w:szCs w:val="20"/>
+              </w:rPr>
+              <w:t>Erroneous</w:t>
+            </w:r>
+          </w:p>
+        </w:tc>
+        <w:tc>
+          <w:tcPr>
+            <w:tcW w:w="2300" w:type="pct"/>
+            <w:tcMar>
+              <w:top w:w="30" w:type="dxa"/>
+              <w:left w:w="80" w:type="dxa"/>
+              <w:bottom w:w="30" w:type="dxa"/>
+              <w:right w:w="80" w:type="dxa"/>
+            </w:tcMar>
+          </w:tcPr>
+          <w:p>
+            <w:r>
+              <w:rPr>
+                <w:rFonts w:ascii="Aptos" w:eastAsia="Aptos" w:hAnsi="Aptos" w:cs="Aptos"/>
+                <w:sz w:val="20"/>
+                <w:szCs w:val="20"/>
+              </w:rPr>
+              <w:t>The file is not created and a message appears stating “Load a register first”.</w:t>
             </w:r>
           </w:p>
         </w:tc>

</xml_diff>

<commit_message>
added test plan for objective 8: viewing a sales report
</commit_message>
<xml_diff>
--- a/Testing.docx
+++ b/Testing.docx
@@ -5629,6 +5629,7 @@
                 <w:sz w:val="20"/>
                 <w:szCs w:val="20"/>
               </w:rPr>
+              <w:lastRenderedPageBreak/>
               <w:t>No.</w:t>
             </w:r>
           </w:p>
@@ -6082,6 +6083,464 @@
                 <w:szCs w:val="20"/>
               </w:rPr>
               <w:t>The file is not created and a message appears stating “Load a register first”.</w:t>
+            </w:r>
+          </w:p>
+        </w:tc>
+      </w:tr>
+    </w:tbl>
+    <w:p/>
+    <w:p>
+      <w:pPr>
+        <w:pStyle w:val="Heading3"/>
+      </w:pPr>
+      <w:r>
+        <w:rPr>
+          <w:rFonts w:ascii="Aptos Display" w:eastAsia="Aptos Display" w:hAnsi="Aptos Display" w:cs="Aptos Display"/>
+          <w:b/>
+          <w:bCs/>
+          <w:color w:val="000000"/>
+        </w:rPr>
+        <w:t>Objective 8: Viewing a Sales Report</w:t>
+      </w:r>
+    </w:p>
+    <w:p>
+      <w:r>
+        <w:rPr>
+          <w:rFonts w:ascii="Aptos" w:eastAsia="Aptos" w:hAnsi="Aptos" w:cs="Aptos"/>
+        </w:rPr>
+        <w:t>These tests check the sales report over the bookings and food order created so far, before any cancellation.</w:t>
+      </w:r>
+    </w:p>
+    <w:tbl>
+      <w:tblPr>
+        <w:tblW w:w="5000" w:type="pct"/>
+        <w:tblBorders>
+          <w:top w:val="single" w:sz="4" w:space="0" w:color="808080"/>
+          <w:left w:val="single" w:sz="4" w:space="0" w:color="808080"/>
+          <w:bottom w:val="single" w:sz="4" w:space="0" w:color="808080"/>
+          <w:right w:val="single" w:sz="4" w:space="0" w:color="808080"/>
+          <w:insideH w:val="single" w:sz="4" w:space="0" w:color="808080"/>
+          <w:insideV w:val="single" w:sz="4" w:space="0" w:color="808080"/>
+        </w:tblBorders>
+        <w:tblCellMar>
+          <w:left w:w="10" w:type="dxa"/>
+          <w:right w:w="10" w:type="dxa"/>
+        </w:tblCellMar>
+        <w:tblLook w:val="0000" w:firstRow="0" w:lastRow="0" w:firstColumn="0" w:lastColumn="0" w:noHBand="0" w:noVBand="0"/>
+      </w:tblPr>
+      <w:tblGrid>
+        <w:gridCol w:w="554"/>
+        <w:gridCol w:w="3454"/>
+        <w:gridCol w:w="1047"/>
+        <w:gridCol w:w="4295"/>
+      </w:tblGrid>
+      <w:tr>
+        <w:tblPrEx>
+          <w:tblCellMar>
+            <w:top w:w="0" w:type="dxa"/>
+            <w:bottom w:w="0" w:type="dxa"/>
+          </w:tblCellMar>
+        </w:tblPrEx>
+        <w:trPr>
+          <w:cantSplit/>
+          <w:tblHeader/>
+        </w:trPr>
+        <w:tc>
+          <w:tcPr>
+            <w:tcW w:w="300" w:type="pct"/>
+            <w:shd w:val="clear" w:color="auto" w:fill="F2CEED" w:themeFill="accent5" w:themeFillTint="33"/>
+            <w:tcMar>
+              <w:top w:w="30" w:type="dxa"/>
+              <w:left w:w="80" w:type="dxa"/>
+              <w:bottom w:w="30" w:type="dxa"/>
+              <w:right w:w="80" w:type="dxa"/>
+            </w:tcMar>
+          </w:tcPr>
+          <w:p>
+            <w:r>
+              <w:rPr>
+                <w:rFonts w:ascii="Aptos" w:eastAsia="Aptos" w:hAnsi="Aptos" w:cs="Aptos"/>
+                <w:b/>
+                <w:bCs/>
+                <w:sz w:val="20"/>
+                <w:szCs w:val="20"/>
+              </w:rPr>
+              <w:t>No.</w:t>
+            </w:r>
+          </w:p>
+        </w:tc>
+        <w:tc>
+          <w:tcPr>
+            <w:tcW w:w="1850" w:type="pct"/>
+            <w:shd w:val="clear" w:color="auto" w:fill="F2CEED" w:themeFill="accent5" w:themeFillTint="33"/>
+            <w:tcMar>
+              <w:top w:w="30" w:type="dxa"/>
+              <w:left w:w="80" w:type="dxa"/>
+              <w:bottom w:w="30" w:type="dxa"/>
+              <w:right w:w="80" w:type="dxa"/>
+            </w:tcMar>
+          </w:tcPr>
+          <w:p>
+            <w:r>
+              <w:rPr>
+                <w:rFonts w:ascii="Aptos" w:eastAsia="Aptos" w:hAnsi="Aptos" w:cs="Aptos"/>
+                <w:b/>
+                <w:bCs/>
+                <w:sz w:val="20"/>
+                <w:szCs w:val="20"/>
+              </w:rPr>
+              <w:t>Test</w:t>
+            </w:r>
+          </w:p>
+        </w:tc>
+        <w:tc>
+          <w:tcPr>
+            <w:tcW w:w="550" w:type="pct"/>
+            <w:shd w:val="clear" w:color="auto" w:fill="F2CEED" w:themeFill="accent5" w:themeFillTint="33"/>
+            <w:tcMar>
+              <w:top w:w="30" w:type="dxa"/>
+              <w:left w:w="80" w:type="dxa"/>
+              <w:bottom w:w="30" w:type="dxa"/>
+              <w:right w:w="80" w:type="dxa"/>
+            </w:tcMar>
+          </w:tcPr>
+          <w:p>
+            <w:r>
+              <w:rPr>
+                <w:rFonts w:ascii="Aptos" w:eastAsia="Aptos" w:hAnsi="Aptos" w:cs="Aptos"/>
+                <w:b/>
+                <w:bCs/>
+                <w:sz w:val="20"/>
+                <w:szCs w:val="20"/>
+              </w:rPr>
+              <w:t>Type</w:t>
+            </w:r>
+          </w:p>
+        </w:tc>
+        <w:tc>
+          <w:tcPr>
+            <w:tcW w:w="2300" w:type="pct"/>
+            <w:shd w:val="clear" w:color="auto" w:fill="F2CEED" w:themeFill="accent5" w:themeFillTint="33"/>
+            <w:tcMar>
+              <w:top w:w="30" w:type="dxa"/>
+              <w:left w:w="80" w:type="dxa"/>
+              <w:bottom w:w="30" w:type="dxa"/>
+              <w:right w:w="80" w:type="dxa"/>
+            </w:tcMar>
+          </w:tcPr>
+          <w:p>
+            <w:r>
+              <w:rPr>
+                <w:rFonts w:ascii="Aptos" w:eastAsia="Aptos" w:hAnsi="Aptos" w:cs="Aptos"/>
+                <w:b/>
+                <w:bCs/>
+                <w:sz w:val="20"/>
+                <w:szCs w:val="20"/>
+              </w:rPr>
+              <w:t>Expected Result</w:t>
+            </w:r>
+          </w:p>
+        </w:tc>
+      </w:tr>
+      <w:tr>
+        <w:tblPrEx>
+          <w:tblCellMar>
+            <w:top w:w="0" w:type="dxa"/>
+            <w:bottom w:w="0" w:type="dxa"/>
+          </w:tblCellMar>
+        </w:tblPrEx>
+        <w:trPr>
+          <w:cantSplit/>
+        </w:trPr>
+        <w:tc>
+          <w:tcPr>
+            <w:tcW w:w="300" w:type="pct"/>
+            <w:tcMar>
+              <w:top w:w="30" w:type="dxa"/>
+              <w:left w:w="80" w:type="dxa"/>
+              <w:bottom w:w="30" w:type="dxa"/>
+              <w:right w:w="80" w:type="dxa"/>
+            </w:tcMar>
+          </w:tcPr>
+          <w:p>
+            <w:r>
+              <w:rPr>
+                <w:rFonts w:ascii="Aptos" w:eastAsia="Aptos" w:hAnsi="Aptos" w:cs="Aptos"/>
+                <w:sz w:val="20"/>
+                <w:szCs w:val="20"/>
+              </w:rPr>
+              <w:t>48</w:t>
+            </w:r>
+          </w:p>
+        </w:tc>
+        <w:tc>
+          <w:tcPr>
+            <w:tcW w:w="1850" w:type="pct"/>
+            <w:tcMar>
+              <w:top w:w="30" w:type="dxa"/>
+              <w:left w:w="80" w:type="dxa"/>
+              <w:bottom w:w="30" w:type="dxa"/>
+              <w:right w:w="80" w:type="dxa"/>
+            </w:tcMar>
+          </w:tcPr>
+          <w:p>
+            <w:r>
+              <w:rPr>
+                <w:rFonts w:ascii="Aptos" w:eastAsia="Aptos" w:hAnsi="Aptos" w:cs="Aptos"/>
+                <w:sz w:val="20"/>
+                <w:szCs w:val="20"/>
+              </w:rPr>
+              <w:t>On the Sales Report form, set the date range to 01/07/2026 to 31/07/2026 and press Run Report</w:t>
+            </w:r>
+          </w:p>
+        </w:tc>
+        <w:tc>
+          <w:tcPr>
+            <w:tcW w:w="550" w:type="pct"/>
+            <w:tcMar>
+              <w:top w:w="30" w:type="dxa"/>
+              <w:left w:w="80" w:type="dxa"/>
+              <w:bottom w:w="30" w:type="dxa"/>
+              <w:right w:w="80" w:type="dxa"/>
+            </w:tcMar>
+          </w:tcPr>
+          <w:p>
+            <w:r>
+              <w:rPr>
+                <w:rFonts w:ascii="Aptos" w:eastAsia="Aptos" w:hAnsi="Aptos" w:cs="Aptos"/>
+                <w:sz w:val="20"/>
+                <w:szCs w:val="20"/>
+              </w:rPr>
+              <w:t>Normal</w:t>
+            </w:r>
+          </w:p>
+        </w:tc>
+        <w:tc>
+          <w:tcPr>
+            <w:tcW w:w="2300" w:type="pct"/>
+            <w:tcMar>
+              <w:top w:w="30" w:type="dxa"/>
+              <w:left w:w="80" w:type="dxa"/>
+              <w:bottom w:w="30" w:type="dxa"/>
+              <w:right w:w="80" w:type="dxa"/>
+            </w:tcMar>
+          </w:tcPr>
+          <w:p>
+            <w:r>
+              <w:rPr>
+                <w:rFonts w:ascii="Aptos" w:eastAsia="Aptos" w:hAnsi="Aptos" w:cs="Aptos"/>
+                <w:sz w:val="20"/>
+                <w:szCs w:val="20"/>
+              </w:rPr>
+              <w:t>The report shows Inception with 3 bookings and a ticket revenue of £36.00, and Paddington 2 with 1 booking and a ticket revenue of £7.50. The ticket revenue total is £43.50, the food revenue is £11.50 and the grand total is £55.00.</w:t>
+            </w:r>
+          </w:p>
+        </w:tc>
+      </w:tr>
+      <w:tr>
+        <w:tblPrEx>
+          <w:tblCellMar>
+            <w:top w:w="0" w:type="dxa"/>
+            <w:bottom w:w="0" w:type="dxa"/>
+          </w:tblCellMar>
+        </w:tblPrEx>
+        <w:trPr>
+          <w:cantSplit/>
+        </w:trPr>
+        <w:tc>
+          <w:tcPr>
+            <w:tcW w:w="300" w:type="pct"/>
+            <w:tcMar>
+              <w:top w:w="30" w:type="dxa"/>
+              <w:left w:w="80" w:type="dxa"/>
+              <w:bottom w:w="30" w:type="dxa"/>
+              <w:right w:w="80" w:type="dxa"/>
+            </w:tcMar>
+          </w:tcPr>
+          <w:p>
+            <w:r>
+              <w:rPr>
+                <w:rFonts w:ascii="Aptos" w:eastAsia="Aptos" w:hAnsi="Aptos" w:cs="Aptos"/>
+                <w:sz w:val="20"/>
+                <w:szCs w:val="20"/>
+              </w:rPr>
+              <w:t>49</w:t>
+            </w:r>
+          </w:p>
+        </w:tc>
+        <w:tc>
+          <w:tcPr>
+            <w:tcW w:w="1850" w:type="pct"/>
+            <w:tcMar>
+              <w:top w:w="30" w:type="dxa"/>
+              <w:left w:w="80" w:type="dxa"/>
+              <w:bottom w:w="30" w:type="dxa"/>
+              <w:right w:w="80" w:type="dxa"/>
+            </w:tcMar>
+          </w:tcPr>
+          <w:p>
+            <w:r>
+              <w:rPr>
+                <w:rFonts w:ascii="Aptos" w:eastAsia="Aptos" w:hAnsi="Aptos" w:cs="Aptos"/>
+                <w:sz w:val="20"/>
+                <w:szCs w:val="20"/>
+              </w:rPr>
+              <w:t>Set the date range to 01/01/2020 to 02/01/2020 and press Run Report</w:t>
+            </w:r>
+          </w:p>
+        </w:tc>
+        <w:tc>
+          <w:tcPr>
+            <w:tcW w:w="550" w:type="pct"/>
+            <w:tcMar>
+              <w:top w:w="30" w:type="dxa"/>
+              <w:left w:w="80" w:type="dxa"/>
+              <w:bottom w:w="30" w:type="dxa"/>
+              <w:right w:w="80" w:type="dxa"/>
+            </w:tcMar>
+          </w:tcPr>
+          <w:p>
+            <w:r>
+              <w:rPr>
+                <w:rFonts w:ascii="Aptos" w:eastAsia="Aptos" w:hAnsi="Aptos" w:cs="Aptos"/>
+                <w:sz w:val="20"/>
+                <w:szCs w:val="20"/>
+              </w:rPr>
+              <w:t>Boundary</w:t>
+            </w:r>
+          </w:p>
+        </w:tc>
+        <w:tc>
+          <w:tcPr>
+            <w:tcW w:w="2300" w:type="pct"/>
+            <w:tcMar>
+              <w:top w:w="30" w:type="dxa"/>
+              <w:left w:w="80" w:type="dxa"/>
+              <w:bottom w:w="30" w:type="dxa"/>
+              <w:right w:w="80" w:type="dxa"/>
+            </w:tcMar>
+          </w:tcPr>
+          <w:p>
+            <w:r>
+              <w:rPr>
+                <w:rFonts w:ascii="Aptos" w:eastAsia="Aptos" w:hAnsi="Aptos" w:cs="Aptos"/>
+                <w:sz w:val="20"/>
+                <w:szCs w:val="20"/>
+              </w:rPr>
+              <w:t>The report shows no film rows and the ticket revenue, food revenue and grand total all show £0.00, because no bookings fall in that range.</w:t>
+            </w:r>
+          </w:p>
+        </w:tc>
+      </w:tr>
+      <w:tr>
+        <w:tblPrEx>
+          <w:tblCellMar>
+            <w:top w:w="0" w:type="dxa"/>
+            <w:bottom w:w="0" w:type="dxa"/>
+          </w:tblCellMar>
+        </w:tblPrEx>
+        <w:trPr>
+          <w:cantSplit/>
+        </w:trPr>
+        <w:tc>
+          <w:tcPr>
+            <w:tcW w:w="300" w:type="pct"/>
+            <w:tcMar>
+              <w:top w:w="30" w:type="dxa"/>
+              <w:left w:w="80" w:type="dxa"/>
+              <w:bottom w:w="30" w:type="dxa"/>
+              <w:right w:w="80" w:type="dxa"/>
+            </w:tcMar>
+          </w:tcPr>
+          <w:p>
+            <w:r>
+              <w:rPr>
+                <w:rFonts w:ascii="Aptos" w:eastAsia="Aptos" w:hAnsi="Aptos" w:cs="Aptos"/>
+                <w:sz w:val="20"/>
+                <w:szCs w:val="20"/>
+              </w:rPr>
+              <w:t>50</w:t>
+            </w:r>
+          </w:p>
+        </w:tc>
+        <w:tc>
+          <w:tcPr>
+            <w:tcW w:w="1850" w:type="pct"/>
+            <w:tcMar>
+              <w:top w:w="30" w:type="dxa"/>
+              <w:left w:w="80" w:type="dxa"/>
+              <w:bottom w:w="30" w:type="dxa"/>
+              <w:right w:w="80" w:type="dxa"/>
+            </w:tcMar>
+          </w:tcPr>
+          <w:p>
+            <w:r>
+              <w:rPr>
+                <w:rFonts w:ascii="Aptos" w:eastAsia="Aptos" w:hAnsi="Aptos" w:cs="Aptos"/>
+                <w:sz w:val="20"/>
+                <w:szCs w:val="20"/>
+              </w:rPr>
+              <w:t>Set the From date to 31/07/2026 and the To date to 01/07/2026, then press Run Report</w:t>
+            </w:r>
+          </w:p>
+        </w:tc>
+        <w:tc>
+          <w:tcPr>
+            <w:tcW w:w="550" w:type="pct"/>
+            <w:tcMar>
+              <w:top w:w="30" w:type="dxa"/>
+              <w:left w:w="80" w:type="dxa"/>
+              <w:bottom w:w="30" w:type="dxa"/>
+              <w:right w:w="80" w:type="dxa"/>
+            </w:tcMar>
+          </w:tcPr>
+          <w:p>
+            <w:r>
+              <w:rPr>
+                <w:rFonts w:ascii="Aptos" w:eastAsia="Aptos" w:hAnsi="Aptos" w:cs="Aptos"/>
+                <w:sz w:val="20"/>
+                <w:szCs w:val="20"/>
+              </w:rPr>
+              <w:t>Erroneous</w:t>
+            </w:r>
+          </w:p>
+        </w:tc>
+        <w:tc>
+          <w:tcPr>
+            <w:tcW w:w="2300" w:type="pct"/>
+            <w:tcMar>
+              <w:top w:w="30" w:type="dxa"/>
+              <w:left w:w="80" w:type="dxa"/>
+              <w:bottom w:w="30" w:type="dxa"/>
+              <w:right w:w="80" w:type="dxa"/>
+            </w:tcMar>
+          </w:tcPr>
+          <w:p>
+            <w:r>
+              <w:rPr>
+                <w:rFonts w:ascii="Aptos" w:eastAsia="Aptos" w:hAnsi="Aptos" w:cs="Aptos"/>
+                <w:sz w:val="20"/>
+                <w:szCs w:val="20"/>
+              </w:rPr>
+              <w:t xml:space="preserve">The report is not run and a message appears stating “From date </w:t>
+            </w:r>
+            <w:proofErr w:type="spellStart"/>
+            <w:r>
+              <w:rPr>
+                <w:rFonts w:ascii="Aptos" w:eastAsia="Aptos" w:hAnsi="Aptos" w:cs="Aptos"/>
+                <w:sz w:val="20"/>
+                <w:szCs w:val="20"/>
+              </w:rPr>
+              <w:t>cant</w:t>
+            </w:r>
+            <w:proofErr w:type="spellEnd"/>
+            <w:r>
+              <w:rPr>
+                <w:rFonts w:ascii="Aptos" w:eastAsia="Aptos" w:hAnsi="Aptos" w:cs="Aptos"/>
+                <w:sz w:val="20"/>
+                <w:szCs w:val="20"/>
+              </w:rPr>
+              <w:t xml:space="preserve"> be after the to date”.</w:t>
             </w:r>
           </w:p>
         </w:tc>

</xml_diff>

<commit_message>
added a test plan for objective 12: cancelling a booking
</commit_message>
<xml_diff>
--- a/Testing.docx
+++ b/Testing.docx
@@ -6541,6 +6541,541 @@
                 <w:szCs w:val="20"/>
               </w:rPr>
               <w:t xml:space="preserve"> be after the to date”.</w:t>
+            </w:r>
+          </w:p>
+        </w:tc>
+      </w:tr>
+    </w:tbl>
+    <w:p/>
+    <w:p>
+      <w:pPr>
+        <w:pStyle w:val="Heading3"/>
+      </w:pPr>
+      <w:r>
+        <w:rPr>
+          <w:rFonts w:ascii="Aptos Display" w:eastAsia="Aptos Display" w:hAnsi="Aptos Display" w:cs="Aptos Display"/>
+          <w:b/>
+          <w:bCs/>
+          <w:color w:val="000000"/>
+        </w:rPr>
+        <w:t>Objective 12: Cancelling a Booking</w:t>
+      </w:r>
+    </w:p>
+    <w:p>
+      <w:r>
+        <w:rPr>
+          <w:rFonts w:ascii="Aptos" w:eastAsia="Aptos" w:hAnsi="Aptos" w:cs="Aptos"/>
+        </w:rPr>
+        <w:t>These tests check cancellation and then confirm, by re-running the search and the report, that the cancelled booking has really gone.</w:t>
+      </w:r>
+    </w:p>
+    <w:tbl>
+      <w:tblPr>
+        <w:tblW w:w="5000" w:type="pct"/>
+        <w:tblBorders>
+          <w:top w:val="single" w:sz="4" w:space="0" w:color="808080"/>
+          <w:left w:val="single" w:sz="4" w:space="0" w:color="808080"/>
+          <w:bottom w:val="single" w:sz="4" w:space="0" w:color="808080"/>
+          <w:right w:val="single" w:sz="4" w:space="0" w:color="808080"/>
+          <w:insideH w:val="single" w:sz="4" w:space="0" w:color="808080"/>
+          <w:insideV w:val="single" w:sz="4" w:space="0" w:color="808080"/>
+        </w:tblBorders>
+        <w:tblCellMar>
+          <w:left w:w="10" w:type="dxa"/>
+          <w:right w:w="10" w:type="dxa"/>
+        </w:tblCellMar>
+        <w:tblLook w:val="0000" w:firstRow="0" w:lastRow="0" w:firstColumn="0" w:lastColumn="0" w:noHBand="0" w:noVBand="0"/>
+      </w:tblPr>
+      <w:tblGrid>
+        <w:gridCol w:w="554"/>
+        <w:gridCol w:w="3454"/>
+        <w:gridCol w:w="1047"/>
+        <w:gridCol w:w="4295"/>
+      </w:tblGrid>
+      <w:tr>
+        <w:tblPrEx>
+          <w:tblCellMar>
+            <w:top w:w="0" w:type="dxa"/>
+            <w:bottom w:w="0" w:type="dxa"/>
+          </w:tblCellMar>
+        </w:tblPrEx>
+        <w:trPr>
+          <w:cantSplit/>
+          <w:tblHeader/>
+        </w:trPr>
+        <w:tc>
+          <w:tcPr>
+            <w:tcW w:w="300" w:type="pct"/>
+            <w:shd w:val="clear" w:color="auto" w:fill="F2CEED" w:themeFill="accent5" w:themeFillTint="33"/>
+            <w:tcMar>
+              <w:top w:w="30" w:type="dxa"/>
+              <w:left w:w="80" w:type="dxa"/>
+              <w:bottom w:w="30" w:type="dxa"/>
+              <w:right w:w="80" w:type="dxa"/>
+            </w:tcMar>
+          </w:tcPr>
+          <w:p>
+            <w:r>
+              <w:rPr>
+                <w:rFonts w:ascii="Aptos" w:eastAsia="Aptos" w:hAnsi="Aptos" w:cs="Aptos"/>
+                <w:b/>
+                <w:bCs/>
+                <w:sz w:val="20"/>
+                <w:szCs w:val="20"/>
+              </w:rPr>
+              <w:t>No.</w:t>
+            </w:r>
+          </w:p>
+        </w:tc>
+        <w:tc>
+          <w:tcPr>
+            <w:tcW w:w="1850" w:type="pct"/>
+            <w:shd w:val="clear" w:color="auto" w:fill="F2CEED" w:themeFill="accent5" w:themeFillTint="33"/>
+            <w:tcMar>
+              <w:top w:w="30" w:type="dxa"/>
+              <w:left w:w="80" w:type="dxa"/>
+              <w:bottom w:w="30" w:type="dxa"/>
+              <w:right w:w="80" w:type="dxa"/>
+            </w:tcMar>
+          </w:tcPr>
+          <w:p>
+            <w:r>
+              <w:rPr>
+                <w:rFonts w:ascii="Aptos" w:eastAsia="Aptos" w:hAnsi="Aptos" w:cs="Aptos"/>
+                <w:b/>
+                <w:bCs/>
+                <w:sz w:val="20"/>
+                <w:szCs w:val="20"/>
+              </w:rPr>
+              <w:t>Test</w:t>
+            </w:r>
+          </w:p>
+        </w:tc>
+        <w:tc>
+          <w:tcPr>
+            <w:tcW w:w="550" w:type="pct"/>
+            <w:shd w:val="clear" w:color="auto" w:fill="F2CEED" w:themeFill="accent5" w:themeFillTint="33"/>
+            <w:tcMar>
+              <w:top w:w="30" w:type="dxa"/>
+              <w:left w:w="80" w:type="dxa"/>
+              <w:bottom w:w="30" w:type="dxa"/>
+              <w:right w:w="80" w:type="dxa"/>
+            </w:tcMar>
+          </w:tcPr>
+          <w:p>
+            <w:r>
+              <w:rPr>
+                <w:rFonts w:ascii="Aptos" w:eastAsia="Aptos" w:hAnsi="Aptos" w:cs="Aptos"/>
+                <w:b/>
+                <w:bCs/>
+                <w:sz w:val="20"/>
+                <w:szCs w:val="20"/>
+              </w:rPr>
+              <w:t>Type</w:t>
+            </w:r>
+          </w:p>
+        </w:tc>
+        <w:tc>
+          <w:tcPr>
+            <w:tcW w:w="2300" w:type="pct"/>
+            <w:shd w:val="clear" w:color="auto" w:fill="F2CEED" w:themeFill="accent5" w:themeFillTint="33"/>
+            <w:tcMar>
+              <w:top w:w="30" w:type="dxa"/>
+              <w:left w:w="80" w:type="dxa"/>
+              <w:bottom w:w="30" w:type="dxa"/>
+              <w:right w:w="80" w:type="dxa"/>
+            </w:tcMar>
+          </w:tcPr>
+          <w:p>
+            <w:r>
+              <w:rPr>
+                <w:rFonts w:ascii="Aptos" w:eastAsia="Aptos" w:hAnsi="Aptos" w:cs="Aptos"/>
+                <w:b/>
+                <w:bCs/>
+                <w:sz w:val="20"/>
+                <w:szCs w:val="20"/>
+              </w:rPr>
+              <w:t>Expected Result</w:t>
+            </w:r>
+          </w:p>
+        </w:tc>
+      </w:tr>
+      <w:tr>
+        <w:tblPrEx>
+          <w:tblCellMar>
+            <w:top w:w="0" w:type="dxa"/>
+            <w:bottom w:w="0" w:type="dxa"/>
+          </w:tblCellMar>
+        </w:tblPrEx>
+        <w:trPr>
+          <w:cantSplit/>
+        </w:trPr>
+        <w:tc>
+          <w:tcPr>
+            <w:tcW w:w="300" w:type="pct"/>
+            <w:tcMar>
+              <w:top w:w="30" w:type="dxa"/>
+              <w:left w:w="80" w:type="dxa"/>
+              <w:bottom w:w="30" w:type="dxa"/>
+              <w:right w:w="80" w:type="dxa"/>
+            </w:tcMar>
+          </w:tcPr>
+          <w:p>
+            <w:r>
+              <w:rPr>
+                <w:rFonts w:ascii="Aptos" w:eastAsia="Aptos" w:hAnsi="Aptos" w:cs="Aptos"/>
+                <w:sz w:val="20"/>
+                <w:szCs w:val="20"/>
+              </w:rPr>
+              <w:t>51</w:t>
+            </w:r>
+          </w:p>
+        </w:tc>
+        <w:tc>
+          <w:tcPr>
+            <w:tcW w:w="1850" w:type="pct"/>
+            <w:tcMar>
+              <w:top w:w="30" w:type="dxa"/>
+              <w:left w:w="80" w:type="dxa"/>
+              <w:bottom w:w="30" w:type="dxa"/>
+              <w:right w:w="80" w:type="dxa"/>
+            </w:tcMar>
+          </w:tcPr>
+          <w:p>
+            <w:r>
+              <w:rPr>
+                <w:rFonts w:ascii="Aptos" w:eastAsia="Aptos" w:hAnsi="Aptos" w:cs="Aptos"/>
+                <w:sz w:val="20"/>
+                <w:szCs w:val="20"/>
+              </w:rPr>
+              <w:t>On the Booking Search form, without selecting a booking, press Cancel Booking</w:t>
+            </w:r>
+          </w:p>
+        </w:tc>
+        <w:tc>
+          <w:tcPr>
+            <w:tcW w:w="550" w:type="pct"/>
+            <w:tcMar>
+              <w:top w:w="30" w:type="dxa"/>
+              <w:left w:w="80" w:type="dxa"/>
+              <w:bottom w:w="30" w:type="dxa"/>
+              <w:right w:w="80" w:type="dxa"/>
+            </w:tcMar>
+          </w:tcPr>
+          <w:p>
+            <w:r>
+              <w:rPr>
+                <w:rFonts w:ascii="Aptos" w:eastAsia="Aptos" w:hAnsi="Aptos" w:cs="Aptos"/>
+                <w:sz w:val="20"/>
+                <w:szCs w:val="20"/>
+              </w:rPr>
+              <w:t>Erroneous</w:t>
+            </w:r>
+          </w:p>
+        </w:tc>
+        <w:tc>
+          <w:tcPr>
+            <w:tcW w:w="2300" w:type="pct"/>
+            <w:tcMar>
+              <w:top w:w="30" w:type="dxa"/>
+              <w:left w:w="80" w:type="dxa"/>
+              <w:bottom w:w="30" w:type="dxa"/>
+              <w:right w:w="80" w:type="dxa"/>
+            </w:tcMar>
+          </w:tcPr>
+          <w:p>
+            <w:r>
+              <w:rPr>
+                <w:rFonts w:ascii="Aptos" w:eastAsia="Aptos" w:hAnsi="Aptos" w:cs="Aptos"/>
+                <w:sz w:val="20"/>
+                <w:szCs w:val="20"/>
+              </w:rPr>
+              <w:t>Nothing is cancelled and a message appears stating “Select a booking in the grid first”.</w:t>
+            </w:r>
+          </w:p>
+        </w:tc>
+      </w:tr>
+      <w:tr>
+        <w:tblPrEx>
+          <w:tblCellMar>
+            <w:top w:w="0" w:type="dxa"/>
+            <w:bottom w:w="0" w:type="dxa"/>
+          </w:tblCellMar>
+        </w:tblPrEx>
+        <w:trPr>
+          <w:cantSplit/>
+        </w:trPr>
+        <w:tc>
+          <w:tcPr>
+            <w:tcW w:w="300" w:type="pct"/>
+            <w:tcMar>
+              <w:top w:w="30" w:type="dxa"/>
+              <w:left w:w="80" w:type="dxa"/>
+              <w:bottom w:w="30" w:type="dxa"/>
+              <w:right w:w="80" w:type="dxa"/>
+            </w:tcMar>
+          </w:tcPr>
+          <w:p>
+            <w:r>
+              <w:rPr>
+                <w:rFonts w:ascii="Aptos" w:eastAsia="Aptos" w:hAnsi="Aptos" w:cs="Aptos"/>
+                <w:sz w:val="20"/>
+                <w:szCs w:val="20"/>
+              </w:rPr>
+              <w:t>52</w:t>
+            </w:r>
+          </w:p>
+        </w:tc>
+        <w:tc>
+          <w:tcPr>
+            <w:tcW w:w="1850" w:type="pct"/>
+            <w:tcMar>
+              <w:top w:w="30" w:type="dxa"/>
+              <w:left w:w="80" w:type="dxa"/>
+              <w:bottom w:w="30" w:type="dxa"/>
+              <w:right w:w="80" w:type="dxa"/>
+            </w:tcMar>
+          </w:tcPr>
+          <w:p>
+            <w:r>
+              <w:rPr>
+                <w:rFonts w:ascii="Aptos" w:eastAsia="Aptos" w:hAnsi="Aptos" w:cs="Aptos"/>
+                <w:sz w:val="20"/>
+                <w:szCs w:val="20"/>
+              </w:rPr>
+              <w:t>Search for Smith, select David Smith's booking in the grid, press Cancel Booking and choose Yes on the confirmation</w:t>
+            </w:r>
+          </w:p>
+        </w:tc>
+        <w:tc>
+          <w:tcPr>
+            <w:tcW w:w="550" w:type="pct"/>
+            <w:tcMar>
+              <w:top w:w="30" w:type="dxa"/>
+              <w:left w:w="80" w:type="dxa"/>
+              <w:bottom w:w="30" w:type="dxa"/>
+              <w:right w:w="80" w:type="dxa"/>
+            </w:tcMar>
+          </w:tcPr>
+          <w:p>
+            <w:r>
+              <w:rPr>
+                <w:rFonts w:ascii="Aptos" w:eastAsia="Aptos" w:hAnsi="Aptos" w:cs="Aptos"/>
+                <w:sz w:val="20"/>
+                <w:szCs w:val="20"/>
+              </w:rPr>
+              <w:t>Normal</w:t>
+            </w:r>
+          </w:p>
+        </w:tc>
+        <w:tc>
+          <w:tcPr>
+            <w:tcW w:w="2300" w:type="pct"/>
+            <w:tcMar>
+              <w:top w:w="30" w:type="dxa"/>
+              <w:left w:w="80" w:type="dxa"/>
+              <w:bottom w:w="30" w:type="dxa"/>
+              <w:right w:w="80" w:type="dxa"/>
+            </w:tcMar>
+          </w:tcPr>
+          <w:p>
+            <w:r>
+              <w:rPr>
+                <w:rFonts w:ascii="Aptos" w:eastAsia="Aptos" w:hAnsi="Aptos" w:cs="Aptos"/>
+                <w:sz w:val="20"/>
+                <w:szCs w:val="20"/>
+              </w:rPr>
+              <w:t>The booking is cancelled, its seat B2 is freed and a message “Booking cancelled” appears.</w:t>
+            </w:r>
+          </w:p>
+        </w:tc>
+      </w:tr>
+      <w:tr>
+        <w:tblPrEx>
+          <w:tblCellMar>
+            <w:top w:w="0" w:type="dxa"/>
+            <w:bottom w:w="0" w:type="dxa"/>
+          </w:tblCellMar>
+        </w:tblPrEx>
+        <w:trPr>
+          <w:cantSplit/>
+        </w:trPr>
+        <w:tc>
+          <w:tcPr>
+            <w:tcW w:w="300" w:type="pct"/>
+            <w:tcMar>
+              <w:top w:w="30" w:type="dxa"/>
+              <w:left w:w="80" w:type="dxa"/>
+              <w:bottom w:w="30" w:type="dxa"/>
+              <w:right w:w="80" w:type="dxa"/>
+            </w:tcMar>
+          </w:tcPr>
+          <w:p>
+            <w:r>
+              <w:rPr>
+                <w:rFonts w:ascii="Aptos" w:eastAsia="Aptos" w:hAnsi="Aptos" w:cs="Aptos"/>
+                <w:sz w:val="20"/>
+                <w:szCs w:val="20"/>
+              </w:rPr>
+              <w:t>53</w:t>
+            </w:r>
+          </w:p>
+        </w:tc>
+        <w:tc>
+          <w:tcPr>
+            <w:tcW w:w="1850" w:type="pct"/>
+            <w:tcMar>
+              <w:top w:w="30" w:type="dxa"/>
+              <w:left w:w="80" w:type="dxa"/>
+              <w:bottom w:w="30" w:type="dxa"/>
+              <w:right w:w="80" w:type="dxa"/>
+            </w:tcMar>
+          </w:tcPr>
+          <w:p>
+            <w:r>
+              <w:rPr>
+                <w:rFonts w:ascii="Aptos" w:eastAsia="Aptos" w:hAnsi="Aptos" w:cs="Aptos"/>
+                <w:sz w:val="20"/>
+                <w:szCs w:val="20"/>
+              </w:rPr>
+              <w:t>Search for Smith again</w:t>
+            </w:r>
+          </w:p>
+        </w:tc>
+        <w:tc>
+          <w:tcPr>
+            <w:tcW w:w="550" w:type="pct"/>
+            <w:tcMar>
+              <w:top w:w="30" w:type="dxa"/>
+              <w:left w:w="80" w:type="dxa"/>
+              <w:bottom w:w="30" w:type="dxa"/>
+              <w:right w:w="80" w:type="dxa"/>
+            </w:tcMar>
+          </w:tcPr>
+          <w:p>
+            <w:r>
+              <w:rPr>
+                <w:rFonts w:ascii="Aptos" w:eastAsia="Aptos" w:hAnsi="Aptos" w:cs="Aptos"/>
+                <w:sz w:val="20"/>
+                <w:szCs w:val="20"/>
+              </w:rPr>
+              <w:t>Normal</w:t>
+            </w:r>
+          </w:p>
+        </w:tc>
+        <w:tc>
+          <w:tcPr>
+            <w:tcW w:w="2300" w:type="pct"/>
+            <w:tcMar>
+              <w:top w:w="30" w:type="dxa"/>
+              <w:left w:w="80" w:type="dxa"/>
+              <w:bottom w:w="30" w:type="dxa"/>
+              <w:right w:w="80" w:type="dxa"/>
+            </w:tcMar>
+          </w:tcPr>
+          <w:p>
+            <w:r>
+              <w:rPr>
+                <w:rFonts w:ascii="Aptos" w:eastAsia="Aptos" w:hAnsi="Aptos" w:cs="Aptos"/>
+                <w:sz w:val="20"/>
+                <w:szCs w:val="20"/>
+              </w:rPr>
+              <w:t>The grid now shows only 2 bookings, for John Smith and Sarah Smith, proving that David Smith's booking was removed.</w:t>
+            </w:r>
+          </w:p>
+        </w:tc>
+      </w:tr>
+      <w:tr>
+        <w:tblPrEx>
+          <w:tblCellMar>
+            <w:top w:w="0" w:type="dxa"/>
+            <w:bottom w:w="0" w:type="dxa"/>
+          </w:tblCellMar>
+        </w:tblPrEx>
+        <w:trPr>
+          <w:cantSplit/>
+        </w:trPr>
+        <w:tc>
+          <w:tcPr>
+            <w:tcW w:w="300" w:type="pct"/>
+            <w:tcMar>
+              <w:top w:w="30" w:type="dxa"/>
+              <w:left w:w="80" w:type="dxa"/>
+              <w:bottom w:w="30" w:type="dxa"/>
+              <w:right w:w="80" w:type="dxa"/>
+            </w:tcMar>
+          </w:tcPr>
+          <w:p>
+            <w:r>
+              <w:rPr>
+                <w:rFonts w:ascii="Aptos" w:eastAsia="Aptos" w:hAnsi="Aptos" w:cs="Aptos"/>
+                <w:sz w:val="20"/>
+                <w:szCs w:val="20"/>
+              </w:rPr>
+              <w:t>54</w:t>
+            </w:r>
+          </w:p>
+        </w:tc>
+        <w:tc>
+          <w:tcPr>
+            <w:tcW w:w="1850" w:type="pct"/>
+            <w:tcMar>
+              <w:top w:w="30" w:type="dxa"/>
+              <w:left w:w="80" w:type="dxa"/>
+              <w:bottom w:w="30" w:type="dxa"/>
+              <w:right w:w="80" w:type="dxa"/>
+            </w:tcMar>
+          </w:tcPr>
+          <w:p>
+            <w:r>
+              <w:rPr>
+                <w:rFonts w:ascii="Aptos" w:eastAsia="Aptos" w:hAnsi="Aptos" w:cs="Aptos"/>
+                <w:sz w:val="20"/>
+                <w:szCs w:val="20"/>
+              </w:rPr>
+              <w:t>Re-run the sales report for 01/07/2026 to 31/07/2026</w:t>
+            </w:r>
+          </w:p>
+        </w:tc>
+        <w:tc>
+          <w:tcPr>
+            <w:tcW w:w="550" w:type="pct"/>
+            <w:tcMar>
+              <w:top w:w="30" w:type="dxa"/>
+              <w:left w:w="80" w:type="dxa"/>
+              <w:bottom w:w="30" w:type="dxa"/>
+              <w:right w:w="80" w:type="dxa"/>
+            </w:tcMar>
+          </w:tcPr>
+          <w:p>
+            <w:r>
+              <w:rPr>
+                <w:rFonts w:ascii="Aptos" w:eastAsia="Aptos" w:hAnsi="Aptos" w:cs="Aptos"/>
+                <w:sz w:val="20"/>
+                <w:szCs w:val="20"/>
+              </w:rPr>
+              <w:t>Normal</w:t>
+            </w:r>
+          </w:p>
+        </w:tc>
+        <w:tc>
+          <w:tcPr>
+            <w:tcW w:w="2300" w:type="pct"/>
+            <w:tcMar>
+              <w:top w:w="30" w:type="dxa"/>
+              <w:left w:w="80" w:type="dxa"/>
+              <w:bottom w:w="30" w:type="dxa"/>
+              <w:right w:w="80" w:type="dxa"/>
+            </w:tcMar>
+          </w:tcPr>
+          <w:p>
+            <w:r>
+              <w:rPr>
+                <w:rFonts w:ascii="Aptos" w:eastAsia="Aptos" w:hAnsi="Aptos" w:cs="Aptos"/>
+                <w:sz w:val="20"/>
+                <w:szCs w:val="20"/>
+              </w:rPr>
+              <w:t>The Inception ticket revenue has dropped from £36.00 to £27.00 and the grand total is now £46.00, because David Smith's £9.00 booking was cancelled.</w:t>
             </w:r>
           </w:p>
         </w:tc>

</xml_diff>

<commit_message>
added test plan for objective 10: enforcing access levels
</commit_message>
<xml_diff>
--- a/Testing.docx
+++ b/Testing.docx
@@ -7012,6 +7012,7 @@
                 <w:sz w:val="20"/>
                 <w:szCs w:val="20"/>
               </w:rPr>
+              <w:lastRenderedPageBreak/>
               <w:t>54</w:t>
             </w:r>
           </w:p>
@@ -7076,6 +7077,636 @@
                 <w:szCs w:val="20"/>
               </w:rPr>
               <w:t>The Inception ticket revenue has dropped from £36.00 to £27.00 and the grand total is now £46.00, because David Smith's £9.00 booking was cancelled.</w:t>
+            </w:r>
+          </w:p>
+        </w:tc>
+      </w:tr>
+    </w:tbl>
+    <w:p/>
+    <w:p>
+      <w:pPr>
+        <w:pStyle w:val="Heading3"/>
+      </w:pPr>
+      <w:r>
+        <w:rPr>
+          <w:rFonts w:ascii="Aptos Display" w:eastAsia="Aptos Display" w:hAnsi="Aptos Display" w:cs="Aptos Display"/>
+          <w:b/>
+          <w:bCs/>
+          <w:color w:val="000000"/>
+        </w:rPr>
+        <w:t>Objective 10: Enforcing Access Levels</w:t>
+      </w:r>
+    </w:p>
+    <w:p>
+      <w:r>
+        <w:rPr>
+          <w:rFonts w:ascii="Aptos" w:eastAsia="Aptos" w:hAnsi="Aptos" w:cs="Aptos"/>
+        </w:rPr>
+        <w:t>These tests check that the login controls access and that the menu changes depending on the access level of the user. The actual account usernames used should be your own manager and staff accounts.</w:t>
+      </w:r>
+    </w:p>
+    <w:tbl>
+      <w:tblPr>
+        <w:tblW w:w="5000" w:type="pct"/>
+        <w:tblBorders>
+          <w:top w:val="single" w:sz="4" w:space="0" w:color="808080"/>
+          <w:left w:val="single" w:sz="4" w:space="0" w:color="808080"/>
+          <w:bottom w:val="single" w:sz="4" w:space="0" w:color="808080"/>
+          <w:right w:val="single" w:sz="4" w:space="0" w:color="808080"/>
+          <w:insideH w:val="single" w:sz="4" w:space="0" w:color="808080"/>
+          <w:insideV w:val="single" w:sz="4" w:space="0" w:color="808080"/>
+        </w:tblBorders>
+        <w:tblCellMar>
+          <w:left w:w="10" w:type="dxa"/>
+          <w:right w:w="10" w:type="dxa"/>
+        </w:tblCellMar>
+        <w:tblLook w:val="0000" w:firstRow="0" w:lastRow="0" w:firstColumn="0" w:lastColumn="0" w:noHBand="0" w:noVBand="0"/>
+      </w:tblPr>
+      <w:tblGrid>
+        <w:gridCol w:w="554"/>
+        <w:gridCol w:w="3454"/>
+        <w:gridCol w:w="1047"/>
+        <w:gridCol w:w="4295"/>
+      </w:tblGrid>
+      <w:tr>
+        <w:tblPrEx>
+          <w:tblCellMar>
+            <w:top w:w="0" w:type="dxa"/>
+            <w:bottom w:w="0" w:type="dxa"/>
+          </w:tblCellMar>
+        </w:tblPrEx>
+        <w:trPr>
+          <w:cantSplit/>
+          <w:tblHeader/>
+        </w:trPr>
+        <w:tc>
+          <w:tcPr>
+            <w:tcW w:w="300" w:type="pct"/>
+            <w:shd w:val="clear" w:color="auto" w:fill="F2CEED" w:themeFill="accent5" w:themeFillTint="33"/>
+            <w:tcMar>
+              <w:top w:w="30" w:type="dxa"/>
+              <w:left w:w="80" w:type="dxa"/>
+              <w:bottom w:w="30" w:type="dxa"/>
+              <w:right w:w="80" w:type="dxa"/>
+            </w:tcMar>
+          </w:tcPr>
+          <w:p>
+            <w:r>
+              <w:rPr>
+                <w:rFonts w:ascii="Aptos" w:eastAsia="Aptos" w:hAnsi="Aptos" w:cs="Aptos"/>
+                <w:b/>
+                <w:bCs/>
+                <w:sz w:val="20"/>
+                <w:szCs w:val="20"/>
+              </w:rPr>
+              <w:t>No.</w:t>
+            </w:r>
+          </w:p>
+        </w:tc>
+        <w:tc>
+          <w:tcPr>
+            <w:tcW w:w="1850" w:type="pct"/>
+            <w:shd w:val="clear" w:color="auto" w:fill="F2CEED" w:themeFill="accent5" w:themeFillTint="33"/>
+            <w:tcMar>
+              <w:top w:w="30" w:type="dxa"/>
+              <w:left w:w="80" w:type="dxa"/>
+              <w:bottom w:w="30" w:type="dxa"/>
+              <w:right w:w="80" w:type="dxa"/>
+            </w:tcMar>
+          </w:tcPr>
+          <w:p>
+            <w:r>
+              <w:rPr>
+                <w:rFonts w:ascii="Aptos" w:eastAsia="Aptos" w:hAnsi="Aptos" w:cs="Aptos"/>
+                <w:b/>
+                <w:bCs/>
+                <w:sz w:val="20"/>
+                <w:szCs w:val="20"/>
+              </w:rPr>
+              <w:t>Test</w:t>
+            </w:r>
+          </w:p>
+        </w:tc>
+        <w:tc>
+          <w:tcPr>
+            <w:tcW w:w="550" w:type="pct"/>
+            <w:shd w:val="clear" w:color="auto" w:fill="F2CEED" w:themeFill="accent5" w:themeFillTint="33"/>
+            <w:tcMar>
+              <w:top w:w="30" w:type="dxa"/>
+              <w:left w:w="80" w:type="dxa"/>
+              <w:bottom w:w="30" w:type="dxa"/>
+              <w:right w:w="80" w:type="dxa"/>
+            </w:tcMar>
+          </w:tcPr>
+          <w:p>
+            <w:r>
+              <w:rPr>
+                <w:rFonts w:ascii="Aptos" w:eastAsia="Aptos" w:hAnsi="Aptos" w:cs="Aptos"/>
+                <w:b/>
+                <w:bCs/>
+                <w:sz w:val="20"/>
+                <w:szCs w:val="20"/>
+              </w:rPr>
+              <w:t>Type</w:t>
+            </w:r>
+          </w:p>
+        </w:tc>
+        <w:tc>
+          <w:tcPr>
+            <w:tcW w:w="2300" w:type="pct"/>
+            <w:shd w:val="clear" w:color="auto" w:fill="F2CEED" w:themeFill="accent5" w:themeFillTint="33"/>
+            <w:tcMar>
+              <w:top w:w="30" w:type="dxa"/>
+              <w:left w:w="80" w:type="dxa"/>
+              <w:bottom w:w="30" w:type="dxa"/>
+              <w:right w:w="80" w:type="dxa"/>
+            </w:tcMar>
+          </w:tcPr>
+          <w:p>
+            <w:r>
+              <w:rPr>
+                <w:rFonts w:ascii="Aptos" w:eastAsia="Aptos" w:hAnsi="Aptos" w:cs="Aptos"/>
+                <w:b/>
+                <w:bCs/>
+                <w:sz w:val="20"/>
+                <w:szCs w:val="20"/>
+              </w:rPr>
+              <w:t>Expected Result</w:t>
+            </w:r>
+          </w:p>
+        </w:tc>
+      </w:tr>
+      <w:tr>
+        <w:tblPrEx>
+          <w:tblCellMar>
+            <w:top w:w="0" w:type="dxa"/>
+            <w:bottom w:w="0" w:type="dxa"/>
+          </w:tblCellMar>
+        </w:tblPrEx>
+        <w:trPr>
+          <w:cantSplit/>
+        </w:trPr>
+        <w:tc>
+          <w:tcPr>
+            <w:tcW w:w="300" w:type="pct"/>
+            <w:tcMar>
+              <w:top w:w="30" w:type="dxa"/>
+              <w:left w:w="80" w:type="dxa"/>
+              <w:bottom w:w="30" w:type="dxa"/>
+              <w:right w:w="80" w:type="dxa"/>
+            </w:tcMar>
+          </w:tcPr>
+          <w:p>
+            <w:r>
+              <w:rPr>
+                <w:rFonts w:ascii="Aptos" w:eastAsia="Aptos" w:hAnsi="Aptos" w:cs="Aptos"/>
+                <w:sz w:val="20"/>
+                <w:szCs w:val="20"/>
+              </w:rPr>
+              <w:t>55</w:t>
+            </w:r>
+          </w:p>
+        </w:tc>
+        <w:tc>
+          <w:tcPr>
+            <w:tcW w:w="1850" w:type="pct"/>
+            <w:tcMar>
+              <w:top w:w="30" w:type="dxa"/>
+              <w:left w:w="80" w:type="dxa"/>
+              <w:bottom w:w="30" w:type="dxa"/>
+              <w:right w:w="80" w:type="dxa"/>
+            </w:tcMar>
+          </w:tcPr>
+          <w:p>
+            <w:r>
+              <w:rPr>
+                <w:rFonts w:ascii="Aptos" w:eastAsia="Aptos" w:hAnsi="Aptos" w:cs="Aptos"/>
+                <w:sz w:val="20"/>
+                <w:szCs w:val="20"/>
+              </w:rPr>
+              <w:t>At the login screen, leave the username and password blank and press Login</w:t>
+            </w:r>
+          </w:p>
+        </w:tc>
+        <w:tc>
+          <w:tcPr>
+            <w:tcW w:w="550" w:type="pct"/>
+            <w:tcMar>
+              <w:top w:w="30" w:type="dxa"/>
+              <w:left w:w="80" w:type="dxa"/>
+              <w:bottom w:w="30" w:type="dxa"/>
+              <w:right w:w="80" w:type="dxa"/>
+            </w:tcMar>
+          </w:tcPr>
+          <w:p>
+            <w:r>
+              <w:rPr>
+                <w:rFonts w:ascii="Aptos" w:eastAsia="Aptos" w:hAnsi="Aptos" w:cs="Aptos"/>
+                <w:sz w:val="20"/>
+                <w:szCs w:val="20"/>
+              </w:rPr>
+              <w:t>Erroneous</w:t>
+            </w:r>
+          </w:p>
+        </w:tc>
+        <w:tc>
+          <w:tcPr>
+            <w:tcW w:w="2300" w:type="pct"/>
+            <w:tcMar>
+              <w:top w:w="30" w:type="dxa"/>
+              <w:left w:w="80" w:type="dxa"/>
+              <w:bottom w:w="30" w:type="dxa"/>
+              <w:right w:w="80" w:type="dxa"/>
+            </w:tcMar>
+          </w:tcPr>
+          <w:p>
+            <w:r>
+              <w:rPr>
+                <w:rFonts w:ascii="Aptos" w:eastAsia="Aptos" w:hAnsi="Aptos" w:cs="Aptos"/>
+                <w:sz w:val="20"/>
+                <w:szCs w:val="20"/>
+              </w:rPr>
+              <w:t>Login is refused and a message appears stating “Please enter a username and password.”.</w:t>
+            </w:r>
+          </w:p>
+        </w:tc>
+      </w:tr>
+      <w:tr>
+        <w:tblPrEx>
+          <w:tblCellMar>
+            <w:top w:w="0" w:type="dxa"/>
+            <w:bottom w:w="0" w:type="dxa"/>
+          </w:tblCellMar>
+        </w:tblPrEx>
+        <w:trPr>
+          <w:cantSplit/>
+        </w:trPr>
+        <w:tc>
+          <w:tcPr>
+            <w:tcW w:w="300" w:type="pct"/>
+            <w:tcMar>
+              <w:top w:w="30" w:type="dxa"/>
+              <w:left w:w="80" w:type="dxa"/>
+              <w:bottom w:w="30" w:type="dxa"/>
+              <w:right w:w="80" w:type="dxa"/>
+            </w:tcMar>
+          </w:tcPr>
+          <w:p>
+            <w:r>
+              <w:rPr>
+                <w:rFonts w:ascii="Aptos" w:eastAsia="Aptos" w:hAnsi="Aptos" w:cs="Aptos"/>
+                <w:sz w:val="20"/>
+                <w:szCs w:val="20"/>
+              </w:rPr>
+              <w:t>56</w:t>
+            </w:r>
+          </w:p>
+        </w:tc>
+        <w:tc>
+          <w:tcPr>
+            <w:tcW w:w="1850" w:type="pct"/>
+            <w:tcMar>
+              <w:top w:w="30" w:type="dxa"/>
+              <w:left w:w="80" w:type="dxa"/>
+              <w:bottom w:w="30" w:type="dxa"/>
+              <w:right w:w="80" w:type="dxa"/>
+            </w:tcMar>
+          </w:tcPr>
+          <w:p>
+            <w:r>
+              <w:rPr>
+                <w:rFonts w:ascii="Aptos" w:eastAsia="Aptos" w:hAnsi="Aptos" w:cs="Aptos"/>
+                <w:sz w:val="20"/>
+                <w:szCs w:val="20"/>
+              </w:rPr>
+              <w:t>Log in with a valid manager account and the correct password</w:t>
+            </w:r>
+          </w:p>
+        </w:tc>
+        <w:tc>
+          <w:tcPr>
+            <w:tcW w:w="550" w:type="pct"/>
+            <w:tcMar>
+              <w:top w:w="30" w:type="dxa"/>
+              <w:left w:w="80" w:type="dxa"/>
+              <w:bottom w:w="30" w:type="dxa"/>
+              <w:right w:w="80" w:type="dxa"/>
+            </w:tcMar>
+          </w:tcPr>
+          <w:p>
+            <w:r>
+              <w:rPr>
+                <w:rFonts w:ascii="Aptos" w:eastAsia="Aptos" w:hAnsi="Aptos" w:cs="Aptos"/>
+                <w:sz w:val="20"/>
+                <w:szCs w:val="20"/>
+              </w:rPr>
+              <w:t>Normal</w:t>
+            </w:r>
+          </w:p>
+        </w:tc>
+        <w:tc>
+          <w:tcPr>
+            <w:tcW w:w="2300" w:type="pct"/>
+            <w:tcMar>
+              <w:top w:w="30" w:type="dxa"/>
+              <w:left w:w="80" w:type="dxa"/>
+              <w:bottom w:w="30" w:type="dxa"/>
+              <w:right w:w="80" w:type="dxa"/>
+            </w:tcMar>
+          </w:tcPr>
+          <w:p>
+            <w:r>
+              <w:rPr>
+                <w:rFonts w:ascii="Aptos" w:eastAsia="Aptos" w:hAnsi="Aptos" w:cs="Aptos"/>
+                <w:sz w:val="20"/>
+                <w:szCs w:val="20"/>
+              </w:rPr>
+              <w:t>Login succeeds and the main menu appears with all options available, including the manager only options such as the sales report and the logs.</w:t>
+            </w:r>
+          </w:p>
+        </w:tc>
+      </w:tr>
+      <w:tr>
+        <w:tblPrEx>
+          <w:tblCellMar>
+            <w:top w:w="0" w:type="dxa"/>
+            <w:bottom w:w="0" w:type="dxa"/>
+          </w:tblCellMar>
+        </w:tblPrEx>
+        <w:trPr>
+          <w:cantSplit/>
+        </w:trPr>
+        <w:tc>
+          <w:tcPr>
+            <w:tcW w:w="300" w:type="pct"/>
+            <w:tcMar>
+              <w:top w:w="30" w:type="dxa"/>
+              <w:left w:w="80" w:type="dxa"/>
+              <w:bottom w:w="30" w:type="dxa"/>
+              <w:right w:w="80" w:type="dxa"/>
+            </w:tcMar>
+          </w:tcPr>
+          <w:p>
+            <w:r>
+              <w:rPr>
+                <w:rFonts w:ascii="Aptos" w:eastAsia="Aptos" w:hAnsi="Aptos" w:cs="Aptos"/>
+                <w:sz w:val="20"/>
+                <w:szCs w:val="20"/>
+              </w:rPr>
+              <w:t>57</w:t>
+            </w:r>
+          </w:p>
+        </w:tc>
+        <w:tc>
+          <w:tcPr>
+            <w:tcW w:w="1850" w:type="pct"/>
+            <w:tcMar>
+              <w:top w:w="30" w:type="dxa"/>
+              <w:left w:w="80" w:type="dxa"/>
+              <w:bottom w:w="30" w:type="dxa"/>
+              <w:right w:w="80" w:type="dxa"/>
+            </w:tcMar>
+          </w:tcPr>
+          <w:p>
+            <w:r>
+              <w:rPr>
+                <w:rFonts w:ascii="Aptos" w:eastAsia="Aptos" w:hAnsi="Aptos" w:cs="Aptos"/>
+                <w:sz w:val="20"/>
+                <w:szCs w:val="20"/>
+              </w:rPr>
+              <w:t>Log in with a valid staff account and the correct password</w:t>
+            </w:r>
+          </w:p>
+        </w:tc>
+        <w:tc>
+          <w:tcPr>
+            <w:tcW w:w="550" w:type="pct"/>
+            <w:tcMar>
+              <w:top w:w="30" w:type="dxa"/>
+              <w:left w:w="80" w:type="dxa"/>
+              <w:bottom w:w="30" w:type="dxa"/>
+              <w:right w:w="80" w:type="dxa"/>
+            </w:tcMar>
+          </w:tcPr>
+          <w:p>
+            <w:r>
+              <w:rPr>
+                <w:rFonts w:ascii="Aptos" w:eastAsia="Aptos" w:hAnsi="Aptos" w:cs="Aptos"/>
+                <w:sz w:val="20"/>
+                <w:szCs w:val="20"/>
+              </w:rPr>
+              <w:t>Normal</w:t>
+            </w:r>
+          </w:p>
+        </w:tc>
+        <w:tc>
+          <w:tcPr>
+            <w:tcW w:w="2300" w:type="pct"/>
+            <w:tcMar>
+              <w:top w:w="30" w:type="dxa"/>
+              <w:left w:w="80" w:type="dxa"/>
+              <w:bottom w:w="30" w:type="dxa"/>
+              <w:right w:w="80" w:type="dxa"/>
+            </w:tcMar>
+          </w:tcPr>
+          <w:p>
+            <w:r>
+              <w:rPr>
+                <w:rFonts w:ascii="Aptos" w:eastAsia="Aptos" w:hAnsi="Aptos" w:cs="Aptos"/>
+                <w:sz w:val="20"/>
+                <w:szCs w:val="20"/>
+              </w:rPr>
+              <w:t>Login succeeds and the main menu appears with the staff options available but the manager only options hidden or disabled.</w:t>
+            </w:r>
+          </w:p>
+        </w:tc>
+      </w:tr>
+      <w:tr>
+        <w:tblPrEx>
+          <w:tblCellMar>
+            <w:top w:w="0" w:type="dxa"/>
+            <w:bottom w:w="0" w:type="dxa"/>
+          </w:tblCellMar>
+        </w:tblPrEx>
+        <w:trPr>
+          <w:cantSplit/>
+        </w:trPr>
+        <w:tc>
+          <w:tcPr>
+            <w:tcW w:w="300" w:type="pct"/>
+            <w:tcMar>
+              <w:top w:w="30" w:type="dxa"/>
+              <w:left w:w="80" w:type="dxa"/>
+              <w:bottom w:w="30" w:type="dxa"/>
+              <w:right w:w="80" w:type="dxa"/>
+            </w:tcMar>
+          </w:tcPr>
+          <w:p>
+            <w:r>
+              <w:rPr>
+                <w:rFonts w:ascii="Aptos" w:eastAsia="Aptos" w:hAnsi="Aptos" w:cs="Aptos"/>
+                <w:sz w:val="20"/>
+                <w:szCs w:val="20"/>
+              </w:rPr>
+              <w:t>58</w:t>
+            </w:r>
+          </w:p>
+        </w:tc>
+        <w:tc>
+          <w:tcPr>
+            <w:tcW w:w="1850" w:type="pct"/>
+            <w:tcMar>
+              <w:top w:w="30" w:type="dxa"/>
+              <w:left w:w="80" w:type="dxa"/>
+              <w:bottom w:w="30" w:type="dxa"/>
+              <w:right w:w="80" w:type="dxa"/>
+            </w:tcMar>
+          </w:tcPr>
+          <w:p>
+            <w:r>
+              <w:rPr>
+                <w:rFonts w:ascii="Aptos" w:eastAsia="Aptos" w:hAnsi="Aptos" w:cs="Aptos"/>
+                <w:sz w:val="20"/>
+                <w:szCs w:val="20"/>
+              </w:rPr>
+              <w:t>Log in with a valid username but the wrong password three times in a row</w:t>
+            </w:r>
+          </w:p>
+        </w:tc>
+        <w:tc>
+          <w:tcPr>
+            <w:tcW w:w="550" w:type="pct"/>
+            <w:tcMar>
+              <w:top w:w="30" w:type="dxa"/>
+              <w:left w:w="80" w:type="dxa"/>
+              <w:bottom w:w="30" w:type="dxa"/>
+              <w:right w:w="80" w:type="dxa"/>
+            </w:tcMar>
+          </w:tcPr>
+          <w:p>
+            <w:r>
+              <w:rPr>
+                <w:rFonts w:ascii="Aptos" w:eastAsia="Aptos" w:hAnsi="Aptos" w:cs="Aptos"/>
+                <w:sz w:val="20"/>
+                <w:szCs w:val="20"/>
+              </w:rPr>
+              <w:t>Boundary</w:t>
+            </w:r>
+          </w:p>
+        </w:tc>
+        <w:tc>
+          <w:tcPr>
+            <w:tcW w:w="2300" w:type="pct"/>
+            <w:tcMar>
+              <w:top w:w="30" w:type="dxa"/>
+              <w:left w:w="80" w:type="dxa"/>
+              <w:bottom w:w="30" w:type="dxa"/>
+              <w:right w:w="80" w:type="dxa"/>
+            </w:tcMar>
+          </w:tcPr>
+          <w:p>
+            <w:r>
+              <w:rPr>
+                <w:rFonts w:ascii="Aptos" w:eastAsia="Aptos" w:hAnsi="Aptos" w:cs="Aptos"/>
+                <w:sz w:val="20"/>
+                <w:szCs w:val="20"/>
+              </w:rPr>
+              <w:t>After the third failed attempt a message “Too many failed attempts. The application will now close.” appears and the program closes.</w:t>
+            </w:r>
+          </w:p>
+        </w:tc>
+      </w:tr>
+      <w:tr>
+        <w:tblPrEx>
+          <w:tblCellMar>
+            <w:top w:w="0" w:type="dxa"/>
+            <w:bottom w:w="0" w:type="dxa"/>
+          </w:tblCellMar>
+        </w:tblPrEx>
+        <w:trPr>
+          <w:cantSplit/>
+        </w:trPr>
+        <w:tc>
+          <w:tcPr>
+            <w:tcW w:w="300" w:type="pct"/>
+            <w:tcMar>
+              <w:top w:w="30" w:type="dxa"/>
+              <w:left w:w="80" w:type="dxa"/>
+              <w:bottom w:w="30" w:type="dxa"/>
+              <w:right w:w="80" w:type="dxa"/>
+            </w:tcMar>
+          </w:tcPr>
+          <w:p>
+            <w:r>
+              <w:rPr>
+                <w:rFonts w:ascii="Aptos" w:eastAsia="Aptos" w:hAnsi="Aptos" w:cs="Aptos"/>
+                <w:sz w:val="20"/>
+                <w:szCs w:val="20"/>
+              </w:rPr>
+              <w:t>59</w:t>
+            </w:r>
+          </w:p>
+        </w:tc>
+        <w:tc>
+          <w:tcPr>
+            <w:tcW w:w="1850" w:type="pct"/>
+            <w:tcMar>
+              <w:top w:w="30" w:type="dxa"/>
+              <w:left w:w="80" w:type="dxa"/>
+              <w:bottom w:w="30" w:type="dxa"/>
+              <w:right w:w="80" w:type="dxa"/>
+            </w:tcMar>
+          </w:tcPr>
+          <w:p>
+            <w:r>
+              <w:rPr>
+                <w:rFonts w:ascii="Aptos" w:eastAsia="Aptos" w:hAnsi="Aptos" w:cs="Aptos"/>
+                <w:sz w:val="20"/>
+                <w:szCs w:val="20"/>
+              </w:rPr>
+              <w:t>Log in with a username that does not exist, such as ghost</w:t>
+            </w:r>
+          </w:p>
+        </w:tc>
+        <w:tc>
+          <w:tcPr>
+            <w:tcW w:w="550" w:type="pct"/>
+            <w:tcMar>
+              <w:top w:w="30" w:type="dxa"/>
+              <w:left w:w="80" w:type="dxa"/>
+              <w:bottom w:w="30" w:type="dxa"/>
+              <w:right w:w="80" w:type="dxa"/>
+            </w:tcMar>
+          </w:tcPr>
+          <w:p>
+            <w:r>
+              <w:rPr>
+                <w:rFonts w:ascii="Aptos" w:eastAsia="Aptos" w:hAnsi="Aptos" w:cs="Aptos"/>
+                <w:sz w:val="20"/>
+                <w:szCs w:val="20"/>
+              </w:rPr>
+              <w:t>Erroneous</w:t>
+            </w:r>
+          </w:p>
+        </w:tc>
+        <w:tc>
+          <w:tcPr>
+            <w:tcW w:w="2300" w:type="pct"/>
+            <w:tcMar>
+              <w:top w:w="30" w:type="dxa"/>
+              <w:left w:w="80" w:type="dxa"/>
+              <w:bottom w:w="30" w:type="dxa"/>
+              <w:right w:w="80" w:type="dxa"/>
+            </w:tcMar>
+          </w:tcPr>
+          <w:p>
+            <w:r>
+              <w:rPr>
+                <w:rFonts w:ascii="Aptos" w:eastAsia="Aptos" w:hAnsi="Aptos" w:cs="Aptos"/>
+                <w:sz w:val="20"/>
+                <w:szCs w:val="20"/>
+              </w:rPr>
+              <w:t>Login is refused and a message appears stating that the username 'ghost' was not found.</w:t>
             </w:r>
           </w:p>
         </w:tc>

</xml_diff>

<commit_message>
added test plan for objective 13: validating data
</commit_message>
<xml_diff>
--- a/Testing.docx
+++ b/Testing.docx
@@ -7707,6 +7707,654 @@
                 <w:szCs w:val="20"/>
               </w:rPr>
               <w:t>Login is refused and a message appears stating that the username 'ghost' was not found.</w:t>
+            </w:r>
+          </w:p>
+        </w:tc>
+      </w:tr>
+    </w:tbl>
+    <w:p/>
+    <w:p>
+      <w:pPr>
+        <w:pStyle w:val="Heading3"/>
+      </w:pPr>
+      <w:r>
+        <w:rPr>
+          <w:rFonts w:ascii="Aptos Display" w:eastAsia="Aptos Display" w:hAnsi="Aptos Display" w:cs="Aptos Display"/>
+          <w:b/>
+          <w:bCs/>
+          <w:color w:val="000000"/>
+        </w:rPr>
+        <w:t>Objective 13: Validating Data</w:t>
+      </w:r>
+    </w:p>
+    <w:p>
+      <w:r>
+        <w:rPr>
+          <w:rFonts w:ascii="Aptos" w:eastAsia="Aptos" w:hAnsi="Aptos" w:cs="Aptos"/>
+        </w:rPr>
+        <w:t>Validation is exercised across many of the tests above, but these tests focus on it directly, covering format, length, character and range checks. The range checks in particular test data at the edge of what is allowed.</w:t>
+      </w:r>
+    </w:p>
+    <w:tbl>
+      <w:tblPr>
+        <w:tblW w:w="5000" w:type="pct"/>
+        <w:tblBorders>
+          <w:top w:val="single" w:sz="4" w:space="0" w:color="808080"/>
+          <w:left w:val="single" w:sz="4" w:space="0" w:color="808080"/>
+          <w:bottom w:val="single" w:sz="4" w:space="0" w:color="808080"/>
+          <w:right w:val="single" w:sz="4" w:space="0" w:color="808080"/>
+          <w:insideH w:val="single" w:sz="4" w:space="0" w:color="808080"/>
+          <w:insideV w:val="single" w:sz="4" w:space="0" w:color="808080"/>
+        </w:tblBorders>
+        <w:tblCellMar>
+          <w:left w:w="10" w:type="dxa"/>
+          <w:right w:w="10" w:type="dxa"/>
+        </w:tblCellMar>
+        <w:tblLook w:val="0000" w:firstRow="0" w:lastRow="0" w:firstColumn="0" w:lastColumn="0" w:noHBand="0" w:noVBand="0"/>
+      </w:tblPr>
+      <w:tblGrid>
+        <w:gridCol w:w="554"/>
+        <w:gridCol w:w="3454"/>
+        <w:gridCol w:w="1047"/>
+        <w:gridCol w:w="4295"/>
+      </w:tblGrid>
+      <w:tr>
+        <w:tblPrEx>
+          <w:tblCellMar>
+            <w:top w:w="0" w:type="dxa"/>
+            <w:bottom w:w="0" w:type="dxa"/>
+          </w:tblCellMar>
+        </w:tblPrEx>
+        <w:trPr>
+          <w:cantSplit/>
+          <w:tblHeader/>
+        </w:trPr>
+        <w:tc>
+          <w:tcPr>
+            <w:tcW w:w="300" w:type="pct"/>
+            <w:shd w:val="clear" w:color="auto" w:fill="F2CEED" w:themeFill="accent5" w:themeFillTint="33"/>
+            <w:tcMar>
+              <w:top w:w="30" w:type="dxa"/>
+              <w:left w:w="80" w:type="dxa"/>
+              <w:bottom w:w="30" w:type="dxa"/>
+              <w:right w:w="80" w:type="dxa"/>
+            </w:tcMar>
+          </w:tcPr>
+          <w:p>
+            <w:r>
+              <w:rPr>
+                <w:rFonts w:ascii="Aptos" w:eastAsia="Aptos" w:hAnsi="Aptos" w:cs="Aptos"/>
+                <w:b/>
+                <w:bCs/>
+                <w:sz w:val="20"/>
+                <w:szCs w:val="20"/>
+              </w:rPr>
+              <w:t>No.</w:t>
+            </w:r>
+          </w:p>
+        </w:tc>
+        <w:tc>
+          <w:tcPr>
+            <w:tcW w:w="1850" w:type="pct"/>
+            <w:shd w:val="clear" w:color="auto" w:fill="F2CEED" w:themeFill="accent5" w:themeFillTint="33"/>
+            <w:tcMar>
+              <w:top w:w="30" w:type="dxa"/>
+              <w:left w:w="80" w:type="dxa"/>
+              <w:bottom w:w="30" w:type="dxa"/>
+              <w:right w:w="80" w:type="dxa"/>
+            </w:tcMar>
+          </w:tcPr>
+          <w:p>
+            <w:r>
+              <w:rPr>
+                <w:rFonts w:ascii="Aptos" w:eastAsia="Aptos" w:hAnsi="Aptos" w:cs="Aptos"/>
+                <w:b/>
+                <w:bCs/>
+                <w:sz w:val="20"/>
+                <w:szCs w:val="20"/>
+              </w:rPr>
+              <w:t>Test</w:t>
+            </w:r>
+          </w:p>
+        </w:tc>
+        <w:tc>
+          <w:tcPr>
+            <w:tcW w:w="550" w:type="pct"/>
+            <w:shd w:val="clear" w:color="auto" w:fill="F2CEED" w:themeFill="accent5" w:themeFillTint="33"/>
+            <w:tcMar>
+              <w:top w:w="30" w:type="dxa"/>
+              <w:left w:w="80" w:type="dxa"/>
+              <w:bottom w:w="30" w:type="dxa"/>
+              <w:right w:w="80" w:type="dxa"/>
+            </w:tcMar>
+          </w:tcPr>
+          <w:p>
+            <w:r>
+              <w:rPr>
+                <w:rFonts w:ascii="Aptos" w:eastAsia="Aptos" w:hAnsi="Aptos" w:cs="Aptos"/>
+                <w:b/>
+                <w:bCs/>
+                <w:sz w:val="20"/>
+                <w:szCs w:val="20"/>
+              </w:rPr>
+              <w:t>Type</w:t>
+            </w:r>
+          </w:p>
+        </w:tc>
+        <w:tc>
+          <w:tcPr>
+            <w:tcW w:w="2300" w:type="pct"/>
+            <w:shd w:val="clear" w:color="auto" w:fill="F2CEED" w:themeFill="accent5" w:themeFillTint="33"/>
+            <w:tcMar>
+              <w:top w:w="30" w:type="dxa"/>
+              <w:left w:w="80" w:type="dxa"/>
+              <w:bottom w:w="30" w:type="dxa"/>
+              <w:right w:w="80" w:type="dxa"/>
+            </w:tcMar>
+          </w:tcPr>
+          <w:p>
+            <w:r>
+              <w:rPr>
+                <w:rFonts w:ascii="Aptos" w:eastAsia="Aptos" w:hAnsi="Aptos" w:cs="Aptos"/>
+                <w:b/>
+                <w:bCs/>
+                <w:sz w:val="20"/>
+                <w:szCs w:val="20"/>
+              </w:rPr>
+              <w:t>Expected Result</w:t>
+            </w:r>
+          </w:p>
+        </w:tc>
+      </w:tr>
+      <w:tr>
+        <w:tblPrEx>
+          <w:tblCellMar>
+            <w:top w:w="0" w:type="dxa"/>
+            <w:bottom w:w="0" w:type="dxa"/>
+          </w:tblCellMar>
+        </w:tblPrEx>
+        <w:trPr>
+          <w:cantSplit/>
+        </w:trPr>
+        <w:tc>
+          <w:tcPr>
+            <w:tcW w:w="300" w:type="pct"/>
+            <w:tcMar>
+              <w:top w:w="30" w:type="dxa"/>
+              <w:left w:w="80" w:type="dxa"/>
+              <w:bottom w:w="30" w:type="dxa"/>
+              <w:right w:w="80" w:type="dxa"/>
+            </w:tcMar>
+          </w:tcPr>
+          <w:p>
+            <w:r>
+              <w:rPr>
+                <w:rFonts w:ascii="Aptos" w:eastAsia="Aptos" w:hAnsi="Aptos" w:cs="Aptos"/>
+                <w:sz w:val="20"/>
+                <w:szCs w:val="20"/>
+              </w:rPr>
+              <w:t>60</w:t>
+            </w:r>
+          </w:p>
+        </w:tc>
+        <w:tc>
+          <w:tcPr>
+            <w:tcW w:w="1850" w:type="pct"/>
+            <w:tcMar>
+              <w:top w:w="30" w:type="dxa"/>
+              <w:left w:w="80" w:type="dxa"/>
+              <w:bottom w:w="30" w:type="dxa"/>
+              <w:right w:w="80" w:type="dxa"/>
+            </w:tcMar>
+          </w:tcPr>
+          <w:p>
+            <w:r>
+              <w:rPr>
+                <w:rFonts w:ascii="Aptos" w:eastAsia="Aptos" w:hAnsi="Aptos" w:cs="Aptos"/>
+                <w:sz w:val="20"/>
+                <w:szCs w:val="20"/>
+              </w:rPr>
+              <w:t xml:space="preserve">On the Customers form, enter forename John, surname Smith, an email of </w:t>
+            </w:r>
+            <w:proofErr w:type="spellStart"/>
+            <w:r>
+              <w:rPr>
+                <w:rFonts w:ascii="Aptos" w:eastAsia="Aptos" w:hAnsi="Aptos" w:cs="Aptos"/>
+                <w:sz w:val="20"/>
+                <w:szCs w:val="20"/>
+              </w:rPr>
+              <w:t>johnsmith</w:t>
+            </w:r>
+            <w:proofErr w:type="spellEnd"/>
+            <w:r>
+              <w:rPr>
+                <w:rFonts w:ascii="Aptos" w:eastAsia="Aptos" w:hAnsi="Aptos" w:cs="Aptos"/>
+                <w:sz w:val="20"/>
+                <w:szCs w:val="20"/>
+              </w:rPr>
+              <w:t xml:space="preserve"> with no @ or full stop, and a valid phone number, then press Add</w:t>
+            </w:r>
+          </w:p>
+        </w:tc>
+        <w:tc>
+          <w:tcPr>
+            <w:tcW w:w="550" w:type="pct"/>
+            <w:tcMar>
+              <w:top w:w="30" w:type="dxa"/>
+              <w:left w:w="80" w:type="dxa"/>
+              <w:bottom w:w="30" w:type="dxa"/>
+              <w:right w:w="80" w:type="dxa"/>
+            </w:tcMar>
+          </w:tcPr>
+          <w:p>
+            <w:r>
+              <w:rPr>
+                <w:rFonts w:ascii="Aptos" w:eastAsia="Aptos" w:hAnsi="Aptos" w:cs="Aptos"/>
+                <w:sz w:val="20"/>
+                <w:szCs w:val="20"/>
+              </w:rPr>
+              <w:t>Erroneous</w:t>
+            </w:r>
+          </w:p>
+        </w:tc>
+        <w:tc>
+          <w:tcPr>
+            <w:tcW w:w="2300" w:type="pct"/>
+            <w:tcMar>
+              <w:top w:w="30" w:type="dxa"/>
+              <w:left w:w="80" w:type="dxa"/>
+              <w:bottom w:w="30" w:type="dxa"/>
+              <w:right w:w="80" w:type="dxa"/>
+            </w:tcMar>
+          </w:tcPr>
+          <w:p>
+            <w:r>
+              <w:rPr>
+                <w:rFonts w:ascii="Aptos" w:eastAsia="Aptos" w:hAnsi="Aptos" w:cs="Aptos"/>
+                <w:sz w:val="20"/>
+                <w:szCs w:val="20"/>
+              </w:rPr>
+              <w:t>The customer is rejected and a message appears stating “Enter a valid email address”, because the email is missing an @ and a full stop.</w:t>
+            </w:r>
+          </w:p>
+        </w:tc>
+      </w:tr>
+      <w:tr>
+        <w:tblPrEx>
+          <w:tblCellMar>
+            <w:top w:w="0" w:type="dxa"/>
+            <w:bottom w:w="0" w:type="dxa"/>
+          </w:tblCellMar>
+        </w:tblPrEx>
+        <w:trPr>
+          <w:cantSplit/>
+        </w:trPr>
+        <w:tc>
+          <w:tcPr>
+            <w:tcW w:w="300" w:type="pct"/>
+            <w:tcMar>
+              <w:top w:w="30" w:type="dxa"/>
+              <w:left w:w="80" w:type="dxa"/>
+              <w:bottom w:w="30" w:type="dxa"/>
+              <w:right w:w="80" w:type="dxa"/>
+            </w:tcMar>
+          </w:tcPr>
+          <w:p>
+            <w:r>
+              <w:rPr>
+                <w:rFonts w:ascii="Aptos" w:eastAsia="Aptos" w:hAnsi="Aptos" w:cs="Aptos"/>
+                <w:sz w:val="20"/>
+                <w:szCs w:val="20"/>
+              </w:rPr>
+              <w:t>61</w:t>
+            </w:r>
+          </w:p>
+        </w:tc>
+        <w:tc>
+          <w:tcPr>
+            <w:tcW w:w="1850" w:type="pct"/>
+            <w:tcMar>
+              <w:top w:w="30" w:type="dxa"/>
+              <w:left w:w="80" w:type="dxa"/>
+              <w:bottom w:w="30" w:type="dxa"/>
+              <w:right w:w="80" w:type="dxa"/>
+            </w:tcMar>
+          </w:tcPr>
+          <w:p>
+            <w:r>
+              <w:rPr>
+                <w:rFonts w:ascii="Aptos" w:eastAsia="Aptos" w:hAnsi="Aptos" w:cs="Aptos"/>
+                <w:sz w:val="20"/>
+                <w:szCs w:val="20"/>
+              </w:rPr>
+              <w:t>On the Customers form, enter valid names and email but a phone number of 0712345 (7 digits), then press Add</w:t>
+            </w:r>
+          </w:p>
+        </w:tc>
+        <w:tc>
+          <w:tcPr>
+            <w:tcW w:w="550" w:type="pct"/>
+            <w:tcMar>
+              <w:top w:w="30" w:type="dxa"/>
+              <w:left w:w="80" w:type="dxa"/>
+              <w:bottom w:w="30" w:type="dxa"/>
+              <w:right w:w="80" w:type="dxa"/>
+            </w:tcMar>
+          </w:tcPr>
+          <w:p>
+            <w:r>
+              <w:rPr>
+                <w:rFonts w:ascii="Aptos" w:eastAsia="Aptos" w:hAnsi="Aptos" w:cs="Aptos"/>
+                <w:sz w:val="20"/>
+                <w:szCs w:val="20"/>
+              </w:rPr>
+              <w:t>Erroneous</w:t>
+            </w:r>
+          </w:p>
+        </w:tc>
+        <w:tc>
+          <w:tcPr>
+            <w:tcW w:w="2300" w:type="pct"/>
+            <w:tcMar>
+              <w:top w:w="30" w:type="dxa"/>
+              <w:left w:w="80" w:type="dxa"/>
+              <w:bottom w:w="30" w:type="dxa"/>
+              <w:right w:w="80" w:type="dxa"/>
+            </w:tcMar>
+          </w:tcPr>
+          <w:p>
+            <w:r>
+              <w:rPr>
+                <w:rFonts w:ascii="Aptos" w:eastAsia="Aptos" w:hAnsi="Aptos" w:cs="Aptos"/>
+                <w:sz w:val="20"/>
+                <w:szCs w:val="20"/>
+              </w:rPr>
+              <w:t>The customer is rejected and a message appears stating “Phone number must be 10 or 11 digits long”.</w:t>
+            </w:r>
+          </w:p>
+        </w:tc>
+      </w:tr>
+      <w:tr>
+        <w:tblPrEx>
+          <w:tblCellMar>
+            <w:top w:w="0" w:type="dxa"/>
+            <w:bottom w:w="0" w:type="dxa"/>
+          </w:tblCellMar>
+        </w:tblPrEx>
+        <w:trPr>
+          <w:cantSplit/>
+        </w:trPr>
+        <w:tc>
+          <w:tcPr>
+            <w:tcW w:w="300" w:type="pct"/>
+            <w:tcMar>
+              <w:top w:w="30" w:type="dxa"/>
+              <w:left w:w="80" w:type="dxa"/>
+              <w:bottom w:w="30" w:type="dxa"/>
+              <w:right w:w="80" w:type="dxa"/>
+            </w:tcMar>
+          </w:tcPr>
+          <w:p>
+            <w:r>
+              <w:rPr>
+                <w:rFonts w:ascii="Aptos" w:eastAsia="Aptos" w:hAnsi="Aptos" w:cs="Aptos"/>
+                <w:sz w:val="20"/>
+                <w:szCs w:val="20"/>
+              </w:rPr>
+              <w:t>62</w:t>
+            </w:r>
+          </w:p>
+        </w:tc>
+        <w:tc>
+          <w:tcPr>
+            <w:tcW w:w="1850" w:type="pct"/>
+            <w:tcMar>
+              <w:top w:w="30" w:type="dxa"/>
+              <w:left w:w="80" w:type="dxa"/>
+              <w:bottom w:w="30" w:type="dxa"/>
+              <w:right w:w="80" w:type="dxa"/>
+            </w:tcMar>
+          </w:tcPr>
+          <w:p>
+            <w:r>
+              <w:rPr>
+                <w:rFonts w:ascii="Aptos" w:eastAsia="Aptos" w:hAnsi="Aptos" w:cs="Aptos"/>
+                <w:sz w:val="20"/>
+                <w:szCs w:val="20"/>
+              </w:rPr>
+              <w:t>On the Customers form, enter a phone number of 07abc456789 (containing letters), then press Add</w:t>
+            </w:r>
+          </w:p>
+        </w:tc>
+        <w:tc>
+          <w:tcPr>
+            <w:tcW w:w="550" w:type="pct"/>
+            <w:tcMar>
+              <w:top w:w="30" w:type="dxa"/>
+              <w:left w:w="80" w:type="dxa"/>
+              <w:bottom w:w="30" w:type="dxa"/>
+              <w:right w:w="80" w:type="dxa"/>
+            </w:tcMar>
+          </w:tcPr>
+          <w:p>
+            <w:r>
+              <w:rPr>
+                <w:rFonts w:ascii="Aptos" w:eastAsia="Aptos" w:hAnsi="Aptos" w:cs="Aptos"/>
+                <w:sz w:val="20"/>
+                <w:szCs w:val="20"/>
+              </w:rPr>
+              <w:t>Erroneous</w:t>
+            </w:r>
+          </w:p>
+        </w:tc>
+        <w:tc>
+          <w:tcPr>
+            <w:tcW w:w="2300" w:type="pct"/>
+            <w:tcMar>
+              <w:top w:w="30" w:type="dxa"/>
+              <w:left w:w="80" w:type="dxa"/>
+              <w:bottom w:w="30" w:type="dxa"/>
+              <w:right w:w="80" w:type="dxa"/>
+            </w:tcMar>
+          </w:tcPr>
+          <w:p>
+            <w:r>
+              <w:rPr>
+                <w:rFonts w:ascii="Aptos" w:eastAsia="Aptos" w:hAnsi="Aptos" w:cs="Aptos"/>
+                <w:sz w:val="20"/>
+                <w:szCs w:val="20"/>
+              </w:rPr>
+              <w:t>The customer is rejected and a message appears stating “Phone number must contain digits only”.</w:t>
+            </w:r>
+          </w:p>
+        </w:tc>
+      </w:tr>
+      <w:tr>
+        <w:tblPrEx>
+          <w:tblCellMar>
+            <w:top w:w="0" w:type="dxa"/>
+            <w:bottom w:w="0" w:type="dxa"/>
+          </w:tblCellMar>
+        </w:tblPrEx>
+        <w:trPr>
+          <w:cantSplit/>
+        </w:trPr>
+        <w:tc>
+          <w:tcPr>
+            <w:tcW w:w="300" w:type="pct"/>
+            <w:tcMar>
+              <w:top w:w="30" w:type="dxa"/>
+              <w:left w:w="80" w:type="dxa"/>
+              <w:bottom w:w="30" w:type="dxa"/>
+              <w:right w:w="80" w:type="dxa"/>
+            </w:tcMar>
+          </w:tcPr>
+          <w:p>
+            <w:r>
+              <w:rPr>
+                <w:rFonts w:ascii="Aptos" w:eastAsia="Aptos" w:hAnsi="Aptos" w:cs="Aptos"/>
+                <w:sz w:val="20"/>
+                <w:szCs w:val="20"/>
+              </w:rPr>
+              <w:t>63</w:t>
+            </w:r>
+          </w:p>
+        </w:tc>
+        <w:tc>
+          <w:tcPr>
+            <w:tcW w:w="1850" w:type="pct"/>
+            <w:tcMar>
+              <w:top w:w="30" w:type="dxa"/>
+              <w:left w:w="80" w:type="dxa"/>
+              <w:bottom w:w="30" w:type="dxa"/>
+              <w:right w:w="80" w:type="dxa"/>
+            </w:tcMar>
+          </w:tcPr>
+          <w:p>
+            <w:r>
+              <w:rPr>
+                <w:rFonts w:ascii="Aptos" w:eastAsia="Aptos" w:hAnsi="Aptos" w:cs="Aptos"/>
+                <w:sz w:val="20"/>
+                <w:szCs w:val="20"/>
+              </w:rPr>
+              <w:t>On the Screens form, enter a capacity of 15, then press Add</w:t>
+            </w:r>
+          </w:p>
+        </w:tc>
+        <w:tc>
+          <w:tcPr>
+            <w:tcW w:w="550" w:type="pct"/>
+            <w:tcMar>
+              <w:top w:w="30" w:type="dxa"/>
+              <w:left w:w="80" w:type="dxa"/>
+              <w:bottom w:w="30" w:type="dxa"/>
+              <w:right w:w="80" w:type="dxa"/>
+            </w:tcMar>
+          </w:tcPr>
+          <w:p>
+            <w:r>
+              <w:rPr>
+                <w:rFonts w:ascii="Aptos" w:eastAsia="Aptos" w:hAnsi="Aptos" w:cs="Aptos"/>
+                <w:sz w:val="20"/>
+                <w:szCs w:val="20"/>
+              </w:rPr>
+              <w:t>Erroneous</w:t>
+            </w:r>
+          </w:p>
+        </w:tc>
+        <w:tc>
+          <w:tcPr>
+            <w:tcW w:w="2300" w:type="pct"/>
+            <w:tcMar>
+              <w:top w:w="30" w:type="dxa"/>
+              <w:left w:w="80" w:type="dxa"/>
+              <w:bottom w:w="30" w:type="dxa"/>
+              <w:right w:w="80" w:type="dxa"/>
+            </w:tcMar>
+          </w:tcPr>
+          <w:p>
+            <w:r>
+              <w:rPr>
+                <w:rFonts w:ascii="Aptos" w:eastAsia="Aptos" w:hAnsi="Aptos" w:cs="Aptos"/>
+                <w:sz w:val="20"/>
+                <w:szCs w:val="20"/>
+              </w:rPr>
+              <w:t>The screen is rejected and a message appears stating “Screen capacity must be a multiple of 10 (e.g. 10, 20, 30...)”, which is a range check that only accepts multiples of ten.</w:t>
+            </w:r>
+          </w:p>
+        </w:tc>
+      </w:tr>
+      <w:tr>
+        <w:tblPrEx>
+          <w:tblCellMar>
+            <w:top w:w="0" w:type="dxa"/>
+            <w:bottom w:w="0" w:type="dxa"/>
+          </w:tblCellMar>
+        </w:tblPrEx>
+        <w:trPr>
+          <w:cantSplit/>
+        </w:trPr>
+        <w:tc>
+          <w:tcPr>
+            <w:tcW w:w="300" w:type="pct"/>
+            <w:tcMar>
+              <w:top w:w="30" w:type="dxa"/>
+              <w:left w:w="80" w:type="dxa"/>
+              <w:bottom w:w="30" w:type="dxa"/>
+              <w:right w:w="80" w:type="dxa"/>
+            </w:tcMar>
+          </w:tcPr>
+          <w:p>
+            <w:r>
+              <w:rPr>
+                <w:rFonts w:ascii="Aptos" w:eastAsia="Aptos" w:hAnsi="Aptos" w:cs="Aptos"/>
+                <w:sz w:val="20"/>
+                <w:szCs w:val="20"/>
+              </w:rPr>
+              <w:t>64</w:t>
+            </w:r>
+          </w:p>
+        </w:tc>
+        <w:tc>
+          <w:tcPr>
+            <w:tcW w:w="1850" w:type="pct"/>
+            <w:tcMar>
+              <w:top w:w="30" w:type="dxa"/>
+              <w:left w:w="80" w:type="dxa"/>
+              <w:bottom w:w="30" w:type="dxa"/>
+              <w:right w:w="80" w:type="dxa"/>
+            </w:tcMar>
+          </w:tcPr>
+          <w:p>
+            <w:r>
+              <w:rPr>
+                <w:rFonts w:ascii="Aptos" w:eastAsia="Aptos" w:hAnsi="Aptos" w:cs="Aptos"/>
+                <w:sz w:val="20"/>
+                <w:szCs w:val="20"/>
+              </w:rPr>
+              <w:t>On the Screenings form, enter a screening time of 14:75, then press Add</w:t>
+            </w:r>
+          </w:p>
+        </w:tc>
+        <w:tc>
+          <w:tcPr>
+            <w:tcW w:w="550" w:type="pct"/>
+            <w:tcMar>
+              <w:top w:w="30" w:type="dxa"/>
+              <w:left w:w="80" w:type="dxa"/>
+              <w:bottom w:w="30" w:type="dxa"/>
+              <w:right w:w="80" w:type="dxa"/>
+            </w:tcMar>
+          </w:tcPr>
+          <w:p>
+            <w:r>
+              <w:rPr>
+                <w:rFonts w:ascii="Aptos" w:eastAsia="Aptos" w:hAnsi="Aptos" w:cs="Aptos"/>
+                <w:sz w:val="20"/>
+                <w:szCs w:val="20"/>
+              </w:rPr>
+              <w:t>Erroneous</w:t>
+            </w:r>
+          </w:p>
+        </w:tc>
+        <w:tc>
+          <w:tcPr>
+            <w:tcW w:w="2300" w:type="pct"/>
+            <w:tcMar>
+              <w:top w:w="30" w:type="dxa"/>
+              <w:left w:w="80" w:type="dxa"/>
+              <w:bottom w:w="30" w:type="dxa"/>
+              <w:right w:w="80" w:type="dxa"/>
+            </w:tcMar>
+          </w:tcPr>
+          <w:p>
+            <w:r>
+              <w:rPr>
+                <w:rFonts w:ascii="Aptos" w:eastAsia="Aptos" w:hAnsi="Aptos" w:cs="Aptos"/>
+                <w:sz w:val="20"/>
+                <w:szCs w:val="20"/>
+              </w:rPr>
+              <w:t>The screening is rejected and a message appears stating “Screening time must be in HH:MM format, e.g. 14:30”, because 75 is outside the valid range of minutes.</w:t>
             </w:r>
           </w:p>
         </w:tc>

</xml_diff>

<commit_message>
added test plan for objective 17: maintaining an audit log
</commit_message>
<xml_diff>
--- a/Testing.docx
+++ b/Testing.docx
@@ -8196,6 +8196,7 @@
                 <w:sz w:val="20"/>
                 <w:szCs w:val="20"/>
               </w:rPr>
+              <w:lastRenderedPageBreak/>
               <w:t>63</w:t>
             </w:r>
           </w:p>
@@ -8355,6 +8356,446 @@
                 <w:szCs w:val="20"/>
               </w:rPr>
               <w:t>The screening is rejected and a message appears stating “Screening time must be in HH:MM format, e.g. 14:30”, because 75 is outside the valid range of minutes.</w:t>
+            </w:r>
+          </w:p>
+        </w:tc>
+      </w:tr>
+    </w:tbl>
+    <w:p/>
+    <w:p>
+      <w:pPr>
+        <w:pStyle w:val="Heading3"/>
+      </w:pPr>
+      <w:r>
+        <w:rPr>
+          <w:rFonts w:ascii="Aptos Display" w:eastAsia="Aptos Display" w:hAnsi="Aptos Display" w:cs="Aptos Display"/>
+          <w:b/>
+          <w:bCs/>
+          <w:color w:val="000000"/>
+        </w:rPr>
+        <w:t>Objective 17: Maintaining an Audit Log</w:t>
+      </w:r>
+    </w:p>
+    <w:p>
+      <w:r>
+        <w:rPr>
+          <w:rFonts w:ascii="Aptos" w:eastAsia="Aptos" w:hAnsi="Aptos" w:cs="Aptos"/>
+        </w:rPr>
+        <w:t>These tests check that key actions are written to the audit log with a timestamp.</w:t>
+      </w:r>
+    </w:p>
+    <w:tbl>
+      <w:tblPr>
+        <w:tblW w:w="5000" w:type="pct"/>
+        <w:tblBorders>
+          <w:top w:val="single" w:sz="4" w:space="0" w:color="808080"/>
+          <w:left w:val="single" w:sz="4" w:space="0" w:color="808080"/>
+          <w:bottom w:val="single" w:sz="4" w:space="0" w:color="808080"/>
+          <w:right w:val="single" w:sz="4" w:space="0" w:color="808080"/>
+          <w:insideH w:val="single" w:sz="4" w:space="0" w:color="808080"/>
+          <w:insideV w:val="single" w:sz="4" w:space="0" w:color="808080"/>
+        </w:tblBorders>
+        <w:tblCellMar>
+          <w:left w:w="10" w:type="dxa"/>
+          <w:right w:w="10" w:type="dxa"/>
+        </w:tblCellMar>
+        <w:tblLook w:val="0000" w:firstRow="0" w:lastRow="0" w:firstColumn="0" w:lastColumn="0" w:noHBand="0" w:noVBand="0"/>
+      </w:tblPr>
+      <w:tblGrid>
+        <w:gridCol w:w="560"/>
+        <w:gridCol w:w="3460"/>
+        <w:gridCol w:w="1029"/>
+        <w:gridCol w:w="4301"/>
+      </w:tblGrid>
+      <w:tr>
+        <w:tblPrEx>
+          <w:tblCellMar>
+            <w:top w:w="0" w:type="dxa"/>
+            <w:bottom w:w="0" w:type="dxa"/>
+          </w:tblCellMar>
+        </w:tblPrEx>
+        <w:trPr>
+          <w:cantSplit/>
+          <w:tblHeader/>
+        </w:trPr>
+        <w:tc>
+          <w:tcPr>
+            <w:tcW w:w="300" w:type="pct"/>
+            <w:shd w:val="clear" w:color="auto" w:fill="F2CEED" w:themeFill="accent5" w:themeFillTint="33"/>
+            <w:tcMar>
+              <w:top w:w="30" w:type="dxa"/>
+              <w:left w:w="80" w:type="dxa"/>
+              <w:bottom w:w="30" w:type="dxa"/>
+              <w:right w:w="80" w:type="dxa"/>
+            </w:tcMar>
+          </w:tcPr>
+          <w:p>
+            <w:r>
+              <w:rPr>
+                <w:rFonts w:ascii="Aptos" w:eastAsia="Aptos" w:hAnsi="Aptos" w:cs="Aptos"/>
+                <w:b/>
+                <w:bCs/>
+                <w:sz w:val="20"/>
+                <w:szCs w:val="20"/>
+              </w:rPr>
+              <w:t>No.</w:t>
+            </w:r>
+          </w:p>
+        </w:tc>
+        <w:tc>
+          <w:tcPr>
+            <w:tcW w:w="1850" w:type="pct"/>
+            <w:shd w:val="clear" w:color="auto" w:fill="F2CEED" w:themeFill="accent5" w:themeFillTint="33"/>
+            <w:tcMar>
+              <w:top w:w="30" w:type="dxa"/>
+              <w:left w:w="80" w:type="dxa"/>
+              <w:bottom w:w="30" w:type="dxa"/>
+              <w:right w:w="80" w:type="dxa"/>
+            </w:tcMar>
+          </w:tcPr>
+          <w:p>
+            <w:r>
+              <w:rPr>
+                <w:rFonts w:ascii="Aptos" w:eastAsia="Aptos" w:hAnsi="Aptos" w:cs="Aptos"/>
+                <w:b/>
+                <w:bCs/>
+                <w:sz w:val="20"/>
+                <w:szCs w:val="20"/>
+              </w:rPr>
+              <w:t>Test</w:t>
+            </w:r>
+          </w:p>
+        </w:tc>
+        <w:tc>
+          <w:tcPr>
+            <w:tcW w:w="550" w:type="pct"/>
+            <w:shd w:val="clear" w:color="auto" w:fill="F2CEED" w:themeFill="accent5" w:themeFillTint="33"/>
+            <w:tcMar>
+              <w:top w:w="30" w:type="dxa"/>
+              <w:left w:w="80" w:type="dxa"/>
+              <w:bottom w:w="30" w:type="dxa"/>
+              <w:right w:w="80" w:type="dxa"/>
+            </w:tcMar>
+          </w:tcPr>
+          <w:p>
+            <w:r>
+              <w:rPr>
+                <w:rFonts w:ascii="Aptos" w:eastAsia="Aptos" w:hAnsi="Aptos" w:cs="Aptos"/>
+                <w:b/>
+                <w:bCs/>
+                <w:sz w:val="20"/>
+                <w:szCs w:val="20"/>
+              </w:rPr>
+              <w:t>Type</w:t>
+            </w:r>
+          </w:p>
+        </w:tc>
+        <w:tc>
+          <w:tcPr>
+            <w:tcW w:w="2300" w:type="pct"/>
+            <w:shd w:val="clear" w:color="auto" w:fill="F2CEED" w:themeFill="accent5" w:themeFillTint="33"/>
+            <w:tcMar>
+              <w:top w:w="30" w:type="dxa"/>
+              <w:left w:w="80" w:type="dxa"/>
+              <w:bottom w:w="30" w:type="dxa"/>
+              <w:right w:w="80" w:type="dxa"/>
+            </w:tcMar>
+          </w:tcPr>
+          <w:p>
+            <w:r>
+              <w:rPr>
+                <w:rFonts w:ascii="Aptos" w:eastAsia="Aptos" w:hAnsi="Aptos" w:cs="Aptos"/>
+                <w:b/>
+                <w:bCs/>
+                <w:sz w:val="20"/>
+                <w:szCs w:val="20"/>
+              </w:rPr>
+              <w:t>Expected Result</w:t>
+            </w:r>
+          </w:p>
+        </w:tc>
+      </w:tr>
+      <w:tr>
+        <w:tblPrEx>
+          <w:tblCellMar>
+            <w:top w:w="0" w:type="dxa"/>
+            <w:bottom w:w="0" w:type="dxa"/>
+          </w:tblCellMar>
+        </w:tblPrEx>
+        <w:trPr>
+          <w:cantSplit/>
+        </w:trPr>
+        <w:tc>
+          <w:tcPr>
+            <w:tcW w:w="300" w:type="pct"/>
+            <w:tcMar>
+              <w:top w:w="30" w:type="dxa"/>
+              <w:left w:w="80" w:type="dxa"/>
+              <w:bottom w:w="30" w:type="dxa"/>
+              <w:right w:w="80" w:type="dxa"/>
+            </w:tcMar>
+          </w:tcPr>
+          <w:p>
+            <w:r>
+              <w:rPr>
+                <w:rFonts w:ascii="Aptos" w:eastAsia="Aptos" w:hAnsi="Aptos" w:cs="Aptos"/>
+                <w:sz w:val="20"/>
+                <w:szCs w:val="20"/>
+              </w:rPr>
+              <w:t>65</w:t>
+            </w:r>
+          </w:p>
+        </w:tc>
+        <w:tc>
+          <w:tcPr>
+            <w:tcW w:w="1850" w:type="pct"/>
+            <w:tcMar>
+              <w:top w:w="30" w:type="dxa"/>
+              <w:left w:w="80" w:type="dxa"/>
+              <w:bottom w:w="30" w:type="dxa"/>
+              <w:right w:w="80" w:type="dxa"/>
+            </w:tcMar>
+          </w:tcPr>
+          <w:p>
+            <w:r>
+              <w:rPr>
+                <w:rFonts w:ascii="Aptos" w:eastAsia="Aptos" w:hAnsi="Aptos" w:cs="Aptos"/>
+                <w:sz w:val="20"/>
+                <w:szCs w:val="20"/>
+              </w:rPr>
+              <w:t>Log in successfully and then open the Logs form</w:t>
+            </w:r>
+          </w:p>
+        </w:tc>
+        <w:tc>
+          <w:tcPr>
+            <w:tcW w:w="550" w:type="pct"/>
+            <w:tcMar>
+              <w:top w:w="30" w:type="dxa"/>
+              <w:left w:w="80" w:type="dxa"/>
+              <w:bottom w:w="30" w:type="dxa"/>
+              <w:right w:w="80" w:type="dxa"/>
+            </w:tcMar>
+          </w:tcPr>
+          <w:p>
+            <w:r>
+              <w:rPr>
+                <w:rFonts w:ascii="Aptos" w:eastAsia="Aptos" w:hAnsi="Aptos" w:cs="Aptos"/>
+                <w:sz w:val="20"/>
+                <w:szCs w:val="20"/>
+              </w:rPr>
+              <w:t>Normal</w:t>
+            </w:r>
+          </w:p>
+        </w:tc>
+        <w:tc>
+          <w:tcPr>
+            <w:tcW w:w="2300" w:type="pct"/>
+            <w:tcMar>
+              <w:top w:w="30" w:type="dxa"/>
+              <w:left w:w="80" w:type="dxa"/>
+              <w:bottom w:w="30" w:type="dxa"/>
+              <w:right w:w="80" w:type="dxa"/>
+            </w:tcMar>
+          </w:tcPr>
+          <w:p>
+            <w:r>
+              <w:rPr>
+                <w:rFonts w:ascii="Aptos" w:eastAsia="Aptos" w:hAnsi="Aptos" w:cs="Aptos"/>
+                <w:sz w:val="20"/>
+                <w:szCs w:val="20"/>
+              </w:rPr>
+              <w:t>The log grid shows an AUTH entry recording that the user logged in successfully, along with the date and time.</w:t>
+            </w:r>
+          </w:p>
+        </w:tc>
+      </w:tr>
+      <w:tr>
+        <w:tblPrEx>
+          <w:tblCellMar>
+            <w:top w:w="0" w:type="dxa"/>
+            <w:bottom w:w="0" w:type="dxa"/>
+          </w:tblCellMar>
+        </w:tblPrEx>
+        <w:trPr>
+          <w:cantSplit/>
+        </w:trPr>
+        <w:tc>
+          <w:tcPr>
+            <w:tcW w:w="300" w:type="pct"/>
+            <w:tcMar>
+              <w:top w:w="30" w:type="dxa"/>
+              <w:left w:w="80" w:type="dxa"/>
+              <w:bottom w:w="30" w:type="dxa"/>
+              <w:right w:w="80" w:type="dxa"/>
+            </w:tcMar>
+          </w:tcPr>
+          <w:p>
+            <w:r>
+              <w:rPr>
+                <w:rFonts w:ascii="Aptos" w:eastAsia="Aptos" w:hAnsi="Aptos" w:cs="Aptos"/>
+                <w:sz w:val="20"/>
+                <w:szCs w:val="20"/>
+              </w:rPr>
+              <w:t>66</w:t>
+            </w:r>
+          </w:p>
+        </w:tc>
+        <w:tc>
+          <w:tcPr>
+            <w:tcW w:w="1850" w:type="pct"/>
+            <w:tcMar>
+              <w:top w:w="30" w:type="dxa"/>
+              <w:left w:w="80" w:type="dxa"/>
+              <w:bottom w:w="30" w:type="dxa"/>
+              <w:right w:w="80" w:type="dxa"/>
+            </w:tcMar>
+          </w:tcPr>
+          <w:p>
+            <w:r>
+              <w:rPr>
+                <w:rFonts w:ascii="Aptos" w:eastAsia="Aptos" w:hAnsi="Aptos" w:cs="Aptos"/>
+                <w:sz w:val="20"/>
+                <w:szCs w:val="20"/>
+              </w:rPr>
+              <w:t>Create a booking and then open the Logs form</w:t>
+            </w:r>
+          </w:p>
+        </w:tc>
+        <w:tc>
+          <w:tcPr>
+            <w:tcW w:w="550" w:type="pct"/>
+            <w:tcMar>
+              <w:top w:w="30" w:type="dxa"/>
+              <w:left w:w="80" w:type="dxa"/>
+              <w:bottom w:w="30" w:type="dxa"/>
+              <w:right w:w="80" w:type="dxa"/>
+            </w:tcMar>
+          </w:tcPr>
+          <w:p>
+            <w:r>
+              <w:rPr>
+                <w:rFonts w:ascii="Aptos" w:eastAsia="Aptos" w:hAnsi="Aptos" w:cs="Aptos"/>
+                <w:sz w:val="20"/>
+                <w:szCs w:val="20"/>
+              </w:rPr>
+              <w:t>Normal</w:t>
+            </w:r>
+          </w:p>
+        </w:tc>
+        <w:tc>
+          <w:tcPr>
+            <w:tcW w:w="2300" w:type="pct"/>
+            <w:tcMar>
+              <w:top w:w="30" w:type="dxa"/>
+              <w:left w:w="80" w:type="dxa"/>
+              <w:bottom w:w="30" w:type="dxa"/>
+              <w:right w:w="80" w:type="dxa"/>
+            </w:tcMar>
+          </w:tcPr>
+          <w:p>
+            <w:r>
+              <w:rPr>
+                <w:rFonts w:ascii="Aptos" w:eastAsia="Aptos" w:hAnsi="Aptos" w:cs="Aptos"/>
+                <w:sz w:val="20"/>
+                <w:szCs w:val="20"/>
+              </w:rPr>
+              <w:t>The log shows a BOOKING entry recording that a booking was created, including the number of seats and a timestamp.</w:t>
+            </w:r>
+          </w:p>
+        </w:tc>
+      </w:tr>
+      <w:tr>
+        <w:tblPrEx>
+          <w:tblCellMar>
+            <w:top w:w="0" w:type="dxa"/>
+            <w:bottom w:w="0" w:type="dxa"/>
+          </w:tblCellMar>
+        </w:tblPrEx>
+        <w:trPr>
+          <w:cantSplit/>
+        </w:trPr>
+        <w:tc>
+          <w:tcPr>
+            <w:tcW w:w="300" w:type="pct"/>
+            <w:tcMar>
+              <w:top w:w="30" w:type="dxa"/>
+              <w:left w:w="80" w:type="dxa"/>
+              <w:bottom w:w="30" w:type="dxa"/>
+              <w:right w:w="80" w:type="dxa"/>
+            </w:tcMar>
+          </w:tcPr>
+          <w:p>
+            <w:r>
+              <w:rPr>
+                <w:rFonts w:ascii="Aptos" w:eastAsia="Aptos" w:hAnsi="Aptos" w:cs="Aptos"/>
+                <w:sz w:val="20"/>
+                <w:szCs w:val="20"/>
+              </w:rPr>
+              <w:t>67</w:t>
+            </w:r>
+          </w:p>
+        </w:tc>
+        <w:tc>
+          <w:tcPr>
+            <w:tcW w:w="1850" w:type="pct"/>
+            <w:tcMar>
+              <w:top w:w="30" w:type="dxa"/>
+              <w:left w:w="80" w:type="dxa"/>
+              <w:bottom w:w="30" w:type="dxa"/>
+              <w:right w:w="80" w:type="dxa"/>
+            </w:tcMar>
+          </w:tcPr>
+          <w:p>
+            <w:r>
+              <w:rPr>
+                <w:rFonts w:ascii="Aptos" w:eastAsia="Aptos" w:hAnsi="Aptos" w:cs="Aptos"/>
+                <w:sz w:val="20"/>
+                <w:szCs w:val="20"/>
+              </w:rPr>
+              <w:t>Cancel a booking and then open the Logs form</w:t>
+            </w:r>
+          </w:p>
+        </w:tc>
+        <w:tc>
+          <w:tcPr>
+            <w:tcW w:w="550" w:type="pct"/>
+            <w:tcMar>
+              <w:top w:w="30" w:type="dxa"/>
+              <w:left w:w="80" w:type="dxa"/>
+              <w:bottom w:w="30" w:type="dxa"/>
+              <w:right w:w="80" w:type="dxa"/>
+            </w:tcMar>
+          </w:tcPr>
+          <w:p>
+            <w:r>
+              <w:rPr>
+                <w:rFonts w:ascii="Aptos" w:eastAsia="Aptos" w:hAnsi="Aptos" w:cs="Aptos"/>
+                <w:sz w:val="20"/>
+                <w:szCs w:val="20"/>
+              </w:rPr>
+              <w:t>Normal</w:t>
+            </w:r>
+          </w:p>
+        </w:tc>
+        <w:tc>
+          <w:tcPr>
+            <w:tcW w:w="2300" w:type="pct"/>
+            <w:tcMar>
+              <w:top w:w="30" w:type="dxa"/>
+              <w:left w:w="80" w:type="dxa"/>
+              <w:bottom w:w="30" w:type="dxa"/>
+              <w:right w:w="80" w:type="dxa"/>
+            </w:tcMar>
+          </w:tcPr>
+          <w:p>
+            <w:r>
+              <w:rPr>
+                <w:rFonts w:ascii="Aptos" w:eastAsia="Aptos" w:hAnsi="Aptos" w:cs="Aptos"/>
+                <w:sz w:val="20"/>
+                <w:szCs w:val="20"/>
+              </w:rPr>
+              <w:t>The log shows a BOOKING entry recording that the booking was cancelled, along with a timestamp.</w:t>
             </w:r>
           </w:p>
         </w:tc>

</xml_diff>

<commit_message>
added wholesystem test plan
</commit_message>
<xml_diff>
--- a/Testing.docx
+++ b/Testing.docx
@@ -8802,6 +8802,352 @@
       </w:tr>
     </w:tbl>
     <w:p/>
+    <w:p>
+      <w:pPr>
+        <w:pStyle w:val="Heading3"/>
+      </w:pPr>
+      <w:r>
+        <w:rPr>
+          <w:rFonts w:ascii="Aptos Display" w:eastAsia="Aptos Display" w:hAnsi="Aptos Display" w:cs="Aptos Display"/>
+          <w:b/>
+          <w:bCs/>
+          <w:color w:val="000000"/>
+        </w:rPr>
+        <w:t>Whole System Test</w:t>
+      </w:r>
+    </w:p>
+    <w:p>
+      <w:r>
+        <w:rPr>
+          <w:rFonts w:ascii="Aptos" w:eastAsia="Aptos" w:hAnsi="Aptos" w:cs="Aptos"/>
+        </w:rPr>
+        <w:t>The final tests check that all of the parts of the system work together as one process, by running a complete booking lifecycle from start to finish and then confirming that every action was logged.</w:t>
+      </w:r>
+    </w:p>
+    <w:tbl>
+      <w:tblPr>
+        <w:tblW w:w="5000" w:type="pct"/>
+        <w:tblBorders>
+          <w:top w:val="single" w:sz="4" w:space="0" w:color="808080"/>
+          <w:left w:val="single" w:sz="4" w:space="0" w:color="808080"/>
+          <w:bottom w:val="single" w:sz="4" w:space="0" w:color="808080"/>
+          <w:right w:val="single" w:sz="4" w:space="0" w:color="808080"/>
+          <w:insideH w:val="single" w:sz="4" w:space="0" w:color="808080"/>
+          <w:insideV w:val="single" w:sz="4" w:space="0" w:color="808080"/>
+        </w:tblBorders>
+        <w:tblCellMar>
+          <w:left w:w="10" w:type="dxa"/>
+          <w:right w:w="10" w:type="dxa"/>
+        </w:tblCellMar>
+        <w:tblLook w:val="0000" w:firstRow="0" w:lastRow="0" w:firstColumn="0" w:lastColumn="0" w:noHBand="0" w:noVBand="0"/>
+      </w:tblPr>
+      <w:tblGrid>
+        <w:gridCol w:w="560"/>
+        <w:gridCol w:w="3460"/>
+        <w:gridCol w:w="1029"/>
+        <w:gridCol w:w="4301"/>
+      </w:tblGrid>
+      <w:tr>
+        <w:tblPrEx>
+          <w:tblCellMar>
+            <w:top w:w="0" w:type="dxa"/>
+            <w:bottom w:w="0" w:type="dxa"/>
+          </w:tblCellMar>
+        </w:tblPrEx>
+        <w:trPr>
+          <w:cantSplit/>
+          <w:tblHeader/>
+        </w:trPr>
+        <w:tc>
+          <w:tcPr>
+            <w:tcW w:w="300" w:type="pct"/>
+            <w:shd w:val="clear" w:color="auto" w:fill="F2CEED" w:themeFill="accent5" w:themeFillTint="33"/>
+            <w:tcMar>
+              <w:top w:w="30" w:type="dxa"/>
+              <w:left w:w="80" w:type="dxa"/>
+              <w:bottom w:w="30" w:type="dxa"/>
+              <w:right w:w="80" w:type="dxa"/>
+            </w:tcMar>
+          </w:tcPr>
+          <w:p>
+            <w:r>
+              <w:rPr>
+                <w:rFonts w:ascii="Aptos" w:eastAsia="Aptos" w:hAnsi="Aptos" w:cs="Aptos"/>
+                <w:b/>
+                <w:bCs/>
+                <w:sz w:val="20"/>
+                <w:szCs w:val="20"/>
+              </w:rPr>
+              <w:t>No.</w:t>
+            </w:r>
+          </w:p>
+        </w:tc>
+        <w:tc>
+          <w:tcPr>
+            <w:tcW w:w="1850" w:type="pct"/>
+            <w:shd w:val="clear" w:color="auto" w:fill="F2CEED" w:themeFill="accent5" w:themeFillTint="33"/>
+            <w:tcMar>
+              <w:top w:w="30" w:type="dxa"/>
+              <w:left w:w="80" w:type="dxa"/>
+              <w:bottom w:w="30" w:type="dxa"/>
+              <w:right w:w="80" w:type="dxa"/>
+            </w:tcMar>
+          </w:tcPr>
+          <w:p>
+            <w:r>
+              <w:rPr>
+                <w:rFonts w:ascii="Aptos" w:eastAsia="Aptos" w:hAnsi="Aptos" w:cs="Aptos"/>
+                <w:b/>
+                <w:bCs/>
+                <w:sz w:val="20"/>
+                <w:szCs w:val="20"/>
+              </w:rPr>
+              <w:t>Test</w:t>
+            </w:r>
+          </w:p>
+        </w:tc>
+        <w:tc>
+          <w:tcPr>
+            <w:tcW w:w="550" w:type="pct"/>
+            <w:shd w:val="clear" w:color="auto" w:fill="F2CEED" w:themeFill="accent5" w:themeFillTint="33"/>
+            <w:tcMar>
+              <w:top w:w="30" w:type="dxa"/>
+              <w:left w:w="80" w:type="dxa"/>
+              <w:bottom w:w="30" w:type="dxa"/>
+              <w:right w:w="80" w:type="dxa"/>
+            </w:tcMar>
+          </w:tcPr>
+          <w:p>
+            <w:r>
+              <w:rPr>
+                <w:rFonts w:ascii="Aptos" w:eastAsia="Aptos" w:hAnsi="Aptos" w:cs="Aptos"/>
+                <w:b/>
+                <w:bCs/>
+                <w:sz w:val="20"/>
+                <w:szCs w:val="20"/>
+              </w:rPr>
+              <w:t>Type</w:t>
+            </w:r>
+          </w:p>
+        </w:tc>
+        <w:tc>
+          <w:tcPr>
+            <w:tcW w:w="2300" w:type="pct"/>
+            <w:shd w:val="clear" w:color="auto" w:fill="F2CEED" w:themeFill="accent5" w:themeFillTint="33"/>
+            <w:tcMar>
+              <w:top w:w="30" w:type="dxa"/>
+              <w:left w:w="80" w:type="dxa"/>
+              <w:bottom w:w="30" w:type="dxa"/>
+              <w:right w:w="80" w:type="dxa"/>
+            </w:tcMar>
+          </w:tcPr>
+          <w:p>
+            <w:r>
+              <w:rPr>
+                <w:rFonts w:ascii="Aptos" w:eastAsia="Aptos" w:hAnsi="Aptos" w:cs="Aptos"/>
+                <w:b/>
+                <w:bCs/>
+                <w:sz w:val="20"/>
+                <w:szCs w:val="20"/>
+              </w:rPr>
+              <w:t>Expected Result</w:t>
+            </w:r>
+          </w:p>
+        </w:tc>
+      </w:tr>
+      <w:tr>
+        <w:tblPrEx>
+          <w:tblCellMar>
+            <w:top w:w="0" w:type="dxa"/>
+            <w:bottom w:w="0" w:type="dxa"/>
+          </w:tblCellMar>
+        </w:tblPrEx>
+        <w:trPr>
+          <w:cantSplit/>
+        </w:trPr>
+        <w:tc>
+          <w:tcPr>
+            <w:tcW w:w="300" w:type="pct"/>
+            <w:tcMar>
+              <w:top w:w="30" w:type="dxa"/>
+              <w:left w:w="80" w:type="dxa"/>
+              <w:bottom w:w="30" w:type="dxa"/>
+              <w:right w:w="80" w:type="dxa"/>
+            </w:tcMar>
+          </w:tcPr>
+          <w:p>
+            <w:r>
+              <w:rPr>
+                <w:rFonts w:ascii="Aptos" w:eastAsia="Aptos" w:hAnsi="Aptos" w:cs="Aptos"/>
+                <w:sz w:val="20"/>
+                <w:szCs w:val="20"/>
+              </w:rPr>
+              <w:t>68</w:t>
+            </w:r>
+          </w:p>
+        </w:tc>
+        <w:tc>
+          <w:tcPr>
+            <w:tcW w:w="1850" w:type="pct"/>
+            <w:tcMar>
+              <w:top w:w="30" w:type="dxa"/>
+              <w:left w:w="80" w:type="dxa"/>
+              <w:bottom w:w="30" w:type="dxa"/>
+              <w:right w:w="80" w:type="dxa"/>
+            </w:tcMar>
+          </w:tcPr>
+          <w:p>
+            <w:r>
+              <w:rPr>
+                <w:rFonts w:ascii="Aptos" w:eastAsia="Aptos" w:hAnsi="Aptos" w:cs="Aptos"/>
+                <w:sz w:val="20"/>
+                <w:szCs w:val="20"/>
+              </w:rPr>
+              <w:t>Log in as a manager, add a new film Dune (12A, 166), add a screening for it on Screen 1 for a future date at 18:00 priced 10.00, add a new customer Liam Brown with valid details, make a booking for Liam Brown of one seat on that screening, add 1 Large Popcorn to the booking, search for Brown, load the register for the Dune screening, run the sales report, then cancel the booking</w:t>
+            </w:r>
+          </w:p>
+        </w:tc>
+        <w:tc>
+          <w:tcPr>
+            <w:tcW w:w="550" w:type="pct"/>
+            <w:tcMar>
+              <w:top w:w="30" w:type="dxa"/>
+              <w:left w:w="80" w:type="dxa"/>
+              <w:bottom w:w="30" w:type="dxa"/>
+              <w:right w:w="80" w:type="dxa"/>
+            </w:tcMar>
+          </w:tcPr>
+          <w:p>
+            <w:r>
+              <w:rPr>
+                <w:rFonts w:ascii="Aptos" w:eastAsia="Aptos" w:hAnsi="Aptos" w:cs="Aptos"/>
+                <w:sz w:val="20"/>
+                <w:szCs w:val="20"/>
+              </w:rPr>
+              <w:t>Normal</w:t>
+            </w:r>
+          </w:p>
+        </w:tc>
+        <w:tc>
+          <w:tcPr>
+            <w:tcW w:w="2300" w:type="pct"/>
+            <w:tcMar>
+              <w:top w:w="30" w:type="dxa"/>
+              <w:left w:w="80" w:type="dxa"/>
+              <w:bottom w:w="30" w:type="dxa"/>
+              <w:right w:w="80" w:type="dxa"/>
+            </w:tcMar>
+          </w:tcPr>
+          <w:p>
+            <w:r>
+              <w:rPr>
+                <w:rFonts w:ascii="Aptos" w:eastAsia="Aptos" w:hAnsi="Aptos" w:cs="Aptos"/>
+                <w:sz w:val="20"/>
+                <w:szCs w:val="20"/>
+              </w:rPr>
+              <w:t>Every step completes without error and the data stays consistent throughout. The booking appears in the search and on the register with the popcorn on its order, the sales report includes the £10.00 ticket and £4.50 of food, and after the booking is cancelled the seat is freed and the report total drops by £14.50.</w:t>
+            </w:r>
+          </w:p>
+        </w:tc>
+      </w:tr>
+      <w:tr>
+        <w:tblPrEx>
+          <w:tblCellMar>
+            <w:top w:w="0" w:type="dxa"/>
+            <w:bottom w:w="0" w:type="dxa"/>
+          </w:tblCellMar>
+        </w:tblPrEx>
+        <w:trPr>
+          <w:cantSplit/>
+        </w:trPr>
+        <w:tc>
+          <w:tcPr>
+            <w:tcW w:w="300" w:type="pct"/>
+            <w:tcMar>
+              <w:top w:w="30" w:type="dxa"/>
+              <w:left w:w="80" w:type="dxa"/>
+              <w:bottom w:w="30" w:type="dxa"/>
+              <w:right w:w="80" w:type="dxa"/>
+            </w:tcMar>
+          </w:tcPr>
+          <w:p>
+            <w:r>
+              <w:rPr>
+                <w:rFonts w:ascii="Aptos" w:eastAsia="Aptos" w:hAnsi="Aptos" w:cs="Aptos"/>
+                <w:sz w:val="20"/>
+                <w:szCs w:val="20"/>
+              </w:rPr>
+              <w:lastRenderedPageBreak/>
+              <w:t>69</w:t>
+            </w:r>
+          </w:p>
+        </w:tc>
+        <w:tc>
+          <w:tcPr>
+            <w:tcW w:w="1850" w:type="pct"/>
+            <w:tcMar>
+              <w:top w:w="30" w:type="dxa"/>
+              <w:left w:w="80" w:type="dxa"/>
+              <w:bottom w:w="30" w:type="dxa"/>
+              <w:right w:w="80" w:type="dxa"/>
+            </w:tcMar>
+          </w:tcPr>
+          <w:p>
+            <w:r>
+              <w:rPr>
+                <w:rFonts w:ascii="Aptos" w:eastAsia="Aptos" w:hAnsi="Aptos" w:cs="Aptos"/>
+                <w:sz w:val="20"/>
+                <w:szCs w:val="20"/>
+              </w:rPr>
+              <w:t>After completing the whole system test above, open the Logs form</w:t>
+            </w:r>
+          </w:p>
+        </w:tc>
+        <w:tc>
+          <w:tcPr>
+            <w:tcW w:w="550" w:type="pct"/>
+            <w:tcMar>
+              <w:top w:w="30" w:type="dxa"/>
+              <w:left w:w="80" w:type="dxa"/>
+              <w:bottom w:w="30" w:type="dxa"/>
+              <w:right w:w="80" w:type="dxa"/>
+            </w:tcMar>
+          </w:tcPr>
+          <w:p>
+            <w:r>
+              <w:rPr>
+                <w:rFonts w:ascii="Aptos" w:eastAsia="Aptos" w:hAnsi="Aptos" w:cs="Aptos"/>
+                <w:sz w:val="20"/>
+                <w:szCs w:val="20"/>
+              </w:rPr>
+              <w:t>Normal</w:t>
+            </w:r>
+          </w:p>
+        </w:tc>
+        <w:tc>
+          <w:tcPr>
+            <w:tcW w:w="2300" w:type="pct"/>
+            <w:tcMar>
+              <w:top w:w="30" w:type="dxa"/>
+              <w:left w:w="80" w:type="dxa"/>
+              <w:bottom w:w="30" w:type="dxa"/>
+              <w:right w:w="80" w:type="dxa"/>
+            </w:tcMar>
+          </w:tcPr>
+          <w:p>
+            <w:r>
+              <w:rPr>
+                <w:rFonts w:ascii="Aptos" w:eastAsia="Aptos" w:hAnsi="Aptos" w:cs="Aptos"/>
+                <w:sz w:val="20"/>
+                <w:szCs w:val="20"/>
+              </w:rPr>
+              <w:t>The log contains an entry for each action carried out during the whole system test, such as the film being added, the screening being added, the customer being added, the booking being created, food being added, the register being loaded, the report being run and the booking being cancelled, each with a timestamp.</w:t>
+            </w:r>
+          </w:p>
+        </w:tc>
+      </w:tr>
+    </w:tbl>
+    <w:p/>
     <w:p/>
     <w:sectPr>
       <w:headerReference w:type="even" r:id="rId7"/>
@@ -8913,6 +9259,7 @@
         <w:docPartUnique/>
       </w:docPartObj>
     </w:sdtPr>
+    <w:sdtEndPr/>
     <w:sdtContent>
       <w:p>
         <w:pPr>

</xml_diff>

<commit_message>
started the frmSettings, created the CreateBackup(). made it work and added a WriteLogs() line to it too. works well
</commit_message>
<xml_diff>
--- a/Testing.docx
+++ b/Testing.docx
@@ -1,6 +1,6 @@
 
 <file path=word/document.xml><?xml version="1.0" encoding="utf-8"?>
-<w:document xmlns:wpc="http://schemas.microsoft.com/office/word/2010/wordprocessingCanvas" xmlns:cx="http://schemas.microsoft.com/office/drawing/2014/chartex" xmlns:cx1="http://schemas.microsoft.com/office/drawing/2015/9/8/chartex" xmlns:cx2="http://schemas.microsoft.com/office/drawing/2015/10/21/chartex" xmlns:cx3="http://schemas.microsoft.com/office/drawing/2016/5/9/chartex" xmlns:cx4="http://schemas.microsoft.com/office/drawing/2016/5/10/chartex" xmlns:cx5="http://schemas.microsoft.com/office/drawing/2016/5/11/chartex" xmlns:cx6="http://schemas.microsoft.com/office/drawing/2016/5/12/chartex" xmlns:cx7="http://schemas.microsoft.com/office/drawing/2016/5/13/chartex" xmlns:cx8="http://schemas.microsoft.com/office/drawing/2016/5/14/chartex" xmlns:mc="http://schemas.openxmlformats.org/markup-compatibility/2006" xmlns:aink="http://schemas.microsoft.com/office/drawing/2016/ink" xmlns:am3d="http://schemas.microsoft.com/office/drawing/2017/model3d" xmlns:o="urn:schemas-microsoft-com:office:office" xmlns:oel="http://schemas.microsoft.com/office/2019/extlst" xmlns:r="http://schemas.openxmlformats.org/officeDocument/2006/relationships" xmlns:m="http://schemas.openxmlformats.org/officeDocument/2006/math" xmlns:v="urn:schemas-microsoft-com:vml" xmlns:wp14="http://schemas.microsoft.com/office/word/2010/wordprocessingDrawing" xmlns:wp="http://schemas.openxmlformats.org/drawingml/2006/wordprocessingDrawing" xmlns:w10="urn:schemas-microsoft-com:office:word" xmlns:w="http://schemas.openxmlformats.org/wordprocessingml/2006/main" xmlns:w14="http://schemas.microsoft.com/office/word/2010/wordml" xmlns:w15="http://schemas.microsoft.com/office/word/2012/wordml" xmlns:w16cex="http://schemas.microsoft.com/office/word/2018/wordml/cex" xmlns:w16cid="http://schemas.microsoft.com/office/word/2016/wordml/cid" xmlns:w16="http://schemas.microsoft.com/office/word/2018/wordml" xmlns:w16du="http://schemas.microsoft.com/office/word/2023/wordml/word16du" xmlns:w16sdtdh="http://schemas.microsoft.com/office/word/2020/wordml/sdtdatahash" xmlns:w16sdtfl="http://schemas.microsoft.com/office/word/2024/wordml/sdtformatlock" xmlns:w16se="http://schemas.microsoft.com/office/word/2015/wordml/symex" xmlns:wpg="http://schemas.microsoft.com/office/word/2010/wordprocessingGroup" xmlns:wpi="http://schemas.microsoft.com/office/word/2010/wordprocessingInk" xmlns:wne="http://schemas.microsoft.com/office/word/2006/wordml" xmlns:wps="http://schemas.microsoft.com/office/word/2010/wordprocessingShape" mc:Ignorable="w14 w15 w16se w16cid w16 w16cex w16sdtdh w16sdtfl w16du wp14">
+<w:document xmlns:wpc="http://schemas.microsoft.com/office/word/2010/wordprocessingCanvas" xmlns:cx="http://schemas.microsoft.com/office/drawing/2014/chartex" xmlns:cx1="http://schemas.microsoft.com/office/drawing/2015/9/8/chartex" xmlns:cx2="http://schemas.microsoft.com/office/drawing/2015/10/21/chartex" xmlns:cx3="http://schemas.microsoft.com/office/drawing/2016/5/9/chartex" xmlns:cx4="http://schemas.microsoft.com/office/drawing/2016/5/10/chartex" xmlns:cx5="http://schemas.microsoft.com/office/drawing/2016/5/11/chartex" xmlns:cx6="http://schemas.microsoft.com/office/drawing/2016/5/12/chartex" xmlns:cx7="http://schemas.microsoft.com/office/drawing/2016/5/13/chartex" xmlns:cx8="http://schemas.microsoft.com/office/drawing/2016/5/14/chartex" xmlns:mc="http://schemas.openxmlformats.org/markup-compatibility/2006" xmlns:aink="http://schemas.microsoft.com/office/drawing/2016/ink" xmlns:am3d="http://schemas.microsoft.com/office/drawing/2017/model3d" xmlns:o="urn:schemas-microsoft-com:office:office" xmlns:oel="http://schemas.microsoft.com/office/2019/extlst" xmlns:r="http://schemas.openxmlformats.org/officeDocument/2006/relationships" xmlns:m="http://schemas.openxmlformats.org/officeDocument/2006/math" xmlns:v="urn:schemas-microsoft-com:vml" xmlns:wp14="http://schemas.microsoft.com/office/word/2010/wordprocessingDrawing" xmlns:wp="http://schemas.openxmlformats.org/drawingml/2006/wordprocessingDrawing" xmlns:w10="urn:schemas-microsoft-com:office:word" xmlns:w="http://schemas.openxmlformats.org/wordprocessingml/2006/main" xmlns:w14="http://schemas.microsoft.com/office/word/2010/wordml" xmlns:w15="http://schemas.microsoft.com/office/word/2012/wordml" xmlns:w16cei="http://schemas.microsoft.com/office/word/2026/wordml/cei" xmlns:w16cex="http://schemas.microsoft.com/office/word/2018/wordml/cex" xmlns:w16cid="http://schemas.microsoft.com/office/word/2016/wordml/cid" xmlns:w16="http://schemas.microsoft.com/office/word/2018/wordml" xmlns:w16du="http://schemas.microsoft.com/office/word/2023/wordml/word16du" xmlns:w16sdtdh="http://schemas.microsoft.com/office/word/2020/wordml/sdtdatahash" xmlns:w16sdtfl="http://schemas.microsoft.com/office/word/2024/wordml/sdtformatlock" xmlns:w16se="http://schemas.microsoft.com/office/word/2015/wordml/symex" xmlns:wpg="http://schemas.microsoft.com/office/word/2010/wordprocessingGroup" xmlns:wpi="http://schemas.microsoft.com/office/word/2010/wordprocessingInk" xmlns:wne="http://schemas.microsoft.com/office/word/2006/wordml" xmlns:wps="http://schemas.microsoft.com/office/word/2010/wordprocessingShape" mc:Ignorable="w14 w15 w16se w16cid w16 w16cex w16sdtdh w16sdtfl w16du wp14">
   <w:body>
     <w:p>
       <w:pPr>
@@ -162,12 +162,6 @@
         <w:gridCol w:w="4295"/>
       </w:tblGrid>
       <w:tr>
-        <w:tblPrEx>
-          <w:tblCellMar>
-            <w:top w:w="0" w:type="dxa"/>
-            <w:bottom w:w="0" w:type="dxa"/>
-          </w:tblCellMar>
-        </w:tblPrEx>
         <w:trPr>
           <w:cantSplit/>
           <w:tblHeader/>
@@ -271,12 +265,6 @@
         </w:tc>
       </w:tr>
       <w:tr>
-        <w:tblPrEx>
-          <w:tblCellMar>
-            <w:top w:w="0" w:type="dxa"/>
-            <w:bottom w:w="0" w:type="dxa"/>
-          </w:tblCellMar>
-        </w:tblPrEx>
         <w:trPr>
           <w:cantSplit/>
         </w:trPr>
@@ -366,12 +354,6 @@
         </w:tc>
       </w:tr>
       <w:tr>
-        <w:tblPrEx>
-          <w:tblCellMar>
-            <w:top w:w="0" w:type="dxa"/>
-            <w:bottom w:w="0" w:type="dxa"/>
-          </w:tblCellMar>
-        </w:tblPrEx>
         <w:trPr>
           <w:cantSplit/>
         </w:trPr>
@@ -461,12 +443,6 @@
         </w:tc>
       </w:tr>
       <w:tr>
-        <w:tblPrEx>
-          <w:tblCellMar>
-            <w:top w:w="0" w:type="dxa"/>
-            <w:bottom w:w="0" w:type="dxa"/>
-          </w:tblCellMar>
-        </w:tblPrEx>
         <w:trPr>
           <w:cantSplit/>
         </w:trPr>
@@ -556,12 +532,6 @@
         </w:tc>
       </w:tr>
       <w:tr>
-        <w:tblPrEx>
-          <w:tblCellMar>
-            <w:top w:w="0" w:type="dxa"/>
-            <w:bottom w:w="0" w:type="dxa"/>
-          </w:tblCellMar>
-        </w:tblPrEx>
         <w:trPr>
           <w:cantSplit/>
         </w:trPr>
@@ -669,12 +639,6 @@
         </w:tc>
       </w:tr>
       <w:tr>
-        <w:tblPrEx>
-          <w:tblCellMar>
-            <w:top w:w="0" w:type="dxa"/>
-            <w:bottom w:w="0" w:type="dxa"/>
-          </w:tblCellMar>
-        </w:tblPrEx>
         <w:trPr>
           <w:cantSplit/>
         </w:trPr>
@@ -811,12 +775,6 @@
         <w:gridCol w:w="4295"/>
       </w:tblGrid>
       <w:tr>
-        <w:tblPrEx>
-          <w:tblCellMar>
-            <w:top w:w="0" w:type="dxa"/>
-            <w:bottom w:w="0" w:type="dxa"/>
-          </w:tblCellMar>
-        </w:tblPrEx>
         <w:trPr>
           <w:cantSplit/>
           <w:tblHeader/>
@@ -919,12 +877,6 @@
         </w:tc>
       </w:tr>
       <w:tr>
-        <w:tblPrEx>
-          <w:tblCellMar>
-            <w:top w:w="0" w:type="dxa"/>
-            <w:bottom w:w="0" w:type="dxa"/>
-          </w:tblCellMar>
-        </w:tblPrEx>
         <w:trPr>
           <w:cantSplit/>
         </w:trPr>
@@ -1014,12 +966,6 @@
         </w:tc>
       </w:tr>
       <w:tr>
-        <w:tblPrEx>
-          <w:tblCellMar>
-            <w:top w:w="0" w:type="dxa"/>
-            <w:bottom w:w="0" w:type="dxa"/>
-          </w:tblCellMar>
-        </w:tblPrEx>
         <w:trPr>
           <w:cantSplit/>
         </w:trPr>
@@ -1109,12 +1055,6 @@
         </w:tc>
       </w:tr>
       <w:tr>
-        <w:tblPrEx>
-          <w:tblCellMar>
-            <w:top w:w="0" w:type="dxa"/>
-            <w:bottom w:w="0" w:type="dxa"/>
-          </w:tblCellMar>
-        </w:tblPrEx>
         <w:trPr>
           <w:cantSplit/>
         </w:trPr>
@@ -1204,12 +1144,6 @@
         </w:tc>
       </w:tr>
       <w:tr>
-        <w:tblPrEx>
-          <w:tblCellMar>
-            <w:top w:w="0" w:type="dxa"/>
-            <w:bottom w:w="0" w:type="dxa"/>
-          </w:tblCellMar>
-        </w:tblPrEx>
         <w:trPr>
           <w:cantSplit/>
         </w:trPr>
@@ -1299,12 +1233,6 @@
         </w:tc>
       </w:tr>
       <w:tr>
-        <w:tblPrEx>
-          <w:tblCellMar>
-            <w:top w:w="0" w:type="dxa"/>
-            <w:bottom w:w="0" w:type="dxa"/>
-          </w:tblCellMar>
-        </w:tblPrEx>
         <w:trPr>
           <w:cantSplit/>
         </w:trPr>
@@ -1441,12 +1369,6 @@
         <w:gridCol w:w="4295"/>
       </w:tblGrid>
       <w:tr>
-        <w:tblPrEx>
-          <w:tblCellMar>
-            <w:top w:w="0" w:type="dxa"/>
-            <w:bottom w:w="0" w:type="dxa"/>
-          </w:tblCellMar>
-        </w:tblPrEx>
         <w:trPr>
           <w:cantSplit/>
           <w:tblHeader/>
@@ -1549,12 +1471,6 @@
         </w:tc>
       </w:tr>
       <w:tr>
-        <w:tblPrEx>
-          <w:tblCellMar>
-            <w:top w:w="0" w:type="dxa"/>
-            <w:bottom w:w="0" w:type="dxa"/>
-          </w:tblCellMar>
-        </w:tblPrEx>
         <w:trPr>
           <w:cantSplit/>
         </w:trPr>
@@ -1644,12 +1560,6 @@
         </w:tc>
       </w:tr>
       <w:tr>
-        <w:tblPrEx>
-          <w:tblCellMar>
-            <w:top w:w="0" w:type="dxa"/>
-            <w:bottom w:w="0" w:type="dxa"/>
-          </w:tblCellMar>
-        </w:tblPrEx>
         <w:trPr>
           <w:cantSplit/>
         </w:trPr>
@@ -1757,12 +1667,6 @@
         </w:tc>
       </w:tr>
       <w:tr>
-        <w:tblPrEx>
-          <w:tblCellMar>
-            <w:top w:w="0" w:type="dxa"/>
-            <w:bottom w:w="0" w:type="dxa"/>
-          </w:tblCellMar>
-        </w:tblPrEx>
         <w:trPr>
           <w:cantSplit/>
         </w:trPr>
@@ -1853,12 +1757,6 @@
         </w:tc>
       </w:tr>
       <w:tr>
-        <w:tblPrEx>
-          <w:tblCellMar>
-            <w:top w:w="0" w:type="dxa"/>
-            <w:bottom w:w="0" w:type="dxa"/>
-          </w:tblCellMar>
-        </w:tblPrEx>
         <w:trPr>
           <w:cantSplit/>
         </w:trPr>
@@ -1948,12 +1846,6 @@
         </w:tc>
       </w:tr>
       <w:tr>
-        <w:tblPrEx>
-          <w:tblCellMar>
-            <w:top w:w="0" w:type="dxa"/>
-            <w:bottom w:w="0" w:type="dxa"/>
-          </w:tblCellMar>
-        </w:tblPrEx>
         <w:trPr>
           <w:cantSplit/>
         </w:trPr>
@@ -2043,12 +1935,6 @@
         </w:tc>
       </w:tr>
       <w:tr>
-        <w:tblPrEx>
-          <w:tblCellMar>
-            <w:top w:w="0" w:type="dxa"/>
-            <w:bottom w:w="0" w:type="dxa"/>
-          </w:tblCellMar>
-        </w:tblPrEx>
         <w:trPr>
           <w:cantSplit/>
         </w:trPr>
@@ -2138,12 +2024,6 @@
         </w:tc>
       </w:tr>
       <w:tr>
-        <w:tblPrEx>
-          <w:tblCellMar>
-            <w:top w:w="0" w:type="dxa"/>
-            <w:bottom w:w="0" w:type="dxa"/>
-          </w:tblCellMar>
-        </w:tblPrEx>
         <w:trPr>
           <w:cantSplit/>
         </w:trPr>
@@ -2280,12 +2160,6 @@
         <w:gridCol w:w="4295"/>
       </w:tblGrid>
       <w:tr>
-        <w:tblPrEx>
-          <w:tblCellMar>
-            <w:top w:w="0" w:type="dxa"/>
-            <w:bottom w:w="0" w:type="dxa"/>
-          </w:tblCellMar>
-        </w:tblPrEx>
         <w:trPr>
           <w:cantSplit/>
           <w:tblHeader/>
@@ -2388,12 +2262,6 @@
         </w:tc>
       </w:tr>
       <w:tr>
-        <w:tblPrEx>
-          <w:tblCellMar>
-            <w:top w:w="0" w:type="dxa"/>
-            <w:bottom w:w="0" w:type="dxa"/>
-          </w:tblCellMar>
-        </w:tblPrEx>
         <w:trPr>
           <w:cantSplit/>
         </w:trPr>
@@ -2501,12 +2369,6 @@
         </w:tc>
       </w:tr>
       <w:tr>
-        <w:tblPrEx>
-          <w:tblCellMar>
-            <w:top w:w="0" w:type="dxa"/>
-            <w:bottom w:w="0" w:type="dxa"/>
-          </w:tblCellMar>
-        </w:tblPrEx>
         <w:trPr>
           <w:cantSplit/>
         </w:trPr>
@@ -2596,12 +2458,6 @@
         </w:tc>
       </w:tr>
       <w:tr>
-        <w:tblPrEx>
-          <w:tblCellMar>
-            <w:top w:w="0" w:type="dxa"/>
-            <w:bottom w:w="0" w:type="dxa"/>
-          </w:tblCellMar>
-        </w:tblPrEx>
         <w:trPr>
           <w:cantSplit/>
         </w:trPr>
@@ -2691,12 +2547,6 @@
         </w:tc>
       </w:tr>
       <w:tr>
-        <w:tblPrEx>
-          <w:tblCellMar>
-            <w:top w:w="0" w:type="dxa"/>
-            <w:bottom w:w="0" w:type="dxa"/>
-          </w:tblCellMar>
-        </w:tblPrEx>
         <w:trPr>
           <w:cantSplit/>
         </w:trPr>
@@ -2786,12 +2636,6 @@
         </w:tc>
       </w:tr>
       <w:tr>
-        <w:tblPrEx>
-          <w:tblCellMar>
-            <w:top w:w="0" w:type="dxa"/>
-            <w:bottom w:w="0" w:type="dxa"/>
-          </w:tblCellMar>
-        </w:tblPrEx>
         <w:trPr>
           <w:cantSplit/>
         </w:trPr>
@@ -2917,12 +2761,6 @@
         </w:tc>
       </w:tr>
       <w:tr>
-        <w:tblPrEx>
-          <w:tblCellMar>
-            <w:top w:w="0" w:type="dxa"/>
-            <w:bottom w:w="0" w:type="dxa"/>
-          </w:tblCellMar>
-        </w:tblPrEx>
         <w:trPr>
           <w:cantSplit/>
         </w:trPr>
@@ -3012,12 +2850,6 @@
         </w:tc>
       </w:tr>
       <w:tr>
-        <w:tblPrEx>
-          <w:tblCellMar>
-            <w:top w:w="0" w:type="dxa"/>
-            <w:bottom w:w="0" w:type="dxa"/>
-          </w:tblCellMar>
-        </w:tblPrEx>
         <w:trPr>
           <w:cantSplit/>
         </w:trPr>
@@ -3108,12 +2940,6 @@
         </w:tc>
       </w:tr>
       <w:tr>
-        <w:tblPrEx>
-          <w:tblCellMar>
-            <w:top w:w="0" w:type="dxa"/>
-            <w:bottom w:w="0" w:type="dxa"/>
-          </w:tblCellMar>
-        </w:tblPrEx>
         <w:trPr>
           <w:cantSplit/>
         </w:trPr>
@@ -3250,12 +3076,6 @@
         <w:gridCol w:w="4295"/>
       </w:tblGrid>
       <w:tr>
-        <w:tblPrEx>
-          <w:tblCellMar>
-            <w:top w:w="0" w:type="dxa"/>
-            <w:bottom w:w="0" w:type="dxa"/>
-          </w:tblCellMar>
-        </w:tblPrEx>
         <w:trPr>
           <w:cantSplit/>
           <w:tblHeader/>
@@ -3358,12 +3178,6 @@
         </w:tc>
       </w:tr>
       <w:tr>
-        <w:tblPrEx>
-          <w:tblCellMar>
-            <w:top w:w="0" w:type="dxa"/>
-            <w:bottom w:w="0" w:type="dxa"/>
-          </w:tblCellMar>
-        </w:tblPrEx>
         <w:trPr>
           <w:cantSplit/>
         </w:trPr>
@@ -3453,12 +3267,6 @@
         </w:tc>
       </w:tr>
       <w:tr>
-        <w:tblPrEx>
-          <w:tblCellMar>
-            <w:top w:w="0" w:type="dxa"/>
-            <w:bottom w:w="0" w:type="dxa"/>
-          </w:tblCellMar>
-        </w:tblPrEx>
         <w:trPr>
           <w:cantSplit/>
         </w:trPr>
@@ -3548,12 +3356,6 @@
         </w:tc>
       </w:tr>
       <w:tr>
-        <w:tblPrEx>
-          <w:tblCellMar>
-            <w:top w:w="0" w:type="dxa"/>
-            <w:bottom w:w="0" w:type="dxa"/>
-          </w:tblCellMar>
-        </w:tblPrEx>
         <w:trPr>
           <w:cantSplit/>
         </w:trPr>
@@ -3690,12 +3492,6 @@
         <w:gridCol w:w="4301"/>
       </w:tblGrid>
       <w:tr>
-        <w:tblPrEx>
-          <w:tblCellMar>
-            <w:top w:w="0" w:type="dxa"/>
-            <w:bottom w:w="0" w:type="dxa"/>
-          </w:tblCellMar>
-        </w:tblPrEx>
         <w:trPr>
           <w:cantSplit/>
           <w:tblHeader/>
@@ -3798,12 +3594,6 @@
         </w:tc>
       </w:tr>
       <w:tr>
-        <w:tblPrEx>
-          <w:tblCellMar>
-            <w:top w:w="0" w:type="dxa"/>
-            <w:bottom w:w="0" w:type="dxa"/>
-          </w:tblCellMar>
-        </w:tblPrEx>
         <w:trPr>
           <w:cantSplit/>
         </w:trPr>
@@ -3893,12 +3683,6 @@
         </w:tc>
       </w:tr>
       <w:tr>
-        <w:tblPrEx>
-          <w:tblCellMar>
-            <w:top w:w="0" w:type="dxa"/>
-            <w:bottom w:w="0" w:type="dxa"/>
-          </w:tblCellMar>
-        </w:tblPrEx>
         <w:trPr>
           <w:cantSplit/>
         </w:trPr>
@@ -3988,12 +3772,6 @@
         </w:tc>
       </w:tr>
       <w:tr>
-        <w:tblPrEx>
-          <w:tblCellMar>
-            <w:top w:w="0" w:type="dxa"/>
-            <w:bottom w:w="0" w:type="dxa"/>
-          </w:tblCellMar>
-        </w:tblPrEx>
         <w:trPr>
           <w:cantSplit/>
         </w:trPr>
@@ -4130,12 +3908,6 @@
         <w:gridCol w:w="4295"/>
       </w:tblGrid>
       <w:tr>
-        <w:tblPrEx>
-          <w:tblCellMar>
-            <w:top w:w="0" w:type="dxa"/>
-            <w:bottom w:w="0" w:type="dxa"/>
-          </w:tblCellMar>
-        </w:tblPrEx>
         <w:trPr>
           <w:cantSplit/>
           <w:tblHeader/>
@@ -4239,12 +4011,6 @@
         </w:tc>
       </w:tr>
       <w:tr>
-        <w:tblPrEx>
-          <w:tblCellMar>
-            <w:top w:w="0" w:type="dxa"/>
-            <w:bottom w:w="0" w:type="dxa"/>
-          </w:tblCellMar>
-        </w:tblPrEx>
         <w:trPr>
           <w:cantSplit/>
         </w:trPr>
@@ -4352,12 +4118,6 @@
         </w:tc>
       </w:tr>
       <w:tr>
-        <w:tblPrEx>
-          <w:tblCellMar>
-            <w:top w:w="0" w:type="dxa"/>
-            <w:bottom w:w="0" w:type="dxa"/>
-          </w:tblCellMar>
-        </w:tblPrEx>
         <w:trPr>
           <w:cantSplit/>
         </w:trPr>
@@ -4447,12 +4207,6 @@
         </w:tc>
       </w:tr>
       <w:tr>
-        <w:tblPrEx>
-          <w:tblCellMar>
-            <w:top w:w="0" w:type="dxa"/>
-            <w:bottom w:w="0" w:type="dxa"/>
-          </w:tblCellMar>
-        </w:tblPrEx>
         <w:trPr>
           <w:cantSplit/>
         </w:trPr>
@@ -4542,12 +4296,6 @@
         </w:tc>
       </w:tr>
       <w:tr>
-        <w:tblPrEx>
-          <w:tblCellMar>
-            <w:top w:w="0" w:type="dxa"/>
-            <w:bottom w:w="0" w:type="dxa"/>
-          </w:tblCellMar>
-        </w:tblPrEx>
         <w:trPr>
           <w:cantSplit/>
         </w:trPr>
@@ -4637,12 +4385,6 @@
         </w:tc>
       </w:tr>
       <w:tr>
-        <w:tblPrEx>
-          <w:tblCellMar>
-            <w:top w:w="0" w:type="dxa"/>
-            <w:bottom w:w="0" w:type="dxa"/>
-          </w:tblCellMar>
-        </w:tblPrEx>
         <w:trPr>
           <w:cantSplit/>
         </w:trPr>
@@ -4732,12 +4474,6 @@
         </w:tc>
       </w:tr>
       <w:tr>
-        <w:tblPrEx>
-          <w:tblCellMar>
-            <w:top w:w="0" w:type="dxa"/>
-            <w:bottom w:w="0" w:type="dxa"/>
-          </w:tblCellMar>
-        </w:tblPrEx>
         <w:trPr>
           <w:cantSplit/>
         </w:trPr>
@@ -4827,12 +4563,6 @@
         </w:tc>
       </w:tr>
       <w:tr>
-        <w:tblPrEx>
-          <w:tblCellMar>
-            <w:top w:w="0" w:type="dxa"/>
-            <w:bottom w:w="0" w:type="dxa"/>
-          </w:tblCellMar>
-        </w:tblPrEx>
         <w:trPr>
           <w:cantSplit/>
         </w:trPr>
@@ -4922,12 +4652,6 @@
         </w:tc>
       </w:tr>
       <w:tr>
-        <w:tblPrEx>
-          <w:tblCellMar>
-            <w:top w:w="0" w:type="dxa"/>
-            <w:bottom w:w="0" w:type="dxa"/>
-          </w:tblCellMar>
-        </w:tblPrEx>
         <w:trPr>
           <w:cantSplit/>
         </w:trPr>
@@ -5064,12 +4788,6 @@
         <w:gridCol w:w="4295"/>
       </w:tblGrid>
       <w:tr>
-        <w:tblPrEx>
-          <w:tblCellMar>
-            <w:top w:w="0" w:type="dxa"/>
-            <w:bottom w:w="0" w:type="dxa"/>
-          </w:tblCellMar>
-        </w:tblPrEx>
         <w:trPr>
           <w:cantSplit/>
           <w:tblHeader/>
@@ -5172,12 +4890,6 @@
         </w:tc>
       </w:tr>
       <w:tr>
-        <w:tblPrEx>
-          <w:tblCellMar>
-            <w:top w:w="0" w:type="dxa"/>
-            <w:bottom w:w="0" w:type="dxa"/>
-          </w:tblCellMar>
-        </w:tblPrEx>
         <w:trPr>
           <w:cantSplit/>
         </w:trPr>
@@ -5267,12 +4979,6 @@
         </w:tc>
       </w:tr>
       <w:tr>
-        <w:tblPrEx>
-          <w:tblCellMar>
-            <w:top w:w="0" w:type="dxa"/>
-            <w:bottom w:w="0" w:type="dxa"/>
-          </w:tblCellMar>
-        </w:tblPrEx>
         <w:trPr>
           <w:cantSplit/>
         </w:trPr>
@@ -5362,12 +5068,6 @@
         </w:tc>
       </w:tr>
       <w:tr>
-        <w:tblPrEx>
-          <w:tblCellMar>
-            <w:top w:w="0" w:type="dxa"/>
-            <w:bottom w:w="0" w:type="dxa"/>
-          </w:tblCellMar>
-        </w:tblPrEx>
         <w:trPr>
           <w:cantSplit/>
         </w:trPr>
@@ -5457,12 +5157,6 @@
         </w:tc>
       </w:tr>
       <w:tr>
-        <w:tblPrEx>
-          <w:tblCellMar>
-            <w:top w:w="0" w:type="dxa"/>
-            <w:bottom w:w="0" w:type="dxa"/>
-          </w:tblCellMar>
-        </w:tblPrEx>
         <w:trPr>
           <w:cantSplit/>
         </w:trPr>
@@ -5599,12 +5293,6 @@
         <w:gridCol w:w="4295"/>
       </w:tblGrid>
       <w:tr>
-        <w:tblPrEx>
-          <w:tblCellMar>
-            <w:top w:w="0" w:type="dxa"/>
-            <w:bottom w:w="0" w:type="dxa"/>
-          </w:tblCellMar>
-        </w:tblPrEx>
         <w:trPr>
           <w:cantSplit/>
           <w:tblHeader/>
@@ -5708,12 +5396,6 @@
         </w:tc>
       </w:tr>
       <w:tr>
-        <w:tblPrEx>
-          <w:tblCellMar>
-            <w:top w:w="0" w:type="dxa"/>
-            <w:bottom w:w="0" w:type="dxa"/>
-          </w:tblCellMar>
-        </w:tblPrEx>
         <w:trPr>
           <w:cantSplit/>
         </w:trPr>
@@ -5803,12 +5485,6 @@
         </w:tc>
       </w:tr>
       <w:tr>
-        <w:tblPrEx>
-          <w:tblCellMar>
-            <w:top w:w="0" w:type="dxa"/>
-            <w:bottom w:w="0" w:type="dxa"/>
-          </w:tblCellMar>
-        </w:tblPrEx>
         <w:trPr>
           <w:cantSplit/>
         </w:trPr>
@@ -5898,12 +5574,6 @@
         </w:tc>
       </w:tr>
       <w:tr>
-        <w:tblPrEx>
-          <w:tblCellMar>
-            <w:top w:w="0" w:type="dxa"/>
-            <w:bottom w:w="0" w:type="dxa"/>
-          </w:tblCellMar>
-        </w:tblPrEx>
         <w:trPr>
           <w:cantSplit/>
         </w:trPr>
@@ -5993,12 +5663,6 @@
         </w:tc>
       </w:tr>
       <w:tr>
-        <w:tblPrEx>
-          <w:tblCellMar>
-            <w:top w:w="0" w:type="dxa"/>
-            <w:bottom w:w="0" w:type="dxa"/>
-          </w:tblCellMar>
-        </w:tblPrEx>
         <w:trPr>
           <w:cantSplit/>
         </w:trPr>
@@ -6135,12 +5799,6 @@
         <w:gridCol w:w="4295"/>
       </w:tblGrid>
       <w:tr>
-        <w:tblPrEx>
-          <w:tblCellMar>
-            <w:top w:w="0" w:type="dxa"/>
-            <w:bottom w:w="0" w:type="dxa"/>
-          </w:tblCellMar>
-        </w:tblPrEx>
         <w:trPr>
           <w:cantSplit/>
           <w:tblHeader/>
@@ -6243,12 +5901,6 @@
         </w:tc>
       </w:tr>
       <w:tr>
-        <w:tblPrEx>
-          <w:tblCellMar>
-            <w:top w:w="0" w:type="dxa"/>
-            <w:bottom w:w="0" w:type="dxa"/>
-          </w:tblCellMar>
-        </w:tblPrEx>
         <w:trPr>
           <w:cantSplit/>
         </w:trPr>
@@ -6338,12 +5990,6 @@
         </w:tc>
       </w:tr>
       <w:tr>
-        <w:tblPrEx>
-          <w:tblCellMar>
-            <w:top w:w="0" w:type="dxa"/>
-            <w:bottom w:w="0" w:type="dxa"/>
-          </w:tblCellMar>
-        </w:tblPrEx>
         <w:trPr>
           <w:cantSplit/>
         </w:trPr>
@@ -6433,12 +6079,6 @@
         </w:tc>
       </w:tr>
       <w:tr>
-        <w:tblPrEx>
-          <w:tblCellMar>
-            <w:top w:w="0" w:type="dxa"/>
-            <w:bottom w:w="0" w:type="dxa"/>
-          </w:tblCellMar>
-        </w:tblPrEx>
         <w:trPr>
           <w:cantSplit/>
         </w:trPr>
@@ -6593,12 +6233,6 @@
         <w:gridCol w:w="4295"/>
       </w:tblGrid>
       <w:tr>
-        <w:tblPrEx>
-          <w:tblCellMar>
-            <w:top w:w="0" w:type="dxa"/>
-            <w:bottom w:w="0" w:type="dxa"/>
-          </w:tblCellMar>
-        </w:tblPrEx>
         <w:trPr>
           <w:cantSplit/>
           <w:tblHeader/>
@@ -6701,12 +6335,6 @@
         </w:tc>
       </w:tr>
       <w:tr>
-        <w:tblPrEx>
-          <w:tblCellMar>
-            <w:top w:w="0" w:type="dxa"/>
-            <w:bottom w:w="0" w:type="dxa"/>
-          </w:tblCellMar>
-        </w:tblPrEx>
         <w:trPr>
           <w:cantSplit/>
         </w:trPr>
@@ -6796,12 +6424,6 @@
         </w:tc>
       </w:tr>
       <w:tr>
-        <w:tblPrEx>
-          <w:tblCellMar>
-            <w:top w:w="0" w:type="dxa"/>
-            <w:bottom w:w="0" w:type="dxa"/>
-          </w:tblCellMar>
-        </w:tblPrEx>
         <w:trPr>
           <w:cantSplit/>
         </w:trPr>
@@ -6891,12 +6513,6 @@
         </w:tc>
       </w:tr>
       <w:tr>
-        <w:tblPrEx>
-          <w:tblCellMar>
-            <w:top w:w="0" w:type="dxa"/>
-            <w:bottom w:w="0" w:type="dxa"/>
-          </w:tblCellMar>
-        </w:tblPrEx>
         <w:trPr>
           <w:cantSplit/>
         </w:trPr>
@@ -6986,12 +6602,6 @@
         </w:tc>
       </w:tr>
       <w:tr>
-        <w:tblPrEx>
-          <w:tblCellMar>
-            <w:top w:w="0" w:type="dxa"/>
-            <w:bottom w:w="0" w:type="dxa"/>
-          </w:tblCellMar>
-        </w:tblPrEx>
         <w:trPr>
           <w:cantSplit/>
         </w:trPr>
@@ -7129,12 +6739,6 @@
         <w:gridCol w:w="4295"/>
       </w:tblGrid>
       <w:tr>
-        <w:tblPrEx>
-          <w:tblCellMar>
-            <w:top w:w="0" w:type="dxa"/>
-            <w:bottom w:w="0" w:type="dxa"/>
-          </w:tblCellMar>
-        </w:tblPrEx>
         <w:trPr>
           <w:cantSplit/>
           <w:tblHeader/>
@@ -7237,12 +6841,6 @@
         </w:tc>
       </w:tr>
       <w:tr>
-        <w:tblPrEx>
-          <w:tblCellMar>
-            <w:top w:w="0" w:type="dxa"/>
-            <w:bottom w:w="0" w:type="dxa"/>
-          </w:tblCellMar>
-        </w:tblPrEx>
         <w:trPr>
           <w:cantSplit/>
         </w:trPr>
@@ -7332,12 +6930,6 @@
         </w:tc>
       </w:tr>
       <w:tr>
-        <w:tblPrEx>
-          <w:tblCellMar>
-            <w:top w:w="0" w:type="dxa"/>
-            <w:bottom w:w="0" w:type="dxa"/>
-          </w:tblCellMar>
-        </w:tblPrEx>
         <w:trPr>
           <w:cantSplit/>
         </w:trPr>
@@ -7427,12 +7019,6 @@
         </w:tc>
       </w:tr>
       <w:tr>
-        <w:tblPrEx>
-          <w:tblCellMar>
-            <w:top w:w="0" w:type="dxa"/>
-            <w:bottom w:w="0" w:type="dxa"/>
-          </w:tblCellMar>
-        </w:tblPrEx>
         <w:trPr>
           <w:cantSplit/>
         </w:trPr>
@@ -7522,12 +7108,6 @@
         </w:tc>
       </w:tr>
       <w:tr>
-        <w:tblPrEx>
-          <w:tblCellMar>
-            <w:top w:w="0" w:type="dxa"/>
-            <w:bottom w:w="0" w:type="dxa"/>
-          </w:tblCellMar>
-        </w:tblPrEx>
         <w:trPr>
           <w:cantSplit/>
         </w:trPr>
@@ -7617,12 +7197,6 @@
         </w:tc>
       </w:tr>
       <w:tr>
-        <w:tblPrEx>
-          <w:tblCellMar>
-            <w:top w:w="0" w:type="dxa"/>
-            <w:bottom w:w="0" w:type="dxa"/>
-          </w:tblCellMar>
-        </w:tblPrEx>
         <w:trPr>
           <w:cantSplit/>
         </w:trPr>
@@ -7759,12 +7333,6 @@
         <w:gridCol w:w="4295"/>
       </w:tblGrid>
       <w:tr>
-        <w:tblPrEx>
-          <w:tblCellMar>
-            <w:top w:w="0" w:type="dxa"/>
-            <w:bottom w:w="0" w:type="dxa"/>
-          </w:tblCellMar>
-        </w:tblPrEx>
         <w:trPr>
           <w:cantSplit/>
           <w:tblHeader/>
@@ -7867,12 +7435,6 @@
         </w:tc>
       </w:tr>
       <w:tr>
-        <w:tblPrEx>
-          <w:tblCellMar>
-            <w:top w:w="0" w:type="dxa"/>
-            <w:bottom w:w="0" w:type="dxa"/>
-          </w:tblCellMar>
-        </w:tblPrEx>
         <w:trPr>
           <w:cantSplit/>
         </w:trPr>
@@ -7980,12 +7542,6 @@
         </w:tc>
       </w:tr>
       <w:tr>
-        <w:tblPrEx>
-          <w:tblCellMar>
-            <w:top w:w="0" w:type="dxa"/>
-            <w:bottom w:w="0" w:type="dxa"/>
-          </w:tblCellMar>
-        </w:tblPrEx>
         <w:trPr>
           <w:cantSplit/>
         </w:trPr>
@@ -8075,12 +7631,6 @@
         </w:tc>
       </w:tr>
       <w:tr>
-        <w:tblPrEx>
-          <w:tblCellMar>
-            <w:top w:w="0" w:type="dxa"/>
-            <w:bottom w:w="0" w:type="dxa"/>
-          </w:tblCellMar>
-        </w:tblPrEx>
         <w:trPr>
           <w:cantSplit/>
         </w:trPr>
@@ -8170,12 +7720,6 @@
         </w:tc>
       </w:tr>
       <w:tr>
-        <w:tblPrEx>
-          <w:tblCellMar>
-            <w:top w:w="0" w:type="dxa"/>
-            <w:bottom w:w="0" w:type="dxa"/>
-          </w:tblCellMar>
-        </w:tblPrEx>
         <w:trPr>
           <w:cantSplit/>
         </w:trPr>
@@ -8266,12 +7810,6 @@
         </w:tc>
       </w:tr>
       <w:tr>
-        <w:tblPrEx>
-          <w:tblCellMar>
-            <w:top w:w="0" w:type="dxa"/>
-            <w:bottom w:w="0" w:type="dxa"/>
-          </w:tblCellMar>
-        </w:tblPrEx>
         <w:trPr>
           <w:cantSplit/>
         </w:trPr>
@@ -8408,12 +7946,6 @@
         <w:gridCol w:w="4301"/>
       </w:tblGrid>
       <w:tr>
-        <w:tblPrEx>
-          <w:tblCellMar>
-            <w:top w:w="0" w:type="dxa"/>
-            <w:bottom w:w="0" w:type="dxa"/>
-          </w:tblCellMar>
-        </w:tblPrEx>
         <w:trPr>
           <w:cantSplit/>
           <w:tblHeader/>
@@ -8516,12 +8048,6 @@
         </w:tc>
       </w:tr>
       <w:tr>
-        <w:tblPrEx>
-          <w:tblCellMar>
-            <w:top w:w="0" w:type="dxa"/>
-            <w:bottom w:w="0" w:type="dxa"/>
-          </w:tblCellMar>
-        </w:tblPrEx>
         <w:trPr>
           <w:cantSplit/>
         </w:trPr>
@@ -8611,12 +8137,6 @@
         </w:tc>
       </w:tr>
       <w:tr>
-        <w:tblPrEx>
-          <w:tblCellMar>
-            <w:top w:w="0" w:type="dxa"/>
-            <w:bottom w:w="0" w:type="dxa"/>
-          </w:tblCellMar>
-        </w:tblPrEx>
         <w:trPr>
           <w:cantSplit/>
         </w:trPr>
@@ -8706,12 +8226,6 @@
         </w:tc>
       </w:tr>
       <w:tr>
-        <w:tblPrEx>
-          <w:tblCellMar>
-            <w:top w:w="0" w:type="dxa"/>
-            <w:bottom w:w="0" w:type="dxa"/>
-          </w:tblCellMar>
-        </w:tblPrEx>
         <w:trPr>
           <w:cantSplit/>
         </w:trPr>
@@ -8848,12 +8362,6 @@
         <w:gridCol w:w="4301"/>
       </w:tblGrid>
       <w:tr>
-        <w:tblPrEx>
-          <w:tblCellMar>
-            <w:top w:w="0" w:type="dxa"/>
-            <w:bottom w:w="0" w:type="dxa"/>
-          </w:tblCellMar>
-        </w:tblPrEx>
         <w:trPr>
           <w:cantSplit/>
           <w:tblHeader/>
@@ -8956,12 +8464,6 @@
         </w:tc>
       </w:tr>
       <w:tr>
-        <w:tblPrEx>
-          <w:tblCellMar>
-            <w:top w:w="0" w:type="dxa"/>
-            <w:bottom w:w="0" w:type="dxa"/>
-          </w:tblCellMar>
-        </w:tblPrEx>
         <w:trPr>
           <w:cantSplit/>
         </w:trPr>
@@ -9051,12 +8553,6 @@
         </w:tc>
       </w:tr>
       <w:tr>
-        <w:tblPrEx>
-          <w:tblCellMar>
-            <w:top w:w="0" w:type="dxa"/>
-            <w:bottom w:w="0" w:type="dxa"/>
-          </w:tblCellMar>
-        </w:tblPrEx>
         <w:trPr>
           <w:cantSplit/>
         </w:trPr>
@@ -9148,6 +8644,17 @@
       </w:tr>
     </w:tbl>
     <w:p/>
+    <w:p>
+      <w:pPr>
+        <w:rPr>
+          <w:b/>
+          <w:bCs/>
+          <w:i/>
+          <w:iCs/>
+          <w:u w:val="single"/>
+        </w:rPr>
+      </w:pPr>
+    </w:p>
     <w:p/>
     <w:sectPr>
       <w:headerReference w:type="even" r:id="rId7"/>
@@ -9172,7 +8679,7 @@
 </file>
 
 <file path=word/endnotes.xml><?xml version="1.0" encoding="utf-8"?>
-<w:endnotes xmlns:wpc="http://schemas.microsoft.com/office/word/2010/wordprocessingCanvas" xmlns:cx="http://schemas.microsoft.com/office/drawing/2014/chartex" xmlns:cx1="http://schemas.microsoft.com/office/drawing/2015/9/8/chartex" xmlns:cx2="http://schemas.microsoft.com/office/drawing/2015/10/21/chartex" xmlns:cx3="http://schemas.microsoft.com/office/drawing/2016/5/9/chartex" xmlns:cx4="http://schemas.microsoft.com/office/drawing/2016/5/10/chartex" xmlns:cx5="http://schemas.microsoft.com/office/drawing/2016/5/11/chartex" xmlns:cx6="http://schemas.microsoft.com/office/drawing/2016/5/12/chartex" xmlns:cx7="http://schemas.microsoft.com/office/drawing/2016/5/13/chartex" xmlns:cx8="http://schemas.microsoft.com/office/drawing/2016/5/14/chartex" xmlns:mc="http://schemas.openxmlformats.org/markup-compatibility/2006" xmlns:aink="http://schemas.microsoft.com/office/drawing/2016/ink" xmlns:am3d="http://schemas.microsoft.com/office/drawing/2017/model3d" xmlns:o="urn:schemas-microsoft-com:office:office" xmlns:oel="http://schemas.microsoft.com/office/2019/extlst" xmlns:r="http://schemas.openxmlformats.org/officeDocument/2006/relationships" xmlns:m="http://schemas.openxmlformats.org/officeDocument/2006/math" xmlns:v="urn:schemas-microsoft-com:vml" xmlns:wp14="http://schemas.microsoft.com/office/word/2010/wordprocessingDrawing" xmlns:wp="http://schemas.openxmlformats.org/drawingml/2006/wordprocessingDrawing" xmlns:w10="urn:schemas-microsoft-com:office:word" xmlns:w="http://schemas.openxmlformats.org/wordprocessingml/2006/main" xmlns:w14="http://schemas.microsoft.com/office/word/2010/wordml" xmlns:w15="http://schemas.microsoft.com/office/word/2012/wordml" xmlns:w16cex="http://schemas.microsoft.com/office/word/2018/wordml/cex" xmlns:w16cid="http://schemas.microsoft.com/office/word/2016/wordml/cid" xmlns:w16="http://schemas.microsoft.com/office/word/2018/wordml" xmlns:w16du="http://schemas.microsoft.com/office/word/2023/wordml/word16du" xmlns:w16sdtdh="http://schemas.microsoft.com/office/word/2020/wordml/sdtdatahash" xmlns:w16sdtfl="http://schemas.microsoft.com/office/word/2024/wordml/sdtformatlock" xmlns:w16se="http://schemas.microsoft.com/office/word/2015/wordml/symex" xmlns:wpg="http://schemas.microsoft.com/office/word/2010/wordprocessingGroup" xmlns:wpi="http://schemas.microsoft.com/office/word/2010/wordprocessingInk" xmlns:wne="http://schemas.microsoft.com/office/word/2006/wordml" xmlns:wps="http://schemas.microsoft.com/office/word/2010/wordprocessingShape" mc:Ignorable="w14 w15 w16se w16cid w16 w16cex w16sdtdh w16sdtfl w16du wp14">
+<w:endnotes xmlns:wpc="http://schemas.microsoft.com/office/word/2010/wordprocessingCanvas" xmlns:cx="http://schemas.microsoft.com/office/drawing/2014/chartex" xmlns:cx1="http://schemas.microsoft.com/office/drawing/2015/9/8/chartex" xmlns:cx2="http://schemas.microsoft.com/office/drawing/2015/10/21/chartex" xmlns:cx3="http://schemas.microsoft.com/office/drawing/2016/5/9/chartex" xmlns:cx4="http://schemas.microsoft.com/office/drawing/2016/5/10/chartex" xmlns:cx5="http://schemas.microsoft.com/office/drawing/2016/5/11/chartex" xmlns:cx6="http://schemas.microsoft.com/office/drawing/2016/5/12/chartex" xmlns:cx7="http://schemas.microsoft.com/office/drawing/2016/5/13/chartex" xmlns:cx8="http://schemas.microsoft.com/office/drawing/2016/5/14/chartex" xmlns:mc="http://schemas.openxmlformats.org/markup-compatibility/2006" xmlns:aink="http://schemas.microsoft.com/office/drawing/2016/ink" xmlns:am3d="http://schemas.microsoft.com/office/drawing/2017/model3d" xmlns:o="urn:schemas-microsoft-com:office:office" xmlns:oel="http://schemas.microsoft.com/office/2019/extlst" xmlns:r="http://schemas.openxmlformats.org/officeDocument/2006/relationships" xmlns:m="http://schemas.openxmlformats.org/officeDocument/2006/math" xmlns:v="urn:schemas-microsoft-com:vml" xmlns:wp14="http://schemas.microsoft.com/office/word/2010/wordprocessingDrawing" xmlns:wp="http://schemas.openxmlformats.org/drawingml/2006/wordprocessingDrawing" xmlns:w10="urn:schemas-microsoft-com:office:word" xmlns:w="http://schemas.openxmlformats.org/wordprocessingml/2006/main" xmlns:w14="http://schemas.microsoft.com/office/word/2010/wordml" xmlns:w15="http://schemas.microsoft.com/office/word/2012/wordml" xmlns:w16cei="http://schemas.microsoft.com/office/word/2026/wordml/cei" xmlns:w16cex="http://schemas.microsoft.com/office/word/2018/wordml/cex" xmlns:w16cid="http://schemas.microsoft.com/office/word/2016/wordml/cid" xmlns:w16="http://schemas.microsoft.com/office/word/2018/wordml" xmlns:w16du="http://schemas.microsoft.com/office/word/2023/wordml/word16du" xmlns:w16sdtdh="http://schemas.microsoft.com/office/word/2020/wordml/sdtdatahash" xmlns:w16sdtfl="http://schemas.microsoft.com/office/word/2024/wordml/sdtformatlock" xmlns:w16se="http://schemas.microsoft.com/office/word/2015/wordml/symex" xmlns:wpg="http://schemas.microsoft.com/office/word/2010/wordprocessingGroup" xmlns:wpi="http://schemas.microsoft.com/office/word/2010/wordprocessingInk" xmlns:wne="http://schemas.microsoft.com/office/word/2006/wordml" xmlns:wps="http://schemas.microsoft.com/office/word/2010/wordprocessingShape" mc:Ignorable="w14 w15 w16se w16cid w16 w16cex w16sdtdh w16sdtfl w16du wp14">
   <w:endnote w:type="separator" w:id="-1">
     <w:p>
       <w:r>
@@ -9191,7 +8698,7 @@
 </file>
 
 <file path=word/footer1.xml><?xml version="1.0" encoding="utf-8"?>
-<w:ftr xmlns:wpc="http://schemas.microsoft.com/office/word/2010/wordprocessingCanvas" xmlns:cx="http://schemas.microsoft.com/office/drawing/2014/chartex" xmlns:cx1="http://schemas.microsoft.com/office/drawing/2015/9/8/chartex" xmlns:cx2="http://schemas.microsoft.com/office/drawing/2015/10/21/chartex" xmlns:cx3="http://schemas.microsoft.com/office/drawing/2016/5/9/chartex" xmlns:cx4="http://schemas.microsoft.com/office/drawing/2016/5/10/chartex" xmlns:cx5="http://schemas.microsoft.com/office/drawing/2016/5/11/chartex" xmlns:cx6="http://schemas.microsoft.com/office/drawing/2016/5/12/chartex" xmlns:cx7="http://schemas.microsoft.com/office/drawing/2016/5/13/chartex" xmlns:cx8="http://schemas.microsoft.com/office/drawing/2016/5/14/chartex" xmlns:mc="http://schemas.openxmlformats.org/markup-compatibility/2006" xmlns:aink="http://schemas.microsoft.com/office/drawing/2016/ink" xmlns:am3d="http://schemas.microsoft.com/office/drawing/2017/model3d" xmlns:o="urn:schemas-microsoft-com:office:office" xmlns:oel="http://schemas.microsoft.com/office/2019/extlst" xmlns:r="http://schemas.openxmlformats.org/officeDocument/2006/relationships" xmlns:m="http://schemas.openxmlformats.org/officeDocument/2006/math" xmlns:v="urn:schemas-microsoft-com:vml" xmlns:wp14="http://schemas.microsoft.com/office/word/2010/wordprocessingDrawing" xmlns:wp="http://schemas.openxmlformats.org/drawingml/2006/wordprocessingDrawing" xmlns:w10="urn:schemas-microsoft-com:office:word" xmlns:w="http://schemas.openxmlformats.org/wordprocessingml/2006/main" xmlns:w14="http://schemas.microsoft.com/office/word/2010/wordml" xmlns:w15="http://schemas.microsoft.com/office/word/2012/wordml" xmlns:w16cex="http://schemas.microsoft.com/office/word/2018/wordml/cex" xmlns:w16cid="http://schemas.microsoft.com/office/word/2016/wordml/cid" xmlns:w16="http://schemas.microsoft.com/office/word/2018/wordml" xmlns:w16du="http://schemas.microsoft.com/office/word/2023/wordml/word16du" xmlns:w16sdtdh="http://schemas.microsoft.com/office/word/2020/wordml/sdtdatahash" xmlns:w16sdtfl="http://schemas.microsoft.com/office/word/2024/wordml/sdtformatlock" xmlns:w16se="http://schemas.microsoft.com/office/word/2015/wordml/symex" xmlns:wpg="http://schemas.microsoft.com/office/word/2010/wordprocessingGroup" xmlns:wpi="http://schemas.microsoft.com/office/word/2010/wordprocessingInk" xmlns:wne="http://schemas.microsoft.com/office/word/2006/wordml" xmlns:wps="http://schemas.microsoft.com/office/word/2010/wordprocessingShape" mc:Ignorable="w14 w15 w16se w16cid w16 w16cex w16sdtdh w16sdtfl w16du wp14">
+<w:ftr xmlns:wpc="http://schemas.microsoft.com/office/word/2010/wordprocessingCanvas" xmlns:cx="http://schemas.microsoft.com/office/drawing/2014/chartex" xmlns:cx1="http://schemas.microsoft.com/office/drawing/2015/9/8/chartex" xmlns:cx2="http://schemas.microsoft.com/office/drawing/2015/10/21/chartex" xmlns:cx3="http://schemas.microsoft.com/office/drawing/2016/5/9/chartex" xmlns:cx4="http://schemas.microsoft.com/office/drawing/2016/5/10/chartex" xmlns:cx5="http://schemas.microsoft.com/office/drawing/2016/5/11/chartex" xmlns:cx6="http://schemas.microsoft.com/office/drawing/2016/5/12/chartex" xmlns:cx7="http://schemas.microsoft.com/office/drawing/2016/5/13/chartex" xmlns:cx8="http://schemas.microsoft.com/office/drawing/2016/5/14/chartex" xmlns:mc="http://schemas.openxmlformats.org/markup-compatibility/2006" xmlns:aink="http://schemas.microsoft.com/office/drawing/2016/ink" xmlns:am3d="http://schemas.microsoft.com/office/drawing/2017/model3d" xmlns:o="urn:schemas-microsoft-com:office:office" xmlns:oel="http://schemas.microsoft.com/office/2019/extlst" xmlns:r="http://schemas.openxmlformats.org/officeDocument/2006/relationships" xmlns:m="http://schemas.openxmlformats.org/officeDocument/2006/math" xmlns:v="urn:schemas-microsoft-com:vml" xmlns:wp14="http://schemas.microsoft.com/office/word/2010/wordprocessingDrawing" xmlns:wp="http://schemas.openxmlformats.org/drawingml/2006/wordprocessingDrawing" xmlns:w10="urn:schemas-microsoft-com:office:word" xmlns:w="http://schemas.openxmlformats.org/wordprocessingml/2006/main" xmlns:w14="http://schemas.microsoft.com/office/word/2010/wordml" xmlns:w15="http://schemas.microsoft.com/office/word/2012/wordml" xmlns:w16cei="http://schemas.microsoft.com/office/word/2026/wordml/cei" xmlns:w16cex="http://schemas.microsoft.com/office/word/2018/wordml/cex" xmlns:w16cid="http://schemas.microsoft.com/office/word/2016/wordml/cid" xmlns:w16="http://schemas.microsoft.com/office/word/2018/wordml" xmlns:w16du="http://schemas.microsoft.com/office/word/2023/wordml/word16du" xmlns:w16sdtdh="http://schemas.microsoft.com/office/word/2020/wordml/sdtdatahash" xmlns:w16sdtfl="http://schemas.microsoft.com/office/word/2024/wordml/sdtformatlock" xmlns:w16se="http://schemas.microsoft.com/office/word/2015/wordml/symex" xmlns:wpg="http://schemas.microsoft.com/office/word/2010/wordprocessingGroup" xmlns:wpi="http://schemas.microsoft.com/office/word/2010/wordprocessingInk" xmlns:wne="http://schemas.microsoft.com/office/word/2006/wordml" xmlns:wps="http://schemas.microsoft.com/office/word/2010/wordprocessingShape" mc:Ignorable="w14 w15 w16se w16cid w16 w16cex w16sdtdh w16sdtfl w16du wp14">
   <w:p>
     <w:pPr>
       <w:pStyle w:val="Footer"/>
@@ -9201,7 +8708,7 @@
 </file>
 
 <file path=word/footer2.xml><?xml version="1.0" encoding="utf-8"?>
-<w:ftr xmlns:wpc="http://schemas.microsoft.com/office/word/2010/wordprocessingCanvas" xmlns:cx="http://schemas.microsoft.com/office/drawing/2014/chartex" xmlns:cx1="http://schemas.microsoft.com/office/drawing/2015/9/8/chartex" xmlns:cx2="http://schemas.microsoft.com/office/drawing/2015/10/21/chartex" xmlns:cx3="http://schemas.microsoft.com/office/drawing/2016/5/9/chartex" xmlns:cx4="http://schemas.microsoft.com/office/drawing/2016/5/10/chartex" xmlns:cx5="http://schemas.microsoft.com/office/drawing/2016/5/11/chartex" xmlns:cx6="http://schemas.microsoft.com/office/drawing/2016/5/12/chartex" xmlns:cx7="http://schemas.microsoft.com/office/drawing/2016/5/13/chartex" xmlns:cx8="http://schemas.microsoft.com/office/drawing/2016/5/14/chartex" xmlns:mc="http://schemas.openxmlformats.org/markup-compatibility/2006" xmlns:aink="http://schemas.microsoft.com/office/drawing/2016/ink" xmlns:am3d="http://schemas.microsoft.com/office/drawing/2017/model3d" xmlns:o="urn:schemas-microsoft-com:office:office" xmlns:oel="http://schemas.microsoft.com/office/2019/extlst" xmlns:r="http://schemas.openxmlformats.org/officeDocument/2006/relationships" xmlns:m="http://schemas.openxmlformats.org/officeDocument/2006/math" xmlns:v="urn:schemas-microsoft-com:vml" xmlns:wp14="http://schemas.microsoft.com/office/word/2010/wordprocessingDrawing" xmlns:wp="http://schemas.openxmlformats.org/drawingml/2006/wordprocessingDrawing" xmlns:w10="urn:schemas-microsoft-com:office:word" xmlns:w="http://schemas.openxmlformats.org/wordprocessingml/2006/main" xmlns:w14="http://schemas.microsoft.com/office/word/2010/wordml" xmlns:w15="http://schemas.microsoft.com/office/word/2012/wordml" xmlns:w16cex="http://schemas.microsoft.com/office/word/2018/wordml/cex" xmlns:w16cid="http://schemas.microsoft.com/office/word/2016/wordml/cid" xmlns:w16="http://schemas.microsoft.com/office/word/2018/wordml" xmlns:w16du="http://schemas.microsoft.com/office/word/2023/wordml/word16du" xmlns:w16sdtdh="http://schemas.microsoft.com/office/word/2020/wordml/sdtdatahash" xmlns:w16sdtfl="http://schemas.microsoft.com/office/word/2024/wordml/sdtformatlock" xmlns:w16se="http://schemas.microsoft.com/office/word/2015/wordml/symex" xmlns:wpg="http://schemas.microsoft.com/office/word/2010/wordprocessingGroup" xmlns:wpi="http://schemas.microsoft.com/office/word/2010/wordprocessingInk" xmlns:wne="http://schemas.microsoft.com/office/word/2006/wordml" xmlns:wps="http://schemas.microsoft.com/office/word/2010/wordprocessingShape" mc:Ignorable="w14 w15 w16se w16cid w16 w16cex w16sdtdh w16sdtfl w16du wp14">
+<w:ftr xmlns:wpc="http://schemas.microsoft.com/office/word/2010/wordprocessingCanvas" xmlns:cx="http://schemas.microsoft.com/office/drawing/2014/chartex" xmlns:cx1="http://schemas.microsoft.com/office/drawing/2015/9/8/chartex" xmlns:cx2="http://schemas.microsoft.com/office/drawing/2015/10/21/chartex" xmlns:cx3="http://schemas.microsoft.com/office/drawing/2016/5/9/chartex" xmlns:cx4="http://schemas.microsoft.com/office/drawing/2016/5/10/chartex" xmlns:cx5="http://schemas.microsoft.com/office/drawing/2016/5/11/chartex" xmlns:cx6="http://schemas.microsoft.com/office/drawing/2016/5/12/chartex" xmlns:cx7="http://schemas.microsoft.com/office/drawing/2016/5/13/chartex" xmlns:cx8="http://schemas.microsoft.com/office/drawing/2016/5/14/chartex" xmlns:mc="http://schemas.openxmlformats.org/markup-compatibility/2006" xmlns:aink="http://schemas.microsoft.com/office/drawing/2016/ink" xmlns:am3d="http://schemas.microsoft.com/office/drawing/2017/model3d" xmlns:o="urn:schemas-microsoft-com:office:office" xmlns:oel="http://schemas.microsoft.com/office/2019/extlst" xmlns:r="http://schemas.openxmlformats.org/officeDocument/2006/relationships" xmlns:m="http://schemas.openxmlformats.org/officeDocument/2006/math" xmlns:v="urn:schemas-microsoft-com:vml" xmlns:wp14="http://schemas.microsoft.com/office/word/2010/wordprocessingDrawing" xmlns:wp="http://schemas.openxmlformats.org/drawingml/2006/wordprocessingDrawing" xmlns:w10="urn:schemas-microsoft-com:office:word" xmlns:w="http://schemas.openxmlformats.org/wordprocessingml/2006/main" xmlns:w14="http://schemas.microsoft.com/office/word/2010/wordml" xmlns:w15="http://schemas.microsoft.com/office/word/2012/wordml" xmlns:w16cei="http://schemas.microsoft.com/office/word/2026/wordml/cei" xmlns:w16cex="http://schemas.microsoft.com/office/word/2018/wordml/cex" xmlns:w16cid="http://schemas.microsoft.com/office/word/2016/wordml/cid" xmlns:w16="http://schemas.microsoft.com/office/word/2018/wordml" xmlns:w16du="http://schemas.microsoft.com/office/word/2023/wordml/word16du" xmlns:w16sdtdh="http://schemas.microsoft.com/office/word/2020/wordml/sdtdatahash" xmlns:w16sdtfl="http://schemas.microsoft.com/office/word/2024/wordml/sdtformatlock" xmlns:w16se="http://schemas.microsoft.com/office/word/2015/wordml/symex" xmlns:wpg="http://schemas.microsoft.com/office/word/2010/wordprocessingGroup" xmlns:wpi="http://schemas.microsoft.com/office/word/2010/wordprocessingInk" xmlns:wne="http://schemas.microsoft.com/office/word/2006/wordml" xmlns:wps="http://schemas.microsoft.com/office/word/2010/wordprocessingShape" mc:Ignorable="w14 w15 w16se w16cid w16 w16cex w16sdtdh w16sdtfl w16du wp14">
   <w:p>
     <w:pPr>
       <w:pStyle w:val="Footer"/>
@@ -9211,7 +8718,7 @@
 </file>
 
 <file path=word/footer3.xml><?xml version="1.0" encoding="utf-8"?>
-<w:ftr xmlns:wpc="http://schemas.microsoft.com/office/word/2010/wordprocessingCanvas" xmlns:cx="http://schemas.microsoft.com/office/drawing/2014/chartex" xmlns:cx1="http://schemas.microsoft.com/office/drawing/2015/9/8/chartex" xmlns:cx2="http://schemas.microsoft.com/office/drawing/2015/10/21/chartex" xmlns:cx3="http://schemas.microsoft.com/office/drawing/2016/5/9/chartex" xmlns:cx4="http://schemas.microsoft.com/office/drawing/2016/5/10/chartex" xmlns:cx5="http://schemas.microsoft.com/office/drawing/2016/5/11/chartex" xmlns:cx6="http://schemas.microsoft.com/office/drawing/2016/5/12/chartex" xmlns:cx7="http://schemas.microsoft.com/office/drawing/2016/5/13/chartex" xmlns:cx8="http://schemas.microsoft.com/office/drawing/2016/5/14/chartex" xmlns:mc="http://schemas.openxmlformats.org/markup-compatibility/2006" xmlns:aink="http://schemas.microsoft.com/office/drawing/2016/ink" xmlns:am3d="http://schemas.microsoft.com/office/drawing/2017/model3d" xmlns:o="urn:schemas-microsoft-com:office:office" xmlns:oel="http://schemas.microsoft.com/office/2019/extlst" xmlns:r="http://schemas.openxmlformats.org/officeDocument/2006/relationships" xmlns:m="http://schemas.openxmlformats.org/officeDocument/2006/math" xmlns:v="urn:schemas-microsoft-com:vml" xmlns:wp14="http://schemas.microsoft.com/office/word/2010/wordprocessingDrawing" xmlns:wp="http://schemas.openxmlformats.org/drawingml/2006/wordprocessingDrawing" xmlns:w10="urn:schemas-microsoft-com:office:word" xmlns:w="http://schemas.openxmlformats.org/wordprocessingml/2006/main" xmlns:w14="http://schemas.microsoft.com/office/word/2010/wordml" xmlns:w15="http://schemas.microsoft.com/office/word/2012/wordml" xmlns:w16cex="http://schemas.microsoft.com/office/word/2018/wordml/cex" xmlns:w16cid="http://schemas.microsoft.com/office/word/2016/wordml/cid" xmlns:w16="http://schemas.microsoft.com/office/word/2018/wordml" xmlns:w16du="http://schemas.microsoft.com/office/word/2023/wordml/word16du" xmlns:w16sdtdh="http://schemas.microsoft.com/office/word/2020/wordml/sdtdatahash" xmlns:w16sdtfl="http://schemas.microsoft.com/office/word/2024/wordml/sdtformatlock" xmlns:w16se="http://schemas.microsoft.com/office/word/2015/wordml/symex" xmlns:wpg="http://schemas.microsoft.com/office/word/2010/wordprocessingGroup" xmlns:wpi="http://schemas.microsoft.com/office/word/2010/wordprocessingInk" xmlns:wne="http://schemas.microsoft.com/office/word/2006/wordml" xmlns:wps="http://schemas.microsoft.com/office/word/2010/wordprocessingShape" mc:Ignorable="w14 w15 w16se w16cid w16 w16cex w16sdtdh w16sdtfl w16du wp14">
+<w:ftr xmlns:wpc="http://schemas.microsoft.com/office/word/2010/wordprocessingCanvas" xmlns:cx="http://schemas.microsoft.com/office/drawing/2014/chartex" xmlns:cx1="http://schemas.microsoft.com/office/drawing/2015/9/8/chartex" xmlns:cx2="http://schemas.microsoft.com/office/drawing/2015/10/21/chartex" xmlns:cx3="http://schemas.microsoft.com/office/drawing/2016/5/9/chartex" xmlns:cx4="http://schemas.microsoft.com/office/drawing/2016/5/10/chartex" xmlns:cx5="http://schemas.microsoft.com/office/drawing/2016/5/11/chartex" xmlns:cx6="http://schemas.microsoft.com/office/drawing/2016/5/12/chartex" xmlns:cx7="http://schemas.microsoft.com/office/drawing/2016/5/13/chartex" xmlns:cx8="http://schemas.microsoft.com/office/drawing/2016/5/14/chartex" xmlns:mc="http://schemas.openxmlformats.org/markup-compatibility/2006" xmlns:aink="http://schemas.microsoft.com/office/drawing/2016/ink" xmlns:am3d="http://schemas.microsoft.com/office/drawing/2017/model3d" xmlns:o="urn:schemas-microsoft-com:office:office" xmlns:oel="http://schemas.microsoft.com/office/2019/extlst" xmlns:r="http://schemas.openxmlformats.org/officeDocument/2006/relationships" xmlns:m="http://schemas.openxmlformats.org/officeDocument/2006/math" xmlns:v="urn:schemas-microsoft-com:vml" xmlns:wp14="http://schemas.microsoft.com/office/word/2010/wordprocessingDrawing" xmlns:wp="http://schemas.openxmlformats.org/drawingml/2006/wordprocessingDrawing" xmlns:w10="urn:schemas-microsoft-com:office:word" xmlns:w="http://schemas.openxmlformats.org/wordprocessingml/2006/main" xmlns:w14="http://schemas.microsoft.com/office/word/2010/wordml" xmlns:w15="http://schemas.microsoft.com/office/word/2012/wordml" xmlns:w16cei="http://schemas.microsoft.com/office/word/2026/wordml/cei" xmlns:w16cex="http://schemas.microsoft.com/office/word/2018/wordml/cex" xmlns:w16cid="http://schemas.microsoft.com/office/word/2016/wordml/cid" xmlns:w16="http://schemas.microsoft.com/office/word/2018/wordml" xmlns:w16du="http://schemas.microsoft.com/office/word/2023/wordml/word16du" xmlns:w16sdtdh="http://schemas.microsoft.com/office/word/2020/wordml/sdtdatahash" xmlns:w16sdtfl="http://schemas.microsoft.com/office/word/2024/wordml/sdtformatlock" xmlns:w16se="http://schemas.microsoft.com/office/word/2015/wordml/symex" xmlns:wpg="http://schemas.microsoft.com/office/word/2010/wordprocessingGroup" xmlns:wpi="http://schemas.microsoft.com/office/word/2010/wordprocessingInk" xmlns:wne="http://schemas.microsoft.com/office/word/2006/wordml" xmlns:wps="http://schemas.microsoft.com/office/word/2010/wordprocessingShape" mc:Ignorable="w14 w15 w16se w16cid w16 w16cex w16sdtdh w16sdtfl w16du wp14">
   <w:p>
     <w:pPr>
       <w:pStyle w:val="Footer"/>
@@ -9221,7 +8728,7 @@
 </file>
 
 <file path=word/footnotes.xml><?xml version="1.0" encoding="utf-8"?>
-<w:footnotes xmlns:wpc="http://schemas.microsoft.com/office/word/2010/wordprocessingCanvas" xmlns:cx="http://schemas.microsoft.com/office/drawing/2014/chartex" xmlns:cx1="http://schemas.microsoft.com/office/drawing/2015/9/8/chartex" xmlns:cx2="http://schemas.microsoft.com/office/drawing/2015/10/21/chartex" xmlns:cx3="http://schemas.microsoft.com/office/drawing/2016/5/9/chartex" xmlns:cx4="http://schemas.microsoft.com/office/drawing/2016/5/10/chartex" xmlns:cx5="http://schemas.microsoft.com/office/drawing/2016/5/11/chartex" xmlns:cx6="http://schemas.microsoft.com/office/drawing/2016/5/12/chartex" xmlns:cx7="http://schemas.microsoft.com/office/drawing/2016/5/13/chartex" xmlns:cx8="http://schemas.microsoft.com/office/drawing/2016/5/14/chartex" xmlns:mc="http://schemas.openxmlformats.org/markup-compatibility/2006" xmlns:aink="http://schemas.microsoft.com/office/drawing/2016/ink" xmlns:am3d="http://schemas.microsoft.com/office/drawing/2017/model3d" xmlns:o="urn:schemas-microsoft-com:office:office" xmlns:oel="http://schemas.microsoft.com/office/2019/extlst" xmlns:r="http://schemas.openxmlformats.org/officeDocument/2006/relationships" xmlns:m="http://schemas.openxmlformats.org/officeDocument/2006/math" xmlns:v="urn:schemas-microsoft-com:vml" xmlns:wp14="http://schemas.microsoft.com/office/word/2010/wordprocessingDrawing" xmlns:wp="http://schemas.openxmlformats.org/drawingml/2006/wordprocessingDrawing" xmlns:w10="urn:schemas-microsoft-com:office:word" xmlns:w="http://schemas.openxmlformats.org/wordprocessingml/2006/main" xmlns:w14="http://schemas.microsoft.com/office/word/2010/wordml" xmlns:w15="http://schemas.microsoft.com/office/word/2012/wordml" xmlns:w16cex="http://schemas.microsoft.com/office/word/2018/wordml/cex" xmlns:w16cid="http://schemas.microsoft.com/office/word/2016/wordml/cid" xmlns:w16="http://schemas.microsoft.com/office/word/2018/wordml" xmlns:w16du="http://schemas.microsoft.com/office/word/2023/wordml/word16du" xmlns:w16sdtdh="http://schemas.microsoft.com/office/word/2020/wordml/sdtdatahash" xmlns:w16sdtfl="http://schemas.microsoft.com/office/word/2024/wordml/sdtformatlock" xmlns:w16se="http://schemas.microsoft.com/office/word/2015/wordml/symex" xmlns:wpg="http://schemas.microsoft.com/office/word/2010/wordprocessingGroup" xmlns:wpi="http://schemas.microsoft.com/office/word/2010/wordprocessingInk" xmlns:wne="http://schemas.microsoft.com/office/word/2006/wordml" xmlns:wps="http://schemas.microsoft.com/office/word/2010/wordprocessingShape" mc:Ignorable="w14 w15 w16se w16cid w16 w16cex w16sdtdh w16sdtfl w16du wp14">
+<w:footnotes xmlns:wpc="http://schemas.microsoft.com/office/word/2010/wordprocessingCanvas" xmlns:cx="http://schemas.microsoft.com/office/drawing/2014/chartex" xmlns:cx1="http://schemas.microsoft.com/office/drawing/2015/9/8/chartex" xmlns:cx2="http://schemas.microsoft.com/office/drawing/2015/10/21/chartex" xmlns:cx3="http://schemas.microsoft.com/office/drawing/2016/5/9/chartex" xmlns:cx4="http://schemas.microsoft.com/office/drawing/2016/5/10/chartex" xmlns:cx5="http://schemas.microsoft.com/office/drawing/2016/5/11/chartex" xmlns:cx6="http://schemas.microsoft.com/office/drawing/2016/5/12/chartex" xmlns:cx7="http://schemas.microsoft.com/office/drawing/2016/5/13/chartex" xmlns:cx8="http://schemas.microsoft.com/office/drawing/2016/5/14/chartex" xmlns:mc="http://schemas.openxmlformats.org/markup-compatibility/2006" xmlns:aink="http://schemas.microsoft.com/office/drawing/2016/ink" xmlns:am3d="http://schemas.microsoft.com/office/drawing/2017/model3d" xmlns:o="urn:schemas-microsoft-com:office:office" xmlns:oel="http://schemas.microsoft.com/office/2019/extlst" xmlns:r="http://schemas.openxmlformats.org/officeDocument/2006/relationships" xmlns:m="http://schemas.openxmlformats.org/officeDocument/2006/math" xmlns:v="urn:schemas-microsoft-com:vml" xmlns:wp14="http://schemas.microsoft.com/office/word/2010/wordprocessingDrawing" xmlns:wp="http://schemas.openxmlformats.org/drawingml/2006/wordprocessingDrawing" xmlns:w10="urn:schemas-microsoft-com:office:word" xmlns:w="http://schemas.openxmlformats.org/wordprocessingml/2006/main" xmlns:w14="http://schemas.microsoft.com/office/word/2010/wordml" xmlns:w15="http://schemas.microsoft.com/office/word/2012/wordml" xmlns:w16cei="http://schemas.microsoft.com/office/word/2026/wordml/cei" xmlns:w16cex="http://schemas.microsoft.com/office/word/2018/wordml/cex" xmlns:w16cid="http://schemas.microsoft.com/office/word/2016/wordml/cid" xmlns:w16="http://schemas.microsoft.com/office/word/2018/wordml" xmlns:w16du="http://schemas.microsoft.com/office/word/2023/wordml/word16du" xmlns:w16sdtdh="http://schemas.microsoft.com/office/word/2020/wordml/sdtdatahash" xmlns:w16sdtfl="http://schemas.microsoft.com/office/word/2024/wordml/sdtformatlock" xmlns:w16se="http://schemas.microsoft.com/office/word/2015/wordml/symex" xmlns:wpg="http://schemas.microsoft.com/office/word/2010/wordprocessingGroup" xmlns:wpi="http://schemas.microsoft.com/office/word/2010/wordprocessingInk" xmlns:wne="http://schemas.microsoft.com/office/word/2006/wordml" xmlns:wps="http://schemas.microsoft.com/office/word/2010/wordprocessingShape" mc:Ignorable="w14 w15 w16se w16cid w16 w16cex w16sdtdh w16sdtfl w16du wp14">
   <w:footnote w:type="separator" w:id="-1">
     <w:p>
       <w:r>
@@ -9240,7 +8747,7 @@
 </file>
 
 <file path=word/header1.xml><?xml version="1.0" encoding="utf-8"?>
-<w:hdr xmlns:wpc="http://schemas.microsoft.com/office/word/2010/wordprocessingCanvas" xmlns:cx="http://schemas.microsoft.com/office/drawing/2014/chartex" xmlns:cx1="http://schemas.microsoft.com/office/drawing/2015/9/8/chartex" xmlns:cx2="http://schemas.microsoft.com/office/drawing/2015/10/21/chartex" xmlns:cx3="http://schemas.microsoft.com/office/drawing/2016/5/9/chartex" xmlns:cx4="http://schemas.microsoft.com/office/drawing/2016/5/10/chartex" xmlns:cx5="http://schemas.microsoft.com/office/drawing/2016/5/11/chartex" xmlns:cx6="http://schemas.microsoft.com/office/drawing/2016/5/12/chartex" xmlns:cx7="http://schemas.microsoft.com/office/drawing/2016/5/13/chartex" xmlns:cx8="http://schemas.microsoft.com/office/drawing/2016/5/14/chartex" xmlns:mc="http://schemas.openxmlformats.org/markup-compatibility/2006" xmlns:aink="http://schemas.microsoft.com/office/drawing/2016/ink" xmlns:am3d="http://schemas.microsoft.com/office/drawing/2017/model3d" xmlns:o="urn:schemas-microsoft-com:office:office" xmlns:oel="http://schemas.microsoft.com/office/2019/extlst" xmlns:r="http://schemas.openxmlformats.org/officeDocument/2006/relationships" xmlns:m="http://schemas.openxmlformats.org/officeDocument/2006/math" xmlns:v="urn:schemas-microsoft-com:vml" xmlns:wp14="http://schemas.microsoft.com/office/word/2010/wordprocessingDrawing" xmlns:wp="http://schemas.openxmlformats.org/drawingml/2006/wordprocessingDrawing" xmlns:w10="urn:schemas-microsoft-com:office:word" xmlns:w="http://schemas.openxmlformats.org/wordprocessingml/2006/main" xmlns:w14="http://schemas.microsoft.com/office/word/2010/wordml" xmlns:w15="http://schemas.microsoft.com/office/word/2012/wordml" xmlns:w16cex="http://schemas.microsoft.com/office/word/2018/wordml/cex" xmlns:w16cid="http://schemas.microsoft.com/office/word/2016/wordml/cid" xmlns:w16="http://schemas.microsoft.com/office/word/2018/wordml" xmlns:w16du="http://schemas.microsoft.com/office/word/2023/wordml/word16du" xmlns:w16sdtdh="http://schemas.microsoft.com/office/word/2020/wordml/sdtdatahash" xmlns:w16sdtfl="http://schemas.microsoft.com/office/word/2024/wordml/sdtformatlock" xmlns:w16se="http://schemas.microsoft.com/office/word/2015/wordml/symex" xmlns:wpg="http://schemas.microsoft.com/office/word/2010/wordprocessingGroup" xmlns:wpi="http://schemas.microsoft.com/office/word/2010/wordprocessingInk" xmlns:wne="http://schemas.microsoft.com/office/word/2006/wordml" xmlns:wps="http://schemas.microsoft.com/office/word/2010/wordprocessingShape" mc:Ignorable="w14 w15 w16se w16cid w16 w16cex w16sdtdh w16sdtfl w16du wp14">
+<w:hdr xmlns:wpc="http://schemas.microsoft.com/office/word/2010/wordprocessingCanvas" xmlns:cx="http://schemas.microsoft.com/office/drawing/2014/chartex" xmlns:cx1="http://schemas.microsoft.com/office/drawing/2015/9/8/chartex" xmlns:cx2="http://schemas.microsoft.com/office/drawing/2015/10/21/chartex" xmlns:cx3="http://schemas.microsoft.com/office/drawing/2016/5/9/chartex" xmlns:cx4="http://schemas.microsoft.com/office/drawing/2016/5/10/chartex" xmlns:cx5="http://schemas.microsoft.com/office/drawing/2016/5/11/chartex" xmlns:cx6="http://schemas.microsoft.com/office/drawing/2016/5/12/chartex" xmlns:cx7="http://schemas.microsoft.com/office/drawing/2016/5/13/chartex" xmlns:cx8="http://schemas.microsoft.com/office/drawing/2016/5/14/chartex" xmlns:mc="http://schemas.openxmlformats.org/markup-compatibility/2006" xmlns:aink="http://schemas.microsoft.com/office/drawing/2016/ink" xmlns:am3d="http://schemas.microsoft.com/office/drawing/2017/model3d" xmlns:o="urn:schemas-microsoft-com:office:office" xmlns:oel="http://schemas.microsoft.com/office/2019/extlst" xmlns:r="http://schemas.openxmlformats.org/officeDocument/2006/relationships" xmlns:m="http://schemas.openxmlformats.org/officeDocument/2006/math" xmlns:v="urn:schemas-microsoft-com:vml" xmlns:wp14="http://schemas.microsoft.com/office/word/2010/wordprocessingDrawing" xmlns:wp="http://schemas.openxmlformats.org/drawingml/2006/wordprocessingDrawing" xmlns:w10="urn:schemas-microsoft-com:office:word" xmlns:w="http://schemas.openxmlformats.org/wordprocessingml/2006/main" xmlns:w14="http://schemas.microsoft.com/office/word/2010/wordml" xmlns:w15="http://schemas.microsoft.com/office/word/2012/wordml" xmlns:w16cei="http://schemas.microsoft.com/office/word/2026/wordml/cei" xmlns:w16cex="http://schemas.microsoft.com/office/word/2018/wordml/cex" xmlns:w16cid="http://schemas.microsoft.com/office/word/2016/wordml/cid" xmlns:w16="http://schemas.microsoft.com/office/word/2018/wordml" xmlns:w16du="http://schemas.microsoft.com/office/word/2023/wordml/word16du" xmlns:w16sdtdh="http://schemas.microsoft.com/office/word/2020/wordml/sdtdatahash" xmlns:w16sdtfl="http://schemas.microsoft.com/office/word/2024/wordml/sdtformatlock" xmlns:w16se="http://schemas.microsoft.com/office/word/2015/wordml/symex" xmlns:wpg="http://schemas.microsoft.com/office/word/2010/wordprocessingGroup" xmlns:wpi="http://schemas.microsoft.com/office/word/2010/wordprocessingInk" xmlns:wne="http://schemas.microsoft.com/office/word/2006/wordml" xmlns:wps="http://schemas.microsoft.com/office/word/2010/wordprocessingShape" mc:Ignorable="w14 w15 w16se w16cid w16 w16cex w16sdtdh w16sdtfl w16du wp14">
   <w:p>
     <w:pPr>
       <w:pStyle w:val="Header"/>
@@ -9250,7 +8757,7 @@
 </file>
 
 <file path=word/header2.xml><?xml version="1.0" encoding="utf-8"?>
-<w:hdr xmlns:wpc="http://schemas.microsoft.com/office/word/2010/wordprocessingCanvas" xmlns:cx="http://schemas.microsoft.com/office/drawing/2014/chartex" xmlns:cx1="http://schemas.microsoft.com/office/drawing/2015/9/8/chartex" xmlns:cx2="http://schemas.microsoft.com/office/drawing/2015/10/21/chartex" xmlns:cx3="http://schemas.microsoft.com/office/drawing/2016/5/9/chartex" xmlns:cx4="http://schemas.microsoft.com/office/drawing/2016/5/10/chartex" xmlns:cx5="http://schemas.microsoft.com/office/drawing/2016/5/11/chartex" xmlns:cx6="http://schemas.microsoft.com/office/drawing/2016/5/12/chartex" xmlns:cx7="http://schemas.microsoft.com/office/drawing/2016/5/13/chartex" xmlns:cx8="http://schemas.microsoft.com/office/drawing/2016/5/14/chartex" xmlns:mc="http://schemas.openxmlformats.org/markup-compatibility/2006" xmlns:aink="http://schemas.microsoft.com/office/drawing/2016/ink" xmlns:am3d="http://schemas.microsoft.com/office/drawing/2017/model3d" xmlns:o="urn:schemas-microsoft-com:office:office" xmlns:oel="http://schemas.microsoft.com/office/2019/extlst" xmlns:r="http://schemas.openxmlformats.org/officeDocument/2006/relationships" xmlns:m="http://schemas.openxmlformats.org/officeDocument/2006/math" xmlns:v="urn:schemas-microsoft-com:vml" xmlns:wp14="http://schemas.microsoft.com/office/word/2010/wordprocessingDrawing" xmlns:wp="http://schemas.openxmlformats.org/drawingml/2006/wordprocessingDrawing" xmlns:w10="urn:schemas-microsoft-com:office:word" xmlns:w="http://schemas.openxmlformats.org/wordprocessingml/2006/main" xmlns:w14="http://schemas.microsoft.com/office/word/2010/wordml" xmlns:w15="http://schemas.microsoft.com/office/word/2012/wordml" xmlns:w16cex="http://schemas.microsoft.com/office/word/2018/wordml/cex" xmlns:w16cid="http://schemas.microsoft.com/office/word/2016/wordml/cid" xmlns:w16="http://schemas.microsoft.com/office/word/2018/wordml" xmlns:w16du="http://schemas.microsoft.com/office/word/2023/wordml/word16du" xmlns:w16sdtdh="http://schemas.microsoft.com/office/word/2020/wordml/sdtdatahash" xmlns:w16sdtfl="http://schemas.microsoft.com/office/word/2024/wordml/sdtformatlock" xmlns:w16se="http://schemas.microsoft.com/office/word/2015/wordml/symex" xmlns:wpg="http://schemas.microsoft.com/office/word/2010/wordprocessingGroup" xmlns:wpi="http://schemas.microsoft.com/office/word/2010/wordprocessingInk" xmlns:wne="http://schemas.microsoft.com/office/word/2006/wordml" xmlns:wps="http://schemas.microsoft.com/office/word/2010/wordprocessingShape" mc:Ignorable="w14 w15 w16se w16cid w16 w16cex w16sdtdh w16sdtfl w16du wp14">
+<w:hdr xmlns:wpc="http://schemas.microsoft.com/office/word/2010/wordprocessingCanvas" xmlns:cx="http://schemas.microsoft.com/office/drawing/2014/chartex" xmlns:cx1="http://schemas.microsoft.com/office/drawing/2015/9/8/chartex" xmlns:cx2="http://schemas.microsoft.com/office/drawing/2015/10/21/chartex" xmlns:cx3="http://schemas.microsoft.com/office/drawing/2016/5/9/chartex" xmlns:cx4="http://schemas.microsoft.com/office/drawing/2016/5/10/chartex" xmlns:cx5="http://schemas.microsoft.com/office/drawing/2016/5/11/chartex" xmlns:cx6="http://schemas.microsoft.com/office/drawing/2016/5/12/chartex" xmlns:cx7="http://schemas.microsoft.com/office/drawing/2016/5/13/chartex" xmlns:cx8="http://schemas.microsoft.com/office/drawing/2016/5/14/chartex" xmlns:mc="http://schemas.openxmlformats.org/markup-compatibility/2006" xmlns:aink="http://schemas.microsoft.com/office/drawing/2016/ink" xmlns:am3d="http://schemas.microsoft.com/office/drawing/2017/model3d" xmlns:o="urn:schemas-microsoft-com:office:office" xmlns:oel="http://schemas.microsoft.com/office/2019/extlst" xmlns:r="http://schemas.openxmlformats.org/officeDocument/2006/relationships" xmlns:m="http://schemas.openxmlformats.org/officeDocument/2006/math" xmlns:v="urn:schemas-microsoft-com:vml" xmlns:wp14="http://schemas.microsoft.com/office/word/2010/wordprocessingDrawing" xmlns:wp="http://schemas.openxmlformats.org/drawingml/2006/wordprocessingDrawing" xmlns:w10="urn:schemas-microsoft-com:office:word" xmlns:w="http://schemas.openxmlformats.org/wordprocessingml/2006/main" xmlns:w14="http://schemas.microsoft.com/office/word/2010/wordml" xmlns:w15="http://schemas.microsoft.com/office/word/2012/wordml" xmlns:w16cei="http://schemas.microsoft.com/office/word/2026/wordml/cei" xmlns:w16cex="http://schemas.microsoft.com/office/word/2018/wordml/cex" xmlns:w16cid="http://schemas.microsoft.com/office/word/2016/wordml/cid" xmlns:w16="http://schemas.microsoft.com/office/word/2018/wordml" xmlns:w16du="http://schemas.microsoft.com/office/word/2023/wordml/word16du" xmlns:w16sdtdh="http://schemas.microsoft.com/office/word/2020/wordml/sdtdatahash" xmlns:w16sdtfl="http://schemas.microsoft.com/office/word/2024/wordml/sdtformatlock" xmlns:w16se="http://schemas.microsoft.com/office/word/2015/wordml/symex" xmlns:wpg="http://schemas.microsoft.com/office/word/2010/wordprocessingGroup" xmlns:wpi="http://schemas.microsoft.com/office/word/2010/wordprocessingInk" xmlns:wne="http://schemas.microsoft.com/office/word/2006/wordml" xmlns:wps="http://schemas.microsoft.com/office/word/2010/wordprocessingShape" mc:Ignorable="w14 w15 w16se w16cid w16 w16cex w16sdtdh w16sdtfl w16du wp14">
   <w:sdt>
     <w:sdtPr>
       <w:id w:val="78800505"/>
@@ -9308,7 +8815,7 @@
 </file>
 
 <file path=word/header3.xml><?xml version="1.0" encoding="utf-8"?>
-<w:hdr xmlns:wpc="http://schemas.microsoft.com/office/word/2010/wordprocessingCanvas" xmlns:cx="http://schemas.microsoft.com/office/drawing/2014/chartex" xmlns:cx1="http://schemas.microsoft.com/office/drawing/2015/9/8/chartex" xmlns:cx2="http://schemas.microsoft.com/office/drawing/2015/10/21/chartex" xmlns:cx3="http://schemas.microsoft.com/office/drawing/2016/5/9/chartex" xmlns:cx4="http://schemas.microsoft.com/office/drawing/2016/5/10/chartex" xmlns:cx5="http://schemas.microsoft.com/office/drawing/2016/5/11/chartex" xmlns:cx6="http://schemas.microsoft.com/office/drawing/2016/5/12/chartex" xmlns:cx7="http://schemas.microsoft.com/office/drawing/2016/5/13/chartex" xmlns:cx8="http://schemas.microsoft.com/office/drawing/2016/5/14/chartex" xmlns:mc="http://schemas.openxmlformats.org/markup-compatibility/2006" xmlns:aink="http://schemas.microsoft.com/office/drawing/2016/ink" xmlns:am3d="http://schemas.microsoft.com/office/drawing/2017/model3d" xmlns:o="urn:schemas-microsoft-com:office:office" xmlns:oel="http://schemas.microsoft.com/office/2019/extlst" xmlns:r="http://schemas.openxmlformats.org/officeDocument/2006/relationships" xmlns:m="http://schemas.openxmlformats.org/officeDocument/2006/math" xmlns:v="urn:schemas-microsoft-com:vml" xmlns:wp14="http://schemas.microsoft.com/office/word/2010/wordprocessingDrawing" xmlns:wp="http://schemas.openxmlformats.org/drawingml/2006/wordprocessingDrawing" xmlns:w10="urn:schemas-microsoft-com:office:word" xmlns:w="http://schemas.openxmlformats.org/wordprocessingml/2006/main" xmlns:w14="http://schemas.microsoft.com/office/word/2010/wordml" xmlns:w15="http://schemas.microsoft.com/office/word/2012/wordml" xmlns:w16cex="http://schemas.microsoft.com/office/word/2018/wordml/cex" xmlns:w16cid="http://schemas.microsoft.com/office/word/2016/wordml/cid" xmlns:w16="http://schemas.microsoft.com/office/word/2018/wordml" xmlns:w16du="http://schemas.microsoft.com/office/word/2023/wordml/word16du" xmlns:w16sdtdh="http://schemas.microsoft.com/office/word/2020/wordml/sdtdatahash" xmlns:w16sdtfl="http://schemas.microsoft.com/office/word/2024/wordml/sdtformatlock" xmlns:w16se="http://schemas.microsoft.com/office/word/2015/wordml/symex" xmlns:wpg="http://schemas.microsoft.com/office/word/2010/wordprocessingGroup" xmlns:wpi="http://schemas.microsoft.com/office/word/2010/wordprocessingInk" xmlns:wne="http://schemas.microsoft.com/office/word/2006/wordml" xmlns:wps="http://schemas.microsoft.com/office/word/2010/wordprocessingShape" mc:Ignorable="w14 w15 w16se w16cid w16 w16cex w16sdtdh w16sdtfl w16du wp14">
+<w:hdr xmlns:wpc="http://schemas.microsoft.com/office/word/2010/wordprocessingCanvas" xmlns:cx="http://schemas.microsoft.com/office/drawing/2014/chartex" xmlns:cx1="http://schemas.microsoft.com/office/drawing/2015/9/8/chartex" xmlns:cx2="http://schemas.microsoft.com/office/drawing/2015/10/21/chartex" xmlns:cx3="http://schemas.microsoft.com/office/drawing/2016/5/9/chartex" xmlns:cx4="http://schemas.microsoft.com/office/drawing/2016/5/10/chartex" xmlns:cx5="http://schemas.microsoft.com/office/drawing/2016/5/11/chartex" xmlns:cx6="http://schemas.microsoft.com/office/drawing/2016/5/12/chartex" xmlns:cx7="http://schemas.microsoft.com/office/drawing/2016/5/13/chartex" xmlns:cx8="http://schemas.microsoft.com/office/drawing/2016/5/14/chartex" xmlns:mc="http://schemas.openxmlformats.org/markup-compatibility/2006" xmlns:aink="http://schemas.microsoft.com/office/drawing/2016/ink" xmlns:am3d="http://schemas.microsoft.com/office/drawing/2017/model3d" xmlns:o="urn:schemas-microsoft-com:office:office" xmlns:oel="http://schemas.microsoft.com/office/2019/extlst" xmlns:r="http://schemas.openxmlformats.org/officeDocument/2006/relationships" xmlns:m="http://schemas.openxmlformats.org/officeDocument/2006/math" xmlns:v="urn:schemas-microsoft-com:vml" xmlns:wp14="http://schemas.microsoft.com/office/word/2010/wordprocessingDrawing" xmlns:wp="http://schemas.openxmlformats.org/drawingml/2006/wordprocessingDrawing" xmlns:w10="urn:schemas-microsoft-com:office:word" xmlns:w="http://schemas.openxmlformats.org/wordprocessingml/2006/main" xmlns:w14="http://schemas.microsoft.com/office/word/2010/wordml" xmlns:w15="http://schemas.microsoft.com/office/word/2012/wordml" xmlns:w16cei="http://schemas.microsoft.com/office/word/2026/wordml/cei" xmlns:w16cex="http://schemas.microsoft.com/office/word/2018/wordml/cex" xmlns:w16cid="http://schemas.microsoft.com/office/word/2016/wordml/cid" xmlns:w16="http://schemas.microsoft.com/office/word/2018/wordml" xmlns:w16du="http://schemas.microsoft.com/office/word/2023/wordml/word16du" xmlns:w16sdtdh="http://schemas.microsoft.com/office/word/2020/wordml/sdtdatahash" xmlns:w16sdtfl="http://schemas.microsoft.com/office/word/2024/wordml/sdtformatlock" xmlns:w16se="http://schemas.microsoft.com/office/word/2015/wordml/symex" xmlns:wpg="http://schemas.microsoft.com/office/word/2010/wordprocessingGroup" xmlns:wpi="http://schemas.microsoft.com/office/word/2010/wordprocessingInk" xmlns:wne="http://schemas.microsoft.com/office/word/2006/wordml" xmlns:wps="http://schemas.microsoft.com/office/word/2010/wordprocessingShape" mc:Ignorable="w14 w15 w16se w16cid w16 w16cex w16sdtdh w16sdtfl w16du wp14">
   <w:p>
     <w:pPr>
       <w:pStyle w:val="Header"/>

</xml_diff>

<commit_message>
adding filmtopia project testing
</commit_message>
<xml_diff>
--- a/Testing.docx
+++ b/Testing.docx
@@ -1,12 +1,11 @@
 
 <file path=word/document.xml><?xml version="1.0" encoding="utf-8"?>
-<w:document xmlns:wpc="http://schemas.microsoft.com/office/word/2010/wordprocessingCanvas" xmlns:cx="http://schemas.microsoft.com/office/drawing/2014/chartex" xmlns:cx1="http://schemas.microsoft.com/office/drawing/2015/9/8/chartex" xmlns:cx2="http://schemas.microsoft.com/office/drawing/2015/10/21/chartex" xmlns:cx3="http://schemas.microsoft.com/office/drawing/2016/5/9/chartex" xmlns:cx4="http://schemas.microsoft.com/office/drawing/2016/5/10/chartex" xmlns:cx5="http://schemas.microsoft.com/office/drawing/2016/5/11/chartex" xmlns:cx6="http://schemas.microsoft.com/office/drawing/2016/5/12/chartex" xmlns:cx7="http://schemas.microsoft.com/office/drawing/2016/5/13/chartex" xmlns:cx8="http://schemas.microsoft.com/office/drawing/2016/5/14/chartex" xmlns:mc="http://schemas.openxmlformats.org/markup-compatibility/2006" xmlns:aink="http://schemas.microsoft.com/office/drawing/2016/ink" xmlns:am3d="http://schemas.microsoft.com/office/drawing/2017/model3d" xmlns:o="urn:schemas-microsoft-com:office:office" xmlns:oel="http://schemas.microsoft.com/office/2019/extlst" xmlns:r="http://schemas.openxmlformats.org/officeDocument/2006/relationships" xmlns:m="http://schemas.openxmlformats.org/officeDocument/2006/math" xmlns:v="urn:schemas-microsoft-com:vml" xmlns:wp14="http://schemas.microsoft.com/office/word/2010/wordprocessingDrawing" xmlns:wp="http://schemas.openxmlformats.org/drawingml/2006/wordprocessingDrawing" xmlns:w10="urn:schemas-microsoft-com:office:word" xmlns:w="http://schemas.openxmlformats.org/wordprocessingml/2006/main" xmlns:w14="http://schemas.microsoft.com/office/word/2010/wordml" xmlns:w15="http://schemas.microsoft.com/office/word/2012/wordml" xmlns:w16cex="http://schemas.microsoft.com/office/word/2018/wordml/cex" xmlns:w16cid="http://schemas.microsoft.com/office/word/2016/wordml/cid" xmlns:w16="http://schemas.microsoft.com/office/word/2018/wordml" xmlns:w16du="http://schemas.microsoft.com/office/word/2023/wordml/word16du" xmlns:w16sdtdh="http://schemas.microsoft.com/office/word/2020/wordml/sdtdatahash" xmlns:w16sdtfl="http://schemas.microsoft.com/office/word/2024/wordml/sdtformatlock" xmlns:w16se="http://schemas.microsoft.com/office/word/2015/wordml/symex" xmlns:wpg="http://schemas.microsoft.com/office/word/2010/wordprocessingGroup" xmlns:wpi="http://schemas.microsoft.com/office/word/2010/wordprocessingInk" xmlns:wne="http://schemas.microsoft.com/office/word/2006/wordml" xmlns:wps="http://schemas.microsoft.com/office/word/2010/wordprocessingShape" mc:Ignorable="w14 w15 w16se w16cid w16 w16cex w16sdtdh w16sdtfl w16du wp14">
+<w:document xmlns:wpc="http://schemas.microsoft.com/office/word/2010/wordprocessingCanvas" xmlns:cx="http://schemas.microsoft.com/office/drawing/2014/chartex" xmlns:cx1="http://schemas.microsoft.com/office/drawing/2015/9/8/chartex" xmlns:cx2="http://schemas.microsoft.com/office/drawing/2015/10/21/chartex" xmlns:cx3="http://schemas.microsoft.com/office/drawing/2016/5/9/chartex" xmlns:cx4="http://schemas.microsoft.com/office/drawing/2016/5/10/chartex" xmlns:cx5="http://schemas.microsoft.com/office/drawing/2016/5/11/chartex" xmlns:cx6="http://schemas.microsoft.com/office/drawing/2016/5/12/chartex" xmlns:cx7="http://schemas.microsoft.com/office/drawing/2016/5/13/chartex" xmlns:cx8="http://schemas.microsoft.com/office/drawing/2016/5/14/chartex" xmlns:mc="http://schemas.openxmlformats.org/markup-compatibility/2006" xmlns:aink="http://schemas.microsoft.com/office/drawing/2016/ink" xmlns:am3d="http://schemas.microsoft.com/office/drawing/2017/model3d" xmlns:o="urn:schemas-microsoft-com:office:office" xmlns:oel="http://schemas.microsoft.com/office/2019/extlst" xmlns:r="http://schemas.openxmlformats.org/officeDocument/2006/relationships" xmlns:m="http://schemas.openxmlformats.org/officeDocument/2006/math" xmlns:v="urn:schemas-microsoft-com:vml" xmlns:wp14="http://schemas.microsoft.com/office/word/2010/wordprocessingDrawing" xmlns:wp="http://schemas.openxmlformats.org/drawingml/2006/wordprocessingDrawing" xmlns:w10="urn:schemas-microsoft-com:office:word" xmlns:w="http://schemas.openxmlformats.org/wordprocessingml/2006/main" xmlns:w14="http://schemas.microsoft.com/office/word/2010/wordml" xmlns:w15="http://schemas.microsoft.com/office/word/2012/wordml" xmlns:w16cei="http://schemas.microsoft.com/office/word/2026/wordml/cei" xmlns:w16cex="http://schemas.microsoft.com/office/word/2018/wordml/cex" xmlns:w16cid="http://schemas.microsoft.com/office/word/2016/wordml/cid" xmlns:w16="http://schemas.microsoft.com/office/word/2018/wordml" xmlns:w16du="http://schemas.microsoft.com/office/word/2023/wordml/word16du" xmlns:w16sdtdh="http://schemas.microsoft.com/office/word/2020/wordml/sdtdatahash" xmlns:w16sdtfl="http://schemas.microsoft.com/office/word/2024/wordml/sdtformatlock" xmlns:w16se="http://schemas.microsoft.com/office/word/2015/wordml/symex" xmlns:wpg="http://schemas.microsoft.com/office/word/2010/wordprocessingGroup" xmlns:wpi="http://schemas.microsoft.com/office/word/2010/wordprocessingInk" xmlns:wne="http://schemas.microsoft.com/office/word/2006/wordml" xmlns:wps="http://schemas.microsoft.com/office/word/2010/wordprocessingShape" mc:Ignorable="w14 w15 w16se w16cid w16 w16cex w16sdtdh w16sdtfl w16du wp14">
   <w:body>
     <w:p>
       <w:pPr>
         <w:pStyle w:val="Heading1"/>
       </w:pPr>
-      <w:proofErr w:type="spellStart"/>
       <w:r>
         <w:rPr>
           <w:rFonts w:ascii="Aptos Display" w:eastAsia="Aptos Display" w:hAnsi="Aptos Display" w:cs="Aptos Display"/>
@@ -14,17 +13,7 @@
           <w:bCs/>
           <w:color w:val="A02B93"/>
         </w:rPr>
-        <w:t>Filmtopia</w:t>
-      </w:r>
-      <w:proofErr w:type="spellEnd"/>
-      <w:r>
-        <w:rPr>
-          <w:rFonts w:ascii="Aptos Display" w:eastAsia="Aptos Display" w:hAnsi="Aptos Display" w:cs="Aptos Display"/>
-          <w:b/>
-          <w:bCs/>
-          <w:color w:val="A02B93"/>
-        </w:rPr>
-        <w:t xml:space="preserve"> Project Testing</w:t>
+        <w:t xml:space="preserve">Filmtopia Project Testing</w:t>
       </w:r>
     </w:p>
     <w:p>
@@ -32,71 +21,8 @@
         <w:rPr>
           <w:rFonts w:ascii="Aptos" w:eastAsia="Aptos" w:hAnsi="Aptos" w:cs="Aptos"/>
         </w:rPr>
-        <w:t xml:space="preserve">This section sets out the plan for testing the finished </w:t>
+        <w:t xml:space="preserve">This section sets out the plan for testing the finished Filmtopia system and, in the actual test runs that follow, shows the results of carrying that plan out. Testing is a vital part of the project because it is what proves that each objective has actually been met and that the system behaves correctly not only with sensible data but also when a user makes a mistake.</w:t>
       </w:r>
-      <w:proofErr w:type="spellStart"/>
-      <w:r>
-        <w:rPr>
-          <w:rFonts w:ascii="Aptos" w:eastAsia="Aptos" w:hAnsi="Aptos" w:cs="Aptos"/>
-        </w:rPr>
-        <w:t>Filmtopia</w:t>
-      </w:r>
-      <w:proofErr w:type="spellEnd"/>
-      <w:r>
-        <w:rPr>
-          <w:rFonts w:ascii="Aptos" w:eastAsia="Aptos" w:hAnsi="Aptos" w:cs="Aptos"/>
-        </w:rPr>
-        <w:t xml:space="preserve"> system and, in the actual test runs that follow, shows the results of carrying that plan out. Testing is a vital part of the project because it is what proves that each objective has actually been met and that the system behaves correctly not only with sensible data but also when a user makes a mistake.</w:t>
-      </w:r>
-    </w:p>
-    <w:p>
-      <w:pPr>
-        <w:pStyle w:val="Heading2"/>
-      </w:pPr>
-      <w:r>
-        <w:rPr>
-          <w:rFonts w:ascii="Aptos Display" w:eastAsia="Aptos Display" w:hAnsi="Aptos Display" w:cs="Aptos Display"/>
-          <w:b/>
-          <w:bCs/>
-          <w:color w:val="000000"/>
-        </w:rPr>
-        <w:t>Introduction</w:t>
-      </w:r>
-    </w:p>
-    <w:p>
-      <w:r>
-        <w:rPr>
-          <w:rFonts w:ascii="Aptos" w:eastAsia="Aptos" w:hAnsi="Aptos" w:cs="Aptos"/>
-        </w:rPr>
-        <w:t>Each objective is tested using three different kinds of data wherever it is possible to do so. Normal data is ordinary, sensible data that a user would enter during normal use, and this should always be accepted. Erroneous data is data that is wrong in some way, such as a missing field or a letter where a number is expected, and this should always be rejected with a clear message. Boundary data is data that sits right at the edge of what is allowed, such as the smallest screen that can be created or the exact minute at which a screen becomes free again, and this should be accepted because it is still within the rules. Testing all three kinds is important because a system that only works with perfect data is not reliable, and it is often the awkward data that reveals a problem.</w:t>
-      </w:r>
-    </w:p>
-    <w:p>
-      <w:r>
-        <w:rPr>
-          <w:rFonts w:ascii="Aptos" w:eastAsia="Aptos" w:hAnsi="Aptos" w:cs="Aptos"/>
-        </w:rPr>
-        <w:t>The plan is laid out with a table for each objective, and every test is given a number, a description of the exact data to be entered, the type of test and the expected result. The expected results are written using real values, for example an exact total in pounds or the exact wording of the message the system shows, rather than vague statements, so that there can be no doubt about whether a test has passed. The objectives are tested in a logical order rather than in numerical order, because many of them depend on data created by others. For example films, screens and screenings all have to exist before a booking can be made, so those objectives are tested first. The tests also follow on from one another, so that data entered in an early test is then used and checked in a later one, for example three customers with the surname Smith are added and a search for Smith is later expected to return exactly those three.</w:t>
-      </w:r>
-    </w:p>
-    <w:p>
-      <w:r>
-        <w:rPr>
-          <w:rFonts w:ascii="Aptos" w:eastAsia="Aptos" w:hAnsi="Aptos" w:cs="Aptos"/>
-        </w:rPr>
-        <w:t>The first version of this plan was written while the prototype was being built, and it only covered the thirteen objectives the prototype set out to meet. Since then the system has grown a great deal. The list of objectives has been extended from eighteen to forty four, and several of the things the prototype already did have been rebuilt underneath. Screens are no longer created by typing in a total number of seats, seats now have types that carry their own price, and a booking can now be partly refunded rather than only cancelled outright. That means the original tests could not simply be added to, because a number of them described behaviour the system no longer has. This plan therefore does two things. It re-tests every prototype objective against the system as it now stands, and it tests the objectives that were identified after the prototype was finished. Where a prototype test no longer matched the system it has been rewritten rather than left in place, because a test that does not match the system is worse than no test at all.</w:t>
-      </w:r>
-    </w:p>
-    <w:p>
-      <w:pPr>
-        <w:pStyle w:val="Heading1"/>
-        <w:rPr>
-          <w:rFonts w:ascii="Aptos Display" w:eastAsia="Aptos Display" w:hAnsi="Aptos Display" w:cs="Aptos Display"/>
-          <w:b/>
-          <w:bCs/>
-          <w:color w:val="A02B93" w:themeColor="accent5"/>
-        </w:rPr>
-      </w:pPr>
     </w:p>
     <w:sectPr>
       <w:headerReference w:type="even" r:id="rId7"/>
@@ -121,7 +47,7 @@
 </file>
 
 <file path=word/endnotes.xml><?xml version="1.0" encoding="utf-8"?>
-<w:endnotes xmlns:wpc="http://schemas.microsoft.com/office/word/2010/wordprocessingCanvas" xmlns:cx="http://schemas.microsoft.com/office/drawing/2014/chartex" xmlns:cx1="http://schemas.microsoft.com/office/drawing/2015/9/8/chartex" xmlns:cx2="http://schemas.microsoft.com/office/drawing/2015/10/21/chartex" xmlns:cx3="http://schemas.microsoft.com/office/drawing/2016/5/9/chartex" xmlns:cx4="http://schemas.microsoft.com/office/drawing/2016/5/10/chartex" xmlns:cx5="http://schemas.microsoft.com/office/drawing/2016/5/11/chartex" xmlns:cx6="http://schemas.microsoft.com/office/drawing/2016/5/12/chartex" xmlns:cx7="http://schemas.microsoft.com/office/drawing/2016/5/13/chartex" xmlns:cx8="http://schemas.microsoft.com/office/drawing/2016/5/14/chartex" xmlns:mc="http://schemas.openxmlformats.org/markup-compatibility/2006" xmlns:aink="http://schemas.microsoft.com/office/drawing/2016/ink" xmlns:am3d="http://schemas.microsoft.com/office/drawing/2017/model3d" xmlns:o="urn:schemas-microsoft-com:office:office" xmlns:oel="http://schemas.microsoft.com/office/2019/extlst" xmlns:r="http://schemas.openxmlformats.org/officeDocument/2006/relationships" xmlns:m="http://schemas.openxmlformats.org/officeDocument/2006/math" xmlns:v="urn:schemas-microsoft-com:vml" xmlns:wp14="http://schemas.microsoft.com/office/word/2010/wordprocessingDrawing" xmlns:wp="http://schemas.openxmlformats.org/drawingml/2006/wordprocessingDrawing" xmlns:w10="urn:schemas-microsoft-com:office:word" xmlns:w="http://schemas.openxmlformats.org/wordprocessingml/2006/main" xmlns:w14="http://schemas.microsoft.com/office/word/2010/wordml" xmlns:w15="http://schemas.microsoft.com/office/word/2012/wordml" xmlns:w16cex="http://schemas.microsoft.com/office/word/2018/wordml/cex" xmlns:w16cid="http://schemas.microsoft.com/office/word/2016/wordml/cid" xmlns:w16="http://schemas.microsoft.com/office/word/2018/wordml" xmlns:w16du="http://schemas.microsoft.com/office/word/2023/wordml/word16du" xmlns:w16sdtdh="http://schemas.microsoft.com/office/word/2020/wordml/sdtdatahash" xmlns:w16sdtfl="http://schemas.microsoft.com/office/word/2024/wordml/sdtformatlock" xmlns:w16se="http://schemas.microsoft.com/office/word/2015/wordml/symex" xmlns:wpg="http://schemas.microsoft.com/office/word/2010/wordprocessingGroup" xmlns:wpi="http://schemas.microsoft.com/office/word/2010/wordprocessingInk" xmlns:wne="http://schemas.microsoft.com/office/word/2006/wordml" xmlns:wps="http://schemas.microsoft.com/office/word/2010/wordprocessingShape" mc:Ignorable="w14 w15 w16se w16cid w16 w16cex w16sdtdh w16sdtfl w16du wp14">
+<w:endnotes xmlns:wpc="http://schemas.microsoft.com/office/word/2010/wordprocessingCanvas" xmlns:cx="http://schemas.microsoft.com/office/drawing/2014/chartex" xmlns:cx1="http://schemas.microsoft.com/office/drawing/2015/9/8/chartex" xmlns:cx2="http://schemas.microsoft.com/office/drawing/2015/10/21/chartex" xmlns:cx3="http://schemas.microsoft.com/office/drawing/2016/5/9/chartex" xmlns:cx4="http://schemas.microsoft.com/office/drawing/2016/5/10/chartex" xmlns:cx5="http://schemas.microsoft.com/office/drawing/2016/5/11/chartex" xmlns:cx6="http://schemas.microsoft.com/office/drawing/2016/5/12/chartex" xmlns:cx7="http://schemas.microsoft.com/office/drawing/2016/5/13/chartex" xmlns:cx8="http://schemas.microsoft.com/office/drawing/2016/5/14/chartex" xmlns:mc="http://schemas.openxmlformats.org/markup-compatibility/2006" xmlns:aink="http://schemas.microsoft.com/office/drawing/2016/ink" xmlns:am3d="http://schemas.microsoft.com/office/drawing/2017/model3d" xmlns:o="urn:schemas-microsoft-com:office:office" xmlns:oel="http://schemas.microsoft.com/office/2019/extlst" xmlns:r="http://schemas.openxmlformats.org/officeDocument/2006/relationships" xmlns:m="http://schemas.openxmlformats.org/officeDocument/2006/math" xmlns:v="urn:schemas-microsoft-com:vml" xmlns:wp14="http://schemas.microsoft.com/office/word/2010/wordprocessingDrawing" xmlns:wp="http://schemas.openxmlformats.org/drawingml/2006/wordprocessingDrawing" xmlns:w10="urn:schemas-microsoft-com:office:word" xmlns:w="http://schemas.openxmlformats.org/wordprocessingml/2006/main" xmlns:w14="http://schemas.microsoft.com/office/word/2010/wordml" xmlns:w15="http://schemas.microsoft.com/office/word/2012/wordml" xmlns:w16cei="http://schemas.microsoft.com/office/word/2026/wordml/cei" xmlns:w16cex="http://schemas.microsoft.com/office/word/2018/wordml/cex" xmlns:w16cid="http://schemas.microsoft.com/office/word/2016/wordml/cid" xmlns:w16="http://schemas.microsoft.com/office/word/2018/wordml" xmlns:w16du="http://schemas.microsoft.com/office/word/2023/wordml/word16du" xmlns:w16sdtdh="http://schemas.microsoft.com/office/word/2020/wordml/sdtdatahash" xmlns:w16sdtfl="http://schemas.microsoft.com/office/word/2024/wordml/sdtformatlock" xmlns:w16se="http://schemas.microsoft.com/office/word/2015/wordml/symex" xmlns:wpg="http://schemas.microsoft.com/office/word/2010/wordprocessingGroup" xmlns:wpi="http://schemas.microsoft.com/office/word/2010/wordprocessingInk" xmlns:wne="http://schemas.microsoft.com/office/word/2006/wordml" xmlns:wps="http://schemas.microsoft.com/office/word/2010/wordprocessingShape" mc:Ignorable="w14 w15 w16se w16cid w16 w16cex w16sdtdh w16sdtfl w16du wp14">
   <w:endnote w:type="separator" w:id="-1">
     <w:p>
       <w:r>
@@ -140,7 +66,7 @@
 </file>
 
 <file path=word/footer1.xml><?xml version="1.0" encoding="utf-8"?>
-<w:ftr xmlns:wpc="http://schemas.microsoft.com/office/word/2010/wordprocessingCanvas" xmlns:cx="http://schemas.microsoft.com/office/drawing/2014/chartex" xmlns:cx1="http://schemas.microsoft.com/office/drawing/2015/9/8/chartex" xmlns:cx2="http://schemas.microsoft.com/office/drawing/2015/10/21/chartex" xmlns:cx3="http://schemas.microsoft.com/office/drawing/2016/5/9/chartex" xmlns:cx4="http://schemas.microsoft.com/office/drawing/2016/5/10/chartex" xmlns:cx5="http://schemas.microsoft.com/office/drawing/2016/5/11/chartex" xmlns:cx6="http://schemas.microsoft.com/office/drawing/2016/5/12/chartex" xmlns:cx7="http://schemas.microsoft.com/office/drawing/2016/5/13/chartex" xmlns:cx8="http://schemas.microsoft.com/office/drawing/2016/5/14/chartex" xmlns:mc="http://schemas.openxmlformats.org/markup-compatibility/2006" xmlns:aink="http://schemas.microsoft.com/office/drawing/2016/ink" xmlns:am3d="http://schemas.microsoft.com/office/drawing/2017/model3d" xmlns:o="urn:schemas-microsoft-com:office:office" xmlns:oel="http://schemas.microsoft.com/office/2019/extlst" xmlns:r="http://schemas.openxmlformats.org/officeDocument/2006/relationships" xmlns:m="http://schemas.openxmlformats.org/officeDocument/2006/math" xmlns:v="urn:schemas-microsoft-com:vml" xmlns:wp14="http://schemas.microsoft.com/office/word/2010/wordprocessingDrawing" xmlns:wp="http://schemas.openxmlformats.org/drawingml/2006/wordprocessingDrawing" xmlns:w10="urn:schemas-microsoft-com:office:word" xmlns:w="http://schemas.openxmlformats.org/wordprocessingml/2006/main" xmlns:w14="http://schemas.microsoft.com/office/word/2010/wordml" xmlns:w15="http://schemas.microsoft.com/office/word/2012/wordml" xmlns:w16cex="http://schemas.microsoft.com/office/word/2018/wordml/cex" xmlns:w16cid="http://schemas.microsoft.com/office/word/2016/wordml/cid" xmlns:w16="http://schemas.microsoft.com/office/word/2018/wordml" xmlns:w16du="http://schemas.microsoft.com/office/word/2023/wordml/word16du" xmlns:w16sdtdh="http://schemas.microsoft.com/office/word/2020/wordml/sdtdatahash" xmlns:w16sdtfl="http://schemas.microsoft.com/office/word/2024/wordml/sdtformatlock" xmlns:w16se="http://schemas.microsoft.com/office/word/2015/wordml/symex" xmlns:wpg="http://schemas.microsoft.com/office/word/2010/wordprocessingGroup" xmlns:wpi="http://schemas.microsoft.com/office/word/2010/wordprocessingInk" xmlns:wne="http://schemas.microsoft.com/office/word/2006/wordml" xmlns:wps="http://schemas.microsoft.com/office/word/2010/wordprocessingShape" mc:Ignorable="w14 w15 w16se w16cid w16 w16cex w16sdtdh w16sdtfl w16du wp14">
+<w:ftr xmlns:wpc="http://schemas.microsoft.com/office/word/2010/wordprocessingCanvas" xmlns:cx="http://schemas.microsoft.com/office/drawing/2014/chartex" xmlns:cx1="http://schemas.microsoft.com/office/drawing/2015/9/8/chartex" xmlns:cx2="http://schemas.microsoft.com/office/drawing/2015/10/21/chartex" xmlns:cx3="http://schemas.microsoft.com/office/drawing/2016/5/9/chartex" xmlns:cx4="http://schemas.microsoft.com/office/drawing/2016/5/10/chartex" xmlns:cx5="http://schemas.microsoft.com/office/drawing/2016/5/11/chartex" xmlns:cx6="http://schemas.microsoft.com/office/drawing/2016/5/12/chartex" xmlns:cx7="http://schemas.microsoft.com/office/drawing/2016/5/13/chartex" xmlns:cx8="http://schemas.microsoft.com/office/drawing/2016/5/14/chartex" xmlns:mc="http://schemas.openxmlformats.org/markup-compatibility/2006" xmlns:aink="http://schemas.microsoft.com/office/drawing/2016/ink" xmlns:am3d="http://schemas.microsoft.com/office/drawing/2017/model3d" xmlns:o="urn:schemas-microsoft-com:office:office" xmlns:oel="http://schemas.microsoft.com/office/2019/extlst" xmlns:r="http://schemas.openxmlformats.org/officeDocument/2006/relationships" xmlns:m="http://schemas.openxmlformats.org/officeDocument/2006/math" xmlns:v="urn:schemas-microsoft-com:vml" xmlns:wp14="http://schemas.microsoft.com/office/word/2010/wordprocessingDrawing" xmlns:wp="http://schemas.openxmlformats.org/drawingml/2006/wordprocessingDrawing" xmlns:w10="urn:schemas-microsoft-com:office:word" xmlns:w="http://schemas.openxmlformats.org/wordprocessingml/2006/main" xmlns:w14="http://schemas.microsoft.com/office/word/2010/wordml" xmlns:w15="http://schemas.microsoft.com/office/word/2012/wordml" xmlns:w16cei="http://schemas.microsoft.com/office/word/2026/wordml/cei" xmlns:w16cex="http://schemas.microsoft.com/office/word/2018/wordml/cex" xmlns:w16cid="http://schemas.microsoft.com/office/word/2016/wordml/cid" xmlns:w16="http://schemas.microsoft.com/office/word/2018/wordml" xmlns:w16du="http://schemas.microsoft.com/office/word/2023/wordml/word16du" xmlns:w16sdtdh="http://schemas.microsoft.com/office/word/2020/wordml/sdtdatahash" xmlns:w16sdtfl="http://schemas.microsoft.com/office/word/2024/wordml/sdtformatlock" xmlns:w16se="http://schemas.microsoft.com/office/word/2015/wordml/symex" xmlns:wpg="http://schemas.microsoft.com/office/word/2010/wordprocessingGroup" xmlns:wpi="http://schemas.microsoft.com/office/word/2010/wordprocessingInk" xmlns:wne="http://schemas.microsoft.com/office/word/2006/wordml" xmlns:wps="http://schemas.microsoft.com/office/word/2010/wordprocessingShape" mc:Ignorable="w14 w15 w16se w16cid w16 w16cex w16sdtdh w16sdtfl w16du wp14">
   <w:p>
     <w:pPr>
       <w:pStyle w:val="Footer"/>
@@ -150,7 +76,7 @@
 </file>
 
 <file path=word/footer2.xml><?xml version="1.0" encoding="utf-8"?>
-<w:ftr xmlns:wpc="http://schemas.microsoft.com/office/word/2010/wordprocessingCanvas" xmlns:cx="http://schemas.microsoft.com/office/drawing/2014/chartex" xmlns:cx1="http://schemas.microsoft.com/office/drawing/2015/9/8/chartex" xmlns:cx2="http://schemas.microsoft.com/office/drawing/2015/10/21/chartex" xmlns:cx3="http://schemas.microsoft.com/office/drawing/2016/5/9/chartex" xmlns:cx4="http://schemas.microsoft.com/office/drawing/2016/5/10/chartex" xmlns:cx5="http://schemas.microsoft.com/office/drawing/2016/5/11/chartex" xmlns:cx6="http://schemas.microsoft.com/office/drawing/2016/5/12/chartex" xmlns:cx7="http://schemas.microsoft.com/office/drawing/2016/5/13/chartex" xmlns:cx8="http://schemas.microsoft.com/office/drawing/2016/5/14/chartex" xmlns:mc="http://schemas.openxmlformats.org/markup-compatibility/2006" xmlns:aink="http://schemas.microsoft.com/office/drawing/2016/ink" xmlns:am3d="http://schemas.microsoft.com/office/drawing/2017/model3d" xmlns:o="urn:schemas-microsoft-com:office:office" xmlns:oel="http://schemas.microsoft.com/office/2019/extlst" xmlns:r="http://schemas.openxmlformats.org/officeDocument/2006/relationships" xmlns:m="http://schemas.openxmlformats.org/officeDocument/2006/math" xmlns:v="urn:schemas-microsoft-com:vml" xmlns:wp14="http://schemas.microsoft.com/office/word/2010/wordprocessingDrawing" xmlns:wp="http://schemas.openxmlformats.org/drawingml/2006/wordprocessingDrawing" xmlns:w10="urn:schemas-microsoft-com:office:word" xmlns:w="http://schemas.openxmlformats.org/wordprocessingml/2006/main" xmlns:w14="http://schemas.microsoft.com/office/word/2010/wordml" xmlns:w15="http://schemas.microsoft.com/office/word/2012/wordml" xmlns:w16cex="http://schemas.microsoft.com/office/word/2018/wordml/cex" xmlns:w16cid="http://schemas.microsoft.com/office/word/2016/wordml/cid" xmlns:w16="http://schemas.microsoft.com/office/word/2018/wordml" xmlns:w16du="http://schemas.microsoft.com/office/word/2023/wordml/word16du" xmlns:w16sdtdh="http://schemas.microsoft.com/office/word/2020/wordml/sdtdatahash" xmlns:w16sdtfl="http://schemas.microsoft.com/office/word/2024/wordml/sdtformatlock" xmlns:w16se="http://schemas.microsoft.com/office/word/2015/wordml/symex" xmlns:wpg="http://schemas.microsoft.com/office/word/2010/wordprocessingGroup" xmlns:wpi="http://schemas.microsoft.com/office/word/2010/wordprocessingInk" xmlns:wne="http://schemas.microsoft.com/office/word/2006/wordml" xmlns:wps="http://schemas.microsoft.com/office/word/2010/wordprocessingShape" mc:Ignorable="w14 w15 w16se w16cid w16 w16cex w16sdtdh w16sdtfl w16du wp14">
+<w:ftr xmlns:wpc="http://schemas.microsoft.com/office/word/2010/wordprocessingCanvas" xmlns:cx="http://schemas.microsoft.com/office/drawing/2014/chartex" xmlns:cx1="http://schemas.microsoft.com/office/drawing/2015/9/8/chartex" xmlns:cx2="http://schemas.microsoft.com/office/drawing/2015/10/21/chartex" xmlns:cx3="http://schemas.microsoft.com/office/drawing/2016/5/9/chartex" xmlns:cx4="http://schemas.microsoft.com/office/drawing/2016/5/10/chartex" xmlns:cx5="http://schemas.microsoft.com/office/drawing/2016/5/11/chartex" xmlns:cx6="http://schemas.microsoft.com/office/drawing/2016/5/12/chartex" xmlns:cx7="http://schemas.microsoft.com/office/drawing/2016/5/13/chartex" xmlns:cx8="http://schemas.microsoft.com/office/drawing/2016/5/14/chartex" xmlns:mc="http://schemas.openxmlformats.org/markup-compatibility/2006" xmlns:aink="http://schemas.microsoft.com/office/drawing/2016/ink" xmlns:am3d="http://schemas.microsoft.com/office/drawing/2017/model3d" xmlns:o="urn:schemas-microsoft-com:office:office" xmlns:oel="http://schemas.microsoft.com/office/2019/extlst" xmlns:r="http://schemas.openxmlformats.org/officeDocument/2006/relationships" xmlns:m="http://schemas.openxmlformats.org/officeDocument/2006/math" xmlns:v="urn:schemas-microsoft-com:vml" xmlns:wp14="http://schemas.microsoft.com/office/word/2010/wordprocessingDrawing" xmlns:wp="http://schemas.openxmlformats.org/drawingml/2006/wordprocessingDrawing" xmlns:w10="urn:schemas-microsoft-com:office:word" xmlns:w="http://schemas.openxmlformats.org/wordprocessingml/2006/main" xmlns:w14="http://schemas.microsoft.com/office/word/2010/wordml" xmlns:w15="http://schemas.microsoft.com/office/word/2012/wordml" xmlns:w16cei="http://schemas.microsoft.com/office/word/2026/wordml/cei" xmlns:w16cex="http://schemas.microsoft.com/office/word/2018/wordml/cex" xmlns:w16cid="http://schemas.microsoft.com/office/word/2016/wordml/cid" xmlns:w16="http://schemas.microsoft.com/office/word/2018/wordml" xmlns:w16du="http://schemas.microsoft.com/office/word/2023/wordml/word16du" xmlns:w16sdtdh="http://schemas.microsoft.com/office/word/2020/wordml/sdtdatahash" xmlns:w16sdtfl="http://schemas.microsoft.com/office/word/2024/wordml/sdtformatlock" xmlns:w16se="http://schemas.microsoft.com/office/word/2015/wordml/symex" xmlns:wpg="http://schemas.microsoft.com/office/word/2010/wordprocessingGroup" xmlns:wpi="http://schemas.microsoft.com/office/word/2010/wordprocessingInk" xmlns:wne="http://schemas.microsoft.com/office/word/2006/wordml" xmlns:wps="http://schemas.microsoft.com/office/word/2010/wordprocessingShape" mc:Ignorable="w14 w15 w16se w16cid w16 w16cex w16sdtdh w16sdtfl w16du wp14">
   <w:p>
     <w:pPr>
       <w:pStyle w:val="Footer"/>
@@ -160,7 +86,7 @@
 </file>
 
 <file path=word/footer3.xml><?xml version="1.0" encoding="utf-8"?>
-<w:ftr xmlns:wpc="http://schemas.microsoft.com/office/word/2010/wordprocessingCanvas" xmlns:cx="http://schemas.microsoft.com/office/drawing/2014/chartex" xmlns:cx1="http://schemas.microsoft.com/office/drawing/2015/9/8/chartex" xmlns:cx2="http://schemas.microsoft.com/office/drawing/2015/10/21/chartex" xmlns:cx3="http://schemas.microsoft.com/office/drawing/2016/5/9/chartex" xmlns:cx4="http://schemas.microsoft.com/office/drawing/2016/5/10/chartex" xmlns:cx5="http://schemas.microsoft.com/office/drawing/2016/5/11/chartex" xmlns:cx6="http://schemas.microsoft.com/office/drawing/2016/5/12/chartex" xmlns:cx7="http://schemas.microsoft.com/office/drawing/2016/5/13/chartex" xmlns:cx8="http://schemas.microsoft.com/office/drawing/2016/5/14/chartex" xmlns:mc="http://schemas.openxmlformats.org/markup-compatibility/2006" xmlns:aink="http://schemas.microsoft.com/office/drawing/2016/ink" xmlns:am3d="http://schemas.microsoft.com/office/drawing/2017/model3d" xmlns:o="urn:schemas-microsoft-com:office:office" xmlns:oel="http://schemas.microsoft.com/office/2019/extlst" xmlns:r="http://schemas.openxmlformats.org/officeDocument/2006/relationships" xmlns:m="http://schemas.openxmlformats.org/officeDocument/2006/math" xmlns:v="urn:schemas-microsoft-com:vml" xmlns:wp14="http://schemas.microsoft.com/office/word/2010/wordprocessingDrawing" xmlns:wp="http://schemas.openxmlformats.org/drawingml/2006/wordprocessingDrawing" xmlns:w10="urn:schemas-microsoft-com:office:word" xmlns:w="http://schemas.openxmlformats.org/wordprocessingml/2006/main" xmlns:w14="http://schemas.microsoft.com/office/word/2010/wordml" xmlns:w15="http://schemas.microsoft.com/office/word/2012/wordml" xmlns:w16cex="http://schemas.microsoft.com/office/word/2018/wordml/cex" xmlns:w16cid="http://schemas.microsoft.com/office/word/2016/wordml/cid" xmlns:w16="http://schemas.microsoft.com/office/word/2018/wordml" xmlns:w16du="http://schemas.microsoft.com/office/word/2023/wordml/word16du" xmlns:w16sdtdh="http://schemas.microsoft.com/office/word/2020/wordml/sdtdatahash" xmlns:w16sdtfl="http://schemas.microsoft.com/office/word/2024/wordml/sdtformatlock" xmlns:w16se="http://schemas.microsoft.com/office/word/2015/wordml/symex" xmlns:wpg="http://schemas.microsoft.com/office/word/2010/wordprocessingGroup" xmlns:wpi="http://schemas.microsoft.com/office/word/2010/wordprocessingInk" xmlns:wne="http://schemas.microsoft.com/office/word/2006/wordml" xmlns:wps="http://schemas.microsoft.com/office/word/2010/wordprocessingShape" mc:Ignorable="w14 w15 w16se w16cid w16 w16cex w16sdtdh w16sdtfl w16du wp14">
+<w:ftr xmlns:wpc="http://schemas.microsoft.com/office/word/2010/wordprocessingCanvas" xmlns:cx="http://schemas.microsoft.com/office/drawing/2014/chartex" xmlns:cx1="http://schemas.microsoft.com/office/drawing/2015/9/8/chartex" xmlns:cx2="http://schemas.microsoft.com/office/drawing/2015/10/21/chartex" xmlns:cx3="http://schemas.microsoft.com/office/drawing/2016/5/9/chartex" xmlns:cx4="http://schemas.microsoft.com/office/drawing/2016/5/10/chartex" xmlns:cx5="http://schemas.microsoft.com/office/drawing/2016/5/11/chartex" xmlns:cx6="http://schemas.microsoft.com/office/drawing/2016/5/12/chartex" xmlns:cx7="http://schemas.microsoft.com/office/drawing/2016/5/13/chartex" xmlns:cx8="http://schemas.microsoft.com/office/drawing/2016/5/14/chartex" xmlns:mc="http://schemas.openxmlformats.org/markup-compatibility/2006" xmlns:aink="http://schemas.microsoft.com/office/drawing/2016/ink" xmlns:am3d="http://schemas.microsoft.com/office/drawing/2017/model3d" xmlns:o="urn:schemas-microsoft-com:office:office" xmlns:oel="http://schemas.microsoft.com/office/2019/extlst" xmlns:r="http://schemas.openxmlformats.org/officeDocument/2006/relationships" xmlns:m="http://schemas.openxmlformats.org/officeDocument/2006/math" xmlns:v="urn:schemas-microsoft-com:vml" xmlns:wp14="http://schemas.microsoft.com/office/word/2010/wordprocessingDrawing" xmlns:wp="http://schemas.openxmlformats.org/drawingml/2006/wordprocessingDrawing" xmlns:w10="urn:schemas-microsoft-com:office:word" xmlns:w="http://schemas.openxmlformats.org/wordprocessingml/2006/main" xmlns:w14="http://schemas.microsoft.com/office/word/2010/wordml" xmlns:w15="http://schemas.microsoft.com/office/word/2012/wordml" xmlns:w16cei="http://schemas.microsoft.com/office/word/2026/wordml/cei" xmlns:w16cex="http://schemas.microsoft.com/office/word/2018/wordml/cex" xmlns:w16cid="http://schemas.microsoft.com/office/word/2016/wordml/cid" xmlns:w16="http://schemas.microsoft.com/office/word/2018/wordml" xmlns:w16du="http://schemas.microsoft.com/office/word/2023/wordml/word16du" xmlns:w16sdtdh="http://schemas.microsoft.com/office/word/2020/wordml/sdtdatahash" xmlns:w16sdtfl="http://schemas.microsoft.com/office/word/2024/wordml/sdtformatlock" xmlns:w16se="http://schemas.microsoft.com/office/word/2015/wordml/symex" xmlns:wpg="http://schemas.microsoft.com/office/word/2010/wordprocessingGroup" xmlns:wpi="http://schemas.microsoft.com/office/word/2010/wordprocessingInk" xmlns:wne="http://schemas.microsoft.com/office/word/2006/wordml" xmlns:wps="http://schemas.microsoft.com/office/word/2010/wordprocessingShape" mc:Ignorable="w14 w15 w16se w16cid w16 w16cex w16sdtdh w16sdtfl w16du wp14">
   <w:p>
     <w:pPr>
       <w:pStyle w:val="Footer"/>
@@ -170,7 +96,7 @@
 </file>
 
 <file path=word/footnotes.xml><?xml version="1.0" encoding="utf-8"?>
-<w:footnotes xmlns:wpc="http://schemas.microsoft.com/office/word/2010/wordprocessingCanvas" xmlns:cx="http://schemas.microsoft.com/office/drawing/2014/chartex" xmlns:cx1="http://schemas.microsoft.com/office/drawing/2015/9/8/chartex" xmlns:cx2="http://schemas.microsoft.com/office/drawing/2015/10/21/chartex" xmlns:cx3="http://schemas.microsoft.com/office/drawing/2016/5/9/chartex" xmlns:cx4="http://schemas.microsoft.com/office/drawing/2016/5/10/chartex" xmlns:cx5="http://schemas.microsoft.com/office/drawing/2016/5/11/chartex" xmlns:cx6="http://schemas.microsoft.com/office/drawing/2016/5/12/chartex" xmlns:cx7="http://schemas.microsoft.com/office/drawing/2016/5/13/chartex" xmlns:cx8="http://schemas.microsoft.com/office/drawing/2016/5/14/chartex" xmlns:mc="http://schemas.openxmlformats.org/markup-compatibility/2006" xmlns:aink="http://schemas.microsoft.com/office/drawing/2016/ink" xmlns:am3d="http://schemas.microsoft.com/office/drawing/2017/model3d" xmlns:o="urn:schemas-microsoft-com:office:office" xmlns:oel="http://schemas.microsoft.com/office/2019/extlst" xmlns:r="http://schemas.openxmlformats.org/officeDocument/2006/relationships" xmlns:m="http://schemas.openxmlformats.org/officeDocument/2006/math" xmlns:v="urn:schemas-microsoft-com:vml" xmlns:wp14="http://schemas.microsoft.com/office/word/2010/wordprocessingDrawing" xmlns:wp="http://schemas.openxmlformats.org/drawingml/2006/wordprocessingDrawing" xmlns:w10="urn:schemas-microsoft-com:office:word" xmlns:w="http://schemas.openxmlformats.org/wordprocessingml/2006/main" xmlns:w14="http://schemas.microsoft.com/office/word/2010/wordml" xmlns:w15="http://schemas.microsoft.com/office/word/2012/wordml" xmlns:w16cex="http://schemas.microsoft.com/office/word/2018/wordml/cex" xmlns:w16cid="http://schemas.microsoft.com/office/word/2016/wordml/cid" xmlns:w16="http://schemas.microsoft.com/office/word/2018/wordml" xmlns:w16du="http://schemas.microsoft.com/office/word/2023/wordml/word16du" xmlns:w16sdtdh="http://schemas.microsoft.com/office/word/2020/wordml/sdtdatahash" xmlns:w16sdtfl="http://schemas.microsoft.com/office/word/2024/wordml/sdtformatlock" xmlns:w16se="http://schemas.microsoft.com/office/word/2015/wordml/symex" xmlns:wpg="http://schemas.microsoft.com/office/word/2010/wordprocessingGroup" xmlns:wpi="http://schemas.microsoft.com/office/word/2010/wordprocessingInk" xmlns:wne="http://schemas.microsoft.com/office/word/2006/wordml" xmlns:wps="http://schemas.microsoft.com/office/word/2010/wordprocessingShape" mc:Ignorable="w14 w15 w16se w16cid w16 w16cex w16sdtdh w16sdtfl w16du wp14">
+<w:footnotes xmlns:wpc="http://schemas.microsoft.com/office/word/2010/wordprocessingCanvas" xmlns:cx="http://schemas.microsoft.com/office/drawing/2014/chartex" xmlns:cx1="http://schemas.microsoft.com/office/drawing/2015/9/8/chartex" xmlns:cx2="http://schemas.microsoft.com/office/drawing/2015/10/21/chartex" xmlns:cx3="http://schemas.microsoft.com/office/drawing/2016/5/9/chartex" xmlns:cx4="http://schemas.microsoft.com/office/drawing/2016/5/10/chartex" xmlns:cx5="http://schemas.microsoft.com/office/drawing/2016/5/11/chartex" xmlns:cx6="http://schemas.microsoft.com/office/drawing/2016/5/12/chartex" xmlns:cx7="http://schemas.microsoft.com/office/drawing/2016/5/13/chartex" xmlns:cx8="http://schemas.microsoft.com/office/drawing/2016/5/14/chartex" xmlns:mc="http://schemas.openxmlformats.org/markup-compatibility/2006" xmlns:aink="http://schemas.microsoft.com/office/drawing/2016/ink" xmlns:am3d="http://schemas.microsoft.com/office/drawing/2017/model3d" xmlns:o="urn:schemas-microsoft-com:office:office" xmlns:oel="http://schemas.microsoft.com/office/2019/extlst" xmlns:r="http://schemas.openxmlformats.org/officeDocument/2006/relationships" xmlns:m="http://schemas.openxmlformats.org/officeDocument/2006/math" xmlns:v="urn:schemas-microsoft-com:vml" xmlns:wp14="http://schemas.microsoft.com/office/word/2010/wordprocessingDrawing" xmlns:wp="http://schemas.openxmlformats.org/drawingml/2006/wordprocessingDrawing" xmlns:w10="urn:schemas-microsoft-com:office:word" xmlns:w="http://schemas.openxmlformats.org/wordprocessingml/2006/main" xmlns:w14="http://schemas.microsoft.com/office/word/2010/wordml" xmlns:w15="http://schemas.microsoft.com/office/word/2012/wordml" xmlns:w16cei="http://schemas.microsoft.com/office/word/2026/wordml/cei" xmlns:w16cex="http://schemas.microsoft.com/office/word/2018/wordml/cex" xmlns:w16cid="http://schemas.microsoft.com/office/word/2016/wordml/cid" xmlns:w16="http://schemas.microsoft.com/office/word/2018/wordml" xmlns:w16du="http://schemas.microsoft.com/office/word/2023/wordml/word16du" xmlns:w16sdtdh="http://schemas.microsoft.com/office/word/2020/wordml/sdtdatahash" xmlns:w16sdtfl="http://schemas.microsoft.com/office/word/2024/wordml/sdtformatlock" xmlns:w16se="http://schemas.microsoft.com/office/word/2015/wordml/symex" xmlns:wpg="http://schemas.microsoft.com/office/word/2010/wordprocessingGroup" xmlns:wpi="http://schemas.microsoft.com/office/word/2010/wordprocessingInk" xmlns:wne="http://schemas.microsoft.com/office/word/2006/wordml" xmlns:wps="http://schemas.microsoft.com/office/word/2010/wordprocessingShape" mc:Ignorable="w14 w15 w16se w16cid w16 w16cex w16sdtdh w16sdtfl w16du wp14">
   <w:footnote w:type="separator" w:id="-1">
     <w:p>
       <w:r>
@@ -189,7 +115,7 @@
 </file>
 
 <file path=word/header1.xml><?xml version="1.0" encoding="utf-8"?>
-<w:hdr xmlns:wpc="http://schemas.microsoft.com/office/word/2010/wordprocessingCanvas" xmlns:cx="http://schemas.microsoft.com/office/drawing/2014/chartex" xmlns:cx1="http://schemas.microsoft.com/office/drawing/2015/9/8/chartex" xmlns:cx2="http://schemas.microsoft.com/office/drawing/2015/10/21/chartex" xmlns:cx3="http://schemas.microsoft.com/office/drawing/2016/5/9/chartex" xmlns:cx4="http://schemas.microsoft.com/office/drawing/2016/5/10/chartex" xmlns:cx5="http://schemas.microsoft.com/office/drawing/2016/5/11/chartex" xmlns:cx6="http://schemas.microsoft.com/office/drawing/2016/5/12/chartex" xmlns:cx7="http://schemas.microsoft.com/office/drawing/2016/5/13/chartex" xmlns:cx8="http://schemas.microsoft.com/office/drawing/2016/5/14/chartex" xmlns:mc="http://schemas.openxmlformats.org/markup-compatibility/2006" xmlns:aink="http://schemas.microsoft.com/office/drawing/2016/ink" xmlns:am3d="http://schemas.microsoft.com/office/drawing/2017/model3d" xmlns:o="urn:schemas-microsoft-com:office:office" xmlns:oel="http://schemas.microsoft.com/office/2019/extlst" xmlns:r="http://schemas.openxmlformats.org/officeDocument/2006/relationships" xmlns:m="http://schemas.openxmlformats.org/officeDocument/2006/math" xmlns:v="urn:schemas-microsoft-com:vml" xmlns:wp14="http://schemas.microsoft.com/office/word/2010/wordprocessingDrawing" xmlns:wp="http://schemas.openxmlformats.org/drawingml/2006/wordprocessingDrawing" xmlns:w10="urn:schemas-microsoft-com:office:word" xmlns:w="http://schemas.openxmlformats.org/wordprocessingml/2006/main" xmlns:w14="http://schemas.microsoft.com/office/word/2010/wordml" xmlns:w15="http://schemas.microsoft.com/office/word/2012/wordml" xmlns:w16cex="http://schemas.microsoft.com/office/word/2018/wordml/cex" xmlns:w16cid="http://schemas.microsoft.com/office/word/2016/wordml/cid" xmlns:w16="http://schemas.microsoft.com/office/word/2018/wordml" xmlns:w16du="http://schemas.microsoft.com/office/word/2023/wordml/word16du" xmlns:w16sdtdh="http://schemas.microsoft.com/office/word/2020/wordml/sdtdatahash" xmlns:w16sdtfl="http://schemas.microsoft.com/office/word/2024/wordml/sdtformatlock" xmlns:w16se="http://schemas.microsoft.com/office/word/2015/wordml/symex" xmlns:wpg="http://schemas.microsoft.com/office/word/2010/wordprocessingGroup" xmlns:wpi="http://schemas.microsoft.com/office/word/2010/wordprocessingInk" xmlns:wne="http://schemas.microsoft.com/office/word/2006/wordml" xmlns:wps="http://schemas.microsoft.com/office/word/2010/wordprocessingShape" mc:Ignorable="w14 w15 w16se w16cid w16 w16cex w16sdtdh w16sdtfl w16du wp14">
+<w:hdr xmlns:wpc="http://schemas.microsoft.com/office/word/2010/wordprocessingCanvas" xmlns:cx="http://schemas.microsoft.com/office/drawing/2014/chartex" xmlns:cx1="http://schemas.microsoft.com/office/drawing/2015/9/8/chartex" xmlns:cx2="http://schemas.microsoft.com/office/drawing/2015/10/21/chartex" xmlns:cx3="http://schemas.microsoft.com/office/drawing/2016/5/9/chartex" xmlns:cx4="http://schemas.microsoft.com/office/drawing/2016/5/10/chartex" xmlns:cx5="http://schemas.microsoft.com/office/drawing/2016/5/11/chartex" xmlns:cx6="http://schemas.microsoft.com/office/drawing/2016/5/12/chartex" xmlns:cx7="http://schemas.microsoft.com/office/drawing/2016/5/13/chartex" xmlns:cx8="http://schemas.microsoft.com/office/drawing/2016/5/14/chartex" xmlns:mc="http://schemas.openxmlformats.org/markup-compatibility/2006" xmlns:aink="http://schemas.microsoft.com/office/drawing/2016/ink" xmlns:am3d="http://schemas.microsoft.com/office/drawing/2017/model3d" xmlns:o="urn:schemas-microsoft-com:office:office" xmlns:oel="http://schemas.microsoft.com/office/2019/extlst" xmlns:r="http://schemas.openxmlformats.org/officeDocument/2006/relationships" xmlns:m="http://schemas.openxmlformats.org/officeDocument/2006/math" xmlns:v="urn:schemas-microsoft-com:vml" xmlns:wp14="http://schemas.microsoft.com/office/word/2010/wordprocessingDrawing" xmlns:wp="http://schemas.openxmlformats.org/drawingml/2006/wordprocessingDrawing" xmlns:w10="urn:schemas-microsoft-com:office:word" xmlns:w="http://schemas.openxmlformats.org/wordprocessingml/2006/main" xmlns:w14="http://schemas.microsoft.com/office/word/2010/wordml" xmlns:w15="http://schemas.microsoft.com/office/word/2012/wordml" xmlns:w16cei="http://schemas.microsoft.com/office/word/2026/wordml/cei" xmlns:w16cex="http://schemas.microsoft.com/office/word/2018/wordml/cex" xmlns:w16cid="http://schemas.microsoft.com/office/word/2016/wordml/cid" xmlns:w16="http://schemas.microsoft.com/office/word/2018/wordml" xmlns:w16du="http://schemas.microsoft.com/office/word/2023/wordml/word16du" xmlns:w16sdtdh="http://schemas.microsoft.com/office/word/2020/wordml/sdtdatahash" xmlns:w16sdtfl="http://schemas.microsoft.com/office/word/2024/wordml/sdtformatlock" xmlns:w16se="http://schemas.microsoft.com/office/word/2015/wordml/symex" xmlns:wpg="http://schemas.microsoft.com/office/word/2010/wordprocessingGroup" xmlns:wpi="http://schemas.microsoft.com/office/word/2010/wordprocessingInk" xmlns:wne="http://schemas.microsoft.com/office/word/2006/wordml" xmlns:wps="http://schemas.microsoft.com/office/word/2010/wordprocessingShape" mc:Ignorable="w14 w15 w16se w16cid w16 w16cex w16sdtdh w16sdtfl w16du wp14">
   <w:p>
     <w:pPr>
       <w:pStyle w:val="Header"/>
@@ -199,7 +125,7 @@
 </file>
 
 <file path=word/header2.xml><?xml version="1.0" encoding="utf-8"?>
-<w:hdr xmlns:wpc="http://schemas.microsoft.com/office/word/2010/wordprocessingCanvas" xmlns:cx="http://schemas.microsoft.com/office/drawing/2014/chartex" xmlns:cx1="http://schemas.microsoft.com/office/drawing/2015/9/8/chartex" xmlns:cx2="http://schemas.microsoft.com/office/drawing/2015/10/21/chartex" xmlns:cx3="http://schemas.microsoft.com/office/drawing/2016/5/9/chartex" xmlns:cx4="http://schemas.microsoft.com/office/drawing/2016/5/10/chartex" xmlns:cx5="http://schemas.microsoft.com/office/drawing/2016/5/11/chartex" xmlns:cx6="http://schemas.microsoft.com/office/drawing/2016/5/12/chartex" xmlns:cx7="http://schemas.microsoft.com/office/drawing/2016/5/13/chartex" xmlns:cx8="http://schemas.microsoft.com/office/drawing/2016/5/14/chartex" xmlns:mc="http://schemas.openxmlformats.org/markup-compatibility/2006" xmlns:aink="http://schemas.microsoft.com/office/drawing/2016/ink" xmlns:am3d="http://schemas.microsoft.com/office/drawing/2017/model3d" xmlns:o="urn:schemas-microsoft-com:office:office" xmlns:oel="http://schemas.microsoft.com/office/2019/extlst" xmlns:r="http://schemas.openxmlformats.org/officeDocument/2006/relationships" xmlns:m="http://schemas.openxmlformats.org/officeDocument/2006/math" xmlns:v="urn:schemas-microsoft-com:vml" xmlns:wp14="http://schemas.microsoft.com/office/word/2010/wordprocessingDrawing" xmlns:wp="http://schemas.openxmlformats.org/drawingml/2006/wordprocessingDrawing" xmlns:w10="urn:schemas-microsoft-com:office:word" xmlns:w="http://schemas.openxmlformats.org/wordprocessingml/2006/main" xmlns:w14="http://schemas.microsoft.com/office/word/2010/wordml" xmlns:w15="http://schemas.microsoft.com/office/word/2012/wordml" xmlns:w16cex="http://schemas.microsoft.com/office/word/2018/wordml/cex" xmlns:w16cid="http://schemas.microsoft.com/office/word/2016/wordml/cid" xmlns:w16="http://schemas.microsoft.com/office/word/2018/wordml" xmlns:w16du="http://schemas.microsoft.com/office/word/2023/wordml/word16du" xmlns:w16sdtdh="http://schemas.microsoft.com/office/word/2020/wordml/sdtdatahash" xmlns:w16sdtfl="http://schemas.microsoft.com/office/word/2024/wordml/sdtformatlock" xmlns:w16se="http://schemas.microsoft.com/office/word/2015/wordml/symex" xmlns:wpg="http://schemas.microsoft.com/office/word/2010/wordprocessingGroup" xmlns:wpi="http://schemas.microsoft.com/office/word/2010/wordprocessingInk" xmlns:wne="http://schemas.microsoft.com/office/word/2006/wordml" xmlns:wps="http://schemas.microsoft.com/office/word/2010/wordprocessingShape" mc:Ignorable="w14 w15 w16se w16cid w16 w16cex w16sdtdh w16sdtfl w16du wp14">
+<w:hdr xmlns:wpc="http://schemas.microsoft.com/office/word/2010/wordprocessingCanvas" xmlns:cx="http://schemas.microsoft.com/office/drawing/2014/chartex" xmlns:cx1="http://schemas.microsoft.com/office/drawing/2015/9/8/chartex" xmlns:cx2="http://schemas.microsoft.com/office/drawing/2015/10/21/chartex" xmlns:cx3="http://schemas.microsoft.com/office/drawing/2016/5/9/chartex" xmlns:cx4="http://schemas.microsoft.com/office/drawing/2016/5/10/chartex" xmlns:cx5="http://schemas.microsoft.com/office/drawing/2016/5/11/chartex" xmlns:cx6="http://schemas.microsoft.com/office/drawing/2016/5/12/chartex" xmlns:cx7="http://schemas.microsoft.com/office/drawing/2016/5/13/chartex" xmlns:cx8="http://schemas.microsoft.com/office/drawing/2016/5/14/chartex" xmlns:mc="http://schemas.openxmlformats.org/markup-compatibility/2006" xmlns:aink="http://schemas.microsoft.com/office/drawing/2016/ink" xmlns:am3d="http://schemas.microsoft.com/office/drawing/2017/model3d" xmlns:o="urn:schemas-microsoft-com:office:office" xmlns:oel="http://schemas.microsoft.com/office/2019/extlst" xmlns:r="http://schemas.openxmlformats.org/officeDocument/2006/relationships" xmlns:m="http://schemas.openxmlformats.org/officeDocument/2006/math" xmlns:v="urn:schemas-microsoft-com:vml" xmlns:wp14="http://schemas.microsoft.com/office/word/2010/wordprocessingDrawing" xmlns:wp="http://schemas.openxmlformats.org/drawingml/2006/wordprocessingDrawing" xmlns:w10="urn:schemas-microsoft-com:office:word" xmlns:w="http://schemas.openxmlformats.org/wordprocessingml/2006/main" xmlns:w14="http://schemas.microsoft.com/office/word/2010/wordml" xmlns:w15="http://schemas.microsoft.com/office/word/2012/wordml" xmlns:w16cei="http://schemas.microsoft.com/office/word/2026/wordml/cei" xmlns:w16cex="http://schemas.microsoft.com/office/word/2018/wordml/cex" xmlns:w16cid="http://schemas.microsoft.com/office/word/2016/wordml/cid" xmlns:w16="http://schemas.microsoft.com/office/word/2018/wordml" xmlns:w16du="http://schemas.microsoft.com/office/word/2023/wordml/word16du" xmlns:w16sdtdh="http://schemas.microsoft.com/office/word/2020/wordml/sdtdatahash" xmlns:w16sdtfl="http://schemas.microsoft.com/office/word/2024/wordml/sdtformatlock" xmlns:w16se="http://schemas.microsoft.com/office/word/2015/wordml/symex" xmlns:wpg="http://schemas.microsoft.com/office/word/2010/wordprocessingGroup" xmlns:wpi="http://schemas.microsoft.com/office/word/2010/wordprocessingInk" xmlns:wne="http://schemas.microsoft.com/office/word/2006/wordml" xmlns:wps="http://schemas.microsoft.com/office/word/2010/wordprocessingShape" mc:Ignorable="w14 w15 w16se w16cid w16 w16cex w16sdtdh w16sdtfl w16du wp14">
   <w:sdt>
     <w:sdtPr>
       <w:id w:val="78800505"/>
@@ -257,7 +183,7 @@
 </file>
 
 <file path=word/header3.xml><?xml version="1.0" encoding="utf-8"?>
-<w:hdr xmlns:wpc="http://schemas.microsoft.com/office/word/2010/wordprocessingCanvas" xmlns:cx="http://schemas.microsoft.com/office/drawing/2014/chartex" xmlns:cx1="http://schemas.microsoft.com/office/drawing/2015/9/8/chartex" xmlns:cx2="http://schemas.microsoft.com/office/drawing/2015/10/21/chartex" xmlns:cx3="http://schemas.microsoft.com/office/drawing/2016/5/9/chartex" xmlns:cx4="http://schemas.microsoft.com/office/drawing/2016/5/10/chartex" xmlns:cx5="http://schemas.microsoft.com/office/drawing/2016/5/11/chartex" xmlns:cx6="http://schemas.microsoft.com/office/drawing/2016/5/12/chartex" xmlns:cx7="http://schemas.microsoft.com/office/drawing/2016/5/13/chartex" xmlns:cx8="http://schemas.microsoft.com/office/drawing/2016/5/14/chartex" xmlns:mc="http://schemas.openxmlformats.org/markup-compatibility/2006" xmlns:aink="http://schemas.microsoft.com/office/drawing/2016/ink" xmlns:am3d="http://schemas.microsoft.com/office/drawing/2017/model3d" xmlns:o="urn:schemas-microsoft-com:office:office" xmlns:oel="http://schemas.microsoft.com/office/2019/extlst" xmlns:r="http://schemas.openxmlformats.org/officeDocument/2006/relationships" xmlns:m="http://schemas.openxmlformats.org/officeDocument/2006/math" xmlns:v="urn:schemas-microsoft-com:vml" xmlns:wp14="http://schemas.microsoft.com/office/word/2010/wordprocessingDrawing" xmlns:wp="http://schemas.openxmlformats.org/drawingml/2006/wordprocessingDrawing" xmlns:w10="urn:schemas-microsoft-com:office:word" xmlns:w="http://schemas.openxmlformats.org/wordprocessingml/2006/main" xmlns:w14="http://schemas.microsoft.com/office/word/2010/wordml" xmlns:w15="http://schemas.microsoft.com/office/word/2012/wordml" xmlns:w16cex="http://schemas.microsoft.com/office/word/2018/wordml/cex" xmlns:w16cid="http://schemas.microsoft.com/office/word/2016/wordml/cid" xmlns:w16="http://schemas.microsoft.com/office/word/2018/wordml" xmlns:w16du="http://schemas.microsoft.com/office/word/2023/wordml/word16du" xmlns:w16sdtdh="http://schemas.microsoft.com/office/word/2020/wordml/sdtdatahash" xmlns:w16sdtfl="http://schemas.microsoft.com/office/word/2024/wordml/sdtformatlock" xmlns:w16se="http://schemas.microsoft.com/office/word/2015/wordml/symex" xmlns:wpg="http://schemas.microsoft.com/office/word/2010/wordprocessingGroup" xmlns:wpi="http://schemas.microsoft.com/office/word/2010/wordprocessingInk" xmlns:wne="http://schemas.microsoft.com/office/word/2006/wordml" xmlns:wps="http://schemas.microsoft.com/office/word/2010/wordprocessingShape" mc:Ignorable="w14 w15 w16se w16cid w16 w16cex w16sdtdh w16sdtfl w16du wp14">
+<w:hdr xmlns:wpc="http://schemas.microsoft.com/office/word/2010/wordprocessingCanvas" xmlns:cx="http://schemas.microsoft.com/office/drawing/2014/chartex" xmlns:cx1="http://schemas.microsoft.com/office/drawing/2015/9/8/chartex" xmlns:cx2="http://schemas.microsoft.com/office/drawing/2015/10/21/chartex" xmlns:cx3="http://schemas.microsoft.com/office/drawing/2016/5/9/chartex" xmlns:cx4="http://schemas.microsoft.com/office/drawing/2016/5/10/chartex" xmlns:cx5="http://schemas.microsoft.com/office/drawing/2016/5/11/chartex" xmlns:cx6="http://schemas.microsoft.com/office/drawing/2016/5/12/chartex" xmlns:cx7="http://schemas.microsoft.com/office/drawing/2016/5/13/chartex" xmlns:cx8="http://schemas.microsoft.com/office/drawing/2016/5/14/chartex" xmlns:mc="http://schemas.openxmlformats.org/markup-compatibility/2006" xmlns:aink="http://schemas.microsoft.com/office/drawing/2016/ink" xmlns:am3d="http://schemas.microsoft.com/office/drawing/2017/model3d" xmlns:o="urn:schemas-microsoft-com:office:office" xmlns:oel="http://schemas.microsoft.com/office/2019/extlst" xmlns:r="http://schemas.openxmlformats.org/officeDocument/2006/relationships" xmlns:m="http://schemas.openxmlformats.org/officeDocument/2006/math" xmlns:v="urn:schemas-microsoft-com:vml" xmlns:wp14="http://schemas.microsoft.com/office/word/2010/wordprocessingDrawing" xmlns:wp="http://schemas.openxmlformats.org/drawingml/2006/wordprocessingDrawing" xmlns:w10="urn:schemas-microsoft-com:office:word" xmlns:w="http://schemas.openxmlformats.org/wordprocessingml/2006/main" xmlns:w14="http://schemas.microsoft.com/office/word/2010/wordml" xmlns:w15="http://schemas.microsoft.com/office/word/2012/wordml" xmlns:w16cei="http://schemas.microsoft.com/office/word/2026/wordml/cei" xmlns:w16cex="http://schemas.microsoft.com/office/word/2018/wordml/cex" xmlns:w16cid="http://schemas.microsoft.com/office/word/2016/wordml/cid" xmlns:w16="http://schemas.microsoft.com/office/word/2018/wordml" xmlns:w16du="http://schemas.microsoft.com/office/word/2023/wordml/word16du" xmlns:w16sdtdh="http://schemas.microsoft.com/office/word/2020/wordml/sdtdatahash" xmlns:w16sdtfl="http://schemas.microsoft.com/office/word/2024/wordml/sdtformatlock" xmlns:w16se="http://schemas.microsoft.com/office/word/2015/wordml/symex" xmlns:wpg="http://schemas.microsoft.com/office/word/2010/wordprocessingGroup" xmlns:wpi="http://schemas.microsoft.com/office/word/2010/wordprocessingInk" xmlns:wne="http://schemas.microsoft.com/office/word/2006/wordml" xmlns:wps="http://schemas.microsoft.com/office/word/2010/wordprocessingShape" mc:Ignorable="w14 w15 w16se w16cid w16 w16cex w16sdtdh w16sdtfl w16du wp14">
   <w:p>
     <w:pPr>
       <w:pStyle w:val="Header"/>

</xml_diff>

<commit_message>
added test plan: prototype objectives
</commit_message>
<xml_diff>
--- a/Testing.docx
+++ b/Testing.docx
@@ -160,6 +160,28 @@
           <w:rFonts w:ascii="Aptos" w:eastAsia="Aptos" w:hAnsi="Aptos" w:cs="Aptos"/>
         </w:rPr>
         <w:t xml:space="preserve">Four bookings are made, and these are the bookings that the search, the door list, the sales report, the refund and the cancellation tests all work on. Booking A is for John Smith on the Inception screening in seats B1 and B2, which are both Standard, so the tickets come to £18.00, and two Large Popcorn and one Cola are added to it later. Booking B is for Sarah Smith on the same screening in seat A1, which is a Saver seat, so it comes to £7.20. Booking C is for David Smith in seat D1, which is Premium, so it comes to £13.50. Booking D is for Emma Jones on the Paddington 2 screening in seat A1, which comes to £7.50. Before anything is refunded or cancelled that gives five tickets sold, ticket takings of £46.20, food takings of £11.50 and a grand total of £57.70. Those three figures are the starting point for the sales report tests, and the refund and cancellation tests are then expected to move them by exact amounts.</w:t>
+      </w:r>
+    </w:p>
+    <w:p>
+      <w:pPr>
+        <w:pStyle w:val="Heading2"/>
+      </w:pPr>
+      <w:r>
+        <w:rPr>
+          <w:rFonts w:ascii="Aptos Display" w:eastAsia="Aptos Display" w:hAnsi="Aptos Display" w:cs="Aptos Display"/>
+          <w:b/>
+          <w:bCs/>
+          <w:color w:val="000000"/>
+        </w:rPr>
+        <w:t xml:space="preserve">Test Plan: Prototype Objectives</w:t>
+      </w:r>
+    </w:p>
+    <w:p>
+      <w:r>
+        <w:rPr>
+          <w:rFonts w:ascii="Aptos" w:eastAsia="Aptos" w:hAnsi="Aptos" w:cs="Aptos"/>
+        </w:rPr>
+        <w:t xml:space="preserve">The objectives in this part of the plan were all met by the prototype, but every one of them is tested again here rather than being taken on trust, because the schema and several of the forms have been rebuilt since the prototype was finished. In particular the way a screen is created, the way a seat is priced and the way a booking is cancelled have all changed, so the tests covering those objectives are new tests rather than repeats.</w:t>
       </w:r>
     </w:p>
     <w:sectPr>

</xml_diff>

<commit_message>
added objective 6: adding new films
</commit_message>
<xml_diff>
--- a/Testing.docx
+++ b/Testing.docx
@@ -182,6 +182,1052 @@
           <w:rFonts w:ascii="Aptos" w:eastAsia="Aptos" w:hAnsi="Aptos" w:cs="Aptos"/>
         </w:rPr>
         <w:t xml:space="preserve">The objectives in this part of the plan were all met by the prototype, but every one of them is tested again here rather than being taken on trust, because the schema and several of the forms have been rebuilt since the prototype was finished. In particular the way a screen is created, the way a seat is priced and the way a booking is cancelled have all changed, so the tests covering those objectives are new tests rather than repeats.</w:t>
+      </w:r>
+    </w:p>
+    <w:p>
+      <w:pPr>
+        <w:pStyle w:val="Heading3"/>
+      </w:pPr>
+      <w:r>
+        <w:rPr>
+          <w:rFonts w:ascii="Aptos Display" w:eastAsia="Aptos Display" w:hAnsi="Aptos Display" w:cs="Aptos Display"/>
+          <w:b/>
+          <w:bCs/>
+          <w:color w:val="000000"/>
+        </w:rPr>
+        <w:t xml:space="preserve">Objective 6: Adding New Films</w:t>
+      </w:r>
+    </w:p>
+    <w:p>
+      <w:r>
+        <w:rPr>
+          <w:rFonts w:ascii="Aptos" w:eastAsia="Aptos" w:hAnsi="Aptos" w:cs="Aptos"/>
+        </w:rPr>
+        <w:t xml:space="preserve">This objective is tested first because films sit at the bottom of the data that everything else depends on, so they need to exist before screenings and bookings can be tested. The duration is checked at both ends because it is entered in minutes and a user who types a running time in hours, or who types the year by mistake, would otherwise create a film the scheduling would then work from.</w:t>
+      </w:r>
+    </w:p>
+    <w:tbl>
+      <w:tblPr>
+        <w:tblW w:w="5000" w:type="pct"/>
+        <w:tblBorders>
+          <w:top w:val="single" w:sz="4" w:space="0" w:color="808080"/>
+          <w:left w:val="single" w:sz="4" w:space="0" w:color="808080"/>
+          <w:bottom w:val="single" w:sz="4" w:space="0" w:color="808080"/>
+          <w:right w:val="single" w:sz="4" w:space="0" w:color="808080"/>
+          <w:insideH w:val="single" w:sz="4" w:space="0" w:color="808080"/>
+          <w:insideV w:val="single" w:sz="4" w:space="0" w:color="808080"/>
+        </w:tblBorders>
+        <w:tblCellMar>
+          <w:left w:w="10" w:type="dxa"/>
+          <w:right w:w="10" w:type="dxa"/>
+        </w:tblCellMar>
+        <w:tblLook w:val="0000" w:firstRow="0" w:lastRow="0" w:firstColumn="0" w:lastColumn="0" w:noHBand="0" w:noVBand="0"/>
+      </w:tblPr>
+      <w:tblGrid>
+        <w:gridCol w:w="561"/>
+        <w:gridCol w:w="3460"/>
+        <w:gridCol w:w="1047"/>
+        <w:gridCol w:w="4282"/>
+      </w:tblGrid>
+      <w:tr>
+        <w:trPr>
+          <w:cantSplit/>
+          <w:tblHeader/>
+        </w:trPr>
+        <w:tc>
+          <w:tcPr>
+            <w:tcW w:w="300" w:type="pct"/>
+            <w:shd w:val="clear" w:color="auto" w:fill="F2CEED" w:themeFill="accent5" w:themeFillTint="33"/>
+            <w:tcMar>
+              <w:top w:w="30" w:type="dxa"/>
+              <w:left w:w="80" w:type="dxa"/>
+              <w:bottom w:w="30" w:type="dxa"/>
+              <w:right w:w="80" w:type="dxa"/>
+            </w:tcMar>
+          </w:tcPr>
+          <w:p>
+            <w:r>
+              <w:rPr>
+                <w:rFonts w:ascii="Aptos" w:eastAsia="Aptos" w:hAnsi="Aptos" w:cs="Aptos"/>
+                <w:b/>
+                <w:bCs/>
+                <w:sz w:val="20"/>
+                <w:szCs w:val="20"/>
+              </w:rPr>
+              <w:t xml:space="preserve">No.</w:t>
+            </w:r>
+          </w:p>
+        </w:tc>
+        <w:tc>
+          <w:tcPr>
+            <w:tcW w:w="1850" w:type="pct"/>
+            <w:shd w:val="clear" w:color="auto" w:fill="F2CEED" w:themeFill="accent5" w:themeFillTint="33"/>
+            <w:tcMar>
+              <w:top w:w="30" w:type="dxa"/>
+              <w:left w:w="80" w:type="dxa"/>
+              <w:bottom w:w="30" w:type="dxa"/>
+              <w:right w:w="80" w:type="dxa"/>
+            </w:tcMar>
+          </w:tcPr>
+          <w:p>
+            <w:r>
+              <w:rPr>
+                <w:rFonts w:ascii="Aptos" w:eastAsia="Aptos" w:hAnsi="Aptos" w:cs="Aptos"/>
+                <w:b/>
+                <w:bCs/>
+                <w:sz w:val="20"/>
+                <w:szCs w:val="20"/>
+              </w:rPr>
+              <w:t xml:space="preserve">Test</w:t>
+            </w:r>
+          </w:p>
+        </w:tc>
+        <w:tc>
+          <w:tcPr>
+            <w:tcW w:w="560" w:type="pct"/>
+            <w:shd w:val="clear" w:color="auto" w:fill="F2CEED" w:themeFill="accent5" w:themeFillTint="33"/>
+            <w:tcMar>
+              <w:top w:w="30" w:type="dxa"/>
+              <w:left w:w="80" w:type="dxa"/>
+              <w:bottom w:w="30" w:type="dxa"/>
+              <w:right w:w="80" w:type="dxa"/>
+            </w:tcMar>
+          </w:tcPr>
+          <w:p>
+            <w:r>
+              <w:rPr>
+                <w:rFonts w:ascii="Aptos" w:eastAsia="Aptos" w:hAnsi="Aptos" w:cs="Aptos"/>
+                <w:b/>
+                <w:bCs/>
+                <w:sz w:val="20"/>
+                <w:szCs w:val="20"/>
+              </w:rPr>
+              <w:t xml:space="preserve">Type</w:t>
+            </w:r>
+          </w:p>
+        </w:tc>
+        <w:tc>
+          <w:tcPr>
+            <w:tcW w:w="2290" w:type="pct"/>
+            <w:shd w:val="clear" w:color="auto" w:fill="F2CEED" w:themeFill="accent5" w:themeFillTint="33"/>
+            <w:tcMar>
+              <w:top w:w="30" w:type="dxa"/>
+              <w:left w:w="80" w:type="dxa"/>
+              <w:bottom w:w="30" w:type="dxa"/>
+              <w:right w:w="80" w:type="dxa"/>
+            </w:tcMar>
+          </w:tcPr>
+          <w:p>
+            <w:r>
+              <w:rPr>
+                <w:rFonts w:ascii="Aptos" w:eastAsia="Aptos" w:hAnsi="Aptos" w:cs="Aptos"/>
+                <w:b/>
+                <w:bCs/>
+                <w:sz w:val="20"/>
+                <w:szCs w:val="20"/>
+              </w:rPr>
+              <w:t xml:space="preserve">Expected Result</w:t>
+            </w:r>
+          </w:p>
+        </w:tc>
+      </w:tr>
+      <w:tr>
+        <w:trPr>
+          <w:cantSplit/>
+        </w:trPr>
+        <w:tc>
+          <w:tcPr>
+            <w:tcW w:w="300" w:type="pct"/>
+            <w:tcMar>
+              <w:top w:w="30" w:type="dxa"/>
+              <w:left w:w="80" w:type="dxa"/>
+              <w:bottom w:w="30" w:type="dxa"/>
+              <w:right w:w="80" w:type="dxa"/>
+            </w:tcMar>
+          </w:tcPr>
+          <w:p>
+            <w:r>
+              <w:rPr>
+                <w:rFonts w:ascii="Aptos" w:eastAsia="Aptos" w:hAnsi="Aptos" w:cs="Aptos"/>
+                <w:sz w:val="20"/>
+                <w:szCs w:val="20"/>
+              </w:rPr>
+              <w:t xml:space="preserve">1</w:t>
+            </w:r>
+          </w:p>
+        </w:tc>
+        <w:tc>
+          <w:tcPr>
+            <w:tcW w:w="1850" w:type="pct"/>
+            <w:tcMar>
+              <w:top w:w="30" w:type="dxa"/>
+              <w:left w:w="80" w:type="dxa"/>
+              <w:bottom w:w="30" w:type="dxa"/>
+              <w:right w:w="80" w:type="dxa"/>
+            </w:tcMar>
+          </w:tcPr>
+          <w:p>
+            <w:r>
+              <w:rPr>
+                <w:rFonts w:ascii="Aptos" w:eastAsia="Aptos" w:hAnsi="Aptos" w:cs="Aptos"/>
+                <w:sz w:val="20"/>
+                <w:szCs w:val="20"/>
+              </w:rPr>
+              <w:t xml:space="preserve">Leave the film title blank, enter an age rating of 12A and a duration of 148, then press Add</w:t>
+            </w:r>
+          </w:p>
+        </w:tc>
+        <w:tc>
+          <w:tcPr>
+            <w:tcW w:w="560" w:type="pct"/>
+            <w:tcMar>
+              <w:top w:w="30" w:type="dxa"/>
+              <w:left w:w="80" w:type="dxa"/>
+              <w:bottom w:w="30" w:type="dxa"/>
+              <w:right w:w="80" w:type="dxa"/>
+            </w:tcMar>
+          </w:tcPr>
+          <w:p>
+            <w:r>
+              <w:rPr>
+                <w:rFonts w:ascii="Aptos" w:eastAsia="Aptos" w:hAnsi="Aptos" w:cs="Aptos"/>
+                <w:sz w:val="20"/>
+                <w:szCs w:val="20"/>
+              </w:rPr>
+              <w:t xml:space="preserve">Erroneous</w:t>
+            </w:r>
+          </w:p>
+        </w:tc>
+        <w:tc>
+          <w:tcPr>
+            <w:tcW w:w="2290" w:type="pct"/>
+            <w:tcMar>
+              <w:top w:w="30" w:type="dxa"/>
+              <w:left w:w="80" w:type="dxa"/>
+              <w:bottom w:w="30" w:type="dxa"/>
+              <w:right w:w="80" w:type="dxa"/>
+            </w:tcMar>
+          </w:tcPr>
+          <w:p>
+            <w:r>
+              <w:rPr>
+                <w:rFonts w:ascii="Aptos" w:eastAsia="Aptos" w:hAnsi="Aptos" w:cs="Aptos"/>
+                <w:sz w:val="20"/>
+                <w:szCs w:val="20"/>
+              </w:rPr>
+              <w:t xml:space="preserve">The film is rejected and a message appears stating “Enter a film title”.</w:t>
+            </w:r>
+          </w:p>
+        </w:tc>
+      </w:tr>
+      <w:tr>
+        <w:trPr>
+          <w:cantSplit/>
+        </w:trPr>
+        <w:tc>
+          <w:tcPr>
+            <w:tcW w:w="300" w:type="pct"/>
+            <w:tcMar>
+              <w:top w:w="30" w:type="dxa"/>
+              <w:left w:w="80" w:type="dxa"/>
+              <w:bottom w:w="30" w:type="dxa"/>
+              <w:right w:w="80" w:type="dxa"/>
+            </w:tcMar>
+          </w:tcPr>
+          <w:p>
+            <w:r>
+              <w:rPr>
+                <w:rFonts w:ascii="Aptos" w:eastAsia="Aptos" w:hAnsi="Aptos" w:cs="Aptos"/>
+                <w:sz w:val="20"/>
+                <w:szCs w:val="20"/>
+              </w:rPr>
+              <w:t xml:space="preserve">2</w:t>
+            </w:r>
+          </w:p>
+        </w:tc>
+        <w:tc>
+          <w:tcPr>
+            <w:tcW w:w="1850" w:type="pct"/>
+            <w:tcMar>
+              <w:top w:w="30" w:type="dxa"/>
+              <w:left w:w="80" w:type="dxa"/>
+              <w:bottom w:w="30" w:type="dxa"/>
+              <w:right w:w="80" w:type="dxa"/>
+            </w:tcMar>
+          </w:tcPr>
+          <w:p>
+            <w:r>
+              <w:rPr>
+                <w:rFonts w:ascii="Aptos" w:eastAsia="Aptos" w:hAnsi="Aptos" w:cs="Aptos"/>
+                <w:sz w:val="20"/>
+                <w:szCs w:val="20"/>
+              </w:rPr>
+              <w:t xml:space="preserve">Enter the title Inception, leave the age rating blank, enter a duration of 148, then press Add</w:t>
+            </w:r>
+          </w:p>
+        </w:tc>
+        <w:tc>
+          <w:tcPr>
+            <w:tcW w:w="560" w:type="pct"/>
+            <w:tcMar>
+              <w:top w:w="30" w:type="dxa"/>
+              <w:left w:w="80" w:type="dxa"/>
+              <w:bottom w:w="30" w:type="dxa"/>
+              <w:right w:w="80" w:type="dxa"/>
+            </w:tcMar>
+          </w:tcPr>
+          <w:p>
+            <w:r>
+              <w:rPr>
+                <w:rFonts w:ascii="Aptos" w:eastAsia="Aptos" w:hAnsi="Aptos" w:cs="Aptos"/>
+                <w:sz w:val="20"/>
+                <w:szCs w:val="20"/>
+              </w:rPr>
+              <w:t xml:space="preserve">Erroneous</w:t>
+            </w:r>
+          </w:p>
+        </w:tc>
+        <w:tc>
+          <w:tcPr>
+            <w:tcW w:w="2290" w:type="pct"/>
+            <w:tcMar>
+              <w:top w:w="30" w:type="dxa"/>
+              <w:left w:w="80" w:type="dxa"/>
+              <w:bottom w:w="30" w:type="dxa"/>
+              <w:right w:w="80" w:type="dxa"/>
+            </w:tcMar>
+          </w:tcPr>
+          <w:p>
+            <w:r>
+              <w:rPr>
+                <w:rFonts w:ascii="Aptos" w:eastAsia="Aptos" w:hAnsi="Aptos" w:cs="Aptos"/>
+                <w:sz w:val="20"/>
+                <w:szCs w:val="20"/>
+              </w:rPr>
+              <w:t xml:space="preserve">The film is rejected and a message appears stating “Pick an age rating”.</w:t>
+            </w:r>
+          </w:p>
+        </w:tc>
+      </w:tr>
+      <w:tr>
+        <w:trPr>
+          <w:cantSplit/>
+        </w:trPr>
+        <w:tc>
+          <w:tcPr>
+            <w:tcW w:w="300" w:type="pct"/>
+            <w:tcMar>
+              <w:top w:w="30" w:type="dxa"/>
+              <w:left w:w="80" w:type="dxa"/>
+              <w:bottom w:w="30" w:type="dxa"/>
+              <w:right w:w="80" w:type="dxa"/>
+            </w:tcMar>
+          </w:tcPr>
+          <w:p>
+            <w:r>
+              <w:rPr>
+                <w:rFonts w:ascii="Aptos" w:eastAsia="Aptos" w:hAnsi="Aptos" w:cs="Aptos"/>
+                <w:sz w:val="20"/>
+                <w:szCs w:val="20"/>
+              </w:rPr>
+              <w:t xml:space="preserve">3</w:t>
+            </w:r>
+          </w:p>
+        </w:tc>
+        <w:tc>
+          <w:tcPr>
+            <w:tcW w:w="1850" w:type="pct"/>
+            <w:tcMar>
+              <w:top w:w="30" w:type="dxa"/>
+              <w:left w:w="80" w:type="dxa"/>
+              <w:bottom w:w="30" w:type="dxa"/>
+              <w:right w:w="80" w:type="dxa"/>
+            </w:tcMar>
+          </w:tcPr>
+          <w:p>
+            <w:r>
+              <w:rPr>
+                <w:rFonts w:ascii="Aptos" w:eastAsia="Aptos" w:hAnsi="Aptos" w:cs="Aptos"/>
+                <w:sz w:val="20"/>
+                <w:szCs w:val="20"/>
+              </w:rPr>
+              <w:t xml:space="preserve">Enter the title Inception, age rating 12A, and a duration of abc, then press Add</w:t>
+            </w:r>
+          </w:p>
+        </w:tc>
+        <w:tc>
+          <w:tcPr>
+            <w:tcW w:w="560" w:type="pct"/>
+            <w:tcMar>
+              <w:top w:w="30" w:type="dxa"/>
+              <w:left w:w="80" w:type="dxa"/>
+              <w:bottom w:w="30" w:type="dxa"/>
+              <w:right w:w="80" w:type="dxa"/>
+            </w:tcMar>
+          </w:tcPr>
+          <w:p>
+            <w:r>
+              <w:rPr>
+                <w:rFonts w:ascii="Aptos" w:eastAsia="Aptos" w:hAnsi="Aptos" w:cs="Aptos"/>
+                <w:sz w:val="20"/>
+                <w:szCs w:val="20"/>
+              </w:rPr>
+              <w:t xml:space="preserve">Erroneous</w:t>
+            </w:r>
+          </w:p>
+        </w:tc>
+        <w:tc>
+          <w:tcPr>
+            <w:tcW w:w="2290" w:type="pct"/>
+            <w:tcMar>
+              <w:top w:w="30" w:type="dxa"/>
+              <w:left w:w="80" w:type="dxa"/>
+              <w:bottom w:w="30" w:type="dxa"/>
+              <w:right w:w="80" w:type="dxa"/>
+            </w:tcMar>
+          </w:tcPr>
+          <w:p>
+            <w:r>
+              <w:rPr>
+                <w:rFonts w:ascii="Aptos" w:eastAsia="Aptos" w:hAnsi="Aptos" w:cs="Aptos"/>
+                <w:sz w:val="20"/>
+                <w:szCs w:val="20"/>
+              </w:rPr>
+              <w:t xml:space="preserve">The film is rejected and a message appears stating “The duration has to be a number of minutes”.</w:t>
+            </w:r>
+          </w:p>
+        </w:tc>
+      </w:tr>
+      <w:tr>
+        <w:trPr>
+          <w:cantSplit/>
+        </w:trPr>
+        <w:tc>
+          <w:tcPr>
+            <w:tcW w:w="300" w:type="pct"/>
+            <w:tcMar>
+              <w:top w:w="30" w:type="dxa"/>
+              <w:left w:w="80" w:type="dxa"/>
+              <w:bottom w:w="30" w:type="dxa"/>
+              <w:right w:w="80" w:type="dxa"/>
+            </w:tcMar>
+          </w:tcPr>
+          <w:p>
+            <w:r>
+              <w:rPr>
+                <w:rFonts w:ascii="Aptos" w:eastAsia="Aptos" w:hAnsi="Aptos" w:cs="Aptos"/>
+                <w:sz w:val="20"/>
+                <w:szCs w:val="20"/>
+              </w:rPr>
+              <w:t xml:space="preserve">4</w:t>
+            </w:r>
+          </w:p>
+        </w:tc>
+        <w:tc>
+          <w:tcPr>
+            <w:tcW w:w="1850" w:type="pct"/>
+            <w:tcMar>
+              <w:top w:w="30" w:type="dxa"/>
+              <w:left w:w="80" w:type="dxa"/>
+              <w:bottom w:w="30" w:type="dxa"/>
+              <w:right w:w="80" w:type="dxa"/>
+            </w:tcMar>
+          </w:tcPr>
+          <w:p>
+            <w:r>
+              <w:rPr>
+                <w:rFonts w:ascii="Aptos" w:eastAsia="Aptos" w:hAnsi="Aptos" w:cs="Aptos"/>
+                <w:sz w:val="20"/>
+                <w:szCs w:val="20"/>
+              </w:rPr>
+              <w:t xml:space="preserve">Enter the title Inception, age rating 12A, and a duration of 0, then press Add</w:t>
+            </w:r>
+          </w:p>
+        </w:tc>
+        <w:tc>
+          <w:tcPr>
+            <w:tcW w:w="560" w:type="pct"/>
+            <w:tcMar>
+              <w:top w:w="30" w:type="dxa"/>
+              <w:left w:w="80" w:type="dxa"/>
+              <w:bottom w:w="30" w:type="dxa"/>
+              <w:right w:w="80" w:type="dxa"/>
+            </w:tcMar>
+          </w:tcPr>
+          <w:p>
+            <w:r>
+              <w:rPr>
+                <w:rFonts w:ascii="Aptos" w:eastAsia="Aptos" w:hAnsi="Aptos" w:cs="Aptos"/>
+                <w:sz w:val="20"/>
+                <w:szCs w:val="20"/>
+              </w:rPr>
+              <w:t xml:space="preserve">Erroneous</w:t>
+            </w:r>
+          </w:p>
+        </w:tc>
+        <w:tc>
+          <w:tcPr>
+            <w:tcW w:w="2290" w:type="pct"/>
+            <w:tcMar>
+              <w:top w:w="30" w:type="dxa"/>
+              <w:left w:w="80" w:type="dxa"/>
+              <w:bottom w:w="30" w:type="dxa"/>
+              <w:right w:w="80" w:type="dxa"/>
+            </w:tcMar>
+          </w:tcPr>
+          <w:p>
+            <w:r>
+              <w:rPr>
+                <w:rFonts w:ascii="Aptos" w:eastAsia="Aptos" w:hAnsi="Aptos" w:cs="Aptos"/>
+                <w:sz w:val="20"/>
+                <w:szCs w:val="20"/>
+              </w:rPr>
+              <w:t xml:space="preserve">The film is rejected and a message appears stating “The duration has to be more than zero”.</w:t>
+            </w:r>
+          </w:p>
+        </w:tc>
+      </w:tr>
+      <w:tr>
+        <w:trPr>
+          <w:cantSplit/>
+        </w:trPr>
+        <w:tc>
+          <w:tcPr>
+            <w:tcW w:w="300" w:type="pct"/>
+            <w:tcMar>
+              <w:top w:w="30" w:type="dxa"/>
+              <w:left w:w="80" w:type="dxa"/>
+              <w:bottom w:w="30" w:type="dxa"/>
+              <w:right w:w="80" w:type="dxa"/>
+            </w:tcMar>
+          </w:tcPr>
+          <w:p>
+            <w:r>
+              <w:rPr>
+                <w:rFonts w:ascii="Aptos" w:eastAsia="Aptos" w:hAnsi="Aptos" w:cs="Aptos"/>
+                <w:sz w:val="20"/>
+                <w:szCs w:val="20"/>
+              </w:rPr>
+              <w:t xml:space="preserve">5</w:t>
+            </w:r>
+          </w:p>
+        </w:tc>
+        <w:tc>
+          <w:tcPr>
+            <w:tcW w:w="1850" w:type="pct"/>
+            <w:tcMar>
+              <w:top w:w="30" w:type="dxa"/>
+              <w:left w:w="80" w:type="dxa"/>
+              <w:bottom w:w="30" w:type="dxa"/>
+              <w:right w:w="80" w:type="dxa"/>
+            </w:tcMar>
+          </w:tcPr>
+          <w:p>
+            <w:r>
+              <w:rPr>
+                <w:rFonts w:ascii="Aptos" w:eastAsia="Aptos" w:hAnsi="Aptos" w:cs="Aptos"/>
+                <w:sz w:val="20"/>
+                <w:szCs w:val="20"/>
+              </w:rPr>
+              <w:t xml:space="preserve">Enter the title Inception, age rating 12A, and a duration of 400, then press Add</w:t>
+            </w:r>
+          </w:p>
+        </w:tc>
+        <w:tc>
+          <w:tcPr>
+            <w:tcW w:w="560" w:type="pct"/>
+            <w:tcMar>
+              <w:top w:w="30" w:type="dxa"/>
+              <w:left w:w="80" w:type="dxa"/>
+              <w:bottom w:w="30" w:type="dxa"/>
+              <w:right w:w="80" w:type="dxa"/>
+            </w:tcMar>
+          </w:tcPr>
+          <w:p>
+            <w:r>
+              <w:rPr>
+                <w:rFonts w:ascii="Aptos" w:eastAsia="Aptos" w:hAnsi="Aptos" w:cs="Aptos"/>
+                <w:sz w:val="20"/>
+                <w:szCs w:val="20"/>
+              </w:rPr>
+              <w:t xml:space="preserve">Erroneous</w:t>
+            </w:r>
+          </w:p>
+        </w:tc>
+        <w:tc>
+          <w:tcPr>
+            <w:tcW w:w="2290" w:type="pct"/>
+            <w:tcMar>
+              <w:top w:w="30" w:type="dxa"/>
+              <w:left w:w="80" w:type="dxa"/>
+              <w:bottom w:w="30" w:type="dxa"/>
+              <w:right w:w="80" w:type="dxa"/>
+            </w:tcMar>
+          </w:tcPr>
+          <w:p>
+            <w:r>
+              <w:rPr>
+                <w:rFonts w:ascii="Aptos" w:eastAsia="Aptos" w:hAnsi="Aptos" w:cs="Aptos"/>
+                <w:sz w:val="20"/>
+                <w:szCs w:val="20"/>
+              </w:rPr>
+              <w:t xml:space="preserve">The film is rejected and a message appears stating “That duration looks too long, it should be in minutes”, because 400 minutes is longer than any real film.</w:t>
+            </w:r>
+          </w:p>
+        </w:tc>
+      </w:tr>
+      <w:tr>
+        <w:trPr>
+          <w:cantSplit/>
+        </w:trPr>
+        <w:tc>
+          <w:tcPr>
+            <w:tcW w:w="300" w:type="pct"/>
+            <w:tcMar>
+              <w:top w:w="30" w:type="dxa"/>
+              <w:left w:w="80" w:type="dxa"/>
+              <w:bottom w:w="30" w:type="dxa"/>
+              <w:right w:w="80" w:type="dxa"/>
+            </w:tcMar>
+          </w:tcPr>
+          <w:p>
+            <w:r>
+              <w:rPr>
+                <w:rFonts w:ascii="Aptos" w:eastAsia="Aptos" w:hAnsi="Aptos" w:cs="Aptos"/>
+                <w:sz w:val="20"/>
+                <w:szCs w:val="20"/>
+              </w:rPr>
+              <w:t xml:space="preserve">6</w:t>
+            </w:r>
+          </w:p>
+        </w:tc>
+        <w:tc>
+          <w:tcPr>
+            <w:tcW w:w="1850" w:type="pct"/>
+            <w:tcMar>
+              <w:top w:w="30" w:type="dxa"/>
+              <w:left w:w="80" w:type="dxa"/>
+              <w:bottom w:w="30" w:type="dxa"/>
+              <w:right w:w="80" w:type="dxa"/>
+            </w:tcMar>
+          </w:tcPr>
+          <w:p>
+            <w:r>
+              <w:rPr>
+                <w:rFonts w:ascii="Aptos" w:eastAsia="Aptos" w:hAnsi="Aptos" w:cs="Aptos"/>
+                <w:sz w:val="20"/>
+                <w:szCs w:val="20"/>
+              </w:rPr>
+              <w:t xml:space="preserve">Enter the title Marker Film, age rating 12A, a duration of 300 and a year of 2026, then press Add</w:t>
+            </w:r>
+          </w:p>
+        </w:tc>
+        <w:tc>
+          <w:tcPr>
+            <w:tcW w:w="560" w:type="pct"/>
+            <w:tcMar>
+              <w:top w:w="30" w:type="dxa"/>
+              <w:left w:w="80" w:type="dxa"/>
+              <w:bottom w:w="30" w:type="dxa"/>
+              <w:right w:w="80" w:type="dxa"/>
+            </w:tcMar>
+          </w:tcPr>
+          <w:p>
+            <w:r>
+              <w:rPr>
+                <w:rFonts w:ascii="Aptos" w:eastAsia="Aptos" w:hAnsi="Aptos" w:cs="Aptos"/>
+                <w:sz w:val="20"/>
+                <w:szCs w:val="20"/>
+              </w:rPr>
+              <w:t xml:space="preserve">Boundary</w:t>
+            </w:r>
+          </w:p>
+        </w:tc>
+        <w:tc>
+          <w:tcPr>
+            <w:tcW w:w="2290" w:type="pct"/>
+            <w:tcMar>
+              <w:top w:w="30" w:type="dxa"/>
+              <w:left w:w="80" w:type="dxa"/>
+              <w:bottom w:w="30" w:type="dxa"/>
+              <w:right w:w="80" w:type="dxa"/>
+            </w:tcMar>
+          </w:tcPr>
+          <w:p>
+            <w:r>
+              <w:rPr>
+                <w:rFonts w:ascii="Aptos" w:eastAsia="Aptos" w:hAnsi="Aptos" w:cs="Aptos"/>
+                <w:sz w:val="20"/>
+                <w:szCs w:val="20"/>
+              </w:rPr>
+              <w:t xml:space="preserve">The film is accepted, because 300 minutes is the longest duration the validation allows. This film is deleted again straight away so that it does not appear in any later test.</w:t>
+            </w:r>
+          </w:p>
+        </w:tc>
+      </w:tr>
+      <w:tr>
+        <w:trPr>
+          <w:cantSplit/>
+        </w:trPr>
+        <w:tc>
+          <w:tcPr>
+            <w:tcW w:w="300" w:type="pct"/>
+            <w:tcMar>
+              <w:top w:w="30" w:type="dxa"/>
+              <w:left w:w="80" w:type="dxa"/>
+              <w:bottom w:w="30" w:type="dxa"/>
+              <w:right w:w="80" w:type="dxa"/>
+            </w:tcMar>
+          </w:tcPr>
+          <w:p>
+            <w:r>
+              <w:rPr>
+                <w:rFonts w:ascii="Aptos" w:eastAsia="Aptos" w:hAnsi="Aptos" w:cs="Aptos"/>
+                <w:sz w:val="20"/>
+                <w:szCs w:val="20"/>
+              </w:rPr>
+              <w:t xml:space="preserve">7</w:t>
+            </w:r>
+          </w:p>
+        </w:tc>
+        <w:tc>
+          <w:tcPr>
+            <w:tcW w:w="1850" w:type="pct"/>
+            <w:tcMar>
+              <w:top w:w="30" w:type="dxa"/>
+              <w:left w:w="80" w:type="dxa"/>
+              <w:bottom w:w="30" w:type="dxa"/>
+              <w:right w:w="80" w:type="dxa"/>
+            </w:tcMar>
+          </w:tcPr>
+          <w:p>
+            <w:r>
+              <w:rPr>
+                <w:rFonts w:ascii="Aptos" w:eastAsia="Aptos" w:hAnsi="Aptos" w:cs="Aptos"/>
+                <w:sz w:val="20"/>
+                <w:szCs w:val="20"/>
+              </w:rPr>
+              <w:t xml:space="preserve">Enter the title Inception, age rating 12A, duration 148, year 2010 and a suitable description, then press Add</w:t>
+            </w:r>
+          </w:p>
+        </w:tc>
+        <w:tc>
+          <w:tcPr>
+            <w:tcW w:w="560" w:type="pct"/>
+            <w:tcMar>
+              <w:top w:w="30" w:type="dxa"/>
+              <w:left w:w="80" w:type="dxa"/>
+              <w:bottom w:w="30" w:type="dxa"/>
+              <w:right w:w="80" w:type="dxa"/>
+            </w:tcMar>
+          </w:tcPr>
+          <w:p>
+            <w:r>
+              <w:rPr>
+                <w:rFonts w:ascii="Aptos" w:eastAsia="Aptos" w:hAnsi="Aptos" w:cs="Aptos"/>
+                <w:sz w:val="20"/>
+                <w:szCs w:val="20"/>
+              </w:rPr>
+              <w:t xml:space="preserve">Normal</w:t>
+            </w:r>
+          </w:p>
+        </w:tc>
+        <w:tc>
+          <w:tcPr>
+            <w:tcW w:w="2290" w:type="pct"/>
+            <w:tcMar>
+              <w:top w:w="30" w:type="dxa"/>
+              <w:left w:w="80" w:type="dxa"/>
+              <w:bottom w:w="30" w:type="dxa"/>
+              <w:right w:w="80" w:type="dxa"/>
+            </w:tcMar>
+          </w:tcPr>
+          <w:p>
+            <w:r>
+              <w:rPr>
+                <w:rFonts w:ascii="Aptos" w:eastAsia="Aptos" w:hAnsi="Aptos" w:cs="Aptos"/>
+                <w:sz w:val="20"/>
+                <w:szCs w:val="20"/>
+              </w:rPr>
+              <w:t xml:space="preserve">The film Inception is saved to tblFilm and appears in the films grid.</w:t>
+            </w:r>
+          </w:p>
+        </w:tc>
+      </w:tr>
+      <w:tr>
+        <w:trPr>
+          <w:cantSplit/>
+        </w:trPr>
+        <w:tc>
+          <w:tcPr>
+            <w:tcW w:w="300" w:type="pct"/>
+            <w:tcMar>
+              <w:top w:w="30" w:type="dxa"/>
+              <w:left w:w="80" w:type="dxa"/>
+              <w:bottom w:w="30" w:type="dxa"/>
+              <w:right w:w="80" w:type="dxa"/>
+            </w:tcMar>
+          </w:tcPr>
+          <w:p>
+            <w:r>
+              <w:rPr>
+                <w:rFonts w:ascii="Aptos" w:eastAsia="Aptos" w:hAnsi="Aptos" w:cs="Aptos"/>
+                <w:sz w:val="20"/>
+                <w:szCs w:val="20"/>
+              </w:rPr>
+              <w:t xml:space="preserve">8</w:t>
+            </w:r>
+          </w:p>
+        </w:tc>
+        <w:tc>
+          <w:tcPr>
+            <w:tcW w:w="1850" w:type="pct"/>
+            <w:tcMar>
+              <w:top w:w="30" w:type="dxa"/>
+              <w:left w:w="80" w:type="dxa"/>
+              <w:bottom w:w="30" w:type="dxa"/>
+              <w:right w:w="80" w:type="dxa"/>
+            </w:tcMar>
+          </w:tcPr>
+          <w:p>
+            <w:r>
+              <w:rPr>
+                <w:rFonts w:ascii="Aptos" w:eastAsia="Aptos" w:hAnsi="Aptos" w:cs="Aptos"/>
+                <w:sz w:val="20"/>
+                <w:szCs w:val="20"/>
+              </w:rPr>
+              <w:t xml:space="preserve">Enter the title Paddington 2, age rating PG, duration 103, year 2017 and a suitable description, then press Add</w:t>
+            </w:r>
+          </w:p>
+        </w:tc>
+        <w:tc>
+          <w:tcPr>
+            <w:tcW w:w="560" w:type="pct"/>
+            <w:tcMar>
+              <w:top w:w="30" w:type="dxa"/>
+              <w:left w:w="80" w:type="dxa"/>
+              <w:bottom w:w="30" w:type="dxa"/>
+              <w:right w:w="80" w:type="dxa"/>
+            </w:tcMar>
+          </w:tcPr>
+          <w:p>
+            <w:r>
+              <w:rPr>
+                <w:rFonts w:ascii="Aptos" w:eastAsia="Aptos" w:hAnsi="Aptos" w:cs="Aptos"/>
+                <w:sz w:val="20"/>
+                <w:szCs w:val="20"/>
+              </w:rPr>
+              <w:t xml:space="preserve">Normal</w:t>
+            </w:r>
+          </w:p>
+        </w:tc>
+        <w:tc>
+          <w:tcPr>
+            <w:tcW w:w="2290" w:type="pct"/>
+            <w:tcMar>
+              <w:top w:w="30" w:type="dxa"/>
+              <w:left w:w="80" w:type="dxa"/>
+              <w:bottom w:w="30" w:type="dxa"/>
+              <w:right w:w="80" w:type="dxa"/>
+            </w:tcMar>
+          </w:tcPr>
+          <w:p>
+            <w:r>
+              <w:rPr>
+                <w:rFonts w:ascii="Aptos" w:eastAsia="Aptos" w:hAnsi="Aptos" w:cs="Aptos"/>
+                <w:sz w:val="20"/>
+                <w:szCs w:val="20"/>
+              </w:rPr>
+              <w:t xml:space="preserve">The film Paddington 2 is saved and both films now appear in the grid.</w:t>
+            </w:r>
+          </w:p>
+        </w:tc>
+      </w:tr>
+      <w:tr>
+        <w:trPr>
+          <w:cantSplit/>
+        </w:trPr>
+        <w:tc>
+          <w:tcPr>
+            <w:tcW w:w="300" w:type="pct"/>
+            <w:tcMar>
+              <w:top w:w="30" w:type="dxa"/>
+              <w:left w:w="80" w:type="dxa"/>
+              <w:bottom w:w="30" w:type="dxa"/>
+              <w:right w:w="80" w:type="dxa"/>
+            </w:tcMar>
+          </w:tcPr>
+          <w:p>
+            <w:r>
+              <w:rPr>
+                <w:rFonts w:ascii="Aptos" w:eastAsia="Aptos" w:hAnsi="Aptos" w:cs="Aptos"/>
+                <w:sz w:val="20"/>
+                <w:szCs w:val="20"/>
+              </w:rPr>
+              <w:t xml:space="preserve">9</w:t>
+            </w:r>
+          </w:p>
+        </w:tc>
+        <w:tc>
+          <w:tcPr>
+            <w:tcW w:w="1850" w:type="pct"/>
+            <w:tcMar>
+              <w:top w:w="30" w:type="dxa"/>
+              <w:left w:w="80" w:type="dxa"/>
+              <w:bottom w:w="30" w:type="dxa"/>
+              <w:right w:w="80" w:type="dxa"/>
+            </w:tcMar>
+          </w:tcPr>
+          <w:p>
+            <w:r>
+              <w:rPr>
+                <w:rFonts w:ascii="Aptos" w:eastAsia="Aptos" w:hAnsi="Aptos" w:cs="Aptos"/>
+                <w:sz w:val="20"/>
+                <w:szCs w:val="20"/>
+              </w:rPr>
+              <w:t xml:space="preserve">Enter the title Inception with a year of 2010 a second time, then press Add</w:t>
+            </w:r>
+          </w:p>
+        </w:tc>
+        <w:tc>
+          <w:tcPr>
+            <w:tcW w:w="560" w:type="pct"/>
+            <w:tcMar>
+              <w:top w:w="30" w:type="dxa"/>
+              <w:left w:w="80" w:type="dxa"/>
+              <w:bottom w:w="30" w:type="dxa"/>
+              <w:right w:w="80" w:type="dxa"/>
+            </w:tcMar>
+          </w:tcPr>
+          <w:p>
+            <w:r>
+              <w:rPr>
+                <w:rFonts w:ascii="Aptos" w:eastAsia="Aptos" w:hAnsi="Aptos" w:cs="Aptos"/>
+                <w:sz w:val="20"/>
+                <w:szCs w:val="20"/>
+              </w:rPr>
+              <w:t xml:space="preserve">Erroneous</w:t>
+            </w:r>
+          </w:p>
+        </w:tc>
+        <w:tc>
+          <w:tcPr>
+            <w:tcW w:w="2290" w:type="pct"/>
+            <w:tcMar>
+              <w:top w:w="30" w:type="dxa"/>
+              <w:left w:w="80" w:type="dxa"/>
+              <w:bottom w:w="30" w:type="dxa"/>
+              <w:right w:w="80" w:type="dxa"/>
+            </w:tcMar>
+          </w:tcPr>
+          <w:p>
+            <w:r>
+              <w:rPr>
+                <w:rFonts w:ascii="Aptos" w:eastAsia="Aptos" w:hAnsi="Aptos" w:cs="Aptos"/>
+                <w:sz w:val="20"/>
+                <w:szCs w:val="20"/>
+              </w:rPr>
+              <w:t xml:space="preserve">The film is rejected and a message appears stating that Inception is already on the system for that year and that the existing one should be edited rather than added twice.</w:t>
+            </w:r>
+          </w:p>
+        </w:tc>
+      </w:tr>
+      <w:tr>
+        <w:trPr>
+          <w:cantSplit/>
+        </w:trPr>
+        <w:tc>
+          <w:tcPr>
+            <w:tcW w:w="300" w:type="pct"/>
+            <w:tcMar>
+              <w:top w:w="30" w:type="dxa"/>
+              <w:left w:w="80" w:type="dxa"/>
+              <w:bottom w:w="30" w:type="dxa"/>
+              <w:right w:w="80" w:type="dxa"/>
+            </w:tcMar>
+          </w:tcPr>
+          <w:p>
+            <w:r>
+              <w:rPr>
+                <w:rFonts w:ascii="Aptos" w:eastAsia="Aptos" w:hAnsi="Aptos" w:cs="Aptos"/>
+                <w:sz w:val="20"/>
+                <w:szCs w:val="20"/>
+              </w:rPr>
+              <w:t xml:space="preserve">10</w:t>
+            </w:r>
+          </w:p>
+        </w:tc>
+        <w:tc>
+          <w:tcPr>
+            <w:tcW w:w="1850" w:type="pct"/>
+            <w:tcMar>
+              <w:top w:w="30" w:type="dxa"/>
+              <w:left w:w="80" w:type="dxa"/>
+              <w:bottom w:w="30" w:type="dxa"/>
+              <w:right w:w="80" w:type="dxa"/>
+            </w:tcMar>
+          </w:tcPr>
+          <w:p>
+            <w:r>
+              <w:rPr>
+                <w:rFonts w:ascii="Aptos" w:eastAsia="Aptos" w:hAnsi="Aptos" w:cs="Aptos"/>
+                <w:sz w:val="20"/>
+                <w:szCs w:val="20"/>
+              </w:rPr>
+              <w:t xml:space="preserve">Enter the title Test Film, age rating 12A, duration 100 and a year of twenty, then press Add</w:t>
+            </w:r>
+          </w:p>
+        </w:tc>
+        <w:tc>
+          <w:tcPr>
+            <w:tcW w:w="560" w:type="pct"/>
+            <w:tcMar>
+              <w:top w:w="30" w:type="dxa"/>
+              <w:left w:w="80" w:type="dxa"/>
+              <w:bottom w:w="30" w:type="dxa"/>
+              <w:right w:w="80" w:type="dxa"/>
+            </w:tcMar>
+          </w:tcPr>
+          <w:p>
+            <w:r>
+              <w:rPr>
+                <w:rFonts w:ascii="Aptos" w:eastAsia="Aptos" w:hAnsi="Aptos" w:cs="Aptos"/>
+                <w:sz w:val="20"/>
+                <w:szCs w:val="20"/>
+              </w:rPr>
+              <w:t xml:space="preserve">Erroneous</w:t>
+            </w:r>
+          </w:p>
+        </w:tc>
+        <w:tc>
+          <w:tcPr>
+            <w:tcW w:w="2290" w:type="pct"/>
+            <w:tcMar>
+              <w:top w:w="30" w:type="dxa"/>
+              <w:left w:w="80" w:type="dxa"/>
+              <w:bottom w:w="30" w:type="dxa"/>
+              <w:right w:w="80" w:type="dxa"/>
+            </w:tcMar>
+          </w:tcPr>
+          <w:p>
+            <w:r>
+              <w:rPr>
+                <w:rFonts w:ascii="Aptos" w:eastAsia="Aptos" w:hAnsi="Aptos" w:cs="Aptos"/>
+                <w:sz w:val="20"/>
+                <w:szCs w:val="20"/>
+              </w:rPr>
+              <w:t xml:space="preserve">The film is rejected and a message appears stating “The year has to be a number, like 2021”.</w:t>
+            </w:r>
+          </w:p>
+        </w:tc>
+      </w:tr>
+    </w:tbl>
+    <w:p>
+      <w:r>
+        <w:rPr>
+          <w:rFonts w:ascii="Aptos" w:eastAsia="Aptos" w:hAnsi="Aptos" w:cs="Aptos"/>
+        </w:rPr>
+        <w:t xml:space="preserve"/>
       </w:r>
     </w:p>
     <w:sectPr>

</xml_diff>

<commit_message>
added objectives 16 and 20: creating a screen and generating its seats
</commit_message>
<xml_diff>
--- a/Testing.docx
+++ b/Testing.docx
@@ -1217,6 +1217,1230 @@
                 <w:szCs w:val="20"/>
               </w:rPr>
               <w:t xml:space="preserve">The film is rejected and a message appears stating “The year has to be a number, like 2021”.</w:t>
+            </w:r>
+          </w:p>
+        </w:tc>
+      </w:tr>
+    </w:tbl>
+    <w:p>
+      <w:r>
+        <w:rPr>
+          <w:rFonts w:ascii="Aptos" w:eastAsia="Aptos" w:hAnsi="Aptos" w:cs="Aptos"/>
+        </w:rPr>
+        <w:t xml:space="preserve"/>
+      </w:r>
+    </w:p>
+    <w:p>
+      <w:pPr>
+        <w:pStyle w:val="Heading3"/>
+      </w:pPr>
+      <w:r>
+        <w:rPr>
+          <w:rFonts w:ascii="Aptos Display" w:eastAsia="Aptos Display" w:hAnsi="Aptos Display" w:cs="Aptos Display"/>
+          <w:b/>
+          <w:bCs/>
+          <w:color w:val="000000"/>
+        </w:rPr>
+        <w:t xml:space="preserve">Objectives 16 and 20: Creating a Screen and Generating Its Seats</w:t>
+      </w:r>
+    </w:p>
+    <w:p>
+      <w:r>
+        <w:rPr>
+          <w:rFonts w:ascii="Aptos" w:eastAsia="Aptos" w:hAnsi="Aptos" w:cs="Aptos"/>
+        </w:rPr>
+        <w:t xml:space="preserve">Screens are created next, since a screening cannot be scheduled without a screen and its seats to attach it to. These two objectives are tested together because they happen in one action. The manager enters how the screen is laid out and chooses a seat plan, and the system then generates every seat record and decides what type each seat is. The capacity is not typed in at all, it is worked out from the rows and the seats per row, which is why the tests below enter a layout rather than a total.</w:t>
+      </w:r>
+    </w:p>
+    <w:tbl>
+      <w:tblPr>
+        <w:tblW w:w="5000" w:type="pct"/>
+        <w:tblBorders>
+          <w:top w:val="single" w:sz="4" w:space="0" w:color="808080"/>
+          <w:left w:val="single" w:sz="4" w:space="0" w:color="808080"/>
+          <w:bottom w:val="single" w:sz="4" w:space="0" w:color="808080"/>
+          <w:right w:val="single" w:sz="4" w:space="0" w:color="808080"/>
+          <w:insideH w:val="single" w:sz="4" w:space="0" w:color="808080"/>
+          <w:insideV w:val="single" w:sz="4" w:space="0" w:color="808080"/>
+        </w:tblBorders>
+        <w:tblCellMar>
+          <w:left w:w="10" w:type="dxa"/>
+          <w:right w:w="10" w:type="dxa"/>
+        </w:tblCellMar>
+        <w:tblLook w:val="0000" w:firstRow="0" w:lastRow="0" w:firstColumn="0" w:lastColumn="0" w:noHBand="0" w:noVBand="0"/>
+      </w:tblPr>
+      <w:tblGrid>
+        <w:gridCol w:w="561"/>
+        <w:gridCol w:w="3460"/>
+        <w:gridCol w:w="1047"/>
+        <w:gridCol w:w="4282"/>
+      </w:tblGrid>
+      <w:tr>
+        <w:trPr>
+          <w:cantSplit/>
+          <w:tblHeader/>
+        </w:trPr>
+        <w:tc>
+          <w:tcPr>
+            <w:tcW w:w="300" w:type="pct"/>
+            <w:shd w:val="clear" w:color="auto" w:fill="F2CEED" w:themeFill="accent5" w:themeFillTint="33"/>
+            <w:tcMar>
+              <w:top w:w="30" w:type="dxa"/>
+              <w:left w:w="80" w:type="dxa"/>
+              <w:bottom w:w="30" w:type="dxa"/>
+              <w:right w:w="80" w:type="dxa"/>
+            </w:tcMar>
+          </w:tcPr>
+          <w:p>
+            <w:r>
+              <w:rPr>
+                <w:rFonts w:ascii="Aptos" w:eastAsia="Aptos" w:hAnsi="Aptos" w:cs="Aptos"/>
+                <w:b/>
+                <w:bCs/>
+                <w:sz w:val="20"/>
+                <w:szCs w:val="20"/>
+              </w:rPr>
+              <w:t xml:space="preserve">No.</w:t>
+            </w:r>
+          </w:p>
+        </w:tc>
+        <w:tc>
+          <w:tcPr>
+            <w:tcW w:w="1850" w:type="pct"/>
+            <w:shd w:val="clear" w:color="auto" w:fill="F2CEED" w:themeFill="accent5" w:themeFillTint="33"/>
+            <w:tcMar>
+              <w:top w:w="30" w:type="dxa"/>
+              <w:left w:w="80" w:type="dxa"/>
+              <w:bottom w:w="30" w:type="dxa"/>
+              <w:right w:w="80" w:type="dxa"/>
+            </w:tcMar>
+          </w:tcPr>
+          <w:p>
+            <w:r>
+              <w:rPr>
+                <w:rFonts w:ascii="Aptos" w:eastAsia="Aptos" w:hAnsi="Aptos" w:cs="Aptos"/>
+                <w:b/>
+                <w:bCs/>
+                <w:sz w:val="20"/>
+                <w:szCs w:val="20"/>
+              </w:rPr>
+              <w:t xml:space="preserve">Test</w:t>
+            </w:r>
+          </w:p>
+        </w:tc>
+        <w:tc>
+          <w:tcPr>
+            <w:tcW w:w="560" w:type="pct"/>
+            <w:shd w:val="clear" w:color="auto" w:fill="F2CEED" w:themeFill="accent5" w:themeFillTint="33"/>
+            <w:tcMar>
+              <w:top w:w="30" w:type="dxa"/>
+              <w:left w:w="80" w:type="dxa"/>
+              <w:bottom w:w="30" w:type="dxa"/>
+              <w:right w:w="80" w:type="dxa"/>
+            </w:tcMar>
+          </w:tcPr>
+          <w:p>
+            <w:r>
+              <w:rPr>
+                <w:rFonts w:ascii="Aptos" w:eastAsia="Aptos" w:hAnsi="Aptos" w:cs="Aptos"/>
+                <w:b/>
+                <w:bCs/>
+                <w:sz w:val="20"/>
+                <w:szCs w:val="20"/>
+              </w:rPr>
+              <w:t xml:space="preserve">Type</w:t>
+            </w:r>
+          </w:p>
+        </w:tc>
+        <w:tc>
+          <w:tcPr>
+            <w:tcW w:w="2290" w:type="pct"/>
+            <w:shd w:val="clear" w:color="auto" w:fill="F2CEED" w:themeFill="accent5" w:themeFillTint="33"/>
+            <w:tcMar>
+              <w:top w:w="30" w:type="dxa"/>
+              <w:left w:w="80" w:type="dxa"/>
+              <w:bottom w:w="30" w:type="dxa"/>
+              <w:right w:w="80" w:type="dxa"/>
+            </w:tcMar>
+          </w:tcPr>
+          <w:p>
+            <w:r>
+              <w:rPr>
+                <w:rFonts w:ascii="Aptos" w:eastAsia="Aptos" w:hAnsi="Aptos" w:cs="Aptos"/>
+                <w:b/>
+                <w:bCs/>
+                <w:sz w:val="20"/>
+                <w:szCs w:val="20"/>
+              </w:rPr>
+              <w:t xml:space="preserve">Expected Result</w:t>
+            </w:r>
+          </w:p>
+        </w:tc>
+      </w:tr>
+      <w:tr>
+        <w:trPr>
+          <w:cantSplit/>
+        </w:trPr>
+        <w:tc>
+          <w:tcPr>
+            <w:tcW w:w="300" w:type="pct"/>
+            <w:tcMar>
+              <w:top w:w="30" w:type="dxa"/>
+              <w:left w:w="80" w:type="dxa"/>
+              <w:bottom w:w="30" w:type="dxa"/>
+              <w:right w:w="80" w:type="dxa"/>
+            </w:tcMar>
+          </w:tcPr>
+          <w:p>
+            <w:r>
+              <w:rPr>
+                <w:rFonts w:ascii="Aptos" w:eastAsia="Aptos" w:hAnsi="Aptos" w:cs="Aptos"/>
+                <w:sz w:val="20"/>
+                <w:szCs w:val="20"/>
+              </w:rPr>
+              <w:t xml:space="preserve">11</w:t>
+            </w:r>
+          </w:p>
+        </w:tc>
+        <w:tc>
+          <w:tcPr>
+            <w:tcW w:w="1850" w:type="pct"/>
+            <w:tcMar>
+              <w:top w:w="30" w:type="dxa"/>
+              <w:left w:w="80" w:type="dxa"/>
+              <w:bottom w:w="30" w:type="dxa"/>
+              <w:right w:w="80" w:type="dxa"/>
+            </w:tcMar>
+          </w:tcPr>
+          <w:p>
+            <w:r>
+              <w:rPr>
+                <w:rFonts w:ascii="Aptos" w:eastAsia="Aptos" w:hAnsi="Aptos" w:cs="Aptos"/>
+                <w:sz w:val="20"/>
+                <w:szCs w:val="20"/>
+              </w:rPr>
+              <w:t xml:space="preserve">Leave the screen name blank, enter 5 rows of 10 seats, then press Add</w:t>
+            </w:r>
+          </w:p>
+        </w:tc>
+        <w:tc>
+          <w:tcPr>
+            <w:tcW w:w="560" w:type="pct"/>
+            <w:tcMar>
+              <w:top w:w="30" w:type="dxa"/>
+              <w:left w:w="80" w:type="dxa"/>
+              <w:bottom w:w="30" w:type="dxa"/>
+              <w:right w:w="80" w:type="dxa"/>
+            </w:tcMar>
+          </w:tcPr>
+          <w:p>
+            <w:r>
+              <w:rPr>
+                <w:rFonts w:ascii="Aptos" w:eastAsia="Aptos" w:hAnsi="Aptos" w:cs="Aptos"/>
+                <w:sz w:val="20"/>
+                <w:szCs w:val="20"/>
+              </w:rPr>
+              <w:t xml:space="preserve">Erroneous</w:t>
+            </w:r>
+          </w:p>
+        </w:tc>
+        <w:tc>
+          <w:tcPr>
+            <w:tcW w:w="2290" w:type="pct"/>
+            <w:tcMar>
+              <w:top w:w="30" w:type="dxa"/>
+              <w:left w:w="80" w:type="dxa"/>
+              <w:bottom w:w="30" w:type="dxa"/>
+              <w:right w:w="80" w:type="dxa"/>
+            </w:tcMar>
+          </w:tcPr>
+          <w:p>
+            <w:r>
+              <w:rPr>
+                <w:rFonts w:ascii="Aptos" w:eastAsia="Aptos" w:hAnsi="Aptos" w:cs="Aptos"/>
+                <w:sz w:val="20"/>
+                <w:szCs w:val="20"/>
+              </w:rPr>
+              <w:t xml:space="preserve">The screen is rejected and a message appears stating “Enter a screen name”.</w:t>
+            </w:r>
+          </w:p>
+        </w:tc>
+      </w:tr>
+      <w:tr>
+        <w:trPr>
+          <w:cantSplit/>
+        </w:trPr>
+        <w:tc>
+          <w:tcPr>
+            <w:tcW w:w="300" w:type="pct"/>
+            <w:tcMar>
+              <w:top w:w="30" w:type="dxa"/>
+              <w:left w:w="80" w:type="dxa"/>
+              <w:bottom w:w="30" w:type="dxa"/>
+              <w:right w:w="80" w:type="dxa"/>
+            </w:tcMar>
+          </w:tcPr>
+          <w:p>
+            <w:r>
+              <w:rPr>
+                <w:rFonts w:ascii="Aptos" w:eastAsia="Aptos" w:hAnsi="Aptos" w:cs="Aptos"/>
+                <w:sz w:val="20"/>
+                <w:szCs w:val="20"/>
+              </w:rPr>
+              <w:t xml:space="preserve">12</w:t>
+            </w:r>
+          </w:p>
+        </w:tc>
+        <w:tc>
+          <w:tcPr>
+            <w:tcW w:w="1850" w:type="pct"/>
+            <w:tcMar>
+              <w:top w:w="30" w:type="dxa"/>
+              <w:left w:w="80" w:type="dxa"/>
+              <w:bottom w:w="30" w:type="dxa"/>
+              <w:right w:w="80" w:type="dxa"/>
+            </w:tcMar>
+          </w:tcPr>
+          <w:p>
+            <w:r>
+              <w:rPr>
+                <w:rFonts w:ascii="Aptos" w:eastAsia="Aptos" w:hAnsi="Aptos" w:cs="Aptos"/>
+                <w:sz w:val="20"/>
+                <w:szCs w:val="20"/>
+              </w:rPr>
+              <w:t xml:space="preserve">Enter the name Screen 1, enter abc rows and 10 seats per row, then press Add</w:t>
+            </w:r>
+          </w:p>
+        </w:tc>
+        <w:tc>
+          <w:tcPr>
+            <w:tcW w:w="560" w:type="pct"/>
+            <w:tcMar>
+              <w:top w:w="30" w:type="dxa"/>
+              <w:left w:w="80" w:type="dxa"/>
+              <w:bottom w:w="30" w:type="dxa"/>
+              <w:right w:w="80" w:type="dxa"/>
+            </w:tcMar>
+          </w:tcPr>
+          <w:p>
+            <w:r>
+              <w:rPr>
+                <w:rFonts w:ascii="Aptos" w:eastAsia="Aptos" w:hAnsi="Aptos" w:cs="Aptos"/>
+                <w:sz w:val="20"/>
+                <w:szCs w:val="20"/>
+              </w:rPr>
+              <w:t xml:space="preserve">Erroneous</w:t>
+            </w:r>
+          </w:p>
+        </w:tc>
+        <w:tc>
+          <w:tcPr>
+            <w:tcW w:w="2290" w:type="pct"/>
+            <w:tcMar>
+              <w:top w:w="30" w:type="dxa"/>
+              <w:left w:w="80" w:type="dxa"/>
+              <w:bottom w:w="30" w:type="dxa"/>
+              <w:right w:w="80" w:type="dxa"/>
+            </w:tcMar>
+          </w:tcPr>
+          <w:p>
+            <w:r>
+              <w:rPr>
+                <w:rFonts w:ascii="Aptos" w:eastAsia="Aptos" w:hAnsi="Aptos" w:cs="Aptos"/>
+                <w:sz w:val="20"/>
+                <w:szCs w:val="20"/>
+              </w:rPr>
+              <w:t xml:space="preserve">The screen is rejected and a message appears stating “How many rows has to be a number”.</w:t>
+            </w:r>
+          </w:p>
+        </w:tc>
+      </w:tr>
+      <w:tr>
+        <w:trPr>
+          <w:cantSplit/>
+        </w:trPr>
+        <w:tc>
+          <w:tcPr>
+            <w:tcW w:w="300" w:type="pct"/>
+            <w:tcMar>
+              <w:top w:w="30" w:type="dxa"/>
+              <w:left w:w="80" w:type="dxa"/>
+              <w:bottom w:w="30" w:type="dxa"/>
+              <w:right w:w="80" w:type="dxa"/>
+            </w:tcMar>
+          </w:tcPr>
+          <w:p>
+            <w:r>
+              <w:rPr>
+                <w:rFonts w:ascii="Aptos" w:eastAsia="Aptos" w:hAnsi="Aptos" w:cs="Aptos"/>
+                <w:sz w:val="20"/>
+                <w:szCs w:val="20"/>
+              </w:rPr>
+              <w:t xml:space="preserve">13</w:t>
+            </w:r>
+          </w:p>
+        </w:tc>
+        <w:tc>
+          <w:tcPr>
+            <w:tcW w:w="1850" w:type="pct"/>
+            <w:tcMar>
+              <w:top w:w="30" w:type="dxa"/>
+              <w:left w:w="80" w:type="dxa"/>
+              <w:bottom w:w="30" w:type="dxa"/>
+              <w:right w:w="80" w:type="dxa"/>
+            </w:tcMar>
+          </w:tcPr>
+          <w:p>
+            <w:r>
+              <w:rPr>
+                <w:rFonts w:ascii="Aptos" w:eastAsia="Aptos" w:hAnsi="Aptos" w:cs="Aptos"/>
+                <w:sz w:val="20"/>
+                <w:szCs w:val="20"/>
+              </w:rPr>
+              <w:t xml:space="preserve">Enter the name Screen 1, enter 0 rows and 10 seats per row, then press Add</w:t>
+            </w:r>
+          </w:p>
+        </w:tc>
+        <w:tc>
+          <w:tcPr>
+            <w:tcW w:w="560" w:type="pct"/>
+            <w:tcMar>
+              <w:top w:w="30" w:type="dxa"/>
+              <w:left w:w="80" w:type="dxa"/>
+              <w:bottom w:w="30" w:type="dxa"/>
+              <w:right w:w="80" w:type="dxa"/>
+            </w:tcMar>
+          </w:tcPr>
+          <w:p>
+            <w:r>
+              <w:rPr>
+                <w:rFonts w:ascii="Aptos" w:eastAsia="Aptos" w:hAnsi="Aptos" w:cs="Aptos"/>
+                <w:sz w:val="20"/>
+                <w:szCs w:val="20"/>
+              </w:rPr>
+              <w:t xml:space="preserve">Erroneous</w:t>
+            </w:r>
+          </w:p>
+        </w:tc>
+        <w:tc>
+          <w:tcPr>
+            <w:tcW w:w="2290" w:type="pct"/>
+            <w:tcMar>
+              <w:top w:w="30" w:type="dxa"/>
+              <w:left w:w="80" w:type="dxa"/>
+              <w:bottom w:w="30" w:type="dxa"/>
+              <w:right w:w="80" w:type="dxa"/>
+            </w:tcMar>
+          </w:tcPr>
+          <w:p>
+            <w:r>
+              <w:rPr>
+                <w:rFonts w:ascii="Aptos" w:eastAsia="Aptos" w:hAnsi="Aptos" w:cs="Aptos"/>
+                <w:sz w:val="20"/>
+                <w:szCs w:val="20"/>
+              </w:rPr>
+              <w:t xml:space="preserve">The screen is rejected and a message appears stating “A screen needs at least one row”.</w:t>
+            </w:r>
+          </w:p>
+        </w:tc>
+      </w:tr>
+      <w:tr>
+        <w:trPr>
+          <w:cantSplit/>
+        </w:trPr>
+        <w:tc>
+          <w:tcPr>
+            <w:tcW w:w="300" w:type="pct"/>
+            <w:tcMar>
+              <w:top w:w="30" w:type="dxa"/>
+              <w:left w:w="80" w:type="dxa"/>
+              <w:bottom w:w="30" w:type="dxa"/>
+              <w:right w:w="80" w:type="dxa"/>
+            </w:tcMar>
+          </w:tcPr>
+          <w:p>
+            <w:r>
+              <w:rPr>
+                <w:rFonts w:ascii="Aptos" w:eastAsia="Aptos" w:hAnsi="Aptos" w:cs="Aptos"/>
+                <w:sz w:val="20"/>
+                <w:szCs w:val="20"/>
+              </w:rPr>
+              <w:t xml:space="preserve">14</w:t>
+            </w:r>
+          </w:p>
+        </w:tc>
+        <w:tc>
+          <w:tcPr>
+            <w:tcW w:w="1850" w:type="pct"/>
+            <w:tcMar>
+              <w:top w:w="30" w:type="dxa"/>
+              <w:left w:w="80" w:type="dxa"/>
+              <w:bottom w:w="30" w:type="dxa"/>
+              <w:right w:w="80" w:type="dxa"/>
+            </w:tcMar>
+          </w:tcPr>
+          <w:p>
+            <w:r>
+              <w:rPr>
+                <w:rFonts w:ascii="Aptos" w:eastAsia="Aptos" w:hAnsi="Aptos" w:cs="Aptos"/>
+                <w:sz w:val="20"/>
+                <w:szCs w:val="20"/>
+              </w:rPr>
+              <w:t xml:space="preserve">Enter the name Screen 1, enter 5 rows and 0 seats per row, then press Add</w:t>
+            </w:r>
+          </w:p>
+        </w:tc>
+        <w:tc>
+          <w:tcPr>
+            <w:tcW w:w="560" w:type="pct"/>
+            <w:tcMar>
+              <w:top w:w="30" w:type="dxa"/>
+              <w:left w:w="80" w:type="dxa"/>
+              <w:bottom w:w="30" w:type="dxa"/>
+              <w:right w:w="80" w:type="dxa"/>
+            </w:tcMar>
+          </w:tcPr>
+          <w:p>
+            <w:r>
+              <w:rPr>
+                <w:rFonts w:ascii="Aptos" w:eastAsia="Aptos" w:hAnsi="Aptos" w:cs="Aptos"/>
+                <w:sz w:val="20"/>
+                <w:szCs w:val="20"/>
+              </w:rPr>
+              <w:t xml:space="preserve">Erroneous</w:t>
+            </w:r>
+          </w:p>
+        </w:tc>
+        <w:tc>
+          <w:tcPr>
+            <w:tcW w:w="2290" w:type="pct"/>
+            <w:tcMar>
+              <w:top w:w="30" w:type="dxa"/>
+              <w:left w:w="80" w:type="dxa"/>
+              <w:bottom w:w="30" w:type="dxa"/>
+              <w:right w:w="80" w:type="dxa"/>
+            </w:tcMar>
+          </w:tcPr>
+          <w:p>
+            <w:r>
+              <w:rPr>
+                <w:rFonts w:ascii="Aptos" w:eastAsia="Aptos" w:hAnsi="Aptos" w:cs="Aptos"/>
+                <w:sz w:val="20"/>
+                <w:szCs w:val="20"/>
+              </w:rPr>
+              <w:t xml:space="preserve">The screen is rejected and a message appears stating “A row needs at least one seat in it”.</w:t>
+            </w:r>
+          </w:p>
+        </w:tc>
+      </w:tr>
+      <w:tr>
+        <w:trPr>
+          <w:cantSplit/>
+        </w:trPr>
+        <w:tc>
+          <w:tcPr>
+            <w:tcW w:w="300" w:type="pct"/>
+            <w:tcMar>
+              <w:top w:w="30" w:type="dxa"/>
+              <w:left w:w="80" w:type="dxa"/>
+              <w:bottom w:w="30" w:type="dxa"/>
+              <w:right w:w="80" w:type="dxa"/>
+            </w:tcMar>
+          </w:tcPr>
+          <w:p>
+            <w:r>
+              <w:rPr>
+                <w:rFonts w:ascii="Aptos" w:eastAsia="Aptos" w:hAnsi="Aptos" w:cs="Aptos"/>
+                <w:sz w:val="20"/>
+                <w:szCs w:val="20"/>
+              </w:rPr>
+              <w:t xml:space="preserve">15</w:t>
+            </w:r>
+          </w:p>
+        </w:tc>
+        <w:tc>
+          <w:tcPr>
+            <w:tcW w:w="1850" w:type="pct"/>
+            <w:tcMar>
+              <w:top w:w="30" w:type="dxa"/>
+              <w:left w:w="80" w:type="dxa"/>
+              <w:bottom w:w="30" w:type="dxa"/>
+              <w:right w:w="80" w:type="dxa"/>
+            </w:tcMar>
+          </w:tcPr>
+          <w:p>
+            <w:r>
+              <w:rPr>
+                <w:rFonts w:ascii="Aptos" w:eastAsia="Aptos" w:hAnsi="Aptos" w:cs="Aptos"/>
+                <w:sz w:val="20"/>
+                <w:szCs w:val="20"/>
+              </w:rPr>
+              <w:t xml:space="preserve">Enter the name Screen 1, enter 27 rows and 10 seats per row, then press Add</w:t>
+            </w:r>
+          </w:p>
+        </w:tc>
+        <w:tc>
+          <w:tcPr>
+            <w:tcW w:w="560" w:type="pct"/>
+            <w:tcMar>
+              <w:top w:w="30" w:type="dxa"/>
+              <w:left w:w="80" w:type="dxa"/>
+              <w:bottom w:w="30" w:type="dxa"/>
+              <w:right w:w="80" w:type="dxa"/>
+            </w:tcMar>
+          </w:tcPr>
+          <w:p>
+            <w:r>
+              <w:rPr>
+                <w:rFonts w:ascii="Aptos" w:eastAsia="Aptos" w:hAnsi="Aptos" w:cs="Aptos"/>
+                <w:sz w:val="20"/>
+                <w:szCs w:val="20"/>
+              </w:rPr>
+              <w:t xml:space="preserve">Erroneous</w:t>
+            </w:r>
+          </w:p>
+        </w:tc>
+        <w:tc>
+          <w:tcPr>
+            <w:tcW w:w="2290" w:type="pct"/>
+            <w:tcMar>
+              <w:top w:w="30" w:type="dxa"/>
+              <w:left w:w="80" w:type="dxa"/>
+              <w:bottom w:w="30" w:type="dxa"/>
+              <w:right w:w="80" w:type="dxa"/>
+            </w:tcMar>
+          </w:tcPr>
+          <w:p>
+            <w:r>
+              <w:rPr>
+                <w:rFonts w:ascii="Aptos" w:eastAsia="Aptos" w:hAnsi="Aptos" w:cs="Aptos"/>
+                <w:sz w:val="20"/>
+                <w:szCs w:val="20"/>
+              </w:rPr>
+              <w:t xml:space="preserve">The screen is rejected and a message appears stating “The rows are lettered A to Z, so a screen cannot have more than 26 rows”.</w:t>
+            </w:r>
+          </w:p>
+        </w:tc>
+      </w:tr>
+      <w:tr>
+        <w:trPr>
+          <w:cantSplit/>
+        </w:trPr>
+        <w:tc>
+          <w:tcPr>
+            <w:tcW w:w="300" w:type="pct"/>
+            <w:tcMar>
+              <w:top w:w="30" w:type="dxa"/>
+              <w:left w:w="80" w:type="dxa"/>
+              <w:bottom w:w="30" w:type="dxa"/>
+              <w:right w:w="80" w:type="dxa"/>
+            </w:tcMar>
+          </w:tcPr>
+          <w:p>
+            <w:r>
+              <w:rPr>
+                <w:rFonts w:ascii="Aptos" w:eastAsia="Aptos" w:hAnsi="Aptos" w:cs="Aptos"/>
+                <w:sz w:val="20"/>
+                <w:szCs w:val="20"/>
+              </w:rPr>
+              <w:t xml:space="preserve">16</w:t>
+            </w:r>
+          </w:p>
+        </w:tc>
+        <w:tc>
+          <w:tcPr>
+            <w:tcW w:w="1850" w:type="pct"/>
+            <w:tcMar>
+              <w:top w:w="30" w:type="dxa"/>
+              <w:left w:w="80" w:type="dxa"/>
+              <w:bottom w:w="30" w:type="dxa"/>
+              <w:right w:w="80" w:type="dxa"/>
+            </w:tcMar>
+          </w:tcPr>
+          <w:p>
+            <w:r>
+              <w:rPr>
+                <w:rFonts w:ascii="Aptos" w:eastAsia="Aptos" w:hAnsi="Aptos" w:cs="Aptos"/>
+                <w:sz w:val="20"/>
+                <w:szCs w:val="20"/>
+              </w:rPr>
+              <w:t xml:space="preserve">Enter the name Screen 1, enter 5 rows and 21 seats per row, then press Add</w:t>
+            </w:r>
+          </w:p>
+        </w:tc>
+        <w:tc>
+          <w:tcPr>
+            <w:tcW w:w="560" w:type="pct"/>
+            <w:tcMar>
+              <w:top w:w="30" w:type="dxa"/>
+              <w:left w:w="80" w:type="dxa"/>
+              <w:bottom w:w="30" w:type="dxa"/>
+              <w:right w:w="80" w:type="dxa"/>
+            </w:tcMar>
+          </w:tcPr>
+          <w:p>
+            <w:r>
+              <w:rPr>
+                <w:rFonts w:ascii="Aptos" w:eastAsia="Aptos" w:hAnsi="Aptos" w:cs="Aptos"/>
+                <w:sz w:val="20"/>
+                <w:szCs w:val="20"/>
+              </w:rPr>
+              <w:t xml:space="preserve">Erroneous</w:t>
+            </w:r>
+          </w:p>
+        </w:tc>
+        <w:tc>
+          <w:tcPr>
+            <w:tcW w:w="2290" w:type="pct"/>
+            <w:tcMar>
+              <w:top w:w="30" w:type="dxa"/>
+              <w:left w:w="80" w:type="dxa"/>
+              <w:bottom w:w="30" w:type="dxa"/>
+              <w:right w:w="80" w:type="dxa"/>
+            </w:tcMar>
+          </w:tcPr>
+          <w:p>
+            <w:r>
+              <w:rPr>
+                <w:rFonts w:ascii="Aptos" w:eastAsia="Aptos" w:hAnsi="Aptos" w:cs="Aptos"/>
+                <w:sz w:val="20"/>
+                <w:szCs w:val="20"/>
+              </w:rPr>
+              <w:t xml:space="preserve">The screen is rejected and a message appears stating “A row cannot have more than 20 seats in it, they would not fit on the seat map”.</w:t>
+            </w:r>
+          </w:p>
+        </w:tc>
+      </w:tr>
+      <w:tr>
+        <w:trPr>
+          <w:cantSplit/>
+        </w:trPr>
+        <w:tc>
+          <w:tcPr>
+            <w:tcW w:w="300" w:type="pct"/>
+            <w:tcMar>
+              <w:top w:w="30" w:type="dxa"/>
+              <w:left w:w="80" w:type="dxa"/>
+              <w:bottom w:w="30" w:type="dxa"/>
+              <w:right w:w="80" w:type="dxa"/>
+            </w:tcMar>
+          </w:tcPr>
+          <w:p>
+            <w:r>
+              <w:rPr>
+                <w:rFonts w:ascii="Aptos" w:eastAsia="Aptos" w:hAnsi="Aptos" w:cs="Aptos"/>
+                <w:sz w:val="20"/>
+                <w:szCs w:val="20"/>
+              </w:rPr>
+              <w:t xml:space="preserve">17</w:t>
+            </w:r>
+          </w:p>
+        </w:tc>
+        <w:tc>
+          <w:tcPr>
+            <w:tcW w:w="1850" w:type="pct"/>
+            <w:tcMar>
+              <w:top w:w="30" w:type="dxa"/>
+              <w:left w:w="80" w:type="dxa"/>
+              <w:bottom w:w="30" w:type="dxa"/>
+              <w:right w:w="80" w:type="dxa"/>
+            </w:tcMar>
+          </w:tcPr>
+          <w:p>
+            <w:r>
+              <w:rPr>
+                <w:rFonts w:ascii="Aptos" w:eastAsia="Aptos" w:hAnsi="Aptos" w:cs="Aptos"/>
+                <w:sz w:val="20"/>
+                <w:szCs w:val="20"/>
+              </w:rPr>
+              <w:t xml:space="preserve">Enter the name Screen 1, 5 rows of 10 seats, choose the seat plan Premium at the back, then press Add</w:t>
+            </w:r>
+          </w:p>
+        </w:tc>
+        <w:tc>
+          <w:tcPr>
+            <w:tcW w:w="560" w:type="pct"/>
+            <w:tcMar>
+              <w:top w:w="30" w:type="dxa"/>
+              <w:left w:w="80" w:type="dxa"/>
+              <w:bottom w:w="30" w:type="dxa"/>
+              <w:right w:w="80" w:type="dxa"/>
+            </w:tcMar>
+          </w:tcPr>
+          <w:p>
+            <w:r>
+              <w:rPr>
+                <w:rFonts w:ascii="Aptos" w:eastAsia="Aptos" w:hAnsi="Aptos" w:cs="Aptos"/>
+                <w:sz w:val="20"/>
+                <w:szCs w:val="20"/>
+              </w:rPr>
+              <w:t xml:space="preserve">Normal</w:t>
+            </w:r>
+          </w:p>
+        </w:tc>
+        <w:tc>
+          <w:tcPr>
+            <w:tcW w:w="2290" w:type="pct"/>
+            <w:tcMar>
+              <w:top w:w="30" w:type="dxa"/>
+              <w:left w:w="80" w:type="dxa"/>
+              <w:bottom w:w="30" w:type="dxa"/>
+              <w:right w:w="80" w:type="dxa"/>
+            </w:tcMar>
+          </w:tcPr>
+          <w:p>
+            <w:r>
+              <w:rPr>
+                <w:rFonts w:ascii="Aptos" w:eastAsia="Aptos" w:hAnsi="Aptos" w:cs="Aptos"/>
+                <w:sz w:val="20"/>
+                <w:szCs w:val="20"/>
+              </w:rPr>
+              <w:t xml:space="preserve">Screen 1 is saved with a capacity of 50, which the system has worked out from 5 times 10 rather than it being typed in, and 50 seat records are generated in rows A to E each holding seats 1 to 10.</w:t>
+            </w:r>
+          </w:p>
+        </w:tc>
+      </w:tr>
+      <w:tr>
+        <w:trPr>
+          <w:cantSplit/>
+        </w:trPr>
+        <w:tc>
+          <w:tcPr>
+            <w:tcW w:w="300" w:type="pct"/>
+            <w:tcMar>
+              <w:top w:w="30" w:type="dxa"/>
+              <w:left w:w="80" w:type="dxa"/>
+              <w:bottom w:w="30" w:type="dxa"/>
+              <w:right w:w="80" w:type="dxa"/>
+            </w:tcMar>
+          </w:tcPr>
+          <w:p>
+            <w:r>
+              <w:rPr>
+                <w:rFonts w:ascii="Aptos" w:eastAsia="Aptos" w:hAnsi="Aptos" w:cs="Aptos"/>
+                <w:sz w:val="20"/>
+                <w:szCs w:val="20"/>
+              </w:rPr>
+              <w:t xml:space="preserve">18</w:t>
+            </w:r>
+          </w:p>
+        </w:tc>
+        <w:tc>
+          <w:tcPr>
+            <w:tcW w:w="1850" w:type="pct"/>
+            <w:tcMar>
+              <w:top w:w="30" w:type="dxa"/>
+              <w:left w:w="80" w:type="dxa"/>
+              <w:bottom w:w="30" w:type="dxa"/>
+              <w:right w:w="80" w:type="dxa"/>
+            </w:tcMar>
+          </w:tcPr>
+          <w:p>
+            <w:r>
+              <w:rPr>
+                <w:rFonts w:ascii="Aptos" w:eastAsia="Aptos" w:hAnsi="Aptos" w:cs="Aptos"/>
+                <w:sz w:val="20"/>
+                <w:szCs w:val="20"/>
+              </w:rPr>
+              <w:t xml:space="preserve">Look at the seat types generated for Screen 1 in tblSeat</w:t>
+            </w:r>
+          </w:p>
+        </w:tc>
+        <w:tc>
+          <w:tcPr>
+            <w:tcW w:w="560" w:type="pct"/>
+            <w:tcMar>
+              <w:top w:w="30" w:type="dxa"/>
+              <w:left w:w="80" w:type="dxa"/>
+              <w:bottom w:w="30" w:type="dxa"/>
+              <w:right w:w="80" w:type="dxa"/>
+            </w:tcMar>
+          </w:tcPr>
+          <w:p>
+            <w:r>
+              <w:rPr>
+                <w:rFonts w:ascii="Aptos" w:eastAsia="Aptos" w:hAnsi="Aptos" w:cs="Aptos"/>
+                <w:sz w:val="20"/>
+                <w:szCs w:val="20"/>
+              </w:rPr>
+              <w:t xml:space="preserve">Normal</w:t>
+            </w:r>
+          </w:p>
+        </w:tc>
+        <w:tc>
+          <w:tcPr>
+            <w:tcW w:w="2290" w:type="pct"/>
+            <w:tcMar>
+              <w:top w:w="30" w:type="dxa"/>
+              <w:left w:w="80" w:type="dxa"/>
+              <w:bottom w:w="30" w:type="dxa"/>
+              <w:right w:w="80" w:type="dxa"/>
+            </w:tcMar>
+          </w:tcPr>
+          <w:p>
+            <w:r>
+              <w:rPr>
+                <w:rFonts w:ascii="Aptos" w:eastAsia="Aptos" w:hAnsi="Aptos" w:cs="Aptos"/>
+                <w:sz w:val="20"/>
+                <w:szCs w:val="20"/>
+              </w:rPr>
+              <w:t xml:space="preserve">Row A is Saver, rows B and C are Standard except for C1 and C10 which are Accessible, and rows D and E are Premium, which is what the Premium at the back plan describes.</w:t>
+            </w:r>
+          </w:p>
+        </w:tc>
+      </w:tr>
+      <w:tr>
+        <w:trPr>
+          <w:cantSplit/>
+        </w:trPr>
+        <w:tc>
+          <w:tcPr>
+            <w:tcW w:w="300" w:type="pct"/>
+            <w:tcMar>
+              <w:top w:w="30" w:type="dxa"/>
+              <w:left w:w="80" w:type="dxa"/>
+              <w:bottom w:w="30" w:type="dxa"/>
+              <w:right w:w="80" w:type="dxa"/>
+            </w:tcMar>
+          </w:tcPr>
+          <w:p>
+            <w:r>
+              <w:rPr>
+                <w:rFonts w:ascii="Aptos" w:eastAsia="Aptos" w:hAnsi="Aptos" w:cs="Aptos"/>
+                <w:sz w:val="20"/>
+                <w:szCs w:val="20"/>
+              </w:rPr>
+              <w:t xml:space="preserve">19</w:t>
+            </w:r>
+          </w:p>
+        </w:tc>
+        <w:tc>
+          <w:tcPr>
+            <w:tcW w:w="1850" w:type="pct"/>
+            <w:tcMar>
+              <w:top w:w="30" w:type="dxa"/>
+              <w:left w:w="80" w:type="dxa"/>
+              <w:bottom w:w="30" w:type="dxa"/>
+              <w:right w:w="80" w:type="dxa"/>
+            </w:tcMar>
+          </w:tcPr>
+          <w:p>
+            <w:r>
+              <w:rPr>
+                <w:rFonts w:ascii="Aptos" w:eastAsia="Aptos" w:hAnsi="Aptos" w:cs="Aptos"/>
+                <w:sz w:val="20"/>
+                <w:szCs w:val="20"/>
+              </w:rPr>
+              <w:t xml:space="preserve">Enter the name Screen 2, 3 rows of 10 seats, choose the seat plan Every seat the same, then press Add</w:t>
+            </w:r>
+          </w:p>
+        </w:tc>
+        <w:tc>
+          <w:tcPr>
+            <w:tcW w:w="560" w:type="pct"/>
+            <w:tcMar>
+              <w:top w:w="30" w:type="dxa"/>
+              <w:left w:w="80" w:type="dxa"/>
+              <w:bottom w:w="30" w:type="dxa"/>
+              <w:right w:w="80" w:type="dxa"/>
+            </w:tcMar>
+          </w:tcPr>
+          <w:p>
+            <w:r>
+              <w:rPr>
+                <w:rFonts w:ascii="Aptos" w:eastAsia="Aptos" w:hAnsi="Aptos" w:cs="Aptos"/>
+                <w:sz w:val="20"/>
+                <w:szCs w:val="20"/>
+              </w:rPr>
+              <w:t xml:space="preserve">Normal</w:t>
+            </w:r>
+          </w:p>
+        </w:tc>
+        <w:tc>
+          <w:tcPr>
+            <w:tcW w:w="2290" w:type="pct"/>
+            <w:tcMar>
+              <w:top w:w="30" w:type="dxa"/>
+              <w:left w:w="80" w:type="dxa"/>
+              <w:bottom w:w="30" w:type="dxa"/>
+              <w:right w:w="80" w:type="dxa"/>
+            </w:tcMar>
+          </w:tcPr>
+          <w:p>
+            <w:r>
+              <w:rPr>
+                <w:rFonts w:ascii="Aptos" w:eastAsia="Aptos" w:hAnsi="Aptos" w:cs="Aptos"/>
+                <w:sz w:val="20"/>
+                <w:szCs w:val="20"/>
+              </w:rPr>
+              <w:t xml:space="preserve">Screen 2 is saved with a capacity of 30 and 30 seats are generated in rows A to C, all of them Standard except B1 and B10 which are Accessible.</w:t>
+            </w:r>
+          </w:p>
+        </w:tc>
+      </w:tr>
+      <w:tr>
+        <w:trPr>
+          <w:cantSplit/>
+        </w:trPr>
+        <w:tc>
+          <w:tcPr>
+            <w:tcW w:w="300" w:type="pct"/>
+            <w:tcMar>
+              <w:top w:w="30" w:type="dxa"/>
+              <w:left w:w="80" w:type="dxa"/>
+              <w:bottom w:w="30" w:type="dxa"/>
+              <w:right w:w="80" w:type="dxa"/>
+            </w:tcMar>
+          </w:tcPr>
+          <w:p>
+            <w:r>
+              <w:rPr>
+                <w:rFonts w:ascii="Aptos" w:eastAsia="Aptos" w:hAnsi="Aptos" w:cs="Aptos"/>
+                <w:sz w:val="20"/>
+                <w:szCs w:val="20"/>
+              </w:rPr>
+              <w:t xml:space="preserve">20</w:t>
+            </w:r>
+          </w:p>
+        </w:tc>
+        <w:tc>
+          <w:tcPr>
+            <w:tcW w:w="1850" w:type="pct"/>
+            <w:tcMar>
+              <w:top w:w="30" w:type="dxa"/>
+              <w:left w:w="80" w:type="dxa"/>
+              <w:bottom w:w="30" w:type="dxa"/>
+              <w:right w:w="80" w:type="dxa"/>
+            </w:tcMar>
+          </w:tcPr>
+          <w:p>
+            <w:r>
+              <w:rPr>
+                <w:rFonts w:ascii="Aptos" w:eastAsia="Aptos" w:hAnsi="Aptos" w:cs="Aptos"/>
+                <w:sz w:val="20"/>
+                <w:szCs w:val="20"/>
+              </w:rPr>
+              <w:t xml:space="preserve">Enter the name Small Screen with 1 row of 1 seat, then press Add</w:t>
+            </w:r>
+          </w:p>
+        </w:tc>
+        <w:tc>
+          <w:tcPr>
+            <w:tcW w:w="560" w:type="pct"/>
+            <w:tcMar>
+              <w:top w:w="30" w:type="dxa"/>
+              <w:left w:w="80" w:type="dxa"/>
+              <w:bottom w:w="30" w:type="dxa"/>
+              <w:right w:w="80" w:type="dxa"/>
+            </w:tcMar>
+          </w:tcPr>
+          <w:p>
+            <w:r>
+              <w:rPr>
+                <w:rFonts w:ascii="Aptos" w:eastAsia="Aptos" w:hAnsi="Aptos" w:cs="Aptos"/>
+                <w:sz w:val="20"/>
+                <w:szCs w:val="20"/>
+              </w:rPr>
+              <w:t xml:space="preserve">Boundary</w:t>
+            </w:r>
+          </w:p>
+        </w:tc>
+        <w:tc>
+          <w:tcPr>
+            <w:tcW w:w="2290" w:type="pct"/>
+            <w:tcMar>
+              <w:top w:w="30" w:type="dxa"/>
+              <w:left w:w="80" w:type="dxa"/>
+              <w:bottom w:w="30" w:type="dxa"/>
+              <w:right w:w="80" w:type="dxa"/>
+            </w:tcMar>
+          </w:tcPr>
+          <w:p>
+            <w:r>
+              <w:rPr>
+                <w:rFonts w:ascii="Aptos" w:eastAsia="Aptos" w:hAnsi="Aptos" w:cs="Aptos"/>
+                <w:sz w:val="20"/>
+                <w:szCs w:val="20"/>
+              </w:rPr>
+              <w:t xml:space="preserve">The screen is accepted at the smallest layout the validation allows and generates a single seat A1.</w:t>
+            </w:r>
+          </w:p>
+        </w:tc>
+      </w:tr>
+      <w:tr>
+        <w:trPr>
+          <w:cantSplit/>
+        </w:trPr>
+        <w:tc>
+          <w:tcPr>
+            <w:tcW w:w="300" w:type="pct"/>
+            <w:tcMar>
+              <w:top w:w="30" w:type="dxa"/>
+              <w:left w:w="80" w:type="dxa"/>
+              <w:bottom w:w="30" w:type="dxa"/>
+              <w:right w:w="80" w:type="dxa"/>
+            </w:tcMar>
+          </w:tcPr>
+          <w:p>
+            <w:r>
+              <w:rPr>
+                <w:rFonts w:ascii="Aptos" w:eastAsia="Aptos" w:hAnsi="Aptos" w:cs="Aptos"/>
+                <w:sz w:val="20"/>
+                <w:szCs w:val="20"/>
+              </w:rPr>
+              <w:t xml:space="preserve">21</w:t>
+            </w:r>
+          </w:p>
+        </w:tc>
+        <w:tc>
+          <w:tcPr>
+            <w:tcW w:w="1850" w:type="pct"/>
+            <w:tcMar>
+              <w:top w:w="30" w:type="dxa"/>
+              <w:left w:w="80" w:type="dxa"/>
+              <w:bottom w:w="30" w:type="dxa"/>
+              <w:right w:w="80" w:type="dxa"/>
+            </w:tcMar>
+          </w:tcPr>
+          <w:p>
+            <w:r>
+              <w:rPr>
+                <w:rFonts w:ascii="Aptos" w:eastAsia="Aptos" w:hAnsi="Aptos" w:cs="Aptos"/>
+                <w:sz w:val="20"/>
+                <w:szCs w:val="20"/>
+              </w:rPr>
+              <w:t xml:space="preserve">Enter the name Big Screen with 26 rows of 20 seats, then press Add</w:t>
+            </w:r>
+          </w:p>
+        </w:tc>
+        <w:tc>
+          <w:tcPr>
+            <w:tcW w:w="560" w:type="pct"/>
+            <w:tcMar>
+              <w:top w:w="30" w:type="dxa"/>
+              <w:left w:w="80" w:type="dxa"/>
+              <w:bottom w:w="30" w:type="dxa"/>
+              <w:right w:w="80" w:type="dxa"/>
+            </w:tcMar>
+          </w:tcPr>
+          <w:p>
+            <w:r>
+              <w:rPr>
+                <w:rFonts w:ascii="Aptos" w:eastAsia="Aptos" w:hAnsi="Aptos" w:cs="Aptos"/>
+                <w:sz w:val="20"/>
+                <w:szCs w:val="20"/>
+              </w:rPr>
+              <w:t xml:space="preserve">Boundary</w:t>
+            </w:r>
+          </w:p>
+        </w:tc>
+        <w:tc>
+          <w:tcPr>
+            <w:tcW w:w="2290" w:type="pct"/>
+            <w:tcMar>
+              <w:top w:w="30" w:type="dxa"/>
+              <w:left w:w="80" w:type="dxa"/>
+              <w:bottom w:w="30" w:type="dxa"/>
+              <w:right w:w="80" w:type="dxa"/>
+            </w:tcMar>
+          </w:tcPr>
+          <w:p>
+            <w:r>
+              <w:rPr>
+                <w:rFonts w:ascii="Aptos" w:eastAsia="Aptos" w:hAnsi="Aptos" w:cs="Aptos"/>
+                <w:sz w:val="20"/>
+                <w:szCs w:val="20"/>
+              </w:rPr>
+              <w:t xml:space="preserve">The screen is accepted at the largest layout allowed and generates 520 seats in rows A to Z. This screen is deleted again afterwards so that it does not affect any later test.</w:t>
+            </w:r>
+          </w:p>
+        </w:tc>
+      </w:tr>
+      <w:tr>
+        <w:trPr>
+          <w:cantSplit/>
+        </w:trPr>
+        <w:tc>
+          <w:tcPr>
+            <w:tcW w:w="300" w:type="pct"/>
+            <w:tcMar>
+              <w:top w:w="30" w:type="dxa"/>
+              <w:left w:w="80" w:type="dxa"/>
+              <w:bottom w:w="30" w:type="dxa"/>
+              <w:right w:w="80" w:type="dxa"/>
+            </w:tcMar>
+          </w:tcPr>
+          <w:p>
+            <w:r>
+              <w:rPr>
+                <w:rFonts w:ascii="Aptos" w:eastAsia="Aptos" w:hAnsi="Aptos" w:cs="Aptos"/>
+                <w:sz w:val="20"/>
+                <w:szCs w:val="20"/>
+              </w:rPr>
+              <w:t xml:space="preserve">22</w:t>
+            </w:r>
+          </w:p>
+        </w:tc>
+        <w:tc>
+          <w:tcPr>
+            <w:tcW w:w="1850" w:type="pct"/>
+            <w:tcMar>
+              <w:top w:w="30" w:type="dxa"/>
+              <w:left w:w="80" w:type="dxa"/>
+              <w:bottom w:w="30" w:type="dxa"/>
+              <w:right w:w="80" w:type="dxa"/>
+            </w:tcMar>
+          </w:tcPr>
+          <w:p>
+            <w:r>
+              <w:rPr>
+                <w:rFonts w:ascii="Aptos" w:eastAsia="Aptos" w:hAnsi="Aptos" w:cs="Aptos"/>
+                <w:sz w:val="20"/>
+                <w:szCs w:val="20"/>
+              </w:rPr>
+              <w:t xml:space="preserve">Enter the name Screen 1 a second time with 5 rows of 10 seats, then press Add</w:t>
+            </w:r>
+          </w:p>
+        </w:tc>
+        <w:tc>
+          <w:tcPr>
+            <w:tcW w:w="560" w:type="pct"/>
+            <w:tcMar>
+              <w:top w:w="30" w:type="dxa"/>
+              <w:left w:w="80" w:type="dxa"/>
+              <w:bottom w:w="30" w:type="dxa"/>
+              <w:right w:w="80" w:type="dxa"/>
+            </w:tcMar>
+          </w:tcPr>
+          <w:p>
+            <w:r>
+              <w:rPr>
+                <w:rFonts w:ascii="Aptos" w:eastAsia="Aptos" w:hAnsi="Aptos" w:cs="Aptos"/>
+                <w:sz w:val="20"/>
+                <w:szCs w:val="20"/>
+              </w:rPr>
+              <w:t xml:space="preserve">Erroneous</w:t>
+            </w:r>
+          </w:p>
+        </w:tc>
+        <w:tc>
+          <w:tcPr>
+            <w:tcW w:w="2290" w:type="pct"/>
+            <w:tcMar>
+              <w:top w:w="30" w:type="dxa"/>
+              <w:left w:w="80" w:type="dxa"/>
+              <w:bottom w:w="30" w:type="dxa"/>
+              <w:right w:w="80" w:type="dxa"/>
+            </w:tcMar>
+          </w:tcPr>
+          <w:p>
+            <w:r>
+              <w:rPr>
+                <w:rFonts w:ascii="Aptos" w:eastAsia="Aptos" w:hAnsi="Aptos" w:cs="Aptos"/>
+                <w:sz w:val="20"/>
+                <w:szCs w:val="20"/>
+              </w:rPr>
+              <w:t xml:space="preserve">The screen is rejected and a message appears stating that there is already a screen called Screen 1, and explaining that screens are picked by name everywhere else so two the same could not be told apart.</w:t>
             </w:r>
           </w:p>
         </w:tc>

</xml_diff>

<commit_message>
added objective 7: adding new screenings
</commit_message>
<xml_diff>
--- a/Testing.docx
+++ b/Testing.docx
@@ -2441,6 +2441,1141 @@
                 <w:szCs w:val="20"/>
               </w:rPr>
               <w:t xml:space="preserve">The screen is rejected and a message appears stating that there is already a screen called Screen 1, and explaining that screens are picked by name everywhere else so two the same could not be told apart.</w:t>
+            </w:r>
+          </w:p>
+        </w:tc>
+      </w:tr>
+    </w:tbl>
+    <w:p>
+      <w:r>
+        <w:rPr>
+          <w:rFonts w:ascii="Aptos" w:eastAsia="Aptos" w:hAnsi="Aptos" w:cs="Aptos"/>
+        </w:rPr>
+        <w:t xml:space="preserve"/>
+      </w:r>
+    </w:p>
+    <w:p>
+      <w:pPr>
+        <w:pStyle w:val="Heading3"/>
+      </w:pPr>
+      <w:r>
+        <w:rPr>
+          <w:rFonts w:ascii="Aptos Display" w:eastAsia="Aptos Display" w:hAnsi="Aptos Display" w:cs="Aptos Display"/>
+          <w:b/>
+          <w:bCs/>
+          <w:color w:val="000000"/>
+        </w:rPr>
+        <w:t xml:space="preserve">Objective 7: Adding New Screenings</w:t>
+      </w:r>
+    </w:p>
+    <w:p>
+      <w:r>
+        <w:rPr>
+          <w:rFonts w:ascii="Aptos" w:eastAsia="Aptos" w:hAnsi="Aptos" w:cs="Aptos"/>
+        </w:rPr>
+        <w:t xml:space="preserve">With films and screens in place, screenings can now be created and linked to them. A screening occupies its screen for longer than the film itself runs, because the trailers are shown first and the screen has to be cleaned afterwards, so the tests below check the clash detection at the exact minute the screen becomes free again rather than only at obviously wrong times.</w:t>
+      </w:r>
+    </w:p>
+    <w:tbl>
+      <w:tblPr>
+        <w:tblW w:w="5000" w:type="pct"/>
+        <w:tblBorders>
+          <w:top w:val="single" w:sz="4" w:space="0" w:color="808080"/>
+          <w:left w:val="single" w:sz="4" w:space="0" w:color="808080"/>
+          <w:bottom w:val="single" w:sz="4" w:space="0" w:color="808080"/>
+          <w:right w:val="single" w:sz="4" w:space="0" w:color="808080"/>
+          <w:insideH w:val="single" w:sz="4" w:space="0" w:color="808080"/>
+          <w:insideV w:val="single" w:sz="4" w:space="0" w:color="808080"/>
+        </w:tblBorders>
+        <w:tblCellMar>
+          <w:left w:w="10" w:type="dxa"/>
+          <w:right w:w="10" w:type="dxa"/>
+        </w:tblCellMar>
+        <w:tblLook w:val="0000" w:firstRow="0" w:lastRow="0" w:firstColumn="0" w:lastColumn="0" w:noHBand="0" w:noVBand="0"/>
+      </w:tblPr>
+      <w:tblGrid>
+        <w:gridCol w:w="561"/>
+        <w:gridCol w:w="3460"/>
+        <w:gridCol w:w="1047"/>
+        <w:gridCol w:w="4282"/>
+      </w:tblGrid>
+      <w:tr>
+        <w:trPr>
+          <w:cantSplit/>
+          <w:tblHeader/>
+        </w:trPr>
+        <w:tc>
+          <w:tcPr>
+            <w:tcW w:w="300" w:type="pct"/>
+            <w:shd w:val="clear" w:color="auto" w:fill="F2CEED" w:themeFill="accent5" w:themeFillTint="33"/>
+            <w:tcMar>
+              <w:top w:w="30" w:type="dxa"/>
+              <w:left w:w="80" w:type="dxa"/>
+              <w:bottom w:w="30" w:type="dxa"/>
+              <w:right w:w="80" w:type="dxa"/>
+            </w:tcMar>
+          </w:tcPr>
+          <w:p>
+            <w:r>
+              <w:rPr>
+                <w:rFonts w:ascii="Aptos" w:eastAsia="Aptos" w:hAnsi="Aptos" w:cs="Aptos"/>
+                <w:b/>
+                <w:bCs/>
+                <w:sz w:val="20"/>
+                <w:szCs w:val="20"/>
+              </w:rPr>
+              <w:t xml:space="preserve">No.</w:t>
+            </w:r>
+          </w:p>
+        </w:tc>
+        <w:tc>
+          <w:tcPr>
+            <w:tcW w:w="1850" w:type="pct"/>
+            <w:shd w:val="clear" w:color="auto" w:fill="F2CEED" w:themeFill="accent5" w:themeFillTint="33"/>
+            <w:tcMar>
+              <w:top w:w="30" w:type="dxa"/>
+              <w:left w:w="80" w:type="dxa"/>
+              <w:bottom w:w="30" w:type="dxa"/>
+              <w:right w:w="80" w:type="dxa"/>
+            </w:tcMar>
+          </w:tcPr>
+          <w:p>
+            <w:r>
+              <w:rPr>
+                <w:rFonts w:ascii="Aptos" w:eastAsia="Aptos" w:hAnsi="Aptos" w:cs="Aptos"/>
+                <w:b/>
+                <w:bCs/>
+                <w:sz w:val="20"/>
+                <w:szCs w:val="20"/>
+              </w:rPr>
+              <w:t xml:space="preserve">Test</w:t>
+            </w:r>
+          </w:p>
+        </w:tc>
+        <w:tc>
+          <w:tcPr>
+            <w:tcW w:w="560" w:type="pct"/>
+            <w:shd w:val="clear" w:color="auto" w:fill="F2CEED" w:themeFill="accent5" w:themeFillTint="33"/>
+            <w:tcMar>
+              <w:top w:w="30" w:type="dxa"/>
+              <w:left w:w="80" w:type="dxa"/>
+              <w:bottom w:w="30" w:type="dxa"/>
+              <w:right w:w="80" w:type="dxa"/>
+            </w:tcMar>
+          </w:tcPr>
+          <w:p>
+            <w:r>
+              <w:rPr>
+                <w:rFonts w:ascii="Aptos" w:eastAsia="Aptos" w:hAnsi="Aptos" w:cs="Aptos"/>
+                <w:b/>
+                <w:bCs/>
+                <w:sz w:val="20"/>
+                <w:szCs w:val="20"/>
+              </w:rPr>
+              <w:t xml:space="preserve">Type</w:t>
+            </w:r>
+          </w:p>
+        </w:tc>
+        <w:tc>
+          <w:tcPr>
+            <w:tcW w:w="2290" w:type="pct"/>
+            <w:shd w:val="clear" w:color="auto" w:fill="F2CEED" w:themeFill="accent5" w:themeFillTint="33"/>
+            <w:tcMar>
+              <w:top w:w="30" w:type="dxa"/>
+              <w:left w:w="80" w:type="dxa"/>
+              <w:bottom w:w="30" w:type="dxa"/>
+              <w:right w:w="80" w:type="dxa"/>
+            </w:tcMar>
+          </w:tcPr>
+          <w:p>
+            <w:r>
+              <w:rPr>
+                <w:rFonts w:ascii="Aptos" w:eastAsia="Aptos" w:hAnsi="Aptos" w:cs="Aptos"/>
+                <w:b/>
+                <w:bCs/>
+                <w:sz w:val="20"/>
+                <w:szCs w:val="20"/>
+              </w:rPr>
+              <w:t xml:space="preserve">Expected Result</w:t>
+            </w:r>
+          </w:p>
+        </w:tc>
+      </w:tr>
+      <w:tr>
+        <w:trPr>
+          <w:cantSplit/>
+        </w:trPr>
+        <w:tc>
+          <w:tcPr>
+            <w:tcW w:w="300" w:type="pct"/>
+            <w:tcMar>
+              <w:top w:w="30" w:type="dxa"/>
+              <w:left w:w="80" w:type="dxa"/>
+              <w:bottom w:w="30" w:type="dxa"/>
+              <w:right w:w="80" w:type="dxa"/>
+            </w:tcMar>
+          </w:tcPr>
+          <w:p>
+            <w:r>
+              <w:rPr>
+                <w:rFonts w:ascii="Aptos" w:eastAsia="Aptos" w:hAnsi="Aptos" w:cs="Aptos"/>
+                <w:sz w:val="20"/>
+                <w:szCs w:val="20"/>
+              </w:rPr>
+              <w:t xml:space="preserve">23</w:t>
+            </w:r>
+          </w:p>
+        </w:tc>
+        <w:tc>
+          <w:tcPr>
+            <w:tcW w:w="1850" w:type="pct"/>
+            <w:tcMar>
+              <w:top w:w="30" w:type="dxa"/>
+              <w:left w:w="80" w:type="dxa"/>
+              <w:bottom w:w="30" w:type="dxa"/>
+              <w:right w:w="80" w:type="dxa"/>
+            </w:tcMar>
+          </w:tcPr>
+          <w:p>
+            <w:r>
+              <w:rPr>
+                <w:rFonts w:ascii="Aptos" w:eastAsia="Aptos" w:hAnsi="Aptos" w:cs="Aptos"/>
+                <w:sz w:val="20"/>
+                <w:szCs w:val="20"/>
+              </w:rPr>
+              <w:t xml:space="preserve">Without picking a film or a screen, press Add</w:t>
+            </w:r>
+          </w:p>
+        </w:tc>
+        <w:tc>
+          <w:tcPr>
+            <w:tcW w:w="560" w:type="pct"/>
+            <w:tcMar>
+              <w:top w:w="30" w:type="dxa"/>
+              <w:left w:w="80" w:type="dxa"/>
+              <w:bottom w:w="30" w:type="dxa"/>
+              <w:right w:w="80" w:type="dxa"/>
+            </w:tcMar>
+          </w:tcPr>
+          <w:p>
+            <w:r>
+              <w:rPr>
+                <w:rFonts w:ascii="Aptos" w:eastAsia="Aptos" w:hAnsi="Aptos" w:cs="Aptos"/>
+                <w:sz w:val="20"/>
+                <w:szCs w:val="20"/>
+              </w:rPr>
+              <w:t xml:space="preserve">Erroneous</w:t>
+            </w:r>
+          </w:p>
+        </w:tc>
+        <w:tc>
+          <w:tcPr>
+            <w:tcW w:w="2290" w:type="pct"/>
+            <w:tcMar>
+              <w:top w:w="30" w:type="dxa"/>
+              <w:left w:w="80" w:type="dxa"/>
+              <w:bottom w:w="30" w:type="dxa"/>
+              <w:right w:w="80" w:type="dxa"/>
+            </w:tcMar>
+          </w:tcPr>
+          <w:p>
+            <w:r>
+              <w:rPr>
+                <w:rFonts w:ascii="Aptos" w:eastAsia="Aptos" w:hAnsi="Aptos" w:cs="Aptos"/>
+                <w:sz w:val="20"/>
+                <w:szCs w:val="20"/>
+              </w:rPr>
+              <w:t xml:space="preserve">The screening is rejected and a message appears stating “Pick a film and a screen”.</w:t>
+            </w:r>
+          </w:p>
+        </w:tc>
+      </w:tr>
+      <w:tr>
+        <w:trPr>
+          <w:cantSplit/>
+        </w:trPr>
+        <w:tc>
+          <w:tcPr>
+            <w:tcW w:w="300" w:type="pct"/>
+            <w:tcMar>
+              <w:top w:w="30" w:type="dxa"/>
+              <w:left w:w="80" w:type="dxa"/>
+              <w:bottom w:w="30" w:type="dxa"/>
+              <w:right w:w="80" w:type="dxa"/>
+            </w:tcMar>
+          </w:tcPr>
+          <w:p>
+            <w:r>
+              <w:rPr>
+                <w:rFonts w:ascii="Aptos" w:eastAsia="Aptos" w:hAnsi="Aptos" w:cs="Aptos"/>
+                <w:sz w:val="20"/>
+                <w:szCs w:val="20"/>
+              </w:rPr>
+              <w:t xml:space="preserve">24</w:t>
+            </w:r>
+          </w:p>
+        </w:tc>
+        <w:tc>
+          <w:tcPr>
+            <w:tcW w:w="1850" w:type="pct"/>
+            <w:tcMar>
+              <w:top w:w="30" w:type="dxa"/>
+              <w:left w:w="80" w:type="dxa"/>
+              <w:bottom w:w="30" w:type="dxa"/>
+              <w:right w:w="80" w:type="dxa"/>
+            </w:tcMar>
+          </w:tcPr>
+          <w:p>
+            <w:r>
+              <w:rPr>
+                <w:rFonts w:ascii="Aptos" w:eastAsia="Aptos" w:hAnsi="Aptos" w:cs="Aptos"/>
+                <w:sz w:val="20"/>
+                <w:szCs w:val="20"/>
+              </w:rPr>
+              <w:t xml:space="preserve">Pick Inception and Screen 1, set the date to 01/01/2020, the time to 19:30 and the price to 9.00, then press Add</w:t>
+            </w:r>
+          </w:p>
+        </w:tc>
+        <w:tc>
+          <w:tcPr>
+            <w:tcW w:w="560" w:type="pct"/>
+            <w:tcMar>
+              <w:top w:w="30" w:type="dxa"/>
+              <w:left w:w="80" w:type="dxa"/>
+              <w:bottom w:w="30" w:type="dxa"/>
+              <w:right w:w="80" w:type="dxa"/>
+            </w:tcMar>
+          </w:tcPr>
+          <w:p>
+            <w:r>
+              <w:rPr>
+                <w:rFonts w:ascii="Aptos" w:eastAsia="Aptos" w:hAnsi="Aptos" w:cs="Aptos"/>
+                <w:sz w:val="20"/>
+                <w:szCs w:val="20"/>
+              </w:rPr>
+              <w:t xml:space="preserve">Erroneous</w:t>
+            </w:r>
+          </w:p>
+        </w:tc>
+        <w:tc>
+          <w:tcPr>
+            <w:tcW w:w="2290" w:type="pct"/>
+            <w:tcMar>
+              <w:top w:w="30" w:type="dxa"/>
+              <w:left w:w="80" w:type="dxa"/>
+              <w:bottom w:w="30" w:type="dxa"/>
+              <w:right w:w="80" w:type="dxa"/>
+            </w:tcMar>
+          </w:tcPr>
+          <w:p>
+            <w:r>
+              <w:rPr>
+                <w:rFonts w:ascii="Aptos" w:eastAsia="Aptos" w:hAnsi="Aptos" w:cs="Aptos"/>
+                <w:sz w:val="20"/>
+                <w:szCs w:val="20"/>
+              </w:rPr>
+              <w:t xml:space="preserve">The screening is rejected and a message appears stating “Screening date cant be in the past”.</w:t>
+            </w:r>
+          </w:p>
+        </w:tc>
+      </w:tr>
+      <w:tr>
+        <w:trPr>
+          <w:cantSplit/>
+        </w:trPr>
+        <w:tc>
+          <w:tcPr>
+            <w:tcW w:w="300" w:type="pct"/>
+            <w:tcMar>
+              <w:top w:w="30" w:type="dxa"/>
+              <w:left w:w="80" w:type="dxa"/>
+              <w:bottom w:w="30" w:type="dxa"/>
+              <w:right w:w="80" w:type="dxa"/>
+            </w:tcMar>
+          </w:tcPr>
+          <w:p>
+            <w:r>
+              <w:rPr>
+                <w:rFonts w:ascii="Aptos" w:eastAsia="Aptos" w:hAnsi="Aptos" w:cs="Aptos"/>
+                <w:sz w:val="20"/>
+                <w:szCs w:val="20"/>
+              </w:rPr>
+              <w:t xml:space="preserve">25</w:t>
+            </w:r>
+          </w:p>
+        </w:tc>
+        <w:tc>
+          <w:tcPr>
+            <w:tcW w:w="1850" w:type="pct"/>
+            <w:tcMar>
+              <w:top w:w="30" w:type="dxa"/>
+              <w:left w:w="80" w:type="dxa"/>
+              <w:bottom w:w="30" w:type="dxa"/>
+              <w:right w:w="80" w:type="dxa"/>
+            </w:tcMar>
+          </w:tcPr>
+          <w:p>
+            <w:r>
+              <w:rPr>
+                <w:rFonts w:ascii="Aptos" w:eastAsia="Aptos" w:hAnsi="Aptos" w:cs="Aptos"/>
+                <w:sz w:val="20"/>
+                <w:szCs w:val="20"/>
+              </w:rPr>
+              <w:t xml:space="preserve">Pick Inception and Screen 1, set the date to 20/07/2026, enter the time as 25:00 and the price as 9.00, then press Add</w:t>
+            </w:r>
+          </w:p>
+        </w:tc>
+        <w:tc>
+          <w:tcPr>
+            <w:tcW w:w="560" w:type="pct"/>
+            <w:tcMar>
+              <w:top w:w="30" w:type="dxa"/>
+              <w:left w:w="80" w:type="dxa"/>
+              <w:bottom w:w="30" w:type="dxa"/>
+              <w:right w:w="80" w:type="dxa"/>
+            </w:tcMar>
+          </w:tcPr>
+          <w:p>
+            <w:r>
+              <w:rPr>
+                <w:rFonts w:ascii="Aptos" w:eastAsia="Aptos" w:hAnsi="Aptos" w:cs="Aptos"/>
+                <w:sz w:val="20"/>
+                <w:szCs w:val="20"/>
+              </w:rPr>
+              <w:t xml:space="preserve">Erroneous</w:t>
+            </w:r>
+          </w:p>
+        </w:tc>
+        <w:tc>
+          <w:tcPr>
+            <w:tcW w:w="2290" w:type="pct"/>
+            <w:tcMar>
+              <w:top w:w="30" w:type="dxa"/>
+              <w:left w:w="80" w:type="dxa"/>
+              <w:bottom w:w="30" w:type="dxa"/>
+              <w:right w:w="80" w:type="dxa"/>
+            </w:tcMar>
+          </w:tcPr>
+          <w:p>
+            <w:r>
+              <w:rPr>
+                <w:rFonts w:ascii="Aptos" w:eastAsia="Aptos" w:hAnsi="Aptos" w:cs="Aptos"/>
+                <w:sz w:val="20"/>
+                <w:szCs w:val="20"/>
+              </w:rPr>
+              <w:t xml:space="preserve">The screening is rejected and a message appears stating “Screening time must be in HH:MM format, e.g. 14:30”, because 25 is not a valid hour.</w:t>
+            </w:r>
+          </w:p>
+        </w:tc>
+      </w:tr>
+      <w:tr>
+        <w:trPr>
+          <w:cantSplit/>
+        </w:trPr>
+        <w:tc>
+          <w:tcPr>
+            <w:tcW w:w="300" w:type="pct"/>
+            <w:tcMar>
+              <w:top w:w="30" w:type="dxa"/>
+              <w:left w:w="80" w:type="dxa"/>
+              <w:bottom w:w="30" w:type="dxa"/>
+              <w:right w:w="80" w:type="dxa"/>
+            </w:tcMar>
+          </w:tcPr>
+          <w:p>
+            <w:r>
+              <w:rPr>
+                <w:rFonts w:ascii="Aptos" w:eastAsia="Aptos" w:hAnsi="Aptos" w:cs="Aptos"/>
+                <w:sz w:val="20"/>
+                <w:szCs w:val="20"/>
+              </w:rPr>
+              <w:t xml:space="preserve">26</w:t>
+            </w:r>
+          </w:p>
+        </w:tc>
+        <w:tc>
+          <w:tcPr>
+            <w:tcW w:w="1850" w:type="pct"/>
+            <w:tcMar>
+              <w:top w:w="30" w:type="dxa"/>
+              <w:left w:w="80" w:type="dxa"/>
+              <w:bottom w:w="30" w:type="dxa"/>
+              <w:right w:w="80" w:type="dxa"/>
+            </w:tcMar>
+          </w:tcPr>
+          <w:p>
+            <w:r>
+              <w:rPr>
+                <w:rFonts w:ascii="Aptos" w:eastAsia="Aptos" w:hAnsi="Aptos" w:cs="Aptos"/>
+                <w:sz w:val="20"/>
+                <w:szCs w:val="20"/>
+              </w:rPr>
+              <w:t xml:space="preserve">Pick Inception and Screen 1, date 20/07/2026, time 19:30, enter a price of abc, then press Add</w:t>
+            </w:r>
+          </w:p>
+        </w:tc>
+        <w:tc>
+          <w:tcPr>
+            <w:tcW w:w="560" w:type="pct"/>
+            <w:tcMar>
+              <w:top w:w="30" w:type="dxa"/>
+              <w:left w:w="80" w:type="dxa"/>
+              <w:bottom w:w="30" w:type="dxa"/>
+              <w:right w:w="80" w:type="dxa"/>
+            </w:tcMar>
+          </w:tcPr>
+          <w:p>
+            <w:r>
+              <w:rPr>
+                <w:rFonts w:ascii="Aptos" w:eastAsia="Aptos" w:hAnsi="Aptos" w:cs="Aptos"/>
+                <w:sz w:val="20"/>
+                <w:szCs w:val="20"/>
+              </w:rPr>
+              <w:t xml:space="preserve">Erroneous</w:t>
+            </w:r>
+          </w:p>
+        </w:tc>
+        <w:tc>
+          <w:tcPr>
+            <w:tcW w:w="2290" w:type="pct"/>
+            <w:tcMar>
+              <w:top w:w="30" w:type="dxa"/>
+              <w:left w:w="80" w:type="dxa"/>
+              <w:bottom w:w="30" w:type="dxa"/>
+              <w:right w:w="80" w:type="dxa"/>
+            </w:tcMar>
+          </w:tcPr>
+          <w:p>
+            <w:r>
+              <w:rPr>
+                <w:rFonts w:ascii="Aptos" w:eastAsia="Aptos" w:hAnsi="Aptos" w:cs="Aptos"/>
+                <w:sz w:val="20"/>
+                <w:szCs w:val="20"/>
+              </w:rPr>
+              <w:t xml:space="preserve">The screening is rejected and a message appears stating “The ticket price must be a number.”.</w:t>
+            </w:r>
+          </w:p>
+        </w:tc>
+      </w:tr>
+      <w:tr>
+        <w:trPr>
+          <w:cantSplit/>
+        </w:trPr>
+        <w:tc>
+          <w:tcPr>
+            <w:tcW w:w="300" w:type="pct"/>
+            <w:tcMar>
+              <w:top w:w="30" w:type="dxa"/>
+              <w:left w:w="80" w:type="dxa"/>
+              <w:bottom w:w="30" w:type="dxa"/>
+              <w:right w:w="80" w:type="dxa"/>
+            </w:tcMar>
+          </w:tcPr>
+          <w:p>
+            <w:r>
+              <w:rPr>
+                <w:rFonts w:ascii="Aptos" w:eastAsia="Aptos" w:hAnsi="Aptos" w:cs="Aptos"/>
+                <w:sz w:val="20"/>
+                <w:szCs w:val="20"/>
+              </w:rPr>
+              <w:t xml:space="preserve">27</w:t>
+            </w:r>
+          </w:p>
+        </w:tc>
+        <w:tc>
+          <w:tcPr>
+            <w:tcW w:w="1850" w:type="pct"/>
+            <w:tcMar>
+              <w:top w:w="30" w:type="dxa"/>
+              <w:left w:w="80" w:type="dxa"/>
+              <w:bottom w:w="30" w:type="dxa"/>
+              <w:right w:w="80" w:type="dxa"/>
+            </w:tcMar>
+          </w:tcPr>
+          <w:p>
+            <w:r>
+              <w:rPr>
+                <w:rFonts w:ascii="Aptos" w:eastAsia="Aptos" w:hAnsi="Aptos" w:cs="Aptos"/>
+                <w:sz w:val="20"/>
+                <w:szCs w:val="20"/>
+              </w:rPr>
+              <w:t xml:space="preserve">Pick Inception and Screen 1, date 20/07/2026, time 19:30, enter a price of 0, then press Add</w:t>
+            </w:r>
+          </w:p>
+        </w:tc>
+        <w:tc>
+          <w:tcPr>
+            <w:tcW w:w="560" w:type="pct"/>
+            <w:tcMar>
+              <w:top w:w="30" w:type="dxa"/>
+              <w:left w:w="80" w:type="dxa"/>
+              <w:bottom w:w="30" w:type="dxa"/>
+              <w:right w:w="80" w:type="dxa"/>
+            </w:tcMar>
+          </w:tcPr>
+          <w:p>
+            <w:r>
+              <w:rPr>
+                <w:rFonts w:ascii="Aptos" w:eastAsia="Aptos" w:hAnsi="Aptos" w:cs="Aptos"/>
+                <w:sz w:val="20"/>
+                <w:szCs w:val="20"/>
+              </w:rPr>
+              <w:t xml:space="preserve">Erroneous</w:t>
+            </w:r>
+          </w:p>
+        </w:tc>
+        <w:tc>
+          <w:tcPr>
+            <w:tcW w:w="2290" w:type="pct"/>
+            <w:tcMar>
+              <w:top w:w="30" w:type="dxa"/>
+              <w:left w:w="80" w:type="dxa"/>
+              <w:bottom w:w="30" w:type="dxa"/>
+              <w:right w:w="80" w:type="dxa"/>
+            </w:tcMar>
+          </w:tcPr>
+          <w:p>
+            <w:r>
+              <w:rPr>
+                <w:rFonts w:ascii="Aptos" w:eastAsia="Aptos" w:hAnsi="Aptos" w:cs="Aptos"/>
+                <w:sz w:val="20"/>
+                <w:szCs w:val="20"/>
+              </w:rPr>
+              <w:t xml:space="preserve">The screening is rejected and a message appears stating “The ticket price must be greater than 0.”.</w:t>
+            </w:r>
+          </w:p>
+        </w:tc>
+      </w:tr>
+      <w:tr>
+        <w:trPr>
+          <w:cantSplit/>
+        </w:trPr>
+        <w:tc>
+          <w:tcPr>
+            <w:tcW w:w="300" w:type="pct"/>
+            <w:tcMar>
+              <w:top w:w="30" w:type="dxa"/>
+              <w:left w:w="80" w:type="dxa"/>
+              <w:bottom w:w="30" w:type="dxa"/>
+              <w:right w:w="80" w:type="dxa"/>
+            </w:tcMar>
+          </w:tcPr>
+          <w:p>
+            <w:r>
+              <w:rPr>
+                <w:rFonts w:ascii="Aptos" w:eastAsia="Aptos" w:hAnsi="Aptos" w:cs="Aptos"/>
+                <w:sz w:val="20"/>
+                <w:szCs w:val="20"/>
+              </w:rPr>
+              <w:t xml:space="preserve">28</w:t>
+            </w:r>
+          </w:p>
+        </w:tc>
+        <w:tc>
+          <w:tcPr>
+            <w:tcW w:w="1850" w:type="pct"/>
+            <w:tcMar>
+              <w:top w:w="30" w:type="dxa"/>
+              <w:left w:w="80" w:type="dxa"/>
+              <w:bottom w:w="30" w:type="dxa"/>
+              <w:right w:w="80" w:type="dxa"/>
+            </w:tcMar>
+          </w:tcPr>
+          <w:p>
+            <w:r>
+              <w:rPr>
+                <w:rFonts w:ascii="Aptos" w:eastAsia="Aptos" w:hAnsi="Aptos" w:cs="Aptos"/>
+                <w:sz w:val="20"/>
+                <w:szCs w:val="20"/>
+              </w:rPr>
+              <w:t xml:space="preserve">Pick Inception and Screen 1, date 20/07/2026, time 19:30, enter a price of 60, then press Add</w:t>
+            </w:r>
+          </w:p>
+        </w:tc>
+        <w:tc>
+          <w:tcPr>
+            <w:tcW w:w="560" w:type="pct"/>
+            <w:tcMar>
+              <w:top w:w="30" w:type="dxa"/>
+              <w:left w:w="80" w:type="dxa"/>
+              <w:bottom w:w="30" w:type="dxa"/>
+              <w:right w:w="80" w:type="dxa"/>
+            </w:tcMar>
+          </w:tcPr>
+          <w:p>
+            <w:r>
+              <w:rPr>
+                <w:rFonts w:ascii="Aptos" w:eastAsia="Aptos" w:hAnsi="Aptos" w:cs="Aptos"/>
+                <w:sz w:val="20"/>
+                <w:szCs w:val="20"/>
+              </w:rPr>
+              <w:t xml:space="preserve">Erroneous</w:t>
+            </w:r>
+          </w:p>
+        </w:tc>
+        <w:tc>
+          <w:tcPr>
+            <w:tcW w:w="2290" w:type="pct"/>
+            <w:tcMar>
+              <w:top w:w="30" w:type="dxa"/>
+              <w:left w:w="80" w:type="dxa"/>
+              <w:bottom w:w="30" w:type="dxa"/>
+              <w:right w:w="80" w:type="dxa"/>
+            </w:tcMar>
+          </w:tcPr>
+          <w:p>
+            <w:r>
+              <w:rPr>
+                <w:rFonts w:ascii="Aptos" w:eastAsia="Aptos" w:hAnsi="Aptos" w:cs="Aptos"/>
+                <w:sz w:val="20"/>
+                <w:szCs w:val="20"/>
+              </w:rPr>
+              <w:t xml:space="preserve">The screening is rejected and a message appears stating “Enter a ticket price in pounds, more than 0 and no more than 50”.</w:t>
+            </w:r>
+          </w:p>
+        </w:tc>
+      </w:tr>
+      <w:tr>
+        <w:trPr>
+          <w:cantSplit/>
+        </w:trPr>
+        <w:tc>
+          <w:tcPr>
+            <w:tcW w:w="300" w:type="pct"/>
+            <w:tcMar>
+              <w:top w:w="30" w:type="dxa"/>
+              <w:left w:w="80" w:type="dxa"/>
+              <w:bottom w:w="30" w:type="dxa"/>
+              <w:right w:w="80" w:type="dxa"/>
+            </w:tcMar>
+          </w:tcPr>
+          <w:p>
+            <w:r>
+              <w:rPr>
+                <w:rFonts w:ascii="Aptos" w:eastAsia="Aptos" w:hAnsi="Aptos" w:cs="Aptos"/>
+                <w:sz w:val="20"/>
+                <w:szCs w:val="20"/>
+              </w:rPr>
+              <w:t xml:space="preserve">29</w:t>
+            </w:r>
+          </w:p>
+        </w:tc>
+        <w:tc>
+          <w:tcPr>
+            <w:tcW w:w="1850" w:type="pct"/>
+            <w:tcMar>
+              <w:top w:w="30" w:type="dxa"/>
+              <w:left w:w="80" w:type="dxa"/>
+              <w:bottom w:w="30" w:type="dxa"/>
+              <w:right w:w="80" w:type="dxa"/>
+            </w:tcMar>
+          </w:tcPr>
+          <w:p>
+            <w:r>
+              <w:rPr>
+                <w:rFonts w:ascii="Aptos" w:eastAsia="Aptos" w:hAnsi="Aptos" w:cs="Aptos"/>
+                <w:sz w:val="20"/>
+                <w:szCs w:val="20"/>
+              </w:rPr>
+              <w:t xml:space="preserve">Pick Inception and Screen 1, date 20/07/2026, time 19:30, price 9.00, then press Add</w:t>
+            </w:r>
+          </w:p>
+        </w:tc>
+        <w:tc>
+          <w:tcPr>
+            <w:tcW w:w="560" w:type="pct"/>
+            <w:tcMar>
+              <w:top w:w="30" w:type="dxa"/>
+              <w:left w:w="80" w:type="dxa"/>
+              <w:bottom w:w="30" w:type="dxa"/>
+              <w:right w:w="80" w:type="dxa"/>
+            </w:tcMar>
+          </w:tcPr>
+          <w:p>
+            <w:r>
+              <w:rPr>
+                <w:rFonts w:ascii="Aptos" w:eastAsia="Aptos" w:hAnsi="Aptos" w:cs="Aptos"/>
+                <w:sz w:val="20"/>
+                <w:szCs w:val="20"/>
+              </w:rPr>
+              <w:t xml:space="preserve">Normal</w:t>
+            </w:r>
+          </w:p>
+        </w:tc>
+        <w:tc>
+          <w:tcPr>
+            <w:tcW w:w="2290" w:type="pct"/>
+            <w:tcMar>
+              <w:top w:w="30" w:type="dxa"/>
+              <w:left w:w="80" w:type="dxa"/>
+              <w:bottom w:w="30" w:type="dxa"/>
+              <w:right w:w="80" w:type="dxa"/>
+            </w:tcMar>
+          </w:tcPr>
+          <w:p>
+            <w:r>
+              <w:rPr>
+                <w:rFonts w:ascii="Aptos" w:eastAsia="Aptos" w:hAnsi="Aptos" w:cs="Aptos"/>
+                <w:sz w:val="20"/>
+                <w:szCs w:val="20"/>
+              </w:rPr>
+              <w:t xml:space="preserve">The screening is saved and appears in the grid showing Inception on Screen 1 at 19:30 priced at £9.00.</w:t>
+            </w:r>
+          </w:p>
+        </w:tc>
+      </w:tr>
+      <w:tr>
+        <w:trPr>
+          <w:cantSplit/>
+        </w:trPr>
+        <w:tc>
+          <w:tcPr>
+            <w:tcW w:w="300" w:type="pct"/>
+            <w:tcMar>
+              <w:top w:w="30" w:type="dxa"/>
+              <w:left w:w="80" w:type="dxa"/>
+              <w:bottom w:w="30" w:type="dxa"/>
+              <w:right w:w="80" w:type="dxa"/>
+            </w:tcMar>
+          </w:tcPr>
+          <w:p>
+            <w:r>
+              <w:rPr>
+                <w:rFonts w:ascii="Aptos" w:eastAsia="Aptos" w:hAnsi="Aptos" w:cs="Aptos"/>
+                <w:sz w:val="20"/>
+                <w:szCs w:val="20"/>
+              </w:rPr>
+              <w:t xml:space="preserve">30</w:t>
+            </w:r>
+          </w:p>
+        </w:tc>
+        <w:tc>
+          <w:tcPr>
+            <w:tcW w:w="1850" w:type="pct"/>
+            <w:tcMar>
+              <w:top w:w="30" w:type="dxa"/>
+              <w:left w:w="80" w:type="dxa"/>
+              <w:bottom w:w="30" w:type="dxa"/>
+              <w:right w:w="80" w:type="dxa"/>
+            </w:tcMar>
+          </w:tcPr>
+          <w:p>
+            <w:r>
+              <w:rPr>
+                <w:rFonts w:ascii="Aptos" w:eastAsia="Aptos" w:hAnsi="Aptos" w:cs="Aptos"/>
+                <w:sz w:val="20"/>
+                <w:szCs w:val="20"/>
+              </w:rPr>
+              <w:t xml:space="preserve">Pick Paddington 2 and Screen 2, date 21/07/2026, time 14:00, price 7.50, then press Add</w:t>
+            </w:r>
+          </w:p>
+        </w:tc>
+        <w:tc>
+          <w:tcPr>
+            <w:tcW w:w="560" w:type="pct"/>
+            <w:tcMar>
+              <w:top w:w="30" w:type="dxa"/>
+              <w:left w:w="80" w:type="dxa"/>
+              <w:bottom w:w="30" w:type="dxa"/>
+              <w:right w:w="80" w:type="dxa"/>
+            </w:tcMar>
+          </w:tcPr>
+          <w:p>
+            <w:r>
+              <w:rPr>
+                <w:rFonts w:ascii="Aptos" w:eastAsia="Aptos" w:hAnsi="Aptos" w:cs="Aptos"/>
+                <w:sz w:val="20"/>
+                <w:szCs w:val="20"/>
+              </w:rPr>
+              <w:t xml:space="preserve">Normal</w:t>
+            </w:r>
+          </w:p>
+        </w:tc>
+        <w:tc>
+          <w:tcPr>
+            <w:tcW w:w="2290" w:type="pct"/>
+            <w:tcMar>
+              <w:top w:w="30" w:type="dxa"/>
+              <w:left w:w="80" w:type="dxa"/>
+              <w:bottom w:w="30" w:type="dxa"/>
+              <w:right w:w="80" w:type="dxa"/>
+            </w:tcMar>
+          </w:tcPr>
+          <w:p>
+            <w:r>
+              <w:rPr>
+                <w:rFonts w:ascii="Aptos" w:eastAsia="Aptos" w:hAnsi="Aptos" w:cs="Aptos"/>
+                <w:sz w:val="20"/>
+                <w:szCs w:val="20"/>
+              </w:rPr>
+              <w:t xml:space="preserve">The screening is saved and appears in the grid showing Paddington 2 on Screen 2.</w:t>
+            </w:r>
+          </w:p>
+        </w:tc>
+      </w:tr>
+      <w:tr>
+        <w:trPr>
+          <w:cantSplit/>
+        </w:trPr>
+        <w:tc>
+          <w:tcPr>
+            <w:tcW w:w="300" w:type="pct"/>
+            <w:tcMar>
+              <w:top w:w="30" w:type="dxa"/>
+              <w:left w:w="80" w:type="dxa"/>
+              <w:bottom w:w="30" w:type="dxa"/>
+              <w:right w:w="80" w:type="dxa"/>
+            </w:tcMar>
+          </w:tcPr>
+          <w:p>
+            <w:r>
+              <w:rPr>
+                <w:rFonts w:ascii="Aptos" w:eastAsia="Aptos" w:hAnsi="Aptos" w:cs="Aptos"/>
+                <w:sz w:val="20"/>
+                <w:szCs w:val="20"/>
+              </w:rPr>
+              <w:t xml:space="preserve">31</w:t>
+            </w:r>
+          </w:p>
+        </w:tc>
+        <w:tc>
+          <w:tcPr>
+            <w:tcW w:w="1850" w:type="pct"/>
+            <w:tcMar>
+              <w:top w:w="30" w:type="dxa"/>
+              <w:left w:w="80" w:type="dxa"/>
+              <w:bottom w:w="30" w:type="dxa"/>
+              <w:right w:w="80" w:type="dxa"/>
+            </w:tcMar>
+          </w:tcPr>
+          <w:p>
+            <w:r>
+              <w:rPr>
+                <w:rFonts w:ascii="Aptos" w:eastAsia="Aptos" w:hAnsi="Aptos" w:cs="Aptos"/>
+                <w:sz w:val="20"/>
+                <w:szCs w:val="20"/>
+              </w:rPr>
+              <w:t xml:space="preserve">Pick Inception and Screen 1, date 20/07/2026, time 22:30, price 9.00, then press Add</w:t>
+            </w:r>
+          </w:p>
+        </w:tc>
+        <w:tc>
+          <w:tcPr>
+            <w:tcW w:w="560" w:type="pct"/>
+            <w:tcMar>
+              <w:top w:w="30" w:type="dxa"/>
+              <w:left w:w="80" w:type="dxa"/>
+              <w:bottom w:w="30" w:type="dxa"/>
+              <w:right w:w="80" w:type="dxa"/>
+            </w:tcMar>
+          </w:tcPr>
+          <w:p>
+            <w:r>
+              <w:rPr>
+                <w:rFonts w:ascii="Aptos" w:eastAsia="Aptos" w:hAnsi="Aptos" w:cs="Aptos"/>
+                <w:sz w:val="20"/>
+                <w:szCs w:val="20"/>
+              </w:rPr>
+              <w:t xml:space="preserve">Erroneous</w:t>
+            </w:r>
+          </w:p>
+        </w:tc>
+        <w:tc>
+          <w:tcPr>
+            <w:tcW w:w="2290" w:type="pct"/>
+            <w:tcMar>
+              <w:top w:w="30" w:type="dxa"/>
+              <w:left w:w="80" w:type="dxa"/>
+              <w:bottom w:w="30" w:type="dxa"/>
+              <w:right w:w="80" w:type="dxa"/>
+            </w:tcMar>
+          </w:tcPr>
+          <w:p>
+            <w:r>
+              <w:rPr>
+                <w:rFonts w:ascii="Aptos" w:eastAsia="Aptos" w:hAnsi="Aptos" w:cs="Aptos"/>
+                <w:sz w:val="20"/>
+                <w:szCs w:val="20"/>
+              </w:rPr>
+              <w:t xml:space="preserve">The screening is rejected and a message appears stating that the screen is already showing Inception, because the 19:30 screening needs the screen until 22:33 once the 20 minutes of trailers and the 15 minute turnaround are counted.</w:t>
+            </w:r>
+          </w:p>
+        </w:tc>
+      </w:tr>
+      <w:tr>
+        <w:trPr>
+          <w:cantSplit/>
+        </w:trPr>
+        <w:tc>
+          <w:tcPr>
+            <w:tcW w:w="300" w:type="pct"/>
+            <w:tcMar>
+              <w:top w:w="30" w:type="dxa"/>
+              <w:left w:w="80" w:type="dxa"/>
+              <w:bottom w:w="30" w:type="dxa"/>
+              <w:right w:w="80" w:type="dxa"/>
+            </w:tcMar>
+          </w:tcPr>
+          <w:p>
+            <w:r>
+              <w:rPr>
+                <w:rFonts w:ascii="Aptos" w:eastAsia="Aptos" w:hAnsi="Aptos" w:cs="Aptos"/>
+                <w:sz w:val="20"/>
+                <w:szCs w:val="20"/>
+              </w:rPr>
+              <w:t xml:space="preserve">32</w:t>
+            </w:r>
+          </w:p>
+        </w:tc>
+        <w:tc>
+          <w:tcPr>
+            <w:tcW w:w="1850" w:type="pct"/>
+            <w:tcMar>
+              <w:top w:w="30" w:type="dxa"/>
+              <w:left w:w="80" w:type="dxa"/>
+              <w:bottom w:w="30" w:type="dxa"/>
+              <w:right w:w="80" w:type="dxa"/>
+            </w:tcMar>
+          </w:tcPr>
+          <w:p>
+            <w:r>
+              <w:rPr>
+                <w:rFonts w:ascii="Aptos" w:eastAsia="Aptos" w:hAnsi="Aptos" w:cs="Aptos"/>
+                <w:sz w:val="20"/>
+                <w:szCs w:val="20"/>
+              </w:rPr>
+              <w:t xml:space="preserve">Pick Inception and Screen 1, date 20/07/2026, time 22:33, price 9.00, then press Add</w:t>
+            </w:r>
+          </w:p>
+        </w:tc>
+        <w:tc>
+          <w:tcPr>
+            <w:tcW w:w="560" w:type="pct"/>
+            <w:tcMar>
+              <w:top w:w="30" w:type="dxa"/>
+              <w:left w:w="80" w:type="dxa"/>
+              <w:bottom w:w="30" w:type="dxa"/>
+              <w:right w:w="80" w:type="dxa"/>
+            </w:tcMar>
+          </w:tcPr>
+          <w:p>
+            <w:r>
+              <w:rPr>
+                <w:rFonts w:ascii="Aptos" w:eastAsia="Aptos" w:hAnsi="Aptos" w:cs="Aptos"/>
+                <w:sz w:val="20"/>
+                <w:szCs w:val="20"/>
+              </w:rPr>
+              <w:t xml:space="preserve">Boundary</w:t>
+            </w:r>
+          </w:p>
+        </w:tc>
+        <w:tc>
+          <w:tcPr>
+            <w:tcW w:w="2290" w:type="pct"/>
+            <w:tcMar>
+              <w:top w:w="30" w:type="dxa"/>
+              <w:left w:w="80" w:type="dxa"/>
+              <w:bottom w:w="30" w:type="dxa"/>
+              <w:right w:w="80" w:type="dxa"/>
+            </w:tcMar>
+          </w:tcPr>
+          <w:p>
+            <w:r>
+              <w:rPr>
+                <w:rFonts w:ascii="Aptos" w:eastAsia="Aptos" w:hAnsi="Aptos" w:cs="Aptos"/>
+                <w:sz w:val="20"/>
+                <w:szCs w:val="20"/>
+              </w:rPr>
+              <w:t xml:space="preserve">The screening is accepted, because 22:33 is the exact minute the screen becomes free again. This screening is deleted afterwards so that the later booking and report tests still work from the four bookings described in the test data.</w:t>
+            </w:r>
+          </w:p>
+        </w:tc>
+      </w:tr>
+      <w:tr>
+        <w:trPr>
+          <w:cantSplit/>
+        </w:trPr>
+        <w:tc>
+          <w:tcPr>
+            <w:tcW w:w="300" w:type="pct"/>
+            <w:tcMar>
+              <w:top w:w="30" w:type="dxa"/>
+              <w:left w:w="80" w:type="dxa"/>
+              <w:bottom w:w="30" w:type="dxa"/>
+              <w:right w:w="80" w:type="dxa"/>
+            </w:tcMar>
+          </w:tcPr>
+          <w:p>
+            <w:r>
+              <w:rPr>
+                <w:rFonts w:ascii="Aptos" w:eastAsia="Aptos" w:hAnsi="Aptos" w:cs="Aptos"/>
+                <w:sz w:val="20"/>
+                <w:szCs w:val="20"/>
+              </w:rPr>
+              <w:t xml:space="preserve">33</w:t>
+            </w:r>
+          </w:p>
+        </w:tc>
+        <w:tc>
+          <w:tcPr>
+            <w:tcW w:w="1850" w:type="pct"/>
+            <w:tcMar>
+              <w:top w:w="30" w:type="dxa"/>
+              <w:left w:w="80" w:type="dxa"/>
+              <w:bottom w:w="30" w:type="dxa"/>
+              <w:right w:w="80" w:type="dxa"/>
+            </w:tcMar>
+          </w:tcPr>
+          <w:p>
+            <w:r>
+              <w:rPr>
+                <w:rFonts w:ascii="Aptos" w:eastAsia="Aptos" w:hAnsi="Aptos" w:cs="Aptos"/>
+                <w:sz w:val="20"/>
+                <w:szCs w:val="20"/>
+              </w:rPr>
+              <w:t xml:space="preserve">Pick Paddington 2 and Small Screen, a future date, time 14:00, enter a price of 50.00, then press Add</w:t>
+            </w:r>
+          </w:p>
+        </w:tc>
+        <w:tc>
+          <w:tcPr>
+            <w:tcW w:w="560" w:type="pct"/>
+            <w:tcMar>
+              <w:top w:w="30" w:type="dxa"/>
+              <w:left w:w="80" w:type="dxa"/>
+              <w:bottom w:w="30" w:type="dxa"/>
+              <w:right w:w="80" w:type="dxa"/>
+            </w:tcMar>
+          </w:tcPr>
+          <w:p>
+            <w:r>
+              <w:rPr>
+                <w:rFonts w:ascii="Aptos" w:eastAsia="Aptos" w:hAnsi="Aptos" w:cs="Aptos"/>
+                <w:sz w:val="20"/>
+                <w:szCs w:val="20"/>
+              </w:rPr>
+              <w:t xml:space="preserve">Boundary</w:t>
+            </w:r>
+          </w:p>
+        </w:tc>
+        <w:tc>
+          <w:tcPr>
+            <w:tcW w:w="2290" w:type="pct"/>
+            <w:tcMar>
+              <w:top w:w="30" w:type="dxa"/>
+              <w:left w:w="80" w:type="dxa"/>
+              <w:bottom w:w="30" w:type="dxa"/>
+              <w:right w:w="80" w:type="dxa"/>
+            </w:tcMar>
+          </w:tcPr>
+          <w:p>
+            <w:r>
+              <w:rPr>
+                <w:rFonts w:ascii="Aptos" w:eastAsia="Aptos" w:hAnsi="Aptos" w:cs="Aptos"/>
+                <w:sz w:val="20"/>
+                <w:szCs w:val="20"/>
+              </w:rPr>
+              <w:t xml:space="preserve">The screening is accepted, because 50.00 is the highest ticket price the validation allows.</w:t>
             </w:r>
           </w:p>
         </w:tc>

</xml_diff>

<commit_message>
added objective 1: adding new customer bookings
</commit_message>
<xml_diff>
--- a/Testing.docx
+++ b/Testing.docx
@@ -3576,6 +3576,1230 @@
                 <w:szCs w:val="20"/>
               </w:rPr>
               <w:t xml:space="preserve">The screening is accepted, because 50.00 is the highest ticket price the validation allows.</w:t>
+            </w:r>
+          </w:p>
+        </w:tc>
+      </w:tr>
+    </w:tbl>
+    <w:p>
+      <w:r>
+        <w:rPr>
+          <w:rFonts w:ascii="Aptos" w:eastAsia="Aptos" w:hAnsi="Aptos" w:cs="Aptos"/>
+        </w:rPr>
+        <w:t xml:space="preserve"/>
+      </w:r>
+    </w:p>
+    <w:p>
+      <w:pPr>
+        <w:pStyle w:val="Heading3"/>
+      </w:pPr>
+      <w:r>
+        <w:rPr>
+          <w:rFonts w:ascii="Aptos Display" w:eastAsia="Aptos Display" w:hAnsi="Aptos Display" w:cs="Aptos Display"/>
+          <w:b/>
+          <w:bCs/>
+          <w:color w:val="000000"/>
+        </w:rPr>
+        <w:t xml:space="preserve">Objective 1: Adding New Customer Bookings</w:t>
+      </w:r>
+    </w:p>
+    <w:p>
+      <w:r>
+        <w:rPr>
+          <w:rFonts w:ascii="Aptos" w:eastAsia="Aptos" w:hAnsi="Aptos" w:cs="Aptos"/>
+        </w:rPr>
+        <w:t xml:space="preserve">Before bookings can be made the customers must exist, so a set of customers is added first and then the bookings are created against the two screenings. Three customers share the surname Smith so that the search objective can be tested later against a known answer.</w:t>
+      </w:r>
+    </w:p>
+    <w:tbl>
+      <w:tblPr>
+        <w:tblW w:w="5000" w:type="pct"/>
+        <w:tblBorders>
+          <w:top w:val="single" w:sz="4" w:space="0" w:color="808080"/>
+          <w:left w:val="single" w:sz="4" w:space="0" w:color="808080"/>
+          <w:bottom w:val="single" w:sz="4" w:space="0" w:color="808080"/>
+          <w:right w:val="single" w:sz="4" w:space="0" w:color="808080"/>
+          <w:insideH w:val="single" w:sz="4" w:space="0" w:color="808080"/>
+          <w:insideV w:val="single" w:sz="4" w:space="0" w:color="808080"/>
+        </w:tblBorders>
+        <w:tblCellMar>
+          <w:left w:w="10" w:type="dxa"/>
+          <w:right w:w="10" w:type="dxa"/>
+        </w:tblCellMar>
+        <w:tblLook w:val="0000" w:firstRow="0" w:lastRow="0" w:firstColumn="0" w:lastColumn="0" w:noHBand="0" w:noVBand="0"/>
+      </w:tblPr>
+      <w:tblGrid>
+        <w:gridCol w:w="561"/>
+        <w:gridCol w:w="3460"/>
+        <w:gridCol w:w="1047"/>
+        <w:gridCol w:w="4282"/>
+      </w:tblGrid>
+      <w:tr>
+        <w:trPr>
+          <w:cantSplit/>
+          <w:tblHeader/>
+        </w:trPr>
+        <w:tc>
+          <w:tcPr>
+            <w:tcW w:w="300" w:type="pct"/>
+            <w:shd w:val="clear" w:color="auto" w:fill="F2CEED" w:themeFill="accent5" w:themeFillTint="33"/>
+            <w:tcMar>
+              <w:top w:w="30" w:type="dxa"/>
+              <w:left w:w="80" w:type="dxa"/>
+              <w:bottom w:w="30" w:type="dxa"/>
+              <w:right w:w="80" w:type="dxa"/>
+            </w:tcMar>
+          </w:tcPr>
+          <w:p>
+            <w:r>
+              <w:rPr>
+                <w:rFonts w:ascii="Aptos" w:eastAsia="Aptos" w:hAnsi="Aptos" w:cs="Aptos"/>
+                <w:b/>
+                <w:bCs/>
+                <w:sz w:val="20"/>
+                <w:szCs w:val="20"/>
+              </w:rPr>
+              <w:t xml:space="preserve">No.</w:t>
+            </w:r>
+          </w:p>
+        </w:tc>
+        <w:tc>
+          <w:tcPr>
+            <w:tcW w:w="1850" w:type="pct"/>
+            <w:shd w:val="clear" w:color="auto" w:fill="F2CEED" w:themeFill="accent5" w:themeFillTint="33"/>
+            <w:tcMar>
+              <w:top w:w="30" w:type="dxa"/>
+              <w:left w:w="80" w:type="dxa"/>
+              <w:bottom w:w="30" w:type="dxa"/>
+              <w:right w:w="80" w:type="dxa"/>
+            </w:tcMar>
+          </w:tcPr>
+          <w:p>
+            <w:r>
+              <w:rPr>
+                <w:rFonts w:ascii="Aptos" w:eastAsia="Aptos" w:hAnsi="Aptos" w:cs="Aptos"/>
+                <w:b/>
+                <w:bCs/>
+                <w:sz w:val="20"/>
+                <w:szCs w:val="20"/>
+              </w:rPr>
+              <w:t xml:space="preserve">Test</w:t>
+            </w:r>
+          </w:p>
+        </w:tc>
+        <w:tc>
+          <w:tcPr>
+            <w:tcW w:w="560" w:type="pct"/>
+            <w:shd w:val="clear" w:color="auto" w:fill="F2CEED" w:themeFill="accent5" w:themeFillTint="33"/>
+            <w:tcMar>
+              <w:top w:w="30" w:type="dxa"/>
+              <w:left w:w="80" w:type="dxa"/>
+              <w:bottom w:w="30" w:type="dxa"/>
+              <w:right w:w="80" w:type="dxa"/>
+            </w:tcMar>
+          </w:tcPr>
+          <w:p>
+            <w:r>
+              <w:rPr>
+                <w:rFonts w:ascii="Aptos" w:eastAsia="Aptos" w:hAnsi="Aptos" w:cs="Aptos"/>
+                <w:b/>
+                <w:bCs/>
+                <w:sz w:val="20"/>
+                <w:szCs w:val="20"/>
+              </w:rPr>
+              <w:t xml:space="preserve">Type</w:t>
+            </w:r>
+          </w:p>
+        </w:tc>
+        <w:tc>
+          <w:tcPr>
+            <w:tcW w:w="2290" w:type="pct"/>
+            <w:shd w:val="clear" w:color="auto" w:fill="F2CEED" w:themeFill="accent5" w:themeFillTint="33"/>
+            <w:tcMar>
+              <w:top w:w="30" w:type="dxa"/>
+              <w:left w:w="80" w:type="dxa"/>
+              <w:bottom w:w="30" w:type="dxa"/>
+              <w:right w:w="80" w:type="dxa"/>
+            </w:tcMar>
+          </w:tcPr>
+          <w:p>
+            <w:r>
+              <w:rPr>
+                <w:rFonts w:ascii="Aptos" w:eastAsia="Aptos" w:hAnsi="Aptos" w:cs="Aptos"/>
+                <w:b/>
+                <w:bCs/>
+                <w:sz w:val="20"/>
+                <w:szCs w:val="20"/>
+              </w:rPr>
+              <w:t xml:space="preserve">Expected Result</w:t>
+            </w:r>
+          </w:p>
+        </w:tc>
+      </w:tr>
+      <w:tr>
+        <w:trPr>
+          <w:cantSplit/>
+        </w:trPr>
+        <w:tc>
+          <w:tcPr>
+            <w:tcW w:w="300" w:type="pct"/>
+            <w:tcMar>
+              <w:top w:w="30" w:type="dxa"/>
+              <w:left w:w="80" w:type="dxa"/>
+              <w:bottom w:w="30" w:type="dxa"/>
+              <w:right w:w="80" w:type="dxa"/>
+            </w:tcMar>
+          </w:tcPr>
+          <w:p>
+            <w:r>
+              <w:rPr>
+                <w:rFonts w:ascii="Aptos" w:eastAsia="Aptos" w:hAnsi="Aptos" w:cs="Aptos"/>
+                <w:sz w:val="20"/>
+                <w:szCs w:val="20"/>
+              </w:rPr>
+              <w:t xml:space="preserve">34</w:t>
+            </w:r>
+          </w:p>
+        </w:tc>
+        <w:tc>
+          <w:tcPr>
+            <w:tcW w:w="1850" w:type="pct"/>
+            <w:tcMar>
+              <w:top w:w="30" w:type="dxa"/>
+              <w:left w:w="80" w:type="dxa"/>
+              <w:bottom w:w="30" w:type="dxa"/>
+              <w:right w:w="80" w:type="dxa"/>
+            </w:tcMar>
+          </w:tcPr>
+          <w:p>
+            <w:r>
+              <w:rPr>
+                <w:rFonts w:ascii="Aptos" w:eastAsia="Aptos" w:hAnsi="Aptos" w:cs="Aptos"/>
+                <w:sz w:val="20"/>
+                <w:szCs w:val="20"/>
+              </w:rPr>
+              <w:t xml:space="preserve">On the Customers form, leave the forename blank, enter the surname Smith with a valid email and phone number, then press Add</w:t>
+            </w:r>
+          </w:p>
+        </w:tc>
+        <w:tc>
+          <w:tcPr>
+            <w:tcW w:w="560" w:type="pct"/>
+            <w:tcMar>
+              <w:top w:w="30" w:type="dxa"/>
+              <w:left w:w="80" w:type="dxa"/>
+              <w:bottom w:w="30" w:type="dxa"/>
+              <w:right w:w="80" w:type="dxa"/>
+            </w:tcMar>
+          </w:tcPr>
+          <w:p>
+            <w:r>
+              <w:rPr>
+                <w:rFonts w:ascii="Aptos" w:eastAsia="Aptos" w:hAnsi="Aptos" w:cs="Aptos"/>
+                <w:sz w:val="20"/>
+                <w:szCs w:val="20"/>
+              </w:rPr>
+              <w:t xml:space="preserve">Erroneous</w:t>
+            </w:r>
+          </w:p>
+        </w:tc>
+        <w:tc>
+          <w:tcPr>
+            <w:tcW w:w="2290" w:type="pct"/>
+            <w:tcMar>
+              <w:top w:w="30" w:type="dxa"/>
+              <w:left w:w="80" w:type="dxa"/>
+              <w:bottom w:w="30" w:type="dxa"/>
+              <w:right w:w="80" w:type="dxa"/>
+            </w:tcMar>
+          </w:tcPr>
+          <w:p>
+            <w:r>
+              <w:rPr>
+                <w:rFonts w:ascii="Aptos" w:eastAsia="Aptos" w:hAnsi="Aptos" w:cs="Aptos"/>
+                <w:sz w:val="20"/>
+                <w:szCs w:val="20"/>
+              </w:rPr>
+              <w:t xml:space="preserve">The customer is rejected and a message appears stating “Enter a forename”.</w:t>
+            </w:r>
+          </w:p>
+        </w:tc>
+      </w:tr>
+      <w:tr>
+        <w:trPr>
+          <w:cantSplit/>
+        </w:trPr>
+        <w:tc>
+          <w:tcPr>
+            <w:tcW w:w="300" w:type="pct"/>
+            <w:tcMar>
+              <w:top w:w="30" w:type="dxa"/>
+              <w:left w:w="80" w:type="dxa"/>
+              <w:bottom w:w="30" w:type="dxa"/>
+              <w:right w:w="80" w:type="dxa"/>
+            </w:tcMar>
+          </w:tcPr>
+          <w:p>
+            <w:r>
+              <w:rPr>
+                <w:rFonts w:ascii="Aptos" w:eastAsia="Aptos" w:hAnsi="Aptos" w:cs="Aptos"/>
+                <w:sz w:val="20"/>
+                <w:szCs w:val="20"/>
+              </w:rPr>
+              <w:t xml:space="preserve">35</w:t>
+            </w:r>
+          </w:p>
+        </w:tc>
+        <w:tc>
+          <w:tcPr>
+            <w:tcW w:w="1850" w:type="pct"/>
+            <w:tcMar>
+              <w:top w:w="30" w:type="dxa"/>
+              <w:left w:w="80" w:type="dxa"/>
+              <w:bottom w:w="30" w:type="dxa"/>
+              <w:right w:w="80" w:type="dxa"/>
+            </w:tcMar>
+          </w:tcPr>
+          <w:p>
+            <w:r>
+              <w:rPr>
+                <w:rFonts w:ascii="Aptos" w:eastAsia="Aptos" w:hAnsi="Aptos" w:cs="Aptos"/>
+                <w:sz w:val="20"/>
+                <w:szCs w:val="20"/>
+              </w:rPr>
+              <w:t xml:space="preserve">On the Customers form, enter the forename John and leave the surname blank, then press Add</w:t>
+            </w:r>
+          </w:p>
+        </w:tc>
+        <w:tc>
+          <w:tcPr>
+            <w:tcW w:w="560" w:type="pct"/>
+            <w:tcMar>
+              <w:top w:w="30" w:type="dxa"/>
+              <w:left w:w="80" w:type="dxa"/>
+              <w:bottom w:w="30" w:type="dxa"/>
+              <w:right w:w="80" w:type="dxa"/>
+            </w:tcMar>
+          </w:tcPr>
+          <w:p>
+            <w:r>
+              <w:rPr>
+                <w:rFonts w:ascii="Aptos" w:eastAsia="Aptos" w:hAnsi="Aptos" w:cs="Aptos"/>
+                <w:sz w:val="20"/>
+                <w:szCs w:val="20"/>
+              </w:rPr>
+              <w:t xml:space="preserve">Erroneous</w:t>
+            </w:r>
+          </w:p>
+        </w:tc>
+        <w:tc>
+          <w:tcPr>
+            <w:tcW w:w="2290" w:type="pct"/>
+            <w:tcMar>
+              <w:top w:w="30" w:type="dxa"/>
+              <w:left w:w="80" w:type="dxa"/>
+              <w:bottom w:w="30" w:type="dxa"/>
+              <w:right w:w="80" w:type="dxa"/>
+            </w:tcMar>
+          </w:tcPr>
+          <w:p>
+            <w:r>
+              <w:rPr>
+                <w:rFonts w:ascii="Aptos" w:eastAsia="Aptos" w:hAnsi="Aptos" w:cs="Aptos"/>
+                <w:sz w:val="20"/>
+                <w:szCs w:val="20"/>
+              </w:rPr>
+              <w:t xml:space="preserve">The customer is rejected and a message appears stating “Enter a surname”.</w:t>
+            </w:r>
+          </w:p>
+        </w:tc>
+      </w:tr>
+      <w:tr>
+        <w:trPr>
+          <w:cantSplit/>
+        </w:trPr>
+        <w:tc>
+          <w:tcPr>
+            <w:tcW w:w="300" w:type="pct"/>
+            <w:tcMar>
+              <w:top w:w="30" w:type="dxa"/>
+              <w:left w:w="80" w:type="dxa"/>
+              <w:bottom w:w="30" w:type="dxa"/>
+              <w:right w:w="80" w:type="dxa"/>
+            </w:tcMar>
+          </w:tcPr>
+          <w:p>
+            <w:r>
+              <w:rPr>
+                <w:rFonts w:ascii="Aptos" w:eastAsia="Aptos" w:hAnsi="Aptos" w:cs="Aptos"/>
+                <w:sz w:val="20"/>
+                <w:szCs w:val="20"/>
+              </w:rPr>
+              <w:t xml:space="preserve">36</w:t>
+            </w:r>
+          </w:p>
+        </w:tc>
+        <w:tc>
+          <w:tcPr>
+            <w:tcW w:w="1850" w:type="pct"/>
+            <w:tcMar>
+              <w:top w:w="30" w:type="dxa"/>
+              <w:left w:w="80" w:type="dxa"/>
+              <w:bottom w:w="30" w:type="dxa"/>
+              <w:right w:w="80" w:type="dxa"/>
+            </w:tcMar>
+          </w:tcPr>
+          <w:p>
+            <w:r>
+              <w:rPr>
+                <w:rFonts w:ascii="Aptos" w:eastAsia="Aptos" w:hAnsi="Aptos" w:cs="Aptos"/>
+                <w:sz w:val="20"/>
+                <w:szCs w:val="20"/>
+              </w:rPr>
+              <w:t xml:space="preserve">On the Customers form, enter forename John, surname Smith, email john.smith@email.com, phone 07123456789, then press Add</w:t>
+            </w:r>
+          </w:p>
+        </w:tc>
+        <w:tc>
+          <w:tcPr>
+            <w:tcW w:w="560" w:type="pct"/>
+            <w:tcMar>
+              <w:top w:w="30" w:type="dxa"/>
+              <w:left w:w="80" w:type="dxa"/>
+              <w:bottom w:w="30" w:type="dxa"/>
+              <w:right w:w="80" w:type="dxa"/>
+            </w:tcMar>
+          </w:tcPr>
+          <w:p>
+            <w:r>
+              <w:rPr>
+                <w:rFonts w:ascii="Aptos" w:eastAsia="Aptos" w:hAnsi="Aptos" w:cs="Aptos"/>
+                <w:sz w:val="20"/>
+                <w:szCs w:val="20"/>
+              </w:rPr>
+              <w:t xml:space="preserve">Normal</w:t>
+            </w:r>
+          </w:p>
+        </w:tc>
+        <w:tc>
+          <w:tcPr>
+            <w:tcW w:w="2290" w:type="pct"/>
+            <w:tcMar>
+              <w:top w:w="30" w:type="dxa"/>
+              <w:left w:w="80" w:type="dxa"/>
+              <w:bottom w:w="30" w:type="dxa"/>
+              <w:right w:w="80" w:type="dxa"/>
+            </w:tcMar>
+          </w:tcPr>
+          <w:p>
+            <w:r>
+              <w:rPr>
+                <w:rFonts w:ascii="Aptos" w:eastAsia="Aptos" w:hAnsi="Aptos" w:cs="Aptos"/>
+                <w:sz w:val="20"/>
+                <w:szCs w:val="20"/>
+              </w:rPr>
+              <w:t xml:space="preserve">The customer John Smith is saved to tblCustomer and appears in the customers grid.</w:t>
+            </w:r>
+          </w:p>
+        </w:tc>
+      </w:tr>
+      <w:tr>
+        <w:trPr>
+          <w:cantSplit/>
+        </w:trPr>
+        <w:tc>
+          <w:tcPr>
+            <w:tcW w:w="300" w:type="pct"/>
+            <w:tcMar>
+              <w:top w:w="30" w:type="dxa"/>
+              <w:left w:w="80" w:type="dxa"/>
+              <w:bottom w:w="30" w:type="dxa"/>
+              <w:right w:w="80" w:type="dxa"/>
+            </w:tcMar>
+          </w:tcPr>
+          <w:p>
+            <w:r>
+              <w:rPr>
+                <w:rFonts w:ascii="Aptos" w:eastAsia="Aptos" w:hAnsi="Aptos" w:cs="Aptos"/>
+                <w:sz w:val="20"/>
+                <w:szCs w:val="20"/>
+              </w:rPr>
+              <w:t xml:space="preserve">37</w:t>
+            </w:r>
+          </w:p>
+        </w:tc>
+        <w:tc>
+          <w:tcPr>
+            <w:tcW w:w="1850" w:type="pct"/>
+            <w:tcMar>
+              <w:top w:w="30" w:type="dxa"/>
+              <w:left w:w="80" w:type="dxa"/>
+              <w:bottom w:w="30" w:type="dxa"/>
+              <w:right w:w="80" w:type="dxa"/>
+            </w:tcMar>
+          </w:tcPr>
+          <w:p>
+            <w:r>
+              <w:rPr>
+                <w:rFonts w:ascii="Aptos" w:eastAsia="Aptos" w:hAnsi="Aptos" w:cs="Aptos"/>
+                <w:sz w:val="20"/>
+                <w:szCs w:val="20"/>
+              </w:rPr>
+              <w:t xml:space="preserve">Add the customers Sarah Smith (sarah.s@email.com, 07222333444), David Smith (dsmith@email.com, 07555666777) and Emma Jones (emma.j@email.com, 07111222333)</w:t>
+            </w:r>
+          </w:p>
+        </w:tc>
+        <w:tc>
+          <w:tcPr>
+            <w:tcW w:w="560" w:type="pct"/>
+            <w:tcMar>
+              <w:top w:w="30" w:type="dxa"/>
+              <w:left w:w="80" w:type="dxa"/>
+              <w:bottom w:w="30" w:type="dxa"/>
+              <w:right w:w="80" w:type="dxa"/>
+            </w:tcMar>
+          </w:tcPr>
+          <w:p>
+            <w:r>
+              <w:rPr>
+                <w:rFonts w:ascii="Aptos" w:eastAsia="Aptos" w:hAnsi="Aptos" w:cs="Aptos"/>
+                <w:sz w:val="20"/>
+                <w:szCs w:val="20"/>
+              </w:rPr>
+              <w:t xml:space="preserve">Normal</w:t>
+            </w:r>
+          </w:p>
+        </w:tc>
+        <w:tc>
+          <w:tcPr>
+            <w:tcW w:w="2290" w:type="pct"/>
+            <w:tcMar>
+              <w:top w:w="30" w:type="dxa"/>
+              <w:left w:w="80" w:type="dxa"/>
+              <w:bottom w:w="30" w:type="dxa"/>
+              <w:right w:w="80" w:type="dxa"/>
+            </w:tcMar>
+          </w:tcPr>
+          <w:p>
+            <w:r>
+              <w:rPr>
+                <w:rFonts w:ascii="Aptos" w:eastAsia="Aptos" w:hAnsi="Aptos" w:cs="Aptos"/>
+                <w:sz w:val="20"/>
+                <w:szCs w:val="20"/>
+              </w:rPr>
+              <w:t xml:space="preserve">All three customers are saved, so there are now four customers, three of whom have the surname Smith.</w:t>
+            </w:r>
+          </w:p>
+        </w:tc>
+      </w:tr>
+      <w:tr>
+        <w:trPr>
+          <w:cantSplit/>
+        </w:trPr>
+        <w:tc>
+          <w:tcPr>
+            <w:tcW w:w="300" w:type="pct"/>
+            <w:tcMar>
+              <w:top w:w="30" w:type="dxa"/>
+              <w:left w:w="80" w:type="dxa"/>
+              <w:bottom w:w="30" w:type="dxa"/>
+              <w:right w:w="80" w:type="dxa"/>
+            </w:tcMar>
+          </w:tcPr>
+          <w:p>
+            <w:r>
+              <w:rPr>
+                <w:rFonts w:ascii="Aptos" w:eastAsia="Aptos" w:hAnsi="Aptos" w:cs="Aptos"/>
+                <w:sz w:val="20"/>
+                <w:szCs w:val="20"/>
+              </w:rPr>
+              <w:t xml:space="preserve">38</w:t>
+            </w:r>
+          </w:p>
+        </w:tc>
+        <w:tc>
+          <w:tcPr>
+            <w:tcW w:w="1850" w:type="pct"/>
+            <w:tcMar>
+              <w:top w:w="30" w:type="dxa"/>
+              <w:left w:w="80" w:type="dxa"/>
+              <w:bottom w:w="30" w:type="dxa"/>
+              <w:right w:w="80" w:type="dxa"/>
+            </w:tcMar>
+          </w:tcPr>
+          <w:p>
+            <w:r>
+              <w:rPr>
+                <w:rFonts w:ascii="Aptos" w:eastAsia="Aptos" w:hAnsi="Aptos" w:cs="Aptos"/>
+                <w:sz w:val="20"/>
+                <w:szCs w:val="20"/>
+              </w:rPr>
+              <w:t xml:space="preserve">On the Bookings form, without picking a screening and without selecting anything, press Complete sale</w:t>
+            </w:r>
+          </w:p>
+        </w:tc>
+        <w:tc>
+          <w:tcPr>
+            <w:tcW w:w="560" w:type="pct"/>
+            <w:tcMar>
+              <w:top w:w="30" w:type="dxa"/>
+              <w:left w:w="80" w:type="dxa"/>
+              <w:bottom w:w="30" w:type="dxa"/>
+              <w:right w:w="80" w:type="dxa"/>
+            </w:tcMar>
+          </w:tcPr>
+          <w:p>
+            <w:r>
+              <w:rPr>
+                <w:rFonts w:ascii="Aptos" w:eastAsia="Aptos" w:hAnsi="Aptos" w:cs="Aptos"/>
+                <w:sz w:val="20"/>
+                <w:szCs w:val="20"/>
+              </w:rPr>
+              <w:t xml:space="preserve">Erroneous</w:t>
+            </w:r>
+          </w:p>
+        </w:tc>
+        <w:tc>
+          <w:tcPr>
+            <w:tcW w:w="2290" w:type="pct"/>
+            <w:tcMar>
+              <w:top w:w="30" w:type="dxa"/>
+              <w:left w:w="80" w:type="dxa"/>
+              <w:bottom w:w="30" w:type="dxa"/>
+              <w:right w:w="80" w:type="dxa"/>
+            </w:tcMar>
+          </w:tcPr>
+          <w:p>
+            <w:r>
+              <w:rPr>
+                <w:rFonts w:ascii="Aptos" w:eastAsia="Aptos" w:hAnsi="Aptos" w:cs="Aptos"/>
+                <w:sz w:val="20"/>
+                <w:szCs w:val="20"/>
+              </w:rPr>
+              <w:t xml:space="preserve">The sale is rejected and a message appears stating “Pick some seats, or add something from the food and drink list”.</w:t>
+            </w:r>
+          </w:p>
+        </w:tc>
+      </w:tr>
+      <w:tr>
+        <w:trPr>
+          <w:cantSplit/>
+        </w:trPr>
+        <w:tc>
+          <w:tcPr>
+            <w:tcW w:w="300" w:type="pct"/>
+            <w:tcMar>
+              <w:top w:w="30" w:type="dxa"/>
+              <w:left w:w="80" w:type="dxa"/>
+              <w:bottom w:w="30" w:type="dxa"/>
+              <w:right w:w="80" w:type="dxa"/>
+            </w:tcMar>
+          </w:tcPr>
+          <w:p>
+            <w:r>
+              <w:rPr>
+                <w:rFonts w:ascii="Aptos" w:eastAsia="Aptos" w:hAnsi="Aptos" w:cs="Aptos"/>
+                <w:sz w:val="20"/>
+                <w:szCs w:val="20"/>
+              </w:rPr>
+              <w:t xml:space="preserve">39</w:t>
+            </w:r>
+          </w:p>
+        </w:tc>
+        <w:tc>
+          <w:tcPr>
+            <w:tcW w:w="1850" w:type="pct"/>
+            <w:tcMar>
+              <w:top w:w="30" w:type="dxa"/>
+              <w:left w:w="80" w:type="dxa"/>
+              <w:bottom w:w="30" w:type="dxa"/>
+              <w:right w:w="80" w:type="dxa"/>
+            </w:tcMar>
+          </w:tcPr>
+          <w:p>
+            <w:r>
+              <w:rPr>
+                <w:rFonts w:ascii="Aptos" w:eastAsia="Aptos" w:hAnsi="Aptos" w:cs="Aptos"/>
+                <w:sz w:val="20"/>
+                <w:szCs w:val="20"/>
+              </w:rPr>
+              <w:t xml:space="preserve">On the Bookings form, select seats on the seat map but leave the customer blank and Walk-in unticked, then press Complete sale</w:t>
+            </w:r>
+          </w:p>
+        </w:tc>
+        <w:tc>
+          <w:tcPr>
+            <w:tcW w:w="560" w:type="pct"/>
+            <w:tcMar>
+              <w:top w:w="30" w:type="dxa"/>
+              <w:left w:w="80" w:type="dxa"/>
+              <w:bottom w:w="30" w:type="dxa"/>
+              <w:right w:w="80" w:type="dxa"/>
+            </w:tcMar>
+          </w:tcPr>
+          <w:p>
+            <w:r>
+              <w:rPr>
+                <w:rFonts w:ascii="Aptos" w:eastAsia="Aptos" w:hAnsi="Aptos" w:cs="Aptos"/>
+                <w:sz w:val="20"/>
+                <w:szCs w:val="20"/>
+              </w:rPr>
+              <w:t xml:space="preserve">Erroneous</w:t>
+            </w:r>
+          </w:p>
+        </w:tc>
+        <w:tc>
+          <w:tcPr>
+            <w:tcW w:w="2290" w:type="pct"/>
+            <w:tcMar>
+              <w:top w:w="30" w:type="dxa"/>
+              <w:left w:w="80" w:type="dxa"/>
+              <w:bottom w:w="30" w:type="dxa"/>
+              <w:right w:w="80" w:type="dxa"/>
+            </w:tcMar>
+          </w:tcPr>
+          <w:p>
+            <w:r>
+              <w:rPr>
+                <w:rFonts w:ascii="Aptos" w:eastAsia="Aptos" w:hAnsi="Aptos" w:cs="Aptos"/>
+                <w:sz w:val="20"/>
+                <w:szCs w:val="20"/>
+              </w:rPr>
+              <w:t xml:space="preserve">The sale is rejected and a message appears stating “Pick a customer first, or tick Walk-in”.</w:t>
+            </w:r>
+          </w:p>
+        </w:tc>
+      </w:tr>
+      <w:tr>
+        <w:trPr>
+          <w:cantSplit/>
+        </w:trPr>
+        <w:tc>
+          <w:tcPr>
+            <w:tcW w:w="300" w:type="pct"/>
+            <w:tcMar>
+              <w:top w:w="30" w:type="dxa"/>
+              <w:left w:w="80" w:type="dxa"/>
+              <w:bottom w:w="30" w:type="dxa"/>
+              <w:right w:w="80" w:type="dxa"/>
+            </w:tcMar>
+          </w:tcPr>
+          <w:p>
+            <w:r>
+              <w:rPr>
+                <w:rFonts w:ascii="Aptos" w:eastAsia="Aptos" w:hAnsi="Aptos" w:cs="Aptos"/>
+                <w:sz w:val="20"/>
+                <w:szCs w:val="20"/>
+              </w:rPr>
+              <w:t xml:space="preserve">40</w:t>
+            </w:r>
+          </w:p>
+        </w:tc>
+        <w:tc>
+          <w:tcPr>
+            <w:tcW w:w="1850" w:type="pct"/>
+            <w:tcMar>
+              <w:top w:w="30" w:type="dxa"/>
+              <w:left w:w="80" w:type="dxa"/>
+              <w:bottom w:w="30" w:type="dxa"/>
+              <w:right w:w="80" w:type="dxa"/>
+            </w:tcMar>
+          </w:tcPr>
+          <w:p>
+            <w:r>
+              <w:rPr>
+                <w:rFonts w:ascii="Aptos" w:eastAsia="Aptos" w:hAnsi="Aptos" w:cs="Aptos"/>
+                <w:sz w:val="20"/>
+                <w:szCs w:val="20"/>
+              </w:rPr>
+              <w:t xml:space="preserve">Pick the Inception screening and customer John Smith, select seats B1 and B2, then press Complete sale</w:t>
+            </w:r>
+          </w:p>
+        </w:tc>
+        <w:tc>
+          <w:tcPr>
+            <w:tcW w:w="560" w:type="pct"/>
+            <w:tcMar>
+              <w:top w:w="30" w:type="dxa"/>
+              <w:left w:w="80" w:type="dxa"/>
+              <w:bottom w:w="30" w:type="dxa"/>
+              <w:right w:w="80" w:type="dxa"/>
+            </w:tcMar>
+          </w:tcPr>
+          <w:p>
+            <w:r>
+              <w:rPr>
+                <w:rFonts w:ascii="Aptos" w:eastAsia="Aptos" w:hAnsi="Aptos" w:cs="Aptos"/>
+                <w:sz w:val="20"/>
+                <w:szCs w:val="20"/>
+              </w:rPr>
+              <w:t xml:space="preserve">Normal</w:t>
+            </w:r>
+          </w:p>
+        </w:tc>
+        <w:tc>
+          <w:tcPr>
+            <w:tcW w:w="2290" w:type="pct"/>
+            <w:tcMar>
+              <w:top w:w="30" w:type="dxa"/>
+              <w:left w:w="80" w:type="dxa"/>
+              <w:bottom w:w="30" w:type="dxa"/>
+              <w:right w:w="80" w:type="dxa"/>
+            </w:tcMar>
+          </w:tcPr>
+          <w:p>
+            <w:r>
+              <w:rPr>
+                <w:rFonts w:ascii="Aptos" w:eastAsia="Aptos" w:hAnsi="Aptos" w:cs="Aptos"/>
+                <w:sz w:val="20"/>
+                <w:szCs w:val="20"/>
+              </w:rPr>
+              <w:t xml:space="preserve">A booking is created for John Smith with 2 seats and a total cost of £18.00, because B1 and B2 are both Standard seats at £9.00. Both seats are written to tblBookingSeat with a SeatPricePaid of £9.00 each.</w:t>
+            </w:r>
+          </w:p>
+        </w:tc>
+      </w:tr>
+      <w:tr>
+        <w:trPr>
+          <w:cantSplit/>
+        </w:trPr>
+        <w:tc>
+          <w:tcPr>
+            <w:tcW w:w="300" w:type="pct"/>
+            <w:tcMar>
+              <w:top w:w="30" w:type="dxa"/>
+              <w:left w:w="80" w:type="dxa"/>
+              <w:bottom w:w="30" w:type="dxa"/>
+              <w:right w:w="80" w:type="dxa"/>
+            </w:tcMar>
+          </w:tcPr>
+          <w:p>
+            <w:r>
+              <w:rPr>
+                <w:rFonts w:ascii="Aptos" w:eastAsia="Aptos" w:hAnsi="Aptos" w:cs="Aptos"/>
+                <w:sz w:val="20"/>
+                <w:szCs w:val="20"/>
+              </w:rPr>
+              <w:t xml:space="preserve">41</w:t>
+            </w:r>
+          </w:p>
+        </w:tc>
+        <w:tc>
+          <w:tcPr>
+            <w:tcW w:w="1850" w:type="pct"/>
+            <w:tcMar>
+              <w:top w:w="30" w:type="dxa"/>
+              <w:left w:w="80" w:type="dxa"/>
+              <w:bottom w:w="30" w:type="dxa"/>
+              <w:right w:w="80" w:type="dxa"/>
+            </w:tcMar>
+          </w:tcPr>
+          <w:p>
+            <w:r>
+              <w:rPr>
+                <w:rFonts w:ascii="Aptos" w:eastAsia="Aptos" w:hAnsi="Aptos" w:cs="Aptos"/>
+                <w:sz w:val="20"/>
+                <w:szCs w:val="20"/>
+              </w:rPr>
+              <w:t xml:space="preserve">Pick the Inception screening and customer Sarah Smith, select seat A1, then press Complete sale</w:t>
+            </w:r>
+          </w:p>
+        </w:tc>
+        <w:tc>
+          <w:tcPr>
+            <w:tcW w:w="560" w:type="pct"/>
+            <w:tcMar>
+              <w:top w:w="30" w:type="dxa"/>
+              <w:left w:w="80" w:type="dxa"/>
+              <w:bottom w:w="30" w:type="dxa"/>
+              <w:right w:w="80" w:type="dxa"/>
+            </w:tcMar>
+          </w:tcPr>
+          <w:p>
+            <w:r>
+              <w:rPr>
+                <w:rFonts w:ascii="Aptos" w:eastAsia="Aptos" w:hAnsi="Aptos" w:cs="Aptos"/>
+                <w:sz w:val="20"/>
+                <w:szCs w:val="20"/>
+              </w:rPr>
+              <w:t xml:space="preserve">Normal</w:t>
+            </w:r>
+          </w:p>
+        </w:tc>
+        <w:tc>
+          <w:tcPr>
+            <w:tcW w:w="2290" w:type="pct"/>
+            <w:tcMar>
+              <w:top w:w="30" w:type="dxa"/>
+              <w:left w:w="80" w:type="dxa"/>
+              <w:bottom w:w="30" w:type="dxa"/>
+              <w:right w:w="80" w:type="dxa"/>
+            </w:tcMar>
+          </w:tcPr>
+          <w:p>
+            <w:r>
+              <w:rPr>
+                <w:rFonts w:ascii="Aptos" w:eastAsia="Aptos" w:hAnsi="Aptos" w:cs="Aptos"/>
+                <w:sz w:val="20"/>
+                <w:szCs w:val="20"/>
+              </w:rPr>
+              <w:t xml:space="preserve">A booking is created for Sarah Smith with 1 seat and a total cost of £7.20, because A1 is a Saver seat and 9.00 multiplied by 0.8 is 7.20.</w:t>
+            </w:r>
+          </w:p>
+        </w:tc>
+      </w:tr>
+      <w:tr>
+        <w:trPr>
+          <w:cantSplit/>
+        </w:trPr>
+        <w:tc>
+          <w:tcPr>
+            <w:tcW w:w="300" w:type="pct"/>
+            <w:tcMar>
+              <w:top w:w="30" w:type="dxa"/>
+              <w:left w:w="80" w:type="dxa"/>
+              <w:bottom w:w="30" w:type="dxa"/>
+              <w:right w:w="80" w:type="dxa"/>
+            </w:tcMar>
+          </w:tcPr>
+          <w:p>
+            <w:r>
+              <w:rPr>
+                <w:rFonts w:ascii="Aptos" w:eastAsia="Aptos" w:hAnsi="Aptos" w:cs="Aptos"/>
+                <w:sz w:val="20"/>
+                <w:szCs w:val="20"/>
+              </w:rPr>
+              <w:t xml:space="preserve">42</w:t>
+            </w:r>
+          </w:p>
+        </w:tc>
+        <w:tc>
+          <w:tcPr>
+            <w:tcW w:w="1850" w:type="pct"/>
+            <w:tcMar>
+              <w:top w:w="30" w:type="dxa"/>
+              <w:left w:w="80" w:type="dxa"/>
+              <w:bottom w:w="30" w:type="dxa"/>
+              <w:right w:w="80" w:type="dxa"/>
+            </w:tcMar>
+          </w:tcPr>
+          <w:p>
+            <w:r>
+              <w:rPr>
+                <w:rFonts w:ascii="Aptos" w:eastAsia="Aptos" w:hAnsi="Aptos" w:cs="Aptos"/>
+                <w:sz w:val="20"/>
+                <w:szCs w:val="20"/>
+              </w:rPr>
+              <w:t xml:space="preserve">Pick the Inception screening and customer David Smith, select seat D1, then press Complete sale</w:t>
+            </w:r>
+          </w:p>
+        </w:tc>
+        <w:tc>
+          <w:tcPr>
+            <w:tcW w:w="560" w:type="pct"/>
+            <w:tcMar>
+              <w:top w:w="30" w:type="dxa"/>
+              <w:left w:w="80" w:type="dxa"/>
+              <w:bottom w:w="30" w:type="dxa"/>
+              <w:right w:w="80" w:type="dxa"/>
+            </w:tcMar>
+          </w:tcPr>
+          <w:p>
+            <w:r>
+              <w:rPr>
+                <w:rFonts w:ascii="Aptos" w:eastAsia="Aptos" w:hAnsi="Aptos" w:cs="Aptos"/>
+                <w:sz w:val="20"/>
+                <w:szCs w:val="20"/>
+              </w:rPr>
+              <w:t xml:space="preserve">Normal</w:t>
+            </w:r>
+          </w:p>
+        </w:tc>
+        <w:tc>
+          <w:tcPr>
+            <w:tcW w:w="2290" w:type="pct"/>
+            <w:tcMar>
+              <w:top w:w="30" w:type="dxa"/>
+              <w:left w:w="80" w:type="dxa"/>
+              <w:bottom w:w="30" w:type="dxa"/>
+              <w:right w:w="80" w:type="dxa"/>
+            </w:tcMar>
+          </w:tcPr>
+          <w:p>
+            <w:r>
+              <w:rPr>
+                <w:rFonts w:ascii="Aptos" w:eastAsia="Aptos" w:hAnsi="Aptos" w:cs="Aptos"/>
+                <w:sz w:val="20"/>
+                <w:szCs w:val="20"/>
+              </w:rPr>
+              <w:t xml:space="preserve">A booking is created for David Smith with 1 seat and a total cost of £13.50, because D1 is a Premium seat and 9.00 multiplied by 1.5 is 13.50.</w:t>
+            </w:r>
+          </w:p>
+        </w:tc>
+      </w:tr>
+      <w:tr>
+        <w:trPr>
+          <w:cantSplit/>
+        </w:trPr>
+        <w:tc>
+          <w:tcPr>
+            <w:tcW w:w="300" w:type="pct"/>
+            <w:tcMar>
+              <w:top w:w="30" w:type="dxa"/>
+              <w:left w:w="80" w:type="dxa"/>
+              <w:bottom w:w="30" w:type="dxa"/>
+              <w:right w:w="80" w:type="dxa"/>
+            </w:tcMar>
+          </w:tcPr>
+          <w:p>
+            <w:r>
+              <w:rPr>
+                <w:rFonts w:ascii="Aptos" w:eastAsia="Aptos" w:hAnsi="Aptos" w:cs="Aptos"/>
+                <w:sz w:val="20"/>
+                <w:szCs w:val="20"/>
+              </w:rPr>
+              <w:t xml:space="preserve">43</w:t>
+            </w:r>
+          </w:p>
+        </w:tc>
+        <w:tc>
+          <w:tcPr>
+            <w:tcW w:w="1850" w:type="pct"/>
+            <w:tcMar>
+              <w:top w:w="30" w:type="dxa"/>
+              <w:left w:w="80" w:type="dxa"/>
+              <w:bottom w:w="30" w:type="dxa"/>
+              <w:right w:w="80" w:type="dxa"/>
+            </w:tcMar>
+          </w:tcPr>
+          <w:p>
+            <w:r>
+              <w:rPr>
+                <w:rFonts w:ascii="Aptos" w:eastAsia="Aptos" w:hAnsi="Aptos" w:cs="Aptos"/>
+                <w:sz w:val="20"/>
+                <w:szCs w:val="20"/>
+              </w:rPr>
+              <w:t xml:space="preserve">Pick the Paddington 2 screening and customer Emma Jones, select seat A1, then press Complete sale</w:t>
+            </w:r>
+          </w:p>
+        </w:tc>
+        <w:tc>
+          <w:tcPr>
+            <w:tcW w:w="560" w:type="pct"/>
+            <w:tcMar>
+              <w:top w:w="30" w:type="dxa"/>
+              <w:left w:w="80" w:type="dxa"/>
+              <w:bottom w:w="30" w:type="dxa"/>
+              <w:right w:w="80" w:type="dxa"/>
+            </w:tcMar>
+          </w:tcPr>
+          <w:p>
+            <w:r>
+              <w:rPr>
+                <w:rFonts w:ascii="Aptos" w:eastAsia="Aptos" w:hAnsi="Aptos" w:cs="Aptos"/>
+                <w:sz w:val="20"/>
+                <w:szCs w:val="20"/>
+              </w:rPr>
+              <w:t xml:space="preserve">Normal</w:t>
+            </w:r>
+          </w:p>
+        </w:tc>
+        <w:tc>
+          <w:tcPr>
+            <w:tcW w:w="2290" w:type="pct"/>
+            <w:tcMar>
+              <w:top w:w="30" w:type="dxa"/>
+              <w:left w:w="80" w:type="dxa"/>
+              <w:bottom w:w="30" w:type="dxa"/>
+              <w:right w:w="80" w:type="dxa"/>
+            </w:tcMar>
+          </w:tcPr>
+          <w:p>
+            <w:r>
+              <w:rPr>
+                <w:rFonts w:ascii="Aptos" w:eastAsia="Aptos" w:hAnsi="Aptos" w:cs="Aptos"/>
+                <w:sz w:val="20"/>
+                <w:szCs w:val="20"/>
+              </w:rPr>
+              <w:t xml:space="preserve">A booking is created for Emma Jones with 1 seat and a total cost of £7.50.</w:t>
+            </w:r>
+          </w:p>
+        </w:tc>
+      </w:tr>
+      <w:tr>
+        <w:trPr>
+          <w:cantSplit/>
+        </w:trPr>
+        <w:tc>
+          <w:tcPr>
+            <w:tcW w:w="300" w:type="pct"/>
+            <w:tcMar>
+              <w:top w:w="30" w:type="dxa"/>
+              <w:left w:w="80" w:type="dxa"/>
+              <w:bottom w:w="30" w:type="dxa"/>
+              <w:right w:w="80" w:type="dxa"/>
+            </w:tcMar>
+          </w:tcPr>
+          <w:p>
+            <w:r>
+              <w:rPr>
+                <w:rFonts w:ascii="Aptos" w:eastAsia="Aptos" w:hAnsi="Aptos" w:cs="Aptos"/>
+                <w:sz w:val="20"/>
+                <w:szCs w:val="20"/>
+              </w:rPr>
+              <w:t xml:space="preserve">44</w:t>
+            </w:r>
+          </w:p>
+        </w:tc>
+        <w:tc>
+          <w:tcPr>
+            <w:tcW w:w="1850" w:type="pct"/>
+            <w:tcMar>
+              <w:top w:w="30" w:type="dxa"/>
+              <w:left w:w="80" w:type="dxa"/>
+              <w:bottom w:w="30" w:type="dxa"/>
+              <w:right w:w="80" w:type="dxa"/>
+            </w:tcMar>
+          </w:tcPr>
+          <w:p>
+            <w:r>
+              <w:rPr>
+                <w:rFonts w:ascii="Aptos" w:eastAsia="Aptos" w:hAnsi="Aptos" w:cs="Aptos"/>
+                <w:sz w:val="20"/>
+                <w:szCs w:val="20"/>
+              </w:rPr>
+              <w:t xml:space="preserve">Pick the Inception screening, tick Walk-in, select seat E10 and press Complete sale</w:t>
+            </w:r>
+          </w:p>
+        </w:tc>
+        <w:tc>
+          <w:tcPr>
+            <w:tcW w:w="560" w:type="pct"/>
+            <w:tcMar>
+              <w:top w:w="30" w:type="dxa"/>
+              <w:left w:w="80" w:type="dxa"/>
+              <w:bottom w:w="30" w:type="dxa"/>
+              <w:right w:w="80" w:type="dxa"/>
+            </w:tcMar>
+          </w:tcPr>
+          <w:p>
+            <w:r>
+              <w:rPr>
+                <w:rFonts w:ascii="Aptos" w:eastAsia="Aptos" w:hAnsi="Aptos" w:cs="Aptos"/>
+                <w:sz w:val="20"/>
+                <w:szCs w:val="20"/>
+              </w:rPr>
+              <w:t xml:space="preserve">Normal</w:t>
+            </w:r>
+          </w:p>
+        </w:tc>
+        <w:tc>
+          <w:tcPr>
+            <w:tcW w:w="2290" w:type="pct"/>
+            <w:tcMar>
+              <w:top w:w="30" w:type="dxa"/>
+              <w:left w:w="80" w:type="dxa"/>
+              <w:bottom w:w="30" w:type="dxa"/>
+              <w:right w:w="80" w:type="dxa"/>
+            </w:tcMar>
+          </w:tcPr>
+          <w:p>
+            <w:r>
+              <w:rPr>
+                <w:rFonts w:ascii="Aptos" w:eastAsia="Aptos" w:hAnsi="Aptos" w:cs="Aptos"/>
+                <w:sz w:val="20"/>
+                <w:szCs w:val="20"/>
+              </w:rPr>
+              <w:t xml:space="preserve">A booking is created without a named customer being chosen, recorded against the walk-in customer, at £13.50 because E10 is Premium. This booking is refunded again afterwards so that the report figures in the test data still hold.</w:t>
+            </w:r>
+          </w:p>
+        </w:tc>
+      </w:tr>
+      <w:tr>
+        <w:trPr>
+          <w:cantSplit/>
+        </w:trPr>
+        <w:tc>
+          <w:tcPr>
+            <w:tcW w:w="300" w:type="pct"/>
+            <w:tcMar>
+              <w:top w:w="30" w:type="dxa"/>
+              <w:left w:w="80" w:type="dxa"/>
+              <w:bottom w:w="30" w:type="dxa"/>
+              <w:right w:w="80" w:type="dxa"/>
+            </w:tcMar>
+          </w:tcPr>
+          <w:p>
+            <w:r>
+              <w:rPr>
+                <w:rFonts w:ascii="Aptos" w:eastAsia="Aptos" w:hAnsi="Aptos" w:cs="Aptos"/>
+                <w:sz w:val="20"/>
+                <w:szCs w:val="20"/>
+              </w:rPr>
+              <w:t xml:space="preserve">45</w:t>
+            </w:r>
+          </w:p>
+        </w:tc>
+        <w:tc>
+          <w:tcPr>
+            <w:tcW w:w="1850" w:type="pct"/>
+            <w:tcMar>
+              <w:top w:w="30" w:type="dxa"/>
+              <w:left w:w="80" w:type="dxa"/>
+              <w:bottom w:w="30" w:type="dxa"/>
+              <w:right w:w="80" w:type="dxa"/>
+            </w:tcMar>
+          </w:tcPr>
+          <w:p>
+            <w:r>
+              <w:rPr>
+                <w:rFonts w:ascii="Aptos" w:eastAsia="Aptos" w:hAnsi="Aptos" w:cs="Aptos"/>
+                <w:sz w:val="20"/>
+                <w:szCs w:val="20"/>
+              </w:rPr>
+              <w:t xml:space="preserve">Pick the Inception screening and try to select nine seats</w:t>
+            </w:r>
+          </w:p>
+        </w:tc>
+        <w:tc>
+          <w:tcPr>
+            <w:tcW w:w="560" w:type="pct"/>
+            <w:tcMar>
+              <w:top w:w="30" w:type="dxa"/>
+              <w:left w:w="80" w:type="dxa"/>
+              <w:bottom w:w="30" w:type="dxa"/>
+              <w:right w:w="80" w:type="dxa"/>
+            </w:tcMar>
+          </w:tcPr>
+          <w:p>
+            <w:r>
+              <w:rPr>
+                <w:rFonts w:ascii="Aptos" w:eastAsia="Aptos" w:hAnsi="Aptos" w:cs="Aptos"/>
+                <w:sz w:val="20"/>
+                <w:szCs w:val="20"/>
+              </w:rPr>
+              <w:t xml:space="preserve">Boundary</w:t>
+            </w:r>
+          </w:p>
+        </w:tc>
+        <w:tc>
+          <w:tcPr>
+            <w:tcW w:w="2290" w:type="pct"/>
+            <w:tcMar>
+              <w:top w:w="30" w:type="dxa"/>
+              <w:left w:w="80" w:type="dxa"/>
+              <w:bottom w:w="30" w:type="dxa"/>
+              <w:right w:w="80" w:type="dxa"/>
+            </w:tcMar>
+          </w:tcPr>
+          <w:p>
+            <w:r>
+              <w:rPr>
+                <w:rFonts w:ascii="Aptos" w:eastAsia="Aptos" w:hAnsi="Aptos" w:cs="Aptos"/>
+                <w:sz w:val="20"/>
+                <w:szCs w:val="20"/>
+              </w:rPr>
+              <w:t xml:space="preserve">The ninth seat cannot be added and a message appears saying how many seats can be bought in one sale, because the maximum seats per sale setting is 8. Selecting exactly 8 seats is allowed.</w:t>
             </w:r>
           </w:p>
         </w:tc>

</xml_diff>

<commit_message>
added objective 2: preventing double bookings
</commit_message>
<xml_diff>
--- a/Testing.docx
+++ b/Testing.docx
@@ -4800,6 +4800,607 @@
                 <w:szCs w:val="20"/>
               </w:rPr>
               <w:t xml:space="preserve">The ninth seat cannot be added and a message appears saying how many seats can be bought in one sale, because the maximum seats per sale setting is 8. Selecting exactly 8 seats is allowed.</w:t>
+            </w:r>
+          </w:p>
+        </w:tc>
+      </w:tr>
+    </w:tbl>
+    <w:p>
+      <w:r>
+        <w:rPr>
+          <w:rFonts w:ascii="Aptos" w:eastAsia="Aptos" w:hAnsi="Aptos" w:cs="Aptos"/>
+        </w:rPr>
+        <w:t xml:space="preserve"/>
+      </w:r>
+    </w:p>
+    <w:p>
+      <w:pPr>
+        <w:pStyle w:val="Heading3"/>
+      </w:pPr>
+      <w:r>
+        <w:rPr>
+          <w:rFonts w:ascii="Aptos Display" w:eastAsia="Aptos Display" w:hAnsi="Aptos Display" w:cs="Aptos Display"/>
+          <w:b/>
+          <w:bCs/>
+          <w:color w:val="000000"/>
+        </w:rPr>
+        <w:t xml:space="preserve">Objective 2: Preventing Double Bookings</w:t>
+      </w:r>
+    </w:p>
+    <w:p>
+      <w:r>
+        <w:rPr>
+          <w:rFonts w:ascii="Aptos" w:eastAsia="Aptos" w:hAnsi="Aptos" w:cs="Aptos"/>
+        </w:rPr>
+        <w:t xml:space="preserve">These tests check that seats already sold in the previous tests cannot be sold again for the same screening. The database itself enforces this through a unique index across the screening and the seat, so the last test deliberately attacks it from two directions at once to check that the protection is real rather than only being a check in the program.</w:t>
+      </w:r>
+    </w:p>
+    <w:tbl>
+      <w:tblPr>
+        <w:tblW w:w="5000" w:type="pct"/>
+        <w:tblBorders>
+          <w:top w:val="single" w:sz="4" w:space="0" w:color="808080"/>
+          <w:left w:val="single" w:sz="4" w:space="0" w:color="808080"/>
+          <w:bottom w:val="single" w:sz="4" w:space="0" w:color="808080"/>
+          <w:right w:val="single" w:sz="4" w:space="0" w:color="808080"/>
+          <w:insideH w:val="single" w:sz="4" w:space="0" w:color="808080"/>
+          <w:insideV w:val="single" w:sz="4" w:space="0" w:color="808080"/>
+        </w:tblBorders>
+        <w:tblCellMar>
+          <w:left w:w="10" w:type="dxa"/>
+          <w:right w:w="10" w:type="dxa"/>
+        </w:tblCellMar>
+        <w:tblLook w:val="0000" w:firstRow="0" w:lastRow="0" w:firstColumn="0" w:lastColumn="0" w:noHBand="0" w:noVBand="0"/>
+      </w:tblPr>
+      <w:tblGrid>
+        <w:gridCol w:w="561"/>
+        <w:gridCol w:w="3460"/>
+        <w:gridCol w:w="1047"/>
+        <w:gridCol w:w="4282"/>
+      </w:tblGrid>
+      <w:tr>
+        <w:trPr>
+          <w:cantSplit/>
+          <w:tblHeader/>
+        </w:trPr>
+        <w:tc>
+          <w:tcPr>
+            <w:tcW w:w="300" w:type="pct"/>
+            <w:shd w:val="clear" w:color="auto" w:fill="F2CEED" w:themeFill="accent5" w:themeFillTint="33"/>
+            <w:tcMar>
+              <w:top w:w="30" w:type="dxa"/>
+              <w:left w:w="80" w:type="dxa"/>
+              <w:bottom w:w="30" w:type="dxa"/>
+              <w:right w:w="80" w:type="dxa"/>
+            </w:tcMar>
+          </w:tcPr>
+          <w:p>
+            <w:r>
+              <w:rPr>
+                <w:rFonts w:ascii="Aptos" w:eastAsia="Aptos" w:hAnsi="Aptos" w:cs="Aptos"/>
+                <w:b/>
+                <w:bCs/>
+                <w:sz w:val="20"/>
+                <w:szCs w:val="20"/>
+              </w:rPr>
+              <w:t xml:space="preserve">No.</w:t>
+            </w:r>
+          </w:p>
+        </w:tc>
+        <w:tc>
+          <w:tcPr>
+            <w:tcW w:w="1850" w:type="pct"/>
+            <w:shd w:val="clear" w:color="auto" w:fill="F2CEED" w:themeFill="accent5" w:themeFillTint="33"/>
+            <w:tcMar>
+              <w:top w:w="30" w:type="dxa"/>
+              <w:left w:w="80" w:type="dxa"/>
+              <w:bottom w:w="30" w:type="dxa"/>
+              <w:right w:w="80" w:type="dxa"/>
+            </w:tcMar>
+          </w:tcPr>
+          <w:p>
+            <w:r>
+              <w:rPr>
+                <w:rFonts w:ascii="Aptos" w:eastAsia="Aptos" w:hAnsi="Aptos" w:cs="Aptos"/>
+                <w:b/>
+                <w:bCs/>
+                <w:sz w:val="20"/>
+                <w:szCs w:val="20"/>
+              </w:rPr>
+              <w:t xml:space="preserve">Test</w:t>
+            </w:r>
+          </w:p>
+        </w:tc>
+        <w:tc>
+          <w:tcPr>
+            <w:tcW w:w="560" w:type="pct"/>
+            <w:shd w:val="clear" w:color="auto" w:fill="F2CEED" w:themeFill="accent5" w:themeFillTint="33"/>
+            <w:tcMar>
+              <w:top w:w="30" w:type="dxa"/>
+              <w:left w:w="80" w:type="dxa"/>
+              <w:bottom w:w="30" w:type="dxa"/>
+              <w:right w:w="80" w:type="dxa"/>
+            </w:tcMar>
+          </w:tcPr>
+          <w:p>
+            <w:r>
+              <w:rPr>
+                <w:rFonts w:ascii="Aptos" w:eastAsia="Aptos" w:hAnsi="Aptos" w:cs="Aptos"/>
+                <w:b/>
+                <w:bCs/>
+                <w:sz w:val="20"/>
+                <w:szCs w:val="20"/>
+              </w:rPr>
+              <w:t xml:space="preserve">Type</w:t>
+            </w:r>
+          </w:p>
+        </w:tc>
+        <w:tc>
+          <w:tcPr>
+            <w:tcW w:w="2290" w:type="pct"/>
+            <w:shd w:val="clear" w:color="auto" w:fill="F2CEED" w:themeFill="accent5" w:themeFillTint="33"/>
+            <w:tcMar>
+              <w:top w:w="30" w:type="dxa"/>
+              <w:left w:w="80" w:type="dxa"/>
+              <w:bottom w:w="30" w:type="dxa"/>
+              <w:right w:w="80" w:type="dxa"/>
+            </w:tcMar>
+          </w:tcPr>
+          <w:p>
+            <w:r>
+              <w:rPr>
+                <w:rFonts w:ascii="Aptos" w:eastAsia="Aptos" w:hAnsi="Aptos" w:cs="Aptos"/>
+                <w:b/>
+                <w:bCs/>
+                <w:sz w:val="20"/>
+                <w:szCs w:val="20"/>
+              </w:rPr>
+              <w:t xml:space="preserve">Expected Result</w:t>
+            </w:r>
+          </w:p>
+        </w:tc>
+      </w:tr>
+      <w:tr>
+        <w:trPr>
+          <w:cantSplit/>
+        </w:trPr>
+        <w:tc>
+          <w:tcPr>
+            <w:tcW w:w="300" w:type="pct"/>
+            <w:tcMar>
+              <w:top w:w="30" w:type="dxa"/>
+              <w:left w:w="80" w:type="dxa"/>
+              <w:bottom w:w="30" w:type="dxa"/>
+              <w:right w:w="80" w:type="dxa"/>
+            </w:tcMar>
+          </w:tcPr>
+          <w:p>
+            <w:r>
+              <w:rPr>
+                <w:rFonts w:ascii="Aptos" w:eastAsia="Aptos" w:hAnsi="Aptos" w:cs="Aptos"/>
+                <w:sz w:val="20"/>
+                <w:szCs w:val="20"/>
+              </w:rPr>
+              <w:t xml:space="preserve">46</w:t>
+            </w:r>
+          </w:p>
+        </w:tc>
+        <w:tc>
+          <w:tcPr>
+            <w:tcW w:w="1850" w:type="pct"/>
+            <w:tcMar>
+              <w:top w:w="30" w:type="dxa"/>
+              <w:left w:w="80" w:type="dxa"/>
+              <w:bottom w:w="30" w:type="dxa"/>
+              <w:right w:w="80" w:type="dxa"/>
+            </w:tcMar>
+          </w:tcPr>
+          <w:p>
+            <w:r>
+              <w:rPr>
+                <w:rFonts w:ascii="Aptos" w:eastAsia="Aptos" w:hAnsi="Aptos" w:cs="Aptos"/>
+                <w:sz w:val="20"/>
+                <w:szCs w:val="20"/>
+              </w:rPr>
+              <w:t xml:space="preserve">Open the Bookings form, pick the Inception screening and look at seats B1, B2, A1 and D1 on the seat map</w:t>
+            </w:r>
+          </w:p>
+        </w:tc>
+        <w:tc>
+          <w:tcPr>
+            <w:tcW w:w="560" w:type="pct"/>
+            <w:tcMar>
+              <w:top w:w="30" w:type="dxa"/>
+              <w:left w:w="80" w:type="dxa"/>
+              <w:bottom w:w="30" w:type="dxa"/>
+              <w:right w:w="80" w:type="dxa"/>
+            </w:tcMar>
+          </w:tcPr>
+          <w:p>
+            <w:r>
+              <w:rPr>
+                <w:rFonts w:ascii="Aptos" w:eastAsia="Aptos" w:hAnsi="Aptos" w:cs="Aptos"/>
+                <w:sz w:val="20"/>
+                <w:szCs w:val="20"/>
+              </w:rPr>
+              <w:t xml:space="preserve">Normal</w:t>
+            </w:r>
+          </w:p>
+        </w:tc>
+        <w:tc>
+          <w:tcPr>
+            <w:tcW w:w="2290" w:type="pct"/>
+            <w:tcMar>
+              <w:top w:w="30" w:type="dxa"/>
+              <w:left w:w="80" w:type="dxa"/>
+              <w:bottom w:w="30" w:type="dxa"/>
+              <w:right w:w="80" w:type="dxa"/>
+            </w:tcMar>
+          </w:tcPr>
+          <w:p>
+            <w:r>
+              <w:rPr>
+                <w:rFonts w:ascii="Aptos" w:eastAsia="Aptos" w:hAnsi="Aptos" w:cs="Aptos"/>
+                <w:sz w:val="20"/>
+                <w:szCs w:val="20"/>
+              </w:rPr>
+              <w:t xml:space="preserve">These four seats appear in the taken colour and cannot be clicked, because they were sold in the tests for objective 1.</w:t>
+            </w:r>
+          </w:p>
+        </w:tc>
+      </w:tr>
+      <w:tr>
+        <w:trPr>
+          <w:cantSplit/>
+        </w:trPr>
+        <w:tc>
+          <w:tcPr>
+            <w:tcW w:w="300" w:type="pct"/>
+            <w:tcMar>
+              <w:top w:w="30" w:type="dxa"/>
+              <w:left w:w="80" w:type="dxa"/>
+              <w:bottom w:w="30" w:type="dxa"/>
+              <w:right w:w="80" w:type="dxa"/>
+            </w:tcMar>
+          </w:tcPr>
+          <w:p>
+            <w:r>
+              <w:rPr>
+                <w:rFonts w:ascii="Aptos" w:eastAsia="Aptos" w:hAnsi="Aptos" w:cs="Aptos"/>
+                <w:sz w:val="20"/>
+                <w:szCs w:val="20"/>
+              </w:rPr>
+              <w:t xml:space="preserve">47</w:t>
+            </w:r>
+          </w:p>
+        </w:tc>
+        <w:tc>
+          <w:tcPr>
+            <w:tcW w:w="1850" w:type="pct"/>
+            <w:tcMar>
+              <w:top w:w="30" w:type="dxa"/>
+              <w:left w:w="80" w:type="dxa"/>
+              <w:bottom w:w="30" w:type="dxa"/>
+              <w:right w:w="80" w:type="dxa"/>
+            </w:tcMar>
+          </w:tcPr>
+          <w:p>
+            <w:r>
+              <w:rPr>
+                <w:rFonts w:ascii="Aptos" w:eastAsia="Aptos" w:hAnsi="Aptos" w:cs="Aptos"/>
+                <w:sz w:val="20"/>
+                <w:szCs w:val="20"/>
+              </w:rPr>
+              <w:t xml:space="preserve">With the Inception screening selected, try to click seat B1 to select it</w:t>
+            </w:r>
+          </w:p>
+        </w:tc>
+        <w:tc>
+          <w:tcPr>
+            <w:tcW w:w="560" w:type="pct"/>
+            <w:tcMar>
+              <w:top w:w="30" w:type="dxa"/>
+              <w:left w:w="80" w:type="dxa"/>
+              <w:bottom w:w="30" w:type="dxa"/>
+              <w:right w:w="80" w:type="dxa"/>
+            </w:tcMar>
+          </w:tcPr>
+          <w:p>
+            <w:r>
+              <w:rPr>
+                <w:rFonts w:ascii="Aptos" w:eastAsia="Aptos" w:hAnsi="Aptos" w:cs="Aptos"/>
+                <w:sz w:val="20"/>
+                <w:szCs w:val="20"/>
+              </w:rPr>
+              <w:t xml:space="preserve">Erroneous</w:t>
+            </w:r>
+          </w:p>
+        </w:tc>
+        <w:tc>
+          <w:tcPr>
+            <w:tcW w:w="2290" w:type="pct"/>
+            <w:tcMar>
+              <w:top w:w="30" w:type="dxa"/>
+              <w:left w:w="80" w:type="dxa"/>
+              <w:bottom w:w="30" w:type="dxa"/>
+              <w:right w:w="80" w:type="dxa"/>
+            </w:tcMar>
+          </w:tcPr>
+          <w:p>
+            <w:r>
+              <w:rPr>
+                <w:rFonts w:ascii="Aptos" w:eastAsia="Aptos" w:hAnsi="Aptos" w:cs="Aptos"/>
+                <w:sz w:val="20"/>
+                <w:szCs w:val="20"/>
+              </w:rPr>
+              <w:t xml:space="preserve">Nothing happens, because the seat is disabled, so a seat that has already been sold cannot be selected again for the same screening.</w:t>
+            </w:r>
+          </w:p>
+        </w:tc>
+      </w:tr>
+      <w:tr>
+        <w:trPr>
+          <w:cantSplit/>
+        </w:trPr>
+        <w:tc>
+          <w:tcPr>
+            <w:tcW w:w="300" w:type="pct"/>
+            <w:tcMar>
+              <w:top w:w="30" w:type="dxa"/>
+              <w:left w:w="80" w:type="dxa"/>
+              <w:bottom w:w="30" w:type="dxa"/>
+              <w:right w:w="80" w:type="dxa"/>
+            </w:tcMar>
+          </w:tcPr>
+          <w:p>
+            <w:r>
+              <w:rPr>
+                <w:rFonts w:ascii="Aptos" w:eastAsia="Aptos" w:hAnsi="Aptos" w:cs="Aptos"/>
+                <w:sz w:val="20"/>
+                <w:szCs w:val="20"/>
+              </w:rPr>
+              <w:t xml:space="preserve">48</w:t>
+            </w:r>
+          </w:p>
+        </w:tc>
+        <w:tc>
+          <w:tcPr>
+            <w:tcW w:w="1850" w:type="pct"/>
+            <w:tcMar>
+              <w:top w:w="30" w:type="dxa"/>
+              <w:left w:w="80" w:type="dxa"/>
+              <w:bottom w:w="30" w:type="dxa"/>
+              <w:right w:w="80" w:type="dxa"/>
+            </w:tcMar>
+          </w:tcPr>
+          <w:p>
+            <w:r>
+              <w:rPr>
+                <w:rFonts w:ascii="Aptos" w:eastAsia="Aptos" w:hAnsi="Aptos" w:cs="Aptos"/>
+                <w:sz w:val="20"/>
+                <w:szCs w:val="20"/>
+              </w:rPr>
+              <w:t xml:space="preserve">With the Inception screening selected, select an available seat such as C5 and complete a sale for John Smith</w:t>
+            </w:r>
+          </w:p>
+        </w:tc>
+        <w:tc>
+          <w:tcPr>
+            <w:tcW w:w="560" w:type="pct"/>
+            <w:tcMar>
+              <w:top w:w="30" w:type="dxa"/>
+              <w:left w:w="80" w:type="dxa"/>
+              <w:bottom w:w="30" w:type="dxa"/>
+              <w:right w:w="80" w:type="dxa"/>
+            </w:tcMar>
+          </w:tcPr>
+          <w:p>
+            <w:r>
+              <w:rPr>
+                <w:rFonts w:ascii="Aptos" w:eastAsia="Aptos" w:hAnsi="Aptos" w:cs="Aptos"/>
+                <w:sz w:val="20"/>
+                <w:szCs w:val="20"/>
+              </w:rPr>
+              <w:t xml:space="preserve">Normal</w:t>
+            </w:r>
+          </w:p>
+        </w:tc>
+        <w:tc>
+          <w:tcPr>
+            <w:tcW w:w="2290" w:type="pct"/>
+            <w:tcMar>
+              <w:top w:w="30" w:type="dxa"/>
+              <w:left w:w="80" w:type="dxa"/>
+              <w:bottom w:w="30" w:type="dxa"/>
+              <w:right w:w="80" w:type="dxa"/>
+            </w:tcMar>
+          </w:tcPr>
+          <w:p>
+            <w:r>
+              <w:rPr>
+                <w:rFonts w:ascii="Aptos" w:eastAsia="Aptos" w:hAnsi="Aptos" w:cs="Aptos"/>
+                <w:sz w:val="20"/>
+                <w:szCs w:val="20"/>
+              </w:rPr>
+              <w:t xml:space="preserve">The sale succeeds, showing that only seats which are already taken are blocked and available seats can still be sold normally. This booking is refunded again afterwards.</w:t>
+            </w:r>
+          </w:p>
+        </w:tc>
+      </w:tr>
+      <w:tr>
+        <w:trPr>
+          <w:cantSplit/>
+        </w:trPr>
+        <w:tc>
+          <w:tcPr>
+            <w:tcW w:w="300" w:type="pct"/>
+            <w:tcMar>
+              <w:top w:w="30" w:type="dxa"/>
+              <w:left w:w="80" w:type="dxa"/>
+              <w:bottom w:w="30" w:type="dxa"/>
+              <w:right w:w="80" w:type="dxa"/>
+            </w:tcMar>
+          </w:tcPr>
+          <w:p>
+            <w:r>
+              <w:rPr>
+                <w:rFonts w:ascii="Aptos" w:eastAsia="Aptos" w:hAnsi="Aptos" w:cs="Aptos"/>
+                <w:sz w:val="20"/>
+                <w:szCs w:val="20"/>
+              </w:rPr>
+              <w:t xml:space="preserve">49</w:t>
+            </w:r>
+          </w:p>
+        </w:tc>
+        <w:tc>
+          <w:tcPr>
+            <w:tcW w:w="1850" w:type="pct"/>
+            <w:tcMar>
+              <w:top w:w="30" w:type="dxa"/>
+              <w:left w:w="80" w:type="dxa"/>
+              <w:bottom w:w="30" w:type="dxa"/>
+              <w:right w:w="80" w:type="dxa"/>
+            </w:tcMar>
+          </w:tcPr>
+          <w:p>
+            <w:r>
+              <w:rPr>
+                <w:rFonts w:ascii="Aptos" w:eastAsia="Aptos" w:hAnsi="Aptos" w:cs="Aptos"/>
+                <w:sz w:val="20"/>
+                <w:szCs w:val="20"/>
+              </w:rPr>
+              <w:t xml:space="preserve">Open the Bookings form twice, select seat C6 on the Inception screening in both, and complete the sale in the first before completing it in the second</w:t>
+            </w:r>
+          </w:p>
+        </w:tc>
+        <w:tc>
+          <w:tcPr>
+            <w:tcW w:w="560" w:type="pct"/>
+            <w:tcMar>
+              <w:top w:w="30" w:type="dxa"/>
+              <w:left w:w="80" w:type="dxa"/>
+              <w:bottom w:w="30" w:type="dxa"/>
+              <w:right w:w="80" w:type="dxa"/>
+            </w:tcMar>
+          </w:tcPr>
+          <w:p>
+            <w:r>
+              <w:rPr>
+                <w:rFonts w:ascii="Aptos" w:eastAsia="Aptos" w:hAnsi="Aptos" w:cs="Aptos"/>
+                <w:sz w:val="20"/>
+                <w:szCs w:val="20"/>
+              </w:rPr>
+              <w:t xml:space="preserve">Erroneous</w:t>
+            </w:r>
+          </w:p>
+        </w:tc>
+        <w:tc>
+          <w:tcPr>
+            <w:tcW w:w="2290" w:type="pct"/>
+            <w:tcMar>
+              <w:top w:w="30" w:type="dxa"/>
+              <w:left w:w="80" w:type="dxa"/>
+              <w:bottom w:w="30" w:type="dxa"/>
+              <w:right w:w="80" w:type="dxa"/>
+            </w:tcMar>
+          </w:tcPr>
+          <w:p>
+            <w:r>
+              <w:rPr>
+                <w:rFonts w:ascii="Aptos" w:eastAsia="Aptos" w:hAnsi="Aptos" w:cs="Aptos"/>
+                <w:sz w:val="20"/>
+                <w:szCs w:val="20"/>
+              </w:rPr>
+              <w:t xml:space="preserve">The first sale succeeds. The second is refused with a message stating that one of those seats has just been booked on another till, and nothing at all is written for the second sale, because the whole sale is carried out as one transaction.</w:t>
+            </w:r>
+          </w:p>
+        </w:tc>
+      </w:tr>
+      <w:tr>
+        <w:trPr>
+          <w:cantSplit/>
+        </w:trPr>
+        <w:tc>
+          <w:tcPr>
+            <w:tcW w:w="300" w:type="pct"/>
+            <w:tcMar>
+              <w:top w:w="30" w:type="dxa"/>
+              <w:left w:w="80" w:type="dxa"/>
+              <w:bottom w:w="30" w:type="dxa"/>
+              <w:right w:w="80" w:type="dxa"/>
+            </w:tcMar>
+          </w:tcPr>
+          <w:p>
+            <w:r>
+              <w:rPr>
+                <w:rFonts w:ascii="Aptos" w:eastAsia="Aptos" w:hAnsi="Aptos" w:cs="Aptos"/>
+                <w:sz w:val="20"/>
+                <w:szCs w:val="20"/>
+              </w:rPr>
+              <w:t xml:space="preserve">50</w:t>
+            </w:r>
+          </w:p>
+        </w:tc>
+        <w:tc>
+          <w:tcPr>
+            <w:tcW w:w="1850" w:type="pct"/>
+            <w:tcMar>
+              <w:top w:w="30" w:type="dxa"/>
+              <w:left w:w="80" w:type="dxa"/>
+              <w:bottom w:w="30" w:type="dxa"/>
+              <w:right w:w="80" w:type="dxa"/>
+            </w:tcMar>
+          </w:tcPr>
+          <w:p>
+            <w:r>
+              <w:rPr>
+                <w:rFonts w:ascii="Aptos" w:eastAsia="Aptos" w:hAnsi="Aptos" w:cs="Aptos"/>
+                <w:sz w:val="20"/>
+                <w:szCs w:val="20"/>
+              </w:rPr>
+              <w:t xml:space="preserve">Look at seat A1 on the Paddington 2 screening, which is booked, and seat A1 on the Inception screening, which is also booked</w:t>
+            </w:r>
+          </w:p>
+        </w:tc>
+        <w:tc>
+          <w:tcPr>
+            <w:tcW w:w="560" w:type="pct"/>
+            <w:tcMar>
+              <w:top w:w="30" w:type="dxa"/>
+              <w:left w:w="80" w:type="dxa"/>
+              <w:bottom w:w="30" w:type="dxa"/>
+              <w:right w:w="80" w:type="dxa"/>
+            </w:tcMar>
+          </w:tcPr>
+          <w:p>
+            <w:r>
+              <w:rPr>
+                <w:rFonts w:ascii="Aptos" w:eastAsia="Aptos" w:hAnsi="Aptos" w:cs="Aptos"/>
+                <w:sz w:val="20"/>
+                <w:szCs w:val="20"/>
+              </w:rPr>
+              <w:t xml:space="preserve">Normal</w:t>
+            </w:r>
+          </w:p>
+        </w:tc>
+        <w:tc>
+          <w:tcPr>
+            <w:tcW w:w="2290" w:type="pct"/>
+            <w:tcMar>
+              <w:top w:w="30" w:type="dxa"/>
+              <w:left w:w="80" w:type="dxa"/>
+              <w:bottom w:w="30" w:type="dxa"/>
+              <w:right w:w="80" w:type="dxa"/>
+            </w:tcMar>
+          </w:tcPr>
+          <w:p>
+            <w:r>
+              <w:rPr>
+                <w:rFonts w:ascii="Aptos" w:eastAsia="Aptos" w:hAnsi="Aptos" w:cs="Aptos"/>
+                <w:sz w:val="20"/>
+                <w:szCs w:val="20"/>
+              </w:rPr>
+              <w:t xml:space="preserve">Both are shown as taken on their own screening only. Booking A1 on one screening has no effect on seat A1 of the other, because a seat is only taken for the screening it was sold for.</w:t>
             </w:r>
           </w:p>
         </w:tc>

</xml_diff>

<commit_message>
added objective 3: displaying the graphical seat map
</commit_message>
<xml_diff>
--- a/Testing.docx
+++ b/Testing.docx
@@ -5401,6 +5401,696 @@
                 <w:szCs w:val="20"/>
               </w:rPr>
               <w:t xml:space="preserve">Both are shown as taken on their own screening only. Booking A1 on one screening has no effect on seat A1 of the other, because a seat is only taken for the screening it was sold for.</w:t>
+            </w:r>
+          </w:p>
+        </w:tc>
+      </w:tr>
+    </w:tbl>
+    <w:p>
+      <w:r>
+        <w:rPr>
+          <w:rFonts w:ascii="Aptos" w:eastAsia="Aptos" w:hAnsi="Aptos" w:cs="Aptos"/>
+        </w:rPr>
+        <w:t xml:space="preserve"/>
+      </w:r>
+    </w:p>
+    <w:p>
+      <w:pPr>
+        <w:pStyle w:val="Heading3"/>
+      </w:pPr>
+      <w:r>
+        <w:rPr>
+          <w:rFonts w:ascii="Aptos Display" w:eastAsia="Aptos Display" w:hAnsi="Aptos Display" w:cs="Aptos Display"/>
+          <w:b/>
+          <w:bCs/>
+          <w:color w:val="000000"/>
+        </w:rPr>
+        <w:t xml:space="preserve">Objective 3: Displaying the Graphical Seat Map</w:t>
+      </w:r>
+    </w:p>
+    <w:p>
+      <w:r>
+        <w:rPr>
+          <w:rFonts w:ascii="Aptos" w:eastAsia="Aptos" w:hAnsi="Aptos" w:cs="Aptos"/>
+        </w:rPr>
+        <w:t xml:space="preserve">These tests check that the seat map is drawn correctly and quickly for a chosen screening, and that it now shows the type of each seat as well as whether it is free, since the type is what decides the price.</w:t>
+      </w:r>
+    </w:p>
+    <w:tbl>
+      <w:tblPr>
+        <w:tblW w:w="5000" w:type="pct"/>
+        <w:tblBorders>
+          <w:top w:val="single" w:sz="4" w:space="0" w:color="808080"/>
+          <w:left w:val="single" w:sz="4" w:space="0" w:color="808080"/>
+          <w:bottom w:val="single" w:sz="4" w:space="0" w:color="808080"/>
+          <w:right w:val="single" w:sz="4" w:space="0" w:color="808080"/>
+          <w:insideH w:val="single" w:sz="4" w:space="0" w:color="808080"/>
+          <w:insideV w:val="single" w:sz="4" w:space="0" w:color="808080"/>
+        </w:tblBorders>
+        <w:tblCellMar>
+          <w:left w:w="10" w:type="dxa"/>
+          <w:right w:w="10" w:type="dxa"/>
+        </w:tblCellMar>
+        <w:tblLook w:val="0000" w:firstRow="0" w:lastRow="0" w:firstColumn="0" w:lastColumn="0" w:noHBand="0" w:noVBand="0"/>
+      </w:tblPr>
+      <w:tblGrid>
+        <w:gridCol w:w="561"/>
+        <w:gridCol w:w="3460"/>
+        <w:gridCol w:w="1047"/>
+        <w:gridCol w:w="4282"/>
+      </w:tblGrid>
+      <w:tr>
+        <w:trPr>
+          <w:cantSplit/>
+          <w:tblHeader/>
+        </w:trPr>
+        <w:tc>
+          <w:tcPr>
+            <w:tcW w:w="300" w:type="pct"/>
+            <w:shd w:val="clear" w:color="auto" w:fill="F2CEED" w:themeFill="accent5" w:themeFillTint="33"/>
+            <w:tcMar>
+              <w:top w:w="30" w:type="dxa"/>
+              <w:left w:w="80" w:type="dxa"/>
+              <w:bottom w:w="30" w:type="dxa"/>
+              <w:right w:w="80" w:type="dxa"/>
+            </w:tcMar>
+          </w:tcPr>
+          <w:p>
+            <w:r>
+              <w:rPr>
+                <w:rFonts w:ascii="Aptos" w:eastAsia="Aptos" w:hAnsi="Aptos" w:cs="Aptos"/>
+                <w:b/>
+                <w:bCs/>
+                <w:sz w:val="20"/>
+                <w:szCs w:val="20"/>
+              </w:rPr>
+              <w:t xml:space="preserve">No.</w:t>
+            </w:r>
+          </w:p>
+        </w:tc>
+        <w:tc>
+          <w:tcPr>
+            <w:tcW w:w="1850" w:type="pct"/>
+            <w:shd w:val="clear" w:color="auto" w:fill="F2CEED" w:themeFill="accent5" w:themeFillTint="33"/>
+            <w:tcMar>
+              <w:top w:w="30" w:type="dxa"/>
+              <w:left w:w="80" w:type="dxa"/>
+              <w:bottom w:w="30" w:type="dxa"/>
+              <w:right w:w="80" w:type="dxa"/>
+            </w:tcMar>
+          </w:tcPr>
+          <w:p>
+            <w:r>
+              <w:rPr>
+                <w:rFonts w:ascii="Aptos" w:eastAsia="Aptos" w:hAnsi="Aptos" w:cs="Aptos"/>
+                <w:b/>
+                <w:bCs/>
+                <w:sz w:val="20"/>
+                <w:szCs w:val="20"/>
+              </w:rPr>
+              <w:t xml:space="preserve">Test</w:t>
+            </w:r>
+          </w:p>
+        </w:tc>
+        <w:tc>
+          <w:tcPr>
+            <w:tcW w:w="560" w:type="pct"/>
+            <w:shd w:val="clear" w:color="auto" w:fill="F2CEED" w:themeFill="accent5" w:themeFillTint="33"/>
+            <w:tcMar>
+              <w:top w:w="30" w:type="dxa"/>
+              <w:left w:w="80" w:type="dxa"/>
+              <w:bottom w:w="30" w:type="dxa"/>
+              <w:right w:w="80" w:type="dxa"/>
+            </w:tcMar>
+          </w:tcPr>
+          <w:p>
+            <w:r>
+              <w:rPr>
+                <w:rFonts w:ascii="Aptos" w:eastAsia="Aptos" w:hAnsi="Aptos" w:cs="Aptos"/>
+                <w:b/>
+                <w:bCs/>
+                <w:sz w:val="20"/>
+                <w:szCs w:val="20"/>
+              </w:rPr>
+              <w:t xml:space="preserve">Type</w:t>
+            </w:r>
+          </w:p>
+        </w:tc>
+        <w:tc>
+          <w:tcPr>
+            <w:tcW w:w="2290" w:type="pct"/>
+            <w:shd w:val="clear" w:color="auto" w:fill="F2CEED" w:themeFill="accent5" w:themeFillTint="33"/>
+            <w:tcMar>
+              <w:top w:w="30" w:type="dxa"/>
+              <w:left w:w="80" w:type="dxa"/>
+              <w:bottom w:w="30" w:type="dxa"/>
+              <w:right w:w="80" w:type="dxa"/>
+            </w:tcMar>
+          </w:tcPr>
+          <w:p>
+            <w:r>
+              <w:rPr>
+                <w:rFonts w:ascii="Aptos" w:eastAsia="Aptos" w:hAnsi="Aptos" w:cs="Aptos"/>
+                <w:b/>
+                <w:bCs/>
+                <w:sz w:val="20"/>
+                <w:szCs w:val="20"/>
+              </w:rPr>
+              <w:t xml:space="preserve">Expected Result</w:t>
+            </w:r>
+          </w:p>
+        </w:tc>
+      </w:tr>
+      <w:tr>
+        <w:trPr>
+          <w:cantSplit/>
+        </w:trPr>
+        <w:tc>
+          <w:tcPr>
+            <w:tcW w:w="300" w:type="pct"/>
+            <w:tcMar>
+              <w:top w:w="30" w:type="dxa"/>
+              <w:left w:w="80" w:type="dxa"/>
+              <w:bottom w:w="30" w:type="dxa"/>
+              <w:right w:w="80" w:type="dxa"/>
+            </w:tcMar>
+          </w:tcPr>
+          <w:p>
+            <w:r>
+              <w:rPr>
+                <w:rFonts w:ascii="Aptos" w:eastAsia="Aptos" w:hAnsi="Aptos" w:cs="Aptos"/>
+                <w:sz w:val="20"/>
+                <w:szCs w:val="20"/>
+              </w:rPr>
+              <w:t xml:space="preserve">51</w:t>
+            </w:r>
+          </w:p>
+        </w:tc>
+        <w:tc>
+          <w:tcPr>
+            <w:tcW w:w="1850" w:type="pct"/>
+            <w:tcMar>
+              <w:top w:w="30" w:type="dxa"/>
+              <w:left w:w="80" w:type="dxa"/>
+              <w:bottom w:w="30" w:type="dxa"/>
+              <w:right w:w="80" w:type="dxa"/>
+            </w:tcMar>
+          </w:tcPr>
+          <w:p>
+            <w:r>
+              <w:rPr>
+                <w:rFonts w:ascii="Aptos" w:eastAsia="Aptos" w:hAnsi="Aptos" w:cs="Aptos"/>
+                <w:sz w:val="20"/>
+                <w:szCs w:val="20"/>
+              </w:rPr>
+              <w:t xml:space="preserve">Pick the Inception screening, which runs in Screen 1, on the Bookings form</w:t>
+            </w:r>
+          </w:p>
+        </w:tc>
+        <w:tc>
+          <w:tcPr>
+            <w:tcW w:w="560" w:type="pct"/>
+            <w:tcMar>
+              <w:top w:w="30" w:type="dxa"/>
+              <w:left w:w="80" w:type="dxa"/>
+              <w:bottom w:w="30" w:type="dxa"/>
+              <w:right w:w="80" w:type="dxa"/>
+            </w:tcMar>
+          </w:tcPr>
+          <w:p>
+            <w:r>
+              <w:rPr>
+                <w:rFonts w:ascii="Aptos" w:eastAsia="Aptos" w:hAnsi="Aptos" w:cs="Aptos"/>
+                <w:sz w:val="20"/>
+                <w:szCs w:val="20"/>
+              </w:rPr>
+              <w:t xml:space="preserve">Normal</w:t>
+            </w:r>
+          </w:p>
+        </w:tc>
+        <w:tc>
+          <w:tcPr>
+            <w:tcW w:w="2290" w:type="pct"/>
+            <w:tcMar>
+              <w:top w:w="30" w:type="dxa"/>
+              <w:left w:w="80" w:type="dxa"/>
+              <w:bottom w:w="30" w:type="dxa"/>
+              <w:right w:w="80" w:type="dxa"/>
+            </w:tcMar>
+          </w:tcPr>
+          <w:p>
+            <w:r>
+              <w:rPr>
+                <w:rFonts w:ascii="Aptos" w:eastAsia="Aptos" w:hAnsi="Aptos" w:cs="Aptos"/>
+                <w:sz w:val="20"/>
+                <w:szCs w:val="20"/>
+              </w:rPr>
+              <w:t xml:space="preserve">A graphical seat map is displayed showing 50 seats laid out as 5 rows A to E of 10 seats each, matching the layout of Screen 1.</w:t>
+            </w:r>
+          </w:p>
+        </w:tc>
+      </w:tr>
+      <w:tr>
+        <w:trPr>
+          <w:cantSplit/>
+        </w:trPr>
+        <w:tc>
+          <w:tcPr>
+            <w:tcW w:w="300" w:type="pct"/>
+            <w:tcMar>
+              <w:top w:w="30" w:type="dxa"/>
+              <w:left w:w="80" w:type="dxa"/>
+              <w:bottom w:w="30" w:type="dxa"/>
+              <w:right w:w="80" w:type="dxa"/>
+            </w:tcMar>
+          </w:tcPr>
+          <w:p>
+            <w:r>
+              <w:rPr>
+                <w:rFonts w:ascii="Aptos" w:eastAsia="Aptos" w:hAnsi="Aptos" w:cs="Aptos"/>
+                <w:sz w:val="20"/>
+                <w:szCs w:val="20"/>
+              </w:rPr>
+              <w:t xml:space="preserve">52</w:t>
+            </w:r>
+          </w:p>
+        </w:tc>
+        <w:tc>
+          <w:tcPr>
+            <w:tcW w:w="1850" w:type="pct"/>
+            <w:tcMar>
+              <w:top w:w="30" w:type="dxa"/>
+              <w:left w:w="80" w:type="dxa"/>
+              <w:bottom w:w="30" w:type="dxa"/>
+              <w:right w:w="80" w:type="dxa"/>
+            </w:tcMar>
+          </w:tcPr>
+          <w:p>
+            <w:r>
+              <w:rPr>
+                <w:rFonts w:ascii="Aptos" w:eastAsia="Aptos" w:hAnsi="Aptos" w:cs="Aptos"/>
+                <w:sz w:val="20"/>
+                <w:szCs w:val="20"/>
+              </w:rPr>
+              <w:t xml:space="preserve">Look at the colours of the seats on the Inception seat map</w:t>
+            </w:r>
+          </w:p>
+        </w:tc>
+        <w:tc>
+          <w:tcPr>
+            <w:tcW w:w="560" w:type="pct"/>
+            <w:tcMar>
+              <w:top w:w="30" w:type="dxa"/>
+              <w:left w:w="80" w:type="dxa"/>
+              <w:bottom w:w="30" w:type="dxa"/>
+              <w:right w:w="80" w:type="dxa"/>
+            </w:tcMar>
+          </w:tcPr>
+          <w:p>
+            <w:r>
+              <w:rPr>
+                <w:rFonts w:ascii="Aptos" w:eastAsia="Aptos" w:hAnsi="Aptos" w:cs="Aptos"/>
+                <w:sz w:val="20"/>
+                <w:szCs w:val="20"/>
+              </w:rPr>
+              <w:t xml:space="preserve">Normal</w:t>
+            </w:r>
+          </w:p>
+        </w:tc>
+        <w:tc>
+          <w:tcPr>
+            <w:tcW w:w="2290" w:type="pct"/>
+            <w:tcMar>
+              <w:top w:w="30" w:type="dxa"/>
+              <w:left w:w="80" w:type="dxa"/>
+              <w:bottom w:w="30" w:type="dxa"/>
+              <w:right w:w="80" w:type="dxa"/>
+            </w:tcMar>
+          </w:tcPr>
+          <w:p>
+            <w:r>
+              <w:rPr>
+                <w:rFonts w:ascii="Aptos" w:eastAsia="Aptos" w:hAnsi="Aptos" w:cs="Aptos"/>
+                <w:sz w:val="20"/>
+                <w:szCs w:val="20"/>
+              </w:rPr>
+              <w:t xml:space="preserve">Available seats appear in the available colour, seats that have been sold appear in the taken colour and cannot be clicked, and a seat turns the selected colour when it is clicked.</w:t>
+            </w:r>
+          </w:p>
+        </w:tc>
+      </w:tr>
+      <w:tr>
+        <w:trPr>
+          <w:cantSplit/>
+        </w:trPr>
+        <w:tc>
+          <w:tcPr>
+            <w:tcW w:w="300" w:type="pct"/>
+            <w:tcMar>
+              <w:top w:w="30" w:type="dxa"/>
+              <w:left w:w="80" w:type="dxa"/>
+              <w:bottom w:w="30" w:type="dxa"/>
+              <w:right w:w="80" w:type="dxa"/>
+            </w:tcMar>
+          </w:tcPr>
+          <w:p>
+            <w:r>
+              <w:rPr>
+                <w:rFonts w:ascii="Aptos" w:eastAsia="Aptos" w:hAnsi="Aptos" w:cs="Aptos"/>
+                <w:sz w:val="20"/>
+                <w:szCs w:val="20"/>
+              </w:rPr>
+              <w:t xml:space="preserve">53</w:t>
+            </w:r>
+          </w:p>
+        </w:tc>
+        <w:tc>
+          <w:tcPr>
+            <w:tcW w:w="1850" w:type="pct"/>
+            <w:tcMar>
+              <w:top w:w="30" w:type="dxa"/>
+              <w:left w:w="80" w:type="dxa"/>
+              <w:bottom w:w="30" w:type="dxa"/>
+              <w:right w:w="80" w:type="dxa"/>
+            </w:tcMar>
+          </w:tcPr>
+          <w:p>
+            <w:r>
+              <w:rPr>
+                <w:rFonts w:ascii="Aptos" w:eastAsia="Aptos" w:hAnsi="Aptos" w:cs="Aptos"/>
+                <w:sz w:val="20"/>
+                <w:szCs w:val="20"/>
+              </w:rPr>
+              <w:t xml:space="preserve">Look at the edges of the seats in rows A, C and D and compare them with the key</w:t>
+            </w:r>
+          </w:p>
+        </w:tc>
+        <w:tc>
+          <w:tcPr>
+            <w:tcW w:w="560" w:type="pct"/>
+            <w:tcMar>
+              <w:top w:w="30" w:type="dxa"/>
+              <w:left w:w="80" w:type="dxa"/>
+              <w:bottom w:w="30" w:type="dxa"/>
+              <w:right w:w="80" w:type="dxa"/>
+            </w:tcMar>
+          </w:tcPr>
+          <w:p>
+            <w:r>
+              <w:rPr>
+                <w:rFonts w:ascii="Aptos" w:eastAsia="Aptos" w:hAnsi="Aptos" w:cs="Aptos"/>
+                <w:sz w:val="20"/>
+                <w:szCs w:val="20"/>
+              </w:rPr>
+              <w:t xml:space="preserve">Normal</w:t>
+            </w:r>
+          </w:p>
+        </w:tc>
+        <w:tc>
+          <w:tcPr>
+            <w:tcW w:w="2290" w:type="pct"/>
+            <w:tcMar>
+              <w:top w:w="30" w:type="dxa"/>
+              <w:left w:w="80" w:type="dxa"/>
+              <w:bottom w:w="30" w:type="dxa"/>
+              <w:right w:w="80" w:type="dxa"/>
+            </w:tcMar>
+          </w:tcPr>
+          <w:p>
+            <w:r>
+              <w:rPr>
+                <w:rFonts w:ascii="Aptos" w:eastAsia="Aptos" w:hAnsi="Aptos" w:cs="Aptos"/>
+                <w:sz w:val="20"/>
+                <w:szCs w:val="20"/>
+              </w:rPr>
+              <w:t xml:space="preserve">Saver, Accessible and Premium seats are edged in their own colour and the key explains what each one means, so a member of staff can see which seats cost more before selecting them.</w:t>
+            </w:r>
+          </w:p>
+        </w:tc>
+      </w:tr>
+      <w:tr>
+        <w:trPr>
+          <w:cantSplit/>
+        </w:trPr>
+        <w:tc>
+          <w:tcPr>
+            <w:tcW w:w="300" w:type="pct"/>
+            <w:tcMar>
+              <w:top w:w="30" w:type="dxa"/>
+              <w:left w:w="80" w:type="dxa"/>
+              <w:bottom w:w="30" w:type="dxa"/>
+              <w:right w:w="80" w:type="dxa"/>
+            </w:tcMar>
+          </w:tcPr>
+          <w:p>
+            <w:r>
+              <w:rPr>
+                <w:rFonts w:ascii="Aptos" w:eastAsia="Aptos" w:hAnsi="Aptos" w:cs="Aptos"/>
+                <w:sz w:val="20"/>
+                <w:szCs w:val="20"/>
+              </w:rPr>
+              <w:t xml:space="preserve">54</w:t>
+            </w:r>
+          </w:p>
+        </w:tc>
+        <w:tc>
+          <w:tcPr>
+            <w:tcW w:w="1850" w:type="pct"/>
+            <w:tcMar>
+              <w:top w:w="30" w:type="dxa"/>
+              <w:left w:w="80" w:type="dxa"/>
+              <w:bottom w:w="30" w:type="dxa"/>
+              <w:right w:w="80" w:type="dxa"/>
+            </w:tcMar>
+          </w:tcPr>
+          <w:p>
+            <w:r>
+              <w:rPr>
+                <w:rFonts w:ascii="Aptos" w:eastAsia="Aptos" w:hAnsi="Aptos" w:cs="Aptos"/>
+                <w:sz w:val="20"/>
+                <w:szCs w:val="20"/>
+              </w:rPr>
+              <w:t xml:space="preserve">Select seat D2 and look at the running total</w:t>
+            </w:r>
+          </w:p>
+        </w:tc>
+        <w:tc>
+          <w:tcPr>
+            <w:tcW w:w="560" w:type="pct"/>
+            <w:tcMar>
+              <w:top w:w="30" w:type="dxa"/>
+              <w:left w:w="80" w:type="dxa"/>
+              <w:bottom w:w="30" w:type="dxa"/>
+              <w:right w:w="80" w:type="dxa"/>
+            </w:tcMar>
+          </w:tcPr>
+          <w:p>
+            <w:r>
+              <w:rPr>
+                <w:rFonts w:ascii="Aptos" w:eastAsia="Aptos" w:hAnsi="Aptos" w:cs="Aptos"/>
+                <w:sz w:val="20"/>
+                <w:szCs w:val="20"/>
+              </w:rPr>
+              <w:t xml:space="preserve">Normal</w:t>
+            </w:r>
+          </w:p>
+        </w:tc>
+        <w:tc>
+          <w:tcPr>
+            <w:tcW w:w="2290" w:type="pct"/>
+            <w:tcMar>
+              <w:top w:w="30" w:type="dxa"/>
+              <w:left w:w="80" w:type="dxa"/>
+              <w:bottom w:w="30" w:type="dxa"/>
+              <w:right w:w="80" w:type="dxa"/>
+            </w:tcMar>
+          </w:tcPr>
+          <w:p>
+            <w:r>
+              <w:rPr>
+                <w:rFonts w:ascii="Aptos" w:eastAsia="Aptos" w:hAnsi="Aptos" w:cs="Aptos"/>
+                <w:sz w:val="20"/>
+                <w:szCs w:val="20"/>
+              </w:rPr>
+              <w:t xml:space="preserve">The total shows £13.50 rather than £9.00, because D2 is a Premium seat, so the price of the seat is visible before the sale is completed.</w:t>
+            </w:r>
+          </w:p>
+        </w:tc>
+      </w:tr>
+      <w:tr>
+        <w:trPr>
+          <w:cantSplit/>
+        </w:trPr>
+        <w:tc>
+          <w:tcPr>
+            <w:tcW w:w="300" w:type="pct"/>
+            <w:tcMar>
+              <w:top w:w="30" w:type="dxa"/>
+              <w:left w:w="80" w:type="dxa"/>
+              <w:bottom w:w="30" w:type="dxa"/>
+              <w:right w:w="80" w:type="dxa"/>
+            </w:tcMar>
+          </w:tcPr>
+          <w:p>
+            <w:r>
+              <w:rPr>
+                <w:rFonts w:ascii="Aptos" w:eastAsia="Aptos" w:hAnsi="Aptos" w:cs="Aptos"/>
+                <w:sz w:val="20"/>
+                <w:szCs w:val="20"/>
+              </w:rPr>
+              <w:t xml:space="preserve">55</w:t>
+            </w:r>
+          </w:p>
+        </w:tc>
+        <w:tc>
+          <w:tcPr>
+            <w:tcW w:w="1850" w:type="pct"/>
+            <w:tcMar>
+              <w:top w:w="30" w:type="dxa"/>
+              <w:left w:w="80" w:type="dxa"/>
+              <w:bottom w:w="30" w:type="dxa"/>
+              <w:right w:w="80" w:type="dxa"/>
+            </w:tcMar>
+          </w:tcPr>
+          <w:p>
+            <w:r>
+              <w:rPr>
+                <w:rFonts w:ascii="Aptos" w:eastAsia="Aptos" w:hAnsi="Aptos" w:cs="Aptos"/>
+                <w:sz w:val="20"/>
+                <w:szCs w:val="20"/>
+              </w:rPr>
+              <w:t xml:space="preserve">Pick the Inception screening and time how long the seat map takes to appear</w:t>
+            </w:r>
+          </w:p>
+        </w:tc>
+        <w:tc>
+          <w:tcPr>
+            <w:tcW w:w="560" w:type="pct"/>
+            <w:tcMar>
+              <w:top w:w="30" w:type="dxa"/>
+              <w:left w:w="80" w:type="dxa"/>
+              <w:bottom w:w="30" w:type="dxa"/>
+              <w:right w:w="80" w:type="dxa"/>
+            </w:tcMar>
+          </w:tcPr>
+          <w:p>
+            <w:r>
+              <w:rPr>
+                <w:rFonts w:ascii="Aptos" w:eastAsia="Aptos" w:hAnsi="Aptos" w:cs="Aptos"/>
+                <w:sz w:val="20"/>
+                <w:szCs w:val="20"/>
+              </w:rPr>
+              <w:t xml:space="preserve">Normal</w:t>
+            </w:r>
+          </w:p>
+        </w:tc>
+        <w:tc>
+          <w:tcPr>
+            <w:tcW w:w="2290" w:type="pct"/>
+            <w:tcMar>
+              <w:top w:w="30" w:type="dxa"/>
+              <w:left w:w="80" w:type="dxa"/>
+              <w:bottom w:w="30" w:type="dxa"/>
+              <w:right w:w="80" w:type="dxa"/>
+            </w:tcMar>
+          </w:tcPr>
+          <w:p>
+            <w:r>
+              <w:rPr>
+                <w:rFonts w:ascii="Aptos" w:eastAsia="Aptos" w:hAnsi="Aptos" w:cs="Aptos"/>
+                <w:sz w:val="20"/>
+                <w:szCs w:val="20"/>
+              </w:rPr>
+              <w:t xml:space="preserve">The seat map finishes loading within 3 seconds of the screening being selected, meeting the success criterion set in the Investigation.</w:t>
+            </w:r>
+          </w:p>
+        </w:tc>
+      </w:tr>
+      <w:tr>
+        <w:trPr>
+          <w:cantSplit/>
+        </w:trPr>
+        <w:tc>
+          <w:tcPr>
+            <w:tcW w:w="300" w:type="pct"/>
+            <w:tcMar>
+              <w:top w:w="30" w:type="dxa"/>
+              <w:left w:w="80" w:type="dxa"/>
+              <w:bottom w:w="30" w:type="dxa"/>
+              <w:right w:w="80" w:type="dxa"/>
+            </w:tcMar>
+          </w:tcPr>
+          <w:p>
+            <w:r>
+              <w:rPr>
+                <w:rFonts w:ascii="Aptos" w:eastAsia="Aptos" w:hAnsi="Aptos" w:cs="Aptos"/>
+                <w:sz w:val="20"/>
+                <w:szCs w:val="20"/>
+              </w:rPr>
+              <w:t xml:space="preserve">56</w:t>
+            </w:r>
+          </w:p>
+        </w:tc>
+        <w:tc>
+          <w:tcPr>
+            <w:tcW w:w="1850" w:type="pct"/>
+            <w:tcMar>
+              <w:top w:w="30" w:type="dxa"/>
+              <w:left w:w="80" w:type="dxa"/>
+              <w:bottom w:w="30" w:type="dxa"/>
+              <w:right w:w="80" w:type="dxa"/>
+            </w:tcMar>
+          </w:tcPr>
+          <w:p>
+            <w:r>
+              <w:rPr>
+                <w:rFonts w:ascii="Aptos" w:eastAsia="Aptos" w:hAnsi="Aptos" w:cs="Aptos"/>
+                <w:sz w:val="20"/>
+                <w:szCs w:val="20"/>
+              </w:rPr>
+              <w:t xml:space="preserve">Pick the screening on Big Screen, which has 520 seats, and time how long the seat map takes to appear</w:t>
+            </w:r>
+          </w:p>
+        </w:tc>
+        <w:tc>
+          <w:tcPr>
+            <w:tcW w:w="560" w:type="pct"/>
+            <w:tcMar>
+              <w:top w:w="30" w:type="dxa"/>
+              <w:left w:w="80" w:type="dxa"/>
+              <w:bottom w:w="30" w:type="dxa"/>
+              <w:right w:w="80" w:type="dxa"/>
+            </w:tcMar>
+          </w:tcPr>
+          <w:p>
+            <w:r>
+              <w:rPr>
+                <w:rFonts w:ascii="Aptos" w:eastAsia="Aptos" w:hAnsi="Aptos" w:cs="Aptos"/>
+                <w:sz w:val="20"/>
+                <w:szCs w:val="20"/>
+              </w:rPr>
+              <w:t xml:space="preserve">Boundary</w:t>
+            </w:r>
+          </w:p>
+        </w:tc>
+        <w:tc>
+          <w:tcPr>
+            <w:tcW w:w="2290" w:type="pct"/>
+            <w:tcMar>
+              <w:top w:w="30" w:type="dxa"/>
+              <w:left w:w="80" w:type="dxa"/>
+              <w:bottom w:w="30" w:type="dxa"/>
+              <w:right w:w="80" w:type="dxa"/>
+            </w:tcMar>
+          </w:tcPr>
+          <w:p>
+            <w:r>
+              <w:rPr>
+                <w:rFonts w:ascii="Aptos" w:eastAsia="Aptos" w:hAnsi="Aptos" w:cs="Aptos"/>
+                <w:sz w:val="20"/>
+                <w:szCs w:val="20"/>
+              </w:rPr>
+              <w:t xml:space="preserve">The seat map still finishes loading within 3 seconds at the largest screen size the system allows.</w:t>
             </w:r>
           </w:p>
         </w:tc>

</xml_diff>

<commit_message>
added objective 5: adding food and drink to an order
</commit_message>
<xml_diff>
--- a/Testing.docx
+++ b/Testing.docx
@@ -6091,6 +6091,1141 @@
                 <w:szCs w:val="20"/>
               </w:rPr>
               <w:t xml:space="preserve">The seat map still finishes loading within 3 seconds at the largest screen size the system allows.</w:t>
+            </w:r>
+          </w:p>
+        </w:tc>
+      </w:tr>
+    </w:tbl>
+    <w:p>
+      <w:r>
+        <w:rPr>
+          <w:rFonts w:ascii="Aptos" w:eastAsia="Aptos" w:hAnsi="Aptos" w:cs="Aptos"/>
+        </w:rPr>
+        <w:t xml:space="preserve"/>
+      </w:r>
+    </w:p>
+    <w:p>
+      <w:pPr>
+        <w:pStyle w:val="Heading3"/>
+      </w:pPr>
+      <w:r>
+        <w:rPr>
+          <w:rFonts w:ascii="Aptos Display" w:eastAsia="Aptos Display" w:hAnsi="Aptos Display" w:cs="Aptos Display"/>
+          <w:b/>
+          <w:bCs/>
+          <w:color w:val="000000"/>
+        </w:rPr>
+        <w:t xml:space="preserve">Objective 5: Adding Food and Drink to an Order</w:t>
+      </w:r>
+    </w:p>
+    <w:p>
+      <w:r>
+        <w:rPr>
+          <w:rFonts w:ascii="Aptos" w:eastAsia="Aptos" w:hAnsi="Aptos" w:cs="Aptos"/>
+        </w:rPr>
+        <w:t xml:space="preserve">Food items are added first and then ordered against John Smith's Inception booking, so that the order total can be checked and later included in the sales report. The price paid for a food item is stored on the order line at the moment of sale in the same way as a ticket price, which the last test in this table checks.</w:t>
+      </w:r>
+    </w:p>
+    <w:tbl>
+      <w:tblPr>
+        <w:tblW w:w="5000" w:type="pct"/>
+        <w:tblBorders>
+          <w:top w:val="single" w:sz="4" w:space="0" w:color="808080"/>
+          <w:left w:val="single" w:sz="4" w:space="0" w:color="808080"/>
+          <w:bottom w:val="single" w:sz="4" w:space="0" w:color="808080"/>
+          <w:right w:val="single" w:sz="4" w:space="0" w:color="808080"/>
+          <w:insideH w:val="single" w:sz="4" w:space="0" w:color="808080"/>
+          <w:insideV w:val="single" w:sz="4" w:space="0" w:color="808080"/>
+        </w:tblBorders>
+        <w:tblCellMar>
+          <w:left w:w="10" w:type="dxa"/>
+          <w:right w:w="10" w:type="dxa"/>
+        </w:tblCellMar>
+        <w:tblLook w:val="0000" w:firstRow="0" w:lastRow="0" w:firstColumn="0" w:lastColumn="0" w:noHBand="0" w:noVBand="0"/>
+      </w:tblPr>
+      <w:tblGrid>
+        <w:gridCol w:w="561"/>
+        <w:gridCol w:w="3460"/>
+        <w:gridCol w:w="1047"/>
+        <w:gridCol w:w="4282"/>
+      </w:tblGrid>
+      <w:tr>
+        <w:trPr>
+          <w:cantSplit/>
+          <w:tblHeader/>
+        </w:trPr>
+        <w:tc>
+          <w:tcPr>
+            <w:tcW w:w="300" w:type="pct"/>
+            <w:shd w:val="clear" w:color="auto" w:fill="F2CEED" w:themeFill="accent5" w:themeFillTint="33"/>
+            <w:tcMar>
+              <w:top w:w="30" w:type="dxa"/>
+              <w:left w:w="80" w:type="dxa"/>
+              <w:bottom w:w="30" w:type="dxa"/>
+              <w:right w:w="80" w:type="dxa"/>
+            </w:tcMar>
+          </w:tcPr>
+          <w:p>
+            <w:r>
+              <w:rPr>
+                <w:rFonts w:ascii="Aptos" w:eastAsia="Aptos" w:hAnsi="Aptos" w:cs="Aptos"/>
+                <w:b/>
+                <w:bCs/>
+                <w:sz w:val="20"/>
+                <w:szCs w:val="20"/>
+              </w:rPr>
+              <w:t xml:space="preserve">No.</w:t>
+            </w:r>
+          </w:p>
+        </w:tc>
+        <w:tc>
+          <w:tcPr>
+            <w:tcW w:w="1850" w:type="pct"/>
+            <w:shd w:val="clear" w:color="auto" w:fill="F2CEED" w:themeFill="accent5" w:themeFillTint="33"/>
+            <w:tcMar>
+              <w:top w:w="30" w:type="dxa"/>
+              <w:left w:w="80" w:type="dxa"/>
+              <w:bottom w:w="30" w:type="dxa"/>
+              <w:right w:w="80" w:type="dxa"/>
+            </w:tcMar>
+          </w:tcPr>
+          <w:p>
+            <w:r>
+              <w:rPr>
+                <w:rFonts w:ascii="Aptos" w:eastAsia="Aptos" w:hAnsi="Aptos" w:cs="Aptos"/>
+                <w:b/>
+                <w:bCs/>
+                <w:sz w:val="20"/>
+                <w:szCs w:val="20"/>
+              </w:rPr>
+              <w:t xml:space="preserve">Test</w:t>
+            </w:r>
+          </w:p>
+        </w:tc>
+        <w:tc>
+          <w:tcPr>
+            <w:tcW w:w="560" w:type="pct"/>
+            <w:shd w:val="clear" w:color="auto" w:fill="F2CEED" w:themeFill="accent5" w:themeFillTint="33"/>
+            <w:tcMar>
+              <w:top w:w="30" w:type="dxa"/>
+              <w:left w:w="80" w:type="dxa"/>
+              <w:bottom w:w="30" w:type="dxa"/>
+              <w:right w:w="80" w:type="dxa"/>
+            </w:tcMar>
+          </w:tcPr>
+          <w:p>
+            <w:r>
+              <w:rPr>
+                <w:rFonts w:ascii="Aptos" w:eastAsia="Aptos" w:hAnsi="Aptos" w:cs="Aptos"/>
+                <w:b/>
+                <w:bCs/>
+                <w:sz w:val="20"/>
+                <w:szCs w:val="20"/>
+              </w:rPr>
+              <w:t xml:space="preserve">Type</w:t>
+            </w:r>
+          </w:p>
+        </w:tc>
+        <w:tc>
+          <w:tcPr>
+            <w:tcW w:w="2290" w:type="pct"/>
+            <w:shd w:val="clear" w:color="auto" w:fill="F2CEED" w:themeFill="accent5" w:themeFillTint="33"/>
+            <w:tcMar>
+              <w:top w:w="30" w:type="dxa"/>
+              <w:left w:w="80" w:type="dxa"/>
+              <w:bottom w:w="30" w:type="dxa"/>
+              <w:right w:w="80" w:type="dxa"/>
+            </w:tcMar>
+          </w:tcPr>
+          <w:p>
+            <w:r>
+              <w:rPr>
+                <w:rFonts w:ascii="Aptos" w:eastAsia="Aptos" w:hAnsi="Aptos" w:cs="Aptos"/>
+                <w:b/>
+                <w:bCs/>
+                <w:sz w:val="20"/>
+                <w:szCs w:val="20"/>
+              </w:rPr>
+              <w:t xml:space="preserve">Expected Result</w:t>
+            </w:r>
+          </w:p>
+        </w:tc>
+      </w:tr>
+      <w:tr>
+        <w:trPr>
+          <w:cantSplit/>
+        </w:trPr>
+        <w:tc>
+          <w:tcPr>
+            <w:tcW w:w="300" w:type="pct"/>
+            <w:tcMar>
+              <w:top w:w="30" w:type="dxa"/>
+              <w:left w:w="80" w:type="dxa"/>
+              <w:bottom w:w="30" w:type="dxa"/>
+              <w:right w:w="80" w:type="dxa"/>
+            </w:tcMar>
+          </w:tcPr>
+          <w:p>
+            <w:r>
+              <w:rPr>
+                <w:rFonts w:ascii="Aptos" w:eastAsia="Aptos" w:hAnsi="Aptos" w:cs="Aptos"/>
+                <w:sz w:val="20"/>
+                <w:szCs w:val="20"/>
+              </w:rPr>
+              <w:t xml:space="preserve">57</w:t>
+            </w:r>
+          </w:p>
+        </w:tc>
+        <w:tc>
+          <w:tcPr>
+            <w:tcW w:w="1850" w:type="pct"/>
+            <w:tcMar>
+              <w:top w:w="30" w:type="dxa"/>
+              <w:left w:w="80" w:type="dxa"/>
+              <w:bottom w:w="30" w:type="dxa"/>
+              <w:right w:w="80" w:type="dxa"/>
+            </w:tcMar>
+          </w:tcPr>
+          <w:p>
+            <w:r>
+              <w:rPr>
+                <w:rFonts w:ascii="Aptos" w:eastAsia="Aptos" w:hAnsi="Aptos" w:cs="Aptos"/>
+                <w:sz w:val="20"/>
+                <w:szCs w:val="20"/>
+              </w:rPr>
+              <w:t xml:space="preserve">On the Food Items form, leave the name blank, enter a price of 4.50 and the category Snacks, then press Add</w:t>
+            </w:r>
+          </w:p>
+        </w:tc>
+        <w:tc>
+          <w:tcPr>
+            <w:tcW w:w="560" w:type="pct"/>
+            <w:tcMar>
+              <w:top w:w="30" w:type="dxa"/>
+              <w:left w:w="80" w:type="dxa"/>
+              <w:bottom w:w="30" w:type="dxa"/>
+              <w:right w:w="80" w:type="dxa"/>
+            </w:tcMar>
+          </w:tcPr>
+          <w:p>
+            <w:r>
+              <w:rPr>
+                <w:rFonts w:ascii="Aptos" w:eastAsia="Aptos" w:hAnsi="Aptos" w:cs="Aptos"/>
+                <w:sz w:val="20"/>
+                <w:szCs w:val="20"/>
+              </w:rPr>
+              <w:t xml:space="preserve">Erroneous</w:t>
+            </w:r>
+          </w:p>
+        </w:tc>
+        <w:tc>
+          <w:tcPr>
+            <w:tcW w:w="2290" w:type="pct"/>
+            <w:tcMar>
+              <w:top w:w="30" w:type="dxa"/>
+              <w:left w:w="80" w:type="dxa"/>
+              <w:bottom w:w="30" w:type="dxa"/>
+              <w:right w:w="80" w:type="dxa"/>
+            </w:tcMar>
+          </w:tcPr>
+          <w:p>
+            <w:r>
+              <w:rPr>
+                <w:rFonts w:ascii="Aptos" w:eastAsia="Aptos" w:hAnsi="Aptos" w:cs="Aptos"/>
+                <w:sz w:val="20"/>
+                <w:szCs w:val="20"/>
+              </w:rPr>
+              <w:t xml:space="preserve">The item is rejected and a message appears stating “Enter a name for the item”.</w:t>
+            </w:r>
+          </w:p>
+        </w:tc>
+      </w:tr>
+      <w:tr>
+        <w:trPr>
+          <w:cantSplit/>
+        </w:trPr>
+        <w:tc>
+          <w:tcPr>
+            <w:tcW w:w="300" w:type="pct"/>
+            <w:tcMar>
+              <w:top w:w="30" w:type="dxa"/>
+              <w:left w:w="80" w:type="dxa"/>
+              <w:bottom w:w="30" w:type="dxa"/>
+              <w:right w:w="80" w:type="dxa"/>
+            </w:tcMar>
+          </w:tcPr>
+          <w:p>
+            <w:r>
+              <w:rPr>
+                <w:rFonts w:ascii="Aptos" w:eastAsia="Aptos" w:hAnsi="Aptos" w:cs="Aptos"/>
+                <w:sz w:val="20"/>
+                <w:szCs w:val="20"/>
+              </w:rPr>
+              <w:t xml:space="preserve">58</w:t>
+            </w:r>
+          </w:p>
+        </w:tc>
+        <w:tc>
+          <w:tcPr>
+            <w:tcW w:w="1850" w:type="pct"/>
+            <w:tcMar>
+              <w:top w:w="30" w:type="dxa"/>
+              <w:left w:w="80" w:type="dxa"/>
+              <w:bottom w:w="30" w:type="dxa"/>
+              <w:right w:w="80" w:type="dxa"/>
+            </w:tcMar>
+          </w:tcPr>
+          <w:p>
+            <w:r>
+              <w:rPr>
+                <w:rFonts w:ascii="Aptos" w:eastAsia="Aptos" w:hAnsi="Aptos" w:cs="Aptos"/>
+                <w:sz w:val="20"/>
+                <w:szCs w:val="20"/>
+              </w:rPr>
+              <w:t xml:space="preserve">On the Food Items form, enter the name Water, leave the price blank and pick the category Drinks, then press Add</w:t>
+            </w:r>
+          </w:p>
+        </w:tc>
+        <w:tc>
+          <w:tcPr>
+            <w:tcW w:w="560" w:type="pct"/>
+            <w:tcMar>
+              <w:top w:w="30" w:type="dxa"/>
+              <w:left w:w="80" w:type="dxa"/>
+              <w:bottom w:w="30" w:type="dxa"/>
+              <w:right w:w="80" w:type="dxa"/>
+            </w:tcMar>
+          </w:tcPr>
+          <w:p>
+            <w:r>
+              <w:rPr>
+                <w:rFonts w:ascii="Aptos" w:eastAsia="Aptos" w:hAnsi="Aptos" w:cs="Aptos"/>
+                <w:sz w:val="20"/>
+                <w:szCs w:val="20"/>
+              </w:rPr>
+              <w:t xml:space="preserve">Erroneous</w:t>
+            </w:r>
+          </w:p>
+        </w:tc>
+        <w:tc>
+          <w:tcPr>
+            <w:tcW w:w="2290" w:type="pct"/>
+            <w:tcMar>
+              <w:top w:w="30" w:type="dxa"/>
+              <w:left w:w="80" w:type="dxa"/>
+              <w:bottom w:w="30" w:type="dxa"/>
+              <w:right w:w="80" w:type="dxa"/>
+            </w:tcMar>
+          </w:tcPr>
+          <w:p>
+            <w:r>
+              <w:rPr>
+                <w:rFonts w:ascii="Aptos" w:eastAsia="Aptos" w:hAnsi="Aptos" w:cs="Aptos"/>
+                <w:sz w:val="20"/>
+                <w:szCs w:val="20"/>
+              </w:rPr>
+              <w:t xml:space="preserve">The item is rejected and a message appears stating “Enter a price”.</w:t>
+            </w:r>
+          </w:p>
+        </w:tc>
+      </w:tr>
+      <w:tr>
+        <w:trPr>
+          <w:cantSplit/>
+        </w:trPr>
+        <w:tc>
+          <w:tcPr>
+            <w:tcW w:w="300" w:type="pct"/>
+            <w:tcMar>
+              <w:top w:w="30" w:type="dxa"/>
+              <w:left w:w="80" w:type="dxa"/>
+              <w:bottom w:w="30" w:type="dxa"/>
+              <w:right w:w="80" w:type="dxa"/>
+            </w:tcMar>
+          </w:tcPr>
+          <w:p>
+            <w:r>
+              <w:rPr>
+                <w:rFonts w:ascii="Aptos" w:eastAsia="Aptos" w:hAnsi="Aptos" w:cs="Aptos"/>
+                <w:sz w:val="20"/>
+                <w:szCs w:val="20"/>
+              </w:rPr>
+              <w:t xml:space="preserve">59</w:t>
+            </w:r>
+          </w:p>
+        </w:tc>
+        <w:tc>
+          <w:tcPr>
+            <w:tcW w:w="1850" w:type="pct"/>
+            <w:tcMar>
+              <w:top w:w="30" w:type="dxa"/>
+              <w:left w:w="80" w:type="dxa"/>
+              <w:bottom w:w="30" w:type="dxa"/>
+              <w:right w:w="80" w:type="dxa"/>
+            </w:tcMar>
+          </w:tcPr>
+          <w:p>
+            <w:r>
+              <w:rPr>
+                <w:rFonts w:ascii="Aptos" w:eastAsia="Aptos" w:hAnsi="Aptos" w:cs="Aptos"/>
+                <w:sz w:val="20"/>
+                <w:szCs w:val="20"/>
+              </w:rPr>
+              <w:t xml:space="preserve">On the Food Items form, enter the name Water, a price of 0 and the category Drinks, then press Add</w:t>
+            </w:r>
+          </w:p>
+        </w:tc>
+        <w:tc>
+          <w:tcPr>
+            <w:tcW w:w="560" w:type="pct"/>
+            <w:tcMar>
+              <w:top w:w="30" w:type="dxa"/>
+              <w:left w:w="80" w:type="dxa"/>
+              <w:bottom w:w="30" w:type="dxa"/>
+              <w:right w:w="80" w:type="dxa"/>
+            </w:tcMar>
+          </w:tcPr>
+          <w:p>
+            <w:r>
+              <w:rPr>
+                <w:rFonts w:ascii="Aptos" w:eastAsia="Aptos" w:hAnsi="Aptos" w:cs="Aptos"/>
+                <w:sz w:val="20"/>
+                <w:szCs w:val="20"/>
+              </w:rPr>
+              <w:t xml:space="preserve">Erroneous</w:t>
+            </w:r>
+          </w:p>
+        </w:tc>
+        <w:tc>
+          <w:tcPr>
+            <w:tcW w:w="2290" w:type="pct"/>
+            <w:tcMar>
+              <w:top w:w="30" w:type="dxa"/>
+              <w:left w:w="80" w:type="dxa"/>
+              <w:bottom w:w="30" w:type="dxa"/>
+              <w:right w:w="80" w:type="dxa"/>
+            </w:tcMar>
+          </w:tcPr>
+          <w:p>
+            <w:r>
+              <w:rPr>
+                <w:rFonts w:ascii="Aptos" w:eastAsia="Aptos" w:hAnsi="Aptos" w:cs="Aptos"/>
+                <w:sz w:val="20"/>
+                <w:szCs w:val="20"/>
+              </w:rPr>
+              <w:t xml:space="preserve">The item is rejected and a message appears stating that the price must be greater than 0.</w:t>
+            </w:r>
+          </w:p>
+        </w:tc>
+      </w:tr>
+      <w:tr>
+        <w:trPr>
+          <w:cantSplit/>
+        </w:trPr>
+        <w:tc>
+          <w:tcPr>
+            <w:tcW w:w="300" w:type="pct"/>
+            <w:tcMar>
+              <w:top w:w="30" w:type="dxa"/>
+              <w:left w:w="80" w:type="dxa"/>
+              <w:bottom w:w="30" w:type="dxa"/>
+              <w:right w:w="80" w:type="dxa"/>
+            </w:tcMar>
+          </w:tcPr>
+          <w:p>
+            <w:r>
+              <w:rPr>
+                <w:rFonts w:ascii="Aptos" w:eastAsia="Aptos" w:hAnsi="Aptos" w:cs="Aptos"/>
+                <w:sz w:val="20"/>
+                <w:szCs w:val="20"/>
+              </w:rPr>
+              <w:t xml:space="preserve">60</w:t>
+            </w:r>
+          </w:p>
+        </w:tc>
+        <w:tc>
+          <w:tcPr>
+            <w:tcW w:w="1850" w:type="pct"/>
+            <w:tcMar>
+              <w:top w:w="30" w:type="dxa"/>
+              <w:left w:w="80" w:type="dxa"/>
+              <w:bottom w:w="30" w:type="dxa"/>
+              <w:right w:w="80" w:type="dxa"/>
+            </w:tcMar>
+          </w:tcPr>
+          <w:p>
+            <w:r>
+              <w:rPr>
+                <w:rFonts w:ascii="Aptos" w:eastAsia="Aptos" w:hAnsi="Aptos" w:cs="Aptos"/>
+                <w:sz w:val="20"/>
+                <w:szCs w:val="20"/>
+              </w:rPr>
+              <w:t xml:space="preserve">On the Food Items form, enter the name Large Popcorn, a price of 4.50 and the category Snacks, then press Add</w:t>
+            </w:r>
+          </w:p>
+        </w:tc>
+        <w:tc>
+          <w:tcPr>
+            <w:tcW w:w="560" w:type="pct"/>
+            <w:tcMar>
+              <w:top w:w="30" w:type="dxa"/>
+              <w:left w:w="80" w:type="dxa"/>
+              <w:bottom w:w="30" w:type="dxa"/>
+              <w:right w:w="80" w:type="dxa"/>
+            </w:tcMar>
+          </w:tcPr>
+          <w:p>
+            <w:r>
+              <w:rPr>
+                <w:rFonts w:ascii="Aptos" w:eastAsia="Aptos" w:hAnsi="Aptos" w:cs="Aptos"/>
+                <w:sz w:val="20"/>
+                <w:szCs w:val="20"/>
+              </w:rPr>
+              <w:t xml:space="preserve">Normal</w:t>
+            </w:r>
+          </w:p>
+        </w:tc>
+        <w:tc>
+          <w:tcPr>
+            <w:tcW w:w="2290" w:type="pct"/>
+            <w:tcMar>
+              <w:top w:w="30" w:type="dxa"/>
+              <w:left w:w="80" w:type="dxa"/>
+              <w:bottom w:w="30" w:type="dxa"/>
+              <w:right w:w="80" w:type="dxa"/>
+            </w:tcMar>
+          </w:tcPr>
+          <w:p>
+            <w:r>
+              <w:rPr>
+                <w:rFonts w:ascii="Aptos" w:eastAsia="Aptos" w:hAnsi="Aptos" w:cs="Aptos"/>
+                <w:sz w:val="20"/>
+                <w:szCs w:val="20"/>
+              </w:rPr>
+              <w:t xml:space="preserve">The food item Large Popcorn is saved to tblFoodItem.</w:t>
+            </w:r>
+          </w:p>
+        </w:tc>
+      </w:tr>
+      <w:tr>
+        <w:trPr>
+          <w:cantSplit/>
+        </w:trPr>
+        <w:tc>
+          <w:tcPr>
+            <w:tcW w:w="300" w:type="pct"/>
+            <w:tcMar>
+              <w:top w:w="30" w:type="dxa"/>
+              <w:left w:w="80" w:type="dxa"/>
+              <w:bottom w:w="30" w:type="dxa"/>
+              <w:right w:w="80" w:type="dxa"/>
+            </w:tcMar>
+          </w:tcPr>
+          <w:p>
+            <w:r>
+              <w:rPr>
+                <w:rFonts w:ascii="Aptos" w:eastAsia="Aptos" w:hAnsi="Aptos" w:cs="Aptos"/>
+                <w:sz w:val="20"/>
+                <w:szCs w:val="20"/>
+              </w:rPr>
+              <w:t xml:space="preserve">61</w:t>
+            </w:r>
+          </w:p>
+        </w:tc>
+        <w:tc>
+          <w:tcPr>
+            <w:tcW w:w="1850" w:type="pct"/>
+            <w:tcMar>
+              <w:top w:w="30" w:type="dxa"/>
+              <w:left w:w="80" w:type="dxa"/>
+              <w:bottom w:w="30" w:type="dxa"/>
+              <w:right w:w="80" w:type="dxa"/>
+            </w:tcMar>
+          </w:tcPr>
+          <w:p>
+            <w:r>
+              <w:rPr>
+                <w:rFonts w:ascii="Aptos" w:eastAsia="Aptos" w:hAnsi="Aptos" w:cs="Aptos"/>
+                <w:sz w:val="20"/>
+                <w:szCs w:val="20"/>
+              </w:rPr>
+              <w:t xml:space="preserve">Add a food item named Cola with a price of 2.50 and the category Drinks</w:t>
+            </w:r>
+          </w:p>
+        </w:tc>
+        <w:tc>
+          <w:tcPr>
+            <w:tcW w:w="560" w:type="pct"/>
+            <w:tcMar>
+              <w:top w:w="30" w:type="dxa"/>
+              <w:left w:w="80" w:type="dxa"/>
+              <w:bottom w:w="30" w:type="dxa"/>
+              <w:right w:w="80" w:type="dxa"/>
+            </w:tcMar>
+          </w:tcPr>
+          <w:p>
+            <w:r>
+              <w:rPr>
+                <w:rFonts w:ascii="Aptos" w:eastAsia="Aptos" w:hAnsi="Aptos" w:cs="Aptos"/>
+                <w:sz w:val="20"/>
+                <w:szCs w:val="20"/>
+              </w:rPr>
+              <w:t xml:space="preserve">Normal</w:t>
+            </w:r>
+          </w:p>
+        </w:tc>
+        <w:tc>
+          <w:tcPr>
+            <w:tcW w:w="2290" w:type="pct"/>
+            <w:tcMar>
+              <w:top w:w="30" w:type="dxa"/>
+              <w:left w:w="80" w:type="dxa"/>
+              <w:bottom w:w="30" w:type="dxa"/>
+              <w:right w:w="80" w:type="dxa"/>
+            </w:tcMar>
+          </w:tcPr>
+          <w:p>
+            <w:r>
+              <w:rPr>
+                <w:rFonts w:ascii="Aptos" w:eastAsia="Aptos" w:hAnsi="Aptos" w:cs="Aptos"/>
+                <w:sz w:val="20"/>
+                <w:szCs w:val="20"/>
+              </w:rPr>
+              <w:t xml:space="preserve">The food item Cola is saved.</w:t>
+            </w:r>
+          </w:p>
+        </w:tc>
+      </w:tr>
+      <w:tr>
+        <w:trPr>
+          <w:cantSplit/>
+        </w:trPr>
+        <w:tc>
+          <w:tcPr>
+            <w:tcW w:w="300" w:type="pct"/>
+            <w:tcMar>
+              <w:top w:w="30" w:type="dxa"/>
+              <w:left w:w="80" w:type="dxa"/>
+              <w:bottom w:w="30" w:type="dxa"/>
+              <w:right w:w="80" w:type="dxa"/>
+            </w:tcMar>
+          </w:tcPr>
+          <w:p>
+            <w:r>
+              <w:rPr>
+                <w:rFonts w:ascii="Aptos" w:eastAsia="Aptos" w:hAnsi="Aptos" w:cs="Aptos"/>
+                <w:sz w:val="20"/>
+                <w:szCs w:val="20"/>
+              </w:rPr>
+              <w:t xml:space="preserve">62</w:t>
+            </w:r>
+          </w:p>
+        </w:tc>
+        <w:tc>
+          <w:tcPr>
+            <w:tcW w:w="1850" w:type="pct"/>
+            <w:tcMar>
+              <w:top w:w="30" w:type="dxa"/>
+              <w:left w:w="80" w:type="dxa"/>
+              <w:bottom w:w="30" w:type="dxa"/>
+              <w:right w:w="80" w:type="dxa"/>
+            </w:tcMar>
+          </w:tcPr>
+          <w:p>
+            <w:r>
+              <w:rPr>
+                <w:rFonts w:ascii="Aptos" w:eastAsia="Aptos" w:hAnsi="Aptos" w:cs="Aptos"/>
+                <w:sz w:val="20"/>
+                <w:szCs w:val="20"/>
+              </w:rPr>
+              <w:t xml:space="preserve">Add a second item named Large Popcorn</w:t>
+            </w:r>
+          </w:p>
+        </w:tc>
+        <w:tc>
+          <w:tcPr>
+            <w:tcW w:w="560" w:type="pct"/>
+            <w:tcMar>
+              <w:top w:w="30" w:type="dxa"/>
+              <w:left w:w="80" w:type="dxa"/>
+              <w:bottom w:w="30" w:type="dxa"/>
+              <w:right w:w="80" w:type="dxa"/>
+            </w:tcMar>
+          </w:tcPr>
+          <w:p>
+            <w:r>
+              <w:rPr>
+                <w:rFonts w:ascii="Aptos" w:eastAsia="Aptos" w:hAnsi="Aptos" w:cs="Aptos"/>
+                <w:sz w:val="20"/>
+                <w:szCs w:val="20"/>
+              </w:rPr>
+              <w:t xml:space="preserve">Erroneous</w:t>
+            </w:r>
+          </w:p>
+        </w:tc>
+        <w:tc>
+          <w:tcPr>
+            <w:tcW w:w="2290" w:type="pct"/>
+            <w:tcMar>
+              <w:top w:w="30" w:type="dxa"/>
+              <w:left w:w="80" w:type="dxa"/>
+              <w:bottom w:w="30" w:type="dxa"/>
+              <w:right w:w="80" w:type="dxa"/>
+            </w:tcMar>
+          </w:tcPr>
+          <w:p>
+            <w:r>
+              <w:rPr>
+                <w:rFonts w:ascii="Aptos" w:eastAsia="Aptos" w:hAnsi="Aptos" w:cs="Aptos"/>
+                <w:sz w:val="20"/>
+                <w:szCs w:val="20"/>
+              </w:rPr>
+              <w:t xml:space="preserve">The item is rejected and a message appears stating that there is already an item called Large Popcorn.</w:t>
+            </w:r>
+          </w:p>
+        </w:tc>
+      </w:tr>
+      <w:tr>
+        <w:trPr>
+          <w:cantSplit/>
+        </w:trPr>
+        <w:tc>
+          <w:tcPr>
+            <w:tcW w:w="300" w:type="pct"/>
+            <w:tcMar>
+              <w:top w:w="30" w:type="dxa"/>
+              <w:left w:w="80" w:type="dxa"/>
+              <w:bottom w:w="30" w:type="dxa"/>
+              <w:right w:w="80" w:type="dxa"/>
+            </w:tcMar>
+          </w:tcPr>
+          <w:p>
+            <w:r>
+              <w:rPr>
+                <w:rFonts w:ascii="Aptos" w:eastAsia="Aptos" w:hAnsi="Aptos" w:cs="Aptos"/>
+                <w:sz w:val="20"/>
+                <w:szCs w:val="20"/>
+              </w:rPr>
+              <w:t xml:space="preserve">63</w:t>
+            </w:r>
+          </w:p>
+        </w:tc>
+        <w:tc>
+          <w:tcPr>
+            <w:tcW w:w="1850" w:type="pct"/>
+            <w:tcMar>
+              <w:top w:w="30" w:type="dxa"/>
+              <w:left w:w="80" w:type="dxa"/>
+              <w:bottom w:w="30" w:type="dxa"/>
+              <w:right w:w="80" w:type="dxa"/>
+            </w:tcMar>
+          </w:tcPr>
+          <w:p>
+            <w:r>
+              <w:rPr>
+                <w:rFonts w:ascii="Aptos" w:eastAsia="Aptos" w:hAnsi="Aptos" w:cs="Aptos"/>
+                <w:sz w:val="20"/>
+                <w:szCs w:val="20"/>
+              </w:rPr>
+              <w:t xml:space="preserve">Open the food order for John Smith's Inception booking, pick Large Popcorn, enter a quantity of 2 and press Add</w:t>
+            </w:r>
+          </w:p>
+        </w:tc>
+        <w:tc>
+          <w:tcPr>
+            <w:tcW w:w="560" w:type="pct"/>
+            <w:tcMar>
+              <w:top w:w="30" w:type="dxa"/>
+              <w:left w:w="80" w:type="dxa"/>
+              <w:bottom w:w="30" w:type="dxa"/>
+              <w:right w:w="80" w:type="dxa"/>
+            </w:tcMar>
+          </w:tcPr>
+          <w:p>
+            <w:r>
+              <w:rPr>
+                <w:rFonts w:ascii="Aptos" w:eastAsia="Aptos" w:hAnsi="Aptos" w:cs="Aptos"/>
+                <w:sz w:val="20"/>
+                <w:szCs w:val="20"/>
+              </w:rPr>
+              <w:t xml:space="preserve">Normal</w:t>
+            </w:r>
+          </w:p>
+        </w:tc>
+        <w:tc>
+          <w:tcPr>
+            <w:tcW w:w="2290" w:type="pct"/>
+            <w:tcMar>
+              <w:top w:w="30" w:type="dxa"/>
+              <w:left w:w="80" w:type="dxa"/>
+              <w:bottom w:w="30" w:type="dxa"/>
+              <w:right w:w="80" w:type="dxa"/>
+            </w:tcMar>
+          </w:tcPr>
+          <w:p>
+            <w:r>
+              <w:rPr>
+                <w:rFonts w:ascii="Aptos" w:eastAsia="Aptos" w:hAnsi="Aptos" w:cs="Aptos"/>
+                <w:sz w:val="20"/>
+                <w:szCs w:val="20"/>
+              </w:rPr>
+              <w:t xml:space="preserve">2 Large Popcorn are added to the order and the running total for the food shows £9.00.</w:t>
+            </w:r>
+          </w:p>
+        </w:tc>
+      </w:tr>
+      <w:tr>
+        <w:trPr>
+          <w:cantSplit/>
+        </w:trPr>
+        <w:tc>
+          <w:tcPr>
+            <w:tcW w:w="300" w:type="pct"/>
+            <w:tcMar>
+              <w:top w:w="30" w:type="dxa"/>
+              <w:left w:w="80" w:type="dxa"/>
+              <w:bottom w:w="30" w:type="dxa"/>
+              <w:right w:w="80" w:type="dxa"/>
+            </w:tcMar>
+          </w:tcPr>
+          <w:p>
+            <w:r>
+              <w:rPr>
+                <w:rFonts w:ascii="Aptos" w:eastAsia="Aptos" w:hAnsi="Aptos" w:cs="Aptos"/>
+                <w:sz w:val="20"/>
+                <w:szCs w:val="20"/>
+              </w:rPr>
+              <w:t xml:space="preserve">64</w:t>
+            </w:r>
+          </w:p>
+        </w:tc>
+        <w:tc>
+          <w:tcPr>
+            <w:tcW w:w="1850" w:type="pct"/>
+            <w:tcMar>
+              <w:top w:w="30" w:type="dxa"/>
+              <w:left w:w="80" w:type="dxa"/>
+              <w:bottom w:w="30" w:type="dxa"/>
+              <w:right w:w="80" w:type="dxa"/>
+            </w:tcMar>
+          </w:tcPr>
+          <w:p>
+            <w:r>
+              <w:rPr>
+                <w:rFonts w:ascii="Aptos" w:eastAsia="Aptos" w:hAnsi="Aptos" w:cs="Aptos"/>
+                <w:sz w:val="20"/>
+                <w:szCs w:val="20"/>
+              </w:rPr>
+              <w:t xml:space="preserve">On the same order, pick Cola, enter a quantity of 1 and press Add</w:t>
+            </w:r>
+          </w:p>
+        </w:tc>
+        <w:tc>
+          <w:tcPr>
+            <w:tcW w:w="560" w:type="pct"/>
+            <w:tcMar>
+              <w:top w:w="30" w:type="dxa"/>
+              <w:left w:w="80" w:type="dxa"/>
+              <w:bottom w:w="30" w:type="dxa"/>
+              <w:right w:w="80" w:type="dxa"/>
+            </w:tcMar>
+          </w:tcPr>
+          <w:p>
+            <w:r>
+              <w:rPr>
+                <w:rFonts w:ascii="Aptos" w:eastAsia="Aptos" w:hAnsi="Aptos" w:cs="Aptos"/>
+                <w:sz w:val="20"/>
+                <w:szCs w:val="20"/>
+              </w:rPr>
+              <w:t xml:space="preserve">Normal</w:t>
+            </w:r>
+          </w:p>
+        </w:tc>
+        <w:tc>
+          <w:tcPr>
+            <w:tcW w:w="2290" w:type="pct"/>
+            <w:tcMar>
+              <w:top w:w="30" w:type="dxa"/>
+              <w:left w:w="80" w:type="dxa"/>
+              <w:bottom w:w="30" w:type="dxa"/>
+              <w:right w:w="80" w:type="dxa"/>
+            </w:tcMar>
+          </w:tcPr>
+          <w:p>
+            <w:r>
+              <w:rPr>
+                <w:rFonts w:ascii="Aptos" w:eastAsia="Aptos" w:hAnsi="Aptos" w:cs="Aptos"/>
+                <w:sz w:val="20"/>
+                <w:szCs w:val="20"/>
+              </w:rPr>
+              <w:t xml:space="preserve">1 Cola is added and the running food total updates to £11.50.</w:t>
+            </w:r>
+          </w:p>
+        </w:tc>
+      </w:tr>
+      <w:tr>
+        <w:trPr>
+          <w:cantSplit/>
+        </w:trPr>
+        <w:tc>
+          <w:tcPr>
+            <w:tcW w:w="300" w:type="pct"/>
+            <w:tcMar>
+              <w:top w:w="30" w:type="dxa"/>
+              <w:left w:w="80" w:type="dxa"/>
+              <w:bottom w:w="30" w:type="dxa"/>
+              <w:right w:w="80" w:type="dxa"/>
+            </w:tcMar>
+          </w:tcPr>
+          <w:p>
+            <w:r>
+              <w:rPr>
+                <w:rFonts w:ascii="Aptos" w:eastAsia="Aptos" w:hAnsi="Aptos" w:cs="Aptos"/>
+                <w:sz w:val="20"/>
+                <w:szCs w:val="20"/>
+              </w:rPr>
+              <w:t xml:space="preserve">65</w:t>
+            </w:r>
+          </w:p>
+        </w:tc>
+        <w:tc>
+          <w:tcPr>
+            <w:tcW w:w="1850" w:type="pct"/>
+            <w:tcMar>
+              <w:top w:w="30" w:type="dxa"/>
+              <w:left w:w="80" w:type="dxa"/>
+              <w:bottom w:w="30" w:type="dxa"/>
+              <w:right w:w="80" w:type="dxa"/>
+            </w:tcMar>
+          </w:tcPr>
+          <w:p>
+            <w:r>
+              <w:rPr>
+                <w:rFonts w:ascii="Aptos" w:eastAsia="Aptos" w:hAnsi="Aptos" w:cs="Aptos"/>
+                <w:sz w:val="20"/>
+                <w:szCs w:val="20"/>
+              </w:rPr>
+              <w:t xml:space="preserve">On the same order, enter a quantity of 0 for a food item and press Add</w:t>
+            </w:r>
+          </w:p>
+        </w:tc>
+        <w:tc>
+          <w:tcPr>
+            <w:tcW w:w="560" w:type="pct"/>
+            <w:tcMar>
+              <w:top w:w="30" w:type="dxa"/>
+              <w:left w:w="80" w:type="dxa"/>
+              <w:bottom w:w="30" w:type="dxa"/>
+              <w:right w:w="80" w:type="dxa"/>
+            </w:tcMar>
+          </w:tcPr>
+          <w:p>
+            <w:r>
+              <w:rPr>
+                <w:rFonts w:ascii="Aptos" w:eastAsia="Aptos" w:hAnsi="Aptos" w:cs="Aptos"/>
+                <w:sz w:val="20"/>
+                <w:szCs w:val="20"/>
+              </w:rPr>
+              <w:t xml:space="preserve">Erroneous</w:t>
+            </w:r>
+          </w:p>
+        </w:tc>
+        <w:tc>
+          <w:tcPr>
+            <w:tcW w:w="2290" w:type="pct"/>
+            <w:tcMar>
+              <w:top w:w="30" w:type="dxa"/>
+              <w:left w:w="80" w:type="dxa"/>
+              <w:bottom w:w="30" w:type="dxa"/>
+              <w:right w:w="80" w:type="dxa"/>
+            </w:tcMar>
+          </w:tcPr>
+          <w:p>
+            <w:r>
+              <w:rPr>
+                <w:rFonts w:ascii="Aptos" w:eastAsia="Aptos" w:hAnsi="Aptos" w:cs="Aptos"/>
+                <w:sz w:val="20"/>
+                <w:szCs w:val="20"/>
+              </w:rPr>
+              <w:t xml:space="preserve">The item is rejected and a message appears stating “Enter a quantity of 1 or more”.</w:t>
+            </w:r>
+          </w:p>
+        </w:tc>
+      </w:tr>
+      <w:tr>
+        <w:trPr>
+          <w:cantSplit/>
+        </w:trPr>
+        <w:tc>
+          <w:tcPr>
+            <w:tcW w:w="300" w:type="pct"/>
+            <w:tcMar>
+              <w:top w:w="30" w:type="dxa"/>
+              <w:left w:w="80" w:type="dxa"/>
+              <w:bottom w:w="30" w:type="dxa"/>
+              <w:right w:w="80" w:type="dxa"/>
+            </w:tcMar>
+          </w:tcPr>
+          <w:p>
+            <w:r>
+              <w:rPr>
+                <w:rFonts w:ascii="Aptos" w:eastAsia="Aptos" w:hAnsi="Aptos" w:cs="Aptos"/>
+                <w:sz w:val="20"/>
+                <w:szCs w:val="20"/>
+              </w:rPr>
+              <w:t xml:space="preserve">66</w:t>
+            </w:r>
+          </w:p>
+        </w:tc>
+        <w:tc>
+          <w:tcPr>
+            <w:tcW w:w="1850" w:type="pct"/>
+            <w:tcMar>
+              <w:top w:w="30" w:type="dxa"/>
+              <w:left w:w="80" w:type="dxa"/>
+              <w:bottom w:w="30" w:type="dxa"/>
+              <w:right w:w="80" w:type="dxa"/>
+            </w:tcMar>
+          </w:tcPr>
+          <w:p>
+            <w:r>
+              <w:rPr>
+                <w:rFonts w:ascii="Aptos" w:eastAsia="Aptos" w:hAnsi="Aptos" w:cs="Aptos"/>
+                <w:sz w:val="20"/>
+                <w:szCs w:val="20"/>
+              </w:rPr>
+              <w:t xml:space="preserve">Save the order and look at John Smith's booking in tblBooking</w:t>
+            </w:r>
+          </w:p>
+        </w:tc>
+        <w:tc>
+          <w:tcPr>
+            <w:tcW w:w="560" w:type="pct"/>
+            <w:tcMar>
+              <w:top w:w="30" w:type="dxa"/>
+              <w:left w:w="80" w:type="dxa"/>
+              <w:bottom w:w="30" w:type="dxa"/>
+              <w:right w:w="80" w:type="dxa"/>
+            </w:tcMar>
+          </w:tcPr>
+          <w:p>
+            <w:r>
+              <w:rPr>
+                <w:rFonts w:ascii="Aptos" w:eastAsia="Aptos" w:hAnsi="Aptos" w:cs="Aptos"/>
+                <w:sz w:val="20"/>
+                <w:szCs w:val="20"/>
+              </w:rPr>
+              <w:t xml:space="preserve">Normal</w:t>
+            </w:r>
+          </w:p>
+        </w:tc>
+        <w:tc>
+          <w:tcPr>
+            <w:tcW w:w="2290" w:type="pct"/>
+            <w:tcMar>
+              <w:top w:w="30" w:type="dxa"/>
+              <w:left w:w="80" w:type="dxa"/>
+              <w:bottom w:w="30" w:type="dxa"/>
+              <w:right w:w="80" w:type="dxa"/>
+            </w:tcMar>
+          </w:tcPr>
+          <w:p>
+            <w:r>
+              <w:rPr>
+                <w:rFonts w:ascii="Aptos" w:eastAsia="Aptos" w:hAnsi="Aptos" w:cs="Aptos"/>
+                <w:sz w:val="20"/>
+                <w:szCs w:val="20"/>
+              </w:rPr>
+              <w:t xml:space="preserve">The stored total cost for the booking is £29.50, which is £18.00 of tickets plus £11.50 of food.</w:t>
+            </w:r>
+          </w:p>
+        </w:tc>
+      </w:tr>
+      <w:tr>
+        <w:trPr>
+          <w:cantSplit/>
+        </w:trPr>
+        <w:tc>
+          <w:tcPr>
+            <w:tcW w:w="300" w:type="pct"/>
+            <w:tcMar>
+              <w:top w:w="30" w:type="dxa"/>
+              <w:left w:w="80" w:type="dxa"/>
+              <w:bottom w:w="30" w:type="dxa"/>
+              <w:right w:w="80" w:type="dxa"/>
+            </w:tcMar>
+          </w:tcPr>
+          <w:p>
+            <w:r>
+              <w:rPr>
+                <w:rFonts w:ascii="Aptos" w:eastAsia="Aptos" w:hAnsi="Aptos" w:cs="Aptos"/>
+                <w:sz w:val="20"/>
+                <w:szCs w:val="20"/>
+              </w:rPr>
+              <w:t xml:space="preserve">67</w:t>
+            </w:r>
+          </w:p>
+        </w:tc>
+        <w:tc>
+          <w:tcPr>
+            <w:tcW w:w="1850" w:type="pct"/>
+            <w:tcMar>
+              <w:top w:w="30" w:type="dxa"/>
+              <w:left w:w="80" w:type="dxa"/>
+              <w:bottom w:w="30" w:type="dxa"/>
+              <w:right w:w="80" w:type="dxa"/>
+            </w:tcMar>
+          </w:tcPr>
+          <w:p>
+            <w:r>
+              <w:rPr>
+                <w:rFonts w:ascii="Aptos" w:eastAsia="Aptos" w:hAnsi="Aptos" w:cs="Aptos"/>
+                <w:sz w:val="20"/>
+                <w:szCs w:val="20"/>
+              </w:rPr>
+              <w:t xml:space="preserve">Change the price of Large Popcorn to 5.00 on the Food Items form, then look at John Smith's order again</w:t>
+            </w:r>
+          </w:p>
+        </w:tc>
+        <w:tc>
+          <w:tcPr>
+            <w:tcW w:w="560" w:type="pct"/>
+            <w:tcMar>
+              <w:top w:w="30" w:type="dxa"/>
+              <w:left w:w="80" w:type="dxa"/>
+              <w:bottom w:w="30" w:type="dxa"/>
+              <w:right w:w="80" w:type="dxa"/>
+            </w:tcMar>
+          </w:tcPr>
+          <w:p>
+            <w:r>
+              <w:rPr>
+                <w:rFonts w:ascii="Aptos" w:eastAsia="Aptos" w:hAnsi="Aptos" w:cs="Aptos"/>
+                <w:sz w:val="20"/>
+                <w:szCs w:val="20"/>
+              </w:rPr>
+              <w:t xml:space="preserve">Normal</w:t>
+            </w:r>
+          </w:p>
+        </w:tc>
+        <w:tc>
+          <w:tcPr>
+            <w:tcW w:w="2290" w:type="pct"/>
+            <w:tcMar>
+              <w:top w:w="30" w:type="dxa"/>
+              <w:left w:w="80" w:type="dxa"/>
+              <w:bottom w:w="30" w:type="dxa"/>
+              <w:right w:w="80" w:type="dxa"/>
+            </w:tcMar>
+          </w:tcPr>
+          <w:p>
+            <w:r>
+              <w:rPr>
+                <w:rFonts w:ascii="Aptos" w:eastAsia="Aptos" w:hAnsi="Aptos" w:cs="Aptos"/>
+                <w:sz w:val="20"/>
+                <w:szCs w:val="20"/>
+              </w:rPr>
+              <w:t xml:space="preserve">The order still shows the popcorn at £4.50 each and the booking total is still £29.50, because the price paid is stored on the order line at the moment of sale and a later price change cannot reach back into a sale that has already been taken. The price is then set back to £4.50.</w:t>
             </w:r>
           </w:p>
         </w:tc>

</xml_diff>

<commit_message>
added objective 11: searching for a booking
</commit_message>
<xml_diff>
--- a/Testing.docx
+++ b/Testing.docx
@@ -7226,6 +7226,607 @@
                 <w:szCs w:val="20"/>
               </w:rPr>
               <w:t xml:space="preserve">The order still shows the popcorn at £4.50 each and the booking total is still £29.50, because the price paid is stored on the order line at the moment of sale and a later price change cannot reach back into a sale that has already been taken. The price is then set back to £4.50.</w:t>
+            </w:r>
+          </w:p>
+        </w:tc>
+      </w:tr>
+    </w:tbl>
+    <w:p>
+      <w:r>
+        <w:rPr>
+          <w:rFonts w:ascii="Aptos" w:eastAsia="Aptos" w:hAnsi="Aptos" w:cs="Aptos"/>
+        </w:rPr>
+        <w:t xml:space="preserve"/>
+      </w:r>
+    </w:p>
+    <w:p>
+      <w:pPr>
+        <w:pStyle w:val="Heading3"/>
+      </w:pPr>
+      <w:r>
+        <w:rPr>
+          <w:rFonts w:ascii="Aptos Display" w:eastAsia="Aptos Display" w:hAnsi="Aptos Display" w:cs="Aptos Display"/>
+          <w:b/>
+          <w:bCs/>
+          <w:color w:val="000000"/>
+        </w:rPr>
+        <w:t xml:space="preserve">Objective 11: Searching for a Booking</w:t>
+      </w:r>
+    </w:p>
+    <w:p>
+      <w:r>
+        <w:rPr>
+          <w:rFonts w:ascii="Aptos" w:eastAsia="Aptos" w:hAnsi="Aptos" w:cs="Aptos"/>
+        </w:rPr>
+        <w:t xml:space="preserve">These tests check the search, using the bookings created earlier. Three customers named Smith have bookings, so a search for Smith should return exactly three.</w:t>
+      </w:r>
+    </w:p>
+    <w:tbl>
+      <w:tblPr>
+        <w:tblW w:w="5000" w:type="pct"/>
+        <w:tblBorders>
+          <w:top w:val="single" w:sz="4" w:space="0" w:color="808080"/>
+          <w:left w:val="single" w:sz="4" w:space="0" w:color="808080"/>
+          <w:bottom w:val="single" w:sz="4" w:space="0" w:color="808080"/>
+          <w:right w:val="single" w:sz="4" w:space="0" w:color="808080"/>
+          <w:insideH w:val="single" w:sz="4" w:space="0" w:color="808080"/>
+          <w:insideV w:val="single" w:sz="4" w:space="0" w:color="808080"/>
+        </w:tblBorders>
+        <w:tblCellMar>
+          <w:left w:w="10" w:type="dxa"/>
+          <w:right w:w="10" w:type="dxa"/>
+        </w:tblCellMar>
+        <w:tblLook w:val="0000" w:firstRow="0" w:lastRow="0" w:firstColumn="0" w:lastColumn="0" w:noHBand="0" w:noVBand="0"/>
+      </w:tblPr>
+      <w:tblGrid>
+        <w:gridCol w:w="561"/>
+        <w:gridCol w:w="3460"/>
+        <w:gridCol w:w="1047"/>
+        <w:gridCol w:w="4282"/>
+      </w:tblGrid>
+      <w:tr>
+        <w:trPr>
+          <w:cantSplit/>
+          <w:tblHeader/>
+        </w:trPr>
+        <w:tc>
+          <w:tcPr>
+            <w:tcW w:w="300" w:type="pct"/>
+            <w:shd w:val="clear" w:color="auto" w:fill="F2CEED" w:themeFill="accent5" w:themeFillTint="33"/>
+            <w:tcMar>
+              <w:top w:w="30" w:type="dxa"/>
+              <w:left w:w="80" w:type="dxa"/>
+              <w:bottom w:w="30" w:type="dxa"/>
+              <w:right w:w="80" w:type="dxa"/>
+            </w:tcMar>
+          </w:tcPr>
+          <w:p>
+            <w:r>
+              <w:rPr>
+                <w:rFonts w:ascii="Aptos" w:eastAsia="Aptos" w:hAnsi="Aptos" w:cs="Aptos"/>
+                <w:b/>
+                <w:bCs/>
+                <w:sz w:val="20"/>
+                <w:szCs w:val="20"/>
+              </w:rPr>
+              <w:t xml:space="preserve">No.</w:t>
+            </w:r>
+          </w:p>
+        </w:tc>
+        <w:tc>
+          <w:tcPr>
+            <w:tcW w:w="1850" w:type="pct"/>
+            <w:shd w:val="clear" w:color="auto" w:fill="F2CEED" w:themeFill="accent5" w:themeFillTint="33"/>
+            <w:tcMar>
+              <w:top w:w="30" w:type="dxa"/>
+              <w:left w:w="80" w:type="dxa"/>
+              <w:bottom w:w="30" w:type="dxa"/>
+              <w:right w:w="80" w:type="dxa"/>
+            </w:tcMar>
+          </w:tcPr>
+          <w:p>
+            <w:r>
+              <w:rPr>
+                <w:rFonts w:ascii="Aptos" w:eastAsia="Aptos" w:hAnsi="Aptos" w:cs="Aptos"/>
+                <w:b/>
+                <w:bCs/>
+                <w:sz w:val="20"/>
+                <w:szCs w:val="20"/>
+              </w:rPr>
+              <w:t xml:space="preserve">Test</w:t>
+            </w:r>
+          </w:p>
+        </w:tc>
+        <w:tc>
+          <w:tcPr>
+            <w:tcW w:w="560" w:type="pct"/>
+            <w:shd w:val="clear" w:color="auto" w:fill="F2CEED" w:themeFill="accent5" w:themeFillTint="33"/>
+            <w:tcMar>
+              <w:top w:w="30" w:type="dxa"/>
+              <w:left w:w="80" w:type="dxa"/>
+              <w:bottom w:w="30" w:type="dxa"/>
+              <w:right w:w="80" w:type="dxa"/>
+            </w:tcMar>
+          </w:tcPr>
+          <w:p>
+            <w:r>
+              <w:rPr>
+                <w:rFonts w:ascii="Aptos" w:eastAsia="Aptos" w:hAnsi="Aptos" w:cs="Aptos"/>
+                <w:b/>
+                <w:bCs/>
+                <w:sz w:val="20"/>
+                <w:szCs w:val="20"/>
+              </w:rPr>
+              <w:t xml:space="preserve">Type</w:t>
+            </w:r>
+          </w:p>
+        </w:tc>
+        <w:tc>
+          <w:tcPr>
+            <w:tcW w:w="2290" w:type="pct"/>
+            <w:shd w:val="clear" w:color="auto" w:fill="F2CEED" w:themeFill="accent5" w:themeFillTint="33"/>
+            <w:tcMar>
+              <w:top w:w="30" w:type="dxa"/>
+              <w:left w:w="80" w:type="dxa"/>
+              <w:bottom w:w="30" w:type="dxa"/>
+              <w:right w:w="80" w:type="dxa"/>
+            </w:tcMar>
+          </w:tcPr>
+          <w:p>
+            <w:r>
+              <w:rPr>
+                <w:rFonts w:ascii="Aptos" w:eastAsia="Aptos" w:hAnsi="Aptos" w:cs="Aptos"/>
+                <w:b/>
+                <w:bCs/>
+                <w:sz w:val="20"/>
+                <w:szCs w:val="20"/>
+              </w:rPr>
+              <w:t xml:space="preserve">Expected Result</w:t>
+            </w:r>
+          </w:p>
+        </w:tc>
+      </w:tr>
+      <w:tr>
+        <w:trPr>
+          <w:cantSplit/>
+        </w:trPr>
+        <w:tc>
+          <w:tcPr>
+            <w:tcW w:w="300" w:type="pct"/>
+            <w:tcMar>
+              <w:top w:w="30" w:type="dxa"/>
+              <w:left w:w="80" w:type="dxa"/>
+              <w:bottom w:w="30" w:type="dxa"/>
+              <w:right w:w="80" w:type="dxa"/>
+            </w:tcMar>
+          </w:tcPr>
+          <w:p>
+            <w:r>
+              <w:rPr>
+                <w:rFonts w:ascii="Aptos" w:eastAsia="Aptos" w:hAnsi="Aptos" w:cs="Aptos"/>
+                <w:sz w:val="20"/>
+                <w:szCs w:val="20"/>
+              </w:rPr>
+              <w:t xml:space="preserve">68</w:t>
+            </w:r>
+          </w:p>
+        </w:tc>
+        <w:tc>
+          <w:tcPr>
+            <w:tcW w:w="1850" w:type="pct"/>
+            <w:tcMar>
+              <w:top w:w="30" w:type="dxa"/>
+              <w:left w:w="80" w:type="dxa"/>
+              <w:bottom w:w="30" w:type="dxa"/>
+              <w:right w:w="80" w:type="dxa"/>
+            </w:tcMar>
+          </w:tcPr>
+          <w:p>
+            <w:r>
+              <w:rPr>
+                <w:rFonts w:ascii="Aptos" w:eastAsia="Aptos" w:hAnsi="Aptos" w:cs="Aptos"/>
+                <w:sz w:val="20"/>
+                <w:szCs w:val="20"/>
+              </w:rPr>
+              <w:t xml:space="preserve">On the Booking Search form, type Smith into the search box and press Search</w:t>
+            </w:r>
+          </w:p>
+        </w:tc>
+        <w:tc>
+          <w:tcPr>
+            <w:tcW w:w="560" w:type="pct"/>
+            <w:tcMar>
+              <w:top w:w="30" w:type="dxa"/>
+              <w:left w:w="80" w:type="dxa"/>
+              <w:bottom w:w="30" w:type="dxa"/>
+              <w:right w:w="80" w:type="dxa"/>
+            </w:tcMar>
+          </w:tcPr>
+          <w:p>
+            <w:r>
+              <w:rPr>
+                <w:rFonts w:ascii="Aptos" w:eastAsia="Aptos" w:hAnsi="Aptos" w:cs="Aptos"/>
+                <w:sz w:val="20"/>
+                <w:szCs w:val="20"/>
+              </w:rPr>
+              <w:t xml:space="preserve">Normal</w:t>
+            </w:r>
+          </w:p>
+        </w:tc>
+        <w:tc>
+          <w:tcPr>
+            <w:tcW w:w="2290" w:type="pct"/>
+            <w:tcMar>
+              <w:top w:w="30" w:type="dxa"/>
+              <w:left w:w="80" w:type="dxa"/>
+              <w:bottom w:w="30" w:type="dxa"/>
+              <w:right w:w="80" w:type="dxa"/>
+            </w:tcMar>
+          </w:tcPr>
+          <w:p>
+            <w:r>
+              <w:rPr>
+                <w:rFonts w:ascii="Aptos" w:eastAsia="Aptos" w:hAnsi="Aptos" w:cs="Aptos"/>
+                <w:sz w:val="20"/>
+                <w:szCs w:val="20"/>
+              </w:rPr>
+              <w:t xml:space="preserve">The grid shows 3 bookings, for John Smith, Sarah Smith and David Smith, because all three have the surname Smith.</w:t>
+            </w:r>
+          </w:p>
+        </w:tc>
+      </w:tr>
+      <w:tr>
+        <w:trPr>
+          <w:cantSplit/>
+        </w:trPr>
+        <w:tc>
+          <w:tcPr>
+            <w:tcW w:w="300" w:type="pct"/>
+            <w:tcMar>
+              <w:top w:w="30" w:type="dxa"/>
+              <w:left w:w="80" w:type="dxa"/>
+              <w:bottom w:w="30" w:type="dxa"/>
+              <w:right w:w="80" w:type="dxa"/>
+            </w:tcMar>
+          </w:tcPr>
+          <w:p>
+            <w:r>
+              <w:rPr>
+                <w:rFonts w:ascii="Aptos" w:eastAsia="Aptos" w:hAnsi="Aptos" w:cs="Aptos"/>
+                <w:sz w:val="20"/>
+                <w:szCs w:val="20"/>
+              </w:rPr>
+              <w:t xml:space="preserve">69</w:t>
+            </w:r>
+          </w:p>
+        </w:tc>
+        <w:tc>
+          <w:tcPr>
+            <w:tcW w:w="1850" w:type="pct"/>
+            <w:tcMar>
+              <w:top w:w="30" w:type="dxa"/>
+              <w:left w:w="80" w:type="dxa"/>
+              <w:bottom w:w="30" w:type="dxa"/>
+              <w:right w:w="80" w:type="dxa"/>
+            </w:tcMar>
+          </w:tcPr>
+          <w:p>
+            <w:r>
+              <w:rPr>
+                <w:rFonts w:ascii="Aptos" w:eastAsia="Aptos" w:hAnsi="Aptos" w:cs="Aptos"/>
+                <w:sz w:val="20"/>
+                <w:szCs w:val="20"/>
+              </w:rPr>
+              <w:t xml:space="preserve">Type Jones into the search box and press Search</w:t>
+            </w:r>
+          </w:p>
+        </w:tc>
+        <w:tc>
+          <w:tcPr>
+            <w:tcW w:w="560" w:type="pct"/>
+            <w:tcMar>
+              <w:top w:w="30" w:type="dxa"/>
+              <w:left w:w="80" w:type="dxa"/>
+              <w:bottom w:w="30" w:type="dxa"/>
+              <w:right w:w="80" w:type="dxa"/>
+            </w:tcMar>
+          </w:tcPr>
+          <w:p>
+            <w:r>
+              <w:rPr>
+                <w:rFonts w:ascii="Aptos" w:eastAsia="Aptos" w:hAnsi="Aptos" w:cs="Aptos"/>
+                <w:sz w:val="20"/>
+                <w:szCs w:val="20"/>
+              </w:rPr>
+              <w:t xml:space="preserve">Normal</w:t>
+            </w:r>
+          </w:p>
+        </w:tc>
+        <w:tc>
+          <w:tcPr>
+            <w:tcW w:w="2290" w:type="pct"/>
+            <w:tcMar>
+              <w:top w:w="30" w:type="dxa"/>
+              <w:left w:w="80" w:type="dxa"/>
+              <w:bottom w:w="30" w:type="dxa"/>
+              <w:right w:w="80" w:type="dxa"/>
+            </w:tcMar>
+          </w:tcPr>
+          <w:p>
+            <w:r>
+              <w:rPr>
+                <w:rFonts w:ascii="Aptos" w:eastAsia="Aptos" w:hAnsi="Aptos" w:cs="Aptos"/>
+                <w:sz w:val="20"/>
+                <w:szCs w:val="20"/>
+              </w:rPr>
+              <w:t xml:space="preserve">The grid shows 1 booking, for Emma Jones.</w:t>
+            </w:r>
+          </w:p>
+        </w:tc>
+      </w:tr>
+      <w:tr>
+        <w:trPr>
+          <w:cantSplit/>
+        </w:trPr>
+        <w:tc>
+          <w:tcPr>
+            <w:tcW w:w="300" w:type="pct"/>
+            <w:tcMar>
+              <w:top w:w="30" w:type="dxa"/>
+              <w:left w:w="80" w:type="dxa"/>
+              <w:bottom w:w="30" w:type="dxa"/>
+              <w:right w:w="80" w:type="dxa"/>
+            </w:tcMar>
+          </w:tcPr>
+          <w:p>
+            <w:r>
+              <w:rPr>
+                <w:rFonts w:ascii="Aptos" w:eastAsia="Aptos" w:hAnsi="Aptos" w:cs="Aptos"/>
+                <w:sz w:val="20"/>
+                <w:szCs w:val="20"/>
+              </w:rPr>
+              <w:t xml:space="preserve">70</w:t>
+            </w:r>
+          </w:p>
+        </w:tc>
+        <w:tc>
+          <w:tcPr>
+            <w:tcW w:w="1850" w:type="pct"/>
+            <w:tcMar>
+              <w:top w:w="30" w:type="dxa"/>
+              <w:left w:w="80" w:type="dxa"/>
+              <w:bottom w:w="30" w:type="dxa"/>
+              <w:right w:w="80" w:type="dxa"/>
+            </w:tcMar>
+          </w:tcPr>
+          <w:p>
+            <w:r>
+              <w:rPr>
+                <w:rFonts w:ascii="Aptos" w:eastAsia="Aptos" w:hAnsi="Aptos" w:cs="Aptos"/>
+                <w:sz w:val="20"/>
+                <w:szCs w:val="20"/>
+              </w:rPr>
+              <w:t xml:space="preserve">Type smith in lower case into the search box and press Search</w:t>
+            </w:r>
+          </w:p>
+        </w:tc>
+        <w:tc>
+          <w:tcPr>
+            <w:tcW w:w="560" w:type="pct"/>
+            <w:tcMar>
+              <w:top w:w="30" w:type="dxa"/>
+              <w:left w:w="80" w:type="dxa"/>
+              <w:bottom w:w="30" w:type="dxa"/>
+              <w:right w:w="80" w:type="dxa"/>
+            </w:tcMar>
+          </w:tcPr>
+          <w:p>
+            <w:r>
+              <w:rPr>
+                <w:rFonts w:ascii="Aptos" w:eastAsia="Aptos" w:hAnsi="Aptos" w:cs="Aptos"/>
+                <w:sz w:val="20"/>
+                <w:szCs w:val="20"/>
+              </w:rPr>
+              <w:t xml:space="preserve">Normal</w:t>
+            </w:r>
+          </w:p>
+        </w:tc>
+        <w:tc>
+          <w:tcPr>
+            <w:tcW w:w="2290" w:type="pct"/>
+            <w:tcMar>
+              <w:top w:w="30" w:type="dxa"/>
+              <w:left w:w="80" w:type="dxa"/>
+              <w:bottom w:w="30" w:type="dxa"/>
+              <w:right w:w="80" w:type="dxa"/>
+            </w:tcMar>
+          </w:tcPr>
+          <w:p>
+            <w:r>
+              <w:rPr>
+                <w:rFonts w:ascii="Aptos" w:eastAsia="Aptos" w:hAnsi="Aptos" w:cs="Aptos"/>
+                <w:sz w:val="20"/>
+                <w:szCs w:val="20"/>
+              </w:rPr>
+              <w:t xml:space="preserve">The grid still shows the same 3 bookings, because the search is not case sensitive.</w:t>
+            </w:r>
+          </w:p>
+        </w:tc>
+      </w:tr>
+      <w:tr>
+        <w:trPr>
+          <w:cantSplit/>
+        </w:trPr>
+        <w:tc>
+          <w:tcPr>
+            <w:tcW w:w="300" w:type="pct"/>
+            <w:tcMar>
+              <w:top w:w="30" w:type="dxa"/>
+              <w:left w:w="80" w:type="dxa"/>
+              <w:bottom w:w="30" w:type="dxa"/>
+              <w:right w:w="80" w:type="dxa"/>
+            </w:tcMar>
+          </w:tcPr>
+          <w:p>
+            <w:r>
+              <w:rPr>
+                <w:rFonts w:ascii="Aptos" w:eastAsia="Aptos" w:hAnsi="Aptos" w:cs="Aptos"/>
+                <w:sz w:val="20"/>
+                <w:szCs w:val="20"/>
+              </w:rPr>
+              <w:t xml:space="preserve">71</w:t>
+            </w:r>
+          </w:p>
+        </w:tc>
+        <w:tc>
+          <w:tcPr>
+            <w:tcW w:w="1850" w:type="pct"/>
+            <w:tcMar>
+              <w:top w:w="30" w:type="dxa"/>
+              <w:left w:w="80" w:type="dxa"/>
+              <w:bottom w:w="30" w:type="dxa"/>
+              <w:right w:w="80" w:type="dxa"/>
+            </w:tcMar>
+          </w:tcPr>
+          <w:p>
+            <w:r>
+              <w:rPr>
+                <w:rFonts w:ascii="Aptos" w:eastAsia="Aptos" w:hAnsi="Aptos" w:cs="Aptos"/>
+                <w:sz w:val="20"/>
+                <w:szCs w:val="20"/>
+              </w:rPr>
+              <w:t xml:space="preserve">Type the booking id of John Smith's booking into the search box and press Search</w:t>
+            </w:r>
+          </w:p>
+        </w:tc>
+        <w:tc>
+          <w:tcPr>
+            <w:tcW w:w="560" w:type="pct"/>
+            <w:tcMar>
+              <w:top w:w="30" w:type="dxa"/>
+              <w:left w:w="80" w:type="dxa"/>
+              <w:bottom w:w="30" w:type="dxa"/>
+              <w:right w:w="80" w:type="dxa"/>
+            </w:tcMar>
+          </w:tcPr>
+          <w:p>
+            <w:r>
+              <w:rPr>
+                <w:rFonts w:ascii="Aptos" w:eastAsia="Aptos" w:hAnsi="Aptos" w:cs="Aptos"/>
+                <w:sz w:val="20"/>
+                <w:szCs w:val="20"/>
+              </w:rPr>
+              <w:t xml:space="preserve">Normal</w:t>
+            </w:r>
+          </w:p>
+        </w:tc>
+        <w:tc>
+          <w:tcPr>
+            <w:tcW w:w="2290" w:type="pct"/>
+            <w:tcMar>
+              <w:top w:w="30" w:type="dxa"/>
+              <w:left w:w="80" w:type="dxa"/>
+              <w:bottom w:w="30" w:type="dxa"/>
+              <w:right w:w="80" w:type="dxa"/>
+            </w:tcMar>
+          </w:tcPr>
+          <w:p>
+            <w:r>
+              <w:rPr>
+                <w:rFonts w:ascii="Aptos" w:eastAsia="Aptos" w:hAnsi="Aptos" w:cs="Aptos"/>
+                <w:sz w:val="20"/>
+                <w:szCs w:val="20"/>
+              </w:rPr>
+              <w:t xml:space="preserve">The grid shows only that one booking, because a search that is a number is matched against the booking id exactly rather than being searched for by name.</w:t>
+            </w:r>
+          </w:p>
+        </w:tc>
+      </w:tr>
+      <w:tr>
+        <w:trPr>
+          <w:cantSplit/>
+        </w:trPr>
+        <w:tc>
+          <w:tcPr>
+            <w:tcW w:w="300" w:type="pct"/>
+            <w:tcMar>
+              <w:top w:w="30" w:type="dxa"/>
+              <w:left w:w="80" w:type="dxa"/>
+              <w:bottom w:w="30" w:type="dxa"/>
+              <w:right w:w="80" w:type="dxa"/>
+            </w:tcMar>
+          </w:tcPr>
+          <w:p>
+            <w:r>
+              <w:rPr>
+                <w:rFonts w:ascii="Aptos" w:eastAsia="Aptos" w:hAnsi="Aptos" w:cs="Aptos"/>
+                <w:sz w:val="20"/>
+                <w:szCs w:val="20"/>
+              </w:rPr>
+              <w:t xml:space="preserve">72</w:t>
+            </w:r>
+          </w:p>
+        </w:tc>
+        <w:tc>
+          <w:tcPr>
+            <w:tcW w:w="1850" w:type="pct"/>
+            <w:tcMar>
+              <w:top w:w="30" w:type="dxa"/>
+              <w:left w:w="80" w:type="dxa"/>
+              <w:bottom w:w="30" w:type="dxa"/>
+              <w:right w:w="80" w:type="dxa"/>
+            </w:tcMar>
+          </w:tcPr>
+          <w:p>
+            <w:r>
+              <w:rPr>
+                <w:rFonts w:ascii="Aptos" w:eastAsia="Aptos" w:hAnsi="Aptos" w:cs="Aptos"/>
+                <w:sz w:val="20"/>
+                <w:szCs w:val="20"/>
+              </w:rPr>
+              <w:t xml:space="preserve">Type Xanadu into the search box and press Search</w:t>
+            </w:r>
+          </w:p>
+        </w:tc>
+        <w:tc>
+          <w:tcPr>
+            <w:tcW w:w="560" w:type="pct"/>
+            <w:tcMar>
+              <w:top w:w="30" w:type="dxa"/>
+              <w:left w:w="80" w:type="dxa"/>
+              <w:bottom w:w="30" w:type="dxa"/>
+              <w:right w:w="80" w:type="dxa"/>
+            </w:tcMar>
+          </w:tcPr>
+          <w:p>
+            <w:r>
+              <w:rPr>
+                <w:rFonts w:ascii="Aptos" w:eastAsia="Aptos" w:hAnsi="Aptos" w:cs="Aptos"/>
+                <w:sz w:val="20"/>
+                <w:szCs w:val="20"/>
+              </w:rPr>
+              <w:t xml:space="preserve">Erroneous</w:t>
+            </w:r>
+          </w:p>
+        </w:tc>
+        <w:tc>
+          <w:tcPr>
+            <w:tcW w:w="2290" w:type="pct"/>
+            <w:tcMar>
+              <w:top w:w="30" w:type="dxa"/>
+              <w:left w:w="80" w:type="dxa"/>
+              <w:bottom w:w="30" w:type="dxa"/>
+              <w:right w:w="80" w:type="dxa"/>
+            </w:tcMar>
+          </w:tcPr>
+          <w:p>
+            <w:r>
+              <w:rPr>
+                <w:rFonts w:ascii="Aptos" w:eastAsia="Aptos" w:hAnsi="Aptos" w:cs="Aptos"/>
+                <w:sz w:val="20"/>
+                <w:szCs w:val="20"/>
+              </w:rPr>
+              <w:t xml:space="preserve">The grid shows no bookings, because there is no customer whose name contains Xanadu.</w:t>
             </w:r>
           </w:p>
         </w:tc>

</xml_diff>

<commit_message>
added objective 9: viewing the door list
</commit_message>
<xml_diff>
--- a/Testing.docx
+++ b/Testing.docx
@@ -7827,6 +7827,607 @@
                 <w:szCs w:val="20"/>
               </w:rPr>
               <w:t xml:space="preserve">The grid shows no bookings, because there is no customer whose name contains Xanadu.</w:t>
+            </w:r>
+          </w:p>
+        </w:tc>
+      </w:tr>
+    </w:tbl>
+    <w:p>
+      <w:r>
+        <w:rPr>
+          <w:rFonts w:ascii="Aptos" w:eastAsia="Aptos" w:hAnsi="Aptos" w:cs="Aptos"/>
+        </w:rPr>
+        <w:t xml:space="preserve"/>
+      </w:r>
+    </w:p>
+    <w:p>
+      <w:pPr>
+        <w:pStyle w:val="Heading3"/>
+      </w:pPr>
+      <w:r>
+        <w:rPr>
+          <w:rFonts w:ascii="Aptos Display" w:eastAsia="Aptos Display" w:hAnsi="Aptos Display" w:cs="Aptos Display"/>
+          <w:b/>
+          <w:bCs/>
+          <w:color w:val="000000"/>
+        </w:rPr>
+        <w:t xml:space="preserve">Objective 9: Viewing the Door List</w:t>
+      </w:r>
+    </w:p>
+    <w:p>
+      <w:r>
+        <w:rPr>
+          <w:rFonts w:ascii="Aptos" w:eastAsia="Aptos" w:hAnsi="Aptos" w:cs="Aptos"/>
+        </w:rPr>
+        <w:t xml:space="preserve">These tests check the door list for a screening and its export. They are run before anything is refunded or cancelled, so all of the Inception bookings are still present.</w:t>
+      </w:r>
+    </w:p>
+    <w:tbl>
+      <w:tblPr>
+        <w:tblW w:w="5000" w:type="pct"/>
+        <w:tblBorders>
+          <w:top w:val="single" w:sz="4" w:space="0" w:color="808080"/>
+          <w:left w:val="single" w:sz="4" w:space="0" w:color="808080"/>
+          <w:bottom w:val="single" w:sz="4" w:space="0" w:color="808080"/>
+          <w:right w:val="single" w:sz="4" w:space="0" w:color="808080"/>
+          <w:insideH w:val="single" w:sz="4" w:space="0" w:color="808080"/>
+          <w:insideV w:val="single" w:sz="4" w:space="0" w:color="808080"/>
+        </w:tblBorders>
+        <w:tblCellMar>
+          <w:left w:w="10" w:type="dxa"/>
+          <w:right w:w="10" w:type="dxa"/>
+        </w:tblCellMar>
+        <w:tblLook w:val="0000" w:firstRow="0" w:lastRow="0" w:firstColumn="0" w:lastColumn="0" w:noHBand="0" w:noVBand="0"/>
+      </w:tblPr>
+      <w:tblGrid>
+        <w:gridCol w:w="561"/>
+        <w:gridCol w:w="3460"/>
+        <w:gridCol w:w="1047"/>
+        <w:gridCol w:w="4282"/>
+      </w:tblGrid>
+      <w:tr>
+        <w:trPr>
+          <w:cantSplit/>
+          <w:tblHeader/>
+        </w:trPr>
+        <w:tc>
+          <w:tcPr>
+            <w:tcW w:w="300" w:type="pct"/>
+            <w:shd w:val="clear" w:color="auto" w:fill="F2CEED" w:themeFill="accent5" w:themeFillTint="33"/>
+            <w:tcMar>
+              <w:top w:w="30" w:type="dxa"/>
+              <w:left w:w="80" w:type="dxa"/>
+              <w:bottom w:w="30" w:type="dxa"/>
+              <w:right w:w="80" w:type="dxa"/>
+            </w:tcMar>
+          </w:tcPr>
+          <w:p>
+            <w:r>
+              <w:rPr>
+                <w:rFonts w:ascii="Aptos" w:eastAsia="Aptos" w:hAnsi="Aptos" w:cs="Aptos"/>
+                <w:b/>
+                <w:bCs/>
+                <w:sz w:val="20"/>
+                <w:szCs w:val="20"/>
+              </w:rPr>
+              <w:t xml:space="preserve">No.</w:t>
+            </w:r>
+          </w:p>
+        </w:tc>
+        <w:tc>
+          <w:tcPr>
+            <w:tcW w:w="1850" w:type="pct"/>
+            <w:shd w:val="clear" w:color="auto" w:fill="F2CEED" w:themeFill="accent5" w:themeFillTint="33"/>
+            <w:tcMar>
+              <w:top w:w="30" w:type="dxa"/>
+              <w:left w:w="80" w:type="dxa"/>
+              <w:bottom w:w="30" w:type="dxa"/>
+              <w:right w:w="80" w:type="dxa"/>
+            </w:tcMar>
+          </w:tcPr>
+          <w:p>
+            <w:r>
+              <w:rPr>
+                <w:rFonts w:ascii="Aptos" w:eastAsia="Aptos" w:hAnsi="Aptos" w:cs="Aptos"/>
+                <w:b/>
+                <w:bCs/>
+                <w:sz w:val="20"/>
+                <w:szCs w:val="20"/>
+              </w:rPr>
+              <w:t xml:space="preserve">Test</w:t>
+            </w:r>
+          </w:p>
+        </w:tc>
+        <w:tc>
+          <w:tcPr>
+            <w:tcW w:w="560" w:type="pct"/>
+            <w:shd w:val="clear" w:color="auto" w:fill="F2CEED" w:themeFill="accent5" w:themeFillTint="33"/>
+            <w:tcMar>
+              <w:top w:w="30" w:type="dxa"/>
+              <w:left w:w="80" w:type="dxa"/>
+              <w:bottom w:w="30" w:type="dxa"/>
+              <w:right w:w="80" w:type="dxa"/>
+            </w:tcMar>
+          </w:tcPr>
+          <w:p>
+            <w:r>
+              <w:rPr>
+                <w:rFonts w:ascii="Aptos" w:eastAsia="Aptos" w:hAnsi="Aptos" w:cs="Aptos"/>
+                <w:b/>
+                <w:bCs/>
+                <w:sz w:val="20"/>
+                <w:szCs w:val="20"/>
+              </w:rPr>
+              <w:t xml:space="preserve">Type</w:t>
+            </w:r>
+          </w:p>
+        </w:tc>
+        <w:tc>
+          <w:tcPr>
+            <w:tcW w:w="2290" w:type="pct"/>
+            <w:shd w:val="clear" w:color="auto" w:fill="F2CEED" w:themeFill="accent5" w:themeFillTint="33"/>
+            <w:tcMar>
+              <w:top w:w="30" w:type="dxa"/>
+              <w:left w:w="80" w:type="dxa"/>
+              <w:bottom w:w="30" w:type="dxa"/>
+              <w:right w:w="80" w:type="dxa"/>
+            </w:tcMar>
+          </w:tcPr>
+          <w:p>
+            <w:r>
+              <w:rPr>
+                <w:rFonts w:ascii="Aptos" w:eastAsia="Aptos" w:hAnsi="Aptos" w:cs="Aptos"/>
+                <w:b/>
+                <w:bCs/>
+                <w:sz w:val="20"/>
+                <w:szCs w:val="20"/>
+              </w:rPr>
+              <w:t xml:space="preserve">Expected Result</w:t>
+            </w:r>
+          </w:p>
+        </w:tc>
+      </w:tr>
+      <w:tr>
+        <w:trPr>
+          <w:cantSplit/>
+        </w:trPr>
+        <w:tc>
+          <w:tcPr>
+            <w:tcW w:w="300" w:type="pct"/>
+            <w:tcMar>
+              <w:top w:w="30" w:type="dxa"/>
+              <w:left w:w="80" w:type="dxa"/>
+              <w:bottom w:w="30" w:type="dxa"/>
+              <w:right w:w="80" w:type="dxa"/>
+            </w:tcMar>
+          </w:tcPr>
+          <w:p>
+            <w:r>
+              <w:rPr>
+                <w:rFonts w:ascii="Aptos" w:eastAsia="Aptos" w:hAnsi="Aptos" w:cs="Aptos"/>
+                <w:sz w:val="20"/>
+                <w:szCs w:val="20"/>
+              </w:rPr>
+              <w:t xml:space="preserve">73</w:t>
+            </w:r>
+          </w:p>
+        </w:tc>
+        <w:tc>
+          <w:tcPr>
+            <w:tcW w:w="1850" w:type="pct"/>
+            <w:tcMar>
+              <w:top w:w="30" w:type="dxa"/>
+              <w:left w:w="80" w:type="dxa"/>
+              <w:bottom w:w="30" w:type="dxa"/>
+              <w:right w:w="80" w:type="dxa"/>
+            </w:tcMar>
+          </w:tcPr>
+          <w:p>
+            <w:r>
+              <w:rPr>
+                <w:rFonts w:ascii="Aptos" w:eastAsia="Aptos" w:hAnsi="Aptos" w:cs="Aptos"/>
+                <w:sz w:val="20"/>
+                <w:szCs w:val="20"/>
+              </w:rPr>
+              <w:t xml:space="preserve">In the door list section, pick the Inception screening and press Load door list</w:t>
+            </w:r>
+          </w:p>
+        </w:tc>
+        <w:tc>
+          <w:tcPr>
+            <w:tcW w:w="560" w:type="pct"/>
+            <w:tcMar>
+              <w:top w:w="30" w:type="dxa"/>
+              <w:left w:w="80" w:type="dxa"/>
+              <w:bottom w:w="30" w:type="dxa"/>
+              <w:right w:w="80" w:type="dxa"/>
+            </w:tcMar>
+          </w:tcPr>
+          <w:p>
+            <w:r>
+              <w:rPr>
+                <w:rFonts w:ascii="Aptos" w:eastAsia="Aptos" w:hAnsi="Aptos" w:cs="Aptos"/>
+                <w:sz w:val="20"/>
+                <w:szCs w:val="20"/>
+              </w:rPr>
+              <w:t xml:space="preserve">Normal</w:t>
+            </w:r>
+          </w:p>
+        </w:tc>
+        <w:tc>
+          <w:tcPr>
+            <w:tcW w:w="2290" w:type="pct"/>
+            <w:tcMar>
+              <w:top w:w="30" w:type="dxa"/>
+              <w:left w:w="80" w:type="dxa"/>
+              <w:bottom w:w="30" w:type="dxa"/>
+              <w:right w:w="80" w:type="dxa"/>
+            </w:tcMar>
+          </w:tcPr>
+          <w:p>
+            <w:r>
+              <w:rPr>
+                <w:rFonts w:ascii="Aptos" w:eastAsia="Aptos" w:hAnsi="Aptos" w:cs="Aptos"/>
+                <w:sz w:val="20"/>
+                <w:szCs w:val="20"/>
+              </w:rPr>
+              <w:t xml:space="preserve">The door list grid shows 4 rows, John Smith in seats B1 and B2, Sarah Smith in seat A1 and David Smith in seat D1, with the booking id against each one.</w:t>
+            </w:r>
+          </w:p>
+        </w:tc>
+      </w:tr>
+      <w:tr>
+        <w:trPr>
+          <w:cantSplit/>
+        </w:trPr>
+        <w:tc>
+          <w:tcPr>
+            <w:tcW w:w="300" w:type="pct"/>
+            <w:tcMar>
+              <w:top w:w="30" w:type="dxa"/>
+              <w:left w:w="80" w:type="dxa"/>
+              <w:bottom w:w="30" w:type="dxa"/>
+              <w:right w:w="80" w:type="dxa"/>
+            </w:tcMar>
+          </w:tcPr>
+          <w:p>
+            <w:r>
+              <w:rPr>
+                <w:rFonts w:ascii="Aptos" w:eastAsia="Aptos" w:hAnsi="Aptos" w:cs="Aptos"/>
+                <w:sz w:val="20"/>
+                <w:szCs w:val="20"/>
+              </w:rPr>
+              <w:t xml:space="preserve">74</w:t>
+            </w:r>
+          </w:p>
+        </w:tc>
+        <w:tc>
+          <w:tcPr>
+            <w:tcW w:w="1850" w:type="pct"/>
+            <w:tcMar>
+              <w:top w:w="30" w:type="dxa"/>
+              <w:left w:w="80" w:type="dxa"/>
+              <w:bottom w:w="30" w:type="dxa"/>
+              <w:right w:w="80" w:type="dxa"/>
+            </w:tcMar>
+          </w:tcPr>
+          <w:p>
+            <w:r>
+              <w:rPr>
+                <w:rFonts w:ascii="Aptos" w:eastAsia="Aptos" w:hAnsi="Aptos" w:cs="Aptos"/>
+                <w:sz w:val="20"/>
+                <w:szCs w:val="20"/>
+              </w:rPr>
+              <w:t xml:space="preserve">Without picking a screening, press Load door list</w:t>
+            </w:r>
+          </w:p>
+        </w:tc>
+        <w:tc>
+          <w:tcPr>
+            <w:tcW w:w="560" w:type="pct"/>
+            <w:tcMar>
+              <w:top w:w="30" w:type="dxa"/>
+              <w:left w:w="80" w:type="dxa"/>
+              <w:bottom w:w="30" w:type="dxa"/>
+              <w:right w:w="80" w:type="dxa"/>
+            </w:tcMar>
+          </w:tcPr>
+          <w:p>
+            <w:r>
+              <w:rPr>
+                <w:rFonts w:ascii="Aptos" w:eastAsia="Aptos" w:hAnsi="Aptos" w:cs="Aptos"/>
+                <w:sz w:val="20"/>
+                <w:szCs w:val="20"/>
+              </w:rPr>
+              <w:t xml:space="preserve">Erroneous</w:t>
+            </w:r>
+          </w:p>
+        </w:tc>
+        <w:tc>
+          <w:tcPr>
+            <w:tcW w:w="2290" w:type="pct"/>
+            <w:tcMar>
+              <w:top w:w="30" w:type="dxa"/>
+              <w:left w:w="80" w:type="dxa"/>
+              <w:bottom w:w="30" w:type="dxa"/>
+              <w:right w:w="80" w:type="dxa"/>
+            </w:tcMar>
+          </w:tcPr>
+          <w:p>
+            <w:r>
+              <w:rPr>
+                <w:rFonts w:ascii="Aptos" w:eastAsia="Aptos" w:hAnsi="Aptos" w:cs="Aptos"/>
+                <w:sz w:val="20"/>
+                <w:szCs w:val="20"/>
+              </w:rPr>
+              <w:t xml:space="preserve">The door list is not loaded and a message appears stating “Pick a screening first”.</w:t>
+            </w:r>
+          </w:p>
+        </w:tc>
+      </w:tr>
+      <w:tr>
+        <w:trPr>
+          <w:cantSplit/>
+        </w:trPr>
+        <w:tc>
+          <w:tcPr>
+            <w:tcW w:w="300" w:type="pct"/>
+            <w:tcMar>
+              <w:top w:w="30" w:type="dxa"/>
+              <w:left w:w="80" w:type="dxa"/>
+              <w:bottom w:w="30" w:type="dxa"/>
+              <w:right w:w="80" w:type="dxa"/>
+            </w:tcMar>
+          </w:tcPr>
+          <w:p>
+            <w:r>
+              <w:rPr>
+                <w:rFonts w:ascii="Aptos" w:eastAsia="Aptos" w:hAnsi="Aptos" w:cs="Aptos"/>
+                <w:sz w:val="20"/>
+                <w:szCs w:val="20"/>
+              </w:rPr>
+              <w:t xml:space="preserve">75</w:t>
+            </w:r>
+          </w:p>
+        </w:tc>
+        <w:tc>
+          <w:tcPr>
+            <w:tcW w:w="1850" w:type="pct"/>
+            <w:tcMar>
+              <w:top w:w="30" w:type="dxa"/>
+              <w:left w:w="80" w:type="dxa"/>
+              <w:bottom w:w="30" w:type="dxa"/>
+              <w:right w:w="80" w:type="dxa"/>
+            </w:tcMar>
+          </w:tcPr>
+          <w:p>
+            <w:r>
+              <w:rPr>
+                <w:rFonts w:ascii="Aptos" w:eastAsia="Aptos" w:hAnsi="Aptos" w:cs="Aptos"/>
+                <w:sz w:val="20"/>
+                <w:szCs w:val="20"/>
+              </w:rPr>
+              <w:t xml:space="preserve">With the Inception door list loaded, press Export door list and save the file</w:t>
+            </w:r>
+          </w:p>
+        </w:tc>
+        <w:tc>
+          <w:tcPr>
+            <w:tcW w:w="560" w:type="pct"/>
+            <w:tcMar>
+              <w:top w:w="30" w:type="dxa"/>
+              <w:left w:w="80" w:type="dxa"/>
+              <w:bottom w:w="30" w:type="dxa"/>
+              <w:right w:w="80" w:type="dxa"/>
+            </w:tcMar>
+          </w:tcPr>
+          <w:p>
+            <w:r>
+              <w:rPr>
+                <w:rFonts w:ascii="Aptos" w:eastAsia="Aptos" w:hAnsi="Aptos" w:cs="Aptos"/>
+                <w:sz w:val="20"/>
+                <w:szCs w:val="20"/>
+              </w:rPr>
+              <w:t xml:space="preserve">Normal</w:t>
+            </w:r>
+          </w:p>
+        </w:tc>
+        <w:tc>
+          <w:tcPr>
+            <w:tcW w:w="2290" w:type="pct"/>
+            <w:tcMar>
+              <w:top w:w="30" w:type="dxa"/>
+              <w:left w:w="80" w:type="dxa"/>
+              <w:bottom w:w="30" w:type="dxa"/>
+              <w:right w:w="80" w:type="dxa"/>
+            </w:tcMar>
+          </w:tcPr>
+          <w:p>
+            <w:r>
+              <w:rPr>
+                <w:rFonts w:ascii="Aptos" w:eastAsia="Aptos" w:hAnsi="Aptos" w:cs="Aptos"/>
+                <w:sz w:val="20"/>
+                <w:szCs w:val="20"/>
+              </w:rPr>
+              <w:t xml:space="preserve">A CSV file is created containing a header row followed by one row for each seat on the door list, and a message appears stating “Door list exported”.</w:t>
+            </w:r>
+          </w:p>
+        </w:tc>
+      </w:tr>
+      <w:tr>
+        <w:trPr>
+          <w:cantSplit/>
+        </w:trPr>
+        <w:tc>
+          <w:tcPr>
+            <w:tcW w:w="300" w:type="pct"/>
+            <w:tcMar>
+              <w:top w:w="30" w:type="dxa"/>
+              <w:left w:w="80" w:type="dxa"/>
+              <w:bottom w:w="30" w:type="dxa"/>
+              <w:right w:w="80" w:type="dxa"/>
+            </w:tcMar>
+          </w:tcPr>
+          <w:p>
+            <w:r>
+              <w:rPr>
+                <w:rFonts w:ascii="Aptos" w:eastAsia="Aptos" w:hAnsi="Aptos" w:cs="Aptos"/>
+                <w:sz w:val="20"/>
+                <w:szCs w:val="20"/>
+              </w:rPr>
+              <w:t xml:space="preserve">76</w:t>
+            </w:r>
+          </w:p>
+        </w:tc>
+        <w:tc>
+          <w:tcPr>
+            <w:tcW w:w="1850" w:type="pct"/>
+            <w:tcMar>
+              <w:top w:w="30" w:type="dxa"/>
+              <w:left w:w="80" w:type="dxa"/>
+              <w:bottom w:w="30" w:type="dxa"/>
+              <w:right w:w="80" w:type="dxa"/>
+            </w:tcMar>
+          </w:tcPr>
+          <w:p>
+            <w:r>
+              <w:rPr>
+                <w:rFonts w:ascii="Aptos" w:eastAsia="Aptos" w:hAnsi="Aptos" w:cs="Aptos"/>
+                <w:sz w:val="20"/>
+                <w:szCs w:val="20"/>
+              </w:rPr>
+              <w:t xml:space="preserve">Without loading a door list first, press Export door list</w:t>
+            </w:r>
+          </w:p>
+        </w:tc>
+        <w:tc>
+          <w:tcPr>
+            <w:tcW w:w="560" w:type="pct"/>
+            <w:tcMar>
+              <w:top w:w="30" w:type="dxa"/>
+              <w:left w:w="80" w:type="dxa"/>
+              <w:bottom w:w="30" w:type="dxa"/>
+              <w:right w:w="80" w:type="dxa"/>
+            </w:tcMar>
+          </w:tcPr>
+          <w:p>
+            <w:r>
+              <w:rPr>
+                <w:rFonts w:ascii="Aptos" w:eastAsia="Aptos" w:hAnsi="Aptos" w:cs="Aptos"/>
+                <w:sz w:val="20"/>
+                <w:szCs w:val="20"/>
+              </w:rPr>
+              <w:t xml:space="preserve">Erroneous</w:t>
+            </w:r>
+          </w:p>
+        </w:tc>
+        <w:tc>
+          <w:tcPr>
+            <w:tcW w:w="2290" w:type="pct"/>
+            <w:tcMar>
+              <w:top w:w="30" w:type="dxa"/>
+              <w:left w:w="80" w:type="dxa"/>
+              <w:bottom w:w="30" w:type="dxa"/>
+              <w:right w:w="80" w:type="dxa"/>
+            </w:tcMar>
+          </w:tcPr>
+          <w:p>
+            <w:r>
+              <w:rPr>
+                <w:rFonts w:ascii="Aptos" w:eastAsia="Aptos" w:hAnsi="Aptos" w:cs="Aptos"/>
+                <w:sz w:val="20"/>
+                <w:szCs w:val="20"/>
+              </w:rPr>
+              <w:t xml:space="preserve">No file is created and a message appears stating “Load a door list first”.</w:t>
+            </w:r>
+          </w:p>
+        </w:tc>
+      </w:tr>
+      <w:tr>
+        <w:trPr>
+          <w:cantSplit/>
+        </w:trPr>
+        <w:tc>
+          <w:tcPr>
+            <w:tcW w:w="300" w:type="pct"/>
+            <w:tcMar>
+              <w:top w:w="30" w:type="dxa"/>
+              <w:left w:w="80" w:type="dxa"/>
+              <w:bottom w:w="30" w:type="dxa"/>
+              <w:right w:w="80" w:type="dxa"/>
+            </w:tcMar>
+          </w:tcPr>
+          <w:p>
+            <w:r>
+              <w:rPr>
+                <w:rFonts w:ascii="Aptos" w:eastAsia="Aptos" w:hAnsi="Aptos" w:cs="Aptos"/>
+                <w:sz w:val="20"/>
+                <w:szCs w:val="20"/>
+              </w:rPr>
+              <w:t xml:space="preserve">77</w:t>
+            </w:r>
+          </w:p>
+        </w:tc>
+        <w:tc>
+          <w:tcPr>
+            <w:tcW w:w="1850" w:type="pct"/>
+            <w:tcMar>
+              <w:top w:w="30" w:type="dxa"/>
+              <w:left w:w="80" w:type="dxa"/>
+              <w:bottom w:w="30" w:type="dxa"/>
+              <w:right w:w="80" w:type="dxa"/>
+            </w:tcMar>
+          </w:tcPr>
+          <w:p>
+            <w:r>
+              <w:rPr>
+                <w:rFonts w:ascii="Aptos" w:eastAsia="Aptos" w:hAnsi="Aptos" w:cs="Aptos"/>
+                <w:sz w:val="20"/>
+                <w:szCs w:val="20"/>
+              </w:rPr>
+              <w:t xml:space="preserve">Pick a screening that has no bookings on it and press Load door list</w:t>
+            </w:r>
+          </w:p>
+        </w:tc>
+        <w:tc>
+          <w:tcPr>
+            <w:tcW w:w="560" w:type="pct"/>
+            <w:tcMar>
+              <w:top w:w="30" w:type="dxa"/>
+              <w:left w:w="80" w:type="dxa"/>
+              <w:bottom w:w="30" w:type="dxa"/>
+              <w:right w:w="80" w:type="dxa"/>
+            </w:tcMar>
+          </w:tcPr>
+          <w:p>
+            <w:r>
+              <w:rPr>
+                <w:rFonts w:ascii="Aptos" w:eastAsia="Aptos" w:hAnsi="Aptos" w:cs="Aptos"/>
+                <w:sz w:val="20"/>
+                <w:szCs w:val="20"/>
+              </w:rPr>
+              <w:t xml:space="preserve">Boundary</w:t>
+            </w:r>
+          </w:p>
+        </w:tc>
+        <w:tc>
+          <w:tcPr>
+            <w:tcW w:w="2290" w:type="pct"/>
+            <w:tcMar>
+              <w:top w:w="30" w:type="dxa"/>
+              <w:left w:w="80" w:type="dxa"/>
+              <w:bottom w:w="30" w:type="dxa"/>
+              <w:right w:w="80" w:type="dxa"/>
+            </w:tcMar>
+          </w:tcPr>
+          <w:p>
+            <w:r>
+              <w:rPr>
+                <w:rFonts w:ascii="Aptos" w:eastAsia="Aptos" w:hAnsi="Aptos" w:cs="Aptos"/>
+                <w:sz w:val="20"/>
+                <w:szCs w:val="20"/>
+              </w:rPr>
+              <w:t xml:space="preserve">The door list loads and is empty rather than the system reporting an error, because a screening with no bookings is a perfectly valid thing to ask for.</w:t>
             </w:r>
           </w:p>
         </w:tc>

</xml_diff>

<commit_message>
added objective 8: viewing a sales report
</commit_message>
<xml_diff>
--- a/Testing.docx
+++ b/Testing.docx
@@ -8428,6 +8428,607 @@
                 <w:szCs w:val="20"/>
               </w:rPr>
               <w:t xml:space="preserve">The door list loads and is empty rather than the system reporting an error, because a screening with no bookings is a perfectly valid thing to ask for.</w:t>
+            </w:r>
+          </w:p>
+        </w:tc>
+      </w:tr>
+    </w:tbl>
+    <w:p>
+      <w:r>
+        <w:rPr>
+          <w:rFonts w:ascii="Aptos" w:eastAsia="Aptos" w:hAnsi="Aptos" w:cs="Aptos"/>
+        </w:rPr>
+        <w:t xml:space="preserve"/>
+      </w:r>
+    </w:p>
+    <w:p>
+      <w:pPr>
+        <w:pStyle w:val="Heading3"/>
+      </w:pPr>
+      <w:r>
+        <w:rPr>
+          <w:rFonts w:ascii="Aptos Display" w:eastAsia="Aptos Display" w:hAnsi="Aptos Display" w:cs="Aptos Display"/>
+          <w:b/>
+          <w:bCs/>
+          <w:color w:val="000000"/>
+        </w:rPr>
+        <w:t xml:space="preserve">Objective 8: Viewing a Sales Report</w:t>
+      </w:r>
+    </w:p>
+    <w:p>
+      <w:r>
+        <w:rPr>
+          <w:rFonts w:ascii="Aptos" w:eastAsia="Aptos" w:hAnsi="Aptos" w:cs="Aptos"/>
+        </w:rPr>
+        <w:t xml:space="preserve">These tests check the sales report over the bookings and the food order created so far, before anything has been refunded or cancelled. The expected figures follow directly from the test data, so the report is checked against arithmetic that can be worked out by hand rather than against whatever the report happens to say.</w:t>
+      </w:r>
+    </w:p>
+    <w:tbl>
+      <w:tblPr>
+        <w:tblW w:w="5000" w:type="pct"/>
+        <w:tblBorders>
+          <w:top w:val="single" w:sz="4" w:space="0" w:color="808080"/>
+          <w:left w:val="single" w:sz="4" w:space="0" w:color="808080"/>
+          <w:bottom w:val="single" w:sz="4" w:space="0" w:color="808080"/>
+          <w:right w:val="single" w:sz="4" w:space="0" w:color="808080"/>
+          <w:insideH w:val="single" w:sz="4" w:space="0" w:color="808080"/>
+          <w:insideV w:val="single" w:sz="4" w:space="0" w:color="808080"/>
+        </w:tblBorders>
+        <w:tblCellMar>
+          <w:left w:w="10" w:type="dxa"/>
+          <w:right w:w="10" w:type="dxa"/>
+        </w:tblCellMar>
+        <w:tblLook w:val="0000" w:firstRow="0" w:lastRow="0" w:firstColumn="0" w:lastColumn="0" w:noHBand="0" w:noVBand="0"/>
+      </w:tblPr>
+      <w:tblGrid>
+        <w:gridCol w:w="561"/>
+        <w:gridCol w:w="3460"/>
+        <w:gridCol w:w="1047"/>
+        <w:gridCol w:w="4282"/>
+      </w:tblGrid>
+      <w:tr>
+        <w:trPr>
+          <w:cantSplit/>
+          <w:tblHeader/>
+        </w:trPr>
+        <w:tc>
+          <w:tcPr>
+            <w:tcW w:w="300" w:type="pct"/>
+            <w:shd w:val="clear" w:color="auto" w:fill="F2CEED" w:themeFill="accent5" w:themeFillTint="33"/>
+            <w:tcMar>
+              <w:top w:w="30" w:type="dxa"/>
+              <w:left w:w="80" w:type="dxa"/>
+              <w:bottom w:w="30" w:type="dxa"/>
+              <w:right w:w="80" w:type="dxa"/>
+            </w:tcMar>
+          </w:tcPr>
+          <w:p>
+            <w:r>
+              <w:rPr>
+                <w:rFonts w:ascii="Aptos" w:eastAsia="Aptos" w:hAnsi="Aptos" w:cs="Aptos"/>
+                <w:b/>
+                <w:bCs/>
+                <w:sz w:val="20"/>
+                <w:szCs w:val="20"/>
+              </w:rPr>
+              <w:t xml:space="preserve">No.</w:t>
+            </w:r>
+          </w:p>
+        </w:tc>
+        <w:tc>
+          <w:tcPr>
+            <w:tcW w:w="1850" w:type="pct"/>
+            <w:shd w:val="clear" w:color="auto" w:fill="F2CEED" w:themeFill="accent5" w:themeFillTint="33"/>
+            <w:tcMar>
+              <w:top w:w="30" w:type="dxa"/>
+              <w:left w:w="80" w:type="dxa"/>
+              <w:bottom w:w="30" w:type="dxa"/>
+              <w:right w:w="80" w:type="dxa"/>
+            </w:tcMar>
+          </w:tcPr>
+          <w:p>
+            <w:r>
+              <w:rPr>
+                <w:rFonts w:ascii="Aptos" w:eastAsia="Aptos" w:hAnsi="Aptos" w:cs="Aptos"/>
+                <w:b/>
+                <w:bCs/>
+                <w:sz w:val="20"/>
+                <w:szCs w:val="20"/>
+              </w:rPr>
+              <w:t xml:space="preserve">Test</w:t>
+            </w:r>
+          </w:p>
+        </w:tc>
+        <w:tc>
+          <w:tcPr>
+            <w:tcW w:w="560" w:type="pct"/>
+            <w:shd w:val="clear" w:color="auto" w:fill="F2CEED" w:themeFill="accent5" w:themeFillTint="33"/>
+            <w:tcMar>
+              <w:top w:w="30" w:type="dxa"/>
+              <w:left w:w="80" w:type="dxa"/>
+              <w:bottom w:w="30" w:type="dxa"/>
+              <w:right w:w="80" w:type="dxa"/>
+            </w:tcMar>
+          </w:tcPr>
+          <w:p>
+            <w:r>
+              <w:rPr>
+                <w:rFonts w:ascii="Aptos" w:eastAsia="Aptos" w:hAnsi="Aptos" w:cs="Aptos"/>
+                <w:b/>
+                <w:bCs/>
+                <w:sz w:val="20"/>
+                <w:szCs w:val="20"/>
+              </w:rPr>
+              <w:t xml:space="preserve">Type</w:t>
+            </w:r>
+          </w:p>
+        </w:tc>
+        <w:tc>
+          <w:tcPr>
+            <w:tcW w:w="2290" w:type="pct"/>
+            <w:shd w:val="clear" w:color="auto" w:fill="F2CEED" w:themeFill="accent5" w:themeFillTint="33"/>
+            <w:tcMar>
+              <w:top w:w="30" w:type="dxa"/>
+              <w:left w:w="80" w:type="dxa"/>
+              <w:bottom w:w="30" w:type="dxa"/>
+              <w:right w:w="80" w:type="dxa"/>
+            </w:tcMar>
+          </w:tcPr>
+          <w:p>
+            <w:r>
+              <w:rPr>
+                <w:rFonts w:ascii="Aptos" w:eastAsia="Aptos" w:hAnsi="Aptos" w:cs="Aptos"/>
+                <w:b/>
+                <w:bCs/>
+                <w:sz w:val="20"/>
+                <w:szCs w:val="20"/>
+              </w:rPr>
+              <w:t xml:space="preserve">Expected Result</w:t>
+            </w:r>
+          </w:p>
+        </w:tc>
+      </w:tr>
+      <w:tr>
+        <w:trPr>
+          <w:cantSplit/>
+        </w:trPr>
+        <w:tc>
+          <w:tcPr>
+            <w:tcW w:w="300" w:type="pct"/>
+            <w:tcMar>
+              <w:top w:w="30" w:type="dxa"/>
+              <w:left w:w="80" w:type="dxa"/>
+              <w:bottom w:w="30" w:type="dxa"/>
+              <w:right w:w="80" w:type="dxa"/>
+            </w:tcMar>
+          </w:tcPr>
+          <w:p>
+            <w:r>
+              <w:rPr>
+                <w:rFonts w:ascii="Aptos" w:eastAsia="Aptos" w:hAnsi="Aptos" w:cs="Aptos"/>
+                <w:sz w:val="20"/>
+                <w:szCs w:val="20"/>
+              </w:rPr>
+              <w:t xml:space="preserve">78</w:t>
+            </w:r>
+          </w:p>
+        </w:tc>
+        <w:tc>
+          <w:tcPr>
+            <w:tcW w:w="1850" w:type="pct"/>
+            <w:tcMar>
+              <w:top w:w="30" w:type="dxa"/>
+              <w:left w:w="80" w:type="dxa"/>
+              <w:bottom w:w="30" w:type="dxa"/>
+              <w:right w:w="80" w:type="dxa"/>
+            </w:tcMar>
+          </w:tcPr>
+          <w:p>
+            <w:r>
+              <w:rPr>
+                <w:rFonts w:ascii="Aptos" w:eastAsia="Aptos" w:hAnsi="Aptos" w:cs="Aptos"/>
+                <w:sz w:val="20"/>
+                <w:szCs w:val="20"/>
+              </w:rPr>
+              <w:t xml:space="preserve">On the Sales Report form, set the date range to 01/07/2026 to 31/07/2026 and press Run report</w:t>
+            </w:r>
+          </w:p>
+        </w:tc>
+        <w:tc>
+          <w:tcPr>
+            <w:tcW w:w="560" w:type="pct"/>
+            <w:tcMar>
+              <w:top w:w="30" w:type="dxa"/>
+              <w:left w:w="80" w:type="dxa"/>
+              <w:bottom w:w="30" w:type="dxa"/>
+              <w:right w:w="80" w:type="dxa"/>
+            </w:tcMar>
+          </w:tcPr>
+          <w:p>
+            <w:r>
+              <w:rPr>
+                <w:rFonts w:ascii="Aptos" w:eastAsia="Aptos" w:hAnsi="Aptos" w:cs="Aptos"/>
+                <w:sz w:val="20"/>
+                <w:szCs w:val="20"/>
+              </w:rPr>
+              <w:t xml:space="preserve">Normal</w:t>
+            </w:r>
+          </w:p>
+        </w:tc>
+        <w:tc>
+          <w:tcPr>
+            <w:tcW w:w="2290" w:type="pct"/>
+            <w:tcMar>
+              <w:top w:w="30" w:type="dxa"/>
+              <w:left w:w="80" w:type="dxa"/>
+              <w:bottom w:w="30" w:type="dxa"/>
+              <w:right w:w="80" w:type="dxa"/>
+            </w:tcMar>
+          </w:tcPr>
+          <w:p>
+            <w:r>
+              <w:rPr>
+                <w:rFonts w:ascii="Aptos" w:eastAsia="Aptos" w:hAnsi="Aptos" w:cs="Aptos"/>
+                <w:sz w:val="20"/>
+                <w:szCs w:val="20"/>
+              </w:rPr>
+              <w:t xml:space="preserve">The report shows Inception with 4 tickets and ticket takings of £38.70, and Paddington 2 with 1 ticket and £7.50. The ticket takings total is £46.20, the food takings are £11.50 and the grand total is £57.70.</w:t>
+            </w:r>
+          </w:p>
+        </w:tc>
+      </w:tr>
+      <w:tr>
+        <w:trPr>
+          <w:cantSplit/>
+        </w:trPr>
+        <w:tc>
+          <w:tcPr>
+            <w:tcW w:w="300" w:type="pct"/>
+            <w:tcMar>
+              <w:top w:w="30" w:type="dxa"/>
+              <w:left w:w="80" w:type="dxa"/>
+              <w:bottom w:w="30" w:type="dxa"/>
+              <w:right w:w="80" w:type="dxa"/>
+            </w:tcMar>
+          </w:tcPr>
+          <w:p>
+            <w:r>
+              <w:rPr>
+                <w:rFonts w:ascii="Aptos" w:eastAsia="Aptos" w:hAnsi="Aptos" w:cs="Aptos"/>
+                <w:sz w:val="20"/>
+                <w:szCs w:val="20"/>
+              </w:rPr>
+              <w:t xml:space="preserve">79</w:t>
+            </w:r>
+          </w:p>
+        </w:tc>
+        <w:tc>
+          <w:tcPr>
+            <w:tcW w:w="1850" w:type="pct"/>
+            <w:tcMar>
+              <w:top w:w="30" w:type="dxa"/>
+              <w:left w:w="80" w:type="dxa"/>
+              <w:bottom w:w="30" w:type="dxa"/>
+              <w:right w:w="80" w:type="dxa"/>
+            </w:tcMar>
+          </w:tcPr>
+          <w:p>
+            <w:r>
+              <w:rPr>
+                <w:rFonts w:ascii="Aptos" w:eastAsia="Aptos" w:hAnsi="Aptos" w:cs="Aptos"/>
+                <w:sz w:val="20"/>
+                <w:szCs w:val="20"/>
+              </w:rPr>
+              <w:t xml:space="preserve">Check the Inception figure by hand against the bookings that make it up</w:t>
+            </w:r>
+          </w:p>
+        </w:tc>
+        <w:tc>
+          <w:tcPr>
+            <w:tcW w:w="560" w:type="pct"/>
+            <w:tcMar>
+              <w:top w:w="30" w:type="dxa"/>
+              <w:left w:w="80" w:type="dxa"/>
+              <w:bottom w:w="30" w:type="dxa"/>
+              <w:right w:w="80" w:type="dxa"/>
+            </w:tcMar>
+          </w:tcPr>
+          <w:p>
+            <w:r>
+              <w:rPr>
+                <w:rFonts w:ascii="Aptos" w:eastAsia="Aptos" w:hAnsi="Aptos" w:cs="Aptos"/>
+                <w:sz w:val="20"/>
+                <w:szCs w:val="20"/>
+              </w:rPr>
+              <w:t xml:space="preserve">Normal</w:t>
+            </w:r>
+          </w:p>
+        </w:tc>
+        <w:tc>
+          <w:tcPr>
+            <w:tcW w:w="2290" w:type="pct"/>
+            <w:tcMar>
+              <w:top w:w="30" w:type="dxa"/>
+              <w:left w:w="80" w:type="dxa"/>
+              <w:bottom w:w="30" w:type="dxa"/>
+              <w:right w:w="80" w:type="dxa"/>
+            </w:tcMar>
+          </w:tcPr>
+          <w:p>
+            <w:r>
+              <w:rPr>
+                <w:rFonts w:ascii="Aptos" w:eastAsia="Aptos" w:hAnsi="Aptos" w:cs="Aptos"/>
+                <w:sz w:val="20"/>
+                <w:szCs w:val="20"/>
+              </w:rPr>
+              <w:t xml:space="preserve">The £38.70 is £18.00 for John Smith's two Standard seats, £7.20 for Sarah Smith's Saver seat and £13.50 for David Smith's Premium seat, which confirms the report is summing what was actually charged rather than assuming every seat cost £9.00.</w:t>
+            </w:r>
+          </w:p>
+        </w:tc>
+      </w:tr>
+      <w:tr>
+        <w:trPr>
+          <w:cantSplit/>
+        </w:trPr>
+        <w:tc>
+          <w:tcPr>
+            <w:tcW w:w="300" w:type="pct"/>
+            <w:tcMar>
+              <w:top w:w="30" w:type="dxa"/>
+              <w:left w:w="80" w:type="dxa"/>
+              <w:bottom w:w="30" w:type="dxa"/>
+              <w:right w:w="80" w:type="dxa"/>
+            </w:tcMar>
+          </w:tcPr>
+          <w:p>
+            <w:r>
+              <w:rPr>
+                <w:rFonts w:ascii="Aptos" w:eastAsia="Aptos" w:hAnsi="Aptos" w:cs="Aptos"/>
+                <w:sz w:val="20"/>
+                <w:szCs w:val="20"/>
+              </w:rPr>
+              <w:t xml:space="preserve">80</w:t>
+            </w:r>
+          </w:p>
+        </w:tc>
+        <w:tc>
+          <w:tcPr>
+            <w:tcW w:w="1850" w:type="pct"/>
+            <w:tcMar>
+              <w:top w:w="30" w:type="dxa"/>
+              <w:left w:w="80" w:type="dxa"/>
+              <w:bottom w:w="30" w:type="dxa"/>
+              <w:right w:w="80" w:type="dxa"/>
+            </w:tcMar>
+          </w:tcPr>
+          <w:p>
+            <w:r>
+              <w:rPr>
+                <w:rFonts w:ascii="Aptos" w:eastAsia="Aptos" w:hAnsi="Aptos" w:cs="Aptos"/>
+                <w:sz w:val="20"/>
+                <w:szCs w:val="20"/>
+              </w:rPr>
+              <w:t xml:space="preserve">Set the date range to 01/01/2020 to 02/01/2020 and press Run report</w:t>
+            </w:r>
+          </w:p>
+        </w:tc>
+        <w:tc>
+          <w:tcPr>
+            <w:tcW w:w="560" w:type="pct"/>
+            <w:tcMar>
+              <w:top w:w="30" w:type="dxa"/>
+              <w:left w:w="80" w:type="dxa"/>
+              <w:bottom w:w="30" w:type="dxa"/>
+              <w:right w:w="80" w:type="dxa"/>
+            </w:tcMar>
+          </w:tcPr>
+          <w:p>
+            <w:r>
+              <w:rPr>
+                <w:rFonts w:ascii="Aptos" w:eastAsia="Aptos" w:hAnsi="Aptos" w:cs="Aptos"/>
+                <w:sz w:val="20"/>
+                <w:szCs w:val="20"/>
+              </w:rPr>
+              <w:t xml:space="preserve">Boundary</w:t>
+            </w:r>
+          </w:p>
+        </w:tc>
+        <w:tc>
+          <w:tcPr>
+            <w:tcW w:w="2290" w:type="pct"/>
+            <w:tcMar>
+              <w:top w:w="30" w:type="dxa"/>
+              <w:left w:w="80" w:type="dxa"/>
+              <w:bottom w:w="30" w:type="dxa"/>
+              <w:right w:w="80" w:type="dxa"/>
+            </w:tcMar>
+          </w:tcPr>
+          <w:p>
+            <w:r>
+              <w:rPr>
+                <w:rFonts w:ascii="Aptos" w:eastAsia="Aptos" w:hAnsi="Aptos" w:cs="Aptos"/>
+                <w:sz w:val="20"/>
+                <w:szCs w:val="20"/>
+              </w:rPr>
+              <w:t xml:space="preserve">The report shows no film rows and the ticket takings, food takings and grand total all show £0.00, because no bookings fall in that range.</w:t>
+            </w:r>
+          </w:p>
+        </w:tc>
+      </w:tr>
+      <w:tr>
+        <w:trPr>
+          <w:cantSplit/>
+        </w:trPr>
+        <w:tc>
+          <w:tcPr>
+            <w:tcW w:w="300" w:type="pct"/>
+            <w:tcMar>
+              <w:top w:w="30" w:type="dxa"/>
+              <w:left w:w="80" w:type="dxa"/>
+              <w:bottom w:w="30" w:type="dxa"/>
+              <w:right w:w="80" w:type="dxa"/>
+            </w:tcMar>
+          </w:tcPr>
+          <w:p>
+            <w:r>
+              <w:rPr>
+                <w:rFonts w:ascii="Aptos" w:eastAsia="Aptos" w:hAnsi="Aptos" w:cs="Aptos"/>
+                <w:sz w:val="20"/>
+                <w:szCs w:val="20"/>
+              </w:rPr>
+              <w:t xml:space="preserve">81</w:t>
+            </w:r>
+          </w:p>
+        </w:tc>
+        <w:tc>
+          <w:tcPr>
+            <w:tcW w:w="1850" w:type="pct"/>
+            <w:tcMar>
+              <w:top w:w="30" w:type="dxa"/>
+              <w:left w:w="80" w:type="dxa"/>
+              <w:bottom w:w="30" w:type="dxa"/>
+              <w:right w:w="80" w:type="dxa"/>
+            </w:tcMar>
+          </w:tcPr>
+          <w:p>
+            <w:r>
+              <w:rPr>
+                <w:rFonts w:ascii="Aptos" w:eastAsia="Aptos" w:hAnsi="Aptos" w:cs="Aptos"/>
+                <w:sz w:val="20"/>
+                <w:szCs w:val="20"/>
+              </w:rPr>
+              <w:t xml:space="preserve">Set the From date to 31/07/2026 and the To date to 01/07/2026, then press Run report</w:t>
+            </w:r>
+          </w:p>
+        </w:tc>
+        <w:tc>
+          <w:tcPr>
+            <w:tcW w:w="560" w:type="pct"/>
+            <w:tcMar>
+              <w:top w:w="30" w:type="dxa"/>
+              <w:left w:w="80" w:type="dxa"/>
+              <w:bottom w:w="30" w:type="dxa"/>
+              <w:right w:w="80" w:type="dxa"/>
+            </w:tcMar>
+          </w:tcPr>
+          <w:p>
+            <w:r>
+              <w:rPr>
+                <w:rFonts w:ascii="Aptos" w:eastAsia="Aptos" w:hAnsi="Aptos" w:cs="Aptos"/>
+                <w:sz w:val="20"/>
+                <w:szCs w:val="20"/>
+              </w:rPr>
+              <w:t xml:space="preserve">Erroneous</w:t>
+            </w:r>
+          </w:p>
+        </w:tc>
+        <w:tc>
+          <w:tcPr>
+            <w:tcW w:w="2290" w:type="pct"/>
+            <w:tcMar>
+              <w:top w:w="30" w:type="dxa"/>
+              <w:left w:w="80" w:type="dxa"/>
+              <w:bottom w:w="30" w:type="dxa"/>
+              <w:right w:w="80" w:type="dxa"/>
+            </w:tcMar>
+          </w:tcPr>
+          <w:p>
+            <w:r>
+              <w:rPr>
+                <w:rFonts w:ascii="Aptos" w:eastAsia="Aptos" w:hAnsi="Aptos" w:cs="Aptos"/>
+                <w:sz w:val="20"/>
+                <w:szCs w:val="20"/>
+              </w:rPr>
+              <w:t xml:space="preserve">The report is not run and a message appears stating “From date cant be after the to date”.</w:t>
+            </w:r>
+          </w:p>
+        </w:tc>
+      </w:tr>
+      <w:tr>
+        <w:trPr>
+          <w:cantSplit/>
+        </w:trPr>
+        <w:tc>
+          <w:tcPr>
+            <w:tcW w:w="300" w:type="pct"/>
+            <w:tcMar>
+              <w:top w:w="30" w:type="dxa"/>
+              <w:left w:w="80" w:type="dxa"/>
+              <w:bottom w:w="30" w:type="dxa"/>
+              <w:right w:w="80" w:type="dxa"/>
+            </w:tcMar>
+          </w:tcPr>
+          <w:p>
+            <w:r>
+              <w:rPr>
+                <w:rFonts w:ascii="Aptos" w:eastAsia="Aptos" w:hAnsi="Aptos" w:cs="Aptos"/>
+                <w:sz w:val="20"/>
+                <w:szCs w:val="20"/>
+              </w:rPr>
+              <w:t xml:space="preserve">82</w:t>
+            </w:r>
+          </w:p>
+        </w:tc>
+        <w:tc>
+          <w:tcPr>
+            <w:tcW w:w="1850" w:type="pct"/>
+            <w:tcMar>
+              <w:top w:w="30" w:type="dxa"/>
+              <w:left w:w="80" w:type="dxa"/>
+              <w:bottom w:w="30" w:type="dxa"/>
+              <w:right w:w="80" w:type="dxa"/>
+            </w:tcMar>
+          </w:tcPr>
+          <w:p>
+            <w:r>
+              <w:rPr>
+                <w:rFonts w:ascii="Aptos" w:eastAsia="Aptos" w:hAnsi="Aptos" w:cs="Aptos"/>
+                <w:sz w:val="20"/>
+                <w:szCs w:val="20"/>
+              </w:rPr>
+              <w:t xml:space="preserve">Set the From date and the To date both to the date the bookings were taken and press Run report</w:t>
+            </w:r>
+          </w:p>
+        </w:tc>
+        <w:tc>
+          <w:tcPr>
+            <w:tcW w:w="560" w:type="pct"/>
+            <w:tcMar>
+              <w:top w:w="30" w:type="dxa"/>
+              <w:left w:w="80" w:type="dxa"/>
+              <w:bottom w:w="30" w:type="dxa"/>
+              <w:right w:w="80" w:type="dxa"/>
+            </w:tcMar>
+          </w:tcPr>
+          <w:p>
+            <w:r>
+              <w:rPr>
+                <w:rFonts w:ascii="Aptos" w:eastAsia="Aptos" w:hAnsi="Aptos" w:cs="Aptos"/>
+                <w:sz w:val="20"/>
+                <w:szCs w:val="20"/>
+              </w:rPr>
+              <w:t xml:space="preserve">Boundary</w:t>
+            </w:r>
+          </w:p>
+        </w:tc>
+        <w:tc>
+          <w:tcPr>
+            <w:tcW w:w="2290" w:type="pct"/>
+            <w:tcMar>
+              <w:top w:w="30" w:type="dxa"/>
+              <w:left w:w="80" w:type="dxa"/>
+              <w:bottom w:w="30" w:type="dxa"/>
+              <w:right w:w="80" w:type="dxa"/>
+            </w:tcMar>
+          </w:tcPr>
+          <w:p>
+            <w:r>
+              <w:rPr>
+                <w:rFonts w:ascii="Aptos" w:eastAsia="Aptos" w:hAnsi="Aptos" w:cs="Aptos"/>
+                <w:sz w:val="20"/>
+                <w:szCs w:val="20"/>
+              </w:rPr>
+              <w:t xml:space="preserve">The bookings taken on that day are all included, because a range of a single day includes the whole of that day rather than nothing.</w:t>
             </w:r>
           </w:p>
         </w:tc>

</xml_diff>

<commit_message>
added objective 12: cancelling a booking
</commit_message>
<xml_diff>
--- a/Testing.docx
+++ b/Testing.docx
@@ -9029,6 +9029,874 @@
                 <w:szCs w:val="20"/>
               </w:rPr>
               <w:t xml:space="preserve">The bookings taken on that day are all included, because a range of a single day includes the whole of that day rather than nothing.</w:t>
+            </w:r>
+          </w:p>
+        </w:tc>
+      </w:tr>
+    </w:tbl>
+    <w:p>
+      <w:r>
+        <w:rPr>
+          <w:rFonts w:ascii="Aptos" w:eastAsia="Aptos" w:hAnsi="Aptos" w:cs="Aptos"/>
+        </w:rPr>
+        <w:t xml:space="preserve"/>
+      </w:r>
+    </w:p>
+    <w:p>
+      <w:pPr>
+        <w:pStyle w:val="Heading3"/>
+      </w:pPr>
+      <w:r>
+        <w:rPr>
+          <w:rFonts w:ascii="Aptos Display" w:eastAsia="Aptos Display" w:hAnsi="Aptos Display" w:cs="Aptos Display"/>
+          <w:b/>
+          <w:bCs/>
+          <w:color w:val="000000"/>
+        </w:rPr>
+        <w:t xml:space="preserve">Objective 12: Cancelling a Booking</w:t>
+      </w:r>
+    </w:p>
+    <w:p>
+      <w:r>
+        <w:rPr>
+          <w:rFonts w:ascii="Aptos" w:eastAsia="Aptos" w:hAnsi="Aptos" w:cs="Aptos"/>
+        </w:rPr>
+        <w:t xml:space="preserve">Cancelling has changed since the prototype. A cancelled booking is no longer deleted, because the sale has to stay on record so that the money given back can be reported. Instead the booking is marked as cancelled and its seats are released. These tests check both halves of that, and then confirm by re-running the search and the report that the cancellation has really taken effect.</w:t>
+      </w:r>
+    </w:p>
+    <w:tbl>
+      <w:tblPr>
+        <w:tblW w:w="5000" w:type="pct"/>
+        <w:tblBorders>
+          <w:top w:val="single" w:sz="4" w:space="0" w:color="808080"/>
+          <w:left w:val="single" w:sz="4" w:space="0" w:color="808080"/>
+          <w:bottom w:val="single" w:sz="4" w:space="0" w:color="808080"/>
+          <w:right w:val="single" w:sz="4" w:space="0" w:color="808080"/>
+          <w:insideH w:val="single" w:sz="4" w:space="0" w:color="808080"/>
+          <w:insideV w:val="single" w:sz="4" w:space="0" w:color="808080"/>
+        </w:tblBorders>
+        <w:tblCellMar>
+          <w:left w:w="10" w:type="dxa"/>
+          <w:right w:w="10" w:type="dxa"/>
+        </w:tblCellMar>
+        <w:tblLook w:val="0000" w:firstRow="0" w:lastRow="0" w:firstColumn="0" w:lastColumn="0" w:noHBand="0" w:noVBand="0"/>
+      </w:tblPr>
+      <w:tblGrid>
+        <w:gridCol w:w="561"/>
+        <w:gridCol w:w="3460"/>
+        <w:gridCol w:w="1047"/>
+        <w:gridCol w:w="4282"/>
+      </w:tblGrid>
+      <w:tr>
+        <w:trPr>
+          <w:cantSplit/>
+          <w:tblHeader/>
+        </w:trPr>
+        <w:tc>
+          <w:tcPr>
+            <w:tcW w:w="300" w:type="pct"/>
+            <w:shd w:val="clear" w:color="auto" w:fill="F2CEED" w:themeFill="accent5" w:themeFillTint="33"/>
+            <w:tcMar>
+              <w:top w:w="30" w:type="dxa"/>
+              <w:left w:w="80" w:type="dxa"/>
+              <w:bottom w:w="30" w:type="dxa"/>
+              <w:right w:w="80" w:type="dxa"/>
+            </w:tcMar>
+          </w:tcPr>
+          <w:p>
+            <w:r>
+              <w:rPr>
+                <w:rFonts w:ascii="Aptos" w:eastAsia="Aptos" w:hAnsi="Aptos" w:cs="Aptos"/>
+                <w:b/>
+                <w:bCs/>
+                <w:sz w:val="20"/>
+                <w:szCs w:val="20"/>
+              </w:rPr>
+              <w:t xml:space="preserve">No.</w:t>
+            </w:r>
+          </w:p>
+        </w:tc>
+        <w:tc>
+          <w:tcPr>
+            <w:tcW w:w="1850" w:type="pct"/>
+            <w:shd w:val="clear" w:color="auto" w:fill="F2CEED" w:themeFill="accent5" w:themeFillTint="33"/>
+            <w:tcMar>
+              <w:top w:w="30" w:type="dxa"/>
+              <w:left w:w="80" w:type="dxa"/>
+              <w:bottom w:w="30" w:type="dxa"/>
+              <w:right w:w="80" w:type="dxa"/>
+            </w:tcMar>
+          </w:tcPr>
+          <w:p>
+            <w:r>
+              <w:rPr>
+                <w:rFonts w:ascii="Aptos" w:eastAsia="Aptos" w:hAnsi="Aptos" w:cs="Aptos"/>
+                <w:b/>
+                <w:bCs/>
+                <w:sz w:val="20"/>
+                <w:szCs w:val="20"/>
+              </w:rPr>
+              <w:t xml:space="preserve">Test</w:t>
+            </w:r>
+          </w:p>
+        </w:tc>
+        <w:tc>
+          <w:tcPr>
+            <w:tcW w:w="560" w:type="pct"/>
+            <w:shd w:val="clear" w:color="auto" w:fill="F2CEED" w:themeFill="accent5" w:themeFillTint="33"/>
+            <w:tcMar>
+              <w:top w:w="30" w:type="dxa"/>
+              <w:left w:w="80" w:type="dxa"/>
+              <w:bottom w:w="30" w:type="dxa"/>
+              <w:right w:w="80" w:type="dxa"/>
+            </w:tcMar>
+          </w:tcPr>
+          <w:p>
+            <w:r>
+              <w:rPr>
+                <w:rFonts w:ascii="Aptos" w:eastAsia="Aptos" w:hAnsi="Aptos" w:cs="Aptos"/>
+                <w:b/>
+                <w:bCs/>
+                <w:sz w:val="20"/>
+                <w:szCs w:val="20"/>
+              </w:rPr>
+              <w:t xml:space="preserve">Type</w:t>
+            </w:r>
+          </w:p>
+        </w:tc>
+        <w:tc>
+          <w:tcPr>
+            <w:tcW w:w="2290" w:type="pct"/>
+            <w:shd w:val="clear" w:color="auto" w:fill="F2CEED" w:themeFill="accent5" w:themeFillTint="33"/>
+            <w:tcMar>
+              <w:top w:w="30" w:type="dxa"/>
+              <w:left w:w="80" w:type="dxa"/>
+              <w:bottom w:w="30" w:type="dxa"/>
+              <w:right w:w="80" w:type="dxa"/>
+            </w:tcMar>
+          </w:tcPr>
+          <w:p>
+            <w:r>
+              <w:rPr>
+                <w:rFonts w:ascii="Aptos" w:eastAsia="Aptos" w:hAnsi="Aptos" w:cs="Aptos"/>
+                <w:b/>
+                <w:bCs/>
+                <w:sz w:val="20"/>
+                <w:szCs w:val="20"/>
+              </w:rPr>
+              <w:t xml:space="preserve">Expected Result</w:t>
+            </w:r>
+          </w:p>
+        </w:tc>
+      </w:tr>
+      <w:tr>
+        <w:trPr>
+          <w:cantSplit/>
+        </w:trPr>
+        <w:tc>
+          <w:tcPr>
+            <w:tcW w:w="300" w:type="pct"/>
+            <w:tcMar>
+              <w:top w:w="30" w:type="dxa"/>
+              <w:left w:w="80" w:type="dxa"/>
+              <w:bottom w:w="30" w:type="dxa"/>
+              <w:right w:w="80" w:type="dxa"/>
+            </w:tcMar>
+          </w:tcPr>
+          <w:p>
+            <w:r>
+              <w:rPr>
+                <w:rFonts w:ascii="Aptos" w:eastAsia="Aptos" w:hAnsi="Aptos" w:cs="Aptos"/>
+                <w:sz w:val="20"/>
+                <w:szCs w:val="20"/>
+              </w:rPr>
+              <w:t xml:space="preserve">83</w:t>
+            </w:r>
+          </w:p>
+        </w:tc>
+        <w:tc>
+          <w:tcPr>
+            <w:tcW w:w="1850" w:type="pct"/>
+            <w:tcMar>
+              <w:top w:w="30" w:type="dxa"/>
+              <w:left w:w="80" w:type="dxa"/>
+              <w:bottom w:w="30" w:type="dxa"/>
+              <w:right w:w="80" w:type="dxa"/>
+            </w:tcMar>
+          </w:tcPr>
+          <w:p>
+            <w:r>
+              <w:rPr>
+                <w:rFonts w:ascii="Aptos" w:eastAsia="Aptos" w:hAnsi="Aptos" w:cs="Aptos"/>
+                <w:sz w:val="20"/>
+                <w:szCs w:val="20"/>
+              </w:rPr>
+              <w:t xml:space="preserve">On the Booking Search form, without selecting a booking, press Refund the whole booking</w:t>
+            </w:r>
+          </w:p>
+        </w:tc>
+        <w:tc>
+          <w:tcPr>
+            <w:tcW w:w="560" w:type="pct"/>
+            <w:tcMar>
+              <w:top w:w="30" w:type="dxa"/>
+              <w:left w:w="80" w:type="dxa"/>
+              <w:bottom w:w="30" w:type="dxa"/>
+              <w:right w:w="80" w:type="dxa"/>
+            </w:tcMar>
+          </w:tcPr>
+          <w:p>
+            <w:r>
+              <w:rPr>
+                <w:rFonts w:ascii="Aptos" w:eastAsia="Aptos" w:hAnsi="Aptos" w:cs="Aptos"/>
+                <w:sz w:val="20"/>
+                <w:szCs w:val="20"/>
+              </w:rPr>
+              <w:t xml:space="preserve">Erroneous</w:t>
+            </w:r>
+          </w:p>
+        </w:tc>
+        <w:tc>
+          <w:tcPr>
+            <w:tcW w:w="2290" w:type="pct"/>
+            <w:tcMar>
+              <w:top w:w="30" w:type="dxa"/>
+              <w:left w:w="80" w:type="dxa"/>
+              <w:bottom w:w="30" w:type="dxa"/>
+              <w:right w:w="80" w:type="dxa"/>
+            </w:tcMar>
+          </w:tcPr>
+          <w:p>
+            <w:r>
+              <w:rPr>
+                <w:rFonts w:ascii="Aptos" w:eastAsia="Aptos" w:hAnsi="Aptos" w:cs="Aptos"/>
+                <w:sz w:val="20"/>
+                <w:szCs w:val="20"/>
+              </w:rPr>
+              <w:t xml:space="preserve">Nothing is cancelled and a message appears stating “Select a booking in the grid first”.</w:t>
+            </w:r>
+          </w:p>
+        </w:tc>
+      </w:tr>
+      <w:tr>
+        <w:trPr>
+          <w:cantSplit/>
+        </w:trPr>
+        <w:tc>
+          <w:tcPr>
+            <w:tcW w:w="300" w:type="pct"/>
+            <w:tcMar>
+              <w:top w:w="30" w:type="dxa"/>
+              <w:left w:w="80" w:type="dxa"/>
+              <w:bottom w:w="30" w:type="dxa"/>
+              <w:right w:w="80" w:type="dxa"/>
+            </w:tcMar>
+          </w:tcPr>
+          <w:p>
+            <w:r>
+              <w:rPr>
+                <w:rFonts w:ascii="Aptos" w:eastAsia="Aptos" w:hAnsi="Aptos" w:cs="Aptos"/>
+                <w:sz w:val="20"/>
+                <w:szCs w:val="20"/>
+              </w:rPr>
+              <w:t xml:space="preserve">84</w:t>
+            </w:r>
+          </w:p>
+        </w:tc>
+        <w:tc>
+          <w:tcPr>
+            <w:tcW w:w="1850" w:type="pct"/>
+            <w:tcMar>
+              <w:top w:w="30" w:type="dxa"/>
+              <w:left w:w="80" w:type="dxa"/>
+              <w:bottom w:w="30" w:type="dxa"/>
+              <w:right w:w="80" w:type="dxa"/>
+            </w:tcMar>
+          </w:tcPr>
+          <w:p>
+            <w:r>
+              <w:rPr>
+                <w:rFonts w:ascii="Aptos" w:eastAsia="Aptos" w:hAnsi="Aptos" w:cs="Aptos"/>
+                <w:sz w:val="20"/>
+                <w:szCs w:val="20"/>
+              </w:rPr>
+              <w:t xml:space="preserve">Log in as a member of staff, select a booking and press Refund the whole booking</w:t>
+            </w:r>
+          </w:p>
+        </w:tc>
+        <w:tc>
+          <w:tcPr>
+            <w:tcW w:w="560" w:type="pct"/>
+            <w:tcMar>
+              <w:top w:w="30" w:type="dxa"/>
+              <w:left w:w="80" w:type="dxa"/>
+              <w:bottom w:w="30" w:type="dxa"/>
+              <w:right w:w="80" w:type="dxa"/>
+            </w:tcMar>
+          </w:tcPr>
+          <w:p>
+            <w:r>
+              <w:rPr>
+                <w:rFonts w:ascii="Aptos" w:eastAsia="Aptos" w:hAnsi="Aptos" w:cs="Aptos"/>
+                <w:sz w:val="20"/>
+                <w:szCs w:val="20"/>
+              </w:rPr>
+              <w:t xml:space="preserve">Erroneous</w:t>
+            </w:r>
+          </w:p>
+        </w:tc>
+        <w:tc>
+          <w:tcPr>
+            <w:tcW w:w="2290" w:type="pct"/>
+            <w:tcMar>
+              <w:top w:w="30" w:type="dxa"/>
+              <w:left w:w="80" w:type="dxa"/>
+              <w:bottom w:w="30" w:type="dxa"/>
+              <w:right w:w="80" w:type="dxa"/>
+            </w:tcMar>
+          </w:tcPr>
+          <w:p>
+            <w:r>
+              <w:rPr>
+                <w:rFonts w:ascii="Aptos" w:eastAsia="Aptos" w:hAnsi="Aptos" w:cs="Aptos"/>
+                <w:sz w:val="20"/>
+                <w:szCs w:val="20"/>
+              </w:rPr>
+              <w:t xml:space="preserve">Nothing is cancelled and a message appears stating “Only a manager can give money back.”.</w:t>
+            </w:r>
+          </w:p>
+        </w:tc>
+      </w:tr>
+      <w:tr>
+        <w:trPr>
+          <w:cantSplit/>
+        </w:trPr>
+        <w:tc>
+          <w:tcPr>
+            <w:tcW w:w="300" w:type="pct"/>
+            <w:tcMar>
+              <w:top w:w="30" w:type="dxa"/>
+              <w:left w:w="80" w:type="dxa"/>
+              <w:bottom w:w="30" w:type="dxa"/>
+              <w:right w:w="80" w:type="dxa"/>
+            </w:tcMar>
+          </w:tcPr>
+          <w:p>
+            <w:r>
+              <w:rPr>
+                <w:rFonts w:ascii="Aptos" w:eastAsia="Aptos" w:hAnsi="Aptos" w:cs="Aptos"/>
+                <w:sz w:val="20"/>
+                <w:szCs w:val="20"/>
+              </w:rPr>
+              <w:t xml:space="preserve">85</w:t>
+            </w:r>
+          </w:p>
+        </w:tc>
+        <w:tc>
+          <w:tcPr>
+            <w:tcW w:w="1850" w:type="pct"/>
+            <w:tcMar>
+              <w:top w:w="30" w:type="dxa"/>
+              <w:left w:w="80" w:type="dxa"/>
+              <w:bottom w:w="30" w:type="dxa"/>
+              <w:right w:w="80" w:type="dxa"/>
+            </w:tcMar>
+          </w:tcPr>
+          <w:p>
+            <w:r>
+              <w:rPr>
+                <w:rFonts w:ascii="Aptos" w:eastAsia="Aptos" w:hAnsi="Aptos" w:cs="Aptos"/>
+                <w:sz w:val="20"/>
+                <w:szCs w:val="20"/>
+              </w:rPr>
+              <w:t xml:space="preserve">Log in as a manager, search for Smith, select David Smith's booking, press Refund the whole booking and choose No on the confirmation</w:t>
+            </w:r>
+          </w:p>
+        </w:tc>
+        <w:tc>
+          <w:tcPr>
+            <w:tcW w:w="560" w:type="pct"/>
+            <w:tcMar>
+              <w:top w:w="30" w:type="dxa"/>
+              <w:left w:w="80" w:type="dxa"/>
+              <w:bottom w:w="30" w:type="dxa"/>
+              <w:right w:w="80" w:type="dxa"/>
+            </w:tcMar>
+          </w:tcPr>
+          <w:p>
+            <w:r>
+              <w:rPr>
+                <w:rFonts w:ascii="Aptos" w:eastAsia="Aptos" w:hAnsi="Aptos" w:cs="Aptos"/>
+                <w:sz w:val="20"/>
+                <w:szCs w:val="20"/>
+              </w:rPr>
+              <w:t xml:space="preserve">Normal</w:t>
+            </w:r>
+          </w:p>
+        </w:tc>
+        <w:tc>
+          <w:tcPr>
+            <w:tcW w:w="2290" w:type="pct"/>
+            <w:tcMar>
+              <w:top w:w="30" w:type="dxa"/>
+              <w:left w:w="80" w:type="dxa"/>
+              <w:bottom w:w="30" w:type="dxa"/>
+              <w:right w:w="80" w:type="dxa"/>
+            </w:tcMar>
+          </w:tcPr>
+          <w:p>
+            <w:r>
+              <w:rPr>
+                <w:rFonts w:ascii="Aptos" w:eastAsia="Aptos" w:hAnsi="Aptos" w:cs="Aptos"/>
+                <w:sz w:val="20"/>
+                <w:szCs w:val="20"/>
+              </w:rPr>
+              <w:t xml:space="preserve">Nothing is cancelled and the booking is still listed, because the confirmation defaults to the safe answer and choosing No must leave the data alone.</w:t>
+            </w:r>
+          </w:p>
+        </w:tc>
+      </w:tr>
+      <w:tr>
+        <w:trPr>
+          <w:cantSplit/>
+        </w:trPr>
+        <w:tc>
+          <w:tcPr>
+            <w:tcW w:w="300" w:type="pct"/>
+            <w:tcMar>
+              <w:top w:w="30" w:type="dxa"/>
+              <w:left w:w="80" w:type="dxa"/>
+              <w:bottom w:w="30" w:type="dxa"/>
+              <w:right w:w="80" w:type="dxa"/>
+            </w:tcMar>
+          </w:tcPr>
+          <w:p>
+            <w:r>
+              <w:rPr>
+                <w:rFonts w:ascii="Aptos" w:eastAsia="Aptos" w:hAnsi="Aptos" w:cs="Aptos"/>
+                <w:sz w:val="20"/>
+                <w:szCs w:val="20"/>
+              </w:rPr>
+              <w:t xml:space="preserve">86</w:t>
+            </w:r>
+          </w:p>
+        </w:tc>
+        <w:tc>
+          <w:tcPr>
+            <w:tcW w:w="1850" w:type="pct"/>
+            <w:tcMar>
+              <w:top w:w="30" w:type="dxa"/>
+              <w:left w:w="80" w:type="dxa"/>
+              <w:bottom w:w="30" w:type="dxa"/>
+              <w:right w:w="80" w:type="dxa"/>
+            </w:tcMar>
+          </w:tcPr>
+          <w:p>
+            <w:r>
+              <w:rPr>
+                <w:rFonts w:ascii="Aptos" w:eastAsia="Aptos" w:hAnsi="Aptos" w:cs="Aptos"/>
+                <w:sz w:val="20"/>
+                <w:szCs w:val="20"/>
+              </w:rPr>
+              <w:t xml:space="preserve">Repeat the previous test but choose Yes on the confirmation</w:t>
+            </w:r>
+          </w:p>
+        </w:tc>
+        <w:tc>
+          <w:tcPr>
+            <w:tcW w:w="560" w:type="pct"/>
+            <w:tcMar>
+              <w:top w:w="30" w:type="dxa"/>
+              <w:left w:w="80" w:type="dxa"/>
+              <w:bottom w:w="30" w:type="dxa"/>
+              <w:right w:w="80" w:type="dxa"/>
+            </w:tcMar>
+          </w:tcPr>
+          <w:p>
+            <w:r>
+              <w:rPr>
+                <w:rFonts w:ascii="Aptos" w:eastAsia="Aptos" w:hAnsi="Aptos" w:cs="Aptos"/>
+                <w:sz w:val="20"/>
+                <w:szCs w:val="20"/>
+              </w:rPr>
+              <w:t xml:space="preserve">Normal</w:t>
+            </w:r>
+          </w:p>
+        </w:tc>
+        <w:tc>
+          <w:tcPr>
+            <w:tcW w:w="2290" w:type="pct"/>
+            <w:tcMar>
+              <w:top w:w="30" w:type="dxa"/>
+              <w:left w:w="80" w:type="dxa"/>
+              <w:bottom w:w="30" w:type="dxa"/>
+              <w:right w:w="80" w:type="dxa"/>
+            </w:tcMar>
+          </w:tcPr>
+          <w:p>
+            <w:r>
+              <w:rPr>
+                <w:rFonts w:ascii="Aptos" w:eastAsia="Aptos" w:hAnsi="Aptos" w:cs="Aptos"/>
+                <w:sz w:val="20"/>
+                <w:szCs w:val="20"/>
+              </w:rPr>
+              <w:t xml:space="preserve">The booking is refunded in full, a message confirms it, and £13.50 is recorded against it in tblRefund.</w:t>
+            </w:r>
+          </w:p>
+        </w:tc>
+      </w:tr>
+      <w:tr>
+        <w:trPr>
+          <w:cantSplit/>
+        </w:trPr>
+        <w:tc>
+          <w:tcPr>
+            <w:tcW w:w="300" w:type="pct"/>
+            <w:tcMar>
+              <w:top w:w="30" w:type="dxa"/>
+              <w:left w:w="80" w:type="dxa"/>
+              <w:bottom w:w="30" w:type="dxa"/>
+              <w:right w:w="80" w:type="dxa"/>
+            </w:tcMar>
+          </w:tcPr>
+          <w:p>
+            <w:r>
+              <w:rPr>
+                <w:rFonts w:ascii="Aptos" w:eastAsia="Aptos" w:hAnsi="Aptos" w:cs="Aptos"/>
+                <w:sz w:val="20"/>
+                <w:szCs w:val="20"/>
+              </w:rPr>
+              <w:t xml:space="preserve">87</w:t>
+            </w:r>
+          </w:p>
+        </w:tc>
+        <w:tc>
+          <w:tcPr>
+            <w:tcW w:w="1850" w:type="pct"/>
+            <w:tcMar>
+              <w:top w:w="30" w:type="dxa"/>
+              <w:left w:w="80" w:type="dxa"/>
+              <w:bottom w:w="30" w:type="dxa"/>
+              <w:right w:w="80" w:type="dxa"/>
+            </w:tcMar>
+          </w:tcPr>
+          <w:p>
+            <w:r>
+              <w:rPr>
+                <w:rFonts w:ascii="Aptos" w:eastAsia="Aptos" w:hAnsi="Aptos" w:cs="Aptos"/>
+                <w:sz w:val="20"/>
+                <w:szCs w:val="20"/>
+              </w:rPr>
+              <w:t xml:space="preserve">Look at David Smith's booking in tblBooking and its row in tblBookingSeat</w:t>
+            </w:r>
+          </w:p>
+        </w:tc>
+        <w:tc>
+          <w:tcPr>
+            <w:tcW w:w="560" w:type="pct"/>
+            <w:tcMar>
+              <w:top w:w="30" w:type="dxa"/>
+              <w:left w:w="80" w:type="dxa"/>
+              <w:bottom w:w="30" w:type="dxa"/>
+              <w:right w:w="80" w:type="dxa"/>
+            </w:tcMar>
+          </w:tcPr>
+          <w:p>
+            <w:r>
+              <w:rPr>
+                <w:rFonts w:ascii="Aptos" w:eastAsia="Aptos" w:hAnsi="Aptos" w:cs="Aptos"/>
+                <w:sz w:val="20"/>
+                <w:szCs w:val="20"/>
+              </w:rPr>
+              <w:t xml:space="preserve">Normal</w:t>
+            </w:r>
+          </w:p>
+        </w:tc>
+        <w:tc>
+          <w:tcPr>
+            <w:tcW w:w="2290" w:type="pct"/>
+            <w:tcMar>
+              <w:top w:w="30" w:type="dxa"/>
+              <w:left w:w="80" w:type="dxa"/>
+              <w:bottom w:w="30" w:type="dxa"/>
+              <w:right w:w="80" w:type="dxa"/>
+            </w:tcMar>
+          </w:tcPr>
+          <w:p>
+            <w:r>
+              <w:rPr>
+                <w:rFonts w:ascii="Aptos" w:eastAsia="Aptos" w:hAnsi="Aptos" w:cs="Aptos"/>
+                <w:sz w:val="20"/>
+                <w:szCs w:val="20"/>
+              </w:rPr>
+              <w:t xml:space="preserve">The booking is still present with a BookingStatus of Cancelled rather than having been deleted, but its row in tblBookingSeat has gone, so the sale stays on record while seat D1 is released.</w:t>
+            </w:r>
+          </w:p>
+        </w:tc>
+      </w:tr>
+      <w:tr>
+        <w:trPr>
+          <w:cantSplit/>
+        </w:trPr>
+        <w:tc>
+          <w:tcPr>
+            <w:tcW w:w="300" w:type="pct"/>
+            <w:tcMar>
+              <w:top w:w="30" w:type="dxa"/>
+              <w:left w:w="80" w:type="dxa"/>
+              <w:bottom w:w="30" w:type="dxa"/>
+              <w:right w:w="80" w:type="dxa"/>
+            </w:tcMar>
+          </w:tcPr>
+          <w:p>
+            <w:r>
+              <w:rPr>
+                <w:rFonts w:ascii="Aptos" w:eastAsia="Aptos" w:hAnsi="Aptos" w:cs="Aptos"/>
+                <w:sz w:val="20"/>
+                <w:szCs w:val="20"/>
+              </w:rPr>
+              <w:t xml:space="preserve">88</w:t>
+            </w:r>
+          </w:p>
+        </w:tc>
+        <w:tc>
+          <w:tcPr>
+            <w:tcW w:w="1850" w:type="pct"/>
+            <w:tcMar>
+              <w:top w:w="30" w:type="dxa"/>
+              <w:left w:w="80" w:type="dxa"/>
+              <w:bottom w:w="30" w:type="dxa"/>
+              <w:right w:w="80" w:type="dxa"/>
+            </w:tcMar>
+          </w:tcPr>
+          <w:p>
+            <w:r>
+              <w:rPr>
+                <w:rFonts w:ascii="Aptos" w:eastAsia="Aptos" w:hAnsi="Aptos" w:cs="Aptos"/>
+                <w:sz w:val="20"/>
+                <w:szCs w:val="20"/>
+              </w:rPr>
+              <w:t xml:space="preserve">Open the Bookings form and look at seat D1 on the Inception screening</w:t>
+            </w:r>
+          </w:p>
+        </w:tc>
+        <w:tc>
+          <w:tcPr>
+            <w:tcW w:w="560" w:type="pct"/>
+            <w:tcMar>
+              <w:top w:w="30" w:type="dxa"/>
+              <w:left w:w="80" w:type="dxa"/>
+              <w:bottom w:w="30" w:type="dxa"/>
+              <w:right w:w="80" w:type="dxa"/>
+            </w:tcMar>
+          </w:tcPr>
+          <w:p>
+            <w:r>
+              <w:rPr>
+                <w:rFonts w:ascii="Aptos" w:eastAsia="Aptos" w:hAnsi="Aptos" w:cs="Aptos"/>
+                <w:sz w:val="20"/>
+                <w:szCs w:val="20"/>
+              </w:rPr>
+              <w:t xml:space="preserve">Normal</w:t>
+            </w:r>
+          </w:p>
+        </w:tc>
+        <w:tc>
+          <w:tcPr>
+            <w:tcW w:w="2290" w:type="pct"/>
+            <w:tcMar>
+              <w:top w:w="30" w:type="dxa"/>
+              <w:left w:w="80" w:type="dxa"/>
+              <w:bottom w:w="30" w:type="dxa"/>
+              <w:right w:w="80" w:type="dxa"/>
+            </w:tcMar>
+          </w:tcPr>
+          <w:p>
+            <w:r>
+              <w:rPr>
+                <w:rFonts w:ascii="Aptos" w:eastAsia="Aptos" w:hAnsi="Aptos" w:cs="Aptos"/>
+                <w:sz w:val="20"/>
+                <w:szCs w:val="20"/>
+              </w:rPr>
+              <w:t xml:space="preserve">Seat D1 is available again and can be selected, because cancelling released it.</w:t>
+            </w:r>
+          </w:p>
+        </w:tc>
+      </w:tr>
+      <w:tr>
+        <w:trPr>
+          <w:cantSplit/>
+        </w:trPr>
+        <w:tc>
+          <w:tcPr>
+            <w:tcW w:w="300" w:type="pct"/>
+            <w:tcMar>
+              <w:top w:w="30" w:type="dxa"/>
+              <w:left w:w="80" w:type="dxa"/>
+              <w:bottom w:w="30" w:type="dxa"/>
+              <w:right w:w="80" w:type="dxa"/>
+            </w:tcMar>
+          </w:tcPr>
+          <w:p>
+            <w:r>
+              <w:rPr>
+                <w:rFonts w:ascii="Aptos" w:eastAsia="Aptos" w:hAnsi="Aptos" w:cs="Aptos"/>
+                <w:sz w:val="20"/>
+                <w:szCs w:val="20"/>
+              </w:rPr>
+              <w:t xml:space="preserve">89</w:t>
+            </w:r>
+          </w:p>
+        </w:tc>
+        <w:tc>
+          <w:tcPr>
+            <w:tcW w:w="1850" w:type="pct"/>
+            <w:tcMar>
+              <w:top w:w="30" w:type="dxa"/>
+              <w:left w:w="80" w:type="dxa"/>
+              <w:bottom w:w="30" w:type="dxa"/>
+              <w:right w:w="80" w:type="dxa"/>
+            </w:tcMar>
+          </w:tcPr>
+          <w:p>
+            <w:r>
+              <w:rPr>
+                <w:rFonts w:ascii="Aptos" w:eastAsia="Aptos" w:hAnsi="Aptos" w:cs="Aptos"/>
+                <w:sz w:val="20"/>
+                <w:szCs w:val="20"/>
+              </w:rPr>
+              <w:t xml:space="preserve">Search for Smith again</w:t>
+            </w:r>
+          </w:p>
+        </w:tc>
+        <w:tc>
+          <w:tcPr>
+            <w:tcW w:w="560" w:type="pct"/>
+            <w:tcMar>
+              <w:top w:w="30" w:type="dxa"/>
+              <w:left w:w="80" w:type="dxa"/>
+              <w:bottom w:w="30" w:type="dxa"/>
+              <w:right w:w="80" w:type="dxa"/>
+            </w:tcMar>
+          </w:tcPr>
+          <w:p>
+            <w:r>
+              <w:rPr>
+                <w:rFonts w:ascii="Aptos" w:eastAsia="Aptos" w:hAnsi="Aptos" w:cs="Aptos"/>
+                <w:sz w:val="20"/>
+                <w:szCs w:val="20"/>
+              </w:rPr>
+              <w:t xml:space="preserve">Normal</w:t>
+            </w:r>
+          </w:p>
+        </w:tc>
+        <w:tc>
+          <w:tcPr>
+            <w:tcW w:w="2290" w:type="pct"/>
+            <w:tcMar>
+              <w:top w:w="30" w:type="dxa"/>
+              <w:left w:w="80" w:type="dxa"/>
+              <w:bottom w:w="30" w:type="dxa"/>
+              <w:right w:w="80" w:type="dxa"/>
+            </w:tcMar>
+          </w:tcPr>
+          <w:p>
+            <w:r>
+              <w:rPr>
+                <w:rFonts w:ascii="Aptos" w:eastAsia="Aptos" w:hAnsi="Aptos" w:cs="Aptos"/>
+                <w:sz w:val="20"/>
+                <w:szCs w:val="20"/>
+              </w:rPr>
+              <w:t xml:space="preserve">The grid still shows David Smith's booking but marked as cancelled, because the record is kept rather than removed.</w:t>
+            </w:r>
+          </w:p>
+        </w:tc>
+      </w:tr>
+      <w:tr>
+        <w:trPr>
+          <w:cantSplit/>
+        </w:trPr>
+        <w:tc>
+          <w:tcPr>
+            <w:tcW w:w="300" w:type="pct"/>
+            <w:tcMar>
+              <w:top w:w="30" w:type="dxa"/>
+              <w:left w:w="80" w:type="dxa"/>
+              <w:bottom w:w="30" w:type="dxa"/>
+              <w:right w:w="80" w:type="dxa"/>
+            </w:tcMar>
+          </w:tcPr>
+          <w:p>
+            <w:r>
+              <w:rPr>
+                <w:rFonts w:ascii="Aptos" w:eastAsia="Aptos" w:hAnsi="Aptos" w:cs="Aptos"/>
+                <w:sz w:val="20"/>
+                <w:szCs w:val="20"/>
+              </w:rPr>
+              <w:t xml:space="preserve">90</w:t>
+            </w:r>
+          </w:p>
+        </w:tc>
+        <w:tc>
+          <w:tcPr>
+            <w:tcW w:w="1850" w:type="pct"/>
+            <w:tcMar>
+              <w:top w:w="30" w:type="dxa"/>
+              <w:left w:w="80" w:type="dxa"/>
+              <w:bottom w:w="30" w:type="dxa"/>
+              <w:right w:w="80" w:type="dxa"/>
+            </w:tcMar>
+          </w:tcPr>
+          <w:p>
+            <w:r>
+              <w:rPr>
+                <w:rFonts w:ascii="Aptos" w:eastAsia="Aptos" w:hAnsi="Aptos" w:cs="Aptos"/>
+                <w:sz w:val="20"/>
+                <w:szCs w:val="20"/>
+              </w:rPr>
+              <w:t xml:space="preserve">Re-run the sales report for 01/07/2026 to 31/07/2026</w:t>
+            </w:r>
+          </w:p>
+        </w:tc>
+        <w:tc>
+          <w:tcPr>
+            <w:tcW w:w="560" w:type="pct"/>
+            <w:tcMar>
+              <w:top w:w="30" w:type="dxa"/>
+              <w:left w:w="80" w:type="dxa"/>
+              <w:bottom w:w="30" w:type="dxa"/>
+              <w:right w:w="80" w:type="dxa"/>
+            </w:tcMar>
+          </w:tcPr>
+          <w:p>
+            <w:r>
+              <w:rPr>
+                <w:rFonts w:ascii="Aptos" w:eastAsia="Aptos" w:hAnsi="Aptos" w:cs="Aptos"/>
+                <w:sz w:val="20"/>
+                <w:szCs w:val="20"/>
+              </w:rPr>
+              <w:t xml:space="preserve">Normal</w:t>
+            </w:r>
+          </w:p>
+        </w:tc>
+        <w:tc>
+          <w:tcPr>
+            <w:tcW w:w="2290" w:type="pct"/>
+            <w:tcMar>
+              <w:top w:w="30" w:type="dxa"/>
+              <w:left w:w="80" w:type="dxa"/>
+              <w:bottom w:w="30" w:type="dxa"/>
+              <w:right w:w="80" w:type="dxa"/>
+            </w:tcMar>
+          </w:tcPr>
+          <w:p>
+            <w:r>
+              <w:rPr>
+                <w:rFonts w:ascii="Aptos" w:eastAsia="Aptos" w:hAnsi="Aptos" w:cs="Aptos"/>
+                <w:sz w:val="20"/>
+                <w:szCs w:val="20"/>
+              </w:rPr>
+              <w:t xml:space="preserve">The Inception ticket takings have dropped from £38.70 to £25.20 and the grand total is now £44.20, because David Smith's £13.50 booking no longer counts towards the takings.</w:t>
             </w:r>
           </w:p>
         </w:tc>

</xml_diff>

<commit_message>
added objective 10: enforcing access levels
</commit_message>
<xml_diff>
--- a/Testing.docx
+++ b/Testing.docx
@@ -9897,6 +9897,874 @@
                 <w:szCs w:val="20"/>
               </w:rPr>
               <w:t xml:space="preserve">The Inception ticket takings have dropped from £38.70 to £25.20 and the grand total is now £44.20, because David Smith's £13.50 booking no longer counts towards the takings.</w:t>
+            </w:r>
+          </w:p>
+        </w:tc>
+      </w:tr>
+    </w:tbl>
+    <w:p>
+      <w:r>
+        <w:rPr>
+          <w:rFonts w:ascii="Aptos" w:eastAsia="Aptos" w:hAnsi="Aptos" w:cs="Aptos"/>
+        </w:rPr>
+        <w:t xml:space="preserve"/>
+      </w:r>
+    </w:p>
+    <w:p>
+      <w:pPr>
+        <w:pStyle w:val="Heading3"/>
+      </w:pPr>
+      <w:r>
+        <w:rPr>
+          <w:rFonts w:ascii="Aptos Display" w:eastAsia="Aptos Display" w:hAnsi="Aptos Display" w:cs="Aptos Display"/>
+          <w:b/>
+          <w:bCs/>
+          <w:color w:val="000000"/>
+        </w:rPr>
+        <w:t xml:space="preserve">Objective 10: Enforcing Access Levels</w:t>
+      </w:r>
+    </w:p>
+    <w:p>
+      <w:r>
+        <w:rPr>
+          <w:rFonts w:ascii="Aptos" w:eastAsia="Aptos" w:hAnsi="Aptos" w:cs="Aptos"/>
+        </w:rPr>
+        <w:t xml:space="preserve">These tests check that the login controls access and that what a user can reach depends on the access level of their account. The manager account has an access level of 1 and the member of staff account an access level of 2.</w:t>
+      </w:r>
+    </w:p>
+    <w:tbl>
+      <w:tblPr>
+        <w:tblW w:w="5000" w:type="pct"/>
+        <w:tblBorders>
+          <w:top w:val="single" w:sz="4" w:space="0" w:color="808080"/>
+          <w:left w:val="single" w:sz="4" w:space="0" w:color="808080"/>
+          <w:bottom w:val="single" w:sz="4" w:space="0" w:color="808080"/>
+          <w:right w:val="single" w:sz="4" w:space="0" w:color="808080"/>
+          <w:insideH w:val="single" w:sz="4" w:space="0" w:color="808080"/>
+          <w:insideV w:val="single" w:sz="4" w:space="0" w:color="808080"/>
+        </w:tblBorders>
+        <w:tblCellMar>
+          <w:left w:w="10" w:type="dxa"/>
+          <w:right w:w="10" w:type="dxa"/>
+        </w:tblCellMar>
+        <w:tblLook w:val="0000" w:firstRow="0" w:lastRow="0" w:firstColumn="0" w:lastColumn="0" w:noHBand="0" w:noVBand="0"/>
+      </w:tblPr>
+      <w:tblGrid>
+        <w:gridCol w:w="561"/>
+        <w:gridCol w:w="3460"/>
+        <w:gridCol w:w="1047"/>
+        <w:gridCol w:w="4282"/>
+      </w:tblGrid>
+      <w:tr>
+        <w:trPr>
+          <w:cantSplit/>
+          <w:tblHeader/>
+        </w:trPr>
+        <w:tc>
+          <w:tcPr>
+            <w:tcW w:w="300" w:type="pct"/>
+            <w:shd w:val="clear" w:color="auto" w:fill="F2CEED" w:themeFill="accent5" w:themeFillTint="33"/>
+            <w:tcMar>
+              <w:top w:w="30" w:type="dxa"/>
+              <w:left w:w="80" w:type="dxa"/>
+              <w:bottom w:w="30" w:type="dxa"/>
+              <w:right w:w="80" w:type="dxa"/>
+            </w:tcMar>
+          </w:tcPr>
+          <w:p>
+            <w:r>
+              <w:rPr>
+                <w:rFonts w:ascii="Aptos" w:eastAsia="Aptos" w:hAnsi="Aptos" w:cs="Aptos"/>
+                <w:b/>
+                <w:bCs/>
+                <w:sz w:val="20"/>
+                <w:szCs w:val="20"/>
+              </w:rPr>
+              <w:t xml:space="preserve">No.</w:t>
+            </w:r>
+          </w:p>
+        </w:tc>
+        <w:tc>
+          <w:tcPr>
+            <w:tcW w:w="1850" w:type="pct"/>
+            <w:shd w:val="clear" w:color="auto" w:fill="F2CEED" w:themeFill="accent5" w:themeFillTint="33"/>
+            <w:tcMar>
+              <w:top w:w="30" w:type="dxa"/>
+              <w:left w:w="80" w:type="dxa"/>
+              <w:bottom w:w="30" w:type="dxa"/>
+              <w:right w:w="80" w:type="dxa"/>
+            </w:tcMar>
+          </w:tcPr>
+          <w:p>
+            <w:r>
+              <w:rPr>
+                <w:rFonts w:ascii="Aptos" w:eastAsia="Aptos" w:hAnsi="Aptos" w:cs="Aptos"/>
+                <w:b/>
+                <w:bCs/>
+                <w:sz w:val="20"/>
+                <w:szCs w:val="20"/>
+              </w:rPr>
+              <w:t xml:space="preserve">Test</w:t>
+            </w:r>
+          </w:p>
+        </w:tc>
+        <w:tc>
+          <w:tcPr>
+            <w:tcW w:w="560" w:type="pct"/>
+            <w:shd w:val="clear" w:color="auto" w:fill="F2CEED" w:themeFill="accent5" w:themeFillTint="33"/>
+            <w:tcMar>
+              <w:top w:w="30" w:type="dxa"/>
+              <w:left w:w="80" w:type="dxa"/>
+              <w:bottom w:w="30" w:type="dxa"/>
+              <w:right w:w="80" w:type="dxa"/>
+            </w:tcMar>
+          </w:tcPr>
+          <w:p>
+            <w:r>
+              <w:rPr>
+                <w:rFonts w:ascii="Aptos" w:eastAsia="Aptos" w:hAnsi="Aptos" w:cs="Aptos"/>
+                <w:b/>
+                <w:bCs/>
+                <w:sz w:val="20"/>
+                <w:szCs w:val="20"/>
+              </w:rPr>
+              <w:t xml:space="preserve">Type</w:t>
+            </w:r>
+          </w:p>
+        </w:tc>
+        <w:tc>
+          <w:tcPr>
+            <w:tcW w:w="2290" w:type="pct"/>
+            <w:shd w:val="clear" w:color="auto" w:fill="F2CEED" w:themeFill="accent5" w:themeFillTint="33"/>
+            <w:tcMar>
+              <w:top w:w="30" w:type="dxa"/>
+              <w:left w:w="80" w:type="dxa"/>
+              <w:bottom w:w="30" w:type="dxa"/>
+              <w:right w:w="80" w:type="dxa"/>
+            </w:tcMar>
+          </w:tcPr>
+          <w:p>
+            <w:r>
+              <w:rPr>
+                <w:rFonts w:ascii="Aptos" w:eastAsia="Aptos" w:hAnsi="Aptos" w:cs="Aptos"/>
+                <w:b/>
+                <w:bCs/>
+                <w:sz w:val="20"/>
+                <w:szCs w:val="20"/>
+              </w:rPr>
+              <w:t xml:space="preserve">Expected Result</w:t>
+            </w:r>
+          </w:p>
+        </w:tc>
+      </w:tr>
+      <w:tr>
+        <w:trPr>
+          <w:cantSplit/>
+        </w:trPr>
+        <w:tc>
+          <w:tcPr>
+            <w:tcW w:w="300" w:type="pct"/>
+            <w:tcMar>
+              <w:top w:w="30" w:type="dxa"/>
+              <w:left w:w="80" w:type="dxa"/>
+              <w:bottom w:w="30" w:type="dxa"/>
+              <w:right w:w="80" w:type="dxa"/>
+            </w:tcMar>
+          </w:tcPr>
+          <w:p>
+            <w:r>
+              <w:rPr>
+                <w:rFonts w:ascii="Aptos" w:eastAsia="Aptos" w:hAnsi="Aptos" w:cs="Aptos"/>
+                <w:sz w:val="20"/>
+                <w:szCs w:val="20"/>
+              </w:rPr>
+              <w:t xml:space="preserve">91</w:t>
+            </w:r>
+          </w:p>
+        </w:tc>
+        <w:tc>
+          <w:tcPr>
+            <w:tcW w:w="1850" w:type="pct"/>
+            <w:tcMar>
+              <w:top w:w="30" w:type="dxa"/>
+              <w:left w:w="80" w:type="dxa"/>
+              <w:bottom w:w="30" w:type="dxa"/>
+              <w:right w:w="80" w:type="dxa"/>
+            </w:tcMar>
+          </w:tcPr>
+          <w:p>
+            <w:r>
+              <w:rPr>
+                <w:rFonts w:ascii="Aptos" w:eastAsia="Aptos" w:hAnsi="Aptos" w:cs="Aptos"/>
+                <w:sz w:val="20"/>
+                <w:szCs w:val="20"/>
+              </w:rPr>
+              <w:t xml:space="preserve">At the login screen, leave the username and password blank and press Login</w:t>
+            </w:r>
+          </w:p>
+        </w:tc>
+        <w:tc>
+          <w:tcPr>
+            <w:tcW w:w="560" w:type="pct"/>
+            <w:tcMar>
+              <w:top w:w="30" w:type="dxa"/>
+              <w:left w:w="80" w:type="dxa"/>
+              <w:bottom w:w="30" w:type="dxa"/>
+              <w:right w:w="80" w:type="dxa"/>
+            </w:tcMar>
+          </w:tcPr>
+          <w:p>
+            <w:r>
+              <w:rPr>
+                <w:rFonts w:ascii="Aptos" w:eastAsia="Aptos" w:hAnsi="Aptos" w:cs="Aptos"/>
+                <w:sz w:val="20"/>
+                <w:szCs w:val="20"/>
+              </w:rPr>
+              <w:t xml:space="preserve">Erroneous</w:t>
+            </w:r>
+          </w:p>
+        </w:tc>
+        <w:tc>
+          <w:tcPr>
+            <w:tcW w:w="2290" w:type="pct"/>
+            <w:tcMar>
+              <w:top w:w="30" w:type="dxa"/>
+              <w:left w:w="80" w:type="dxa"/>
+              <w:bottom w:w="30" w:type="dxa"/>
+              <w:right w:w="80" w:type="dxa"/>
+            </w:tcMar>
+          </w:tcPr>
+          <w:p>
+            <w:r>
+              <w:rPr>
+                <w:rFonts w:ascii="Aptos" w:eastAsia="Aptos" w:hAnsi="Aptos" w:cs="Aptos"/>
+                <w:sz w:val="20"/>
+                <w:szCs w:val="20"/>
+              </w:rPr>
+              <w:t xml:space="preserve">Login is refused and a message appears stating “Please enter a username and password.”.</w:t>
+            </w:r>
+          </w:p>
+        </w:tc>
+      </w:tr>
+      <w:tr>
+        <w:trPr>
+          <w:cantSplit/>
+        </w:trPr>
+        <w:tc>
+          <w:tcPr>
+            <w:tcW w:w="300" w:type="pct"/>
+            <w:tcMar>
+              <w:top w:w="30" w:type="dxa"/>
+              <w:left w:w="80" w:type="dxa"/>
+              <w:bottom w:w="30" w:type="dxa"/>
+              <w:right w:w="80" w:type="dxa"/>
+            </w:tcMar>
+          </w:tcPr>
+          <w:p>
+            <w:r>
+              <w:rPr>
+                <w:rFonts w:ascii="Aptos" w:eastAsia="Aptos" w:hAnsi="Aptos" w:cs="Aptos"/>
+                <w:sz w:val="20"/>
+                <w:szCs w:val="20"/>
+              </w:rPr>
+              <w:t xml:space="preserve">92</w:t>
+            </w:r>
+          </w:p>
+        </w:tc>
+        <w:tc>
+          <w:tcPr>
+            <w:tcW w:w="1850" w:type="pct"/>
+            <w:tcMar>
+              <w:top w:w="30" w:type="dxa"/>
+              <w:left w:w="80" w:type="dxa"/>
+              <w:bottom w:w="30" w:type="dxa"/>
+              <w:right w:w="80" w:type="dxa"/>
+            </w:tcMar>
+          </w:tcPr>
+          <w:p>
+            <w:r>
+              <w:rPr>
+                <w:rFonts w:ascii="Aptos" w:eastAsia="Aptos" w:hAnsi="Aptos" w:cs="Aptos"/>
+                <w:sz w:val="20"/>
+                <w:szCs w:val="20"/>
+              </w:rPr>
+              <w:t xml:space="preserve">Log in with a valid manager account and the correct password</w:t>
+            </w:r>
+          </w:p>
+        </w:tc>
+        <w:tc>
+          <w:tcPr>
+            <w:tcW w:w="560" w:type="pct"/>
+            <w:tcMar>
+              <w:top w:w="30" w:type="dxa"/>
+              <w:left w:w="80" w:type="dxa"/>
+              <w:bottom w:w="30" w:type="dxa"/>
+              <w:right w:w="80" w:type="dxa"/>
+            </w:tcMar>
+          </w:tcPr>
+          <w:p>
+            <w:r>
+              <w:rPr>
+                <w:rFonts w:ascii="Aptos" w:eastAsia="Aptos" w:hAnsi="Aptos" w:cs="Aptos"/>
+                <w:sz w:val="20"/>
+                <w:szCs w:val="20"/>
+              </w:rPr>
+              <w:t xml:space="preserve">Normal</w:t>
+            </w:r>
+          </w:p>
+        </w:tc>
+        <w:tc>
+          <w:tcPr>
+            <w:tcW w:w="2290" w:type="pct"/>
+            <w:tcMar>
+              <w:top w:w="30" w:type="dxa"/>
+              <w:left w:w="80" w:type="dxa"/>
+              <w:bottom w:w="30" w:type="dxa"/>
+              <w:right w:w="80" w:type="dxa"/>
+            </w:tcMar>
+          </w:tcPr>
+          <w:p>
+            <w:r>
+              <w:rPr>
+                <w:rFonts w:ascii="Aptos" w:eastAsia="Aptos" w:hAnsi="Aptos" w:cs="Aptos"/>
+                <w:sz w:val="20"/>
+                <w:szCs w:val="20"/>
+              </w:rPr>
+              <w:t xml:space="preserve">Login succeeds and the main menu appears with all options available, including the manager only options such as the sales report, the screens screen and the audit log.</w:t>
+            </w:r>
+          </w:p>
+        </w:tc>
+      </w:tr>
+      <w:tr>
+        <w:trPr>
+          <w:cantSplit/>
+        </w:trPr>
+        <w:tc>
+          <w:tcPr>
+            <w:tcW w:w="300" w:type="pct"/>
+            <w:tcMar>
+              <w:top w:w="30" w:type="dxa"/>
+              <w:left w:w="80" w:type="dxa"/>
+              <w:bottom w:w="30" w:type="dxa"/>
+              <w:right w:w="80" w:type="dxa"/>
+            </w:tcMar>
+          </w:tcPr>
+          <w:p>
+            <w:r>
+              <w:rPr>
+                <w:rFonts w:ascii="Aptos" w:eastAsia="Aptos" w:hAnsi="Aptos" w:cs="Aptos"/>
+                <w:sz w:val="20"/>
+                <w:szCs w:val="20"/>
+              </w:rPr>
+              <w:t xml:space="preserve">93</w:t>
+            </w:r>
+          </w:p>
+        </w:tc>
+        <w:tc>
+          <w:tcPr>
+            <w:tcW w:w="1850" w:type="pct"/>
+            <w:tcMar>
+              <w:top w:w="30" w:type="dxa"/>
+              <w:left w:w="80" w:type="dxa"/>
+              <w:bottom w:w="30" w:type="dxa"/>
+              <w:right w:w="80" w:type="dxa"/>
+            </w:tcMar>
+          </w:tcPr>
+          <w:p>
+            <w:r>
+              <w:rPr>
+                <w:rFonts w:ascii="Aptos" w:eastAsia="Aptos" w:hAnsi="Aptos" w:cs="Aptos"/>
+                <w:sz w:val="20"/>
+                <w:szCs w:val="20"/>
+              </w:rPr>
+              <w:t xml:space="preserve">Log in with a valid member of staff account and the correct password</w:t>
+            </w:r>
+          </w:p>
+        </w:tc>
+        <w:tc>
+          <w:tcPr>
+            <w:tcW w:w="560" w:type="pct"/>
+            <w:tcMar>
+              <w:top w:w="30" w:type="dxa"/>
+              <w:left w:w="80" w:type="dxa"/>
+              <w:bottom w:w="30" w:type="dxa"/>
+              <w:right w:w="80" w:type="dxa"/>
+            </w:tcMar>
+          </w:tcPr>
+          <w:p>
+            <w:r>
+              <w:rPr>
+                <w:rFonts w:ascii="Aptos" w:eastAsia="Aptos" w:hAnsi="Aptos" w:cs="Aptos"/>
+                <w:sz w:val="20"/>
+                <w:szCs w:val="20"/>
+              </w:rPr>
+              <w:t xml:space="preserve">Normal</w:t>
+            </w:r>
+          </w:p>
+        </w:tc>
+        <w:tc>
+          <w:tcPr>
+            <w:tcW w:w="2290" w:type="pct"/>
+            <w:tcMar>
+              <w:top w:w="30" w:type="dxa"/>
+              <w:left w:w="80" w:type="dxa"/>
+              <w:bottom w:w="30" w:type="dxa"/>
+              <w:right w:w="80" w:type="dxa"/>
+            </w:tcMar>
+          </w:tcPr>
+          <w:p>
+            <w:r>
+              <w:rPr>
+                <w:rFonts w:ascii="Aptos" w:eastAsia="Aptos" w:hAnsi="Aptos" w:cs="Aptos"/>
+                <w:sz w:val="20"/>
+                <w:szCs w:val="20"/>
+              </w:rPr>
+              <w:t xml:space="preserve">Login succeeds and the main menu appears with the counter options available but the manager only options not available.</w:t>
+            </w:r>
+          </w:p>
+        </w:tc>
+      </w:tr>
+      <w:tr>
+        <w:trPr>
+          <w:cantSplit/>
+        </w:trPr>
+        <w:tc>
+          <w:tcPr>
+            <w:tcW w:w="300" w:type="pct"/>
+            <w:tcMar>
+              <w:top w:w="30" w:type="dxa"/>
+              <w:left w:w="80" w:type="dxa"/>
+              <w:bottom w:w="30" w:type="dxa"/>
+              <w:right w:w="80" w:type="dxa"/>
+            </w:tcMar>
+          </w:tcPr>
+          <w:p>
+            <w:r>
+              <w:rPr>
+                <w:rFonts w:ascii="Aptos" w:eastAsia="Aptos" w:hAnsi="Aptos" w:cs="Aptos"/>
+                <w:sz w:val="20"/>
+                <w:szCs w:val="20"/>
+              </w:rPr>
+              <w:t xml:space="preserve">94</w:t>
+            </w:r>
+          </w:p>
+        </w:tc>
+        <w:tc>
+          <w:tcPr>
+            <w:tcW w:w="1850" w:type="pct"/>
+            <w:tcMar>
+              <w:top w:w="30" w:type="dxa"/>
+              <w:left w:w="80" w:type="dxa"/>
+              <w:bottom w:w="30" w:type="dxa"/>
+              <w:right w:w="80" w:type="dxa"/>
+            </w:tcMar>
+          </w:tcPr>
+          <w:p>
+            <w:r>
+              <w:rPr>
+                <w:rFonts w:ascii="Aptos" w:eastAsia="Aptos" w:hAnsi="Aptos" w:cs="Aptos"/>
+                <w:sz w:val="20"/>
+                <w:szCs w:val="20"/>
+              </w:rPr>
+              <w:t xml:space="preserve">While logged in as a member of staff, try to open the sales report</w:t>
+            </w:r>
+          </w:p>
+        </w:tc>
+        <w:tc>
+          <w:tcPr>
+            <w:tcW w:w="560" w:type="pct"/>
+            <w:tcMar>
+              <w:top w:w="30" w:type="dxa"/>
+              <w:left w:w="80" w:type="dxa"/>
+              <w:bottom w:w="30" w:type="dxa"/>
+              <w:right w:w="80" w:type="dxa"/>
+            </w:tcMar>
+          </w:tcPr>
+          <w:p>
+            <w:r>
+              <w:rPr>
+                <w:rFonts w:ascii="Aptos" w:eastAsia="Aptos" w:hAnsi="Aptos" w:cs="Aptos"/>
+                <w:sz w:val="20"/>
+                <w:szCs w:val="20"/>
+              </w:rPr>
+              <w:t xml:space="preserve">Erroneous</w:t>
+            </w:r>
+          </w:p>
+        </w:tc>
+        <w:tc>
+          <w:tcPr>
+            <w:tcW w:w="2290" w:type="pct"/>
+            <w:tcMar>
+              <w:top w:w="30" w:type="dxa"/>
+              <w:left w:w="80" w:type="dxa"/>
+              <w:bottom w:w="30" w:type="dxa"/>
+              <w:right w:w="80" w:type="dxa"/>
+            </w:tcMar>
+          </w:tcPr>
+          <w:p>
+            <w:r>
+              <w:rPr>
+                <w:rFonts w:ascii="Aptos" w:eastAsia="Aptos" w:hAnsi="Aptos" w:cs="Aptos"/>
+                <w:sz w:val="20"/>
+                <w:szCs w:val="20"/>
+              </w:rPr>
+              <w:t xml:space="preserve">The report does not open and a message appears stating “Only a manager can see the sales report.”.</w:t>
+            </w:r>
+          </w:p>
+        </w:tc>
+      </w:tr>
+      <w:tr>
+        <w:trPr>
+          <w:cantSplit/>
+        </w:trPr>
+        <w:tc>
+          <w:tcPr>
+            <w:tcW w:w="300" w:type="pct"/>
+            <w:tcMar>
+              <w:top w:w="30" w:type="dxa"/>
+              <w:left w:w="80" w:type="dxa"/>
+              <w:bottom w:w="30" w:type="dxa"/>
+              <w:right w:w="80" w:type="dxa"/>
+            </w:tcMar>
+          </w:tcPr>
+          <w:p>
+            <w:r>
+              <w:rPr>
+                <w:rFonts w:ascii="Aptos" w:eastAsia="Aptos" w:hAnsi="Aptos" w:cs="Aptos"/>
+                <w:sz w:val="20"/>
+                <w:szCs w:val="20"/>
+              </w:rPr>
+              <w:t xml:space="preserve">95</w:t>
+            </w:r>
+          </w:p>
+        </w:tc>
+        <w:tc>
+          <w:tcPr>
+            <w:tcW w:w="1850" w:type="pct"/>
+            <w:tcMar>
+              <w:top w:w="30" w:type="dxa"/>
+              <w:left w:w="80" w:type="dxa"/>
+              <w:bottom w:w="30" w:type="dxa"/>
+              <w:right w:w="80" w:type="dxa"/>
+            </w:tcMar>
+          </w:tcPr>
+          <w:p>
+            <w:r>
+              <w:rPr>
+                <w:rFonts w:ascii="Aptos" w:eastAsia="Aptos" w:hAnsi="Aptos" w:cs="Aptos"/>
+                <w:sz w:val="20"/>
+                <w:szCs w:val="20"/>
+              </w:rPr>
+              <w:t xml:space="preserve">While logged in as a member of staff, try to open the audit log</w:t>
+            </w:r>
+          </w:p>
+        </w:tc>
+        <w:tc>
+          <w:tcPr>
+            <w:tcW w:w="560" w:type="pct"/>
+            <w:tcMar>
+              <w:top w:w="30" w:type="dxa"/>
+              <w:left w:w="80" w:type="dxa"/>
+              <w:bottom w:w="30" w:type="dxa"/>
+              <w:right w:w="80" w:type="dxa"/>
+            </w:tcMar>
+          </w:tcPr>
+          <w:p>
+            <w:r>
+              <w:rPr>
+                <w:rFonts w:ascii="Aptos" w:eastAsia="Aptos" w:hAnsi="Aptos" w:cs="Aptos"/>
+                <w:sz w:val="20"/>
+                <w:szCs w:val="20"/>
+              </w:rPr>
+              <w:t xml:space="preserve">Erroneous</w:t>
+            </w:r>
+          </w:p>
+        </w:tc>
+        <w:tc>
+          <w:tcPr>
+            <w:tcW w:w="2290" w:type="pct"/>
+            <w:tcMar>
+              <w:top w:w="30" w:type="dxa"/>
+              <w:left w:w="80" w:type="dxa"/>
+              <w:bottom w:w="30" w:type="dxa"/>
+              <w:right w:w="80" w:type="dxa"/>
+            </w:tcMar>
+          </w:tcPr>
+          <w:p>
+            <w:r>
+              <w:rPr>
+                <w:rFonts w:ascii="Aptos" w:eastAsia="Aptos" w:hAnsi="Aptos" w:cs="Aptos"/>
+                <w:sz w:val="20"/>
+                <w:szCs w:val="20"/>
+              </w:rPr>
+              <w:t xml:space="preserve">The log does not open and a message appears stating “Only a manager can see the audit log.”.</w:t>
+            </w:r>
+          </w:p>
+        </w:tc>
+      </w:tr>
+      <w:tr>
+        <w:trPr>
+          <w:cantSplit/>
+        </w:trPr>
+        <w:tc>
+          <w:tcPr>
+            <w:tcW w:w="300" w:type="pct"/>
+            <w:tcMar>
+              <w:top w:w="30" w:type="dxa"/>
+              <w:left w:w="80" w:type="dxa"/>
+              <w:bottom w:w="30" w:type="dxa"/>
+              <w:right w:w="80" w:type="dxa"/>
+            </w:tcMar>
+          </w:tcPr>
+          <w:p>
+            <w:r>
+              <w:rPr>
+                <w:rFonts w:ascii="Aptos" w:eastAsia="Aptos" w:hAnsi="Aptos" w:cs="Aptos"/>
+                <w:sz w:val="20"/>
+                <w:szCs w:val="20"/>
+              </w:rPr>
+              <w:t xml:space="preserve">96</w:t>
+            </w:r>
+          </w:p>
+        </w:tc>
+        <w:tc>
+          <w:tcPr>
+            <w:tcW w:w="1850" w:type="pct"/>
+            <w:tcMar>
+              <w:top w:w="30" w:type="dxa"/>
+              <w:left w:w="80" w:type="dxa"/>
+              <w:bottom w:w="30" w:type="dxa"/>
+              <w:right w:w="80" w:type="dxa"/>
+            </w:tcMar>
+          </w:tcPr>
+          <w:p>
+            <w:r>
+              <w:rPr>
+                <w:rFonts w:ascii="Aptos" w:eastAsia="Aptos" w:hAnsi="Aptos" w:cs="Aptos"/>
+                <w:sz w:val="20"/>
+                <w:szCs w:val="20"/>
+              </w:rPr>
+              <w:t xml:space="preserve">Log in with a valid username but the wrong password twice in a row</w:t>
+            </w:r>
+          </w:p>
+        </w:tc>
+        <w:tc>
+          <w:tcPr>
+            <w:tcW w:w="560" w:type="pct"/>
+            <w:tcMar>
+              <w:top w:w="30" w:type="dxa"/>
+              <w:left w:w="80" w:type="dxa"/>
+              <w:bottom w:w="30" w:type="dxa"/>
+              <w:right w:w="80" w:type="dxa"/>
+            </w:tcMar>
+          </w:tcPr>
+          <w:p>
+            <w:r>
+              <w:rPr>
+                <w:rFonts w:ascii="Aptos" w:eastAsia="Aptos" w:hAnsi="Aptos" w:cs="Aptos"/>
+                <w:sz w:val="20"/>
+                <w:szCs w:val="20"/>
+              </w:rPr>
+              <w:t xml:space="preserve">Boundary</w:t>
+            </w:r>
+          </w:p>
+        </w:tc>
+        <w:tc>
+          <w:tcPr>
+            <w:tcW w:w="2290" w:type="pct"/>
+            <w:tcMar>
+              <w:top w:w="30" w:type="dxa"/>
+              <w:left w:w="80" w:type="dxa"/>
+              <w:bottom w:w="30" w:type="dxa"/>
+              <w:right w:w="80" w:type="dxa"/>
+            </w:tcMar>
+          </w:tcPr>
+          <w:p>
+            <w:r>
+              <w:rPr>
+                <w:rFonts w:ascii="Aptos" w:eastAsia="Aptos" w:hAnsi="Aptos" w:cs="Aptos"/>
+                <w:sz w:val="20"/>
+                <w:szCs w:val="20"/>
+              </w:rPr>
+              <w:t xml:space="preserve">Login is refused each time and the message names which attempt it was, but the program stays open, because the limit is three attempts and two is still inside it.</w:t>
+            </w:r>
+          </w:p>
+        </w:tc>
+      </w:tr>
+      <w:tr>
+        <w:trPr>
+          <w:cantSplit/>
+        </w:trPr>
+        <w:tc>
+          <w:tcPr>
+            <w:tcW w:w="300" w:type="pct"/>
+            <w:tcMar>
+              <w:top w:w="30" w:type="dxa"/>
+              <w:left w:w="80" w:type="dxa"/>
+              <w:bottom w:w="30" w:type="dxa"/>
+              <w:right w:w="80" w:type="dxa"/>
+            </w:tcMar>
+          </w:tcPr>
+          <w:p>
+            <w:r>
+              <w:rPr>
+                <w:rFonts w:ascii="Aptos" w:eastAsia="Aptos" w:hAnsi="Aptos" w:cs="Aptos"/>
+                <w:sz w:val="20"/>
+                <w:szCs w:val="20"/>
+              </w:rPr>
+              <w:t xml:space="preserve">97</w:t>
+            </w:r>
+          </w:p>
+        </w:tc>
+        <w:tc>
+          <w:tcPr>
+            <w:tcW w:w="1850" w:type="pct"/>
+            <w:tcMar>
+              <w:top w:w="30" w:type="dxa"/>
+              <w:left w:w="80" w:type="dxa"/>
+              <w:bottom w:w="30" w:type="dxa"/>
+              <w:right w:w="80" w:type="dxa"/>
+            </w:tcMar>
+          </w:tcPr>
+          <w:p>
+            <w:r>
+              <w:rPr>
+                <w:rFonts w:ascii="Aptos" w:eastAsia="Aptos" w:hAnsi="Aptos" w:cs="Aptos"/>
+                <w:sz w:val="20"/>
+                <w:szCs w:val="20"/>
+              </w:rPr>
+              <w:t xml:space="preserve">Log in with a valid username but the wrong password three times in a row</w:t>
+            </w:r>
+          </w:p>
+        </w:tc>
+        <w:tc>
+          <w:tcPr>
+            <w:tcW w:w="560" w:type="pct"/>
+            <w:tcMar>
+              <w:top w:w="30" w:type="dxa"/>
+              <w:left w:w="80" w:type="dxa"/>
+              <w:bottom w:w="30" w:type="dxa"/>
+              <w:right w:w="80" w:type="dxa"/>
+            </w:tcMar>
+          </w:tcPr>
+          <w:p>
+            <w:r>
+              <w:rPr>
+                <w:rFonts w:ascii="Aptos" w:eastAsia="Aptos" w:hAnsi="Aptos" w:cs="Aptos"/>
+                <w:sz w:val="20"/>
+                <w:szCs w:val="20"/>
+              </w:rPr>
+              <w:t xml:space="preserve">Boundary</w:t>
+            </w:r>
+          </w:p>
+        </w:tc>
+        <w:tc>
+          <w:tcPr>
+            <w:tcW w:w="2290" w:type="pct"/>
+            <w:tcMar>
+              <w:top w:w="30" w:type="dxa"/>
+              <w:left w:w="80" w:type="dxa"/>
+              <w:bottom w:w="30" w:type="dxa"/>
+              <w:right w:w="80" w:type="dxa"/>
+            </w:tcMar>
+          </w:tcPr>
+          <w:p>
+            <w:r>
+              <w:rPr>
+                <w:rFonts w:ascii="Aptos" w:eastAsia="Aptos" w:hAnsi="Aptos" w:cs="Aptos"/>
+                <w:sz w:val="20"/>
+                <w:szCs w:val="20"/>
+              </w:rPr>
+              <w:t xml:space="preserve">After the third failed attempt a message “Too many failed attempts. The application will now close.” appears and the program closes.</w:t>
+            </w:r>
+          </w:p>
+        </w:tc>
+      </w:tr>
+      <w:tr>
+        <w:trPr>
+          <w:cantSplit/>
+        </w:trPr>
+        <w:tc>
+          <w:tcPr>
+            <w:tcW w:w="300" w:type="pct"/>
+            <w:tcMar>
+              <w:top w:w="30" w:type="dxa"/>
+              <w:left w:w="80" w:type="dxa"/>
+              <w:bottom w:w="30" w:type="dxa"/>
+              <w:right w:w="80" w:type="dxa"/>
+            </w:tcMar>
+          </w:tcPr>
+          <w:p>
+            <w:r>
+              <w:rPr>
+                <w:rFonts w:ascii="Aptos" w:eastAsia="Aptos" w:hAnsi="Aptos" w:cs="Aptos"/>
+                <w:sz w:val="20"/>
+                <w:szCs w:val="20"/>
+              </w:rPr>
+              <w:t xml:space="preserve">98</w:t>
+            </w:r>
+          </w:p>
+        </w:tc>
+        <w:tc>
+          <w:tcPr>
+            <w:tcW w:w="1850" w:type="pct"/>
+            <w:tcMar>
+              <w:top w:w="30" w:type="dxa"/>
+              <w:left w:w="80" w:type="dxa"/>
+              <w:bottom w:w="30" w:type="dxa"/>
+              <w:right w:w="80" w:type="dxa"/>
+            </w:tcMar>
+          </w:tcPr>
+          <w:p>
+            <w:r>
+              <w:rPr>
+                <w:rFonts w:ascii="Aptos" w:eastAsia="Aptos" w:hAnsi="Aptos" w:cs="Aptos"/>
+                <w:sz w:val="20"/>
+                <w:szCs w:val="20"/>
+              </w:rPr>
+              <w:t xml:space="preserve">Log in with a username that does not exist, such as ghost</w:t>
+            </w:r>
+          </w:p>
+        </w:tc>
+        <w:tc>
+          <w:tcPr>
+            <w:tcW w:w="560" w:type="pct"/>
+            <w:tcMar>
+              <w:top w:w="30" w:type="dxa"/>
+              <w:left w:w="80" w:type="dxa"/>
+              <w:bottom w:w="30" w:type="dxa"/>
+              <w:right w:w="80" w:type="dxa"/>
+            </w:tcMar>
+          </w:tcPr>
+          <w:p>
+            <w:r>
+              <w:rPr>
+                <w:rFonts w:ascii="Aptos" w:eastAsia="Aptos" w:hAnsi="Aptos" w:cs="Aptos"/>
+                <w:sz w:val="20"/>
+                <w:szCs w:val="20"/>
+              </w:rPr>
+              <w:t xml:space="preserve">Erroneous</w:t>
+            </w:r>
+          </w:p>
+        </w:tc>
+        <w:tc>
+          <w:tcPr>
+            <w:tcW w:w="2290" w:type="pct"/>
+            <w:tcMar>
+              <w:top w:w="30" w:type="dxa"/>
+              <w:left w:w="80" w:type="dxa"/>
+              <w:bottom w:w="30" w:type="dxa"/>
+              <w:right w:w="80" w:type="dxa"/>
+            </w:tcMar>
+          </w:tcPr>
+          <w:p>
+            <w:r>
+              <w:rPr>
+                <w:rFonts w:ascii="Aptos" w:eastAsia="Aptos" w:hAnsi="Aptos" w:cs="Aptos"/>
+                <w:sz w:val="20"/>
+                <w:szCs w:val="20"/>
+              </w:rPr>
+              <w:t xml:space="preserve">Login is refused and a message appears stating that the account ghost was not found.</w:t>
             </w:r>
           </w:p>
         </w:tc>

</xml_diff>

<commit_message>
added objective 13: validating data
</commit_message>
<xml_diff>
--- a/Testing.docx
+++ b/Testing.docx
@@ -10765,6 +10765,874 @@
                 <w:szCs w:val="20"/>
               </w:rPr>
               <w:t xml:space="preserve">Login is refused and a message appears stating that the account ghost was not found.</w:t>
+            </w:r>
+          </w:p>
+        </w:tc>
+      </w:tr>
+    </w:tbl>
+    <w:p>
+      <w:r>
+        <w:rPr>
+          <w:rFonts w:ascii="Aptos" w:eastAsia="Aptos" w:hAnsi="Aptos" w:cs="Aptos"/>
+        </w:rPr>
+        <w:t xml:space="preserve"/>
+      </w:r>
+    </w:p>
+    <w:p>
+      <w:pPr>
+        <w:pStyle w:val="Heading3"/>
+      </w:pPr>
+      <w:r>
+        <w:rPr>
+          <w:rFonts w:ascii="Aptos Display" w:eastAsia="Aptos Display" w:hAnsi="Aptos Display" w:cs="Aptos Display"/>
+          <w:b/>
+          <w:bCs/>
+          <w:color w:val="000000"/>
+        </w:rPr>
+        <w:t xml:space="preserve">Objective 13: Validating Data</w:t>
+      </w:r>
+    </w:p>
+    <w:p>
+      <w:r>
+        <w:rPr>
+          <w:rFonts w:ascii="Aptos" w:eastAsia="Aptos" w:hAnsi="Aptos" w:cs="Aptos"/>
+        </w:rPr>
+        <w:t xml:space="preserve">Validation is exercised across a great many of the tests above, but these tests focus on it directly, so that the different kinds of check can be seen in one place. Between them they cover a presence check, a format check, a length check, a character check, a range check and a lookup against data already in the database.</w:t>
+      </w:r>
+    </w:p>
+    <w:tbl>
+      <w:tblPr>
+        <w:tblW w:w="5000" w:type="pct"/>
+        <w:tblBorders>
+          <w:top w:val="single" w:sz="4" w:space="0" w:color="808080"/>
+          <w:left w:val="single" w:sz="4" w:space="0" w:color="808080"/>
+          <w:bottom w:val="single" w:sz="4" w:space="0" w:color="808080"/>
+          <w:right w:val="single" w:sz="4" w:space="0" w:color="808080"/>
+          <w:insideH w:val="single" w:sz="4" w:space="0" w:color="808080"/>
+          <w:insideV w:val="single" w:sz="4" w:space="0" w:color="808080"/>
+        </w:tblBorders>
+        <w:tblCellMar>
+          <w:left w:w="10" w:type="dxa"/>
+          <w:right w:w="10" w:type="dxa"/>
+        </w:tblCellMar>
+        <w:tblLook w:val="0000" w:firstRow="0" w:lastRow="0" w:firstColumn="0" w:lastColumn="0" w:noHBand="0" w:noVBand="0"/>
+      </w:tblPr>
+      <w:tblGrid>
+        <w:gridCol w:w="561"/>
+        <w:gridCol w:w="3460"/>
+        <w:gridCol w:w="1047"/>
+        <w:gridCol w:w="4282"/>
+      </w:tblGrid>
+      <w:tr>
+        <w:trPr>
+          <w:cantSplit/>
+          <w:tblHeader/>
+        </w:trPr>
+        <w:tc>
+          <w:tcPr>
+            <w:tcW w:w="300" w:type="pct"/>
+            <w:shd w:val="clear" w:color="auto" w:fill="F2CEED" w:themeFill="accent5" w:themeFillTint="33"/>
+            <w:tcMar>
+              <w:top w:w="30" w:type="dxa"/>
+              <w:left w:w="80" w:type="dxa"/>
+              <w:bottom w:w="30" w:type="dxa"/>
+              <w:right w:w="80" w:type="dxa"/>
+            </w:tcMar>
+          </w:tcPr>
+          <w:p>
+            <w:r>
+              <w:rPr>
+                <w:rFonts w:ascii="Aptos" w:eastAsia="Aptos" w:hAnsi="Aptos" w:cs="Aptos"/>
+                <w:b/>
+                <w:bCs/>
+                <w:sz w:val="20"/>
+                <w:szCs w:val="20"/>
+              </w:rPr>
+              <w:t xml:space="preserve">No.</w:t>
+            </w:r>
+          </w:p>
+        </w:tc>
+        <w:tc>
+          <w:tcPr>
+            <w:tcW w:w="1850" w:type="pct"/>
+            <w:shd w:val="clear" w:color="auto" w:fill="F2CEED" w:themeFill="accent5" w:themeFillTint="33"/>
+            <w:tcMar>
+              <w:top w:w="30" w:type="dxa"/>
+              <w:left w:w="80" w:type="dxa"/>
+              <w:bottom w:w="30" w:type="dxa"/>
+              <w:right w:w="80" w:type="dxa"/>
+            </w:tcMar>
+          </w:tcPr>
+          <w:p>
+            <w:r>
+              <w:rPr>
+                <w:rFonts w:ascii="Aptos" w:eastAsia="Aptos" w:hAnsi="Aptos" w:cs="Aptos"/>
+                <w:b/>
+                <w:bCs/>
+                <w:sz w:val="20"/>
+                <w:szCs w:val="20"/>
+              </w:rPr>
+              <w:t xml:space="preserve">Test</w:t>
+            </w:r>
+          </w:p>
+        </w:tc>
+        <w:tc>
+          <w:tcPr>
+            <w:tcW w:w="560" w:type="pct"/>
+            <w:shd w:val="clear" w:color="auto" w:fill="F2CEED" w:themeFill="accent5" w:themeFillTint="33"/>
+            <w:tcMar>
+              <w:top w:w="30" w:type="dxa"/>
+              <w:left w:w="80" w:type="dxa"/>
+              <w:bottom w:w="30" w:type="dxa"/>
+              <w:right w:w="80" w:type="dxa"/>
+            </w:tcMar>
+          </w:tcPr>
+          <w:p>
+            <w:r>
+              <w:rPr>
+                <w:rFonts w:ascii="Aptos" w:eastAsia="Aptos" w:hAnsi="Aptos" w:cs="Aptos"/>
+                <w:b/>
+                <w:bCs/>
+                <w:sz w:val="20"/>
+                <w:szCs w:val="20"/>
+              </w:rPr>
+              <w:t xml:space="preserve">Type</w:t>
+            </w:r>
+          </w:p>
+        </w:tc>
+        <w:tc>
+          <w:tcPr>
+            <w:tcW w:w="2290" w:type="pct"/>
+            <w:shd w:val="clear" w:color="auto" w:fill="F2CEED" w:themeFill="accent5" w:themeFillTint="33"/>
+            <w:tcMar>
+              <w:top w:w="30" w:type="dxa"/>
+              <w:left w:w="80" w:type="dxa"/>
+              <w:bottom w:w="30" w:type="dxa"/>
+              <w:right w:w="80" w:type="dxa"/>
+            </w:tcMar>
+          </w:tcPr>
+          <w:p>
+            <w:r>
+              <w:rPr>
+                <w:rFonts w:ascii="Aptos" w:eastAsia="Aptos" w:hAnsi="Aptos" w:cs="Aptos"/>
+                <w:b/>
+                <w:bCs/>
+                <w:sz w:val="20"/>
+                <w:szCs w:val="20"/>
+              </w:rPr>
+              <w:t xml:space="preserve">Expected Result</w:t>
+            </w:r>
+          </w:p>
+        </w:tc>
+      </w:tr>
+      <w:tr>
+        <w:trPr>
+          <w:cantSplit/>
+        </w:trPr>
+        <w:tc>
+          <w:tcPr>
+            <w:tcW w:w="300" w:type="pct"/>
+            <w:tcMar>
+              <w:top w:w="30" w:type="dxa"/>
+              <w:left w:w="80" w:type="dxa"/>
+              <w:bottom w:w="30" w:type="dxa"/>
+              <w:right w:w="80" w:type="dxa"/>
+            </w:tcMar>
+          </w:tcPr>
+          <w:p>
+            <w:r>
+              <w:rPr>
+                <w:rFonts w:ascii="Aptos" w:eastAsia="Aptos" w:hAnsi="Aptos" w:cs="Aptos"/>
+                <w:sz w:val="20"/>
+                <w:szCs w:val="20"/>
+              </w:rPr>
+              <w:t xml:space="preserve">99</w:t>
+            </w:r>
+          </w:p>
+        </w:tc>
+        <w:tc>
+          <w:tcPr>
+            <w:tcW w:w="1850" w:type="pct"/>
+            <w:tcMar>
+              <w:top w:w="30" w:type="dxa"/>
+              <w:left w:w="80" w:type="dxa"/>
+              <w:bottom w:w="30" w:type="dxa"/>
+              <w:right w:w="80" w:type="dxa"/>
+            </w:tcMar>
+          </w:tcPr>
+          <w:p>
+            <w:r>
+              <w:rPr>
+                <w:rFonts w:ascii="Aptos" w:eastAsia="Aptos" w:hAnsi="Aptos" w:cs="Aptos"/>
+                <w:sz w:val="20"/>
+                <w:szCs w:val="20"/>
+              </w:rPr>
+              <w:t xml:space="preserve">On the Customers form, enter forename John, surname Smith, an email of johnsmith with no at sign or full stop, and a valid phone number, then press Add</w:t>
+            </w:r>
+          </w:p>
+        </w:tc>
+        <w:tc>
+          <w:tcPr>
+            <w:tcW w:w="560" w:type="pct"/>
+            <w:tcMar>
+              <w:top w:w="30" w:type="dxa"/>
+              <w:left w:w="80" w:type="dxa"/>
+              <w:bottom w:w="30" w:type="dxa"/>
+              <w:right w:w="80" w:type="dxa"/>
+            </w:tcMar>
+          </w:tcPr>
+          <w:p>
+            <w:r>
+              <w:rPr>
+                <w:rFonts w:ascii="Aptos" w:eastAsia="Aptos" w:hAnsi="Aptos" w:cs="Aptos"/>
+                <w:sz w:val="20"/>
+                <w:szCs w:val="20"/>
+              </w:rPr>
+              <w:t xml:space="preserve">Erroneous</w:t>
+            </w:r>
+          </w:p>
+        </w:tc>
+        <w:tc>
+          <w:tcPr>
+            <w:tcW w:w="2290" w:type="pct"/>
+            <w:tcMar>
+              <w:top w:w="30" w:type="dxa"/>
+              <w:left w:w="80" w:type="dxa"/>
+              <w:bottom w:w="30" w:type="dxa"/>
+              <w:right w:w="80" w:type="dxa"/>
+            </w:tcMar>
+          </w:tcPr>
+          <w:p>
+            <w:r>
+              <w:rPr>
+                <w:rFonts w:ascii="Aptos" w:eastAsia="Aptos" w:hAnsi="Aptos" w:cs="Aptos"/>
+                <w:sz w:val="20"/>
+                <w:szCs w:val="20"/>
+              </w:rPr>
+              <w:t xml:space="preserve">The customer is rejected and a message appears stating “Enter a valid email address, like name@example.com”. This is a format check.</w:t>
+            </w:r>
+          </w:p>
+        </w:tc>
+      </w:tr>
+      <w:tr>
+        <w:trPr>
+          <w:cantSplit/>
+        </w:trPr>
+        <w:tc>
+          <w:tcPr>
+            <w:tcW w:w="300" w:type="pct"/>
+            <w:tcMar>
+              <w:top w:w="30" w:type="dxa"/>
+              <w:left w:w="80" w:type="dxa"/>
+              <w:bottom w:w="30" w:type="dxa"/>
+              <w:right w:w="80" w:type="dxa"/>
+            </w:tcMar>
+          </w:tcPr>
+          <w:p>
+            <w:r>
+              <w:rPr>
+                <w:rFonts w:ascii="Aptos" w:eastAsia="Aptos" w:hAnsi="Aptos" w:cs="Aptos"/>
+                <w:sz w:val="20"/>
+                <w:szCs w:val="20"/>
+              </w:rPr>
+              <w:t xml:space="preserve">100</w:t>
+            </w:r>
+          </w:p>
+        </w:tc>
+        <w:tc>
+          <w:tcPr>
+            <w:tcW w:w="1850" w:type="pct"/>
+            <w:tcMar>
+              <w:top w:w="30" w:type="dxa"/>
+              <w:left w:w="80" w:type="dxa"/>
+              <w:bottom w:w="30" w:type="dxa"/>
+              <w:right w:w="80" w:type="dxa"/>
+            </w:tcMar>
+          </w:tcPr>
+          <w:p>
+            <w:r>
+              <w:rPr>
+                <w:rFonts w:ascii="Aptos" w:eastAsia="Aptos" w:hAnsi="Aptos" w:cs="Aptos"/>
+                <w:sz w:val="20"/>
+                <w:szCs w:val="20"/>
+              </w:rPr>
+              <w:t xml:space="preserve">On the Customers form, enter valid names and email but a phone number of 0712345, which is 7 digits, then press Add</w:t>
+            </w:r>
+          </w:p>
+        </w:tc>
+        <w:tc>
+          <w:tcPr>
+            <w:tcW w:w="560" w:type="pct"/>
+            <w:tcMar>
+              <w:top w:w="30" w:type="dxa"/>
+              <w:left w:w="80" w:type="dxa"/>
+              <w:bottom w:w="30" w:type="dxa"/>
+              <w:right w:w="80" w:type="dxa"/>
+            </w:tcMar>
+          </w:tcPr>
+          <w:p>
+            <w:r>
+              <w:rPr>
+                <w:rFonts w:ascii="Aptos" w:eastAsia="Aptos" w:hAnsi="Aptos" w:cs="Aptos"/>
+                <w:sz w:val="20"/>
+                <w:szCs w:val="20"/>
+              </w:rPr>
+              <w:t xml:space="preserve">Erroneous</w:t>
+            </w:r>
+          </w:p>
+        </w:tc>
+        <w:tc>
+          <w:tcPr>
+            <w:tcW w:w="2290" w:type="pct"/>
+            <w:tcMar>
+              <w:top w:w="30" w:type="dxa"/>
+              <w:left w:w="80" w:type="dxa"/>
+              <w:bottom w:w="30" w:type="dxa"/>
+              <w:right w:w="80" w:type="dxa"/>
+            </w:tcMar>
+          </w:tcPr>
+          <w:p>
+            <w:r>
+              <w:rPr>
+                <w:rFonts w:ascii="Aptos" w:eastAsia="Aptos" w:hAnsi="Aptos" w:cs="Aptos"/>
+                <w:sz w:val="20"/>
+                <w:szCs w:val="20"/>
+              </w:rPr>
+              <w:t xml:space="preserve">The customer is rejected and a message appears stating “Phone number must be 10 or 11 digits long”. This is a length check.</w:t>
+            </w:r>
+          </w:p>
+        </w:tc>
+      </w:tr>
+      <w:tr>
+        <w:trPr>
+          <w:cantSplit/>
+        </w:trPr>
+        <w:tc>
+          <w:tcPr>
+            <w:tcW w:w="300" w:type="pct"/>
+            <w:tcMar>
+              <w:top w:w="30" w:type="dxa"/>
+              <w:left w:w="80" w:type="dxa"/>
+              <w:bottom w:w="30" w:type="dxa"/>
+              <w:right w:w="80" w:type="dxa"/>
+            </w:tcMar>
+          </w:tcPr>
+          <w:p>
+            <w:r>
+              <w:rPr>
+                <w:rFonts w:ascii="Aptos" w:eastAsia="Aptos" w:hAnsi="Aptos" w:cs="Aptos"/>
+                <w:sz w:val="20"/>
+                <w:szCs w:val="20"/>
+              </w:rPr>
+              <w:t xml:space="preserve">101</w:t>
+            </w:r>
+          </w:p>
+        </w:tc>
+        <w:tc>
+          <w:tcPr>
+            <w:tcW w:w="1850" w:type="pct"/>
+            <w:tcMar>
+              <w:top w:w="30" w:type="dxa"/>
+              <w:left w:w="80" w:type="dxa"/>
+              <w:bottom w:w="30" w:type="dxa"/>
+              <w:right w:w="80" w:type="dxa"/>
+            </w:tcMar>
+          </w:tcPr>
+          <w:p>
+            <w:r>
+              <w:rPr>
+                <w:rFonts w:ascii="Aptos" w:eastAsia="Aptos" w:hAnsi="Aptos" w:cs="Aptos"/>
+                <w:sz w:val="20"/>
+                <w:szCs w:val="20"/>
+              </w:rPr>
+              <w:t xml:space="preserve">On the Customers form, enter a phone number of 07abc456789, then press Add</w:t>
+            </w:r>
+          </w:p>
+        </w:tc>
+        <w:tc>
+          <w:tcPr>
+            <w:tcW w:w="560" w:type="pct"/>
+            <w:tcMar>
+              <w:top w:w="30" w:type="dxa"/>
+              <w:left w:w="80" w:type="dxa"/>
+              <w:bottom w:w="30" w:type="dxa"/>
+              <w:right w:w="80" w:type="dxa"/>
+            </w:tcMar>
+          </w:tcPr>
+          <w:p>
+            <w:r>
+              <w:rPr>
+                <w:rFonts w:ascii="Aptos" w:eastAsia="Aptos" w:hAnsi="Aptos" w:cs="Aptos"/>
+                <w:sz w:val="20"/>
+                <w:szCs w:val="20"/>
+              </w:rPr>
+              <w:t xml:space="preserve">Erroneous</w:t>
+            </w:r>
+          </w:p>
+        </w:tc>
+        <w:tc>
+          <w:tcPr>
+            <w:tcW w:w="2290" w:type="pct"/>
+            <w:tcMar>
+              <w:top w:w="30" w:type="dxa"/>
+              <w:left w:w="80" w:type="dxa"/>
+              <w:bottom w:w="30" w:type="dxa"/>
+              <w:right w:w="80" w:type="dxa"/>
+            </w:tcMar>
+          </w:tcPr>
+          <w:p>
+            <w:r>
+              <w:rPr>
+                <w:rFonts w:ascii="Aptos" w:eastAsia="Aptos" w:hAnsi="Aptos" w:cs="Aptos"/>
+                <w:sz w:val="20"/>
+                <w:szCs w:val="20"/>
+              </w:rPr>
+              <w:t xml:space="preserve">The customer is rejected and a message appears stating “Phone number must contain digits only”. This is a character check.</w:t>
+            </w:r>
+          </w:p>
+        </w:tc>
+      </w:tr>
+      <w:tr>
+        <w:trPr>
+          <w:cantSplit/>
+        </w:trPr>
+        <w:tc>
+          <w:tcPr>
+            <w:tcW w:w="300" w:type="pct"/>
+            <w:tcMar>
+              <w:top w:w="30" w:type="dxa"/>
+              <w:left w:w="80" w:type="dxa"/>
+              <w:bottom w:w="30" w:type="dxa"/>
+              <w:right w:w="80" w:type="dxa"/>
+            </w:tcMar>
+          </w:tcPr>
+          <w:p>
+            <w:r>
+              <w:rPr>
+                <w:rFonts w:ascii="Aptos" w:eastAsia="Aptos" w:hAnsi="Aptos" w:cs="Aptos"/>
+                <w:sz w:val="20"/>
+                <w:szCs w:val="20"/>
+              </w:rPr>
+              <w:t xml:space="preserve">102</w:t>
+            </w:r>
+          </w:p>
+        </w:tc>
+        <w:tc>
+          <w:tcPr>
+            <w:tcW w:w="1850" w:type="pct"/>
+            <w:tcMar>
+              <w:top w:w="30" w:type="dxa"/>
+              <w:left w:w="80" w:type="dxa"/>
+              <w:bottom w:w="30" w:type="dxa"/>
+              <w:right w:w="80" w:type="dxa"/>
+            </w:tcMar>
+          </w:tcPr>
+          <w:p>
+            <w:r>
+              <w:rPr>
+                <w:rFonts w:ascii="Aptos" w:eastAsia="Aptos" w:hAnsi="Aptos" w:cs="Aptos"/>
+                <w:sz w:val="20"/>
+                <w:szCs w:val="20"/>
+              </w:rPr>
+              <w:t xml:space="preserve">On the Customers form, enter a phone number of exactly 10 digits, then press Add</w:t>
+            </w:r>
+          </w:p>
+        </w:tc>
+        <w:tc>
+          <w:tcPr>
+            <w:tcW w:w="560" w:type="pct"/>
+            <w:tcMar>
+              <w:top w:w="30" w:type="dxa"/>
+              <w:left w:w="80" w:type="dxa"/>
+              <w:bottom w:w="30" w:type="dxa"/>
+              <w:right w:w="80" w:type="dxa"/>
+            </w:tcMar>
+          </w:tcPr>
+          <w:p>
+            <w:r>
+              <w:rPr>
+                <w:rFonts w:ascii="Aptos" w:eastAsia="Aptos" w:hAnsi="Aptos" w:cs="Aptos"/>
+                <w:sz w:val="20"/>
+                <w:szCs w:val="20"/>
+              </w:rPr>
+              <w:t xml:space="preserve">Boundary</w:t>
+            </w:r>
+          </w:p>
+        </w:tc>
+        <w:tc>
+          <w:tcPr>
+            <w:tcW w:w="2290" w:type="pct"/>
+            <w:tcMar>
+              <w:top w:w="30" w:type="dxa"/>
+              <w:left w:w="80" w:type="dxa"/>
+              <w:bottom w:w="30" w:type="dxa"/>
+              <w:right w:w="80" w:type="dxa"/>
+            </w:tcMar>
+          </w:tcPr>
+          <w:p>
+            <w:r>
+              <w:rPr>
+                <w:rFonts w:ascii="Aptos" w:eastAsia="Aptos" w:hAnsi="Aptos" w:cs="Aptos"/>
+                <w:sz w:val="20"/>
+                <w:szCs w:val="20"/>
+              </w:rPr>
+              <w:t xml:space="preserve">The customer is accepted, because 10 digits is the shortest phone number allowed.</w:t>
+            </w:r>
+          </w:p>
+        </w:tc>
+      </w:tr>
+      <w:tr>
+        <w:trPr>
+          <w:cantSplit/>
+        </w:trPr>
+        <w:tc>
+          <w:tcPr>
+            <w:tcW w:w="300" w:type="pct"/>
+            <w:tcMar>
+              <w:top w:w="30" w:type="dxa"/>
+              <w:left w:w="80" w:type="dxa"/>
+              <w:bottom w:w="30" w:type="dxa"/>
+              <w:right w:w="80" w:type="dxa"/>
+            </w:tcMar>
+          </w:tcPr>
+          <w:p>
+            <w:r>
+              <w:rPr>
+                <w:rFonts w:ascii="Aptos" w:eastAsia="Aptos" w:hAnsi="Aptos" w:cs="Aptos"/>
+                <w:sz w:val="20"/>
+                <w:szCs w:val="20"/>
+              </w:rPr>
+              <w:t xml:space="preserve">103</w:t>
+            </w:r>
+          </w:p>
+        </w:tc>
+        <w:tc>
+          <w:tcPr>
+            <w:tcW w:w="1850" w:type="pct"/>
+            <w:tcMar>
+              <w:top w:w="30" w:type="dxa"/>
+              <w:left w:w="80" w:type="dxa"/>
+              <w:bottom w:w="30" w:type="dxa"/>
+              <w:right w:w="80" w:type="dxa"/>
+            </w:tcMar>
+          </w:tcPr>
+          <w:p>
+            <w:r>
+              <w:rPr>
+                <w:rFonts w:ascii="Aptos" w:eastAsia="Aptos" w:hAnsi="Aptos" w:cs="Aptos"/>
+                <w:sz w:val="20"/>
+                <w:szCs w:val="20"/>
+              </w:rPr>
+              <w:t xml:space="preserve">On the Screens form, enter 5 rows and 20 seats per row, then press Add</w:t>
+            </w:r>
+          </w:p>
+        </w:tc>
+        <w:tc>
+          <w:tcPr>
+            <w:tcW w:w="560" w:type="pct"/>
+            <w:tcMar>
+              <w:top w:w="30" w:type="dxa"/>
+              <w:left w:w="80" w:type="dxa"/>
+              <w:bottom w:w="30" w:type="dxa"/>
+              <w:right w:w="80" w:type="dxa"/>
+            </w:tcMar>
+          </w:tcPr>
+          <w:p>
+            <w:r>
+              <w:rPr>
+                <w:rFonts w:ascii="Aptos" w:eastAsia="Aptos" w:hAnsi="Aptos" w:cs="Aptos"/>
+                <w:sz w:val="20"/>
+                <w:szCs w:val="20"/>
+              </w:rPr>
+              <w:t xml:space="preserve">Boundary</w:t>
+            </w:r>
+          </w:p>
+        </w:tc>
+        <w:tc>
+          <w:tcPr>
+            <w:tcW w:w="2290" w:type="pct"/>
+            <w:tcMar>
+              <w:top w:w="30" w:type="dxa"/>
+              <w:left w:w="80" w:type="dxa"/>
+              <w:bottom w:w="30" w:type="dxa"/>
+              <w:right w:w="80" w:type="dxa"/>
+            </w:tcMar>
+          </w:tcPr>
+          <w:p>
+            <w:r>
+              <w:rPr>
+                <w:rFonts w:ascii="Aptos" w:eastAsia="Aptos" w:hAnsi="Aptos" w:cs="Aptos"/>
+                <w:sz w:val="20"/>
+                <w:szCs w:val="20"/>
+              </w:rPr>
+              <w:t xml:space="preserve">The screen is accepted, because 20 seats is the largest a row is allowed to be. This is the upper end of a range check.</w:t>
+            </w:r>
+          </w:p>
+        </w:tc>
+      </w:tr>
+      <w:tr>
+        <w:trPr>
+          <w:cantSplit/>
+        </w:trPr>
+        <w:tc>
+          <w:tcPr>
+            <w:tcW w:w="300" w:type="pct"/>
+            <w:tcMar>
+              <w:top w:w="30" w:type="dxa"/>
+              <w:left w:w="80" w:type="dxa"/>
+              <w:bottom w:w="30" w:type="dxa"/>
+              <w:right w:w="80" w:type="dxa"/>
+            </w:tcMar>
+          </w:tcPr>
+          <w:p>
+            <w:r>
+              <w:rPr>
+                <w:rFonts w:ascii="Aptos" w:eastAsia="Aptos" w:hAnsi="Aptos" w:cs="Aptos"/>
+                <w:sz w:val="20"/>
+                <w:szCs w:val="20"/>
+              </w:rPr>
+              <w:t xml:space="preserve">104</w:t>
+            </w:r>
+          </w:p>
+        </w:tc>
+        <w:tc>
+          <w:tcPr>
+            <w:tcW w:w="1850" w:type="pct"/>
+            <w:tcMar>
+              <w:top w:w="30" w:type="dxa"/>
+              <w:left w:w="80" w:type="dxa"/>
+              <w:bottom w:w="30" w:type="dxa"/>
+              <w:right w:w="80" w:type="dxa"/>
+            </w:tcMar>
+          </w:tcPr>
+          <w:p>
+            <w:r>
+              <w:rPr>
+                <w:rFonts w:ascii="Aptos" w:eastAsia="Aptos" w:hAnsi="Aptos" w:cs="Aptos"/>
+                <w:sz w:val="20"/>
+                <w:szCs w:val="20"/>
+              </w:rPr>
+              <w:t xml:space="preserve">On the Screenings form, enter a screening time of 14:75, then press Add</w:t>
+            </w:r>
+          </w:p>
+        </w:tc>
+        <w:tc>
+          <w:tcPr>
+            <w:tcW w:w="560" w:type="pct"/>
+            <w:tcMar>
+              <w:top w:w="30" w:type="dxa"/>
+              <w:left w:w="80" w:type="dxa"/>
+              <w:bottom w:w="30" w:type="dxa"/>
+              <w:right w:w="80" w:type="dxa"/>
+            </w:tcMar>
+          </w:tcPr>
+          <w:p>
+            <w:r>
+              <w:rPr>
+                <w:rFonts w:ascii="Aptos" w:eastAsia="Aptos" w:hAnsi="Aptos" w:cs="Aptos"/>
+                <w:sz w:val="20"/>
+                <w:szCs w:val="20"/>
+              </w:rPr>
+              <w:t xml:space="preserve">Erroneous</w:t>
+            </w:r>
+          </w:p>
+        </w:tc>
+        <w:tc>
+          <w:tcPr>
+            <w:tcW w:w="2290" w:type="pct"/>
+            <w:tcMar>
+              <w:top w:w="30" w:type="dxa"/>
+              <w:left w:w="80" w:type="dxa"/>
+              <w:bottom w:w="30" w:type="dxa"/>
+              <w:right w:w="80" w:type="dxa"/>
+            </w:tcMar>
+          </w:tcPr>
+          <w:p>
+            <w:r>
+              <w:rPr>
+                <w:rFonts w:ascii="Aptos" w:eastAsia="Aptos" w:hAnsi="Aptos" w:cs="Aptos"/>
+                <w:sz w:val="20"/>
+                <w:szCs w:val="20"/>
+              </w:rPr>
+              <w:t xml:space="preserve">The screening is rejected and a message appears stating “Screening time must be in HH:MM format, e.g. 14:30”, because 75 is outside the valid range of minutes.</w:t>
+            </w:r>
+          </w:p>
+        </w:tc>
+      </w:tr>
+      <w:tr>
+        <w:trPr>
+          <w:cantSplit/>
+        </w:trPr>
+        <w:tc>
+          <w:tcPr>
+            <w:tcW w:w="300" w:type="pct"/>
+            <w:tcMar>
+              <w:top w:w="30" w:type="dxa"/>
+              <w:left w:w="80" w:type="dxa"/>
+              <w:bottom w:w="30" w:type="dxa"/>
+              <w:right w:w="80" w:type="dxa"/>
+            </w:tcMar>
+          </w:tcPr>
+          <w:p>
+            <w:r>
+              <w:rPr>
+                <w:rFonts w:ascii="Aptos" w:eastAsia="Aptos" w:hAnsi="Aptos" w:cs="Aptos"/>
+                <w:sz w:val="20"/>
+                <w:szCs w:val="20"/>
+              </w:rPr>
+              <w:t xml:space="preserve">105</w:t>
+            </w:r>
+          </w:p>
+        </w:tc>
+        <w:tc>
+          <w:tcPr>
+            <w:tcW w:w="1850" w:type="pct"/>
+            <w:tcMar>
+              <w:top w:w="30" w:type="dxa"/>
+              <w:left w:w="80" w:type="dxa"/>
+              <w:bottom w:w="30" w:type="dxa"/>
+              <w:right w:w="80" w:type="dxa"/>
+            </w:tcMar>
+          </w:tcPr>
+          <w:p>
+            <w:r>
+              <w:rPr>
+                <w:rFonts w:ascii="Aptos" w:eastAsia="Aptos" w:hAnsi="Aptos" w:cs="Aptos"/>
+                <w:sz w:val="20"/>
+                <w:szCs w:val="20"/>
+              </w:rPr>
+              <w:t xml:space="preserve">On the Screenings form, enter a screening time of 23:59, then press Add</w:t>
+            </w:r>
+          </w:p>
+        </w:tc>
+        <w:tc>
+          <w:tcPr>
+            <w:tcW w:w="560" w:type="pct"/>
+            <w:tcMar>
+              <w:top w:w="30" w:type="dxa"/>
+              <w:left w:w="80" w:type="dxa"/>
+              <w:bottom w:w="30" w:type="dxa"/>
+              <w:right w:w="80" w:type="dxa"/>
+            </w:tcMar>
+          </w:tcPr>
+          <w:p>
+            <w:r>
+              <w:rPr>
+                <w:rFonts w:ascii="Aptos" w:eastAsia="Aptos" w:hAnsi="Aptos" w:cs="Aptos"/>
+                <w:sz w:val="20"/>
+                <w:szCs w:val="20"/>
+              </w:rPr>
+              <w:t xml:space="preserve">Boundary</w:t>
+            </w:r>
+          </w:p>
+        </w:tc>
+        <w:tc>
+          <w:tcPr>
+            <w:tcW w:w="2290" w:type="pct"/>
+            <w:tcMar>
+              <w:top w:w="30" w:type="dxa"/>
+              <w:left w:w="80" w:type="dxa"/>
+              <w:bottom w:w="30" w:type="dxa"/>
+              <w:right w:w="80" w:type="dxa"/>
+            </w:tcMar>
+          </w:tcPr>
+          <w:p>
+            <w:r>
+              <w:rPr>
+                <w:rFonts w:ascii="Aptos" w:eastAsia="Aptos" w:hAnsi="Aptos" w:cs="Aptos"/>
+                <w:sz w:val="20"/>
+                <w:szCs w:val="20"/>
+              </w:rPr>
+              <w:t xml:space="preserve">The time is accepted as a valid time of day, because 23:59 is the last minute the HH:MM format allows.</w:t>
+            </w:r>
+          </w:p>
+        </w:tc>
+      </w:tr>
+      <w:tr>
+        <w:trPr>
+          <w:cantSplit/>
+        </w:trPr>
+        <w:tc>
+          <w:tcPr>
+            <w:tcW w:w="300" w:type="pct"/>
+            <w:tcMar>
+              <w:top w:w="30" w:type="dxa"/>
+              <w:left w:w="80" w:type="dxa"/>
+              <w:bottom w:w="30" w:type="dxa"/>
+              <w:right w:w="80" w:type="dxa"/>
+            </w:tcMar>
+          </w:tcPr>
+          <w:p>
+            <w:r>
+              <w:rPr>
+                <w:rFonts w:ascii="Aptos" w:eastAsia="Aptos" w:hAnsi="Aptos" w:cs="Aptos"/>
+                <w:sz w:val="20"/>
+                <w:szCs w:val="20"/>
+              </w:rPr>
+              <w:t xml:space="preserve">106</w:t>
+            </w:r>
+          </w:p>
+        </w:tc>
+        <w:tc>
+          <w:tcPr>
+            <w:tcW w:w="1850" w:type="pct"/>
+            <w:tcMar>
+              <w:top w:w="30" w:type="dxa"/>
+              <w:left w:w="80" w:type="dxa"/>
+              <w:bottom w:w="30" w:type="dxa"/>
+              <w:right w:w="80" w:type="dxa"/>
+            </w:tcMar>
+          </w:tcPr>
+          <w:p>
+            <w:r>
+              <w:rPr>
+                <w:rFonts w:ascii="Aptos" w:eastAsia="Aptos" w:hAnsi="Aptos" w:cs="Aptos"/>
+                <w:sz w:val="20"/>
+                <w:szCs w:val="20"/>
+              </w:rPr>
+              <w:t xml:space="preserve">On the Films form, leave every box blank and press Add</w:t>
+            </w:r>
+          </w:p>
+        </w:tc>
+        <w:tc>
+          <w:tcPr>
+            <w:tcW w:w="560" w:type="pct"/>
+            <w:tcMar>
+              <w:top w:w="30" w:type="dxa"/>
+              <w:left w:w="80" w:type="dxa"/>
+              <w:bottom w:w="30" w:type="dxa"/>
+              <w:right w:w="80" w:type="dxa"/>
+            </w:tcMar>
+          </w:tcPr>
+          <w:p>
+            <w:r>
+              <w:rPr>
+                <w:rFonts w:ascii="Aptos" w:eastAsia="Aptos" w:hAnsi="Aptos" w:cs="Aptos"/>
+                <w:sz w:val="20"/>
+                <w:szCs w:val="20"/>
+              </w:rPr>
+              <w:t xml:space="preserve">Erroneous</w:t>
+            </w:r>
+          </w:p>
+        </w:tc>
+        <w:tc>
+          <w:tcPr>
+            <w:tcW w:w="2290" w:type="pct"/>
+            <w:tcMar>
+              <w:top w:w="30" w:type="dxa"/>
+              <w:left w:w="80" w:type="dxa"/>
+              <w:bottom w:w="30" w:type="dxa"/>
+              <w:right w:w="80" w:type="dxa"/>
+            </w:tcMar>
+          </w:tcPr>
+          <w:p>
+            <w:r>
+              <w:rPr>
+                <w:rFonts w:ascii="Aptos" w:eastAsia="Aptos" w:hAnsi="Aptos" w:cs="Aptos"/>
+                <w:sz w:val="20"/>
+                <w:szCs w:val="20"/>
+              </w:rPr>
+              <w:t xml:space="preserve">The film is rejected on the first missing field rather than the system attempting to save an empty record, showing that presence checks run before anything is written.</w:t>
             </w:r>
           </w:p>
         </w:tc>

</xml_diff>

<commit_message>
added objective 17: maintaining an audit log
</commit_message>
<xml_diff>
--- a/Testing.docx
+++ b/Testing.docx
@@ -11633,6 +11633,607 @@
                 <w:szCs w:val="20"/>
               </w:rPr>
               <w:t xml:space="preserve">The film is rejected on the first missing field rather than the system attempting to save an empty record, showing that presence checks run before anything is written.</w:t>
+            </w:r>
+          </w:p>
+        </w:tc>
+      </w:tr>
+    </w:tbl>
+    <w:p>
+      <w:r>
+        <w:rPr>
+          <w:rFonts w:ascii="Aptos" w:eastAsia="Aptos" w:hAnsi="Aptos" w:cs="Aptos"/>
+        </w:rPr>
+        <w:t xml:space="preserve"/>
+      </w:r>
+    </w:p>
+    <w:p>
+      <w:pPr>
+        <w:pStyle w:val="Heading3"/>
+      </w:pPr>
+      <w:r>
+        <w:rPr>
+          <w:rFonts w:ascii="Aptos Display" w:eastAsia="Aptos Display" w:hAnsi="Aptos Display" w:cs="Aptos Display"/>
+          <w:b/>
+          <w:bCs/>
+          <w:color w:val="000000"/>
+        </w:rPr>
+        <w:t xml:space="preserve">Objective 17: Maintaining an Audit Log</w:t>
+      </w:r>
+    </w:p>
+    <w:p>
+      <w:r>
+        <w:rPr>
+          <w:rFonts w:ascii="Aptos" w:eastAsia="Aptos" w:hAnsi="Aptos" w:cs="Aptos"/>
+        </w:rPr>
+        <w:t xml:space="preserve">These tests check that the key actions are written to the audit log with a timestamp. The wider log objective, which covers users, severity and searching, is tested later in the post-prototype part of the plan.</w:t>
+      </w:r>
+    </w:p>
+    <w:tbl>
+      <w:tblPr>
+        <w:tblW w:w="5000" w:type="pct"/>
+        <w:tblBorders>
+          <w:top w:val="single" w:sz="4" w:space="0" w:color="808080"/>
+          <w:left w:val="single" w:sz="4" w:space="0" w:color="808080"/>
+          <w:bottom w:val="single" w:sz="4" w:space="0" w:color="808080"/>
+          <w:right w:val="single" w:sz="4" w:space="0" w:color="808080"/>
+          <w:insideH w:val="single" w:sz="4" w:space="0" w:color="808080"/>
+          <w:insideV w:val="single" w:sz="4" w:space="0" w:color="808080"/>
+        </w:tblBorders>
+        <w:tblCellMar>
+          <w:left w:w="10" w:type="dxa"/>
+          <w:right w:w="10" w:type="dxa"/>
+        </w:tblCellMar>
+        <w:tblLook w:val="0000" w:firstRow="0" w:lastRow="0" w:firstColumn="0" w:lastColumn="0" w:noHBand="0" w:noVBand="0"/>
+      </w:tblPr>
+      <w:tblGrid>
+        <w:gridCol w:w="561"/>
+        <w:gridCol w:w="3460"/>
+        <w:gridCol w:w="1047"/>
+        <w:gridCol w:w="4282"/>
+      </w:tblGrid>
+      <w:tr>
+        <w:trPr>
+          <w:cantSplit/>
+          <w:tblHeader/>
+        </w:trPr>
+        <w:tc>
+          <w:tcPr>
+            <w:tcW w:w="300" w:type="pct"/>
+            <w:shd w:val="clear" w:color="auto" w:fill="F2CEED" w:themeFill="accent5" w:themeFillTint="33"/>
+            <w:tcMar>
+              <w:top w:w="30" w:type="dxa"/>
+              <w:left w:w="80" w:type="dxa"/>
+              <w:bottom w:w="30" w:type="dxa"/>
+              <w:right w:w="80" w:type="dxa"/>
+            </w:tcMar>
+          </w:tcPr>
+          <w:p>
+            <w:r>
+              <w:rPr>
+                <w:rFonts w:ascii="Aptos" w:eastAsia="Aptos" w:hAnsi="Aptos" w:cs="Aptos"/>
+                <w:b/>
+                <w:bCs/>
+                <w:sz w:val="20"/>
+                <w:szCs w:val="20"/>
+              </w:rPr>
+              <w:t xml:space="preserve">No.</w:t>
+            </w:r>
+          </w:p>
+        </w:tc>
+        <w:tc>
+          <w:tcPr>
+            <w:tcW w:w="1850" w:type="pct"/>
+            <w:shd w:val="clear" w:color="auto" w:fill="F2CEED" w:themeFill="accent5" w:themeFillTint="33"/>
+            <w:tcMar>
+              <w:top w:w="30" w:type="dxa"/>
+              <w:left w:w="80" w:type="dxa"/>
+              <w:bottom w:w="30" w:type="dxa"/>
+              <w:right w:w="80" w:type="dxa"/>
+            </w:tcMar>
+          </w:tcPr>
+          <w:p>
+            <w:r>
+              <w:rPr>
+                <w:rFonts w:ascii="Aptos" w:eastAsia="Aptos" w:hAnsi="Aptos" w:cs="Aptos"/>
+                <w:b/>
+                <w:bCs/>
+                <w:sz w:val="20"/>
+                <w:szCs w:val="20"/>
+              </w:rPr>
+              <w:t xml:space="preserve">Test</w:t>
+            </w:r>
+          </w:p>
+        </w:tc>
+        <w:tc>
+          <w:tcPr>
+            <w:tcW w:w="560" w:type="pct"/>
+            <w:shd w:val="clear" w:color="auto" w:fill="F2CEED" w:themeFill="accent5" w:themeFillTint="33"/>
+            <w:tcMar>
+              <w:top w:w="30" w:type="dxa"/>
+              <w:left w:w="80" w:type="dxa"/>
+              <w:bottom w:w="30" w:type="dxa"/>
+              <w:right w:w="80" w:type="dxa"/>
+            </w:tcMar>
+          </w:tcPr>
+          <w:p>
+            <w:r>
+              <w:rPr>
+                <w:rFonts w:ascii="Aptos" w:eastAsia="Aptos" w:hAnsi="Aptos" w:cs="Aptos"/>
+                <w:b/>
+                <w:bCs/>
+                <w:sz w:val="20"/>
+                <w:szCs w:val="20"/>
+              </w:rPr>
+              <w:t xml:space="preserve">Type</w:t>
+            </w:r>
+          </w:p>
+        </w:tc>
+        <w:tc>
+          <w:tcPr>
+            <w:tcW w:w="2290" w:type="pct"/>
+            <w:shd w:val="clear" w:color="auto" w:fill="F2CEED" w:themeFill="accent5" w:themeFillTint="33"/>
+            <w:tcMar>
+              <w:top w:w="30" w:type="dxa"/>
+              <w:left w:w="80" w:type="dxa"/>
+              <w:bottom w:w="30" w:type="dxa"/>
+              <w:right w:w="80" w:type="dxa"/>
+            </w:tcMar>
+          </w:tcPr>
+          <w:p>
+            <w:r>
+              <w:rPr>
+                <w:rFonts w:ascii="Aptos" w:eastAsia="Aptos" w:hAnsi="Aptos" w:cs="Aptos"/>
+                <w:b/>
+                <w:bCs/>
+                <w:sz w:val="20"/>
+                <w:szCs w:val="20"/>
+              </w:rPr>
+              <w:t xml:space="preserve">Expected Result</w:t>
+            </w:r>
+          </w:p>
+        </w:tc>
+      </w:tr>
+      <w:tr>
+        <w:trPr>
+          <w:cantSplit/>
+        </w:trPr>
+        <w:tc>
+          <w:tcPr>
+            <w:tcW w:w="300" w:type="pct"/>
+            <w:tcMar>
+              <w:top w:w="30" w:type="dxa"/>
+              <w:left w:w="80" w:type="dxa"/>
+              <w:bottom w:w="30" w:type="dxa"/>
+              <w:right w:w="80" w:type="dxa"/>
+            </w:tcMar>
+          </w:tcPr>
+          <w:p>
+            <w:r>
+              <w:rPr>
+                <w:rFonts w:ascii="Aptos" w:eastAsia="Aptos" w:hAnsi="Aptos" w:cs="Aptos"/>
+                <w:sz w:val="20"/>
+                <w:szCs w:val="20"/>
+              </w:rPr>
+              <w:t xml:space="preserve">107</w:t>
+            </w:r>
+          </w:p>
+        </w:tc>
+        <w:tc>
+          <w:tcPr>
+            <w:tcW w:w="1850" w:type="pct"/>
+            <w:tcMar>
+              <w:top w:w="30" w:type="dxa"/>
+              <w:left w:w="80" w:type="dxa"/>
+              <w:bottom w:w="30" w:type="dxa"/>
+              <w:right w:w="80" w:type="dxa"/>
+            </w:tcMar>
+          </w:tcPr>
+          <w:p>
+            <w:r>
+              <w:rPr>
+                <w:rFonts w:ascii="Aptos" w:eastAsia="Aptos" w:hAnsi="Aptos" w:cs="Aptos"/>
+                <w:sz w:val="20"/>
+                <w:szCs w:val="20"/>
+              </w:rPr>
+              <w:t xml:space="preserve">Log in successfully and then open the Logs form</w:t>
+            </w:r>
+          </w:p>
+        </w:tc>
+        <w:tc>
+          <w:tcPr>
+            <w:tcW w:w="560" w:type="pct"/>
+            <w:tcMar>
+              <w:top w:w="30" w:type="dxa"/>
+              <w:left w:w="80" w:type="dxa"/>
+              <w:bottom w:w="30" w:type="dxa"/>
+              <w:right w:w="80" w:type="dxa"/>
+            </w:tcMar>
+          </w:tcPr>
+          <w:p>
+            <w:r>
+              <w:rPr>
+                <w:rFonts w:ascii="Aptos" w:eastAsia="Aptos" w:hAnsi="Aptos" w:cs="Aptos"/>
+                <w:sz w:val="20"/>
+                <w:szCs w:val="20"/>
+              </w:rPr>
+              <w:t xml:space="preserve">Normal</w:t>
+            </w:r>
+          </w:p>
+        </w:tc>
+        <w:tc>
+          <w:tcPr>
+            <w:tcW w:w="2290" w:type="pct"/>
+            <w:tcMar>
+              <w:top w:w="30" w:type="dxa"/>
+              <w:left w:w="80" w:type="dxa"/>
+              <w:bottom w:w="30" w:type="dxa"/>
+              <w:right w:w="80" w:type="dxa"/>
+            </w:tcMar>
+          </w:tcPr>
+          <w:p>
+            <w:r>
+              <w:rPr>
+                <w:rFonts w:ascii="Aptos" w:eastAsia="Aptos" w:hAnsi="Aptos" w:cs="Aptos"/>
+                <w:sz w:val="20"/>
+                <w:szCs w:val="20"/>
+              </w:rPr>
+              <w:t xml:space="preserve">The log shows an entry recording that the user signed in successfully, along with the date and time.</w:t>
+            </w:r>
+          </w:p>
+        </w:tc>
+      </w:tr>
+      <w:tr>
+        <w:trPr>
+          <w:cantSplit/>
+        </w:trPr>
+        <w:tc>
+          <w:tcPr>
+            <w:tcW w:w="300" w:type="pct"/>
+            <w:tcMar>
+              <w:top w:w="30" w:type="dxa"/>
+              <w:left w:w="80" w:type="dxa"/>
+              <w:bottom w:w="30" w:type="dxa"/>
+              <w:right w:w="80" w:type="dxa"/>
+            </w:tcMar>
+          </w:tcPr>
+          <w:p>
+            <w:r>
+              <w:rPr>
+                <w:rFonts w:ascii="Aptos" w:eastAsia="Aptos" w:hAnsi="Aptos" w:cs="Aptos"/>
+                <w:sz w:val="20"/>
+                <w:szCs w:val="20"/>
+              </w:rPr>
+              <w:t xml:space="preserve">108</w:t>
+            </w:r>
+          </w:p>
+        </w:tc>
+        <w:tc>
+          <w:tcPr>
+            <w:tcW w:w="1850" w:type="pct"/>
+            <w:tcMar>
+              <w:top w:w="30" w:type="dxa"/>
+              <w:left w:w="80" w:type="dxa"/>
+              <w:bottom w:w="30" w:type="dxa"/>
+              <w:right w:w="80" w:type="dxa"/>
+            </w:tcMar>
+          </w:tcPr>
+          <w:p>
+            <w:r>
+              <w:rPr>
+                <w:rFonts w:ascii="Aptos" w:eastAsia="Aptos" w:hAnsi="Aptos" w:cs="Aptos"/>
+                <w:sz w:val="20"/>
+                <w:szCs w:val="20"/>
+              </w:rPr>
+              <w:t xml:space="preserve">Complete a sale and then open the Logs form</w:t>
+            </w:r>
+          </w:p>
+        </w:tc>
+        <w:tc>
+          <w:tcPr>
+            <w:tcW w:w="560" w:type="pct"/>
+            <w:tcMar>
+              <w:top w:w="30" w:type="dxa"/>
+              <w:left w:w="80" w:type="dxa"/>
+              <w:bottom w:w="30" w:type="dxa"/>
+              <w:right w:w="80" w:type="dxa"/>
+            </w:tcMar>
+          </w:tcPr>
+          <w:p>
+            <w:r>
+              <w:rPr>
+                <w:rFonts w:ascii="Aptos" w:eastAsia="Aptos" w:hAnsi="Aptos" w:cs="Aptos"/>
+                <w:sz w:val="20"/>
+                <w:szCs w:val="20"/>
+              </w:rPr>
+              <w:t xml:space="preserve">Normal</w:t>
+            </w:r>
+          </w:p>
+        </w:tc>
+        <w:tc>
+          <w:tcPr>
+            <w:tcW w:w="2290" w:type="pct"/>
+            <w:tcMar>
+              <w:top w:w="30" w:type="dxa"/>
+              <w:left w:w="80" w:type="dxa"/>
+              <w:bottom w:w="30" w:type="dxa"/>
+              <w:right w:w="80" w:type="dxa"/>
+            </w:tcMar>
+          </w:tcPr>
+          <w:p>
+            <w:r>
+              <w:rPr>
+                <w:rFonts w:ascii="Aptos" w:eastAsia="Aptos" w:hAnsi="Aptos" w:cs="Aptos"/>
+                <w:sz w:val="20"/>
+                <w:szCs w:val="20"/>
+              </w:rPr>
+              <w:t xml:space="preserve">The log shows an entry recording that a booking was created, including the number of seats, with a timestamp.</w:t>
+            </w:r>
+          </w:p>
+        </w:tc>
+      </w:tr>
+      <w:tr>
+        <w:trPr>
+          <w:cantSplit/>
+        </w:trPr>
+        <w:tc>
+          <w:tcPr>
+            <w:tcW w:w="300" w:type="pct"/>
+            <w:tcMar>
+              <w:top w:w="30" w:type="dxa"/>
+              <w:left w:w="80" w:type="dxa"/>
+              <w:bottom w:w="30" w:type="dxa"/>
+              <w:right w:w="80" w:type="dxa"/>
+            </w:tcMar>
+          </w:tcPr>
+          <w:p>
+            <w:r>
+              <w:rPr>
+                <w:rFonts w:ascii="Aptos" w:eastAsia="Aptos" w:hAnsi="Aptos" w:cs="Aptos"/>
+                <w:sz w:val="20"/>
+                <w:szCs w:val="20"/>
+              </w:rPr>
+              <w:t xml:space="preserve">109</w:t>
+            </w:r>
+          </w:p>
+        </w:tc>
+        <w:tc>
+          <w:tcPr>
+            <w:tcW w:w="1850" w:type="pct"/>
+            <w:tcMar>
+              <w:top w:w="30" w:type="dxa"/>
+              <w:left w:w="80" w:type="dxa"/>
+              <w:bottom w:w="30" w:type="dxa"/>
+              <w:right w:w="80" w:type="dxa"/>
+            </w:tcMar>
+          </w:tcPr>
+          <w:p>
+            <w:r>
+              <w:rPr>
+                <w:rFonts w:ascii="Aptos" w:eastAsia="Aptos" w:hAnsi="Aptos" w:cs="Aptos"/>
+                <w:sz w:val="20"/>
+                <w:szCs w:val="20"/>
+              </w:rPr>
+              <w:t xml:space="preserve">Refund a booking in full and then open the Logs form</w:t>
+            </w:r>
+          </w:p>
+        </w:tc>
+        <w:tc>
+          <w:tcPr>
+            <w:tcW w:w="560" w:type="pct"/>
+            <w:tcMar>
+              <w:top w:w="30" w:type="dxa"/>
+              <w:left w:w="80" w:type="dxa"/>
+              <w:bottom w:w="30" w:type="dxa"/>
+              <w:right w:w="80" w:type="dxa"/>
+            </w:tcMar>
+          </w:tcPr>
+          <w:p>
+            <w:r>
+              <w:rPr>
+                <w:rFonts w:ascii="Aptos" w:eastAsia="Aptos" w:hAnsi="Aptos" w:cs="Aptos"/>
+                <w:sz w:val="20"/>
+                <w:szCs w:val="20"/>
+              </w:rPr>
+              <w:t xml:space="preserve">Normal</w:t>
+            </w:r>
+          </w:p>
+        </w:tc>
+        <w:tc>
+          <w:tcPr>
+            <w:tcW w:w="2290" w:type="pct"/>
+            <w:tcMar>
+              <w:top w:w="30" w:type="dxa"/>
+              <w:left w:w="80" w:type="dxa"/>
+              <w:bottom w:w="30" w:type="dxa"/>
+              <w:right w:w="80" w:type="dxa"/>
+            </w:tcMar>
+          </w:tcPr>
+          <w:p>
+            <w:r>
+              <w:rPr>
+                <w:rFonts w:ascii="Aptos" w:eastAsia="Aptos" w:hAnsi="Aptos" w:cs="Aptos"/>
+                <w:sz w:val="20"/>
+                <w:szCs w:val="20"/>
+              </w:rPr>
+              <w:t xml:space="preserve">The log shows an entry recording that the booking was refunded, with a timestamp.</w:t>
+            </w:r>
+          </w:p>
+        </w:tc>
+      </w:tr>
+      <w:tr>
+        <w:trPr>
+          <w:cantSplit/>
+        </w:trPr>
+        <w:tc>
+          <w:tcPr>
+            <w:tcW w:w="300" w:type="pct"/>
+            <w:tcMar>
+              <w:top w:w="30" w:type="dxa"/>
+              <w:left w:w="80" w:type="dxa"/>
+              <w:bottom w:w="30" w:type="dxa"/>
+              <w:right w:w="80" w:type="dxa"/>
+            </w:tcMar>
+          </w:tcPr>
+          <w:p>
+            <w:r>
+              <w:rPr>
+                <w:rFonts w:ascii="Aptos" w:eastAsia="Aptos" w:hAnsi="Aptos" w:cs="Aptos"/>
+                <w:sz w:val="20"/>
+                <w:szCs w:val="20"/>
+              </w:rPr>
+              <w:t xml:space="preserve">110</w:t>
+            </w:r>
+          </w:p>
+        </w:tc>
+        <w:tc>
+          <w:tcPr>
+            <w:tcW w:w="1850" w:type="pct"/>
+            <w:tcMar>
+              <w:top w:w="30" w:type="dxa"/>
+              <w:left w:w="80" w:type="dxa"/>
+              <w:bottom w:w="30" w:type="dxa"/>
+              <w:right w:w="80" w:type="dxa"/>
+            </w:tcMar>
+          </w:tcPr>
+          <w:p>
+            <w:r>
+              <w:rPr>
+                <w:rFonts w:ascii="Aptos" w:eastAsia="Aptos" w:hAnsi="Aptos" w:cs="Aptos"/>
+                <w:sz w:val="20"/>
+                <w:szCs w:val="20"/>
+              </w:rPr>
+              <w:t xml:space="preserve">Add a new film and then open the Logs form</w:t>
+            </w:r>
+          </w:p>
+        </w:tc>
+        <w:tc>
+          <w:tcPr>
+            <w:tcW w:w="560" w:type="pct"/>
+            <w:tcMar>
+              <w:top w:w="30" w:type="dxa"/>
+              <w:left w:w="80" w:type="dxa"/>
+              <w:bottom w:w="30" w:type="dxa"/>
+              <w:right w:w="80" w:type="dxa"/>
+            </w:tcMar>
+          </w:tcPr>
+          <w:p>
+            <w:r>
+              <w:rPr>
+                <w:rFonts w:ascii="Aptos" w:eastAsia="Aptos" w:hAnsi="Aptos" w:cs="Aptos"/>
+                <w:sz w:val="20"/>
+                <w:szCs w:val="20"/>
+              </w:rPr>
+              <w:t xml:space="preserve">Normal</w:t>
+            </w:r>
+          </w:p>
+        </w:tc>
+        <w:tc>
+          <w:tcPr>
+            <w:tcW w:w="2290" w:type="pct"/>
+            <w:tcMar>
+              <w:top w:w="30" w:type="dxa"/>
+              <w:left w:w="80" w:type="dxa"/>
+              <w:bottom w:w="30" w:type="dxa"/>
+              <w:right w:w="80" w:type="dxa"/>
+            </w:tcMar>
+          </w:tcPr>
+          <w:p>
+            <w:r>
+              <w:rPr>
+                <w:rFonts w:ascii="Aptos" w:eastAsia="Aptos" w:hAnsi="Aptos" w:cs="Aptos"/>
+                <w:sz w:val="20"/>
+                <w:szCs w:val="20"/>
+              </w:rPr>
+              <w:t xml:space="preserve">The log shows an entry recording that the film was added, with a timestamp.</w:t>
+            </w:r>
+          </w:p>
+        </w:tc>
+      </w:tr>
+      <w:tr>
+        <w:trPr>
+          <w:cantSplit/>
+        </w:trPr>
+        <w:tc>
+          <w:tcPr>
+            <w:tcW w:w="300" w:type="pct"/>
+            <w:tcMar>
+              <w:top w:w="30" w:type="dxa"/>
+              <w:left w:w="80" w:type="dxa"/>
+              <w:bottom w:w="30" w:type="dxa"/>
+              <w:right w:w="80" w:type="dxa"/>
+            </w:tcMar>
+          </w:tcPr>
+          <w:p>
+            <w:r>
+              <w:rPr>
+                <w:rFonts w:ascii="Aptos" w:eastAsia="Aptos" w:hAnsi="Aptos" w:cs="Aptos"/>
+                <w:sz w:val="20"/>
+                <w:szCs w:val="20"/>
+              </w:rPr>
+              <w:t xml:space="preserve">111</w:t>
+            </w:r>
+          </w:p>
+        </w:tc>
+        <w:tc>
+          <w:tcPr>
+            <w:tcW w:w="1850" w:type="pct"/>
+            <w:tcMar>
+              <w:top w:w="30" w:type="dxa"/>
+              <w:left w:w="80" w:type="dxa"/>
+              <w:bottom w:w="30" w:type="dxa"/>
+              <w:right w:w="80" w:type="dxa"/>
+            </w:tcMar>
+          </w:tcPr>
+          <w:p>
+            <w:r>
+              <w:rPr>
+                <w:rFonts w:ascii="Aptos" w:eastAsia="Aptos" w:hAnsi="Aptos" w:cs="Aptos"/>
+                <w:sz w:val="20"/>
+                <w:szCs w:val="20"/>
+              </w:rPr>
+              <w:t xml:space="preserve">Attempt to add a screening that clashes with one already on the screen, then open the Logs form</w:t>
+            </w:r>
+          </w:p>
+        </w:tc>
+        <w:tc>
+          <w:tcPr>
+            <w:tcW w:w="560" w:type="pct"/>
+            <w:tcMar>
+              <w:top w:w="30" w:type="dxa"/>
+              <w:left w:w="80" w:type="dxa"/>
+              <w:bottom w:w="30" w:type="dxa"/>
+              <w:right w:w="80" w:type="dxa"/>
+            </w:tcMar>
+          </w:tcPr>
+          <w:p>
+            <w:r>
+              <w:rPr>
+                <w:rFonts w:ascii="Aptos" w:eastAsia="Aptos" w:hAnsi="Aptos" w:cs="Aptos"/>
+                <w:sz w:val="20"/>
+                <w:szCs w:val="20"/>
+              </w:rPr>
+              <w:t xml:space="preserve">Normal</w:t>
+            </w:r>
+          </w:p>
+        </w:tc>
+        <w:tc>
+          <w:tcPr>
+            <w:tcW w:w="2290" w:type="pct"/>
+            <w:tcMar>
+              <w:top w:w="30" w:type="dxa"/>
+              <w:left w:w="80" w:type="dxa"/>
+              <w:bottom w:w="30" w:type="dxa"/>
+              <w:right w:w="80" w:type="dxa"/>
+            </w:tcMar>
+          </w:tcPr>
+          <w:p>
+            <w:r>
+              <w:rPr>
+                <w:rFonts w:ascii="Aptos" w:eastAsia="Aptos" w:hAnsi="Aptos" w:cs="Aptos"/>
+                <w:sz w:val="20"/>
+                <w:szCs w:val="20"/>
+              </w:rPr>
+              <w:t xml:space="preserve">The log shows an entry recording that the clash was refused, so that failed attempts are recorded as well as successful ones.</w:t>
             </w:r>
           </w:p>
         </w:tc>

</xml_diff>

<commit_message>
added test plan: post-prototype objectives
</commit_message>
<xml_diff>
--- a/Testing.docx
+++ b/Testing.docx
@@ -12245,6 +12245,28 @@
           <w:rFonts w:ascii="Aptos" w:eastAsia="Aptos" w:hAnsi="Aptos" w:cs="Aptos"/>
         </w:rPr>
         <w:t xml:space="preserve"/>
+      </w:r>
+    </w:p>
+    <w:p>
+      <w:pPr>
+        <w:pStyle w:val="Heading2"/>
+      </w:pPr>
+      <w:r>
+        <w:rPr>
+          <w:rFonts w:ascii="Aptos Display" w:eastAsia="Aptos Display" w:hAnsi="Aptos Display" w:cs="Aptos Display"/>
+          <w:b/>
+          <w:bCs/>
+          <w:color w:val="000000"/>
+        </w:rPr>
+        <w:t xml:space="preserve">Test Plan: Post-Prototype Objectives</w:t>
+      </w:r>
+    </w:p>
+    <w:p>
+      <w:r>
+        <w:rPr>
+          <w:rFonts w:ascii="Aptos" w:eastAsia="Aptos" w:hAnsi="Aptos" w:cs="Aptos"/>
+        </w:rPr>
+        <w:t xml:space="preserve">The objectives in this part of the plan were all identified after the prototype was finished, either from the feedback sessions, from using the prototype myself, or from faults that only appeared once there was a realistic amount of data in the database. None of this was part of the prototype build, so all of these tests are new. They are ordered so that they build on the data created in the first part of the plan rather than starting again.</w:t>
       </w:r>
     </w:p>
     <w:sectPr>

</xml_diff>

<commit_message>
added objectives 19 and 21: seat types, price multipliers and the price held at the point of sale
</commit_message>
<xml_diff>
--- a/Testing.docx
+++ b/Testing.docx
@@ -12267,6 +12267,874 @@
           <w:rFonts w:ascii="Aptos" w:eastAsia="Aptos" w:hAnsi="Aptos" w:cs="Aptos"/>
         </w:rPr>
         <w:t xml:space="preserve">The objectives in this part of the plan were all identified after the prototype was finished, either from the feedback sessions, from using the prototype myself, or from faults that only appeared once there was a realistic amount of data in the database. None of this was part of the prototype build, so all of these tests are new. They are ordered so that they build on the data created in the first part of the plan rather than starting again.</w:t>
+      </w:r>
+    </w:p>
+    <w:p>
+      <w:pPr>
+        <w:pStyle w:val="Heading3"/>
+      </w:pPr>
+      <w:r>
+        <w:rPr>
+          <w:rFonts w:ascii="Aptos Display" w:eastAsia="Aptos Display" w:hAnsi="Aptos Display" w:cs="Aptos Display"/>
+          <w:b/>
+          <w:bCs/>
+          <w:color w:val="000000"/>
+        </w:rPr>
+        <w:t xml:space="preserve">Objectives 19 and 21: Seat Types, Price Multipliers and the Price Held at the Point of Sale</w:t>
+      </w:r>
+    </w:p>
+    <w:p>
+      <w:r>
+        <w:rPr>
+          <w:rFonts w:ascii="Aptos" w:eastAsia="Aptos" w:hAnsi="Aptos" w:cs="Aptos"/>
+        </w:rPr>
+        <w:t xml:space="preserve">These two objectives are tested together because they are two halves of the same idea. Objective 19 says a premium seat must cost more than a standard one, and objective 21 says the price actually charged must be kept, so that changing a price later cannot rewrite a sale that has already happened. The second is much the more important of the two, because it was a real fault in the prototype. Putting the ticket price up used to silently change what past bookings appeared to have been worth, since the report worked the price out again from the current price rather than reading what was charged at the time.</w:t>
+      </w:r>
+    </w:p>
+    <w:tbl>
+      <w:tblPr>
+        <w:tblW w:w="5000" w:type="pct"/>
+        <w:tblBorders>
+          <w:top w:val="single" w:sz="4" w:space="0" w:color="808080"/>
+          <w:left w:val="single" w:sz="4" w:space="0" w:color="808080"/>
+          <w:bottom w:val="single" w:sz="4" w:space="0" w:color="808080"/>
+          <w:right w:val="single" w:sz="4" w:space="0" w:color="808080"/>
+          <w:insideH w:val="single" w:sz="4" w:space="0" w:color="808080"/>
+          <w:insideV w:val="single" w:sz="4" w:space="0" w:color="808080"/>
+        </w:tblBorders>
+        <w:tblCellMar>
+          <w:left w:w="10" w:type="dxa"/>
+          <w:right w:w="10" w:type="dxa"/>
+        </w:tblCellMar>
+        <w:tblLook w:val="0000" w:firstRow="0" w:lastRow="0" w:firstColumn="0" w:lastColumn="0" w:noHBand="0" w:noVBand="0"/>
+      </w:tblPr>
+      <w:tblGrid>
+        <w:gridCol w:w="561"/>
+        <w:gridCol w:w="3460"/>
+        <w:gridCol w:w="1047"/>
+        <w:gridCol w:w="4282"/>
+      </w:tblGrid>
+      <w:tr>
+        <w:trPr>
+          <w:cantSplit/>
+          <w:tblHeader/>
+        </w:trPr>
+        <w:tc>
+          <w:tcPr>
+            <w:tcW w:w="300" w:type="pct"/>
+            <w:shd w:val="clear" w:color="auto" w:fill="F2CEED" w:themeFill="accent5" w:themeFillTint="33"/>
+            <w:tcMar>
+              <w:top w:w="30" w:type="dxa"/>
+              <w:left w:w="80" w:type="dxa"/>
+              <w:bottom w:w="30" w:type="dxa"/>
+              <w:right w:w="80" w:type="dxa"/>
+            </w:tcMar>
+          </w:tcPr>
+          <w:p>
+            <w:r>
+              <w:rPr>
+                <w:rFonts w:ascii="Aptos" w:eastAsia="Aptos" w:hAnsi="Aptos" w:cs="Aptos"/>
+                <w:b/>
+                <w:bCs/>
+                <w:sz w:val="20"/>
+                <w:szCs w:val="20"/>
+              </w:rPr>
+              <w:t xml:space="preserve">No.</w:t>
+            </w:r>
+          </w:p>
+        </w:tc>
+        <w:tc>
+          <w:tcPr>
+            <w:tcW w:w="1850" w:type="pct"/>
+            <w:shd w:val="clear" w:color="auto" w:fill="F2CEED" w:themeFill="accent5" w:themeFillTint="33"/>
+            <w:tcMar>
+              <w:top w:w="30" w:type="dxa"/>
+              <w:left w:w="80" w:type="dxa"/>
+              <w:bottom w:w="30" w:type="dxa"/>
+              <w:right w:w="80" w:type="dxa"/>
+            </w:tcMar>
+          </w:tcPr>
+          <w:p>
+            <w:r>
+              <w:rPr>
+                <w:rFonts w:ascii="Aptos" w:eastAsia="Aptos" w:hAnsi="Aptos" w:cs="Aptos"/>
+                <w:b/>
+                <w:bCs/>
+                <w:sz w:val="20"/>
+                <w:szCs w:val="20"/>
+              </w:rPr>
+              <w:t xml:space="preserve">Test</w:t>
+            </w:r>
+          </w:p>
+        </w:tc>
+        <w:tc>
+          <w:tcPr>
+            <w:tcW w:w="560" w:type="pct"/>
+            <w:shd w:val="clear" w:color="auto" w:fill="F2CEED" w:themeFill="accent5" w:themeFillTint="33"/>
+            <w:tcMar>
+              <w:top w:w="30" w:type="dxa"/>
+              <w:left w:w="80" w:type="dxa"/>
+              <w:bottom w:w="30" w:type="dxa"/>
+              <w:right w:w="80" w:type="dxa"/>
+            </w:tcMar>
+          </w:tcPr>
+          <w:p>
+            <w:r>
+              <w:rPr>
+                <w:rFonts w:ascii="Aptos" w:eastAsia="Aptos" w:hAnsi="Aptos" w:cs="Aptos"/>
+                <w:b/>
+                <w:bCs/>
+                <w:sz w:val="20"/>
+                <w:szCs w:val="20"/>
+              </w:rPr>
+              <w:t xml:space="preserve">Type</w:t>
+            </w:r>
+          </w:p>
+        </w:tc>
+        <w:tc>
+          <w:tcPr>
+            <w:tcW w:w="2290" w:type="pct"/>
+            <w:shd w:val="clear" w:color="auto" w:fill="F2CEED" w:themeFill="accent5" w:themeFillTint="33"/>
+            <w:tcMar>
+              <w:top w:w="30" w:type="dxa"/>
+              <w:left w:w="80" w:type="dxa"/>
+              <w:bottom w:w="30" w:type="dxa"/>
+              <w:right w:w="80" w:type="dxa"/>
+            </w:tcMar>
+          </w:tcPr>
+          <w:p>
+            <w:r>
+              <w:rPr>
+                <w:rFonts w:ascii="Aptos" w:eastAsia="Aptos" w:hAnsi="Aptos" w:cs="Aptos"/>
+                <w:b/>
+                <w:bCs/>
+                <w:sz w:val="20"/>
+                <w:szCs w:val="20"/>
+              </w:rPr>
+              <w:t xml:space="preserve">Expected Result</w:t>
+            </w:r>
+          </w:p>
+        </w:tc>
+      </w:tr>
+      <w:tr>
+        <w:trPr>
+          <w:cantSplit/>
+        </w:trPr>
+        <w:tc>
+          <w:tcPr>
+            <w:tcW w:w="300" w:type="pct"/>
+            <w:tcMar>
+              <w:top w:w="30" w:type="dxa"/>
+              <w:left w:w="80" w:type="dxa"/>
+              <w:bottom w:w="30" w:type="dxa"/>
+              <w:right w:w="80" w:type="dxa"/>
+            </w:tcMar>
+          </w:tcPr>
+          <w:p>
+            <w:r>
+              <w:rPr>
+                <w:rFonts w:ascii="Aptos" w:eastAsia="Aptos" w:hAnsi="Aptos" w:cs="Aptos"/>
+                <w:sz w:val="20"/>
+                <w:szCs w:val="20"/>
+              </w:rPr>
+              <w:t xml:space="preserve">112</w:t>
+            </w:r>
+          </w:p>
+        </w:tc>
+        <w:tc>
+          <w:tcPr>
+            <w:tcW w:w="1850" w:type="pct"/>
+            <w:tcMar>
+              <w:top w:w="30" w:type="dxa"/>
+              <w:left w:w="80" w:type="dxa"/>
+              <w:bottom w:w="30" w:type="dxa"/>
+              <w:right w:w="80" w:type="dxa"/>
+            </w:tcMar>
+          </w:tcPr>
+          <w:p>
+            <w:r>
+              <w:rPr>
+                <w:rFonts w:ascii="Aptos" w:eastAsia="Aptos" w:hAnsi="Aptos" w:cs="Aptos"/>
+                <w:sz w:val="20"/>
+                <w:szCs w:val="20"/>
+              </w:rPr>
+              <w:t xml:space="preserve">Look at tblSeatType</w:t>
+            </w:r>
+          </w:p>
+        </w:tc>
+        <w:tc>
+          <w:tcPr>
+            <w:tcW w:w="560" w:type="pct"/>
+            <w:tcMar>
+              <w:top w:w="30" w:type="dxa"/>
+              <w:left w:w="80" w:type="dxa"/>
+              <w:bottom w:w="30" w:type="dxa"/>
+              <w:right w:w="80" w:type="dxa"/>
+            </w:tcMar>
+          </w:tcPr>
+          <w:p>
+            <w:r>
+              <w:rPr>
+                <w:rFonts w:ascii="Aptos" w:eastAsia="Aptos" w:hAnsi="Aptos" w:cs="Aptos"/>
+                <w:sz w:val="20"/>
+                <w:szCs w:val="20"/>
+              </w:rPr>
+              <w:t xml:space="preserve">Normal</w:t>
+            </w:r>
+          </w:p>
+        </w:tc>
+        <w:tc>
+          <w:tcPr>
+            <w:tcW w:w="2290" w:type="pct"/>
+            <w:tcMar>
+              <w:top w:w="30" w:type="dxa"/>
+              <w:left w:w="80" w:type="dxa"/>
+              <w:bottom w:w="30" w:type="dxa"/>
+              <w:right w:w="80" w:type="dxa"/>
+            </w:tcMar>
+          </w:tcPr>
+          <w:p>
+            <w:r>
+              <w:rPr>
+                <w:rFonts w:ascii="Aptos" w:eastAsia="Aptos" w:hAnsi="Aptos" w:cs="Aptos"/>
+                <w:sz w:val="20"/>
+                <w:szCs w:val="20"/>
+              </w:rPr>
+              <w:t xml:space="preserve">There are four seat types, Standard at 1.0, Premium at 1.5, Accessible at 1.0 and Saver at 0.8, so the price rule is held as data in the database rather than being written into the program.</w:t>
+            </w:r>
+          </w:p>
+        </w:tc>
+      </w:tr>
+      <w:tr>
+        <w:trPr>
+          <w:cantSplit/>
+        </w:trPr>
+        <w:tc>
+          <w:tcPr>
+            <w:tcW w:w="300" w:type="pct"/>
+            <w:tcMar>
+              <w:top w:w="30" w:type="dxa"/>
+              <w:left w:w="80" w:type="dxa"/>
+              <w:bottom w:w="30" w:type="dxa"/>
+              <w:right w:w="80" w:type="dxa"/>
+            </w:tcMar>
+          </w:tcPr>
+          <w:p>
+            <w:r>
+              <w:rPr>
+                <w:rFonts w:ascii="Aptos" w:eastAsia="Aptos" w:hAnsi="Aptos" w:cs="Aptos"/>
+                <w:sz w:val="20"/>
+                <w:szCs w:val="20"/>
+              </w:rPr>
+              <w:t xml:space="preserve">113</w:t>
+            </w:r>
+          </w:p>
+        </w:tc>
+        <w:tc>
+          <w:tcPr>
+            <w:tcW w:w="1850" w:type="pct"/>
+            <w:tcMar>
+              <w:top w:w="30" w:type="dxa"/>
+              <w:left w:w="80" w:type="dxa"/>
+              <w:bottom w:w="30" w:type="dxa"/>
+              <w:right w:w="80" w:type="dxa"/>
+            </w:tcMar>
+          </w:tcPr>
+          <w:p>
+            <w:r>
+              <w:rPr>
+                <w:rFonts w:ascii="Aptos" w:eastAsia="Aptos" w:hAnsi="Aptos" w:cs="Aptos"/>
+                <w:sz w:val="20"/>
+                <w:szCs w:val="20"/>
+              </w:rPr>
+              <w:t xml:space="preserve">On the Inception screening, which has a ticket price of £9.00, select seat B1 and look at the price shown</w:t>
+            </w:r>
+          </w:p>
+        </w:tc>
+        <w:tc>
+          <w:tcPr>
+            <w:tcW w:w="560" w:type="pct"/>
+            <w:tcMar>
+              <w:top w:w="30" w:type="dxa"/>
+              <w:left w:w="80" w:type="dxa"/>
+              <w:bottom w:w="30" w:type="dxa"/>
+              <w:right w:w="80" w:type="dxa"/>
+            </w:tcMar>
+          </w:tcPr>
+          <w:p>
+            <w:r>
+              <w:rPr>
+                <w:rFonts w:ascii="Aptos" w:eastAsia="Aptos" w:hAnsi="Aptos" w:cs="Aptos"/>
+                <w:sz w:val="20"/>
+                <w:szCs w:val="20"/>
+              </w:rPr>
+              <w:t xml:space="preserve">Normal</w:t>
+            </w:r>
+          </w:p>
+        </w:tc>
+        <w:tc>
+          <w:tcPr>
+            <w:tcW w:w="2290" w:type="pct"/>
+            <w:tcMar>
+              <w:top w:w="30" w:type="dxa"/>
+              <w:left w:w="80" w:type="dxa"/>
+              <w:bottom w:w="30" w:type="dxa"/>
+              <w:right w:w="80" w:type="dxa"/>
+            </w:tcMar>
+          </w:tcPr>
+          <w:p>
+            <w:r>
+              <w:rPr>
+                <w:rFonts w:ascii="Aptos" w:eastAsia="Aptos" w:hAnsi="Aptos" w:cs="Aptos"/>
+                <w:sz w:val="20"/>
+                <w:szCs w:val="20"/>
+              </w:rPr>
+              <w:t xml:space="preserve">The seat is priced at £9.00, because B1 is Standard and 9.00 multiplied by 1.0 is 9.00.</w:t>
+            </w:r>
+          </w:p>
+        </w:tc>
+      </w:tr>
+      <w:tr>
+        <w:trPr>
+          <w:cantSplit/>
+        </w:trPr>
+        <w:tc>
+          <w:tcPr>
+            <w:tcW w:w="300" w:type="pct"/>
+            <w:tcMar>
+              <w:top w:w="30" w:type="dxa"/>
+              <w:left w:w="80" w:type="dxa"/>
+              <w:bottom w:w="30" w:type="dxa"/>
+              <w:right w:w="80" w:type="dxa"/>
+            </w:tcMar>
+          </w:tcPr>
+          <w:p>
+            <w:r>
+              <w:rPr>
+                <w:rFonts w:ascii="Aptos" w:eastAsia="Aptos" w:hAnsi="Aptos" w:cs="Aptos"/>
+                <w:sz w:val="20"/>
+                <w:szCs w:val="20"/>
+              </w:rPr>
+              <w:t xml:space="preserve">114</w:t>
+            </w:r>
+          </w:p>
+        </w:tc>
+        <w:tc>
+          <w:tcPr>
+            <w:tcW w:w="1850" w:type="pct"/>
+            <w:tcMar>
+              <w:top w:w="30" w:type="dxa"/>
+              <w:left w:w="80" w:type="dxa"/>
+              <w:bottom w:w="30" w:type="dxa"/>
+              <w:right w:w="80" w:type="dxa"/>
+            </w:tcMar>
+          </w:tcPr>
+          <w:p>
+            <w:r>
+              <w:rPr>
+                <w:rFonts w:ascii="Aptos" w:eastAsia="Aptos" w:hAnsi="Aptos" w:cs="Aptos"/>
+                <w:sz w:val="20"/>
+                <w:szCs w:val="20"/>
+              </w:rPr>
+              <w:t xml:space="preserve">On the same screening select seat D1 and look at the price shown</w:t>
+            </w:r>
+          </w:p>
+        </w:tc>
+        <w:tc>
+          <w:tcPr>
+            <w:tcW w:w="560" w:type="pct"/>
+            <w:tcMar>
+              <w:top w:w="30" w:type="dxa"/>
+              <w:left w:w="80" w:type="dxa"/>
+              <w:bottom w:w="30" w:type="dxa"/>
+              <w:right w:w="80" w:type="dxa"/>
+            </w:tcMar>
+          </w:tcPr>
+          <w:p>
+            <w:r>
+              <w:rPr>
+                <w:rFonts w:ascii="Aptos" w:eastAsia="Aptos" w:hAnsi="Aptos" w:cs="Aptos"/>
+                <w:sz w:val="20"/>
+                <w:szCs w:val="20"/>
+              </w:rPr>
+              <w:t xml:space="preserve">Normal</w:t>
+            </w:r>
+          </w:p>
+        </w:tc>
+        <w:tc>
+          <w:tcPr>
+            <w:tcW w:w="2290" w:type="pct"/>
+            <w:tcMar>
+              <w:top w:w="30" w:type="dxa"/>
+              <w:left w:w="80" w:type="dxa"/>
+              <w:bottom w:w="30" w:type="dxa"/>
+              <w:right w:w="80" w:type="dxa"/>
+            </w:tcMar>
+          </w:tcPr>
+          <w:p>
+            <w:r>
+              <w:rPr>
+                <w:rFonts w:ascii="Aptos" w:eastAsia="Aptos" w:hAnsi="Aptos" w:cs="Aptos"/>
+                <w:sz w:val="20"/>
+                <w:szCs w:val="20"/>
+              </w:rPr>
+              <w:t xml:space="preserve">The seat is priced at £13.50, because D1 is Premium and 9.00 multiplied by 1.5 is 13.50, which is more than a standard seat as the objective requires.</w:t>
+            </w:r>
+          </w:p>
+        </w:tc>
+      </w:tr>
+      <w:tr>
+        <w:trPr>
+          <w:cantSplit/>
+        </w:trPr>
+        <w:tc>
+          <w:tcPr>
+            <w:tcW w:w="300" w:type="pct"/>
+            <w:tcMar>
+              <w:top w:w="30" w:type="dxa"/>
+              <w:left w:w="80" w:type="dxa"/>
+              <w:bottom w:w="30" w:type="dxa"/>
+              <w:right w:w="80" w:type="dxa"/>
+            </w:tcMar>
+          </w:tcPr>
+          <w:p>
+            <w:r>
+              <w:rPr>
+                <w:rFonts w:ascii="Aptos" w:eastAsia="Aptos" w:hAnsi="Aptos" w:cs="Aptos"/>
+                <w:sz w:val="20"/>
+                <w:szCs w:val="20"/>
+              </w:rPr>
+              <w:t xml:space="preserve">115</w:t>
+            </w:r>
+          </w:p>
+        </w:tc>
+        <w:tc>
+          <w:tcPr>
+            <w:tcW w:w="1850" w:type="pct"/>
+            <w:tcMar>
+              <w:top w:w="30" w:type="dxa"/>
+              <w:left w:w="80" w:type="dxa"/>
+              <w:bottom w:w="30" w:type="dxa"/>
+              <w:right w:w="80" w:type="dxa"/>
+            </w:tcMar>
+          </w:tcPr>
+          <w:p>
+            <w:r>
+              <w:rPr>
+                <w:rFonts w:ascii="Aptos" w:eastAsia="Aptos" w:hAnsi="Aptos" w:cs="Aptos"/>
+                <w:sz w:val="20"/>
+                <w:szCs w:val="20"/>
+              </w:rPr>
+              <w:t xml:space="preserve">On the same screening select seat A1 and look at the price shown</w:t>
+            </w:r>
+          </w:p>
+        </w:tc>
+        <w:tc>
+          <w:tcPr>
+            <w:tcW w:w="560" w:type="pct"/>
+            <w:tcMar>
+              <w:top w:w="30" w:type="dxa"/>
+              <w:left w:w="80" w:type="dxa"/>
+              <w:bottom w:w="30" w:type="dxa"/>
+              <w:right w:w="80" w:type="dxa"/>
+            </w:tcMar>
+          </w:tcPr>
+          <w:p>
+            <w:r>
+              <w:rPr>
+                <w:rFonts w:ascii="Aptos" w:eastAsia="Aptos" w:hAnsi="Aptos" w:cs="Aptos"/>
+                <w:sz w:val="20"/>
+                <w:szCs w:val="20"/>
+              </w:rPr>
+              <w:t xml:space="preserve">Normal</w:t>
+            </w:r>
+          </w:p>
+        </w:tc>
+        <w:tc>
+          <w:tcPr>
+            <w:tcW w:w="2290" w:type="pct"/>
+            <w:tcMar>
+              <w:top w:w="30" w:type="dxa"/>
+              <w:left w:w="80" w:type="dxa"/>
+              <w:bottom w:w="30" w:type="dxa"/>
+              <w:right w:w="80" w:type="dxa"/>
+            </w:tcMar>
+          </w:tcPr>
+          <w:p>
+            <w:r>
+              <w:rPr>
+                <w:rFonts w:ascii="Aptos" w:eastAsia="Aptos" w:hAnsi="Aptos" w:cs="Aptos"/>
+                <w:sz w:val="20"/>
+                <w:szCs w:val="20"/>
+              </w:rPr>
+              <w:t xml:space="preserve">The seat is priced at £7.20, because A1 is Saver and 9.00 multiplied by 0.8 is 7.20.</w:t>
+            </w:r>
+          </w:p>
+        </w:tc>
+      </w:tr>
+      <w:tr>
+        <w:trPr>
+          <w:cantSplit/>
+        </w:trPr>
+        <w:tc>
+          <w:tcPr>
+            <w:tcW w:w="300" w:type="pct"/>
+            <w:tcMar>
+              <w:top w:w="30" w:type="dxa"/>
+              <w:left w:w="80" w:type="dxa"/>
+              <w:bottom w:w="30" w:type="dxa"/>
+              <w:right w:w="80" w:type="dxa"/>
+            </w:tcMar>
+          </w:tcPr>
+          <w:p>
+            <w:r>
+              <w:rPr>
+                <w:rFonts w:ascii="Aptos" w:eastAsia="Aptos" w:hAnsi="Aptos" w:cs="Aptos"/>
+                <w:sz w:val="20"/>
+                <w:szCs w:val="20"/>
+              </w:rPr>
+              <w:t xml:space="preserve">116</w:t>
+            </w:r>
+          </w:p>
+        </w:tc>
+        <w:tc>
+          <w:tcPr>
+            <w:tcW w:w="1850" w:type="pct"/>
+            <w:tcMar>
+              <w:top w:w="30" w:type="dxa"/>
+              <w:left w:w="80" w:type="dxa"/>
+              <w:bottom w:w="30" w:type="dxa"/>
+              <w:right w:w="80" w:type="dxa"/>
+            </w:tcMar>
+          </w:tcPr>
+          <w:p>
+            <w:r>
+              <w:rPr>
+                <w:rFonts w:ascii="Aptos" w:eastAsia="Aptos" w:hAnsi="Aptos" w:cs="Aptos"/>
+                <w:sz w:val="20"/>
+                <w:szCs w:val="20"/>
+              </w:rPr>
+              <w:t xml:space="preserve">Select seats A2, B3 and D3 together on the Inception screening and look at the running total</w:t>
+            </w:r>
+          </w:p>
+        </w:tc>
+        <w:tc>
+          <w:tcPr>
+            <w:tcW w:w="560" w:type="pct"/>
+            <w:tcMar>
+              <w:top w:w="30" w:type="dxa"/>
+              <w:left w:w="80" w:type="dxa"/>
+              <w:bottom w:w="30" w:type="dxa"/>
+              <w:right w:w="80" w:type="dxa"/>
+            </w:tcMar>
+          </w:tcPr>
+          <w:p>
+            <w:r>
+              <w:rPr>
+                <w:rFonts w:ascii="Aptos" w:eastAsia="Aptos" w:hAnsi="Aptos" w:cs="Aptos"/>
+                <w:sz w:val="20"/>
+                <w:szCs w:val="20"/>
+              </w:rPr>
+              <w:t xml:space="preserve">Normal</w:t>
+            </w:r>
+          </w:p>
+        </w:tc>
+        <w:tc>
+          <w:tcPr>
+            <w:tcW w:w="2290" w:type="pct"/>
+            <w:tcMar>
+              <w:top w:w="30" w:type="dxa"/>
+              <w:left w:w="80" w:type="dxa"/>
+              <w:bottom w:w="30" w:type="dxa"/>
+              <w:right w:w="80" w:type="dxa"/>
+            </w:tcMar>
+          </w:tcPr>
+          <w:p>
+            <w:r>
+              <w:rPr>
+                <w:rFonts w:ascii="Aptos" w:eastAsia="Aptos" w:hAnsi="Aptos" w:cs="Aptos"/>
+                <w:sz w:val="20"/>
+                <w:szCs w:val="20"/>
+              </w:rPr>
+              <w:t xml:space="preserve">The total shows £29.70, which is £7.20 plus £9.00 plus £13.50, so a single sale can mix seats at three different prices.</w:t>
+            </w:r>
+          </w:p>
+        </w:tc>
+      </w:tr>
+      <w:tr>
+        <w:trPr>
+          <w:cantSplit/>
+        </w:trPr>
+        <w:tc>
+          <w:tcPr>
+            <w:tcW w:w="300" w:type="pct"/>
+            <w:tcMar>
+              <w:top w:w="30" w:type="dxa"/>
+              <w:left w:w="80" w:type="dxa"/>
+              <w:bottom w:w="30" w:type="dxa"/>
+              <w:right w:w="80" w:type="dxa"/>
+            </w:tcMar>
+          </w:tcPr>
+          <w:p>
+            <w:r>
+              <w:rPr>
+                <w:rFonts w:ascii="Aptos" w:eastAsia="Aptos" w:hAnsi="Aptos" w:cs="Aptos"/>
+                <w:sz w:val="20"/>
+                <w:szCs w:val="20"/>
+              </w:rPr>
+              <w:t xml:space="preserve">117</w:t>
+            </w:r>
+          </w:p>
+        </w:tc>
+        <w:tc>
+          <w:tcPr>
+            <w:tcW w:w="1850" w:type="pct"/>
+            <w:tcMar>
+              <w:top w:w="30" w:type="dxa"/>
+              <w:left w:w="80" w:type="dxa"/>
+              <w:bottom w:w="30" w:type="dxa"/>
+              <w:right w:w="80" w:type="dxa"/>
+            </w:tcMar>
+          </w:tcPr>
+          <w:p>
+            <w:r>
+              <w:rPr>
+                <w:rFonts w:ascii="Aptos" w:eastAsia="Aptos" w:hAnsi="Aptos" w:cs="Aptos"/>
+                <w:sz w:val="20"/>
+                <w:szCs w:val="20"/>
+              </w:rPr>
+              <w:t xml:space="preserve">Complete that sale and look at the three rows written to tblBookingSeat</w:t>
+            </w:r>
+          </w:p>
+        </w:tc>
+        <w:tc>
+          <w:tcPr>
+            <w:tcW w:w="560" w:type="pct"/>
+            <w:tcMar>
+              <w:top w:w="30" w:type="dxa"/>
+              <w:left w:w="80" w:type="dxa"/>
+              <w:bottom w:w="30" w:type="dxa"/>
+              <w:right w:w="80" w:type="dxa"/>
+            </w:tcMar>
+          </w:tcPr>
+          <w:p>
+            <w:r>
+              <w:rPr>
+                <w:rFonts w:ascii="Aptos" w:eastAsia="Aptos" w:hAnsi="Aptos" w:cs="Aptos"/>
+                <w:sz w:val="20"/>
+                <w:szCs w:val="20"/>
+              </w:rPr>
+              <w:t xml:space="preserve">Normal</w:t>
+            </w:r>
+          </w:p>
+        </w:tc>
+        <w:tc>
+          <w:tcPr>
+            <w:tcW w:w="2290" w:type="pct"/>
+            <w:tcMar>
+              <w:top w:w="30" w:type="dxa"/>
+              <w:left w:w="80" w:type="dxa"/>
+              <w:bottom w:w="30" w:type="dxa"/>
+              <w:right w:w="80" w:type="dxa"/>
+            </w:tcMar>
+          </w:tcPr>
+          <w:p>
+            <w:r>
+              <w:rPr>
+                <w:rFonts w:ascii="Aptos" w:eastAsia="Aptos" w:hAnsi="Aptos" w:cs="Aptos"/>
+                <w:sz w:val="20"/>
+                <w:szCs w:val="20"/>
+              </w:rPr>
+              <w:t xml:space="preserve">The three rows carry a SeatPricePaid of £7.20, £9.00 and £13.50 respectively, so what each individual ticket was charged is stored against that ticket rather than being worked out again later.</w:t>
+            </w:r>
+          </w:p>
+        </w:tc>
+      </w:tr>
+      <w:tr>
+        <w:trPr>
+          <w:cantSplit/>
+        </w:trPr>
+        <w:tc>
+          <w:tcPr>
+            <w:tcW w:w="300" w:type="pct"/>
+            <w:tcMar>
+              <w:top w:w="30" w:type="dxa"/>
+              <w:left w:w="80" w:type="dxa"/>
+              <w:bottom w:w="30" w:type="dxa"/>
+              <w:right w:w="80" w:type="dxa"/>
+            </w:tcMar>
+          </w:tcPr>
+          <w:p>
+            <w:r>
+              <w:rPr>
+                <w:rFonts w:ascii="Aptos" w:eastAsia="Aptos" w:hAnsi="Aptos" w:cs="Aptos"/>
+                <w:sz w:val="20"/>
+                <w:szCs w:val="20"/>
+              </w:rPr>
+              <w:t xml:space="preserve">118</w:t>
+            </w:r>
+          </w:p>
+        </w:tc>
+        <w:tc>
+          <w:tcPr>
+            <w:tcW w:w="1850" w:type="pct"/>
+            <w:tcMar>
+              <w:top w:w="30" w:type="dxa"/>
+              <w:left w:w="80" w:type="dxa"/>
+              <w:bottom w:w="30" w:type="dxa"/>
+              <w:right w:w="80" w:type="dxa"/>
+            </w:tcMar>
+          </w:tcPr>
+          <w:p>
+            <w:r>
+              <w:rPr>
+                <w:rFonts w:ascii="Aptos" w:eastAsia="Aptos" w:hAnsi="Aptos" w:cs="Aptos"/>
+                <w:sz w:val="20"/>
+                <w:szCs w:val="20"/>
+              </w:rPr>
+              <w:t xml:space="preserve">Change the ticket price of the Inception screening from £9.00 to £12.00, then look at that booking again and re-run the sales report</w:t>
+            </w:r>
+          </w:p>
+        </w:tc>
+        <w:tc>
+          <w:tcPr>
+            <w:tcW w:w="560" w:type="pct"/>
+            <w:tcMar>
+              <w:top w:w="30" w:type="dxa"/>
+              <w:left w:w="80" w:type="dxa"/>
+              <w:bottom w:w="30" w:type="dxa"/>
+              <w:right w:w="80" w:type="dxa"/>
+            </w:tcMar>
+          </w:tcPr>
+          <w:p>
+            <w:r>
+              <w:rPr>
+                <w:rFonts w:ascii="Aptos" w:eastAsia="Aptos" w:hAnsi="Aptos" w:cs="Aptos"/>
+                <w:sz w:val="20"/>
+                <w:szCs w:val="20"/>
+              </w:rPr>
+              <w:t xml:space="preserve">Normal</w:t>
+            </w:r>
+          </w:p>
+        </w:tc>
+        <w:tc>
+          <w:tcPr>
+            <w:tcW w:w="2290" w:type="pct"/>
+            <w:tcMar>
+              <w:top w:w="30" w:type="dxa"/>
+              <w:left w:w="80" w:type="dxa"/>
+              <w:bottom w:w="30" w:type="dxa"/>
+              <w:right w:w="80" w:type="dxa"/>
+            </w:tcMar>
+          </w:tcPr>
+          <w:p>
+            <w:r>
+              <w:rPr>
+                <w:rFonts w:ascii="Aptos" w:eastAsia="Aptos" w:hAnsi="Aptos" w:cs="Aptos"/>
+                <w:sz w:val="20"/>
+                <w:szCs w:val="20"/>
+              </w:rPr>
+              <w:t xml:space="preserve">The booking is still worth £29.70 and the report still counts it as £29.70, because the price is read from what was stored at the point of sale. The price is then set back to £9.00 and the booking is refunded so that the figures in the test data still hold.</w:t>
+            </w:r>
+          </w:p>
+        </w:tc>
+      </w:tr>
+      <w:tr>
+        <w:trPr>
+          <w:cantSplit/>
+        </w:trPr>
+        <w:tc>
+          <w:tcPr>
+            <w:tcW w:w="300" w:type="pct"/>
+            <w:tcMar>
+              <w:top w:w="30" w:type="dxa"/>
+              <w:left w:w="80" w:type="dxa"/>
+              <w:bottom w:w="30" w:type="dxa"/>
+              <w:right w:w="80" w:type="dxa"/>
+            </w:tcMar>
+          </w:tcPr>
+          <w:p>
+            <w:r>
+              <w:rPr>
+                <w:rFonts w:ascii="Aptos" w:eastAsia="Aptos" w:hAnsi="Aptos" w:cs="Aptos"/>
+                <w:sz w:val="20"/>
+                <w:szCs w:val="20"/>
+              </w:rPr>
+              <w:t xml:space="preserve">119</w:t>
+            </w:r>
+          </w:p>
+        </w:tc>
+        <w:tc>
+          <w:tcPr>
+            <w:tcW w:w="1850" w:type="pct"/>
+            <w:tcMar>
+              <w:top w:w="30" w:type="dxa"/>
+              <w:left w:w="80" w:type="dxa"/>
+              <w:bottom w:w="30" w:type="dxa"/>
+              <w:right w:w="80" w:type="dxa"/>
+            </w:tcMar>
+          </w:tcPr>
+          <w:p>
+            <w:r>
+              <w:rPr>
+                <w:rFonts w:ascii="Aptos" w:eastAsia="Aptos" w:hAnsi="Aptos" w:cs="Aptos"/>
+                <w:sz w:val="20"/>
+                <w:szCs w:val="20"/>
+              </w:rPr>
+              <w:t xml:space="preserve">With the ticket price back at £9.00, sell a new Standard seat and check its price</w:t>
+            </w:r>
+          </w:p>
+        </w:tc>
+        <w:tc>
+          <w:tcPr>
+            <w:tcW w:w="560" w:type="pct"/>
+            <w:tcMar>
+              <w:top w:w="30" w:type="dxa"/>
+              <w:left w:w="80" w:type="dxa"/>
+              <w:bottom w:w="30" w:type="dxa"/>
+              <w:right w:w="80" w:type="dxa"/>
+            </w:tcMar>
+          </w:tcPr>
+          <w:p>
+            <w:r>
+              <w:rPr>
+                <w:rFonts w:ascii="Aptos" w:eastAsia="Aptos" w:hAnsi="Aptos" w:cs="Aptos"/>
+                <w:sz w:val="20"/>
+                <w:szCs w:val="20"/>
+              </w:rPr>
+              <w:t xml:space="preserve">Normal</w:t>
+            </w:r>
+          </w:p>
+        </w:tc>
+        <w:tc>
+          <w:tcPr>
+            <w:tcW w:w="2290" w:type="pct"/>
+            <w:tcMar>
+              <w:top w:w="30" w:type="dxa"/>
+              <w:left w:w="80" w:type="dxa"/>
+              <w:bottom w:w="30" w:type="dxa"/>
+              <w:right w:w="80" w:type="dxa"/>
+            </w:tcMar>
+          </w:tcPr>
+          <w:p>
+            <w:r>
+              <w:rPr>
+                <w:rFonts w:ascii="Aptos" w:eastAsia="Aptos" w:hAnsi="Aptos" w:cs="Aptos"/>
+                <w:sz w:val="20"/>
+                <w:szCs w:val="20"/>
+              </w:rPr>
+              <w:t xml:space="preserve">The new seat is charged at £9.00, showing that a price change does apply to sales made after it, and only to those.</w:t>
+            </w:r>
+          </w:p>
+        </w:tc>
+      </w:tr>
+    </w:tbl>
+    <w:p>
+      <w:r>
+        <w:rPr>
+          <w:rFonts w:ascii="Aptos" w:eastAsia="Aptos" w:hAnsi="Aptos" w:cs="Aptos"/>
+        </w:rPr>
+        <w:t xml:space="preserve"/>
       </w:r>
     </w:p>
     <w:sectPr>

</xml_diff>

<commit_message>
added objective 23: selling food and drink on its own
</commit_message>
<xml_diff>
--- a/Testing.docx
+++ b/Testing.docx
@@ -13124,6 +13124,518 @@
                 <w:szCs w:val="20"/>
               </w:rPr>
               <w:t xml:space="preserve">The new seat is charged at £9.00, showing that a price change does apply to sales made after it, and only to those.</w:t>
+            </w:r>
+          </w:p>
+        </w:tc>
+      </w:tr>
+    </w:tbl>
+    <w:p>
+      <w:r>
+        <w:rPr>
+          <w:rFonts w:ascii="Aptos" w:eastAsia="Aptos" w:hAnsi="Aptos" w:cs="Aptos"/>
+        </w:rPr>
+        <w:t xml:space="preserve"/>
+      </w:r>
+    </w:p>
+    <w:p>
+      <w:pPr>
+        <w:pStyle w:val="Heading3"/>
+      </w:pPr>
+      <w:r>
+        <w:rPr>
+          <w:rFonts w:ascii="Aptos Display" w:eastAsia="Aptos Display" w:hAnsi="Aptos Display" w:cs="Aptos Display"/>
+          <w:b/>
+          <w:bCs/>
+          <w:color w:val="000000"/>
+        </w:rPr>
+        <w:t xml:space="preserve">Objective 23: Selling Food and Drink on Its Own</w:t>
+      </w:r>
+    </w:p>
+    <w:p>
+      <w:r>
+        <w:rPr>
+          <w:rFonts w:ascii="Aptos" w:eastAsia="Aptos" w:hAnsi="Aptos" w:cs="Aptos"/>
+        </w:rPr>
+        <w:t xml:space="preserve">A customer buying only a drink should not have to be attached to a screening. These tests check that a sale can be completed with food on it and no screening and no seats at all, which the prototype could not do.</w:t>
+      </w:r>
+    </w:p>
+    <w:tbl>
+      <w:tblPr>
+        <w:tblW w:w="5000" w:type="pct"/>
+        <w:tblBorders>
+          <w:top w:val="single" w:sz="4" w:space="0" w:color="808080"/>
+          <w:left w:val="single" w:sz="4" w:space="0" w:color="808080"/>
+          <w:bottom w:val="single" w:sz="4" w:space="0" w:color="808080"/>
+          <w:right w:val="single" w:sz="4" w:space="0" w:color="808080"/>
+          <w:insideH w:val="single" w:sz="4" w:space="0" w:color="808080"/>
+          <w:insideV w:val="single" w:sz="4" w:space="0" w:color="808080"/>
+        </w:tblBorders>
+        <w:tblCellMar>
+          <w:left w:w="10" w:type="dxa"/>
+          <w:right w:w="10" w:type="dxa"/>
+        </w:tblCellMar>
+        <w:tblLook w:val="0000" w:firstRow="0" w:lastRow="0" w:firstColumn="0" w:lastColumn="0" w:noHBand="0" w:noVBand="0"/>
+      </w:tblPr>
+      <w:tblGrid>
+        <w:gridCol w:w="561"/>
+        <w:gridCol w:w="3460"/>
+        <w:gridCol w:w="1047"/>
+        <w:gridCol w:w="4282"/>
+      </w:tblGrid>
+      <w:tr>
+        <w:trPr>
+          <w:cantSplit/>
+          <w:tblHeader/>
+        </w:trPr>
+        <w:tc>
+          <w:tcPr>
+            <w:tcW w:w="300" w:type="pct"/>
+            <w:shd w:val="clear" w:color="auto" w:fill="F2CEED" w:themeFill="accent5" w:themeFillTint="33"/>
+            <w:tcMar>
+              <w:top w:w="30" w:type="dxa"/>
+              <w:left w:w="80" w:type="dxa"/>
+              <w:bottom w:w="30" w:type="dxa"/>
+              <w:right w:w="80" w:type="dxa"/>
+            </w:tcMar>
+          </w:tcPr>
+          <w:p>
+            <w:r>
+              <w:rPr>
+                <w:rFonts w:ascii="Aptos" w:eastAsia="Aptos" w:hAnsi="Aptos" w:cs="Aptos"/>
+                <w:b/>
+                <w:bCs/>
+                <w:sz w:val="20"/>
+                <w:szCs w:val="20"/>
+              </w:rPr>
+              <w:t xml:space="preserve">No.</w:t>
+            </w:r>
+          </w:p>
+        </w:tc>
+        <w:tc>
+          <w:tcPr>
+            <w:tcW w:w="1850" w:type="pct"/>
+            <w:shd w:val="clear" w:color="auto" w:fill="F2CEED" w:themeFill="accent5" w:themeFillTint="33"/>
+            <w:tcMar>
+              <w:top w:w="30" w:type="dxa"/>
+              <w:left w:w="80" w:type="dxa"/>
+              <w:bottom w:w="30" w:type="dxa"/>
+              <w:right w:w="80" w:type="dxa"/>
+            </w:tcMar>
+          </w:tcPr>
+          <w:p>
+            <w:r>
+              <w:rPr>
+                <w:rFonts w:ascii="Aptos" w:eastAsia="Aptos" w:hAnsi="Aptos" w:cs="Aptos"/>
+                <w:b/>
+                <w:bCs/>
+                <w:sz w:val="20"/>
+                <w:szCs w:val="20"/>
+              </w:rPr>
+              <w:t xml:space="preserve">Test</w:t>
+            </w:r>
+          </w:p>
+        </w:tc>
+        <w:tc>
+          <w:tcPr>
+            <w:tcW w:w="560" w:type="pct"/>
+            <w:shd w:val="clear" w:color="auto" w:fill="F2CEED" w:themeFill="accent5" w:themeFillTint="33"/>
+            <w:tcMar>
+              <w:top w:w="30" w:type="dxa"/>
+              <w:left w:w="80" w:type="dxa"/>
+              <w:bottom w:w="30" w:type="dxa"/>
+              <w:right w:w="80" w:type="dxa"/>
+            </w:tcMar>
+          </w:tcPr>
+          <w:p>
+            <w:r>
+              <w:rPr>
+                <w:rFonts w:ascii="Aptos" w:eastAsia="Aptos" w:hAnsi="Aptos" w:cs="Aptos"/>
+                <w:b/>
+                <w:bCs/>
+                <w:sz w:val="20"/>
+                <w:szCs w:val="20"/>
+              </w:rPr>
+              <w:t xml:space="preserve">Type</w:t>
+            </w:r>
+          </w:p>
+        </w:tc>
+        <w:tc>
+          <w:tcPr>
+            <w:tcW w:w="2290" w:type="pct"/>
+            <w:shd w:val="clear" w:color="auto" w:fill="F2CEED" w:themeFill="accent5" w:themeFillTint="33"/>
+            <w:tcMar>
+              <w:top w:w="30" w:type="dxa"/>
+              <w:left w:w="80" w:type="dxa"/>
+              <w:bottom w:w="30" w:type="dxa"/>
+              <w:right w:w="80" w:type="dxa"/>
+            </w:tcMar>
+          </w:tcPr>
+          <w:p>
+            <w:r>
+              <w:rPr>
+                <w:rFonts w:ascii="Aptos" w:eastAsia="Aptos" w:hAnsi="Aptos" w:cs="Aptos"/>
+                <w:b/>
+                <w:bCs/>
+                <w:sz w:val="20"/>
+                <w:szCs w:val="20"/>
+              </w:rPr>
+              <w:t xml:space="preserve">Expected Result</w:t>
+            </w:r>
+          </w:p>
+        </w:tc>
+      </w:tr>
+      <w:tr>
+        <w:trPr>
+          <w:cantSplit/>
+        </w:trPr>
+        <w:tc>
+          <w:tcPr>
+            <w:tcW w:w="300" w:type="pct"/>
+            <w:tcMar>
+              <w:top w:w="30" w:type="dxa"/>
+              <w:left w:w="80" w:type="dxa"/>
+              <w:bottom w:w="30" w:type="dxa"/>
+              <w:right w:w="80" w:type="dxa"/>
+            </w:tcMar>
+          </w:tcPr>
+          <w:p>
+            <w:r>
+              <w:rPr>
+                <w:rFonts w:ascii="Aptos" w:eastAsia="Aptos" w:hAnsi="Aptos" w:cs="Aptos"/>
+                <w:sz w:val="20"/>
+                <w:szCs w:val="20"/>
+              </w:rPr>
+              <w:t xml:space="preserve">120</w:t>
+            </w:r>
+          </w:p>
+        </w:tc>
+        <w:tc>
+          <w:tcPr>
+            <w:tcW w:w="1850" w:type="pct"/>
+            <w:tcMar>
+              <w:top w:w="30" w:type="dxa"/>
+              <w:left w:w="80" w:type="dxa"/>
+              <w:bottom w:w="30" w:type="dxa"/>
+              <w:right w:w="80" w:type="dxa"/>
+            </w:tcMar>
+          </w:tcPr>
+          <w:p>
+            <w:r>
+              <w:rPr>
+                <w:rFonts w:ascii="Aptos" w:eastAsia="Aptos" w:hAnsi="Aptos" w:cs="Aptos"/>
+                <w:sz w:val="20"/>
+                <w:szCs w:val="20"/>
+              </w:rPr>
+              <w:t xml:space="preserve">On the Bookings form, without picking a screening, add 1 Cola to the food list and press Complete sale</w:t>
+            </w:r>
+          </w:p>
+        </w:tc>
+        <w:tc>
+          <w:tcPr>
+            <w:tcW w:w="560" w:type="pct"/>
+            <w:tcMar>
+              <w:top w:w="30" w:type="dxa"/>
+              <w:left w:w="80" w:type="dxa"/>
+              <w:bottom w:w="30" w:type="dxa"/>
+              <w:right w:w="80" w:type="dxa"/>
+            </w:tcMar>
+          </w:tcPr>
+          <w:p>
+            <w:r>
+              <w:rPr>
+                <w:rFonts w:ascii="Aptos" w:eastAsia="Aptos" w:hAnsi="Aptos" w:cs="Aptos"/>
+                <w:sz w:val="20"/>
+                <w:szCs w:val="20"/>
+              </w:rPr>
+              <w:t xml:space="preserve">Normal</w:t>
+            </w:r>
+          </w:p>
+        </w:tc>
+        <w:tc>
+          <w:tcPr>
+            <w:tcW w:w="2290" w:type="pct"/>
+            <w:tcMar>
+              <w:top w:w="30" w:type="dxa"/>
+              <w:left w:w="80" w:type="dxa"/>
+              <w:bottom w:w="30" w:type="dxa"/>
+              <w:right w:w="80" w:type="dxa"/>
+            </w:tcMar>
+          </w:tcPr>
+          <w:p>
+            <w:r>
+              <w:rPr>
+                <w:rFonts w:ascii="Aptos" w:eastAsia="Aptos" w:hAnsi="Aptos" w:cs="Aptos"/>
+                <w:sz w:val="20"/>
+                <w:szCs w:val="20"/>
+              </w:rPr>
+              <w:t xml:space="preserve">The sale completes and a booking is created with a total of £2.50, no screening attached to it and no rows in tblBookingSeat.</w:t>
+            </w:r>
+          </w:p>
+        </w:tc>
+      </w:tr>
+      <w:tr>
+        <w:trPr>
+          <w:cantSplit/>
+        </w:trPr>
+        <w:tc>
+          <w:tcPr>
+            <w:tcW w:w="300" w:type="pct"/>
+            <w:tcMar>
+              <w:top w:w="30" w:type="dxa"/>
+              <w:left w:w="80" w:type="dxa"/>
+              <w:bottom w:w="30" w:type="dxa"/>
+              <w:right w:w="80" w:type="dxa"/>
+            </w:tcMar>
+          </w:tcPr>
+          <w:p>
+            <w:r>
+              <w:rPr>
+                <w:rFonts w:ascii="Aptos" w:eastAsia="Aptos" w:hAnsi="Aptos" w:cs="Aptos"/>
+                <w:sz w:val="20"/>
+                <w:szCs w:val="20"/>
+              </w:rPr>
+              <w:t xml:space="preserve">121</w:t>
+            </w:r>
+          </w:p>
+        </w:tc>
+        <w:tc>
+          <w:tcPr>
+            <w:tcW w:w="1850" w:type="pct"/>
+            <w:tcMar>
+              <w:top w:w="30" w:type="dxa"/>
+              <w:left w:w="80" w:type="dxa"/>
+              <w:bottom w:w="30" w:type="dxa"/>
+              <w:right w:w="80" w:type="dxa"/>
+            </w:tcMar>
+          </w:tcPr>
+          <w:p>
+            <w:r>
+              <w:rPr>
+                <w:rFonts w:ascii="Aptos" w:eastAsia="Aptos" w:hAnsi="Aptos" w:cs="Aptos"/>
+                <w:sz w:val="20"/>
+                <w:szCs w:val="20"/>
+              </w:rPr>
+              <w:t xml:space="preserve">Look at that booking in tblBooking</w:t>
+            </w:r>
+          </w:p>
+        </w:tc>
+        <w:tc>
+          <w:tcPr>
+            <w:tcW w:w="560" w:type="pct"/>
+            <w:tcMar>
+              <w:top w:w="30" w:type="dxa"/>
+              <w:left w:w="80" w:type="dxa"/>
+              <w:bottom w:w="30" w:type="dxa"/>
+              <w:right w:w="80" w:type="dxa"/>
+            </w:tcMar>
+          </w:tcPr>
+          <w:p>
+            <w:r>
+              <w:rPr>
+                <w:rFonts w:ascii="Aptos" w:eastAsia="Aptos" w:hAnsi="Aptos" w:cs="Aptos"/>
+                <w:sz w:val="20"/>
+                <w:szCs w:val="20"/>
+              </w:rPr>
+              <w:t xml:space="preserve">Normal</w:t>
+            </w:r>
+          </w:p>
+        </w:tc>
+        <w:tc>
+          <w:tcPr>
+            <w:tcW w:w="2290" w:type="pct"/>
+            <w:tcMar>
+              <w:top w:w="30" w:type="dxa"/>
+              <w:left w:w="80" w:type="dxa"/>
+              <w:bottom w:w="30" w:type="dxa"/>
+              <w:right w:w="80" w:type="dxa"/>
+            </w:tcMar>
+          </w:tcPr>
+          <w:p>
+            <w:r>
+              <w:rPr>
+                <w:rFonts w:ascii="Aptos" w:eastAsia="Aptos" w:hAnsi="Aptos" w:cs="Aptos"/>
+                <w:sz w:val="20"/>
+                <w:szCs w:val="20"/>
+              </w:rPr>
+              <w:t xml:space="preserve">The ScreeningID is empty rather than pointing at a screening, and the booking still has its order line in tblOrderItem, so a food only sale is stored as a valid booking in its own right.</w:t>
+            </w:r>
+          </w:p>
+        </w:tc>
+      </w:tr>
+      <w:tr>
+        <w:trPr>
+          <w:cantSplit/>
+        </w:trPr>
+        <w:tc>
+          <w:tcPr>
+            <w:tcW w:w="300" w:type="pct"/>
+            <w:tcMar>
+              <w:top w:w="30" w:type="dxa"/>
+              <w:left w:w="80" w:type="dxa"/>
+              <w:bottom w:w="30" w:type="dxa"/>
+              <w:right w:w="80" w:type="dxa"/>
+            </w:tcMar>
+          </w:tcPr>
+          <w:p>
+            <w:r>
+              <w:rPr>
+                <w:rFonts w:ascii="Aptos" w:eastAsia="Aptos" w:hAnsi="Aptos" w:cs="Aptos"/>
+                <w:sz w:val="20"/>
+                <w:szCs w:val="20"/>
+              </w:rPr>
+              <w:t xml:space="preserve">122</w:t>
+            </w:r>
+          </w:p>
+        </w:tc>
+        <w:tc>
+          <w:tcPr>
+            <w:tcW w:w="1850" w:type="pct"/>
+            <w:tcMar>
+              <w:top w:w="30" w:type="dxa"/>
+              <w:left w:w="80" w:type="dxa"/>
+              <w:bottom w:w="30" w:type="dxa"/>
+              <w:right w:w="80" w:type="dxa"/>
+            </w:tcMar>
+          </w:tcPr>
+          <w:p>
+            <w:r>
+              <w:rPr>
+                <w:rFonts w:ascii="Aptos" w:eastAsia="Aptos" w:hAnsi="Aptos" w:cs="Aptos"/>
+                <w:sz w:val="20"/>
+                <w:szCs w:val="20"/>
+              </w:rPr>
+              <w:t xml:space="preserve">Run the sales report for a range covering that sale</w:t>
+            </w:r>
+          </w:p>
+        </w:tc>
+        <w:tc>
+          <w:tcPr>
+            <w:tcW w:w="560" w:type="pct"/>
+            <w:tcMar>
+              <w:top w:w="30" w:type="dxa"/>
+              <w:left w:w="80" w:type="dxa"/>
+              <w:bottom w:w="30" w:type="dxa"/>
+              <w:right w:w="80" w:type="dxa"/>
+            </w:tcMar>
+          </w:tcPr>
+          <w:p>
+            <w:r>
+              <w:rPr>
+                <w:rFonts w:ascii="Aptos" w:eastAsia="Aptos" w:hAnsi="Aptos" w:cs="Aptos"/>
+                <w:sz w:val="20"/>
+                <w:szCs w:val="20"/>
+              </w:rPr>
+              <w:t xml:space="preserve">Normal</w:t>
+            </w:r>
+          </w:p>
+        </w:tc>
+        <w:tc>
+          <w:tcPr>
+            <w:tcW w:w="2290" w:type="pct"/>
+            <w:tcMar>
+              <w:top w:w="30" w:type="dxa"/>
+              <w:left w:w="80" w:type="dxa"/>
+              <w:bottom w:w="30" w:type="dxa"/>
+              <w:right w:w="80" w:type="dxa"/>
+            </w:tcMar>
+          </w:tcPr>
+          <w:p>
+            <w:r>
+              <w:rPr>
+                <w:rFonts w:ascii="Aptos" w:eastAsia="Aptos" w:hAnsi="Aptos" w:cs="Aptos"/>
+                <w:sz w:val="20"/>
+                <w:szCs w:val="20"/>
+              </w:rPr>
+              <w:t xml:space="preserve">The £2.50 appears in the food takings and in the grand total, so a sale with no tickets on it is still counted in the takings.</w:t>
+            </w:r>
+          </w:p>
+        </w:tc>
+      </w:tr>
+      <w:tr>
+        <w:trPr>
+          <w:cantSplit/>
+        </w:trPr>
+        <w:tc>
+          <w:tcPr>
+            <w:tcW w:w="300" w:type="pct"/>
+            <w:tcMar>
+              <w:top w:w="30" w:type="dxa"/>
+              <w:left w:w="80" w:type="dxa"/>
+              <w:bottom w:w="30" w:type="dxa"/>
+              <w:right w:w="80" w:type="dxa"/>
+            </w:tcMar>
+          </w:tcPr>
+          <w:p>
+            <w:r>
+              <w:rPr>
+                <w:rFonts w:ascii="Aptos" w:eastAsia="Aptos" w:hAnsi="Aptos" w:cs="Aptos"/>
+                <w:sz w:val="20"/>
+                <w:szCs w:val="20"/>
+              </w:rPr>
+              <w:t xml:space="preserve">123</w:t>
+            </w:r>
+          </w:p>
+        </w:tc>
+        <w:tc>
+          <w:tcPr>
+            <w:tcW w:w="1850" w:type="pct"/>
+            <w:tcMar>
+              <w:top w:w="30" w:type="dxa"/>
+              <w:left w:w="80" w:type="dxa"/>
+              <w:bottom w:w="30" w:type="dxa"/>
+              <w:right w:w="80" w:type="dxa"/>
+            </w:tcMar>
+          </w:tcPr>
+          <w:p>
+            <w:r>
+              <w:rPr>
+                <w:rFonts w:ascii="Aptos" w:eastAsia="Aptos" w:hAnsi="Aptos" w:cs="Aptos"/>
+                <w:sz w:val="20"/>
+                <w:szCs w:val="20"/>
+              </w:rPr>
+              <w:t xml:space="preserve">Without picking a screening and without adding any food, press Complete sale</w:t>
+            </w:r>
+          </w:p>
+        </w:tc>
+        <w:tc>
+          <w:tcPr>
+            <w:tcW w:w="560" w:type="pct"/>
+            <w:tcMar>
+              <w:top w:w="30" w:type="dxa"/>
+              <w:left w:w="80" w:type="dxa"/>
+              <w:bottom w:w="30" w:type="dxa"/>
+              <w:right w:w="80" w:type="dxa"/>
+            </w:tcMar>
+          </w:tcPr>
+          <w:p>
+            <w:r>
+              <w:rPr>
+                <w:rFonts w:ascii="Aptos" w:eastAsia="Aptos" w:hAnsi="Aptos" w:cs="Aptos"/>
+                <w:sz w:val="20"/>
+                <w:szCs w:val="20"/>
+              </w:rPr>
+              <w:t xml:space="preserve">Erroneous</w:t>
+            </w:r>
+          </w:p>
+        </w:tc>
+        <w:tc>
+          <w:tcPr>
+            <w:tcW w:w="2290" w:type="pct"/>
+            <w:tcMar>
+              <w:top w:w="30" w:type="dxa"/>
+              <w:left w:w="80" w:type="dxa"/>
+              <w:bottom w:w="30" w:type="dxa"/>
+              <w:right w:w="80" w:type="dxa"/>
+            </w:tcMar>
+          </w:tcPr>
+          <w:p>
+            <w:r>
+              <w:rPr>
+                <w:rFonts w:ascii="Aptos" w:eastAsia="Aptos" w:hAnsi="Aptos" w:cs="Aptos"/>
+                <w:sz w:val="20"/>
+                <w:szCs w:val="20"/>
+              </w:rPr>
+              <w:t xml:space="preserve">The sale is rejected and a message appears stating “Pick some seats, or add something from the food and drink list”, so an entirely empty sale is still refused.</w:t>
             </w:r>
           </w:p>
         </w:tc>

</xml_diff>

<commit_message>
added objectives 18 and 22: refunding a booking in full and in part
</commit_message>
<xml_diff>
--- a/Testing.docx
+++ b/Testing.docx
@@ -13636,6 +13636,1052 @@
                 <w:szCs w:val="20"/>
               </w:rPr>
               <w:t xml:space="preserve">The sale is rejected and a message appears stating “Pick some seats, or add something from the food and drink list”, so an entirely empty sale is still refused.</w:t>
+            </w:r>
+          </w:p>
+        </w:tc>
+      </w:tr>
+    </w:tbl>
+    <w:p>
+      <w:r>
+        <w:rPr>
+          <w:rFonts w:ascii="Aptos" w:eastAsia="Aptos" w:hAnsi="Aptos" w:cs="Aptos"/>
+        </w:rPr>
+        <w:t xml:space="preserve"/>
+      </w:r>
+    </w:p>
+    <w:p>
+      <w:pPr>
+        <w:pStyle w:val="Heading3"/>
+      </w:pPr>
+      <w:r>
+        <w:rPr>
+          <w:rFonts w:ascii="Aptos Display" w:eastAsia="Aptos Display" w:hAnsi="Aptos Display" w:cs="Aptos Display"/>
+          <w:b/>
+          <w:bCs/>
+          <w:color w:val="000000"/>
+        </w:rPr>
+        <w:t xml:space="preserve">Objectives 18 and 22: Refunding a Booking in Full and in Part</w:t>
+      </w:r>
+    </w:p>
+    <w:p>
+      <w:r>
+        <w:rPr>
+          <w:rFonts w:ascii="Aptos" w:eastAsia="Aptos" w:hAnsi="Aptos" w:cs="Aptos"/>
+        </w:rPr>
+        <w:t xml:space="preserve">These two objectives are tested together because a full refund is the same process as a partial one with everything selected. The partial refund is the harder case, because the booking has to stay alive with the part that was not handed back still on it, the seat that was handed back has to go back on sale, and the stored total for the booking has to come out right afterwards. John Smith's booking is used, which at this point is seats B1 and B2 at £9.00 each plus 2 Large Popcorn and 1 Cola, giving £29.50.</w:t>
+      </w:r>
+    </w:p>
+    <w:tbl>
+      <w:tblPr>
+        <w:tblW w:w="5000" w:type="pct"/>
+        <w:tblBorders>
+          <w:top w:val="single" w:sz="4" w:space="0" w:color="808080"/>
+          <w:left w:val="single" w:sz="4" w:space="0" w:color="808080"/>
+          <w:bottom w:val="single" w:sz="4" w:space="0" w:color="808080"/>
+          <w:right w:val="single" w:sz="4" w:space="0" w:color="808080"/>
+          <w:insideH w:val="single" w:sz="4" w:space="0" w:color="808080"/>
+          <w:insideV w:val="single" w:sz="4" w:space="0" w:color="808080"/>
+        </w:tblBorders>
+        <w:tblCellMar>
+          <w:left w:w="10" w:type="dxa"/>
+          <w:right w:w="10" w:type="dxa"/>
+        </w:tblCellMar>
+        <w:tblLook w:val="0000" w:firstRow="0" w:lastRow="0" w:firstColumn="0" w:lastColumn="0" w:noHBand="0" w:noVBand="0"/>
+      </w:tblPr>
+      <w:tblGrid>
+        <w:gridCol w:w="561"/>
+        <w:gridCol w:w="3460"/>
+        <w:gridCol w:w="1047"/>
+        <w:gridCol w:w="4282"/>
+      </w:tblGrid>
+      <w:tr>
+        <w:trPr>
+          <w:cantSplit/>
+          <w:tblHeader/>
+        </w:trPr>
+        <w:tc>
+          <w:tcPr>
+            <w:tcW w:w="300" w:type="pct"/>
+            <w:shd w:val="clear" w:color="auto" w:fill="F2CEED" w:themeFill="accent5" w:themeFillTint="33"/>
+            <w:tcMar>
+              <w:top w:w="30" w:type="dxa"/>
+              <w:left w:w="80" w:type="dxa"/>
+              <w:bottom w:w="30" w:type="dxa"/>
+              <w:right w:w="80" w:type="dxa"/>
+            </w:tcMar>
+          </w:tcPr>
+          <w:p>
+            <w:r>
+              <w:rPr>
+                <w:rFonts w:ascii="Aptos" w:eastAsia="Aptos" w:hAnsi="Aptos" w:cs="Aptos"/>
+                <w:b/>
+                <w:bCs/>
+                <w:sz w:val="20"/>
+                <w:szCs w:val="20"/>
+              </w:rPr>
+              <w:t xml:space="preserve">No.</w:t>
+            </w:r>
+          </w:p>
+        </w:tc>
+        <w:tc>
+          <w:tcPr>
+            <w:tcW w:w="1850" w:type="pct"/>
+            <w:shd w:val="clear" w:color="auto" w:fill="F2CEED" w:themeFill="accent5" w:themeFillTint="33"/>
+            <w:tcMar>
+              <w:top w:w="30" w:type="dxa"/>
+              <w:left w:w="80" w:type="dxa"/>
+              <w:bottom w:w="30" w:type="dxa"/>
+              <w:right w:w="80" w:type="dxa"/>
+            </w:tcMar>
+          </w:tcPr>
+          <w:p>
+            <w:r>
+              <w:rPr>
+                <w:rFonts w:ascii="Aptos" w:eastAsia="Aptos" w:hAnsi="Aptos" w:cs="Aptos"/>
+                <w:b/>
+                <w:bCs/>
+                <w:sz w:val="20"/>
+                <w:szCs w:val="20"/>
+              </w:rPr>
+              <w:t xml:space="preserve">Test</w:t>
+            </w:r>
+          </w:p>
+        </w:tc>
+        <w:tc>
+          <w:tcPr>
+            <w:tcW w:w="560" w:type="pct"/>
+            <w:shd w:val="clear" w:color="auto" w:fill="F2CEED" w:themeFill="accent5" w:themeFillTint="33"/>
+            <w:tcMar>
+              <w:top w:w="30" w:type="dxa"/>
+              <w:left w:w="80" w:type="dxa"/>
+              <w:bottom w:w="30" w:type="dxa"/>
+              <w:right w:w="80" w:type="dxa"/>
+            </w:tcMar>
+          </w:tcPr>
+          <w:p>
+            <w:r>
+              <w:rPr>
+                <w:rFonts w:ascii="Aptos" w:eastAsia="Aptos" w:hAnsi="Aptos" w:cs="Aptos"/>
+                <w:b/>
+                <w:bCs/>
+                <w:sz w:val="20"/>
+                <w:szCs w:val="20"/>
+              </w:rPr>
+              <w:t xml:space="preserve">Type</w:t>
+            </w:r>
+          </w:p>
+        </w:tc>
+        <w:tc>
+          <w:tcPr>
+            <w:tcW w:w="2290" w:type="pct"/>
+            <w:shd w:val="clear" w:color="auto" w:fill="F2CEED" w:themeFill="accent5" w:themeFillTint="33"/>
+            <w:tcMar>
+              <w:top w:w="30" w:type="dxa"/>
+              <w:left w:w="80" w:type="dxa"/>
+              <w:bottom w:w="30" w:type="dxa"/>
+              <w:right w:w="80" w:type="dxa"/>
+            </w:tcMar>
+          </w:tcPr>
+          <w:p>
+            <w:r>
+              <w:rPr>
+                <w:rFonts w:ascii="Aptos" w:eastAsia="Aptos" w:hAnsi="Aptos" w:cs="Aptos"/>
+                <w:b/>
+                <w:bCs/>
+                <w:sz w:val="20"/>
+                <w:szCs w:val="20"/>
+              </w:rPr>
+              <w:t xml:space="preserve">Expected Result</w:t>
+            </w:r>
+          </w:p>
+        </w:tc>
+      </w:tr>
+      <w:tr>
+        <w:trPr>
+          <w:cantSplit/>
+        </w:trPr>
+        <w:tc>
+          <w:tcPr>
+            <w:tcW w:w="300" w:type="pct"/>
+            <w:tcMar>
+              <w:top w:w="30" w:type="dxa"/>
+              <w:left w:w="80" w:type="dxa"/>
+              <w:bottom w:w="30" w:type="dxa"/>
+              <w:right w:w="80" w:type="dxa"/>
+            </w:tcMar>
+          </w:tcPr>
+          <w:p>
+            <w:r>
+              <w:rPr>
+                <w:rFonts w:ascii="Aptos" w:eastAsia="Aptos" w:hAnsi="Aptos" w:cs="Aptos"/>
+                <w:sz w:val="20"/>
+                <w:szCs w:val="20"/>
+              </w:rPr>
+              <w:t xml:space="preserve">124</w:t>
+            </w:r>
+          </w:p>
+        </w:tc>
+        <w:tc>
+          <w:tcPr>
+            <w:tcW w:w="1850" w:type="pct"/>
+            <w:tcMar>
+              <w:top w:w="30" w:type="dxa"/>
+              <w:left w:w="80" w:type="dxa"/>
+              <w:bottom w:w="30" w:type="dxa"/>
+              <w:right w:w="80" w:type="dxa"/>
+            </w:tcMar>
+          </w:tcPr>
+          <w:p>
+            <w:r>
+              <w:rPr>
+                <w:rFonts w:ascii="Aptos" w:eastAsia="Aptos" w:hAnsi="Aptos" w:cs="Aptos"/>
+                <w:sz w:val="20"/>
+                <w:szCs w:val="20"/>
+              </w:rPr>
+              <w:t xml:space="preserve">Open the Refund form for John Smith's booking without ticking any seat or entering any quantity, and press Refund</w:t>
+            </w:r>
+          </w:p>
+        </w:tc>
+        <w:tc>
+          <w:tcPr>
+            <w:tcW w:w="560" w:type="pct"/>
+            <w:tcMar>
+              <w:top w:w="30" w:type="dxa"/>
+              <w:left w:w="80" w:type="dxa"/>
+              <w:bottom w:w="30" w:type="dxa"/>
+              <w:right w:w="80" w:type="dxa"/>
+            </w:tcMar>
+          </w:tcPr>
+          <w:p>
+            <w:r>
+              <w:rPr>
+                <w:rFonts w:ascii="Aptos" w:eastAsia="Aptos" w:hAnsi="Aptos" w:cs="Aptos"/>
+                <w:sz w:val="20"/>
+                <w:szCs w:val="20"/>
+              </w:rPr>
+              <w:t xml:space="preserve">Erroneous</w:t>
+            </w:r>
+          </w:p>
+        </w:tc>
+        <w:tc>
+          <w:tcPr>
+            <w:tcW w:w="2290" w:type="pct"/>
+            <w:tcMar>
+              <w:top w:w="30" w:type="dxa"/>
+              <w:left w:w="80" w:type="dxa"/>
+              <w:bottom w:w="30" w:type="dxa"/>
+              <w:right w:w="80" w:type="dxa"/>
+            </w:tcMar>
+          </w:tcPr>
+          <w:p>
+            <w:r>
+              <w:rPr>
+                <w:rFonts w:ascii="Aptos" w:eastAsia="Aptos" w:hAnsi="Aptos" w:cs="Aptos"/>
+                <w:sz w:val="20"/>
+                <w:szCs w:val="20"/>
+              </w:rPr>
+              <w:t xml:space="preserve">Nothing is refunded and a message appears stating “Tick a seat or type a quantity against a food line first”.</w:t>
+            </w:r>
+          </w:p>
+        </w:tc>
+      </w:tr>
+      <w:tr>
+        <w:trPr>
+          <w:cantSplit/>
+        </w:trPr>
+        <w:tc>
+          <w:tcPr>
+            <w:tcW w:w="300" w:type="pct"/>
+            <w:tcMar>
+              <w:top w:w="30" w:type="dxa"/>
+              <w:left w:w="80" w:type="dxa"/>
+              <w:bottom w:w="30" w:type="dxa"/>
+              <w:right w:w="80" w:type="dxa"/>
+            </w:tcMar>
+          </w:tcPr>
+          <w:p>
+            <w:r>
+              <w:rPr>
+                <w:rFonts w:ascii="Aptos" w:eastAsia="Aptos" w:hAnsi="Aptos" w:cs="Aptos"/>
+                <w:sz w:val="20"/>
+                <w:szCs w:val="20"/>
+              </w:rPr>
+              <w:t xml:space="preserve">125</w:t>
+            </w:r>
+          </w:p>
+        </w:tc>
+        <w:tc>
+          <w:tcPr>
+            <w:tcW w:w="1850" w:type="pct"/>
+            <w:tcMar>
+              <w:top w:w="30" w:type="dxa"/>
+              <w:left w:w="80" w:type="dxa"/>
+              <w:bottom w:w="30" w:type="dxa"/>
+              <w:right w:w="80" w:type="dxa"/>
+            </w:tcMar>
+          </w:tcPr>
+          <w:p>
+            <w:r>
+              <w:rPr>
+                <w:rFonts w:ascii="Aptos" w:eastAsia="Aptos" w:hAnsi="Aptos" w:cs="Aptos"/>
+                <w:sz w:val="20"/>
+                <w:szCs w:val="20"/>
+              </w:rPr>
+              <w:t xml:space="preserve">Tick seat B2 but leave the reason blank, then press Refund</w:t>
+            </w:r>
+          </w:p>
+        </w:tc>
+        <w:tc>
+          <w:tcPr>
+            <w:tcW w:w="560" w:type="pct"/>
+            <w:tcMar>
+              <w:top w:w="30" w:type="dxa"/>
+              <w:left w:w="80" w:type="dxa"/>
+              <w:bottom w:w="30" w:type="dxa"/>
+              <w:right w:w="80" w:type="dxa"/>
+            </w:tcMar>
+          </w:tcPr>
+          <w:p>
+            <w:r>
+              <w:rPr>
+                <w:rFonts w:ascii="Aptos" w:eastAsia="Aptos" w:hAnsi="Aptos" w:cs="Aptos"/>
+                <w:sz w:val="20"/>
+                <w:szCs w:val="20"/>
+              </w:rPr>
+              <w:t xml:space="preserve">Erroneous</w:t>
+            </w:r>
+          </w:p>
+        </w:tc>
+        <w:tc>
+          <w:tcPr>
+            <w:tcW w:w="2290" w:type="pct"/>
+            <w:tcMar>
+              <w:top w:w="30" w:type="dxa"/>
+              <w:left w:w="80" w:type="dxa"/>
+              <w:bottom w:w="30" w:type="dxa"/>
+              <w:right w:w="80" w:type="dxa"/>
+            </w:tcMar>
+          </w:tcPr>
+          <w:p>
+            <w:r>
+              <w:rPr>
+                <w:rFonts w:ascii="Aptos" w:eastAsia="Aptos" w:hAnsi="Aptos" w:cs="Aptos"/>
+                <w:sz w:val="20"/>
+                <w:szCs w:val="20"/>
+              </w:rPr>
+              <w:t xml:space="preserve">Nothing is refunded and a message appears stating “Say why the money is going back before refunding it”, so a refund cannot be given without a reason being recorded against it.</w:t>
+            </w:r>
+          </w:p>
+        </w:tc>
+      </w:tr>
+      <w:tr>
+        <w:trPr>
+          <w:cantSplit/>
+        </w:trPr>
+        <w:tc>
+          <w:tcPr>
+            <w:tcW w:w="300" w:type="pct"/>
+            <w:tcMar>
+              <w:top w:w="30" w:type="dxa"/>
+              <w:left w:w="80" w:type="dxa"/>
+              <w:bottom w:w="30" w:type="dxa"/>
+              <w:right w:w="80" w:type="dxa"/>
+            </w:tcMar>
+          </w:tcPr>
+          <w:p>
+            <w:r>
+              <w:rPr>
+                <w:rFonts w:ascii="Aptos" w:eastAsia="Aptos" w:hAnsi="Aptos" w:cs="Aptos"/>
+                <w:sz w:val="20"/>
+                <w:szCs w:val="20"/>
+              </w:rPr>
+              <w:t xml:space="preserve">126</w:t>
+            </w:r>
+          </w:p>
+        </w:tc>
+        <w:tc>
+          <w:tcPr>
+            <w:tcW w:w="1850" w:type="pct"/>
+            <w:tcMar>
+              <w:top w:w="30" w:type="dxa"/>
+              <w:left w:w="80" w:type="dxa"/>
+              <w:bottom w:w="30" w:type="dxa"/>
+              <w:right w:w="80" w:type="dxa"/>
+            </w:tcMar>
+          </w:tcPr>
+          <w:p>
+            <w:r>
+              <w:rPr>
+                <w:rFonts w:ascii="Aptos" w:eastAsia="Aptos" w:hAnsi="Aptos" w:cs="Aptos"/>
+                <w:sz w:val="20"/>
+                <w:szCs w:val="20"/>
+              </w:rPr>
+              <w:t xml:space="preserve">Tick seat B2, type a reason, then press Refund</w:t>
+            </w:r>
+          </w:p>
+        </w:tc>
+        <w:tc>
+          <w:tcPr>
+            <w:tcW w:w="560" w:type="pct"/>
+            <w:tcMar>
+              <w:top w:w="30" w:type="dxa"/>
+              <w:left w:w="80" w:type="dxa"/>
+              <w:bottom w:w="30" w:type="dxa"/>
+              <w:right w:w="80" w:type="dxa"/>
+            </w:tcMar>
+          </w:tcPr>
+          <w:p>
+            <w:r>
+              <w:rPr>
+                <w:rFonts w:ascii="Aptos" w:eastAsia="Aptos" w:hAnsi="Aptos" w:cs="Aptos"/>
+                <w:sz w:val="20"/>
+                <w:szCs w:val="20"/>
+              </w:rPr>
+              <w:t xml:space="preserve">Normal</w:t>
+            </w:r>
+          </w:p>
+        </w:tc>
+        <w:tc>
+          <w:tcPr>
+            <w:tcW w:w="2290" w:type="pct"/>
+            <w:tcMar>
+              <w:top w:w="30" w:type="dxa"/>
+              <w:left w:w="80" w:type="dxa"/>
+              <w:bottom w:w="30" w:type="dxa"/>
+              <w:right w:w="80" w:type="dxa"/>
+            </w:tcMar>
+          </w:tcPr>
+          <w:p>
+            <w:r>
+              <w:rPr>
+                <w:rFonts w:ascii="Aptos" w:eastAsia="Aptos" w:hAnsi="Aptos" w:cs="Aptos"/>
+                <w:sz w:val="20"/>
+                <w:szCs w:val="20"/>
+              </w:rPr>
+              <w:t xml:space="preserve">£9.00 is refunded, a row is written to tblRefund for £9.00 with the reason and the user who did it, and a row is written to tblRefundLine recording that it was seat B2.</w:t>
+            </w:r>
+          </w:p>
+        </w:tc>
+      </w:tr>
+      <w:tr>
+        <w:trPr>
+          <w:cantSplit/>
+        </w:trPr>
+        <w:tc>
+          <w:tcPr>
+            <w:tcW w:w="300" w:type="pct"/>
+            <w:tcMar>
+              <w:top w:w="30" w:type="dxa"/>
+              <w:left w:w="80" w:type="dxa"/>
+              <w:bottom w:w="30" w:type="dxa"/>
+              <w:right w:w="80" w:type="dxa"/>
+            </w:tcMar>
+          </w:tcPr>
+          <w:p>
+            <w:r>
+              <w:rPr>
+                <w:rFonts w:ascii="Aptos" w:eastAsia="Aptos" w:hAnsi="Aptos" w:cs="Aptos"/>
+                <w:sz w:val="20"/>
+                <w:szCs w:val="20"/>
+              </w:rPr>
+              <w:t xml:space="preserve">127</w:t>
+            </w:r>
+          </w:p>
+        </w:tc>
+        <w:tc>
+          <w:tcPr>
+            <w:tcW w:w="1850" w:type="pct"/>
+            <w:tcMar>
+              <w:top w:w="30" w:type="dxa"/>
+              <w:left w:w="80" w:type="dxa"/>
+              <w:bottom w:w="30" w:type="dxa"/>
+              <w:right w:w="80" w:type="dxa"/>
+            </w:tcMar>
+          </w:tcPr>
+          <w:p>
+            <w:r>
+              <w:rPr>
+                <w:rFonts w:ascii="Aptos" w:eastAsia="Aptos" w:hAnsi="Aptos" w:cs="Aptos"/>
+                <w:sz w:val="20"/>
+                <w:szCs w:val="20"/>
+              </w:rPr>
+              <w:t xml:space="preserve">Look at John Smith's booking after that refund</w:t>
+            </w:r>
+          </w:p>
+        </w:tc>
+        <w:tc>
+          <w:tcPr>
+            <w:tcW w:w="560" w:type="pct"/>
+            <w:tcMar>
+              <w:top w:w="30" w:type="dxa"/>
+              <w:left w:w="80" w:type="dxa"/>
+              <w:bottom w:w="30" w:type="dxa"/>
+              <w:right w:w="80" w:type="dxa"/>
+            </w:tcMar>
+          </w:tcPr>
+          <w:p>
+            <w:r>
+              <w:rPr>
+                <w:rFonts w:ascii="Aptos" w:eastAsia="Aptos" w:hAnsi="Aptos" w:cs="Aptos"/>
+                <w:sz w:val="20"/>
+                <w:szCs w:val="20"/>
+              </w:rPr>
+              <w:t xml:space="preserve">Normal</w:t>
+            </w:r>
+          </w:p>
+        </w:tc>
+        <w:tc>
+          <w:tcPr>
+            <w:tcW w:w="2290" w:type="pct"/>
+            <w:tcMar>
+              <w:top w:w="30" w:type="dxa"/>
+              <w:left w:w="80" w:type="dxa"/>
+              <w:bottom w:w="30" w:type="dxa"/>
+              <w:right w:w="80" w:type="dxa"/>
+            </w:tcMar>
+          </w:tcPr>
+          <w:p>
+            <w:r>
+              <w:rPr>
+                <w:rFonts w:ascii="Aptos" w:eastAsia="Aptos" w:hAnsi="Aptos" w:cs="Aptos"/>
+                <w:sz w:val="20"/>
+                <w:szCs w:val="20"/>
+              </w:rPr>
+              <w:t xml:space="preserve">The booking is still Active rather than Cancelled, because part of it is still owed, and its stored total has come down from £29.50 to £20.50, which is £9.00 for the remaining seat B1 plus £11.50 of food.</w:t>
+            </w:r>
+          </w:p>
+        </w:tc>
+      </w:tr>
+      <w:tr>
+        <w:trPr>
+          <w:cantSplit/>
+        </w:trPr>
+        <w:tc>
+          <w:tcPr>
+            <w:tcW w:w="300" w:type="pct"/>
+            <w:tcMar>
+              <w:top w:w="30" w:type="dxa"/>
+              <w:left w:w="80" w:type="dxa"/>
+              <w:bottom w:w="30" w:type="dxa"/>
+              <w:right w:w="80" w:type="dxa"/>
+            </w:tcMar>
+          </w:tcPr>
+          <w:p>
+            <w:r>
+              <w:rPr>
+                <w:rFonts w:ascii="Aptos" w:eastAsia="Aptos" w:hAnsi="Aptos" w:cs="Aptos"/>
+                <w:sz w:val="20"/>
+                <w:szCs w:val="20"/>
+              </w:rPr>
+              <w:t xml:space="preserve">128</w:t>
+            </w:r>
+          </w:p>
+        </w:tc>
+        <w:tc>
+          <w:tcPr>
+            <w:tcW w:w="1850" w:type="pct"/>
+            <w:tcMar>
+              <w:top w:w="30" w:type="dxa"/>
+              <w:left w:w="80" w:type="dxa"/>
+              <w:bottom w:w="30" w:type="dxa"/>
+              <w:right w:w="80" w:type="dxa"/>
+            </w:tcMar>
+          </w:tcPr>
+          <w:p>
+            <w:r>
+              <w:rPr>
+                <w:rFonts w:ascii="Aptos" w:eastAsia="Aptos" w:hAnsi="Aptos" w:cs="Aptos"/>
+                <w:sz w:val="20"/>
+                <w:szCs w:val="20"/>
+              </w:rPr>
+              <w:t xml:space="preserve">Open the Bookings form and look at seat B2 on the Inception screening</w:t>
+            </w:r>
+          </w:p>
+        </w:tc>
+        <w:tc>
+          <w:tcPr>
+            <w:tcW w:w="560" w:type="pct"/>
+            <w:tcMar>
+              <w:top w:w="30" w:type="dxa"/>
+              <w:left w:w="80" w:type="dxa"/>
+              <w:bottom w:w="30" w:type="dxa"/>
+              <w:right w:w="80" w:type="dxa"/>
+            </w:tcMar>
+          </w:tcPr>
+          <w:p>
+            <w:r>
+              <w:rPr>
+                <w:rFonts w:ascii="Aptos" w:eastAsia="Aptos" w:hAnsi="Aptos" w:cs="Aptos"/>
+                <w:sz w:val="20"/>
+                <w:szCs w:val="20"/>
+              </w:rPr>
+              <w:t xml:space="preserve">Normal</w:t>
+            </w:r>
+          </w:p>
+        </w:tc>
+        <w:tc>
+          <w:tcPr>
+            <w:tcW w:w="2290" w:type="pct"/>
+            <w:tcMar>
+              <w:top w:w="30" w:type="dxa"/>
+              <w:left w:w="80" w:type="dxa"/>
+              <w:bottom w:w="30" w:type="dxa"/>
+              <w:right w:w="80" w:type="dxa"/>
+            </w:tcMar>
+          </w:tcPr>
+          <w:p>
+            <w:r>
+              <w:rPr>
+                <w:rFonts w:ascii="Aptos" w:eastAsia="Aptos" w:hAnsi="Aptos" w:cs="Aptos"/>
+                <w:sz w:val="20"/>
+                <w:szCs w:val="20"/>
+              </w:rPr>
+              <w:t xml:space="preserve">Seat B2 is available again and can be sold to somebody else, while seat B1 is still shown as taken, so only the seat that was handed back has been released.</w:t>
+            </w:r>
+          </w:p>
+        </w:tc>
+      </w:tr>
+      <w:tr>
+        <w:trPr>
+          <w:cantSplit/>
+        </w:trPr>
+        <w:tc>
+          <w:tcPr>
+            <w:tcW w:w="300" w:type="pct"/>
+            <w:tcMar>
+              <w:top w:w="30" w:type="dxa"/>
+              <w:left w:w="80" w:type="dxa"/>
+              <w:bottom w:w="30" w:type="dxa"/>
+              <w:right w:w="80" w:type="dxa"/>
+            </w:tcMar>
+          </w:tcPr>
+          <w:p>
+            <w:r>
+              <w:rPr>
+                <w:rFonts w:ascii="Aptos" w:eastAsia="Aptos" w:hAnsi="Aptos" w:cs="Aptos"/>
+                <w:sz w:val="20"/>
+                <w:szCs w:val="20"/>
+              </w:rPr>
+              <w:t xml:space="preserve">129</w:t>
+            </w:r>
+          </w:p>
+        </w:tc>
+        <w:tc>
+          <w:tcPr>
+            <w:tcW w:w="1850" w:type="pct"/>
+            <w:tcMar>
+              <w:top w:w="30" w:type="dxa"/>
+              <w:left w:w="80" w:type="dxa"/>
+              <w:bottom w:w="30" w:type="dxa"/>
+              <w:right w:w="80" w:type="dxa"/>
+            </w:tcMar>
+          </w:tcPr>
+          <w:p>
+            <w:r>
+              <w:rPr>
+                <w:rFonts w:ascii="Aptos" w:eastAsia="Aptos" w:hAnsi="Aptos" w:cs="Aptos"/>
+                <w:sz w:val="20"/>
+                <w:szCs w:val="20"/>
+              </w:rPr>
+              <w:t xml:space="preserve">Open the Refund form for the same booking and refund 1 of the 2 Large Popcorn</w:t>
+            </w:r>
+          </w:p>
+        </w:tc>
+        <w:tc>
+          <w:tcPr>
+            <w:tcW w:w="560" w:type="pct"/>
+            <w:tcMar>
+              <w:top w:w="30" w:type="dxa"/>
+              <w:left w:w="80" w:type="dxa"/>
+              <w:bottom w:w="30" w:type="dxa"/>
+              <w:right w:w="80" w:type="dxa"/>
+            </w:tcMar>
+          </w:tcPr>
+          <w:p>
+            <w:r>
+              <w:rPr>
+                <w:rFonts w:ascii="Aptos" w:eastAsia="Aptos" w:hAnsi="Aptos" w:cs="Aptos"/>
+                <w:sz w:val="20"/>
+                <w:szCs w:val="20"/>
+              </w:rPr>
+              <w:t xml:space="preserve">Normal</w:t>
+            </w:r>
+          </w:p>
+        </w:tc>
+        <w:tc>
+          <w:tcPr>
+            <w:tcW w:w="2290" w:type="pct"/>
+            <w:tcMar>
+              <w:top w:w="30" w:type="dxa"/>
+              <w:left w:w="80" w:type="dxa"/>
+              <w:bottom w:w="30" w:type="dxa"/>
+              <w:right w:w="80" w:type="dxa"/>
+            </w:tcMar>
+          </w:tcPr>
+          <w:p>
+            <w:r>
+              <w:rPr>
+                <w:rFonts w:ascii="Aptos" w:eastAsia="Aptos" w:hAnsi="Aptos" w:cs="Aptos"/>
+                <w:sz w:val="20"/>
+                <w:szCs w:val="20"/>
+              </w:rPr>
+              <w:t xml:space="preserve">£4.50 is refunded and a row is written to tblRefundLine recording a quantity of 1 against that order line, so part of a quantity can be handed back rather than all of it.</w:t>
+            </w:r>
+          </w:p>
+        </w:tc>
+      </w:tr>
+      <w:tr>
+        <w:trPr>
+          <w:cantSplit/>
+        </w:trPr>
+        <w:tc>
+          <w:tcPr>
+            <w:tcW w:w="300" w:type="pct"/>
+            <w:tcMar>
+              <w:top w:w="30" w:type="dxa"/>
+              <w:left w:w="80" w:type="dxa"/>
+              <w:bottom w:w="30" w:type="dxa"/>
+              <w:right w:w="80" w:type="dxa"/>
+            </w:tcMar>
+          </w:tcPr>
+          <w:p>
+            <w:r>
+              <w:rPr>
+                <w:rFonts w:ascii="Aptos" w:eastAsia="Aptos" w:hAnsi="Aptos" w:cs="Aptos"/>
+                <w:sz w:val="20"/>
+                <w:szCs w:val="20"/>
+              </w:rPr>
+              <w:t xml:space="preserve">130</w:t>
+            </w:r>
+          </w:p>
+        </w:tc>
+        <w:tc>
+          <w:tcPr>
+            <w:tcW w:w="1850" w:type="pct"/>
+            <w:tcMar>
+              <w:top w:w="30" w:type="dxa"/>
+              <w:left w:w="80" w:type="dxa"/>
+              <w:bottom w:w="30" w:type="dxa"/>
+              <w:right w:w="80" w:type="dxa"/>
+            </w:tcMar>
+          </w:tcPr>
+          <w:p>
+            <w:r>
+              <w:rPr>
+                <w:rFonts w:ascii="Aptos" w:eastAsia="Aptos" w:hAnsi="Aptos" w:cs="Aptos"/>
+                <w:sz w:val="20"/>
+                <w:szCs w:val="20"/>
+              </w:rPr>
+              <w:t xml:space="preserve">Look at the booking total again</w:t>
+            </w:r>
+          </w:p>
+        </w:tc>
+        <w:tc>
+          <w:tcPr>
+            <w:tcW w:w="560" w:type="pct"/>
+            <w:tcMar>
+              <w:top w:w="30" w:type="dxa"/>
+              <w:left w:w="80" w:type="dxa"/>
+              <w:bottom w:w="30" w:type="dxa"/>
+              <w:right w:w="80" w:type="dxa"/>
+            </w:tcMar>
+          </w:tcPr>
+          <w:p>
+            <w:r>
+              <w:rPr>
+                <w:rFonts w:ascii="Aptos" w:eastAsia="Aptos" w:hAnsi="Aptos" w:cs="Aptos"/>
+                <w:sz w:val="20"/>
+                <w:szCs w:val="20"/>
+              </w:rPr>
+              <w:t xml:space="preserve">Normal</w:t>
+            </w:r>
+          </w:p>
+        </w:tc>
+        <w:tc>
+          <w:tcPr>
+            <w:tcW w:w="2290" w:type="pct"/>
+            <w:tcMar>
+              <w:top w:w="30" w:type="dxa"/>
+              <w:left w:w="80" w:type="dxa"/>
+              <w:bottom w:w="30" w:type="dxa"/>
+              <w:right w:w="80" w:type="dxa"/>
+            </w:tcMar>
+          </w:tcPr>
+          <w:p>
+            <w:r>
+              <w:rPr>
+                <w:rFonts w:ascii="Aptos" w:eastAsia="Aptos" w:hAnsi="Aptos" w:cs="Aptos"/>
+                <w:sz w:val="20"/>
+                <w:szCs w:val="20"/>
+              </w:rPr>
+              <w:t xml:space="preserve">The stored total has come down from £20.50 to £16.00, which is £9.00 for seat B1 plus one popcorn at £4.50 and one cola at £2.50.</w:t>
+            </w:r>
+          </w:p>
+        </w:tc>
+      </w:tr>
+      <w:tr>
+        <w:trPr>
+          <w:cantSplit/>
+        </w:trPr>
+        <w:tc>
+          <w:tcPr>
+            <w:tcW w:w="300" w:type="pct"/>
+            <w:tcMar>
+              <w:top w:w="30" w:type="dxa"/>
+              <w:left w:w="80" w:type="dxa"/>
+              <w:bottom w:w="30" w:type="dxa"/>
+              <w:right w:w="80" w:type="dxa"/>
+            </w:tcMar>
+          </w:tcPr>
+          <w:p>
+            <w:r>
+              <w:rPr>
+                <w:rFonts w:ascii="Aptos" w:eastAsia="Aptos" w:hAnsi="Aptos" w:cs="Aptos"/>
+                <w:sz w:val="20"/>
+                <w:szCs w:val="20"/>
+              </w:rPr>
+              <w:t xml:space="preserve">131</w:t>
+            </w:r>
+          </w:p>
+        </w:tc>
+        <w:tc>
+          <w:tcPr>
+            <w:tcW w:w="1850" w:type="pct"/>
+            <w:tcMar>
+              <w:top w:w="30" w:type="dxa"/>
+              <w:left w:w="80" w:type="dxa"/>
+              <w:bottom w:w="30" w:type="dxa"/>
+              <w:right w:w="80" w:type="dxa"/>
+            </w:tcMar>
+          </w:tcPr>
+          <w:p>
+            <w:r>
+              <w:rPr>
+                <w:rFonts w:ascii="Aptos" w:eastAsia="Aptos" w:hAnsi="Aptos" w:cs="Aptos"/>
+                <w:sz w:val="20"/>
+                <w:szCs w:val="20"/>
+              </w:rPr>
+              <w:t xml:space="preserve">Try to refund 2 Large Popcorn from the same booking, when only 1 is left unrefunded</w:t>
+            </w:r>
+          </w:p>
+        </w:tc>
+        <w:tc>
+          <w:tcPr>
+            <w:tcW w:w="560" w:type="pct"/>
+            <w:tcMar>
+              <w:top w:w="30" w:type="dxa"/>
+              <w:left w:w="80" w:type="dxa"/>
+              <w:bottom w:w="30" w:type="dxa"/>
+              <w:right w:w="80" w:type="dxa"/>
+            </w:tcMar>
+          </w:tcPr>
+          <w:p>
+            <w:r>
+              <w:rPr>
+                <w:rFonts w:ascii="Aptos" w:eastAsia="Aptos" w:hAnsi="Aptos" w:cs="Aptos"/>
+                <w:sz w:val="20"/>
+                <w:szCs w:val="20"/>
+              </w:rPr>
+              <w:t xml:space="preserve">Erroneous</w:t>
+            </w:r>
+          </w:p>
+        </w:tc>
+        <w:tc>
+          <w:tcPr>
+            <w:tcW w:w="2290" w:type="pct"/>
+            <w:tcMar>
+              <w:top w:w="30" w:type="dxa"/>
+              <w:left w:w="80" w:type="dxa"/>
+              <w:bottom w:w="30" w:type="dxa"/>
+              <w:right w:w="80" w:type="dxa"/>
+            </w:tcMar>
+          </w:tcPr>
+          <w:p>
+            <w:r>
+              <w:rPr>
+                <w:rFonts w:ascii="Aptos" w:eastAsia="Aptos" w:hAnsi="Aptos" w:cs="Aptos"/>
+                <w:sz w:val="20"/>
+                <w:szCs w:val="20"/>
+              </w:rPr>
+              <w:t xml:space="preserve">The refund is refused and a message appears saying that some of that has already been refunded, and nothing at all is written, because the whole refund is carried out as one transaction.</w:t>
+            </w:r>
+          </w:p>
+        </w:tc>
+      </w:tr>
+      <w:tr>
+        <w:trPr>
+          <w:cantSplit/>
+        </w:trPr>
+        <w:tc>
+          <w:tcPr>
+            <w:tcW w:w="300" w:type="pct"/>
+            <w:tcMar>
+              <w:top w:w="30" w:type="dxa"/>
+              <w:left w:w="80" w:type="dxa"/>
+              <w:bottom w:w="30" w:type="dxa"/>
+              <w:right w:w="80" w:type="dxa"/>
+            </w:tcMar>
+          </w:tcPr>
+          <w:p>
+            <w:r>
+              <w:rPr>
+                <w:rFonts w:ascii="Aptos" w:eastAsia="Aptos" w:hAnsi="Aptos" w:cs="Aptos"/>
+                <w:sz w:val="20"/>
+                <w:szCs w:val="20"/>
+              </w:rPr>
+              <w:t xml:space="preserve">132</w:t>
+            </w:r>
+          </w:p>
+        </w:tc>
+        <w:tc>
+          <w:tcPr>
+            <w:tcW w:w="1850" w:type="pct"/>
+            <w:tcMar>
+              <w:top w:w="30" w:type="dxa"/>
+              <w:left w:w="80" w:type="dxa"/>
+              <w:bottom w:w="30" w:type="dxa"/>
+              <w:right w:w="80" w:type="dxa"/>
+            </w:tcMar>
+          </w:tcPr>
+          <w:p>
+            <w:r>
+              <w:rPr>
+                <w:rFonts w:ascii="Aptos" w:eastAsia="Aptos" w:hAnsi="Aptos" w:cs="Aptos"/>
+                <w:sz w:val="20"/>
+                <w:szCs w:val="20"/>
+              </w:rPr>
+              <w:t xml:space="preserve">Refund the remaining seat B1 and the remaining food from the booking</w:t>
+            </w:r>
+          </w:p>
+        </w:tc>
+        <w:tc>
+          <w:tcPr>
+            <w:tcW w:w="560" w:type="pct"/>
+            <w:tcMar>
+              <w:top w:w="30" w:type="dxa"/>
+              <w:left w:w="80" w:type="dxa"/>
+              <w:bottom w:w="30" w:type="dxa"/>
+              <w:right w:w="80" w:type="dxa"/>
+            </w:tcMar>
+          </w:tcPr>
+          <w:p>
+            <w:r>
+              <w:rPr>
+                <w:rFonts w:ascii="Aptos" w:eastAsia="Aptos" w:hAnsi="Aptos" w:cs="Aptos"/>
+                <w:sz w:val="20"/>
+                <w:szCs w:val="20"/>
+              </w:rPr>
+              <w:t xml:space="preserve">Boundary</w:t>
+            </w:r>
+          </w:p>
+        </w:tc>
+        <w:tc>
+          <w:tcPr>
+            <w:tcW w:w="2290" w:type="pct"/>
+            <w:tcMar>
+              <w:top w:w="30" w:type="dxa"/>
+              <w:left w:w="80" w:type="dxa"/>
+              <w:bottom w:w="30" w:type="dxa"/>
+              <w:right w:w="80" w:type="dxa"/>
+            </w:tcMar>
+          </w:tcPr>
+          <w:p>
+            <w:r>
+              <w:rPr>
+                <w:rFonts w:ascii="Aptos" w:eastAsia="Aptos" w:hAnsi="Aptos" w:cs="Aptos"/>
+                <w:sz w:val="20"/>
+                <w:szCs w:val="20"/>
+              </w:rPr>
+              <w:t xml:space="preserve">The refund succeeds and the booking now flips to a status of Cancelled, because refunding the last thing on a booking is the same as cancelling it. The booking record itself is still there.</w:t>
+            </w:r>
+          </w:p>
+        </w:tc>
+      </w:tr>
+      <w:tr>
+        <w:trPr>
+          <w:cantSplit/>
+        </w:trPr>
+        <w:tc>
+          <w:tcPr>
+            <w:tcW w:w="300" w:type="pct"/>
+            <w:tcMar>
+              <w:top w:w="30" w:type="dxa"/>
+              <w:left w:w="80" w:type="dxa"/>
+              <w:bottom w:w="30" w:type="dxa"/>
+              <w:right w:w="80" w:type="dxa"/>
+            </w:tcMar>
+          </w:tcPr>
+          <w:p>
+            <w:r>
+              <w:rPr>
+                <w:rFonts w:ascii="Aptos" w:eastAsia="Aptos" w:hAnsi="Aptos" w:cs="Aptos"/>
+                <w:sz w:val="20"/>
+                <w:szCs w:val="20"/>
+              </w:rPr>
+              <w:t xml:space="preserve">133</w:t>
+            </w:r>
+          </w:p>
+        </w:tc>
+        <w:tc>
+          <w:tcPr>
+            <w:tcW w:w="1850" w:type="pct"/>
+            <w:tcMar>
+              <w:top w:w="30" w:type="dxa"/>
+              <w:left w:w="80" w:type="dxa"/>
+              <w:bottom w:w="30" w:type="dxa"/>
+              <w:right w:w="80" w:type="dxa"/>
+            </w:tcMar>
+          </w:tcPr>
+          <w:p>
+            <w:r>
+              <w:rPr>
+                <w:rFonts w:ascii="Aptos" w:eastAsia="Aptos" w:hAnsi="Aptos" w:cs="Aptos"/>
+                <w:sz w:val="20"/>
+                <w:szCs w:val="20"/>
+              </w:rPr>
+              <w:t xml:space="preserve">Run the sales report for the range covering these bookings</w:t>
+            </w:r>
+          </w:p>
+        </w:tc>
+        <w:tc>
+          <w:tcPr>
+            <w:tcW w:w="560" w:type="pct"/>
+            <w:tcMar>
+              <w:top w:w="30" w:type="dxa"/>
+              <w:left w:w="80" w:type="dxa"/>
+              <w:bottom w:w="30" w:type="dxa"/>
+              <w:right w:w="80" w:type="dxa"/>
+            </w:tcMar>
+          </w:tcPr>
+          <w:p>
+            <w:r>
+              <w:rPr>
+                <w:rFonts w:ascii="Aptos" w:eastAsia="Aptos" w:hAnsi="Aptos" w:cs="Aptos"/>
+                <w:sz w:val="20"/>
+                <w:szCs w:val="20"/>
+              </w:rPr>
+              <w:t xml:space="preserve">Normal</w:t>
+            </w:r>
+          </w:p>
+        </w:tc>
+        <w:tc>
+          <w:tcPr>
+            <w:tcW w:w="2290" w:type="pct"/>
+            <w:tcMar>
+              <w:top w:w="30" w:type="dxa"/>
+              <w:left w:w="80" w:type="dxa"/>
+              <w:bottom w:w="30" w:type="dxa"/>
+              <w:right w:w="80" w:type="dxa"/>
+            </w:tcMar>
+          </w:tcPr>
+          <w:p>
+            <w:r>
+              <w:rPr>
+                <w:rFonts w:ascii="Aptos" w:eastAsia="Aptos" w:hAnsi="Aptos" w:cs="Aptos"/>
+                <w:sz w:val="20"/>
+                <w:szCs w:val="20"/>
+              </w:rPr>
+              <w:t xml:space="preserve">The takings have come down by exactly the amounts refunded, and the Refunds report lists each refund with its reason and the member of staff who gave it.</w:t>
             </w:r>
           </w:p>
         </w:tc>

</xml_diff>

<commit_message>
added objectives 24, 25 and 26: how long a screening needs, finding a free slot and rounding
</commit_message>
<xml_diff>
--- a/Testing.docx
+++ b/Testing.docx
@@ -14682,6 +14682,963 @@
                 <w:szCs w:val="20"/>
               </w:rPr>
               <w:t xml:space="preserve">The takings have come down by exactly the amounts refunded, and the Refunds report lists each refund with its reason and the member of staff who gave it.</w:t>
+            </w:r>
+          </w:p>
+        </w:tc>
+      </w:tr>
+    </w:tbl>
+    <w:p>
+      <w:r>
+        <w:rPr>
+          <w:rFonts w:ascii="Aptos" w:eastAsia="Aptos" w:hAnsi="Aptos" w:cs="Aptos"/>
+        </w:rPr>
+        <w:t xml:space="preserve"/>
+      </w:r>
+    </w:p>
+    <w:p>
+      <w:pPr>
+        <w:pStyle w:val="Heading3"/>
+      </w:pPr>
+      <w:r>
+        <w:rPr>
+          <w:rFonts w:ascii="Aptos Display" w:eastAsia="Aptos Display" w:hAnsi="Aptos Display" w:cs="Aptos Display"/>
+          <w:b/>
+          <w:bCs/>
+          <w:color w:val="000000"/>
+        </w:rPr>
+        <w:t xml:space="preserve">Objectives 24, 25 and 26: How Long a Screening Needs, Finding a Free Slot and Rounding</w:t>
+      </w:r>
+    </w:p>
+    <w:p>
+      <w:r>
+        <w:rPr>
+          <w:rFonts w:ascii="Aptos" w:eastAsia="Aptos" w:hAnsi="Aptos" w:cs="Aptos"/>
+        </w:rPr>
+        <w:t xml:space="preserve">These three objectives are tested together because they are all part of the same piece of scheduling. Objective 24 says the trailers and the turnaround have to be counted as well as the film, objective 25 says the system should be able to suggest a time rather than only rejecting one, and objective 26 says a suggested time should look like a time a cinema would actually advertise. The settings used are 20 minutes of trailers, 15 minutes of turnaround, a first show at 10:00 and start times rounded up to 15 minutes.</w:t>
+      </w:r>
+    </w:p>
+    <w:tbl>
+      <w:tblPr>
+        <w:tblW w:w="5000" w:type="pct"/>
+        <w:tblBorders>
+          <w:top w:val="single" w:sz="4" w:space="0" w:color="808080"/>
+          <w:left w:val="single" w:sz="4" w:space="0" w:color="808080"/>
+          <w:bottom w:val="single" w:sz="4" w:space="0" w:color="808080"/>
+          <w:right w:val="single" w:sz="4" w:space="0" w:color="808080"/>
+          <w:insideH w:val="single" w:sz="4" w:space="0" w:color="808080"/>
+          <w:insideV w:val="single" w:sz="4" w:space="0" w:color="808080"/>
+        </w:tblBorders>
+        <w:tblCellMar>
+          <w:left w:w="10" w:type="dxa"/>
+          <w:right w:w="10" w:type="dxa"/>
+        </w:tblCellMar>
+        <w:tblLook w:val="0000" w:firstRow="0" w:lastRow="0" w:firstColumn="0" w:lastColumn="0" w:noHBand="0" w:noVBand="0"/>
+      </w:tblPr>
+      <w:tblGrid>
+        <w:gridCol w:w="561"/>
+        <w:gridCol w:w="3460"/>
+        <w:gridCol w:w="1047"/>
+        <w:gridCol w:w="4282"/>
+      </w:tblGrid>
+      <w:tr>
+        <w:trPr>
+          <w:cantSplit/>
+          <w:tblHeader/>
+        </w:trPr>
+        <w:tc>
+          <w:tcPr>
+            <w:tcW w:w="300" w:type="pct"/>
+            <w:shd w:val="clear" w:color="auto" w:fill="F2CEED" w:themeFill="accent5" w:themeFillTint="33"/>
+            <w:tcMar>
+              <w:top w:w="30" w:type="dxa"/>
+              <w:left w:w="80" w:type="dxa"/>
+              <w:bottom w:w="30" w:type="dxa"/>
+              <w:right w:w="80" w:type="dxa"/>
+            </w:tcMar>
+          </w:tcPr>
+          <w:p>
+            <w:r>
+              <w:rPr>
+                <w:rFonts w:ascii="Aptos" w:eastAsia="Aptos" w:hAnsi="Aptos" w:cs="Aptos"/>
+                <w:b/>
+                <w:bCs/>
+                <w:sz w:val="20"/>
+                <w:szCs w:val="20"/>
+              </w:rPr>
+              <w:t xml:space="preserve">No.</w:t>
+            </w:r>
+          </w:p>
+        </w:tc>
+        <w:tc>
+          <w:tcPr>
+            <w:tcW w:w="1850" w:type="pct"/>
+            <w:shd w:val="clear" w:color="auto" w:fill="F2CEED" w:themeFill="accent5" w:themeFillTint="33"/>
+            <w:tcMar>
+              <w:top w:w="30" w:type="dxa"/>
+              <w:left w:w="80" w:type="dxa"/>
+              <w:bottom w:w="30" w:type="dxa"/>
+              <w:right w:w="80" w:type="dxa"/>
+            </w:tcMar>
+          </w:tcPr>
+          <w:p>
+            <w:r>
+              <w:rPr>
+                <w:rFonts w:ascii="Aptos" w:eastAsia="Aptos" w:hAnsi="Aptos" w:cs="Aptos"/>
+                <w:b/>
+                <w:bCs/>
+                <w:sz w:val="20"/>
+                <w:szCs w:val="20"/>
+              </w:rPr>
+              <w:t xml:space="preserve">Test</w:t>
+            </w:r>
+          </w:p>
+        </w:tc>
+        <w:tc>
+          <w:tcPr>
+            <w:tcW w:w="560" w:type="pct"/>
+            <w:shd w:val="clear" w:color="auto" w:fill="F2CEED" w:themeFill="accent5" w:themeFillTint="33"/>
+            <w:tcMar>
+              <w:top w:w="30" w:type="dxa"/>
+              <w:left w:w="80" w:type="dxa"/>
+              <w:bottom w:w="30" w:type="dxa"/>
+              <w:right w:w="80" w:type="dxa"/>
+            </w:tcMar>
+          </w:tcPr>
+          <w:p>
+            <w:r>
+              <w:rPr>
+                <w:rFonts w:ascii="Aptos" w:eastAsia="Aptos" w:hAnsi="Aptos" w:cs="Aptos"/>
+                <w:b/>
+                <w:bCs/>
+                <w:sz w:val="20"/>
+                <w:szCs w:val="20"/>
+              </w:rPr>
+              <w:t xml:space="preserve">Type</w:t>
+            </w:r>
+          </w:p>
+        </w:tc>
+        <w:tc>
+          <w:tcPr>
+            <w:tcW w:w="2290" w:type="pct"/>
+            <w:shd w:val="clear" w:color="auto" w:fill="F2CEED" w:themeFill="accent5" w:themeFillTint="33"/>
+            <w:tcMar>
+              <w:top w:w="30" w:type="dxa"/>
+              <w:left w:w="80" w:type="dxa"/>
+              <w:bottom w:w="30" w:type="dxa"/>
+              <w:right w:w="80" w:type="dxa"/>
+            </w:tcMar>
+          </w:tcPr>
+          <w:p>
+            <w:r>
+              <w:rPr>
+                <w:rFonts w:ascii="Aptos" w:eastAsia="Aptos" w:hAnsi="Aptos" w:cs="Aptos"/>
+                <w:b/>
+                <w:bCs/>
+                <w:sz w:val="20"/>
+                <w:szCs w:val="20"/>
+              </w:rPr>
+              <w:t xml:space="preserve">Expected Result</w:t>
+            </w:r>
+          </w:p>
+        </w:tc>
+      </w:tr>
+      <w:tr>
+        <w:trPr>
+          <w:cantSplit/>
+        </w:trPr>
+        <w:tc>
+          <w:tcPr>
+            <w:tcW w:w="300" w:type="pct"/>
+            <w:tcMar>
+              <w:top w:w="30" w:type="dxa"/>
+              <w:left w:w="80" w:type="dxa"/>
+              <w:bottom w:w="30" w:type="dxa"/>
+              <w:right w:w="80" w:type="dxa"/>
+            </w:tcMar>
+          </w:tcPr>
+          <w:p>
+            <w:r>
+              <w:rPr>
+                <w:rFonts w:ascii="Aptos" w:eastAsia="Aptos" w:hAnsi="Aptos" w:cs="Aptos"/>
+                <w:sz w:val="20"/>
+                <w:szCs w:val="20"/>
+              </w:rPr>
+              <w:t xml:space="preserve">134</w:t>
+            </w:r>
+          </w:p>
+        </w:tc>
+        <w:tc>
+          <w:tcPr>
+            <w:tcW w:w="1850" w:type="pct"/>
+            <w:tcMar>
+              <w:top w:w="30" w:type="dxa"/>
+              <w:left w:w="80" w:type="dxa"/>
+              <w:bottom w:w="30" w:type="dxa"/>
+              <w:right w:w="80" w:type="dxa"/>
+            </w:tcMar>
+          </w:tcPr>
+          <w:p>
+            <w:r>
+              <w:rPr>
+                <w:rFonts w:ascii="Aptos" w:eastAsia="Aptos" w:hAnsi="Aptos" w:cs="Aptos"/>
+                <w:sz w:val="20"/>
+                <w:szCs w:val="20"/>
+              </w:rPr>
+              <w:t xml:space="preserve">Pick Inception, which runs 148 minutes, and enter a start time of 19:30, then look at the end time shown</w:t>
+            </w:r>
+          </w:p>
+        </w:tc>
+        <w:tc>
+          <w:tcPr>
+            <w:tcW w:w="560" w:type="pct"/>
+            <w:tcMar>
+              <w:top w:w="30" w:type="dxa"/>
+              <w:left w:w="80" w:type="dxa"/>
+              <w:bottom w:w="30" w:type="dxa"/>
+              <w:right w:w="80" w:type="dxa"/>
+            </w:tcMar>
+          </w:tcPr>
+          <w:p>
+            <w:r>
+              <w:rPr>
+                <w:rFonts w:ascii="Aptos" w:eastAsia="Aptos" w:hAnsi="Aptos" w:cs="Aptos"/>
+                <w:sz w:val="20"/>
+                <w:szCs w:val="20"/>
+              </w:rPr>
+              <w:t xml:space="preserve">Normal</w:t>
+            </w:r>
+          </w:p>
+        </w:tc>
+        <w:tc>
+          <w:tcPr>
+            <w:tcW w:w="2290" w:type="pct"/>
+            <w:tcMar>
+              <w:top w:w="30" w:type="dxa"/>
+              <w:left w:w="80" w:type="dxa"/>
+              <w:bottom w:w="30" w:type="dxa"/>
+              <w:right w:w="80" w:type="dxa"/>
+            </w:tcMar>
+          </w:tcPr>
+          <w:p>
+            <w:r>
+              <w:rPr>
+                <w:rFonts w:ascii="Aptos" w:eastAsia="Aptos" w:hAnsi="Aptos" w:cs="Aptos"/>
+                <w:sz w:val="20"/>
+                <w:szCs w:val="20"/>
+              </w:rPr>
+              <w:t xml:space="preserve">The end time shown is 22:18, which is 19:30 plus 20 minutes of trailers plus the 148 minute film, so the audience is told when the film finishes.</w:t>
+            </w:r>
+          </w:p>
+        </w:tc>
+      </w:tr>
+      <w:tr>
+        <w:trPr>
+          <w:cantSplit/>
+        </w:trPr>
+        <w:tc>
+          <w:tcPr>
+            <w:tcW w:w="300" w:type="pct"/>
+            <w:tcMar>
+              <w:top w:w="30" w:type="dxa"/>
+              <w:left w:w="80" w:type="dxa"/>
+              <w:bottom w:w="30" w:type="dxa"/>
+              <w:right w:w="80" w:type="dxa"/>
+            </w:tcMar>
+          </w:tcPr>
+          <w:p>
+            <w:r>
+              <w:rPr>
+                <w:rFonts w:ascii="Aptos" w:eastAsia="Aptos" w:hAnsi="Aptos" w:cs="Aptos"/>
+                <w:sz w:val="20"/>
+                <w:szCs w:val="20"/>
+              </w:rPr>
+              <w:t xml:space="preserve">135</w:t>
+            </w:r>
+          </w:p>
+        </w:tc>
+        <w:tc>
+          <w:tcPr>
+            <w:tcW w:w="1850" w:type="pct"/>
+            <w:tcMar>
+              <w:top w:w="30" w:type="dxa"/>
+              <w:left w:w="80" w:type="dxa"/>
+              <w:bottom w:w="30" w:type="dxa"/>
+              <w:right w:w="80" w:type="dxa"/>
+            </w:tcMar>
+          </w:tcPr>
+          <w:p>
+            <w:r>
+              <w:rPr>
+                <w:rFonts w:ascii="Aptos" w:eastAsia="Aptos" w:hAnsi="Aptos" w:cs="Aptos"/>
+                <w:sz w:val="20"/>
+                <w:szCs w:val="20"/>
+              </w:rPr>
+              <w:t xml:space="preserve">With the same screening entered, check when the screen is treated as free again</w:t>
+            </w:r>
+          </w:p>
+        </w:tc>
+        <w:tc>
+          <w:tcPr>
+            <w:tcW w:w="560" w:type="pct"/>
+            <w:tcMar>
+              <w:top w:w="30" w:type="dxa"/>
+              <w:left w:w="80" w:type="dxa"/>
+              <w:bottom w:w="30" w:type="dxa"/>
+              <w:right w:w="80" w:type="dxa"/>
+            </w:tcMar>
+          </w:tcPr>
+          <w:p>
+            <w:r>
+              <w:rPr>
+                <w:rFonts w:ascii="Aptos" w:eastAsia="Aptos" w:hAnsi="Aptos" w:cs="Aptos"/>
+                <w:sz w:val="20"/>
+                <w:szCs w:val="20"/>
+              </w:rPr>
+              <w:t xml:space="preserve">Normal</w:t>
+            </w:r>
+          </w:p>
+        </w:tc>
+        <w:tc>
+          <w:tcPr>
+            <w:tcW w:w="2290" w:type="pct"/>
+            <w:tcMar>
+              <w:top w:w="30" w:type="dxa"/>
+              <w:left w:w="80" w:type="dxa"/>
+              <w:bottom w:w="30" w:type="dxa"/>
+              <w:right w:w="80" w:type="dxa"/>
+            </w:tcMar>
+          </w:tcPr>
+          <w:p>
+            <w:r>
+              <w:rPr>
+                <w:rFonts w:ascii="Aptos" w:eastAsia="Aptos" w:hAnsi="Aptos" w:cs="Aptos"/>
+                <w:sz w:val="20"/>
+                <w:szCs w:val="20"/>
+              </w:rPr>
+              <w:t xml:space="preserve">The screen is not free until 22:33, because the 15 minute turnaround is added on top of the end of the film, so the screen is held for 183 minutes in total rather than for the 148 minutes the film runs.</w:t>
+            </w:r>
+          </w:p>
+        </w:tc>
+      </w:tr>
+      <w:tr>
+        <w:trPr>
+          <w:cantSplit/>
+        </w:trPr>
+        <w:tc>
+          <w:tcPr>
+            <w:tcW w:w="300" w:type="pct"/>
+            <w:tcMar>
+              <w:top w:w="30" w:type="dxa"/>
+              <w:left w:w="80" w:type="dxa"/>
+              <w:bottom w:w="30" w:type="dxa"/>
+              <w:right w:w="80" w:type="dxa"/>
+            </w:tcMar>
+          </w:tcPr>
+          <w:p>
+            <w:r>
+              <w:rPr>
+                <w:rFonts w:ascii="Aptos" w:eastAsia="Aptos" w:hAnsi="Aptos" w:cs="Aptos"/>
+                <w:sz w:val="20"/>
+                <w:szCs w:val="20"/>
+              </w:rPr>
+              <w:t xml:space="preserve">136</w:t>
+            </w:r>
+          </w:p>
+        </w:tc>
+        <w:tc>
+          <w:tcPr>
+            <w:tcW w:w="1850" w:type="pct"/>
+            <w:tcMar>
+              <w:top w:w="30" w:type="dxa"/>
+              <w:left w:w="80" w:type="dxa"/>
+              <w:bottom w:w="30" w:type="dxa"/>
+              <w:right w:w="80" w:type="dxa"/>
+            </w:tcMar>
+          </w:tcPr>
+          <w:p>
+            <w:r>
+              <w:rPr>
+                <w:rFonts w:ascii="Aptos" w:eastAsia="Aptos" w:hAnsi="Aptos" w:cs="Aptos"/>
+                <w:sz w:val="20"/>
+                <w:szCs w:val="20"/>
+              </w:rPr>
+              <w:t xml:space="preserve">Press Find me a free time without picking a film first</w:t>
+            </w:r>
+          </w:p>
+        </w:tc>
+        <w:tc>
+          <w:tcPr>
+            <w:tcW w:w="560" w:type="pct"/>
+            <w:tcMar>
+              <w:top w:w="30" w:type="dxa"/>
+              <w:left w:w="80" w:type="dxa"/>
+              <w:bottom w:w="30" w:type="dxa"/>
+              <w:right w:w="80" w:type="dxa"/>
+            </w:tcMar>
+          </w:tcPr>
+          <w:p>
+            <w:r>
+              <w:rPr>
+                <w:rFonts w:ascii="Aptos" w:eastAsia="Aptos" w:hAnsi="Aptos" w:cs="Aptos"/>
+                <w:sz w:val="20"/>
+                <w:szCs w:val="20"/>
+              </w:rPr>
+              <w:t xml:space="preserve">Erroneous</w:t>
+            </w:r>
+          </w:p>
+        </w:tc>
+        <w:tc>
+          <w:tcPr>
+            <w:tcW w:w="2290" w:type="pct"/>
+            <w:tcMar>
+              <w:top w:w="30" w:type="dxa"/>
+              <w:left w:w="80" w:type="dxa"/>
+              <w:bottom w:w="30" w:type="dxa"/>
+              <w:right w:w="80" w:type="dxa"/>
+            </w:tcMar>
+          </w:tcPr>
+          <w:p>
+            <w:r>
+              <w:rPr>
+                <w:rFonts w:ascii="Aptos" w:eastAsia="Aptos" w:hAnsi="Aptos" w:cs="Aptos"/>
+                <w:sz w:val="20"/>
+                <w:szCs w:val="20"/>
+              </w:rPr>
+              <w:t xml:space="preserve">No time is suggested and a message appears stating “Pick a film first, otherwise there is no way to know how long it needs”, because the length of the film is what the calculation depends on.</w:t>
+            </w:r>
+          </w:p>
+        </w:tc>
+      </w:tr>
+      <w:tr>
+        <w:trPr>
+          <w:cantSplit/>
+        </w:trPr>
+        <w:tc>
+          <w:tcPr>
+            <w:tcW w:w="300" w:type="pct"/>
+            <w:tcMar>
+              <w:top w:w="30" w:type="dxa"/>
+              <w:left w:w="80" w:type="dxa"/>
+              <w:bottom w:w="30" w:type="dxa"/>
+              <w:right w:w="80" w:type="dxa"/>
+            </w:tcMar>
+          </w:tcPr>
+          <w:p>
+            <w:r>
+              <w:rPr>
+                <w:rFonts w:ascii="Aptos" w:eastAsia="Aptos" w:hAnsi="Aptos" w:cs="Aptos"/>
+                <w:sz w:val="20"/>
+                <w:szCs w:val="20"/>
+              </w:rPr>
+              <w:t xml:space="preserve">137</w:t>
+            </w:r>
+          </w:p>
+        </w:tc>
+        <w:tc>
+          <w:tcPr>
+            <w:tcW w:w="1850" w:type="pct"/>
+            <w:tcMar>
+              <w:top w:w="30" w:type="dxa"/>
+              <w:left w:w="80" w:type="dxa"/>
+              <w:bottom w:w="30" w:type="dxa"/>
+              <w:right w:w="80" w:type="dxa"/>
+            </w:tcMar>
+          </w:tcPr>
+          <w:p>
+            <w:r>
+              <w:rPr>
+                <w:rFonts w:ascii="Aptos" w:eastAsia="Aptos" w:hAnsi="Aptos" w:cs="Aptos"/>
+                <w:sz w:val="20"/>
+                <w:szCs w:val="20"/>
+              </w:rPr>
+              <w:t xml:space="preserve">With Inception and Screen 1 picked on 20/07/2026, where the only screening that day is the one at 19:30, press Find me a free time</w:t>
+            </w:r>
+          </w:p>
+        </w:tc>
+        <w:tc>
+          <w:tcPr>
+            <w:tcW w:w="560" w:type="pct"/>
+            <w:tcMar>
+              <w:top w:w="30" w:type="dxa"/>
+              <w:left w:w="80" w:type="dxa"/>
+              <w:bottom w:w="30" w:type="dxa"/>
+              <w:right w:w="80" w:type="dxa"/>
+            </w:tcMar>
+          </w:tcPr>
+          <w:p>
+            <w:r>
+              <w:rPr>
+                <w:rFonts w:ascii="Aptos" w:eastAsia="Aptos" w:hAnsi="Aptos" w:cs="Aptos"/>
+                <w:sz w:val="20"/>
+                <w:szCs w:val="20"/>
+              </w:rPr>
+              <w:t xml:space="preserve">Normal</w:t>
+            </w:r>
+          </w:p>
+        </w:tc>
+        <w:tc>
+          <w:tcPr>
+            <w:tcW w:w="2290" w:type="pct"/>
+            <w:tcMar>
+              <w:top w:w="30" w:type="dxa"/>
+              <w:left w:w="80" w:type="dxa"/>
+              <w:bottom w:w="30" w:type="dxa"/>
+              <w:right w:w="80" w:type="dxa"/>
+            </w:tcMar>
+          </w:tcPr>
+          <w:p>
+            <w:r>
+              <w:rPr>
+                <w:rFonts w:ascii="Aptos" w:eastAsia="Aptos" w:hAnsi="Aptos" w:cs="Aptos"/>
+                <w:sz w:val="20"/>
+                <w:szCs w:val="20"/>
+              </w:rPr>
+              <w:t xml:space="preserve">10:00 is suggested, because the system looks for the first gap of the day starting from the first show time rather than simply going after the last screening, and the whole morning is free.</w:t>
+            </w:r>
+          </w:p>
+        </w:tc>
+      </w:tr>
+      <w:tr>
+        <w:trPr>
+          <w:cantSplit/>
+        </w:trPr>
+        <w:tc>
+          <w:tcPr>
+            <w:tcW w:w="300" w:type="pct"/>
+            <w:tcMar>
+              <w:top w:w="30" w:type="dxa"/>
+              <w:left w:w="80" w:type="dxa"/>
+              <w:bottom w:w="30" w:type="dxa"/>
+              <w:right w:w="80" w:type="dxa"/>
+            </w:tcMar>
+          </w:tcPr>
+          <w:p>
+            <w:r>
+              <w:rPr>
+                <w:rFonts w:ascii="Aptos" w:eastAsia="Aptos" w:hAnsi="Aptos" w:cs="Aptos"/>
+                <w:sz w:val="20"/>
+                <w:szCs w:val="20"/>
+              </w:rPr>
+              <w:t xml:space="preserve">138</w:t>
+            </w:r>
+          </w:p>
+        </w:tc>
+        <w:tc>
+          <w:tcPr>
+            <w:tcW w:w="1850" w:type="pct"/>
+            <w:tcMar>
+              <w:top w:w="30" w:type="dxa"/>
+              <w:left w:w="80" w:type="dxa"/>
+              <w:bottom w:w="30" w:type="dxa"/>
+              <w:right w:w="80" w:type="dxa"/>
+            </w:tcMar>
+          </w:tcPr>
+          <w:p>
+            <w:r>
+              <w:rPr>
+                <w:rFonts w:ascii="Aptos" w:eastAsia="Aptos" w:hAnsi="Aptos" w:cs="Aptos"/>
+                <w:sz w:val="20"/>
+                <w:szCs w:val="20"/>
+              </w:rPr>
+              <w:t xml:space="preserve">Add that 10:00 screening, then press Find me a free time again for another showing of Inception on the same screen and day</w:t>
+            </w:r>
+          </w:p>
+        </w:tc>
+        <w:tc>
+          <w:tcPr>
+            <w:tcW w:w="560" w:type="pct"/>
+            <w:tcMar>
+              <w:top w:w="30" w:type="dxa"/>
+              <w:left w:w="80" w:type="dxa"/>
+              <w:bottom w:w="30" w:type="dxa"/>
+              <w:right w:w="80" w:type="dxa"/>
+            </w:tcMar>
+          </w:tcPr>
+          <w:p>
+            <w:r>
+              <w:rPr>
+                <w:rFonts w:ascii="Aptos" w:eastAsia="Aptos" w:hAnsi="Aptos" w:cs="Aptos"/>
+                <w:sz w:val="20"/>
+                <w:szCs w:val="20"/>
+              </w:rPr>
+              <w:t xml:space="preserve">Normal</w:t>
+            </w:r>
+          </w:p>
+        </w:tc>
+        <w:tc>
+          <w:tcPr>
+            <w:tcW w:w="2290" w:type="pct"/>
+            <w:tcMar>
+              <w:top w:w="30" w:type="dxa"/>
+              <w:left w:w="80" w:type="dxa"/>
+              <w:bottom w:w="30" w:type="dxa"/>
+              <w:right w:w="80" w:type="dxa"/>
+            </w:tcMar>
+          </w:tcPr>
+          <w:p>
+            <w:r>
+              <w:rPr>
+                <w:rFonts w:ascii="Aptos" w:eastAsia="Aptos" w:hAnsi="Aptos" w:cs="Aptos"/>
+                <w:sz w:val="20"/>
+                <w:szCs w:val="20"/>
+              </w:rPr>
+              <w:t xml:space="preserve">13:15 is suggested. The 10:00 screening holds the screen until 13:03, and 13:03 rounded up to the next 15 minutes is 13:15.</w:t>
+            </w:r>
+          </w:p>
+        </w:tc>
+      </w:tr>
+      <w:tr>
+        <w:trPr>
+          <w:cantSplit/>
+        </w:trPr>
+        <w:tc>
+          <w:tcPr>
+            <w:tcW w:w="300" w:type="pct"/>
+            <w:tcMar>
+              <w:top w:w="30" w:type="dxa"/>
+              <w:left w:w="80" w:type="dxa"/>
+              <w:bottom w:w="30" w:type="dxa"/>
+              <w:right w:w="80" w:type="dxa"/>
+            </w:tcMar>
+          </w:tcPr>
+          <w:p>
+            <w:r>
+              <w:rPr>
+                <w:rFonts w:ascii="Aptos" w:eastAsia="Aptos" w:hAnsi="Aptos" w:cs="Aptos"/>
+                <w:sz w:val="20"/>
+                <w:szCs w:val="20"/>
+              </w:rPr>
+              <w:t xml:space="preserve">139</w:t>
+            </w:r>
+          </w:p>
+        </w:tc>
+        <w:tc>
+          <w:tcPr>
+            <w:tcW w:w="1850" w:type="pct"/>
+            <w:tcMar>
+              <w:top w:w="30" w:type="dxa"/>
+              <w:left w:w="80" w:type="dxa"/>
+              <w:bottom w:w="30" w:type="dxa"/>
+              <w:right w:w="80" w:type="dxa"/>
+            </w:tcMar>
+          </w:tcPr>
+          <w:p>
+            <w:r>
+              <w:rPr>
+                <w:rFonts w:ascii="Aptos" w:eastAsia="Aptos" w:hAnsi="Aptos" w:cs="Aptos"/>
+                <w:sz w:val="20"/>
+                <w:szCs w:val="20"/>
+              </w:rPr>
+              <w:t xml:space="preserve">Change the rounding setting to 10 minutes and press Find me a free time again</w:t>
+            </w:r>
+          </w:p>
+        </w:tc>
+        <w:tc>
+          <w:tcPr>
+            <w:tcW w:w="560" w:type="pct"/>
+            <w:tcMar>
+              <w:top w:w="30" w:type="dxa"/>
+              <w:left w:w="80" w:type="dxa"/>
+              <w:bottom w:w="30" w:type="dxa"/>
+              <w:right w:w="80" w:type="dxa"/>
+            </w:tcMar>
+          </w:tcPr>
+          <w:p>
+            <w:r>
+              <w:rPr>
+                <w:rFonts w:ascii="Aptos" w:eastAsia="Aptos" w:hAnsi="Aptos" w:cs="Aptos"/>
+                <w:sz w:val="20"/>
+                <w:szCs w:val="20"/>
+              </w:rPr>
+              <w:t xml:space="preserve">Normal</w:t>
+            </w:r>
+          </w:p>
+        </w:tc>
+        <w:tc>
+          <w:tcPr>
+            <w:tcW w:w="2290" w:type="pct"/>
+            <w:tcMar>
+              <w:top w:w="30" w:type="dxa"/>
+              <w:left w:w="80" w:type="dxa"/>
+              <w:bottom w:w="30" w:type="dxa"/>
+              <w:right w:w="80" w:type="dxa"/>
+            </w:tcMar>
+          </w:tcPr>
+          <w:p>
+            <w:r>
+              <w:rPr>
+                <w:rFonts w:ascii="Aptos" w:eastAsia="Aptos" w:hAnsi="Aptos" w:cs="Aptos"/>
+                <w:sz w:val="20"/>
+                <w:szCs w:val="20"/>
+              </w:rPr>
+              <w:t xml:space="preserve">13:10 is suggested instead, because 13:03 rounded up to the next 10 minutes is 13:10, so the rounding is taken from the setting rather than being fixed in the program.</w:t>
+            </w:r>
+          </w:p>
+        </w:tc>
+      </w:tr>
+      <w:tr>
+        <w:trPr>
+          <w:cantSplit/>
+        </w:trPr>
+        <w:tc>
+          <w:tcPr>
+            <w:tcW w:w="300" w:type="pct"/>
+            <w:tcMar>
+              <w:top w:w="30" w:type="dxa"/>
+              <w:left w:w="80" w:type="dxa"/>
+              <w:bottom w:w="30" w:type="dxa"/>
+              <w:right w:w="80" w:type="dxa"/>
+            </w:tcMar>
+          </w:tcPr>
+          <w:p>
+            <w:r>
+              <w:rPr>
+                <w:rFonts w:ascii="Aptos" w:eastAsia="Aptos" w:hAnsi="Aptos" w:cs="Aptos"/>
+                <w:sz w:val="20"/>
+                <w:szCs w:val="20"/>
+              </w:rPr>
+              <w:t xml:space="preserve">140</w:t>
+            </w:r>
+          </w:p>
+        </w:tc>
+        <w:tc>
+          <w:tcPr>
+            <w:tcW w:w="1850" w:type="pct"/>
+            <w:tcMar>
+              <w:top w:w="30" w:type="dxa"/>
+              <w:left w:w="80" w:type="dxa"/>
+              <w:bottom w:w="30" w:type="dxa"/>
+              <w:right w:w="80" w:type="dxa"/>
+            </w:tcMar>
+          </w:tcPr>
+          <w:p>
+            <w:r>
+              <w:rPr>
+                <w:rFonts w:ascii="Aptos" w:eastAsia="Aptos" w:hAnsi="Aptos" w:cs="Aptos"/>
+                <w:sz w:val="20"/>
+                <w:szCs w:val="20"/>
+              </w:rPr>
+              <w:t xml:space="preserve">In the settings, enter a rounding of 7 minutes and save</w:t>
+            </w:r>
+          </w:p>
+        </w:tc>
+        <w:tc>
+          <w:tcPr>
+            <w:tcW w:w="560" w:type="pct"/>
+            <w:tcMar>
+              <w:top w:w="30" w:type="dxa"/>
+              <w:left w:w="80" w:type="dxa"/>
+              <w:bottom w:w="30" w:type="dxa"/>
+              <w:right w:w="80" w:type="dxa"/>
+            </w:tcMar>
+          </w:tcPr>
+          <w:p>
+            <w:r>
+              <w:rPr>
+                <w:rFonts w:ascii="Aptos" w:eastAsia="Aptos" w:hAnsi="Aptos" w:cs="Aptos"/>
+                <w:sz w:val="20"/>
+                <w:szCs w:val="20"/>
+              </w:rPr>
+              <w:t xml:space="preserve">Erroneous</w:t>
+            </w:r>
+          </w:p>
+        </w:tc>
+        <w:tc>
+          <w:tcPr>
+            <w:tcW w:w="2290" w:type="pct"/>
+            <w:tcMar>
+              <w:top w:w="30" w:type="dxa"/>
+              <w:left w:w="80" w:type="dxa"/>
+              <w:bottom w:w="30" w:type="dxa"/>
+              <w:right w:w="80" w:type="dxa"/>
+            </w:tcMar>
+          </w:tcPr>
+          <w:p>
+            <w:r>
+              <w:rPr>
+                <w:rFonts w:ascii="Aptos" w:eastAsia="Aptos" w:hAnsi="Aptos" w:cs="Aptos"/>
+                <w:sz w:val="20"/>
+                <w:szCs w:val="20"/>
+              </w:rPr>
+              <w:t xml:space="preserve">The setting is rejected and a message appears stating “Round start times to a number of minutes that divides into an hour, like 5, 10, 15 or 30.”, because a rounding that does not divide into an hour produces start times that drift.</w:t>
+            </w:r>
+          </w:p>
+        </w:tc>
+      </w:tr>
+      <w:tr>
+        <w:trPr>
+          <w:cantSplit/>
+        </w:trPr>
+        <w:tc>
+          <w:tcPr>
+            <w:tcW w:w="300" w:type="pct"/>
+            <w:tcMar>
+              <w:top w:w="30" w:type="dxa"/>
+              <w:left w:w="80" w:type="dxa"/>
+              <w:bottom w:w="30" w:type="dxa"/>
+              <w:right w:w="80" w:type="dxa"/>
+            </w:tcMar>
+          </w:tcPr>
+          <w:p>
+            <w:r>
+              <w:rPr>
+                <w:rFonts w:ascii="Aptos" w:eastAsia="Aptos" w:hAnsi="Aptos" w:cs="Aptos"/>
+                <w:sz w:val="20"/>
+                <w:szCs w:val="20"/>
+              </w:rPr>
+              <w:t xml:space="preserve">141</w:t>
+            </w:r>
+          </w:p>
+        </w:tc>
+        <w:tc>
+          <w:tcPr>
+            <w:tcW w:w="1850" w:type="pct"/>
+            <w:tcMar>
+              <w:top w:w="30" w:type="dxa"/>
+              <w:left w:w="80" w:type="dxa"/>
+              <w:bottom w:w="30" w:type="dxa"/>
+              <w:right w:w="80" w:type="dxa"/>
+            </w:tcMar>
+          </w:tcPr>
+          <w:p>
+            <w:r>
+              <w:rPr>
+                <w:rFonts w:ascii="Aptos" w:eastAsia="Aptos" w:hAnsi="Aptos" w:cs="Aptos"/>
+                <w:sz w:val="20"/>
+                <w:szCs w:val="20"/>
+              </w:rPr>
+              <w:t xml:space="preserve">Fill the whole of a day on Screen 1 with screenings, then press Find me a free time</w:t>
+            </w:r>
+          </w:p>
+        </w:tc>
+        <w:tc>
+          <w:tcPr>
+            <w:tcW w:w="560" w:type="pct"/>
+            <w:tcMar>
+              <w:top w:w="30" w:type="dxa"/>
+              <w:left w:w="80" w:type="dxa"/>
+              <w:bottom w:w="30" w:type="dxa"/>
+              <w:right w:w="80" w:type="dxa"/>
+            </w:tcMar>
+          </w:tcPr>
+          <w:p>
+            <w:r>
+              <w:rPr>
+                <w:rFonts w:ascii="Aptos" w:eastAsia="Aptos" w:hAnsi="Aptos" w:cs="Aptos"/>
+                <w:sz w:val="20"/>
+                <w:szCs w:val="20"/>
+              </w:rPr>
+              <w:t xml:space="preserve">Boundary</w:t>
+            </w:r>
+          </w:p>
+        </w:tc>
+        <w:tc>
+          <w:tcPr>
+            <w:tcW w:w="2290" w:type="pct"/>
+            <w:tcMar>
+              <w:top w:w="30" w:type="dxa"/>
+              <w:left w:w="80" w:type="dxa"/>
+              <w:bottom w:w="30" w:type="dxa"/>
+              <w:right w:w="80" w:type="dxa"/>
+            </w:tcMar>
+          </w:tcPr>
+          <w:p>
+            <w:r>
+              <w:rPr>
+                <w:rFonts w:ascii="Aptos" w:eastAsia="Aptos" w:hAnsi="Aptos" w:cs="Aptos"/>
+                <w:sz w:val="20"/>
+                <w:szCs w:val="20"/>
+              </w:rPr>
+              <w:t xml:space="preserve">No time is suggested and a message appears saying there is no room left for that film on that screen that day, rather than the system suggesting a time that runs past the last show time.</w:t>
+            </w:r>
+          </w:p>
+        </w:tc>
+      </w:tr>
+      <w:tr>
+        <w:trPr>
+          <w:cantSplit/>
+        </w:trPr>
+        <w:tc>
+          <w:tcPr>
+            <w:tcW w:w="300" w:type="pct"/>
+            <w:tcMar>
+              <w:top w:w="30" w:type="dxa"/>
+              <w:left w:w="80" w:type="dxa"/>
+              <w:bottom w:w="30" w:type="dxa"/>
+              <w:right w:w="80" w:type="dxa"/>
+            </w:tcMar>
+          </w:tcPr>
+          <w:p>
+            <w:r>
+              <w:rPr>
+                <w:rFonts w:ascii="Aptos" w:eastAsia="Aptos" w:hAnsi="Aptos" w:cs="Aptos"/>
+                <w:sz w:val="20"/>
+                <w:szCs w:val="20"/>
+              </w:rPr>
+              <w:t xml:space="preserve">142</w:t>
+            </w:r>
+          </w:p>
+        </w:tc>
+        <w:tc>
+          <w:tcPr>
+            <w:tcW w:w="1850" w:type="pct"/>
+            <w:tcMar>
+              <w:top w:w="30" w:type="dxa"/>
+              <w:left w:w="80" w:type="dxa"/>
+              <w:bottom w:w="30" w:type="dxa"/>
+              <w:right w:w="80" w:type="dxa"/>
+            </w:tcMar>
+          </w:tcPr>
+          <w:p>
+            <w:r>
+              <w:rPr>
+                <w:rFonts w:ascii="Aptos" w:eastAsia="Aptos" w:hAnsi="Aptos" w:cs="Aptos"/>
+                <w:sz w:val="20"/>
+                <w:szCs w:val="20"/>
+              </w:rPr>
+              <w:t xml:space="preserve">Change the trailers setting from 20 minutes to 25 and look at the free time suggestion again</w:t>
+            </w:r>
+          </w:p>
+        </w:tc>
+        <w:tc>
+          <w:tcPr>
+            <w:tcW w:w="560" w:type="pct"/>
+            <w:tcMar>
+              <w:top w:w="30" w:type="dxa"/>
+              <w:left w:w="80" w:type="dxa"/>
+              <w:bottom w:w="30" w:type="dxa"/>
+              <w:right w:w="80" w:type="dxa"/>
+            </w:tcMar>
+          </w:tcPr>
+          <w:p>
+            <w:r>
+              <w:rPr>
+                <w:rFonts w:ascii="Aptos" w:eastAsia="Aptos" w:hAnsi="Aptos" w:cs="Aptos"/>
+                <w:sz w:val="20"/>
+                <w:szCs w:val="20"/>
+              </w:rPr>
+              <w:t xml:space="preserve">Normal</w:t>
+            </w:r>
+          </w:p>
+        </w:tc>
+        <w:tc>
+          <w:tcPr>
+            <w:tcW w:w="2290" w:type="pct"/>
+            <w:tcMar>
+              <w:top w:w="30" w:type="dxa"/>
+              <w:left w:w="80" w:type="dxa"/>
+              <w:bottom w:w="30" w:type="dxa"/>
+              <w:right w:w="80" w:type="dxa"/>
+            </w:tcMar>
+          </w:tcPr>
+          <w:p>
+            <w:r>
+              <w:rPr>
+                <w:rFonts w:ascii="Aptos" w:eastAsia="Aptos" w:hAnsi="Aptos" w:cs="Aptos"/>
+                <w:sz w:val="20"/>
+                <w:szCs w:val="20"/>
+              </w:rPr>
+              <w:t xml:space="preserve">The suggested time moves later by 5 minutes, showing that the advertising time is read from the setting rather than being fixed. The setting is then put back to 20.</w:t>
             </w:r>
           </w:p>
         </w:tc>

</xml_diff>

<commit_message>
added objective 27: scheduling a film across a range of dates
</commit_message>
<xml_diff>
--- a/Testing.docx
+++ b/Testing.docx
@@ -15639,6 +15639,785 @@
                 <w:szCs w:val="20"/>
               </w:rPr>
               <w:t xml:space="preserve">The suggested time moves later by 5 minutes, showing that the advertising time is read from the setting rather than being fixed. The setting is then put back to 20.</w:t>
+            </w:r>
+          </w:p>
+        </w:tc>
+      </w:tr>
+    </w:tbl>
+    <w:p>
+      <w:r>
+        <w:rPr>
+          <w:rFonts w:ascii="Aptos" w:eastAsia="Aptos" w:hAnsi="Aptos" w:cs="Aptos"/>
+        </w:rPr>
+        <w:t xml:space="preserve"/>
+      </w:r>
+    </w:p>
+    <w:p>
+      <w:pPr>
+        <w:pStyle w:val="Heading3"/>
+      </w:pPr>
+      <w:r>
+        <w:rPr>
+          <w:rFonts w:ascii="Aptos Display" w:eastAsia="Aptos Display" w:hAnsi="Aptos Display" w:cs="Aptos Display"/>
+          <w:b/>
+          <w:bCs/>
+          <w:color w:val="000000"/>
+        </w:rPr>
+        <w:t xml:space="preserve">Objective 27: Scheduling a Film Across a Range of Dates</w:t>
+      </w:r>
+    </w:p>
+    <w:p>
+      <w:r>
+        <w:rPr>
+          <w:rFonts w:ascii="Aptos" w:eastAsia="Aptos" w:hAnsi="Aptos" w:cs="Aptos"/>
+        </w:rPr>
+        <w:t xml:space="preserve">Entering a film's whole run one screening at a time was one of the things staff raised about the prototype. These tests check that a run can be entered once and that the system deals sensibly with the days in the run where the screen is not actually free.</w:t>
+      </w:r>
+    </w:p>
+    <w:tbl>
+      <w:tblPr>
+        <w:tblW w:w="5000" w:type="pct"/>
+        <w:tblBorders>
+          <w:top w:val="single" w:sz="4" w:space="0" w:color="808080"/>
+          <w:left w:val="single" w:sz="4" w:space="0" w:color="808080"/>
+          <w:bottom w:val="single" w:sz="4" w:space="0" w:color="808080"/>
+          <w:right w:val="single" w:sz="4" w:space="0" w:color="808080"/>
+          <w:insideH w:val="single" w:sz="4" w:space="0" w:color="808080"/>
+          <w:insideV w:val="single" w:sz="4" w:space="0" w:color="808080"/>
+        </w:tblBorders>
+        <w:tblCellMar>
+          <w:left w:w="10" w:type="dxa"/>
+          <w:right w:w="10" w:type="dxa"/>
+        </w:tblCellMar>
+        <w:tblLook w:val="0000" w:firstRow="0" w:lastRow="0" w:firstColumn="0" w:lastColumn="0" w:noHBand="0" w:noVBand="0"/>
+      </w:tblPr>
+      <w:tblGrid>
+        <w:gridCol w:w="561"/>
+        <w:gridCol w:w="3460"/>
+        <w:gridCol w:w="1047"/>
+        <w:gridCol w:w="4282"/>
+      </w:tblGrid>
+      <w:tr>
+        <w:trPr>
+          <w:cantSplit/>
+          <w:tblHeader/>
+        </w:trPr>
+        <w:tc>
+          <w:tcPr>
+            <w:tcW w:w="300" w:type="pct"/>
+            <w:shd w:val="clear" w:color="auto" w:fill="F2CEED" w:themeFill="accent5" w:themeFillTint="33"/>
+            <w:tcMar>
+              <w:top w:w="30" w:type="dxa"/>
+              <w:left w:w="80" w:type="dxa"/>
+              <w:bottom w:w="30" w:type="dxa"/>
+              <w:right w:w="80" w:type="dxa"/>
+            </w:tcMar>
+          </w:tcPr>
+          <w:p>
+            <w:r>
+              <w:rPr>
+                <w:rFonts w:ascii="Aptos" w:eastAsia="Aptos" w:hAnsi="Aptos" w:cs="Aptos"/>
+                <w:b/>
+                <w:bCs/>
+                <w:sz w:val="20"/>
+                <w:szCs w:val="20"/>
+              </w:rPr>
+              <w:t xml:space="preserve">No.</w:t>
+            </w:r>
+          </w:p>
+        </w:tc>
+        <w:tc>
+          <w:tcPr>
+            <w:tcW w:w="1850" w:type="pct"/>
+            <w:shd w:val="clear" w:color="auto" w:fill="F2CEED" w:themeFill="accent5" w:themeFillTint="33"/>
+            <w:tcMar>
+              <w:top w:w="30" w:type="dxa"/>
+              <w:left w:w="80" w:type="dxa"/>
+              <w:bottom w:w="30" w:type="dxa"/>
+              <w:right w:w="80" w:type="dxa"/>
+            </w:tcMar>
+          </w:tcPr>
+          <w:p>
+            <w:r>
+              <w:rPr>
+                <w:rFonts w:ascii="Aptos" w:eastAsia="Aptos" w:hAnsi="Aptos" w:cs="Aptos"/>
+                <w:b/>
+                <w:bCs/>
+                <w:sz w:val="20"/>
+                <w:szCs w:val="20"/>
+              </w:rPr>
+              <w:t xml:space="preserve">Test</w:t>
+            </w:r>
+          </w:p>
+        </w:tc>
+        <w:tc>
+          <w:tcPr>
+            <w:tcW w:w="560" w:type="pct"/>
+            <w:shd w:val="clear" w:color="auto" w:fill="F2CEED" w:themeFill="accent5" w:themeFillTint="33"/>
+            <w:tcMar>
+              <w:top w:w="30" w:type="dxa"/>
+              <w:left w:w="80" w:type="dxa"/>
+              <w:bottom w:w="30" w:type="dxa"/>
+              <w:right w:w="80" w:type="dxa"/>
+            </w:tcMar>
+          </w:tcPr>
+          <w:p>
+            <w:r>
+              <w:rPr>
+                <w:rFonts w:ascii="Aptos" w:eastAsia="Aptos" w:hAnsi="Aptos" w:cs="Aptos"/>
+                <w:b/>
+                <w:bCs/>
+                <w:sz w:val="20"/>
+                <w:szCs w:val="20"/>
+              </w:rPr>
+              <w:t xml:space="preserve">Type</w:t>
+            </w:r>
+          </w:p>
+        </w:tc>
+        <w:tc>
+          <w:tcPr>
+            <w:tcW w:w="2290" w:type="pct"/>
+            <w:shd w:val="clear" w:color="auto" w:fill="F2CEED" w:themeFill="accent5" w:themeFillTint="33"/>
+            <w:tcMar>
+              <w:top w:w="30" w:type="dxa"/>
+              <w:left w:w="80" w:type="dxa"/>
+              <w:bottom w:w="30" w:type="dxa"/>
+              <w:right w:w="80" w:type="dxa"/>
+            </w:tcMar>
+          </w:tcPr>
+          <w:p>
+            <w:r>
+              <w:rPr>
+                <w:rFonts w:ascii="Aptos" w:eastAsia="Aptos" w:hAnsi="Aptos" w:cs="Aptos"/>
+                <w:b/>
+                <w:bCs/>
+                <w:sz w:val="20"/>
+                <w:szCs w:val="20"/>
+              </w:rPr>
+              <w:t xml:space="preserve">Expected Result</w:t>
+            </w:r>
+          </w:p>
+        </w:tc>
+      </w:tr>
+      <w:tr>
+        <w:trPr>
+          <w:cantSplit/>
+        </w:trPr>
+        <w:tc>
+          <w:tcPr>
+            <w:tcW w:w="300" w:type="pct"/>
+            <w:tcMar>
+              <w:top w:w="30" w:type="dxa"/>
+              <w:left w:w="80" w:type="dxa"/>
+              <w:bottom w:w="30" w:type="dxa"/>
+              <w:right w:w="80" w:type="dxa"/>
+            </w:tcMar>
+          </w:tcPr>
+          <w:p>
+            <w:r>
+              <w:rPr>
+                <w:rFonts w:ascii="Aptos" w:eastAsia="Aptos" w:hAnsi="Aptos" w:cs="Aptos"/>
+                <w:sz w:val="20"/>
+                <w:szCs w:val="20"/>
+              </w:rPr>
+              <w:t xml:space="preserve">143</w:t>
+            </w:r>
+          </w:p>
+        </w:tc>
+        <w:tc>
+          <w:tcPr>
+            <w:tcW w:w="1850" w:type="pct"/>
+            <w:tcMar>
+              <w:top w:w="30" w:type="dxa"/>
+              <w:left w:w="80" w:type="dxa"/>
+              <w:bottom w:w="30" w:type="dxa"/>
+              <w:right w:w="80" w:type="dxa"/>
+            </w:tcMar>
+          </w:tcPr>
+          <w:p>
+            <w:r>
+              <w:rPr>
+                <w:rFonts w:ascii="Aptos" w:eastAsia="Aptos" w:hAnsi="Aptos" w:cs="Aptos"/>
+                <w:sz w:val="20"/>
+                <w:szCs w:val="20"/>
+              </w:rPr>
+              <w:t xml:space="preserve">Press Add a run without picking a film</w:t>
+            </w:r>
+          </w:p>
+        </w:tc>
+        <w:tc>
+          <w:tcPr>
+            <w:tcW w:w="560" w:type="pct"/>
+            <w:tcMar>
+              <w:top w:w="30" w:type="dxa"/>
+              <w:left w:w="80" w:type="dxa"/>
+              <w:bottom w:w="30" w:type="dxa"/>
+              <w:right w:w="80" w:type="dxa"/>
+            </w:tcMar>
+          </w:tcPr>
+          <w:p>
+            <w:r>
+              <w:rPr>
+                <w:rFonts w:ascii="Aptos" w:eastAsia="Aptos" w:hAnsi="Aptos" w:cs="Aptos"/>
+                <w:sz w:val="20"/>
+                <w:szCs w:val="20"/>
+              </w:rPr>
+              <w:t xml:space="preserve">Erroneous</w:t>
+            </w:r>
+          </w:p>
+        </w:tc>
+        <w:tc>
+          <w:tcPr>
+            <w:tcW w:w="2290" w:type="pct"/>
+            <w:tcMar>
+              <w:top w:w="30" w:type="dxa"/>
+              <w:left w:w="80" w:type="dxa"/>
+              <w:bottom w:w="30" w:type="dxa"/>
+              <w:right w:w="80" w:type="dxa"/>
+            </w:tcMar>
+          </w:tcPr>
+          <w:p>
+            <w:r>
+              <w:rPr>
+                <w:rFonts w:ascii="Aptos" w:eastAsia="Aptos" w:hAnsi="Aptos" w:cs="Aptos"/>
+                <w:sz w:val="20"/>
+                <w:szCs w:val="20"/>
+              </w:rPr>
+              <w:t xml:space="preserve">Nothing is created and a message appears asking for a film to be picked first.</w:t>
+            </w:r>
+          </w:p>
+        </w:tc>
+      </w:tr>
+      <w:tr>
+        <w:trPr>
+          <w:cantSplit/>
+        </w:trPr>
+        <w:tc>
+          <w:tcPr>
+            <w:tcW w:w="300" w:type="pct"/>
+            <w:tcMar>
+              <w:top w:w="30" w:type="dxa"/>
+              <w:left w:w="80" w:type="dxa"/>
+              <w:bottom w:w="30" w:type="dxa"/>
+              <w:right w:w="80" w:type="dxa"/>
+            </w:tcMar>
+          </w:tcPr>
+          <w:p>
+            <w:r>
+              <w:rPr>
+                <w:rFonts w:ascii="Aptos" w:eastAsia="Aptos" w:hAnsi="Aptos" w:cs="Aptos"/>
+                <w:sz w:val="20"/>
+                <w:szCs w:val="20"/>
+              </w:rPr>
+              <w:t xml:space="preserve">144</w:t>
+            </w:r>
+          </w:p>
+        </w:tc>
+        <w:tc>
+          <w:tcPr>
+            <w:tcW w:w="1850" w:type="pct"/>
+            <w:tcMar>
+              <w:top w:w="30" w:type="dxa"/>
+              <w:left w:w="80" w:type="dxa"/>
+              <w:bottom w:w="30" w:type="dxa"/>
+              <w:right w:w="80" w:type="dxa"/>
+            </w:tcMar>
+          </w:tcPr>
+          <w:p>
+            <w:r>
+              <w:rPr>
+                <w:rFonts w:ascii="Aptos" w:eastAsia="Aptos" w:hAnsi="Aptos" w:cs="Aptos"/>
+                <w:sz w:val="20"/>
+                <w:szCs w:val="20"/>
+              </w:rPr>
+              <w:t xml:space="preserve">Schedule Paddington 2 on Screen 2 at 14:00 every day from 22/07/2026 to 26/07/2026, then confirm</w:t>
+            </w:r>
+          </w:p>
+        </w:tc>
+        <w:tc>
+          <w:tcPr>
+            <w:tcW w:w="560" w:type="pct"/>
+            <w:tcMar>
+              <w:top w:w="30" w:type="dxa"/>
+              <w:left w:w="80" w:type="dxa"/>
+              <w:bottom w:w="30" w:type="dxa"/>
+              <w:right w:w="80" w:type="dxa"/>
+            </w:tcMar>
+          </w:tcPr>
+          <w:p>
+            <w:r>
+              <w:rPr>
+                <w:rFonts w:ascii="Aptos" w:eastAsia="Aptos" w:hAnsi="Aptos" w:cs="Aptos"/>
+                <w:sz w:val="20"/>
+                <w:szCs w:val="20"/>
+              </w:rPr>
+              <w:t xml:space="preserve">Normal</w:t>
+            </w:r>
+          </w:p>
+        </w:tc>
+        <w:tc>
+          <w:tcPr>
+            <w:tcW w:w="2290" w:type="pct"/>
+            <w:tcMar>
+              <w:top w:w="30" w:type="dxa"/>
+              <w:left w:w="80" w:type="dxa"/>
+              <w:bottom w:w="30" w:type="dxa"/>
+              <w:right w:w="80" w:type="dxa"/>
+            </w:tcMar>
+          </w:tcPr>
+          <w:p>
+            <w:r>
+              <w:rPr>
+                <w:rFonts w:ascii="Aptos" w:eastAsia="Aptos" w:hAnsi="Aptos" w:cs="Aptos"/>
+                <w:sz w:val="20"/>
+                <w:szCs w:val="20"/>
+              </w:rPr>
+              <w:t xml:space="preserve">5 screenings are created, one on each day of the range, all at 14:00 on Screen 2, from a single action.</w:t>
+            </w:r>
+          </w:p>
+        </w:tc>
+      </w:tr>
+      <w:tr>
+        <w:trPr>
+          <w:cantSplit/>
+        </w:trPr>
+        <w:tc>
+          <w:tcPr>
+            <w:tcW w:w="300" w:type="pct"/>
+            <w:tcMar>
+              <w:top w:w="30" w:type="dxa"/>
+              <w:left w:w="80" w:type="dxa"/>
+              <w:bottom w:w="30" w:type="dxa"/>
+              <w:right w:w="80" w:type="dxa"/>
+            </w:tcMar>
+          </w:tcPr>
+          <w:p>
+            <w:r>
+              <w:rPr>
+                <w:rFonts w:ascii="Aptos" w:eastAsia="Aptos" w:hAnsi="Aptos" w:cs="Aptos"/>
+                <w:sz w:val="20"/>
+                <w:szCs w:val="20"/>
+              </w:rPr>
+              <w:t xml:space="preserve">145</w:t>
+            </w:r>
+          </w:p>
+        </w:tc>
+        <w:tc>
+          <w:tcPr>
+            <w:tcW w:w="1850" w:type="pct"/>
+            <w:tcMar>
+              <w:top w:w="30" w:type="dxa"/>
+              <w:left w:w="80" w:type="dxa"/>
+              <w:bottom w:w="30" w:type="dxa"/>
+              <w:right w:w="80" w:type="dxa"/>
+            </w:tcMar>
+          </w:tcPr>
+          <w:p>
+            <w:r>
+              <w:rPr>
+                <w:rFonts w:ascii="Aptos" w:eastAsia="Aptos" w:hAnsi="Aptos" w:cs="Aptos"/>
+                <w:sz w:val="20"/>
+                <w:szCs w:val="20"/>
+              </w:rPr>
+              <w:t xml:space="preserve">Look at those 5 screenings in the grid</w:t>
+            </w:r>
+          </w:p>
+        </w:tc>
+        <w:tc>
+          <w:tcPr>
+            <w:tcW w:w="560" w:type="pct"/>
+            <w:tcMar>
+              <w:top w:w="30" w:type="dxa"/>
+              <w:left w:w="80" w:type="dxa"/>
+              <w:bottom w:w="30" w:type="dxa"/>
+              <w:right w:w="80" w:type="dxa"/>
+            </w:tcMar>
+          </w:tcPr>
+          <w:p>
+            <w:r>
+              <w:rPr>
+                <w:rFonts w:ascii="Aptos" w:eastAsia="Aptos" w:hAnsi="Aptos" w:cs="Aptos"/>
+                <w:sz w:val="20"/>
+                <w:szCs w:val="20"/>
+              </w:rPr>
+              <w:t xml:space="preserve">Normal</w:t>
+            </w:r>
+          </w:p>
+        </w:tc>
+        <w:tc>
+          <w:tcPr>
+            <w:tcW w:w="2290" w:type="pct"/>
+            <w:tcMar>
+              <w:top w:w="30" w:type="dxa"/>
+              <w:left w:w="80" w:type="dxa"/>
+              <w:bottom w:w="30" w:type="dxa"/>
+              <w:right w:w="80" w:type="dxa"/>
+            </w:tcMar>
+          </w:tcPr>
+          <w:p>
+            <w:r>
+              <w:rPr>
+                <w:rFonts w:ascii="Aptos" w:eastAsia="Aptos" w:hAnsi="Aptos" w:cs="Aptos"/>
+                <w:sz w:val="20"/>
+                <w:szCs w:val="20"/>
+              </w:rPr>
+              <w:t xml:space="preserve">Each one is a separate screening record with its own screening id and its own ticket price, so they can be booked and reported on individually.</w:t>
+            </w:r>
+          </w:p>
+        </w:tc>
+      </w:tr>
+      <w:tr>
+        <w:trPr>
+          <w:cantSplit/>
+        </w:trPr>
+        <w:tc>
+          <w:tcPr>
+            <w:tcW w:w="300" w:type="pct"/>
+            <w:tcMar>
+              <w:top w:w="30" w:type="dxa"/>
+              <w:left w:w="80" w:type="dxa"/>
+              <w:bottom w:w="30" w:type="dxa"/>
+              <w:right w:w="80" w:type="dxa"/>
+            </w:tcMar>
+          </w:tcPr>
+          <w:p>
+            <w:r>
+              <w:rPr>
+                <w:rFonts w:ascii="Aptos" w:eastAsia="Aptos" w:hAnsi="Aptos" w:cs="Aptos"/>
+                <w:sz w:val="20"/>
+                <w:szCs w:val="20"/>
+              </w:rPr>
+              <w:t xml:space="preserve">146</w:t>
+            </w:r>
+          </w:p>
+        </w:tc>
+        <w:tc>
+          <w:tcPr>
+            <w:tcW w:w="1850" w:type="pct"/>
+            <w:tcMar>
+              <w:top w:w="30" w:type="dxa"/>
+              <w:left w:w="80" w:type="dxa"/>
+              <w:bottom w:w="30" w:type="dxa"/>
+              <w:right w:w="80" w:type="dxa"/>
+            </w:tcMar>
+          </w:tcPr>
+          <w:p>
+            <w:r>
+              <w:rPr>
+                <w:rFonts w:ascii="Aptos" w:eastAsia="Aptos" w:hAnsi="Aptos" w:cs="Aptos"/>
+                <w:sz w:val="20"/>
+                <w:szCs w:val="20"/>
+              </w:rPr>
+              <w:t xml:space="preserve">Schedule exactly the same run a second time</w:t>
+            </w:r>
+          </w:p>
+        </w:tc>
+        <w:tc>
+          <w:tcPr>
+            <w:tcW w:w="560" w:type="pct"/>
+            <w:tcMar>
+              <w:top w:w="30" w:type="dxa"/>
+              <w:left w:w="80" w:type="dxa"/>
+              <w:bottom w:w="30" w:type="dxa"/>
+              <w:right w:w="80" w:type="dxa"/>
+            </w:tcMar>
+          </w:tcPr>
+          <w:p>
+            <w:r>
+              <w:rPr>
+                <w:rFonts w:ascii="Aptos" w:eastAsia="Aptos" w:hAnsi="Aptos" w:cs="Aptos"/>
+                <w:sz w:val="20"/>
+                <w:szCs w:val="20"/>
+              </w:rPr>
+              <w:t xml:space="preserve">Erroneous</w:t>
+            </w:r>
+          </w:p>
+        </w:tc>
+        <w:tc>
+          <w:tcPr>
+            <w:tcW w:w="2290" w:type="pct"/>
+            <w:tcMar>
+              <w:top w:w="30" w:type="dxa"/>
+              <w:left w:w="80" w:type="dxa"/>
+              <w:bottom w:w="30" w:type="dxa"/>
+              <w:right w:w="80" w:type="dxa"/>
+            </w:tcMar>
+          </w:tcPr>
+          <w:p>
+            <w:r>
+              <w:rPr>
+                <w:rFonts w:ascii="Aptos" w:eastAsia="Aptos" w:hAnsi="Aptos" w:cs="Aptos"/>
+                <w:sz w:val="20"/>
+                <w:szCs w:val="20"/>
+              </w:rPr>
+              <w:t xml:space="preserve">Nothing is created and a message appears stating that there is something already on at 14:00 in Screen 2 on every one of those 5 days, and suggesting another time, another screen or the free time finder.</w:t>
+            </w:r>
+          </w:p>
+        </w:tc>
+      </w:tr>
+      <w:tr>
+        <w:trPr>
+          <w:cantSplit/>
+        </w:trPr>
+        <w:tc>
+          <w:tcPr>
+            <w:tcW w:w="300" w:type="pct"/>
+            <w:tcMar>
+              <w:top w:w="30" w:type="dxa"/>
+              <w:left w:w="80" w:type="dxa"/>
+              <w:bottom w:w="30" w:type="dxa"/>
+              <w:right w:w="80" w:type="dxa"/>
+            </w:tcMar>
+          </w:tcPr>
+          <w:p>
+            <w:r>
+              <w:rPr>
+                <w:rFonts w:ascii="Aptos" w:eastAsia="Aptos" w:hAnsi="Aptos" w:cs="Aptos"/>
+                <w:sz w:val="20"/>
+                <w:szCs w:val="20"/>
+              </w:rPr>
+              <w:t xml:space="preserve">147</w:t>
+            </w:r>
+          </w:p>
+        </w:tc>
+        <w:tc>
+          <w:tcPr>
+            <w:tcW w:w="1850" w:type="pct"/>
+            <w:tcMar>
+              <w:top w:w="30" w:type="dxa"/>
+              <w:left w:w="80" w:type="dxa"/>
+              <w:bottom w:w="30" w:type="dxa"/>
+              <w:right w:w="80" w:type="dxa"/>
+            </w:tcMar>
+          </w:tcPr>
+          <w:p>
+            <w:r>
+              <w:rPr>
+                <w:rFonts w:ascii="Aptos" w:eastAsia="Aptos" w:hAnsi="Aptos" w:cs="Aptos"/>
+                <w:sz w:val="20"/>
+                <w:szCs w:val="20"/>
+              </w:rPr>
+              <w:t xml:space="preserve">Schedule a run from 20/07/2026 to 24/07/2026 at 14:00 on Screen 2, where the first day already has a 14:00 screening on it</w:t>
+            </w:r>
+          </w:p>
+        </w:tc>
+        <w:tc>
+          <w:tcPr>
+            <w:tcW w:w="560" w:type="pct"/>
+            <w:tcMar>
+              <w:top w:w="30" w:type="dxa"/>
+              <w:left w:w="80" w:type="dxa"/>
+              <w:bottom w:w="30" w:type="dxa"/>
+              <w:right w:w="80" w:type="dxa"/>
+            </w:tcMar>
+          </w:tcPr>
+          <w:p>
+            <w:r>
+              <w:rPr>
+                <w:rFonts w:ascii="Aptos" w:eastAsia="Aptos" w:hAnsi="Aptos" w:cs="Aptos"/>
+                <w:sz w:val="20"/>
+                <w:szCs w:val="20"/>
+              </w:rPr>
+              <w:t xml:space="preserve">Boundary</w:t>
+            </w:r>
+          </w:p>
+        </w:tc>
+        <w:tc>
+          <w:tcPr>
+            <w:tcW w:w="2290" w:type="pct"/>
+            <w:tcMar>
+              <w:top w:w="30" w:type="dxa"/>
+              <w:left w:w="80" w:type="dxa"/>
+              <w:bottom w:w="30" w:type="dxa"/>
+              <w:right w:w="80" w:type="dxa"/>
+            </w:tcMar>
+          </w:tcPr>
+          <w:p>
+            <w:r>
+              <w:rPr>
+                <w:rFonts w:ascii="Aptos" w:eastAsia="Aptos" w:hAnsi="Aptos" w:cs="Aptos"/>
+                <w:sz w:val="20"/>
+                <w:szCs w:val="20"/>
+              </w:rPr>
+              <w:t xml:space="preserve">The days that are free are added and the day that clashes is skipped, and the message afterwards says how many were added and how many were skipped, so one clash does not throw the whole run away.</w:t>
+            </w:r>
+          </w:p>
+        </w:tc>
+      </w:tr>
+      <w:tr>
+        <w:trPr>
+          <w:cantSplit/>
+        </w:trPr>
+        <w:tc>
+          <w:tcPr>
+            <w:tcW w:w="300" w:type="pct"/>
+            <w:tcMar>
+              <w:top w:w="30" w:type="dxa"/>
+              <w:left w:w="80" w:type="dxa"/>
+              <w:bottom w:w="30" w:type="dxa"/>
+              <w:right w:w="80" w:type="dxa"/>
+            </w:tcMar>
+          </w:tcPr>
+          <w:p>
+            <w:r>
+              <w:rPr>
+                <w:rFonts w:ascii="Aptos" w:eastAsia="Aptos" w:hAnsi="Aptos" w:cs="Aptos"/>
+                <w:sz w:val="20"/>
+                <w:szCs w:val="20"/>
+              </w:rPr>
+              <w:t xml:space="preserve">148</w:t>
+            </w:r>
+          </w:p>
+        </w:tc>
+        <w:tc>
+          <w:tcPr>
+            <w:tcW w:w="1850" w:type="pct"/>
+            <w:tcMar>
+              <w:top w:w="30" w:type="dxa"/>
+              <w:left w:w="80" w:type="dxa"/>
+              <w:bottom w:w="30" w:type="dxa"/>
+              <w:right w:w="80" w:type="dxa"/>
+            </w:tcMar>
+          </w:tcPr>
+          <w:p>
+            <w:r>
+              <w:rPr>
+                <w:rFonts w:ascii="Aptos" w:eastAsia="Aptos" w:hAnsi="Aptos" w:cs="Aptos"/>
+                <w:sz w:val="20"/>
+                <w:szCs w:val="20"/>
+              </w:rPr>
+              <w:t xml:space="preserve">Schedule a run starting on a date in the past</w:t>
+            </w:r>
+          </w:p>
+        </w:tc>
+        <w:tc>
+          <w:tcPr>
+            <w:tcW w:w="560" w:type="pct"/>
+            <w:tcMar>
+              <w:top w:w="30" w:type="dxa"/>
+              <w:left w:w="80" w:type="dxa"/>
+              <w:bottom w:w="30" w:type="dxa"/>
+              <w:right w:w="80" w:type="dxa"/>
+            </w:tcMar>
+          </w:tcPr>
+          <w:p>
+            <w:r>
+              <w:rPr>
+                <w:rFonts w:ascii="Aptos" w:eastAsia="Aptos" w:hAnsi="Aptos" w:cs="Aptos"/>
+                <w:sz w:val="20"/>
+                <w:szCs w:val="20"/>
+              </w:rPr>
+              <w:t xml:space="preserve">Erroneous</w:t>
+            </w:r>
+          </w:p>
+        </w:tc>
+        <w:tc>
+          <w:tcPr>
+            <w:tcW w:w="2290" w:type="pct"/>
+            <w:tcMar>
+              <w:top w:w="30" w:type="dxa"/>
+              <w:left w:w="80" w:type="dxa"/>
+              <w:bottom w:w="30" w:type="dxa"/>
+              <w:right w:w="80" w:type="dxa"/>
+            </w:tcMar>
+          </w:tcPr>
+          <w:p>
+            <w:r>
+              <w:rPr>
+                <w:rFonts w:ascii="Aptos" w:eastAsia="Aptos" w:hAnsi="Aptos" w:cs="Aptos"/>
+                <w:sz w:val="20"/>
+                <w:szCs w:val="20"/>
+              </w:rPr>
+              <w:t xml:space="preserve">Nothing is created and a message appears stating “A run cannot start in the past”.</w:t>
+            </w:r>
+          </w:p>
+        </w:tc>
+      </w:tr>
+      <w:tr>
+        <w:trPr>
+          <w:cantSplit/>
+        </w:trPr>
+        <w:tc>
+          <w:tcPr>
+            <w:tcW w:w="300" w:type="pct"/>
+            <w:tcMar>
+              <w:top w:w="30" w:type="dxa"/>
+              <w:left w:w="80" w:type="dxa"/>
+              <w:bottom w:w="30" w:type="dxa"/>
+              <w:right w:w="80" w:type="dxa"/>
+            </w:tcMar>
+          </w:tcPr>
+          <w:p>
+            <w:r>
+              <w:rPr>
+                <w:rFonts w:ascii="Aptos" w:eastAsia="Aptos" w:hAnsi="Aptos" w:cs="Aptos"/>
+                <w:sz w:val="20"/>
+                <w:szCs w:val="20"/>
+              </w:rPr>
+              <w:t xml:space="preserve">149</w:t>
+            </w:r>
+          </w:p>
+        </w:tc>
+        <w:tc>
+          <w:tcPr>
+            <w:tcW w:w="1850" w:type="pct"/>
+            <w:tcMar>
+              <w:top w:w="30" w:type="dxa"/>
+              <w:left w:w="80" w:type="dxa"/>
+              <w:bottom w:w="30" w:type="dxa"/>
+              <w:right w:w="80" w:type="dxa"/>
+            </w:tcMar>
+          </w:tcPr>
+          <w:p>
+            <w:r>
+              <w:rPr>
+                <w:rFonts w:ascii="Aptos" w:eastAsia="Aptos" w:hAnsi="Aptos" w:cs="Aptos"/>
+                <w:sz w:val="20"/>
+                <w:szCs w:val="20"/>
+              </w:rPr>
+              <w:t xml:space="preserve">Schedule a film repeatedly across a single day on a free screen</w:t>
+            </w:r>
+          </w:p>
+        </w:tc>
+        <w:tc>
+          <w:tcPr>
+            <w:tcW w:w="560" w:type="pct"/>
+            <w:tcMar>
+              <w:top w:w="30" w:type="dxa"/>
+              <w:left w:w="80" w:type="dxa"/>
+              <w:bottom w:w="30" w:type="dxa"/>
+              <w:right w:w="80" w:type="dxa"/>
+            </w:tcMar>
+          </w:tcPr>
+          <w:p>
+            <w:r>
+              <w:rPr>
+                <w:rFonts w:ascii="Aptos" w:eastAsia="Aptos" w:hAnsi="Aptos" w:cs="Aptos"/>
+                <w:sz w:val="20"/>
+                <w:szCs w:val="20"/>
+              </w:rPr>
+              <w:t xml:space="preserve">Normal</w:t>
+            </w:r>
+          </w:p>
+        </w:tc>
+        <w:tc>
+          <w:tcPr>
+            <w:tcW w:w="2290" w:type="pct"/>
+            <w:tcMar>
+              <w:top w:w="30" w:type="dxa"/>
+              <w:left w:w="80" w:type="dxa"/>
+              <w:bottom w:w="30" w:type="dxa"/>
+              <w:right w:w="80" w:type="dxa"/>
+            </w:tcMar>
+          </w:tcPr>
+          <w:p>
+            <w:r>
+              <w:rPr>
+                <w:rFonts w:ascii="Aptos" w:eastAsia="Aptos" w:hAnsi="Aptos" w:cs="Aptos"/>
+                <w:sz w:val="20"/>
+                <w:szCs w:val="20"/>
+              </w:rPr>
+              <w:t xml:space="preserve">The screenings are created one after another with the correct gap between them, each one starting after the previous one has finished and the screen has been turned around.</w:t>
             </w:r>
           </w:p>
         </w:tc>

</xml_diff>

<commit_message>
added objective 28: cancelling a screening that has already sold tickets
</commit_message>
<xml_diff>
--- a/Testing.docx
+++ b/Testing.docx
@@ -16418,6 +16418,785 @@
                 <w:szCs w:val="20"/>
               </w:rPr>
               <w:t xml:space="preserve">The screenings are created one after another with the correct gap between them, each one starting after the previous one has finished and the screen has been turned around.</w:t>
+            </w:r>
+          </w:p>
+        </w:tc>
+      </w:tr>
+    </w:tbl>
+    <w:p>
+      <w:r>
+        <w:rPr>
+          <w:rFonts w:ascii="Aptos" w:eastAsia="Aptos" w:hAnsi="Aptos" w:cs="Aptos"/>
+        </w:rPr>
+        <w:t xml:space="preserve"/>
+      </w:r>
+    </w:p>
+    <w:p>
+      <w:pPr>
+        <w:pStyle w:val="Heading3"/>
+      </w:pPr>
+      <w:r>
+        <w:rPr>
+          <w:rFonts w:ascii="Aptos Display" w:eastAsia="Aptos Display" w:hAnsi="Aptos Display" w:cs="Aptos Display"/>
+          <w:b/>
+          <w:bCs/>
+          <w:color w:val="000000"/>
+        </w:rPr>
+        <w:t xml:space="preserve">Objective 28: Cancelling a Screening That Has Already Sold Tickets</w:t>
+      </w:r>
+    </w:p>
+    <w:p>
+      <w:r>
+        <w:rPr>
+          <w:rFonts w:ascii="Aptos" w:eastAsia="Aptos" w:hAnsi="Aptos" w:cs="Aptos"/>
+        </w:rPr>
+        <w:t xml:space="preserve">A screening that has sold tickets cannot simply be deleted, because the sales have to stay on record. These tests check that cancelling a screening keeps the screening and the bookings, refunds the customers, and takes the screening off sale.</w:t>
+      </w:r>
+    </w:p>
+    <w:tbl>
+      <w:tblPr>
+        <w:tblW w:w="5000" w:type="pct"/>
+        <w:tblBorders>
+          <w:top w:val="single" w:sz="4" w:space="0" w:color="808080"/>
+          <w:left w:val="single" w:sz="4" w:space="0" w:color="808080"/>
+          <w:bottom w:val="single" w:sz="4" w:space="0" w:color="808080"/>
+          <w:right w:val="single" w:sz="4" w:space="0" w:color="808080"/>
+          <w:insideH w:val="single" w:sz="4" w:space="0" w:color="808080"/>
+          <w:insideV w:val="single" w:sz="4" w:space="0" w:color="808080"/>
+        </w:tblBorders>
+        <w:tblCellMar>
+          <w:left w:w="10" w:type="dxa"/>
+          <w:right w:w="10" w:type="dxa"/>
+        </w:tblCellMar>
+        <w:tblLook w:val="0000" w:firstRow="0" w:lastRow="0" w:firstColumn="0" w:lastColumn="0" w:noHBand="0" w:noVBand="0"/>
+      </w:tblPr>
+      <w:tblGrid>
+        <w:gridCol w:w="561"/>
+        <w:gridCol w:w="3460"/>
+        <w:gridCol w:w="1047"/>
+        <w:gridCol w:w="4282"/>
+      </w:tblGrid>
+      <w:tr>
+        <w:trPr>
+          <w:cantSplit/>
+          <w:tblHeader/>
+        </w:trPr>
+        <w:tc>
+          <w:tcPr>
+            <w:tcW w:w="300" w:type="pct"/>
+            <w:shd w:val="clear" w:color="auto" w:fill="F2CEED" w:themeFill="accent5" w:themeFillTint="33"/>
+            <w:tcMar>
+              <w:top w:w="30" w:type="dxa"/>
+              <w:left w:w="80" w:type="dxa"/>
+              <w:bottom w:w="30" w:type="dxa"/>
+              <w:right w:w="80" w:type="dxa"/>
+            </w:tcMar>
+          </w:tcPr>
+          <w:p>
+            <w:r>
+              <w:rPr>
+                <w:rFonts w:ascii="Aptos" w:eastAsia="Aptos" w:hAnsi="Aptos" w:cs="Aptos"/>
+                <w:b/>
+                <w:bCs/>
+                <w:sz w:val="20"/>
+                <w:szCs w:val="20"/>
+              </w:rPr>
+              <w:t xml:space="preserve">No.</w:t>
+            </w:r>
+          </w:p>
+        </w:tc>
+        <w:tc>
+          <w:tcPr>
+            <w:tcW w:w="1850" w:type="pct"/>
+            <w:shd w:val="clear" w:color="auto" w:fill="F2CEED" w:themeFill="accent5" w:themeFillTint="33"/>
+            <w:tcMar>
+              <w:top w:w="30" w:type="dxa"/>
+              <w:left w:w="80" w:type="dxa"/>
+              <w:bottom w:w="30" w:type="dxa"/>
+              <w:right w:w="80" w:type="dxa"/>
+            </w:tcMar>
+          </w:tcPr>
+          <w:p>
+            <w:r>
+              <w:rPr>
+                <w:rFonts w:ascii="Aptos" w:eastAsia="Aptos" w:hAnsi="Aptos" w:cs="Aptos"/>
+                <w:b/>
+                <w:bCs/>
+                <w:sz w:val="20"/>
+                <w:szCs w:val="20"/>
+              </w:rPr>
+              <w:t xml:space="preserve">Test</w:t>
+            </w:r>
+          </w:p>
+        </w:tc>
+        <w:tc>
+          <w:tcPr>
+            <w:tcW w:w="560" w:type="pct"/>
+            <w:shd w:val="clear" w:color="auto" w:fill="F2CEED" w:themeFill="accent5" w:themeFillTint="33"/>
+            <w:tcMar>
+              <w:top w:w="30" w:type="dxa"/>
+              <w:left w:w="80" w:type="dxa"/>
+              <w:bottom w:w="30" w:type="dxa"/>
+              <w:right w:w="80" w:type="dxa"/>
+            </w:tcMar>
+          </w:tcPr>
+          <w:p>
+            <w:r>
+              <w:rPr>
+                <w:rFonts w:ascii="Aptos" w:eastAsia="Aptos" w:hAnsi="Aptos" w:cs="Aptos"/>
+                <w:b/>
+                <w:bCs/>
+                <w:sz w:val="20"/>
+                <w:szCs w:val="20"/>
+              </w:rPr>
+              <w:t xml:space="preserve">Type</w:t>
+            </w:r>
+          </w:p>
+        </w:tc>
+        <w:tc>
+          <w:tcPr>
+            <w:tcW w:w="2290" w:type="pct"/>
+            <w:shd w:val="clear" w:color="auto" w:fill="F2CEED" w:themeFill="accent5" w:themeFillTint="33"/>
+            <w:tcMar>
+              <w:top w:w="30" w:type="dxa"/>
+              <w:left w:w="80" w:type="dxa"/>
+              <w:bottom w:w="30" w:type="dxa"/>
+              <w:right w:w="80" w:type="dxa"/>
+            </w:tcMar>
+          </w:tcPr>
+          <w:p>
+            <w:r>
+              <w:rPr>
+                <w:rFonts w:ascii="Aptos" w:eastAsia="Aptos" w:hAnsi="Aptos" w:cs="Aptos"/>
+                <w:b/>
+                <w:bCs/>
+                <w:sz w:val="20"/>
+                <w:szCs w:val="20"/>
+              </w:rPr>
+              <w:t xml:space="preserve">Expected Result</w:t>
+            </w:r>
+          </w:p>
+        </w:tc>
+      </w:tr>
+      <w:tr>
+        <w:trPr>
+          <w:cantSplit/>
+        </w:trPr>
+        <w:tc>
+          <w:tcPr>
+            <w:tcW w:w="300" w:type="pct"/>
+            <w:tcMar>
+              <w:top w:w="30" w:type="dxa"/>
+              <w:left w:w="80" w:type="dxa"/>
+              <w:bottom w:w="30" w:type="dxa"/>
+              <w:right w:w="80" w:type="dxa"/>
+            </w:tcMar>
+          </w:tcPr>
+          <w:p>
+            <w:r>
+              <w:rPr>
+                <w:rFonts w:ascii="Aptos" w:eastAsia="Aptos" w:hAnsi="Aptos" w:cs="Aptos"/>
+                <w:sz w:val="20"/>
+                <w:szCs w:val="20"/>
+              </w:rPr>
+              <w:t xml:space="preserve">150</w:t>
+            </w:r>
+          </w:p>
+        </w:tc>
+        <w:tc>
+          <w:tcPr>
+            <w:tcW w:w="1850" w:type="pct"/>
+            <w:tcMar>
+              <w:top w:w="30" w:type="dxa"/>
+              <w:left w:w="80" w:type="dxa"/>
+              <w:bottom w:w="30" w:type="dxa"/>
+              <w:right w:w="80" w:type="dxa"/>
+            </w:tcMar>
+          </w:tcPr>
+          <w:p>
+            <w:r>
+              <w:rPr>
+                <w:rFonts w:ascii="Aptos" w:eastAsia="Aptos" w:hAnsi="Aptos" w:cs="Aptos"/>
+                <w:sz w:val="20"/>
+                <w:szCs w:val="20"/>
+              </w:rPr>
+              <w:t xml:space="preserve">Select the Inception screening and press Cancel this screening without typing a reason</w:t>
+            </w:r>
+          </w:p>
+        </w:tc>
+        <w:tc>
+          <w:tcPr>
+            <w:tcW w:w="560" w:type="pct"/>
+            <w:tcMar>
+              <w:top w:w="30" w:type="dxa"/>
+              <w:left w:w="80" w:type="dxa"/>
+              <w:bottom w:w="30" w:type="dxa"/>
+              <w:right w:w="80" w:type="dxa"/>
+            </w:tcMar>
+          </w:tcPr>
+          <w:p>
+            <w:r>
+              <w:rPr>
+                <w:rFonts w:ascii="Aptos" w:eastAsia="Aptos" w:hAnsi="Aptos" w:cs="Aptos"/>
+                <w:sz w:val="20"/>
+                <w:szCs w:val="20"/>
+              </w:rPr>
+              <w:t xml:space="preserve">Erroneous</w:t>
+            </w:r>
+          </w:p>
+        </w:tc>
+        <w:tc>
+          <w:tcPr>
+            <w:tcW w:w="2290" w:type="pct"/>
+            <w:tcMar>
+              <w:top w:w="30" w:type="dxa"/>
+              <w:left w:w="80" w:type="dxa"/>
+              <w:bottom w:w="30" w:type="dxa"/>
+              <w:right w:w="80" w:type="dxa"/>
+            </w:tcMar>
+          </w:tcPr>
+          <w:p>
+            <w:r>
+              <w:rPr>
+                <w:rFonts w:ascii="Aptos" w:eastAsia="Aptos" w:hAnsi="Aptos" w:cs="Aptos"/>
+                <w:sz w:val="20"/>
+                <w:szCs w:val="20"/>
+              </w:rPr>
+              <w:t xml:space="preserve">Nothing is cancelled and a message appears asking for the reason, because the reason goes onto the screening and into the log.</w:t>
+            </w:r>
+          </w:p>
+        </w:tc>
+      </w:tr>
+      <w:tr>
+        <w:trPr>
+          <w:cantSplit/>
+        </w:trPr>
+        <w:tc>
+          <w:tcPr>
+            <w:tcW w:w="300" w:type="pct"/>
+            <w:tcMar>
+              <w:top w:w="30" w:type="dxa"/>
+              <w:left w:w="80" w:type="dxa"/>
+              <w:bottom w:w="30" w:type="dxa"/>
+              <w:right w:w="80" w:type="dxa"/>
+            </w:tcMar>
+          </w:tcPr>
+          <w:p>
+            <w:r>
+              <w:rPr>
+                <w:rFonts w:ascii="Aptos" w:eastAsia="Aptos" w:hAnsi="Aptos" w:cs="Aptos"/>
+                <w:sz w:val="20"/>
+                <w:szCs w:val="20"/>
+              </w:rPr>
+              <w:t xml:space="preserve">151</w:t>
+            </w:r>
+          </w:p>
+        </w:tc>
+        <w:tc>
+          <w:tcPr>
+            <w:tcW w:w="1850" w:type="pct"/>
+            <w:tcMar>
+              <w:top w:w="30" w:type="dxa"/>
+              <w:left w:w="80" w:type="dxa"/>
+              <w:bottom w:w="30" w:type="dxa"/>
+              <w:right w:w="80" w:type="dxa"/>
+            </w:tcMar>
+          </w:tcPr>
+          <w:p>
+            <w:r>
+              <w:rPr>
+                <w:rFonts w:ascii="Aptos" w:eastAsia="Aptos" w:hAnsi="Aptos" w:cs="Aptos"/>
+                <w:sz w:val="20"/>
+                <w:szCs w:val="20"/>
+              </w:rPr>
+              <w:t xml:space="preserve">Select the Inception screening, type a reason such as projector fault, and look at the confirmation before answering</w:t>
+            </w:r>
+          </w:p>
+        </w:tc>
+        <w:tc>
+          <w:tcPr>
+            <w:tcW w:w="560" w:type="pct"/>
+            <w:tcMar>
+              <w:top w:w="30" w:type="dxa"/>
+              <w:left w:w="80" w:type="dxa"/>
+              <w:bottom w:w="30" w:type="dxa"/>
+              <w:right w:w="80" w:type="dxa"/>
+            </w:tcMar>
+          </w:tcPr>
+          <w:p>
+            <w:r>
+              <w:rPr>
+                <w:rFonts w:ascii="Aptos" w:eastAsia="Aptos" w:hAnsi="Aptos" w:cs="Aptos"/>
+                <w:sz w:val="20"/>
+                <w:szCs w:val="20"/>
+              </w:rPr>
+              <w:t xml:space="preserve">Normal</w:t>
+            </w:r>
+          </w:p>
+        </w:tc>
+        <w:tc>
+          <w:tcPr>
+            <w:tcW w:w="2290" w:type="pct"/>
+            <w:tcMar>
+              <w:top w:w="30" w:type="dxa"/>
+              <w:left w:w="80" w:type="dxa"/>
+              <w:bottom w:w="30" w:type="dxa"/>
+              <w:right w:w="80" w:type="dxa"/>
+            </w:tcMar>
+          </w:tcPr>
+          <w:p>
+            <w:r>
+              <w:rPr>
+                <w:rFonts w:ascii="Aptos" w:eastAsia="Aptos" w:hAnsi="Aptos" w:cs="Aptos"/>
+                <w:sz w:val="20"/>
+                <w:szCs w:val="20"/>
+              </w:rPr>
+              <w:t xml:space="preserve">The confirmation says how many bookings and how many seats will be affected, so the manager can see the size of what they are about to do before agreeing to it.</w:t>
+            </w:r>
+          </w:p>
+        </w:tc>
+      </w:tr>
+      <w:tr>
+        <w:trPr>
+          <w:cantSplit/>
+        </w:trPr>
+        <w:tc>
+          <w:tcPr>
+            <w:tcW w:w="300" w:type="pct"/>
+            <w:tcMar>
+              <w:top w:w="30" w:type="dxa"/>
+              <w:left w:w="80" w:type="dxa"/>
+              <w:bottom w:w="30" w:type="dxa"/>
+              <w:right w:w="80" w:type="dxa"/>
+            </w:tcMar>
+          </w:tcPr>
+          <w:p>
+            <w:r>
+              <w:rPr>
+                <w:rFonts w:ascii="Aptos" w:eastAsia="Aptos" w:hAnsi="Aptos" w:cs="Aptos"/>
+                <w:sz w:val="20"/>
+                <w:szCs w:val="20"/>
+              </w:rPr>
+              <w:t xml:space="preserve">152</w:t>
+            </w:r>
+          </w:p>
+        </w:tc>
+        <w:tc>
+          <w:tcPr>
+            <w:tcW w:w="1850" w:type="pct"/>
+            <w:tcMar>
+              <w:top w:w="30" w:type="dxa"/>
+              <w:left w:w="80" w:type="dxa"/>
+              <w:bottom w:w="30" w:type="dxa"/>
+              <w:right w:w="80" w:type="dxa"/>
+            </w:tcMar>
+          </w:tcPr>
+          <w:p>
+            <w:r>
+              <w:rPr>
+                <w:rFonts w:ascii="Aptos" w:eastAsia="Aptos" w:hAnsi="Aptos" w:cs="Aptos"/>
+                <w:sz w:val="20"/>
+                <w:szCs w:val="20"/>
+              </w:rPr>
+              <w:t xml:space="preserve">Confirm the cancellation</w:t>
+            </w:r>
+          </w:p>
+        </w:tc>
+        <w:tc>
+          <w:tcPr>
+            <w:tcW w:w="560" w:type="pct"/>
+            <w:tcMar>
+              <w:top w:w="30" w:type="dxa"/>
+              <w:left w:w="80" w:type="dxa"/>
+              <w:bottom w:w="30" w:type="dxa"/>
+              <w:right w:w="80" w:type="dxa"/>
+            </w:tcMar>
+          </w:tcPr>
+          <w:p>
+            <w:r>
+              <w:rPr>
+                <w:rFonts w:ascii="Aptos" w:eastAsia="Aptos" w:hAnsi="Aptos" w:cs="Aptos"/>
+                <w:sz w:val="20"/>
+                <w:szCs w:val="20"/>
+              </w:rPr>
+              <w:t xml:space="preserve">Normal</w:t>
+            </w:r>
+          </w:p>
+        </w:tc>
+        <w:tc>
+          <w:tcPr>
+            <w:tcW w:w="2290" w:type="pct"/>
+            <w:tcMar>
+              <w:top w:w="30" w:type="dxa"/>
+              <w:left w:w="80" w:type="dxa"/>
+              <w:bottom w:w="30" w:type="dxa"/>
+              <w:right w:w="80" w:type="dxa"/>
+            </w:tcMar>
+          </w:tcPr>
+          <w:p>
+            <w:r>
+              <w:rPr>
+                <w:rFonts w:ascii="Aptos" w:eastAsia="Aptos" w:hAnsi="Aptos" w:cs="Aptos"/>
+                <w:sz w:val="20"/>
+                <w:szCs w:val="20"/>
+              </w:rPr>
+              <w:t xml:space="preserve">The screening is marked as cancelled with the reason and the date stored against it, everybody holding a ticket for it is refunded, and the screening and its bookings are all still present in the database.</w:t>
+            </w:r>
+          </w:p>
+        </w:tc>
+      </w:tr>
+      <w:tr>
+        <w:trPr>
+          <w:cantSplit/>
+        </w:trPr>
+        <w:tc>
+          <w:tcPr>
+            <w:tcW w:w="300" w:type="pct"/>
+            <w:tcMar>
+              <w:top w:w="30" w:type="dxa"/>
+              <w:left w:w="80" w:type="dxa"/>
+              <w:bottom w:w="30" w:type="dxa"/>
+              <w:right w:w="80" w:type="dxa"/>
+            </w:tcMar>
+          </w:tcPr>
+          <w:p>
+            <w:r>
+              <w:rPr>
+                <w:rFonts w:ascii="Aptos" w:eastAsia="Aptos" w:hAnsi="Aptos" w:cs="Aptos"/>
+                <w:sz w:val="20"/>
+                <w:szCs w:val="20"/>
+              </w:rPr>
+              <w:t xml:space="preserve">153</w:t>
+            </w:r>
+          </w:p>
+        </w:tc>
+        <w:tc>
+          <w:tcPr>
+            <w:tcW w:w="1850" w:type="pct"/>
+            <w:tcMar>
+              <w:top w:w="30" w:type="dxa"/>
+              <w:left w:w="80" w:type="dxa"/>
+              <w:bottom w:w="30" w:type="dxa"/>
+              <w:right w:w="80" w:type="dxa"/>
+            </w:tcMar>
+          </w:tcPr>
+          <w:p>
+            <w:r>
+              <w:rPr>
+                <w:rFonts w:ascii="Aptos" w:eastAsia="Aptos" w:hAnsi="Aptos" w:cs="Aptos"/>
+                <w:sz w:val="20"/>
+                <w:szCs w:val="20"/>
+              </w:rPr>
+              <w:t xml:space="preserve">Look for that screening on the Bookings form</w:t>
+            </w:r>
+          </w:p>
+        </w:tc>
+        <w:tc>
+          <w:tcPr>
+            <w:tcW w:w="560" w:type="pct"/>
+            <w:tcMar>
+              <w:top w:w="30" w:type="dxa"/>
+              <w:left w:w="80" w:type="dxa"/>
+              <w:bottom w:w="30" w:type="dxa"/>
+              <w:right w:w="80" w:type="dxa"/>
+            </w:tcMar>
+          </w:tcPr>
+          <w:p>
+            <w:r>
+              <w:rPr>
+                <w:rFonts w:ascii="Aptos" w:eastAsia="Aptos" w:hAnsi="Aptos" w:cs="Aptos"/>
+                <w:sz w:val="20"/>
+                <w:szCs w:val="20"/>
+              </w:rPr>
+              <w:t xml:space="preserve">Normal</w:t>
+            </w:r>
+          </w:p>
+        </w:tc>
+        <w:tc>
+          <w:tcPr>
+            <w:tcW w:w="2290" w:type="pct"/>
+            <w:tcMar>
+              <w:top w:w="30" w:type="dxa"/>
+              <w:left w:w="80" w:type="dxa"/>
+              <w:bottom w:w="30" w:type="dxa"/>
+              <w:right w:w="80" w:type="dxa"/>
+            </w:tcMar>
+          </w:tcPr>
+          <w:p>
+            <w:r>
+              <w:rPr>
+                <w:rFonts w:ascii="Aptos" w:eastAsia="Aptos" w:hAnsi="Aptos" w:cs="Aptos"/>
+                <w:sz w:val="20"/>
+                <w:szCs w:val="20"/>
+              </w:rPr>
+              <w:t xml:space="preserve">It is no longer offered for sale, and picking it directly gives a message saying that the screening cannot be sold at the moment.</w:t>
+            </w:r>
+          </w:p>
+        </w:tc>
+      </w:tr>
+      <w:tr>
+        <w:trPr>
+          <w:cantSplit/>
+        </w:trPr>
+        <w:tc>
+          <w:tcPr>
+            <w:tcW w:w="300" w:type="pct"/>
+            <w:tcMar>
+              <w:top w:w="30" w:type="dxa"/>
+              <w:left w:w="80" w:type="dxa"/>
+              <w:bottom w:w="30" w:type="dxa"/>
+              <w:right w:w="80" w:type="dxa"/>
+            </w:tcMar>
+          </w:tcPr>
+          <w:p>
+            <w:r>
+              <w:rPr>
+                <w:rFonts w:ascii="Aptos" w:eastAsia="Aptos" w:hAnsi="Aptos" w:cs="Aptos"/>
+                <w:sz w:val="20"/>
+                <w:szCs w:val="20"/>
+              </w:rPr>
+              <w:t xml:space="preserve">154</w:t>
+            </w:r>
+          </w:p>
+        </w:tc>
+        <w:tc>
+          <w:tcPr>
+            <w:tcW w:w="1850" w:type="pct"/>
+            <w:tcMar>
+              <w:top w:w="30" w:type="dxa"/>
+              <w:left w:w="80" w:type="dxa"/>
+              <w:bottom w:w="30" w:type="dxa"/>
+              <w:right w:w="80" w:type="dxa"/>
+            </w:tcMar>
+          </w:tcPr>
+          <w:p>
+            <w:r>
+              <w:rPr>
+                <w:rFonts w:ascii="Aptos" w:eastAsia="Aptos" w:hAnsi="Aptos" w:cs="Aptos"/>
+                <w:sz w:val="20"/>
+                <w:szCs w:val="20"/>
+              </w:rPr>
+              <w:t xml:space="preserve">Try to cancel the same screening again</w:t>
+            </w:r>
+          </w:p>
+        </w:tc>
+        <w:tc>
+          <w:tcPr>
+            <w:tcW w:w="560" w:type="pct"/>
+            <w:tcMar>
+              <w:top w:w="30" w:type="dxa"/>
+              <w:left w:w="80" w:type="dxa"/>
+              <w:bottom w:w="30" w:type="dxa"/>
+              <w:right w:w="80" w:type="dxa"/>
+            </w:tcMar>
+          </w:tcPr>
+          <w:p>
+            <w:r>
+              <w:rPr>
+                <w:rFonts w:ascii="Aptos" w:eastAsia="Aptos" w:hAnsi="Aptos" w:cs="Aptos"/>
+                <w:sz w:val="20"/>
+                <w:szCs w:val="20"/>
+              </w:rPr>
+              <w:t xml:space="preserve">Erroneous</w:t>
+            </w:r>
+          </w:p>
+        </w:tc>
+        <w:tc>
+          <w:tcPr>
+            <w:tcW w:w="2290" w:type="pct"/>
+            <w:tcMar>
+              <w:top w:w="30" w:type="dxa"/>
+              <w:left w:w="80" w:type="dxa"/>
+              <w:bottom w:w="30" w:type="dxa"/>
+              <w:right w:w="80" w:type="dxa"/>
+            </w:tcMar>
+          </w:tcPr>
+          <w:p>
+            <w:r>
+              <w:rPr>
+                <w:rFonts w:ascii="Aptos" w:eastAsia="Aptos" w:hAnsi="Aptos" w:cs="Aptos"/>
+                <w:sz w:val="20"/>
+                <w:szCs w:val="20"/>
+              </w:rPr>
+              <w:t xml:space="preserve">A message appears stating “That screening has already been cancelled”.</w:t>
+            </w:r>
+          </w:p>
+        </w:tc>
+      </w:tr>
+      <w:tr>
+        <w:trPr>
+          <w:cantSplit/>
+        </w:trPr>
+        <w:tc>
+          <w:tcPr>
+            <w:tcW w:w="300" w:type="pct"/>
+            <w:tcMar>
+              <w:top w:w="30" w:type="dxa"/>
+              <w:left w:w="80" w:type="dxa"/>
+              <w:bottom w:w="30" w:type="dxa"/>
+              <w:right w:w="80" w:type="dxa"/>
+            </w:tcMar>
+          </w:tcPr>
+          <w:p>
+            <w:r>
+              <w:rPr>
+                <w:rFonts w:ascii="Aptos" w:eastAsia="Aptos" w:hAnsi="Aptos" w:cs="Aptos"/>
+                <w:sz w:val="20"/>
+                <w:szCs w:val="20"/>
+              </w:rPr>
+              <w:t xml:space="preserve">155</w:t>
+            </w:r>
+          </w:p>
+        </w:tc>
+        <w:tc>
+          <w:tcPr>
+            <w:tcW w:w="1850" w:type="pct"/>
+            <w:tcMar>
+              <w:top w:w="30" w:type="dxa"/>
+              <w:left w:w="80" w:type="dxa"/>
+              <w:bottom w:w="30" w:type="dxa"/>
+              <w:right w:w="80" w:type="dxa"/>
+            </w:tcMar>
+          </w:tcPr>
+          <w:p>
+            <w:r>
+              <w:rPr>
+                <w:rFonts w:ascii="Aptos" w:eastAsia="Aptos" w:hAnsi="Aptos" w:cs="Aptos"/>
+                <w:sz w:val="20"/>
+                <w:szCs w:val="20"/>
+              </w:rPr>
+              <w:t xml:space="preserve">Try to delete a screening that has ever had a booking on it</w:t>
+            </w:r>
+          </w:p>
+        </w:tc>
+        <w:tc>
+          <w:tcPr>
+            <w:tcW w:w="560" w:type="pct"/>
+            <w:tcMar>
+              <w:top w:w="30" w:type="dxa"/>
+              <w:left w:w="80" w:type="dxa"/>
+              <w:bottom w:w="30" w:type="dxa"/>
+              <w:right w:w="80" w:type="dxa"/>
+            </w:tcMar>
+          </w:tcPr>
+          <w:p>
+            <w:r>
+              <w:rPr>
+                <w:rFonts w:ascii="Aptos" w:eastAsia="Aptos" w:hAnsi="Aptos" w:cs="Aptos"/>
+                <w:sz w:val="20"/>
+                <w:szCs w:val="20"/>
+              </w:rPr>
+              <w:t xml:space="preserve">Erroneous</w:t>
+            </w:r>
+          </w:p>
+        </w:tc>
+        <w:tc>
+          <w:tcPr>
+            <w:tcW w:w="2290" w:type="pct"/>
+            <w:tcMar>
+              <w:top w:w="30" w:type="dxa"/>
+              <w:left w:w="80" w:type="dxa"/>
+              <w:bottom w:w="30" w:type="dxa"/>
+              <w:right w:w="80" w:type="dxa"/>
+            </w:tcMar>
+          </w:tcPr>
+          <w:p>
+            <w:r>
+              <w:rPr>
+                <w:rFonts w:ascii="Aptos" w:eastAsia="Aptos" w:hAnsi="Aptos" w:cs="Aptos"/>
+                <w:sz w:val="20"/>
+                <w:szCs w:val="20"/>
+              </w:rPr>
+              <w:t xml:space="preserve">The deletion is refused with a message explaining that a booking is kept even after it is cancelled so that the sale stays in the takings, and pointing the user at Cancel this screening instead.</w:t>
+            </w:r>
+          </w:p>
+        </w:tc>
+      </w:tr>
+      <w:tr>
+        <w:trPr>
+          <w:cantSplit/>
+        </w:trPr>
+        <w:tc>
+          <w:tcPr>
+            <w:tcW w:w="300" w:type="pct"/>
+            <w:tcMar>
+              <w:top w:w="30" w:type="dxa"/>
+              <w:left w:w="80" w:type="dxa"/>
+              <w:bottom w:w="30" w:type="dxa"/>
+              <w:right w:w="80" w:type="dxa"/>
+            </w:tcMar>
+          </w:tcPr>
+          <w:p>
+            <w:r>
+              <w:rPr>
+                <w:rFonts w:ascii="Aptos" w:eastAsia="Aptos" w:hAnsi="Aptos" w:cs="Aptos"/>
+                <w:sz w:val="20"/>
+                <w:szCs w:val="20"/>
+              </w:rPr>
+              <w:t xml:space="preserve">156</w:t>
+            </w:r>
+          </w:p>
+        </w:tc>
+        <w:tc>
+          <w:tcPr>
+            <w:tcW w:w="1850" w:type="pct"/>
+            <w:tcMar>
+              <w:top w:w="30" w:type="dxa"/>
+              <w:left w:w="80" w:type="dxa"/>
+              <w:bottom w:w="30" w:type="dxa"/>
+              <w:right w:w="80" w:type="dxa"/>
+            </w:tcMar>
+          </w:tcPr>
+          <w:p>
+            <w:r>
+              <w:rPr>
+                <w:rFonts w:ascii="Aptos" w:eastAsia="Aptos" w:hAnsi="Aptos" w:cs="Aptos"/>
+                <w:sz w:val="20"/>
+                <w:szCs w:val="20"/>
+              </w:rPr>
+              <w:t xml:space="preserve">Run the sales report over the period containing the cancelled screening</w:t>
+            </w:r>
+          </w:p>
+        </w:tc>
+        <w:tc>
+          <w:tcPr>
+            <w:tcW w:w="560" w:type="pct"/>
+            <w:tcMar>
+              <w:top w:w="30" w:type="dxa"/>
+              <w:left w:w="80" w:type="dxa"/>
+              <w:bottom w:w="30" w:type="dxa"/>
+              <w:right w:w="80" w:type="dxa"/>
+            </w:tcMar>
+          </w:tcPr>
+          <w:p>
+            <w:r>
+              <w:rPr>
+                <w:rFonts w:ascii="Aptos" w:eastAsia="Aptos" w:hAnsi="Aptos" w:cs="Aptos"/>
+                <w:sz w:val="20"/>
+                <w:szCs w:val="20"/>
+              </w:rPr>
+              <w:t xml:space="preserve">Normal</w:t>
+            </w:r>
+          </w:p>
+        </w:tc>
+        <w:tc>
+          <w:tcPr>
+            <w:tcW w:w="2290" w:type="pct"/>
+            <w:tcMar>
+              <w:top w:w="30" w:type="dxa"/>
+              <w:left w:w="80" w:type="dxa"/>
+              <w:bottom w:w="30" w:type="dxa"/>
+              <w:right w:w="80" w:type="dxa"/>
+            </w:tcMar>
+          </w:tcPr>
+          <w:p>
+            <w:r>
+              <w:rPr>
+                <w:rFonts w:ascii="Aptos" w:eastAsia="Aptos" w:hAnsi="Aptos" w:cs="Aptos"/>
+                <w:sz w:val="20"/>
+                <w:szCs w:val="20"/>
+              </w:rPr>
+              <w:t xml:space="preserve">The tickets that were refunded no longer count towards the takings, but the refunds themselves are listed on the Refunds report with their reason.</w:t>
             </w:r>
           </w:p>
         </w:tc>

</xml_diff>

<commit_message>
added objective 29: taking a screen out of service and withdrawing a food item
</commit_message>
<xml_diff>
--- a/Testing.docx
+++ b/Testing.docx
@@ -17197,6 +17197,696 @@
                 <w:szCs w:val="20"/>
               </w:rPr>
               <w:t xml:space="preserve">The tickets that were refunded no longer count towards the takings, but the refunds themselves are listed on the Refunds report with their reason.</w:t>
+            </w:r>
+          </w:p>
+        </w:tc>
+      </w:tr>
+    </w:tbl>
+    <w:p>
+      <w:r>
+        <w:rPr>
+          <w:rFonts w:ascii="Aptos" w:eastAsia="Aptos" w:hAnsi="Aptos" w:cs="Aptos"/>
+        </w:rPr>
+        <w:t xml:space="preserve"/>
+      </w:r>
+    </w:p>
+    <w:p>
+      <w:pPr>
+        <w:pStyle w:val="Heading3"/>
+      </w:pPr>
+      <w:r>
+        <w:rPr>
+          <w:rFonts w:ascii="Aptos Display" w:eastAsia="Aptos Display" w:hAnsi="Aptos Display" w:cs="Aptos Display"/>
+          <w:b/>
+          <w:bCs/>
+          <w:color w:val="000000"/>
+        </w:rPr>
+        <w:t xml:space="preserve">Objective 29: Taking a Screen Out of Service and Withdrawing a Food Item</w:t>
+      </w:r>
+    </w:p>
+    <w:p>
+      <w:r>
+        <w:rPr>
+          <w:rFonts w:ascii="Aptos" w:eastAsia="Aptos" w:hAnsi="Aptos" w:cs="Aptos"/>
+        </w:rPr>
+        <w:t xml:space="preserve">Both halves of this objective are the same idea applied to two different records. Something that is no longer sold has to keep its history rather than being deleted, because past sales point at it.</w:t>
+      </w:r>
+    </w:p>
+    <w:tbl>
+      <w:tblPr>
+        <w:tblW w:w="5000" w:type="pct"/>
+        <w:tblBorders>
+          <w:top w:val="single" w:sz="4" w:space="0" w:color="808080"/>
+          <w:left w:val="single" w:sz="4" w:space="0" w:color="808080"/>
+          <w:bottom w:val="single" w:sz="4" w:space="0" w:color="808080"/>
+          <w:right w:val="single" w:sz="4" w:space="0" w:color="808080"/>
+          <w:insideH w:val="single" w:sz="4" w:space="0" w:color="808080"/>
+          <w:insideV w:val="single" w:sz="4" w:space="0" w:color="808080"/>
+        </w:tblBorders>
+        <w:tblCellMar>
+          <w:left w:w="10" w:type="dxa"/>
+          <w:right w:w="10" w:type="dxa"/>
+        </w:tblCellMar>
+        <w:tblLook w:val="0000" w:firstRow="0" w:lastRow="0" w:firstColumn="0" w:lastColumn="0" w:noHBand="0" w:noVBand="0"/>
+      </w:tblPr>
+      <w:tblGrid>
+        <w:gridCol w:w="561"/>
+        <w:gridCol w:w="3460"/>
+        <w:gridCol w:w="1047"/>
+        <w:gridCol w:w="4282"/>
+      </w:tblGrid>
+      <w:tr>
+        <w:trPr>
+          <w:cantSplit/>
+          <w:tblHeader/>
+        </w:trPr>
+        <w:tc>
+          <w:tcPr>
+            <w:tcW w:w="300" w:type="pct"/>
+            <w:shd w:val="clear" w:color="auto" w:fill="F2CEED" w:themeFill="accent5" w:themeFillTint="33"/>
+            <w:tcMar>
+              <w:top w:w="30" w:type="dxa"/>
+              <w:left w:w="80" w:type="dxa"/>
+              <w:bottom w:w="30" w:type="dxa"/>
+              <w:right w:w="80" w:type="dxa"/>
+            </w:tcMar>
+          </w:tcPr>
+          <w:p>
+            <w:r>
+              <w:rPr>
+                <w:rFonts w:ascii="Aptos" w:eastAsia="Aptos" w:hAnsi="Aptos" w:cs="Aptos"/>
+                <w:b/>
+                <w:bCs/>
+                <w:sz w:val="20"/>
+                <w:szCs w:val="20"/>
+              </w:rPr>
+              <w:t xml:space="preserve">No.</w:t>
+            </w:r>
+          </w:p>
+        </w:tc>
+        <w:tc>
+          <w:tcPr>
+            <w:tcW w:w="1850" w:type="pct"/>
+            <w:shd w:val="clear" w:color="auto" w:fill="F2CEED" w:themeFill="accent5" w:themeFillTint="33"/>
+            <w:tcMar>
+              <w:top w:w="30" w:type="dxa"/>
+              <w:left w:w="80" w:type="dxa"/>
+              <w:bottom w:w="30" w:type="dxa"/>
+              <w:right w:w="80" w:type="dxa"/>
+            </w:tcMar>
+          </w:tcPr>
+          <w:p>
+            <w:r>
+              <w:rPr>
+                <w:rFonts w:ascii="Aptos" w:eastAsia="Aptos" w:hAnsi="Aptos" w:cs="Aptos"/>
+                <w:b/>
+                <w:bCs/>
+                <w:sz w:val="20"/>
+                <w:szCs w:val="20"/>
+              </w:rPr>
+              <w:t xml:space="preserve">Test</w:t>
+            </w:r>
+          </w:p>
+        </w:tc>
+        <w:tc>
+          <w:tcPr>
+            <w:tcW w:w="560" w:type="pct"/>
+            <w:shd w:val="clear" w:color="auto" w:fill="F2CEED" w:themeFill="accent5" w:themeFillTint="33"/>
+            <w:tcMar>
+              <w:top w:w="30" w:type="dxa"/>
+              <w:left w:w="80" w:type="dxa"/>
+              <w:bottom w:w="30" w:type="dxa"/>
+              <w:right w:w="80" w:type="dxa"/>
+            </w:tcMar>
+          </w:tcPr>
+          <w:p>
+            <w:r>
+              <w:rPr>
+                <w:rFonts w:ascii="Aptos" w:eastAsia="Aptos" w:hAnsi="Aptos" w:cs="Aptos"/>
+                <w:b/>
+                <w:bCs/>
+                <w:sz w:val="20"/>
+                <w:szCs w:val="20"/>
+              </w:rPr>
+              <w:t xml:space="preserve">Type</w:t>
+            </w:r>
+          </w:p>
+        </w:tc>
+        <w:tc>
+          <w:tcPr>
+            <w:tcW w:w="2290" w:type="pct"/>
+            <w:shd w:val="clear" w:color="auto" w:fill="F2CEED" w:themeFill="accent5" w:themeFillTint="33"/>
+            <w:tcMar>
+              <w:top w:w="30" w:type="dxa"/>
+              <w:left w:w="80" w:type="dxa"/>
+              <w:bottom w:w="30" w:type="dxa"/>
+              <w:right w:w="80" w:type="dxa"/>
+            </w:tcMar>
+          </w:tcPr>
+          <w:p>
+            <w:r>
+              <w:rPr>
+                <w:rFonts w:ascii="Aptos" w:eastAsia="Aptos" w:hAnsi="Aptos" w:cs="Aptos"/>
+                <w:b/>
+                <w:bCs/>
+                <w:sz w:val="20"/>
+                <w:szCs w:val="20"/>
+              </w:rPr>
+              <w:t xml:space="preserve">Expected Result</w:t>
+            </w:r>
+          </w:p>
+        </w:tc>
+      </w:tr>
+      <w:tr>
+        <w:trPr>
+          <w:cantSplit/>
+        </w:trPr>
+        <w:tc>
+          <w:tcPr>
+            <w:tcW w:w="300" w:type="pct"/>
+            <w:tcMar>
+              <w:top w:w="30" w:type="dxa"/>
+              <w:left w:w="80" w:type="dxa"/>
+              <w:bottom w:w="30" w:type="dxa"/>
+              <w:right w:w="80" w:type="dxa"/>
+            </w:tcMar>
+          </w:tcPr>
+          <w:p>
+            <w:r>
+              <w:rPr>
+                <w:rFonts w:ascii="Aptos" w:eastAsia="Aptos" w:hAnsi="Aptos" w:cs="Aptos"/>
+                <w:sz w:val="20"/>
+                <w:szCs w:val="20"/>
+              </w:rPr>
+              <w:t xml:space="preserve">157</w:t>
+            </w:r>
+          </w:p>
+        </w:tc>
+        <w:tc>
+          <w:tcPr>
+            <w:tcW w:w="1850" w:type="pct"/>
+            <w:tcMar>
+              <w:top w:w="30" w:type="dxa"/>
+              <w:left w:w="80" w:type="dxa"/>
+              <w:bottom w:w="30" w:type="dxa"/>
+              <w:right w:w="80" w:type="dxa"/>
+            </w:tcMar>
+          </w:tcPr>
+          <w:p>
+            <w:r>
+              <w:rPr>
+                <w:rFonts w:ascii="Aptos" w:eastAsia="Aptos" w:hAnsi="Aptos" w:cs="Aptos"/>
+                <w:sz w:val="20"/>
+                <w:szCs w:val="20"/>
+              </w:rPr>
+              <w:t xml:space="preserve">Select Screen 2 and press Take out of service without typing a reason</w:t>
+            </w:r>
+          </w:p>
+        </w:tc>
+        <w:tc>
+          <w:tcPr>
+            <w:tcW w:w="560" w:type="pct"/>
+            <w:tcMar>
+              <w:top w:w="30" w:type="dxa"/>
+              <w:left w:w="80" w:type="dxa"/>
+              <w:bottom w:w="30" w:type="dxa"/>
+              <w:right w:w="80" w:type="dxa"/>
+            </w:tcMar>
+          </w:tcPr>
+          <w:p>
+            <w:r>
+              <w:rPr>
+                <w:rFonts w:ascii="Aptos" w:eastAsia="Aptos" w:hAnsi="Aptos" w:cs="Aptos"/>
+                <w:sz w:val="20"/>
+                <w:szCs w:val="20"/>
+              </w:rPr>
+              <w:t xml:space="preserve">Erroneous</w:t>
+            </w:r>
+          </w:p>
+        </w:tc>
+        <w:tc>
+          <w:tcPr>
+            <w:tcW w:w="2290" w:type="pct"/>
+            <w:tcMar>
+              <w:top w:w="30" w:type="dxa"/>
+              <w:left w:w="80" w:type="dxa"/>
+              <w:bottom w:w="30" w:type="dxa"/>
+              <w:right w:w="80" w:type="dxa"/>
+            </w:tcMar>
+          </w:tcPr>
+          <w:p>
+            <w:r>
+              <w:rPr>
+                <w:rFonts w:ascii="Aptos" w:eastAsia="Aptos" w:hAnsi="Aptos" w:cs="Aptos"/>
+                <w:sz w:val="20"/>
+                <w:szCs w:val="20"/>
+              </w:rPr>
+              <w:t xml:space="preserve">Nothing changes and a message appears stating “Say why the screen is coming out of service.”.</w:t>
+            </w:r>
+          </w:p>
+        </w:tc>
+      </w:tr>
+      <w:tr>
+        <w:trPr>
+          <w:cantSplit/>
+        </w:trPr>
+        <w:tc>
+          <w:tcPr>
+            <w:tcW w:w="300" w:type="pct"/>
+            <w:tcMar>
+              <w:top w:w="30" w:type="dxa"/>
+              <w:left w:w="80" w:type="dxa"/>
+              <w:bottom w:w="30" w:type="dxa"/>
+              <w:right w:w="80" w:type="dxa"/>
+            </w:tcMar>
+          </w:tcPr>
+          <w:p>
+            <w:r>
+              <w:rPr>
+                <w:rFonts w:ascii="Aptos" w:eastAsia="Aptos" w:hAnsi="Aptos" w:cs="Aptos"/>
+                <w:sz w:val="20"/>
+                <w:szCs w:val="20"/>
+              </w:rPr>
+              <w:t xml:space="preserve">158</w:t>
+            </w:r>
+          </w:p>
+        </w:tc>
+        <w:tc>
+          <w:tcPr>
+            <w:tcW w:w="1850" w:type="pct"/>
+            <w:tcMar>
+              <w:top w:w="30" w:type="dxa"/>
+              <w:left w:w="80" w:type="dxa"/>
+              <w:bottom w:w="30" w:type="dxa"/>
+              <w:right w:w="80" w:type="dxa"/>
+            </w:tcMar>
+          </w:tcPr>
+          <w:p>
+            <w:r>
+              <w:rPr>
+                <w:rFonts w:ascii="Aptos" w:eastAsia="Aptos" w:hAnsi="Aptos" w:cs="Aptos"/>
+                <w:sz w:val="20"/>
+                <w:szCs w:val="20"/>
+              </w:rPr>
+              <w:t xml:space="preserve">Select Screen 2, type a reason, and confirm</w:t>
+            </w:r>
+          </w:p>
+        </w:tc>
+        <w:tc>
+          <w:tcPr>
+            <w:tcW w:w="560" w:type="pct"/>
+            <w:tcMar>
+              <w:top w:w="30" w:type="dxa"/>
+              <w:left w:w="80" w:type="dxa"/>
+              <w:bottom w:w="30" w:type="dxa"/>
+              <w:right w:w="80" w:type="dxa"/>
+            </w:tcMar>
+          </w:tcPr>
+          <w:p>
+            <w:r>
+              <w:rPr>
+                <w:rFonts w:ascii="Aptos" w:eastAsia="Aptos" w:hAnsi="Aptos" w:cs="Aptos"/>
+                <w:sz w:val="20"/>
+                <w:szCs w:val="20"/>
+              </w:rPr>
+              <w:t xml:space="preserve">Normal</w:t>
+            </w:r>
+          </w:p>
+        </w:tc>
+        <w:tc>
+          <w:tcPr>
+            <w:tcW w:w="2290" w:type="pct"/>
+            <w:tcMar>
+              <w:top w:w="30" w:type="dxa"/>
+              <w:left w:w="80" w:type="dxa"/>
+              <w:bottom w:w="30" w:type="dxa"/>
+              <w:right w:w="80" w:type="dxa"/>
+            </w:tcMar>
+          </w:tcPr>
+          <w:p>
+            <w:r>
+              <w:rPr>
+                <w:rFonts w:ascii="Aptos" w:eastAsia="Aptos" w:hAnsi="Aptos" w:cs="Aptos"/>
+                <w:sz w:val="20"/>
+                <w:szCs w:val="20"/>
+              </w:rPr>
+              <w:t xml:space="preserve">The screen is marked as out of service with the reason and the date, and the screen record and all of its seats are kept.</w:t>
+            </w:r>
+          </w:p>
+        </w:tc>
+      </w:tr>
+      <w:tr>
+        <w:trPr>
+          <w:cantSplit/>
+        </w:trPr>
+        <w:tc>
+          <w:tcPr>
+            <w:tcW w:w="300" w:type="pct"/>
+            <w:tcMar>
+              <w:top w:w="30" w:type="dxa"/>
+              <w:left w:w="80" w:type="dxa"/>
+              <w:bottom w:w="30" w:type="dxa"/>
+              <w:right w:w="80" w:type="dxa"/>
+            </w:tcMar>
+          </w:tcPr>
+          <w:p>
+            <w:r>
+              <w:rPr>
+                <w:rFonts w:ascii="Aptos" w:eastAsia="Aptos" w:hAnsi="Aptos" w:cs="Aptos"/>
+                <w:sz w:val="20"/>
+                <w:szCs w:val="20"/>
+              </w:rPr>
+              <w:t xml:space="preserve">159</w:t>
+            </w:r>
+          </w:p>
+        </w:tc>
+        <w:tc>
+          <w:tcPr>
+            <w:tcW w:w="1850" w:type="pct"/>
+            <w:tcMar>
+              <w:top w:w="30" w:type="dxa"/>
+              <w:left w:w="80" w:type="dxa"/>
+              <w:bottom w:w="30" w:type="dxa"/>
+              <w:right w:w="80" w:type="dxa"/>
+            </w:tcMar>
+          </w:tcPr>
+          <w:p>
+            <w:r>
+              <w:rPr>
+                <w:rFonts w:ascii="Aptos" w:eastAsia="Aptos" w:hAnsi="Aptos" w:cs="Aptos"/>
+                <w:sz w:val="20"/>
+                <w:szCs w:val="20"/>
+              </w:rPr>
+              <w:t xml:space="preserve">Try to schedule a new screening on Screen 2</w:t>
+            </w:r>
+          </w:p>
+        </w:tc>
+        <w:tc>
+          <w:tcPr>
+            <w:tcW w:w="560" w:type="pct"/>
+            <w:tcMar>
+              <w:top w:w="30" w:type="dxa"/>
+              <w:left w:w="80" w:type="dxa"/>
+              <w:bottom w:w="30" w:type="dxa"/>
+              <w:right w:w="80" w:type="dxa"/>
+            </w:tcMar>
+          </w:tcPr>
+          <w:p>
+            <w:r>
+              <w:rPr>
+                <w:rFonts w:ascii="Aptos" w:eastAsia="Aptos" w:hAnsi="Aptos" w:cs="Aptos"/>
+                <w:sz w:val="20"/>
+                <w:szCs w:val="20"/>
+              </w:rPr>
+              <w:t xml:space="preserve">Erroneous</w:t>
+            </w:r>
+          </w:p>
+        </w:tc>
+        <w:tc>
+          <w:tcPr>
+            <w:tcW w:w="2290" w:type="pct"/>
+            <w:tcMar>
+              <w:top w:w="30" w:type="dxa"/>
+              <w:left w:w="80" w:type="dxa"/>
+              <w:bottom w:w="30" w:type="dxa"/>
+              <w:right w:w="80" w:type="dxa"/>
+            </w:tcMar>
+          </w:tcPr>
+          <w:p>
+            <w:r>
+              <w:rPr>
+                <w:rFonts w:ascii="Aptos" w:eastAsia="Aptos" w:hAnsi="Aptos" w:cs="Aptos"/>
+                <w:sz w:val="20"/>
+                <w:szCs w:val="20"/>
+              </w:rPr>
+              <w:t xml:space="preserve">Screen 2 is not offered as a choice, so nothing new can be booked into a screen that is out of service.</w:t>
+            </w:r>
+          </w:p>
+        </w:tc>
+      </w:tr>
+      <w:tr>
+        <w:trPr>
+          <w:cantSplit/>
+        </w:trPr>
+        <w:tc>
+          <w:tcPr>
+            <w:tcW w:w="300" w:type="pct"/>
+            <w:tcMar>
+              <w:top w:w="30" w:type="dxa"/>
+              <w:left w:w="80" w:type="dxa"/>
+              <w:bottom w:w="30" w:type="dxa"/>
+              <w:right w:w="80" w:type="dxa"/>
+            </w:tcMar>
+          </w:tcPr>
+          <w:p>
+            <w:r>
+              <w:rPr>
+                <w:rFonts w:ascii="Aptos" w:eastAsia="Aptos" w:hAnsi="Aptos" w:cs="Aptos"/>
+                <w:sz w:val="20"/>
+                <w:szCs w:val="20"/>
+              </w:rPr>
+              <w:t xml:space="preserve">160</w:t>
+            </w:r>
+          </w:p>
+        </w:tc>
+        <w:tc>
+          <w:tcPr>
+            <w:tcW w:w="1850" w:type="pct"/>
+            <w:tcMar>
+              <w:top w:w="30" w:type="dxa"/>
+              <w:left w:w="80" w:type="dxa"/>
+              <w:bottom w:w="30" w:type="dxa"/>
+              <w:right w:w="80" w:type="dxa"/>
+            </w:tcMar>
+          </w:tcPr>
+          <w:p>
+            <w:r>
+              <w:rPr>
+                <w:rFonts w:ascii="Aptos" w:eastAsia="Aptos" w:hAnsi="Aptos" w:cs="Aptos"/>
+                <w:sz w:val="20"/>
+                <w:szCs w:val="20"/>
+              </w:rPr>
+              <w:t xml:space="preserve">Run the sales report for a period that includes sales made on Screen 2 before it was withdrawn</w:t>
+            </w:r>
+          </w:p>
+        </w:tc>
+        <w:tc>
+          <w:tcPr>
+            <w:tcW w:w="560" w:type="pct"/>
+            <w:tcMar>
+              <w:top w:w="30" w:type="dxa"/>
+              <w:left w:w="80" w:type="dxa"/>
+              <w:bottom w:w="30" w:type="dxa"/>
+              <w:right w:w="80" w:type="dxa"/>
+            </w:tcMar>
+          </w:tcPr>
+          <w:p>
+            <w:r>
+              <w:rPr>
+                <w:rFonts w:ascii="Aptos" w:eastAsia="Aptos" w:hAnsi="Aptos" w:cs="Aptos"/>
+                <w:sz w:val="20"/>
+                <w:szCs w:val="20"/>
+              </w:rPr>
+              <w:t xml:space="preserve">Normal</w:t>
+            </w:r>
+          </w:p>
+        </w:tc>
+        <w:tc>
+          <w:tcPr>
+            <w:tcW w:w="2290" w:type="pct"/>
+            <w:tcMar>
+              <w:top w:w="30" w:type="dxa"/>
+              <w:left w:w="80" w:type="dxa"/>
+              <w:bottom w:w="30" w:type="dxa"/>
+              <w:right w:w="80" w:type="dxa"/>
+            </w:tcMar>
+          </w:tcPr>
+          <w:p>
+            <w:r>
+              <w:rPr>
+                <w:rFonts w:ascii="Aptos" w:eastAsia="Aptos" w:hAnsi="Aptos" w:cs="Aptos"/>
+                <w:sz w:val="20"/>
+                <w:szCs w:val="20"/>
+              </w:rPr>
+              <w:t xml:space="preserve">Those sales are still reported against Screen 2, because the screen record was kept rather than deleted.</w:t>
+            </w:r>
+          </w:p>
+        </w:tc>
+      </w:tr>
+      <w:tr>
+        <w:trPr>
+          <w:cantSplit/>
+        </w:trPr>
+        <w:tc>
+          <w:tcPr>
+            <w:tcW w:w="300" w:type="pct"/>
+            <w:tcMar>
+              <w:top w:w="30" w:type="dxa"/>
+              <w:left w:w="80" w:type="dxa"/>
+              <w:bottom w:w="30" w:type="dxa"/>
+              <w:right w:w="80" w:type="dxa"/>
+            </w:tcMar>
+          </w:tcPr>
+          <w:p>
+            <w:r>
+              <w:rPr>
+                <w:rFonts w:ascii="Aptos" w:eastAsia="Aptos" w:hAnsi="Aptos" w:cs="Aptos"/>
+                <w:sz w:val="20"/>
+                <w:szCs w:val="20"/>
+              </w:rPr>
+              <w:t xml:space="preserve">161</w:t>
+            </w:r>
+          </w:p>
+        </w:tc>
+        <w:tc>
+          <w:tcPr>
+            <w:tcW w:w="1850" w:type="pct"/>
+            <w:tcMar>
+              <w:top w:w="30" w:type="dxa"/>
+              <w:left w:w="80" w:type="dxa"/>
+              <w:bottom w:w="30" w:type="dxa"/>
+              <w:right w:w="80" w:type="dxa"/>
+            </w:tcMar>
+          </w:tcPr>
+          <w:p>
+            <w:r>
+              <w:rPr>
+                <w:rFonts w:ascii="Aptos" w:eastAsia="Aptos" w:hAnsi="Aptos" w:cs="Aptos"/>
+                <w:sz w:val="20"/>
+                <w:szCs w:val="20"/>
+              </w:rPr>
+              <w:t xml:space="preserve">Put Screen 2 back into service</w:t>
+            </w:r>
+          </w:p>
+        </w:tc>
+        <w:tc>
+          <w:tcPr>
+            <w:tcW w:w="560" w:type="pct"/>
+            <w:tcMar>
+              <w:top w:w="30" w:type="dxa"/>
+              <w:left w:w="80" w:type="dxa"/>
+              <w:bottom w:w="30" w:type="dxa"/>
+              <w:right w:w="80" w:type="dxa"/>
+            </w:tcMar>
+          </w:tcPr>
+          <w:p>
+            <w:r>
+              <w:rPr>
+                <w:rFonts w:ascii="Aptos" w:eastAsia="Aptos" w:hAnsi="Aptos" w:cs="Aptos"/>
+                <w:sz w:val="20"/>
+                <w:szCs w:val="20"/>
+              </w:rPr>
+              <w:t xml:space="preserve">Normal</w:t>
+            </w:r>
+          </w:p>
+        </w:tc>
+        <w:tc>
+          <w:tcPr>
+            <w:tcW w:w="2290" w:type="pct"/>
+            <w:tcMar>
+              <w:top w:w="30" w:type="dxa"/>
+              <w:left w:w="80" w:type="dxa"/>
+              <w:bottom w:w="30" w:type="dxa"/>
+              <w:right w:w="80" w:type="dxa"/>
+            </w:tcMar>
+          </w:tcPr>
+          <w:p>
+            <w:r>
+              <w:rPr>
+                <w:rFonts w:ascii="Aptos" w:eastAsia="Aptos" w:hAnsi="Aptos" w:cs="Aptos"/>
+                <w:sz w:val="20"/>
+                <w:szCs w:val="20"/>
+              </w:rPr>
+              <w:t xml:space="preserve">It is offered for scheduling again and its status returns to normal.</w:t>
+            </w:r>
+          </w:p>
+        </w:tc>
+      </w:tr>
+      <w:tr>
+        <w:trPr>
+          <w:cantSplit/>
+        </w:trPr>
+        <w:tc>
+          <w:tcPr>
+            <w:tcW w:w="300" w:type="pct"/>
+            <w:tcMar>
+              <w:top w:w="30" w:type="dxa"/>
+              <w:left w:w="80" w:type="dxa"/>
+              <w:bottom w:w="30" w:type="dxa"/>
+              <w:right w:w="80" w:type="dxa"/>
+            </w:tcMar>
+          </w:tcPr>
+          <w:p>
+            <w:r>
+              <w:rPr>
+                <w:rFonts w:ascii="Aptos" w:eastAsia="Aptos" w:hAnsi="Aptos" w:cs="Aptos"/>
+                <w:sz w:val="20"/>
+                <w:szCs w:val="20"/>
+              </w:rPr>
+              <w:t xml:space="preserve">162</w:t>
+            </w:r>
+          </w:p>
+        </w:tc>
+        <w:tc>
+          <w:tcPr>
+            <w:tcW w:w="1850" w:type="pct"/>
+            <w:tcMar>
+              <w:top w:w="30" w:type="dxa"/>
+              <w:left w:w="80" w:type="dxa"/>
+              <w:bottom w:w="30" w:type="dxa"/>
+              <w:right w:w="80" w:type="dxa"/>
+            </w:tcMar>
+          </w:tcPr>
+          <w:p>
+            <w:r>
+              <w:rPr>
+                <w:rFonts w:ascii="Aptos" w:eastAsia="Aptos" w:hAnsi="Aptos" w:cs="Aptos"/>
+                <w:sz w:val="20"/>
+                <w:szCs w:val="20"/>
+              </w:rPr>
+              <w:t xml:space="preserve">Select the Cola on the Food Items form and press Withdraw</w:t>
+            </w:r>
+          </w:p>
+        </w:tc>
+        <w:tc>
+          <w:tcPr>
+            <w:tcW w:w="560" w:type="pct"/>
+            <w:tcMar>
+              <w:top w:w="30" w:type="dxa"/>
+              <w:left w:w="80" w:type="dxa"/>
+              <w:bottom w:w="30" w:type="dxa"/>
+              <w:right w:w="80" w:type="dxa"/>
+            </w:tcMar>
+          </w:tcPr>
+          <w:p>
+            <w:r>
+              <w:rPr>
+                <w:rFonts w:ascii="Aptos" w:eastAsia="Aptos" w:hAnsi="Aptos" w:cs="Aptos"/>
+                <w:sz w:val="20"/>
+                <w:szCs w:val="20"/>
+              </w:rPr>
+              <w:t xml:space="preserve">Normal</w:t>
+            </w:r>
+          </w:p>
+        </w:tc>
+        <w:tc>
+          <w:tcPr>
+            <w:tcW w:w="2290" w:type="pct"/>
+            <w:tcMar>
+              <w:top w:w="30" w:type="dxa"/>
+              <w:left w:w="80" w:type="dxa"/>
+              <w:bottom w:w="30" w:type="dxa"/>
+              <w:right w:w="80" w:type="dxa"/>
+            </w:tcMar>
+          </w:tcPr>
+          <w:p>
+            <w:r>
+              <w:rPr>
+                <w:rFonts w:ascii="Aptos" w:eastAsia="Aptos" w:hAnsi="Aptos" w:cs="Aptos"/>
+                <w:sz w:val="20"/>
+                <w:szCs w:val="20"/>
+              </w:rPr>
+              <w:t xml:space="preserve">The item is marked as withdrawn, it is no longer offered on a new order, and the past orders that contain a Cola still show it with the price that was paid for it.</w:t>
             </w:r>
           </w:p>
         </w:tc>

</xml_diff>

<commit_message>
added objectives 30 and 31: breaking the sales report down
</commit_message>
<xml_diff>
--- a/Testing.docx
+++ b/Testing.docx
@@ -17887,6 +17887,1319 @@
                 <w:szCs w:val="20"/>
               </w:rPr>
               <w:t xml:space="preserve">The item is marked as withdrawn, it is no longer offered on a new order, and the past orders that contain a Cola still show it with the price that was paid for it.</w:t>
+            </w:r>
+          </w:p>
+        </w:tc>
+      </w:tr>
+    </w:tbl>
+    <w:p>
+      <w:r>
+        <w:rPr>
+          <w:rFonts w:ascii="Aptos" w:eastAsia="Aptos" w:hAnsi="Aptos" w:cs="Aptos"/>
+        </w:rPr>
+        <w:t xml:space="preserve"/>
+      </w:r>
+    </w:p>
+    <w:p>
+      <w:pPr>
+        <w:pStyle w:val="Heading3"/>
+      </w:pPr>
+      <w:r>
+        <w:rPr>
+          <w:rFonts w:ascii="Aptos Display" w:eastAsia="Aptos Display" w:hAnsi="Aptos Display" w:cs="Aptos Display"/>
+          <w:b/>
+          <w:bCs/>
+          <w:color w:val="000000"/>
+        </w:rPr>
+        <w:t xml:space="preserve">Objectives 30 and 31: Breaking the Sales Report Down</w:t>
+      </w:r>
+    </w:p>
+    <w:p>
+      <w:r>
+        <w:rPr>
+          <w:rFonts w:ascii="Aptos" w:eastAsia="Aptos" w:hAnsi="Aptos" w:cs="Aptos"/>
+        </w:rPr>
+        <w:t xml:space="preserve">The prototype report could only total the takings by film. These tests check the other breakdowns and, separately, the choice between measuring a date range by the day the booking was taken and by the day the screening actually happens. That choice matters as soon as a customer books in advance, because the two give different answers for the same range, and a report that does not say which one it is using cannot be trusted.</w:t>
+      </w:r>
+    </w:p>
+    <w:tbl>
+      <w:tblPr>
+        <w:tblW w:w="5000" w:type="pct"/>
+        <w:tblBorders>
+          <w:top w:val="single" w:sz="4" w:space="0" w:color="808080"/>
+          <w:left w:val="single" w:sz="4" w:space="0" w:color="808080"/>
+          <w:bottom w:val="single" w:sz="4" w:space="0" w:color="808080"/>
+          <w:right w:val="single" w:sz="4" w:space="0" w:color="808080"/>
+          <w:insideH w:val="single" w:sz="4" w:space="0" w:color="808080"/>
+          <w:insideV w:val="single" w:sz="4" w:space="0" w:color="808080"/>
+        </w:tblBorders>
+        <w:tblCellMar>
+          <w:left w:w="10" w:type="dxa"/>
+          <w:right w:w="10" w:type="dxa"/>
+        </w:tblCellMar>
+        <w:tblLook w:val="0000" w:firstRow="0" w:lastRow="0" w:firstColumn="0" w:lastColumn="0" w:noHBand="0" w:noVBand="0"/>
+      </w:tblPr>
+      <w:tblGrid>
+        <w:gridCol w:w="561"/>
+        <w:gridCol w:w="3460"/>
+        <w:gridCol w:w="1047"/>
+        <w:gridCol w:w="4282"/>
+      </w:tblGrid>
+      <w:tr>
+        <w:trPr>
+          <w:cantSplit/>
+          <w:tblHeader/>
+        </w:trPr>
+        <w:tc>
+          <w:tcPr>
+            <w:tcW w:w="300" w:type="pct"/>
+            <w:shd w:val="clear" w:color="auto" w:fill="F2CEED" w:themeFill="accent5" w:themeFillTint="33"/>
+            <w:tcMar>
+              <w:top w:w="30" w:type="dxa"/>
+              <w:left w:w="80" w:type="dxa"/>
+              <w:bottom w:w="30" w:type="dxa"/>
+              <w:right w:w="80" w:type="dxa"/>
+            </w:tcMar>
+          </w:tcPr>
+          <w:p>
+            <w:r>
+              <w:rPr>
+                <w:rFonts w:ascii="Aptos" w:eastAsia="Aptos" w:hAnsi="Aptos" w:cs="Aptos"/>
+                <w:b/>
+                <w:bCs/>
+                <w:sz w:val="20"/>
+                <w:szCs w:val="20"/>
+              </w:rPr>
+              <w:t xml:space="preserve">No.</w:t>
+            </w:r>
+          </w:p>
+        </w:tc>
+        <w:tc>
+          <w:tcPr>
+            <w:tcW w:w="1850" w:type="pct"/>
+            <w:shd w:val="clear" w:color="auto" w:fill="F2CEED" w:themeFill="accent5" w:themeFillTint="33"/>
+            <w:tcMar>
+              <w:top w:w="30" w:type="dxa"/>
+              <w:left w:w="80" w:type="dxa"/>
+              <w:bottom w:w="30" w:type="dxa"/>
+              <w:right w:w="80" w:type="dxa"/>
+            </w:tcMar>
+          </w:tcPr>
+          <w:p>
+            <w:r>
+              <w:rPr>
+                <w:rFonts w:ascii="Aptos" w:eastAsia="Aptos" w:hAnsi="Aptos" w:cs="Aptos"/>
+                <w:b/>
+                <w:bCs/>
+                <w:sz w:val="20"/>
+                <w:szCs w:val="20"/>
+              </w:rPr>
+              <w:t xml:space="preserve">Test</w:t>
+            </w:r>
+          </w:p>
+        </w:tc>
+        <w:tc>
+          <w:tcPr>
+            <w:tcW w:w="560" w:type="pct"/>
+            <w:shd w:val="clear" w:color="auto" w:fill="F2CEED" w:themeFill="accent5" w:themeFillTint="33"/>
+            <w:tcMar>
+              <w:top w:w="30" w:type="dxa"/>
+              <w:left w:w="80" w:type="dxa"/>
+              <w:bottom w:w="30" w:type="dxa"/>
+              <w:right w:w="80" w:type="dxa"/>
+            </w:tcMar>
+          </w:tcPr>
+          <w:p>
+            <w:r>
+              <w:rPr>
+                <w:rFonts w:ascii="Aptos" w:eastAsia="Aptos" w:hAnsi="Aptos" w:cs="Aptos"/>
+                <w:b/>
+                <w:bCs/>
+                <w:sz w:val="20"/>
+                <w:szCs w:val="20"/>
+              </w:rPr>
+              <w:t xml:space="preserve">Type</w:t>
+            </w:r>
+          </w:p>
+        </w:tc>
+        <w:tc>
+          <w:tcPr>
+            <w:tcW w:w="2290" w:type="pct"/>
+            <w:shd w:val="clear" w:color="auto" w:fill="F2CEED" w:themeFill="accent5" w:themeFillTint="33"/>
+            <w:tcMar>
+              <w:top w:w="30" w:type="dxa"/>
+              <w:left w:w="80" w:type="dxa"/>
+              <w:bottom w:w="30" w:type="dxa"/>
+              <w:right w:w="80" w:type="dxa"/>
+            </w:tcMar>
+          </w:tcPr>
+          <w:p>
+            <w:r>
+              <w:rPr>
+                <w:rFonts w:ascii="Aptos" w:eastAsia="Aptos" w:hAnsi="Aptos" w:cs="Aptos"/>
+                <w:b/>
+                <w:bCs/>
+                <w:sz w:val="20"/>
+                <w:szCs w:val="20"/>
+              </w:rPr>
+              <w:t xml:space="preserve">Expected Result</w:t>
+            </w:r>
+          </w:p>
+        </w:tc>
+      </w:tr>
+      <w:tr>
+        <w:trPr>
+          <w:cantSplit/>
+        </w:trPr>
+        <w:tc>
+          <w:tcPr>
+            <w:tcW w:w="300" w:type="pct"/>
+            <w:tcMar>
+              <w:top w:w="30" w:type="dxa"/>
+              <w:left w:w="80" w:type="dxa"/>
+              <w:bottom w:w="30" w:type="dxa"/>
+              <w:right w:w="80" w:type="dxa"/>
+            </w:tcMar>
+          </w:tcPr>
+          <w:p>
+            <w:r>
+              <w:rPr>
+                <w:rFonts w:ascii="Aptos" w:eastAsia="Aptos" w:hAnsi="Aptos" w:cs="Aptos"/>
+                <w:sz w:val="20"/>
+                <w:szCs w:val="20"/>
+              </w:rPr>
+              <w:t xml:space="preserve">163</w:t>
+            </w:r>
+          </w:p>
+        </w:tc>
+        <w:tc>
+          <w:tcPr>
+            <w:tcW w:w="1850" w:type="pct"/>
+            <w:tcMar>
+              <w:top w:w="30" w:type="dxa"/>
+              <w:left w:w="80" w:type="dxa"/>
+              <w:bottom w:w="30" w:type="dxa"/>
+              <w:right w:w="80" w:type="dxa"/>
+            </w:tcMar>
+          </w:tcPr>
+          <w:p>
+            <w:r>
+              <w:rPr>
+                <w:rFonts w:ascii="Aptos" w:eastAsia="Aptos" w:hAnsi="Aptos" w:cs="Aptos"/>
+                <w:sz w:val="20"/>
+                <w:szCs w:val="20"/>
+              </w:rPr>
+              <w:t xml:space="preserve">Run the report with the type set to Tickets and concessions</w:t>
+            </w:r>
+          </w:p>
+        </w:tc>
+        <w:tc>
+          <w:tcPr>
+            <w:tcW w:w="560" w:type="pct"/>
+            <w:tcMar>
+              <w:top w:w="30" w:type="dxa"/>
+              <w:left w:w="80" w:type="dxa"/>
+              <w:bottom w:w="30" w:type="dxa"/>
+              <w:right w:w="80" w:type="dxa"/>
+            </w:tcMar>
+          </w:tcPr>
+          <w:p>
+            <w:r>
+              <w:rPr>
+                <w:rFonts w:ascii="Aptos" w:eastAsia="Aptos" w:hAnsi="Aptos" w:cs="Aptos"/>
+                <w:sz w:val="20"/>
+                <w:szCs w:val="20"/>
+              </w:rPr>
+              <w:t xml:space="preserve">Normal</w:t>
+            </w:r>
+          </w:p>
+        </w:tc>
+        <w:tc>
+          <w:tcPr>
+            <w:tcW w:w="2290" w:type="pct"/>
+            <w:tcMar>
+              <w:top w:w="30" w:type="dxa"/>
+              <w:left w:w="80" w:type="dxa"/>
+              <w:bottom w:w="30" w:type="dxa"/>
+              <w:right w:w="80" w:type="dxa"/>
+            </w:tcMar>
+          </w:tcPr>
+          <w:p>
+            <w:r>
+              <w:rPr>
+                <w:rFonts w:ascii="Aptos" w:eastAsia="Aptos" w:hAnsi="Aptos" w:cs="Aptos"/>
+                <w:sz w:val="20"/>
+                <w:szCs w:val="20"/>
+              </w:rPr>
+              <w:t xml:space="preserve">The report lists each film with its tickets, its ticket takings and its food takings, and the totals agree with the headline figures.</w:t>
+            </w:r>
+          </w:p>
+        </w:tc>
+      </w:tr>
+      <w:tr>
+        <w:trPr>
+          <w:cantSplit/>
+        </w:trPr>
+        <w:tc>
+          <w:tcPr>
+            <w:tcW w:w="300" w:type="pct"/>
+            <w:tcMar>
+              <w:top w:w="30" w:type="dxa"/>
+              <w:left w:w="80" w:type="dxa"/>
+              <w:bottom w:w="30" w:type="dxa"/>
+              <w:right w:w="80" w:type="dxa"/>
+            </w:tcMar>
+          </w:tcPr>
+          <w:p>
+            <w:r>
+              <w:rPr>
+                <w:rFonts w:ascii="Aptos" w:eastAsia="Aptos" w:hAnsi="Aptos" w:cs="Aptos"/>
+                <w:sz w:val="20"/>
+                <w:szCs w:val="20"/>
+              </w:rPr>
+              <w:t xml:space="preserve">164</w:t>
+            </w:r>
+          </w:p>
+        </w:tc>
+        <w:tc>
+          <w:tcPr>
+            <w:tcW w:w="1850" w:type="pct"/>
+            <w:tcMar>
+              <w:top w:w="30" w:type="dxa"/>
+              <w:left w:w="80" w:type="dxa"/>
+              <w:bottom w:w="30" w:type="dxa"/>
+              <w:right w:w="80" w:type="dxa"/>
+            </w:tcMar>
+          </w:tcPr>
+          <w:p>
+            <w:r>
+              <w:rPr>
+                <w:rFonts w:ascii="Aptos" w:eastAsia="Aptos" w:hAnsi="Aptos" w:cs="Aptos"/>
+                <w:sz w:val="20"/>
+                <w:szCs w:val="20"/>
+              </w:rPr>
+              <w:t xml:space="preserve">Run the report with the type set to Tickets only</w:t>
+            </w:r>
+          </w:p>
+        </w:tc>
+        <w:tc>
+          <w:tcPr>
+            <w:tcW w:w="560" w:type="pct"/>
+            <w:tcMar>
+              <w:top w:w="30" w:type="dxa"/>
+              <w:left w:w="80" w:type="dxa"/>
+              <w:bottom w:w="30" w:type="dxa"/>
+              <w:right w:w="80" w:type="dxa"/>
+            </w:tcMar>
+          </w:tcPr>
+          <w:p>
+            <w:r>
+              <w:rPr>
+                <w:rFonts w:ascii="Aptos" w:eastAsia="Aptos" w:hAnsi="Aptos" w:cs="Aptos"/>
+                <w:sz w:val="20"/>
+                <w:szCs w:val="20"/>
+              </w:rPr>
+              <w:t xml:space="preserve">Normal</w:t>
+            </w:r>
+          </w:p>
+        </w:tc>
+        <w:tc>
+          <w:tcPr>
+            <w:tcW w:w="2290" w:type="pct"/>
+            <w:tcMar>
+              <w:top w:w="30" w:type="dxa"/>
+              <w:left w:w="80" w:type="dxa"/>
+              <w:bottom w:w="30" w:type="dxa"/>
+              <w:right w:w="80" w:type="dxa"/>
+            </w:tcMar>
+          </w:tcPr>
+          <w:p>
+            <w:r>
+              <w:rPr>
+                <w:rFonts w:ascii="Aptos" w:eastAsia="Aptos" w:hAnsi="Aptos" w:cs="Aptos"/>
+                <w:sz w:val="20"/>
+                <w:szCs w:val="20"/>
+              </w:rPr>
+              <w:t xml:space="preserve">The report lists each film with its tickets sold and its ticket takings only, and the ticket takings total agrees with the previous report.</w:t>
+            </w:r>
+          </w:p>
+        </w:tc>
+      </w:tr>
+      <w:tr>
+        <w:trPr>
+          <w:cantSplit/>
+        </w:trPr>
+        <w:tc>
+          <w:tcPr>
+            <w:tcW w:w="300" w:type="pct"/>
+            <w:tcMar>
+              <w:top w:w="30" w:type="dxa"/>
+              <w:left w:w="80" w:type="dxa"/>
+              <w:bottom w:w="30" w:type="dxa"/>
+              <w:right w:w="80" w:type="dxa"/>
+            </w:tcMar>
+          </w:tcPr>
+          <w:p>
+            <w:r>
+              <w:rPr>
+                <w:rFonts w:ascii="Aptos" w:eastAsia="Aptos" w:hAnsi="Aptos" w:cs="Aptos"/>
+                <w:sz w:val="20"/>
+                <w:szCs w:val="20"/>
+              </w:rPr>
+              <w:t xml:space="preserve">165</w:t>
+            </w:r>
+          </w:p>
+        </w:tc>
+        <w:tc>
+          <w:tcPr>
+            <w:tcW w:w="1850" w:type="pct"/>
+            <w:tcMar>
+              <w:top w:w="30" w:type="dxa"/>
+              <w:left w:w="80" w:type="dxa"/>
+              <w:bottom w:w="30" w:type="dxa"/>
+              <w:right w:w="80" w:type="dxa"/>
+            </w:tcMar>
+          </w:tcPr>
+          <w:p>
+            <w:r>
+              <w:rPr>
+                <w:rFonts w:ascii="Aptos" w:eastAsia="Aptos" w:hAnsi="Aptos" w:cs="Aptos"/>
+                <w:sz w:val="20"/>
+                <w:szCs w:val="20"/>
+              </w:rPr>
+              <w:t xml:space="preserve">Run the report with the type set to Concessions only</w:t>
+            </w:r>
+          </w:p>
+        </w:tc>
+        <w:tc>
+          <w:tcPr>
+            <w:tcW w:w="560" w:type="pct"/>
+            <w:tcMar>
+              <w:top w:w="30" w:type="dxa"/>
+              <w:left w:w="80" w:type="dxa"/>
+              <w:bottom w:w="30" w:type="dxa"/>
+              <w:right w:w="80" w:type="dxa"/>
+            </w:tcMar>
+          </w:tcPr>
+          <w:p>
+            <w:r>
+              <w:rPr>
+                <w:rFonts w:ascii="Aptos" w:eastAsia="Aptos" w:hAnsi="Aptos" w:cs="Aptos"/>
+                <w:sz w:val="20"/>
+                <w:szCs w:val="20"/>
+              </w:rPr>
+              <w:t xml:space="preserve">Normal</w:t>
+            </w:r>
+          </w:p>
+        </w:tc>
+        <w:tc>
+          <w:tcPr>
+            <w:tcW w:w="2290" w:type="pct"/>
+            <w:tcMar>
+              <w:top w:w="30" w:type="dxa"/>
+              <w:left w:w="80" w:type="dxa"/>
+              <w:bottom w:w="30" w:type="dxa"/>
+              <w:right w:w="80" w:type="dxa"/>
+            </w:tcMar>
+          </w:tcPr>
+          <w:p>
+            <w:r>
+              <w:rPr>
+                <w:rFonts w:ascii="Aptos" w:eastAsia="Aptos" w:hAnsi="Aptos" w:cs="Aptos"/>
+                <w:sz w:val="20"/>
+                <w:szCs w:val="20"/>
+              </w:rPr>
+              <w:t xml:space="preserve">The report lists each food item with the quantity sold and what it took, and Large Popcorn and Cola both appear with the quantities entered in the earlier tests.</w:t>
+            </w:r>
+          </w:p>
+        </w:tc>
+      </w:tr>
+      <w:tr>
+        <w:trPr>
+          <w:cantSplit/>
+        </w:trPr>
+        <w:tc>
+          <w:tcPr>
+            <w:tcW w:w="300" w:type="pct"/>
+            <w:tcMar>
+              <w:top w:w="30" w:type="dxa"/>
+              <w:left w:w="80" w:type="dxa"/>
+              <w:bottom w:w="30" w:type="dxa"/>
+              <w:right w:w="80" w:type="dxa"/>
+            </w:tcMar>
+          </w:tcPr>
+          <w:p>
+            <w:r>
+              <w:rPr>
+                <w:rFonts w:ascii="Aptos" w:eastAsia="Aptos" w:hAnsi="Aptos" w:cs="Aptos"/>
+                <w:sz w:val="20"/>
+                <w:szCs w:val="20"/>
+              </w:rPr>
+              <w:t xml:space="preserve">166</w:t>
+            </w:r>
+          </w:p>
+        </w:tc>
+        <w:tc>
+          <w:tcPr>
+            <w:tcW w:w="1850" w:type="pct"/>
+            <w:tcMar>
+              <w:top w:w="30" w:type="dxa"/>
+              <w:left w:w="80" w:type="dxa"/>
+              <w:bottom w:w="30" w:type="dxa"/>
+              <w:right w:w="80" w:type="dxa"/>
+            </w:tcMar>
+          </w:tcPr>
+          <w:p>
+            <w:r>
+              <w:rPr>
+                <w:rFonts w:ascii="Aptos" w:eastAsia="Aptos" w:hAnsi="Aptos" w:cs="Aptos"/>
+                <w:sz w:val="20"/>
+                <w:szCs w:val="20"/>
+              </w:rPr>
+              <w:t xml:space="preserve">Run the report with the type set to By day</w:t>
+            </w:r>
+          </w:p>
+        </w:tc>
+        <w:tc>
+          <w:tcPr>
+            <w:tcW w:w="560" w:type="pct"/>
+            <w:tcMar>
+              <w:top w:w="30" w:type="dxa"/>
+              <w:left w:w="80" w:type="dxa"/>
+              <w:bottom w:w="30" w:type="dxa"/>
+              <w:right w:w="80" w:type="dxa"/>
+            </w:tcMar>
+          </w:tcPr>
+          <w:p>
+            <w:r>
+              <w:rPr>
+                <w:rFonts w:ascii="Aptos" w:eastAsia="Aptos" w:hAnsi="Aptos" w:cs="Aptos"/>
+                <w:sz w:val="20"/>
+                <w:szCs w:val="20"/>
+              </w:rPr>
+              <w:t xml:space="preserve">Normal</w:t>
+            </w:r>
+          </w:p>
+        </w:tc>
+        <w:tc>
+          <w:tcPr>
+            <w:tcW w:w="2290" w:type="pct"/>
+            <w:tcMar>
+              <w:top w:w="30" w:type="dxa"/>
+              <w:left w:w="80" w:type="dxa"/>
+              <w:bottom w:w="30" w:type="dxa"/>
+              <w:right w:w="80" w:type="dxa"/>
+            </w:tcMar>
+          </w:tcPr>
+          <w:p>
+            <w:r>
+              <w:rPr>
+                <w:rFonts w:ascii="Aptos" w:eastAsia="Aptos" w:hAnsi="Aptos" w:cs="Aptos"/>
+                <w:sz w:val="20"/>
+                <w:szCs w:val="20"/>
+              </w:rPr>
+              <w:t xml:space="preserve">The report lists one row per day with the tickets and takings for that day, and the days add up to the same overall total.</w:t>
+            </w:r>
+          </w:p>
+        </w:tc>
+      </w:tr>
+      <w:tr>
+        <w:trPr>
+          <w:cantSplit/>
+        </w:trPr>
+        <w:tc>
+          <w:tcPr>
+            <w:tcW w:w="300" w:type="pct"/>
+            <w:tcMar>
+              <w:top w:w="30" w:type="dxa"/>
+              <w:left w:w="80" w:type="dxa"/>
+              <w:bottom w:w="30" w:type="dxa"/>
+              <w:right w:w="80" w:type="dxa"/>
+            </w:tcMar>
+          </w:tcPr>
+          <w:p>
+            <w:r>
+              <w:rPr>
+                <w:rFonts w:ascii="Aptos" w:eastAsia="Aptos" w:hAnsi="Aptos" w:cs="Aptos"/>
+                <w:sz w:val="20"/>
+                <w:szCs w:val="20"/>
+              </w:rPr>
+              <w:t xml:space="preserve">167</w:t>
+            </w:r>
+          </w:p>
+        </w:tc>
+        <w:tc>
+          <w:tcPr>
+            <w:tcW w:w="1850" w:type="pct"/>
+            <w:tcMar>
+              <w:top w:w="30" w:type="dxa"/>
+              <w:left w:w="80" w:type="dxa"/>
+              <w:bottom w:w="30" w:type="dxa"/>
+              <w:right w:w="80" w:type="dxa"/>
+            </w:tcMar>
+          </w:tcPr>
+          <w:p>
+            <w:r>
+              <w:rPr>
+                <w:rFonts w:ascii="Aptos" w:eastAsia="Aptos" w:hAnsi="Aptos" w:cs="Aptos"/>
+                <w:sz w:val="20"/>
+                <w:szCs w:val="20"/>
+              </w:rPr>
+              <w:t xml:space="preserve">Run the report with the type set to By screening</w:t>
+            </w:r>
+          </w:p>
+        </w:tc>
+        <w:tc>
+          <w:tcPr>
+            <w:tcW w:w="560" w:type="pct"/>
+            <w:tcMar>
+              <w:top w:w="30" w:type="dxa"/>
+              <w:left w:w="80" w:type="dxa"/>
+              <w:bottom w:w="30" w:type="dxa"/>
+              <w:right w:w="80" w:type="dxa"/>
+            </w:tcMar>
+          </w:tcPr>
+          <w:p>
+            <w:r>
+              <w:rPr>
+                <w:rFonts w:ascii="Aptos" w:eastAsia="Aptos" w:hAnsi="Aptos" w:cs="Aptos"/>
+                <w:sz w:val="20"/>
+                <w:szCs w:val="20"/>
+              </w:rPr>
+              <w:t xml:space="preserve">Normal</w:t>
+            </w:r>
+          </w:p>
+        </w:tc>
+        <w:tc>
+          <w:tcPr>
+            <w:tcW w:w="2290" w:type="pct"/>
+            <w:tcMar>
+              <w:top w:w="30" w:type="dxa"/>
+              <w:left w:w="80" w:type="dxa"/>
+              <w:bottom w:w="30" w:type="dxa"/>
+              <w:right w:w="80" w:type="dxa"/>
+            </w:tcMar>
+          </w:tcPr>
+          <w:p>
+            <w:r>
+              <w:rPr>
+                <w:rFonts w:ascii="Aptos" w:eastAsia="Aptos" w:hAnsi="Aptos" w:cs="Aptos"/>
+                <w:sz w:val="20"/>
+                <w:szCs w:val="20"/>
+              </w:rPr>
+              <w:t xml:space="preserve">The report lists each screening separately with its film, date, time and screen, so two showings of the same film on the same day can be told apart.</w:t>
+            </w:r>
+          </w:p>
+        </w:tc>
+      </w:tr>
+      <w:tr>
+        <w:trPr>
+          <w:cantSplit/>
+        </w:trPr>
+        <w:tc>
+          <w:tcPr>
+            <w:tcW w:w="300" w:type="pct"/>
+            <w:tcMar>
+              <w:top w:w="30" w:type="dxa"/>
+              <w:left w:w="80" w:type="dxa"/>
+              <w:bottom w:w="30" w:type="dxa"/>
+              <w:right w:w="80" w:type="dxa"/>
+            </w:tcMar>
+          </w:tcPr>
+          <w:p>
+            <w:r>
+              <w:rPr>
+                <w:rFonts w:ascii="Aptos" w:eastAsia="Aptos" w:hAnsi="Aptos" w:cs="Aptos"/>
+                <w:sz w:val="20"/>
+                <w:szCs w:val="20"/>
+              </w:rPr>
+              <w:t xml:space="preserve">168</w:t>
+            </w:r>
+          </w:p>
+        </w:tc>
+        <w:tc>
+          <w:tcPr>
+            <w:tcW w:w="1850" w:type="pct"/>
+            <w:tcMar>
+              <w:top w:w="30" w:type="dxa"/>
+              <w:left w:w="80" w:type="dxa"/>
+              <w:bottom w:w="30" w:type="dxa"/>
+              <w:right w:w="80" w:type="dxa"/>
+            </w:tcMar>
+          </w:tcPr>
+          <w:p>
+            <w:r>
+              <w:rPr>
+                <w:rFonts w:ascii="Aptos" w:eastAsia="Aptos" w:hAnsi="Aptos" w:cs="Aptos"/>
+                <w:sz w:val="20"/>
+                <w:szCs w:val="20"/>
+              </w:rPr>
+              <w:t xml:space="preserve">Run the report with the type set to By screen</w:t>
+            </w:r>
+          </w:p>
+        </w:tc>
+        <w:tc>
+          <w:tcPr>
+            <w:tcW w:w="560" w:type="pct"/>
+            <w:tcMar>
+              <w:top w:w="30" w:type="dxa"/>
+              <w:left w:w="80" w:type="dxa"/>
+              <w:bottom w:w="30" w:type="dxa"/>
+              <w:right w:w="80" w:type="dxa"/>
+            </w:tcMar>
+          </w:tcPr>
+          <w:p>
+            <w:r>
+              <w:rPr>
+                <w:rFonts w:ascii="Aptos" w:eastAsia="Aptos" w:hAnsi="Aptos" w:cs="Aptos"/>
+                <w:sz w:val="20"/>
+                <w:szCs w:val="20"/>
+              </w:rPr>
+              <w:t xml:space="preserve">Normal</w:t>
+            </w:r>
+          </w:p>
+        </w:tc>
+        <w:tc>
+          <w:tcPr>
+            <w:tcW w:w="2290" w:type="pct"/>
+            <w:tcMar>
+              <w:top w:w="30" w:type="dxa"/>
+              <w:left w:w="80" w:type="dxa"/>
+              <w:bottom w:w="30" w:type="dxa"/>
+              <w:right w:w="80" w:type="dxa"/>
+            </w:tcMar>
+          </w:tcPr>
+          <w:p>
+            <w:r>
+              <w:rPr>
+                <w:rFonts w:ascii="Aptos" w:eastAsia="Aptos" w:hAnsi="Aptos" w:cs="Aptos"/>
+                <w:sz w:val="20"/>
+                <w:szCs w:val="20"/>
+              </w:rPr>
+              <w:t xml:space="preserve">The report lists Screen 1 and Screen 2 with the takings made in each, and the two add up to the overall ticket takings.</w:t>
+            </w:r>
+          </w:p>
+        </w:tc>
+      </w:tr>
+      <w:tr>
+        <w:trPr>
+          <w:cantSplit/>
+        </w:trPr>
+        <w:tc>
+          <w:tcPr>
+            <w:tcW w:w="300" w:type="pct"/>
+            <w:tcMar>
+              <w:top w:w="30" w:type="dxa"/>
+              <w:left w:w="80" w:type="dxa"/>
+              <w:bottom w:w="30" w:type="dxa"/>
+              <w:right w:w="80" w:type="dxa"/>
+            </w:tcMar>
+          </w:tcPr>
+          <w:p>
+            <w:r>
+              <w:rPr>
+                <w:rFonts w:ascii="Aptos" w:eastAsia="Aptos" w:hAnsi="Aptos" w:cs="Aptos"/>
+                <w:sz w:val="20"/>
+                <w:szCs w:val="20"/>
+              </w:rPr>
+              <w:t xml:space="preserve">169</w:t>
+            </w:r>
+          </w:p>
+        </w:tc>
+        <w:tc>
+          <w:tcPr>
+            <w:tcW w:w="1850" w:type="pct"/>
+            <w:tcMar>
+              <w:top w:w="30" w:type="dxa"/>
+              <w:left w:w="80" w:type="dxa"/>
+              <w:bottom w:w="30" w:type="dxa"/>
+              <w:right w:w="80" w:type="dxa"/>
+            </w:tcMar>
+          </w:tcPr>
+          <w:p>
+            <w:r>
+              <w:rPr>
+                <w:rFonts w:ascii="Aptos" w:eastAsia="Aptos" w:hAnsi="Aptos" w:cs="Aptos"/>
+                <w:sz w:val="20"/>
+                <w:szCs w:val="20"/>
+              </w:rPr>
+              <w:t xml:space="preserve">Run the report with the type set to By staff member</w:t>
+            </w:r>
+          </w:p>
+        </w:tc>
+        <w:tc>
+          <w:tcPr>
+            <w:tcW w:w="560" w:type="pct"/>
+            <w:tcMar>
+              <w:top w:w="30" w:type="dxa"/>
+              <w:left w:w="80" w:type="dxa"/>
+              <w:bottom w:w="30" w:type="dxa"/>
+              <w:right w:w="80" w:type="dxa"/>
+            </w:tcMar>
+          </w:tcPr>
+          <w:p>
+            <w:r>
+              <w:rPr>
+                <w:rFonts w:ascii="Aptos" w:eastAsia="Aptos" w:hAnsi="Aptos" w:cs="Aptos"/>
+                <w:sz w:val="20"/>
+                <w:szCs w:val="20"/>
+              </w:rPr>
+              <w:t xml:space="preserve">Normal</w:t>
+            </w:r>
+          </w:p>
+        </w:tc>
+        <w:tc>
+          <w:tcPr>
+            <w:tcW w:w="2290" w:type="pct"/>
+            <w:tcMar>
+              <w:top w:w="30" w:type="dxa"/>
+              <w:left w:w="80" w:type="dxa"/>
+              <w:bottom w:w="30" w:type="dxa"/>
+              <w:right w:w="80" w:type="dxa"/>
+            </w:tcMar>
+          </w:tcPr>
+          <w:p>
+            <w:r>
+              <w:rPr>
+                <w:rFonts w:ascii="Aptos" w:eastAsia="Aptos" w:hAnsi="Aptos" w:cs="Aptos"/>
+                <w:sz w:val="20"/>
+                <w:szCs w:val="20"/>
+              </w:rPr>
+              <w:t xml:space="preserve">The report lists each account that took a sale with the tickets and takings against it, which is what makes it possible to see who sold what.</w:t>
+            </w:r>
+          </w:p>
+        </w:tc>
+      </w:tr>
+      <w:tr>
+        <w:trPr>
+          <w:cantSplit/>
+        </w:trPr>
+        <w:tc>
+          <w:tcPr>
+            <w:tcW w:w="300" w:type="pct"/>
+            <w:tcMar>
+              <w:top w:w="30" w:type="dxa"/>
+              <w:left w:w="80" w:type="dxa"/>
+              <w:bottom w:w="30" w:type="dxa"/>
+              <w:right w:w="80" w:type="dxa"/>
+            </w:tcMar>
+          </w:tcPr>
+          <w:p>
+            <w:r>
+              <w:rPr>
+                <w:rFonts w:ascii="Aptos" w:eastAsia="Aptos" w:hAnsi="Aptos" w:cs="Aptos"/>
+                <w:sz w:val="20"/>
+                <w:szCs w:val="20"/>
+              </w:rPr>
+              <w:t xml:space="preserve">170</w:t>
+            </w:r>
+          </w:p>
+        </w:tc>
+        <w:tc>
+          <w:tcPr>
+            <w:tcW w:w="1850" w:type="pct"/>
+            <w:tcMar>
+              <w:top w:w="30" w:type="dxa"/>
+              <w:left w:w="80" w:type="dxa"/>
+              <w:bottom w:w="30" w:type="dxa"/>
+              <w:right w:w="80" w:type="dxa"/>
+            </w:tcMar>
+          </w:tcPr>
+          <w:p>
+            <w:r>
+              <w:rPr>
+                <w:rFonts w:ascii="Aptos" w:eastAsia="Aptos" w:hAnsi="Aptos" w:cs="Aptos"/>
+                <w:sz w:val="20"/>
+                <w:szCs w:val="20"/>
+              </w:rPr>
+              <w:t xml:space="preserve">Run the report with the type set to Refunds</w:t>
+            </w:r>
+          </w:p>
+        </w:tc>
+        <w:tc>
+          <w:tcPr>
+            <w:tcW w:w="560" w:type="pct"/>
+            <w:tcMar>
+              <w:top w:w="30" w:type="dxa"/>
+              <w:left w:w="80" w:type="dxa"/>
+              <w:bottom w:w="30" w:type="dxa"/>
+              <w:right w:w="80" w:type="dxa"/>
+            </w:tcMar>
+          </w:tcPr>
+          <w:p>
+            <w:r>
+              <w:rPr>
+                <w:rFonts w:ascii="Aptos" w:eastAsia="Aptos" w:hAnsi="Aptos" w:cs="Aptos"/>
+                <w:sz w:val="20"/>
+                <w:szCs w:val="20"/>
+              </w:rPr>
+              <w:t xml:space="preserve">Normal</w:t>
+            </w:r>
+          </w:p>
+        </w:tc>
+        <w:tc>
+          <w:tcPr>
+            <w:tcW w:w="2290" w:type="pct"/>
+            <w:tcMar>
+              <w:top w:w="30" w:type="dxa"/>
+              <w:left w:w="80" w:type="dxa"/>
+              <w:bottom w:w="30" w:type="dxa"/>
+              <w:right w:w="80" w:type="dxa"/>
+            </w:tcMar>
+          </w:tcPr>
+          <w:p>
+            <w:r>
+              <w:rPr>
+                <w:rFonts w:ascii="Aptos" w:eastAsia="Aptos" w:hAnsi="Aptos" w:cs="Aptos"/>
+                <w:sz w:val="20"/>
+                <w:szCs w:val="20"/>
+              </w:rPr>
+              <w:t xml:space="preserve">The report lists each refund with its date, its amount, its reason and the member of staff who gave it.</w:t>
+            </w:r>
+          </w:p>
+        </w:tc>
+      </w:tr>
+      <w:tr>
+        <w:trPr>
+          <w:cantSplit/>
+        </w:trPr>
+        <w:tc>
+          <w:tcPr>
+            <w:tcW w:w="300" w:type="pct"/>
+            <w:tcMar>
+              <w:top w:w="30" w:type="dxa"/>
+              <w:left w:w="80" w:type="dxa"/>
+              <w:bottom w:w="30" w:type="dxa"/>
+              <w:right w:w="80" w:type="dxa"/>
+            </w:tcMar>
+          </w:tcPr>
+          <w:p>
+            <w:r>
+              <w:rPr>
+                <w:rFonts w:ascii="Aptos" w:eastAsia="Aptos" w:hAnsi="Aptos" w:cs="Aptos"/>
+                <w:sz w:val="20"/>
+                <w:szCs w:val="20"/>
+              </w:rPr>
+              <w:t xml:space="preserve">171</w:t>
+            </w:r>
+          </w:p>
+        </w:tc>
+        <w:tc>
+          <w:tcPr>
+            <w:tcW w:w="1850" w:type="pct"/>
+            <w:tcMar>
+              <w:top w:w="30" w:type="dxa"/>
+              <w:left w:w="80" w:type="dxa"/>
+              <w:bottom w:w="30" w:type="dxa"/>
+              <w:right w:w="80" w:type="dxa"/>
+            </w:tcMar>
+          </w:tcPr>
+          <w:p>
+            <w:r>
+              <w:rPr>
+                <w:rFonts w:ascii="Aptos" w:eastAsia="Aptos" w:hAnsi="Aptos" w:cs="Aptos"/>
+                <w:sz w:val="20"/>
+                <w:szCs w:val="20"/>
+              </w:rPr>
+              <w:t xml:space="preserve">Switch from one report type to another and look at the order of the columns</w:t>
+            </w:r>
+          </w:p>
+        </w:tc>
+        <w:tc>
+          <w:tcPr>
+            <w:tcW w:w="560" w:type="pct"/>
+            <w:tcMar>
+              <w:top w:w="30" w:type="dxa"/>
+              <w:left w:w="80" w:type="dxa"/>
+              <w:bottom w:w="30" w:type="dxa"/>
+              <w:right w:w="80" w:type="dxa"/>
+            </w:tcMar>
+          </w:tcPr>
+          <w:p>
+            <w:r>
+              <w:rPr>
+                <w:rFonts w:ascii="Aptos" w:eastAsia="Aptos" w:hAnsi="Aptos" w:cs="Aptos"/>
+                <w:sz w:val="20"/>
+                <w:szCs w:val="20"/>
+              </w:rPr>
+              <w:t xml:space="preserve">Normal</w:t>
+            </w:r>
+          </w:p>
+        </w:tc>
+        <w:tc>
+          <w:tcPr>
+            <w:tcW w:w="2290" w:type="pct"/>
+            <w:tcMar>
+              <w:top w:w="30" w:type="dxa"/>
+              <w:left w:w="80" w:type="dxa"/>
+              <w:bottom w:w="30" w:type="dxa"/>
+              <w:right w:w="80" w:type="dxa"/>
+            </w:tcMar>
+          </w:tcPr>
+          <w:p>
+            <w:r>
+              <w:rPr>
+                <w:rFonts w:ascii="Aptos" w:eastAsia="Aptos" w:hAnsi="Aptos" w:cs="Aptos"/>
+                <w:sz w:val="20"/>
+                <w:szCs w:val="20"/>
+              </w:rPr>
+              <w:t xml:space="preserve">The columns appear in the right order for the report being shown rather than a column being left over in the wrong position from the previous report.</w:t>
+            </w:r>
+          </w:p>
+        </w:tc>
+      </w:tr>
+      <w:tr>
+        <w:trPr>
+          <w:cantSplit/>
+        </w:trPr>
+        <w:tc>
+          <w:tcPr>
+            <w:tcW w:w="300" w:type="pct"/>
+            <w:tcMar>
+              <w:top w:w="30" w:type="dxa"/>
+              <w:left w:w="80" w:type="dxa"/>
+              <w:bottom w:w="30" w:type="dxa"/>
+              <w:right w:w="80" w:type="dxa"/>
+            </w:tcMar>
+          </w:tcPr>
+          <w:p>
+            <w:r>
+              <w:rPr>
+                <w:rFonts w:ascii="Aptos" w:eastAsia="Aptos" w:hAnsi="Aptos" w:cs="Aptos"/>
+                <w:sz w:val="20"/>
+                <w:szCs w:val="20"/>
+              </w:rPr>
+              <w:t xml:space="preserve">172</w:t>
+            </w:r>
+          </w:p>
+        </w:tc>
+        <w:tc>
+          <w:tcPr>
+            <w:tcW w:w="1850" w:type="pct"/>
+            <w:tcMar>
+              <w:top w:w="30" w:type="dxa"/>
+              <w:left w:w="80" w:type="dxa"/>
+              <w:bottom w:w="30" w:type="dxa"/>
+              <w:right w:w="80" w:type="dxa"/>
+            </w:tcMar>
+          </w:tcPr>
+          <w:p>
+            <w:r>
+              <w:rPr>
+                <w:rFonts w:ascii="Aptos" w:eastAsia="Aptos" w:hAnsi="Aptos" w:cs="Aptos"/>
+                <w:sz w:val="20"/>
+                <w:szCs w:val="20"/>
+              </w:rPr>
+              <w:t xml:space="preserve">Take a booking today for a screening next month, then run the report for today measured by the date the booking was taken</w:t>
+            </w:r>
+          </w:p>
+        </w:tc>
+        <w:tc>
+          <w:tcPr>
+            <w:tcW w:w="560" w:type="pct"/>
+            <w:tcMar>
+              <w:top w:w="30" w:type="dxa"/>
+              <w:left w:w="80" w:type="dxa"/>
+              <w:bottom w:w="30" w:type="dxa"/>
+              <w:right w:w="80" w:type="dxa"/>
+            </w:tcMar>
+          </w:tcPr>
+          <w:p>
+            <w:r>
+              <w:rPr>
+                <w:rFonts w:ascii="Aptos" w:eastAsia="Aptos" w:hAnsi="Aptos" w:cs="Aptos"/>
+                <w:sz w:val="20"/>
+                <w:szCs w:val="20"/>
+              </w:rPr>
+              <w:t xml:space="preserve">Normal</w:t>
+            </w:r>
+          </w:p>
+        </w:tc>
+        <w:tc>
+          <w:tcPr>
+            <w:tcW w:w="2290" w:type="pct"/>
+            <w:tcMar>
+              <w:top w:w="30" w:type="dxa"/>
+              <w:left w:w="80" w:type="dxa"/>
+              <w:bottom w:w="30" w:type="dxa"/>
+              <w:right w:w="80" w:type="dxa"/>
+            </w:tcMar>
+          </w:tcPr>
+          <w:p>
+            <w:r>
+              <w:rPr>
+                <w:rFonts w:ascii="Aptos" w:eastAsia="Aptos" w:hAnsi="Aptos" w:cs="Aptos"/>
+                <w:sz w:val="20"/>
+                <w:szCs w:val="20"/>
+              </w:rPr>
+              <w:t xml:space="preserve">The sale is included, because it was taken today.</w:t>
+            </w:r>
+          </w:p>
+        </w:tc>
+      </w:tr>
+      <w:tr>
+        <w:trPr>
+          <w:cantSplit/>
+        </w:trPr>
+        <w:tc>
+          <w:tcPr>
+            <w:tcW w:w="300" w:type="pct"/>
+            <w:tcMar>
+              <w:top w:w="30" w:type="dxa"/>
+              <w:left w:w="80" w:type="dxa"/>
+              <w:bottom w:w="30" w:type="dxa"/>
+              <w:right w:w="80" w:type="dxa"/>
+            </w:tcMar>
+          </w:tcPr>
+          <w:p>
+            <w:r>
+              <w:rPr>
+                <w:rFonts w:ascii="Aptos" w:eastAsia="Aptos" w:hAnsi="Aptos" w:cs="Aptos"/>
+                <w:sz w:val="20"/>
+                <w:szCs w:val="20"/>
+              </w:rPr>
+              <w:t xml:space="preserve">173</w:t>
+            </w:r>
+          </w:p>
+        </w:tc>
+        <w:tc>
+          <w:tcPr>
+            <w:tcW w:w="1850" w:type="pct"/>
+            <w:tcMar>
+              <w:top w:w="30" w:type="dxa"/>
+              <w:left w:w="80" w:type="dxa"/>
+              <w:bottom w:w="30" w:type="dxa"/>
+              <w:right w:w="80" w:type="dxa"/>
+            </w:tcMar>
+          </w:tcPr>
+          <w:p>
+            <w:r>
+              <w:rPr>
+                <w:rFonts w:ascii="Aptos" w:eastAsia="Aptos" w:hAnsi="Aptos" w:cs="Aptos"/>
+                <w:sz w:val="20"/>
+                <w:szCs w:val="20"/>
+              </w:rPr>
+              <w:t xml:space="preserve">Run the same report for today measured by the date of the screening</w:t>
+            </w:r>
+          </w:p>
+        </w:tc>
+        <w:tc>
+          <w:tcPr>
+            <w:tcW w:w="560" w:type="pct"/>
+            <w:tcMar>
+              <w:top w:w="30" w:type="dxa"/>
+              <w:left w:w="80" w:type="dxa"/>
+              <w:bottom w:w="30" w:type="dxa"/>
+              <w:right w:w="80" w:type="dxa"/>
+            </w:tcMar>
+          </w:tcPr>
+          <w:p>
+            <w:r>
+              <w:rPr>
+                <w:rFonts w:ascii="Aptos" w:eastAsia="Aptos" w:hAnsi="Aptos" w:cs="Aptos"/>
+                <w:sz w:val="20"/>
+                <w:szCs w:val="20"/>
+              </w:rPr>
+              <w:t xml:space="preserve">Normal</w:t>
+            </w:r>
+          </w:p>
+        </w:tc>
+        <w:tc>
+          <w:tcPr>
+            <w:tcW w:w="2290" w:type="pct"/>
+            <w:tcMar>
+              <w:top w:w="30" w:type="dxa"/>
+              <w:left w:w="80" w:type="dxa"/>
+              <w:bottom w:w="30" w:type="dxa"/>
+              <w:right w:w="80" w:type="dxa"/>
+            </w:tcMar>
+          </w:tcPr>
+          <w:p>
+            <w:r>
+              <w:rPr>
+                <w:rFonts w:ascii="Aptos" w:eastAsia="Aptos" w:hAnsi="Aptos" w:cs="Aptos"/>
+                <w:sz w:val="20"/>
+                <w:szCs w:val="20"/>
+              </w:rPr>
+              <w:t xml:space="preserve">The sale is not included, because the screening has not happened yet, which shows the two ways of measuring genuinely give different answers.</w:t>
+            </w:r>
+          </w:p>
+        </w:tc>
+      </w:tr>
+      <w:tr>
+        <w:trPr>
+          <w:cantSplit/>
+        </w:trPr>
+        <w:tc>
+          <w:tcPr>
+            <w:tcW w:w="300" w:type="pct"/>
+            <w:tcMar>
+              <w:top w:w="30" w:type="dxa"/>
+              <w:left w:w="80" w:type="dxa"/>
+              <w:bottom w:w="30" w:type="dxa"/>
+              <w:right w:w="80" w:type="dxa"/>
+            </w:tcMar>
+          </w:tcPr>
+          <w:p>
+            <w:r>
+              <w:rPr>
+                <w:rFonts w:ascii="Aptos" w:eastAsia="Aptos" w:hAnsi="Aptos" w:cs="Aptos"/>
+                <w:sz w:val="20"/>
+                <w:szCs w:val="20"/>
+              </w:rPr>
+              <w:t xml:space="preserve">174</w:t>
+            </w:r>
+          </w:p>
+        </w:tc>
+        <w:tc>
+          <w:tcPr>
+            <w:tcW w:w="1850" w:type="pct"/>
+            <w:tcMar>
+              <w:top w:w="30" w:type="dxa"/>
+              <w:left w:w="80" w:type="dxa"/>
+              <w:bottom w:w="30" w:type="dxa"/>
+              <w:right w:w="80" w:type="dxa"/>
+            </w:tcMar>
+          </w:tcPr>
+          <w:p>
+            <w:r>
+              <w:rPr>
+                <w:rFonts w:ascii="Aptos" w:eastAsia="Aptos" w:hAnsi="Aptos" w:cs="Aptos"/>
+                <w:sz w:val="20"/>
+                <w:szCs w:val="20"/>
+              </w:rPr>
+              <w:t xml:space="preserve">Run the report for next month measured by the date of the screening</w:t>
+            </w:r>
+          </w:p>
+        </w:tc>
+        <w:tc>
+          <w:tcPr>
+            <w:tcW w:w="560" w:type="pct"/>
+            <w:tcMar>
+              <w:top w:w="30" w:type="dxa"/>
+              <w:left w:w="80" w:type="dxa"/>
+              <w:bottom w:w="30" w:type="dxa"/>
+              <w:right w:w="80" w:type="dxa"/>
+            </w:tcMar>
+          </w:tcPr>
+          <w:p>
+            <w:r>
+              <w:rPr>
+                <w:rFonts w:ascii="Aptos" w:eastAsia="Aptos" w:hAnsi="Aptos" w:cs="Aptos"/>
+                <w:sz w:val="20"/>
+                <w:szCs w:val="20"/>
+              </w:rPr>
+              <w:t xml:space="preserve">Normal</w:t>
+            </w:r>
+          </w:p>
+        </w:tc>
+        <w:tc>
+          <w:tcPr>
+            <w:tcW w:w="2290" w:type="pct"/>
+            <w:tcMar>
+              <w:top w:w="30" w:type="dxa"/>
+              <w:left w:w="80" w:type="dxa"/>
+              <w:bottom w:w="30" w:type="dxa"/>
+              <w:right w:w="80" w:type="dxa"/>
+            </w:tcMar>
+          </w:tcPr>
+          <w:p>
+            <w:r>
+              <w:rPr>
+                <w:rFonts w:ascii="Aptos" w:eastAsia="Aptos" w:hAnsi="Aptos" w:cs="Aptos"/>
+                <w:sz w:val="20"/>
+                <w:szCs w:val="20"/>
+              </w:rPr>
+              <w:t xml:space="preserve">The sale is included, and the report makes clear which basis it was measured on.</w:t>
+            </w:r>
+          </w:p>
+        </w:tc>
+      </w:tr>
+      <w:tr>
+        <w:trPr>
+          <w:cantSplit/>
+        </w:trPr>
+        <w:tc>
+          <w:tcPr>
+            <w:tcW w:w="300" w:type="pct"/>
+            <w:tcMar>
+              <w:top w:w="30" w:type="dxa"/>
+              <w:left w:w="80" w:type="dxa"/>
+              <w:bottom w:w="30" w:type="dxa"/>
+              <w:right w:w="80" w:type="dxa"/>
+            </w:tcMar>
+          </w:tcPr>
+          <w:p>
+            <w:r>
+              <w:rPr>
+                <w:rFonts w:ascii="Aptos" w:eastAsia="Aptos" w:hAnsi="Aptos" w:cs="Aptos"/>
+                <w:sz w:val="20"/>
+                <w:szCs w:val="20"/>
+              </w:rPr>
+              <w:t xml:space="preserve">175</w:t>
+            </w:r>
+          </w:p>
+        </w:tc>
+        <w:tc>
+          <w:tcPr>
+            <w:tcW w:w="1850" w:type="pct"/>
+            <w:tcMar>
+              <w:top w:w="30" w:type="dxa"/>
+              <w:left w:w="80" w:type="dxa"/>
+              <w:bottom w:w="30" w:type="dxa"/>
+              <w:right w:w="80" w:type="dxa"/>
+            </w:tcMar>
+          </w:tcPr>
+          <w:p>
+            <w:r>
+              <w:rPr>
+                <w:rFonts w:ascii="Aptos" w:eastAsia="Aptos" w:hAnsi="Aptos" w:cs="Aptos"/>
+                <w:sz w:val="20"/>
+                <w:szCs w:val="20"/>
+              </w:rPr>
+              <w:t xml:space="preserve">Run any of the breakdowns over a range with no sales in it at all</w:t>
+            </w:r>
+          </w:p>
+        </w:tc>
+        <w:tc>
+          <w:tcPr>
+            <w:tcW w:w="560" w:type="pct"/>
+            <w:tcMar>
+              <w:top w:w="30" w:type="dxa"/>
+              <w:left w:w="80" w:type="dxa"/>
+              <w:bottom w:w="30" w:type="dxa"/>
+              <w:right w:w="80" w:type="dxa"/>
+            </w:tcMar>
+          </w:tcPr>
+          <w:p>
+            <w:r>
+              <w:rPr>
+                <w:rFonts w:ascii="Aptos" w:eastAsia="Aptos" w:hAnsi="Aptos" w:cs="Aptos"/>
+                <w:sz w:val="20"/>
+                <w:szCs w:val="20"/>
+              </w:rPr>
+              <w:t xml:space="preserve">Boundary</w:t>
+            </w:r>
+          </w:p>
+        </w:tc>
+        <w:tc>
+          <w:tcPr>
+            <w:tcW w:w="2290" w:type="pct"/>
+            <w:tcMar>
+              <w:top w:w="30" w:type="dxa"/>
+              <w:left w:w="80" w:type="dxa"/>
+              <w:bottom w:w="30" w:type="dxa"/>
+              <w:right w:w="80" w:type="dxa"/>
+            </w:tcMar>
+          </w:tcPr>
+          <w:p>
+            <w:r>
+              <w:rPr>
+                <w:rFonts w:ascii="Aptos" w:eastAsia="Aptos" w:hAnsi="Aptos" w:cs="Aptos"/>
+                <w:sz w:val="20"/>
+                <w:szCs w:val="20"/>
+              </w:rPr>
+              <w:t xml:space="preserve">The report comes back empty with totals of £0.00 rather than reporting an error.</w:t>
             </w:r>
           </w:p>
         </w:tc>

</xml_diff>

<commit_message>
added objective 32: exporting to a file
</commit_message>
<xml_diff>
--- a/Testing.docx
+++ b/Testing.docx
@@ -19200,6 +19200,607 @@
                 <w:szCs w:val="20"/>
               </w:rPr>
               <w:t xml:space="preserve">The report comes back empty with totals of £0.00 rather than reporting an error.</w:t>
+            </w:r>
+          </w:p>
+        </w:tc>
+      </w:tr>
+    </w:tbl>
+    <w:p>
+      <w:r>
+        <w:rPr>
+          <w:rFonts w:ascii="Aptos" w:eastAsia="Aptos" w:hAnsi="Aptos" w:cs="Aptos"/>
+        </w:rPr>
+        <w:t xml:space="preserve"/>
+      </w:r>
+    </w:p>
+    <w:p>
+      <w:pPr>
+        <w:pStyle w:val="Heading3"/>
+      </w:pPr>
+      <w:r>
+        <w:rPr>
+          <w:rFonts w:ascii="Aptos Display" w:eastAsia="Aptos Display" w:hAnsi="Aptos Display" w:cs="Aptos Display"/>
+          <w:b/>
+          <w:bCs/>
+          <w:color w:val="000000"/>
+        </w:rPr>
+        <w:t xml:space="preserve">Objective 32: Exporting to a File</w:t>
+      </w:r>
+    </w:p>
+    <w:p>
+      <w:r>
+        <w:rPr>
+          <w:rFonts w:ascii="Aptos" w:eastAsia="Aptos" w:hAnsi="Aptos" w:cs="Aptos"/>
+        </w:rPr>
+        <w:t xml:space="preserve">These tests check that what is on screen can be taken off into a spreadsheet, and that the export handles the awkward cases rather than only the tidy ones.</w:t>
+      </w:r>
+    </w:p>
+    <w:tbl>
+      <w:tblPr>
+        <w:tblW w:w="5000" w:type="pct"/>
+        <w:tblBorders>
+          <w:top w:val="single" w:sz="4" w:space="0" w:color="808080"/>
+          <w:left w:val="single" w:sz="4" w:space="0" w:color="808080"/>
+          <w:bottom w:val="single" w:sz="4" w:space="0" w:color="808080"/>
+          <w:right w:val="single" w:sz="4" w:space="0" w:color="808080"/>
+          <w:insideH w:val="single" w:sz="4" w:space="0" w:color="808080"/>
+          <w:insideV w:val="single" w:sz="4" w:space="0" w:color="808080"/>
+        </w:tblBorders>
+        <w:tblCellMar>
+          <w:left w:w="10" w:type="dxa"/>
+          <w:right w:w="10" w:type="dxa"/>
+        </w:tblCellMar>
+        <w:tblLook w:val="0000" w:firstRow="0" w:lastRow="0" w:firstColumn="0" w:lastColumn="0" w:noHBand="0" w:noVBand="0"/>
+      </w:tblPr>
+      <w:tblGrid>
+        <w:gridCol w:w="561"/>
+        <w:gridCol w:w="3460"/>
+        <w:gridCol w:w="1047"/>
+        <w:gridCol w:w="4282"/>
+      </w:tblGrid>
+      <w:tr>
+        <w:trPr>
+          <w:cantSplit/>
+          <w:tblHeader/>
+        </w:trPr>
+        <w:tc>
+          <w:tcPr>
+            <w:tcW w:w="300" w:type="pct"/>
+            <w:shd w:val="clear" w:color="auto" w:fill="F2CEED" w:themeFill="accent5" w:themeFillTint="33"/>
+            <w:tcMar>
+              <w:top w:w="30" w:type="dxa"/>
+              <w:left w:w="80" w:type="dxa"/>
+              <w:bottom w:w="30" w:type="dxa"/>
+              <w:right w:w="80" w:type="dxa"/>
+            </w:tcMar>
+          </w:tcPr>
+          <w:p>
+            <w:r>
+              <w:rPr>
+                <w:rFonts w:ascii="Aptos" w:eastAsia="Aptos" w:hAnsi="Aptos" w:cs="Aptos"/>
+                <w:b/>
+                <w:bCs/>
+                <w:sz w:val="20"/>
+                <w:szCs w:val="20"/>
+              </w:rPr>
+              <w:t xml:space="preserve">No.</w:t>
+            </w:r>
+          </w:p>
+        </w:tc>
+        <w:tc>
+          <w:tcPr>
+            <w:tcW w:w="1850" w:type="pct"/>
+            <w:shd w:val="clear" w:color="auto" w:fill="F2CEED" w:themeFill="accent5" w:themeFillTint="33"/>
+            <w:tcMar>
+              <w:top w:w="30" w:type="dxa"/>
+              <w:left w:w="80" w:type="dxa"/>
+              <w:bottom w:w="30" w:type="dxa"/>
+              <w:right w:w="80" w:type="dxa"/>
+            </w:tcMar>
+          </w:tcPr>
+          <w:p>
+            <w:r>
+              <w:rPr>
+                <w:rFonts w:ascii="Aptos" w:eastAsia="Aptos" w:hAnsi="Aptos" w:cs="Aptos"/>
+                <w:b/>
+                <w:bCs/>
+                <w:sz w:val="20"/>
+                <w:szCs w:val="20"/>
+              </w:rPr>
+              <w:t xml:space="preserve">Test</w:t>
+            </w:r>
+          </w:p>
+        </w:tc>
+        <w:tc>
+          <w:tcPr>
+            <w:tcW w:w="560" w:type="pct"/>
+            <w:shd w:val="clear" w:color="auto" w:fill="F2CEED" w:themeFill="accent5" w:themeFillTint="33"/>
+            <w:tcMar>
+              <w:top w:w="30" w:type="dxa"/>
+              <w:left w:w="80" w:type="dxa"/>
+              <w:bottom w:w="30" w:type="dxa"/>
+              <w:right w:w="80" w:type="dxa"/>
+            </w:tcMar>
+          </w:tcPr>
+          <w:p>
+            <w:r>
+              <w:rPr>
+                <w:rFonts w:ascii="Aptos" w:eastAsia="Aptos" w:hAnsi="Aptos" w:cs="Aptos"/>
+                <w:b/>
+                <w:bCs/>
+                <w:sz w:val="20"/>
+                <w:szCs w:val="20"/>
+              </w:rPr>
+              <w:t xml:space="preserve">Type</w:t>
+            </w:r>
+          </w:p>
+        </w:tc>
+        <w:tc>
+          <w:tcPr>
+            <w:tcW w:w="2290" w:type="pct"/>
+            <w:shd w:val="clear" w:color="auto" w:fill="F2CEED" w:themeFill="accent5" w:themeFillTint="33"/>
+            <w:tcMar>
+              <w:top w:w="30" w:type="dxa"/>
+              <w:left w:w="80" w:type="dxa"/>
+              <w:bottom w:w="30" w:type="dxa"/>
+              <w:right w:w="80" w:type="dxa"/>
+            </w:tcMar>
+          </w:tcPr>
+          <w:p>
+            <w:r>
+              <w:rPr>
+                <w:rFonts w:ascii="Aptos" w:eastAsia="Aptos" w:hAnsi="Aptos" w:cs="Aptos"/>
+                <w:b/>
+                <w:bCs/>
+                <w:sz w:val="20"/>
+                <w:szCs w:val="20"/>
+              </w:rPr>
+              <w:t xml:space="preserve">Expected Result</w:t>
+            </w:r>
+          </w:p>
+        </w:tc>
+      </w:tr>
+      <w:tr>
+        <w:trPr>
+          <w:cantSplit/>
+        </w:trPr>
+        <w:tc>
+          <w:tcPr>
+            <w:tcW w:w="300" w:type="pct"/>
+            <w:tcMar>
+              <w:top w:w="30" w:type="dxa"/>
+              <w:left w:w="80" w:type="dxa"/>
+              <w:bottom w:w="30" w:type="dxa"/>
+              <w:right w:w="80" w:type="dxa"/>
+            </w:tcMar>
+          </w:tcPr>
+          <w:p>
+            <w:r>
+              <w:rPr>
+                <w:rFonts w:ascii="Aptos" w:eastAsia="Aptos" w:hAnsi="Aptos" w:cs="Aptos"/>
+                <w:sz w:val="20"/>
+                <w:szCs w:val="20"/>
+              </w:rPr>
+              <w:t xml:space="preserve">176</w:t>
+            </w:r>
+          </w:p>
+        </w:tc>
+        <w:tc>
+          <w:tcPr>
+            <w:tcW w:w="1850" w:type="pct"/>
+            <w:tcMar>
+              <w:top w:w="30" w:type="dxa"/>
+              <w:left w:w="80" w:type="dxa"/>
+              <w:bottom w:w="30" w:type="dxa"/>
+              <w:right w:w="80" w:type="dxa"/>
+            </w:tcMar>
+          </w:tcPr>
+          <w:p>
+            <w:r>
+              <w:rPr>
+                <w:rFonts w:ascii="Aptos" w:eastAsia="Aptos" w:hAnsi="Aptos" w:cs="Aptos"/>
+                <w:sz w:val="20"/>
+                <w:szCs w:val="20"/>
+              </w:rPr>
+              <w:t xml:space="preserve">Run a sales report and press Export, then open the file in a spreadsheet</w:t>
+            </w:r>
+          </w:p>
+        </w:tc>
+        <w:tc>
+          <w:tcPr>
+            <w:tcW w:w="560" w:type="pct"/>
+            <w:tcMar>
+              <w:top w:w="30" w:type="dxa"/>
+              <w:left w:w="80" w:type="dxa"/>
+              <w:bottom w:w="30" w:type="dxa"/>
+              <w:right w:w="80" w:type="dxa"/>
+            </w:tcMar>
+          </w:tcPr>
+          <w:p>
+            <w:r>
+              <w:rPr>
+                <w:rFonts w:ascii="Aptos" w:eastAsia="Aptos" w:hAnsi="Aptos" w:cs="Aptos"/>
+                <w:sz w:val="20"/>
+                <w:szCs w:val="20"/>
+              </w:rPr>
+              <w:t xml:space="preserve">Normal</w:t>
+            </w:r>
+          </w:p>
+        </w:tc>
+        <w:tc>
+          <w:tcPr>
+            <w:tcW w:w="2290" w:type="pct"/>
+            <w:tcMar>
+              <w:top w:w="30" w:type="dxa"/>
+              <w:left w:w="80" w:type="dxa"/>
+              <w:bottom w:w="30" w:type="dxa"/>
+              <w:right w:w="80" w:type="dxa"/>
+            </w:tcMar>
+          </w:tcPr>
+          <w:p>
+            <w:r>
+              <w:rPr>
+                <w:rFonts w:ascii="Aptos" w:eastAsia="Aptos" w:hAnsi="Aptos" w:cs="Aptos"/>
+                <w:sz w:val="20"/>
+                <w:szCs w:val="20"/>
+              </w:rPr>
+              <w:t xml:space="preserve">A CSV file is created with a header row and one row per row on the report, and the figures in it match what was on screen.</w:t>
+            </w:r>
+          </w:p>
+        </w:tc>
+      </w:tr>
+      <w:tr>
+        <w:trPr>
+          <w:cantSplit/>
+        </w:trPr>
+        <w:tc>
+          <w:tcPr>
+            <w:tcW w:w="300" w:type="pct"/>
+            <w:tcMar>
+              <w:top w:w="30" w:type="dxa"/>
+              <w:left w:w="80" w:type="dxa"/>
+              <w:bottom w:w="30" w:type="dxa"/>
+              <w:right w:w="80" w:type="dxa"/>
+            </w:tcMar>
+          </w:tcPr>
+          <w:p>
+            <w:r>
+              <w:rPr>
+                <w:rFonts w:ascii="Aptos" w:eastAsia="Aptos" w:hAnsi="Aptos" w:cs="Aptos"/>
+                <w:sz w:val="20"/>
+                <w:szCs w:val="20"/>
+              </w:rPr>
+              <w:t xml:space="preserve">177</w:t>
+            </w:r>
+          </w:p>
+        </w:tc>
+        <w:tc>
+          <w:tcPr>
+            <w:tcW w:w="1850" w:type="pct"/>
+            <w:tcMar>
+              <w:top w:w="30" w:type="dxa"/>
+              <w:left w:w="80" w:type="dxa"/>
+              <w:bottom w:w="30" w:type="dxa"/>
+              <w:right w:w="80" w:type="dxa"/>
+            </w:tcMar>
+          </w:tcPr>
+          <w:p>
+            <w:r>
+              <w:rPr>
+                <w:rFonts w:ascii="Aptos" w:eastAsia="Aptos" w:hAnsi="Aptos" w:cs="Aptos"/>
+                <w:sz w:val="20"/>
+                <w:szCs w:val="20"/>
+              </w:rPr>
+              <w:t xml:space="preserve">Press Export on a report that has not been run</w:t>
+            </w:r>
+          </w:p>
+        </w:tc>
+        <w:tc>
+          <w:tcPr>
+            <w:tcW w:w="560" w:type="pct"/>
+            <w:tcMar>
+              <w:top w:w="30" w:type="dxa"/>
+              <w:left w:w="80" w:type="dxa"/>
+              <w:bottom w:w="30" w:type="dxa"/>
+              <w:right w:w="80" w:type="dxa"/>
+            </w:tcMar>
+          </w:tcPr>
+          <w:p>
+            <w:r>
+              <w:rPr>
+                <w:rFonts w:ascii="Aptos" w:eastAsia="Aptos" w:hAnsi="Aptos" w:cs="Aptos"/>
+                <w:sz w:val="20"/>
+                <w:szCs w:val="20"/>
+              </w:rPr>
+              <w:t xml:space="preserve">Erroneous</w:t>
+            </w:r>
+          </w:p>
+        </w:tc>
+        <w:tc>
+          <w:tcPr>
+            <w:tcW w:w="2290" w:type="pct"/>
+            <w:tcMar>
+              <w:top w:w="30" w:type="dxa"/>
+              <w:left w:w="80" w:type="dxa"/>
+              <w:bottom w:w="30" w:type="dxa"/>
+              <w:right w:w="80" w:type="dxa"/>
+            </w:tcMar>
+          </w:tcPr>
+          <w:p>
+            <w:r>
+              <w:rPr>
+                <w:rFonts w:ascii="Aptos" w:eastAsia="Aptos" w:hAnsi="Aptos" w:cs="Aptos"/>
+                <w:sz w:val="20"/>
+                <w:szCs w:val="20"/>
+              </w:rPr>
+              <w:t xml:space="preserve">No file is created and a message appears saying there is nothing on screen to export.</w:t>
+            </w:r>
+          </w:p>
+        </w:tc>
+      </w:tr>
+      <w:tr>
+        <w:trPr>
+          <w:cantSplit/>
+        </w:trPr>
+        <w:tc>
+          <w:tcPr>
+            <w:tcW w:w="300" w:type="pct"/>
+            <w:tcMar>
+              <w:top w:w="30" w:type="dxa"/>
+              <w:left w:w="80" w:type="dxa"/>
+              <w:bottom w:w="30" w:type="dxa"/>
+              <w:right w:w="80" w:type="dxa"/>
+            </w:tcMar>
+          </w:tcPr>
+          <w:p>
+            <w:r>
+              <w:rPr>
+                <w:rFonts w:ascii="Aptos" w:eastAsia="Aptos" w:hAnsi="Aptos" w:cs="Aptos"/>
+                <w:sz w:val="20"/>
+                <w:szCs w:val="20"/>
+              </w:rPr>
+              <w:t xml:space="preserve">178</w:t>
+            </w:r>
+          </w:p>
+        </w:tc>
+        <w:tc>
+          <w:tcPr>
+            <w:tcW w:w="1850" w:type="pct"/>
+            <w:tcMar>
+              <w:top w:w="30" w:type="dxa"/>
+              <w:left w:w="80" w:type="dxa"/>
+              <w:bottom w:w="30" w:type="dxa"/>
+              <w:right w:w="80" w:type="dxa"/>
+            </w:tcMar>
+          </w:tcPr>
+          <w:p>
+            <w:r>
+              <w:rPr>
+                <w:rFonts w:ascii="Aptos" w:eastAsia="Aptos" w:hAnsi="Aptos" w:cs="Aptos"/>
+                <w:sz w:val="20"/>
+                <w:szCs w:val="20"/>
+              </w:rPr>
+              <w:t xml:space="preserve">Export a list containing a film title with a comma in it</w:t>
+            </w:r>
+          </w:p>
+        </w:tc>
+        <w:tc>
+          <w:tcPr>
+            <w:tcW w:w="560" w:type="pct"/>
+            <w:tcMar>
+              <w:top w:w="30" w:type="dxa"/>
+              <w:left w:w="80" w:type="dxa"/>
+              <w:bottom w:w="30" w:type="dxa"/>
+              <w:right w:w="80" w:type="dxa"/>
+            </w:tcMar>
+          </w:tcPr>
+          <w:p>
+            <w:r>
+              <w:rPr>
+                <w:rFonts w:ascii="Aptos" w:eastAsia="Aptos" w:hAnsi="Aptos" w:cs="Aptos"/>
+                <w:sz w:val="20"/>
+                <w:szCs w:val="20"/>
+              </w:rPr>
+              <w:t xml:space="preserve">Normal</w:t>
+            </w:r>
+          </w:p>
+        </w:tc>
+        <w:tc>
+          <w:tcPr>
+            <w:tcW w:w="2290" w:type="pct"/>
+            <w:tcMar>
+              <w:top w:w="30" w:type="dxa"/>
+              <w:left w:w="80" w:type="dxa"/>
+              <w:bottom w:w="30" w:type="dxa"/>
+              <w:right w:w="80" w:type="dxa"/>
+            </w:tcMar>
+          </w:tcPr>
+          <w:p>
+            <w:r>
+              <w:rPr>
+                <w:rFonts w:ascii="Aptos" w:eastAsia="Aptos" w:hAnsi="Aptos" w:cs="Aptos"/>
+                <w:sz w:val="20"/>
+                <w:szCs w:val="20"/>
+              </w:rPr>
+              <w:t xml:space="preserve">The title stays in a single column when the file is opened, because the value is quoted properly rather than the comma splitting it across two columns.</w:t>
+            </w:r>
+          </w:p>
+        </w:tc>
+      </w:tr>
+      <w:tr>
+        <w:trPr>
+          <w:cantSplit/>
+        </w:trPr>
+        <w:tc>
+          <w:tcPr>
+            <w:tcW w:w="300" w:type="pct"/>
+            <w:tcMar>
+              <w:top w:w="30" w:type="dxa"/>
+              <w:left w:w="80" w:type="dxa"/>
+              <w:bottom w:w="30" w:type="dxa"/>
+              <w:right w:w="80" w:type="dxa"/>
+            </w:tcMar>
+          </w:tcPr>
+          <w:p>
+            <w:r>
+              <w:rPr>
+                <w:rFonts w:ascii="Aptos" w:eastAsia="Aptos" w:hAnsi="Aptos" w:cs="Aptos"/>
+                <w:sz w:val="20"/>
+                <w:szCs w:val="20"/>
+              </w:rPr>
+              <w:t xml:space="preserve">179</w:t>
+            </w:r>
+          </w:p>
+        </w:tc>
+        <w:tc>
+          <w:tcPr>
+            <w:tcW w:w="1850" w:type="pct"/>
+            <w:tcMar>
+              <w:top w:w="30" w:type="dxa"/>
+              <w:left w:w="80" w:type="dxa"/>
+              <w:bottom w:w="30" w:type="dxa"/>
+              <w:right w:w="80" w:type="dxa"/>
+            </w:tcMar>
+          </w:tcPr>
+          <w:p>
+            <w:r>
+              <w:rPr>
+                <w:rFonts w:ascii="Aptos" w:eastAsia="Aptos" w:hAnsi="Aptos" w:cs="Aptos"/>
+                <w:sz w:val="20"/>
+                <w:szCs w:val="20"/>
+              </w:rPr>
+              <w:t xml:space="preserve">Export to a file that is already open in another program</w:t>
+            </w:r>
+          </w:p>
+        </w:tc>
+        <w:tc>
+          <w:tcPr>
+            <w:tcW w:w="560" w:type="pct"/>
+            <w:tcMar>
+              <w:top w:w="30" w:type="dxa"/>
+              <w:left w:w="80" w:type="dxa"/>
+              <w:bottom w:w="30" w:type="dxa"/>
+              <w:right w:w="80" w:type="dxa"/>
+            </w:tcMar>
+          </w:tcPr>
+          <w:p>
+            <w:r>
+              <w:rPr>
+                <w:rFonts w:ascii="Aptos" w:eastAsia="Aptos" w:hAnsi="Aptos" w:cs="Aptos"/>
+                <w:sz w:val="20"/>
+                <w:szCs w:val="20"/>
+              </w:rPr>
+              <w:t xml:space="preserve">Erroneous</w:t>
+            </w:r>
+          </w:p>
+        </w:tc>
+        <w:tc>
+          <w:tcPr>
+            <w:tcW w:w="2290" w:type="pct"/>
+            <w:tcMar>
+              <w:top w:w="30" w:type="dxa"/>
+              <w:left w:w="80" w:type="dxa"/>
+              <w:bottom w:w="30" w:type="dxa"/>
+              <w:right w:w="80" w:type="dxa"/>
+            </w:tcMar>
+          </w:tcPr>
+          <w:p>
+            <w:r>
+              <w:rPr>
+                <w:rFonts w:ascii="Aptos" w:eastAsia="Aptos" w:hAnsi="Aptos" w:cs="Aptos"/>
+                <w:sz w:val="20"/>
+                <w:szCs w:val="20"/>
+              </w:rPr>
+              <w:t xml:space="preserve">The file is not written and a message appears stating that the file could not be written to and suggesting it is closed and tried again, rather than the program crashing.</w:t>
+            </w:r>
+          </w:p>
+        </w:tc>
+      </w:tr>
+      <w:tr>
+        <w:trPr>
+          <w:cantSplit/>
+        </w:trPr>
+        <w:tc>
+          <w:tcPr>
+            <w:tcW w:w="300" w:type="pct"/>
+            <w:tcMar>
+              <w:top w:w="30" w:type="dxa"/>
+              <w:left w:w="80" w:type="dxa"/>
+              <w:bottom w:w="30" w:type="dxa"/>
+              <w:right w:w="80" w:type="dxa"/>
+            </w:tcMar>
+          </w:tcPr>
+          <w:p>
+            <w:r>
+              <w:rPr>
+                <w:rFonts w:ascii="Aptos" w:eastAsia="Aptos" w:hAnsi="Aptos" w:cs="Aptos"/>
+                <w:sz w:val="20"/>
+                <w:szCs w:val="20"/>
+              </w:rPr>
+              <w:t xml:space="preserve">180</w:t>
+            </w:r>
+          </w:p>
+        </w:tc>
+        <w:tc>
+          <w:tcPr>
+            <w:tcW w:w="1850" w:type="pct"/>
+            <w:tcMar>
+              <w:top w:w="30" w:type="dxa"/>
+              <w:left w:w="80" w:type="dxa"/>
+              <w:bottom w:w="30" w:type="dxa"/>
+              <w:right w:w="80" w:type="dxa"/>
+            </w:tcMar>
+          </w:tcPr>
+          <w:p>
+            <w:r>
+              <w:rPr>
+                <w:rFonts w:ascii="Aptos" w:eastAsia="Aptos" w:hAnsi="Aptos" w:cs="Aptos"/>
+                <w:sz w:val="20"/>
+                <w:szCs w:val="20"/>
+              </w:rPr>
+              <w:t xml:space="preserve">Export the audit log, the films list and the door list</w:t>
+            </w:r>
+          </w:p>
+        </w:tc>
+        <w:tc>
+          <w:tcPr>
+            <w:tcW w:w="560" w:type="pct"/>
+            <w:tcMar>
+              <w:top w:w="30" w:type="dxa"/>
+              <w:left w:w="80" w:type="dxa"/>
+              <w:bottom w:w="30" w:type="dxa"/>
+              <w:right w:w="80" w:type="dxa"/>
+            </w:tcMar>
+          </w:tcPr>
+          <w:p>
+            <w:r>
+              <w:rPr>
+                <w:rFonts w:ascii="Aptos" w:eastAsia="Aptos" w:hAnsi="Aptos" w:cs="Aptos"/>
+                <w:sz w:val="20"/>
+                <w:szCs w:val="20"/>
+              </w:rPr>
+              <w:t xml:space="preserve">Normal</w:t>
+            </w:r>
+          </w:p>
+        </w:tc>
+        <w:tc>
+          <w:tcPr>
+            <w:tcW w:w="2290" w:type="pct"/>
+            <w:tcMar>
+              <w:top w:w="30" w:type="dxa"/>
+              <w:left w:w="80" w:type="dxa"/>
+              <w:bottom w:w="30" w:type="dxa"/>
+              <w:right w:w="80" w:type="dxa"/>
+            </w:tcMar>
+          </w:tcPr>
+          <w:p>
+            <w:r>
+              <w:rPr>
+                <w:rFonts w:ascii="Aptos" w:eastAsia="Aptos" w:hAnsi="Aptos" w:cs="Aptos"/>
+                <w:sz w:val="20"/>
+                <w:szCs w:val="20"/>
+              </w:rPr>
+              <w:t xml:space="preserve">Each one produces its own CSV file with the columns that were on screen, so exporting works across the different lists rather than only on the sales report.</w:t>
             </w:r>
           </w:p>
         </w:tc>

</xml_diff>

<commit_message>
added objective 33: importing films from a data file
</commit_message>
<xml_diff>
--- a/Testing.docx
+++ b/Testing.docx
@@ -19801,6 +19801,874 @@
                 <w:szCs w:val="20"/>
               </w:rPr>
               <w:t xml:space="preserve">Each one produces its own CSV file with the columns that were on screen, so exporting works across the different lists rather than only on the sales report.</w:t>
+            </w:r>
+          </w:p>
+        </w:tc>
+      </w:tr>
+    </w:tbl>
+    <w:p>
+      <w:r>
+        <w:rPr>
+          <w:rFonts w:ascii="Aptos" w:eastAsia="Aptos" w:hAnsi="Aptos" w:cs="Aptos"/>
+        </w:rPr>
+        <w:t xml:space="preserve"/>
+      </w:r>
+    </w:p>
+    <w:p>
+      <w:pPr>
+        <w:pStyle w:val="Heading3"/>
+      </w:pPr>
+      <w:r>
+        <w:rPr>
+          <w:rFonts w:ascii="Aptos Display" w:eastAsia="Aptos Display" w:hAnsi="Aptos Display" w:cs="Aptos Display"/>
+          <w:b/>
+          <w:bCs/>
+          <w:color w:val="000000"/>
+        </w:rPr>
+        <w:t xml:space="preserve">Objective 33: Importing Films from a Data File</w:t>
+      </w:r>
+    </w:p>
+    <w:p>
+      <w:r>
+        <w:rPr>
+          <w:rFonts w:ascii="Aptos" w:eastAsia="Aptos" w:hAnsi="Aptos" w:cs="Aptos"/>
+        </w:rPr>
+        <w:t xml:space="preserve">Typing a film catalogue in by hand is slow and error prone, so films can be imported in bulk from the IMDb data file. These tests use a copy of that file. The import has to cope with a very large file, with films that are already on the system and with a file that is not what it claims to be.</w:t>
+      </w:r>
+    </w:p>
+    <w:tbl>
+      <w:tblPr>
+        <w:tblW w:w="5000" w:type="pct"/>
+        <w:tblBorders>
+          <w:top w:val="single" w:sz="4" w:space="0" w:color="808080"/>
+          <w:left w:val="single" w:sz="4" w:space="0" w:color="808080"/>
+          <w:bottom w:val="single" w:sz="4" w:space="0" w:color="808080"/>
+          <w:right w:val="single" w:sz="4" w:space="0" w:color="808080"/>
+          <w:insideH w:val="single" w:sz="4" w:space="0" w:color="808080"/>
+          <w:insideV w:val="single" w:sz="4" w:space="0" w:color="808080"/>
+        </w:tblBorders>
+        <w:tblCellMar>
+          <w:left w:w="10" w:type="dxa"/>
+          <w:right w:w="10" w:type="dxa"/>
+        </w:tblCellMar>
+        <w:tblLook w:val="0000" w:firstRow="0" w:lastRow="0" w:firstColumn="0" w:lastColumn="0" w:noHBand="0" w:noVBand="0"/>
+      </w:tblPr>
+      <w:tblGrid>
+        <w:gridCol w:w="561"/>
+        <w:gridCol w:w="3460"/>
+        <w:gridCol w:w="1047"/>
+        <w:gridCol w:w="4282"/>
+      </w:tblGrid>
+      <w:tr>
+        <w:trPr>
+          <w:cantSplit/>
+          <w:tblHeader/>
+        </w:trPr>
+        <w:tc>
+          <w:tcPr>
+            <w:tcW w:w="300" w:type="pct"/>
+            <w:shd w:val="clear" w:color="auto" w:fill="F2CEED" w:themeFill="accent5" w:themeFillTint="33"/>
+            <w:tcMar>
+              <w:top w:w="30" w:type="dxa"/>
+              <w:left w:w="80" w:type="dxa"/>
+              <w:bottom w:w="30" w:type="dxa"/>
+              <w:right w:w="80" w:type="dxa"/>
+            </w:tcMar>
+          </w:tcPr>
+          <w:p>
+            <w:r>
+              <w:rPr>
+                <w:rFonts w:ascii="Aptos" w:eastAsia="Aptos" w:hAnsi="Aptos" w:cs="Aptos"/>
+                <w:b/>
+                <w:bCs/>
+                <w:sz w:val="20"/>
+                <w:szCs w:val="20"/>
+              </w:rPr>
+              <w:t xml:space="preserve">No.</w:t>
+            </w:r>
+          </w:p>
+        </w:tc>
+        <w:tc>
+          <w:tcPr>
+            <w:tcW w:w="1850" w:type="pct"/>
+            <w:shd w:val="clear" w:color="auto" w:fill="F2CEED" w:themeFill="accent5" w:themeFillTint="33"/>
+            <w:tcMar>
+              <w:top w:w="30" w:type="dxa"/>
+              <w:left w:w="80" w:type="dxa"/>
+              <w:bottom w:w="30" w:type="dxa"/>
+              <w:right w:w="80" w:type="dxa"/>
+            </w:tcMar>
+          </w:tcPr>
+          <w:p>
+            <w:r>
+              <w:rPr>
+                <w:rFonts w:ascii="Aptos" w:eastAsia="Aptos" w:hAnsi="Aptos" w:cs="Aptos"/>
+                <w:b/>
+                <w:bCs/>
+                <w:sz w:val="20"/>
+                <w:szCs w:val="20"/>
+              </w:rPr>
+              <w:t xml:space="preserve">Test</w:t>
+            </w:r>
+          </w:p>
+        </w:tc>
+        <w:tc>
+          <w:tcPr>
+            <w:tcW w:w="560" w:type="pct"/>
+            <w:shd w:val="clear" w:color="auto" w:fill="F2CEED" w:themeFill="accent5" w:themeFillTint="33"/>
+            <w:tcMar>
+              <w:top w:w="30" w:type="dxa"/>
+              <w:left w:w="80" w:type="dxa"/>
+              <w:bottom w:w="30" w:type="dxa"/>
+              <w:right w:w="80" w:type="dxa"/>
+            </w:tcMar>
+          </w:tcPr>
+          <w:p>
+            <w:r>
+              <w:rPr>
+                <w:rFonts w:ascii="Aptos" w:eastAsia="Aptos" w:hAnsi="Aptos" w:cs="Aptos"/>
+                <w:b/>
+                <w:bCs/>
+                <w:sz w:val="20"/>
+                <w:szCs w:val="20"/>
+              </w:rPr>
+              <w:t xml:space="preserve">Type</w:t>
+            </w:r>
+          </w:p>
+        </w:tc>
+        <w:tc>
+          <w:tcPr>
+            <w:tcW w:w="2290" w:type="pct"/>
+            <w:shd w:val="clear" w:color="auto" w:fill="F2CEED" w:themeFill="accent5" w:themeFillTint="33"/>
+            <w:tcMar>
+              <w:top w:w="30" w:type="dxa"/>
+              <w:left w:w="80" w:type="dxa"/>
+              <w:bottom w:w="30" w:type="dxa"/>
+              <w:right w:w="80" w:type="dxa"/>
+            </w:tcMar>
+          </w:tcPr>
+          <w:p>
+            <w:r>
+              <w:rPr>
+                <w:rFonts w:ascii="Aptos" w:eastAsia="Aptos" w:hAnsi="Aptos" w:cs="Aptos"/>
+                <w:b/>
+                <w:bCs/>
+                <w:sz w:val="20"/>
+                <w:szCs w:val="20"/>
+              </w:rPr>
+              <w:t xml:space="preserve">Expected Result</w:t>
+            </w:r>
+          </w:p>
+        </w:tc>
+      </w:tr>
+      <w:tr>
+        <w:trPr>
+          <w:cantSplit/>
+        </w:trPr>
+        <w:tc>
+          <w:tcPr>
+            <w:tcW w:w="300" w:type="pct"/>
+            <w:tcMar>
+              <w:top w:w="30" w:type="dxa"/>
+              <w:left w:w="80" w:type="dxa"/>
+              <w:bottom w:w="30" w:type="dxa"/>
+              <w:right w:w="80" w:type="dxa"/>
+            </w:tcMar>
+          </w:tcPr>
+          <w:p>
+            <w:r>
+              <w:rPr>
+                <w:rFonts w:ascii="Aptos" w:eastAsia="Aptos" w:hAnsi="Aptos" w:cs="Aptos"/>
+                <w:sz w:val="20"/>
+                <w:szCs w:val="20"/>
+              </w:rPr>
+              <w:t xml:space="preserve">181</w:t>
+            </w:r>
+          </w:p>
+        </w:tc>
+        <w:tc>
+          <w:tcPr>
+            <w:tcW w:w="1850" w:type="pct"/>
+            <w:tcMar>
+              <w:top w:w="30" w:type="dxa"/>
+              <w:left w:w="80" w:type="dxa"/>
+              <w:bottom w:w="30" w:type="dxa"/>
+              <w:right w:w="80" w:type="dxa"/>
+            </w:tcMar>
+          </w:tcPr>
+          <w:p>
+            <w:r>
+              <w:rPr>
+                <w:rFonts w:ascii="Aptos" w:eastAsia="Aptos" w:hAnsi="Aptos" w:cs="Aptos"/>
+                <w:sz w:val="20"/>
+                <w:szCs w:val="20"/>
+              </w:rPr>
+              <w:t xml:space="preserve">Press Import without choosing a file first</w:t>
+            </w:r>
+          </w:p>
+        </w:tc>
+        <w:tc>
+          <w:tcPr>
+            <w:tcW w:w="560" w:type="pct"/>
+            <w:tcMar>
+              <w:top w:w="30" w:type="dxa"/>
+              <w:left w:w="80" w:type="dxa"/>
+              <w:bottom w:w="30" w:type="dxa"/>
+              <w:right w:w="80" w:type="dxa"/>
+            </w:tcMar>
+          </w:tcPr>
+          <w:p>
+            <w:r>
+              <w:rPr>
+                <w:rFonts w:ascii="Aptos" w:eastAsia="Aptos" w:hAnsi="Aptos" w:cs="Aptos"/>
+                <w:sz w:val="20"/>
+                <w:szCs w:val="20"/>
+              </w:rPr>
+              <w:t xml:space="preserve">Erroneous</w:t>
+            </w:r>
+          </w:p>
+        </w:tc>
+        <w:tc>
+          <w:tcPr>
+            <w:tcW w:w="2290" w:type="pct"/>
+            <w:tcMar>
+              <w:top w:w="30" w:type="dxa"/>
+              <w:left w:w="80" w:type="dxa"/>
+              <w:bottom w:w="30" w:type="dxa"/>
+              <w:right w:w="80" w:type="dxa"/>
+            </w:tcMar>
+          </w:tcPr>
+          <w:p>
+            <w:r>
+              <w:rPr>
+                <w:rFonts w:ascii="Aptos" w:eastAsia="Aptos" w:hAnsi="Aptos" w:cs="Aptos"/>
+                <w:sz w:val="20"/>
+                <w:szCs w:val="20"/>
+              </w:rPr>
+              <w:t xml:space="preserve">Nothing is imported and a message appears stating “Choose the IMDb data file first”.</w:t>
+            </w:r>
+          </w:p>
+        </w:tc>
+      </w:tr>
+      <w:tr>
+        <w:trPr>
+          <w:cantSplit/>
+        </w:trPr>
+        <w:tc>
+          <w:tcPr>
+            <w:tcW w:w="300" w:type="pct"/>
+            <w:tcMar>
+              <w:top w:w="30" w:type="dxa"/>
+              <w:left w:w="80" w:type="dxa"/>
+              <w:bottom w:w="30" w:type="dxa"/>
+              <w:right w:w="80" w:type="dxa"/>
+            </w:tcMar>
+          </w:tcPr>
+          <w:p>
+            <w:r>
+              <w:rPr>
+                <w:rFonts w:ascii="Aptos" w:eastAsia="Aptos" w:hAnsi="Aptos" w:cs="Aptos"/>
+                <w:sz w:val="20"/>
+                <w:szCs w:val="20"/>
+              </w:rPr>
+              <w:t xml:space="preserve">182</w:t>
+            </w:r>
+          </w:p>
+        </w:tc>
+        <w:tc>
+          <w:tcPr>
+            <w:tcW w:w="1850" w:type="pct"/>
+            <w:tcMar>
+              <w:top w:w="30" w:type="dxa"/>
+              <w:left w:w="80" w:type="dxa"/>
+              <w:bottom w:w="30" w:type="dxa"/>
+              <w:right w:w="80" w:type="dxa"/>
+            </w:tcMar>
+          </w:tcPr>
+          <w:p>
+            <w:r>
+              <w:rPr>
+                <w:rFonts w:ascii="Aptos" w:eastAsia="Aptos" w:hAnsi="Aptos" w:cs="Aptos"/>
+                <w:sz w:val="20"/>
+                <w:szCs w:val="20"/>
+              </w:rPr>
+              <w:t xml:space="preserve">Choose the data file, search for a title, then press Import without ticking anything</w:t>
+            </w:r>
+          </w:p>
+        </w:tc>
+        <w:tc>
+          <w:tcPr>
+            <w:tcW w:w="560" w:type="pct"/>
+            <w:tcMar>
+              <w:top w:w="30" w:type="dxa"/>
+              <w:left w:w="80" w:type="dxa"/>
+              <w:bottom w:w="30" w:type="dxa"/>
+              <w:right w:w="80" w:type="dxa"/>
+            </w:tcMar>
+          </w:tcPr>
+          <w:p>
+            <w:r>
+              <w:rPr>
+                <w:rFonts w:ascii="Aptos" w:eastAsia="Aptos" w:hAnsi="Aptos" w:cs="Aptos"/>
+                <w:sz w:val="20"/>
+                <w:szCs w:val="20"/>
+              </w:rPr>
+              <w:t xml:space="preserve">Erroneous</w:t>
+            </w:r>
+          </w:p>
+        </w:tc>
+        <w:tc>
+          <w:tcPr>
+            <w:tcW w:w="2290" w:type="pct"/>
+            <w:tcMar>
+              <w:top w:w="30" w:type="dxa"/>
+              <w:left w:w="80" w:type="dxa"/>
+              <w:bottom w:w="30" w:type="dxa"/>
+              <w:right w:w="80" w:type="dxa"/>
+            </w:tcMar>
+          </w:tcPr>
+          <w:p>
+            <w:r>
+              <w:rPr>
+                <w:rFonts w:ascii="Aptos" w:eastAsia="Aptos" w:hAnsi="Aptos" w:cs="Aptos"/>
+                <w:sz w:val="20"/>
+                <w:szCs w:val="20"/>
+              </w:rPr>
+              <w:t xml:space="preserve">Nothing is imported and a message appears stating “Tick the films you want to import first”.</w:t>
+            </w:r>
+          </w:p>
+        </w:tc>
+      </w:tr>
+      <w:tr>
+        <w:trPr>
+          <w:cantSplit/>
+        </w:trPr>
+        <w:tc>
+          <w:tcPr>
+            <w:tcW w:w="300" w:type="pct"/>
+            <w:tcMar>
+              <w:top w:w="30" w:type="dxa"/>
+              <w:left w:w="80" w:type="dxa"/>
+              <w:bottom w:w="30" w:type="dxa"/>
+              <w:right w:w="80" w:type="dxa"/>
+            </w:tcMar>
+          </w:tcPr>
+          <w:p>
+            <w:r>
+              <w:rPr>
+                <w:rFonts w:ascii="Aptos" w:eastAsia="Aptos" w:hAnsi="Aptos" w:cs="Aptos"/>
+                <w:sz w:val="20"/>
+                <w:szCs w:val="20"/>
+              </w:rPr>
+              <w:t xml:space="preserve">183</w:t>
+            </w:r>
+          </w:p>
+        </w:tc>
+        <w:tc>
+          <w:tcPr>
+            <w:tcW w:w="1850" w:type="pct"/>
+            <w:tcMar>
+              <w:top w:w="30" w:type="dxa"/>
+              <w:left w:w="80" w:type="dxa"/>
+              <w:bottom w:w="30" w:type="dxa"/>
+              <w:right w:w="80" w:type="dxa"/>
+            </w:tcMar>
+          </w:tcPr>
+          <w:p>
+            <w:r>
+              <w:rPr>
+                <w:rFonts w:ascii="Aptos" w:eastAsia="Aptos" w:hAnsi="Aptos" w:cs="Aptos"/>
+                <w:sz w:val="20"/>
+                <w:szCs w:val="20"/>
+              </w:rPr>
+              <w:t xml:space="preserve">Choose the data file, search for Dune, tick Dune from 2021 and press Import</w:t>
+            </w:r>
+          </w:p>
+        </w:tc>
+        <w:tc>
+          <w:tcPr>
+            <w:tcW w:w="560" w:type="pct"/>
+            <w:tcMar>
+              <w:top w:w="30" w:type="dxa"/>
+              <w:left w:w="80" w:type="dxa"/>
+              <w:bottom w:w="30" w:type="dxa"/>
+              <w:right w:w="80" w:type="dxa"/>
+            </w:tcMar>
+          </w:tcPr>
+          <w:p>
+            <w:r>
+              <w:rPr>
+                <w:rFonts w:ascii="Aptos" w:eastAsia="Aptos" w:hAnsi="Aptos" w:cs="Aptos"/>
+                <w:sz w:val="20"/>
+                <w:szCs w:val="20"/>
+              </w:rPr>
+              <w:t xml:space="preserve">Normal</w:t>
+            </w:r>
+          </w:p>
+        </w:tc>
+        <w:tc>
+          <w:tcPr>
+            <w:tcW w:w="2290" w:type="pct"/>
+            <w:tcMar>
+              <w:top w:w="30" w:type="dxa"/>
+              <w:left w:w="80" w:type="dxa"/>
+              <w:bottom w:w="30" w:type="dxa"/>
+              <w:right w:w="80" w:type="dxa"/>
+            </w:tcMar>
+          </w:tcPr>
+          <w:p>
+            <w:r>
+              <w:rPr>
+                <w:rFonts w:ascii="Aptos" w:eastAsia="Aptos" w:hAnsi="Aptos" w:cs="Aptos"/>
+                <w:sz w:val="20"/>
+                <w:szCs w:val="20"/>
+              </w:rPr>
+              <w:t xml:space="preserve">The film is added to tblFilm with its title, year, duration and genres filled in from the file rather than typed in.</w:t>
+            </w:r>
+          </w:p>
+        </w:tc>
+      </w:tr>
+      <w:tr>
+        <w:trPr>
+          <w:cantSplit/>
+        </w:trPr>
+        <w:tc>
+          <w:tcPr>
+            <w:tcW w:w="300" w:type="pct"/>
+            <w:tcMar>
+              <w:top w:w="30" w:type="dxa"/>
+              <w:left w:w="80" w:type="dxa"/>
+              <w:bottom w:w="30" w:type="dxa"/>
+              <w:right w:w="80" w:type="dxa"/>
+            </w:tcMar>
+          </w:tcPr>
+          <w:p>
+            <w:r>
+              <w:rPr>
+                <w:rFonts w:ascii="Aptos" w:eastAsia="Aptos" w:hAnsi="Aptos" w:cs="Aptos"/>
+                <w:sz w:val="20"/>
+                <w:szCs w:val="20"/>
+              </w:rPr>
+              <w:t xml:space="preserve">184</w:t>
+            </w:r>
+          </w:p>
+        </w:tc>
+        <w:tc>
+          <w:tcPr>
+            <w:tcW w:w="1850" w:type="pct"/>
+            <w:tcMar>
+              <w:top w:w="30" w:type="dxa"/>
+              <w:left w:w="80" w:type="dxa"/>
+              <w:bottom w:w="30" w:type="dxa"/>
+              <w:right w:w="80" w:type="dxa"/>
+            </w:tcMar>
+          </w:tcPr>
+          <w:p>
+            <w:r>
+              <w:rPr>
+                <w:rFonts w:ascii="Aptos" w:eastAsia="Aptos" w:hAnsi="Aptos" w:cs="Aptos"/>
+                <w:sz w:val="20"/>
+                <w:szCs w:val="20"/>
+              </w:rPr>
+              <w:t xml:space="preserve">Search with a year of twenty rather than a number</w:t>
+            </w:r>
+          </w:p>
+        </w:tc>
+        <w:tc>
+          <w:tcPr>
+            <w:tcW w:w="560" w:type="pct"/>
+            <w:tcMar>
+              <w:top w:w="30" w:type="dxa"/>
+              <w:left w:w="80" w:type="dxa"/>
+              <w:bottom w:w="30" w:type="dxa"/>
+              <w:right w:w="80" w:type="dxa"/>
+            </w:tcMar>
+          </w:tcPr>
+          <w:p>
+            <w:r>
+              <w:rPr>
+                <w:rFonts w:ascii="Aptos" w:eastAsia="Aptos" w:hAnsi="Aptos" w:cs="Aptos"/>
+                <w:sz w:val="20"/>
+                <w:szCs w:val="20"/>
+              </w:rPr>
+              <w:t xml:space="preserve">Erroneous</w:t>
+            </w:r>
+          </w:p>
+        </w:tc>
+        <w:tc>
+          <w:tcPr>
+            <w:tcW w:w="2290" w:type="pct"/>
+            <w:tcMar>
+              <w:top w:w="30" w:type="dxa"/>
+              <w:left w:w="80" w:type="dxa"/>
+              <w:bottom w:w="30" w:type="dxa"/>
+              <w:right w:w="80" w:type="dxa"/>
+            </w:tcMar>
+          </w:tcPr>
+          <w:p>
+            <w:r>
+              <w:rPr>
+                <w:rFonts w:ascii="Aptos" w:eastAsia="Aptos" w:hAnsi="Aptos" w:cs="Aptos"/>
+                <w:sz w:val="20"/>
+                <w:szCs w:val="20"/>
+              </w:rPr>
+              <w:t xml:space="preserve">The search is refused and a message appears stating “The year has to be a number, or leave it empty for every year”.</w:t>
+            </w:r>
+          </w:p>
+        </w:tc>
+      </w:tr>
+      <w:tr>
+        <w:trPr>
+          <w:cantSplit/>
+        </w:trPr>
+        <w:tc>
+          <w:tcPr>
+            <w:tcW w:w="300" w:type="pct"/>
+            <w:tcMar>
+              <w:top w:w="30" w:type="dxa"/>
+              <w:left w:w="80" w:type="dxa"/>
+              <w:bottom w:w="30" w:type="dxa"/>
+              <w:right w:w="80" w:type="dxa"/>
+            </w:tcMar>
+          </w:tcPr>
+          <w:p>
+            <w:r>
+              <w:rPr>
+                <w:rFonts w:ascii="Aptos" w:eastAsia="Aptos" w:hAnsi="Aptos" w:cs="Aptos"/>
+                <w:sz w:val="20"/>
+                <w:szCs w:val="20"/>
+              </w:rPr>
+              <w:t xml:space="preserve">185</w:t>
+            </w:r>
+          </w:p>
+        </w:tc>
+        <w:tc>
+          <w:tcPr>
+            <w:tcW w:w="1850" w:type="pct"/>
+            <w:tcMar>
+              <w:top w:w="30" w:type="dxa"/>
+              <w:left w:w="80" w:type="dxa"/>
+              <w:bottom w:w="30" w:type="dxa"/>
+              <w:right w:w="80" w:type="dxa"/>
+            </w:tcMar>
+          </w:tcPr>
+          <w:p>
+            <w:r>
+              <w:rPr>
+                <w:rFonts w:ascii="Aptos" w:eastAsia="Aptos" w:hAnsi="Aptos" w:cs="Aptos"/>
+                <w:sz w:val="20"/>
+                <w:szCs w:val="20"/>
+              </w:rPr>
+              <w:t xml:space="preserve">Import a film that is already on the system for that year</w:t>
+            </w:r>
+          </w:p>
+        </w:tc>
+        <w:tc>
+          <w:tcPr>
+            <w:tcW w:w="560" w:type="pct"/>
+            <w:tcMar>
+              <w:top w:w="30" w:type="dxa"/>
+              <w:left w:w="80" w:type="dxa"/>
+              <w:bottom w:w="30" w:type="dxa"/>
+              <w:right w:w="80" w:type="dxa"/>
+            </w:tcMar>
+          </w:tcPr>
+          <w:p>
+            <w:r>
+              <w:rPr>
+                <w:rFonts w:ascii="Aptos" w:eastAsia="Aptos" w:hAnsi="Aptos" w:cs="Aptos"/>
+                <w:sz w:val="20"/>
+                <w:szCs w:val="20"/>
+              </w:rPr>
+              <w:t xml:space="preserve">Erroneous</w:t>
+            </w:r>
+          </w:p>
+        </w:tc>
+        <w:tc>
+          <w:tcPr>
+            <w:tcW w:w="2290" w:type="pct"/>
+            <w:tcMar>
+              <w:top w:w="30" w:type="dxa"/>
+              <w:left w:w="80" w:type="dxa"/>
+              <w:bottom w:w="30" w:type="dxa"/>
+              <w:right w:w="80" w:type="dxa"/>
+            </w:tcMar>
+          </w:tcPr>
+          <w:p>
+            <w:r>
+              <w:rPr>
+                <w:rFonts w:ascii="Aptos" w:eastAsia="Aptos" w:hAnsi="Aptos" w:cs="Aptos"/>
+                <w:sz w:val="20"/>
+                <w:szCs w:val="20"/>
+              </w:rPr>
+              <w:t xml:space="preserve">It is skipped rather than added a second time, and the message afterwards says how many were imported and how many were skipped.</w:t>
+            </w:r>
+          </w:p>
+        </w:tc>
+      </w:tr>
+      <w:tr>
+        <w:trPr>
+          <w:cantSplit/>
+        </w:trPr>
+        <w:tc>
+          <w:tcPr>
+            <w:tcW w:w="300" w:type="pct"/>
+            <w:tcMar>
+              <w:top w:w="30" w:type="dxa"/>
+              <w:left w:w="80" w:type="dxa"/>
+              <w:bottom w:w="30" w:type="dxa"/>
+              <w:right w:w="80" w:type="dxa"/>
+            </w:tcMar>
+          </w:tcPr>
+          <w:p>
+            <w:r>
+              <w:rPr>
+                <w:rFonts w:ascii="Aptos" w:eastAsia="Aptos" w:hAnsi="Aptos" w:cs="Aptos"/>
+                <w:sz w:val="20"/>
+                <w:szCs w:val="20"/>
+              </w:rPr>
+              <w:t xml:space="preserve">186</w:t>
+            </w:r>
+          </w:p>
+        </w:tc>
+        <w:tc>
+          <w:tcPr>
+            <w:tcW w:w="1850" w:type="pct"/>
+            <w:tcMar>
+              <w:top w:w="30" w:type="dxa"/>
+              <w:left w:w="80" w:type="dxa"/>
+              <w:bottom w:w="30" w:type="dxa"/>
+              <w:right w:w="80" w:type="dxa"/>
+            </w:tcMar>
+          </w:tcPr>
+          <w:p>
+            <w:r>
+              <w:rPr>
+                <w:rFonts w:ascii="Aptos" w:eastAsia="Aptos" w:hAnsi="Aptos" w:cs="Aptos"/>
+                <w:sz w:val="20"/>
+                <w:szCs w:val="20"/>
+              </w:rPr>
+              <w:t xml:space="preserve">Choose a file that is not the IMDb data file and try to search it</w:t>
+            </w:r>
+          </w:p>
+        </w:tc>
+        <w:tc>
+          <w:tcPr>
+            <w:tcW w:w="560" w:type="pct"/>
+            <w:tcMar>
+              <w:top w:w="30" w:type="dxa"/>
+              <w:left w:w="80" w:type="dxa"/>
+              <w:bottom w:w="30" w:type="dxa"/>
+              <w:right w:w="80" w:type="dxa"/>
+            </w:tcMar>
+          </w:tcPr>
+          <w:p>
+            <w:r>
+              <w:rPr>
+                <w:rFonts w:ascii="Aptos" w:eastAsia="Aptos" w:hAnsi="Aptos" w:cs="Aptos"/>
+                <w:sz w:val="20"/>
+                <w:szCs w:val="20"/>
+              </w:rPr>
+              <w:t xml:space="preserve">Erroneous</w:t>
+            </w:r>
+          </w:p>
+        </w:tc>
+        <w:tc>
+          <w:tcPr>
+            <w:tcW w:w="2290" w:type="pct"/>
+            <w:tcMar>
+              <w:top w:w="30" w:type="dxa"/>
+              <w:left w:w="80" w:type="dxa"/>
+              <w:bottom w:w="30" w:type="dxa"/>
+              <w:right w:w="80" w:type="dxa"/>
+            </w:tcMar>
+          </w:tcPr>
+          <w:p>
+            <w:r>
+              <w:rPr>
+                <w:rFonts w:ascii="Aptos" w:eastAsia="Aptos" w:hAnsi="Aptos" w:cs="Aptos"/>
+                <w:sz w:val="20"/>
+                <w:szCs w:val="20"/>
+              </w:rPr>
+              <w:t xml:space="preserve">A message appears explaining that the file could not be read, and the films already on the system are left alone.</w:t>
+            </w:r>
+          </w:p>
+        </w:tc>
+      </w:tr>
+      <w:tr>
+        <w:trPr>
+          <w:cantSplit/>
+        </w:trPr>
+        <w:tc>
+          <w:tcPr>
+            <w:tcW w:w="300" w:type="pct"/>
+            <w:tcMar>
+              <w:top w:w="30" w:type="dxa"/>
+              <w:left w:w="80" w:type="dxa"/>
+              <w:bottom w:w="30" w:type="dxa"/>
+              <w:right w:w="80" w:type="dxa"/>
+            </w:tcMar>
+          </w:tcPr>
+          <w:p>
+            <w:r>
+              <w:rPr>
+                <w:rFonts w:ascii="Aptos" w:eastAsia="Aptos" w:hAnsi="Aptos" w:cs="Aptos"/>
+                <w:sz w:val="20"/>
+                <w:szCs w:val="20"/>
+              </w:rPr>
+              <w:t xml:space="preserve">187</w:t>
+            </w:r>
+          </w:p>
+        </w:tc>
+        <w:tc>
+          <w:tcPr>
+            <w:tcW w:w="1850" w:type="pct"/>
+            <w:tcMar>
+              <w:top w:w="30" w:type="dxa"/>
+              <w:left w:w="80" w:type="dxa"/>
+              <w:bottom w:w="30" w:type="dxa"/>
+              <w:right w:w="80" w:type="dxa"/>
+            </w:tcMar>
+          </w:tcPr>
+          <w:p>
+            <w:r>
+              <w:rPr>
+                <w:rFonts w:ascii="Aptos" w:eastAsia="Aptos" w:hAnsi="Aptos" w:cs="Aptos"/>
+                <w:sz w:val="20"/>
+                <w:szCs w:val="20"/>
+              </w:rPr>
+              <w:t xml:space="preserve">Log in as a member of staff and try to open the Import Films screen</w:t>
+            </w:r>
+          </w:p>
+        </w:tc>
+        <w:tc>
+          <w:tcPr>
+            <w:tcW w:w="560" w:type="pct"/>
+            <w:tcMar>
+              <w:top w:w="30" w:type="dxa"/>
+              <w:left w:w="80" w:type="dxa"/>
+              <w:bottom w:w="30" w:type="dxa"/>
+              <w:right w:w="80" w:type="dxa"/>
+            </w:tcMar>
+          </w:tcPr>
+          <w:p>
+            <w:r>
+              <w:rPr>
+                <w:rFonts w:ascii="Aptos" w:eastAsia="Aptos" w:hAnsi="Aptos" w:cs="Aptos"/>
+                <w:sz w:val="20"/>
+                <w:szCs w:val="20"/>
+              </w:rPr>
+              <w:t xml:space="preserve">Erroneous</w:t>
+            </w:r>
+          </w:p>
+        </w:tc>
+        <w:tc>
+          <w:tcPr>
+            <w:tcW w:w="2290" w:type="pct"/>
+            <w:tcMar>
+              <w:top w:w="30" w:type="dxa"/>
+              <w:left w:w="80" w:type="dxa"/>
+              <w:bottom w:w="30" w:type="dxa"/>
+              <w:right w:w="80" w:type="dxa"/>
+            </w:tcMar>
+          </w:tcPr>
+          <w:p>
+            <w:r>
+              <w:rPr>
+                <w:rFonts w:ascii="Aptos" w:eastAsia="Aptos" w:hAnsi="Aptos" w:cs="Aptos"/>
+                <w:sz w:val="20"/>
+                <w:szCs w:val="20"/>
+              </w:rPr>
+              <w:t xml:space="preserve">It does not open and a message appears stating “Only a manager can import films”.</w:t>
+            </w:r>
+          </w:p>
+        </w:tc>
+      </w:tr>
+      <w:tr>
+        <w:trPr>
+          <w:cantSplit/>
+        </w:trPr>
+        <w:tc>
+          <w:tcPr>
+            <w:tcW w:w="300" w:type="pct"/>
+            <w:tcMar>
+              <w:top w:w="30" w:type="dxa"/>
+              <w:left w:w="80" w:type="dxa"/>
+              <w:bottom w:w="30" w:type="dxa"/>
+              <w:right w:w="80" w:type="dxa"/>
+            </w:tcMar>
+          </w:tcPr>
+          <w:p>
+            <w:r>
+              <w:rPr>
+                <w:rFonts w:ascii="Aptos" w:eastAsia="Aptos" w:hAnsi="Aptos" w:cs="Aptos"/>
+                <w:sz w:val="20"/>
+                <w:szCs w:val="20"/>
+              </w:rPr>
+              <w:t xml:space="preserve">188</w:t>
+            </w:r>
+          </w:p>
+        </w:tc>
+        <w:tc>
+          <w:tcPr>
+            <w:tcW w:w="1850" w:type="pct"/>
+            <w:tcMar>
+              <w:top w:w="30" w:type="dxa"/>
+              <w:left w:w="80" w:type="dxa"/>
+              <w:bottom w:w="30" w:type="dxa"/>
+              <w:right w:w="80" w:type="dxa"/>
+            </w:tcMar>
+          </w:tcPr>
+          <w:p>
+            <w:r>
+              <w:rPr>
+                <w:rFonts w:ascii="Aptos" w:eastAsia="Aptos" w:hAnsi="Aptos" w:cs="Aptos"/>
+                <w:sz w:val="20"/>
+                <w:szCs w:val="20"/>
+              </w:rPr>
+              <w:t xml:space="preserve">Import several films at once and time how long the search and the import take</w:t>
+            </w:r>
+          </w:p>
+        </w:tc>
+        <w:tc>
+          <w:tcPr>
+            <w:tcW w:w="560" w:type="pct"/>
+            <w:tcMar>
+              <w:top w:w="30" w:type="dxa"/>
+              <w:left w:w="80" w:type="dxa"/>
+              <w:bottom w:w="30" w:type="dxa"/>
+              <w:right w:w="80" w:type="dxa"/>
+            </w:tcMar>
+          </w:tcPr>
+          <w:p>
+            <w:r>
+              <w:rPr>
+                <w:rFonts w:ascii="Aptos" w:eastAsia="Aptos" w:hAnsi="Aptos" w:cs="Aptos"/>
+                <w:sz w:val="20"/>
+                <w:szCs w:val="20"/>
+              </w:rPr>
+              <w:t xml:space="preserve">Normal</w:t>
+            </w:r>
+          </w:p>
+        </w:tc>
+        <w:tc>
+          <w:tcPr>
+            <w:tcW w:w="2290" w:type="pct"/>
+            <w:tcMar>
+              <w:top w:w="30" w:type="dxa"/>
+              <w:left w:w="80" w:type="dxa"/>
+              <w:bottom w:w="30" w:type="dxa"/>
+              <w:right w:w="80" w:type="dxa"/>
+            </w:tcMar>
+          </w:tcPr>
+          <w:p>
+            <w:r>
+              <w:rPr>
+                <w:rFonts w:ascii="Aptos" w:eastAsia="Aptos" w:hAnsi="Aptos" w:cs="Aptos"/>
+                <w:sz w:val="20"/>
+                <w:szCs w:val="20"/>
+              </w:rPr>
+              <w:t xml:space="preserve">The search returns and the import completes without the program appearing to have stopped responding, even though the source file holds a very large number of rows.</w:t>
             </w:r>
           </w:p>
         </w:tc>

</xml_diff>

<commit_message>
added objective 34: storing a poster against a film
</commit_message>
<xml_diff>
--- a/Testing.docx
+++ b/Testing.docx
@@ -20669,6 +20669,785 @@
                 <w:szCs w:val="20"/>
               </w:rPr>
               <w:t xml:space="preserve">The search returns and the import completes without the program appearing to have stopped responding, even though the source file holds a very large number of rows.</w:t>
+            </w:r>
+          </w:p>
+        </w:tc>
+      </w:tr>
+    </w:tbl>
+    <w:p>
+      <w:r>
+        <w:rPr>
+          <w:rFonts w:ascii="Aptos" w:eastAsia="Aptos" w:hAnsi="Aptos" w:cs="Aptos"/>
+        </w:rPr>
+        <w:t xml:space="preserve"/>
+      </w:r>
+    </w:p>
+    <w:p>
+      <w:pPr>
+        <w:pStyle w:val="Heading3"/>
+      </w:pPr>
+      <w:r>
+        <w:rPr>
+          <w:rFonts w:ascii="Aptos Display" w:eastAsia="Aptos Display" w:hAnsi="Aptos Display" w:cs="Aptos Display"/>
+          <w:b/>
+          <w:bCs/>
+          <w:color w:val="000000"/>
+        </w:rPr>
+        <w:t xml:space="preserve">Objective 34: Storing a Poster Against a Film</w:t>
+      </w:r>
+    </w:p>
+    <w:p>
+      <w:r>
+        <w:rPr>
+          <w:rFonts w:ascii="Aptos" w:eastAsia="Aptos" w:hAnsi="Aptos" w:cs="Aptos"/>
+        </w:rPr>
+        <w:t xml:space="preserve">These tests check that a poster can be attached to a film both from a file and by looking it up online, and that the failures are handled rather than being allowed to crash the form.</w:t>
+      </w:r>
+    </w:p>
+    <w:tbl>
+      <w:tblPr>
+        <w:tblW w:w="5000" w:type="pct"/>
+        <w:tblBorders>
+          <w:top w:val="single" w:sz="4" w:space="0" w:color="808080"/>
+          <w:left w:val="single" w:sz="4" w:space="0" w:color="808080"/>
+          <w:bottom w:val="single" w:sz="4" w:space="0" w:color="808080"/>
+          <w:right w:val="single" w:sz="4" w:space="0" w:color="808080"/>
+          <w:insideH w:val="single" w:sz="4" w:space="0" w:color="808080"/>
+          <w:insideV w:val="single" w:sz="4" w:space="0" w:color="808080"/>
+        </w:tblBorders>
+        <w:tblCellMar>
+          <w:left w:w="10" w:type="dxa"/>
+          <w:right w:w="10" w:type="dxa"/>
+        </w:tblCellMar>
+        <w:tblLook w:val="0000" w:firstRow="0" w:lastRow="0" w:firstColumn="0" w:lastColumn="0" w:noHBand="0" w:noVBand="0"/>
+      </w:tblPr>
+      <w:tblGrid>
+        <w:gridCol w:w="561"/>
+        <w:gridCol w:w="3460"/>
+        <w:gridCol w:w="1047"/>
+        <w:gridCol w:w="4282"/>
+      </w:tblGrid>
+      <w:tr>
+        <w:trPr>
+          <w:cantSplit/>
+          <w:tblHeader/>
+        </w:trPr>
+        <w:tc>
+          <w:tcPr>
+            <w:tcW w:w="300" w:type="pct"/>
+            <w:shd w:val="clear" w:color="auto" w:fill="F2CEED" w:themeFill="accent5" w:themeFillTint="33"/>
+            <w:tcMar>
+              <w:top w:w="30" w:type="dxa"/>
+              <w:left w:w="80" w:type="dxa"/>
+              <w:bottom w:w="30" w:type="dxa"/>
+              <w:right w:w="80" w:type="dxa"/>
+            </w:tcMar>
+          </w:tcPr>
+          <w:p>
+            <w:r>
+              <w:rPr>
+                <w:rFonts w:ascii="Aptos" w:eastAsia="Aptos" w:hAnsi="Aptos" w:cs="Aptos"/>
+                <w:b/>
+                <w:bCs/>
+                <w:sz w:val="20"/>
+                <w:szCs w:val="20"/>
+              </w:rPr>
+              <w:t xml:space="preserve">No.</w:t>
+            </w:r>
+          </w:p>
+        </w:tc>
+        <w:tc>
+          <w:tcPr>
+            <w:tcW w:w="1850" w:type="pct"/>
+            <w:shd w:val="clear" w:color="auto" w:fill="F2CEED" w:themeFill="accent5" w:themeFillTint="33"/>
+            <w:tcMar>
+              <w:top w:w="30" w:type="dxa"/>
+              <w:left w:w="80" w:type="dxa"/>
+              <w:bottom w:w="30" w:type="dxa"/>
+              <w:right w:w="80" w:type="dxa"/>
+            </w:tcMar>
+          </w:tcPr>
+          <w:p>
+            <w:r>
+              <w:rPr>
+                <w:rFonts w:ascii="Aptos" w:eastAsia="Aptos" w:hAnsi="Aptos" w:cs="Aptos"/>
+                <w:b/>
+                <w:bCs/>
+                <w:sz w:val="20"/>
+                <w:szCs w:val="20"/>
+              </w:rPr>
+              <w:t xml:space="preserve">Test</w:t>
+            </w:r>
+          </w:p>
+        </w:tc>
+        <w:tc>
+          <w:tcPr>
+            <w:tcW w:w="560" w:type="pct"/>
+            <w:shd w:val="clear" w:color="auto" w:fill="F2CEED" w:themeFill="accent5" w:themeFillTint="33"/>
+            <w:tcMar>
+              <w:top w:w="30" w:type="dxa"/>
+              <w:left w:w="80" w:type="dxa"/>
+              <w:bottom w:w="30" w:type="dxa"/>
+              <w:right w:w="80" w:type="dxa"/>
+            </w:tcMar>
+          </w:tcPr>
+          <w:p>
+            <w:r>
+              <w:rPr>
+                <w:rFonts w:ascii="Aptos" w:eastAsia="Aptos" w:hAnsi="Aptos" w:cs="Aptos"/>
+                <w:b/>
+                <w:bCs/>
+                <w:sz w:val="20"/>
+                <w:szCs w:val="20"/>
+              </w:rPr>
+              <w:t xml:space="preserve">Type</w:t>
+            </w:r>
+          </w:p>
+        </w:tc>
+        <w:tc>
+          <w:tcPr>
+            <w:tcW w:w="2290" w:type="pct"/>
+            <w:shd w:val="clear" w:color="auto" w:fill="F2CEED" w:themeFill="accent5" w:themeFillTint="33"/>
+            <w:tcMar>
+              <w:top w:w="30" w:type="dxa"/>
+              <w:left w:w="80" w:type="dxa"/>
+              <w:bottom w:w="30" w:type="dxa"/>
+              <w:right w:w="80" w:type="dxa"/>
+            </w:tcMar>
+          </w:tcPr>
+          <w:p>
+            <w:r>
+              <w:rPr>
+                <w:rFonts w:ascii="Aptos" w:eastAsia="Aptos" w:hAnsi="Aptos" w:cs="Aptos"/>
+                <w:b/>
+                <w:bCs/>
+                <w:sz w:val="20"/>
+                <w:szCs w:val="20"/>
+              </w:rPr>
+              <w:t xml:space="preserve">Expected Result</w:t>
+            </w:r>
+          </w:p>
+        </w:tc>
+      </w:tr>
+      <w:tr>
+        <w:trPr>
+          <w:cantSplit/>
+        </w:trPr>
+        <w:tc>
+          <w:tcPr>
+            <w:tcW w:w="300" w:type="pct"/>
+            <w:tcMar>
+              <w:top w:w="30" w:type="dxa"/>
+              <w:left w:w="80" w:type="dxa"/>
+              <w:bottom w:w="30" w:type="dxa"/>
+              <w:right w:w="80" w:type="dxa"/>
+            </w:tcMar>
+          </w:tcPr>
+          <w:p>
+            <w:r>
+              <w:rPr>
+                <w:rFonts w:ascii="Aptos" w:eastAsia="Aptos" w:hAnsi="Aptos" w:cs="Aptos"/>
+                <w:sz w:val="20"/>
+                <w:szCs w:val="20"/>
+              </w:rPr>
+              <w:t xml:space="preserve">189</w:t>
+            </w:r>
+          </w:p>
+        </w:tc>
+        <w:tc>
+          <w:tcPr>
+            <w:tcW w:w="1850" w:type="pct"/>
+            <w:tcMar>
+              <w:top w:w="30" w:type="dxa"/>
+              <w:left w:w="80" w:type="dxa"/>
+              <w:bottom w:w="30" w:type="dxa"/>
+              <w:right w:w="80" w:type="dxa"/>
+            </w:tcMar>
+          </w:tcPr>
+          <w:p>
+            <w:r>
+              <w:rPr>
+                <w:rFonts w:ascii="Aptos" w:eastAsia="Aptos" w:hAnsi="Aptos" w:cs="Aptos"/>
+                <w:sz w:val="20"/>
+                <w:szCs w:val="20"/>
+              </w:rPr>
+              <w:t xml:space="preserve">Select a film, press Choose poster and pick a picture file</w:t>
+            </w:r>
+          </w:p>
+        </w:tc>
+        <w:tc>
+          <w:tcPr>
+            <w:tcW w:w="560" w:type="pct"/>
+            <w:tcMar>
+              <w:top w:w="30" w:type="dxa"/>
+              <w:left w:w="80" w:type="dxa"/>
+              <w:bottom w:w="30" w:type="dxa"/>
+              <w:right w:w="80" w:type="dxa"/>
+            </w:tcMar>
+          </w:tcPr>
+          <w:p>
+            <w:r>
+              <w:rPr>
+                <w:rFonts w:ascii="Aptos" w:eastAsia="Aptos" w:hAnsi="Aptos" w:cs="Aptos"/>
+                <w:sz w:val="20"/>
+                <w:szCs w:val="20"/>
+              </w:rPr>
+              <w:t xml:space="preserve">Normal</w:t>
+            </w:r>
+          </w:p>
+        </w:tc>
+        <w:tc>
+          <w:tcPr>
+            <w:tcW w:w="2290" w:type="pct"/>
+            <w:tcMar>
+              <w:top w:w="30" w:type="dxa"/>
+              <w:left w:w="80" w:type="dxa"/>
+              <w:bottom w:w="30" w:type="dxa"/>
+              <w:right w:w="80" w:type="dxa"/>
+            </w:tcMar>
+          </w:tcPr>
+          <w:p>
+            <w:r>
+              <w:rPr>
+                <w:rFonts w:ascii="Aptos" w:eastAsia="Aptos" w:hAnsi="Aptos" w:cs="Aptos"/>
+                <w:sz w:val="20"/>
+                <w:szCs w:val="20"/>
+              </w:rPr>
+              <w:t xml:space="preserve">The poster is shown on the form and stored against the film in tblFilm.</w:t>
+            </w:r>
+          </w:p>
+        </w:tc>
+      </w:tr>
+      <w:tr>
+        <w:trPr>
+          <w:cantSplit/>
+        </w:trPr>
+        <w:tc>
+          <w:tcPr>
+            <w:tcW w:w="300" w:type="pct"/>
+            <w:tcMar>
+              <w:top w:w="30" w:type="dxa"/>
+              <w:left w:w="80" w:type="dxa"/>
+              <w:bottom w:w="30" w:type="dxa"/>
+              <w:right w:w="80" w:type="dxa"/>
+            </w:tcMar>
+          </w:tcPr>
+          <w:p>
+            <w:r>
+              <w:rPr>
+                <w:rFonts w:ascii="Aptos" w:eastAsia="Aptos" w:hAnsi="Aptos" w:cs="Aptos"/>
+                <w:sz w:val="20"/>
+                <w:szCs w:val="20"/>
+              </w:rPr>
+              <w:t xml:space="preserve">190</w:t>
+            </w:r>
+          </w:p>
+        </w:tc>
+        <w:tc>
+          <w:tcPr>
+            <w:tcW w:w="1850" w:type="pct"/>
+            <w:tcMar>
+              <w:top w:w="30" w:type="dxa"/>
+              <w:left w:w="80" w:type="dxa"/>
+              <w:bottom w:w="30" w:type="dxa"/>
+              <w:right w:w="80" w:type="dxa"/>
+            </w:tcMar>
+          </w:tcPr>
+          <w:p>
+            <w:r>
+              <w:rPr>
+                <w:rFonts w:ascii="Aptos" w:eastAsia="Aptos" w:hAnsi="Aptos" w:cs="Aptos"/>
+                <w:sz w:val="20"/>
+                <w:szCs w:val="20"/>
+              </w:rPr>
+              <w:t xml:space="preserve">Look at that film wherever it is presented to a customer</w:t>
+            </w:r>
+          </w:p>
+        </w:tc>
+        <w:tc>
+          <w:tcPr>
+            <w:tcW w:w="560" w:type="pct"/>
+            <w:tcMar>
+              <w:top w:w="30" w:type="dxa"/>
+              <w:left w:w="80" w:type="dxa"/>
+              <w:bottom w:w="30" w:type="dxa"/>
+              <w:right w:w="80" w:type="dxa"/>
+            </w:tcMar>
+          </w:tcPr>
+          <w:p>
+            <w:r>
+              <w:rPr>
+                <w:rFonts w:ascii="Aptos" w:eastAsia="Aptos" w:hAnsi="Aptos" w:cs="Aptos"/>
+                <w:sz w:val="20"/>
+                <w:szCs w:val="20"/>
+              </w:rPr>
+              <w:t xml:space="preserve">Normal</w:t>
+            </w:r>
+          </w:p>
+        </w:tc>
+        <w:tc>
+          <w:tcPr>
+            <w:tcW w:w="2290" w:type="pct"/>
+            <w:tcMar>
+              <w:top w:w="30" w:type="dxa"/>
+              <w:left w:w="80" w:type="dxa"/>
+              <w:bottom w:w="30" w:type="dxa"/>
+              <w:right w:w="80" w:type="dxa"/>
+            </w:tcMar>
+          </w:tcPr>
+          <w:p>
+            <w:r>
+              <w:rPr>
+                <w:rFonts w:ascii="Aptos" w:eastAsia="Aptos" w:hAnsi="Aptos" w:cs="Aptos"/>
+                <w:sz w:val="20"/>
+                <w:szCs w:val="20"/>
+              </w:rPr>
+              <w:t xml:space="preserve">The poster is displayed alongside the film rather than only on the films screen.</w:t>
+            </w:r>
+          </w:p>
+        </w:tc>
+      </w:tr>
+      <w:tr>
+        <w:trPr>
+          <w:cantSplit/>
+        </w:trPr>
+        <w:tc>
+          <w:tcPr>
+            <w:tcW w:w="300" w:type="pct"/>
+            <w:tcMar>
+              <w:top w:w="30" w:type="dxa"/>
+              <w:left w:w="80" w:type="dxa"/>
+              <w:bottom w:w="30" w:type="dxa"/>
+              <w:right w:w="80" w:type="dxa"/>
+            </w:tcMar>
+          </w:tcPr>
+          <w:p>
+            <w:r>
+              <w:rPr>
+                <w:rFonts w:ascii="Aptos" w:eastAsia="Aptos" w:hAnsi="Aptos" w:cs="Aptos"/>
+                <w:sz w:val="20"/>
+                <w:szCs w:val="20"/>
+              </w:rPr>
+              <w:t xml:space="preserve">191</w:t>
+            </w:r>
+          </w:p>
+        </w:tc>
+        <w:tc>
+          <w:tcPr>
+            <w:tcW w:w="1850" w:type="pct"/>
+            <w:tcMar>
+              <w:top w:w="30" w:type="dxa"/>
+              <w:left w:w="80" w:type="dxa"/>
+              <w:bottom w:w="30" w:type="dxa"/>
+              <w:right w:w="80" w:type="dxa"/>
+            </w:tcMar>
+          </w:tcPr>
+          <w:p>
+            <w:r>
+              <w:rPr>
+                <w:rFonts w:ascii="Aptos" w:eastAsia="Aptos" w:hAnsi="Aptos" w:cs="Aptos"/>
+                <w:sz w:val="20"/>
+                <w:szCs w:val="20"/>
+              </w:rPr>
+              <w:t xml:space="preserve">Press Fetch poster with the title box empty</w:t>
+            </w:r>
+          </w:p>
+        </w:tc>
+        <w:tc>
+          <w:tcPr>
+            <w:tcW w:w="560" w:type="pct"/>
+            <w:tcMar>
+              <w:top w:w="30" w:type="dxa"/>
+              <w:left w:w="80" w:type="dxa"/>
+              <w:bottom w:w="30" w:type="dxa"/>
+              <w:right w:w="80" w:type="dxa"/>
+            </w:tcMar>
+          </w:tcPr>
+          <w:p>
+            <w:r>
+              <w:rPr>
+                <w:rFonts w:ascii="Aptos" w:eastAsia="Aptos" w:hAnsi="Aptos" w:cs="Aptos"/>
+                <w:sz w:val="20"/>
+                <w:szCs w:val="20"/>
+              </w:rPr>
+              <w:t xml:space="preserve">Erroneous</w:t>
+            </w:r>
+          </w:p>
+        </w:tc>
+        <w:tc>
+          <w:tcPr>
+            <w:tcW w:w="2290" w:type="pct"/>
+            <w:tcMar>
+              <w:top w:w="30" w:type="dxa"/>
+              <w:left w:w="80" w:type="dxa"/>
+              <w:bottom w:w="30" w:type="dxa"/>
+              <w:right w:w="80" w:type="dxa"/>
+            </w:tcMar>
+          </w:tcPr>
+          <w:p>
+            <w:r>
+              <w:rPr>
+                <w:rFonts w:ascii="Aptos" w:eastAsia="Aptos" w:hAnsi="Aptos" w:cs="Aptos"/>
+                <w:sz w:val="20"/>
+                <w:szCs w:val="20"/>
+              </w:rPr>
+              <w:t xml:space="preserve">Nothing is fetched and a message appears stating “Type the film title in first, that is what TMDB is asked for.”.</w:t>
+            </w:r>
+          </w:p>
+        </w:tc>
+      </w:tr>
+      <w:tr>
+        <w:trPr>
+          <w:cantSplit/>
+        </w:trPr>
+        <w:tc>
+          <w:tcPr>
+            <w:tcW w:w="300" w:type="pct"/>
+            <w:tcMar>
+              <w:top w:w="30" w:type="dxa"/>
+              <w:left w:w="80" w:type="dxa"/>
+              <w:bottom w:w="30" w:type="dxa"/>
+              <w:right w:w="80" w:type="dxa"/>
+            </w:tcMar>
+          </w:tcPr>
+          <w:p>
+            <w:r>
+              <w:rPr>
+                <w:rFonts w:ascii="Aptos" w:eastAsia="Aptos" w:hAnsi="Aptos" w:cs="Aptos"/>
+                <w:sz w:val="20"/>
+                <w:szCs w:val="20"/>
+              </w:rPr>
+              <w:t xml:space="preserve">192</w:t>
+            </w:r>
+          </w:p>
+        </w:tc>
+        <w:tc>
+          <w:tcPr>
+            <w:tcW w:w="1850" w:type="pct"/>
+            <w:tcMar>
+              <w:top w:w="30" w:type="dxa"/>
+              <w:left w:w="80" w:type="dxa"/>
+              <w:bottom w:w="30" w:type="dxa"/>
+              <w:right w:w="80" w:type="dxa"/>
+            </w:tcMar>
+          </w:tcPr>
+          <w:p>
+            <w:r>
+              <w:rPr>
+                <w:rFonts w:ascii="Aptos" w:eastAsia="Aptos" w:hAnsi="Aptos" w:cs="Aptos"/>
+                <w:sz w:val="20"/>
+                <w:szCs w:val="20"/>
+              </w:rPr>
+              <w:t xml:space="preserve">Select Inception and press Fetch poster</w:t>
+            </w:r>
+          </w:p>
+        </w:tc>
+        <w:tc>
+          <w:tcPr>
+            <w:tcW w:w="560" w:type="pct"/>
+            <w:tcMar>
+              <w:top w:w="30" w:type="dxa"/>
+              <w:left w:w="80" w:type="dxa"/>
+              <w:bottom w:w="30" w:type="dxa"/>
+              <w:right w:w="80" w:type="dxa"/>
+            </w:tcMar>
+          </w:tcPr>
+          <w:p>
+            <w:r>
+              <w:rPr>
+                <w:rFonts w:ascii="Aptos" w:eastAsia="Aptos" w:hAnsi="Aptos" w:cs="Aptos"/>
+                <w:sz w:val="20"/>
+                <w:szCs w:val="20"/>
+              </w:rPr>
+              <w:t xml:space="preserve">Normal</w:t>
+            </w:r>
+          </w:p>
+        </w:tc>
+        <w:tc>
+          <w:tcPr>
+            <w:tcW w:w="2290" w:type="pct"/>
+            <w:tcMar>
+              <w:top w:w="30" w:type="dxa"/>
+              <w:left w:w="80" w:type="dxa"/>
+              <w:bottom w:w="30" w:type="dxa"/>
+              <w:right w:w="80" w:type="dxa"/>
+            </w:tcMar>
+          </w:tcPr>
+          <w:p>
+            <w:r>
+              <w:rPr>
+                <w:rFonts w:ascii="Aptos" w:eastAsia="Aptos" w:hAnsi="Aptos" w:cs="Aptos"/>
+                <w:sz w:val="20"/>
+                <w:szCs w:val="20"/>
+              </w:rPr>
+              <w:t xml:space="preserve">The poster is looked up online, downloaded and stored against the film.</w:t>
+            </w:r>
+          </w:p>
+        </w:tc>
+      </w:tr>
+      <w:tr>
+        <w:trPr>
+          <w:cantSplit/>
+        </w:trPr>
+        <w:tc>
+          <w:tcPr>
+            <w:tcW w:w="300" w:type="pct"/>
+            <w:tcMar>
+              <w:top w:w="30" w:type="dxa"/>
+              <w:left w:w="80" w:type="dxa"/>
+              <w:bottom w:w="30" w:type="dxa"/>
+              <w:right w:w="80" w:type="dxa"/>
+            </w:tcMar>
+          </w:tcPr>
+          <w:p>
+            <w:r>
+              <w:rPr>
+                <w:rFonts w:ascii="Aptos" w:eastAsia="Aptos" w:hAnsi="Aptos" w:cs="Aptos"/>
+                <w:sz w:val="20"/>
+                <w:szCs w:val="20"/>
+              </w:rPr>
+              <w:t xml:space="preserve">193</w:t>
+            </w:r>
+          </w:p>
+        </w:tc>
+        <w:tc>
+          <w:tcPr>
+            <w:tcW w:w="1850" w:type="pct"/>
+            <w:tcMar>
+              <w:top w:w="30" w:type="dxa"/>
+              <w:left w:w="80" w:type="dxa"/>
+              <w:bottom w:w="30" w:type="dxa"/>
+              <w:right w:w="80" w:type="dxa"/>
+            </w:tcMar>
+          </w:tcPr>
+          <w:p>
+            <w:r>
+              <w:rPr>
+                <w:rFonts w:ascii="Aptos" w:eastAsia="Aptos" w:hAnsi="Aptos" w:cs="Aptos"/>
+                <w:sz w:val="20"/>
+                <w:szCs w:val="20"/>
+              </w:rPr>
+              <w:t xml:space="preserve">Press Fetch poster for a title that does not exist, such as Xanadu 9</w:t>
+            </w:r>
+          </w:p>
+        </w:tc>
+        <w:tc>
+          <w:tcPr>
+            <w:tcW w:w="560" w:type="pct"/>
+            <w:tcMar>
+              <w:top w:w="30" w:type="dxa"/>
+              <w:left w:w="80" w:type="dxa"/>
+              <w:bottom w:w="30" w:type="dxa"/>
+              <w:right w:w="80" w:type="dxa"/>
+            </w:tcMar>
+          </w:tcPr>
+          <w:p>
+            <w:r>
+              <w:rPr>
+                <w:rFonts w:ascii="Aptos" w:eastAsia="Aptos" w:hAnsi="Aptos" w:cs="Aptos"/>
+                <w:sz w:val="20"/>
+                <w:szCs w:val="20"/>
+              </w:rPr>
+              <w:t xml:space="preserve">Erroneous</w:t>
+            </w:r>
+          </w:p>
+        </w:tc>
+        <w:tc>
+          <w:tcPr>
+            <w:tcW w:w="2290" w:type="pct"/>
+            <w:tcMar>
+              <w:top w:w="30" w:type="dxa"/>
+              <w:left w:w="80" w:type="dxa"/>
+              <w:bottom w:w="30" w:type="dxa"/>
+              <w:right w:w="80" w:type="dxa"/>
+            </w:tcMar>
+          </w:tcPr>
+          <w:p>
+            <w:r>
+              <w:rPr>
+                <w:rFonts w:ascii="Aptos" w:eastAsia="Aptos" w:hAnsi="Aptos" w:cs="Aptos"/>
+                <w:sz w:val="20"/>
+                <w:szCs w:val="20"/>
+              </w:rPr>
+              <w:t xml:space="preserve">A message appears saying there is no poster for a film matching that title and year, and the film is left as it was.</w:t>
+            </w:r>
+          </w:p>
+        </w:tc>
+      </w:tr>
+      <w:tr>
+        <w:trPr>
+          <w:cantSplit/>
+        </w:trPr>
+        <w:tc>
+          <w:tcPr>
+            <w:tcW w:w="300" w:type="pct"/>
+            <w:tcMar>
+              <w:top w:w="30" w:type="dxa"/>
+              <w:left w:w="80" w:type="dxa"/>
+              <w:bottom w:w="30" w:type="dxa"/>
+              <w:right w:w="80" w:type="dxa"/>
+            </w:tcMar>
+          </w:tcPr>
+          <w:p>
+            <w:r>
+              <w:rPr>
+                <w:rFonts w:ascii="Aptos" w:eastAsia="Aptos" w:hAnsi="Aptos" w:cs="Aptos"/>
+                <w:sz w:val="20"/>
+                <w:szCs w:val="20"/>
+              </w:rPr>
+              <w:t xml:space="preserve">194</w:t>
+            </w:r>
+          </w:p>
+        </w:tc>
+        <w:tc>
+          <w:tcPr>
+            <w:tcW w:w="1850" w:type="pct"/>
+            <w:tcMar>
+              <w:top w:w="30" w:type="dxa"/>
+              <w:left w:w="80" w:type="dxa"/>
+              <w:bottom w:w="30" w:type="dxa"/>
+              <w:right w:w="80" w:type="dxa"/>
+            </w:tcMar>
+          </w:tcPr>
+          <w:p>
+            <w:r>
+              <w:rPr>
+                <w:rFonts w:ascii="Aptos" w:eastAsia="Aptos" w:hAnsi="Aptos" w:cs="Aptos"/>
+                <w:sz w:val="20"/>
+                <w:szCs w:val="20"/>
+              </w:rPr>
+              <w:t xml:space="preserve">Press Choose poster and pick a file that is not a picture, such as a text file</w:t>
+            </w:r>
+          </w:p>
+        </w:tc>
+        <w:tc>
+          <w:tcPr>
+            <w:tcW w:w="560" w:type="pct"/>
+            <w:tcMar>
+              <w:top w:w="30" w:type="dxa"/>
+              <w:left w:w="80" w:type="dxa"/>
+              <w:bottom w:w="30" w:type="dxa"/>
+              <w:right w:w="80" w:type="dxa"/>
+            </w:tcMar>
+          </w:tcPr>
+          <w:p>
+            <w:r>
+              <w:rPr>
+                <w:rFonts w:ascii="Aptos" w:eastAsia="Aptos" w:hAnsi="Aptos" w:cs="Aptos"/>
+                <w:sz w:val="20"/>
+                <w:szCs w:val="20"/>
+              </w:rPr>
+              <w:t xml:space="preserve">Erroneous</w:t>
+            </w:r>
+          </w:p>
+        </w:tc>
+        <w:tc>
+          <w:tcPr>
+            <w:tcW w:w="2290" w:type="pct"/>
+            <w:tcMar>
+              <w:top w:w="30" w:type="dxa"/>
+              <w:left w:w="80" w:type="dxa"/>
+              <w:bottom w:w="30" w:type="dxa"/>
+              <w:right w:w="80" w:type="dxa"/>
+            </w:tcMar>
+          </w:tcPr>
+          <w:p>
+            <w:r>
+              <w:rPr>
+                <w:rFonts w:ascii="Aptos" w:eastAsia="Aptos" w:hAnsi="Aptos" w:cs="Aptos"/>
+                <w:sz w:val="20"/>
+                <w:szCs w:val="20"/>
+              </w:rPr>
+              <w:t xml:space="preserve">A message appears stating “That file could not be read as a picture.” and no poster is stored.</w:t>
+            </w:r>
+          </w:p>
+        </w:tc>
+      </w:tr>
+      <w:tr>
+        <w:trPr>
+          <w:cantSplit/>
+        </w:trPr>
+        <w:tc>
+          <w:tcPr>
+            <w:tcW w:w="300" w:type="pct"/>
+            <w:tcMar>
+              <w:top w:w="30" w:type="dxa"/>
+              <w:left w:w="80" w:type="dxa"/>
+              <w:bottom w:w="30" w:type="dxa"/>
+              <w:right w:w="80" w:type="dxa"/>
+            </w:tcMar>
+          </w:tcPr>
+          <w:p>
+            <w:r>
+              <w:rPr>
+                <w:rFonts w:ascii="Aptos" w:eastAsia="Aptos" w:hAnsi="Aptos" w:cs="Aptos"/>
+                <w:sz w:val="20"/>
+                <w:szCs w:val="20"/>
+              </w:rPr>
+              <w:t xml:space="preserve">195</w:t>
+            </w:r>
+          </w:p>
+        </w:tc>
+        <w:tc>
+          <w:tcPr>
+            <w:tcW w:w="1850" w:type="pct"/>
+            <w:tcMar>
+              <w:top w:w="30" w:type="dxa"/>
+              <w:left w:w="80" w:type="dxa"/>
+              <w:bottom w:w="30" w:type="dxa"/>
+              <w:right w:w="80" w:type="dxa"/>
+            </w:tcMar>
+          </w:tcPr>
+          <w:p>
+            <w:r>
+              <w:rPr>
+                <w:rFonts w:ascii="Aptos" w:eastAsia="Aptos" w:hAnsi="Aptos" w:cs="Aptos"/>
+                <w:sz w:val="20"/>
+                <w:szCs w:val="20"/>
+              </w:rPr>
+              <w:t xml:space="preserve">Select a film with a poster and press Remove poster</w:t>
+            </w:r>
+          </w:p>
+        </w:tc>
+        <w:tc>
+          <w:tcPr>
+            <w:tcW w:w="560" w:type="pct"/>
+            <w:tcMar>
+              <w:top w:w="30" w:type="dxa"/>
+              <w:left w:w="80" w:type="dxa"/>
+              <w:bottom w:w="30" w:type="dxa"/>
+              <w:right w:w="80" w:type="dxa"/>
+            </w:tcMar>
+          </w:tcPr>
+          <w:p>
+            <w:r>
+              <w:rPr>
+                <w:rFonts w:ascii="Aptos" w:eastAsia="Aptos" w:hAnsi="Aptos" w:cs="Aptos"/>
+                <w:sz w:val="20"/>
+                <w:szCs w:val="20"/>
+              </w:rPr>
+              <w:t xml:space="preserve">Normal</w:t>
+            </w:r>
+          </w:p>
+        </w:tc>
+        <w:tc>
+          <w:tcPr>
+            <w:tcW w:w="2290" w:type="pct"/>
+            <w:tcMar>
+              <w:top w:w="30" w:type="dxa"/>
+              <w:left w:w="80" w:type="dxa"/>
+              <w:bottom w:w="30" w:type="dxa"/>
+              <w:right w:w="80" w:type="dxa"/>
+            </w:tcMar>
+          </w:tcPr>
+          <w:p>
+            <w:r>
+              <w:rPr>
+                <w:rFonts w:ascii="Aptos" w:eastAsia="Aptos" w:hAnsi="Aptos" w:cs="Aptos"/>
+                <w:sz w:val="20"/>
+                <w:szCs w:val="20"/>
+              </w:rPr>
+              <w:t xml:space="preserve">The poster is cleared from the film and the form shows it without one.</w:t>
             </w:r>
           </w:p>
         </w:tc>

</xml_diff>

<commit_message>
added objective 35: changing a password
</commit_message>
<xml_diff>
--- a/Testing.docx
+++ b/Testing.docx
@@ -21448,6 +21448,785 @@
                 <w:szCs w:val="20"/>
               </w:rPr>
               <w:t xml:space="preserve">The poster is cleared from the film and the form shows it without one.</w:t>
+            </w:r>
+          </w:p>
+        </w:tc>
+      </w:tr>
+    </w:tbl>
+    <w:p>
+      <w:r>
+        <w:rPr>
+          <w:rFonts w:ascii="Aptos" w:eastAsia="Aptos" w:hAnsi="Aptos" w:cs="Aptos"/>
+        </w:rPr>
+        <w:t xml:space="preserve"/>
+      </w:r>
+    </w:p>
+    <w:p>
+      <w:pPr>
+        <w:pStyle w:val="Heading3"/>
+      </w:pPr>
+      <w:r>
+        <w:rPr>
+          <w:rFonts w:ascii="Aptos Display" w:eastAsia="Aptos Display" w:hAnsi="Aptos Display" w:cs="Aptos Display"/>
+          <w:b/>
+          <w:bCs/>
+          <w:color w:val="000000"/>
+        </w:rPr>
+        <w:t xml:space="preserve">Objective 35: Changing a Password</w:t>
+      </w:r>
+    </w:p>
+    <w:p>
+      <w:r>
+        <w:rPr>
+          <w:rFonts w:ascii="Aptos" w:eastAsia="Aptos" w:hAnsi="Aptos" w:cs="Aptos"/>
+        </w:rPr>
+        <w:t xml:space="preserve">These tests check that a user can change their own password from inside the program, and that the checks around it hold.</w:t>
+      </w:r>
+    </w:p>
+    <w:tbl>
+      <w:tblPr>
+        <w:tblW w:w="5000" w:type="pct"/>
+        <w:tblBorders>
+          <w:top w:val="single" w:sz="4" w:space="0" w:color="808080"/>
+          <w:left w:val="single" w:sz="4" w:space="0" w:color="808080"/>
+          <w:bottom w:val="single" w:sz="4" w:space="0" w:color="808080"/>
+          <w:right w:val="single" w:sz="4" w:space="0" w:color="808080"/>
+          <w:insideH w:val="single" w:sz="4" w:space="0" w:color="808080"/>
+          <w:insideV w:val="single" w:sz="4" w:space="0" w:color="808080"/>
+        </w:tblBorders>
+        <w:tblCellMar>
+          <w:left w:w="10" w:type="dxa"/>
+          <w:right w:w="10" w:type="dxa"/>
+        </w:tblCellMar>
+        <w:tblLook w:val="0000" w:firstRow="0" w:lastRow="0" w:firstColumn="0" w:lastColumn="0" w:noHBand="0" w:noVBand="0"/>
+      </w:tblPr>
+      <w:tblGrid>
+        <w:gridCol w:w="561"/>
+        <w:gridCol w:w="3460"/>
+        <w:gridCol w:w="1047"/>
+        <w:gridCol w:w="4282"/>
+      </w:tblGrid>
+      <w:tr>
+        <w:trPr>
+          <w:cantSplit/>
+          <w:tblHeader/>
+        </w:trPr>
+        <w:tc>
+          <w:tcPr>
+            <w:tcW w:w="300" w:type="pct"/>
+            <w:shd w:val="clear" w:color="auto" w:fill="F2CEED" w:themeFill="accent5" w:themeFillTint="33"/>
+            <w:tcMar>
+              <w:top w:w="30" w:type="dxa"/>
+              <w:left w:w="80" w:type="dxa"/>
+              <w:bottom w:w="30" w:type="dxa"/>
+              <w:right w:w="80" w:type="dxa"/>
+            </w:tcMar>
+          </w:tcPr>
+          <w:p>
+            <w:r>
+              <w:rPr>
+                <w:rFonts w:ascii="Aptos" w:eastAsia="Aptos" w:hAnsi="Aptos" w:cs="Aptos"/>
+                <w:b/>
+                <w:bCs/>
+                <w:sz w:val="20"/>
+                <w:szCs w:val="20"/>
+              </w:rPr>
+              <w:t xml:space="preserve">No.</w:t>
+            </w:r>
+          </w:p>
+        </w:tc>
+        <w:tc>
+          <w:tcPr>
+            <w:tcW w:w="1850" w:type="pct"/>
+            <w:shd w:val="clear" w:color="auto" w:fill="F2CEED" w:themeFill="accent5" w:themeFillTint="33"/>
+            <w:tcMar>
+              <w:top w:w="30" w:type="dxa"/>
+              <w:left w:w="80" w:type="dxa"/>
+              <w:bottom w:w="30" w:type="dxa"/>
+              <w:right w:w="80" w:type="dxa"/>
+            </w:tcMar>
+          </w:tcPr>
+          <w:p>
+            <w:r>
+              <w:rPr>
+                <w:rFonts w:ascii="Aptos" w:eastAsia="Aptos" w:hAnsi="Aptos" w:cs="Aptos"/>
+                <w:b/>
+                <w:bCs/>
+                <w:sz w:val="20"/>
+                <w:szCs w:val="20"/>
+              </w:rPr>
+              <w:t xml:space="preserve">Test</w:t>
+            </w:r>
+          </w:p>
+        </w:tc>
+        <w:tc>
+          <w:tcPr>
+            <w:tcW w:w="560" w:type="pct"/>
+            <w:shd w:val="clear" w:color="auto" w:fill="F2CEED" w:themeFill="accent5" w:themeFillTint="33"/>
+            <w:tcMar>
+              <w:top w:w="30" w:type="dxa"/>
+              <w:left w:w="80" w:type="dxa"/>
+              <w:bottom w:w="30" w:type="dxa"/>
+              <w:right w:w="80" w:type="dxa"/>
+            </w:tcMar>
+          </w:tcPr>
+          <w:p>
+            <w:r>
+              <w:rPr>
+                <w:rFonts w:ascii="Aptos" w:eastAsia="Aptos" w:hAnsi="Aptos" w:cs="Aptos"/>
+                <w:b/>
+                <w:bCs/>
+                <w:sz w:val="20"/>
+                <w:szCs w:val="20"/>
+              </w:rPr>
+              <w:t xml:space="preserve">Type</w:t>
+            </w:r>
+          </w:p>
+        </w:tc>
+        <w:tc>
+          <w:tcPr>
+            <w:tcW w:w="2290" w:type="pct"/>
+            <w:shd w:val="clear" w:color="auto" w:fill="F2CEED" w:themeFill="accent5" w:themeFillTint="33"/>
+            <w:tcMar>
+              <w:top w:w="30" w:type="dxa"/>
+              <w:left w:w="80" w:type="dxa"/>
+              <w:bottom w:w="30" w:type="dxa"/>
+              <w:right w:w="80" w:type="dxa"/>
+            </w:tcMar>
+          </w:tcPr>
+          <w:p>
+            <w:r>
+              <w:rPr>
+                <w:rFonts w:ascii="Aptos" w:eastAsia="Aptos" w:hAnsi="Aptos" w:cs="Aptos"/>
+                <w:b/>
+                <w:bCs/>
+                <w:sz w:val="20"/>
+                <w:szCs w:val="20"/>
+              </w:rPr>
+              <w:t xml:space="preserve">Expected Result</w:t>
+            </w:r>
+          </w:p>
+        </w:tc>
+      </w:tr>
+      <w:tr>
+        <w:trPr>
+          <w:cantSplit/>
+        </w:trPr>
+        <w:tc>
+          <w:tcPr>
+            <w:tcW w:w="300" w:type="pct"/>
+            <w:tcMar>
+              <w:top w:w="30" w:type="dxa"/>
+              <w:left w:w="80" w:type="dxa"/>
+              <w:bottom w:w="30" w:type="dxa"/>
+              <w:right w:w="80" w:type="dxa"/>
+            </w:tcMar>
+          </w:tcPr>
+          <w:p>
+            <w:r>
+              <w:rPr>
+                <w:rFonts w:ascii="Aptos" w:eastAsia="Aptos" w:hAnsi="Aptos" w:cs="Aptos"/>
+                <w:sz w:val="20"/>
+                <w:szCs w:val="20"/>
+              </w:rPr>
+              <w:t xml:space="preserve">196</w:t>
+            </w:r>
+          </w:p>
+        </w:tc>
+        <w:tc>
+          <w:tcPr>
+            <w:tcW w:w="1850" w:type="pct"/>
+            <w:tcMar>
+              <w:top w:w="30" w:type="dxa"/>
+              <w:left w:w="80" w:type="dxa"/>
+              <w:bottom w:w="30" w:type="dxa"/>
+              <w:right w:w="80" w:type="dxa"/>
+            </w:tcMar>
+          </w:tcPr>
+          <w:p>
+            <w:r>
+              <w:rPr>
+                <w:rFonts w:ascii="Aptos" w:eastAsia="Aptos" w:hAnsi="Aptos" w:cs="Aptos"/>
+                <w:sz w:val="20"/>
+                <w:szCs w:val="20"/>
+              </w:rPr>
+              <w:t xml:space="preserve">Open the change password section, fill in only one of the three boxes and press Change password</w:t>
+            </w:r>
+          </w:p>
+        </w:tc>
+        <w:tc>
+          <w:tcPr>
+            <w:tcW w:w="560" w:type="pct"/>
+            <w:tcMar>
+              <w:top w:w="30" w:type="dxa"/>
+              <w:left w:w="80" w:type="dxa"/>
+              <w:bottom w:w="30" w:type="dxa"/>
+              <w:right w:w="80" w:type="dxa"/>
+            </w:tcMar>
+          </w:tcPr>
+          <w:p>
+            <w:r>
+              <w:rPr>
+                <w:rFonts w:ascii="Aptos" w:eastAsia="Aptos" w:hAnsi="Aptos" w:cs="Aptos"/>
+                <w:sz w:val="20"/>
+                <w:szCs w:val="20"/>
+              </w:rPr>
+              <w:t xml:space="preserve">Erroneous</w:t>
+            </w:r>
+          </w:p>
+        </w:tc>
+        <w:tc>
+          <w:tcPr>
+            <w:tcW w:w="2290" w:type="pct"/>
+            <w:tcMar>
+              <w:top w:w="30" w:type="dxa"/>
+              <w:left w:w="80" w:type="dxa"/>
+              <w:bottom w:w="30" w:type="dxa"/>
+              <w:right w:w="80" w:type="dxa"/>
+            </w:tcMar>
+          </w:tcPr>
+          <w:p>
+            <w:r>
+              <w:rPr>
+                <w:rFonts w:ascii="Aptos" w:eastAsia="Aptos" w:hAnsi="Aptos" w:cs="Aptos"/>
+                <w:sz w:val="20"/>
+                <w:szCs w:val="20"/>
+              </w:rPr>
+              <w:t xml:space="preserve">Nothing changes and a message appears stating “Please fill in all three password boxes.”.</w:t>
+            </w:r>
+          </w:p>
+        </w:tc>
+      </w:tr>
+      <w:tr>
+        <w:trPr>
+          <w:cantSplit/>
+        </w:trPr>
+        <w:tc>
+          <w:tcPr>
+            <w:tcW w:w="300" w:type="pct"/>
+            <w:tcMar>
+              <w:top w:w="30" w:type="dxa"/>
+              <w:left w:w="80" w:type="dxa"/>
+              <w:bottom w:w="30" w:type="dxa"/>
+              <w:right w:w="80" w:type="dxa"/>
+            </w:tcMar>
+          </w:tcPr>
+          <w:p>
+            <w:r>
+              <w:rPr>
+                <w:rFonts w:ascii="Aptos" w:eastAsia="Aptos" w:hAnsi="Aptos" w:cs="Aptos"/>
+                <w:sz w:val="20"/>
+                <w:szCs w:val="20"/>
+              </w:rPr>
+              <w:t xml:space="preserve">197</w:t>
+            </w:r>
+          </w:p>
+        </w:tc>
+        <w:tc>
+          <w:tcPr>
+            <w:tcW w:w="1850" w:type="pct"/>
+            <w:tcMar>
+              <w:top w:w="30" w:type="dxa"/>
+              <w:left w:w="80" w:type="dxa"/>
+              <w:bottom w:w="30" w:type="dxa"/>
+              <w:right w:w="80" w:type="dxa"/>
+            </w:tcMar>
+          </w:tcPr>
+          <w:p>
+            <w:r>
+              <w:rPr>
+                <w:rFonts w:ascii="Aptos" w:eastAsia="Aptos" w:hAnsi="Aptos" w:cs="Aptos"/>
+                <w:sz w:val="20"/>
+                <w:szCs w:val="20"/>
+              </w:rPr>
+              <w:t xml:space="preserve">Enter the wrong current password with a valid new password entered twice</w:t>
+            </w:r>
+          </w:p>
+        </w:tc>
+        <w:tc>
+          <w:tcPr>
+            <w:tcW w:w="560" w:type="pct"/>
+            <w:tcMar>
+              <w:top w:w="30" w:type="dxa"/>
+              <w:left w:w="80" w:type="dxa"/>
+              <w:bottom w:w="30" w:type="dxa"/>
+              <w:right w:w="80" w:type="dxa"/>
+            </w:tcMar>
+          </w:tcPr>
+          <w:p>
+            <w:r>
+              <w:rPr>
+                <w:rFonts w:ascii="Aptos" w:eastAsia="Aptos" w:hAnsi="Aptos" w:cs="Aptos"/>
+                <w:sz w:val="20"/>
+                <w:szCs w:val="20"/>
+              </w:rPr>
+              <w:t xml:space="preserve">Erroneous</w:t>
+            </w:r>
+          </w:p>
+        </w:tc>
+        <w:tc>
+          <w:tcPr>
+            <w:tcW w:w="2290" w:type="pct"/>
+            <w:tcMar>
+              <w:top w:w="30" w:type="dxa"/>
+              <w:left w:w="80" w:type="dxa"/>
+              <w:bottom w:w="30" w:type="dxa"/>
+              <w:right w:w="80" w:type="dxa"/>
+            </w:tcMar>
+          </w:tcPr>
+          <w:p>
+            <w:r>
+              <w:rPr>
+                <w:rFonts w:ascii="Aptos" w:eastAsia="Aptos" w:hAnsi="Aptos" w:cs="Aptos"/>
+                <w:sz w:val="20"/>
+                <w:szCs w:val="20"/>
+              </w:rPr>
+              <w:t xml:space="preserve">Nothing changes and a message appears stating “Your current password is not correct.”, so somebody at an unattended machine cannot change the password without knowing the old one.</w:t>
+            </w:r>
+          </w:p>
+        </w:tc>
+      </w:tr>
+      <w:tr>
+        <w:trPr>
+          <w:cantSplit/>
+        </w:trPr>
+        <w:tc>
+          <w:tcPr>
+            <w:tcW w:w="300" w:type="pct"/>
+            <w:tcMar>
+              <w:top w:w="30" w:type="dxa"/>
+              <w:left w:w="80" w:type="dxa"/>
+              <w:bottom w:w="30" w:type="dxa"/>
+              <w:right w:w="80" w:type="dxa"/>
+            </w:tcMar>
+          </w:tcPr>
+          <w:p>
+            <w:r>
+              <w:rPr>
+                <w:rFonts w:ascii="Aptos" w:eastAsia="Aptos" w:hAnsi="Aptos" w:cs="Aptos"/>
+                <w:sz w:val="20"/>
+                <w:szCs w:val="20"/>
+              </w:rPr>
+              <w:t xml:space="preserve">198</w:t>
+            </w:r>
+          </w:p>
+        </w:tc>
+        <w:tc>
+          <w:tcPr>
+            <w:tcW w:w="1850" w:type="pct"/>
+            <w:tcMar>
+              <w:top w:w="30" w:type="dxa"/>
+              <w:left w:w="80" w:type="dxa"/>
+              <w:bottom w:w="30" w:type="dxa"/>
+              <w:right w:w="80" w:type="dxa"/>
+            </w:tcMar>
+          </w:tcPr>
+          <w:p>
+            <w:r>
+              <w:rPr>
+                <w:rFonts w:ascii="Aptos" w:eastAsia="Aptos" w:hAnsi="Aptos" w:cs="Aptos"/>
+                <w:sz w:val="20"/>
+                <w:szCs w:val="20"/>
+              </w:rPr>
+              <w:t xml:space="preserve">Enter the correct current password but a new password of only 3 characters</w:t>
+            </w:r>
+          </w:p>
+        </w:tc>
+        <w:tc>
+          <w:tcPr>
+            <w:tcW w:w="560" w:type="pct"/>
+            <w:tcMar>
+              <w:top w:w="30" w:type="dxa"/>
+              <w:left w:w="80" w:type="dxa"/>
+              <w:bottom w:w="30" w:type="dxa"/>
+              <w:right w:w="80" w:type="dxa"/>
+            </w:tcMar>
+          </w:tcPr>
+          <w:p>
+            <w:r>
+              <w:rPr>
+                <w:rFonts w:ascii="Aptos" w:eastAsia="Aptos" w:hAnsi="Aptos" w:cs="Aptos"/>
+                <w:sz w:val="20"/>
+                <w:szCs w:val="20"/>
+              </w:rPr>
+              <w:t xml:space="preserve">Erroneous</w:t>
+            </w:r>
+          </w:p>
+        </w:tc>
+        <w:tc>
+          <w:tcPr>
+            <w:tcW w:w="2290" w:type="pct"/>
+            <w:tcMar>
+              <w:top w:w="30" w:type="dxa"/>
+              <w:left w:w="80" w:type="dxa"/>
+              <w:bottom w:w="30" w:type="dxa"/>
+              <w:right w:w="80" w:type="dxa"/>
+            </w:tcMar>
+          </w:tcPr>
+          <w:p>
+            <w:r>
+              <w:rPr>
+                <w:rFonts w:ascii="Aptos" w:eastAsia="Aptos" w:hAnsi="Aptos" w:cs="Aptos"/>
+                <w:sz w:val="20"/>
+                <w:szCs w:val="20"/>
+              </w:rPr>
+              <w:t xml:space="preserve">Nothing changes and a message appears saying the new password must be at least 6 characters, which is the minimum held in the settings.</w:t>
+            </w:r>
+          </w:p>
+        </w:tc>
+      </w:tr>
+      <w:tr>
+        <w:trPr>
+          <w:cantSplit/>
+        </w:trPr>
+        <w:tc>
+          <w:tcPr>
+            <w:tcW w:w="300" w:type="pct"/>
+            <w:tcMar>
+              <w:top w:w="30" w:type="dxa"/>
+              <w:left w:w="80" w:type="dxa"/>
+              <w:bottom w:w="30" w:type="dxa"/>
+              <w:right w:w="80" w:type="dxa"/>
+            </w:tcMar>
+          </w:tcPr>
+          <w:p>
+            <w:r>
+              <w:rPr>
+                <w:rFonts w:ascii="Aptos" w:eastAsia="Aptos" w:hAnsi="Aptos" w:cs="Aptos"/>
+                <w:sz w:val="20"/>
+                <w:szCs w:val="20"/>
+              </w:rPr>
+              <w:t xml:space="preserve">199</w:t>
+            </w:r>
+          </w:p>
+        </w:tc>
+        <w:tc>
+          <w:tcPr>
+            <w:tcW w:w="1850" w:type="pct"/>
+            <w:tcMar>
+              <w:top w:w="30" w:type="dxa"/>
+              <w:left w:w="80" w:type="dxa"/>
+              <w:bottom w:w="30" w:type="dxa"/>
+              <w:right w:w="80" w:type="dxa"/>
+            </w:tcMar>
+          </w:tcPr>
+          <w:p>
+            <w:r>
+              <w:rPr>
+                <w:rFonts w:ascii="Aptos" w:eastAsia="Aptos" w:hAnsi="Aptos" w:cs="Aptos"/>
+                <w:sz w:val="20"/>
+                <w:szCs w:val="20"/>
+              </w:rPr>
+              <w:t xml:space="preserve">Enter a new password of exactly 6 characters</w:t>
+            </w:r>
+          </w:p>
+        </w:tc>
+        <w:tc>
+          <w:tcPr>
+            <w:tcW w:w="560" w:type="pct"/>
+            <w:tcMar>
+              <w:top w:w="30" w:type="dxa"/>
+              <w:left w:w="80" w:type="dxa"/>
+              <w:bottom w:w="30" w:type="dxa"/>
+              <w:right w:w="80" w:type="dxa"/>
+            </w:tcMar>
+          </w:tcPr>
+          <w:p>
+            <w:r>
+              <w:rPr>
+                <w:rFonts w:ascii="Aptos" w:eastAsia="Aptos" w:hAnsi="Aptos" w:cs="Aptos"/>
+                <w:sz w:val="20"/>
+                <w:szCs w:val="20"/>
+              </w:rPr>
+              <w:t xml:space="preserve">Boundary</w:t>
+            </w:r>
+          </w:p>
+        </w:tc>
+        <w:tc>
+          <w:tcPr>
+            <w:tcW w:w="2290" w:type="pct"/>
+            <w:tcMar>
+              <w:top w:w="30" w:type="dxa"/>
+              <w:left w:w="80" w:type="dxa"/>
+              <w:bottom w:w="30" w:type="dxa"/>
+              <w:right w:w="80" w:type="dxa"/>
+            </w:tcMar>
+          </w:tcPr>
+          <w:p>
+            <w:r>
+              <w:rPr>
+                <w:rFonts w:ascii="Aptos" w:eastAsia="Aptos" w:hAnsi="Aptos" w:cs="Aptos"/>
+                <w:sz w:val="20"/>
+                <w:szCs w:val="20"/>
+              </w:rPr>
+              <w:t xml:space="preserve">The password is changed, because 6 characters is the shortest the setting allows.</w:t>
+            </w:r>
+          </w:p>
+        </w:tc>
+      </w:tr>
+      <w:tr>
+        <w:trPr>
+          <w:cantSplit/>
+        </w:trPr>
+        <w:tc>
+          <w:tcPr>
+            <w:tcW w:w="300" w:type="pct"/>
+            <w:tcMar>
+              <w:top w:w="30" w:type="dxa"/>
+              <w:left w:w="80" w:type="dxa"/>
+              <w:bottom w:w="30" w:type="dxa"/>
+              <w:right w:w="80" w:type="dxa"/>
+            </w:tcMar>
+          </w:tcPr>
+          <w:p>
+            <w:r>
+              <w:rPr>
+                <w:rFonts w:ascii="Aptos" w:eastAsia="Aptos" w:hAnsi="Aptos" w:cs="Aptos"/>
+                <w:sz w:val="20"/>
+                <w:szCs w:val="20"/>
+              </w:rPr>
+              <w:t xml:space="preserve">200</w:t>
+            </w:r>
+          </w:p>
+        </w:tc>
+        <w:tc>
+          <w:tcPr>
+            <w:tcW w:w="1850" w:type="pct"/>
+            <w:tcMar>
+              <w:top w:w="30" w:type="dxa"/>
+              <w:left w:w="80" w:type="dxa"/>
+              <w:bottom w:w="30" w:type="dxa"/>
+              <w:right w:w="80" w:type="dxa"/>
+            </w:tcMar>
+          </w:tcPr>
+          <w:p>
+            <w:r>
+              <w:rPr>
+                <w:rFonts w:ascii="Aptos" w:eastAsia="Aptos" w:hAnsi="Aptos" w:cs="Aptos"/>
+                <w:sz w:val="20"/>
+                <w:szCs w:val="20"/>
+              </w:rPr>
+              <w:t xml:space="preserve">Enter the correct current password but two different new passwords</w:t>
+            </w:r>
+          </w:p>
+        </w:tc>
+        <w:tc>
+          <w:tcPr>
+            <w:tcW w:w="560" w:type="pct"/>
+            <w:tcMar>
+              <w:top w:w="30" w:type="dxa"/>
+              <w:left w:w="80" w:type="dxa"/>
+              <w:bottom w:w="30" w:type="dxa"/>
+              <w:right w:w="80" w:type="dxa"/>
+            </w:tcMar>
+          </w:tcPr>
+          <w:p>
+            <w:r>
+              <w:rPr>
+                <w:rFonts w:ascii="Aptos" w:eastAsia="Aptos" w:hAnsi="Aptos" w:cs="Aptos"/>
+                <w:sz w:val="20"/>
+                <w:szCs w:val="20"/>
+              </w:rPr>
+              <w:t xml:space="preserve">Erroneous</w:t>
+            </w:r>
+          </w:p>
+        </w:tc>
+        <w:tc>
+          <w:tcPr>
+            <w:tcW w:w="2290" w:type="pct"/>
+            <w:tcMar>
+              <w:top w:w="30" w:type="dxa"/>
+              <w:left w:w="80" w:type="dxa"/>
+              <w:bottom w:w="30" w:type="dxa"/>
+              <w:right w:w="80" w:type="dxa"/>
+            </w:tcMar>
+          </w:tcPr>
+          <w:p>
+            <w:r>
+              <w:rPr>
+                <w:rFonts w:ascii="Aptos" w:eastAsia="Aptos" w:hAnsi="Aptos" w:cs="Aptos"/>
+                <w:sz w:val="20"/>
+                <w:szCs w:val="20"/>
+              </w:rPr>
+              <w:t xml:space="preserve">Nothing changes and a message appears stating “The new passwords do not match.”.</w:t>
+            </w:r>
+          </w:p>
+        </w:tc>
+      </w:tr>
+      <w:tr>
+        <w:trPr>
+          <w:cantSplit/>
+        </w:trPr>
+        <w:tc>
+          <w:tcPr>
+            <w:tcW w:w="300" w:type="pct"/>
+            <w:tcMar>
+              <w:top w:w="30" w:type="dxa"/>
+              <w:left w:w="80" w:type="dxa"/>
+              <w:bottom w:w="30" w:type="dxa"/>
+              <w:right w:w="80" w:type="dxa"/>
+            </w:tcMar>
+          </w:tcPr>
+          <w:p>
+            <w:r>
+              <w:rPr>
+                <w:rFonts w:ascii="Aptos" w:eastAsia="Aptos" w:hAnsi="Aptos" w:cs="Aptos"/>
+                <w:sz w:val="20"/>
+                <w:szCs w:val="20"/>
+              </w:rPr>
+              <w:t xml:space="preserve">201</w:t>
+            </w:r>
+          </w:p>
+        </w:tc>
+        <w:tc>
+          <w:tcPr>
+            <w:tcW w:w="1850" w:type="pct"/>
+            <w:tcMar>
+              <w:top w:w="30" w:type="dxa"/>
+              <w:left w:w="80" w:type="dxa"/>
+              <w:bottom w:w="30" w:type="dxa"/>
+              <w:right w:w="80" w:type="dxa"/>
+            </w:tcMar>
+          </w:tcPr>
+          <w:p>
+            <w:r>
+              <w:rPr>
+                <w:rFonts w:ascii="Aptos" w:eastAsia="Aptos" w:hAnsi="Aptos" w:cs="Aptos"/>
+                <w:sz w:val="20"/>
+                <w:szCs w:val="20"/>
+              </w:rPr>
+              <w:t xml:space="preserve">Enter the current password as the new password as well</w:t>
+            </w:r>
+          </w:p>
+        </w:tc>
+        <w:tc>
+          <w:tcPr>
+            <w:tcW w:w="560" w:type="pct"/>
+            <w:tcMar>
+              <w:top w:w="30" w:type="dxa"/>
+              <w:left w:w="80" w:type="dxa"/>
+              <w:bottom w:w="30" w:type="dxa"/>
+              <w:right w:w="80" w:type="dxa"/>
+            </w:tcMar>
+          </w:tcPr>
+          <w:p>
+            <w:r>
+              <w:rPr>
+                <w:rFonts w:ascii="Aptos" w:eastAsia="Aptos" w:hAnsi="Aptos" w:cs="Aptos"/>
+                <w:sz w:val="20"/>
+                <w:szCs w:val="20"/>
+              </w:rPr>
+              <w:t xml:space="preserve">Erroneous</w:t>
+            </w:r>
+          </w:p>
+        </w:tc>
+        <w:tc>
+          <w:tcPr>
+            <w:tcW w:w="2290" w:type="pct"/>
+            <w:tcMar>
+              <w:top w:w="30" w:type="dxa"/>
+              <w:left w:w="80" w:type="dxa"/>
+              <w:bottom w:w="30" w:type="dxa"/>
+              <w:right w:w="80" w:type="dxa"/>
+            </w:tcMar>
+          </w:tcPr>
+          <w:p>
+            <w:r>
+              <w:rPr>
+                <w:rFonts w:ascii="Aptos" w:eastAsia="Aptos" w:hAnsi="Aptos" w:cs="Aptos"/>
+                <w:sz w:val="20"/>
+                <w:szCs w:val="20"/>
+              </w:rPr>
+              <w:t xml:space="preserve">Nothing changes and a message appears stating “Your new password must be different from your current one.”.</w:t>
+            </w:r>
+          </w:p>
+        </w:tc>
+      </w:tr>
+      <w:tr>
+        <w:trPr>
+          <w:cantSplit/>
+        </w:trPr>
+        <w:tc>
+          <w:tcPr>
+            <w:tcW w:w="300" w:type="pct"/>
+            <w:tcMar>
+              <w:top w:w="30" w:type="dxa"/>
+              <w:left w:w="80" w:type="dxa"/>
+              <w:bottom w:w="30" w:type="dxa"/>
+              <w:right w:w="80" w:type="dxa"/>
+            </w:tcMar>
+          </w:tcPr>
+          <w:p>
+            <w:r>
+              <w:rPr>
+                <w:rFonts w:ascii="Aptos" w:eastAsia="Aptos" w:hAnsi="Aptos" w:cs="Aptos"/>
+                <w:sz w:val="20"/>
+                <w:szCs w:val="20"/>
+              </w:rPr>
+              <w:t xml:space="preserve">202</w:t>
+            </w:r>
+          </w:p>
+        </w:tc>
+        <w:tc>
+          <w:tcPr>
+            <w:tcW w:w="1850" w:type="pct"/>
+            <w:tcMar>
+              <w:top w:w="30" w:type="dxa"/>
+              <w:left w:w="80" w:type="dxa"/>
+              <w:bottom w:w="30" w:type="dxa"/>
+              <w:right w:w="80" w:type="dxa"/>
+            </w:tcMar>
+          </w:tcPr>
+          <w:p>
+            <w:r>
+              <w:rPr>
+                <w:rFonts w:ascii="Aptos" w:eastAsia="Aptos" w:hAnsi="Aptos" w:cs="Aptos"/>
+                <w:sz w:val="20"/>
+                <w:szCs w:val="20"/>
+              </w:rPr>
+              <w:t xml:space="preserve">Change the password correctly, then log out and log back in with the new password</w:t>
+            </w:r>
+          </w:p>
+        </w:tc>
+        <w:tc>
+          <w:tcPr>
+            <w:tcW w:w="560" w:type="pct"/>
+            <w:tcMar>
+              <w:top w:w="30" w:type="dxa"/>
+              <w:left w:w="80" w:type="dxa"/>
+              <w:bottom w:w="30" w:type="dxa"/>
+              <w:right w:w="80" w:type="dxa"/>
+            </w:tcMar>
+          </w:tcPr>
+          <w:p>
+            <w:r>
+              <w:rPr>
+                <w:rFonts w:ascii="Aptos" w:eastAsia="Aptos" w:hAnsi="Aptos" w:cs="Aptos"/>
+                <w:sz w:val="20"/>
+                <w:szCs w:val="20"/>
+              </w:rPr>
+              <w:t xml:space="preserve">Normal</w:t>
+            </w:r>
+          </w:p>
+        </w:tc>
+        <w:tc>
+          <w:tcPr>
+            <w:tcW w:w="2290" w:type="pct"/>
+            <w:tcMar>
+              <w:top w:w="30" w:type="dxa"/>
+              <w:left w:w="80" w:type="dxa"/>
+              <w:bottom w:w="30" w:type="dxa"/>
+              <w:right w:w="80" w:type="dxa"/>
+            </w:tcMar>
+          </w:tcPr>
+          <w:p>
+            <w:r>
+              <w:rPr>
+                <w:rFonts w:ascii="Aptos" w:eastAsia="Aptos" w:hAnsi="Aptos" w:cs="Aptos"/>
+                <w:sz w:val="20"/>
+                <w:szCs w:val="20"/>
+              </w:rPr>
+              <w:t xml:space="preserve">A message confirms the password has been changed, the new password works and the old password no longer does.</w:t>
             </w:r>
           </w:p>
         </w:tc>

</xml_diff>

<commit_message>
added objective 36: backing up the database
</commit_message>
<xml_diff>
--- a/Testing.docx
+++ b/Testing.docx
@@ -22227,6 +22227,607 @@
                 <w:szCs w:val="20"/>
               </w:rPr>
               <w:t xml:space="preserve">A message confirms the password has been changed, the new password works and the old password no longer does.</w:t>
+            </w:r>
+          </w:p>
+        </w:tc>
+      </w:tr>
+    </w:tbl>
+    <w:p>
+      <w:r>
+        <w:rPr>
+          <w:rFonts w:ascii="Aptos" w:eastAsia="Aptos" w:hAnsi="Aptos" w:cs="Aptos"/>
+        </w:rPr>
+        <w:t xml:space="preserve"/>
+      </w:r>
+    </w:p>
+    <w:p>
+      <w:pPr>
+        <w:pStyle w:val="Heading3"/>
+      </w:pPr>
+      <w:r>
+        <w:rPr>
+          <w:rFonts w:ascii="Aptos Display" w:eastAsia="Aptos Display" w:hAnsi="Aptos Display" w:cs="Aptos Display"/>
+          <w:b/>
+          <w:bCs/>
+          <w:color w:val="000000"/>
+        </w:rPr>
+        <w:t xml:space="preserve">Objective 36: Backing Up the Database</w:t>
+      </w:r>
+    </w:p>
+    <w:p>
+      <w:r>
+        <w:rPr>
+          <w:rFonts w:ascii="Aptos" w:eastAsia="Aptos" w:hAnsi="Aptos" w:cs="Aptos"/>
+        </w:rPr>
+        <w:t xml:space="preserve">These tests check that a manager can take a backup from inside the program and that a member of staff cannot.</w:t>
+      </w:r>
+    </w:p>
+    <w:tbl>
+      <w:tblPr>
+        <w:tblW w:w="5000" w:type="pct"/>
+        <w:tblBorders>
+          <w:top w:val="single" w:sz="4" w:space="0" w:color="808080"/>
+          <w:left w:val="single" w:sz="4" w:space="0" w:color="808080"/>
+          <w:bottom w:val="single" w:sz="4" w:space="0" w:color="808080"/>
+          <w:right w:val="single" w:sz="4" w:space="0" w:color="808080"/>
+          <w:insideH w:val="single" w:sz="4" w:space="0" w:color="808080"/>
+          <w:insideV w:val="single" w:sz="4" w:space="0" w:color="808080"/>
+        </w:tblBorders>
+        <w:tblCellMar>
+          <w:left w:w="10" w:type="dxa"/>
+          <w:right w:w="10" w:type="dxa"/>
+        </w:tblCellMar>
+        <w:tblLook w:val="0000" w:firstRow="0" w:lastRow="0" w:firstColumn="0" w:lastColumn="0" w:noHBand="0" w:noVBand="0"/>
+      </w:tblPr>
+      <w:tblGrid>
+        <w:gridCol w:w="561"/>
+        <w:gridCol w:w="3460"/>
+        <w:gridCol w:w="1047"/>
+        <w:gridCol w:w="4282"/>
+      </w:tblGrid>
+      <w:tr>
+        <w:trPr>
+          <w:cantSplit/>
+          <w:tblHeader/>
+        </w:trPr>
+        <w:tc>
+          <w:tcPr>
+            <w:tcW w:w="300" w:type="pct"/>
+            <w:shd w:val="clear" w:color="auto" w:fill="F2CEED" w:themeFill="accent5" w:themeFillTint="33"/>
+            <w:tcMar>
+              <w:top w:w="30" w:type="dxa"/>
+              <w:left w:w="80" w:type="dxa"/>
+              <w:bottom w:w="30" w:type="dxa"/>
+              <w:right w:w="80" w:type="dxa"/>
+            </w:tcMar>
+          </w:tcPr>
+          <w:p>
+            <w:r>
+              <w:rPr>
+                <w:rFonts w:ascii="Aptos" w:eastAsia="Aptos" w:hAnsi="Aptos" w:cs="Aptos"/>
+                <w:b/>
+                <w:bCs/>
+                <w:sz w:val="20"/>
+                <w:szCs w:val="20"/>
+              </w:rPr>
+              <w:t xml:space="preserve">No.</w:t>
+            </w:r>
+          </w:p>
+        </w:tc>
+        <w:tc>
+          <w:tcPr>
+            <w:tcW w:w="1850" w:type="pct"/>
+            <w:shd w:val="clear" w:color="auto" w:fill="F2CEED" w:themeFill="accent5" w:themeFillTint="33"/>
+            <w:tcMar>
+              <w:top w:w="30" w:type="dxa"/>
+              <w:left w:w="80" w:type="dxa"/>
+              <w:bottom w:w="30" w:type="dxa"/>
+              <w:right w:w="80" w:type="dxa"/>
+            </w:tcMar>
+          </w:tcPr>
+          <w:p>
+            <w:r>
+              <w:rPr>
+                <w:rFonts w:ascii="Aptos" w:eastAsia="Aptos" w:hAnsi="Aptos" w:cs="Aptos"/>
+                <w:b/>
+                <w:bCs/>
+                <w:sz w:val="20"/>
+                <w:szCs w:val="20"/>
+              </w:rPr>
+              <w:t xml:space="preserve">Test</w:t>
+            </w:r>
+          </w:p>
+        </w:tc>
+        <w:tc>
+          <w:tcPr>
+            <w:tcW w:w="560" w:type="pct"/>
+            <w:shd w:val="clear" w:color="auto" w:fill="F2CEED" w:themeFill="accent5" w:themeFillTint="33"/>
+            <w:tcMar>
+              <w:top w:w="30" w:type="dxa"/>
+              <w:left w:w="80" w:type="dxa"/>
+              <w:bottom w:w="30" w:type="dxa"/>
+              <w:right w:w="80" w:type="dxa"/>
+            </w:tcMar>
+          </w:tcPr>
+          <w:p>
+            <w:r>
+              <w:rPr>
+                <w:rFonts w:ascii="Aptos" w:eastAsia="Aptos" w:hAnsi="Aptos" w:cs="Aptos"/>
+                <w:b/>
+                <w:bCs/>
+                <w:sz w:val="20"/>
+                <w:szCs w:val="20"/>
+              </w:rPr>
+              <w:t xml:space="preserve">Type</w:t>
+            </w:r>
+          </w:p>
+        </w:tc>
+        <w:tc>
+          <w:tcPr>
+            <w:tcW w:w="2290" w:type="pct"/>
+            <w:shd w:val="clear" w:color="auto" w:fill="F2CEED" w:themeFill="accent5" w:themeFillTint="33"/>
+            <w:tcMar>
+              <w:top w:w="30" w:type="dxa"/>
+              <w:left w:w="80" w:type="dxa"/>
+              <w:bottom w:w="30" w:type="dxa"/>
+              <w:right w:w="80" w:type="dxa"/>
+            </w:tcMar>
+          </w:tcPr>
+          <w:p>
+            <w:r>
+              <w:rPr>
+                <w:rFonts w:ascii="Aptos" w:eastAsia="Aptos" w:hAnsi="Aptos" w:cs="Aptos"/>
+                <w:b/>
+                <w:bCs/>
+                <w:sz w:val="20"/>
+                <w:szCs w:val="20"/>
+              </w:rPr>
+              <w:t xml:space="preserve">Expected Result</w:t>
+            </w:r>
+          </w:p>
+        </w:tc>
+      </w:tr>
+      <w:tr>
+        <w:trPr>
+          <w:cantSplit/>
+        </w:trPr>
+        <w:tc>
+          <w:tcPr>
+            <w:tcW w:w="300" w:type="pct"/>
+            <w:tcMar>
+              <w:top w:w="30" w:type="dxa"/>
+              <w:left w:w="80" w:type="dxa"/>
+              <w:bottom w:w="30" w:type="dxa"/>
+              <w:right w:w="80" w:type="dxa"/>
+            </w:tcMar>
+          </w:tcPr>
+          <w:p>
+            <w:r>
+              <w:rPr>
+                <w:rFonts w:ascii="Aptos" w:eastAsia="Aptos" w:hAnsi="Aptos" w:cs="Aptos"/>
+                <w:sz w:val="20"/>
+                <w:szCs w:val="20"/>
+              </w:rPr>
+              <w:t xml:space="preserve">203</w:t>
+            </w:r>
+          </w:p>
+        </w:tc>
+        <w:tc>
+          <w:tcPr>
+            <w:tcW w:w="1850" w:type="pct"/>
+            <w:tcMar>
+              <w:top w:w="30" w:type="dxa"/>
+              <w:left w:w="80" w:type="dxa"/>
+              <w:bottom w:w="30" w:type="dxa"/>
+              <w:right w:w="80" w:type="dxa"/>
+            </w:tcMar>
+          </w:tcPr>
+          <w:p>
+            <w:r>
+              <w:rPr>
+                <w:rFonts w:ascii="Aptos" w:eastAsia="Aptos" w:hAnsi="Aptos" w:cs="Aptos"/>
+                <w:sz w:val="20"/>
+                <w:szCs w:val="20"/>
+              </w:rPr>
+              <w:t xml:space="preserve">As a manager, press Create backup without choosing a folder</w:t>
+            </w:r>
+          </w:p>
+        </w:tc>
+        <w:tc>
+          <w:tcPr>
+            <w:tcW w:w="560" w:type="pct"/>
+            <w:tcMar>
+              <w:top w:w="30" w:type="dxa"/>
+              <w:left w:w="80" w:type="dxa"/>
+              <w:bottom w:w="30" w:type="dxa"/>
+              <w:right w:w="80" w:type="dxa"/>
+            </w:tcMar>
+          </w:tcPr>
+          <w:p>
+            <w:r>
+              <w:rPr>
+                <w:rFonts w:ascii="Aptos" w:eastAsia="Aptos" w:hAnsi="Aptos" w:cs="Aptos"/>
+                <w:sz w:val="20"/>
+                <w:szCs w:val="20"/>
+              </w:rPr>
+              <w:t xml:space="preserve">Erroneous</w:t>
+            </w:r>
+          </w:p>
+        </w:tc>
+        <w:tc>
+          <w:tcPr>
+            <w:tcW w:w="2290" w:type="pct"/>
+            <w:tcMar>
+              <w:top w:w="30" w:type="dxa"/>
+              <w:left w:w="80" w:type="dxa"/>
+              <w:bottom w:w="30" w:type="dxa"/>
+              <w:right w:w="80" w:type="dxa"/>
+            </w:tcMar>
+          </w:tcPr>
+          <w:p>
+            <w:r>
+              <w:rPr>
+                <w:rFonts w:ascii="Aptos" w:eastAsia="Aptos" w:hAnsi="Aptos" w:cs="Aptos"/>
+                <w:sz w:val="20"/>
+                <w:szCs w:val="20"/>
+              </w:rPr>
+              <w:t xml:space="preserve">No backup is made and a message appears stating “Please choose a folder first.”.</w:t>
+            </w:r>
+          </w:p>
+        </w:tc>
+      </w:tr>
+      <w:tr>
+        <w:trPr>
+          <w:cantSplit/>
+        </w:trPr>
+        <w:tc>
+          <w:tcPr>
+            <w:tcW w:w="300" w:type="pct"/>
+            <w:tcMar>
+              <w:top w:w="30" w:type="dxa"/>
+              <w:left w:w="80" w:type="dxa"/>
+              <w:bottom w:w="30" w:type="dxa"/>
+              <w:right w:w="80" w:type="dxa"/>
+            </w:tcMar>
+          </w:tcPr>
+          <w:p>
+            <w:r>
+              <w:rPr>
+                <w:rFonts w:ascii="Aptos" w:eastAsia="Aptos" w:hAnsi="Aptos" w:cs="Aptos"/>
+                <w:sz w:val="20"/>
+                <w:szCs w:val="20"/>
+              </w:rPr>
+              <w:t xml:space="preserve">204</w:t>
+            </w:r>
+          </w:p>
+        </w:tc>
+        <w:tc>
+          <w:tcPr>
+            <w:tcW w:w="1850" w:type="pct"/>
+            <w:tcMar>
+              <w:top w:w="30" w:type="dxa"/>
+              <w:left w:w="80" w:type="dxa"/>
+              <w:bottom w:w="30" w:type="dxa"/>
+              <w:right w:w="80" w:type="dxa"/>
+            </w:tcMar>
+          </w:tcPr>
+          <w:p>
+            <w:r>
+              <w:rPr>
+                <w:rFonts w:ascii="Aptos" w:eastAsia="Aptos" w:hAnsi="Aptos" w:cs="Aptos"/>
+                <w:sz w:val="20"/>
+                <w:szCs w:val="20"/>
+              </w:rPr>
+              <w:t xml:space="preserve">As a manager, choose a folder and press Create backup</w:t>
+            </w:r>
+          </w:p>
+        </w:tc>
+        <w:tc>
+          <w:tcPr>
+            <w:tcW w:w="560" w:type="pct"/>
+            <w:tcMar>
+              <w:top w:w="30" w:type="dxa"/>
+              <w:left w:w="80" w:type="dxa"/>
+              <w:bottom w:w="30" w:type="dxa"/>
+              <w:right w:w="80" w:type="dxa"/>
+            </w:tcMar>
+          </w:tcPr>
+          <w:p>
+            <w:r>
+              <w:rPr>
+                <w:rFonts w:ascii="Aptos" w:eastAsia="Aptos" w:hAnsi="Aptos" w:cs="Aptos"/>
+                <w:sz w:val="20"/>
+                <w:szCs w:val="20"/>
+              </w:rPr>
+              <w:t xml:space="preserve">Normal</w:t>
+            </w:r>
+          </w:p>
+        </w:tc>
+        <w:tc>
+          <w:tcPr>
+            <w:tcW w:w="2290" w:type="pct"/>
+            <w:tcMar>
+              <w:top w:w="30" w:type="dxa"/>
+              <w:left w:w="80" w:type="dxa"/>
+              <w:bottom w:w="30" w:type="dxa"/>
+              <w:right w:w="80" w:type="dxa"/>
+            </w:tcMar>
+          </w:tcPr>
+          <w:p>
+            <w:r>
+              <w:rPr>
+                <w:rFonts w:ascii="Aptos" w:eastAsia="Aptos" w:hAnsi="Aptos" w:cs="Aptos"/>
+                <w:sz w:val="20"/>
+                <w:szCs w:val="20"/>
+              </w:rPr>
+              <w:t xml:space="preserve">A copy of the database is written into that folder with the date in its file name, and a message confirms where it was put.</w:t>
+            </w:r>
+          </w:p>
+        </w:tc>
+      </w:tr>
+      <w:tr>
+        <w:trPr>
+          <w:cantSplit/>
+        </w:trPr>
+        <w:tc>
+          <w:tcPr>
+            <w:tcW w:w="300" w:type="pct"/>
+            <w:tcMar>
+              <w:top w:w="30" w:type="dxa"/>
+              <w:left w:w="80" w:type="dxa"/>
+              <w:bottom w:w="30" w:type="dxa"/>
+              <w:right w:w="80" w:type="dxa"/>
+            </w:tcMar>
+          </w:tcPr>
+          <w:p>
+            <w:r>
+              <w:rPr>
+                <w:rFonts w:ascii="Aptos" w:eastAsia="Aptos" w:hAnsi="Aptos" w:cs="Aptos"/>
+                <w:sz w:val="20"/>
+                <w:szCs w:val="20"/>
+              </w:rPr>
+              <w:t xml:space="preserve">205</w:t>
+            </w:r>
+          </w:p>
+        </w:tc>
+        <w:tc>
+          <w:tcPr>
+            <w:tcW w:w="1850" w:type="pct"/>
+            <w:tcMar>
+              <w:top w:w="30" w:type="dxa"/>
+              <w:left w:w="80" w:type="dxa"/>
+              <w:bottom w:w="30" w:type="dxa"/>
+              <w:right w:w="80" w:type="dxa"/>
+            </w:tcMar>
+          </w:tcPr>
+          <w:p>
+            <w:r>
+              <w:rPr>
+                <w:rFonts w:ascii="Aptos" w:eastAsia="Aptos" w:hAnsi="Aptos" w:cs="Aptos"/>
+                <w:sz w:val="20"/>
+                <w:szCs w:val="20"/>
+              </w:rPr>
+              <w:t xml:space="preserve">Open the backup file in Access</w:t>
+            </w:r>
+          </w:p>
+        </w:tc>
+        <w:tc>
+          <w:tcPr>
+            <w:tcW w:w="560" w:type="pct"/>
+            <w:tcMar>
+              <w:top w:w="30" w:type="dxa"/>
+              <w:left w:w="80" w:type="dxa"/>
+              <w:bottom w:w="30" w:type="dxa"/>
+              <w:right w:w="80" w:type="dxa"/>
+            </w:tcMar>
+          </w:tcPr>
+          <w:p>
+            <w:r>
+              <w:rPr>
+                <w:rFonts w:ascii="Aptos" w:eastAsia="Aptos" w:hAnsi="Aptos" w:cs="Aptos"/>
+                <w:sz w:val="20"/>
+                <w:szCs w:val="20"/>
+              </w:rPr>
+              <w:t xml:space="preserve">Normal</w:t>
+            </w:r>
+          </w:p>
+        </w:tc>
+        <w:tc>
+          <w:tcPr>
+            <w:tcW w:w="2290" w:type="pct"/>
+            <w:tcMar>
+              <w:top w:w="30" w:type="dxa"/>
+              <w:left w:w="80" w:type="dxa"/>
+              <w:bottom w:w="30" w:type="dxa"/>
+              <w:right w:w="80" w:type="dxa"/>
+            </w:tcMar>
+          </w:tcPr>
+          <w:p>
+            <w:r>
+              <w:rPr>
+                <w:rFonts w:ascii="Aptos" w:eastAsia="Aptos" w:hAnsi="Aptos" w:cs="Aptos"/>
+                <w:sz w:val="20"/>
+                <w:szCs w:val="20"/>
+              </w:rPr>
+              <w:t xml:space="preserve">It opens as a working copy of the database with all of the tables and the data in them, so it is a real backup rather than an empty file.</w:t>
+            </w:r>
+          </w:p>
+        </w:tc>
+      </w:tr>
+      <w:tr>
+        <w:trPr>
+          <w:cantSplit/>
+        </w:trPr>
+        <w:tc>
+          <w:tcPr>
+            <w:tcW w:w="300" w:type="pct"/>
+            <w:tcMar>
+              <w:top w:w="30" w:type="dxa"/>
+              <w:left w:w="80" w:type="dxa"/>
+              <w:bottom w:w="30" w:type="dxa"/>
+              <w:right w:w="80" w:type="dxa"/>
+            </w:tcMar>
+          </w:tcPr>
+          <w:p>
+            <w:r>
+              <w:rPr>
+                <w:rFonts w:ascii="Aptos" w:eastAsia="Aptos" w:hAnsi="Aptos" w:cs="Aptos"/>
+                <w:sz w:val="20"/>
+                <w:szCs w:val="20"/>
+              </w:rPr>
+              <w:t xml:space="preserve">206</w:t>
+            </w:r>
+          </w:p>
+        </w:tc>
+        <w:tc>
+          <w:tcPr>
+            <w:tcW w:w="1850" w:type="pct"/>
+            <w:tcMar>
+              <w:top w:w="30" w:type="dxa"/>
+              <w:left w:w="80" w:type="dxa"/>
+              <w:bottom w:w="30" w:type="dxa"/>
+              <w:right w:w="80" w:type="dxa"/>
+            </w:tcMar>
+          </w:tcPr>
+          <w:p>
+            <w:r>
+              <w:rPr>
+                <w:rFonts w:ascii="Aptos" w:eastAsia="Aptos" w:hAnsi="Aptos" w:cs="Aptos"/>
+                <w:sz w:val="20"/>
+                <w:szCs w:val="20"/>
+              </w:rPr>
+              <w:t xml:space="preserve">As a manager, choose a folder that has since been deleted and press Create backup</w:t>
+            </w:r>
+          </w:p>
+        </w:tc>
+        <w:tc>
+          <w:tcPr>
+            <w:tcW w:w="560" w:type="pct"/>
+            <w:tcMar>
+              <w:top w:w="30" w:type="dxa"/>
+              <w:left w:w="80" w:type="dxa"/>
+              <w:bottom w:w="30" w:type="dxa"/>
+              <w:right w:w="80" w:type="dxa"/>
+            </w:tcMar>
+          </w:tcPr>
+          <w:p>
+            <w:r>
+              <w:rPr>
+                <w:rFonts w:ascii="Aptos" w:eastAsia="Aptos" w:hAnsi="Aptos" w:cs="Aptos"/>
+                <w:sz w:val="20"/>
+                <w:szCs w:val="20"/>
+              </w:rPr>
+              <w:t xml:space="preserve">Erroneous</w:t>
+            </w:r>
+          </w:p>
+        </w:tc>
+        <w:tc>
+          <w:tcPr>
+            <w:tcW w:w="2290" w:type="pct"/>
+            <w:tcMar>
+              <w:top w:w="30" w:type="dxa"/>
+              <w:left w:w="80" w:type="dxa"/>
+              <w:bottom w:w="30" w:type="dxa"/>
+              <w:right w:w="80" w:type="dxa"/>
+            </w:tcMar>
+          </w:tcPr>
+          <w:p>
+            <w:r>
+              <w:rPr>
+                <w:rFonts w:ascii="Aptos" w:eastAsia="Aptos" w:hAnsi="Aptos" w:cs="Aptos"/>
+                <w:sz w:val="20"/>
+                <w:szCs w:val="20"/>
+              </w:rPr>
+              <w:t xml:space="preserve">No backup is made and a message appears stating “That folder no longer exists.”.</w:t>
+            </w:r>
+          </w:p>
+        </w:tc>
+      </w:tr>
+      <w:tr>
+        <w:trPr>
+          <w:cantSplit/>
+        </w:trPr>
+        <w:tc>
+          <w:tcPr>
+            <w:tcW w:w="300" w:type="pct"/>
+            <w:tcMar>
+              <w:top w:w="30" w:type="dxa"/>
+              <w:left w:w="80" w:type="dxa"/>
+              <w:bottom w:w="30" w:type="dxa"/>
+              <w:right w:w="80" w:type="dxa"/>
+            </w:tcMar>
+          </w:tcPr>
+          <w:p>
+            <w:r>
+              <w:rPr>
+                <w:rFonts w:ascii="Aptos" w:eastAsia="Aptos" w:hAnsi="Aptos" w:cs="Aptos"/>
+                <w:sz w:val="20"/>
+                <w:szCs w:val="20"/>
+              </w:rPr>
+              <w:t xml:space="preserve">207</w:t>
+            </w:r>
+          </w:p>
+        </w:tc>
+        <w:tc>
+          <w:tcPr>
+            <w:tcW w:w="1850" w:type="pct"/>
+            <w:tcMar>
+              <w:top w:w="30" w:type="dxa"/>
+              <w:left w:w="80" w:type="dxa"/>
+              <w:bottom w:w="30" w:type="dxa"/>
+              <w:right w:w="80" w:type="dxa"/>
+            </w:tcMar>
+          </w:tcPr>
+          <w:p>
+            <w:r>
+              <w:rPr>
+                <w:rFonts w:ascii="Aptos" w:eastAsia="Aptos" w:hAnsi="Aptos" w:cs="Aptos"/>
+                <w:sz w:val="20"/>
+                <w:szCs w:val="20"/>
+              </w:rPr>
+              <w:t xml:space="preserve">Log in as a member of staff and look for the backup option</w:t>
+            </w:r>
+          </w:p>
+        </w:tc>
+        <w:tc>
+          <w:tcPr>
+            <w:tcW w:w="560" w:type="pct"/>
+            <w:tcMar>
+              <w:top w:w="30" w:type="dxa"/>
+              <w:left w:w="80" w:type="dxa"/>
+              <w:bottom w:w="30" w:type="dxa"/>
+              <w:right w:w="80" w:type="dxa"/>
+            </w:tcMar>
+          </w:tcPr>
+          <w:p>
+            <w:r>
+              <w:rPr>
+                <w:rFonts w:ascii="Aptos" w:eastAsia="Aptos" w:hAnsi="Aptos" w:cs="Aptos"/>
+                <w:sz w:val="20"/>
+                <w:szCs w:val="20"/>
+              </w:rPr>
+              <w:t xml:space="preserve">Erroneous</w:t>
+            </w:r>
+          </w:p>
+        </w:tc>
+        <w:tc>
+          <w:tcPr>
+            <w:tcW w:w="2290" w:type="pct"/>
+            <w:tcMar>
+              <w:top w:w="30" w:type="dxa"/>
+              <w:left w:w="80" w:type="dxa"/>
+              <w:bottom w:w="30" w:type="dxa"/>
+              <w:right w:w="80" w:type="dxa"/>
+            </w:tcMar>
+          </w:tcPr>
+          <w:p>
+            <w:r>
+              <w:rPr>
+                <w:rFonts w:ascii="Aptos" w:eastAsia="Aptos" w:hAnsi="Aptos" w:cs="Aptos"/>
+                <w:sz w:val="20"/>
+                <w:szCs w:val="20"/>
+              </w:rPr>
+              <w:t xml:space="preserve">It is not available, so a member of staff cannot take a copy of the whole database away with them.</w:t>
             </w:r>
           </w:p>
         </w:tc>

</xml_diff>

<commit_message>
added objective 37: recording who took a sale
</commit_message>
<xml_diff>
--- a/Testing.docx
+++ b/Testing.docx
@@ -22828,6 +22828,607 @@
                 <w:szCs w:val="20"/>
               </w:rPr>
               <w:t xml:space="preserve">It is not available, so a member of staff cannot take a copy of the whole database away with them.</w:t>
+            </w:r>
+          </w:p>
+        </w:tc>
+      </w:tr>
+    </w:tbl>
+    <w:p>
+      <w:r>
+        <w:rPr>
+          <w:rFonts w:ascii="Aptos" w:eastAsia="Aptos" w:hAnsi="Aptos" w:cs="Aptos"/>
+        </w:rPr>
+        <w:t xml:space="preserve"/>
+      </w:r>
+    </w:p>
+    <w:p>
+      <w:pPr>
+        <w:pStyle w:val="Heading3"/>
+      </w:pPr>
+      <w:r>
+        <w:rPr>
+          <w:rFonts w:ascii="Aptos Display" w:eastAsia="Aptos Display" w:hAnsi="Aptos Display" w:cs="Aptos Display"/>
+          <w:b/>
+          <w:bCs/>
+          <w:color w:val="000000"/>
+        </w:rPr>
+        <w:t xml:space="preserve">Objective 37: Recording Who Took a Sale</w:t>
+      </w:r>
+    </w:p>
+    <w:p>
+      <w:r>
+        <w:rPr>
+          <w:rFonts w:ascii="Aptos" w:eastAsia="Aptos" w:hAnsi="Aptos" w:cs="Aptos"/>
+        </w:rPr>
+        <w:t xml:space="preserve">These tests check that every sale is recorded against the account that took it, and that a user can see their own activity but not anybody else's.</w:t>
+      </w:r>
+    </w:p>
+    <w:tbl>
+      <w:tblPr>
+        <w:tblW w:w="5000" w:type="pct"/>
+        <w:tblBorders>
+          <w:top w:val="single" w:sz="4" w:space="0" w:color="808080"/>
+          <w:left w:val="single" w:sz="4" w:space="0" w:color="808080"/>
+          <w:bottom w:val="single" w:sz="4" w:space="0" w:color="808080"/>
+          <w:right w:val="single" w:sz="4" w:space="0" w:color="808080"/>
+          <w:insideH w:val="single" w:sz="4" w:space="0" w:color="808080"/>
+          <w:insideV w:val="single" w:sz="4" w:space="0" w:color="808080"/>
+        </w:tblBorders>
+        <w:tblCellMar>
+          <w:left w:w="10" w:type="dxa"/>
+          <w:right w:w="10" w:type="dxa"/>
+        </w:tblCellMar>
+        <w:tblLook w:val="0000" w:firstRow="0" w:lastRow="0" w:firstColumn="0" w:lastColumn="0" w:noHBand="0" w:noVBand="0"/>
+      </w:tblPr>
+      <w:tblGrid>
+        <w:gridCol w:w="561"/>
+        <w:gridCol w:w="3460"/>
+        <w:gridCol w:w="1047"/>
+        <w:gridCol w:w="4282"/>
+      </w:tblGrid>
+      <w:tr>
+        <w:trPr>
+          <w:cantSplit/>
+          <w:tblHeader/>
+        </w:trPr>
+        <w:tc>
+          <w:tcPr>
+            <w:tcW w:w="300" w:type="pct"/>
+            <w:shd w:val="clear" w:color="auto" w:fill="F2CEED" w:themeFill="accent5" w:themeFillTint="33"/>
+            <w:tcMar>
+              <w:top w:w="30" w:type="dxa"/>
+              <w:left w:w="80" w:type="dxa"/>
+              <w:bottom w:w="30" w:type="dxa"/>
+              <w:right w:w="80" w:type="dxa"/>
+            </w:tcMar>
+          </w:tcPr>
+          <w:p>
+            <w:r>
+              <w:rPr>
+                <w:rFonts w:ascii="Aptos" w:eastAsia="Aptos" w:hAnsi="Aptos" w:cs="Aptos"/>
+                <w:b/>
+                <w:bCs/>
+                <w:sz w:val="20"/>
+                <w:szCs w:val="20"/>
+              </w:rPr>
+              <w:t xml:space="preserve">No.</w:t>
+            </w:r>
+          </w:p>
+        </w:tc>
+        <w:tc>
+          <w:tcPr>
+            <w:tcW w:w="1850" w:type="pct"/>
+            <w:shd w:val="clear" w:color="auto" w:fill="F2CEED" w:themeFill="accent5" w:themeFillTint="33"/>
+            <w:tcMar>
+              <w:top w:w="30" w:type="dxa"/>
+              <w:left w:w="80" w:type="dxa"/>
+              <w:bottom w:w="30" w:type="dxa"/>
+              <w:right w:w="80" w:type="dxa"/>
+            </w:tcMar>
+          </w:tcPr>
+          <w:p>
+            <w:r>
+              <w:rPr>
+                <w:rFonts w:ascii="Aptos" w:eastAsia="Aptos" w:hAnsi="Aptos" w:cs="Aptos"/>
+                <w:b/>
+                <w:bCs/>
+                <w:sz w:val="20"/>
+                <w:szCs w:val="20"/>
+              </w:rPr>
+              <w:t xml:space="preserve">Test</w:t>
+            </w:r>
+          </w:p>
+        </w:tc>
+        <w:tc>
+          <w:tcPr>
+            <w:tcW w:w="560" w:type="pct"/>
+            <w:shd w:val="clear" w:color="auto" w:fill="F2CEED" w:themeFill="accent5" w:themeFillTint="33"/>
+            <w:tcMar>
+              <w:top w:w="30" w:type="dxa"/>
+              <w:left w:w="80" w:type="dxa"/>
+              <w:bottom w:w="30" w:type="dxa"/>
+              <w:right w:w="80" w:type="dxa"/>
+            </w:tcMar>
+          </w:tcPr>
+          <w:p>
+            <w:r>
+              <w:rPr>
+                <w:rFonts w:ascii="Aptos" w:eastAsia="Aptos" w:hAnsi="Aptos" w:cs="Aptos"/>
+                <w:b/>
+                <w:bCs/>
+                <w:sz w:val="20"/>
+                <w:szCs w:val="20"/>
+              </w:rPr>
+              <w:t xml:space="preserve">Type</w:t>
+            </w:r>
+          </w:p>
+        </w:tc>
+        <w:tc>
+          <w:tcPr>
+            <w:tcW w:w="2290" w:type="pct"/>
+            <w:shd w:val="clear" w:color="auto" w:fill="F2CEED" w:themeFill="accent5" w:themeFillTint="33"/>
+            <w:tcMar>
+              <w:top w:w="30" w:type="dxa"/>
+              <w:left w:w="80" w:type="dxa"/>
+              <w:bottom w:w="30" w:type="dxa"/>
+              <w:right w:w="80" w:type="dxa"/>
+            </w:tcMar>
+          </w:tcPr>
+          <w:p>
+            <w:r>
+              <w:rPr>
+                <w:rFonts w:ascii="Aptos" w:eastAsia="Aptos" w:hAnsi="Aptos" w:cs="Aptos"/>
+                <w:b/>
+                <w:bCs/>
+                <w:sz w:val="20"/>
+                <w:szCs w:val="20"/>
+              </w:rPr>
+              <w:t xml:space="preserve">Expected Result</w:t>
+            </w:r>
+          </w:p>
+        </w:tc>
+      </w:tr>
+      <w:tr>
+        <w:trPr>
+          <w:cantSplit/>
+        </w:trPr>
+        <w:tc>
+          <w:tcPr>
+            <w:tcW w:w="300" w:type="pct"/>
+            <w:tcMar>
+              <w:top w:w="30" w:type="dxa"/>
+              <w:left w:w="80" w:type="dxa"/>
+              <w:bottom w:w="30" w:type="dxa"/>
+              <w:right w:w="80" w:type="dxa"/>
+            </w:tcMar>
+          </w:tcPr>
+          <w:p>
+            <w:r>
+              <w:rPr>
+                <w:rFonts w:ascii="Aptos" w:eastAsia="Aptos" w:hAnsi="Aptos" w:cs="Aptos"/>
+                <w:sz w:val="20"/>
+                <w:szCs w:val="20"/>
+              </w:rPr>
+              <w:t xml:space="preserve">208</w:t>
+            </w:r>
+          </w:p>
+        </w:tc>
+        <w:tc>
+          <w:tcPr>
+            <w:tcW w:w="1850" w:type="pct"/>
+            <w:tcMar>
+              <w:top w:w="30" w:type="dxa"/>
+              <w:left w:w="80" w:type="dxa"/>
+              <w:bottom w:w="30" w:type="dxa"/>
+              <w:right w:w="80" w:type="dxa"/>
+            </w:tcMar>
+          </w:tcPr>
+          <w:p>
+            <w:r>
+              <w:rPr>
+                <w:rFonts w:ascii="Aptos" w:eastAsia="Aptos" w:hAnsi="Aptos" w:cs="Aptos"/>
+                <w:sz w:val="20"/>
+                <w:szCs w:val="20"/>
+              </w:rPr>
+              <w:t xml:space="preserve">Log in as a member of staff, take a sale, and look at that booking in tblBooking</w:t>
+            </w:r>
+          </w:p>
+        </w:tc>
+        <w:tc>
+          <w:tcPr>
+            <w:tcW w:w="560" w:type="pct"/>
+            <w:tcMar>
+              <w:top w:w="30" w:type="dxa"/>
+              <w:left w:w="80" w:type="dxa"/>
+              <w:bottom w:w="30" w:type="dxa"/>
+              <w:right w:w="80" w:type="dxa"/>
+            </w:tcMar>
+          </w:tcPr>
+          <w:p>
+            <w:r>
+              <w:rPr>
+                <w:rFonts w:ascii="Aptos" w:eastAsia="Aptos" w:hAnsi="Aptos" w:cs="Aptos"/>
+                <w:sz w:val="20"/>
+                <w:szCs w:val="20"/>
+              </w:rPr>
+              <w:t xml:space="preserve">Normal</w:t>
+            </w:r>
+          </w:p>
+        </w:tc>
+        <w:tc>
+          <w:tcPr>
+            <w:tcW w:w="2290" w:type="pct"/>
+            <w:tcMar>
+              <w:top w:w="30" w:type="dxa"/>
+              <w:left w:w="80" w:type="dxa"/>
+              <w:bottom w:w="30" w:type="dxa"/>
+              <w:right w:w="80" w:type="dxa"/>
+            </w:tcMar>
+          </w:tcPr>
+          <w:p>
+            <w:r>
+              <w:rPr>
+                <w:rFonts w:ascii="Aptos" w:eastAsia="Aptos" w:hAnsi="Aptos" w:cs="Aptos"/>
+                <w:sz w:val="20"/>
+                <w:szCs w:val="20"/>
+              </w:rPr>
+              <w:t xml:space="preserve">The booking carries the LoginID of the member of staff who took it.</w:t>
+            </w:r>
+          </w:p>
+        </w:tc>
+      </w:tr>
+      <w:tr>
+        <w:trPr>
+          <w:cantSplit/>
+        </w:trPr>
+        <w:tc>
+          <w:tcPr>
+            <w:tcW w:w="300" w:type="pct"/>
+            <w:tcMar>
+              <w:top w:w="30" w:type="dxa"/>
+              <w:left w:w="80" w:type="dxa"/>
+              <w:bottom w:w="30" w:type="dxa"/>
+              <w:right w:w="80" w:type="dxa"/>
+            </w:tcMar>
+          </w:tcPr>
+          <w:p>
+            <w:r>
+              <w:rPr>
+                <w:rFonts w:ascii="Aptos" w:eastAsia="Aptos" w:hAnsi="Aptos" w:cs="Aptos"/>
+                <w:sz w:val="20"/>
+                <w:szCs w:val="20"/>
+              </w:rPr>
+              <w:t xml:space="preserve">209</w:t>
+            </w:r>
+          </w:p>
+        </w:tc>
+        <w:tc>
+          <w:tcPr>
+            <w:tcW w:w="1850" w:type="pct"/>
+            <w:tcMar>
+              <w:top w:w="30" w:type="dxa"/>
+              <w:left w:w="80" w:type="dxa"/>
+              <w:bottom w:w="30" w:type="dxa"/>
+              <w:right w:w="80" w:type="dxa"/>
+            </w:tcMar>
+          </w:tcPr>
+          <w:p>
+            <w:r>
+              <w:rPr>
+                <w:rFonts w:ascii="Aptos" w:eastAsia="Aptos" w:hAnsi="Aptos" w:cs="Aptos"/>
+                <w:sz w:val="20"/>
+                <w:szCs w:val="20"/>
+              </w:rPr>
+              <w:t xml:space="preserve">Open My Account as that member of staff and look at the sales section</w:t>
+            </w:r>
+          </w:p>
+        </w:tc>
+        <w:tc>
+          <w:tcPr>
+            <w:tcW w:w="560" w:type="pct"/>
+            <w:tcMar>
+              <w:top w:w="30" w:type="dxa"/>
+              <w:left w:w="80" w:type="dxa"/>
+              <w:bottom w:w="30" w:type="dxa"/>
+              <w:right w:w="80" w:type="dxa"/>
+            </w:tcMar>
+          </w:tcPr>
+          <w:p>
+            <w:r>
+              <w:rPr>
+                <w:rFonts w:ascii="Aptos" w:eastAsia="Aptos" w:hAnsi="Aptos" w:cs="Aptos"/>
+                <w:sz w:val="20"/>
+                <w:szCs w:val="20"/>
+              </w:rPr>
+              <w:t xml:space="preserve">Normal</w:t>
+            </w:r>
+          </w:p>
+        </w:tc>
+        <w:tc>
+          <w:tcPr>
+            <w:tcW w:w="2290" w:type="pct"/>
+            <w:tcMar>
+              <w:top w:w="30" w:type="dxa"/>
+              <w:left w:w="80" w:type="dxa"/>
+              <w:bottom w:w="30" w:type="dxa"/>
+              <w:right w:w="80" w:type="dxa"/>
+            </w:tcMar>
+          </w:tcPr>
+          <w:p>
+            <w:r>
+              <w:rPr>
+                <w:rFonts w:ascii="Aptos" w:eastAsia="Aptos" w:hAnsi="Aptos" w:cs="Aptos"/>
+                <w:sz w:val="20"/>
+                <w:szCs w:val="20"/>
+              </w:rPr>
+              <w:t xml:space="preserve">The sale just taken is listed there, with what it was worth.</w:t>
+            </w:r>
+          </w:p>
+        </w:tc>
+      </w:tr>
+      <w:tr>
+        <w:trPr>
+          <w:cantSplit/>
+        </w:trPr>
+        <w:tc>
+          <w:tcPr>
+            <w:tcW w:w="300" w:type="pct"/>
+            <w:tcMar>
+              <w:top w:w="30" w:type="dxa"/>
+              <w:left w:w="80" w:type="dxa"/>
+              <w:bottom w:w="30" w:type="dxa"/>
+              <w:right w:w="80" w:type="dxa"/>
+            </w:tcMar>
+          </w:tcPr>
+          <w:p>
+            <w:r>
+              <w:rPr>
+                <w:rFonts w:ascii="Aptos" w:eastAsia="Aptos" w:hAnsi="Aptos" w:cs="Aptos"/>
+                <w:sz w:val="20"/>
+                <w:szCs w:val="20"/>
+              </w:rPr>
+              <w:t xml:space="preserve">210</w:t>
+            </w:r>
+          </w:p>
+        </w:tc>
+        <w:tc>
+          <w:tcPr>
+            <w:tcW w:w="1850" w:type="pct"/>
+            <w:tcMar>
+              <w:top w:w="30" w:type="dxa"/>
+              <w:left w:w="80" w:type="dxa"/>
+              <w:bottom w:w="30" w:type="dxa"/>
+              <w:right w:w="80" w:type="dxa"/>
+            </w:tcMar>
+          </w:tcPr>
+          <w:p>
+            <w:r>
+              <w:rPr>
+                <w:rFonts w:ascii="Aptos" w:eastAsia="Aptos" w:hAnsi="Aptos" w:cs="Aptos"/>
+                <w:sz w:val="20"/>
+                <w:szCs w:val="20"/>
+              </w:rPr>
+              <w:t xml:space="preserve">Log in as a different user and open My Account</w:t>
+            </w:r>
+          </w:p>
+        </w:tc>
+        <w:tc>
+          <w:tcPr>
+            <w:tcW w:w="560" w:type="pct"/>
+            <w:tcMar>
+              <w:top w:w="30" w:type="dxa"/>
+              <w:left w:w="80" w:type="dxa"/>
+              <w:bottom w:w="30" w:type="dxa"/>
+              <w:right w:w="80" w:type="dxa"/>
+            </w:tcMar>
+          </w:tcPr>
+          <w:p>
+            <w:r>
+              <w:rPr>
+                <w:rFonts w:ascii="Aptos" w:eastAsia="Aptos" w:hAnsi="Aptos" w:cs="Aptos"/>
+                <w:sz w:val="20"/>
+                <w:szCs w:val="20"/>
+              </w:rPr>
+              <w:t xml:space="preserve">Normal</w:t>
+            </w:r>
+          </w:p>
+        </w:tc>
+        <w:tc>
+          <w:tcPr>
+            <w:tcW w:w="2290" w:type="pct"/>
+            <w:tcMar>
+              <w:top w:w="30" w:type="dxa"/>
+              <w:left w:w="80" w:type="dxa"/>
+              <w:bottom w:w="30" w:type="dxa"/>
+              <w:right w:w="80" w:type="dxa"/>
+            </w:tcMar>
+          </w:tcPr>
+          <w:p>
+            <w:r>
+              <w:rPr>
+                <w:rFonts w:ascii="Aptos" w:eastAsia="Aptos" w:hAnsi="Aptos" w:cs="Aptos"/>
+                <w:sz w:val="20"/>
+                <w:szCs w:val="20"/>
+              </w:rPr>
+              <w:t xml:space="preserve">Only that user's own sales and own activity are listed, and there is no way from that screen to see anybody else's.</w:t>
+            </w:r>
+          </w:p>
+        </w:tc>
+      </w:tr>
+      <w:tr>
+        <w:trPr>
+          <w:cantSplit/>
+        </w:trPr>
+        <w:tc>
+          <w:tcPr>
+            <w:tcW w:w="300" w:type="pct"/>
+            <w:tcMar>
+              <w:top w:w="30" w:type="dxa"/>
+              <w:left w:w="80" w:type="dxa"/>
+              <w:bottom w:w="30" w:type="dxa"/>
+              <w:right w:w="80" w:type="dxa"/>
+            </w:tcMar>
+          </w:tcPr>
+          <w:p>
+            <w:r>
+              <w:rPr>
+                <w:rFonts w:ascii="Aptos" w:eastAsia="Aptos" w:hAnsi="Aptos" w:cs="Aptos"/>
+                <w:sz w:val="20"/>
+                <w:szCs w:val="20"/>
+              </w:rPr>
+              <w:t xml:space="preserve">211</w:t>
+            </w:r>
+          </w:p>
+        </w:tc>
+        <w:tc>
+          <w:tcPr>
+            <w:tcW w:w="1850" w:type="pct"/>
+            <w:tcMar>
+              <w:top w:w="30" w:type="dxa"/>
+              <w:left w:w="80" w:type="dxa"/>
+              <w:bottom w:w="30" w:type="dxa"/>
+              <w:right w:w="80" w:type="dxa"/>
+            </w:tcMar>
+          </w:tcPr>
+          <w:p>
+            <w:r>
+              <w:rPr>
+                <w:rFonts w:ascii="Aptos" w:eastAsia="Aptos" w:hAnsi="Aptos" w:cs="Aptos"/>
+                <w:sz w:val="20"/>
+                <w:szCs w:val="20"/>
+              </w:rPr>
+              <w:t xml:space="preserve">As a manager, run the sales report with the type set to By staff member</w:t>
+            </w:r>
+          </w:p>
+        </w:tc>
+        <w:tc>
+          <w:tcPr>
+            <w:tcW w:w="560" w:type="pct"/>
+            <w:tcMar>
+              <w:top w:w="30" w:type="dxa"/>
+              <w:left w:w="80" w:type="dxa"/>
+              <w:bottom w:w="30" w:type="dxa"/>
+              <w:right w:w="80" w:type="dxa"/>
+            </w:tcMar>
+          </w:tcPr>
+          <w:p>
+            <w:r>
+              <w:rPr>
+                <w:rFonts w:ascii="Aptos" w:eastAsia="Aptos" w:hAnsi="Aptos" w:cs="Aptos"/>
+                <w:sz w:val="20"/>
+                <w:szCs w:val="20"/>
+              </w:rPr>
+              <w:t xml:space="preserve">Normal</w:t>
+            </w:r>
+          </w:p>
+        </w:tc>
+        <w:tc>
+          <w:tcPr>
+            <w:tcW w:w="2290" w:type="pct"/>
+            <w:tcMar>
+              <w:top w:w="30" w:type="dxa"/>
+              <w:left w:w="80" w:type="dxa"/>
+              <w:bottom w:w="30" w:type="dxa"/>
+              <w:right w:w="80" w:type="dxa"/>
+            </w:tcMar>
+          </w:tcPr>
+          <w:p>
+            <w:r>
+              <w:rPr>
+                <w:rFonts w:ascii="Aptos" w:eastAsia="Aptos" w:hAnsi="Aptos" w:cs="Aptos"/>
+                <w:sz w:val="20"/>
+                <w:szCs w:val="20"/>
+              </w:rPr>
+              <w:t xml:space="preserve">Each account appears with the tickets and takings it took, so the manager can see everybody's figures while a member of staff can only see their own.</w:t>
+            </w:r>
+          </w:p>
+        </w:tc>
+      </w:tr>
+      <w:tr>
+        <w:trPr>
+          <w:cantSplit/>
+        </w:trPr>
+        <w:tc>
+          <w:tcPr>
+            <w:tcW w:w="300" w:type="pct"/>
+            <w:tcMar>
+              <w:top w:w="30" w:type="dxa"/>
+              <w:left w:w="80" w:type="dxa"/>
+              <w:bottom w:w="30" w:type="dxa"/>
+              <w:right w:w="80" w:type="dxa"/>
+            </w:tcMar>
+          </w:tcPr>
+          <w:p>
+            <w:r>
+              <w:rPr>
+                <w:rFonts w:ascii="Aptos" w:eastAsia="Aptos" w:hAnsi="Aptos" w:cs="Aptos"/>
+                <w:sz w:val="20"/>
+                <w:szCs w:val="20"/>
+              </w:rPr>
+              <w:t xml:space="preserve">212</w:t>
+            </w:r>
+          </w:p>
+        </w:tc>
+        <w:tc>
+          <w:tcPr>
+            <w:tcW w:w="1850" w:type="pct"/>
+            <w:tcMar>
+              <w:top w:w="30" w:type="dxa"/>
+              <w:left w:w="80" w:type="dxa"/>
+              <w:bottom w:w="30" w:type="dxa"/>
+              <w:right w:w="80" w:type="dxa"/>
+            </w:tcMar>
+          </w:tcPr>
+          <w:p>
+            <w:r>
+              <w:rPr>
+                <w:rFonts w:ascii="Aptos" w:eastAsia="Aptos" w:hAnsi="Aptos" w:cs="Aptos"/>
+                <w:sz w:val="20"/>
+                <w:szCs w:val="20"/>
+              </w:rPr>
+              <w:t xml:space="preserve">Press Export on the My Account activity list</w:t>
+            </w:r>
+          </w:p>
+        </w:tc>
+        <w:tc>
+          <w:tcPr>
+            <w:tcW w:w="560" w:type="pct"/>
+            <w:tcMar>
+              <w:top w:w="30" w:type="dxa"/>
+              <w:left w:w="80" w:type="dxa"/>
+              <w:bottom w:w="30" w:type="dxa"/>
+              <w:right w:w="80" w:type="dxa"/>
+            </w:tcMar>
+          </w:tcPr>
+          <w:p>
+            <w:r>
+              <w:rPr>
+                <w:rFonts w:ascii="Aptos" w:eastAsia="Aptos" w:hAnsi="Aptos" w:cs="Aptos"/>
+                <w:sz w:val="20"/>
+                <w:szCs w:val="20"/>
+              </w:rPr>
+              <w:t xml:space="preserve">Normal</w:t>
+            </w:r>
+          </w:p>
+        </w:tc>
+        <w:tc>
+          <w:tcPr>
+            <w:tcW w:w="2290" w:type="pct"/>
+            <w:tcMar>
+              <w:top w:w="30" w:type="dxa"/>
+              <w:left w:w="80" w:type="dxa"/>
+              <w:bottom w:w="30" w:type="dxa"/>
+              <w:right w:w="80" w:type="dxa"/>
+            </w:tcMar>
+          </w:tcPr>
+          <w:p>
+            <w:r>
+              <w:rPr>
+                <w:rFonts w:ascii="Aptos" w:eastAsia="Aptos" w:hAnsi="Aptos" w:cs="Aptos"/>
+                <w:sz w:val="20"/>
+                <w:szCs w:val="20"/>
+              </w:rPr>
+              <w:t xml:space="preserve">A CSV file of that user's own activity is created and a message confirms it.</w:t>
             </w:r>
           </w:p>
         </w:tc>

</xml_diff>

<commit_message>
added objectives 4 and 38: the customer kiosk
</commit_message>
<xml_diff>
--- a/Testing.docx
+++ b/Testing.docx
@@ -23429,6 +23429,874 @@
                 <w:szCs w:val="20"/>
               </w:rPr>
               <w:t xml:space="preserve">A CSV file of that user's own activity is created and a message confirms it.</w:t>
+            </w:r>
+          </w:p>
+        </w:tc>
+      </w:tr>
+    </w:tbl>
+    <w:p>
+      <w:r>
+        <w:rPr>
+          <w:rFonts w:ascii="Aptos" w:eastAsia="Aptos" w:hAnsi="Aptos" w:cs="Aptos"/>
+        </w:rPr>
+        <w:t xml:space="preserve"/>
+      </w:r>
+    </w:p>
+    <w:p>
+      <w:pPr>
+        <w:pStyle w:val="Heading3"/>
+      </w:pPr>
+      <w:r>
+        <w:rPr>
+          <w:rFonts w:ascii="Aptos Display" w:eastAsia="Aptos Display" w:hAnsi="Aptos Display" w:cs="Aptos Display"/>
+          <w:b/>
+          <w:bCs/>
+          <w:color w:val="000000"/>
+        </w:rPr>
+        <w:t xml:space="preserve">Objectives 4 and 38: The Customer Kiosk</w:t>
+      </w:r>
+    </w:p>
+    <w:p>
+      <w:r>
+        <w:rPr>
+          <w:rFonts w:ascii="Aptos" w:eastAsia="Aptos" w:hAnsi="Aptos" w:cs="Aptos"/>
+        </w:rPr>
+        <w:t xml:space="preserve">The kiosk is the customer facing side of the system and is entirely post-prototype work. Objective 4 covers a customer being able to buy a ticket without help, and objective 38 covers the kiosk not being a way into the rest of the system. The two are tested together because they are the same screen.</w:t>
+      </w:r>
+    </w:p>
+    <w:tbl>
+      <w:tblPr>
+        <w:tblW w:w="5000" w:type="pct"/>
+        <w:tblBorders>
+          <w:top w:val="single" w:sz="4" w:space="0" w:color="808080"/>
+          <w:left w:val="single" w:sz="4" w:space="0" w:color="808080"/>
+          <w:bottom w:val="single" w:sz="4" w:space="0" w:color="808080"/>
+          <w:right w:val="single" w:sz="4" w:space="0" w:color="808080"/>
+          <w:insideH w:val="single" w:sz="4" w:space="0" w:color="808080"/>
+          <w:insideV w:val="single" w:sz="4" w:space="0" w:color="808080"/>
+        </w:tblBorders>
+        <w:tblCellMar>
+          <w:left w:w="10" w:type="dxa"/>
+          <w:right w:w="10" w:type="dxa"/>
+        </w:tblCellMar>
+        <w:tblLook w:val="0000" w:firstRow="0" w:lastRow="0" w:firstColumn="0" w:lastColumn="0" w:noHBand="0" w:noVBand="0"/>
+      </w:tblPr>
+      <w:tblGrid>
+        <w:gridCol w:w="561"/>
+        <w:gridCol w:w="3460"/>
+        <w:gridCol w:w="1047"/>
+        <w:gridCol w:w="4282"/>
+      </w:tblGrid>
+      <w:tr>
+        <w:trPr>
+          <w:cantSplit/>
+          <w:tblHeader/>
+        </w:trPr>
+        <w:tc>
+          <w:tcPr>
+            <w:tcW w:w="300" w:type="pct"/>
+            <w:shd w:val="clear" w:color="auto" w:fill="F2CEED" w:themeFill="accent5" w:themeFillTint="33"/>
+            <w:tcMar>
+              <w:top w:w="30" w:type="dxa"/>
+              <w:left w:w="80" w:type="dxa"/>
+              <w:bottom w:w="30" w:type="dxa"/>
+              <w:right w:w="80" w:type="dxa"/>
+            </w:tcMar>
+          </w:tcPr>
+          <w:p>
+            <w:r>
+              <w:rPr>
+                <w:rFonts w:ascii="Aptos" w:eastAsia="Aptos" w:hAnsi="Aptos" w:cs="Aptos"/>
+                <w:b/>
+                <w:bCs/>
+                <w:sz w:val="20"/>
+                <w:szCs w:val="20"/>
+              </w:rPr>
+              <w:t xml:space="preserve">No.</w:t>
+            </w:r>
+          </w:p>
+        </w:tc>
+        <w:tc>
+          <w:tcPr>
+            <w:tcW w:w="1850" w:type="pct"/>
+            <w:shd w:val="clear" w:color="auto" w:fill="F2CEED" w:themeFill="accent5" w:themeFillTint="33"/>
+            <w:tcMar>
+              <w:top w:w="30" w:type="dxa"/>
+              <w:left w:w="80" w:type="dxa"/>
+              <w:bottom w:w="30" w:type="dxa"/>
+              <w:right w:w="80" w:type="dxa"/>
+            </w:tcMar>
+          </w:tcPr>
+          <w:p>
+            <w:r>
+              <w:rPr>
+                <w:rFonts w:ascii="Aptos" w:eastAsia="Aptos" w:hAnsi="Aptos" w:cs="Aptos"/>
+                <w:b/>
+                <w:bCs/>
+                <w:sz w:val="20"/>
+                <w:szCs w:val="20"/>
+              </w:rPr>
+              <w:t xml:space="preserve">Test</w:t>
+            </w:r>
+          </w:p>
+        </w:tc>
+        <w:tc>
+          <w:tcPr>
+            <w:tcW w:w="560" w:type="pct"/>
+            <w:shd w:val="clear" w:color="auto" w:fill="F2CEED" w:themeFill="accent5" w:themeFillTint="33"/>
+            <w:tcMar>
+              <w:top w:w="30" w:type="dxa"/>
+              <w:left w:w="80" w:type="dxa"/>
+              <w:bottom w:w="30" w:type="dxa"/>
+              <w:right w:w="80" w:type="dxa"/>
+            </w:tcMar>
+          </w:tcPr>
+          <w:p>
+            <w:r>
+              <w:rPr>
+                <w:rFonts w:ascii="Aptos" w:eastAsia="Aptos" w:hAnsi="Aptos" w:cs="Aptos"/>
+                <w:b/>
+                <w:bCs/>
+                <w:sz w:val="20"/>
+                <w:szCs w:val="20"/>
+              </w:rPr>
+              <w:t xml:space="preserve">Type</w:t>
+            </w:r>
+          </w:p>
+        </w:tc>
+        <w:tc>
+          <w:tcPr>
+            <w:tcW w:w="2290" w:type="pct"/>
+            <w:shd w:val="clear" w:color="auto" w:fill="F2CEED" w:themeFill="accent5" w:themeFillTint="33"/>
+            <w:tcMar>
+              <w:top w:w="30" w:type="dxa"/>
+              <w:left w:w="80" w:type="dxa"/>
+              <w:bottom w:w="30" w:type="dxa"/>
+              <w:right w:w="80" w:type="dxa"/>
+            </w:tcMar>
+          </w:tcPr>
+          <w:p>
+            <w:r>
+              <w:rPr>
+                <w:rFonts w:ascii="Aptos" w:eastAsia="Aptos" w:hAnsi="Aptos" w:cs="Aptos"/>
+                <w:b/>
+                <w:bCs/>
+                <w:sz w:val="20"/>
+                <w:szCs w:val="20"/>
+              </w:rPr>
+              <w:t xml:space="preserve">Expected Result</w:t>
+            </w:r>
+          </w:p>
+        </w:tc>
+      </w:tr>
+      <w:tr>
+        <w:trPr>
+          <w:cantSplit/>
+        </w:trPr>
+        <w:tc>
+          <w:tcPr>
+            <w:tcW w:w="300" w:type="pct"/>
+            <w:tcMar>
+              <w:top w:w="30" w:type="dxa"/>
+              <w:left w:w="80" w:type="dxa"/>
+              <w:bottom w:w="30" w:type="dxa"/>
+              <w:right w:w="80" w:type="dxa"/>
+            </w:tcMar>
+          </w:tcPr>
+          <w:p>
+            <w:r>
+              <w:rPr>
+                <w:rFonts w:ascii="Aptos" w:eastAsia="Aptos" w:hAnsi="Aptos" w:cs="Aptos"/>
+                <w:sz w:val="20"/>
+                <w:szCs w:val="20"/>
+              </w:rPr>
+              <w:t xml:space="preserve">213</w:t>
+            </w:r>
+          </w:p>
+        </w:tc>
+        <w:tc>
+          <w:tcPr>
+            <w:tcW w:w="1850" w:type="pct"/>
+            <w:tcMar>
+              <w:top w:w="30" w:type="dxa"/>
+              <w:left w:w="80" w:type="dxa"/>
+              <w:bottom w:w="30" w:type="dxa"/>
+              <w:right w:w="80" w:type="dxa"/>
+            </w:tcMar>
+          </w:tcPr>
+          <w:p>
+            <w:r>
+              <w:rPr>
+                <w:rFonts w:ascii="Aptos" w:eastAsia="Aptos" w:hAnsi="Aptos" w:cs="Aptos"/>
+                <w:sz w:val="20"/>
+                <w:szCs w:val="20"/>
+              </w:rPr>
+              <w:t xml:space="preserve">Put the machine into kiosk mode and confirm</w:t>
+            </w:r>
+          </w:p>
+        </w:tc>
+        <w:tc>
+          <w:tcPr>
+            <w:tcW w:w="560" w:type="pct"/>
+            <w:tcMar>
+              <w:top w:w="30" w:type="dxa"/>
+              <w:left w:w="80" w:type="dxa"/>
+              <w:bottom w:w="30" w:type="dxa"/>
+              <w:right w:w="80" w:type="dxa"/>
+            </w:tcMar>
+          </w:tcPr>
+          <w:p>
+            <w:r>
+              <w:rPr>
+                <w:rFonts w:ascii="Aptos" w:eastAsia="Aptos" w:hAnsi="Aptos" w:cs="Aptos"/>
+                <w:sz w:val="20"/>
+                <w:szCs w:val="20"/>
+              </w:rPr>
+              <w:t xml:space="preserve">Normal</w:t>
+            </w:r>
+          </w:p>
+        </w:tc>
+        <w:tc>
+          <w:tcPr>
+            <w:tcW w:w="2290" w:type="pct"/>
+            <w:tcMar>
+              <w:top w:w="30" w:type="dxa"/>
+              <w:left w:w="80" w:type="dxa"/>
+              <w:bottom w:w="30" w:type="dxa"/>
+              <w:right w:w="80" w:type="dxa"/>
+            </w:tcMar>
+          </w:tcPr>
+          <w:p>
+            <w:r>
+              <w:rPr>
+                <w:rFonts w:ascii="Aptos" w:eastAsia="Aptos" w:hAnsi="Aptos" w:cs="Aptos"/>
+                <w:sz w:val="20"/>
+                <w:szCs w:val="20"/>
+              </w:rPr>
+              <w:t xml:space="preserve">The kiosk opens full screen showing the films that are on, and the staff menu is no longer reachable behind it.</w:t>
+            </w:r>
+          </w:p>
+        </w:tc>
+      </w:tr>
+      <w:tr>
+        <w:trPr>
+          <w:cantSplit/>
+        </w:trPr>
+        <w:tc>
+          <w:tcPr>
+            <w:tcW w:w="300" w:type="pct"/>
+            <w:tcMar>
+              <w:top w:w="30" w:type="dxa"/>
+              <w:left w:w="80" w:type="dxa"/>
+              <w:bottom w:w="30" w:type="dxa"/>
+              <w:right w:w="80" w:type="dxa"/>
+            </w:tcMar>
+          </w:tcPr>
+          <w:p>
+            <w:r>
+              <w:rPr>
+                <w:rFonts w:ascii="Aptos" w:eastAsia="Aptos" w:hAnsi="Aptos" w:cs="Aptos"/>
+                <w:sz w:val="20"/>
+                <w:szCs w:val="20"/>
+              </w:rPr>
+              <w:t xml:space="preserve">214</w:t>
+            </w:r>
+          </w:p>
+        </w:tc>
+        <w:tc>
+          <w:tcPr>
+            <w:tcW w:w="1850" w:type="pct"/>
+            <w:tcMar>
+              <w:top w:w="30" w:type="dxa"/>
+              <w:left w:w="80" w:type="dxa"/>
+              <w:bottom w:w="30" w:type="dxa"/>
+              <w:right w:w="80" w:type="dxa"/>
+            </w:tcMar>
+          </w:tcPr>
+          <w:p>
+            <w:r>
+              <w:rPr>
+                <w:rFonts w:ascii="Aptos" w:eastAsia="Aptos" w:hAnsi="Aptos" w:cs="Aptos"/>
+                <w:sz w:val="20"/>
+                <w:szCs w:val="20"/>
+              </w:rPr>
+              <w:t xml:space="preserve">As a customer, pick a film, pick a screening, choose a seat and complete the purchase without any staff involvement</w:t>
+            </w:r>
+          </w:p>
+        </w:tc>
+        <w:tc>
+          <w:tcPr>
+            <w:tcW w:w="560" w:type="pct"/>
+            <w:tcMar>
+              <w:top w:w="30" w:type="dxa"/>
+              <w:left w:w="80" w:type="dxa"/>
+              <w:bottom w:w="30" w:type="dxa"/>
+              <w:right w:w="80" w:type="dxa"/>
+            </w:tcMar>
+          </w:tcPr>
+          <w:p>
+            <w:r>
+              <w:rPr>
+                <w:rFonts w:ascii="Aptos" w:eastAsia="Aptos" w:hAnsi="Aptos" w:cs="Aptos"/>
+                <w:sz w:val="20"/>
+                <w:szCs w:val="20"/>
+              </w:rPr>
+              <w:t xml:space="preserve">Normal</w:t>
+            </w:r>
+          </w:p>
+        </w:tc>
+        <w:tc>
+          <w:tcPr>
+            <w:tcW w:w="2290" w:type="pct"/>
+            <w:tcMar>
+              <w:top w:w="30" w:type="dxa"/>
+              <w:left w:w="80" w:type="dxa"/>
+              <w:bottom w:w="30" w:type="dxa"/>
+              <w:right w:w="80" w:type="dxa"/>
+            </w:tcMar>
+          </w:tcPr>
+          <w:p>
+            <w:r>
+              <w:rPr>
+                <w:rFonts w:ascii="Aptos" w:eastAsia="Aptos" w:hAnsi="Aptos" w:cs="Aptos"/>
+                <w:sz w:val="20"/>
+                <w:szCs w:val="20"/>
+              </w:rPr>
+              <w:t xml:space="preserve">A booking is created in the same tables as a booking taken at the counter, and the seat is shown as taken to the next customer.</w:t>
+            </w:r>
+          </w:p>
+        </w:tc>
+      </w:tr>
+      <w:tr>
+        <w:trPr>
+          <w:cantSplit/>
+        </w:trPr>
+        <w:tc>
+          <w:tcPr>
+            <w:tcW w:w="300" w:type="pct"/>
+            <w:tcMar>
+              <w:top w:w="30" w:type="dxa"/>
+              <w:left w:w="80" w:type="dxa"/>
+              <w:bottom w:w="30" w:type="dxa"/>
+              <w:right w:w="80" w:type="dxa"/>
+            </w:tcMar>
+          </w:tcPr>
+          <w:p>
+            <w:r>
+              <w:rPr>
+                <w:rFonts w:ascii="Aptos" w:eastAsia="Aptos" w:hAnsi="Aptos" w:cs="Aptos"/>
+                <w:sz w:val="20"/>
+                <w:szCs w:val="20"/>
+              </w:rPr>
+              <w:t xml:space="preserve">215</w:t>
+            </w:r>
+          </w:p>
+        </w:tc>
+        <w:tc>
+          <w:tcPr>
+            <w:tcW w:w="1850" w:type="pct"/>
+            <w:tcMar>
+              <w:top w:w="30" w:type="dxa"/>
+              <w:left w:w="80" w:type="dxa"/>
+              <w:bottom w:w="30" w:type="dxa"/>
+              <w:right w:w="80" w:type="dxa"/>
+            </w:tcMar>
+          </w:tcPr>
+          <w:p>
+            <w:r>
+              <w:rPr>
+                <w:rFonts w:ascii="Aptos" w:eastAsia="Aptos" w:hAnsi="Aptos" w:cs="Aptos"/>
+                <w:sz w:val="20"/>
+                <w:szCs w:val="20"/>
+              </w:rPr>
+              <w:t xml:space="preserve">At the kiosk, add a Large Popcorn to the order before paying</w:t>
+            </w:r>
+          </w:p>
+        </w:tc>
+        <w:tc>
+          <w:tcPr>
+            <w:tcW w:w="560" w:type="pct"/>
+            <w:tcMar>
+              <w:top w:w="30" w:type="dxa"/>
+              <w:left w:w="80" w:type="dxa"/>
+              <w:bottom w:w="30" w:type="dxa"/>
+              <w:right w:w="80" w:type="dxa"/>
+            </w:tcMar>
+          </w:tcPr>
+          <w:p>
+            <w:r>
+              <w:rPr>
+                <w:rFonts w:ascii="Aptos" w:eastAsia="Aptos" w:hAnsi="Aptos" w:cs="Aptos"/>
+                <w:sz w:val="20"/>
+                <w:szCs w:val="20"/>
+              </w:rPr>
+              <w:t xml:space="preserve">Normal</w:t>
+            </w:r>
+          </w:p>
+        </w:tc>
+        <w:tc>
+          <w:tcPr>
+            <w:tcW w:w="2290" w:type="pct"/>
+            <w:tcMar>
+              <w:top w:w="30" w:type="dxa"/>
+              <w:left w:w="80" w:type="dxa"/>
+              <w:bottom w:w="30" w:type="dxa"/>
+              <w:right w:w="80" w:type="dxa"/>
+            </w:tcMar>
+          </w:tcPr>
+          <w:p>
+            <w:r>
+              <w:rPr>
+                <w:rFonts w:ascii="Aptos" w:eastAsia="Aptos" w:hAnsi="Aptos" w:cs="Aptos"/>
+                <w:sz w:val="20"/>
+                <w:szCs w:val="20"/>
+              </w:rPr>
+              <w:t xml:space="preserve">The food is added to the same booking, so tickets and food are bought in one go rather than in two queues.</w:t>
+            </w:r>
+          </w:p>
+        </w:tc>
+      </w:tr>
+      <w:tr>
+        <w:trPr>
+          <w:cantSplit/>
+        </w:trPr>
+        <w:tc>
+          <w:tcPr>
+            <w:tcW w:w="300" w:type="pct"/>
+            <w:tcMar>
+              <w:top w:w="30" w:type="dxa"/>
+              <w:left w:w="80" w:type="dxa"/>
+              <w:bottom w:w="30" w:type="dxa"/>
+              <w:right w:w="80" w:type="dxa"/>
+            </w:tcMar>
+          </w:tcPr>
+          <w:p>
+            <w:r>
+              <w:rPr>
+                <w:rFonts w:ascii="Aptos" w:eastAsia="Aptos" w:hAnsi="Aptos" w:cs="Aptos"/>
+                <w:sz w:val="20"/>
+                <w:szCs w:val="20"/>
+              </w:rPr>
+              <w:t xml:space="preserve">216</w:t>
+            </w:r>
+          </w:p>
+        </w:tc>
+        <w:tc>
+          <w:tcPr>
+            <w:tcW w:w="1850" w:type="pct"/>
+            <w:tcMar>
+              <w:top w:w="30" w:type="dxa"/>
+              <w:left w:w="80" w:type="dxa"/>
+              <w:bottom w:w="30" w:type="dxa"/>
+              <w:right w:w="80" w:type="dxa"/>
+            </w:tcMar>
+          </w:tcPr>
+          <w:p>
+            <w:r>
+              <w:rPr>
+                <w:rFonts w:ascii="Aptos" w:eastAsia="Aptos" w:hAnsi="Aptos" w:cs="Aptos"/>
+                <w:sz w:val="20"/>
+                <w:szCs w:val="20"/>
+              </w:rPr>
+              <w:t xml:space="preserve">At the kiosk, try to choose a seat that is already taken</w:t>
+            </w:r>
+          </w:p>
+        </w:tc>
+        <w:tc>
+          <w:tcPr>
+            <w:tcW w:w="560" w:type="pct"/>
+            <w:tcMar>
+              <w:top w:w="30" w:type="dxa"/>
+              <w:left w:w="80" w:type="dxa"/>
+              <w:bottom w:w="30" w:type="dxa"/>
+              <w:right w:w="80" w:type="dxa"/>
+            </w:tcMar>
+          </w:tcPr>
+          <w:p>
+            <w:r>
+              <w:rPr>
+                <w:rFonts w:ascii="Aptos" w:eastAsia="Aptos" w:hAnsi="Aptos" w:cs="Aptos"/>
+                <w:sz w:val="20"/>
+                <w:szCs w:val="20"/>
+              </w:rPr>
+              <w:t xml:space="preserve">Erroneous</w:t>
+            </w:r>
+          </w:p>
+        </w:tc>
+        <w:tc>
+          <w:tcPr>
+            <w:tcW w:w="2290" w:type="pct"/>
+            <w:tcMar>
+              <w:top w:w="30" w:type="dxa"/>
+              <w:left w:w="80" w:type="dxa"/>
+              <w:bottom w:w="30" w:type="dxa"/>
+              <w:right w:w="80" w:type="dxa"/>
+            </w:tcMar>
+          </w:tcPr>
+          <w:p>
+            <w:r>
+              <w:rPr>
+                <w:rFonts w:ascii="Aptos" w:eastAsia="Aptos" w:hAnsi="Aptos" w:cs="Aptos"/>
+                <w:sz w:val="20"/>
+                <w:szCs w:val="20"/>
+              </w:rPr>
+              <w:t xml:space="preserve">The seat cannot be selected, in the same way as at the counter.</w:t>
+            </w:r>
+          </w:p>
+        </w:tc>
+      </w:tr>
+      <w:tr>
+        <w:trPr>
+          <w:cantSplit/>
+        </w:trPr>
+        <w:tc>
+          <w:tcPr>
+            <w:tcW w:w="300" w:type="pct"/>
+            <w:tcMar>
+              <w:top w:w="30" w:type="dxa"/>
+              <w:left w:w="80" w:type="dxa"/>
+              <w:bottom w:w="30" w:type="dxa"/>
+              <w:right w:w="80" w:type="dxa"/>
+            </w:tcMar>
+          </w:tcPr>
+          <w:p>
+            <w:r>
+              <w:rPr>
+                <w:rFonts w:ascii="Aptos" w:eastAsia="Aptos" w:hAnsi="Aptos" w:cs="Aptos"/>
+                <w:sz w:val="20"/>
+                <w:szCs w:val="20"/>
+              </w:rPr>
+              <w:t xml:space="preserve">217</w:t>
+            </w:r>
+          </w:p>
+        </w:tc>
+        <w:tc>
+          <w:tcPr>
+            <w:tcW w:w="1850" w:type="pct"/>
+            <w:tcMar>
+              <w:top w:w="30" w:type="dxa"/>
+              <w:left w:w="80" w:type="dxa"/>
+              <w:bottom w:w="30" w:type="dxa"/>
+              <w:right w:w="80" w:type="dxa"/>
+            </w:tcMar>
+          </w:tcPr>
+          <w:p>
+            <w:r>
+              <w:rPr>
+                <w:rFonts w:ascii="Aptos" w:eastAsia="Aptos" w:hAnsi="Aptos" w:cs="Aptos"/>
+                <w:sz w:val="20"/>
+                <w:szCs w:val="20"/>
+              </w:rPr>
+              <w:t xml:space="preserve">At the kiosk, start a purchase and then leave the screen untouched</w:t>
+            </w:r>
+          </w:p>
+        </w:tc>
+        <w:tc>
+          <w:tcPr>
+            <w:tcW w:w="560" w:type="pct"/>
+            <w:tcMar>
+              <w:top w:w="30" w:type="dxa"/>
+              <w:left w:w="80" w:type="dxa"/>
+              <w:bottom w:w="30" w:type="dxa"/>
+              <w:right w:w="80" w:type="dxa"/>
+            </w:tcMar>
+          </w:tcPr>
+          <w:p>
+            <w:r>
+              <w:rPr>
+                <w:rFonts w:ascii="Aptos" w:eastAsia="Aptos" w:hAnsi="Aptos" w:cs="Aptos"/>
+                <w:sz w:val="20"/>
+                <w:szCs w:val="20"/>
+              </w:rPr>
+              <w:t xml:space="preserve">Boundary</w:t>
+            </w:r>
+          </w:p>
+        </w:tc>
+        <w:tc>
+          <w:tcPr>
+            <w:tcW w:w="2290" w:type="pct"/>
+            <w:tcMar>
+              <w:top w:w="30" w:type="dxa"/>
+              <w:left w:w="80" w:type="dxa"/>
+              <w:bottom w:w="30" w:type="dxa"/>
+              <w:right w:w="80" w:type="dxa"/>
+            </w:tcMar>
+          </w:tcPr>
+          <w:p>
+            <w:r>
+              <w:rPr>
+                <w:rFonts w:ascii="Aptos" w:eastAsia="Aptos" w:hAnsi="Aptos" w:cs="Aptos"/>
+                <w:sz w:val="20"/>
+                <w:szCs w:val="20"/>
+              </w:rPr>
+              <w:t xml:space="preserve">After 90 seconds of no activity the kiosk returns to the start and clears what was being chosen, so the next customer does not walk up to somebody else's half finished order.</w:t>
+            </w:r>
+          </w:p>
+        </w:tc>
+      </w:tr>
+      <w:tr>
+        <w:trPr>
+          <w:cantSplit/>
+        </w:trPr>
+        <w:tc>
+          <w:tcPr>
+            <w:tcW w:w="300" w:type="pct"/>
+            <w:tcMar>
+              <w:top w:w="30" w:type="dxa"/>
+              <w:left w:w="80" w:type="dxa"/>
+              <w:bottom w:w="30" w:type="dxa"/>
+              <w:right w:w="80" w:type="dxa"/>
+            </w:tcMar>
+          </w:tcPr>
+          <w:p>
+            <w:r>
+              <w:rPr>
+                <w:rFonts w:ascii="Aptos" w:eastAsia="Aptos" w:hAnsi="Aptos" w:cs="Aptos"/>
+                <w:sz w:val="20"/>
+                <w:szCs w:val="20"/>
+              </w:rPr>
+              <w:t xml:space="preserve">218</w:t>
+            </w:r>
+          </w:p>
+        </w:tc>
+        <w:tc>
+          <w:tcPr>
+            <w:tcW w:w="1850" w:type="pct"/>
+            <w:tcMar>
+              <w:top w:w="30" w:type="dxa"/>
+              <w:left w:w="80" w:type="dxa"/>
+              <w:bottom w:w="30" w:type="dxa"/>
+              <w:right w:w="80" w:type="dxa"/>
+            </w:tcMar>
+          </w:tcPr>
+          <w:p>
+            <w:r>
+              <w:rPr>
+                <w:rFonts w:ascii="Aptos" w:eastAsia="Aptos" w:hAnsi="Aptos" w:cs="Aptos"/>
+                <w:sz w:val="20"/>
+                <w:szCs w:val="20"/>
+              </w:rPr>
+              <w:t xml:space="preserve">At the kiosk, press the exit option</w:t>
+            </w:r>
+          </w:p>
+        </w:tc>
+        <w:tc>
+          <w:tcPr>
+            <w:tcW w:w="560" w:type="pct"/>
+            <w:tcMar>
+              <w:top w:w="30" w:type="dxa"/>
+              <w:left w:w="80" w:type="dxa"/>
+              <w:bottom w:w="30" w:type="dxa"/>
+              <w:right w:w="80" w:type="dxa"/>
+            </w:tcMar>
+          </w:tcPr>
+          <w:p>
+            <w:r>
+              <w:rPr>
+                <w:rFonts w:ascii="Aptos" w:eastAsia="Aptos" w:hAnsi="Aptos" w:cs="Aptos"/>
+                <w:sz w:val="20"/>
+                <w:szCs w:val="20"/>
+              </w:rPr>
+              <w:t xml:space="preserve">Erroneous</w:t>
+            </w:r>
+          </w:p>
+        </w:tc>
+        <w:tc>
+          <w:tcPr>
+            <w:tcW w:w="2290" w:type="pct"/>
+            <w:tcMar>
+              <w:top w:w="30" w:type="dxa"/>
+              <w:left w:w="80" w:type="dxa"/>
+              <w:bottom w:w="30" w:type="dxa"/>
+              <w:right w:w="80" w:type="dxa"/>
+            </w:tcMar>
+          </w:tcPr>
+          <w:p>
+            <w:r>
+              <w:rPr>
+                <w:rFonts w:ascii="Aptos" w:eastAsia="Aptos" w:hAnsi="Aptos" w:cs="Aptos"/>
+                <w:sz w:val="20"/>
+                <w:szCs w:val="20"/>
+              </w:rPr>
+              <w:t xml:space="preserve">The kiosk asks for the password of the account that started it, and without that password it stays in kiosk mode.</w:t>
+            </w:r>
+          </w:p>
+        </w:tc>
+      </w:tr>
+      <w:tr>
+        <w:trPr>
+          <w:cantSplit/>
+        </w:trPr>
+        <w:tc>
+          <w:tcPr>
+            <w:tcW w:w="300" w:type="pct"/>
+            <w:tcMar>
+              <w:top w:w="30" w:type="dxa"/>
+              <w:left w:w="80" w:type="dxa"/>
+              <w:bottom w:w="30" w:type="dxa"/>
+              <w:right w:w="80" w:type="dxa"/>
+            </w:tcMar>
+          </w:tcPr>
+          <w:p>
+            <w:r>
+              <w:rPr>
+                <w:rFonts w:ascii="Aptos" w:eastAsia="Aptos" w:hAnsi="Aptos" w:cs="Aptos"/>
+                <w:sz w:val="20"/>
+                <w:szCs w:val="20"/>
+              </w:rPr>
+              <w:t xml:space="preserve">219</w:t>
+            </w:r>
+          </w:p>
+        </w:tc>
+        <w:tc>
+          <w:tcPr>
+            <w:tcW w:w="1850" w:type="pct"/>
+            <w:tcMar>
+              <w:top w:w="30" w:type="dxa"/>
+              <w:left w:w="80" w:type="dxa"/>
+              <w:bottom w:w="30" w:type="dxa"/>
+              <w:right w:w="80" w:type="dxa"/>
+            </w:tcMar>
+          </w:tcPr>
+          <w:p>
+            <w:r>
+              <w:rPr>
+                <w:rFonts w:ascii="Aptos" w:eastAsia="Aptos" w:hAnsi="Aptos" w:cs="Aptos"/>
+                <w:sz w:val="20"/>
+                <w:szCs w:val="20"/>
+              </w:rPr>
+              <w:t xml:space="preserve">At the kiosk, enter the wrong password at the exit prompt</w:t>
+            </w:r>
+          </w:p>
+        </w:tc>
+        <w:tc>
+          <w:tcPr>
+            <w:tcW w:w="560" w:type="pct"/>
+            <w:tcMar>
+              <w:top w:w="30" w:type="dxa"/>
+              <w:left w:w="80" w:type="dxa"/>
+              <w:bottom w:w="30" w:type="dxa"/>
+              <w:right w:w="80" w:type="dxa"/>
+            </w:tcMar>
+          </w:tcPr>
+          <w:p>
+            <w:r>
+              <w:rPr>
+                <w:rFonts w:ascii="Aptos" w:eastAsia="Aptos" w:hAnsi="Aptos" w:cs="Aptos"/>
+                <w:sz w:val="20"/>
+                <w:szCs w:val="20"/>
+              </w:rPr>
+              <w:t xml:space="preserve">Erroneous</w:t>
+            </w:r>
+          </w:p>
+        </w:tc>
+        <w:tc>
+          <w:tcPr>
+            <w:tcW w:w="2290" w:type="pct"/>
+            <w:tcMar>
+              <w:top w:w="30" w:type="dxa"/>
+              <w:left w:w="80" w:type="dxa"/>
+              <w:bottom w:w="30" w:type="dxa"/>
+              <w:right w:w="80" w:type="dxa"/>
+            </w:tcMar>
+          </w:tcPr>
+          <w:p>
+            <w:r>
+              <w:rPr>
+                <w:rFonts w:ascii="Aptos" w:eastAsia="Aptos" w:hAnsi="Aptos" w:cs="Aptos"/>
+                <w:sz w:val="20"/>
+                <w:szCs w:val="20"/>
+              </w:rPr>
+              <w:t xml:space="preserve">A message appears stating “That password is not correct.” and the kiosk stays in kiosk mode.</w:t>
+            </w:r>
+          </w:p>
+        </w:tc>
+      </w:tr>
+      <w:tr>
+        <w:trPr>
+          <w:cantSplit/>
+        </w:trPr>
+        <w:tc>
+          <w:tcPr>
+            <w:tcW w:w="300" w:type="pct"/>
+            <w:tcMar>
+              <w:top w:w="30" w:type="dxa"/>
+              <w:left w:w="80" w:type="dxa"/>
+              <w:bottom w:w="30" w:type="dxa"/>
+              <w:right w:w="80" w:type="dxa"/>
+            </w:tcMar>
+          </w:tcPr>
+          <w:p>
+            <w:r>
+              <w:rPr>
+                <w:rFonts w:ascii="Aptos" w:eastAsia="Aptos" w:hAnsi="Aptos" w:cs="Aptos"/>
+                <w:sz w:val="20"/>
+                <w:szCs w:val="20"/>
+              </w:rPr>
+              <w:t xml:space="preserve">220</w:t>
+            </w:r>
+          </w:p>
+        </w:tc>
+        <w:tc>
+          <w:tcPr>
+            <w:tcW w:w="1850" w:type="pct"/>
+            <w:tcMar>
+              <w:top w:w="30" w:type="dxa"/>
+              <w:left w:w="80" w:type="dxa"/>
+              <w:bottom w:w="30" w:type="dxa"/>
+              <w:right w:w="80" w:type="dxa"/>
+            </w:tcMar>
+          </w:tcPr>
+          <w:p>
+            <w:r>
+              <w:rPr>
+                <w:rFonts w:ascii="Aptos" w:eastAsia="Aptos" w:hAnsi="Aptos" w:cs="Aptos"/>
+                <w:sz w:val="20"/>
+                <w:szCs w:val="20"/>
+              </w:rPr>
+              <w:t xml:space="preserve">At the kiosk, enter the correct password at the exit prompt</w:t>
+            </w:r>
+          </w:p>
+        </w:tc>
+        <w:tc>
+          <w:tcPr>
+            <w:tcW w:w="560" w:type="pct"/>
+            <w:tcMar>
+              <w:top w:w="30" w:type="dxa"/>
+              <w:left w:w="80" w:type="dxa"/>
+              <w:bottom w:w="30" w:type="dxa"/>
+              <w:right w:w="80" w:type="dxa"/>
+            </w:tcMar>
+          </w:tcPr>
+          <w:p>
+            <w:r>
+              <w:rPr>
+                <w:rFonts w:ascii="Aptos" w:eastAsia="Aptos" w:hAnsi="Aptos" w:cs="Aptos"/>
+                <w:sz w:val="20"/>
+                <w:szCs w:val="20"/>
+              </w:rPr>
+              <w:t xml:space="preserve">Normal</w:t>
+            </w:r>
+          </w:p>
+        </w:tc>
+        <w:tc>
+          <w:tcPr>
+            <w:tcW w:w="2290" w:type="pct"/>
+            <w:tcMar>
+              <w:top w:w="30" w:type="dxa"/>
+              <w:left w:w="80" w:type="dxa"/>
+              <w:bottom w:w="30" w:type="dxa"/>
+              <w:right w:w="80" w:type="dxa"/>
+            </w:tcMar>
+          </w:tcPr>
+          <w:p>
+            <w:r>
+              <w:rPr>
+                <w:rFonts w:ascii="Aptos" w:eastAsia="Aptos" w:hAnsi="Aptos" w:cs="Aptos"/>
+                <w:sz w:val="20"/>
+                <w:szCs w:val="20"/>
+              </w:rPr>
+              <w:t xml:space="preserve">The kiosk closes and the staff menu is reachable again, and the exit is written to the audit log.</w:t>
             </w:r>
           </w:p>
         </w:tc>

</xml_diff>

<commit_message>
added objective 39: the audit log with users, severity and searching
</commit_message>
<xml_diff>
--- a/Testing.docx
+++ b/Testing.docx
@@ -24297,6 +24297,874 @@
                 <w:szCs w:val="20"/>
               </w:rPr>
               <w:t xml:space="preserve">The kiosk closes and the staff menu is reachable again, and the exit is written to the audit log.</w:t>
+            </w:r>
+          </w:p>
+        </w:tc>
+      </w:tr>
+    </w:tbl>
+    <w:p>
+      <w:r>
+        <w:rPr>
+          <w:rFonts w:ascii="Aptos" w:eastAsia="Aptos" w:hAnsi="Aptos" w:cs="Aptos"/>
+        </w:rPr>
+        <w:t xml:space="preserve"/>
+      </w:r>
+    </w:p>
+    <w:p>
+      <w:pPr>
+        <w:pStyle w:val="Heading3"/>
+      </w:pPr>
+      <w:r>
+        <w:rPr>
+          <w:rFonts w:ascii="Aptos Display" w:eastAsia="Aptos Display" w:hAnsi="Aptos Display" w:cs="Aptos Display"/>
+          <w:b/>
+          <w:bCs/>
+          <w:color w:val="000000"/>
+        </w:rPr>
+        <w:t xml:space="preserve">Objective 39: The Audit Log With Users, Severity and Searching</w:t>
+      </w:r>
+    </w:p>
+    <w:p>
+      <w:r>
+        <w:rPr>
+          <w:rFonts w:ascii="Aptos" w:eastAsia="Aptos" w:hAnsi="Aptos" w:cs="Aptos"/>
+        </w:rPr>
+        <w:t xml:space="preserve">Objective 17 only required that key actions were logged. This objective goes further and requires that the log records who did each thing, grades how serious it is, and can still be used once there are a great many entries in it. These tests use a log that already has a realistic number of entries in it from all of the testing above.</w:t>
+      </w:r>
+    </w:p>
+    <w:tbl>
+      <w:tblPr>
+        <w:tblW w:w="5000" w:type="pct"/>
+        <w:tblBorders>
+          <w:top w:val="single" w:sz="4" w:space="0" w:color="808080"/>
+          <w:left w:val="single" w:sz="4" w:space="0" w:color="808080"/>
+          <w:bottom w:val="single" w:sz="4" w:space="0" w:color="808080"/>
+          <w:right w:val="single" w:sz="4" w:space="0" w:color="808080"/>
+          <w:insideH w:val="single" w:sz="4" w:space="0" w:color="808080"/>
+          <w:insideV w:val="single" w:sz="4" w:space="0" w:color="808080"/>
+        </w:tblBorders>
+        <w:tblCellMar>
+          <w:left w:w="10" w:type="dxa"/>
+          <w:right w:w="10" w:type="dxa"/>
+        </w:tblCellMar>
+        <w:tblLook w:val="0000" w:firstRow="0" w:lastRow="0" w:firstColumn="0" w:lastColumn="0" w:noHBand="0" w:noVBand="0"/>
+      </w:tblPr>
+      <w:tblGrid>
+        <w:gridCol w:w="561"/>
+        <w:gridCol w:w="3460"/>
+        <w:gridCol w:w="1047"/>
+        <w:gridCol w:w="4282"/>
+      </w:tblGrid>
+      <w:tr>
+        <w:trPr>
+          <w:cantSplit/>
+          <w:tblHeader/>
+        </w:trPr>
+        <w:tc>
+          <w:tcPr>
+            <w:tcW w:w="300" w:type="pct"/>
+            <w:shd w:val="clear" w:color="auto" w:fill="F2CEED" w:themeFill="accent5" w:themeFillTint="33"/>
+            <w:tcMar>
+              <w:top w:w="30" w:type="dxa"/>
+              <w:left w:w="80" w:type="dxa"/>
+              <w:bottom w:w="30" w:type="dxa"/>
+              <w:right w:w="80" w:type="dxa"/>
+            </w:tcMar>
+          </w:tcPr>
+          <w:p>
+            <w:r>
+              <w:rPr>
+                <w:rFonts w:ascii="Aptos" w:eastAsia="Aptos" w:hAnsi="Aptos" w:cs="Aptos"/>
+                <w:b/>
+                <w:bCs/>
+                <w:sz w:val="20"/>
+                <w:szCs w:val="20"/>
+              </w:rPr>
+              <w:t xml:space="preserve">No.</w:t>
+            </w:r>
+          </w:p>
+        </w:tc>
+        <w:tc>
+          <w:tcPr>
+            <w:tcW w:w="1850" w:type="pct"/>
+            <w:shd w:val="clear" w:color="auto" w:fill="F2CEED" w:themeFill="accent5" w:themeFillTint="33"/>
+            <w:tcMar>
+              <w:top w:w="30" w:type="dxa"/>
+              <w:left w:w="80" w:type="dxa"/>
+              <w:bottom w:w="30" w:type="dxa"/>
+              <w:right w:w="80" w:type="dxa"/>
+            </w:tcMar>
+          </w:tcPr>
+          <w:p>
+            <w:r>
+              <w:rPr>
+                <w:rFonts w:ascii="Aptos" w:eastAsia="Aptos" w:hAnsi="Aptos" w:cs="Aptos"/>
+                <w:b/>
+                <w:bCs/>
+                <w:sz w:val="20"/>
+                <w:szCs w:val="20"/>
+              </w:rPr>
+              <w:t xml:space="preserve">Test</w:t>
+            </w:r>
+          </w:p>
+        </w:tc>
+        <w:tc>
+          <w:tcPr>
+            <w:tcW w:w="560" w:type="pct"/>
+            <w:shd w:val="clear" w:color="auto" w:fill="F2CEED" w:themeFill="accent5" w:themeFillTint="33"/>
+            <w:tcMar>
+              <w:top w:w="30" w:type="dxa"/>
+              <w:left w:w="80" w:type="dxa"/>
+              <w:bottom w:w="30" w:type="dxa"/>
+              <w:right w:w="80" w:type="dxa"/>
+            </w:tcMar>
+          </w:tcPr>
+          <w:p>
+            <w:r>
+              <w:rPr>
+                <w:rFonts w:ascii="Aptos" w:eastAsia="Aptos" w:hAnsi="Aptos" w:cs="Aptos"/>
+                <w:b/>
+                <w:bCs/>
+                <w:sz w:val="20"/>
+                <w:szCs w:val="20"/>
+              </w:rPr>
+              <w:t xml:space="preserve">Type</w:t>
+            </w:r>
+          </w:p>
+        </w:tc>
+        <w:tc>
+          <w:tcPr>
+            <w:tcW w:w="2290" w:type="pct"/>
+            <w:shd w:val="clear" w:color="auto" w:fill="F2CEED" w:themeFill="accent5" w:themeFillTint="33"/>
+            <w:tcMar>
+              <w:top w:w="30" w:type="dxa"/>
+              <w:left w:w="80" w:type="dxa"/>
+              <w:bottom w:w="30" w:type="dxa"/>
+              <w:right w:w="80" w:type="dxa"/>
+            </w:tcMar>
+          </w:tcPr>
+          <w:p>
+            <w:r>
+              <w:rPr>
+                <w:rFonts w:ascii="Aptos" w:eastAsia="Aptos" w:hAnsi="Aptos" w:cs="Aptos"/>
+                <w:b/>
+                <w:bCs/>
+                <w:sz w:val="20"/>
+                <w:szCs w:val="20"/>
+              </w:rPr>
+              <w:t xml:space="preserve">Expected Result</w:t>
+            </w:r>
+          </w:p>
+        </w:tc>
+      </w:tr>
+      <w:tr>
+        <w:trPr>
+          <w:cantSplit/>
+        </w:trPr>
+        <w:tc>
+          <w:tcPr>
+            <w:tcW w:w="300" w:type="pct"/>
+            <w:tcMar>
+              <w:top w:w="30" w:type="dxa"/>
+              <w:left w:w="80" w:type="dxa"/>
+              <w:bottom w:w="30" w:type="dxa"/>
+              <w:right w:w="80" w:type="dxa"/>
+            </w:tcMar>
+          </w:tcPr>
+          <w:p>
+            <w:r>
+              <w:rPr>
+                <w:rFonts w:ascii="Aptos" w:eastAsia="Aptos" w:hAnsi="Aptos" w:cs="Aptos"/>
+                <w:sz w:val="20"/>
+                <w:szCs w:val="20"/>
+              </w:rPr>
+              <w:t xml:space="preserve">221</w:t>
+            </w:r>
+          </w:p>
+        </w:tc>
+        <w:tc>
+          <w:tcPr>
+            <w:tcW w:w="1850" w:type="pct"/>
+            <w:tcMar>
+              <w:top w:w="30" w:type="dxa"/>
+              <w:left w:w="80" w:type="dxa"/>
+              <w:bottom w:w="30" w:type="dxa"/>
+              <w:right w:w="80" w:type="dxa"/>
+            </w:tcMar>
+          </w:tcPr>
+          <w:p>
+            <w:r>
+              <w:rPr>
+                <w:rFonts w:ascii="Aptos" w:eastAsia="Aptos" w:hAnsi="Aptos" w:cs="Aptos"/>
+                <w:sz w:val="20"/>
+                <w:szCs w:val="20"/>
+              </w:rPr>
+              <w:t xml:space="preserve">Open the Logs form and look at any entry</w:t>
+            </w:r>
+          </w:p>
+        </w:tc>
+        <w:tc>
+          <w:tcPr>
+            <w:tcW w:w="560" w:type="pct"/>
+            <w:tcMar>
+              <w:top w:w="30" w:type="dxa"/>
+              <w:left w:w="80" w:type="dxa"/>
+              <w:bottom w:w="30" w:type="dxa"/>
+              <w:right w:w="80" w:type="dxa"/>
+            </w:tcMar>
+          </w:tcPr>
+          <w:p>
+            <w:r>
+              <w:rPr>
+                <w:rFonts w:ascii="Aptos" w:eastAsia="Aptos" w:hAnsi="Aptos" w:cs="Aptos"/>
+                <w:sz w:val="20"/>
+                <w:szCs w:val="20"/>
+              </w:rPr>
+              <w:t xml:space="preserve">Normal</w:t>
+            </w:r>
+          </w:p>
+        </w:tc>
+        <w:tc>
+          <w:tcPr>
+            <w:tcW w:w="2290" w:type="pct"/>
+            <w:tcMar>
+              <w:top w:w="30" w:type="dxa"/>
+              <w:left w:w="80" w:type="dxa"/>
+              <w:bottom w:w="30" w:type="dxa"/>
+              <w:right w:w="80" w:type="dxa"/>
+            </w:tcMar>
+          </w:tcPr>
+          <w:p>
+            <w:r>
+              <w:rPr>
+                <w:rFonts w:ascii="Aptos" w:eastAsia="Aptos" w:hAnsi="Aptos" w:cs="Aptos"/>
+                <w:sz w:val="20"/>
+                <w:szCs w:val="20"/>
+              </w:rPr>
+              <w:t xml:space="preserve">Each entry shows the date and time, the type, the message, the user responsible and a severity.</w:t>
+            </w:r>
+          </w:p>
+        </w:tc>
+      </w:tr>
+      <w:tr>
+        <w:trPr>
+          <w:cantSplit/>
+        </w:trPr>
+        <w:tc>
+          <w:tcPr>
+            <w:tcW w:w="300" w:type="pct"/>
+            <w:tcMar>
+              <w:top w:w="30" w:type="dxa"/>
+              <w:left w:w="80" w:type="dxa"/>
+              <w:bottom w:w="30" w:type="dxa"/>
+              <w:right w:w="80" w:type="dxa"/>
+            </w:tcMar>
+          </w:tcPr>
+          <w:p>
+            <w:r>
+              <w:rPr>
+                <w:rFonts w:ascii="Aptos" w:eastAsia="Aptos" w:hAnsi="Aptos" w:cs="Aptos"/>
+                <w:sz w:val="20"/>
+                <w:szCs w:val="20"/>
+              </w:rPr>
+              <w:t xml:space="preserve">222</w:t>
+            </w:r>
+          </w:p>
+        </w:tc>
+        <w:tc>
+          <w:tcPr>
+            <w:tcW w:w="1850" w:type="pct"/>
+            <w:tcMar>
+              <w:top w:w="30" w:type="dxa"/>
+              <w:left w:w="80" w:type="dxa"/>
+              <w:bottom w:w="30" w:type="dxa"/>
+              <w:right w:w="80" w:type="dxa"/>
+            </w:tcMar>
+          </w:tcPr>
+          <w:p>
+            <w:r>
+              <w:rPr>
+                <w:rFonts w:ascii="Aptos" w:eastAsia="Aptos" w:hAnsi="Aptos" w:cs="Aptos"/>
+                <w:sz w:val="20"/>
+                <w:szCs w:val="20"/>
+              </w:rPr>
+              <w:t xml:space="preserve">Look at the severities used across the log</w:t>
+            </w:r>
+          </w:p>
+        </w:tc>
+        <w:tc>
+          <w:tcPr>
+            <w:tcW w:w="560" w:type="pct"/>
+            <w:tcMar>
+              <w:top w:w="30" w:type="dxa"/>
+              <w:left w:w="80" w:type="dxa"/>
+              <w:bottom w:w="30" w:type="dxa"/>
+              <w:right w:w="80" w:type="dxa"/>
+            </w:tcMar>
+          </w:tcPr>
+          <w:p>
+            <w:r>
+              <w:rPr>
+                <w:rFonts w:ascii="Aptos" w:eastAsia="Aptos" w:hAnsi="Aptos" w:cs="Aptos"/>
+                <w:sz w:val="20"/>
+                <w:szCs w:val="20"/>
+              </w:rPr>
+              <w:t xml:space="preserve">Normal</w:t>
+            </w:r>
+          </w:p>
+        </w:tc>
+        <w:tc>
+          <w:tcPr>
+            <w:tcW w:w="2290" w:type="pct"/>
+            <w:tcMar>
+              <w:top w:w="30" w:type="dxa"/>
+              <w:left w:w="80" w:type="dxa"/>
+              <w:bottom w:w="30" w:type="dxa"/>
+              <w:right w:w="80" w:type="dxa"/>
+            </w:tcMar>
+          </w:tcPr>
+          <w:p>
+            <w:r>
+              <w:rPr>
+                <w:rFonts w:ascii="Aptos" w:eastAsia="Aptos" w:hAnsi="Aptos" w:cs="Aptos"/>
+                <w:sz w:val="20"/>
+                <w:szCs w:val="20"/>
+              </w:rPr>
+              <w:t xml:space="preserve">Entries are graded as INFO, CHANGE, WARNING or SECURITY rather than all being the same, so the serious entries can be picked out from the routine ones.</w:t>
+            </w:r>
+          </w:p>
+        </w:tc>
+      </w:tr>
+      <w:tr>
+        <w:trPr>
+          <w:cantSplit/>
+        </w:trPr>
+        <w:tc>
+          <w:tcPr>
+            <w:tcW w:w="300" w:type="pct"/>
+            <w:tcMar>
+              <w:top w:w="30" w:type="dxa"/>
+              <w:left w:w="80" w:type="dxa"/>
+              <w:bottom w:w="30" w:type="dxa"/>
+              <w:right w:w="80" w:type="dxa"/>
+            </w:tcMar>
+          </w:tcPr>
+          <w:p>
+            <w:r>
+              <w:rPr>
+                <w:rFonts w:ascii="Aptos" w:eastAsia="Aptos" w:hAnsi="Aptos" w:cs="Aptos"/>
+                <w:sz w:val="20"/>
+                <w:szCs w:val="20"/>
+              </w:rPr>
+              <w:t xml:space="preserve">223</w:t>
+            </w:r>
+          </w:p>
+        </w:tc>
+        <w:tc>
+          <w:tcPr>
+            <w:tcW w:w="1850" w:type="pct"/>
+            <w:tcMar>
+              <w:top w:w="30" w:type="dxa"/>
+              <w:left w:w="80" w:type="dxa"/>
+              <w:bottom w:w="30" w:type="dxa"/>
+              <w:right w:w="80" w:type="dxa"/>
+            </w:tcMar>
+          </w:tcPr>
+          <w:p>
+            <w:r>
+              <w:rPr>
+                <w:rFonts w:ascii="Aptos" w:eastAsia="Aptos" w:hAnsi="Aptos" w:cs="Aptos"/>
+                <w:sz w:val="20"/>
+                <w:szCs w:val="20"/>
+              </w:rPr>
+              <w:t xml:space="preserve">Filter the log by the severity SECURITY</w:t>
+            </w:r>
+          </w:p>
+        </w:tc>
+        <w:tc>
+          <w:tcPr>
+            <w:tcW w:w="560" w:type="pct"/>
+            <w:tcMar>
+              <w:top w:w="30" w:type="dxa"/>
+              <w:left w:w="80" w:type="dxa"/>
+              <w:bottom w:w="30" w:type="dxa"/>
+              <w:right w:w="80" w:type="dxa"/>
+            </w:tcMar>
+          </w:tcPr>
+          <w:p>
+            <w:r>
+              <w:rPr>
+                <w:rFonts w:ascii="Aptos" w:eastAsia="Aptos" w:hAnsi="Aptos" w:cs="Aptos"/>
+                <w:sz w:val="20"/>
+                <w:szCs w:val="20"/>
+              </w:rPr>
+              <w:t xml:space="preserve">Normal</w:t>
+            </w:r>
+          </w:p>
+        </w:tc>
+        <w:tc>
+          <w:tcPr>
+            <w:tcW w:w="2290" w:type="pct"/>
+            <w:tcMar>
+              <w:top w:w="30" w:type="dxa"/>
+              <w:left w:w="80" w:type="dxa"/>
+              <w:bottom w:w="30" w:type="dxa"/>
+              <w:right w:w="80" w:type="dxa"/>
+            </w:tcMar>
+          </w:tcPr>
+          <w:p>
+            <w:r>
+              <w:rPr>
+                <w:rFonts w:ascii="Aptos" w:eastAsia="Aptos" w:hAnsi="Aptos" w:cs="Aptos"/>
+                <w:sz w:val="20"/>
+                <w:szCs w:val="20"/>
+              </w:rPr>
+              <w:t xml:space="preserve">Only the security entries are listed, such as failed sign in attempts and the kiosk being unlocked.</w:t>
+            </w:r>
+          </w:p>
+        </w:tc>
+      </w:tr>
+      <w:tr>
+        <w:trPr>
+          <w:cantSplit/>
+        </w:trPr>
+        <w:tc>
+          <w:tcPr>
+            <w:tcW w:w="300" w:type="pct"/>
+            <w:tcMar>
+              <w:top w:w="30" w:type="dxa"/>
+              <w:left w:w="80" w:type="dxa"/>
+              <w:bottom w:w="30" w:type="dxa"/>
+              <w:right w:w="80" w:type="dxa"/>
+            </w:tcMar>
+          </w:tcPr>
+          <w:p>
+            <w:r>
+              <w:rPr>
+                <w:rFonts w:ascii="Aptos" w:eastAsia="Aptos" w:hAnsi="Aptos" w:cs="Aptos"/>
+                <w:sz w:val="20"/>
+                <w:szCs w:val="20"/>
+              </w:rPr>
+              <w:t xml:space="preserve">224</w:t>
+            </w:r>
+          </w:p>
+        </w:tc>
+        <w:tc>
+          <w:tcPr>
+            <w:tcW w:w="1850" w:type="pct"/>
+            <w:tcMar>
+              <w:top w:w="30" w:type="dxa"/>
+              <w:left w:w="80" w:type="dxa"/>
+              <w:bottom w:w="30" w:type="dxa"/>
+              <w:right w:w="80" w:type="dxa"/>
+            </w:tcMar>
+          </w:tcPr>
+          <w:p>
+            <w:r>
+              <w:rPr>
+                <w:rFonts w:ascii="Aptos" w:eastAsia="Aptos" w:hAnsi="Aptos" w:cs="Aptos"/>
+                <w:sz w:val="20"/>
+                <w:szCs w:val="20"/>
+              </w:rPr>
+              <w:t xml:space="preserve">Filter the log by a user</w:t>
+            </w:r>
+          </w:p>
+        </w:tc>
+        <w:tc>
+          <w:tcPr>
+            <w:tcW w:w="560" w:type="pct"/>
+            <w:tcMar>
+              <w:top w:w="30" w:type="dxa"/>
+              <w:left w:w="80" w:type="dxa"/>
+              <w:bottom w:w="30" w:type="dxa"/>
+              <w:right w:w="80" w:type="dxa"/>
+            </w:tcMar>
+          </w:tcPr>
+          <w:p>
+            <w:r>
+              <w:rPr>
+                <w:rFonts w:ascii="Aptos" w:eastAsia="Aptos" w:hAnsi="Aptos" w:cs="Aptos"/>
+                <w:sz w:val="20"/>
+                <w:szCs w:val="20"/>
+              </w:rPr>
+              <w:t xml:space="preserve">Normal</w:t>
+            </w:r>
+          </w:p>
+        </w:tc>
+        <w:tc>
+          <w:tcPr>
+            <w:tcW w:w="2290" w:type="pct"/>
+            <w:tcMar>
+              <w:top w:w="30" w:type="dxa"/>
+              <w:left w:w="80" w:type="dxa"/>
+              <w:bottom w:w="30" w:type="dxa"/>
+              <w:right w:w="80" w:type="dxa"/>
+            </w:tcMar>
+          </w:tcPr>
+          <w:p>
+            <w:r>
+              <w:rPr>
+                <w:rFonts w:ascii="Aptos" w:eastAsia="Aptos" w:hAnsi="Aptos" w:cs="Aptos"/>
+                <w:sz w:val="20"/>
+                <w:szCs w:val="20"/>
+              </w:rPr>
+              <w:t xml:space="preserve">Only that user's entries are listed.</w:t>
+            </w:r>
+          </w:p>
+        </w:tc>
+      </w:tr>
+      <w:tr>
+        <w:trPr>
+          <w:cantSplit/>
+        </w:trPr>
+        <w:tc>
+          <w:tcPr>
+            <w:tcW w:w="300" w:type="pct"/>
+            <w:tcMar>
+              <w:top w:w="30" w:type="dxa"/>
+              <w:left w:w="80" w:type="dxa"/>
+              <w:bottom w:w="30" w:type="dxa"/>
+              <w:right w:w="80" w:type="dxa"/>
+            </w:tcMar>
+          </w:tcPr>
+          <w:p>
+            <w:r>
+              <w:rPr>
+                <w:rFonts w:ascii="Aptos" w:eastAsia="Aptos" w:hAnsi="Aptos" w:cs="Aptos"/>
+                <w:sz w:val="20"/>
+                <w:szCs w:val="20"/>
+              </w:rPr>
+              <w:t xml:space="preserve">225</w:t>
+            </w:r>
+          </w:p>
+        </w:tc>
+        <w:tc>
+          <w:tcPr>
+            <w:tcW w:w="1850" w:type="pct"/>
+            <w:tcMar>
+              <w:top w:w="30" w:type="dxa"/>
+              <w:left w:w="80" w:type="dxa"/>
+              <w:bottom w:w="30" w:type="dxa"/>
+              <w:right w:w="80" w:type="dxa"/>
+            </w:tcMar>
+          </w:tcPr>
+          <w:p>
+            <w:r>
+              <w:rPr>
+                <w:rFonts w:ascii="Aptos" w:eastAsia="Aptos" w:hAnsi="Aptos" w:cs="Aptos"/>
+                <w:sz w:val="20"/>
+                <w:szCs w:val="20"/>
+              </w:rPr>
+              <w:t xml:space="preserve">Filter the log by a type such as BOOKING</w:t>
+            </w:r>
+          </w:p>
+        </w:tc>
+        <w:tc>
+          <w:tcPr>
+            <w:tcW w:w="560" w:type="pct"/>
+            <w:tcMar>
+              <w:top w:w="30" w:type="dxa"/>
+              <w:left w:w="80" w:type="dxa"/>
+              <w:bottom w:w="30" w:type="dxa"/>
+              <w:right w:w="80" w:type="dxa"/>
+            </w:tcMar>
+          </w:tcPr>
+          <w:p>
+            <w:r>
+              <w:rPr>
+                <w:rFonts w:ascii="Aptos" w:eastAsia="Aptos" w:hAnsi="Aptos" w:cs="Aptos"/>
+                <w:sz w:val="20"/>
+                <w:szCs w:val="20"/>
+              </w:rPr>
+              <w:t xml:space="preserve">Normal</w:t>
+            </w:r>
+          </w:p>
+        </w:tc>
+        <w:tc>
+          <w:tcPr>
+            <w:tcW w:w="2290" w:type="pct"/>
+            <w:tcMar>
+              <w:top w:w="30" w:type="dxa"/>
+              <w:left w:w="80" w:type="dxa"/>
+              <w:bottom w:w="30" w:type="dxa"/>
+              <w:right w:w="80" w:type="dxa"/>
+            </w:tcMar>
+          </w:tcPr>
+          <w:p>
+            <w:r>
+              <w:rPr>
+                <w:rFonts w:ascii="Aptos" w:eastAsia="Aptos" w:hAnsi="Aptos" w:cs="Aptos"/>
+                <w:sz w:val="20"/>
+                <w:szCs w:val="20"/>
+              </w:rPr>
+              <w:t xml:space="preserve">Only the booking entries are listed.</w:t>
+            </w:r>
+          </w:p>
+        </w:tc>
+      </w:tr>
+      <w:tr>
+        <w:trPr>
+          <w:cantSplit/>
+        </w:trPr>
+        <w:tc>
+          <w:tcPr>
+            <w:tcW w:w="300" w:type="pct"/>
+            <w:tcMar>
+              <w:top w:w="30" w:type="dxa"/>
+              <w:left w:w="80" w:type="dxa"/>
+              <w:bottom w:w="30" w:type="dxa"/>
+              <w:right w:w="80" w:type="dxa"/>
+            </w:tcMar>
+          </w:tcPr>
+          <w:p>
+            <w:r>
+              <w:rPr>
+                <w:rFonts w:ascii="Aptos" w:eastAsia="Aptos" w:hAnsi="Aptos" w:cs="Aptos"/>
+                <w:sz w:val="20"/>
+                <w:szCs w:val="20"/>
+              </w:rPr>
+              <w:t xml:space="preserve">226</w:t>
+            </w:r>
+          </w:p>
+        </w:tc>
+        <w:tc>
+          <w:tcPr>
+            <w:tcW w:w="1850" w:type="pct"/>
+            <w:tcMar>
+              <w:top w:w="30" w:type="dxa"/>
+              <w:left w:w="80" w:type="dxa"/>
+              <w:bottom w:w="30" w:type="dxa"/>
+              <w:right w:w="80" w:type="dxa"/>
+            </w:tcMar>
+          </w:tcPr>
+          <w:p>
+            <w:r>
+              <w:rPr>
+                <w:rFonts w:ascii="Aptos" w:eastAsia="Aptos" w:hAnsi="Aptos" w:cs="Aptos"/>
+                <w:sz w:val="20"/>
+                <w:szCs w:val="20"/>
+              </w:rPr>
+              <w:t xml:space="preserve">Apply a user, a type and a severity filter together</w:t>
+            </w:r>
+          </w:p>
+        </w:tc>
+        <w:tc>
+          <w:tcPr>
+            <w:tcW w:w="560" w:type="pct"/>
+            <w:tcMar>
+              <w:top w:w="30" w:type="dxa"/>
+              <w:left w:w="80" w:type="dxa"/>
+              <w:bottom w:w="30" w:type="dxa"/>
+              <w:right w:w="80" w:type="dxa"/>
+            </w:tcMar>
+          </w:tcPr>
+          <w:p>
+            <w:r>
+              <w:rPr>
+                <w:rFonts w:ascii="Aptos" w:eastAsia="Aptos" w:hAnsi="Aptos" w:cs="Aptos"/>
+                <w:sz w:val="20"/>
+                <w:szCs w:val="20"/>
+              </w:rPr>
+              <w:t xml:space="preserve">Normal</w:t>
+            </w:r>
+          </w:p>
+        </w:tc>
+        <w:tc>
+          <w:tcPr>
+            <w:tcW w:w="2290" w:type="pct"/>
+            <w:tcMar>
+              <w:top w:w="30" w:type="dxa"/>
+              <w:left w:w="80" w:type="dxa"/>
+              <w:bottom w:w="30" w:type="dxa"/>
+              <w:right w:w="80" w:type="dxa"/>
+            </w:tcMar>
+          </w:tcPr>
+          <w:p>
+            <w:r>
+              <w:rPr>
+                <w:rFonts w:ascii="Aptos" w:eastAsia="Aptos" w:hAnsi="Aptos" w:cs="Aptos"/>
+                <w:sz w:val="20"/>
+                <w:szCs w:val="20"/>
+              </w:rPr>
+              <w:t xml:space="preserve">Only the entries matching all three are listed, so the filters combine rather than replacing one another.</w:t>
+            </w:r>
+          </w:p>
+        </w:tc>
+      </w:tr>
+      <w:tr>
+        <w:trPr>
+          <w:cantSplit/>
+        </w:trPr>
+        <w:tc>
+          <w:tcPr>
+            <w:tcW w:w="300" w:type="pct"/>
+            <w:tcMar>
+              <w:top w:w="30" w:type="dxa"/>
+              <w:left w:w="80" w:type="dxa"/>
+              <w:bottom w:w="30" w:type="dxa"/>
+              <w:right w:w="80" w:type="dxa"/>
+            </w:tcMar>
+          </w:tcPr>
+          <w:p>
+            <w:r>
+              <w:rPr>
+                <w:rFonts w:ascii="Aptos" w:eastAsia="Aptos" w:hAnsi="Aptos" w:cs="Aptos"/>
+                <w:sz w:val="20"/>
+                <w:szCs w:val="20"/>
+              </w:rPr>
+              <w:t xml:space="preserve">227</w:t>
+            </w:r>
+          </w:p>
+        </w:tc>
+        <w:tc>
+          <w:tcPr>
+            <w:tcW w:w="1850" w:type="pct"/>
+            <w:tcMar>
+              <w:top w:w="30" w:type="dxa"/>
+              <w:left w:w="80" w:type="dxa"/>
+              <w:bottom w:w="30" w:type="dxa"/>
+              <w:right w:w="80" w:type="dxa"/>
+            </w:tcMar>
+          </w:tcPr>
+          <w:p>
+            <w:r>
+              <w:rPr>
+                <w:rFonts w:ascii="Aptos" w:eastAsia="Aptos" w:hAnsi="Aptos" w:cs="Aptos"/>
+                <w:sz w:val="20"/>
+                <w:szCs w:val="20"/>
+              </w:rPr>
+              <w:t xml:space="preserve">Press Clear filters</w:t>
+            </w:r>
+          </w:p>
+        </w:tc>
+        <w:tc>
+          <w:tcPr>
+            <w:tcW w:w="560" w:type="pct"/>
+            <w:tcMar>
+              <w:top w:w="30" w:type="dxa"/>
+              <w:left w:w="80" w:type="dxa"/>
+              <w:bottom w:w="30" w:type="dxa"/>
+              <w:right w:w="80" w:type="dxa"/>
+            </w:tcMar>
+          </w:tcPr>
+          <w:p>
+            <w:r>
+              <w:rPr>
+                <w:rFonts w:ascii="Aptos" w:eastAsia="Aptos" w:hAnsi="Aptos" w:cs="Aptos"/>
+                <w:sz w:val="20"/>
+                <w:szCs w:val="20"/>
+              </w:rPr>
+              <w:t xml:space="preserve">Normal</w:t>
+            </w:r>
+          </w:p>
+        </w:tc>
+        <w:tc>
+          <w:tcPr>
+            <w:tcW w:w="2290" w:type="pct"/>
+            <w:tcMar>
+              <w:top w:w="30" w:type="dxa"/>
+              <w:left w:w="80" w:type="dxa"/>
+              <w:bottom w:w="30" w:type="dxa"/>
+              <w:right w:w="80" w:type="dxa"/>
+            </w:tcMar>
+          </w:tcPr>
+          <w:p>
+            <w:r>
+              <w:rPr>
+                <w:rFonts w:ascii="Aptos" w:eastAsia="Aptos" w:hAnsi="Aptos" w:cs="Aptos"/>
+                <w:sz w:val="20"/>
+                <w:szCs w:val="20"/>
+              </w:rPr>
+              <w:t xml:space="preserve">The full log is listed again and the count returns to the total number of entries.</w:t>
+            </w:r>
+          </w:p>
+        </w:tc>
+      </w:tr>
+      <w:tr>
+        <w:trPr>
+          <w:cantSplit/>
+        </w:trPr>
+        <w:tc>
+          <w:tcPr>
+            <w:tcW w:w="300" w:type="pct"/>
+            <w:tcMar>
+              <w:top w:w="30" w:type="dxa"/>
+              <w:left w:w="80" w:type="dxa"/>
+              <w:bottom w:w="30" w:type="dxa"/>
+              <w:right w:w="80" w:type="dxa"/>
+            </w:tcMar>
+          </w:tcPr>
+          <w:p>
+            <w:r>
+              <w:rPr>
+                <w:rFonts w:ascii="Aptos" w:eastAsia="Aptos" w:hAnsi="Aptos" w:cs="Aptos"/>
+                <w:sz w:val="20"/>
+                <w:szCs w:val="20"/>
+              </w:rPr>
+              <w:t xml:space="preserve">228</w:t>
+            </w:r>
+          </w:p>
+        </w:tc>
+        <w:tc>
+          <w:tcPr>
+            <w:tcW w:w="1850" w:type="pct"/>
+            <w:tcMar>
+              <w:top w:w="30" w:type="dxa"/>
+              <w:left w:w="80" w:type="dxa"/>
+              <w:bottom w:w="30" w:type="dxa"/>
+              <w:right w:w="80" w:type="dxa"/>
+            </w:tcMar>
+          </w:tcPr>
+          <w:p>
+            <w:r>
+              <w:rPr>
+                <w:rFonts w:ascii="Aptos" w:eastAsia="Aptos" w:hAnsi="Aptos" w:cs="Aptos"/>
+                <w:sz w:val="20"/>
+                <w:szCs w:val="20"/>
+              </w:rPr>
+              <w:t xml:space="preserve">Filter the log down to something that matches nothing</w:t>
+            </w:r>
+          </w:p>
+        </w:tc>
+        <w:tc>
+          <w:tcPr>
+            <w:tcW w:w="560" w:type="pct"/>
+            <w:tcMar>
+              <w:top w:w="30" w:type="dxa"/>
+              <w:left w:w="80" w:type="dxa"/>
+              <w:bottom w:w="30" w:type="dxa"/>
+              <w:right w:w="80" w:type="dxa"/>
+            </w:tcMar>
+          </w:tcPr>
+          <w:p>
+            <w:r>
+              <w:rPr>
+                <w:rFonts w:ascii="Aptos" w:eastAsia="Aptos" w:hAnsi="Aptos" w:cs="Aptos"/>
+                <w:sz w:val="20"/>
+                <w:szCs w:val="20"/>
+              </w:rPr>
+              <w:t xml:space="preserve">Boundary</w:t>
+            </w:r>
+          </w:p>
+        </w:tc>
+        <w:tc>
+          <w:tcPr>
+            <w:tcW w:w="2290" w:type="pct"/>
+            <w:tcMar>
+              <w:top w:w="30" w:type="dxa"/>
+              <w:left w:w="80" w:type="dxa"/>
+              <w:bottom w:w="30" w:type="dxa"/>
+              <w:right w:w="80" w:type="dxa"/>
+            </w:tcMar>
+          </w:tcPr>
+          <w:p>
+            <w:r>
+              <w:rPr>
+                <w:rFonts w:ascii="Aptos" w:eastAsia="Aptos" w:hAnsi="Aptos" w:cs="Aptos"/>
+                <w:sz w:val="20"/>
+                <w:szCs w:val="20"/>
+              </w:rPr>
+              <w:t xml:space="preserve">The grid comes back empty and the count shows zero rather than the form reporting an error.</w:t>
             </w:r>
           </w:p>
         </w:tc>

</xml_diff>

<commit_message>
added objective 40: holding settings in the database
</commit_message>
<xml_diff>
--- a/Testing.docx
+++ b/Testing.docx
@@ -25165,6 +25165,696 @@
                 <w:szCs w:val="20"/>
               </w:rPr>
               <w:t xml:space="preserve">The grid comes back empty and the count shows zero rather than the form reporting an error.</w:t>
+            </w:r>
+          </w:p>
+        </w:tc>
+      </w:tr>
+    </w:tbl>
+    <w:p>
+      <w:r>
+        <w:rPr>
+          <w:rFonts w:ascii="Aptos" w:eastAsia="Aptos" w:hAnsi="Aptos" w:cs="Aptos"/>
+        </w:rPr>
+        <w:t xml:space="preserve"/>
+      </w:r>
+    </w:p>
+    <w:p>
+      <w:pPr>
+        <w:pStyle w:val="Heading3"/>
+      </w:pPr>
+      <w:r>
+        <w:rPr>
+          <w:rFonts w:ascii="Aptos Display" w:eastAsia="Aptos Display" w:hAnsi="Aptos Display" w:cs="Aptos Display"/>
+          <w:b/>
+          <w:bCs/>
+          <w:color w:val="000000"/>
+        </w:rPr>
+        <w:t xml:space="preserve">Objective 40: Holding Settings in the Database</w:t>
+      </w:r>
+    </w:p>
+    <w:p>
+      <w:r>
+        <w:rPr>
+          <w:rFonts w:ascii="Aptos" w:eastAsia="Aptos" w:hAnsi="Aptos" w:cs="Aptos"/>
+        </w:rPr>
+        <w:t xml:space="preserve">The prototype had values such as the length of the trailers and the number of login attempts written into the program, which meant they could only be changed by rebuilding it. These tests check that they now live in the database and that changing one really does change how the system behaves.</w:t>
+      </w:r>
+    </w:p>
+    <w:tbl>
+      <w:tblPr>
+        <w:tblW w:w="5000" w:type="pct"/>
+        <w:tblBorders>
+          <w:top w:val="single" w:sz="4" w:space="0" w:color="808080"/>
+          <w:left w:val="single" w:sz="4" w:space="0" w:color="808080"/>
+          <w:bottom w:val="single" w:sz="4" w:space="0" w:color="808080"/>
+          <w:right w:val="single" w:sz="4" w:space="0" w:color="808080"/>
+          <w:insideH w:val="single" w:sz="4" w:space="0" w:color="808080"/>
+          <w:insideV w:val="single" w:sz="4" w:space="0" w:color="808080"/>
+        </w:tblBorders>
+        <w:tblCellMar>
+          <w:left w:w="10" w:type="dxa"/>
+          <w:right w:w="10" w:type="dxa"/>
+        </w:tblCellMar>
+        <w:tblLook w:val="0000" w:firstRow="0" w:lastRow="0" w:firstColumn="0" w:lastColumn="0" w:noHBand="0" w:noVBand="0"/>
+      </w:tblPr>
+      <w:tblGrid>
+        <w:gridCol w:w="561"/>
+        <w:gridCol w:w="3460"/>
+        <w:gridCol w:w="1047"/>
+        <w:gridCol w:w="4282"/>
+      </w:tblGrid>
+      <w:tr>
+        <w:trPr>
+          <w:cantSplit/>
+          <w:tblHeader/>
+        </w:trPr>
+        <w:tc>
+          <w:tcPr>
+            <w:tcW w:w="300" w:type="pct"/>
+            <w:shd w:val="clear" w:color="auto" w:fill="F2CEED" w:themeFill="accent5" w:themeFillTint="33"/>
+            <w:tcMar>
+              <w:top w:w="30" w:type="dxa"/>
+              <w:left w:w="80" w:type="dxa"/>
+              <w:bottom w:w="30" w:type="dxa"/>
+              <w:right w:w="80" w:type="dxa"/>
+            </w:tcMar>
+          </w:tcPr>
+          <w:p>
+            <w:r>
+              <w:rPr>
+                <w:rFonts w:ascii="Aptos" w:eastAsia="Aptos" w:hAnsi="Aptos" w:cs="Aptos"/>
+                <w:b/>
+                <w:bCs/>
+                <w:sz w:val="20"/>
+                <w:szCs w:val="20"/>
+              </w:rPr>
+              <w:t xml:space="preserve">No.</w:t>
+            </w:r>
+          </w:p>
+        </w:tc>
+        <w:tc>
+          <w:tcPr>
+            <w:tcW w:w="1850" w:type="pct"/>
+            <w:shd w:val="clear" w:color="auto" w:fill="F2CEED" w:themeFill="accent5" w:themeFillTint="33"/>
+            <w:tcMar>
+              <w:top w:w="30" w:type="dxa"/>
+              <w:left w:w="80" w:type="dxa"/>
+              <w:bottom w:w="30" w:type="dxa"/>
+              <w:right w:w="80" w:type="dxa"/>
+            </w:tcMar>
+          </w:tcPr>
+          <w:p>
+            <w:r>
+              <w:rPr>
+                <w:rFonts w:ascii="Aptos" w:eastAsia="Aptos" w:hAnsi="Aptos" w:cs="Aptos"/>
+                <w:b/>
+                <w:bCs/>
+                <w:sz w:val="20"/>
+                <w:szCs w:val="20"/>
+              </w:rPr>
+              <w:t xml:space="preserve">Test</w:t>
+            </w:r>
+          </w:p>
+        </w:tc>
+        <w:tc>
+          <w:tcPr>
+            <w:tcW w:w="560" w:type="pct"/>
+            <w:shd w:val="clear" w:color="auto" w:fill="F2CEED" w:themeFill="accent5" w:themeFillTint="33"/>
+            <w:tcMar>
+              <w:top w:w="30" w:type="dxa"/>
+              <w:left w:w="80" w:type="dxa"/>
+              <w:bottom w:w="30" w:type="dxa"/>
+              <w:right w:w="80" w:type="dxa"/>
+            </w:tcMar>
+          </w:tcPr>
+          <w:p>
+            <w:r>
+              <w:rPr>
+                <w:rFonts w:ascii="Aptos" w:eastAsia="Aptos" w:hAnsi="Aptos" w:cs="Aptos"/>
+                <w:b/>
+                <w:bCs/>
+                <w:sz w:val="20"/>
+                <w:szCs w:val="20"/>
+              </w:rPr>
+              <w:t xml:space="preserve">Type</w:t>
+            </w:r>
+          </w:p>
+        </w:tc>
+        <w:tc>
+          <w:tcPr>
+            <w:tcW w:w="2290" w:type="pct"/>
+            <w:shd w:val="clear" w:color="auto" w:fill="F2CEED" w:themeFill="accent5" w:themeFillTint="33"/>
+            <w:tcMar>
+              <w:top w:w="30" w:type="dxa"/>
+              <w:left w:w="80" w:type="dxa"/>
+              <w:bottom w:w="30" w:type="dxa"/>
+              <w:right w:w="80" w:type="dxa"/>
+            </w:tcMar>
+          </w:tcPr>
+          <w:p>
+            <w:r>
+              <w:rPr>
+                <w:rFonts w:ascii="Aptos" w:eastAsia="Aptos" w:hAnsi="Aptos" w:cs="Aptos"/>
+                <w:b/>
+                <w:bCs/>
+                <w:sz w:val="20"/>
+                <w:szCs w:val="20"/>
+              </w:rPr>
+              <w:t xml:space="preserve">Expected Result</w:t>
+            </w:r>
+          </w:p>
+        </w:tc>
+      </w:tr>
+      <w:tr>
+        <w:trPr>
+          <w:cantSplit/>
+        </w:trPr>
+        <w:tc>
+          <w:tcPr>
+            <w:tcW w:w="300" w:type="pct"/>
+            <w:tcMar>
+              <w:top w:w="30" w:type="dxa"/>
+              <w:left w:w="80" w:type="dxa"/>
+              <w:bottom w:w="30" w:type="dxa"/>
+              <w:right w:w="80" w:type="dxa"/>
+            </w:tcMar>
+          </w:tcPr>
+          <w:p>
+            <w:r>
+              <w:rPr>
+                <w:rFonts w:ascii="Aptos" w:eastAsia="Aptos" w:hAnsi="Aptos" w:cs="Aptos"/>
+                <w:sz w:val="20"/>
+                <w:szCs w:val="20"/>
+              </w:rPr>
+              <w:t xml:space="preserve">229</w:t>
+            </w:r>
+          </w:p>
+        </w:tc>
+        <w:tc>
+          <w:tcPr>
+            <w:tcW w:w="1850" w:type="pct"/>
+            <w:tcMar>
+              <w:top w:w="30" w:type="dxa"/>
+              <w:left w:w="80" w:type="dxa"/>
+              <w:bottom w:w="30" w:type="dxa"/>
+              <w:right w:w="80" w:type="dxa"/>
+            </w:tcMar>
+          </w:tcPr>
+          <w:p>
+            <w:r>
+              <w:rPr>
+                <w:rFonts w:ascii="Aptos" w:eastAsia="Aptos" w:hAnsi="Aptos" w:cs="Aptos"/>
+                <w:sz w:val="20"/>
+                <w:szCs w:val="20"/>
+              </w:rPr>
+              <w:t xml:space="preserve">Look at tblSystemSetting</w:t>
+            </w:r>
+          </w:p>
+        </w:tc>
+        <w:tc>
+          <w:tcPr>
+            <w:tcW w:w="560" w:type="pct"/>
+            <w:tcMar>
+              <w:top w:w="30" w:type="dxa"/>
+              <w:left w:w="80" w:type="dxa"/>
+              <w:bottom w:w="30" w:type="dxa"/>
+              <w:right w:w="80" w:type="dxa"/>
+            </w:tcMar>
+          </w:tcPr>
+          <w:p>
+            <w:r>
+              <w:rPr>
+                <w:rFonts w:ascii="Aptos" w:eastAsia="Aptos" w:hAnsi="Aptos" w:cs="Aptos"/>
+                <w:sz w:val="20"/>
+                <w:szCs w:val="20"/>
+              </w:rPr>
+              <w:t xml:space="preserve">Normal</w:t>
+            </w:r>
+          </w:p>
+        </w:tc>
+        <w:tc>
+          <w:tcPr>
+            <w:tcW w:w="2290" w:type="pct"/>
+            <w:tcMar>
+              <w:top w:w="30" w:type="dxa"/>
+              <w:left w:w="80" w:type="dxa"/>
+              <w:bottom w:w="30" w:type="dxa"/>
+              <w:right w:w="80" w:type="dxa"/>
+            </w:tcMar>
+          </w:tcPr>
+          <w:p>
+            <w:r>
+              <w:rPr>
+                <w:rFonts w:ascii="Aptos" w:eastAsia="Aptos" w:hAnsi="Aptos" w:cs="Aptos"/>
+                <w:sz w:val="20"/>
+                <w:szCs w:val="20"/>
+              </w:rPr>
+              <w:t xml:space="preserve">The trailer time, the turnaround time, the first and last show times, the rounding, the default ticket price, the maximum seats per sale, the kiosk idle time, the number of login attempts and the minimum password length are all held there as data.</w:t>
+            </w:r>
+          </w:p>
+        </w:tc>
+      </w:tr>
+      <w:tr>
+        <w:trPr>
+          <w:cantSplit/>
+        </w:trPr>
+        <w:tc>
+          <w:tcPr>
+            <w:tcW w:w="300" w:type="pct"/>
+            <w:tcMar>
+              <w:top w:w="30" w:type="dxa"/>
+              <w:left w:w="80" w:type="dxa"/>
+              <w:bottom w:w="30" w:type="dxa"/>
+              <w:right w:w="80" w:type="dxa"/>
+            </w:tcMar>
+          </w:tcPr>
+          <w:p>
+            <w:r>
+              <w:rPr>
+                <w:rFonts w:ascii="Aptos" w:eastAsia="Aptos" w:hAnsi="Aptos" w:cs="Aptos"/>
+                <w:sz w:val="20"/>
+                <w:szCs w:val="20"/>
+              </w:rPr>
+              <w:t xml:space="preserve">230</w:t>
+            </w:r>
+          </w:p>
+        </w:tc>
+        <w:tc>
+          <w:tcPr>
+            <w:tcW w:w="1850" w:type="pct"/>
+            <w:tcMar>
+              <w:top w:w="30" w:type="dxa"/>
+              <w:left w:w="80" w:type="dxa"/>
+              <w:bottom w:w="30" w:type="dxa"/>
+              <w:right w:w="80" w:type="dxa"/>
+            </w:tcMar>
+          </w:tcPr>
+          <w:p>
+            <w:r>
+              <w:rPr>
+                <w:rFonts w:ascii="Aptos" w:eastAsia="Aptos" w:hAnsi="Aptos" w:cs="Aptos"/>
+                <w:sz w:val="20"/>
+                <w:szCs w:val="20"/>
+              </w:rPr>
+              <w:t xml:space="preserve">Change the default ticket price to 8.00 and add a new screening</w:t>
+            </w:r>
+          </w:p>
+        </w:tc>
+        <w:tc>
+          <w:tcPr>
+            <w:tcW w:w="560" w:type="pct"/>
+            <w:tcMar>
+              <w:top w:w="30" w:type="dxa"/>
+              <w:left w:w="80" w:type="dxa"/>
+              <w:bottom w:w="30" w:type="dxa"/>
+              <w:right w:w="80" w:type="dxa"/>
+            </w:tcMar>
+          </w:tcPr>
+          <w:p>
+            <w:r>
+              <w:rPr>
+                <w:rFonts w:ascii="Aptos" w:eastAsia="Aptos" w:hAnsi="Aptos" w:cs="Aptos"/>
+                <w:sz w:val="20"/>
+                <w:szCs w:val="20"/>
+              </w:rPr>
+              <w:t xml:space="preserve">Normal</w:t>
+            </w:r>
+          </w:p>
+        </w:tc>
+        <w:tc>
+          <w:tcPr>
+            <w:tcW w:w="2290" w:type="pct"/>
+            <w:tcMar>
+              <w:top w:w="30" w:type="dxa"/>
+              <w:left w:w="80" w:type="dxa"/>
+              <w:bottom w:w="30" w:type="dxa"/>
+              <w:right w:w="80" w:type="dxa"/>
+            </w:tcMar>
+          </w:tcPr>
+          <w:p>
+            <w:r>
+              <w:rPr>
+                <w:rFonts w:ascii="Aptos" w:eastAsia="Aptos" w:hAnsi="Aptos" w:cs="Aptos"/>
+                <w:sz w:val="20"/>
+                <w:szCs w:val="20"/>
+              </w:rPr>
+              <w:t xml:space="preserve">The new screening is offered at £8.00 without the price being typed in, so the setting is genuinely being read.</w:t>
+            </w:r>
+          </w:p>
+        </w:tc>
+      </w:tr>
+      <w:tr>
+        <w:trPr>
+          <w:cantSplit/>
+        </w:trPr>
+        <w:tc>
+          <w:tcPr>
+            <w:tcW w:w="300" w:type="pct"/>
+            <w:tcMar>
+              <w:top w:w="30" w:type="dxa"/>
+              <w:left w:w="80" w:type="dxa"/>
+              <w:bottom w:w="30" w:type="dxa"/>
+              <w:right w:w="80" w:type="dxa"/>
+            </w:tcMar>
+          </w:tcPr>
+          <w:p>
+            <w:r>
+              <w:rPr>
+                <w:rFonts w:ascii="Aptos" w:eastAsia="Aptos" w:hAnsi="Aptos" w:cs="Aptos"/>
+                <w:sz w:val="20"/>
+                <w:szCs w:val="20"/>
+              </w:rPr>
+              <w:t xml:space="preserve">231</w:t>
+            </w:r>
+          </w:p>
+        </w:tc>
+        <w:tc>
+          <w:tcPr>
+            <w:tcW w:w="1850" w:type="pct"/>
+            <w:tcMar>
+              <w:top w:w="30" w:type="dxa"/>
+              <w:left w:w="80" w:type="dxa"/>
+              <w:bottom w:w="30" w:type="dxa"/>
+              <w:right w:w="80" w:type="dxa"/>
+            </w:tcMar>
+          </w:tcPr>
+          <w:p>
+            <w:r>
+              <w:rPr>
+                <w:rFonts w:ascii="Aptos" w:eastAsia="Aptos" w:hAnsi="Aptos" w:cs="Aptos"/>
+                <w:sz w:val="20"/>
+                <w:szCs w:val="20"/>
+              </w:rPr>
+              <w:t xml:space="preserve">Change the maximum seats per sale from 8 to 4, then try to select 5 seats in one sale</w:t>
+            </w:r>
+          </w:p>
+        </w:tc>
+        <w:tc>
+          <w:tcPr>
+            <w:tcW w:w="560" w:type="pct"/>
+            <w:tcMar>
+              <w:top w:w="30" w:type="dxa"/>
+              <w:left w:w="80" w:type="dxa"/>
+              <w:bottom w:w="30" w:type="dxa"/>
+              <w:right w:w="80" w:type="dxa"/>
+            </w:tcMar>
+          </w:tcPr>
+          <w:p>
+            <w:r>
+              <w:rPr>
+                <w:rFonts w:ascii="Aptos" w:eastAsia="Aptos" w:hAnsi="Aptos" w:cs="Aptos"/>
+                <w:sz w:val="20"/>
+                <w:szCs w:val="20"/>
+              </w:rPr>
+              <w:t xml:space="preserve">Normal</w:t>
+            </w:r>
+          </w:p>
+        </w:tc>
+        <w:tc>
+          <w:tcPr>
+            <w:tcW w:w="2290" w:type="pct"/>
+            <w:tcMar>
+              <w:top w:w="30" w:type="dxa"/>
+              <w:left w:w="80" w:type="dxa"/>
+              <w:bottom w:w="30" w:type="dxa"/>
+              <w:right w:w="80" w:type="dxa"/>
+            </w:tcMar>
+          </w:tcPr>
+          <w:p>
+            <w:r>
+              <w:rPr>
+                <w:rFonts w:ascii="Aptos" w:eastAsia="Aptos" w:hAnsi="Aptos" w:cs="Aptos"/>
+                <w:sz w:val="20"/>
+                <w:szCs w:val="20"/>
+              </w:rPr>
+              <w:t xml:space="preserve">The fifth seat cannot be added and the message names the new limit of 4, showing the change took effect without the program being rebuilt.</w:t>
+            </w:r>
+          </w:p>
+        </w:tc>
+      </w:tr>
+      <w:tr>
+        <w:trPr>
+          <w:cantSplit/>
+        </w:trPr>
+        <w:tc>
+          <w:tcPr>
+            <w:tcW w:w="300" w:type="pct"/>
+            <w:tcMar>
+              <w:top w:w="30" w:type="dxa"/>
+              <w:left w:w="80" w:type="dxa"/>
+              <w:bottom w:w="30" w:type="dxa"/>
+              <w:right w:w="80" w:type="dxa"/>
+            </w:tcMar>
+          </w:tcPr>
+          <w:p>
+            <w:r>
+              <w:rPr>
+                <w:rFonts w:ascii="Aptos" w:eastAsia="Aptos" w:hAnsi="Aptos" w:cs="Aptos"/>
+                <w:sz w:val="20"/>
+                <w:szCs w:val="20"/>
+              </w:rPr>
+              <w:t xml:space="preserve">232</w:t>
+            </w:r>
+          </w:p>
+        </w:tc>
+        <w:tc>
+          <w:tcPr>
+            <w:tcW w:w="1850" w:type="pct"/>
+            <w:tcMar>
+              <w:top w:w="30" w:type="dxa"/>
+              <w:left w:w="80" w:type="dxa"/>
+              <w:bottom w:w="30" w:type="dxa"/>
+              <w:right w:w="80" w:type="dxa"/>
+            </w:tcMar>
+          </w:tcPr>
+          <w:p>
+            <w:r>
+              <w:rPr>
+                <w:rFonts w:ascii="Aptos" w:eastAsia="Aptos" w:hAnsi="Aptos" w:cs="Aptos"/>
+                <w:sz w:val="20"/>
+                <w:szCs w:val="20"/>
+              </w:rPr>
+              <w:t xml:space="preserve">Change the number of login attempts allowed from 3 to 2, then fail to log in twice</w:t>
+            </w:r>
+          </w:p>
+        </w:tc>
+        <w:tc>
+          <w:tcPr>
+            <w:tcW w:w="560" w:type="pct"/>
+            <w:tcMar>
+              <w:top w:w="30" w:type="dxa"/>
+              <w:left w:w="80" w:type="dxa"/>
+              <w:bottom w:w="30" w:type="dxa"/>
+              <w:right w:w="80" w:type="dxa"/>
+            </w:tcMar>
+          </w:tcPr>
+          <w:p>
+            <w:r>
+              <w:rPr>
+                <w:rFonts w:ascii="Aptos" w:eastAsia="Aptos" w:hAnsi="Aptos" w:cs="Aptos"/>
+                <w:sz w:val="20"/>
+                <w:szCs w:val="20"/>
+              </w:rPr>
+              <w:t xml:space="preserve">Normal</w:t>
+            </w:r>
+          </w:p>
+        </w:tc>
+        <w:tc>
+          <w:tcPr>
+            <w:tcW w:w="2290" w:type="pct"/>
+            <w:tcMar>
+              <w:top w:w="30" w:type="dxa"/>
+              <w:left w:w="80" w:type="dxa"/>
+              <w:bottom w:w="30" w:type="dxa"/>
+              <w:right w:w="80" w:type="dxa"/>
+            </w:tcMar>
+          </w:tcPr>
+          <w:p>
+            <w:r>
+              <w:rPr>
+                <w:rFonts w:ascii="Aptos" w:eastAsia="Aptos" w:hAnsi="Aptos" w:cs="Aptos"/>
+                <w:sz w:val="20"/>
+                <w:szCs w:val="20"/>
+              </w:rPr>
+              <w:t xml:space="preserve">The program closes after the second failed attempt rather than the third.</w:t>
+            </w:r>
+          </w:p>
+        </w:tc>
+      </w:tr>
+      <w:tr>
+        <w:trPr>
+          <w:cantSplit/>
+        </w:trPr>
+        <w:tc>
+          <w:tcPr>
+            <w:tcW w:w="300" w:type="pct"/>
+            <w:tcMar>
+              <w:top w:w="30" w:type="dxa"/>
+              <w:left w:w="80" w:type="dxa"/>
+              <w:bottom w:w="30" w:type="dxa"/>
+              <w:right w:w="80" w:type="dxa"/>
+            </w:tcMar>
+          </w:tcPr>
+          <w:p>
+            <w:r>
+              <w:rPr>
+                <w:rFonts w:ascii="Aptos" w:eastAsia="Aptos" w:hAnsi="Aptos" w:cs="Aptos"/>
+                <w:sz w:val="20"/>
+                <w:szCs w:val="20"/>
+              </w:rPr>
+              <w:t xml:space="preserve">233</w:t>
+            </w:r>
+          </w:p>
+        </w:tc>
+        <w:tc>
+          <w:tcPr>
+            <w:tcW w:w="1850" w:type="pct"/>
+            <w:tcMar>
+              <w:top w:w="30" w:type="dxa"/>
+              <w:left w:w="80" w:type="dxa"/>
+              <w:bottom w:w="30" w:type="dxa"/>
+              <w:right w:w="80" w:type="dxa"/>
+            </w:tcMar>
+          </w:tcPr>
+          <w:p>
+            <w:r>
+              <w:rPr>
+                <w:rFonts w:ascii="Aptos" w:eastAsia="Aptos" w:hAnsi="Aptos" w:cs="Aptos"/>
+                <w:sz w:val="20"/>
+                <w:szCs w:val="20"/>
+              </w:rPr>
+              <w:t xml:space="preserve">Enter a first show time of 9:5 in the settings</w:t>
+            </w:r>
+          </w:p>
+        </w:tc>
+        <w:tc>
+          <w:tcPr>
+            <w:tcW w:w="560" w:type="pct"/>
+            <w:tcMar>
+              <w:top w:w="30" w:type="dxa"/>
+              <w:left w:w="80" w:type="dxa"/>
+              <w:bottom w:w="30" w:type="dxa"/>
+              <w:right w:w="80" w:type="dxa"/>
+            </w:tcMar>
+          </w:tcPr>
+          <w:p>
+            <w:r>
+              <w:rPr>
+                <w:rFonts w:ascii="Aptos" w:eastAsia="Aptos" w:hAnsi="Aptos" w:cs="Aptos"/>
+                <w:sz w:val="20"/>
+                <w:szCs w:val="20"/>
+              </w:rPr>
+              <w:t xml:space="preserve">Erroneous</w:t>
+            </w:r>
+          </w:p>
+        </w:tc>
+        <w:tc>
+          <w:tcPr>
+            <w:tcW w:w="2290" w:type="pct"/>
+            <w:tcMar>
+              <w:top w:w="30" w:type="dxa"/>
+              <w:left w:w="80" w:type="dxa"/>
+              <w:bottom w:w="30" w:type="dxa"/>
+              <w:right w:w="80" w:type="dxa"/>
+            </w:tcMar>
+          </w:tcPr>
+          <w:p>
+            <w:r>
+              <w:rPr>
+                <w:rFonts w:ascii="Aptos" w:eastAsia="Aptos" w:hAnsi="Aptos" w:cs="Aptos"/>
+                <w:sz w:val="20"/>
+                <w:szCs w:val="20"/>
+              </w:rPr>
+              <w:t xml:space="preserve">The setting is rejected because it is not a valid HH:MM time, and the value already stored is left alone.</w:t>
+            </w:r>
+          </w:p>
+        </w:tc>
+      </w:tr>
+      <w:tr>
+        <w:trPr>
+          <w:cantSplit/>
+        </w:trPr>
+        <w:tc>
+          <w:tcPr>
+            <w:tcW w:w="300" w:type="pct"/>
+            <w:tcMar>
+              <w:top w:w="30" w:type="dxa"/>
+              <w:left w:w="80" w:type="dxa"/>
+              <w:bottom w:w="30" w:type="dxa"/>
+              <w:right w:w="80" w:type="dxa"/>
+            </w:tcMar>
+          </w:tcPr>
+          <w:p>
+            <w:r>
+              <w:rPr>
+                <w:rFonts w:ascii="Aptos" w:eastAsia="Aptos" w:hAnsi="Aptos" w:cs="Aptos"/>
+                <w:sz w:val="20"/>
+                <w:szCs w:val="20"/>
+              </w:rPr>
+              <w:t xml:space="preserve">234</w:t>
+            </w:r>
+          </w:p>
+        </w:tc>
+        <w:tc>
+          <w:tcPr>
+            <w:tcW w:w="1850" w:type="pct"/>
+            <w:tcMar>
+              <w:top w:w="30" w:type="dxa"/>
+              <w:left w:w="80" w:type="dxa"/>
+              <w:bottom w:w="30" w:type="dxa"/>
+              <w:right w:w="80" w:type="dxa"/>
+            </w:tcMar>
+          </w:tcPr>
+          <w:p>
+            <w:r>
+              <w:rPr>
+                <w:rFonts w:ascii="Aptos" w:eastAsia="Aptos" w:hAnsi="Aptos" w:cs="Aptos"/>
+                <w:sz w:val="20"/>
+                <w:szCs w:val="20"/>
+              </w:rPr>
+              <w:t xml:space="preserve">Put every setting back to its original value and confirm the system behaves as it did before</w:t>
+            </w:r>
+          </w:p>
+        </w:tc>
+        <w:tc>
+          <w:tcPr>
+            <w:tcW w:w="560" w:type="pct"/>
+            <w:tcMar>
+              <w:top w:w="30" w:type="dxa"/>
+              <w:left w:w="80" w:type="dxa"/>
+              <w:bottom w:w="30" w:type="dxa"/>
+              <w:right w:w="80" w:type="dxa"/>
+            </w:tcMar>
+          </w:tcPr>
+          <w:p>
+            <w:r>
+              <w:rPr>
+                <w:rFonts w:ascii="Aptos" w:eastAsia="Aptos" w:hAnsi="Aptos" w:cs="Aptos"/>
+                <w:sz w:val="20"/>
+                <w:szCs w:val="20"/>
+              </w:rPr>
+              <w:t xml:space="preserve">Normal</w:t>
+            </w:r>
+          </w:p>
+        </w:tc>
+        <w:tc>
+          <w:tcPr>
+            <w:tcW w:w="2290" w:type="pct"/>
+            <w:tcMar>
+              <w:top w:w="30" w:type="dxa"/>
+              <w:left w:w="80" w:type="dxa"/>
+              <w:bottom w:w="30" w:type="dxa"/>
+              <w:right w:w="80" w:type="dxa"/>
+            </w:tcMar>
+          </w:tcPr>
+          <w:p>
+            <w:r>
+              <w:rPr>
+                <w:rFonts w:ascii="Aptos" w:eastAsia="Aptos" w:hAnsi="Aptos" w:cs="Aptos"/>
+                <w:sz w:val="20"/>
+                <w:szCs w:val="20"/>
+              </w:rPr>
+              <w:t xml:space="preserve">The behaviour returns to what the rest of this plan assumes, which shows the settings can be changed both ways rather than only in one direction.</w:t>
             </w:r>
           </w:p>
         </w:tc>

</xml_diff>

<commit_message>
added objective 41: light and dark colour schemes
</commit_message>
<xml_diff>
--- a/Testing.docx
+++ b/Testing.docx
@@ -25855,6 +25855,696 @@
                 <w:szCs w:val="20"/>
               </w:rPr>
               <w:t xml:space="preserve">The behaviour returns to what the rest of this plan assumes, which shows the settings can be changed both ways rather than only in one direction.</w:t>
+            </w:r>
+          </w:p>
+        </w:tc>
+      </w:tr>
+    </w:tbl>
+    <w:p>
+      <w:r>
+        <w:rPr>
+          <w:rFonts w:ascii="Aptos" w:eastAsia="Aptos" w:hAnsi="Aptos" w:cs="Aptos"/>
+        </w:rPr>
+        <w:t xml:space="preserve"/>
+      </w:r>
+    </w:p>
+    <w:p>
+      <w:pPr>
+        <w:pStyle w:val="Heading3"/>
+      </w:pPr>
+      <w:r>
+        <w:rPr>
+          <w:rFonts w:ascii="Aptos Display" w:eastAsia="Aptos Display" w:hAnsi="Aptos Display" w:cs="Aptos Display"/>
+          <w:b/>
+          <w:bCs/>
+          <w:color w:val="000000"/>
+        </w:rPr>
+        <w:t xml:space="preserve">Objective 41: Light and Dark Colour Schemes</w:t>
+      </w:r>
+    </w:p>
+    <w:p>
+      <w:r>
+        <w:rPr>
+          <w:rFonts w:ascii="Aptos" w:eastAsia="Aptos" w:hAnsi="Aptos" w:cs="Aptos"/>
+        </w:rPr>
+        <w:t xml:space="preserve">These tests check that the colour scheme is applied everywhere rather than only on the form it was changed from, and that it is remembered against the user account rather than the machine, which is the part that makes it useful when two people share a till.</w:t>
+      </w:r>
+    </w:p>
+    <w:tbl>
+      <w:tblPr>
+        <w:tblW w:w="5000" w:type="pct"/>
+        <w:tblBorders>
+          <w:top w:val="single" w:sz="4" w:space="0" w:color="808080"/>
+          <w:left w:val="single" w:sz="4" w:space="0" w:color="808080"/>
+          <w:bottom w:val="single" w:sz="4" w:space="0" w:color="808080"/>
+          <w:right w:val="single" w:sz="4" w:space="0" w:color="808080"/>
+          <w:insideH w:val="single" w:sz="4" w:space="0" w:color="808080"/>
+          <w:insideV w:val="single" w:sz="4" w:space="0" w:color="808080"/>
+        </w:tblBorders>
+        <w:tblCellMar>
+          <w:left w:w="10" w:type="dxa"/>
+          <w:right w:w="10" w:type="dxa"/>
+        </w:tblCellMar>
+        <w:tblLook w:val="0000" w:firstRow="0" w:lastRow="0" w:firstColumn="0" w:lastColumn="0" w:noHBand="0" w:noVBand="0"/>
+      </w:tblPr>
+      <w:tblGrid>
+        <w:gridCol w:w="561"/>
+        <w:gridCol w:w="3460"/>
+        <w:gridCol w:w="1047"/>
+        <w:gridCol w:w="4282"/>
+      </w:tblGrid>
+      <w:tr>
+        <w:trPr>
+          <w:cantSplit/>
+          <w:tblHeader/>
+        </w:trPr>
+        <w:tc>
+          <w:tcPr>
+            <w:tcW w:w="300" w:type="pct"/>
+            <w:shd w:val="clear" w:color="auto" w:fill="F2CEED" w:themeFill="accent5" w:themeFillTint="33"/>
+            <w:tcMar>
+              <w:top w:w="30" w:type="dxa"/>
+              <w:left w:w="80" w:type="dxa"/>
+              <w:bottom w:w="30" w:type="dxa"/>
+              <w:right w:w="80" w:type="dxa"/>
+            </w:tcMar>
+          </w:tcPr>
+          <w:p>
+            <w:r>
+              <w:rPr>
+                <w:rFonts w:ascii="Aptos" w:eastAsia="Aptos" w:hAnsi="Aptos" w:cs="Aptos"/>
+                <w:b/>
+                <w:bCs/>
+                <w:sz w:val="20"/>
+                <w:szCs w:val="20"/>
+              </w:rPr>
+              <w:t xml:space="preserve">No.</w:t>
+            </w:r>
+          </w:p>
+        </w:tc>
+        <w:tc>
+          <w:tcPr>
+            <w:tcW w:w="1850" w:type="pct"/>
+            <w:shd w:val="clear" w:color="auto" w:fill="F2CEED" w:themeFill="accent5" w:themeFillTint="33"/>
+            <w:tcMar>
+              <w:top w:w="30" w:type="dxa"/>
+              <w:left w:w="80" w:type="dxa"/>
+              <w:bottom w:w="30" w:type="dxa"/>
+              <w:right w:w="80" w:type="dxa"/>
+            </w:tcMar>
+          </w:tcPr>
+          <w:p>
+            <w:r>
+              <w:rPr>
+                <w:rFonts w:ascii="Aptos" w:eastAsia="Aptos" w:hAnsi="Aptos" w:cs="Aptos"/>
+                <w:b/>
+                <w:bCs/>
+                <w:sz w:val="20"/>
+                <w:szCs w:val="20"/>
+              </w:rPr>
+              <w:t xml:space="preserve">Test</w:t>
+            </w:r>
+          </w:p>
+        </w:tc>
+        <w:tc>
+          <w:tcPr>
+            <w:tcW w:w="560" w:type="pct"/>
+            <w:shd w:val="clear" w:color="auto" w:fill="F2CEED" w:themeFill="accent5" w:themeFillTint="33"/>
+            <w:tcMar>
+              <w:top w:w="30" w:type="dxa"/>
+              <w:left w:w="80" w:type="dxa"/>
+              <w:bottom w:w="30" w:type="dxa"/>
+              <w:right w:w="80" w:type="dxa"/>
+            </w:tcMar>
+          </w:tcPr>
+          <w:p>
+            <w:r>
+              <w:rPr>
+                <w:rFonts w:ascii="Aptos" w:eastAsia="Aptos" w:hAnsi="Aptos" w:cs="Aptos"/>
+                <w:b/>
+                <w:bCs/>
+                <w:sz w:val="20"/>
+                <w:szCs w:val="20"/>
+              </w:rPr>
+              <w:t xml:space="preserve">Type</w:t>
+            </w:r>
+          </w:p>
+        </w:tc>
+        <w:tc>
+          <w:tcPr>
+            <w:tcW w:w="2290" w:type="pct"/>
+            <w:shd w:val="clear" w:color="auto" w:fill="F2CEED" w:themeFill="accent5" w:themeFillTint="33"/>
+            <w:tcMar>
+              <w:top w:w="30" w:type="dxa"/>
+              <w:left w:w="80" w:type="dxa"/>
+              <w:bottom w:w="30" w:type="dxa"/>
+              <w:right w:w="80" w:type="dxa"/>
+            </w:tcMar>
+          </w:tcPr>
+          <w:p>
+            <w:r>
+              <w:rPr>
+                <w:rFonts w:ascii="Aptos" w:eastAsia="Aptos" w:hAnsi="Aptos" w:cs="Aptos"/>
+                <w:b/>
+                <w:bCs/>
+                <w:sz w:val="20"/>
+                <w:szCs w:val="20"/>
+              </w:rPr>
+              <w:t xml:space="preserve">Expected Result</w:t>
+            </w:r>
+          </w:p>
+        </w:tc>
+      </w:tr>
+      <w:tr>
+        <w:trPr>
+          <w:cantSplit/>
+        </w:trPr>
+        <w:tc>
+          <w:tcPr>
+            <w:tcW w:w="300" w:type="pct"/>
+            <w:tcMar>
+              <w:top w:w="30" w:type="dxa"/>
+              <w:left w:w="80" w:type="dxa"/>
+              <w:bottom w:w="30" w:type="dxa"/>
+              <w:right w:w="80" w:type="dxa"/>
+            </w:tcMar>
+          </w:tcPr>
+          <w:p>
+            <w:r>
+              <w:rPr>
+                <w:rFonts w:ascii="Aptos" w:eastAsia="Aptos" w:hAnsi="Aptos" w:cs="Aptos"/>
+                <w:sz w:val="20"/>
+                <w:szCs w:val="20"/>
+              </w:rPr>
+              <w:t xml:space="preserve">235</w:t>
+            </w:r>
+          </w:p>
+        </w:tc>
+        <w:tc>
+          <w:tcPr>
+            <w:tcW w:w="1850" w:type="pct"/>
+            <w:tcMar>
+              <w:top w:w="30" w:type="dxa"/>
+              <w:left w:w="80" w:type="dxa"/>
+              <w:bottom w:w="30" w:type="dxa"/>
+              <w:right w:w="80" w:type="dxa"/>
+            </w:tcMar>
+          </w:tcPr>
+          <w:p>
+            <w:r>
+              <w:rPr>
+                <w:rFonts w:ascii="Aptos" w:eastAsia="Aptos" w:hAnsi="Aptos" w:cs="Aptos"/>
+                <w:sz w:val="20"/>
+                <w:szCs w:val="20"/>
+              </w:rPr>
+              <w:t xml:space="preserve">Switch the colour scheme to dark and look at the form it was changed on</w:t>
+            </w:r>
+          </w:p>
+        </w:tc>
+        <w:tc>
+          <w:tcPr>
+            <w:tcW w:w="560" w:type="pct"/>
+            <w:tcMar>
+              <w:top w:w="30" w:type="dxa"/>
+              <w:left w:w="80" w:type="dxa"/>
+              <w:bottom w:w="30" w:type="dxa"/>
+              <w:right w:w="80" w:type="dxa"/>
+            </w:tcMar>
+          </w:tcPr>
+          <w:p>
+            <w:r>
+              <w:rPr>
+                <w:rFonts w:ascii="Aptos" w:eastAsia="Aptos" w:hAnsi="Aptos" w:cs="Aptos"/>
+                <w:sz w:val="20"/>
+                <w:szCs w:val="20"/>
+              </w:rPr>
+              <w:t xml:space="preserve">Normal</w:t>
+            </w:r>
+          </w:p>
+        </w:tc>
+        <w:tc>
+          <w:tcPr>
+            <w:tcW w:w="2290" w:type="pct"/>
+            <w:tcMar>
+              <w:top w:w="30" w:type="dxa"/>
+              <w:left w:w="80" w:type="dxa"/>
+              <w:bottom w:w="30" w:type="dxa"/>
+              <w:right w:w="80" w:type="dxa"/>
+            </w:tcMar>
+          </w:tcPr>
+          <w:p>
+            <w:r>
+              <w:rPr>
+                <w:rFonts w:ascii="Aptos" w:eastAsia="Aptos" w:hAnsi="Aptos" w:cs="Aptos"/>
+                <w:sz w:val="20"/>
+                <w:szCs w:val="20"/>
+              </w:rPr>
+              <w:t xml:space="preserve">The form changes to the dark colours immediately.</w:t>
+            </w:r>
+          </w:p>
+        </w:tc>
+      </w:tr>
+      <w:tr>
+        <w:trPr>
+          <w:cantSplit/>
+        </w:trPr>
+        <w:tc>
+          <w:tcPr>
+            <w:tcW w:w="300" w:type="pct"/>
+            <w:tcMar>
+              <w:top w:w="30" w:type="dxa"/>
+              <w:left w:w="80" w:type="dxa"/>
+              <w:bottom w:w="30" w:type="dxa"/>
+              <w:right w:w="80" w:type="dxa"/>
+            </w:tcMar>
+          </w:tcPr>
+          <w:p>
+            <w:r>
+              <w:rPr>
+                <w:rFonts w:ascii="Aptos" w:eastAsia="Aptos" w:hAnsi="Aptos" w:cs="Aptos"/>
+                <w:sz w:val="20"/>
+                <w:szCs w:val="20"/>
+              </w:rPr>
+              <w:t xml:space="preserve">236</w:t>
+            </w:r>
+          </w:p>
+        </w:tc>
+        <w:tc>
+          <w:tcPr>
+            <w:tcW w:w="1850" w:type="pct"/>
+            <w:tcMar>
+              <w:top w:w="30" w:type="dxa"/>
+              <w:left w:w="80" w:type="dxa"/>
+              <w:bottom w:w="30" w:type="dxa"/>
+              <w:right w:w="80" w:type="dxa"/>
+            </w:tcMar>
+          </w:tcPr>
+          <w:p>
+            <w:r>
+              <w:rPr>
+                <w:rFonts w:ascii="Aptos" w:eastAsia="Aptos" w:hAnsi="Aptos" w:cs="Aptos"/>
+                <w:sz w:val="20"/>
+                <w:szCs w:val="20"/>
+              </w:rPr>
+              <w:t xml:space="preserve">With the dark scheme on, open every other form in turn</w:t>
+            </w:r>
+          </w:p>
+        </w:tc>
+        <w:tc>
+          <w:tcPr>
+            <w:tcW w:w="560" w:type="pct"/>
+            <w:tcMar>
+              <w:top w:w="30" w:type="dxa"/>
+              <w:left w:w="80" w:type="dxa"/>
+              <w:bottom w:w="30" w:type="dxa"/>
+              <w:right w:w="80" w:type="dxa"/>
+            </w:tcMar>
+          </w:tcPr>
+          <w:p>
+            <w:r>
+              <w:rPr>
+                <w:rFonts w:ascii="Aptos" w:eastAsia="Aptos" w:hAnsi="Aptos" w:cs="Aptos"/>
+                <w:sz w:val="20"/>
+                <w:szCs w:val="20"/>
+              </w:rPr>
+              <w:t xml:space="preserve">Normal</w:t>
+            </w:r>
+          </w:p>
+        </w:tc>
+        <w:tc>
+          <w:tcPr>
+            <w:tcW w:w="2290" w:type="pct"/>
+            <w:tcMar>
+              <w:top w:w="30" w:type="dxa"/>
+              <w:left w:w="80" w:type="dxa"/>
+              <w:bottom w:w="30" w:type="dxa"/>
+              <w:right w:w="80" w:type="dxa"/>
+            </w:tcMar>
+          </w:tcPr>
+          <w:p>
+            <w:r>
+              <w:rPr>
+                <w:rFonts w:ascii="Aptos" w:eastAsia="Aptos" w:hAnsi="Aptos" w:cs="Aptos"/>
+                <w:sz w:val="20"/>
+                <w:szCs w:val="20"/>
+              </w:rPr>
+              <w:t xml:space="preserve">Every form appears in the dark colours, including the grids, the panels and the seat map, rather than some forms being left in the light colours.</w:t>
+            </w:r>
+          </w:p>
+        </w:tc>
+      </w:tr>
+      <w:tr>
+        <w:trPr>
+          <w:cantSplit/>
+        </w:trPr>
+        <w:tc>
+          <w:tcPr>
+            <w:tcW w:w="300" w:type="pct"/>
+            <w:tcMar>
+              <w:top w:w="30" w:type="dxa"/>
+              <w:left w:w="80" w:type="dxa"/>
+              <w:bottom w:w="30" w:type="dxa"/>
+              <w:right w:w="80" w:type="dxa"/>
+            </w:tcMar>
+          </w:tcPr>
+          <w:p>
+            <w:r>
+              <w:rPr>
+                <w:rFonts w:ascii="Aptos" w:eastAsia="Aptos" w:hAnsi="Aptos" w:cs="Aptos"/>
+                <w:sz w:val="20"/>
+                <w:szCs w:val="20"/>
+              </w:rPr>
+              <w:t xml:space="preserve">237</w:t>
+            </w:r>
+          </w:p>
+        </w:tc>
+        <w:tc>
+          <w:tcPr>
+            <w:tcW w:w="1850" w:type="pct"/>
+            <w:tcMar>
+              <w:top w:w="30" w:type="dxa"/>
+              <w:left w:w="80" w:type="dxa"/>
+              <w:bottom w:w="30" w:type="dxa"/>
+              <w:right w:w="80" w:type="dxa"/>
+            </w:tcMar>
+          </w:tcPr>
+          <w:p>
+            <w:r>
+              <w:rPr>
+                <w:rFonts w:ascii="Aptos" w:eastAsia="Aptos" w:hAnsi="Aptos" w:cs="Aptos"/>
+                <w:sz w:val="20"/>
+                <w:szCs w:val="20"/>
+              </w:rPr>
+              <w:t xml:space="preserve">Look at the seat map with the dark scheme on</w:t>
+            </w:r>
+          </w:p>
+        </w:tc>
+        <w:tc>
+          <w:tcPr>
+            <w:tcW w:w="560" w:type="pct"/>
+            <w:tcMar>
+              <w:top w:w="30" w:type="dxa"/>
+              <w:left w:w="80" w:type="dxa"/>
+              <w:bottom w:w="30" w:type="dxa"/>
+              <w:right w:w="80" w:type="dxa"/>
+            </w:tcMar>
+          </w:tcPr>
+          <w:p>
+            <w:r>
+              <w:rPr>
+                <w:rFonts w:ascii="Aptos" w:eastAsia="Aptos" w:hAnsi="Aptos" w:cs="Aptos"/>
+                <w:sz w:val="20"/>
+                <w:szCs w:val="20"/>
+              </w:rPr>
+              <w:t xml:space="preserve">Normal</w:t>
+            </w:r>
+          </w:p>
+        </w:tc>
+        <w:tc>
+          <w:tcPr>
+            <w:tcW w:w="2290" w:type="pct"/>
+            <w:tcMar>
+              <w:top w:w="30" w:type="dxa"/>
+              <w:left w:w="80" w:type="dxa"/>
+              <w:bottom w:w="30" w:type="dxa"/>
+              <w:right w:w="80" w:type="dxa"/>
+            </w:tcMar>
+          </w:tcPr>
+          <w:p>
+            <w:r>
+              <w:rPr>
+                <w:rFonts w:ascii="Aptos" w:eastAsia="Aptos" w:hAnsi="Aptos" w:cs="Aptos"/>
+                <w:sz w:val="20"/>
+                <w:szCs w:val="20"/>
+              </w:rPr>
+              <w:t xml:space="preserve">The available, selected and taken seat colours are all still clearly different from one another and from the background, so the seat map is still readable.</w:t>
+            </w:r>
+          </w:p>
+        </w:tc>
+      </w:tr>
+      <w:tr>
+        <w:trPr>
+          <w:cantSplit/>
+        </w:trPr>
+        <w:tc>
+          <w:tcPr>
+            <w:tcW w:w="300" w:type="pct"/>
+            <w:tcMar>
+              <w:top w:w="30" w:type="dxa"/>
+              <w:left w:w="80" w:type="dxa"/>
+              <w:bottom w:w="30" w:type="dxa"/>
+              <w:right w:w="80" w:type="dxa"/>
+            </w:tcMar>
+          </w:tcPr>
+          <w:p>
+            <w:r>
+              <w:rPr>
+                <w:rFonts w:ascii="Aptos" w:eastAsia="Aptos" w:hAnsi="Aptos" w:cs="Aptos"/>
+                <w:sz w:val="20"/>
+                <w:szCs w:val="20"/>
+              </w:rPr>
+              <w:t xml:space="preserve">238</w:t>
+            </w:r>
+          </w:p>
+        </w:tc>
+        <w:tc>
+          <w:tcPr>
+            <w:tcW w:w="1850" w:type="pct"/>
+            <w:tcMar>
+              <w:top w:w="30" w:type="dxa"/>
+              <w:left w:w="80" w:type="dxa"/>
+              <w:bottom w:w="30" w:type="dxa"/>
+              <w:right w:w="80" w:type="dxa"/>
+            </w:tcMar>
+          </w:tcPr>
+          <w:p>
+            <w:r>
+              <w:rPr>
+                <w:rFonts w:ascii="Aptos" w:eastAsia="Aptos" w:hAnsi="Aptos" w:cs="Aptos"/>
+                <w:sz w:val="20"/>
+                <w:szCs w:val="20"/>
+              </w:rPr>
+              <w:t xml:space="preserve">Log out and log back in as the same user</w:t>
+            </w:r>
+          </w:p>
+        </w:tc>
+        <w:tc>
+          <w:tcPr>
+            <w:tcW w:w="560" w:type="pct"/>
+            <w:tcMar>
+              <w:top w:w="30" w:type="dxa"/>
+              <w:left w:w="80" w:type="dxa"/>
+              <w:bottom w:w="30" w:type="dxa"/>
+              <w:right w:w="80" w:type="dxa"/>
+            </w:tcMar>
+          </w:tcPr>
+          <w:p>
+            <w:r>
+              <w:rPr>
+                <w:rFonts w:ascii="Aptos" w:eastAsia="Aptos" w:hAnsi="Aptos" w:cs="Aptos"/>
+                <w:sz w:val="20"/>
+                <w:szCs w:val="20"/>
+              </w:rPr>
+              <w:t xml:space="preserve">Normal</w:t>
+            </w:r>
+          </w:p>
+        </w:tc>
+        <w:tc>
+          <w:tcPr>
+            <w:tcW w:w="2290" w:type="pct"/>
+            <w:tcMar>
+              <w:top w:w="30" w:type="dxa"/>
+              <w:left w:w="80" w:type="dxa"/>
+              <w:bottom w:w="30" w:type="dxa"/>
+              <w:right w:w="80" w:type="dxa"/>
+            </w:tcMar>
+          </w:tcPr>
+          <w:p>
+            <w:r>
+              <w:rPr>
+                <w:rFonts w:ascii="Aptos" w:eastAsia="Aptos" w:hAnsi="Aptos" w:cs="Aptos"/>
+                <w:sz w:val="20"/>
+                <w:szCs w:val="20"/>
+              </w:rPr>
+              <w:t xml:space="preserve">The dark scheme is still on, because the choice was saved against the account in tblUserSettings.</w:t>
+            </w:r>
+          </w:p>
+        </w:tc>
+      </w:tr>
+      <w:tr>
+        <w:trPr>
+          <w:cantSplit/>
+        </w:trPr>
+        <w:tc>
+          <w:tcPr>
+            <w:tcW w:w="300" w:type="pct"/>
+            <w:tcMar>
+              <w:top w:w="30" w:type="dxa"/>
+              <w:left w:w="80" w:type="dxa"/>
+              <w:bottom w:w="30" w:type="dxa"/>
+              <w:right w:w="80" w:type="dxa"/>
+            </w:tcMar>
+          </w:tcPr>
+          <w:p>
+            <w:r>
+              <w:rPr>
+                <w:rFonts w:ascii="Aptos" w:eastAsia="Aptos" w:hAnsi="Aptos" w:cs="Aptos"/>
+                <w:sz w:val="20"/>
+                <w:szCs w:val="20"/>
+              </w:rPr>
+              <w:t xml:space="preserve">239</w:t>
+            </w:r>
+          </w:p>
+        </w:tc>
+        <w:tc>
+          <w:tcPr>
+            <w:tcW w:w="1850" w:type="pct"/>
+            <w:tcMar>
+              <w:top w:w="30" w:type="dxa"/>
+              <w:left w:w="80" w:type="dxa"/>
+              <w:bottom w:w="30" w:type="dxa"/>
+              <w:right w:w="80" w:type="dxa"/>
+            </w:tcMar>
+          </w:tcPr>
+          <w:p>
+            <w:r>
+              <w:rPr>
+                <w:rFonts w:ascii="Aptos" w:eastAsia="Aptos" w:hAnsi="Aptos" w:cs="Aptos"/>
+                <w:sz w:val="20"/>
+                <w:szCs w:val="20"/>
+              </w:rPr>
+              <w:t xml:space="preserve">Log in as a different user on the same machine</w:t>
+            </w:r>
+          </w:p>
+        </w:tc>
+        <w:tc>
+          <w:tcPr>
+            <w:tcW w:w="560" w:type="pct"/>
+            <w:tcMar>
+              <w:top w:w="30" w:type="dxa"/>
+              <w:left w:w="80" w:type="dxa"/>
+              <w:bottom w:w="30" w:type="dxa"/>
+              <w:right w:w="80" w:type="dxa"/>
+            </w:tcMar>
+          </w:tcPr>
+          <w:p>
+            <w:r>
+              <w:rPr>
+                <w:rFonts w:ascii="Aptos" w:eastAsia="Aptos" w:hAnsi="Aptos" w:cs="Aptos"/>
+                <w:sz w:val="20"/>
+                <w:szCs w:val="20"/>
+              </w:rPr>
+              <w:t xml:space="preserve">Normal</w:t>
+            </w:r>
+          </w:p>
+        </w:tc>
+        <w:tc>
+          <w:tcPr>
+            <w:tcW w:w="2290" w:type="pct"/>
+            <w:tcMar>
+              <w:top w:w="30" w:type="dxa"/>
+              <w:left w:w="80" w:type="dxa"/>
+              <w:bottom w:w="30" w:type="dxa"/>
+              <w:right w:w="80" w:type="dxa"/>
+            </w:tcMar>
+          </w:tcPr>
+          <w:p>
+            <w:r>
+              <w:rPr>
+                <w:rFonts w:ascii="Aptos" w:eastAsia="Aptos" w:hAnsi="Aptos" w:cs="Aptos"/>
+                <w:sz w:val="20"/>
+                <w:szCs w:val="20"/>
+              </w:rPr>
+              <w:t xml:space="preserve">That user gets their own colour scheme rather than the one the previous user chose, which shows the setting follows the account and not the machine.</w:t>
+            </w:r>
+          </w:p>
+        </w:tc>
+      </w:tr>
+      <w:tr>
+        <w:trPr>
+          <w:cantSplit/>
+        </w:trPr>
+        <w:tc>
+          <w:tcPr>
+            <w:tcW w:w="300" w:type="pct"/>
+            <w:tcMar>
+              <w:top w:w="30" w:type="dxa"/>
+              <w:left w:w="80" w:type="dxa"/>
+              <w:bottom w:w="30" w:type="dxa"/>
+              <w:right w:w="80" w:type="dxa"/>
+            </w:tcMar>
+          </w:tcPr>
+          <w:p>
+            <w:r>
+              <w:rPr>
+                <w:rFonts w:ascii="Aptos" w:eastAsia="Aptos" w:hAnsi="Aptos" w:cs="Aptos"/>
+                <w:sz w:val="20"/>
+                <w:szCs w:val="20"/>
+              </w:rPr>
+              <w:t xml:space="preserve">240</w:t>
+            </w:r>
+          </w:p>
+        </w:tc>
+        <w:tc>
+          <w:tcPr>
+            <w:tcW w:w="1850" w:type="pct"/>
+            <w:tcMar>
+              <w:top w:w="30" w:type="dxa"/>
+              <w:left w:w="80" w:type="dxa"/>
+              <w:bottom w:w="30" w:type="dxa"/>
+              <w:right w:w="80" w:type="dxa"/>
+            </w:tcMar>
+          </w:tcPr>
+          <w:p>
+            <w:r>
+              <w:rPr>
+                <w:rFonts w:ascii="Aptos" w:eastAsia="Aptos" w:hAnsi="Aptos" w:cs="Aptos"/>
+                <w:sz w:val="20"/>
+                <w:szCs w:val="20"/>
+              </w:rPr>
+              <w:t xml:space="preserve">Press Put settings back to default</w:t>
+            </w:r>
+          </w:p>
+        </w:tc>
+        <w:tc>
+          <w:tcPr>
+            <w:tcW w:w="560" w:type="pct"/>
+            <w:tcMar>
+              <w:top w:w="30" w:type="dxa"/>
+              <w:left w:w="80" w:type="dxa"/>
+              <w:bottom w:w="30" w:type="dxa"/>
+              <w:right w:w="80" w:type="dxa"/>
+            </w:tcMar>
+          </w:tcPr>
+          <w:p>
+            <w:r>
+              <w:rPr>
+                <w:rFonts w:ascii="Aptos" w:eastAsia="Aptos" w:hAnsi="Aptos" w:cs="Aptos"/>
+                <w:sz w:val="20"/>
+                <w:szCs w:val="20"/>
+              </w:rPr>
+              <w:t xml:space="preserve">Normal</w:t>
+            </w:r>
+          </w:p>
+        </w:tc>
+        <w:tc>
+          <w:tcPr>
+            <w:tcW w:w="2290" w:type="pct"/>
+            <w:tcMar>
+              <w:top w:w="30" w:type="dxa"/>
+              <w:left w:w="80" w:type="dxa"/>
+              <w:bottom w:w="30" w:type="dxa"/>
+              <w:right w:w="80" w:type="dxa"/>
+            </w:tcMar>
+          </w:tcPr>
+          <w:p>
+            <w:r>
+              <w:rPr>
+                <w:rFonts w:ascii="Aptos" w:eastAsia="Aptos" w:hAnsi="Aptos" w:cs="Aptos"/>
+                <w:sz w:val="20"/>
+                <w:szCs w:val="20"/>
+              </w:rPr>
+              <w:t xml:space="preserve">The scheme returns to the light colours and a message confirms it.</w:t>
             </w:r>
           </w:p>
         </w:tc>

</xml_diff>

<commit_message>
added objective 42: the main menu dashboard
</commit_message>
<xml_diff>
--- a/Testing.docx
+++ b/Testing.docx
@@ -26545,6 +26545,607 @@
                 <w:szCs w:val="20"/>
               </w:rPr>
               <w:t xml:space="preserve">The scheme returns to the light colours and a message confirms it.</w:t>
+            </w:r>
+          </w:p>
+        </w:tc>
+      </w:tr>
+    </w:tbl>
+    <w:p>
+      <w:r>
+        <w:rPr>
+          <w:rFonts w:ascii="Aptos" w:eastAsia="Aptos" w:hAnsi="Aptos" w:cs="Aptos"/>
+        </w:rPr>
+        <w:t xml:space="preserve"/>
+      </w:r>
+    </w:p>
+    <w:p>
+      <w:pPr>
+        <w:pStyle w:val="Heading3"/>
+      </w:pPr>
+      <w:r>
+        <w:rPr>
+          <w:rFonts w:ascii="Aptos Display" w:eastAsia="Aptos Display" w:hAnsi="Aptos Display" w:cs="Aptos Display"/>
+          <w:b/>
+          <w:bCs/>
+          <w:color w:val="000000"/>
+        </w:rPr>
+        <w:t xml:space="preserve">Objective 42: The Main Menu Dashboard</w:t>
+      </w:r>
+    </w:p>
+    <w:p>
+      <w:r>
+        <w:rPr>
+          <w:rFonts w:ascii="Aptos" w:eastAsia="Aptos" w:hAnsi="Aptos" w:cs="Aptos"/>
+        </w:rPr>
+        <w:t xml:space="preserve">These tests check that the main menu shows a user something useful about the state of the cinema at the start of a shift rather than only a set of buttons, and that what it shows depends on who is signed in.</w:t>
+      </w:r>
+    </w:p>
+    <w:tbl>
+      <w:tblPr>
+        <w:tblW w:w="5000" w:type="pct"/>
+        <w:tblBorders>
+          <w:top w:val="single" w:sz="4" w:space="0" w:color="808080"/>
+          <w:left w:val="single" w:sz="4" w:space="0" w:color="808080"/>
+          <w:bottom w:val="single" w:sz="4" w:space="0" w:color="808080"/>
+          <w:right w:val="single" w:sz="4" w:space="0" w:color="808080"/>
+          <w:insideH w:val="single" w:sz="4" w:space="0" w:color="808080"/>
+          <w:insideV w:val="single" w:sz="4" w:space="0" w:color="808080"/>
+        </w:tblBorders>
+        <w:tblCellMar>
+          <w:left w:w="10" w:type="dxa"/>
+          <w:right w:w="10" w:type="dxa"/>
+        </w:tblCellMar>
+        <w:tblLook w:val="0000" w:firstRow="0" w:lastRow="0" w:firstColumn="0" w:lastColumn="0" w:noHBand="0" w:noVBand="0"/>
+      </w:tblPr>
+      <w:tblGrid>
+        <w:gridCol w:w="561"/>
+        <w:gridCol w:w="3460"/>
+        <w:gridCol w:w="1047"/>
+        <w:gridCol w:w="4282"/>
+      </w:tblGrid>
+      <w:tr>
+        <w:trPr>
+          <w:cantSplit/>
+          <w:tblHeader/>
+        </w:trPr>
+        <w:tc>
+          <w:tcPr>
+            <w:tcW w:w="300" w:type="pct"/>
+            <w:shd w:val="clear" w:color="auto" w:fill="F2CEED" w:themeFill="accent5" w:themeFillTint="33"/>
+            <w:tcMar>
+              <w:top w:w="30" w:type="dxa"/>
+              <w:left w:w="80" w:type="dxa"/>
+              <w:bottom w:w="30" w:type="dxa"/>
+              <w:right w:w="80" w:type="dxa"/>
+            </w:tcMar>
+          </w:tcPr>
+          <w:p>
+            <w:r>
+              <w:rPr>
+                <w:rFonts w:ascii="Aptos" w:eastAsia="Aptos" w:hAnsi="Aptos" w:cs="Aptos"/>
+                <w:b/>
+                <w:bCs/>
+                <w:sz w:val="20"/>
+                <w:szCs w:val="20"/>
+              </w:rPr>
+              <w:t xml:space="preserve">No.</w:t>
+            </w:r>
+          </w:p>
+        </w:tc>
+        <w:tc>
+          <w:tcPr>
+            <w:tcW w:w="1850" w:type="pct"/>
+            <w:shd w:val="clear" w:color="auto" w:fill="F2CEED" w:themeFill="accent5" w:themeFillTint="33"/>
+            <w:tcMar>
+              <w:top w:w="30" w:type="dxa"/>
+              <w:left w:w="80" w:type="dxa"/>
+              <w:bottom w:w="30" w:type="dxa"/>
+              <w:right w:w="80" w:type="dxa"/>
+            </w:tcMar>
+          </w:tcPr>
+          <w:p>
+            <w:r>
+              <w:rPr>
+                <w:rFonts w:ascii="Aptos" w:eastAsia="Aptos" w:hAnsi="Aptos" w:cs="Aptos"/>
+                <w:b/>
+                <w:bCs/>
+                <w:sz w:val="20"/>
+                <w:szCs w:val="20"/>
+              </w:rPr>
+              <w:t xml:space="preserve">Test</w:t>
+            </w:r>
+          </w:p>
+        </w:tc>
+        <w:tc>
+          <w:tcPr>
+            <w:tcW w:w="560" w:type="pct"/>
+            <w:shd w:val="clear" w:color="auto" w:fill="F2CEED" w:themeFill="accent5" w:themeFillTint="33"/>
+            <w:tcMar>
+              <w:top w:w="30" w:type="dxa"/>
+              <w:left w:w="80" w:type="dxa"/>
+              <w:bottom w:w="30" w:type="dxa"/>
+              <w:right w:w="80" w:type="dxa"/>
+            </w:tcMar>
+          </w:tcPr>
+          <w:p>
+            <w:r>
+              <w:rPr>
+                <w:rFonts w:ascii="Aptos" w:eastAsia="Aptos" w:hAnsi="Aptos" w:cs="Aptos"/>
+                <w:b/>
+                <w:bCs/>
+                <w:sz w:val="20"/>
+                <w:szCs w:val="20"/>
+              </w:rPr>
+              <w:t xml:space="preserve">Type</w:t>
+            </w:r>
+          </w:p>
+        </w:tc>
+        <w:tc>
+          <w:tcPr>
+            <w:tcW w:w="2290" w:type="pct"/>
+            <w:shd w:val="clear" w:color="auto" w:fill="F2CEED" w:themeFill="accent5" w:themeFillTint="33"/>
+            <w:tcMar>
+              <w:top w:w="30" w:type="dxa"/>
+              <w:left w:w="80" w:type="dxa"/>
+              <w:bottom w:w="30" w:type="dxa"/>
+              <w:right w:w="80" w:type="dxa"/>
+            </w:tcMar>
+          </w:tcPr>
+          <w:p>
+            <w:r>
+              <w:rPr>
+                <w:rFonts w:ascii="Aptos" w:eastAsia="Aptos" w:hAnsi="Aptos" w:cs="Aptos"/>
+                <w:b/>
+                <w:bCs/>
+                <w:sz w:val="20"/>
+                <w:szCs w:val="20"/>
+              </w:rPr>
+              <w:t xml:space="preserve">Expected Result</w:t>
+            </w:r>
+          </w:p>
+        </w:tc>
+      </w:tr>
+      <w:tr>
+        <w:trPr>
+          <w:cantSplit/>
+        </w:trPr>
+        <w:tc>
+          <w:tcPr>
+            <w:tcW w:w="300" w:type="pct"/>
+            <w:tcMar>
+              <w:top w:w="30" w:type="dxa"/>
+              <w:left w:w="80" w:type="dxa"/>
+              <w:bottom w:w="30" w:type="dxa"/>
+              <w:right w:w="80" w:type="dxa"/>
+            </w:tcMar>
+          </w:tcPr>
+          <w:p>
+            <w:r>
+              <w:rPr>
+                <w:rFonts w:ascii="Aptos" w:eastAsia="Aptos" w:hAnsi="Aptos" w:cs="Aptos"/>
+                <w:sz w:val="20"/>
+                <w:szCs w:val="20"/>
+              </w:rPr>
+              <w:t xml:space="preserve">241</w:t>
+            </w:r>
+          </w:p>
+        </w:tc>
+        <w:tc>
+          <w:tcPr>
+            <w:tcW w:w="1850" w:type="pct"/>
+            <w:tcMar>
+              <w:top w:w="30" w:type="dxa"/>
+              <w:left w:w="80" w:type="dxa"/>
+              <w:bottom w:w="30" w:type="dxa"/>
+              <w:right w:w="80" w:type="dxa"/>
+            </w:tcMar>
+          </w:tcPr>
+          <w:p>
+            <w:r>
+              <w:rPr>
+                <w:rFonts w:ascii="Aptos" w:eastAsia="Aptos" w:hAnsi="Aptos" w:cs="Aptos"/>
+                <w:sz w:val="20"/>
+                <w:szCs w:val="20"/>
+              </w:rPr>
+              <w:t xml:space="preserve">Log in as a manager and look at the main menu</w:t>
+            </w:r>
+          </w:p>
+        </w:tc>
+        <w:tc>
+          <w:tcPr>
+            <w:tcW w:w="560" w:type="pct"/>
+            <w:tcMar>
+              <w:top w:w="30" w:type="dxa"/>
+              <w:left w:w="80" w:type="dxa"/>
+              <w:bottom w:w="30" w:type="dxa"/>
+              <w:right w:w="80" w:type="dxa"/>
+            </w:tcMar>
+          </w:tcPr>
+          <w:p>
+            <w:r>
+              <w:rPr>
+                <w:rFonts w:ascii="Aptos" w:eastAsia="Aptos" w:hAnsi="Aptos" w:cs="Aptos"/>
+                <w:sz w:val="20"/>
+                <w:szCs w:val="20"/>
+              </w:rPr>
+              <w:t xml:space="preserve">Normal</w:t>
+            </w:r>
+          </w:p>
+        </w:tc>
+        <w:tc>
+          <w:tcPr>
+            <w:tcW w:w="2290" w:type="pct"/>
+            <w:tcMar>
+              <w:top w:w="30" w:type="dxa"/>
+              <w:left w:w="80" w:type="dxa"/>
+              <w:bottom w:w="30" w:type="dxa"/>
+              <w:right w:w="80" w:type="dxa"/>
+            </w:tcMar>
+          </w:tcPr>
+          <w:p>
+            <w:r>
+              <w:rPr>
+                <w:rFonts w:ascii="Aptos" w:eastAsia="Aptos" w:hAnsi="Aptos" w:cs="Aptos"/>
+                <w:sz w:val="20"/>
+                <w:szCs w:val="20"/>
+              </w:rPr>
+              <w:t xml:space="preserve">The dashboard shows the figures for the day, such as what is on, how many seats have sold and what has been taken, alongside the menu.</w:t>
+            </w:r>
+          </w:p>
+        </w:tc>
+      </w:tr>
+      <w:tr>
+        <w:trPr>
+          <w:cantSplit/>
+        </w:trPr>
+        <w:tc>
+          <w:tcPr>
+            <w:tcW w:w="300" w:type="pct"/>
+            <w:tcMar>
+              <w:top w:w="30" w:type="dxa"/>
+              <w:left w:w="80" w:type="dxa"/>
+              <w:bottom w:w="30" w:type="dxa"/>
+              <w:right w:w="80" w:type="dxa"/>
+            </w:tcMar>
+          </w:tcPr>
+          <w:p>
+            <w:r>
+              <w:rPr>
+                <w:rFonts w:ascii="Aptos" w:eastAsia="Aptos" w:hAnsi="Aptos" w:cs="Aptos"/>
+                <w:sz w:val="20"/>
+                <w:szCs w:val="20"/>
+              </w:rPr>
+              <w:t xml:space="preserve">242</w:t>
+            </w:r>
+          </w:p>
+        </w:tc>
+        <w:tc>
+          <w:tcPr>
+            <w:tcW w:w="1850" w:type="pct"/>
+            <w:tcMar>
+              <w:top w:w="30" w:type="dxa"/>
+              <w:left w:w="80" w:type="dxa"/>
+              <w:bottom w:w="30" w:type="dxa"/>
+              <w:right w:w="80" w:type="dxa"/>
+            </w:tcMar>
+          </w:tcPr>
+          <w:p>
+            <w:r>
+              <w:rPr>
+                <w:rFonts w:ascii="Aptos" w:eastAsia="Aptos" w:hAnsi="Aptos" w:cs="Aptos"/>
+                <w:sz w:val="20"/>
+                <w:szCs w:val="20"/>
+              </w:rPr>
+              <w:t xml:space="preserve">Check the takings shown on the dashboard against the sales report for the same day</w:t>
+            </w:r>
+          </w:p>
+        </w:tc>
+        <w:tc>
+          <w:tcPr>
+            <w:tcW w:w="560" w:type="pct"/>
+            <w:tcMar>
+              <w:top w:w="30" w:type="dxa"/>
+              <w:left w:w="80" w:type="dxa"/>
+              <w:bottom w:w="30" w:type="dxa"/>
+              <w:right w:w="80" w:type="dxa"/>
+            </w:tcMar>
+          </w:tcPr>
+          <w:p>
+            <w:r>
+              <w:rPr>
+                <w:rFonts w:ascii="Aptos" w:eastAsia="Aptos" w:hAnsi="Aptos" w:cs="Aptos"/>
+                <w:sz w:val="20"/>
+                <w:szCs w:val="20"/>
+              </w:rPr>
+              <w:t xml:space="preserve">Normal</w:t>
+            </w:r>
+          </w:p>
+        </w:tc>
+        <w:tc>
+          <w:tcPr>
+            <w:tcW w:w="2290" w:type="pct"/>
+            <w:tcMar>
+              <w:top w:w="30" w:type="dxa"/>
+              <w:left w:w="80" w:type="dxa"/>
+              <w:bottom w:w="30" w:type="dxa"/>
+              <w:right w:w="80" w:type="dxa"/>
+            </w:tcMar>
+          </w:tcPr>
+          <w:p>
+            <w:r>
+              <w:rPr>
+                <w:rFonts w:ascii="Aptos" w:eastAsia="Aptos" w:hAnsi="Aptos" w:cs="Aptos"/>
+                <w:sz w:val="20"/>
+                <w:szCs w:val="20"/>
+              </w:rPr>
+              <w:t xml:space="preserve">The two agree, because both exclude cancelled bookings. They disagreed at one point when only one of them filtered them out, so this is checked directly rather than assumed.</w:t>
+            </w:r>
+          </w:p>
+        </w:tc>
+      </w:tr>
+      <w:tr>
+        <w:trPr>
+          <w:cantSplit/>
+        </w:trPr>
+        <w:tc>
+          <w:tcPr>
+            <w:tcW w:w="300" w:type="pct"/>
+            <w:tcMar>
+              <w:top w:w="30" w:type="dxa"/>
+              <w:left w:w="80" w:type="dxa"/>
+              <w:bottom w:w="30" w:type="dxa"/>
+              <w:right w:w="80" w:type="dxa"/>
+            </w:tcMar>
+          </w:tcPr>
+          <w:p>
+            <w:r>
+              <w:rPr>
+                <w:rFonts w:ascii="Aptos" w:eastAsia="Aptos" w:hAnsi="Aptos" w:cs="Aptos"/>
+                <w:sz w:val="20"/>
+                <w:szCs w:val="20"/>
+              </w:rPr>
+              <w:t xml:space="preserve">243</w:t>
+            </w:r>
+          </w:p>
+        </w:tc>
+        <w:tc>
+          <w:tcPr>
+            <w:tcW w:w="1850" w:type="pct"/>
+            <w:tcMar>
+              <w:top w:w="30" w:type="dxa"/>
+              <w:left w:w="80" w:type="dxa"/>
+              <w:bottom w:w="30" w:type="dxa"/>
+              <w:right w:w="80" w:type="dxa"/>
+            </w:tcMar>
+          </w:tcPr>
+          <w:p>
+            <w:r>
+              <w:rPr>
+                <w:rFonts w:ascii="Aptos" w:eastAsia="Aptos" w:hAnsi="Aptos" w:cs="Aptos"/>
+                <w:sz w:val="20"/>
+                <w:szCs w:val="20"/>
+              </w:rPr>
+              <w:t xml:space="preserve">Log in as a member of staff and look at the main menu</w:t>
+            </w:r>
+          </w:p>
+        </w:tc>
+        <w:tc>
+          <w:tcPr>
+            <w:tcW w:w="560" w:type="pct"/>
+            <w:tcMar>
+              <w:top w:w="30" w:type="dxa"/>
+              <w:left w:w="80" w:type="dxa"/>
+              <w:bottom w:w="30" w:type="dxa"/>
+              <w:right w:w="80" w:type="dxa"/>
+            </w:tcMar>
+          </w:tcPr>
+          <w:p>
+            <w:r>
+              <w:rPr>
+                <w:rFonts w:ascii="Aptos" w:eastAsia="Aptos" w:hAnsi="Aptos" w:cs="Aptos"/>
+                <w:sz w:val="20"/>
+                <w:szCs w:val="20"/>
+              </w:rPr>
+              <w:t xml:space="preserve">Normal</w:t>
+            </w:r>
+          </w:p>
+        </w:tc>
+        <w:tc>
+          <w:tcPr>
+            <w:tcW w:w="2290" w:type="pct"/>
+            <w:tcMar>
+              <w:top w:w="30" w:type="dxa"/>
+              <w:left w:w="80" w:type="dxa"/>
+              <w:bottom w:w="30" w:type="dxa"/>
+              <w:right w:w="80" w:type="dxa"/>
+            </w:tcMar>
+          </w:tcPr>
+          <w:p>
+            <w:r>
+              <w:rPr>
+                <w:rFonts w:ascii="Aptos" w:eastAsia="Aptos" w:hAnsi="Aptos" w:cs="Aptos"/>
+                <w:sz w:val="20"/>
+                <w:szCs w:val="20"/>
+              </w:rPr>
+              <w:t xml:space="preserve">The dashboard shows what is relevant to the counter and the manager only options are not shown.</w:t>
+            </w:r>
+          </w:p>
+        </w:tc>
+      </w:tr>
+      <w:tr>
+        <w:trPr>
+          <w:cantSplit/>
+        </w:trPr>
+        <w:tc>
+          <w:tcPr>
+            <w:tcW w:w="300" w:type="pct"/>
+            <w:tcMar>
+              <w:top w:w="30" w:type="dxa"/>
+              <w:left w:w="80" w:type="dxa"/>
+              <w:bottom w:w="30" w:type="dxa"/>
+              <w:right w:w="80" w:type="dxa"/>
+            </w:tcMar>
+          </w:tcPr>
+          <w:p>
+            <w:r>
+              <w:rPr>
+                <w:rFonts w:ascii="Aptos" w:eastAsia="Aptos" w:hAnsi="Aptos" w:cs="Aptos"/>
+                <w:sz w:val="20"/>
+                <w:szCs w:val="20"/>
+              </w:rPr>
+              <w:t xml:space="preserve">244</w:t>
+            </w:r>
+          </w:p>
+        </w:tc>
+        <w:tc>
+          <w:tcPr>
+            <w:tcW w:w="1850" w:type="pct"/>
+            <w:tcMar>
+              <w:top w:w="30" w:type="dxa"/>
+              <w:left w:w="80" w:type="dxa"/>
+              <w:bottom w:w="30" w:type="dxa"/>
+              <w:right w:w="80" w:type="dxa"/>
+            </w:tcMar>
+          </w:tcPr>
+          <w:p>
+            <w:r>
+              <w:rPr>
+                <w:rFonts w:ascii="Aptos" w:eastAsia="Aptos" w:hAnsi="Aptos" w:cs="Aptos"/>
+                <w:sz w:val="20"/>
+                <w:szCs w:val="20"/>
+              </w:rPr>
+              <w:t xml:space="preserve">Take a sale, then return to the main menu and refresh</w:t>
+            </w:r>
+          </w:p>
+        </w:tc>
+        <w:tc>
+          <w:tcPr>
+            <w:tcW w:w="560" w:type="pct"/>
+            <w:tcMar>
+              <w:top w:w="30" w:type="dxa"/>
+              <w:left w:w="80" w:type="dxa"/>
+              <w:bottom w:w="30" w:type="dxa"/>
+              <w:right w:w="80" w:type="dxa"/>
+            </w:tcMar>
+          </w:tcPr>
+          <w:p>
+            <w:r>
+              <w:rPr>
+                <w:rFonts w:ascii="Aptos" w:eastAsia="Aptos" w:hAnsi="Aptos" w:cs="Aptos"/>
+                <w:sz w:val="20"/>
+                <w:szCs w:val="20"/>
+              </w:rPr>
+              <w:t xml:space="preserve">Normal</w:t>
+            </w:r>
+          </w:p>
+        </w:tc>
+        <w:tc>
+          <w:tcPr>
+            <w:tcW w:w="2290" w:type="pct"/>
+            <w:tcMar>
+              <w:top w:w="30" w:type="dxa"/>
+              <w:left w:w="80" w:type="dxa"/>
+              <w:bottom w:w="30" w:type="dxa"/>
+              <w:right w:w="80" w:type="dxa"/>
+            </w:tcMar>
+          </w:tcPr>
+          <w:p>
+            <w:r>
+              <w:rPr>
+                <w:rFonts w:ascii="Aptos" w:eastAsia="Aptos" w:hAnsi="Aptos" w:cs="Aptos"/>
+                <w:sz w:val="20"/>
+                <w:szCs w:val="20"/>
+              </w:rPr>
+              <w:t xml:space="preserve">The figures on the dashboard have moved to include that sale.</w:t>
+            </w:r>
+          </w:p>
+        </w:tc>
+      </w:tr>
+      <w:tr>
+        <w:trPr>
+          <w:cantSplit/>
+        </w:trPr>
+        <w:tc>
+          <w:tcPr>
+            <w:tcW w:w="300" w:type="pct"/>
+            <w:tcMar>
+              <w:top w:w="30" w:type="dxa"/>
+              <w:left w:w="80" w:type="dxa"/>
+              <w:bottom w:w="30" w:type="dxa"/>
+              <w:right w:w="80" w:type="dxa"/>
+            </w:tcMar>
+          </w:tcPr>
+          <w:p>
+            <w:r>
+              <w:rPr>
+                <w:rFonts w:ascii="Aptos" w:eastAsia="Aptos" w:hAnsi="Aptos" w:cs="Aptos"/>
+                <w:sz w:val="20"/>
+                <w:szCs w:val="20"/>
+              </w:rPr>
+              <w:t xml:space="preserve">245</w:t>
+            </w:r>
+          </w:p>
+        </w:tc>
+        <w:tc>
+          <w:tcPr>
+            <w:tcW w:w="1850" w:type="pct"/>
+            <w:tcMar>
+              <w:top w:w="30" w:type="dxa"/>
+              <w:left w:w="80" w:type="dxa"/>
+              <w:bottom w:w="30" w:type="dxa"/>
+              <w:right w:w="80" w:type="dxa"/>
+            </w:tcMar>
+          </w:tcPr>
+          <w:p>
+            <w:r>
+              <w:rPr>
+                <w:rFonts w:ascii="Aptos" w:eastAsia="Aptos" w:hAnsi="Aptos" w:cs="Aptos"/>
+                <w:sz w:val="20"/>
+                <w:szCs w:val="20"/>
+              </w:rPr>
+              <w:t xml:space="preserve">Look at the main menu on a day with nothing on</w:t>
+            </w:r>
+          </w:p>
+        </w:tc>
+        <w:tc>
+          <w:tcPr>
+            <w:tcW w:w="560" w:type="pct"/>
+            <w:tcMar>
+              <w:top w:w="30" w:type="dxa"/>
+              <w:left w:w="80" w:type="dxa"/>
+              <w:bottom w:w="30" w:type="dxa"/>
+              <w:right w:w="80" w:type="dxa"/>
+            </w:tcMar>
+          </w:tcPr>
+          <w:p>
+            <w:r>
+              <w:rPr>
+                <w:rFonts w:ascii="Aptos" w:eastAsia="Aptos" w:hAnsi="Aptos" w:cs="Aptos"/>
+                <w:sz w:val="20"/>
+                <w:szCs w:val="20"/>
+              </w:rPr>
+              <w:t xml:space="preserve">Boundary</w:t>
+            </w:r>
+          </w:p>
+        </w:tc>
+        <w:tc>
+          <w:tcPr>
+            <w:tcW w:w="2290" w:type="pct"/>
+            <w:tcMar>
+              <w:top w:w="30" w:type="dxa"/>
+              <w:left w:w="80" w:type="dxa"/>
+              <w:bottom w:w="30" w:type="dxa"/>
+              <w:right w:w="80" w:type="dxa"/>
+            </w:tcMar>
+          </w:tcPr>
+          <w:p>
+            <w:r>
+              <w:rPr>
+                <w:rFonts w:ascii="Aptos" w:eastAsia="Aptos" w:hAnsi="Aptos" w:cs="Aptos"/>
+                <w:sz w:val="20"/>
+                <w:szCs w:val="20"/>
+              </w:rPr>
+              <w:t xml:space="preserve">The dashboard shows an empty state saying there is nothing on rather than showing a blank grid with no explanation.</w:t>
             </w:r>
           </w:p>
         </w:tc>

</xml_diff>

<commit_message>
added objective 43: warning before data is lost
</commit_message>
<xml_diff>
--- a/Testing.docx
+++ b/Testing.docx
@@ -27146,6 +27146,696 @@
                 <w:szCs w:val="20"/>
               </w:rPr>
               <w:t xml:space="preserve">The dashboard shows an empty state saying there is nothing on rather than showing a blank grid with no explanation.</w:t>
+            </w:r>
+          </w:p>
+        </w:tc>
+      </w:tr>
+    </w:tbl>
+    <w:p>
+      <w:r>
+        <w:rPr>
+          <w:rFonts w:ascii="Aptos" w:eastAsia="Aptos" w:hAnsi="Aptos" w:cs="Aptos"/>
+        </w:rPr>
+        <w:t xml:space="preserve"/>
+      </w:r>
+    </w:p>
+    <w:p>
+      <w:pPr>
+        <w:pStyle w:val="Heading3"/>
+      </w:pPr>
+      <w:r>
+        <w:rPr>
+          <w:rFonts w:ascii="Aptos Display" w:eastAsia="Aptos Display" w:hAnsi="Aptos Display" w:cs="Aptos Display"/>
+          <w:b/>
+          <w:bCs/>
+          <w:color w:val="000000"/>
+        </w:rPr>
+        <w:t xml:space="preserve">Objective 43: Warning Before Data Is Lost</w:t>
+      </w:r>
+    </w:p>
+    <w:p>
+      <w:r>
+        <w:rPr>
+          <w:rFonts w:ascii="Aptos" w:eastAsia="Aptos" w:hAnsi="Aptos" w:cs="Aptos"/>
+        </w:rPr>
+        <w:t xml:space="preserve">These tests check that the system asks before it throws away typing or destroys a record, and that the safe answer is the one that is selected by default so that pressing return on a confirmation cannot destroy anything.</w:t>
+      </w:r>
+    </w:p>
+    <w:tbl>
+      <w:tblPr>
+        <w:tblW w:w="5000" w:type="pct"/>
+        <w:tblBorders>
+          <w:top w:val="single" w:sz="4" w:space="0" w:color="808080"/>
+          <w:left w:val="single" w:sz="4" w:space="0" w:color="808080"/>
+          <w:bottom w:val="single" w:sz="4" w:space="0" w:color="808080"/>
+          <w:right w:val="single" w:sz="4" w:space="0" w:color="808080"/>
+          <w:insideH w:val="single" w:sz="4" w:space="0" w:color="808080"/>
+          <w:insideV w:val="single" w:sz="4" w:space="0" w:color="808080"/>
+        </w:tblBorders>
+        <w:tblCellMar>
+          <w:left w:w="10" w:type="dxa"/>
+          <w:right w:w="10" w:type="dxa"/>
+        </w:tblCellMar>
+        <w:tblLook w:val="0000" w:firstRow="0" w:lastRow="0" w:firstColumn="0" w:lastColumn="0" w:noHBand="0" w:noVBand="0"/>
+      </w:tblPr>
+      <w:tblGrid>
+        <w:gridCol w:w="561"/>
+        <w:gridCol w:w="3460"/>
+        <w:gridCol w:w="1047"/>
+        <w:gridCol w:w="4282"/>
+      </w:tblGrid>
+      <w:tr>
+        <w:trPr>
+          <w:cantSplit/>
+          <w:tblHeader/>
+        </w:trPr>
+        <w:tc>
+          <w:tcPr>
+            <w:tcW w:w="300" w:type="pct"/>
+            <w:shd w:val="clear" w:color="auto" w:fill="F2CEED" w:themeFill="accent5" w:themeFillTint="33"/>
+            <w:tcMar>
+              <w:top w:w="30" w:type="dxa"/>
+              <w:left w:w="80" w:type="dxa"/>
+              <w:bottom w:w="30" w:type="dxa"/>
+              <w:right w:w="80" w:type="dxa"/>
+            </w:tcMar>
+          </w:tcPr>
+          <w:p>
+            <w:r>
+              <w:rPr>
+                <w:rFonts w:ascii="Aptos" w:eastAsia="Aptos" w:hAnsi="Aptos" w:cs="Aptos"/>
+                <w:b/>
+                <w:bCs/>
+                <w:sz w:val="20"/>
+                <w:szCs w:val="20"/>
+              </w:rPr>
+              <w:t xml:space="preserve">No.</w:t>
+            </w:r>
+          </w:p>
+        </w:tc>
+        <w:tc>
+          <w:tcPr>
+            <w:tcW w:w="1850" w:type="pct"/>
+            <w:shd w:val="clear" w:color="auto" w:fill="F2CEED" w:themeFill="accent5" w:themeFillTint="33"/>
+            <w:tcMar>
+              <w:top w:w="30" w:type="dxa"/>
+              <w:left w:w="80" w:type="dxa"/>
+              <w:bottom w:w="30" w:type="dxa"/>
+              <w:right w:w="80" w:type="dxa"/>
+            </w:tcMar>
+          </w:tcPr>
+          <w:p>
+            <w:r>
+              <w:rPr>
+                <w:rFonts w:ascii="Aptos" w:eastAsia="Aptos" w:hAnsi="Aptos" w:cs="Aptos"/>
+                <w:b/>
+                <w:bCs/>
+                <w:sz w:val="20"/>
+                <w:szCs w:val="20"/>
+              </w:rPr>
+              <w:t xml:space="preserve">Test</w:t>
+            </w:r>
+          </w:p>
+        </w:tc>
+        <w:tc>
+          <w:tcPr>
+            <w:tcW w:w="560" w:type="pct"/>
+            <w:shd w:val="clear" w:color="auto" w:fill="F2CEED" w:themeFill="accent5" w:themeFillTint="33"/>
+            <w:tcMar>
+              <w:top w:w="30" w:type="dxa"/>
+              <w:left w:w="80" w:type="dxa"/>
+              <w:bottom w:w="30" w:type="dxa"/>
+              <w:right w:w="80" w:type="dxa"/>
+            </w:tcMar>
+          </w:tcPr>
+          <w:p>
+            <w:r>
+              <w:rPr>
+                <w:rFonts w:ascii="Aptos" w:eastAsia="Aptos" w:hAnsi="Aptos" w:cs="Aptos"/>
+                <w:b/>
+                <w:bCs/>
+                <w:sz w:val="20"/>
+                <w:szCs w:val="20"/>
+              </w:rPr>
+              <w:t xml:space="preserve">Type</w:t>
+            </w:r>
+          </w:p>
+        </w:tc>
+        <w:tc>
+          <w:tcPr>
+            <w:tcW w:w="2290" w:type="pct"/>
+            <w:shd w:val="clear" w:color="auto" w:fill="F2CEED" w:themeFill="accent5" w:themeFillTint="33"/>
+            <w:tcMar>
+              <w:top w:w="30" w:type="dxa"/>
+              <w:left w:w="80" w:type="dxa"/>
+              <w:bottom w:w="30" w:type="dxa"/>
+              <w:right w:w="80" w:type="dxa"/>
+            </w:tcMar>
+          </w:tcPr>
+          <w:p>
+            <w:r>
+              <w:rPr>
+                <w:rFonts w:ascii="Aptos" w:eastAsia="Aptos" w:hAnsi="Aptos" w:cs="Aptos"/>
+                <w:b/>
+                <w:bCs/>
+                <w:sz w:val="20"/>
+                <w:szCs w:val="20"/>
+              </w:rPr>
+              <w:t xml:space="preserve">Expected Result</w:t>
+            </w:r>
+          </w:p>
+        </w:tc>
+      </w:tr>
+      <w:tr>
+        <w:trPr>
+          <w:cantSplit/>
+        </w:trPr>
+        <w:tc>
+          <w:tcPr>
+            <w:tcW w:w="300" w:type="pct"/>
+            <w:tcMar>
+              <w:top w:w="30" w:type="dxa"/>
+              <w:left w:w="80" w:type="dxa"/>
+              <w:bottom w:w="30" w:type="dxa"/>
+              <w:right w:w="80" w:type="dxa"/>
+            </w:tcMar>
+          </w:tcPr>
+          <w:p>
+            <w:r>
+              <w:rPr>
+                <w:rFonts w:ascii="Aptos" w:eastAsia="Aptos" w:hAnsi="Aptos" w:cs="Aptos"/>
+                <w:sz w:val="20"/>
+                <w:szCs w:val="20"/>
+              </w:rPr>
+              <w:t xml:space="preserve">246</w:t>
+            </w:r>
+          </w:p>
+        </w:tc>
+        <w:tc>
+          <w:tcPr>
+            <w:tcW w:w="1850" w:type="pct"/>
+            <w:tcMar>
+              <w:top w:w="30" w:type="dxa"/>
+              <w:left w:w="80" w:type="dxa"/>
+              <w:bottom w:w="30" w:type="dxa"/>
+              <w:right w:w="80" w:type="dxa"/>
+            </w:tcMar>
+          </w:tcPr>
+          <w:p>
+            <w:r>
+              <w:rPr>
+                <w:rFonts w:ascii="Aptos" w:eastAsia="Aptos" w:hAnsi="Aptos" w:cs="Aptos"/>
+                <w:sz w:val="20"/>
+                <w:szCs w:val="20"/>
+              </w:rPr>
+              <w:t xml:space="preserve">Type details into the Films form and then press Clear without saving</w:t>
+            </w:r>
+          </w:p>
+        </w:tc>
+        <w:tc>
+          <w:tcPr>
+            <w:tcW w:w="560" w:type="pct"/>
+            <w:tcMar>
+              <w:top w:w="30" w:type="dxa"/>
+              <w:left w:w="80" w:type="dxa"/>
+              <w:bottom w:w="30" w:type="dxa"/>
+              <w:right w:w="80" w:type="dxa"/>
+            </w:tcMar>
+          </w:tcPr>
+          <w:p>
+            <w:r>
+              <w:rPr>
+                <w:rFonts w:ascii="Aptos" w:eastAsia="Aptos" w:hAnsi="Aptos" w:cs="Aptos"/>
+                <w:sz w:val="20"/>
+                <w:szCs w:val="20"/>
+              </w:rPr>
+              <w:t xml:space="preserve">Erroneous</w:t>
+            </w:r>
+          </w:p>
+        </w:tc>
+        <w:tc>
+          <w:tcPr>
+            <w:tcW w:w="2290" w:type="pct"/>
+            <w:tcMar>
+              <w:top w:w="30" w:type="dxa"/>
+              <w:left w:w="80" w:type="dxa"/>
+              <w:bottom w:w="30" w:type="dxa"/>
+              <w:right w:w="80" w:type="dxa"/>
+            </w:tcMar>
+          </w:tcPr>
+          <w:p>
+            <w:r>
+              <w:rPr>
+                <w:rFonts w:ascii="Aptos" w:eastAsia="Aptos" w:hAnsi="Aptos" w:cs="Aptos"/>
+                <w:sz w:val="20"/>
+                <w:szCs w:val="20"/>
+              </w:rPr>
+              <w:t xml:space="preserve">A warning appears saying there are changes that have not been saved, and choosing not to continue leaves the typing where it is.</w:t>
+            </w:r>
+          </w:p>
+        </w:tc>
+      </w:tr>
+      <w:tr>
+        <w:trPr>
+          <w:cantSplit/>
+        </w:trPr>
+        <w:tc>
+          <w:tcPr>
+            <w:tcW w:w="300" w:type="pct"/>
+            <w:tcMar>
+              <w:top w:w="30" w:type="dxa"/>
+              <w:left w:w="80" w:type="dxa"/>
+              <w:bottom w:w="30" w:type="dxa"/>
+              <w:right w:w="80" w:type="dxa"/>
+            </w:tcMar>
+          </w:tcPr>
+          <w:p>
+            <w:r>
+              <w:rPr>
+                <w:rFonts w:ascii="Aptos" w:eastAsia="Aptos" w:hAnsi="Aptos" w:cs="Aptos"/>
+                <w:sz w:val="20"/>
+                <w:szCs w:val="20"/>
+              </w:rPr>
+              <w:t xml:space="preserve">247</w:t>
+            </w:r>
+          </w:p>
+        </w:tc>
+        <w:tc>
+          <w:tcPr>
+            <w:tcW w:w="1850" w:type="pct"/>
+            <w:tcMar>
+              <w:top w:w="30" w:type="dxa"/>
+              <w:left w:w="80" w:type="dxa"/>
+              <w:bottom w:w="30" w:type="dxa"/>
+              <w:right w:w="80" w:type="dxa"/>
+            </w:tcMar>
+          </w:tcPr>
+          <w:p>
+            <w:r>
+              <w:rPr>
+                <w:rFonts w:ascii="Aptos" w:eastAsia="Aptos" w:hAnsi="Aptos" w:cs="Aptos"/>
+                <w:sz w:val="20"/>
+                <w:szCs w:val="20"/>
+              </w:rPr>
+              <w:t xml:space="preserve">Type details into the Films form and then select a different film in the grid</w:t>
+            </w:r>
+          </w:p>
+        </w:tc>
+        <w:tc>
+          <w:tcPr>
+            <w:tcW w:w="560" w:type="pct"/>
+            <w:tcMar>
+              <w:top w:w="30" w:type="dxa"/>
+              <w:left w:w="80" w:type="dxa"/>
+              <w:bottom w:w="30" w:type="dxa"/>
+              <w:right w:w="80" w:type="dxa"/>
+            </w:tcMar>
+          </w:tcPr>
+          <w:p>
+            <w:r>
+              <w:rPr>
+                <w:rFonts w:ascii="Aptos" w:eastAsia="Aptos" w:hAnsi="Aptos" w:cs="Aptos"/>
+                <w:sz w:val="20"/>
+                <w:szCs w:val="20"/>
+              </w:rPr>
+              <w:t xml:space="preserve">Erroneous</w:t>
+            </w:r>
+          </w:p>
+        </w:tc>
+        <w:tc>
+          <w:tcPr>
+            <w:tcW w:w="2290" w:type="pct"/>
+            <w:tcMar>
+              <w:top w:w="30" w:type="dxa"/>
+              <w:left w:w="80" w:type="dxa"/>
+              <w:bottom w:w="30" w:type="dxa"/>
+              <w:right w:w="80" w:type="dxa"/>
+            </w:tcMar>
+          </w:tcPr>
+          <w:p>
+            <w:r>
+              <w:rPr>
+                <w:rFonts w:ascii="Aptos" w:eastAsia="Aptos" w:hAnsi="Aptos" w:cs="Aptos"/>
+                <w:sz w:val="20"/>
+                <w:szCs w:val="20"/>
+              </w:rPr>
+              <w:t xml:space="preserve">The same warning appears before the boxes are overwritten with the other film's details.</w:t>
+            </w:r>
+          </w:p>
+        </w:tc>
+      </w:tr>
+      <w:tr>
+        <w:trPr>
+          <w:cantSplit/>
+        </w:trPr>
+        <w:tc>
+          <w:tcPr>
+            <w:tcW w:w="300" w:type="pct"/>
+            <w:tcMar>
+              <w:top w:w="30" w:type="dxa"/>
+              <w:left w:w="80" w:type="dxa"/>
+              <w:bottom w:w="30" w:type="dxa"/>
+              <w:right w:w="80" w:type="dxa"/>
+            </w:tcMar>
+          </w:tcPr>
+          <w:p>
+            <w:r>
+              <w:rPr>
+                <w:rFonts w:ascii="Aptos" w:eastAsia="Aptos" w:hAnsi="Aptos" w:cs="Aptos"/>
+                <w:sz w:val="20"/>
+                <w:szCs w:val="20"/>
+              </w:rPr>
+              <w:t xml:space="preserve">248</w:t>
+            </w:r>
+          </w:p>
+        </w:tc>
+        <w:tc>
+          <w:tcPr>
+            <w:tcW w:w="1850" w:type="pct"/>
+            <w:tcMar>
+              <w:top w:w="30" w:type="dxa"/>
+              <w:left w:w="80" w:type="dxa"/>
+              <w:bottom w:w="30" w:type="dxa"/>
+              <w:right w:w="80" w:type="dxa"/>
+            </w:tcMar>
+          </w:tcPr>
+          <w:p>
+            <w:r>
+              <w:rPr>
+                <w:rFonts w:ascii="Aptos" w:eastAsia="Aptos" w:hAnsi="Aptos" w:cs="Aptos"/>
+                <w:sz w:val="20"/>
+                <w:szCs w:val="20"/>
+              </w:rPr>
+              <w:t xml:space="preserve">Answer No to that warning</w:t>
+            </w:r>
+          </w:p>
+        </w:tc>
+        <w:tc>
+          <w:tcPr>
+            <w:tcW w:w="560" w:type="pct"/>
+            <w:tcMar>
+              <w:top w:w="30" w:type="dxa"/>
+              <w:left w:w="80" w:type="dxa"/>
+              <w:bottom w:w="30" w:type="dxa"/>
+              <w:right w:w="80" w:type="dxa"/>
+            </w:tcMar>
+          </w:tcPr>
+          <w:p>
+            <w:r>
+              <w:rPr>
+                <w:rFonts w:ascii="Aptos" w:eastAsia="Aptos" w:hAnsi="Aptos" w:cs="Aptos"/>
+                <w:sz w:val="20"/>
+                <w:szCs w:val="20"/>
+              </w:rPr>
+              <w:t xml:space="preserve">Normal</w:t>
+            </w:r>
+          </w:p>
+        </w:tc>
+        <w:tc>
+          <w:tcPr>
+            <w:tcW w:w="2290" w:type="pct"/>
+            <w:tcMar>
+              <w:top w:w="30" w:type="dxa"/>
+              <w:left w:w="80" w:type="dxa"/>
+              <w:bottom w:w="30" w:type="dxa"/>
+              <w:right w:w="80" w:type="dxa"/>
+            </w:tcMar>
+          </w:tcPr>
+          <w:p>
+            <w:r>
+              <w:rPr>
+                <w:rFonts w:ascii="Aptos" w:eastAsia="Aptos" w:hAnsi="Aptos" w:cs="Aptos"/>
+                <w:sz w:val="20"/>
+                <w:szCs w:val="20"/>
+              </w:rPr>
+              <w:t xml:space="preserve">The typing is still there and nothing has been lost.</w:t>
+            </w:r>
+          </w:p>
+        </w:tc>
+      </w:tr>
+      <w:tr>
+        <w:trPr>
+          <w:cantSplit/>
+        </w:trPr>
+        <w:tc>
+          <w:tcPr>
+            <w:tcW w:w="300" w:type="pct"/>
+            <w:tcMar>
+              <w:top w:w="30" w:type="dxa"/>
+              <w:left w:w="80" w:type="dxa"/>
+              <w:bottom w:w="30" w:type="dxa"/>
+              <w:right w:w="80" w:type="dxa"/>
+            </w:tcMar>
+          </w:tcPr>
+          <w:p>
+            <w:r>
+              <w:rPr>
+                <w:rFonts w:ascii="Aptos" w:eastAsia="Aptos" w:hAnsi="Aptos" w:cs="Aptos"/>
+                <w:sz w:val="20"/>
+                <w:szCs w:val="20"/>
+              </w:rPr>
+              <w:t xml:space="preserve">249</w:t>
+            </w:r>
+          </w:p>
+        </w:tc>
+        <w:tc>
+          <w:tcPr>
+            <w:tcW w:w="1850" w:type="pct"/>
+            <w:tcMar>
+              <w:top w:w="30" w:type="dxa"/>
+              <w:left w:w="80" w:type="dxa"/>
+              <w:bottom w:w="30" w:type="dxa"/>
+              <w:right w:w="80" w:type="dxa"/>
+            </w:tcMar>
+          </w:tcPr>
+          <w:p>
+            <w:r>
+              <w:rPr>
+                <w:rFonts w:ascii="Aptos" w:eastAsia="Aptos" w:hAnsi="Aptos" w:cs="Aptos"/>
+                <w:sz w:val="20"/>
+                <w:szCs w:val="20"/>
+              </w:rPr>
+              <w:t xml:space="preserve">Look at which button is selected by default on a confirmation that would destroy data</w:t>
+            </w:r>
+          </w:p>
+        </w:tc>
+        <w:tc>
+          <w:tcPr>
+            <w:tcW w:w="560" w:type="pct"/>
+            <w:tcMar>
+              <w:top w:w="30" w:type="dxa"/>
+              <w:left w:w="80" w:type="dxa"/>
+              <w:bottom w:w="30" w:type="dxa"/>
+              <w:right w:w="80" w:type="dxa"/>
+            </w:tcMar>
+          </w:tcPr>
+          <w:p>
+            <w:r>
+              <w:rPr>
+                <w:rFonts w:ascii="Aptos" w:eastAsia="Aptos" w:hAnsi="Aptos" w:cs="Aptos"/>
+                <w:sz w:val="20"/>
+                <w:szCs w:val="20"/>
+              </w:rPr>
+              <w:t xml:space="preserve">Normal</w:t>
+            </w:r>
+          </w:p>
+        </w:tc>
+        <w:tc>
+          <w:tcPr>
+            <w:tcW w:w="2290" w:type="pct"/>
+            <w:tcMar>
+              <w:top w:w="30" w:type="dxa"/>
+              <w:left w:w="80" w:type="dxa"/>
+              <w:bottom w:w="30" w:type="dxa"/>
+              <w:right w:w="80" w:type="dxa"/>
+            </w:tcMar>
+          </w:tcPr>
+          <w:p>
+            <w:r>
+              <w:rPr>
+                <w:rFonts w:ascii="Aptos" w:eastAsia="Aptos" w:hAnsi="Aptos" w:cs="Aptos"/>
+                <w:sz w:val="20"/>
+                <w:szCs w:val="20"/>
+              </w:rPr>
+              <w:t xml:space="preserve">The safe answer is the one selected, so pressing return on the confirmation does not destroy anything.</w:t>
+            </w:r>
+          </w:p>
+        </w:tc>
+      </w:tr>
+      <w:tr>
+        <w:trPr>
+          <w:cantSplit/>
+        </w:trPr>
+        <w:tc>
+          <w:tcPr>
+            <w:tcW w:w="300" w:type="pct"/>
+            <w:tcMar>
+              <w:top w:w="30" w:type="dxa"/>
+              <w:left w:w="80" w:type="dxa"/>
+              <w:bottom w:w="30" w:type="dxa"/>
+              <w:right w:w="80" w:type="dxa"/>
+            </w:tcMar>
+          </w:tcPr>
+          <w:p>
+            <w:r>
+              <w:rPr>
+                <w:rFonts w:ascii="Aptos" w:eastAsia="Aptos" w:hAnsi="Aptos" w:cs="Aptos"/>
+                <w:sz w:val="20"/>
+                <w:szCs w:val="20"/>
+              </w:rPr>
+              <w:t xml:space="preserve">250</w:t>
+            </w:r>
+          </w:p>
+        </w:tc>
+        <w:tc>
+          <w:tcPr>
+            <w:tcW w:w="1850" w:type="pct"/>
+            <w:tcMar>
+              <w:top w:w="30" w:type="dxa"/>
+              <w:left w:w="80" w:type="dxa"/>
+              <w:bottom w:w="30" w:type="dxa"/>
+              <w:right w:w="80" w:type="dxa"/>
+            </w:tcMar>
+          </w:tcPr>
+          <w:p>
+            <w:r>
+              <w:rPr>
+                <w:rFonts w:ascii="Aptos" w:eastAsia="Aptos" w:hAnsi="Aptos" w:cs="Aptos"/>
+                <w:sz w:val="20"/>
+                <w:szCs w:val="20"/>
+              </w:rPr>
+              <w:t xml:space="preserve">Press Delete on a record that can be deleted and answer No</w:t>
+            </w:r>
+          </w:p>
+        </w:tc>
+        <w:tc>
+          <w:tcPr>
+            <w:tcW w:w="560" w:type="pct"/>
+            <w:tcMar>
+              <w:top w:w="30" w:type="dxa"/>
+              <w:left w:w="80" w:type="dxa"/>
+              <w:bottom w:w="30" w:type="dxa"/>
+              <w:right w:w="80" w:type="dxa"/>
+            </w:tcMar>
+          </w:tcPr>
+          <w:p>
+            <w:r>
+              <w:rPr>
+                <w:rFonts w:ascii="Aptos" w:eastAsia="Aptos" w:hAnsi="Aptos" w:cs="Aptos"/>
+                <w:sz w:val="20"/>
+                <w:szCs w:val="20"/>
+              </w:rPr>
+              <w:t xml:space="preserve">Normal</w:t>
+            </w:r>
+          </w:p>
+        </w:tc>
+        <w:tc>
+          <w:tcPr>
+            <w:tcW w:w="2290" w:type="pct"/>
+            <w:tcMar>
+              <w:top w:w="30" w:type="dxa"/>
+              <w:left w:w="80" w:type="dxa"/>
+              <w:bottom w:w="30" w:type="dxa"/>
+              <w:right w:w="80" w:type="dxa"/>
+            </w:tcMar>
+          </w:tcPr>
+          <w:p>
+            <w:r>
+              <w:rPr>
+                <w:rFonts w:ascii="Aptos" w:eastAsia="Aptos" w:hAnsi="Aptos" w:cs="Aptos"/>
+                <w:sz w:val="20"/>
+                <w:szCs w:val="20"/>
+              </w:rPr>
+              <w:t xml:space="preserve">The record is still there.</w:t>
+            </w:r>
+          </w:p>
+        </w:tc>
+      </w:tr>
+      <w:tr>
+        <w:trPr>
+          <w:cantSplit/>
+        </w:trPr>
+        <w:tc>
+          <w:tcPr>
+            <w:tcW w:w="300" w:type="pct"/>
+            <w:tcMar>
+              <w:top w:w="30" w:type="dxa"/>
+              <w:left w:w="80" w:type="dxa"/>
+              <w:bottom w:w="30" w:type="dxa"/>
+              <w:right w:w="80" w:type="dxa"/>
+            </w:tcMar>
+          </w:tcPr>
+          <w:p>
+            <w:r>
+              <w:rPr>
+                <w:rFonts w:ascii="Aptos" w:eastAsia="Aptos" w:hAnsi="Aptos" w:cs="Aptos"/>
+                <w:sz w:val="20"/>
+                <w:szCs w:val="20"/>
+              </w:rPr>
+              <w:t xml:space="preserve">251</w:t>
+            </w:r>
+          </w:p>
+        </w:tc>
+        <w:tc>
+          <w:tcPr>
+            <w:tcW w:w="1850" w:type="pct"/>
+            <w:tcMar>
+              <w:top w:w="30" w:type="dxa"/>
+              <w:left w:w="80" w:type="dxa"/>
+              <w:bottom w:w="30" w:type="dxa"/>
+              <w:right w:w="80" w:type="dxa"/>
+            </w:tcMar>
+          </w:tcPr>
+          <w:p>
+            <w:r>
+              <w:rPr>
+                <w:rFonts w:ascii="Aptos" w:eastAsia="Aptos" w:hAnsi="Aptos" w:cs="Aptos"/>
+                <w:sz w:val="20"/>
+                <w:szCs w:val="20"/>
+              </w:rPr>
+              <w:t xml:space="preserve">Change the seat plan on a screen that has tickets already sold</w:t>
+            </w:r>
+          </w:p>
+        </w:tc>
+        <w:tc>
+          <w:tcPr>
+            <w:tcW w:w="560" w:type="pct"/>
+            <w:tcMar>
+              <w:top w:w="30" w:type="dxa"/>
+              <w:left w:w="80" w:type="dxa"/>
+              <w:bottom w:w="30" w:type="dxa"/>
+              <w:right w:w="80" w:type="dxa"/>
+            </w:tcMar>
+          </w:tcPr>
+          <w:p>
+            <w:r>
+              <w:rPr>
+                <w:rFonts w:ascii="Aptos" w:eastAsia="Aptos" w:hAnsi="Aptos" w:cs="Aptos"/>
+                <w:sz w:val="20"/>
+                <w:szCs w:val="20"/>
+              </w:rPr>
+              <w:t xml:space="preserve">Erroneous</w:t>
+            </w:r>
+          </w:p>
+        </w:tc>
+        <w:tc>
+          <w:tcPr>
+            <w:tcW w:w="2290" w:type="pct"/>
+            <w:tcMar>
+              <w:top w:w="30" w:type="dxa"/>
+              <w:left w:w="80" w:type="dxa"/>
+              <w:bottom w:w="30" w:type="dxa"/>
+              <w:right w:w="80" w:type="dxa"/>
+            </w:tcMar>
+          </w:tcPr>
+          <w:p>
+            <w:r>
+              <w:rPr>
+                <w:rFonts w:ascii="Aptos" w:eastAsia="Aptos" w:hAnsi="Aptos" w:cs="Aptos"/>
+                <w:sz w:val="20"/>
+                <w:szCs w:val="20"/>
+              </w:rPr>
+              <w:t xml:space="preserve">A confirmation appears explaining that changing what sort a seat is changes what it costs from now on and that tickets already sold keep the price they were sold at, and answering No leaves the plan as it was.</w:t>
             </w:r>
           </w:p>
         </w:tc>

</xml_diff>

<commit_message>
added objective 44: preventing duplicates and protecting records other records depend on
</commit_message>
<xml_diff>
--- a/Testing.docx
+++ b/Testing.docx
@@ -27836,6 +27836,963 @@
                 <w:szCs w:val="20"/>
               </w:rPr>
               <w:t xml:space="preserve">A confirmation appears explaining that changing what sort a seat is changes what it costs from now on and that tickets already sold keep the price they were sold at, and answering No leaves the plan as it was.</w:t>
+            </w:r>
+          </w:p>
+        </w:tc>
+      </w:tr>
+    </w:tbl>
+    <w:p>
+      <w:r>
+        <w:rPr>
+          <w:rFonts w:ascii="Aptos" w:eastAsia="Aptos" w:hAnsi="Aptos" w:cs="Aptos"/>
+        </w:rPr>
+        <w:t xml:space="preserve"/>
+      </w:r>
+    </w:p>
+    <w:p>
+      <w:pPr>
+        <w:pStyle w:val="Heading3"/>
+      </w:pPr>
+      <w:r>
+        <w:rPr>
+          <w:rFonts w:ascii="Aptos Display" w:eastAsia="Aptos Display" w:hAnsi="Aptos Display" w:cs="Aptos Display"/>
+          <w:b/>
+          <w:bCs/>
+          <w:color w:val="000000"/>
+        </w:rPr>
+        <w:t xml:space="preserve">Objective 44: Preventing Duplicates and Protecting Records Other Records Depend On</w:t>
+      </w:r>
+    </w:p>
+    <w:p>
+      <w:r>
+        <w:rPr>
+          <w:rFonts w:ascii="Aptos" w:eastAsia="Aptos" w:hAnsi="Aptos" w:cs="Aptos"/>
+        </w:rPr>
+        <w:t xml:space="preserve">This objective has two halves. The first is that a record must not be created twice where two the same could not be told apart afterwards. The second is that a record cannot be deleted while other records point at it. Some of these have already been met in passing earlier in the plan, and they are brought together here so that the objective can be judged in one place.</w:t>
+      </w:r>
+    </w:p>
+    <w:tbl>
+      <w:tblPr>
+        <w:tblW w:w="5000" w:type="pct"/>
+        <w:tblBorders>
+          <w:top w:val="single" w:sz="4" w:space="0" w:color="808080"/>
+          <w:left w:val="single" w:sz="4" w:space="0" w:color="808080"/>
+          <w:bottom w:val="single" w:sz="4" w:space="0" w:color="808080"/>
+          <w:right w:val="single" w:sz="4" w:space="0" w:color="808080"/>
+          <w:insideH w:val="single" w:sz="4" w:space="0" w:color="808080"/>
+          <w:insideV w:val="single" w:sz="4" w:space="0" w:color="808080"/>
+        </w:tblBorders>
+        <w:tblCellMar>
+          <w:left w:w="10" w:type="dxa"/>
+          <w:right w:w="10" w:type="dxa"/>
+        </w:tblCellMar>
+        <w:tblLook w:val="0000" w:firstRow="0" w:lastRow="0" w:firstColumn="0" w:lastColumn="0" w:noHBand="0" w:noVBand="0"/>
+      </w:tblPr>
+      <w:tblGrid>
+        <w:gridCol w:w="561"/>
+        <w:gridCol w:w="3460"/>
+        <w:gridCol w:w="1047"/>
+        <w:gridCol w:w="4282"/>
+      </w:tblGrid>
+      <w:tr>
+        <w:trPr>
+          <w:cantSplit/>
+          <w:tblHeader/>
+        </w:trPr>
+        <w:tc>
+          <w:tcPr>
+            <w:tcW w:w="300" w:type="pct"/>
+            <w:shd w:val="clear" w:color="auto" w:fill="F2CEED" w:themeFill="accent5" w:themeFillTint="33"/>
+            <w:tcMar>
+              <w:top w:w="30" w:type="dxa"/>
+              <w:left w:w="80" w:type="dxa"/>
+              <w:bottom w:w="30" w:type="dxa"/>
+              <w:right w:w="80" w:type="dxa"/>
+            </w:tcMar>
+          </w:tcPr>
+          <w:p>
+            <w:r>
+              <w:rPr>
+                <w:rFonts w:ascii="Aptos" w:eastAsia="Aptos" w:hAnsi="Aptos" w:cs="Aptos"/>
+                <w:b/>
+                <w:bCs/>
+                <w:sz w:val="20"/>
+                <w:szCs w:val="20"/>
+              </w:rPr>
+              <w:t xml:space="preserve">No.</w:t>
+            </w:r>
+          </w:p>
+        </w:tc>
+        <w:tc>
+          <w:tcPr>
+            <w:tcW w:w="1850" w:type="pct"/>
+            <w:shd w:val="clear" w:color="auto" w:fill="F2CEED" w:themeFill="accent5" w:themeFillTint="33"/>
+            <w:tcMar>
+              <w:top w:w="30" w:type="dxa"/>
+              <w:left w:w="80" w:type="dxa"/>
+              <w:bottom w:w="30" w:type="dxa"/>
+              <w:right w:w="80" w:type="dxa"/>
+            </w:tcMar>
+          </w:tcPr>
+          <w:p>
+            <w:r>
+              <w:rPr>
+                <w:rFonts w:ascii="Aptos" w:eastAsia="Aptos" w:hAnsi="Aptos" w:cs="Aptos"/>
+                <w:b/>
+                <w:bCs/>
+                <w:sz w:val="20"/>
+                <w:szCs w:val="20"/>
+              </w:rPr>
+              <w:t xml:space="preserve">Test</w:t>
+            </w:r>
+          </w:p>
+        </w:tc>
+        <w:tc>
+          <w:tcPr>
+            <w:tcW w:w="560" w:type="pct"/>
+            <w:shd w:val="clear" w:color="auto" w:fill="F2CEED" w:themeFill="accent5" w:themeFillTint="33"/>
+            <w:tcMar>
+              <w:top w:w="30" w:type="dxa"/>
+              <w:left w:w="80" w:type="dxa"/>
+              <w:bottom w:w="30" w:type="dxa"/>
+              <w:right w:w="80" w:type="dxa"/>
+            </w:tcMar>
+          </w:tcPr>
+          <w:p>
+            <w:r>
+              <w:rPr>
+                <w:rFonts w:ascii="Aptos" w:eastAsia="Aptos" w:hAnsi="Aptos" w:cs="Aptos"/>
+                <w:b/>
+                <w:bCs/>
+                <w:sz w:val="20"/>
+                <w:szCs w:val="20"/>
+              </w:rPr>
+              <w:t xml:space="preserve">Type</w:t>
+            </w:r>
+          </w:p>
+        </w:tc>
+        <w:tc>
+          <w:tcPr>
+            <w:tcW w:w="2290" w:type="pct"/>
+            <w:shd w:val="clear" w:color="auto" w:fill="F2CEED" w:themeFill="accent5" w:themeFillTint="33"/>
+            <w:tcMar>
+              <w:top w:w="30" w:type="dxa"/>
+              <w:left w:w="80" w:type="dxa"/>
+              <w:bottom w:w="30" w:type="dxa"/>
+              <w:right w:w="80" w:type="dxa"/>
+            </w:tcMar>
+          </w:tcPr>
+          <w:p>
+            <w:r>
+              <w:rPr>
+                <w:rFonts w:ascii="Aptos" w:eastAsia="Aptos" w:hAnsi="Aptos" w:cs="Aptos"/>
+                <w:b/>
+                <w:bCs/>
+                <w:sz w:val="20"/>
+                <w:szCs w:val="20"/>
+              </w:rPr>
+              <w:t xml:space="preserve">Expected Result</w:t>
+            </w:r>
+          </w:p>
+        </w:tc>
+      </w:tr>
+      <w:tr>
+        <w:trPr>
+          <w:cantSplit/>
+        </w:trPr>
+        <w:tc>
+          <w:tcPr>
+            <w:tcW w:w="300" w:type="pct"/>
+            <w:tcMar>
+              <w:top w:w="30" w:type="dxa"/>
+              <w:left w:w="80" w:type="dxa"/>
+              <w:bottom w:w="30" w:type="dxa"/>
+              <w:right w:w="80" w:type="dxa"/>
+            </w:tcMar>
+          </w:tcPr>
+          <w:p>
+            <w:r>
+              <w:rPr>
+                <w:rFonts w:ascii="Aptos" w:eastAsia="Aptos" w:hAnsi="Aptos" w:cs="Aptos"/>
+                <w:sz w:val="20"/>
+                <w:szCs w:val="20"/>
+              </w:rPr>
+              <w:t xml:space="preserve">252</w:t>
+            </w:r>
+          </w:p>
+        </w:tc>
+        <w:tc>
+          <w:tcPr>
+            <w:tcW w:w="1850" w:type="pct"/>
+            <w:tcMar>
+              <w:top w:w="30" w:type="dxa"/>
+              <w:left w:w="80" w:type="dxa"/>
+              <w:bottom w:w="30" w:type="dxa"/>
+              <w:right w:w="80" w:type="dxa"/>
+            </w:tcMar>
+          </w:tcPr>
+          <w:p>
+            <w:r>
+              <w:rPr>
+                <w:rFonts w:ascii="Aptos" w:eastAsia="Aptos" w:hAnsi="Aptos" w:cs="Aptos"/>
+                <w:sz w:val="20"/>
+                <w:szCs w:val="20"/>
+              </w:rPr>
+              <w:t xml:space="preserve">Try to add a second screen called Screen 1</w:t>
+            </w:r>
+          </w:p>
+        </w:tc>
+        <w:tc>
+          <w:tcPr>
+            <w:tcW w:w="560" w:type="pct"/>
+            <w:tcMar>
+              <w:top w:w="30" w:type="dxa"/>
+              <w:left w:w="80" w:type="dxa"/>
+              <w:bottom w:w="30" w:type="dxa"/>
+              <w:right w:w="80" w:type="dxa"/>
+            </w:tcMar>
+          </w:tcPr>
+          <w:p>
+            <w:r>
+              <w:rPr>
+                <w:rFonts w:ascii="Aptos" w:eastAsia="Aptos" w:hAnsi="Aptos" w:cs="Aptos"/>
+                <w:sz w:val="20"/>
+                <w:szCs w:val="20"/>
+              </w:rPr>
+              <w:t xml:space="preserve">Erroneous</w:t>
+            </w:r>
+          </w:p>
+        </w:tc>
+        <w:tc>
+          <w:tcPr>
+            <w:tcW w:w="2290" w:type="pct"/>
+            <w:tcMar>
+              <w:top w:w="30" w:type="dxa"/>
+              <w:left w:w="80" w:type="dxa"/>
+              <w:bottom w:w="30" w:type="dxa"/>
+              <w:right w:w="80" w:type="dxa"/>
+            </w:tcMar>
+          </w:tcPr>
+          <w:p>
+            <w:r>
+              <w:rPr>
+                <w:rFonts w:ascii="Aptos" w:eastAsia="Aptos" w:hAnsi="Aptos" w:cs="Aptos"/>
+                <w:sz w:val="20"/>
+                <w:szCs w:val="20"/>
+              </w:rPr>
+              <w:t xml:space="preserve">It is refused, because screens are picked by name everywhere else and two the same could not be told apart.</w:t>
+            </w:r>
+          </w:p>
+        </w:tc>
+      </w:tr>
+      <w:tr>
+        <w:trPr>
+          <w:cantSplit/>
+        </w:trPr>
+        <w:tc>
+          <w:tcPr>
+            <w:tcW w:w="300" w:type="pct"/>
+            <w:tcMar>
+              <w:top w:w="30" w:type="dxa"/>
+              <w:left w:w="80" w:type="dxa"/>
+              <w:bottom w:w="30" w:type="dxa"/>
+              <w:right w:w="80" w:type="dxa"/>
+            </w:tcMar>
+          </w:tcPr>
+          <w:p>
+            <w:r>
+              <w:rPr>
+                <w:rFonts w:ascii="Aptos" w:eastAsia="Aptos" w:hAnsi="Aptos" w:cs="Aptos"/>
+                <w:sz w:val="20"/>
+                <w:szCs w:val="20"/>
+              </w:rPr>
+              <w:t xml:space="preserve">253</w:t>
+            </w:r>
+          </w:p>
+        </w:tc>
+        <w:tc>
+          <w:tcPr>
+            <w:tcW w:w="1850" w:type="pct"/>
+            <w:tcMar>
+              <w:top w:w="30" w:type="dxa"/>
+              <w:left w:w="80" w:type="dxa"/>
+              <w:bottom w:w="30" w:type="dxa"/>
+              <w:right w:w="80" w:type="dxa"/>
+            </w:tcMar>
+          </w:tcPr>
+          <w:p>
+            <w:r>
+              <w:rPr>
+                <w:rFonts w:ascii="Aptos" w:eastAsia="Aptos" w:hAnsi="Aptos" w:cs="Aptos"/>
+                <w:sz w:val="20"/>
+                <w:szCs w:val="20"/>
+              </w:rPr>
+              <w:t xml:space="preserve">Try to add Inception a second time for the year 2010</w:t>
+            </w:r>
+          </w:p>
+        </w:tc>
+        <w:tc>
+          <w:tcPr>
+            <w:tcW w:w="560" w:type="pct"/>
+            <w:tcMar>
+              <w:top w:w="30" w:type="dxa"/>
+              <w:left w:w="80" w:type="dxa"/>
+              <w:bottom w:w="30" w:type="dxa"/>
+              <w:right w:w="80" w:type="dxa"/>
+            </w:tcMar>
+          </w:tcPr>
+          <w:p>
+            <w:r>
+              <w:rPr>
+                <w:rFonts w:ascii="Aptos" w:eastAsia="Aptos" w:hAnsi="Aptos" w:cs="Aptos"/>
+                <w:sz w:val="20"/>
+                <w:szCs w:val="20"/>
+              </w:rPr>
+              <w:t xml:space="preserve">Erroneous</w:t>
+            </w:r>
+          </w:p>
+        </w:tc>
+        <w:tc>
+          <w:tcPr>
+            <w:tcW w:w="2290" w:type="pct"/>
+            <w:tcMar>
+              <w:top w:w="30" w:type="dxa"/>
+              <w:left w:w="80" w:type="dxa"/>
+              <w:bottom w:w="30" w:type="dxa"/>
+              <w:right w:w="80" w:type="dxa"/>
+            </w:tcMar>
+          </w:tcPr>
+          <w:p>
+            <w:r>
+              <w:rPr>
+                <w:rFonts w:ascii="Aptos" w:eastAsia="Aptos" w:hAnsi="Aptos" w:cs="Aptos"/>
+                <w:sz w:val="20"/>
+                <w:szCs w:val="20"/>
+              </w:rPr>
+              <w:t xml:space="preserve">It is refused, because a film is identified by its title and year together.</w:t>
+            </w:r>
+          </w:p>
+        </w:tc>
+      </w:tr>
+      <w:tr>
+        <w:trPr>
+          <w:cantSplit/>
+        </w:trPr>
+        <w:tc>
+          <w:tcPr>
+            <w:tcW w:w="300" w:type="pct"/>
+            <w:tcMar>
+              <w:top w:w="30" w:type="dxa"/>
+              <w:left w:w="80" w:type="dxa"/>
+              <w:bottom w:w="30" w:type="dxa"/>
+              <w:right w:w="80" w:type="dxa"/>
+            </w:tcMar>
+          </w:tcPr>
+          <w:p>
+            <w:r>
+              <w:rPr>
+                <w:rFonts w:ascii="Aptos" w:eastAsia="Aptos" w:hAnsi="Aptos" w:cs="Aptos"/>
+                <w:sz w:val="20"/>
+                <w:szCs w:val="20"/>
+              </w:rPr>
+              <w:t xml:space="preserve">254</w:t>
+            </w:r>
+          </w:p>
+        </w:tc>
+        <w:tc>
+          <w:tcPr>
+            <w:tcW w:w="1850" w:type="pct"/>
+            <w:tcMar>
+              <w:top w:w="30" w:type="dxa"/>
+              <w:left w:w="80" w:type="dxa"/>
+              <w:bottom w:w="30" w:type="dxa"/>
+              <w:right w:w="80" w:type="dxa"/>
+            </w:tcMar>
+          </w:tcPr>
+          <w:p>
+            <w:r>
+              <w:rPr>
+                <w:rFonts w:ascii="Aptos" w:eastAsia="Aptos" w:hAnsi="Aptos" w:cs="Aptos"/>
+                <w:sz w:val="20"/>
+                <w:szCs w:val="20"/>
+              </w:rPr>
+              <w:t xml:space="preserve">Add a film called Dune for 2021 when a Dune from 1984 is already on the system</w:t>
+            </w:r>
+          </w:p>
+        </w:tc>
+        <w:tc>
+          <w:tcPr>
+            <w:tcW w:w="560" w:type="pct"/>
+            <w:tcMar>
+              <w:top w:w="30" w:type="dxa"/>
+              <w:left w:w="80" w:type="dxa"/>
+              <w:bottom w:w="30" w:type="dxa"/>
+              <w:right w:w="80" w:type="dxa"/>
+            </w:tcMar>
+          </w:tcPr>
+          <w:p>
+            <w:r>
+              <w:rPr>
+                <w:rFonts w:ascii="Aptos" w:eastAsia="Aptos" w:hAnsi="Aptos" w:cs="Aptos"/>
+                <w:sz w:val="20"/>
+                <w:szCs w:val="20"/>
+              </w:rPr>
+              <w:t xml:space="preserve">Normal</w:t>
+            </w:r>
+          </w:p>
+        </w:tc>
+        <w:tc>
+          <w:tcPr>
+            <w:tcW w:w="2290" w:type="pct"/>
+            <w:tcMar>
+              <w:top w:w="30" w:type="dxa"/>
+              <w:left w:w="80" w:type="dxa"/>
+              <w:bottom w:w="30" w:type="dxa"/>
+              <w:right w:w="80" w:type="dxa"/>
+            </w:tcMar>
+          </w:tcPr>
+          <w:p>
+            <w:r>
+              <w:rPr>
+                <w:rFonts w:ascii="Aptos" w:eastAsia="Aptos" w:hAnsi="Aptos" w:cs="Aptos"/>
+                <w:sz w:val="20"/>
+                <w:szCs w:val="20"/>
+              </w:rPr>
+              <w:t xml:space="preserve">It is accepted, because the two are different films and the year tells them apart, so the duplicate check is not simply blocking any repeated title.</w:t>
+            </w:r>
+          </w:p>
+        </w:tc>
+      </w:tr>
+      <w:tr>
+        <w:trPr>
+          <w:cantSplit/>
+        </w:trPr>
+        <w:tc>
+          <w:tcPr>
+            <w:tcW w:w="300" w:type="pct"/>
+            <w:tcMar>
+              <w:top w:w="30" w:type="dxa"/>
+              <w:left w:w="80" w:type="dxa"/>
+              <w:bottom w:w="30" w:type="dxa"/>
+              <w:right w:w="80" w:type="dxa"/>
+            </w:tcMar>
+          </w:tcPr>
+          <w:p>
+            <w:r>
+              <w:rPr>
+                <w:rFonts w:ascii="Aptos" w:eastAsia="Aptos" w:hAnsi="Aptos" w:cs="Aptos"/>
+                <w:sz w:val="20"/>
+                <w:szCs w:val="20"/>
+              </w:rPr>
+              <w:t xml:space="preserve">255</w:t>
+            </w:r>
+          </w:p>
+        </w:tc>
+        <w:tc>
+          <w:tcPr>
+            <w:tcW w:w="1850" w:type="pct"/>
+            <w:tcMar>
+              <w:top w:w="30" w:type="dxa"/>
+              <w:left w:w="80" w:type="dxa"/>
+              <w:bottom w:w="30" w:type="dxa"/>
+              <w:right w:w="80" w:type="dxa"/>
+            </w:tcMar>
+          </w:tcPr>
+          <w:p>
+            <w:r>
+              <w:rPr>
+                <w:rFonts w:ascii="Aptos" w:eastAsia="Aptos" w:hAnsi="Aptos" w:cs="Aptos"/>
+                <w:sz w:val="20"/>
+                <w:szCs w:val="20"/>
+              </w:rPr>
+              <w:t xml:space="preserve">Try to add a second food item called Large Popcorn</w:t>
+            </w:r>
+          </w:p>
+        </w:tc>
+        <w:tc>
+          <w:tcPr>
+            <w:tcW w:w="560" w:type="pct"/>
+            <w:tcMar>
+              <w:top w:w="30" w:type="dxa"/>
+              <w:left w:w="80" w:type="dxa"/>
+              <w:bottom w:w="30" w:type="dxa"/>
+              <w:right w:w="80" w:type="dxa"/>
+            </w:tcMar>
+          </w:tcPr>
+          <w:p>
+            <w:r>
+              <w:rPr>
+                <w:rFonts w:ascii="Aptos" w:eastAsia="Aptos" w:hAnsi="Aptos" w:cs="Aptos"/>
+                <w:sz w:val="20"/>
+                <w:szCs w:val="20"/>
+              </w:rPr>
+              <w:t xml:space="preserve">Erroneous</w:t>
+            </w:r>
+          </w:p>
+        </w:tc>
+        <w:tc>
+          <w:tcPr>
+            <w:tcW w:w="2290" w:type="pct"/>
+            <w:tcMar>
+              <w:top w:w="30" w:type="dxa"/>
+              <w:left w:w="80" w:type="dxa"/>
+              <w:bottom w:w="30" w:type="dxa"/>
+              <w:right w:w="80" w:type="dxa"/>
+            </w:tcMar>
+          </w:tcPr>
+          <w:p>
+            <w:r>
+              <w:rPr>
+                <w:rFonts w:ascii="Aptos" w:eastAsia="Aptos" w:hAnsi="Aptos" w:cs="Aptos"/>
+                <w:sz w:val="20"/>
+                <w:szCs w:val="20"/>
+              </w:rPr>
+              <w:t xml:space="preserve">It is refused, because two items with the same name on an order could not be told apart.</w:t>
+            </w:r>
+          </w:p>
+        </w:tc>
+      </w:tr>
+      <w:tr>
+        <w:trPr>
+          <w:cantSplit/>
+        </w:trPr>
+        <w:tc>
+          <w:tcPr>
+            <w:tcW w:w="300" w:type="pct"/>
+            <w:tcMar>
+              <w:top w:w="30" w:type="dxa"/>
+              <w:left w:w="80" w:type="dxa"/>
+              <w:bottom w:w="30" w:type="dxa"/>
+              <w:right w:w="80" w:type="dxa"/>
+            </w:tcMar>
+          </w:tcPr>
+          <w:p>
+            <w:r>
+              <w:rPr>
+                <w:rFonts w:ascii="Aptos" w:eastAsia="Aptos" w:hAnsi="Aptos" w:cs="Aptos"/>
+                <w:sz w:val="20"/>
+                <w:szCs w:val="20"/>
+              </w:rPr>
+              <w:t xml:space="preserve">256</w:t>
+            </w:r>
+          </w:p>
+        </w:tc>
+        <w:tc>
+          <w:tcPr>
+            <w:tcW w:w="1850" w:type="pct"/>
+            <w:tcMar>
+              <w:top w:w="30" w:type="dxa"/>
+              <w:left w:w="80" w:type="dxa"/>
+              <w:bottom w:w="30" w:type="dxa"/>
+              <w:right w:w="80" w:type="dxa"/>
+            </w:tcMar>
+          </w:tcPr>
+          <w:p>
+            <w:r>
+              <w:rPr>
+                <w:rFonts w:ascii="Aptos" w:eastAsia="Aptos" w:hAnsi="Aptos" w:cs="Aptos"/>
+                <w:sz w:val="20"/>
+                <w:szCs w:val="20"/>
+              </w:rPr>
+              <w:t xml:space="preserve">Try to add a second customer called John Smith</w:t>
+            </w:r>
+          </w:p>
+        </w:tc>
+        <w:tc>
+          <w:tcPr>
+            <w:tcW w:w="560" w:type="pct"/>
+            <w:tcMar>
+              <w:top w:w="30" w:type="dxa"/>
+              <w:left w:w="80" w:type="dxa"/>
+              <w:bottom w:w="30" w:type="dxa"/>
+              <w:right w:w="80" w:type="dxa"/>
+            </w:tcMar>
+          </w:tcPr>
+          <w:p>
+            <w:r>
+              <w:rPr>
+                <w:rFonts w:ascii="Aptos" w:eastAsia="Aptos" w:hAnsi="Aptos" w:cs="Aptos"/>
+                <w:sz w:val="20"/>
+                <w:szCs w:val="20"/>
+              </w:rPr>
+              <w:t xml:space="preserve">Boundary</w:t>
+            </w:r>
+          </w:p>
+        </w:tc>
+        <w:tc>
+          <w:tcPr>
+            <w:tcW w:w="2290" w:type="pct"/>
+            <w:tcMar>
+              <w:top w:w="30" w:type="dxa"/>
+              <w:left w:w="80" w:type="dxa"/>
+              <w:bottom w:w="30" w:type="dxa"/>
+              <w:right w:w="80" w:type="dxa"/>
+            </w:tcMar>
+          </w:tcPr>
+          <w:p>
+            <w:r>
+              <w:rPr>
+                <w:rFonts w:ascii="Aptos" w:eastAsia="Aptos" w:hAnsi="Aptos" w:cs="Aptos"/>
+                <w:sz w:val="20"/>
+                <w:szCs w:val="20"/>
+              </w:rPr>
+              <w:t xml:space="preserve">A warning appears saying there is already somebody of that name, but it asks whether to save this one as well, because two customers genuinely can share a name. Answering No does not save it and answering Yes does.</w:t>
+            </w:r>
+          </w:p>
+        </w:tc>
+      </w:tr>
+      <w:tr>
+        <w:trPr>
+          <w:cantSplit/>
+        </w:trPr>
+        <w:tc>
+          <w:tcPr>
+            <w:tcW w:w="300" w:type="pct"/>
+            <w:tcMar>
+              <w:top w:w="30" w:type="dxa"/>
+              <w:left w:w="80" w:type="dxa"/>
+              <w:bottom w:w="30" w:type="dxa"/>
+              <w:right w:w="80" w:type="dxa"/>
+            </w:tcMar>
+          </w:tcPr>
+          <w:p>
+            <w:r>
+              <w:rPr>
+                <w:rFonts w:ascii="Aptos" w:eastAsia="Aptos" w:hAnsi="Aptos" w:cs="Aptos"/>
+                <w:sz w:val="20"/>
+                <w:szCs w:val="20"/>
+              </w:rPr>
+              <w:t xml:space="preserve">257</w:t>
+            </w:r>
+          </w:p>
+        </w:tc>
+        <w:tc>
+          <w:tcPr>
+            <w:tcW w:w="1850" w:type="pct"/>
+            <w:tcMar>
+              <w:top w:w="30" w:type="dxa"/>
+              <w:left w:w="80" w:type="dxa"/>
+              <w:bottom w:w="30" w:type="dxa"/>
+              <w:right w:w="80" w:type="dxa"/>
+            </w:tcMar>
+          </w:tcPr>
+          <w:p>
+            <w:r>
+              <w:rPr>
+                <w:rFonts w:ascii="Aptos" w:eastAsia="Aptos" w:hAnsi="Aptos" w:cs="Aptos"/>
+                <w:sz w:val="20"/>
+                <w:szCs w:val="20"/>
+              </w:rPr>
+              <w:t xml:space="preserve">Try to delete a film that has screenings against it</w:t>
+            </w:r>
+          </w:p>
+        </w:tc>
+        <w:tc>
+          <w:tcPr>
+            <w:tcW w:w="560" w:type="pct"/>
+            <w:tcMar>
+              <w:top w:w="30" w:type="dxa"/>
+              <w:left w:w="80" w:type="dxa"/>
+              <w:bottom w:w="30" w:type="dxa"/>
+              <w:right w:w="80" w:type="dxa"/>
+            </w:tcMar>
+          </w:tcPr>
+          <w:p>
+            <w:r>
+              <w:rPr>
+                <w:rFonts w:ascii="Aptos" w:eastAsia="Aptos" w:hAnsi="Aptos" w:cs="Aptos"/>
+                <w:sz w:val="20"/>
+                <w:szCs w:val="20"/>
+              </w:rPr>
+              <w:t xml:space="preserve">Erroneous</w:t>
+            </w:r>
+          </w:p>
+        </w:tc>
+        <w:tc>
+          <w:tcPr>
+            <w:tcW w:w="2290" w:type="pct"/>
+            <w:tcMar>
+              <w:top w:w="30" w:type="dxa"/>
+              <w:left w:w="80" w:type="dxa"/>
+              <w:bottom w:w="30" w:type="dxa"/>
+              <w:right w:w="80" w:type="dxa"/>
+            </w:tcMar>
+          </w:tcPr>
+          <w:p>
+            <w:r>
+              <w:rPr>
+                <w:rFonts w:ascii="Aptos" w:eastAsia="Aptos" w:hAnsi="Aptos" w:cs="Aptos"/>
+                <w:sz w:val="20"/>
+                <w:szCs w:val="20"/>
+              </w:rPr>
+              <w:t xml:space="preserve">The deletion is refused with a message explaining that screenings depend on it.</w:t>
+            </w:r>
+          </w:p>
+        </w:tc>
+      </w:tr>
+      <w:tr>
+        <w:trPr>
+          <w:cantSplit/>
+        </w:trPr>
+        <w:tc>
+          <w:tcPr>
+            <w:tcW w:w="300" w:type="pct"/>
+            <w:tcMar>
+              <w:top w:w="30" w:type="dxa"/>
+              <w:left w:w="80" w:type="dxa"/>
+              <w:bottom w:w="30" w:type="dxa"/>
+              <w:right w:w="80" w:type="dxa"/>
+            </w:tcMar>
+          </w:tcPr>
+          <w:p>
+            <w:r>
+              <w:rPr>
+                <w:rFonts w:ascii="Aptos" w:eastAsia="Aptos" w:hAnsi="Aptos" w:cs="Aptos"/>
+                <w:sz w:val="20"/>
+                <w:szCs w:val="20"/>
+              </w:rPr>
+              <w:t xml:space="preserve">258</w:t>
+            </w:r>
+          </w:p>
+        </w:tc>
+        <w:tc>
+          <w:tcPr>
+            <w:tcW w:w="1850" w:type="pct"/>
+            <w:tcMar>
+              <w:top w:w="30" w:type="dxa"/>
+              <w:left w:w="80" w:type="dxa"/>
+              <w:bottom w:w="30" w:type="dxa"/>
+              <w:right w:w="80" w:type="dxa"/>
+            </w:tcMar>
+          </w:tcPr>
+          <w:p>
+            <w:r>
+              <w:rPr>
+                <w:rFonts w:ascii="Aptos" w:eastAsia="Aptos" w:hAnsi="Aptos" w:cs="Aptos"/>
+                <w:sz w:val="20"/>
+                <w:szCs w:val="20"/>
+              </w:rPr>
+              <w:t xml:space="preserve">Try to delete a screen that has seats and screenings against it</w:t>
+            </w:r>
+          </w:p>
+        </w:tc>
+        <w:tc>
+          <w:tcPr>
+            <w:tcW w:w="560" w:type="pct"/>
+            <w:tcMar>
+              <w:top w:w="30" w:type="dxa"/>
+              <w:left w:w="80" w:type="dxa"/>
+              <w:bottom w:w="30" w:type="dxa"/>
+              <w:right w:w="80" w:type="dxa"/>
+            </w:tcMar>
+          </w:tcPr>
+          <w:p>
+            <w:r>
+              <w:rPr>
+                <w:rFonts w:ascii="Aptos" w:eastAsia="Aptos" w:hAnsi="Aptos" w:cs="Aptos"/>
+                <w:sz w:val="20"/>
+                <w:szCs w:val="20"/>
+              </w:rPr>
+              <w:t xml:space="preserve">Erroneous</w:t>
+            </w:r>
+          </w:p>
+        </w:tc>
+        <w:tc>
+          <w:tcPr>
+            <w:tcW w:w="2290" w:type="pct"/>
+            <w:tcMar>
+              <w:top w:w="30" w:type="dxa"/>
+              <w:left w:w="80" w:type="dxa"/>
+              <w:bottom w:w="30" w:type="dxa"/>
+              <w:right w:w="80" w:type="dxa"/>
+            </w:tcMar>
+          </w:tcPr>
+          <w:p>
+            <w:r>
+              <w:rPr>
+                <w:rFonts w:ascii="Aptos" w:eastAsia="Aptos" w:hAnsi="Aptos" w:cs="Aptos"/>
+                <w:sz w:val="20"/>
+                <w:szCs w:val="20"/>
+              </w:rPr>
+              <w:t xml:space="preserve">The deletion is refused rather than leaving screenings pointing at a screen that no longer exists.</w:t>
+            </w:r>
+          </w:p>
+        </w:tc>
+      </w:tr>
+      <w:tr>
+        <w:trPr>
+          <w:cantSplit/>
+        </w:trPr>
+        <w:tc>
+          <w:tcPr>
+            <w:tcW w:w="300" w:type="pct"/>
+            <w:tcMar>
+              <w:top w:w="30" w:type="dxa"/>
+              <w:left w:w="80" w:type="dxa"/>
+              <w:bottom w:w="30" w:type="dxa"/>
+              <w:right w:w="80" w:type="dxa"/>
+            </w:tcMar>
+          </w:tcPr>
+          <w:p>
+            <w:r>
+              <w:rPr>
+                <w:rFonts w:ascii="Aptos" w:eastAsia="Aptos" w:hAnsi="Aptos" w:cs="Aptos"/>
+                <w:sz w:val="20"/>
+                <w:szCs w:val="20"/>
+              </w:rPr>
+              <w:t xml:space="preserve">259</w:t>
+            </w:r>
+          </w:p>
+        </w:tc>
+        <w:tc>
+          <w:tcPr>
+            <w:tcW w:w="1850" w:type="pct"/>
+            <w:tcMar>
+              <w:top w:w="30" w:type="dxa"/>
+              <w:left w:w="80" w:type="dxa"/>
+              <w:bottom w:w="30" w:type="dxa"/>
+              <w:right w:w="80" w:type="dxa"/>
+            </w:tcMar>
+          </w:tcPr>
+          <w:p>
+            <w:r>
+              <w:rPr>
+                <w:rFonts w:ascii="Aptos" w:eastAsia="Aptos" w:hAnsi="Aptos" w:cs="Aptos"/>
+                <w:sz w:val="20"/>
+                <w:szCs w:val="20"/>
+              </w:rPr>
+              <w:t xml:space="preserve">Try to change the number of seats on a screen that already has seats sold</w:t>
+            </w:r>
+          </w:p>
+        </w:tc>
+        <w:tc>
+          <w:tcPr>
+            <w:tcW w:w="560" w:type="pct"/>
+            <w:tcMar>
+              <w:top w:w="30" w:type="dxa"/>
+              <w:left w:w="80" w:type="dxa"/>
+              <w:bottom w:w="30" w:type="dxa"/>
+              <w:right w:w="80" w:type="dxa"/>
+            </w:tcMar>
+          </w:tcPr>
+          <w:p>
+            <w:r>
+              <w:rPr>
+                <w:rFonts w:ascii="Aptos" w:eastAsia="Aptos" w:hAnsi="Aptos" w:cs="Aptos"/>
+                <w:sz w:val="20"/>
+                <w:szCs w:val="20"/>
+              </w:rPr>
+              <w:t xml:space="preserve">Erroneous</w:t>
+            </w:r>
+          </w:p>
+        </w:tc>
+        <w:tc>
+          <w:tcPr>
+            <w:tcW w:w="2290" w:type="pct"/>
+            <w:tcMar>
+              <w:top w:w="30" w:type="dxa"/>
+              <w:left w:w="80" w:type="dxa"/>
+              <w:bottom w:w="30" w:type="dxa"/>
+              <w:right w:w="80" w:type="dxa"/>
+            </w:tcMar>
+          </w:tcPr>
+          <w:p>
+            <w:r>
+              <w:rPr>
+                <w:rFonts w:ascii="Aptos" w:eastAsia="Aptos" w:hAnsi="Aptos" w:cs="Aptos"/>
+                <w:sz w:val="20"/>
+                <w:szCs w:val="20"/>
+              </w:rPr>
+              <w:t xml:space="preserve">The change is refused with a message explaining that the bookings would be left pointing at seats that no longer exist, and suggesting those bookings are cancelled first.</w:t>
+            </w:r>
+          </w:p>
+        </w:tc>
+      </w:tr>
+      <w:tr>
+        <w:trPr>
+          <w:cantSplit/>
+        </w:trPr>
+        <w:tc>
+          <w:tcPr>
+            <w:tcW w:w="300" w:type="pct"/>
+            <w:tcMar>
+              <w:top w:w="30" w:type="dxa"/>
+              <w:left w:w="80" w:type="dxa"/>
+              <w:bottom w:w="30" w:type="dxa"/>
+              <w:right w:w="80" w:type="dxa"/>
+            </w:tcMar>
+          </w:tcPr>
+          <w:p>
+            <w:r>
+              <w:rPr>
+                <w:rFonts w:ascii="Aptos" w:eastAsia="Aptos" w:hAnsi="Aptos" w:cs="Aptos"/>
+                <w:sz w:val="20"/>
+                <w:szCs w:val="20"/>
+              </w:rPr>
+              <w:t xml:space="preserve">260</w:t>
+            </w:r>
+          </w:p>
+        </w:tc>
+        <w:tc>
+          <w:tcPr>
+            <w:tcW w:w="1850" w:type="pct"/>
+            <w:tcMar>
+              <w:top w:w="30" w:type="dxa"/>
+              <w:left w:w="80" w:type="dxa"/>
+              <w:bottom w:w="30" w:type="dxa"/>
+              <w:right w:w="80" w:type="dxa"/>
+            </w:tcMar>
+          </w:tcPr>
+          <w:p>
+            <w:r>
+              <w:rPr>
+                <w:rFonts w:ascii="Aptos" w:eastAsia="Aptos" w:hAnsi="Aptos" w:cs="Aptos"/>
+                <w:sz w:val="20"/>
+                <w:szCs w:val="20"/>
+              </w:rPr>
+              <w:t xml:space="preserve">Try to delete a customer who has bookings against them</w:t>
+            </w:r>
+          </w:p>
+        </w:tc>
+        <w:tc>
+          <w:tcPr>
+            <w:tcW w:w="560" w:type="pct"/>
+            <w:tcMar>
+              <w:top w:w="30" w:type="dxa"/>
+              <w:left w:w="80" w:type="dxa"/>
+              <w:bottom w:w="30" w:type="dxa"/>
+              <w:right w:w="80" w:type="dxa"/>
+            </w:tcMar>
+          </w:tcPr>
+          <w:p>
+            <w:r>
+              <w:rPr>
+                <w:rFonts w:ascii="Aptos" w:eastAsia="Aptos" w:hAnsi="Aptos" w:cs="Aptos"/>
+                <w:sz w:val="20"/>
+                <w:szCs w:val="20"/>
+              </w:rPr>
+              <w:t xml:space="preserve">Erroneous</w:t>
+            </w:r>
+          </w:p>
+        </w:tc>
+        <w:tc>
+          <w:tcPr>
+            <w:tcW w:w="2290" w:type="pct"/>
+            <w:tcMar>
+              <w:top w:w="30" w:type="dxa"/>
+              <w:left w:w="80" w:type="dxa"/>
+              <w:bottom w:w="30" w:type="dxa"/>
+              <w:right w:w="80" w:type="dxa"/>
+            </w:tcMar>
+          </w:tcPr>
+          <w:p>
+            <w:r>
+              <w:rPr>
+                <w:rFonts w:ascii="Aptos" w:eastAsia="Aptos" w:hAnsi="Aptos" w:cs="Aptos"/>
+                <w:sz w:val="20"/>
+                <w:szCs w:val="20"/>
+              </w:rPr>
+              <w:t xml:space="preserve">The deletion is refused, because the bookings would otherwise be left with no customer.</w:t>
             </w:r>
           </w:p>
         </w:tc>

</xml_diff>

<commit_message>
added objectives 14 and 15: a consistent interface and easy navigation
</commit_message>
<xml_diff>
--- a/Testing.docx
+++ b/Testing.docx
@@ -28793,6 +28793,696 @@
                 <w:szCs w:val="20"/>
               </w:rPr>
               <w:t xml:space="preserve">The deletion is refused, because the bookings would otherwise be left with no customer.</w:t>
+            </w:r>
+          </w:p>
+        </w:tc>
+      </w:tr>
+    </w:tbl>
+    <w:p>
+      <w:r>
+        <w:rPr>
+          <w:rFonts w:ascii="Aptos" w:eastAsia="Aptos" w:hAnsi="Aptos" w:cs="Aptos"/>
+        </w:rPr>
+        <w:t xml:space="preserve"/>
+      </w:r>
+    </w:p>
+    <w:p>
+      <w:pPr>
+        <w:pStyle w:val="Heading3"/>
+      </w:pPr>
+      <w:r>
+        <w:rPr>
+          <w:rFonts w:ascii="Aptos Display" w:eastAsia="Aptos Display" w:hAnsi="Aptos Display" w:cs="Aptos Display"/>
+          <w:b/>
+          <w:bCs/>
+          <w:color w:val="000000"/>
+        </w:rPr>
+        <w:t xml:space="preserve">Objectives 14 and 15: A Consistent Interface and Easy Navigation</w:t>
+      </w:r>
+    </w:p>
+    <w:p>
+      <w:r>
+        <w:rPr>
+          <w:rFonts w:ascii="Aptos" w:eastAsia="Aptos" w:hAnsi="Aptos" w:cs="Aptos"/>
+        </w:rPr>
+        <w:t xml:space="preserve">These two objectives are about how the system looks and how easily it can be moved around, so they are judged partly by inspection and partly by watching somebody who has not used it before. They are tested last because they are about the finished system as a whole rather than about any one feature.</w:t>
+      </w:r>
+    </w:p>
+    <w:tbl>
+      <w:tblPr>
+        <w:tblW w:w="5000" w:type="pct"/>
+        <w:tblBorders>
+          <w:top w:val="single" w:sz="4" w:space="0" w:color="808080"/>
+          <w:left w:val="single" w:sz="4" w:space="0" w:color="808080"/>
+          <w:bottom w:val="single" w:sz="4" w:space="0" w:color="808080"/>
+          <w:right w:val="single" w:sz="4" w:space="0" w:color="808080"/>
+          <w:insideH w:val="single" w:sz="4" w:space="0" w:color="808080"/>
+          <w:insideV w:val="single" w:sz="4" w:space="0" w:color="808080"/>
+        </w:tblBorders>
+        <w:tblCellMar>
+          <w:left w:w="10" w:type="dxa"/>
+          <w:right w:w="10" w:type="dxa"/>
+        </w:tblCellMar>
+        <w:tblLook w:val="0000" w:firstRow="0" w:lastRow="0" w:firstColumn="0" w:lastColumn="0" w:noHBand="0" w:noVBand="0"/>
+      </w:tblPr>
+      <w:tblGrid>
+        <w:gridCol w:w="561"/>
+        <w:gridCol w:w="3460"/>
+        <w:gridCol w:w="1047"/>
+        <w:gridCol w:w="4282"/>
+      </w:tblGrid>
+      <w:tr>
+        <w:trPr>
+          <w:cantSplit/>
+          <w:tblHeader/>
+        </w:trPr>
+        <w:tc>
+          <w:tcPr>
+            <w:tcW w:w="300" w:type="pct"/>
+            <w:shd w:val="clear" w:color="auto" w:fill="F2CEED" w:themeFill="accent5" w:themeFillTint="33"/>
+            <w:tcMar>
+              <w:top w:w="30" w:type="dxa"/>
+              <w:left w:w="80" w:type="dxa"/>
+              <w:bottom w:w="30" w:type="dxa"/>
+              <w:right w:w="80" w:type="dxa"/>
+            </w:tcMar>
+          </w:tcPr>
+          <w:p>
+            <w:r>
+              <w:rPr>
+                <w:rFonts w:ascii="Aptos" w:eastAsia="Aptos" w:hAnsi="Aptos" w:cs="Aptos"/>
+                <w:b/>
+                <w:bCs/>
+                <w:sz w:val="20"/>
+                <w:szCs w:val="20"/>
+              </w:rPr>
+              <w:t xml:space="preserve">No.</w:t>
+            </w:r>
+          </w:p>
+        </w:tc>
+        <w:tc>
+          <w:tcPr>
+            <w:tcW w:w="1850" w:type="pct"/>
+            <w:shd w:val="clear" w:color="auto" w:fill="F2CEED" w:themeFill="accent5" w:themeFillTint="33"/>
+            <w:tcMar>
+              <w:top w:w="30" w:type="dxa"/>
+              <w:left w:w="80" w:type="dxa"/>
+              <w:bottom w:w="30" w:type="dxa"/>
+              <w:right w:w="80" w:type="dxa"/>
+            </w:tcMar>
+          </w:tcPr>
+          <w:p>
+            <w:r>
+              <w:rPr>
+                <w:rFonts w:ascii="Aptos" w:eastAsia="Aptos" w:hAnsi="Aptos" w:cs="Aptos"/>
+                <w:b/>
+                <w:bCs/>
+                <w:sz w:val="20"/>
+                <w:szCs w:val="20"/>
+              </w:rPr>
+              <w:t xml:space="preserve">Test</w:t>
+            </w:r>
+          </w:p>
+        </w:tc>
+        <w:tc>
+          <w:tcPr>
+            <w:tcW w:w="560" w:type="pct"/>
+            <w:shd w:val="clear" w:color="auto" w:fill="F2CEED" w:themeFill="accent5" w:themeFillTint="33"/>
+            <w:tcMar>
+              <w:top w:w="30" w:type="dxa"/>
+              <w:left w:w="80" w:type="dxa"/>
+              <w:bottom w:w="30" w:type="dxa"/>
+              <w:right w:w="80" w:type="dxa"/>
+            </w:tcMar>
+          </w:tcPr>
+          <w:p>
+            <w:r>
+              <w:rPr>
+                <w:rFonts w:ascii="Aptos" w:eastAsia="Aptos" w:hAnsi="Aptos" w:cs="Aptos"/>
+                <w:b/>
+                <w:bCs/>
+                <w:sz w:val="20"/>
+                <w:szCs w:val="20"/>
+              </w:rPr>
+              <w:t xml:space="preserve">Type</w:t>
+            </w:r>
+          </w:p>
+        </w:tc>
+        <w:tc>
+          <w:tcPr>
+            <w:tcW w:w="2290" w:type="pct"/>
+            <w:shd w:val="clear" w:color="auto" w:fill="F2CEED" w:themeFill="accent5" w:themeFillTint="33"/>
+            <w:tcMar>
+              <w:top w:w="30" w:type="dxa"/>
+              <w:left w:w="80" w:type="dxa"/>
+              <w:bottom w:w="30" w:type="dxa"/>
+              <w:right w:w="80" w:type="dxa"/>
+            </w:tcMar>
+          </w:tcPr>
+          <w:p>
+            <w:r>
+              <w:rPr>
+                <w:rFonts w:ascii="Aptos" w:eastAsia="Aptos" w:hAnsi="Aptos" w:cs="Aptos"/>
+                <w:b/>
+                <w:bCs/>
+                <w:sz w:val="20"/>
+                <w:szCs w:val="20"/>
+              </w:rPr>
+              <w:t xml:space="preserve">Expected Result</w:t>
+            </w:r>
+          </w:p>
+        </w:tc>
+      </w:tr>
+      <w:tr>
+        <w:trPr>
+          <w:cantSplit/>
+        </w:trPr>
+        <w:tc>
+          <w:tcPr>
+            <w:tcW w:w="300" w:type="pct"/>
+            <w:tcMar>
+              <w:top w:w="30" w:type="dxa"/>
+              <w:left w:w="80" w:type="dxa"/>
+              <w:bottom w:w="30" w:type="dxa"/>
+              <w:right w:w="80" w:type="dxa"/>
+            </w:tcMar>
+          </w:tcPr>
+          <w:p>
+            <w:r>
+              <w:rPr>
+                <w:rFonts w:ascii="Aptos" w:eastAsia="Aptos" w:hAnsi="Aptos" w:cs="Aptos"/>
+                <w:sz w:val="20"/>
+                <w:szCs w:val="20"/>
+              </w:rPr>
+              <w:t xml:space="preserve">261</w:t>
+            </w:r>
+          </w:p>
+        </w:tc>
+        <w:tc>
+          <w:tcPr>
+            <w:tcW w:w="1850" w:type="pct"/>
+            <w:tcMar>
+              <w:top w:w="30" w:type="dxa"/>
+              <w:left w:w="80" w:type="dxa"/>
+              <w:bottom w:w="30" w:type="dxa"/>
+              <w:right w:w="80" w:type="dxa"/>
+            </w:tcMar>
+          </w:tcPr>
+          <w:p>
+            <w:r>
+              <w:rPr>
+                <w:rFonts w:ascii="Aptos" w:eastAsia="Aptos" w:hAnsi="Aptos" w:cs="Aptos"/>
+                <w:sz w:val="20"/>
+                <w:szCs w:val="20"/>
+              </w:rPr>
+              <w:t xml:space="preserve">Open every form in turn and compare the colours, the fonts and the position of the buttons</w:t>
+            </w:r>
+          </w:p>
+        </w:tc>
+        <w:tc>
+          <w:tcPr>
+            <w:tcW w:w="560" w:type="pct"/>
+            <w:tcMar>
+              <w:top w:w="30" w:type="dxa"/>
+              <w:left w:w="80" w:type="dxa"/>
+              <w:bottom w:w="30" w:type="dxa"/>
+              <w:right w:w="80" w:type="dxa"/>
+            </w:tcMar>
+          </w:tcPr>
+          <w:p>
+            <w:r>
+              <w:rPr>
+                <w:rFonts w:ascii="Aptos" w:eastAsia="Aptos" w:hAnsi="Aptos" w:cs="Aptos"/>
+                <w:sz w:val="20"/>
+                <w:szCs w:val="20"/>
+              </w:rPr>
+              <w:t xml:space="preserve">Normal</w:t>
+            </w:r>
+          </w:p>
+        </w:tc>
+        <w:tc>
+          <w:tcPr>
+            <w:tcW w:w="2290" w:type="pct"/>
+            <w:tcMar>
+              <w:top w:w="30" w:type="dxa"/>
+              <w:left w:w="80" w:type="dxa"/>
+              <w:bottom w:w="30" w:type="dxa"/>
+              <w:right w:w="80" w:type="dxa"/>
+            </w:tcMar>
+          </w:tcPr>
+          <w:p>
+            <w:r>
+              <w:rPr>
+                <w:rFonts w:ascii="Aptos" w:eastAsia="Aptos" w:hAnsi="Aptos" w:cs="Aptos"/>
+                <w:sz w:val="20"/>
+                <w:szCs w:val="20"/>
+              </w:rPr>
+              <w:t xml:space="preserve">Every form uses the same colour scheme, the same font and the same layout conventions, with the action buttons in the same place on each one.</w:t>
+            </w:r>
+          </w:p>
+        </w:tc>
+      </w:tr>
+      <w:tr>
+        <w:trPr>
+          <w:cantSplit/>
+        </w:trPr>
+        <w:tc>
+          <w:tcPr>
+            <w:tcW w:w="300" w:type="pct"/>
+            <w:tcMar>
+              <w:top w:w="30" w:type="dxa"/>
+              <w:left w:w="80" w:type="dxa"/>
+              <w:bottom w:w="30" w:type="dxa"/>
+              <w:right w:w="80" w:type="dxa"/>
+            </w:tcMar>
+          </w:tcPr>
+          <w:p>
+            <w:r>
+              <w:rPr>
+                <w:rFonts w:ascii="Aptos" w:eastAsia="Aptos" w:hAnsi="Aptos" w:cs="Aptos"/>
+                <w:sz w:val="20"/>
+                <w:szCs w:val="20"/>
+              </w:rPr>
+              <w:t xml:space="preserve">262</w:t>
+            </w:r>
+          </w:p>
+        </w:tc>
+        <w:tc>
+          <w:tcPr>
+            <w:tcW w:w="1850" w:type="pct"/>
+            <w:tcMar>
+              <w:top w:w="30" w:type="dxa"/>
+              <w:left w:w="80" w:type="dxa"/>
+              <w:bottom w:w="30" w:type="dxa"/>
+              <w:right w:w="80" w:type="dxa"/>
+            </w:tcMar>
+          </w:tcPr>
+          <w:p>
+            <w:r>
+              <w:rPr>
+                <w:rFonts w:ascii="Aptos" w:eastAsia="Aptos" w:hAnsi="Aptos" w:cs="Aptos"/>
+                <w:sz w:val="20"/>
+                <w:szCs w:val="20"/>
+              </w:rPr>
+              <w:t xml:space="preserve">Check the naming used on the buttons across the forms</w:t>
+            </w:r>
+          </w:p>
+        </w:tc>
+        <w:tc>
+          <w:tcPr>
+            <w:tcW w:w="560" w:type="pct"/>
+            <w:tcMar>
+              <w:top w:w="30" w:type="dxa"/>
+              <w:left w:w="80" w:type="dxa"/>
+              <w:bottom w:w="30" w:type="dxa"/>
+              <w:right w:w="80" w:type="dxa"/>
+            </w:tcMar>
+          </w:tcPr>
+          <w:p>
+            <w:r>
+              <w:rPr>
+                <w:rFonts w:ascii="Aptos" w:eastAsia="Aptos" w:hAnsi="Aptos" w:cs="Aptos"/>
+                <w:sz w:val="20"/>
+                <w:szCs w:val="20"/>
+              </w:rPr>
+              <w:t xml:space="preserve">Normal</w:t>
+            </w:r>
+          </w:p>
+        </w:tc>
+        <w:tc>
+          <w:tcPr>
+            <w:tcW w:w="2290" w:type="pct"/>
+            <w:tcMar>
+              <w:top w:w="30" w:type="dxa"/>
+              <w:left w:w="80" w:type="dxa"/>
+              <w:bottom w:w="30" w:type="dxa"/>
+              <w:right w:w="80" w:type="dxa"/>
+            </w:tcMar>
+          </w:tcPr>
+          <w:p>
+            <w:r>
+              <w:rPr>
+                <w:rFonts w:ascii="Aptos" w:eastAsia="Aptos" w:hAnsi="Aptos" w:cs="Aptos"/>
+                <w:sz w:val="20"/>
+                <w:szCs w:val="20"/>
+              </w:rPr>
+              <w:t xml:space="preserve">The same action is called the same thing everywhere rather than one form saying Add and another saying New for the same operation.</w:t>
+            </w:r>
+          </w:p>
+        </w:tc>
+      </w:tr>
+      <w:tr>
+        <w:trPr>
+          <w:cantSplit/>
+        </w:trPr>
+        <w:tc>
+          <w:tcPr>
+            <w:tcW w:w="300" w:type="pct"/>
+            <w:tcMar>
+              <w:top w:w="30" w:type="dxa"/>
+              <w:left w:w="80" w:type="dxa"/>
+              <w:bottom w:w="30" w:type="dxa"/>
+              <w:right w:w="80" w:type="dxa"/>
+            </w:tcMar>
+          </w:tcPr>
+          <w:p>
+            <w:r>
+              <w:rPr>
+                <w:rFonts w:ascii="Aptos" w:eastAsia="Aptos" w:hAnsi="Aptos" w:cs="Aptos"/>
+                <w:sz w:val="20"/>
+                <w:szCs w:val="20"/>
+              </w:rPr>
+              <w:t xml:space="preserve">263</w:t>
+            </w:r>
+          </w:p>
+        </w:tc>
+        <w:tc>
+          <w:tcPr>
+            <w:tcW w:w="1850" w:type="pct"/>
+            <w:tcMar>
+              <w:top w:w="30" w:type="dxa"/>
+              <w:left w:w="80" w:type="dxa"/>
+              <w:bottom w:w="30" w:type="dxa"/>
+              <w:right w:w="80" w:type="dxa"/>
+            </w:tcMar>
+          </w:tcPr>
+          <w:p>
+            <w:r>
+              <w:rPr>
+                <w:rFonts w:ascii="Aptos" w:eastAsia="Aptos" w:hAnsi="Aptos" w:cs="Aptos"/>
+                <w:sz w:val="20"/>
+                <w:szCs w:val="20"/>
+              </w:rPr>
+              <w:t xml:space="preserve">Check that every form shows its version label</w:t>
+            </w:r>
+          </w:p>
+        </w:tc>
+        <w:tc>
+          <w:tcPr>
+            <w:tcW w:w="560" w:type="pct"/>
+            <w:tcMar>
+              <w:top w:w="30" w:type="dxa"/>
+              <w:left w:w="80" w:type="dxa"/>
+              <w:bottom w:w="30" w:type="dxa"/>
+              <w:right w:w="80" w:type="dxa"/>
+            </w:tcMar>
+          </w:tcPr>
+          <w:p>
+            <w:r>
+              <w:rPr>
+                <w:rFonts w:ascii="Aptos" w:eastAsia="Aptos" w:hAnsi="Aptos" w:cs="Aptos"/>
+                <w:sz w:val="20"/>
+                <w:szCs w:val="20"/>
+              </w:rPr>
+              <w:t xml:space="preserve">Normal</w:t>
+            </w:r>
+          </w:p>
+        </w:tc>
+        <w:tc>
+          <w:tcPr>
+            <w:tcW w:w="2290" w:type="pct"/>
+            <w:tcMar>
+              <w:top w:w="30" w:type="dxa"/>
+              <w:left w:w="80" w:type="dxa"/>
+              <w:bottom w:w="30" w:type="dxa"/>
+              <w:right w:w="80" w:type="dxa"/>
+            </w:tcMar>
+          </w:tcPr>
+          <w:p>
+            <w:r>
+              <w:rPr>
+                <w:rFonts w:ascii="Aptos" w:eastAsia="Aptos" w:hAnsi="Aptos" w:cs="Aptos"/>
+                <w:sz w:val="20"/>
+                <w:szCs w:val="20"/>
+              </w:rPr>
+              <w:t xml:space="preserve">Each form displays the current version, and no form is missing the label.</w:t>
+            </w:r>
+          </w:p>
+        </w:tc>
+      </w:tr>
+      <w:tr>
+        <w:trPr>
+          <w:cantSplit/>
+        </w:trPr>
+        <w:tc>
+          <w:tcPr>
+            <w:tcW w:w="300" w:type="pct"/>
+            <w:tcMar>
+              <w:top w:w="30" w:type="dxa"/>
+              <w:left w:w="80" w:type="dxa"/>
+              <w:bottom w:w="30" w:type="dxa"/>
+              <w:right w:w="80" w:type="dxa"/>
+            </w:tcMar>
+          </w:tcPr>
+          <w:p>
+            <w:r>
+              <w:rPr>
+                <w:rFonts w:ascii="Aptos" w:eastAsia="Aptos" w:hAnsi="Aptos" w:cs="Aptos"/>
+                <w:sz w:val="20"/>
+                <w:szCs w:val="20"/>
+              </w:rPr>
+              <w:t xml:space="preserve">264</w:t>
+            </w:r>
+          </w:p>
+        </w:tc>
+        <w:tc>
+          <w:tcPr>
+            <w:tcW w:w="1850" w:type="pct"/>
+            <w:tcMar>
+              <w:top w:w="30" w:type="dxa"/>
+              <w:left w:w="80" w:type="dxa"/>
+              <w:bottom w:w="30" w:type="dxa"/>
+              <w:right w:w="80" w:type="dxa"/>
+            </w:tcMar>
+          </w:tcPr>
+          <w:p>
+            <w:r>
+              <w:rPr>
+                <w:rFonts w:ascii="Aptos" w:eastAsia="Aptos" w:hAnsi="Aptos" w:cs="Aptos"/>
+                <w:sz w:val="20"/>
+                <w:szCs w:val="20"/>
+              </w:rPr>
+              <w:t xml:space="preserve">From the main menu, reach every feature of the system</w:t>
+            </w:r>
+          </w:p>
+        </w:tc>
+        <w:tc>
+          <w:tcPr>
+            <w:tcW w:w="560" w:type="pct"/>
+            <w:tcMar>
+              <w:top w:w="30" w:type="dxa"/>
+              <w:left w:w="80" w:type="dxa"/>
+              <w:bottom w:w="30" w:type="dxa"/>
+              <w:right w:w="80" w:type="dxa"/>
+            </w:tcMar>
+          </w:tcPr>
+          <w:p>
+            <w:r>
+              <w:rPr>
+                <w:rFonts w:ascii="Aptos" w:eastAsia="Aptos" w:hAnsi="Aptos" w:cs="Aptos"/>
+                <w:sz w:val="20"/>
+                <w:szCs w:val="20"/>
+              </w:rPr>
+              <w:t xml:space="preserve">Normal</w:t>
+            </w:r>
+          </w:p>
+        </w:tc>
+        <w:tc>
+          <w:tcPr>
+            <w:tcW w:w="2290" w:type="pct"/>
+            <w:tcMar>
+              <w:top w:w="30" w:type="dxa"/>
+              <w:left w:w="80" w:type="dxa"/>
+              <w:bottom w:w="30" w:type="dxa"/>
+              <w:right w:w="80" w:type="dxa"/>
+            </w:tcMar>
+          </w:tcPr>
+          <w:p>
+            <w:r>
+              <w:rPr>
+                <w:rFonts w:ascii="Aptos" w:eastAsia="Aptos" w:hAnsi="Aptos" w:cs="Aptos"/>
+                <w:sz w:val="20"/>
+                <w:szCs w:val="20"/>
+              </w:rPr>
+              <w:t xml:space="preserve">Every feature can be reached from the main menu without going through another feature first, and the menu is labelled in plain words rather than in technical terms.</w:t>
+            </w:r>
+          </w:p>
+        </w:tc>
+      </w:tr>
+      <w:tr>
+        <w:trPr>
+          <w:cantSplit/>
+        </w:trPr>
+        <w:tc>
+          <w:tcPr>
+            <w:tcW w:w="300" w:type="pct"/>
+            <w:tcMar>
+              <w:top w:w="30" w:type="dxa"/>
+              <w:left w:w="80" w:type="dxa"/>
+              <w:bottom w:w="30" w:type="dxa"/>
+              <w:right w:w="80" w:type="dxa"/>
+            </w:tcMar>
+          </w:tcPr>
+          <w:p>
+            <w:r>
+              <w:rPr>
+                <w:rFonts w:ascii="Aptos" w:eastAsia="Aptos" w:hAnsi="Aptos" w:cs="Aptos"/>
+                <w:sz w:val="20"/>
+                <w:szCs w:val="20"/>
+              </w:rPr>
+              <w:t xml:space="preserve">265</w:t>
+            </w:r>
+          </w:p>
+        </w:tc>
+        <w:tc>
+          <w:tcPr>
+            <w:tcW w:w="1850" w:type="pct"/>
+            <w:tcMar>
+              <w:top w:w="30" w:type="dxa"/>
+              <w:left w:w="80" w:type="dxa"/>
+              <w:bottom w:w="30" w:type="dxa"/>
+              <w:right w:w="80" w:type="dxa"/>
+            </w:tcMar>
+          </w:tcPr>
+          <w:p>
+            <w:r>
+              <w:rPr>
+                <w:rFonts w:ascii="Aptos" w:eastAsia="Aptos" w:hAnsi="Aptos" w:cs="Aptos"/>
+                <w:sz w:val="20"/>
+                <w:szCs w:val="20"/>
+              </w:rPr>
+              <w:t xml:space="preserve">Ask somebody who has not used the system before to find a booking and cancel it, with no explanation given first</w:t>
+            </w:r>
+          </w:p>
+        </w:tc>
+        <w:tc>
+          <w:tcPr>
+            <w:tcW w:w="560" w:type="pct"/>
+            <w:tcMar>
+              <w:top w:w="30" w:type="dxa"/>
+              <w:left w:w="80" w:type="dxa"/>
+              <w:bottom w:w="30" w:type="dxa"/>
+              <w:right w:w="80" w:type="dxa"/>
+            </w:tcMar>
+          </w:tcPr>
+          <w:p>
+            <w:r>
+              <w:rPr>
+                <w:rFonts w:ascii="Aptos" w:eastAsia="Aptos" w:hAnsi="Aptos" w:cs="Aptos"/>
+                <w:sz w:val="20"/>
+                <w:szCs w:val="20"/>
+              </w:rPr>
+              <w:t xml:space="preserve">Normal</w:t>
+            </w:r>
+          </w:p>
+        </w:tc>
+        <w:tc>
+          <w:tcPr>
+            <w:tcW w:w="2290" w:type="pct"/>
+            <w:tcMar>
+              <w:top w:w="30" w:type="dxa"/>
+              <w:left w:w="80" w:type="dxa"/>
+              <w:bottom w:w="30" w:type="dxa"/>
+              <w:right w:w="80" w:type="dxa"/>
+            </w:tcMar>
+          </w:tcPr>
+          <w:p>
+            <w:r>
+              <w:rPr>
+                <w:rFonts w:ascii="Aptos" w:eastAsia="Aptos" w:hAnsi="Aptos" w:cs="Aptos"/>
+                <w:sz w:val="20"/>
+                <w:szCs w:val="20"/>
+              </w:rPr>
+              <w:t xml:space="preserve">They can find their way to it from the main menu without being told where to go, which is what the objective means by not requiring technical knowledge.</w:t>
+            </w:r>
+          </w:p>
+        </w:tc>
+      </w:tr>
+      <w:tr>
+        <w:trPr>
+          <w:cantSplit/>
+        </w:trPr>
+        <w:tc>
+          <w:tcPr>
+            <w:tcW w:w="300" w:type="pct"/>
+            <w:tcMar>
+              <w:top w:w="30" w:type="dxa"/>
+              <w:left w:w="80" w:type="dxa"/>
+              <w:bottom w:w="30" w:type="dxa"/>
+              <w:right w:w="80" w:type="dxa"/>
+            </w:tcMar>
+          </w:tcPr>
+          <w:p>
+            <w:r>
+              <w:rPr>
+                <w:rFonts w:ascii="Aptos" w:eastAsia="Aptos" w:hAnsi="Aptos" w:cs="Aptos"/>
+                <w:sz w:val="20"/>
+                <w:szCs w:val="20"/>
+              </w:rPr>
+              <w:t xml:space="preserve">266</w:t>
+            </w:r>
+          </w:p>
+        </w:tc>
+        <w:tc>
+          <w:tcPr>
+            <w:tcW w:w="1850" w:type="pct"/>
+            <w:tcMar>
+              <w:top w:w="30" w:type="dxa"/>
+              <w:left w:w="80" w:type="dxa"/>
+              <w:bottom w:w="30" w:type="dxa"/>
+              <w:right w:w="80" w:type="dxa"/>
+            </w:tcMar>
+          </w:tcPr>
+          <w:p>
+            <w:r>
+              <w:rPr>
+                <w:rFonts w:ascii="Aptos" w:eastAsia="Aptos" w:hAnsi="Aptos" w:cs="Aptos"/>
+                <w:sz w:val="20"/>
+                <w:szCs w:val="20"/>
+              </w:rPr>
+              <w:t xml:space="preserve">Resize a form and look at what happens to the grid and the buttons</w:t>
+            </w:r>
+          </w:p>
+        </w:tc>
+        <w:tc>
+          <w:tcPr>
+            <w:tcW w:w="560" w:type="pct"/>
+            <w:tcMar>
+              <w:top w:w="30" w:type="dxa"/>
+              <w:left w:w="80" w:type="dxa"/>
+              <w:bottom w:w="30" w:type="dxa"/>
+              <w:right w:w="80" w:type="dxa"/>
+            </w:tcMar>
+          </w:tcPr>
+          <w:p>
+            <w:r>
+              <w:rPr>
+                <w:rFonts w:ascii="Aptos" w:eastAsia="Aptos" w:hAnsi="Aptos" w:cs="Aptos"/>
+                <w:sz w:val="20"/>
+                <w:szCs w:val="20"/>
+              </w:rPr>
+              <w:t xml:space="preserve">Normal</w:t>
+            </w:r>
+          </w:p>
+        </w:tc>
+        <w:tc>
+          <w:tcPr>
+            <w:tcW w:w="2290" w:type="pct"/>
+            <w:tcMar>
+              <w:top w:w="30" w:type="dxa"/>
+              <w:left w:w="80" w:type="dxa"/>
+              <w:bottom w:w="30" w:type="dxa"/>
+              <w:right w:w="80" w:type="dxa"/>
+            </w:tcMar>
+          </w:tcPr>
+          <w:p>
+            <w:r>
+              <w:rPr>
+                <w:rFonts w:ascii="Aptos" w:eastAsia="Aptos" w:hAnsi="Aptos" w:cs="Aptos"/>
+                <w:sz w:val="20"/>
+                <w:szCs w:val="20"/>
+              </w:rPr>
+              <w:t xml:space="preserve">The controls stay where they should be and nothing is left overlapping or running off the edge of the form.</w:t>
             </w:r>
           </w:p>
         </w:tc>

</xml_diff>

<commit_message>
added whole system test
</commit_message>
<xml_diff>
--- a/Testing.docx
+++ b/Testing.docx
@@ -29483,6 +29483,785 @@
                 <w:szCs w:val="20"/>
               </w:rPr>
               <w:t xml:space="preserve">The controls stay where they should be and nothing is left overlapping or running off the edge of the form.</w:t>
+            </w:r>
+          </w:p>
+        </w:tc>
+      </w:tr>
+    </w:tbl>
+    <w:p>
+      <w:r>
+        <w:rPr>
+          <w:rFonts w:ascii="Aptos" w:eastAsia="Aptos" w:hAnsi="Aptos" w:cs="Aptos"/>
+        </w:rPr>
+        <w:t xml:space="preserve"/>
+      </w:r>
+    </w:p>
+    <w:p>
+      <w:pPr>
+        <w:pStyle w:val="Heading2"/>
+      </w:pPr>
+      <w:r>
+        <w:rPr>
+          <w:rFonts w:ascii="Aptos Display" w:eastAsia="Aptos Display" w:hAnsi="Aptos Display" w:cs="Aptos Display"/>
+          <w:b/>
+          <w:bCs/>
+          <w:color w:val="000000"/>
+        </w:rPr>
+        <w:t xml:space="preserve">Whole System Test</w:t>
+      </w:r>
+    </w:p>
+    <w:p>
+      <w:r>
+        <w:rPr>
+          <w:rFonts w:ascii="Aptos" w:eastAsia="Aptos" w:hAnsi="Aptos" w:cs="Aptos"/>
+        </w:rPr>
+        <w:t xml:space="preserve">The tests above each check one objective at a time. The whole system test checks that the parts still work when they are used together, by running a complete sale from beginning to end and then confirming that every step of it was recorded. This matters because most of the faults found while building the system were not faults in a single form. They appeared where one part handed data to another, for example where the dashboard and the sales report counted cancelled bookings differently, or where a price change reached back into a sale that had already been taken. A test that only ever opens one form at a time would not have found either of those.</w:t>
+      </w:r>
+    </w:p>
+    <w:tbl>
+      <w:tblPr>
+        <w:tblW w:w="5000" w:type="pct"/>
+        <w:tblBorders>
+          <w:top w:val="single" w:sz="4" w:space="0" w:color="808080"/>
+          <w:left w:val="single" w:sz="4" w:space="0" w:color="808080"/>
+          <w:bottom w:val="single" w:sz="4" w:space="0" w:color="808080"/>
+          <w:right w:val="single" w:sz="4" w:space="0" w:color="808080"/>
+          <w:insideH w:val="single" w:sz="4" w:space="0" w:color="808080"/>
+          <w:insideV w:val="single" w:sz="4" w:space="0" w:color="808080"/>
+        </w:tblBorders>
+        <w:tblCellMar>
+          <w:left w:w="10" w:type="dxa"/>
+          <w:right w:w="10" w:type="dxa"/>
+        </w:tblCellMar>
+        <w:tblLook w:val="0000" w:firstRow="0" w:lastRow="0" w:firstColumn="0" w:lastColumn="0" w:noHBand="0" w:noVBand="0"/>
+      </w:tblPr>
+      <w:tblGrid>
+        <w:gridCol w:w="561"/>
+        <w:gridCol w:w="3460"/>
+        <w:gridCol w:w="1047"/>
+        <w:gridCol w:w="4282"/>
+      </w:tblGrid>
+      <w:tr>
+        <w:trPr>
+          <w:cantSplit/>
+          <w:tblHeader/>
+        </w:trPr>
+        <w:tc>
+          <w:tcPr>
+            <w:tcW w:w="300" w:type="pct"/>
+            <w:shd w:val="clear" w:color="auto" w:fill="F2CEED" w:themeFill="accent5" w:themeFillTint="33"/>
+            <w:tcMar>
+              <w:top w:w="30" w:type="dxa"/>
+              <w:left w:w="80" w:type="dxa"/>
+              <w:bottom w:w="30" w:type="dxa"/>
+              <w:right w:w="80" w:type="dxa"/>
+            </w:tcMar>
+          </w:tcPr>
+          <w:p>
+            <w:r>
+              <w:rPr>
+                <w:rFonts w:ascii="Aptos" w:eastAsia="Aptos" w:hAnsi="Aptos" w:cs="Aptos"/>
+                <w:b/>
+                <w:bCs/>
+                <w:sz w:val="20"/>
+                <w:szCs w:val="20"/>
+              </w:rPr>
+              <w:t xml:space="preserve">No.</w:t>
+            </w:r>
+          </w:p>
+        </w:tc>
+        <w:tc>
+          <w:tcPr>
+            <w:tcW w:w="1850" w:type="pct"/>
+            <w:shd w:val="clear" w:color="auto" w:fill="F2CEED" w:themeFill="accent5" w:themeFillTint="33"/>
+            <w:tcMar>
+              <w:top w:w="30" w:type="dxa"/>
+              <w:left w:w="80" w:type="dxa"/>
+              <w:bottom w:w="30" w:type="dxa"/>
+              <w:right w:w="80" w:type="dxa"/>
+            </w:tcMar>
+          </w:tcPr>
+          <w:p>
+            <w:r>
+              <w:rPr>
+                <w:rFonts w:ascii="Aptos" w:eastAsia="Aptos" w:hAnsi="Aptos" w:cs="Aptos"/>
+                <w:b/>
+                <w:bCs/>
+                <w:sz w:val="20"/>
+                <w:szCs w:val="20"/>
+              </w:rPr>
+              <w:t xml:space="preserve">Test</w:t>
+            </w:r>
+          </w:p>
+        </w:tc>
+        <w:tc>
+          <w:tcPr>
+            <w:tcW w:w="560" w:type="pct"/>
+            <w:shd w:val="clear" w:color="auto" w:fill="F2CEED" w:themeFill="accent5" w:themeFillTint="33"/>
+            <w:tcMar>
+              <w:top w:w="30" w:type="dxa"/>
+              <w:left w:w="80" w:type="dxa"/>
+              <w:bottom w:w="30" w:type="dxa"/>
+              <w:right w:w="80" w:type="dxa"/>
+            </w:tcMar>
+          </w:tcPr>
+          <w:p>
+            <w:r>
+              <w:rPr>
+                <w:rFonts w:ascii="Aptos" w:eastAsia="Aptos" w:hAnsi="Aptos" w:cs="Aptos"/>
+                <w:b/>
+                <w:bCs/>
+                <w:sz w:val="20"/>
+                <w:szCs w:val="20"/>
+              </w:rPr>
+              <w:t xml:space="preserve">Type</w:t>
+            </w:r>
+          </w:p>
+        </w:tc>
+        <w:tc>
+          <w:tcPr>
+            <w:tcW w:w="2290" w:type="pct"/>
+            <w:shd w:val="clear" w:color="auto" w:fill="F2CEED" w:themeFill="accent5" w:themeFillTint="33"/>
+            <w:tcMar>
+              <w:top w:w="30" w:type="dxa"/>
+              <w:left w:w="80" w:type="dxa"/>
+              <w:bottom w:w="30" w:type="dxa"/>
+              <w:right w:w="80" w:type="dxa"/>
+            </w:tcMar>
+          </w:tcPr>
+          <w:p>
+            <w:r>
+              <w:rPr>
+                <w:rFonts w:ascii="Aptos" w:eastAsia="Aptos" w:hAnsi="Aptos" w:cs="Aptos"/>
+                <w:b/>
+                <w:bCs/>
+                <w:sz w:val="20"/>
+                <w:szCs w:val="20"/>
+              </w:rPr>
+              <w:t xml:space="preserve">Expected Result</w:t>
+            </w:r>
+          </w:p>
+        </w:tc>
+      </w:tr>
+      <w:tr>
+        <w:trPr>
+          <w:cantSplit/>
+        </w:trPr>
+        <w:tc>
+          <w:tcPr>
+            <w:tcW w:w="300" w:type="pct"/>
+            <w:tcMar>
+              <w:top w:w="30" w:type="dxa"/>
+              <w:left w:w="80" w:type="dxa"/>
+              <w:bottom w:w="30" w:type="dxa"/>
+              <w:right w:w="80" w:type="dxa"/>
+            </w:tcMar>
+          </w:tcPr>
+          <w:p>
+            <w:r>
+              <w:rPr>
+                <w:rFonts w:ascii="Aptos" w:eastAsia="Aptos" w:hAnsi="Aptos" w:cs="Aptos"/>
+                <w:sz w:val="20"/>
+                <w:szCs w:val="20"/>
+              </w:rPr>
+              <w:t xml:space="preserve">267</w:t>
+            </w:r>
+          </w:p>
+        </w:tc>
+        <w:tc>
+          <w:tcPr>
+            <w:tcW w:w="1850" w:type="pct"/>
+            <w:tcMar>
+              <w:top w:w="30" w:type="dxa"/>
+              <w:left w:w="80" w:type="dxa"/>
+              <w:bottom w:w="30" w:type="dxa"/>
+              <w:right w:w="80" w:type="dxa"/>
+            </w:tcMar>
+          </w:tcPr>
+          <w:p>
+            <w:r>
+              <w:rPr>
+                <w:rFonts w:ascii="Aptos" w:eastAsia="Aptos" w:hAnsi="Aptos" w:cs="Aptos"/>
+                <w:sz w:val="20"/>
+                <w:szCs w:val="20"/>
+              </w:rPr>
+              <w:t xml:space="preserve">Log in as a manager. Add the film Dune rated 12A with a duration of 166 minutes and the year 2021. Add a screening for it on Screen 1 on a future date at 18:00 priced at £10.00. Add a new customer Liam Brown with valid details. Sell him seat A2, which is a Saver seat, and seat D2, which is Premium, and add 1 Large Popcorn to the same sale.</w:t>
+            </w:r>
+          </w:p>
+        </w:tc>
+        <w:tc>
+          <w:tcPr>
+            <w:tcW w:w="560" w:type="pct"/>
+            <w:tcMar>
+              <w:top w:w="30" w:type="dxa"/>
+              <w:left w:w="80" w:type="dxa"/>
+              <w:bottom w:w="30" w:type="dxa"/>
+              <w:right w:w="80" w:type="dxa"/>
+            </w:tcMar>
+          </w:tcPr>
+          <w:p>
+            <w:r>
+              <w:rPr>
+                <w:rFonts w:ascii="Aptos" w:eastAsia="Aptos" w:hAnsi="Aptos" w:cs="Aptos"/>
+                <w:sz w:val="20"/>
+                <w:szCs w:val="20"/>
+              </w:rPr>
+              <w:t xml:space="preserve">Normal</w:t>
+            </w:r>
+          </w:p>
+        </w:tc>
+        <w:tc>
+          <w:tcPr>
+            <w:tcW w:w="2290" w:type="pct"/>
+            <w:tcMar>
+              <w:top w:w="30" w:type="dxa"/>
+              <w:left w:w="80" w:type="dxa"/>
+              <w:bottom w:w="30" w:type="dxa"/>
+              <w:right w:w="80" w:type="dxa"/>
+            </w:tcMar>
+          </w:tcPr>
+          <w:p>
+            <w:r>
+              <w:rPr>
+                <w:rFonts w:ascii="Aptos" w:eastAsia="Aptos" w:hAnsi="Aptos" w:cs="Aptos"/>
+                <w:sz w:val="20"/>
+                <w:szCs w:val="20"/>
+              </w:rPr>
+              <w:t xml:space="preserve">Every step completes without error. The sale comes to £26.50, which is £8.00 for the Saver seat at 0.8 of £10.00, £15.00 for the Premium seat at 1.5, and £4.50 for the popcorn. The two seats are written to tblBookingSeat with £8.00 and £15.00 stored against them individually.</w:t>
+            </w:r>
+          </w:p>
+        </w:tc>
+      </w:tr>
+      <w:tr>
+        <w:trPr>
+          <w:cantSplit/>
+        </w:trPr>
+        <w:tc>
+          <w:tcPr>
+            <w:tcW w:w="300" w:type="pct"/>
+            <w:tcMar>
+              <w:top w:w="30" w:type="dxa"/>
+              <w:left w:w="80" w:type="dxa"/>
+              <w:bottom w:w="30" w:type="dxa"/>
+              <w:right w:w="80" w:type="dxa"/>
+            </w:tcMar>
+          </w:tcPr>
+          <w:p>
+            <w:r>
+              <w:rPr>
+                <w:rFonts w:ascii="Aptos" w:eastAsia="Aptos" w:hAnsi="Aptos" w:cs="Aptos"/>
+                <w:sz w:val="20"/>
+                <w:szCs w:val="20"/>
+              </w:rPr>
+              <w:t xml:space="preserve">268</w:t>
+            </w:r>
+          </w:p>
+        </w:tc>
+        <w:tc>
+          <w:tcPr>
+            <w:tcW w:w="1850" w:type="pct"/>
+            <w:tcMar>
+              <w:top w:w="30" w:type="dxa"/>
+              <w:left w:w="80" w:type="dxa"/>
+              <w:bottom w:w="30" w:type="dxa"/>
+              <w:right w:w="80" w:type="dxa"/>
+            </w:tcMar>
+          </w:tcPr>
+          <w:p>
+            <w:r>
+              <w:rPr>
+                <w:rFonts w:ascii="Aptos" w:eastAsia="Aptos" w:hAnsi="Aptos" w:cs="Aptos"/>
+                <w:sz w:val="20"/>
+                <w:szCs w:val="20"/>
+              </w:rPr>
+              <w:t xml:space="preserve">Without closing anything, search for Brown, then load the door list for the Dune screening, then run the sales report over a range covering it.</w:t>
+            </w:r>
+          </w:p>
+        </w:tc>
+        <w:tc>
+          <w:tcPr>
+            <w:tcW w:w="560" w:type="pct"/>
+            <w:tcMar>
+              <w:top w:w="30" w:type="dxa"/>
+              <w:left w:w="80" w:type="dxa"/>
+              <w:bottom w:w="30" w:type="dxa"/>
+              <w:right w:w="80" w:type="dxa"/>
+            </w:tcMar>
+          </w:tcPr>
+          <w:p>
+            <w:r>
+              <w:rPr>
+                <w:rFonts w:ascii="Aptos" w:eastAsia="Aptos" w:hAnsi="Aptos" w:cs="Aptos"/>
+                <w:sz w:val="20"/>
+                <w:szCs w:val="20"/>
+              </w:rPr>
+              <w:t xml:space="preserve">Normal</w:t>
+            </w:r>
+          </w:p>
+        </w:tc>
+        <w:tc>
+          <w:tcPr>
+            <w:tcW w:w="2290" w:type="pct"/>
+            <w:tcMar>
+              <w:top w:w="30" w:type="dxa"/>
+              <w:left w:w="80" w:type="dxa"/>
+              <w:bottom w:w="30" w:type="dxa"/>
+              <w:right w:w="80" w:type="dxa"/>
+            </w:tcMar>
+          </w:tcPr>
+          <w:p>
+            <w:r>
+              <w:rPr>
+                <w:rFonts w:ascii="Aptos" w:eastAsia="Aptos" w:hAnsi="Aptos" w:cs="Aptos"/>
+                <w:sz w:val="20"/>
+                <w:szCs w:val="20"/>
+              </w:rPr>
+              <w:t xml:space="preserve">The search returns the booking. The door list shows Liam Brown in seats A2 and D2. The report includes Dune with 2 tickets and £23.00 of ticket takings and £4.50 of food, and the dashboard figure for that day agrees with the report.</w:t>
+            </w:r>
+          </w:p>
+        </w:tc>
+      </w:tr>
+      <w:tr>
+        <w:trPr>
+          <w:cantSplit/>
+        </w:trPr>
+        <w:tc>
+          <w:tcPr>
+            <w:tcW w:w="300" w:type="pct"/>
+            <w:tcMar>
+              <w:top w:w="30" w:type="dxa"/>
+              <w:left w:w="80" w:type="dxa"/>
+              <w:bottom w:w="30" w:type="dxa"/>
+              <w:right w:w="80" w:type="dxa"/>
+            </w:tcMar>
+          </w:tcPr>
+          <w:p>
+            <w:r>
+              <w:rPr>
+                <w:rFonts w:ascii="Aptos" w:eastAsia="Aptos" w:hAnsi="Aptos" w:cs="Aptos"/>
+                <w:sz w:val="20"/>
+                <w:szCs w:val="20"/>
+              </w:rPr>
+              <w:t xml:space="preserve">269</w:t>
+            </w:r>
+          </w:p>
+        </w:tc>
+        <w:tc>
+          <w:tcPr>
+            <w:tcW w:w="1850" w:type="pct"/>
+            <w:tcMar>
+              <w:top w:w="30" w:type="dxa"/>
+              <w:left w:w="80" w:type="dxa"/>
+              <w:bottom w:w="30" w:type="dxa"/>
+              <w:right w:w="80" w:type="dxa"/>
+            </w:tcMar>
+          </w:tcPr>
+          <w:p>
+            <w:r>
+              <w:rPr>
+                <w:rFonts w:ascii="Aptos" w:eastAsia="Aptos" w:hAnsi="Aptos" w:cs="Aptos"/>
+                <w:sz w:val="20"/>
+                <w:szCs w:val="20"/>
+              </w:rPr>
+              <w:t xml:space="preserve">Refund seat D2 only, giving a reason, then look at the booking, the seat map and the report again.</w:t>
+            </w:r>
+          </w:p>
+        </w:tc>
+        <w:tc>
+          <w:tcPr>
+            <w:tcW w:w="560" w:type="pct"/>
+            <w:tcMar>
+              <w:top w:w="30" w:type="dxa"/>
+              <w:left w:w="80" w:type="dxa"/>
+              <w:bottom w:w="30" w:type="dxa"/>
+              <w:right w:w="80" w:type="dxa"/>
+            </w:tcMar>
+          </w:tcPr>
+          <w:p>
+            <w:r>
+              <w:rPr>
+                <w:rFonts w:ascii="Aptos" w:eastAsia="Aptos" w:hAnsi="Aptos" w:cs="Aptos"/>
+                <w:sz w:val="20"/>
+                <w:szCs w:val="20"/>
+              </w:rPr>
+              <w:t xml:space="preserve">Normal</w:t>
+            </w:r>
+          </w:p>
+        </w:tc>
+        <w:tc>
+          <w:tcPr>
+            <w:tcW w:w="2290" w:type="pct"/>
+            <w:tcMar>
+              <w:top w:w="30" w:type="dxa"/>
+              <w:left w:w="80" w:type="dxa"/>
+              <w:bottom w:w="30" w:type="dxa"/>
+              <w:right w:w="80" w:type="dxa"/>
+            </w:tcMar>
+          </w:tcPr>
+          <w:p>
+            <w:r>
+              <w:rPr>
+                <w:rFonts w:ascii="Aptos" w:eastAsia="Aptos" w:hAnsi="Aptos" w:cs="Aptos"/>
+                <w:sz w:val="20"/>
+                <w:szCs w:val="20"/>
+              </w:rPr>
+              <w:t xml:space="preserve">£15.00 is refunded. The booking stays Active with a total of £12.50, seat D2 is available again on the seat map while A2 is still taken, and the report has dropped by exactly £15.00 to £8.00 of ticket takings for Dune.</w:t>
+            </w:r>
+          </w:p>
+        </w:tc>
+      </w:tr>
+      <w:tr>
+        <w:trPr>
+          <w:cantSplit/>
+        </w:trPr>
+        <w:tc>
+          <w:tcPr>
+            <w:tcW w:w="300" w:type="pct"/>
+            <w:tcMar>
+              <w:top w:w="30" w:type="dxa"/>
+              <w:left w:w="80" w:type="dxa"/>
+              <w:bottom w:w="30" w:type="dxa"/>
+              <w:right w:w="80" w:type="dxa"/>
+            </w:tcMar>
+          </w:tcPr>
+          <w:p>
+            <w:r>
+              <w:rPr>
+                <w:rFonts w:ascii="Aptos" w:eastAsia="Aptos" w:hAnsi="Aptos" w:cs="Aptos"/>
+                <w:sz w:val="20"/>
+                <w:szCs w:val="20"/>
+              </w:rPr>
+              <w:t xml:space="preserve">270</w:t>
+            </w:r>
+          </w:p>
+        </w:tc>
+        <w:tc>
+          <w:tcPr>
+            <w:tcW w:w="1850" w:type="pct"/>
+            <w:tcMar>
+              <w:top w:w="30" w:type="dxa"/>
+              <w:left w:w="80" w:type="dxa"/>
+              <w:bottom w:w="30" w:type="dxa"/>
+              <w:right w:w="80" w:type="dxa"/>
+            </w:tcMar>
+          </w:tcPr>
+          <w:p>
+            <w:r>
+              <w:rPr>
+                <w:rFonts w:ascii="Aptos" w:eastAsia="Aptos" w:hAnsi="Aptos" w:cs="Aptos"/>
+                <w:sz w:val="20"/>
+                <w:szCs w:val="20"/>
+              </w:rPr>
+              <w:t xml:space="preserve">Refund the rest of the booking, then look at the booking and the seat map again.</w:t>
+            </w:r>
+          </w:p>
+        </w:tc>
+        <w:tc>
+          <w:tcPr>
+            <w:tcW w:w="560" w:type="pct"/>
+            <w:tcMar>
+              <w:top w:w="30" w:type="dxa"/>
+              <w:left w:w="80" w:type="dxa"/>
+              <w:bottom w:w="30" w:type="dxa"/>
+              <w:right w:w="80" w:type="dxa"/>
+            </w:tcMar>
+          </w:tcPr>
+          <w:p>
+            <w:r>
+              <w:rPr>
+                <w:rFonts w:ascii="Aptos" w:eastAsia="Aptos" w:hAnsi="Aptos" w:cs="Aptos"/>
+                <w:sz w:val="20"/>
+                <w:szCs w:val="20"/>
+              </w:rPr>
+              <w:t xml:space="preserve">Normal</w:t>
+            </w:r>
+          </w:p>
+        </w:tc>
+        <w:tc>
+          <w:tcPr>
+            <w:tcW w:w="2290" w:type="pct"/>
+            <w:tcMar>
+              <w:top w:w="30" w:type="dxa"/>
+              <w:left w:w="80" w:type="dxa"/>
+              <w:bottom w:w="30" w:type="dxa"/>
+              <w:right w:w="80" w:type="dxa"/>
+            </w:tcMar>
+          </w:tcPr>
+          <w:p>
+            <w:r>
+              <w:rPr>
+                <w:rFonts w:ascii="Aptos" w:eastAsia="Aptos" w:hAnsi="Aptos" w:cs="Aptos"/>
+                <w:sz w:val="20"/>
+                <w:szCs w:val="20"/>
+              </w:rPr>
+              <w:t xml:space="preserve">The booking is now marked as Cancelled but is still present in tblBooking, both seats are back on sale, and the report shows no ticket takings for Dune while the refunds report shows both refunds with their reasons.</w:t>
+            </w:r>
+          </w:p>
+        </w:tc>
+      </w:tr>
+      <w:tr>
+        <w:trPr>
+          <w:cantSplit/>
+        </w:trPr>
+        <w:tc>
+          <w:tcPr>
+            <w:tcW w:w="300" w:type="pct"/>
+            <w:tcMar>
+              <w:top w:w="30" w:type="dxa"/>
+              <w:left w:w="80" w:type="dxa"/>
+              <w:bottom w:w="30" w:type="dxa"/>
+              <w:right w:w="80" w:type="dxa"/>
+            </w:tcMar>
+          </w:tcPr>
+          <w:p>
+            <w:r>
+              <w:rPr>
+                <w:rFonts w:ascii="Aptos" w:eastAsia="Aptos" w:hAnsi="Aptos" w:cs="Aptos"/>
+                <w:sz w:val="20"/>
+                <w:szCs w:val="20"/>
+              </w:rPr>
+              <w:t xml:space="preserve">271</w:t>
+            </w:r>
+          </w:p>
+        </w:tc>
+        <w:tc>
+          <w:tcPr>
+            <w:tcW w:w="1850" w:type="pct"/>
+            <w:tcMar>
+              <w:top w:w="30" w:type="dxa"/>
+              <w:left w:w="80" w:type="dxa"/>
+              <w:bottom w:w="30" w:type="dxa"/>
+              <w:right w:w="80" w:type="dxa"/>
+            </w:tcMar>
+          </w:tcPr>
+          <w:p>
+            <w:r>
+              <w:rPr>
+                <w:rFonts w:ascii="Aptos" w:eastAsia="Aptos" w:hAnsi="Aptos" w:cs="Aptos"/>
+                <w:sz w:val="20"/>
+                <w:szCs w:val="20"/>
+              </w:rPr>
+              <w:t xml:space="preserve">Change the ticket price of the Dune screening to £12.00 and re-run the report over the same range.</w:t>
+            </w:r>
+          </w:p>
+        </w:tc>
+        <w:tc>
+          <w:tcPr>
+            <w:tcW w:w="560" w:type="pct"/>
+            <w:tcMar>
+              <w:top w:w="30" w:type="dxa"/>
+              <w:left w:w="80" w:type="dxa"/>
+              <w:bottom w:w="30" w:type="dxa"/>
+              <w:right w:w="80" w:type="dxa"/>
+            </w:tcMar>
+          </w:tcPr>
+          <w:p>
+            <w:r>
+              <w:rPr>
+                <w:rFonts w:ascii="Aptos" w:eastAsia="Aptos" w:hAnsi="Aptos" w:cs="Aptos"/>
+                <w:sz w:val="20"/>
+                <w:szCs w:val="20"/>
+              </w:rPr>
+              <w:t xml:space="preserve">Normal</w:t>
+            </w:r>
+          </w:p>
+        </w:tc>
+        <w:tc>
+          <w:tcPr>
+            <w:tcW w:w="2290" w:type="pct"/>
+            <w:tcMar>
+              <w:top w:w="30" w:type="dxa"/>
+              <w:left w:w="80" w:type="dxa"/>
+              <w:bottom w:w="30" w:type="dxa"/>
+              <w:right w:w="80" w:type="dxa"/>
+            </w:tcMar>
+          </w:tcPr>
+          <w:p>
+            <w:r>
+              <w:rPr>
+                <w:rFonts w:ascii="Aptos" w:eastAsia="Aptos" w:hAnsi="Aptos" w:cs="Aptos"/>
+                <w:sz w:val="20"/>
+                <w:szCs w:val="20"/>
+              </w:rPr>
+              <w:t xml:space="preserve">The figures for the sale that already happened do not move, because each ticket was stored at the price it was actually charged.</w:t>
+            </w:r>
+          </w:p>
+        </w:tc>
+      </w:tr>
+      <w:tr>
+        <w:trPr>
+          <w:cantSplit/>
+        </w:trPr>
+        <w:tc>
+          <w:tcPr>
+            <w:tcW w:w="300" w:type="pct"/>
+            <w:tcMar>
+              <w:top w:w="30" w:type="dxa"/>
+              <w:left w:w="80" w:type="dxa"/>
+              <w:bottom w:w="30" w:type="dxa"/>
+              <w:right w:w="80" w:type="dxa"/>
+            </w:tcMar>
+          </w:tcPr>
+          <w:p>
+            <w:r>
+              <w:rPr>
+                <w:rFonts w:ascii="Aptos" w:eastAsia="Aptos" w:hAnsi="Aptos" w:cs="Aptos"/>
+                <w:sz w:val="20"/>
+                <w:szCs w:val="20"/>
+              </w:rPr>
+              <w:t xml:space="preserve">272</w:t>
+            </w:r>
+          </w:p>
+        </w:tc>
+        <w:tc>
+          <w:tcPr>
+            <w:tcW w:w="1850" w:type="pct"/>
+            <w:tcMar>
+              <w:top w:w="30" w:type="dxa"/>
+              <w:left w:w="80" w:type="dxa"/>
+              <w:bottom w:w="30" w:type="dxa"/>
+              <w:right w:w="80" w:type="dxa"/>
+            </w:tcMar>
+          </w:tcPr>
+          <w:p>
+            <w:r>
+              <w:rPr>
+                <w:rFonts w:ascii="Aptos" w:eastAsia="Aptos" w:hAnsi="Aptos" w:cs="Aptos"/>
+                <w:sz w:val="20"/>
+                <w:szCs w:val="20"/>
+              </w:rPr>
+              <w:t xml:space="preserve">Open the Logs form and look at the entries made during this test.</w:t>
+            </w:r>
+          </w:p>
+        </w:tc>
+        <w:tc>
+          <w:tcPr>
+            <w:tcW w:w="560" w:type="pct"/>
+            <w:tcMar>
+              <w:top w:w="30" w:type="dxa"/>
+              <w:left w:w="80" w:type="dxa"/>
+              <w:bottom w:w="30" w:type="dxa"/>
+              <w:right w:w="80" w:type="dxa"/>
+            </w:tcMar>
+          </w:tcPr>
+          <w:p>
+            <w:r>
+              <w:rPr>
+                <w:rFonts w:ascii="Aptos" w:eastAsia="Aptos" w:hAnsi="Aptos" w:cs="Aptos"/>
+                <w:sz w:val="20"/>
+                <w:szCs w:val="20"/>
+              </w:rPr>
+              <w:t xml:space="preserve">Normal</w:t>
+            </w:r>
+          </w:p>
+        </w:tc>
+        <w:tc>
+          <w:tcPr>
+            <w:tcW w:w="2290" w:type="pct"/>
+            <w:tcMar>
+              <w:top w:w="30" w:type="dxa"/>
+              <w:left w:w="80" w:type="dxa"/>
+              <w:bottom w:w="30" w:type="dxa"/>
+              <w:right w:w="80" w:type="dxa"/>
+            </w:tcMar>
+          </w:tcPr>
+          <w:p>
+            <w:r>
+              <w:rPr>
+                <w:rFonts w:ascii="Aptos" w:eastAsia="Aptos" w:hAnsi="Aptos" w:cs="Aptos"/>
+                <w:sz w:val="20"/>
+                <w:szCs w:val="20"/>
+              </w:rPr>
+              <w:t xml:space="preserve">There is an entry for each action carried out, the film being added, the screening being added, the customer being added, the sale being taken, the door list being loaded, the report being run and each of the two refunds, each with a timestamp, a severity and the manager's username against it.</w:t>
+            </w:r>
+          </w:p>
+        </w:tc>
+      </w:tr>
+      <w:tr>
+        <w:trPr>
+          <w:cantSplit/>
+        </w:trPr>
+        <w:tc>
+          <w:tcPr>
+            <w:tcW w:w="300" w:type="pct"/>
+            <w:tcMar>
+              <w:top w:w="30" w:type="dxa"/>
+              <w:left w:w="80" w:type="dxa"/>
+              <w:bottom w:w="30" w:type="dxa"/>
+              <w:right w:w="80" w:type="dxa"/>
+            </w:tcMar>
+          </w:tcPr>
+          <w:p>
+            <w:r>
+              <w:rPr>
+                <w:rFonts w:ascii="Aptos" w:eastAsia="Aptos" w:hAnsi="Aptos" w:cs="Aptos"/>
+                <w:sz w:val="20"/>
+                <w:szCs w:val="20"/>
+              </w:rPr>
+              <w:t xml:space="preserve">273</w:t>
+            </w:r>
+          </w:p>
+        </w:tc>
+        <w:tc>
+          <w:tcPr>
+            <w:tcW w:w="1850" w:type="pct"/>
+            <w:tcMar>
+              <w:top w:w="30" w:type="dxa"/>
+              <w:left w:w="80" w:type="dxa"/>
+              <w:bottom w:w="30" w:type="dxa"/>
+              <w:right w:w="80" w:type="dxa"/>
+            </w:tcMar>
+          </w:tcPr>
+          <w:p>
+            <w:r>
+              <w:rPr>
+                <w:rFonts w:ascii="Aptos" w:eastAsia="Aptos" w:hAnsi="Aptos" w:cs="Aptos"/>
+                <w:sz w:val="20"/>
+                <w:szCs w:val="20"/>
+              </w:rPr>
+              <w:t xml:space="preserve">Log out, log back in as a member of staff, and repeat as much of the test as that account is allowed to do.</w:t>
+            </w:r>
+          </w:p>
+        </w:tc>
+        <w:tc>
+          <w:tcPr>
+            <w:tcW w:w="560" w:type="pct"/>
+            <w:tcMar>
+              <w:top w:w="30" w:type="dxa"/>
+              <w:left w:w="80" w:type="dxa"/>
+              <w:bottom w:w="30" w:type="dxa"/>
+              <w:right w:w="80" w:type="dxa"/>
+            </w:tcMar>
+          </w:tcPr>
+          <w:p>
+            <w:r>
+              <w:rPr>
+                <w:rFonts w:ascii="Aptos" w:eastAsia="Aptos" w:hAnsi="Aptos" w:cs="Aptos"/>
+                <w:sz w:val="20"/>
+                <w:szCs w:val="20"/>
+              </w:rPr>
+              <w:t xml:space="preserve">Normal</w:t>
+            </w:r>
+          </w:p>
+        </w:tc>
+        <w:tc>
+          <w:tcPr>
+            <w:tcW w:w="2290" w:type="pct"/>
+            <w:tcMar>
+              <w:top w:w="30" w:type="dxa"/>
+              <w:left w:w="80" w:type="dxa"/>
+              <w:bottom w:w="30" w:type="dxa"/>
+              <w:right w:w="80" w:type="dxa"/>
+            </w:tcMar>
+          </w:tcPr>
+          <w:p>
+            <w:r>
+              <w:rPr>
+                <w:rFonts w:ascii="Aptos" w:eastAsia="Aptos" w:hAnsi="Aptos" w:cs="Aptos"/>
+                <w:sz w:val="20"/>
+                <w:szCs w:val="20"/>
+              </w:rPr>
+              <w:t xml:space="preserve">The sale can be taken from the counter, but the sales report, the films screen, the screens screen and the audit log are all refused with a message naming the manager as the only role that can reach them.</w:t>
             </w:r>
           </w:p>
         </w:tc>

</xml_diff>

<commit_message>
added results for tests 1 to 40
</commit_message>
<xml_diff>
--- a/Testing.docx
+++ b/Testing.docx
@@ -33426,6 +33426,3714 @@
           <w:rFonts w:ascii="Aptos" w:eastAsia="Aptos" w:hAnsi="Aptos" w:cs="Aptos"/>
         </w:rPr>
         <w:t xml:space="preserve">Where a test failed, what was done about it is written in the re-test table at the end rather than the original row being overwritten, because the record of what went wrong and how it was fixed is worth more than a table with nothing but passes in it.</w:t>
+      </w:r>
+    </w:p>
+    <w:p>
+      <w:pPr>
+        <w:pStyle w:val="Heading3"/>
+      </w:pPr>
+      <w:r>
+        <w:rPr>
+          <w:rFonts w:ascii="Aptos Display" w:eastAsia="Aptos Display" w:hAnsi="Aptos Display" w:cs="Aptos Display"/>
+          <w:b/>
+          <w:bCs/>
+          <w:color w:val="000000"/>
+        </w:rPr>
+        <w:t xml:space="preserve">Results for tests 1 to 40</w:t>
+      </w:r>
+    </w:p>
+    <w:tbl>
+      <w:tblPr>
+        <w:tblW w:w="5000" w:type="pct"/>
+        <w:tblBorders>
+          <w:top w:val="single" w:sz="4" w:space="0" w:color="808080"/>
+          <w:left w:val="single" w:sz="4" w:space="0" w:color="808080"/>
+          <w:bottom w:val="single" w:sz="4" w:space="0" w:color="808080"/>
+          <w:right w:val="single" w:sz="4" w:space="0" w:color="808080"/>
+          <w:insideH w:val="single" w:sz="4" w:space="0" w:color="808080"/>
+          <w:insideV w:val="single" w:sz="4" w:space="0" w:color="808080"/>
+        </w:tblBorders>
+        <w:tblCellMar>
+          <w:left w:w="10" w:type="dxa"/>
+          <w:right w:w="10" w:type="dxa"/>
+        </w:tblCellMar>
+        <w:tblLook w:val="0000" w:firstRow="0" w:lastRow="0" w:firstColumn="0" w:lastColumn="0" w:noHBand="0" w:noVBand="0"/>
+      </w:tblPr>
+      <w:tblGrid>
+        <w:gridCol w:w="561"/>
+        <w:gridCol w:w="4394"/>
+        <w:gridCol w:w="1402"/>
+        <w:gridCol w:w="2992"/>
+      </w:tblGrid>
+      <w:tr>
+        <w:trPr>
+          <w:cantSplit/>
+          <w:tblHeader/>
+        </w:trPr>
+        <w:tc>
+          <w:tcPr>
+            <w:tcW w:w="300" w:type="pct"/>
+            <w:shd w:val="clear" w:color="auto" w:fill="F2CEED" w:themeFill="accent5" w:themeFillTint="33"/>
+            <w:tcMar>
+              <w:top w:w="30" w:type="dxa"/>
+              <w:left w:w="80" w:type="dxa"/>
+              <w:bottom w:w="30" w:type="dxa"/>
+              <w:right w:w="80" w:type="dxa"/>
+            </w:tcMar>
+          </w:tcPr>
+          <w:p>
+            <w:r>
+              <w:rPr>
+                <w:rFonts w:ascii="Aptos" w:eastAsia="Aptos" w:hAnsi="Aptos" w:cs="Aptos"/>
+                <w:b/>
+                <w:bCs/>
+                <w:sz w:val="20"/>
+                <w:szCs w:val="20"/>
+              </w:rPr>
+              <w:t xml:space="preserve">No.</w:t>
+            </w:r>
+          </w:p>
+        </w:tc>
+        <w:tc>
+          <w:tcPr>
+            <w:tcW w:w="2350" w:type="pct"/>
+            <w:shd w:val="clear" w:color="auto" w:fill="F2CEED" w:themeFill="accent5" w:themeFillTint="33"/>
+            <w:tcMar>
+              <w:top w:w="30" w:type="dxa"/>
+              <w:left w:w="80" w:type="dxa"/>
+              <w:bottom w:w="30" w:type="dxa"/>
+              <w:right w:w="80" w:type="dxa"/>
+            </w:tcMar>
+          </w:tcPr>
+          <w:p>
+            <w:r>
+              <w:rPr>
+                <w:rFonts w:ascii="Aptos" w:eastAsia="Aptos" w:hAnsi="Aptos" w:cs="Aptos"/>
+                <w:b/>
+                <w:bCs/>
+                <w:sz w:val="20"/>
+                <w:szCs w:val="20"/>
+              </w:rPr>
+              <w:t xml:space="preserve">Actual Result</w:t>
+            </w:r>
+          </w:p>
+        </w:tc>
+        <w:tc>
+          <w:tcPr>
+            <w:tcW w:w="750" w:type="pct"/>
+            <w:shd w:val="clear" w:color="auto" w:fill="F2CEED" w:themeFill="accent5" w:themeFillTint="33"/>
+            <w:tcMar>
+              <w:top w:w="30" w:type="dxa"/>
+              <w:left w:w="80" w:type="dxa"/>
+              <w:bottom w:w="30" w:type="dxa"/>
+              <w:right w:w="80" w:type="dxa"/>
+            </w:tcMar>
+          </w:tcPr>
+          <w:p>
+            <w:r>
+              <w:rPr>
+                <w:rFonts w:ascii="Aptos" w:eastAsia="Aptos" w:hAnsi="Aptos" w:cs="Aptos"/>
+                <w:b/>
+                <w:bCs/>
+                <w:sz w:val="20"/>
+                <w:szCs w:val="20"/>
+              </w:rPr>
+              <w:t xml:space="preserve">Pass or Fail</w:t>
+            </w:r>
+          </w:p>
+        </w:tc>
+        <w:tc>
+          <w:tcPr>
+            <w:tcW w:w="1600" w:type="pct"/>
+            <w:shd w:val="clear" w:color="auto" w:fill="F2CEED" w:themeFill="accent5" w:themeFillTint="33"/>
+            <w:tcMar>
+              <w:top w:w="30" w:type="dxa"/>
+              <w:left w:w="80" w:type="dxa"/>
+              <w:bottom w:w="30" w:type="dxa"/>
+              <w:right w:w="80" w:type="dxa"/>
+            </w:tcMar>
+          </w:tcPr>
+          <w:p>
+            <w:r>
+              <w:rPr>
+                <w:rFonts w:ascii="Aptos" w:eastAsia="Aptos" w:hAnsi="Aptos" w:cs="Aptos"/>
+                <w:b/>
+                <w:bCs/>
+                <w:sz w:val="20"/>
+                <w:szCs w:val="20"/>
+              </w:rPr>
+              <w:t xml:space="preserve">Evidence</w:t>
+            </w:r>
+          </w:p>
+        </w:tc>
+      </w:tr>
+      <w:tr>
+        <w:trPr>
+          <w:cantSplit/>
+        </w:trPr>
+        <w:tc>
+          <w:tcPr>
+            <w:tcW w:w="300" w:type="pct"/>
+            <w:tcMar>
+              <w:top w:w="30" w:type="dxa"/>
+              <w:left w:w="80" w:type="dxa"/>
+              <w:bottom w:w="30" w:type="dxa"/>
+              <w:right w:w="80" w:type="dxa"/>
+            </w:tcMar>
+          </w:tcPr>
+          <w:p>
+            <w:r>
+              <w:rPr>
+                <w:rFonts w:ascii="Aptos" w:eastAsia="Aptos" w:hAnsi="Aptos" w:cs="Aptos"/>
+                <w:sz w:val="20"/>
+                <w:szCs w:val="20"/>
+              </w:rPr>
+              <w:t xml:space="preserve">1</w:t>
+            </w:r>
+          </w:p>
+        </w:tc>
+        <w:tc>
+          <w:tcPr>
+            <w:tcW w:w="2350" w:type="pct"/>
+            <w:tcMar>
+              <w:top w:w="30" w:type="dxa"/>
+              <w:left w:w="80" w:type="dxa"/>
+              <w:bottom w:w="30" w:type="dxa"/>
+              <w:right w:w="80" w:type="dxa"/>
+            </w:tcMar>
+          </w:tcPr>
+          <w:p>
+            <w:r>
+              <w:rPr>
+                <w:rFonts w:ascii="Aptos" w:eastAsia="Aptos" w:hAnsi="Aptos" w:cs="Aptos"/>
+                <w:sz w:val="20"/>
+                <w:szCs w:val="20"/>
+              </w:rPr>
+              <w:t xml:space="preserve"/>
+            </w:r>
+          </w:p>
+        </w:tc>
+        <w:tc>
+          <w:tcPr>
+            <w:tcW w:w="750" w:type="pct"/>
+            <w:tcMar>
+              <w:top w:w="30" w:type="dxa"/>
+              <w:left w:w="80" w:type="dxa"/>
+              <w:bottom w:w="30" w:type="dxa"/>
+              <w:right w:w="80" w:type="dxa"/>
+            </w:tcMar>
+          </w:tcPr>
+          <w:p>
+            <w:r>
+              <w:rPr>
+                <w:rFonts w:ascii="Aptos" w:eastAsia="Aptos" w:hAnsi="Aptos" w:cs="Aptos"/>
+                <w:sz w:val="20"/>
+                <w:szCs w:val="20"/>
+              </w:rPr>
+              <w:t xml:space="preserve"/>
+            </w:r>
+          </w:p>
+        </w:tc>
+        <w:tc>
+          <w:tcPr>
+            <w:tcW w:w="1600" w:type="pct"/>
+            <w:tcMar>
+              <w:top w:w="30" w:type="dxa"/>
+              <w:left w:w="80" w:type="dxa"/>
+              <w:bottom w:w="30" w:type="dxa"/>
+              <w:right w:w="80" w:type="dxa"/>
+            </w:tcMar>
+          </w:tcPr>
+          <w:p>
+            <w:r>
+              <w:rPr>
+                <w:rFonts w:ascii="Aptos" w:eastAsia="Aptos" w:hAnsi="Aptos" w:cs="Aptos"/>
+                <w:sz w:val="20"/>
+                <w:szCs w:val="20"/>
+              </w:rPr>
+              <w:t xml:space="preserve"/>
+            </w:r>
+          </w:p>
+        </w:tc>
+      </w:tr>
+      <w:tr>
+        <w:trPr>
+          <w:cantSplit/>
+        </w:trPr>
+        <w:tc>
+          <w:tcPr>
+            <w:tcW w:w="300" w:type="pct"/>
+            <w:tcMar>
+              <w:top w:w="30" w:type="dxa"/>
+              <w:left w:w="80" w:type="dxa"/>
+              <w:bottom w:w="30" w:type="dxa"/>
+              <w:right w:w="80" w:type="dxa"/>
+            </w:tcMar>
+          </w:tcPr>
+          <w:p>
+            <w:r>
+              <w:rPr>
+                <w:rFonts w:ascii="Aptos" w:eastAsia="Aptos" w:hAnsi="Aptos" w:cs="Aptos"/>
+                <w:sz w:val="20"/>
+                <w:szCs w:val="20"/>
+              </w:rPr>
+              <w:t xml:space="preserve">2</w:t>
+            </w:r>
+          </w:p>
+        </w:tc>
+        <w:tc>
+          <w:tcPr>
+            <w:tcW w:w="2350" w:type="pct"/>
+            <w:tcMar>
+              <w:top w:w="30" w:type="dxa"/>
+              <w:left w:w="80" w:type="dxa"/>
+              <w:bottom w:w="30" w:type="dxa"/>
+              <w:right w:w="80" w:type="dxa"/>
+            </w:tcMar>
+          </w:tcPr>
+          <w:p>
+            <w:r>
+              <w:rPr>
+                <w:rFonts w:ascii="Aptos" w:eastAsia="Aptos" w:hAnsi="Aptos" w:cs="Aptos"/>
+                <w:sz w:val="20"/>
+                <w:szCs w:val="20"/>
+              </w:rPr>
+              <w:t xml:space="preserve"/>
+            </w:r>
+          </w:p>
+        </w:tc>
+        <w:tc>
+          <w:tcPr>
+            <w:tcW w:w="750" w:type="pct"/>
+            <w:tcMar>
+              <w:top w:w="30" w:type="dxa"/>
+              <w:left w:w="80" w:type="dxa"/>
+              <w:bottom w:w="30" w:type="dxa"/>
+              <w:right w:w="80" w:type="dxa"/>
+            </w:tcMar>
+          </w:tcPr>
+          <w:p>
+            <w:r>
+              <w:rPr>
+                <w:rFonts w:ascii="Aptos" w:eastAsia="Aptos" w:hAnsi="Aptos" w:cs="Aptos"/>
+                <w:sz w:val="20"/>
+                <w:szCs w:val="20"/>
+              </w:rPr>
+              <w:t xml:space="preserve"/>
+            </w:r>
+          </w:p>
+        </w:tc>
+        <w:tc>
+          <w:tcPr>
+            <w:tcW w:w="1600" w:type="pct"/>
+            <w:tcMar>
+              <w:top w:w="30" w:type="dxa"/>
+              <w:left w:w="80" w:type="dxa"/>
+              <w:bottom w:w="30" w:type="dxa"/>
+              <w:right w:w="80" w:type="dxa"/>
+            </w:tcMar>
+          </w:tcPr>
+          <w:p>
+            <w:r>
+              <w:rPr>
+                <w:rFonts w:ascii="Aptos" w:eastAsia="Aptos" w:hAnsi="Aptos" w:cs="Aptos"/>
+                <w:sz w:val="20"/>
+                <w:szCs w:val="20"/>
+              </w:rPr>
+              <w:t xml:space="preserve"/>
+            </w:r>
+          </w:p>
+        </w:tc>
+      </w:tr>
+      <w:tr>
+        <w:trPr>
+          <w:cantSplit/>
+        </w:trPr>
+        <w:tc>
+          <w:tcPr>
+            <w:tcW w:w="300" w:type="pct"/>
+            <w:tcMar>
+              <w:top w:w="30" w:type="dxa"/>
+              <w:left w:w="80" w:type="dxa"/>
+              <w:bottom w:w="30" w:type="dxa"/>
+              <w:right w:w="80" w:type="dxa"/>
+            </w:tcMar>
+          </w:tcPr>
+          <w:p>
+            <w:r>
+              <w:rPr>
+                <w:rFonts w:ascii="Aptos" w:eastAsia="Aptos" w:hAnsi="Aptos" w:cs="Aptos"/>
+                <w:sz w:val="20"/>
+                <w:szCs w:val="20"/>
+              </w:rPr>
+              <w:t xml:space="preserve">3</w:t>
+            </w:r>
+          </w:p>
+        </w:tc>
+        <w:tc>
+          <w:tcPr>
+            <w:tcW w:w="2350" w:type="pct"/>
+            <w:tcMar>
+              <w:top w:w="30" w:type="dxa"/>
+              <w:left w:w="80" w:type="dxa"/>
+              <w:bottom w:w="30" w:type="dxa"/>
+              <w:right w:w="80" w:type="dxa"/>
+            </w:tcMar>
+          </w:tcPr>
+          <w:p>
+            <w:r>
+              <w:rPr>
+                <w:rFonts w:ascii="Aptos" w:eastAsia="Aptos" w:hAnsi="Aptos" w:cs="Aptos"/>
+                <w:sz w:val="20"/>
+                <w:szCs w:val="20"/>
+              </w:rPr>
+              <w:t xml:space="preserve"/>
+            </w:r>
+          </w:p>
+        </w:tc>
+        <w:tc>
+          <w:tcPr>
+            <w:tcW w:w="750" w:type="pct"/>
+            <w:tcMar>
+              <w:top w:w="30" w:type="dxa"/>
+              <w:left w:w="80" w:type="dxa"/>
+              <w:bottom w:w="30" w:type="dxa"/>
+              <w:right w:w="80" w:type="dxa"/>
+            </w:tcMar>
+          </w:tcPr>
+          <w:p>
+            <w:r>
+              <w:rPr>
+                <w:rFonts w:ascii="Aptos" w:eastAsia="Aptos" w:hAnsi="Aptos" w:cs="Aptos"/>
+                <w:sz w:val="20"/>
+                <w:szCs w:val="20"/>
+              </w:rPr>
+              <w:t xml:space="preserve"/>
+            </w:r>
+          </w:p>
+        </w:tc>
+        <w:tc>
+          <w:tcPr>
+            <w:tcW w:w="1600" w:type="pct"/>
+            <w:tcMar>
+              <w:top w:w="30" w:type="dxa"/>
+              <w:left w:w="80" w:type="dxa"/>
+              <w:bottom w:w="30" w:type="dxa"/>
+              <w:right w:w="80" w:type="dxa"/>
+            </w:tcMar>
+          </w:tcPr>
+          <w:p>
+            <w:r>
+              <w:rPr>
+                <w:rFonts w:ascii="Aptos" w:eastAsia="Aptos" w:hAnsi="Aptos" w:cs="Aptos"/>
+                <w:sz w:val="20"/>
+                <w:szCs w:val="20"/>
+              </w:rPr>
+              <w:t xml:space="preserve"/>
+            </w:r>
+          </w:p>
+        </w:tc>
+      </w:tr>
+      <w:tr>
+        <w:trPr>
+          <w:cantSplit/>
+        </w:trPr>
+        <w:tc>
+          <w:tcPr>
+            <w:tcW w:w="300" w:type="pct"/>
+            <w:tcMar>
+              <w:top w:w="30" w:type="dxa"/>
+              <w:left w:w="80" w:type="dxa"/>
+              <w:bottom w:w="30" w:type="dxa"/>
+              <w:right w:w="80" w:type="dxa"/>
+            </w:tcMar>
+          </w:tcPr>
+          <w:p>
+            <w:r>
+              <w:rPr>
+                <w:rFonts w:ascii="Aptos" w:eastAsia="Aptos" w:hAnsi="Aptos" w:cs="Aptos"/>
+                <w:sz w:val="20"/>
+                <w:szCs w:val="20"/>
+              </w:rPr>
+              <w:t xml:space="preserve">4</w:t>
+            </w:r>
+          </w:p>
+        </w:tc>
+        <w:tc>
+          <w:tcPr>
+            <w:tcW w:w="2350" w:type="pct"/>
+            <w:tcMar>
+              <w:top w:w="30" w:type="dxa"/>
+              <w:left w:w="80" w:type="dxa"/>
+              <w:bottom w:w="30" w:type="dxa"/>
+              <w:right w:w="80" w:type="dxa"/>
+            </w:tcMar>
+          </w:tcPr>
+          <w:p>
+            <w:r>
+              <w:rPr>
+                <w:rFonts w:ascii="Aptos" w:eastAsia="Aptos" w:hAnsi="Aptos" w:cs="Aptos"/>
+                <w:sz w:val="20"/>
+                <w:szCs w:val="20"/>
+              </w:rPr>
+              <w:t xml:space="preserve"/>
+            </w:r>
+          </w:p>
+        </w:tc>
+        <w:tc>
+          <w:tcPr>
+            <w:tcW w:w="750" w:type="pct"/>
+            <w:tcMar>
+              <w:top w:w="30" w:type="dxa"/>
+              <w:left w:w="80" w:type="dxa"/>
+              <w:bottom w:w="30" w:type="dxa"/>
+              <w:right w:w="80" w:type="dxa"/>
+            </w:tcMar>
+          </w:tcPr>
+          <w:p>
+            <w:r>
+              <w:rPr>
+                <w:rFonts w:ascii="Aptos" w:eastAsia="Aptos" w:hAnsi="Aptos" w:cs="Aptos"/>
+                <w:sz w:val="20"/>
+                <w:szCs w:val="20"/>
+              </w:rPr>
+              <w:t xml:space="preserve"/>
+            </w:r>
+          </w:p>
+        </w:tc>
+        <w:tc>
+          <w:tcPr>
+            <w:tcW w:w="1600" w:type="pct"/>
+            <w:tcMar>
+              <w:top w:w="30" w:type="dxa"/>
+              <w:left w:w="80" w:type="dxa"/>
+              <w:bottom w:w="30" w:type="dxa"/>
+              <w:right w:w="80" w:type="dxa"/>
+            </w:tcMar>
+          </w:tcPr>
+          <w:p>
+            <w:r>
+              <w:rPr>
+                <w:rFonts w:ascii="Aptos" w:eastAsia="Aptos" w:hAnsi="Aptos" w:cs="Aptos"/>
+                <w:sz w:val="20"/>
+                <w:szCs w:val="20"/>
+              </w:rPr>
+              <w:t xml:space="preserve"/>
+            </w:r>
+          </w:p>
+        </w:tc>
+      </w:tr>
+      <w:tr>
+        <w:trPr>
+          <w:cantSplit/>
+        </w:trPr>
+        <w:tc>
+          <w:tcPr>
+            <w:tcW w:w="300" w:type="pct"/>
+            <w:tcMar>
+              <w:top w:w="30" w:type="dxa"/>
+              <w:left w:w="80" w:type="dxa"/>
+              <w:bottom w:w="30" w:type="dxa"/>
+              <w:right w:w="80" w:type="dxa"/>
+            </w:tcMar>
+          </w:tcPr>
+          <w:p>
+            <w:r>
+              <w:rPr>
+                <w:rFonts w:ascii="Aptos" w:eastAsia="Aptos" w:hAnsi="Aptos" w:cs="Aptos"/>
+                <w:sz w:val="20"/>
+                <w:szCs w:val="20"/>
+              </w:rPr>
+              <w:t xml:space="preserve">5</w:t>
+            </w:r>
+          </w:p>
+        </w:tc>
+        <w:tc>
+          <w:tcPr>
+            <w:tcW w:w="2350" w:type="pct"/>
+            <w:tcMar>
+              <w:top w:w="30" w:type="dxa"/>
+              <w:left w:w="80" w:type="dxa"/>
+              <w:bottom w:w="30" w:type="dxa"/>
+              <w:right w:w="80" w:type="dxa"/>
+            </w:tcMar>
+          </w:tcPr>
+          <w:p>
+            <w:r>
+              <w:rPr>
+                <w:rFonts w:ascii="Aptos" w:eastAsia="Aptos" w:hAnsi="Aptos" w:cs="Aptos"/>
+                <w:sz w:val="20"/>
+                <w:szCs w:val="20"/>
+              </w:rPr>
+              <w:t xml:space="preserve"/>
+            </w:r>
+          </w:p>
+        </w:tc>
+        <w:tc>
+          <w:tcPr>
+            <w:tcW w:w="750" w:type="pct"/>
+            <w:tcMar>
+              <w:top w:w="30" w:type="dxa"/>
+              <w:left w:w="80" w:type="dxa"/>
+              <w:bottom w:w="30" w:type="dxa"/>
+              <w:right w:w="80" w:type="dxa"/>
+            </w:tcMar>
+          </w:tcPr>
+          <w:p>
+            <w:r>
+              <w:rPr>
+                <w:rFonts w:ascii="Aptos" w:eastAsia="Aptos" w:hAnsi="Aptos" w:cs="Aptos"/>
+                <w:sz w:val="20"/>
+                <w:szCs w:val="20"/>
+              </w:rPr>
+              <w:t xml:space="preserve"/>
+            </w:r>
+          </w:p>
+        </w:tc>
+        <w:tc>
+          <w:tcPr>
+            <w:tcW w:w="1600" w:type="pct"/>
+            <w:tcMar>
+              <w:top w:w="30" w:type="dxa"/>
+              <w:left w:w="80" w:type="dxa"/>
+              <w:bottom w:w="30" w:type="dxa"/>
+              <w:right w:w="80" w:type="dxa"/>
+            </w:tcMar>
+          </w:tcPr>
+          <w:p>
+            <w:r>
+              <w:rPr>
+                <w:rFonts w:ascii="Aptos" w:eastAsia="Aptos" w:hAnsi="Aptos" w:cs="Aptos"/>
+                <w:sz w:val="20"/>
+                <w:szCs w:val="20"/>
+              </w:rPr>
+              <w:t xml:space="preserve"/>
+            </w:r>
+          </w:p>
+        </w:tc>
+      </w:tr>
+      <w:tr>
+        <w:trPr>
+          <w:cantSplit/>
+        </w:trPr>
+        <w:tc>
+          <w:tcPr>
+            <w:tcW w:w="300" w:type="pct"/>
+            <w:tcMar>
+              <w:top w:w="30" w:type="dxa"/>
+              <w:left w:w="80" w:type="dxa"/>
+              <w:bottom w:w="30" w:type="dxa"/>
+              <w:right w:w="80" w:type="dxa"/>
+            </w:tcMar>
+          </w:tcPr>
+          <w:p>
+            <w:r>
+              <w:rPr>
+                <w:rFonts w:ascii="Aptos" w:eastAsia="Aptos" w:hAnsi="Aptos" w:cs="Aptos"/>
+                <w:sz w:val="20"/>
+                <w:szCs w:val="20"/>
+              </w:rPr>
+              <w:t xml:space="preserve">6</w:t>
+            </w:r>
+          </w:p>
+        </w:tc>
+        <w:tc>
+          <w:tcPr>
+            <w:tcW w:w="2350" w:type="pct"/>
+            <w:tcMar>
+              <w:top w:w="30" w:type="dxa"/>
+              <w:left w:w="80" w:type="dxa"/>
+              <w:bottom w:w="30" w:type="dxa"/>
+              <w:right w:w="80" w:type="dxa"/>
+            </w:tcMar>
+          </w:tcPr>
+          <w:p>
+            <w:r>
+              <w:rPr>
+                <w:rFonts w:ascii="Aptos" w:eastAsia="Aptos" w:hAnsi="Aptos" w:cs="Aptos"/>
+                <w:sz w:val="20"/>
+                <w:szCs w:val="20"/>
+              </w:rPr>
+              <w:t xml:space="preserve"/>
+            </w:r>
+          </w:p>
+        </w:tc>
+        <w:tc>
+          <w:tcPr>
+            <w:tcW w:w="750" w:type="pct"/>
+            <w:tcMar>
+              <w:top w:w="30" w:type="dxa"/>
+              <w:left w:w="80" w:type="dxa"/>
+              <w:bottom w:w="30" w:type="dxa"/>
+              <w:right w:w="80" w:type="dxa"/>
+            </w:tcMar>
+          </w:tcPr>
+          <w:p>
+            <w:r>
+              <w:rPr>
+                <w:rFonts w:ascii="Aptos" w:eastAsia="Aptos" w:hAnsi="Aptos" w:cs="Aptos"/>
+                <w:sz w:val="20"/>
+                <w:szCs w:val="20"/>
+              </w:rPr>
+              <w:t xml:space="preserve"/>
+            </w:r>
+          </w:p>
+        </w:tc>
+        <w:tc>
+          <w:tcPr>
+            <w:tcW w:w="1600" w:type="pct"/>
+            <w:tcMar>
+              <w:top w:w="30" w:type="dxa"/>
+              <w:left w:w="80" w:type="dxa"/>
+              <w:bottom w:w="30" w:type="dxa"/>
+              <w:right w:w="80" w:type="dxa"/>
+            </w:tcMar>
+          </w:tcPr>
+          <w:p>
+            <w:r>
+              <w:rPr>
+                <w:rFonts w:ascii="Aptos" w:eastAsia="Aptos" w:hAnsi="Aptos" w:cs="Aptos"/>
+                <w:sz w:val="20"/>
+                <w:szCs w:val="20"/>
+              </w:rPr>
+              <w:t xml:space="preserve"/>
+            </w:r>
+          </w:p>
+        </w:tc>
+      </w:tr>
+      <w:tr>
+        <w:trPr>
+          <w:cantSplit/>
+        </w:trPr>
+        <w:tc>
+          <w:tcPr>
+            <w:tcW w:w="300" w:type="pct"/>
+            <w:tcMar>
+              <w:top w:w="30" w:type="dxa"/>
+              <w:left w:w="80" w:type="dxa"/>
+              <w:bottom w:w="30" w:type="dxa"/>
+              <w:right w:w="80" w:type="dxa"/>
+            </w:tcMar>
+          </w:tcPr>
+          <w:p>
+            <w:r>
+              <w:rPr>
+                <w:rFonts w:ascii="Aptos" w:eastAsia="Aptos" w:hAnsi="Aptos" w:cs="Aptos"/>
+                <w:sz w:val="20"/>
+                <w:szCs w:val="20"/>
+              </w:rPr>
+              <w:t xml:space="preserve">7</w:t>
+            </w:r>
+          </w:p>
+        </w:tc>
+        <w:tc>
+          <w:tcPr>
+            <w:tcW w:w="2350" w:type="pct"/>
+            <w:tcMar>
+              <w:top w:w="30" w:type="dxa"/>
+              <w:left w:w="80" w:type="dxa"/>
+              <w:bottom w:w="30" w:type="dxa"/>
+              <w:right w:w="80" w:type="dxa"/>
+            </w:tcMar>
+          </w:tcPr>
+          <w:p>
+            <w:r>
+              <w:rPr>
+                <w:rFonts w:ascii="Aptos" w:eastAsia="Aptos" w:hAnsi="Aptos" w:cs="Aptos"/>
+                <w:sz w:val="20"/>
+                <w:szCs w:val="20"/>
+              </w:rPr>
+              <w:t xml:space="preserve"/>
+            </w:r>
+          </w:p>
+        </w:tc>
+        <w:tc>
+          <w:tcPr>
+            <w:tcW w:w="750" w:type="pct"/>
+            <w:tcMar>
+              <w:top w:w="30" w:type="dxa"/>
+              <w:left w:w="80" w:type="dxa"/>
+              <w:bottom w:w="30" w:type="dxa"/>
+              <w:right w:w="80" w:type="dxa"/>
+            </w:tcMar>
+          </w:tcPr>
+          <w:p>
+            <w:r>
+              <w:rPr>
+                <w:rFonts w:ascii="Aptos" w:eastAsia="Aptos" w:hAnsi="Aptos" w:cs="Aptos"/>
+                <w:sz w:val="20"/>
+                <w:szCs w:val="20"/>
+              </w:rPr>
+              <w:t xml:space="preserve"/>
+            </w:r>
+          </w:p>
+        </w:tc>
+        <w:tc>
+          <w:tcPr>
+            <w:tcW w:w="1600" w:type="pct"/>
+            <w:tcMar>
+              <w:top w:w="30" w:type="dxa"/>
+              <w:left w:w="80" w:type="dxa"/>
+              <w:bottom w:w="30" w:type="dxa"/>
+              <w:right w:w="80" w:type="dxa"/>
+            </w:tcMar>
+          </w:tcPr>
+          <w:p>
+            <w:r>
+              <w:rPr>
+                <w:rFonts w:ascii="Aptos" w:eastAsia="Aptos" w:hAnsi="Aptos" w:cs="Aptos"/>
+                <w:sz w:val="20"/>
+                <w:szCs w:val="20"/>
+              </w:rPr>
+              <w:t xml:space="preserve"/>
+            </w:r>
+          </w:p>
+        </w:tc>
+      </w:tr>
+      <w:tr>
+        <w:trPr>
+          <w:cantSplit/>
+        </w:trPr>
+        <w:tc>
+          <w:tcPr>
+            <w:tcW w:w="300" w:type="pct"/>
+            <w:tcMar>
+              <w:top w:w="30" w:type="dxa"/>
+              <w:left w:w="80" w:type="dxa"/>
+              <w:bottom w:w="30" w:type="dxa"/>
+              <w:right w:w="80" w:type="dxa"/>
+            </w:tcMar>
+          </w:tcPr>
+          <w:p>
+            <w:r>
+              <w:rPr>
+                <w:rFonts w:ascii="Aptos" w:eastAsia="Aptos" w:hAnsi="Aptos" w:cs="Aptos"/>
+                <w:sz w:val="20"/>
+                <w:szCs w:val="20"/>
+              </w:rPr>
+              <w:t xml:space="preserve">8</w:t>
+            </w:r>
+          </w:p>
+        </w:tc>
+        <w:tc>
+          <w:tcPr>
+            <w:tcW w:w="2350" w:type="pct"/>
+            <w:tcMar>
+              <w:top w:w="30" w:type="dxa"/>
+              <w:left w:w="80" w:type="dxa"/>
+              <w:bottom w:w="30" w:type="dxa"/>
+              <w:right w:w="80" w:type="dxa"/>
+            </w:tcMar>
+          </w:tcPr>
+          <w:p>
+            <w:r>
+              <w:rPr>
+                <w:rFonts w:ascii="Aptos" w:eastAsia="Aptos" w:hAnsi="Aptos" w:cs="Aptos"/>
+                <w:sz w:val="20"/>
+                <w:szCs w:val="20"/>
+              </w:rPr>
+              <w:t xml:space="preserve"/>
+            </w:r>
+          </w:p>
+        </w:tc>
+        <w:tc>
+          <w:tcPr>
+            <w:tcW w:w="750" w:type="pct"/>
+            <w:tcMar>
+              <w:top w:w="30" w:type="dxa"/>
+              <w:left w:w="80" w:type="dxa"/>
+              <w:bottom w:w="30" w:type="dxa"/>
+              <w:right w:w="80" w:type="dxa"/>
+            </w:tcMar>
+          </w:tcPr>
+          <w:p>
+            <w:r>
+              <w:rPr>
+                <w:rFonts w:ascii="Aptos" w:eastAsia="Aptos" w:hAnsi="Aptos" w:cs="Aptos"/>
+                <w:sz w:val="20"/>
+                <w:szCs w:val="20"/>
+              </w:rPr>
+              <w:t xml:space="preserve"/>
+            </w:r>
+          </w:p>
+        </w:tc>
+        <w:tc>
+          <w:tcPr>
+            <w:tcW w:w="1600" w:type="pct"/>
+            <w:tcMar>
+              <w:top w:w="30" w:type="dxa"/>
+              <w:left w:w="80" w:type="dxa"/>
+              <w:bottom w:w="30" w:type="dxa"/>
+              <w:right w:w="80" w:type="dxa"/>
+            </w:tcMar>
+          </w:tcPr>
+          <w:p>
+            <w:r>
+              <w:rPr>
+                <w:rFonts w:ascii="Aptos" w:eastAsia="Aptos" w:hAnsi="Aptos" w:cs="Aptos"/>
+                <w:sz w:val="20"/>
+                <w:szCs w:val="20"/>
+              </w:rPr>
+              <w:t xml:space="preserve"/>
+            </w:r>
+          </w:p>
+        </w:tc>
+      </w:tr>
+      <w:tr>
+        <w:trPr>
+          <w:cantSplit/>
+        </w:trPr>
+        <w:tc>
+          <w:tcPr>
+            <w:tcW w:w="300" w:type="pct"/>
+            <w:tcMar>
+              <w:top w:w="30" w:type="dxa"/>
+              <w:left w:w="80" w:type="dxa"/>
+              <w:bottom w:w="30" w:type="dxa"/>
+              <w:right w:w="80" w:type="dxa"/>
+            </w:tcMar>
+          </w:tcPr>
+          <w:p>
+            <w:r>
+              <w:rPr>
+                <w:rFonts w:ascii="Aptos" w:eastAsia="Aptos" w:hAnsi="Aptos" w:cs="Aptos"/>
+                <w:sz w:val="20"/>
+                <w:szCs w:val="20"/>
+              </w:rPr>
+              <w:t xml:space="preserve">9</w:t>
+            </w:r>
+          </w:p>
+        </w:tc>
+        <w:tc>
+          <w:tcPr>
+            <w:tcW w:w="2350" w:type="pct"/>
+            <w:tcMar>
+              <w:top w:w="30" w:type="dxa"/>
+              <w:left w:w="80" w:type="dxa"/>
+              <w:bottom w:w="30" w:type="dxa"/>
+              <w:right w:w="80" w:type="dxa"/>
+            </w:tcMar>
+          </w:tcPr>
+          <w:p>
+            <w:r>
+              <w:rPr>
+                <w:rFonts w:ascii="Aptos" w:eastAsia="Aptos" w:hAnsi="Aptos" w:cs="Aptos"/>
+                <w:sz w:val="20"/>
+                <w:szCs w:val="20"/>
+              </w:rPr>
+              <w:t xml:space="preserve"/>
+            </w:r>
+          </w:p>
+        </w:tc>
+        <w:tc>
+          <w:tcPr>
+            <w:tcW w:w="750" w:type="pct"/>
+            <w:tcMar>
+              <w:top w:w="30" w:type="dxa"/>
+              <w:left w:w="80" w:type="dxa"/>
+              <w:bottom w:w="30" w:type="dxa"/>
+              <w:right w:w="80" w:type="dxa"/>
+            </w:tcMar>
+          </w:tcPr>
+          <w:p>
+            <w:r>
+              <w:rPr>
+                <w:rFonts w:ascii="Aptos" w:eastAsia="Aptos" w:hAnsi="Aptos" w:cs="Aptos"/>
+                <w:sz w:val="20"/>
+                <w:szCs w:val="20"/>
+              </w:rPr>
+              <w:t xml:space="preserve"/>
+            </w:r>
+          </w:p>
+        </w:tc>
+        <w:tc>
+          <w:tcPr>
+            <w:tcW w:w="1600" w:type="pct"/>
+            <w:tcMar>
+              <w:top w:w="30" w:type="dxa"/>
+              <w:left w:w="80" w:type="dxa"/>
+              <w:bottom w:w="30" w:type="dxa"/>
+              <w:right w:w="80" w:type="dxa"/>
+            </w:tcMar>
+          </w:tcPr>
+          <w:p>
+            <w:r>
+              <w:rPr>
+                <w:rFonts w:ascii="Aptos" w:eastAsia="Aptos" w:hAnsi="Aptos" w:cs="Aptos"/>
+                <w:sz w:val="20"/>
+                <w:szCs w:val="20"/>
+              </w:rPr>
+              <w:t xml:space="preserve"/>
+            </w:r>
+          </w:p>
+        </w:tc>
+      </w:tr>
+      <w:tr>
+        <w:trPr>
+          <w:cantSplit/>
+        </w:trPr>
+        <w:tc>
+          <w:tcPr>
+            <w:tcW w:w="300" w:type="pct"/>
+            <w:tcMar>
+              <w:top w:w="30" w:type="dxa"/>
+              <w:left w:w="80" w:type="dxa"/>
+              <w:bottom w:w="30" w:type="dxa"/>
+              <w:right w:w="80" w:type="dxa"/>
+            </w:tcMar>
+          </w:tcPr>
+          <w:p>
+            <w:r>
+              <w:rPr>
+                <w:rFonts w:ascii="Aptos" w:eastAsia="Aptos" w:hAnsi="Aptos" w:cs="Aptos"/>
+                <w:sz w:val="20"/>
+                <w:szCs w:val="20"/>
+              </w:rPr>
+              <w:t xml:space="preserve">10</w:t>
+            </w:r>
+          </w:p>
+        </w:tc>
+        <w:tc>
+          <w:tcPr>
+            <w:tcW w:w="2350" w:type="pct"/>
+            <w:tcMar>
+              <w:top w:w="30" w:type="dxa"/>
+              <w:left w:w="80" w:type="dxa"/>
+              <w:bottom w:w="30" w:type="dxa"/>
+              <w:right w:w="80" w:type="dxa"/>
+            </w:tcMar>
+          </w:tcPr>
+          <w:p>
+            <w:r>
+              <w:rPr>
+                <w:rFonts w:ascii="Aptos" w:eastAsia="Aptos" w:hAnsi="Aptos" w:cs="Aptos"/>
+                <w:sz w:val="20"/>
+                <w:szCs w:val="20"/>
+              </w:rPr>
+              <w:t xml:space="preserve"/>
+            </w:r>
+          </w:p>
+        </w:tc>
+        <w:tc>
+          <w:tcPr>
+            <w:tcW w:w="750" w:type="pct"/>
+            <w:tcMar>
+              <w:top w:w="30" w:type="dxa"/>
+              <w:left w:w="80" w:type="dxa"/>
+              <w:bottom w:w="30" w:type="dxa"/>
+              <w:right w:w="80" w:type="dxa"/>
+            </w:tcMar>
+          </w:tcPr>
+          <w:p>
+            <w:r>
+              <w:rPr>
+                <w:rFonts w:ascii="Aptos" w:eastAsia="Aptos" w:hAnsi="Aptos" w:cs="Aptos"/>
+                <w:sz w:val="20"/>
+                <w:szCs w:val="20"/>
+              </w:rPr>
+              <w:t xml:space="preserve"/>
+            </w:r>
+          </w:p>
+        </w:tc>
+        <w:tc>
+          <w:tcPr>
+            <w:tcW w:w="1600" w:type="pct"/>
+            <w:tcMar>
+              <w:top w:w="30" w:type="dxa"/>
+              <w:left w:w="80" w:type="dxa"/>
+              <w:bottom w:w="30" w:type="dxa"/>
+              <w:right w:w="80" w:type="dxa"/>
+            </w:tcMar>
+          </w:tcPr>
+          <w:p>
+            <w:r>
+              <w:rPr>
+                <w:rFonts w:ascii="Aptos" w:eastAsia="Aptos" w:hAnsi="Aptos" w:cs="Aptos"/>
+                <w:sz w:val="20"/>
+                <w:szCs w:val="20"/>
+              </w:rPr>
+              <w:t xml:space="preserve"/>
+            </w:r>
+          </w:p>
+        </w:tc>
+      </w:tr>
+      <w:tr>
+        <w:trPr>
+          <w:cantSplit/>
+        </w:trPr>
+        <w:tc>
+          <w:tcPr>
+            <w:tcW w:w="300" w:type="pct"/>
+            <w:tcMar>
+              <w:top w:w="30" w:type="dxa"/>
+              <w:left w:w="80" w:type="dxa"/>
+              <w:bottom w:w="30" w:type="dxa"/>
+              <w:right w:w="80" w:type="dxa"/>
+            </w:tcMar>
+          </w:tcPr>
+          <w:p>
+            <w:r>
+              <w:rPr>
+                <w:rFonts w:ascii="Aptos" w:eastAsia="Aptos" w:hAnsi="Aptos" w:cs="Aptos"/>
+                <w:sz w:val="20"/>
+                <w:szCs w:val="20"/>
+              </w:rPr>
+              <w:t xml:space="preserve">11</w:t>
+            </w:r>
+          </w:p>
+        </w:tc>
+        <w:tc>
+          <w:tcPr>
+            <w:tcW w:w="2350" w:type="pct"/>
+            <w:tcMar>
+              <w:top w:w="30" w:type="dxa"/>
+              <w:left w:w="80" w:type="dxa"/>
+              <w:bottom w:w="30" w:type="dxa"/>
+              <w:right w:w="80" w:type="dxa"/>
+            </w:tcMar>
+          </w:tcPr>
+          <w:p>
+            <w:r>
+              <w:rPr>
+                <w:rFonts w:ascii="Aptos" w:eastAsia="Aptos" w:hAnsi="Aptos" w:cs="Aptos"/>
+                <w:sz w:val="20"/>
+                <w:szCs w:val="20"/>
+              </w:rPr>
+              <w:t xml:space="preserve"/>
+            </w:r>
+          </w:p>
+        </w:tc>
+        <w:tc>
+          <w:tcPr>
+            <w:tcW w:w="750" w:type="pct"/>
+            <w:tcMar>
+              <w:top w:w="30" w:type="dxa"/>
+              <w:left w:w="80" w:type="dxa"/>
+              <w:bottom w:w="30" w:type="dxa"/>
+              <w:right w:w="80" w:type="dxa"/>
+            </w:tcMar>
+          </w:tcPr>
+          <w:p>
+            <w:r>
+              <w:rPr>
+                <w:rFonts w:ascii="Aptos" w:eastAsia="Aptos" w:hAnsi="Aptos" w:cs="Aptos"/>
+                <w:sz w:val="20"/>
+                <w:szCs w:val="20"/>
+              </w:rPr>
+              <w:t xml:space="preserve"/>
+            </w:r>
+          </w:p>
+        </w:tc>
+        <w:tc>
+          <w:tcPr>
+            <w:tcW w:w="1600" w:type="pct"/>
+            <w:tcMar>
+              <w:top w:w="30" w:type="dxa"/>
+              <w:left w:w="80" w:type="dxa"/>
+              <w:bottom w:w="30" w:type="dxa"/>
+              <w:right w:w="80" w:type="dxa"/>
+            </w:tcMar>
+          </w:tcPr>
+          <w:p>
+            <w:r>
+              <w:rPr>
+                <w:rFonts w:ascii="Aptos" w:eastAsia="Aptos" w:hAnsi="Aptos" w:cs="Aptos"/>
+                <w:sz w:val="20"/>
+                <w:szCs w:val="20"/>
+              </w:rPr>
+              <w:t xml:space="preserve"/>
+            </w:r>
+          </w:p>
+        </w:tc>
+      </w:tr>
+      <w:tr>
+        <w:trPr>
+          <w:cantSplit/>
+        </w:trPr>
+        <w:tc>
+          <w:tcPr>
+            <w:tcW w:w="300" w:type="pct"/>
+            <w:tcMar>
+              <w:top w:w="30" w:type="dxa"/>
+              <w:left w:w="80" w:type="dxa"/>
+              <w:bottom w:w="30" w:type="dxa"/>
+              <w:right w:w="80" w:type="dxa"/>
+            </w:tcMar>
+          </w:tcPr>
+          <w:p>
+            <w:r>
+              <w:rPr>
+                <w:rFonts w:ascii="Aptos" w:eastAsia="Aptos" w:hAnsi="Aptos" w:cs="Aptos"/>
+                <w:sz w:val="20"/>
+                <w:szCs w:val="20"/>
+              </w:rPr>
+              <w:t xml:space="preserve">12</w:t>
+            </w:r>
+          </w:p>
+        </w:tc>
+        <w:tc>
+          <w:tcPr>
+            <w:tcW w:w="2350" w:type="pct"/>
+            <w:tcMar>
+              <w:top w:w="30" w:type="dxa"/>
+              <w:left w:w="80" w:type="dxa"/>
+              <w:bottom w:w="30" w:type="dxa"/>
+              <w:right w:w="80" w:type="dxa"/>
+            </w:tcMar>
+          </w:tcPr>
+          <w:p>
+            <w:r>
+              <w:rPr>
+                <w:rFonts w:ascii="Aptos" w:eastAsia="Aptos" w:hAnsi="Aptos" w:cs="Aptos"/>
+                <w:sz w:val="20"/>
+                <w:szCs w:val="20"/>
+              </w:rPr>
+              <w:t xml:space="preserve"/>
+            </w:r>
+          </w:p>
+        </w:tc>
+        <w:tc>
+          <w:tcPr>
+            <w:tcW w:w="750" w:type="pct"/>
+            <w:tcMar>
+              <w:top w:w="30" w:type="dxa"/>
+              <w:left w:w="80" w:type="dxa"/>
+              <w:bottom w:w="30" w:type="dxa"/>
+              <w:right w:w="80" w:type="dxa"/>
+            </w:tcMar>
+          </w:tcPr>
+          <w:p>
+            <w:r>
+              <w:rPr>
+                <w:rFonts w:ascii="Aptos" w:eastAsia="Aptos" w:hAnsi="Aptos" w:cs="Aptos"/>
+                <w:sz w:val="20"/>
+                <w:szCs w:val="20"/>
+              </w:rPr>
+              <w:t xml:space="preserve"/>
+            </w:r>
+          </w:p>
+        </w:tc>
+        <w:tc>
+          <w:tcPr>
+            <w:tcW w:w="1600" w:type="pct"/>
+            <w:tcMar>
+              <w:top w:w="30" w:type="dxa"/>
+              <w:left w:w="80" w:type="dxa"/>
+              <w:bottom w:w="30" w:type="dxa"/>
+              <w:right w:w="80" w:type="dxa"/>
+            </w:tcMar>
+          </w:tcPr>
+          <w:p>
+            <w:r>
+              <w:rPr>
+                <w:rFonts w:ascii="Aptos" w:eastAsia="Aptos" w:hAnsi="Aptos" w:cs="Aptos"/>
+                <w:sz w:val="20"/>
+                <w:szCs w:val="20"/>
+              </w:rPr>
+              <w:t xml:space="preserve"/>
+            </w:r>
+          </w:p>
+        </w:tc>
+      </w:tr>
+      <w:tr>
+        <w:trPr>
+          <w:cantSplit/>
+        </w:trPr>
+        <w:tc>
+          <w:tcPr>
+            <w:tcW w:w="300" w:type="pct"/>
+            <w:tcMar>
+              <w:top w:w="30" w:type="dxa"/>
+              <w:left w:w="80" w:type="dxa"/>
+              <w:bottom w:w="30" w:type="dxa"/>
+              <w:right w:w="80" w:type="dxa"/>
+            </w:tcMar>
+          </w:tcPr>
+          <w:p>
+            <w:r>
+              <w:rPr>
+                <w:rFonts w:ascii="Aptos" w:eastAsia="Aptos" w:hAnsi="Aptos" w:cs="Aptos"/>
+                <w:sz w:val="20"/>
+                <w:szCs w:val="20"/>
+              </w:rPr>
+              <w:t xml:space="preserve">13</w:t>
+            </w:r>
+          </w:p>
+        </w:tc>
+        <w:tc>
+          <w:tcPr>
+            <w:tcW w:w="2350" w:type="pct"/>
+            <w:tcMar>
+              <w:top w:w="30" w:type="dxa"/>
+              <w:left w:w="80" w:type="dxa"/>
+              <w:bottom w:w="30" w:type="dxa"/>
+              <w:right w:w="80" w:type="dxa"/>
+            </w:tcMar>
+          </w:tcPr>
+          <w:p>
+            <w:r>
+              <w:rPr>
+                <w:rFonts w:ascii="Aptos" w:eastAsia="Aptos" w:hAnsi="Aptos" w:cs="Aptos"/>
+                <w:sz w:val="20"/>
+                <w:szCs w:val="20"/>
+              </w:rPr>
+              <w:t xml:space="preserve"/>
+            </w:r>
+          </w:p>
+        </w:tc>
+        <w:tc>
+          <w:tcPr>
+            <w:tcW w:w="750" w:type="pct"/>
+            <w:tcMar>
+              <w:top w:w="30" w:type="dxa"/>
+              <w:left w:w="80" w:type="dxa"/>
+              <w:bottom w:w="30" w:type="dxa"/>
+              <w:right w:w="80" w:type="dxa"/>
+            </w:tcMar>
+          </w:tcPr>
+          <w:p>
+            <w:r>
+              <w:rPr>
+                <w:rFonts w:ascii="Aptos" w:eastAsia="Aptos" w:hAnsi="Aptos" w:cs="Aptos"/>
+                <w:sz w:val="20"/>
+                <w:szCs w:val="20"/>
+              </w:rPr>
+              <w:t xml:space="preserve"/>
+            </w:r>
+          </w:p>
+        </w:tc>
+        <w:tc>
+          <w:tcPr>
+            <w:tcW w:w="1600" w:type="pct"/>
+            <w:tcMar>
+              <w:top w:w="30" w:type="dxa"/>
+              <w:left w:w="80" w:type="dxa"/>
+              <w:bottom w:w="30" w:type="dxa"/>
+              <w:right w:w="80" w:type="dxa"/>
+            </w:tcMar>
+          </w:tcPr>
+          <w:p>
+            <w:r>
+              <w:rPr>
+                <w:rFonts w:ascii="Aptos" w:eastAsia="Aptos" w:hAnsi="Aptos" w:cs="Aptos"/>
+                <w:sz w:val="20"/>
+                <w:szCs w:val="20"/>
+              </w:rPr>
+              <w:t xml:space="preserve"/>
+            </w:r>
+          </w:p>
+        </w:tc>
+      </w:tr>
+      <w:tr>
+        <w:trPr>
+          <w:cantSplit/>
+        </w:trPr>
+        <w:tc>
+          <w:tcPr>
+            <w:tcW w:w="300" w:type="pct"/>
+            <w:tcMar>
+              <w:top w:w="30" w:type="dxa"/>
+              <w:left w:w="80" w:type="dxa"/>
+              <w:bottom w:w="30" w:type="dxa"/>
+              <w:right w:w="80" w:type="dxa"/>
+            </w:tcMar>
+          </w:tcPr>
+          <w:p>
+            <w:r>
+              <w:rPr>
+                <w:rFonts w:ascii="Aptos" w:eastAsia="Aptos" w:hAnsi="Aptos" w:cs="Aptos"/>
+                <w:sz w:val="20"/>
+                <w:szCs w:val="20"/>
+              </w:rPr>
+              <w:t xml:space="preserve">14</w:t>
+            </w:r>
+          </w:p>
+        </w:tc>
+        <w:tc>
+          <w:tcPr>
+            <w:tcW w:w="2350" w:type="pct"/>
+            <w:tcMar>
+              <w:top w:w="30" w:type="dxa"/>
+              <w:left w:w="80" w:type="dxa"/>
+              <w:bottom w:w="30" w:type="dxa"/>
+              <w:right w:w="80" w:type="dxa"/>
+            </w:tcMar>
+          </w:tcPr>
+          <w:p>
+            <w:r>
+              <w:rPr>
+                <w:rFonts w:ascii="Aptos" w:eastAsia="Aptos" w:hAnsi="Aptos" w:cs="Aptos"/>
+                <w:sz w:val="20"/>
+                <w:szCs w:val="20"/>
+              </w:rPr>
+              <w:t xml:space="preserve"/>
+            </w:r>
+          </w:p>
+        </w:tc>
+        <w:tc>
+          <w:tcPr>
+            <w:tcW w:w="750" w:type="pct"/>
+            <w:tcMar>
+              <w:top w:w="30" w:type="dxa"/>
+              <w:left w:w="80" w:type="dxa"/>
+              <w:bottom w:w="30" w:type="dxa"/>
+              <w:right w:w="80" w:type="dxa"/>
+            </w:tcMar>
+          </w:tcPr>
+          <w:p>
+            <w:r>
+              <w:rPr>
+                <w:rFonts w:ascii="Aptos" w:eastAsia="Aptos" w:hAnsi="Aptos" w:cs="Aptos"/>
+                <w:sz w:val="20"/>
+                <w:szCs w:val="20"/>
+              </w:rPr>
+              <w:t xml:space="preserve"/>
+            </w:r>
+          </w:p>
+        </w:tc>
+        <w:tc>
+          <w:tcPr>
+            <w:tcW w:w="1600" w:type="pct"/>
+            <w:tcMar>
+              <w:top w:w="30" w:type="dxa"/>
+              <w:left w:w="80" w:type="dxa"/>
+              <w:bottom w:w="30" w:type="dxa"/>
+              <w:right w:w="80" w:type="dxa"/>
+            </w:tcMar>
+          </w:tcPr>
+          <w:p>
+            <w:r>
+              <w:rPr>
+                <w:rFonts w:ascii="Aptos" w:eastAsia="Aptos" w:hAnsi="Aptos" w:cs="Aptos"/>
+                <w:sz w:val="20"/>
+                <w:szCs w:val="20"/>
+              </w:rPr>
+              <w:t xml:space="preserve"/>
+            </w:r>
+          </w:p>
+        </w:tc>
+      </w:tr>
+      <w:tr>
+        <w:trPr>
+          <w:cantSplit/>
+        </w:trPr>
+        <w:tc>
+          <w:tcPr>
+            <w:tcW w:w="300" w:type="pct"/>
+            <w:tcMar>
+              <w:top w:w="30" w:type="dxa"/>
+              <w:left w:w="80" w:type="dxa"/>
+              <w:bottom w:w="30" w:type="dxa"/>
+              <w:right w:w="80" w:type="dxa"/>
+            </w:tcMar>
+          </w:tcPr>
+          <w:p>
+            <w:r>
+              <w:rPr>
+                <w:rFonts w:ascii="Aptos" w:eastAsia="Aptos" w:hAnsi="Aptos" w:cs="Aptos"/>
+                <w:sz w:val="20"/>
+                <w:szCs w:val="20"/>
+              </w:rPr>
+              <w:t xml:space="preserve">15</w:t>
+            </w:r>
+          </w:p>
+        </w:tc>
+        <w:tc>
+          <w:tcPr>
+            <w:tcW w:w="2350" w:type="pct"/>
+            <w:tcMar>
+              <w:top w:w="30" w:type="dxa"/>
+              <w:left w:w="80" w:type="dxa"/>
+              <w:bottom w:w="30" w:type="dxa"/>
+              <w:right w:w="80" w:type="dxa"/>
+            </w:tcMar>
+          </w:tcPr>
+          <w:p>
+            <w:r>
+              <w:rPr>
+                <w:rFonts w:ascii="Aptos" w:eastAsia="Aptos" w:hAnsi="Aptos" w:cs="Aptos"/>
+                <w:sz w:val="20"/>
+                <w:szCs w:val="20"/>
+              </w:rPr>
+              <w:t xml:space="preserve"/>
+            </w:r>
+          </w:p>
+        </w:tc>
+        <w:tc>
+          <w:tcPr>
+            <w:tcW w:w="750" w:type="pct"/>
+            <w:tcMar>
+              <w:top w:w="30" w:type="dxa"/>
+              <w:left w:w="80" w:type="dxa"/>
+              <w:bottom w:w="30" w:type="dxa"/>
+              <w:right w:w="80" w:type="dxa"/>
+            </w:tcMar>
+          </w:tcPr>
+          <w:p>
+            <w:r>
+              <w:rPr>
+                <w:rFonts w:ascii="Aptos" w:eastAsia="Aptos" w:hAnsi="Aptos" w:cs="Aptos"/>
+                <w:sz w:val="20"/>
+                <w:szCs w:val="20"/>
+              </w:rPr>
+              <w:t xml:space="preserve"/>
+            </w:r>
+          </w:p>
+        </w:tc>
+        <w:tc>
+          <w:tcPr>
+            <w:tcW w:w="1600" w:type="pct"/>
+            <w:tcMar>
+              <w:top w:w="30" w:type="dxa"/>
+              <w:left w:w="80" w:type="dxa"/>
+              <w:bottom w:w="30" w:type="dxa"/>
+              <w:right w:w="80" w:type="dxa"/>
+            </w:tcMar>
+          </w:tcPr>
+          <w:p>
+            <w:r>
+              <w:rPr>
+                <w:rFonts w:ascii="Aptos" w:eastAsia="Aptos" w:hAnsi="Aptos" w:cs="Aptos"/>
+                <w:sz w:val="20"/>
+                <w:szCs w:val="20"/>
+              </w:rPr>
+              <w:t xml:space="preserve"/>
+            </w:r>
+          </w:p>
+        </w:tc>
+      </w:tr>
+      <w:tr>
+        <w:trPr>
+          <w:cantSplit/>
+        </w:trPr>
+        <w:tc>
+          <w:tcPr>
+            <w:tcW w:w="300" w:type="pct"/>
+            <w:tcMar>
+              <w:top w:w="30" w:type="dxa"/>
+              <w:left w:w="80" w:type="dxa"/>
+              <w:bottom w:w="30" w:type="dxa"/>
+              <w:right w:w="80" w:type="dxa"/>
+            </w:tcMar>
+          </w:tcPr>
+          <w:p>
+            <w:r>
+              <w:rPr>
+                <w:rFonts w:ascii="Aptos" w:eastAsia="Aptos" w:hAnsi="Aptos" w:cs="Aptos"/>
+                <w:sz w:val="20"/>
+                <w:szCs w:val="20"/>
+              </w:rPr>
+              <w:t xml:space="preserve">16</w:t>
+            </w:r>
+          </w:p>
+        </w:tc>
+        <w:tc>
+          <w:tcPr>
+            <w:tcW w:w="2350" w:type="pct"/>
+            <w:tcMar>
+              <w:top w:w="30" w:type="dxa"/>
+              <w:left w:w="80" w:type="dxa"/>
+              <w:bottom w:w="30" w:type="dxa"/>
+              <w:right w:w="80" w:type="dxa"/>
+            </w:tcMar>
+          </w:tcPr>
+          <w:p>
+            <w:r>
+              <w:rPr>
+                <w:rFonts w:ascii="Aptos" w:eastAsia="Aptos" w:hAnsi="Aptos" w:cs="Aptos"/>
+                <w:sz w:val="20"/>
+                <w:szCs w:val="20"/>
+              </w:rPr>
+              <w:t xml:space="preserve"/>
+            </w:r>
+          </w:p>
+        </w:tc>
+        <w:tc>
+          <w:tcPr>
+            <w:tcW w:w="750" w:type="pct"/>
+            <w:tcMar>
+              <w:top w:w="30" w:type="dxa"/>
+              <w:left w:w="80" w:type="dxa"/>
+              <w:bottom w:w="30" w:type="dxa"/>
+              <w:right w:w="80" w:type="dxa"/>
+            </w:tcMar>
+          </w:tcPr>
+          <w:p>
+            <w:r>
+              <w:rPr>
+                <w:rFonts w:ascii="Aptos" w:eastAsia="Aptos" w:hAnsi="Aptos" w:cs="Aptos"/>
+                <w:sz w:val="20"/>
+                <w:szCs w:val="20"/>
+              </w:rPr>
+              <w:t xml:space="preserve"/>
+            </w:r>
+          </w:p>
+        </w:tc>
+        <w:tc>
+          <w:tcPr>
+            <w:tcW w:w="1600" w:type="pct"/>
+            <w:tcMar>
+              <w:top w:w="30" w:type="dxa"/>
+              <w:left w:w="80" w:type="dxa"/>
+              <w:bottom w:w="30" w:type="dxa"/>
+              <w:right w:w="80" w:type="dxa"/>
+            </w:tcMar>
+          </w:tcPr>
+          <w:p>
+            <w:r>
+              <w:rPr>
+                <w:rFonts w:ascii="Aptos" w:eastAsia="Aptos" w:hAnsi="Aptos" w:cs="Aptos"/>
+                <w:sz w:val="20"/>
+                <w:szCs w:val="20"/>
+              </w:rPr>
+              <w:t xml:space="preserve"/>
+            </w:r>
+          </w:p>
+        </w:tc>
+      </w:tr>
+      <w:tr>
+        <w:trPr>
+          <w:cantSplit/>
+        </w:trPr>
+        <w:tc>
+          <w:tcPr>
+            <w:tcW w:w="300" w:type="pct"/>
+            <w:tcMar>
+              <w:top w:w="30" w:type="dxa"/>
+              <w:left w:w="80" w:type="dxa"/>
+              <w:bottom w:w="30" w:type="dxa"/>
+              <w:right w:w="80" w:type="dxa"/>
+            </w:tcMar>
+          </w:tcPr>
+          <w:p>
+            <w:r>
+              <w:rPr>
+                <w:rFonts w:ascii="Aptos" w:eastAsia="Aptos" w:hAnsi="Aptos" w:cs="Aptos"/>
+                <w:sz w:val="20"/>
+                <w:szCs w:val="20"/>
+              </w:rPr>
+              <w:t xml:space="preserve">17</w:t>
+            </w:r>
+          </w:p>
+        </w:tc>
+        <w:tc>
+          <w:tcPr>
+            <w:tcW w:w="2350" w:type="pct"/>
+            <w:tcMar>
+              <w:top w:w="30" w:type="dxa"/>
+              <w:left w:w="80" w:type="dxa"/>
+              <w:bottom w:w="30" w:type="dxa"/>
+              <w:right w:w="80" w:type="dxa"/>
+            </w:tcMar>
+          </w:tcPr>
+          <w:p>
+            <w:r>
+              <w:rPr>
+                <w:rFonts w:ascii="Aptos" w:eastAsia="Aptos" w:hAnsi="Aptos" w:cs="Aptos"/>
+                <w:sz w:val="20"/>
+                <w:szCs w:val="20"/>
+              </w:rPr>
+              <w:t xml:space="preserve"/>
+            </w:r>
+          </w:p>
+        </w:tc>
+        <w:tc>
+          <w:tcPr>
+            <w:tcW w:w="750" w:type="pct"/>
+            <w:tcMar>
+              <w:top w:w="30" w:type="dxa"/>
+              <w:left w:w="80" w:type="dxa"/>
+              <w:bottom w:w="30" w:type="dxa"/>
+              <w:right w:w="80" w:type="dxa"/>
+            </w:tcMar>
+          </w:tcPr>
+          <w:p>
+            <w:r>
+              <w:rPr>
+                <w:rFonts w:ascii="Aptos" w:eastAsia="Aptos" w:hAnsi="Aptos" w:cs="Aptos"/>
+                <w:sz w:val="20"/>
+                <w:szCs w:val="20"/>
+              </w:rPr>
+              <w:t xml:space="preserve"/>
+            </w:r>
+          </w:p>
+        </w:tc>
+        <w:tc>
+          <w:tcPr>
+            <w:tcW w:w="1600" w:type="pct"/>
+            <w:tcMar>
+              <w:top w:w="30" w:type="dxa"/>
+              <w:left w:w="80" w:type="dxa"/>
+              <w:bottom w:w="30" w:type="dxa"/>
+              <w:right w:w="80" w:type="dxa"/>
+            </w:tcMar>
+          </w:tcPr>
+          <w:p>
+            <w:r>
+              <w:rPr>
+                <w:rFonts w:ascii="Aptos" w:eastAsia="Aptos" w:hAnsi="Aptos" w:cs="Aptos"/>
+                <w:sz w:val="20"/>
+                <w:szCs w:val="20"/>
+              </w:rPr>
+              <w:t xml:space="preserve"/>
+            </w:r>
+          </w:p>
+        </w:tc>
+      </w:tr>
+      <w:tr>
+        <w:trPr>
+          <w:cantSplit/>
+        </w:trPr>
+        <w:tc>
+          <w:tcPr>
+            <w:tcW w:w="300" w:type="pct"/>
+            <w:tcMar>
+              <w:top w:w="30" w:type="dxa"/>
+              <w:left w:w="80" w:type="dxa"/>
+              <w:bottom w:w="30" w:type="dxa"/>
+              <w:right w:w="80" w:type="dxa"/>
+            </w:tcMar>
+          </w:tcPr>
+          <w:p>
+            <w:r>
+              <w:rPr>
+                <w:rFonts w:ascii="Aptos" w:eastAsia="Aptos" w:hAnsi="Aptos" w:cs="Aptos"/>
+                <w:sz w:val="20"/>
+                <w:szCs w:val="20"/>
+              </w:rPr>
+              <w:t xml:space="preserve">18</w:t>
+            </w:r>
+          </w:p>
+        </w:tc>
+        <w:tc>
+          <w:tcPr>
+            <w:tcW w:w="2350" w:type="pct"/>
+            <w:tcMar>
+              <w:top w:w="30" w:type="dxa"/>
+              <w:left w:w="80" w:type="dxa"/>
+              <w:bottom w:w="30" w:type="dxa"/>
+              <w:right w:w="80" w:type="dxa"/>
+            </w:tcMar>
+          </w:tcPr>
+          <w:p>
+            <w:r>
+              <w:rPr>
+                <w:rFonts w:ascii="Aptos" w:eastAsia="Aptos" w:hAnsi="Aptos" w:cs="Aptos"/>
+                <w:sz w:val="20"/>
+                <w:szCs w:val="20"/>
+              </w:rPr>
+              <w:t xml:space="preserve"/>
+            </w:r>
+          </w:p>
+        </w:tc>
+        <w:tc>
+          <w:tcPr>
+            <w:tcW w:w="750" w:type="pct"/>
+            <w:tcMar>
+              <w:top w:w="30" w:type="dxa"/>
+              <w:left w:w="80" w:type="dxa"/>
+              <w:bottom w:w="30" w:type="dxa"/>
+              <w:right w:w="80" w:type="dxa"/>
+            </w:tcMar>
+          </w:tcPr>
+          <w:p>
+            <w:r>
+              <w:rPr>
+                <w:rFonts w:ascii="Aptos" w:eastAsia="Aptos" w:hAnsi="Aptos" w:cs="Aptos"/>
+                <w:sz w:val="20"/>
+                <w:szCs w:val="20"/>
+              </w:rPr>
+              <w:t xml:space="preserve"/>
+            </w:r>
+          </w:p>
+        </w:tc>
+        <w:tc>
+          <w:tcPr>
+            <w:tcW w:w="1600" w:type="pct"/>
+            <w:tcMar>
+              <w:top w:w="30" w:type="dxa"/>
+              <w:left w:w="80" w:type="dxa"/>
+              <w:bottom w:w="30" w:type="dxa"/>
+              <w:right w:w="80" w:type="dxa"/>
+            </w:tcMar>
+          </w:tcPr>
+          <w:p>
+            <w:r>
+              <w:rPr>
+                <w:rFonts w:ascii="Aptos" w:eastAsia="Aptos" w:hAnsi="Aptos" w:cs="Aptos"/>
+                <w:sz w:val="20"/>
+                <w:szCs w:val="20"/>
+              </w:rPr>
+              <w:t xml:space="preserve"/>
+            </w:r>
+          </w:p>
+        </w:tc>
+      </w:tr>
+      <w:tr>
+        <w:trPr>
+          <w:cantSplit/>
+        </w:trPr>
+        <w:tc>
+          <w:tcPr>
+            <w:tcW w:w="300" w:type="pct"/>
+            <w:tcMar>
+              <w:top w:w="30" w:type="dxa"/>
+              <w:left w:w="80" w:type="dxa"/>
+              <w:bottom w:w="30" w:type="dxa"/>
+              <w:right w:w="80" w:type="dxa"/>
+            </w:tcMar>
+          </w:tcPr>
+          <w:p>
+            <w:r>
+              <w:rPr>
+                <w:rFonts w:ascii="Aptos" w:eastAsia="Aptos" w:hAnsi="Aptos" w:cs="Aptos"/>
+                <w:sz w:val="20"/>
+                <w:szCs w:val="20"/>
+              </w:rPr>
+              <w:t xml:space="preserve">19</w:t>
+            </w:r>
+          </w:p>
+        </w:tc>
+        <w:tc>
+          <w:tcPr>
+            <w:tcW w:w="2350" w:type="pct"/>
+            <w:tcMar>
+              <w:top w:w="30" w:type="dxa"/>
+              <w:left w:w="80" w:type="dxa"/>
+              <w:bottom w:w="30" w:type="dxa"/>
+              <w:right w:w="80" w:type="dxa"/>
+            </w:tcMar>
+          </w:tcPr>
+          <w:p>
+            <w:r>
+              <w:rPr>
+                <w:rFonts w:ascii="Aptos" w:eastAsia="Aptos" w:hAnsi="Aptos" w:cs="Aptos"/>
+                <w:sz w:val="20"/>
+                <w:szCs w:val="20"/>
+              </w:rPr>
+              <w:t xml:space="preserve"/>
+            </w:r>
+          </w:p>
+        </w:tc>
+        <w:tc>
+          <w:tcPr>
+            <w:tcW w:w="750" w:type="pct"/>
+            <w:tcMar>
+              <w:top w:w="30" w:type="dxa"/>
+              <w:left w:w="80" w:type="dxa"/>
+              <w:bottom w:w="30" w:type="dxa"/>
+              <w:right w:w="80" w:type="dxa"/>
+            </w:tcMar>
+          </w:tcPr>
+          <w:p>
+            <w:r>
+              <w:rPr>
+                <w:rFonts w:ascii="Aptos" w:eastAsia="Aptos" w:hAnsi="Aptos" w:cs="Aptos"/>
+                <w:sz w:val="20"/>
+                <w:szCs w:val="20"/>
+              </w:rPr>
+              <w:t xml:space="preserve"/>
+            </w:r>
+          </w:p>
+        </w:tc>
+        <w:tc>
+          <w:tcPr>
+            <w:tcW w:w="1600" w:type="pct"/>
+            <w:tcMar>
+              <w:top w:w="30" w:type="dxa"/>
+              <w:left w:w="80" w:type="dxa"/>
+              <w:bottom w:w="30" w:type="dxa"/>
+              <w:right w:w="80" w:type="dxa"/>
+            </w:tcMar>
+          </w:tcPr>
+          <w:p>
+            <w:r>
+              <w:rPr>
+                <w:rFonts w:ascii="Aptos" w:eastAsia="Aptos" w:hAnsi="Aptos" w:cs="Aptos"/>
+                <w:sz w:val="20"/>
+                <w:szCs w:val="20"/>
+              </w:rPr>
+              <w:t xml:space="preserve"/>
+            </w:r>
+          </w:p>
+        </w:tc>
+      </w:tr>
+      <w:tr>
+        <w:trPr>
+          <w:cantSplit/>
+        </w:trPr>
+        <w:tc>
+          <w:tcPr>
+            <w:tcW w:w="300" w:type="pct"/>
+            <w:tcMar>
+              <w:top w:w="30" w:type="dxa"/>
+              <w:left w:w="80" w:type="dxa"/>
+              <w:bottom w:w="30" w:type="dxa"/>
+              <w:right w:w="80" w:type="dxa"/>
+            </w:tcMar>
+          </w:tcPr>
+          <w:p>
+            <w:r>
+              <w:rPr>
+                <w:rFonts w:ascii="Aptos" w:eastAsia="Aptos" w:hAnsi="Aptos" w:cs="Aptos"/>
+                <w:sz w:val="20"/>
+                <w:szCs w:val="20"/>
+              </w:rPr>
+              <w:t xml:space="preserve">20</w:t>
+            </w:r>
+          </w:p>
+        </w:tc>
+        <w:tc>
+          <w:tcPr>
+            <w:tcW w:w="2350" w:type="pct"/>
+            <w:tcMar>
+              <w:top w:w="30" w:type="dxa"/>
+              <w:left w:w="80" w:type="dxa"/>
+              <w:bottom w:w="30" w:type="dxa"/>
+              <w:right w:w="80" w:type="dxa"/>
+            </w:tcMar>
+          </w:tcPr>
+          <w:p>
+            <w:r>
+              <w:rPr>
+                <w:rFonts w:ascii="Aptos" w:eastAsia="Aptos" w:hAnsi="Aptos" w:cs="Aptos"/>
+                <w:sz w:val="20"/>
+                <w:szCs w:val="20"/>
+              </w:rPr>
+              <w:t xml:space="preserve"/>
+            </w:r>
+          </w:p>
+        </w:tc>
+        <w:tc>
+          <w:tcPr>
+            <w:tcW w:w="750" w:type="pct"/>
+            <w:tcMar>
+              <w:top w:w="30" w:type="dxa"/>
+              <w:left w:w="80" w:type="dxa"/>
+              <w:bottom w:w="30" w:type="dxa"/>
+              <w:right w:w="80" w:type="dxa"/>
+            </w:tcMar>
+          </w:tcPr>
+          <w:p>
+            <w:r>
+              <w:rPr>
+                <w:rFonts w:ascii="Aptos" w:eastAsia="Aptos" w:hAnsi="Aptos" w:cs="Aptos"/>
+                <w:sz w:val="20"/>
+                <w:szCs w:val="20"/>
+              </w:rPr>
+              <w:t xml:space="preserve"/>
+            </w:r>
+          </w:p>
+        </w:tc>
+        <w:tc>
+          <w:tcPr>
+            <w:tcW w:w="1600" w:type="pct"/>
+            <w:tcMar>
+              <w:top w:w="30" w:type="dxa"/>
+              <w:left w:w="80" w:type="dxa"/>
+              <w:bottom w:w="30" w:type="dxa"/>
+              <w:right w:w="80" w:type="dxa"/>
+            </w:tcMar>
+          </w:tcPr>
+          <w:p>
+            <w:r>
+              <w:rPr>
+                <w:rFonts w:ascii="Aptos" w:eastAsia="Aptos" w:hAnsi="Aptos" w:cs="Aptos"/>
+                <w:sz w:val="20"/>
+                <w:szCs w:val="20"/>
+              </w:rPr>
+              <w:t xml:space="preserve"/>
+            </w:r>
+          </w:p>
+        </w:tc>
+      </w:tr>
+      <w:tr>
+        <w:trPr>
+          <w:cantSplit/>
+        </w:trPr>
+        <w:tc>
+          <w:tcPr>
+            <w:tcW w:w="300" w:type="pct"/>
+            <w:tcMar>
+              <w:top w:w="30" w:type="dxa"/>
+              <w:left w:w="80" w:type="dxa"/>
+              <w:bottom w:w="30" w:type="dxa"/>
+              <w:right w:w="80" w:type="dxa"/>
+            </w:tcMar>
+          </w:tcPr>
+          <w:p>
+            <w:r>
+              <w:rPr>
+                <w:rFonts w:ascii="Aptos" w:eastAsia="Aptos" w:hAnsi="Aptos" w:cs="Aptos"/>
+                <w:sz w:val="20"/>
+                <w:szCs w:val="20"/>
+              </w:rPr>
+              <w:t xml:space="preserve">21</w:t>
+            </w:r>
+          </w:p>
+        </w:tc>
+        <w:tc>
+          <w:tcPr>
+            <w:tcW w:w="2350" w:type="pct"/>
+            <w:tcMar>
+              <w:top w:w="30" w:type="dxa"/>
+              <w:left w:w="80" w:type="dxa"/>
+              <w:bottom w:w="30" w:type="dxa"/>
+              <w:right w:w="80" w:type="dxa"/>
+            </w:tcMar>
+          </w:tcPr>
+          <w:p>
+            <w:r>
+              <w:rPr>
+                <w:rFonts w:ascii="Aptos" w:eastAsia="Aptos" w:hAnsi="Aptos" w:cs="Aptos"/>
+                <w:sz w:val="20"/>
+                <w:szCs w:val="20"/>
+              </w:rPr>
+              <w:t xml:space="preserve"/>
+            </w:r>
+          </w:p>
+        </w:tc>
+        <w:tc>
+          <w:tcPr>
+            <w:tcW w:w="750" w:type="pct"/>
+            <w:tcMar>
+              <w:top w:w="30" w:type="dxa"/>
+              <w:left w:w="80" w:type="dxa"/>
+              <w:bottom w:w="30" w:type="dxa"/>
+              <w:right w:w="80" w:type="dxa"/>
+            </w:tcMar>
+          </w:tcPr>
+          <w:p>
+            <w:r>
+              <w:rPr>
+                <w:rFonts w:ascii="Aptos" w:eastAsia="Aptos" w:hAnsi="Aptos" w:cs="Aptos"/>
+                <w:sz w:val="20"/>
+                <w:szCs w:val="20"/>
+              </w:rPr>
+              <w:t xml:space="preserve"/>
+            </w:r>
+          </w:p>
+        </w:tc>
+        <w:tc>
+          <w:tcPr>
+            <w:tcW w:w="1600" w:type="pct"/>
+            <w:tcMar>
+              <w:top w:w="30" w:type="dxa"/>
+              <w:left w:w="80" w:type="dxa"/>
+              <w:bottom w:w="30" w:type="dxa"/>
+              <w:right w:w="80" w:type="dxa"/>
+            </w:tcMar>
+          </w:tcPr>
+          <w:p>
+            <w:r>
+              <w:rPr>
+                <w:rFonts w:ascii="Aptos" w:eastAsia="Aptos" w:hAnsi="Aptos" w:cs="Aptos"/>
+                <w:sz w:val="20"/>
+                <w:szCs w:val="20"/>
+              </w:rPr>
+              <w:t xml:space="preserve"/>
+            </w:r>
+          </w:p>
+        </w:tc>
+      </w:tr>
+      <w:tr>
+        <w:trPr>
+          <w:cantSplit/>
+        </w:trPr>
+        <w:tc>
+          <w:tcPr>
+            <w:tcW w:w="300" w:type="pct"/>
+            <w:tcMar>
+              <w:top w:w="30" w:type="dxa"/>
+              <w:left w:w="80" w:type="dxa"/>
+              <w:bottom w:w="30" w:type="dxa"/>
+              <w:right w:w="80" w:type="dxa"/>
+            </w:tcMar>
+          </w:tcPr>
+          <w:p>
+            <w:r>
+              <w:rPr>
+                <w:rFonts w:ascii="Aptos" w:eastAsia="Aptos" w:hAnsi="Aptos" w:cs="Aptos"/>
+                <w:sz w:val="20"/>
+                <w:szCs w:val="20"/>
+              </w:rPr>
+              <w:t xml:space="preserve">22</w:t>
+            </w:r>
+          </w:p>
+        </w:tc>
+        <w:tc>
+          <w:tcPr>
+            <w:tcW w:w="2350" w:type="pct"/>
+            <w:tcMar>
+              <w:top w:w="30" w:type="dxa"/>
+              <w:left w:w="80" w:type="dxa"/>
+              <w:bottom w:w="30" w:type="dxa"/>
+              <w:right w:w="80" w:type="dxa"/>
+            </w:tcMar>
+          </w:tcPr>
+          <w:p>
+            <w:r>
+              <w:rPr>
+                <w:rFonts w:ascii="Aptos" w:eastAsia="Aptos" w:hAnsi="Aptos" w:cs="Aptos"/>
+                <w:sz w:val="20"/>
+                <w:szCs w:val="20"/>
+              </w:rPr>
+              <w:t xml:space="preserve"/>
+            </w:r>
+          </w:p>
+        </w:tc>
+        <w:tc>
+          <w:tcPr>
+            <w:tcW w:w="750" w:type="pct"/>
+            <w:tcMar>
+              <w:top w:w="30" w:type="dxa"/>
+              <w:left w:w="80" w:type="dxa"/>
+              <w:bottom w:w="30" w:type="dxa"/>
+              <w:right w:w="80" w:type="dxa"/>
+            </w:tcMar>
+          </w:tcPr>
+          <w:p>
+            <w:r>
+              <w:rPr>
+                <w:rFonts w:ascii="Aptos" w:eastAsia="Aptos" w:hAnsi="Aptos" w:cs="Aptos"/>
+                <w:sz w:val="20"/>
+                <w:szCs w:val="20"/>
+              </w:rPr>
+              <w:t xml:space="preserve"/>
+            </w:r>
+          </w:p>
+        </w:tc>
+        <w:tc>
+          <w:tcPr>
+            <w:tcW w:w="1600" w:type="pct"/>
+            <w:tcMar>
+              <w:top w:w="30" w:type="dxa"/>
+              <w:left w:w="80" w:type="dxa"/>
+              <w:bottom w:w="30" w:type="dxa"/>
+              <w:right w:w="80" w:type="dxa"/>
+            </w:tcMar>
+          </w:tcPr>
+          <w:p>
+            <w:r>
+              <w:rPr>
+                <w:rFonts w:ascii="Aptos" w:eastAsia="Aptos" w:hAnsi="Aptos" w:cs="Aptos"/>
+                <w:sz w:val="20"/>
+                <w:szCs w:val="20"/>
+              </w:rPr>
+              <w:t xml:space="preserve"/>
+            </w:r>
+          </w:p>
+        </w:tc>
+      </w:tr>
+      <w:tr>
+        <w:trPr>
+          <w:cantSplit/>
+        </w:trPr>
+        <w:tc>
+          <w:tcPr>
+            <w:tcW w:w="300" w:type="pct"/>
+            <w:tcMar>
+              <w:top w:w="30" w:type="dxa"/>
+              <w:left w:w="80" w:type="dxa"/>
+              <w:bottom w:w="30" w:type="dxa"/>
+              <w:right w:w="80" w:type="dxa"/>
+            </w:tcMar>
+          </w:tcPr>
+          <w:p>
+            <w:r>
+              <w:rPr>
+                <w:rFonts w:ascii="Aptos" w:eastAsia="Aptos" w:hAnsi="Aptos" w:cs="Aptos"/>
+                <w:sz w:val="20"/>
+                <w:szCs w:val="20"/>
+              </w:rPr>
+              <w:t xml:space="preserve">23</w:t>
+            </w:r>
+          </w:p>
+        </w:tc>
+        <w:tc>
+          <w:tcPr>
+            <w:tcW w:w="2350" w:type="pct"/>
+            <w:tcMar>
+              <w:top w:w="30" w:type="dxa"/>
+              <w:left w:w="80" w:type="dxa"/>
+              <w:bottom w:w="30" w:type="dxa"/>
+              <w:right w:w="80" w:type="dxa"/>
+            </w:tcMar>
+          </w:tcPr>
+          <w:p>
+            <w:r>
+              <w:rPr>
+                <w:rFonts w:ascii="Aptos" w:eastAsia="Aptos" w:hAnsi="Aptos" w:cs="Aptos"/>
+                <w:sz w:val="20"/>
+                <w:szCs w:val="20"/>
+              </w:rPr>
+              <w:t xml:space="preserve"/>
+            </w:r>
+          </w:p>
+        </w:tc>
+        <w:tc>
+          <w:tcPr>
+            <w:tcW w:w="750" w:type="pct"/>
+            <w:tcMar>
+              <w:top w:w="30" w:type="dxa"/>
+              <w:left w:w="80" w:type="dxa"/>
+              <w:bottom w:w="30" w:type="dxa"/>
+              <w:right w:w="80" w:type="dxa"/>
+            </w:tcMar>
+          </w:tcPr>
+          <w:p>
+            <w:r>
+              <w:rPr>
+                <w:rFonts w:ascii="Aptos" w:eastAsia="Aptos" w:hAnsi="Aptos" w:cs="Aptos"/>
+                <w:sz w:val="20"/>
+                <w:szCs w:val="20"/>
+              </w:rPr>
+              <w:t xml:space="preserve"/>
+            </w:r>
+          </w:p>
+        </w:tc>
+        <w:tc>
+          <w:tcPr>
+            <w:tcW w:w="1600" w:type="pct"/>
+            <w:tcMar>
+              <w:top w:w="30" w:type="dxa"/>
+              <w:left w:w="80" w:type="dxa"/>
+              <w:bottom w:w="30" w:type="dxa"/>
+              <w:right w:w="80" w:type="dxa"/>
+            </w:tcMar>
+          </w:tcPr>
+          <w:p>
+            <w:r>
+              <w:rPr>
+                <w:rFonts w:ascii="Aptos" w:eastAsia="Aptos" w:hAnsi="Aptos" w:cs="Aptos"/>
+                <w:sz w:val="20"/>
+                <w:szCs w:val="20"/>
+              </w:rPr>
+              <w:t xml:space="preserve"/>
+            </w:r>
+          </w:p>
+        </w:tc>
+      </w:tr>
+      <w:tr>
+        <w:trPr>
+          <w:cantSplit/>
+        </w:trPr>
+        <w:tc>
+          <w:tcPr>
+            <w:tcW w:w="300" w:type="pct"/>
+            <w:tcMar>
+              <w:top w:w="30" w:type="dxa"/>
+              <w:left w:w="80" w:type="dxa"/>
+              <w:bottom w:w="30" w:type="dxa"/>
+              <w:right w:w="80" w:type="dxa"/>
+            </w:tcMar>
+          </w:tcPr>
+          <w:p>
+            <w:r>
+              <w:rPr>
+                <w:rFonts w:ascii="Aptos" w:eastAsia="Aptos" w:hAnsi="Aptos" w:cs="Aptos"/>
+                <w:sz w:val="20"/>
+                <w:szCs w:val="20"/>
+              </w:rPr>
+              <w:t xml:space="preserve">24</w:t>
+            </w:r>
+          </w:p>
+        </w:tc>
+        <w:tc>
+          <w:tcPr>
+            <w:tcW w:w="2350" w:type="pct"/>
+            <w:tcMar>
+              <w:top w:w="30" w:type="dxa"/>
+              <w:left w:w="80" w:type="dxa"/>
+              <w:bottom w:w="30" w:type="dxa"/>
+              <w:right w:w="80" w:type="dxa"/>
+            </w:tcMar>
+          </w:tcPr>
+          <w:p>
+            <w:r>
+              <w:rPr>
+                <w:rFonts w:ascii="Aptos" w:eastAsia="Aptos" w:hAnsi="Aptos" w:cs="Aptos"/>
+                <w:sz w:val="20"/>
+                <w:szCs w:val="20"/>
+              </w:rPr>
+              <w:t xml:space="preserve"/>
+            </w:r>
+          </w:p>
+        </w:tc>
+        <w:tc>
+          <w:tcPr>
+            <w:tcW w:w="750" w:type="pct"/>
+            <w:tcMar>
+              <w:top w:w="30" w:type="dxa"/>
+              <w:left w:w="80" w:type="dxa"/>
+              <w:bottom w:w="30" w:type="dxa"/>
+              <w:right w:w="80" w:type="dxa"/>
+            </w:tcMar>
+          </w:tcPr>
+          <w:p>
+            <w:r>
+              <w:rPr>
+                <w:rFonts w:ascii="Aptos" w:eastAsia="Aptos" w:hAnsi="Aptos" w:cs="Aptos"/>
+                <w:sz w:val="20"/>
+                <w:szCs w:val="20"/>
+              </w:rPr>
+              <w:t xml:space="preserve"/>
+            </w:r>
+          </w:p>
+        </w:tc>
+        <w:tc>
+          <w:tcPr>
+            <w:tcW w:w="1600" w:type="pct"/>
+            <w:tcMar>
+              <w:top w:w="30" w:type="dxa"/>
+              <w:left w:w="80" w:type="dxa"/>
+              <w:bottom w:w="30" w:type="dxa"/>
+              <w:right w:w="80" w:type="dxa"/>
+            </w:tcMar>
+          </w:tcPr>
+          <w:p>
+            <w:r>
+              <w:rPr>
+                <w:rFonts w:ascii="Aptos" w:eastAsia="Aptos" w:hAnsi="Aptos" w:cs="Aptos"/>
+                <w:sz w:val="20"/>
+                <w:szCs w:val="20"/>
+              </w:rPr>
+              <w:t xml:space="preserve"/>
+            </w:r>
+          </w:p>
+        </w:tc>
+      </w:tr>
+      <w:tr>
+        <w:trPr>
+          <w:cantSplit/>
+        </w:trPr>
+        <w:tc>
+          <w:tcPr>
+            <w:tcW w:w="300" w:type="pct"/>
+            <w:tcMar>
+              <w:top w:w="30" w:type="dxa"/>
+              <w:left w:w="80" w:type="dxa"/>
+              <w:bottom w:w="30" w:type="dxa"/>
+              <w:right w:w="80" w:type="dxa"/>
+            </w:tcMar>
+          </w:tcPr>
+          <w:p>
+            <w:r>
+              <w:rPr>
+                <w:rFonts w:ascii="Aptos" w:eastAsia="Aptos" w:hAnsi="Aptos" w:cs="Aptos"/>
+                <w:sz w:val="20"/>
+                <w:szCs w:val="20"/>
+              </w:rPr>
+              <w:t xml:space="preserve">25</w:t>
+            </w:r>
+          </w:p>
+        </w:tc>
+        <w:tc>
+          <w:tcPr>
+            <w:tcW w:w="2350" w:type="pct"/>
+            <w:tcMar>
+              <w:top w:w="30" w:type="dxa"/>
+              <w:left w:w="80" w:type="dxa"/>
+              <w:bottom w:w="30" w:type="dxa"/>
+              <w:right w:w="80" w:type="dxa"/>
+            </w:tcMar>
+          </w:tcPr>
+          <w:p>
+            <w:r>
+              <w:rPr>
+                <w:rFonts w:ascii="Aptos" w:eastAsia="Aptos" w:hAnsi="Aptos" w:cs="Aptos"/>
+                <w:sz w:val="20"/>
+                <w:szCs w:val="20"/>
+              </w:rPr>
+              <w:t xml:space="preserve"/>
+            </w:r>
+          </w:p>
+        </w:tc>
+        <w:tc>
+          <w:tcPr>
+            <w:tcW w:w="750" w:type="pct"/>
+            <w:tcMar>
+              <w:top w:w="30" w:type="dxa"/>
+              <w:left w:w="80" w:type="dxa"/>
+              <w:bottom w:w="30" w:type="dxa"/>
+              <w:right w:w="80" w:type="dxa"/>
+            </w:tcMar>
+          </w:tcPr>
+          <w:p>
+            <w:r>
+              <w:rPr>
+                <w:rFonts w:ascii="Aptos" w:eastAsia="Aptos" w:hAnsi="Aptos" w:cs="Aptos"/>
+                <w:sz w:val="20"/>
+                <w:szCs w:val="20"/>
+              </w:rPr>
+              <w:t xml:space="preserve"/>
+            </w:r>
+          </w:p>
+        </w:tc>
+        <w:tc>
+          <w:tcPr>
+            <w:tcW w:w="1600" w:type="pct"/>
+            <w:tcMar>
+              <w:top w:w="30" w:type="dxa"/>
+              <w:left w:w="80" w:type="dxa"/>
+              <w:bottom w:w="30" w:type="dxa"/>
+              <w:right w:w="80" w:type="dxa"/>
+            </w:tcMar>
+          </w:tcPr>
+          <w:p>
+            <w:r>
+              <w:rPr>
+                <w:rFonts w:ascii="Aptos" w:eastAsia="Aptos" w:hAnsi="Aptos" w:cs="Aptos"/>
+                <w:sz w:val="20"/>
+                <w:szCs w:val="20"/>
+              </w:rPr>
+              <w:t xml:space="preserve"/>
+            </w:r>
+          </w:p>
+        </w:tc>
+      </w:tr>
+      <w:tr>
+        <w:trPr>
+          <w:cantSplit/>
+        </w:trPr>
+        <w:tc>
+          <w:tcPr>
+            <w:tcW w:w="300" w:type="pct"/>
+            <w:tcMar>
+              <w:top w:w="30" w:type="dxa"/>
+              <w:left w:w="80" w:type="dxa"/>
+              <w:bottom w:w="30" w:type="dxa"/>
+              <w:right w:w="80" w:type="dxa"/>
+            </w:tcMar>
+          </w:tcPr>
+          <w:p>
+            <w:r>
+              <w:rPr>
+                <w:rFonts w:ascii="Aptos" w:eastAsia="Aptos" w:hAnsi="Aptos" w:cs="Aptos"/>
+                <w:sz w:val="20"/>
+                <w:szCs w:val="20"/>
+              </w:rPr>
+              <w:t xml:space="preserve">26</w:t>
+            </w:r>
+          </w:p>
+        </w:tc>
+        <w:tc>
+          <w:tcPr>
+            <w:tcW w:w="2350" w:type="pct"/>
+            <w:tcMar>
+              <w:top w:w="30" w:type="dxa"/>
+              <w:left w:w="80" w:type="dxa"/>
+              <w:bottom w:w="30" w:type="dxa"/>
+              <w:right w:w="80" w:type="dxa"/>
+            </w:tcMar>
+          </w:tcPr>
+          <w:p>
+            <w:r>
+              <w:rPr>
+                <w:rFonts w:ascii="Aptos" w:eastAsia="Aptos" w:hAnsi="Aptos" w:cs="Aptos"/>
+                <w:sz w:val="20"/>
+                <w:szCs w:val="20"/>
+              </w:rPr>
+              <w:t xml:space="preserve"/>
+            </w:r>
+          </w:p>
+        </w:tc>
+        <w:tc>
+          <w:tcPr>
+            <w:tcW w:w="750" w:type="pct"/>
+            <w:tcMar>
+              <w:top w:w="30" w:type="dxa"/>
+              <w:left w:w="80" w:type="dxa"/>
+              <w:bottom w:w="30" w:type="dxa"/>
+              <w:right w:w="80" w:type="dxa"/>
+            </w:tcMar>
+          </w:tcPr>
+          <w:p>
+            <w:r>
+              <w:rPr>
+                <w:rFonts w:ascii="Aptos" w:eastAsia="Aptos" w:hAnsi="Aptos" w:cs="Aptos"/>
+                <w:sz w:val="20"/>
+                <w:szCs w:val="20"/>
+              </w:rPr>
+              <w:t xml:space="preserve"/>
+            </w:r>
+          </w:p>
+        </w:tc>
+        <w:tc>
+          <w:tcPr>
+            <w:tcW w:w="1600" w:type="pct"/>
+            <w:tcMar>
+              <w:top w:w="30" w:type="dxa"/>
+              <w:left w:w="80" w:type="dxa"/>
+              <w:bottom w:w="30" w:type="dxa"/>
+              <w:right w:w="80" w:type="dxa"/>
+            </w:tcMar>
+          </w:tcPr>
+          <w:p>
+            <w:r>
+              <w:rPr>
+                <w:rFonts w:ascii="Aptos" w:eastAsia="Aptos" w:hAnsi="Aptos" w:cs="Aptos"/>
+                <w:sz w:val="20"/>
+                <w:szCs w:val="20"/>
+              </w:rPr>
+              <w:t xml:space="preserve"/>
+            </w:r>
+          </w:p>
+        </w:tc>
+      </w:tr>
+      <w:tr>
+        <w:trPr>
+          <w:cantSplit/>
+        </w:trPr>
+        <w:tc>
+          <w:tcPr>
+            <w:tcW w:w="300" w:type="pct"/>
+            <w:tcMar>
+              <w:top w:w="30" w:type="dxa"/>
+              <w:left w:w="80" w:type="dxa"/>
+              <w:bottom w:w="30" w:type="dxa"/>
+              <w:right w:w="80" w:type="dxa"/>
+            </w:tcMar>
+          </w:tcPr>
+          <w:p>
+            <w:r>
+              <w:rPr>
+                <w:rFonts w:ascii="Aptos" w:eastAsia="Aptos" w:hAnsi="Aptos" w:cs="Aptos"/>
+                <w:sz w:val="20"/>
+                <w:szCs w:val="20"/>
+              </w:rPr>
+              <w:t xml:space="preserve">27</w:t>
+            </w:r>
+          </w:p>
+        </w:tc>
+        <w:tc>
+          <w:tcPr>
+            <w:tcW w:w="2350" w:type="pct"/>
+            <w:tcMar>
+              <w:top w:w="30" w:type="dxa"/>
+              <w:left w:w="80" w:type="dxa"/>
+              <w:bottom w:w="30" w:type="dxa"/>
+              <w:right w:w="80" w:type="dxa"/>
+            </w:tcMar>
+          </w:tcPr>
+          <w:p>
+            <w:r>
+              <w:rPr>
+                <w:rFonts w:ascii="Aptos" w:eastAsia="Aptos" w:hAnsi="Aptos" w:cs="Aptos"/>
+                <w:sz w:val="20"/>
+                <w:szCs w:val="20"/>
+              </w:rPr>
+              <w:t xml:space="preserve"/>
+            </w:r>
+          </w:p>
+        </w:tc>
+        <w:tc>
+          <w:tcPr>
+            <w:tcW w:w="750" w:type="pct"/>
+            <w:tcMar>
+              <w:top w:w="30" w:type="dxa"/>
+              <w:left w:w="80" w:type="dxa"/>
+              <w:bottom w:w="30" w:type="dxa"/>
+              <w:right w:w="80" w:type="dxa"/>
+            </w:tcMar>
+          </w:tcPr>
+          <w:p>
+            <w:r>
+              <w:rPr>
+                <w:rFonts w:ascii="Aptos" w:eastAsia="Aptos" w:hAnsi="Aptos" w:cs="Aptos"/>
+                <w:sz w:val="20"/>
+                <w:szCs w:val="20"/>
+              </w:rPr>
+              <w:t xml:space="preserve"/>
+            </w:r>
+          </w:p>
+        </w:tc>
+        <w:tc>
+          <w:tcPr>
+            <w:tcW w:w="1600" w:type="pct"/>
+            <w:tcMar>
+              <w:top w:w="30" w:type="dxa"/>
+              <w:left w:w="80" w:type="dxa"/>
+              <w:bottom w:w="30" w:type="dxa"/>
+              <w:right w:w="80" w:type="dxa"/>
+            </w:tcMar>
+          </w:tcPr>
+          <w:p>
+            <w:r>
+              <w:rPr>
+                <w:rFonts w:ascii="Aptos" w:eastAsia="Aptos" w:hAnsi="Aptos" w:cs="Aptos"/>
+                <w:sz w:val="20"/>
+                <w:szCs w:val="20"/>
+              </w:rPr>
+              <w:t xml:space="preserve"/>
+            </w:r>
+          </w:p>
+        </w:tc>
+      </w:tr>
+      <w:tr>
+        <w:trPr>
+          <w:cantSplit/>
+        </w:trPr>
+        <w:tc>
+          <w:tcPr>
+            <w:tcW w:w="300" w:type="pct"/>
+            <w:tcMar>
+              <w:top w:w="30" w:type="dxa"/>
+              <w:left w:w="80" w:type="dxa"/>
+              <w:bottom w:w="30" w:type="dxa"/>
+              <w:right w:w="80" w:type="dxa"/>
+            </w:tcMar>
+          </w:tcPr>
+          <w:p>
+            <w:r>
+              <w:rPr>
+                <w:rFonts w:ascii="Aptos" w:eastAsia="Aptos" w:hAnsi="Aptos" w:cs="Aptos"/>
+                <w:sz w:val="20"/>
+                <w:szCs w:val="20"/>
+              </w:rPr>
+              <w:t xml:space="preserve">28</w:t>
+            </w:r>
+          </w:p>
+        </w:tc>
+        <w:tc>
+          <w:tcPr>
+            <w:tcW w:w="2350" w:type="pct"/>
+            <w:tcMar>
+              <w:top w:w="30" w:type="dxa"/>
+              <w:left w:w="80" w:type="dxa"/>
+              <w:bottom w:w="30" w:type="dxa"/>
+              <w:right w:w="80" w:type="dxa"/>
+            </w:tcMar>
+          </w:tcPr>
+          <w:p>
+            <w:r>
+              <w:rPr>
+                <w:rFonts w:ascii="Aptos" w:eastAsia="Aptos" w:hAnsi="Aptos" w:cs="Aptos"/>
+                <w:sz w:val="20"/>
+                <w:szCs w:val="20"/>
+              </w:rPr>
+              <w:t xml:space="preserve"/>
+            </w:r>
+          </w:p>
+        </w:tc>
+        <w:tc>
+          <w:tcPr>
+            <w:tcW w:w="750" w:type="pct"/>
+            <w:tcMar>
+              <w:top w:w="30" w:type="dxa"/>
+              <w:left w:w="80" w:type="dxa"/>
+              <w:bottom w:w="30" w:type="dxa"/>
+              <w:right w:w="80" w:type="dxa"/>
+            </w:tcMar>
+          </w:tcPr>
+          <w:p>
+            <w:r>
+              <w:rPr>
+                <w:rFonts w:ascii="Aptos" w:eastAsia="Aptos" w:hAnsi="Aptos" w:cs="Aptos"/>
+                <w:sz w:val="20"/>
+                <w:szCs w:val="20"/>
+              </w:rPr>
+              <w:t xml:space="preserve"/>
+            </w:r>
+          </w:p>
+        </w:tc>
+        <w:tc>
+          <w:tcPr>
+            <w:tcW w:w="1600" w:type="pct"/>
+            <w:tcMar>
+              <w:top w:w="30" w:type="dxa"/>
+              <w:left w:w="80" w:type="dxa"/>
+              <w:bottom w:w="30" w:type="dxa"/>
+              <w:right w:w="80" w:type="dxa"/>
+            </w:tcMar>
+          </w:tcPr>
+          <w:p>
+            <w:r>
+              <w:rPr>
+                <w:rFonts w:ascii="Aptos" w:eastAsia="Aptos" w:hAnsi="Aptos" w:cs="Aptos"/>
+                <w:sz w:val="20"/>
+                <w:szCs w:val="20"/>
+              </w:rPr>
+              <w:t xml:space="preserve"/>
+            </w:r>
+          </w:p>
+        </w:tc>
+      </w:tr>
+      <w:tr>
+        <w:trPr>
+          <w:cantSplit/>
+        </w:trPr>
+        <w:tc>
+          <w:tcPr>
+            <w:tcW w:w="300" w:type="pct"/>
+            <w:tcMar>
+              <w:top w:w="30" w:type="dxa"/>
+              <w:left w:w="80" w:type="dxa"/>
+              <w:bottom w:w="30" w:type="dxa"/>
+              <w:right w:w="80" w:type="dxa"/>
+            </w:tcMar>
+          </w:tcPr>
+          <w:p>
+            <w:r>
+              <w:rPr>
+                <w:rFonts w:ascii="Aptos" w:eastAsia="Aptos" w:hAnsi="Aptos" w:cs="Aptos"/>
+                <w:sz w:val="20"/>
+                <w:szCs w:val="20"/>
+              </w:rPr>
+              <w:t xml:space="preserve">29</w:t>
+            </w:r>
+          </w:p>
+        </w:tc>
+        <w:tc>
+          <w:tcPr>
+            <w:tcW w:w="2350" w:type="pct"/>
+            <w:tcMar>
+              <w:top w:w="30" w:type="dxa"/>
+              <w:left w:w="80" w:type="dxa"/>
+              <w:bottom w:w="30" w:type="dxa"/>
+              <w:right w:w="80" w:type="dxa"/>
+            </w:tcMar>
+          </w:tcPr>
+          <w:p>
+            <w:r>
+              <w:rPr>
+                <w:rFonts w:ascii="Aptos" w:eastAsia="Aptos" w:hAnsi="Aptos" w:cs="Aptos"/>
+                <w:sz w:val="20"/>
+                <w:szCs w:val="20"/>
+              </w:rPr>
+              <w:t xml:space="preserve"/>
+            </w:r>
+          </w:p>
+        </w:tc>
+        <w:tc>
+          <w:tcPr>
+            <w:tcW w:w="750" w:type="pct"/>
+            <w:tcMar>
+              <w:top w:w="30" w:type="dxa"/>
+              <w:left w:w="80" w:type="dxa"/>
+              <w:bottom w:w="30" w:type="dxa"/>
+              <w:right w:w="80" w:type="dxa"/>
+            </w:tcMar>
+          </w:tcPr>
+          <w:p>
+            <w:r>
+              <w:rPr>
+                <w:rFonts w:ascii="Aptos" w:eastAsia="Aptos" w:hAnsi="Aptos" w:cs="Aptos"/>
+                <w:sz w:val="20"/>
+                <w:szCs w:val="20"/>
+              </w:rPr>
+              <w:t xml:space="preserve"/>
+            </w:r>
+          </w:p>
+        </w:tc>
+        <w:tc>
+          <w:tcPr>
+            <w:tcW w:w="1600" w:type="pct"/>
+            <w:tcMar>
+              <w:top w:w="30" w:type="dxa"/>
+              <w:left w:w="80" w:type="dxa"/>
+              <w:bottom w:w="30" w:type="dxa"/>
+              <w:right w:w="80" w:type="dxa"/>
+            </w:tcMar>
+          </w:tcPr>
+          <w:p>
+            <w:r>
+              <w:rPr>
+                <w:rFonts w:ascii="Aptos" w:eastAsia="Aptos" w:hAnsi="Aptos" w:cs="Aptos"/>
+                <w:sz w:val="20"/>
+                <w:szCs w:val="20"/>
+              </w:rPr>
+              <w:t xml:space="preserve"/>
+            </w:r>
+          </w:p>
+        </w:tc>
+      </w:tr>
+      <w:tr>
+        <w:trPr>
+          <w:cantSplit/>
+        </w:trPr>
+        <w:tc>
+          <w:tcPr>
+            <w:tcW w:w="300" w:type="pct"/>
+            <w:tcMar>
+              <w:top w:w="30" w:type="dxa"/>
+              <w:left w:w="80" w:type="dxa"/>
+              <w:bottom w:w="30" w:type="dxa"/>
+              <w:right w:w="80" w:type="dxa"/>
+            </w:tcMar>
+          </w:tcPr>
+          <w:p>
+            <w:r>
+              <w:rPr>
+                <w:rFonts w:ascii="Aptos" w:eastAsia="Aptos" w:hAnsi="Aptos" w:cs="Aptos"/>
+                <w:sz w:val="20"/>
+                <w:szCs w:val="20"/>
+              </w:rPr>
+              <w:t xml:space="preserve">30</w:t>
+            </w:r>
+          </w:p>
+        </w:tc>
+        <w:tc>
+          <w:tcPr>
+            <w:tcW w:w="2350" w:type="pct"/>
+            <w:tcMar>
+              <w:top w:w="30" w:type="dxa"/>
+              <w:left w:w="80" w:type="dxa"/>
+              <w:bottom w:w="30" w:type="dxa"/>
+              <w:right w:w="80" w:type="dxa"/>
+            </w:tcMar>
+          </w:tcPr>
+          <w:p>
+            <w:r>
+              <w:rPr>
+                <w:rFonts w:ascii="Aptos" w:eastAsia="Aptos" w:hAnsi="Aptos" w:cs="Aptos"/>
+                <w:sz w:val="20"/>
+                <w:szCs w:val="20"/>
+              </w:rPr>
+              <w:t xml:space="preserve"/>
+            </w:r>
+          </w:p>
+        </w:tc>
+        <w:tc>
+          <w:tcPr>
+            <w:tcW w:w="750" w:type="pct"/>
+            <w:tcMar>
+              <w:top w:w="30" w:type="dxa"/>
+              <w:left w:w="80" w:type="dxa"/>
+              <w:bottom w:w="30" w:type="dxa"/>
+              <w:right w:w="80" w:type="dxa"/>
+            </w:tcMar>
+          </w:tcPr>
+          <w:p>
+            <w:r>
+              <w:rPr>
+                <w:rFonts w:ascii="Aptos" w:eastAsia="Aptos" w:hAnsi="Aptos" w:cs="Aptos"/>
+                <w:sz w:val="20"/>
+                <w:szCs w:val="20"/>
+              </w:rPr>
+              <w:t xml:space="preserve"/>
+            </w:r>
+          </w:p>
+        </w:tc>
+        <w:tc>
+          <w:tcPr>
+            <w:tcW w:w="1600" w:type="pct"/>
+            <w:tcMar>
+              <w:top w:w="30" w:type="dxa"/>
+              <w:left w:w="80" w:type="dxa"/>
+              <w:bottom w:w="30" w:type="dxa"/>
+              <w:right w:w="80" w:type="dxa"/>
+            </w:tcMar>
+          </w:tcPr>
+          <w:p>
+            <w:r>
+              <w:rPr>
+                <w:rFonts w:ascii="Aptos" w:eastAsia="Aptos" w:hAnsi="Aptos" w:cs="Aptos"/>
+                <w:sz w:val="20"/>
+                <w:szCs w:val="20"/>
+              </w:rPr>
+              <w:t xml:space="preserve"/>
+            </w:r>
+          </w:p>
+        </w:tc>
+      </w:tr>
+      <w:tr>
+        <w:trPr>
+          <w:cantSplit/>
+        </w:trPr>
+        <w:tc>
+          <w:tcPr>
+            <w:tcW w:w="300" w:type="pct"/>
+            <w:tcMar>
+              <w:top w:w="30" w:type="dxa"/>
+              <w:left w:w="80" w:type="dxa"/>
+              <w:bottom w:w="30" w:type="dxa"/>
+              <w:right w:w="80" w:type="dxa"/>
+            </w:tcMar>
+          </w:tcPr>
+          <w:p>
+            <w:r>
+              <w:rPr>
+                <w:rFonts w:ascii="Aptos" w:eastAsia="Aptos" w:hAnsi="Aptos" w:cs="Aptos"/>
+                <w:sz w:val="20"/>
+                <w:szCs w:val="20"/>
+              </w:rPr>
+              <w:t xml:space="preserve">31</w:t>
+            </w:r>
+          </w:p>
+        </w:tc>
+        <w:tc>
+          <w:tcPr>
+            <w:tcW w:w="2350" w:type="pct"/>
+            <w:tcMar>
+              <w:top w:w="30" w:type="dxa"/>
+              <w:left w:w="80" w:type="dxa"/>
+              <w:bottom w:w="30" w:type="dxa"/>
+              <w:right w:w="80" w:type="dxa"/>
+            </w:tcMar>
+          </w:tcPr>
+          <w:p>
+            <w:r>
+              <w:rPr>
+                <w:rFonts w:ascii="Aptos" w:eastAsia="Aptos" w:hAnsi="Aptos" w:cs="Aptos"/>
+                <w:sz w:val="20"/>
+                <w:szCs w:val="20"/>
+              </w:rPr>
+              <w:t xml:space="preserve"/>
+            </w:r>
+          </w:p>
+        </w:tc>
+        <w:tc>
+          <w:tcPr>
+            <w:tcW w:w="750" w:type="pct"/>
+            <w:tcMar>
+              <w:top w:w="30" w:type="dxa"/>
+              <w:left w:w="80" w:type="dxa"/>
+              <w:bottom w:w="30" w:type="dxa"/>
+              <w:right w:w="80" w:type="dxa"/>
+            </w:tcMar>
+          </w:tcPr>
+          <w:p>
+            <w:r>
+              <w:rPr>
+                <w:rFonts w:ascii="Aptos" w:eastAsia="Aptos" w:hAnsi="Aptos" w:cs="Aptos"/>
+                <w:sz w:val="20"/>
+                <w:szCs w:val="20"/>
+              </w:rPr>
+              <w:t xml:space="preserve"/>
+            </w:r>
+          </w:p>
+        </w:tc>
+        <w:tc>
+          <w:tcPr>
+            <w:tcW w:w="1600" w:type="pct"/>
+            <w:tcMar>
+              <w:top w:w="30" w:type="dxa"/>
+              <w:left w:w="80" w:type="dxa"/>
+              <w:bottom w:w="30" w:type="dxa"/>
+              <w:right w:w="80" w:type="dxa"/>
+            </w:tcMar>
+          </w:tcPr>
+          <w:p>
+            <w:r>
+              <w:rPr>
+                <w:rFonts w:ascii="Aptos" w:eastAsia="Aptos" w:hAnsi="Aptos" w:cs="Aptos"/>
+                <w:sz w:val="20"/>
+                <w:szCs w:val="20"/>
+              </w:rPr>
+              <w:t xml:space="preserve"/>
+            </w:r>
+          </w:p>
+        </w:tc>
+      </w:tr>
+      <w:tr>
+        <w:trPr>
+          <w:cantSplit/>
+        </w:trPr>
+        <w:tc>
+          <w:tcPr>
+            <w:tcW w:w="300" w:type="pct"/>
+            <w:tcMar>
+              <w:top w:w="30" w:type="dxa"/>
+              <w:left w:w="80" w:type="dxa"/>
+              <w:bottom w:w="30" w:type="dxa"/>
+              <w:right w:w="80" w:type="dxa"/>
+            </w:tcMar>
+          </w:tcPr>
+          <w:p>
+            <w:r>
+              <w:rPr>
+                <w:rFonts w:ascii="Aptos" w:eastAsia="Aptos" w:hAnsi="Aptos" w:cs="Aptos"/>
+                <w:sz w:val="20"/>
+                <w:szCs w:val="20"/>
+              </w:rPr>
+              <w:t xml:space="preserve">32</w:t>
+            </w:r>
+          </w:p>
+        </w:tc>
+        <w:tc>
+          <w:tcPr>
+            <w:tcW w:w="2350" w:type="pct"/>
+            <w:tcMar>
+              <w:top w:w="30" w:type="dxa"/>
+              <w:left w:w="80" w:type="dxa"/>
+              <w:bottom w:w="30" w:type="dxa"/>
+              <w:right w:w="80" w:type="dxa"/>
+            </w:tcMar>
+          </w:tcPr>
+          <w:p>
+            <w:r>
+              <w:rPr>
+                <w:rFonts w:ascii="Aptos" w:eastAsia="Aptos" w:hAnsi="Aptos" w:cs="Aptos"/>
+                <w:sz w:val="20"/>
+                <w:szCs w:val="20"/>
+              </w:rPr>
+              <w:t xml:space="preserve"/>
+            </w:r>
+          </w:p>
+        </w:tc>
+        <w:tc>
+          <w:tcPr>
+            <w:tcW w:w="750" w:type="pct"/>
+            <w:tcMar>
+              <w:top w:w="30" w:type="dxa"/>
+              <w:left w:w="80" w:type="dxa"/>
+              <w:bottom w:w="30" w:type="dxa"/>
+              <w:right w:w="80" w:type="dxa"/>
+            </w:tcMar>
+          </w:tcPr>
+          <w:p>
+            <w:r>
+              <w:rPr>
+                <w:rFonts w:ascii="Aptos" w:eastAsia="Aptos" w:hAnsi="Aptos" w:cs="Aptos"/>
+                <w:sz w:val="20"/>
+                <w:szCs w:val="20"/>
+              </w:rPr>
+              <w:t xml:space="preserve"/>
+            </w:r>
+          </w:p>
+        </w:tc>
+        <w:tc>
+          <w:tcPr>
+            <w:tcW w:w="1600" w:type="pct"/>
+            <w:tcMar>
+              <w:top w:w="30" w:type="dxa"/>
+              <w:left w:w="80" w:type="dxa"/>
+              <w:bottom w:w="30" w:type="dxa"/>
+              <w:right w:w="80" w:type="dxa"/>
+            </w:tcMar>
+          </w:tcPr>
+          <w:p>
+            <w:r>
+              <w:rPr>
+                <w:rFonts w:ascii="Aptos" w:eastAsia="Aptos" w:hAnsi="Aptos" w:cs="Aptos"/>
+                <w:sz w:val="20"/>
+                <w:szCs w:val="20"/>
+              </w:rPr>
+              <w:t xml:space="preserve"/>
+            </w:r>
+          </w:p>
+        </w:tc>
+      </w:tr>
+      <w:tr>
+        <w:trPr>
+          <w:cantSplit/>
+        </w:trPr>
+        <w:tc>
+          <w:tcPr>
+            <w:tcW w:w="300" w:type="pct"/>
+            <w:tcMar>
+              <w:top w:w="30" w:type="dxa"/>
+              <w:left w:w="80" w:type="dxa"/>
+              <w:bottom w:w="30" w:type="dxa"/>
+              <w:right w:w="80" w:type="dxa"/>
+            </w:tcMar>
+          </w:tcPr>
+          <w:p>
+            <w:r>
+              <w:rPr>
+                <w:rFonts w:ascii="Aptos" w:eastAsia="Aptos" w:hAnsi="Aptos" w:cs="Aptos"/>
+                <w:sz w:val="20"/>
+                <w:szCs w:val="20"/>
+              </w:rPr>
+              <w:t xml:space="preserve">33</w:t>
+            </w:r>
+          </w:p>
+        </w:tc>
+        <w:tc>
+          <w:tcPr>
+            <w:tcW w:w="2350" w:type="pct"/>
+            <w:tcMar>
+              <w:top w:w="30" w:type="dxa"/>
+              <w:left w:w="80" w:type="dxa"/>
+              <w:bottom w:w="30" w:type="dxa"/>
+              <w:right w:w="80" w:type="dxa"/>
+            </w:tcMar>
+          </w:tcPr>
+          <w:p>
+            <w:r>
+              <w:rPr>
+                <w:rFonts w:ascii="Aptos" w:eastAsia="Aptos" w:hAnsi="Aptos" w:cs="Aptos"/>
+                <w:sz w:val="20"/>
+                <w:szCs w:val="20"/>
+              </w:rPr>
+              <w:t xml:space="preserve"/>
+            </w:r>
+          </w:p>
+        </w:tc>
+        <w:tc>
+          <w:tcPr>
+            <w:tcW w:w="750" w:type="pct"/>
+            <w:tcMar>
+              <w:top w:w="30" w:type="dxa"/>
+              <w:left w:w="80" w:type="dxa"/>
+              <w:bottom w:w="30" w:type="dxa"/>
+              <w:right w:w="80" w:type="dxa"/>
+            </w:tcMar>
+          </w:tcPr>
+          <w:p>
+            <w:r>
+              <w:rPr>
+                <w:rFonts w:ascii="Aptos" w:eastAsia="Aptos" w:hAnsi="Aptos" w:cs="Aptos"/>
+                <w:sz w:val="20"/>
+                <w:szCs w:val="20"/>
+              </w:rPr>
+              <w:t xml:space="preserve"/>
+            </w:r>
+          </w:p>
+        </w:tc>
+        <w:tc>
+          <w:tcPr>
+            <w:tcW w:w="1600" w:type="pct"/>
+            <w:tcMar>
+              <w:top w:w="30" w:type="dxa"/>
+              <w:left w:w="80" w:type="dxa"/>
+              <w:bottom w:w="30" w:type="dxa"/>
+              <w:right w:w="80" w:type="dxa"/>
+            </w:tcMar>
+          </w:tcPr>
+          <w:p>
+            <w:r>
+              <w:rPr>
+                <w:rFonts w:ascii="Aptos" w:eastAsia="Aptos" w:hAnsi="Aptos" w:cs="Aptos"/>
+                <w:sz w:val="20"/>
+                <w:szCs w:val="20"/>
+              </w:rPr>
+              <w:t xml:space="preserve"/>
+            </w:r>
+          </w:p>
+        </w:tc>
+      </w:tr>
+      <w:tr>
+        <w:trPr>
+          <w:cantSplit/>
+        </w:trPr>
+        <w:tc>
+          <w:tcPr>
+            <w:tcW w:w="300" w:type="pct"/>
+            <w:tcMar>
+              <w:top w:w="30" w:type="dxa"/>
+              <w:left w:w="80" w:type="dxa"/>
+              <w:bottom w:w="30" w:type="dxa"/>
+              <w:right w:w="80" w:type="dxa"/>
+            </w:tcMar>
+          </w:tcPr>
+          <w:p>
+            <w:r>
+              <w:rPr>
+                <w:rFonts w:ascii="Aptos" w:eastAsia="Aptos" w:hAnsi="Aptos" w:cs="Aptos"/>
+                <w:sz w:val="20"/>
+                <w:szCs w:val="20"/>
+              </w:rPr>
+              <w:t xml:space="preserve">34</w:t>
+            </w:r>
+          </w:p>
+        </w:tc>
+        <w:tc>
+          <w:tcPr>
+            <w:tcW w:w="2350" w:type="pct"/>
+            <w:tcMar>
+              <w:top w:w="30" w:type="dxa"/>
+              <w:left w:w="80" w:type="dxa"/>
+              <w:bottom w:w="30" w:type="dxa"/>
+              <w:right w:w="80" w:type="dxa"/>
+            </w:tcMar>
+          </w:tcPr>
+          <w:p>
+            <w:r>
+              <w:rPr>
+                <w:rFonts w:ascii="Aptos" w:eastAsia="Aptos" w:hAnsi="Aptos" w:cs="Aptos"/>
+                <w:sz w:val="20"/>
+                <w:szCs w:val="20"/>
+              </w:rPr>
+              <w:t xml:space="preserve"/>
+            </w:r>
+          </w:p>
+        </w:tc>
+        <w:tc>
+          <w:tcPr>
+            <w:tcW w:w="750" w:type="pct"/>
+            <w:tcMar>
+              <w:top w:w="30" w:type="dxa"/>
+              <w:left w:w="80" w:type="dxa"/>
+              <w:bottom w:w="30" w:type="dxa"/>
+              <w:right w:w="80" w:type="dxa"/>
+            </w:tcMar>
+          </w:tcPr>
+          <w:p>
+            <w:r>
+              <w:rPr>
+                <w:rFonts w:ascii="Aptos" w:eastAsia="Aptos" w:hAnsi="Aptos" w:cs="Aptos"/>
+                <w:sz w:val="20"/>
+                <w:szCs w:val="20"/>
+              </w:rPr>
+              <w:t xml:space="preserve"/>
+            </w:r>
+          </w:p>
+        </w:tc>
+        <w:tc>
+          <w:tcPr>
+            <w:tcW w:w="1600" w:type="pct"/>
+            <w:tcMar>
+              <w:top w:w="30" w:type="dxa"/>
+              <w:left w:w="80" w:type="dxa"/>
+              <w:bottom w:w="30" w:type="dxa"/>
+              <w:right w:w="80" w:type="dxa"/>
+            </w:tcMar>
+          </w:tcPr>
+          <w:p>
+            <w:r>
+              <w:rPr>
+                <w:rFonts w:ascii="Aptos" w:eastAsia="Aptos" w:hAnsi="Aptos" w:cs="Aptos"/>
+                <w:sz w:val="20"/>
+                <w:szCs w:val="20"/>
+              </w:rPr>
+              <w:t xml:space="preserve"/>
+            </w:r>
+          </w:p>
+        </w:tc>
+      </w:tr>
+      <w:tr>
+        <w:trPr>
+          <w:cantSplit/>
+        </w:trPr>
+        <w:tc>
+          <w:tcPr>
+            <w:tcW w:w="300" w:type="pct"/>
+            <w:tcMar>
+              <w:top w:w="30" w:type="dxa"/>
+              <w:left w:w="80" w:type="dxa"/>
+              <w:bottom w:w="30" w:type="dxa"/>
+              <w:right w:w="80" w:type="dxa"/>
+            </w:tcMar>
+          </w:tcPr>
+          <w:p>
+            <w:r>
+              <w:rPr>
+                <w:rFonts w:ascii="Aptos" w:eastAsia="Aptos" w:hAnsi="Aptos" w:cs="Aptos"/>
+                <w:sz w:val="20"/>
+                <w:szCs w:val="20"/>
+              </w:rPr>
+              <w:t xml:space="preserve">35</w:t>
+            </w:r>
+          </w:p>
+        </w:tc>
+        <w:tc>
+          <w:tcPr>
+            <w:tcW w:w="2350" w:type="pct"/>
+            <w:tcMar>
+              <w:top w:w="30" w:type="dxa"/>
+              <w:left w:w="80" w:type="dxa"/>
+              <w:bottom w:w="30" w:type="dxa"/>
+              <w:right w:w="80" w:type="dxa"/>
+            </w:tcMar>
+          </w:tcPr>
+          <w:p>
+            <w:r>
+              <w:rPr>
+                <w:rFonts w:ascii="Aptos" w:eastAsia="Aptos" w:hAnsi="Aptos" w:cs="Aptos"/>
+                <w:sz w:val="20"/>
+                <w:szCs w:val="20"/>
+              </w:rPr>
+              <w:t xml:space="preserve"/>
+            </w:r>
+          </w:p>
+        </w:tc>
+        <w:tc>
+          <w:tcPr>
+            <w:tcW w:w="750" w:type="pct"/>
+            <w:tcMar>
+              <w:top w:w="30" w:type="dxa"/>
+              <w:left w:w="80" w:type="dxa"/>
+              <w:bottom w:w="30" w:type="dxa"/>
+              <w:right w:w="80" w:type="dxa"/>
+            </w:tcMar>
+          </w:tcPr>
+          <w:p>
+            <w:r>
+              <w:rPr>
+                <w:rFonts w:ascii="Aptos" w:eastAsia="Aptos" w:hAnsi="Aptos" w:cs="Aptos"/>
+                <w:sz w:val="20"/>
+                <w:szCs w:val="20"/>
+              </w:rPr>
+              <w:t xml:space="preserve"/>
+            </w:r>
+          </w:p>
+        </w:tc>
+        <w:tc>
+          <w:tcPr>
+            <w:tcW w:w="1600" w:type="pct"/>
+            <w:tcMar>
+              <w:top w:w="30" w:type="dxa"/>
+              <w:left w:w="80" w:type="dxa"/>
+              <w:bottom w:w="30" w:type="dxa"/>
+              <w:right w:w="80" w:type="dxa"/>
+            </w:tcMar>
+          </w:tcPr>
+          <w:p>
+            <w:r>
+              <w:rPr>
+                <w:rFonts w:ascii="Aptos" w:eastAsia="Aptos" w:hAnsi="Aptos" w:cs="Aptos"/>
+                <w:sz w:val="20"/>
+                <w:szCs w:val="20"/>
+              </w:rPr>
+              <w:t xml:space="preserve"/>
+            </w:r>
+          </w:p>
+        </w:tc>
+      </w:tr>
+      <w:tr>
+        <w:trPr>
+          <w:cantSplit/>
+        </w:trPr>
+        <w:tc>
+          <w:tcPr>
+            <w:tcW w:w="300" w:type="pct"/>
+            <w:tcMar>
+              <w:top w:w="30" w:type="dxa"/>
+              <w:left w:w="80" w:type="dxa"/>
+              <w:bottom w:w="30" w:type="dxa"/>
+              <w:right w:w="80" w:type="dxa"/>
+            </w:tcMar>
+          </w:tcPr>
+          <w:p>
+            <w:r>
+              <w:rPr>
+                <w:rFonts w:ascii="Aptos" w:eastAsia="Aptos" w:hAnsi="Aptos" w:cs="Aptos"/>
+                <w:sz w:val="20"/>
+                <w:szCs w:val="20"/>
+              </w:rPr>
+              <w:t xml:space="preserve">36</w:t>
+            </w:r>
+          </w:p>
+        </w:tc>
+        <w:tc>
+          <w:tcPr>
+            <w:tcW w:w="2350" w:type="pct"/>
+            <w:tcMar>
+              <w:top w:w="30" w:type="dxa"/>
+              <w:left w:w="80" w:type="dxa"/>
+              <w:bottom w:w="30" w:type="dxa"/>
+              <w:right w:w="80" w:type="dxa"/>
+            </w:tcMar>
+          </w:tcPr>
+          <w:p>
+            <w:r>
+              <w:rPr>
+                <w:rFonts w:ascii="Aptos" w:eastAsia="Aptos" w:hAnsi="Aptos" w:cs="Aptos"/>
+                <w:sz w:val="20"/>
+                <w:szCs w:val="20"/>
+              </w:rPr>
+              <w:t xml:space="preserve"/>
+            </w:r>
+          </w:p>
+        </w:tc>
+        <w:tc>
+          <w:tcPr>
+            <w:tcW w:w="750" w:type="pct"/>
+            <w:tcMar>
+              <w:top w:w="30" w:type="dxa"/>
+              <w:left w:w="80" w:type="dxa"/>
+              <w:bottom w:w="30" w:type="dxa"/>
+              <w:right w:w="80" w:type="dxa"/>
+            </w:tcMar>
+          </w:tcPr>
+          <w:p>
+            <w:r>
+              <w:rPr>
+                <w:rFonts w:ascii="Aptos" w:eastAsia="Aptos" w:hAnsi="Aptos" w:cs="Aptos"/>
+                <w:sz w:val="20"/>
+                <w:szCs w:val="20"/>
+              </w:rPr>
+              <w:t xml:space="preserve"/>
+            </w:r>
+          </w:p>
+        </w:tc>
+        <w:tc>
+          <w:tcPr>
+            <w:tcW w:w="1600" w:type="pct"/>
+            <w:tcMar>
+              <w:top w:w="30" w:type="dxa"/>
+              <w:left w:w="80" w:type="dxa"/>
+              <w:bottom w:w="30" w:type="dxa"/>
+              <w:right w:w="80" w:type="dxa"/>
+            </w:tcMar>
+          </w:tcPr>
+          <w:p>
+            <w:r>
+              <w:rPr>
+                <w:rFonts w:ascii="Aptos" w:eastAsia="Aptos" w:hAnsi="Aptos" w:cs="Aptos"/>
+                <w:sz w:val="20"/>
+                <w:szCs w:val="20"/>
+              </w:rPr>
+              <w:t xml:space="preserve"/>
+            </w:r>
+          </w:p>
+        </w:tc>
+      </w:tr>
+      <w:tr>
+        <w:trPr>
+          <w:cantSplit/>
+        </w:trPr>
+        <w:tc>
+          <w:tcPr>
+            <w:tcW w:w="300" w:type="pct"/>
+            <w:tcMar>
+              <w:top w:w="30" w:type="dxa"/>
+              <w:left w:w="80" w:type="dxa"/>
+              <w:bottom w:w="30" w:type="dxa"/>
+              <w:right w:w="80" w:type="dxa"/>
+            </w:tcMar>
+          </w:tcPr>
+          <w:p>
+            <w:r>
+              <w:rPr>
+                <w:rFonts w:ascii="Aptos" w:eastAsia="Aptos" w:hAnsi="Aptos" w:cs="Aptos"/>
+                <w:sz w:val="20"/>
+                <w:szCs w:val="20"/>
+              </w:rPr>
+              <w:t xml:space="preserve">37</w:t>
+            </w:r>
+          </w:p>
+        </w:tc>
+        <w:tc>
+          <w:tcPr>
+            <w:tcW w:w="2350" w:type="pct"/>
+            <w:tcMar>
+              <w:top w:w="30" w:type="dxa"/>
+              <w:left w:w="80" w:type="dxa"/>
+              <w:bottom w:w="30" w:type="dxa"/>
+              <w:right w:w="80" w:type="dxa"/>
+            </w:tcMar>
+          </w:tcPr>
+          <w:p>
+            <w:r>
+              <w:rPr>
+                <w:rFonts w:ascii="Aptos" w:eastAsia="Aptos" w:hAnsi="Aptos" w:cs="Aptos"/>
+                <w:sz w:val="20"/>
+                <w:szCs w:val="20"/>
+              </w:rPr>
+              <w:t xml:space="preserve"/>
+            </w:r>
+          </w:p>
+        </w:tc>
+        <w:tc>
+          <w:tcPr>
+            <w:tcW w:w="750" w:type="pct"/>
+            <w:tcMar>
+              <w:top w:w="30" w:type="dxa"/>
+              <w:left w:w="80" w:type="dxa"/>
+              <w:bottom w:w="30" w:type="dxa"/>
+              <w:right w:w="80" w:type="dxa"/>
+            </w:tcMar>
+          </w:tcPr>
+          <w:p>
+            <w:r>
+              <w:rPr>
+                <w:rFonts w:ascii="Aptos" w:eastAsia="Aptos" w:hAnsi="Aptos" w:cs="Aptos"/>
+                <w:sz w:val="20"/>
+                <w:szCs w:val="20"/>
+              </w:rPr>
+              <w:t xml:space="preserve"/>
+            </w:r>
+          </w:p>
+        </w:tc>
+        <w:tc>
+          <w:tcPr>
+            <w:tcW w:w="1600" w:type="pct"/>
+            <w:tcMar>
+              <w:top w:w="30" w:type="dxa"/>
+              <w:left w:w="80" w:type="dxa"/>
+              <w:bottom w:w="30" w:type="dxa"/>
+              <w:right w:w="80" w:type="dxa"/>
+            </w:tcMar>
+          </w:tcPr>
+          <w:p>
+            <w:r>
+              <w:rPr>
+                <w:rFonts w:ascii="Aptos" w:eastAsia="Aptos" w:hAnsi="Aptos" w:cs="Aptos"/>
+                <w:sz w:val="20"/>
+                <w:szCs w:val="20"/>
+              </w:rPr>
+              <w:t xml:space="preserve"/>
+            </w:r>
+          </w:p>
+        </w:tc>
+      </w:tr>
+      <w:tr>
+        <w:trPr>
+          <w:cantSplit/>
+        </w:trPr>
+        <w:tc>
+          <w:tcPr>
+            <w:tcW w:w="300" w:type="pct"/>
+            <w:tcMar>
+              <w:top w:w="30" w:type="dxa"/>
+              <w:left w:w="80" w:type="dxa"/>
+              <w:bottom w:w="30" w:type="dxa"/>
+              <w:right w:w="80" w:type="dxa"/>
+            </w:tcMar>
+          </w:tcPr>
+          <w:p>
+            <w:r>
+              <w:rPr>
+                <w:rFonts w:ascii="Aptos" w:eastAsia="Aptos" w:hAnsi="Aptos" w:cs="Aptos"/>
+                <w:sz w:val="20"/>
+                <w:szCs w:val="20"/>
+              </w:rPr>
+              <w:t xml:space="preserve">38</w:t>
+            </w:r>
+          </w:p>
+        </w:tc>
+        <w:tc>
+          <w:tcPr>
+            <w:tcW w:w="2350" w:type="pct"/>
+            <w:tcMar>
+              <w:top w:w="30" w:type="dxa"/>
+              <w:left w:w="80" w:type="dxa"/>
+              <w:bottom w:w="30" w:type="dxa"/>
+              <w:right w:w="80" w:type="dxa"/>
+            </w:tcMar>
+          </w:tcPr>
+          <w:p>
+            <w:r>
+              <w:rPr>
+                <w:rFonts w:ascii="Aptos" w:eastAsia="Aptos" w:hAnsi="Aptos" w:cs="Aptos"/>
+                <w:sz w:val="20"/>
+                <w:szCs w:val="20"/>
+              </w:rPr>
+              <w:t xml:space="preserve"/>
+            </w:r>
+          </w:p>
+        </w:tc>
+        <w:tc>
+          <w:tcPr>
+            <w:tcW w:w="750" w:type="pct"/>
+            <w:tcMar>
+              <w:top w:w="30" w:type="dxa"/>
+              <w:left w:w="80" w:type="dxa"/>
+              <w:bottom w:w="30" w:type="dxa"/>
+              <w:right w:w="80" w:type="dxa"/>
+            </w:tcMar>
+          </w:tcPr>
+          <w:p>
+            <w:r>
+              <w:rPr>
+                <w:rFonts w:ascii="Aptos" w:eastAsia="Aptos" w:hAnsi="Aptos" w:cs="Aptos"/>
+                <w:sz w:val="20"/>
+                <w:szCs w:val="20"/>
+              </w:rPr>
+              <w:t xml:space="preserve"/>
+            </w:r>
+          </w:p>
+        </w:tc>
+        <w:tc>
+          <w:tcPr>
+            <w:tcW w:w="1600" w:type="pct"/>
+            <w:tcMar>
+              <w:top w:w="30" w:type="dxa"/>
+              <w:left w:w="80" w:type="dxa"/>
+              <w:bottom w:w="30" w:type="dxa"/>
+              <w:right w:w="80" w:type="dxa"/>
+            </w:tcMar>
+          </w:tcPr>
+          <w:p>
+            <w:r>
+              <w:rPr>
+                <w:rFonts w:ascii="Aptos" w:eastAsia="Aptos" w:hAnsi="Aptos" w:cs="Aptos"/>
+                <w:sz w:val="20"/>
+                <w:szCs w:val="20"/>
+              </w:rPr>
+              <w:t xml:space="preserve"/>
+            </w:r>
+          </w:p>
+        </w:tc>
+      </w:tr>
+      <w:tr>
+        <w:trPr>
+          <w:cantSplit/>
+        </w:trPr>
+        <w:tc>
+          <w:tcPr>
+            <w:tcW w:w="300" w:type="pct"/>
+            <w:tcMar>
+              <w:top w:w="30" w:type="dxa"/>
+              <w:left w:w="80" w:type="dxa"/>
+              <w:bottom w:w="30" w:type="dxa"/>
+              <w:right w:w="80" w:type="dxa"/>
+            </w:tcMar>
+          </w:tcPr>
+          <w:p>
+            <w:r>
+              <w:rPr>
+                <w:rFonts w:ascii="Aptos" w:eastAsia="Aptos" w:hAnsi="Aptos" w:cs="Aptos"/>
+                <w:sz w:val="20"/>
+                <w:szCs w:val="20"/>
+              </w:rPr>
+              <w:t xml:space="preserve">39</w:t>
+            </w:r>
+          </w:p>
+        </w:tc>
+        <w:tc>
+          <w:tcPr>
+            <w:tcW w:w="2350" w:type="pct"/>
+            <w:tcMar>
+              <w:top w:w="30" w:type="dxa"/>
+              <w:left w:w="80" w:type="dxa"/>
+              <w:bottom w:w="30" w:type="dxa"/>
+              <w:right w:w="80" w:type="dxa"/>
+            </w:tcMar>
+          </w:tcPr>
+          <w:p>
+            <w:r>
+              <w:rPr>
+                <w:rFonts w:ascii="Aptos" w:eastAsia="Aptos" w:hAnsi="Aptos" w:cs="Aptos"/>
+                <w:sz w:val="20"/>
+                <w:szCs w:val="20"/>
+              </w:rPr>
+              <w:t xml:space="preserve"/>
+            </w:r>
+          </w:p>
+        </w:tc>
+        <w:tc>
+          <w:tcPr>
+            <w:tcW w:w="750" w:type="pct"/>
+            <w:tcMar>
+              <w:top w:w="30" w:type="dxa"/>
+              <w:left w:w="80" w:type="dxa"/>
+              <w:bottom w:w="30" w:type="dxa"/>
+              <w:right w:w="80" w:type="dxa"/>
+            </w:tcMar>
+          </w:tcPr>
+          <w:p>
+            <w:r>
+              <w:rPr>
+                <w:rFonts w:ascii="Aptos" w:eastAsia="Aptos" w:hAnsi="Aptos" w:cs="Aptos"/>
+                <w:sz w:val="20"/>
+                <w:szCs w:val="20"/>
+              </w:rPr>
+              <w:t xml:space="preserve"/>
+            </w:r>
+          </w:p>
+        </w:tc>
+        <w:tc>
+          <w:tcPr>
+            <w:tcW w:w="1600" w:type="pct"/>
+            <w:tcMar>
+              <w:top w:w="30" w:type="dxa"/>
+              <w:left w:w="80" w:type="dxa"/>
+              <w:bottom w:w="30" w:type="dxa"/>
+              <w:right w:w="80" w:type="dxa"/>
+            </w:tcMar>
+          </w:tcPr>
+          <w:p>
+            <w:r>
+              <w:rPr>
+                <w:rFonts w:ascii="Aptos" w:eastAsia="Aptos" w:hAnsi="Aptos" w:cs="Aptos"/>
+                <w:sz w:val="20"/>
+                <w:szCs w:val="20"/>
+              </w:rPr>
+              <w:t xml:space="preserve"/>
+            </w:r>
+          </w:p>
+        </w:tc>
+      </w:tr>
+      <w:tr>
+        <w:trPr>
+          <w:cantSplit/>
+        </w:trPr>
+        <w:tc>
+          <w:tcPr>
+            <w:tcW w:w="300" w:type="pct"/>
+            <w:tcMar>
+              <w:top w:w="30" w:type="dxa"/>
+              <w:left w:w="80" w:type="dxa"/>
+              <w:bottom w:w="30" w:type="dxa"/>
+              <w:right w:w="80" w:type="dxa"/>
+            </w:tcMar>
+          </w:tcPr>
+          <w:p>
+            <w:r>
+              <w:rPr>
+                <w:rFonts w:ascii="Aptos" w:eastAsia="Aptos" w:hAnsi="Aptos" w:cs="Aptos"/>
+                <w:sz w:val="20"/>
+                <w:szCs w:val="20"/>
+              </w:rPr>
+              <w:t xml:space="preserve">40</w:t>
+            </w:r>
+          </w:p>
+        </w:tc>
+        <w:tc>
+          <w:tcPr>
+            <w:tcW w:w="2350" w:type="pct"/>
+            <w:tcMar>
+              <w:top w:w="30" w:type="dxa"/>
+              <w:left w:w="80" w:type="dxa"/>
+              <w:bottom w:w="30" w:type="dxa"/>
+              <w:right w:w="80" w:type="dxa"/>
+            </w:tcMar>
+          </w:tcPr>
+          <w:p>
+            <w:r>
+              <w:rPr>
+                <w:rFonts w:ascii="Aptos" w:eastAsia="Aptos" w:hAnsi="Aptos" w:cs="Aptos"/>
+                <w:sz w:val="20"/>
+                <w:szCs w:val="20"/>
+              </w:rPr>
+              <w:t xml:space="preserve"/>
+            </w:r>
+          </w:p>
+        </w:tc>
+        <w:tc>
+          <w:tcPr>
+            <w:tcW w:w="750" w:type="pct"/>
+            <w:tcMar>
+              <w:top w:w="30" w:type="dxa"/>
+              <w:left w:w="80" w:type="dxa"/>
+              <w:bottom w:w="30" w:type="dxa"/>
+              <w:right w:w="80" w:type="dxa"/>
+            </w:tcMar>
+          </w:tcPr>
+          <w:p>
+            <w:r>
+              <w:rPr>
+                <w:rFonts w:ascii="Aptos" w:eastAsia="Aptos" w:hAnsi="Aptos" w:cs="Aptos"/>
+                <w:sz w:val="20"/>
+                <w:szCs w:val="20"/>
+              </w:rPr>
+              <w:t xml:space="preserve"/>
+            </w:r>
+          </w:p>
+        </w:tc>
+        <w:tc>
+          <w:tcPr>
+            <w:tcW w:w="1600" w:type="pct"/>
+            <w:tcMar>
+              <w:top w:w="30" w:type="dxa"/>
+              <w:left w:w="80" w:type="dxa"/>
+              <w:bottom w:w="30" w:type="dxa"/>
+              <w:right w:w="80" w:type="dxa"/>
+            </w:tcMar>
+          </w:tcPr>
+          <w:p>
+            <w:r>
+              <w:rPr>
+                <w:rFonts w:ascii="Aptos" w:eastAsia="Aptos" w:hAnsi="Aptos" w:cs="Aptos"/>
+                <w:sz w:val="20"/>
+                <w:szCs w:val="20"/>
+              </w:rPr>
+              <w:t xml:space="preserve"/>
+            </w:r>
+          </w:p>
+        </w:tc>
+      </w:tr>
+    </w:tbl>
+    <w:p>
+      <w:r>
+        <w:rPr>
+          <w:rFonts w:ascii="Aptos" w:eastAsia="Aptos" w:hAnsi="Aptos" w:cs="Aptos"/>
+        </w:rPr>
+        <w:t xml:space="preserve"/>
       </w:r>
     </w:p>
     <w:sectPr>

</xml_diff>

<commit_message>
added results for tests 41 to 80
</commit_message>
<xml_diff>
--- a/Testing.docx
+++ b/Testing.docx
@@ -37060,6 +37060,3714 @@
                 <w:szCs w:val="20"/>
               </w:rPr>
               <w:t xml:space="preserve">40</w:t>
+            </w:r>
+          </w:p>
+        </w:tc>
+        <w:tc>
+          <w:tcPr>
+            <w:tcW w:w="2350" w:type="pct"/>
+            <w:tcMar>
+              <w:top w:w="30" w:type="dxa"/>
+              <w:left w:w="80" w:type="dxa"/>
+              <w:bottom w:w="30" w:type="dxa"/>
+              <w:right w:w="80" w:type="dxa"/>
+            </w:tcMar>
+          </w:tcPr>
+          <w:p>
+            <w:r>
+              <w:rPr>
+                <w:rFonts w:ascii="Aptos" w:eastAsia="Aptos" w:hAnsi="Aptos" w:cs="Aptos"/>
+                <w:sz w:val="20"/>
+                <w:szCs w:val="20"/>
+              </w:rPr>
+              <w:t xml:space="preserve"/>
+            </w:r>
+          </w:p>
+        </w:tc>
+        <w:tc>
+          <w:tcPr>
+            <w:tcW w:w="750" w:type="pct"/>
+            <w:tcMar>
+              <w:top w:w="30" w:type="dxa"/>
+              <w:left w:w="80" w:type="dxa"/>
+              <w:bottom w:w="30" w:type="dxa"/>
+              <w:right w:w="80" w:type="dxa"/>
+            </w:tcMar>
+          </w:tcPr>
+          <w:p>
+            <w:r>
+              <w:rPr>
+                <w:rFonts w:ascii="Aptos" w:eastAsia="Aptos" w:hAnsi="Aptos" w:cs="Aptos"/>
+                <w:sz w:val="20"/>
+                <w:szCs w:val="20"/>
+              </w:rPr>
+              <w:t xml:space="preserve"/>
+            </w:r>
+          </w:p>
+        </w:tc>
+        <w:tc>
+          <w:tcPr>
+            <w:tcW w:w="1600" w:type="pct"/>
+            <w:tcMar>
+              <w:top w:w="30" w:type="dxa"/>
+              <w:left w:w="80" w:type="dxa"/>
+              <w:bottom w:w="30" w:type="dxa"/>
+              <w:right w:w="80" w:type="dxa"/>
+            </w:tcMar>
+          </w:tcPr>
+          <w:p>
+            <w:r>
+              <w:rPr>
+                <w:rFonts w:ascii="Aptos" w:eastAsia="Aptos" w:hAnsi="Aptos" w:cs="Aptos"/>
+                <w:sz w:val="20"/>
+                <w:szCs w:val="20"/>
+              </w:rPr>
+              <w:t xml:space="preserve"/>
+            </w:r>
+          </w:p>
+        </w:tc>
+      </w:tr>
+    </w:tbl>
+    <w:p>
+      <w:r>
+        <w:rPr>
+          <w:rFonts w:ascii="Aptos" w:eastAsia="Aptos" w:hAnsi="Aptos" w:cs="Aptos"/>
+        </w:rPr>
+        <w:t xml:space="preserve"/>
+      </w:r>
+    </w:p>
+    <w:p>
+      <w:pPr>
+        <w:pStyle w:val="Heading3"/>
+      </w:pPr>
+      <w:r>
+        <w:rPr>
+          <w:rFonts w:ascii="Aptos Display" w:eastAsia="Aptos Display" w:hAnsi="Aptos Display" w:cs="Aptos Display"/>
+          <w:b/>
+          <w:bCs/>
+          <w:color w:val="000000"/>
+        </w:rPr>
+        <w:t xml:space="preserve">Results for tests 41 to 80</w:t>
+      </w:r>
+    </w:p>
+    <w:tbl>
+      <w:tblPr>
+        <w:tblW w:w="5000" w:type="pct"/>
+        <w:tblBorders>
+          <w:top w:val="single" w:sz="4" w:space="0" w:color="808080"/>
+          <w:left w:val="single" w:sz="4" w:space="0" w:color="808080"/>
+          <w:bottom w:val="single" w:sz="4" w:space="0" w:color="808080"/>
+          <w:right w:val="single" w:sz="4" w:space="0" w:color="808080"/>
+          <w:insideH w:val="single" w:sz="4" w:space="0" w:color="808080"/>
+          <w:insideV w:val="single" w:sz="4" w:space="0" w:color="808080"/>
+        </w:tblBorders>
+        <w:tblCellMar>
+          <w:left w:w="10" w:type="dxa"/>
+          <w:right w:w="10" w:type="dxa"/>
+        </w:tblCellMar>
+        <w:tblLook w:val="0000" w:firstRow="0" w:lastRow="0" w:firstColumn="0" w:lastColumn="0" w:noHBand="0" w:noVBand="0"/>
+      </w:tblPr>
+      <w:tblGrid>
+        <w:gridCol w:w="561"/>
+        <w:gridCol w:w="4394"/>
+        <w:gridCol w:w="1402"/>
+        <w:gridCol w:w="2992"/>
+      </w:tblGrid>
+      <w:tr>
+        <w:trPr>
+          <w:cantSplit/>
+          <w:tblHeader/>
+        </w:trPr>
+        <w:tc>
+          <w:tcPr>
+            <w:tcW w:w="300" w:type="pct"/>
+            <w:shd w:val="clear" w:color="auto" w:fill="F2CEED" w:themeFill="accent5" w:themeFillTint="33"/>
+            <w:tcMar>
+              <w:top w:w="30" w:type="dxa"/>
+              <w:left w:w="80" w:type="dxa"/>
+              <w:bottom w:w="30" w:type="dxa"/>
+              <w:right w:w="80" w:type="dxa"/>
+            </w:tcMar>
+          </w:tcPr>
+          <w:p>
+            <w:r>
+              <w:rPr>
+                <w:rFonts w:ascii="Aptos" w:eastAsia="Aptos" w:hAnsi="Aptos" w:cs="Aptos"/>
+                <w:b/>
+                <w:bCs/>
+                <w:sz w:val="20"/>
+                <w:szCs w:val="20"/>
+              </w:rPr>
+              <w:t xml:space="preserve">No.</w:t>
+            </w:r>
+          </w:p>
+        </w:tc>
+        <w:tc>
+          <w:tcPr>
+            <w:tcW w:w="2350" w:type="pct"/>
+            <w:shd w:val="clear" w:color="auto" w:fill="F2CEED" w:themeFill="accent5" w:themeFillTint="33"/>
+            <w:tcMar>
+              <w:top w:w="30" w:type="dxa"/>
+              <w:left w:w="80" w:type="dxa"/>
+              <w:bottom w:w="30" w:type="dxa"/>
+              <w:right w:w="80" w:type="dxa"/>
+            </w:tcMar>
+          </w:tcPr>
+          <w:p>
+            <w:r>
+              <w:rPr>
+                <w:rFonts w:ascii="Aptos" w:eastAsia="Aptos" w:hAnsi="Aptos" w:cs="Aptos"/>
+                <w:b/>
+                <w:bCs/>
+                <w:sz w:val="20"/>
+                <w:szCs w:val="20"/>
+              </w:rPr>
+              <w:t xml:space="preserve">Actual Result</w:t>
+            </w:r>
+          </w:p>
+        </w:tc>
+        <w:tc>
+          <w:tcPr>
+            <w:tcW w:w="750" w:type="pct"/>
+            <w:shd w:val="clear" w:color="auto" w:fill="F2CEED" w:themeFill="accent5" w:themeFillTint="33"/>
+            <w:tcMar>
+              <w:top w:w="30" w:type="dxa"/>
+              <w:left w:w="80" w:type="dxa"/>
+              <w:bottom w:w="30" w:type="dxa"/>
+              <w:right w:w="80" w:type="dxa"/>
+            </w:tcMar>
+          </w:tcPr>
+          <w:p>
+            <w:r>
+              <w:rPr>
+                <w:rFonts w:ascii="Aptos" w:eastAsia="Aptos" w:hAnsi="Aptos" w:cs="Aptos"/>
+                <w:b/>
+                <w:bCs/>
+                <w:sz w:val="20"/>
+                <w:szCs w:val="20"/>
+              </w:rPr>
+              <w:t xml:space="preserve">Pass or Fail</w:t>
+            </w:r>
+          </w:p>
+        </w:tc>
+        <w:tc>
+          <w:tcPr>
+            <w:tcW w:w="1600" w:type="pct"/>
+            <w:shd w:val="clear" w:color="auto" w:fill="F2CEED" w:themeFill="accent5" w:themeFillTint="33"/>
+            <w:tcMar>
+              <w:top w:w="30" w:type="dxa"/>
+              <w:left w:w="80" w:type="dxa"/>
+              <w:bottom w:w="30" w:type="dxa"/>
+              <w:right w:w="80" w:type="dxa"/>
+            </w:tcMar>
+          </w:tcPr>
+          <w:p>
+            <w:r>
+              <w:rPr>
+                <w:rFonts w:ascii="Aptos" w:eastAsia="Aptos" w:hAnsi="Aptos" w:cs="Aptos"/>
+                <w:b/>
+                <w:bCs/>
+                <w:sz w:val="20"/>
+                <w:szCs w:val="20"/>
+              </w:rPr>
+              <w:t xml:space="preserve">Evidence</w:t>
+            </w:r>
+          </w:p>
+        </w:tc>
+      </w:tr>
+      <w:tr>
+        <w:trPr>
+          <w:cantSplit/>
+        </w:trPr>
+        <w:tc>
+          <w:tcPr>
+            <w:tcW w:w="300" w:type="pct"/>
+            <w:tcMar>
+              <w:top w:w="30" w:type="dxa"/>
+              <w:left w:w="80" w:type="dxa"/>
+              <w:bottom w:w="30" w:type="dxa"/>
+              <w:right w:w="80" w:type="dxa"/>
+            </w:tcMar>
+          </w:tcPr>
+          <w:p>
+            <w:r>
+              <w:rPr>
+                <w:rFonts w:ascii="Aptos" w:eastAsia="Aptos" w:hAnsi="Aptos" w:cs="Aptos"/>
+                <w:sz w:val="20"/>
+                <w:szCs w:val="20"/>
+              </w:rPr>
+              <w:t xml:space="preserve">41</w:t>
+            </w:r>
+          </w:p>
+        </w:tc>
+        <w:tc>
+          <w:tcPr>
+            <w:tcW w:w="2350" w:type="pct"/>
+            <w:tcMar>
+              <w:top w:w="30" w:type="dxa"/>
+              <w:left w:w="80" w:type="dxa"/>
+              <w:bottom w:w="30" w:type="dxa"/>
+              <w:right w:w="80" w:type="dxa"/>
+            </w:tcMar>
+          </w:tcPr>
+          <w:p>
+            <w:r>
+              <w:rPr>
+                <w:rFonts w:ascii="Aptos" w:eastAsia="Aptos" w:hAnsi="Aptos" w:cs="Aptos"/>
+                <w:sz w:val="20"/>
+                <w:szCs w:val="20"/>
+              </w:rPr>
+              <w:t xml:space="preserve"/>
+            </w:r>
+          </w:p>
+        </w:tc>
+        <w:tc>
+          <w:tcPr>
+            <w:tcW w:w="750" w:type="pct"/>
+            <w:tcMar>
+              <w:top w:w="30" w:type="dxa"/>
+              <w:left w:w="80" w:type="dxa"/>
+              <w:bottom w:w="30" w:type="dxa"/>
+              <w:right w:w="80" w:type="dxa"/>
+            </w:tcMar>
+          </w:tcPr>
+          <w:p>
+            <w:r>
+              <w:rPr>
+                <w:rFonts w:ascii="Aptos" w:eastAsia="Aptos" w:hAnsi="Aptos" w:cs="Aptos"/>
+                <w:sz w:val="20"/>
+                <w:szCs w:val="20"/>
+              </w:rPr>
+              <w:t xml:space="preserve"/>
+            </w:r>
+          </w:p>
+        </w:tc>
+        <w:tc>
+          <w:tcPr>
+            <w:tcW w:w="1600" w:type="pct"/>
+            <w:tcMar>
+              <w:top w:w="30" w:type="dxa"/>
+              <w:left w:w="80" w:type="dxa"/>
+              <w:bottom w:w="30" w:type="dxa"/>
+              <w:right w:w="80" w:type="dxa"/>
+            </w:tcMar>
+          </w:tcPr>
+          <w:p>
+            <w:r>
+              <w:rPr>
+                <w:rFonts w:ascii="Aptos" w:eastAsia="Aptos" w:hAnsi="Aptos" w:cs="Aptos"/>
+                <w:sz w:val="20"/>
+                <w:szCs w:val="20"/>
+              </w:rPr>
+              <w:t xml:space="preserve"/>
+            </w:r>
+          </w:p>
+        </w:tc>
+      </w:tr>
+      <w:tr>
+        <w:trPr>
+          <w:cantSplit/>
+        </w:trPr>
+        <w:tc>
+          <w:tcPr>
+            <w:tcW w:w="300" w:type="pct"/>
+            <w:tcMar>
+              <w:top w:w="30" w:type="dxa"/>
+              <w:left w:w="80" w:type="dxa"/>
+              <w:bottom w:w="30" w:type="dxa"/>
+              <w:right w:w="80" w:type="dxa"/>
+            </w:tcMar>
+          </w:tcPr>
+          <w:p>
+            <w:r>
+              <w:rPr>
+                <w:rFonts w:ascii="Aptos" w:eastAsia="Aptos" w:hAnsi="Aptos" w:cs="Aptos"/>
+                <w:sz w:val="20"/>
+                <w:szCs w:val="20"/>
+              </w:rPr>
+              <w:t xml:space="preserve">42</w:t>
+            </w:r>
+          </w:p>
+        </w:tc>
+        <w:tc>
+          <w:tcPr>
+            <w:tcW w:w="2350" w:type="pct"/>
+            <w:tcMar>
+              <w:top w:w="30" w:type="dxa"/>
+              <w:left w:w="80" w:type="dxa"/>
+              <w:bottom w:w="30" w:type="dxa"/>
+              <w:right w:w="80" w:type="dxa"/>
+            </w:tcMar>
+          </w:tcPr>
+          <w:p>
+            <w:r>
+              <w:rPr>
+                <w:rFonts w:ascii="Aptos" w:eastAsia="Aptos" w:hAnsi="Aptos" w:cs="Aptos"/>
+                <w:sz w:val="20"/>
+                <w:szCs w:val="20"/>
+              </w:rPr>
+              <w:t xml:space="preserve"/>
+            </w:r>
+          </w:p>
+        </w:tc>
+        <w:tc>
+          <w:tcPr>
+            <w:tcW w:w="750" w:type="pct"/>
+            <w:tcMar>
+              <w:top w:w="30" w:type="dxa"/>
+              <w:left w:w="80" w:type="dxa"/>
+              <w:bottom w:w="30" w:type="dxa"/>
+              <w:right w:w="80" w:type="dxa"/>
+            </w:tcMar>
+          </w:tcPr>
+          <w:p>
+            <w:r>
+              <w:rPr>
+                <w:rFonts w:ascii="Aptos" w:eastAsia="Aptos" w:hAnsi="Aptos" w:cs="Aptos"/>
+                <w:sz w:val="20"/>
+                <w:szCs w:val="20"/>
+              </w:rPr>
+              <w:t xml:space="preserve"/>
+            </w:r>
+          </w:p>
+        </w:tc>
+        <w:tc>
+          <w:tcPr>
+            <w:tcW w:w="1600" w:type="pct"/>
+            <w:tcMar>
+              <w:top w:w="30" w:type="dxa"/>
+              <w:left w:w="80" w:type="dxa"/>
+              <w:bottom w:w="30" w:type="dxa"/>
+              <w:right w:w="80" w:type="dxa"/>
+            </w:tcMar>
+          </w:tcPr>
+          <w:p>
+            <w:r>
+              <w:rPr>
+                <w:rFonts w:ascii="Aptos" w:eastAsia="Aptos" w:hAnsi="Aptos" w:cs="Aptos"/>
+                <w:sz w:val="20"/>
+                <w:szCs w:val="20"/>
+              </w:rPr>
+              <w:t xml:space="preserve"/>
+            </w:r>
+          </w:p>
+        </w:tc>
+      </w:tr>
+      <w:tr>
+        <w:trPr>
+          <w:cantSplit/>
+        </w:trPr>
+        <w:tc>
+          <w:tcPr>
+            <w:tcW w:w="300" w:type="pct"/>
+            <w:tcMar>
+              <w:top w:w="30" w:type="dxa"/>
+              <w:left w:w="80" w:type="dxa"/>
+              <w:bottom w:w="30" w:type="dxa"/>
+              <w:right w:w="80" w:type="dxa"/>
+            </w:tcMar>
+          </w:tcPr>
+          <w:p>
+            <w:r>
+              <w:rPr>
+                <w:rFonts w:ascii="Aptos" w:eastAsia="Aptos" w:hAnsi="Aptos" w:cs="Aptos"/>
+                <w:sz w:val="20"/>
+                <w:szCs w:val="20"/>
+              </w:rPr>
+              <w:t xml:space="preserve">43</w:t>
+            </w:r>
+          </w:p>
+        </w:tc>
+        <w:tc>
+          <w:tcPr>
+            <w:tcW w:w="2350" w:type="pct"/>
+            <w:tcMar>
+              <w:top w:w="30" w:type="dxa"/>
+              <w:left w:w="80" w:type="dxa"/>
+              <w:bottom w:w="30" w:type="dxa"/>
+              <w:right w:w="80" w:type="dxa"/>
+            </w:tcMar>
+          </w:tcPr>
+          <w:p>
+            <w:r>
+              <w:rPr>
+                <w:rFonts w:ascii="Aptos" w:eastAsia="Aptos" w:hAnsi="Aptos" w:cs="Aptos"/>
+                <w:sz w:val="20"/>
+                <w:szCs w:val="20"/>
+              </w:rPr>
+              <w:t xml:space="preserve"/>
+            </w:r>
+          </w:p>
+        </w:tc>
+        <w:tc>
+          <w:tcPr>
+            <w:tcW w:w="750" w:type="pct"/>
+            <w:tcMar>
+              <w:top w:w="30" w:type="dxa"/>
+              <w:left w:w="80" w:type="dxa"/>
+              <w:bottom w:w="30" w:type="dxa"/>
+              <w:right w:w="80" w:type="dxa"/>
+            </w:tcMar>
+          </w:tcPr>
+          <w:p>
+            <w:r>
+              <w:rPr>
+                <w:rFonts w:ascii="Aptos" w:eastAsia="Aptos" w:hAnsi="Aptos" w:cs="Aptos"/>
+                <w:sz w:val="20"/>
+                <w:szCs w:val="20"/>
+              </w:rPr>
+              <w:t xml:space="preserve"/>
+            </w:r>
+          </w:p>
+        </w:tc>
+        <w:tc>
+          <w:tcPr>
+            <w:tcW w:w="1600" w:type="pct"/>
+            <w:tcMar>
+              <w:top w:w="30" w:type="dxa"/>
+              <w:left w:w="80" w:type="dxa"/>
+              <w:bottom w:w="30" w:type="dxa"/>
+              <w:right w:w="80" w:type="dxa"/>
+            </w:tcMar>
+          </w:tcPr>
+          <w:p>
+            <w:r>
+              <w:rPr>
+                <w:rFonts w:ascii="Aptos" w:eastAsia="Aptos" w:hAnsi="Aptos" w:cs="Aptos"/>
+                <w:sz w:val="20"/>
+                <w:szCs w:val="20"/>
+              </w:rPr>
+              <w:t xml:space="preserve"/>
+            </w:r>
+          </w:p>
+        </w:tc>
+      </w:tr>
+      <w:tr>
+        <w:trPr>
+          <w:cantSplit/>
+        </w:trPr>
+        <w:tc>
+          <w:tcPr>
+            <w:tcW w:w="300" w:type="pct"/>
+            <w:tcMar>
+              <w:top w:w="30" w:type="dxa"/>
+              <w:left w:w="80" w:type="dxa"/>
+              <w:bottom w:w="30" w:type="dxa"/>
+              <w:right w:w="80" w:type="dxa"/>
+            </w:tcMar>
+          </w:tcPr>
+          <w:p>
+            <w:r>
+              <w:rPr>
+                <w:rFonts w:ascii="Aptos" w:eastAsia="Aptos" w:hAnsi="Aptos" w:cs="Aptos"/>
+                <w:sz w:val="20"/>
+                <w:szCs w:val="20"/>
+              </w:rPr>
+              <w:t xml:space="preserve">44</w:t>
+            </w:r>
+          </w:p>
+        </w:tc>
+        <w:tc>
+          <w:tcPr>
+            <w:tcW w:w="2350" w:type="pct"/>
+            <w:tcMar>
+              <w:top w:w="30" w:type="dxa"/>
+              <w:left w:w="80" w:type="dxa"/>
+              <w:bottom w:w="30" w:type="dxa"/>
+              <w:right w:w="80" w:type="dxa"/>
+            </w:tcMar>
+          </w:tcPr>
+          <w:p>
+            <w:r>
+              <w:rPr>
+                <w:rFonts w:ascii="Aptos" w:eastAsia="Aptos" w:hAnsi="Aptos" w:cs="Aptos"/>
+                <w:sz w:val="20"/>
+                <w:szCs w:val="20"/>
+              </w:rPr>
+              <w:t xml:space="preserve"/>
+            </w:r>
+          </w:p>
+        </w:tc>
+        <w:tc>
+          <w:tcPr>
+            <w:tcW w:w="750" w:type="pct"/>
+            <w:tcMar>
+              <w:top w:w="30" w:type="dxa"/>
+              <w:left w:w="80" w:type="dxa"/>
+              <w:bottom w:w="30" w:type="dxa"/>
+              <w:right w:w="80" w:type="dxa"/>
+            </w:tcMar>
+          </w:tcPr>
+          <w:p>
+            <w:r>
+              <w:rPr>
+                <w:rFonts w:ascii="Aptos" w:eastAsia="Aptos" w:hAnsi="Aptos" w:cs="Aptos"/>
+                <w:sz w:val="20"/>
+                <w:szCs w:val="20"/>
+              </w:rPr>
+              <w:t xml:space="preserve"/>
+            </w:r>
+          </w:p>
+        </w:tc>
+        <w:tc>
+          <w:tcPr>
+            <w:tcW w:w="1600" w:type="pct"/>
+            <w:tcMar>
+              <w:top w:w="30" w:type="dxa"/>
+              <w:left w:w="80" w:type="dxa"/>
+              <w:bottom w:w="30" w:type="dxa"/>
+              <w:right w:w="80" w:type="dxa"/>
+            </w:tcMar>
+          </w:tcPr>
+          <w:p>
+            <w:r>
+              <w:rPr>
+                <w:rFonts w:ascii="Aptos" w:eastAsia="Aptos" w:hAnsi="Aptos" w:cs="Aptos"/>
+                <w:sz w:val="20"/>
+                <w:szCs w:val="20"/>
+              </w:rPr>
+              <w:t xml:space="preserve"/>
+            </w:r>
+          </w:p>
+        </w:tc>
+      </w:tr>
+      <w:tr>
+        <w:trPr>
+          <w:cantSplit/>
+        </w:trPr>
+        <w:tc>
+          <w:tcPr>
+            <w:tcW w:w="300" w:type="pct"/>
+            <w:tcMar>
+              <w:top w:w="30" w:type="dxa"/>
+              <w:left w:w="80" w:type="dxa"/>
+              <w:bottom w:w="30" w:type="dxa"/>
+              <w:right w:w="80" w:type="dxa"/>
+            </w:tcMar>
+          </w:tcPr>
+          <w:p>
+            <w:r>
+              <w:rPr>
+                <w:rFonts w:ascii="Aptos" w:eastAsia="Aptos" w:hAnsi="Aptos" w:cs="Aptos"/>
+                <w:sz w:val="20"/>
+                <w:szCs w:val="20"/>
+              </w:rPr>
+              <w:t xml:space="preserve">45</w:t>
+            </w:r>
+          </w:p>
+        </w:tc>
+        <w:tc>
+          <w:tcPr>
+            <w:tcW w:w="2350" w:type="pct"/>
+            <w:tcMar>
+              <w:top w:w="30" w:type="dxa"/>
+              <w:left w:w="80" w:type="dxa"/>
+              <w:bottom w:w="30" w:type="dxa"/>
+              <w:right w:w="80" w:type="dxa"/>
+            </w:tcMar>
+          </w:tcPr>
+          <w:p>
+            <w:r>
+              <w:rPr>
+                <w:rFonts w:ascii="Aptos" w:eastAsia="Aptos" w:hAnsi="Aptos" w:cs="Aptos"/>
+                <w:sz w:val="20"/>
+                <w:szCs w:val="20"/>
+              </w:rPr>
+              <w:t xml:space="preserve"/>
+            </w:r>
+          </w:p>
+        </w:tc>
+        <w:tc>
+          <w:tcPr>
+            <w:tcW w:w="750" w:type="pct"/>
+            <w:tcMar>
+              <w:top w:w="30" w:type="dxa"/>
+              <w:left w:w="80" w:type="dxa"/>
+              <w:bottom w:w="30" w:type="dxa"/>
+              <w:right w:w="80" w:type="dxa"/>
+            </w:tcMar>
+          </w:tcPr>
+          <w:p>
+            <w:r>
+              <w:rPr>
+                <w:rFonts w:ascii="Aptos" w:eastAsia="Aptos" w:hAnsi="Aptos" w:cs="Aptos"/>
+                <w:sz w:val="20"/>
+                <w:szCs w:val="20"/>
+              </w:rPr>
+              <w:t xml:space="preserve"/>
+            </w:r>
+          </w:p>
+        </w:tc>
+        <w:tc>
+          <w:tcPr>
+            <w:tcW w:w="1600" w:type="pct"/>
+            <w:tcMar>
+              <w:top w:w="30" w:type="dxa"/>
+              <w:left w:w="80" w:type="dxa"/>
+              <w:bottom w:w="30" w:type="dxa"/>
+              <w:right w:w="80" w:type="dxa"/>
+            </w:tcMar>
+          </w:tcPr>
+          <w:p>
+            <w:r>
+              <w:rPr>
+                <w:rFonts w:ascii="Aptos" w:eastAsia="Aptos" w:hAnsi="Aptos" w:cs="Aptos"/>
+                <w:sz w:val="20"/>
+                <w:szCs w:val="20"/>
+              </w:rPr>
+              <w:t xml:space="preserve"/>
+            </w:r>
+          </w:p>
+        </w:tc>
+      </w:tr>
+      <w:tr>
+        <w:trPr>
+          <w:cantSplit/>
+        </w:trPr>
+        <w:tc>
+          <w:tcPr>
+            <w:tcW w:w="300" w:type="pct"/>
+            <w:tcMar>
+              <w:top w:w="30" w:type="dxa"/>
+              <w:left w:w="80" w:type="dxa"/>
+              <w:bottom w:w="30" w:type="dxa"/>
+              <w:right w:w="80" w:type="dxa"/>
+            </w:tcMar>
+          </w:tcPr>
+          <w:p>
+            <w:r>
+              <w:rPr>
+                <w:rFonts w:ascii="Aptos" w:eastAsia="Aptos" w:hAnsi="Aptos" w:cs="Aptos"/>
+                <w:sz w:val="20"/>
+                <w:szCs w:val="20"/>
+              </w:rPr>
+              <w:t xml:space="preserve">46</w:t>
+            </w:r>
+          </w:p>
+        </w:tc>
+        <w:tc>
+          <w:tcPr>
+            <w:tcW w:w="2350" w:type="pct"/>
+            <w:tcMar>
+              <w:top w:w="30" w:type="dxa"/>
+              <w:left w:w="80" w:type="dxa"/>
+              <w:bottom w:w="30" w:type="dxa"/>
+              <w:right w:w="80" w:type="dxa"/>
+            </w:tcMar>
+          </w:tcPr>
+          <w:p>
+            <w:r>
+              <w:rPr>
+                <w:rFonts w:ascii="Aptos" w:eastAsia="Aptos" w:hAnsi="Aptos" w:cs="Aptos"/>
+                <w:sz w:val="20"/>
+                <w:szCs w:val="20"/>
+              </w:rPr>
+              <w:t xml:space="preserve"/>
+            </w:r>
+          </w:p>
+        </w:tc>
+        <w:tc>
+          <w:tcPr>
+            <w:tcW w:w="750" w:type="pct"/>
+            <w:tcMar>
+              <w:top w:w="30" w:type="dxa"/>
+              <w:left w:w="80" w:type="dxa"/>
+              <w:bottom w:w="30" w:type="dxa"/>
+              <w:right w:w="80" w:type="dxa"/>
+            </w:tcMar>
+          </w:tcPr>
+          <w:p>
+            <w:r>
+              <w:rPr>
+                <w:rFonts w:ascii="Aptos" w:eastAsia="Aptos" w:hAnsi="Aptos" w:cs="Aptos"/>
+                <w:sz w:val="20"/>
+                <w:szCs w:val="20"/>
+              </w:rPr>
+              <w:t xml:space="preserve"/>
+            </w:r>
+          </w:p>
+        </w:tc>
+        <w:tc>
+          <w:tcPr>
+            <w:tcW w:w="1600" w:type="pct"/>
+            <w:tcMar>
+              <w:top w:w="30" w:type="dxa"/>
+              <w:left w:w="80" w:type="dxa"/>
+              <w:bottom w:w="30" w:type="dxa"/>
+              <w:right w:w="80" w:type="dxa"/>
+            </w:tcMar>
+          </w:tcPr>
+          <w:p>
+            <w:r>
+              <w:rPr>
+                <w:rFonts w:ascii="Aptos" w:eastAsia="Aptos" w:hAnsi="Aptos" w:cs="Aptos"/>
+                <w:sz w:val="20"/>
+                <w:szCs w:val="20"/>
+              </w:rPr>
+              <w:t xml:space="preserve"/>
+            </w:r>
+          </w:p>
+        </w:tc>
+      </w:tr>
+      <w:tr>
+        <w:trPr>
+          <w:cantSplit/>
+        </w:trPr>
+        <w:tc>
+          <w:tcPr>
+            <w:tcW w:w="300" w:type="pct"/>
+            <w:tcMar>
+              <w:top w:w="30" w:type="dxa"/>
+              <w:left w:w="80" w:type="dxa"/>
+              <w:bottom w:w="30" w:type="dxa"/>
+              <w:right w:w="80" w:type="dxa"/>
+            </w:tcMar>
+          </w:tcPr>
+          <w:p>
+            <w:r>
+              <w:rPr>
+                <w:rFonts w:ascii="Aptos" w:eastAsia="Aptos" w:hAnsi="Aptos" w:cs="Aptos"/>
+                <w:sz w:val="20"/>
+                <w:szCs w:val="20"/>
+              </w:rPr>
+              <w:t xml:space="preserve">47</w:t>
+            </w:r>
+          </w:p>
+        </w:tc>
+        <w:tc>
+          <w:tcPr>
+            <w:tcW w:w="2350" w:type="pct"/>
+            <w:tcMar>
+              <w:top w:w="30" w:type="dxa"/>
+              <w:left w:w="80" w:type="dxa"/>
+              <w:bottom w:w="30" w:type="dxa"/>
+              <w:right w:w="80" w:type="dxa"/>
+            </w:tcMar>
+          </w:tcPr>
+          <w:p>
+            <w:r>
+              <w:rPr>
+                <w:rFonts w:ascii="Aptos" w:eastAsia="Aptos" w:hAnsi="Aptos" w:cs="Aptos"/>
+                <w:sz w:val="20"/>
+                <w:szCs w:val="20"/>
+              </w:rPr>
+              <w:t xml:space="preserve"/>
+            </w:r>
+          </w:p>
+        </w:tc>
+        <w:tc>
+          <w:tcPr>
+            <w:tcW w:w="750" w:type="pct"/>
+            <w:tcMar>
+              <w:top w:w="30" w:type="dxa"/>
+              <w:left w:w="80" w:type="dxa"/>
+              <w:bottom w:w="30" w:type="dxa"/>
+              <w:right w:w="80" w:type="dxa"/>
+            </w:tcMar>
+          </w:tcPr>
+          <w:p>
+            <w:r>
+              <w:rPr>
+                <w:rFonts w:ascii="Aptos" w:eastAsia="Aptos" w:hAnsi="Aptos" w:cs="Aptos"/>
+                <w:sz w:val="20"/>
+                <w:szCs w:val="20"/>
+              </w:rPr>
+              <w:t xml:space="preserve"/>
+            </w:r>
+          </w:p>
+        </w:tc>
+        <w:tc>
+          <w:tcPr>
+            <w:tcW w:w="1600" w:type="pct"/>
+            <w:tcMar>
+              <w:top w:w="30" w:type="dxa"/>
+              <w:left w:w="80" w:type="dxa"/>
+              <w:bottom w:w="30" w:type="dxa"/>
+              <w:right w:w="80" w:type="dxa"/>
+            </w:tcMar>
+          </w:tcPr>
+          <w:p>
+            <w:r>
+              <w:rPr>
+                <w:rFonts w:ascii="Aptos" w:eastAsia="Aptos" w:hAnsi="Aptos" w:cs="Aptos"/>
+                <w:sz w:val="20"/>
+                <w:szCs w:val="20"/>
+              </w:rPr>
+              <w:t xml:space="preserve"/>
+            </w:r>
+          </w:p>
+        </w:tc>
+      </w:tr>
+      <w:tr>
+        <w:trPr>
+          <w:cantSplit/>
+        </w:trPr>
+        <w:tc>
+          <w:tcPr>
+            <w:tcW w:w="300" w:type="pct"/>
+            <w:tcMar>
+              <w:top w:w="30" w:type="dxa"/>
+              <w:left w:w="80" w:type="dxa"/>
+              <w:bottom w:w="30" w:type="dxa"/>
+              <w:right w:w="80" w:type="dxa"/>
+            </w:tcMar>
+          </w:tcPr>
+          <w:p>
+            <w:r>
+              <w:rPr>
+                <w:rFonts w:ascii="Aptos" w:eastAsia="Aptos" w:hAnsi="Aptos" w:cs="Aptos"/>
+                <w:sz w:val="20"/>
+                <w:szCs w:val="20"/>
+              </w:rPr>
+              <w:t xml:space="preserve">48</w:t>
+            </w:r>
+          </w:p>
+        </w:tc>
+        <w:tc>
+          <w:tcPr>
+            <w:tcW w:w="2350" w:type="pct"/>
+            <w:tcMar>
+              <w:top w:w="30" w:type="dxa"/>
+              <w:left w:w="80" w:type="dxa"/>
+              <w:bottom w:w="30" w:type="dxa"/>
+              <w:right w:w="80" w:type="dxa"/>
+            </w:tcMar>
+          </w:tcPr>
+          <w:p>
+            <w:r>
+              <w:rPr>
+                <w:rFonts w:ascii="Aptos" w:eastAsia="Aptos" w:hAnsi="Aptos" w:cs="Aptos"/>
+                <w:sz w:val="20"/>
+                <w:szCs w:val="20"/>
+              </w:rPr>
+              <w:t xml:space="preserve"/>
+            </w:r>
+          </w:p>
+        </w:tc>
+        <w:tc>
+          <w:tcPr>
+            <w:tcW w:w="750" w:type="pct"/>
+            <w:tcMar>
+              <w:top w:w="30" w:type="dxa"/>
+              <w:left w:w="80" w:type="dxa"/>
+              <w:bottom w:w="30" w:type="dxa"/>
+              <w:right w:w="80" w:type="dxa"/>
+            </w:tcMar>
+          </w:tcPr>
+          <w:p>
+            <w:r>
+              <w:rPr>
+                <w:rFonts w:ascii="Aptos" w:eastAsia="Aptos" w:hAnsi="Aptos" w:cs="Aptos"/>
+                <w:sz w:val="20"/>
+                <w:szCs w:val="20"/>
+              </w:rPr>
+              <w:t xml:space="preserve"/>
+            </w:r>
+          </w:p>
+        </w:tc>
+        <w:tc>
+          <w:tcPr>
+            <w:tcW w:w="1600" w:type="pct"/>
+            <w:tcMar>
+              <w:top w:w="30" w:type="dxa"/>
+              <w:left w:w="80" w:type="dxa"/>
+              <w:bottom w:w="30" w:type="dxa"/>
+              <w:right w:w="80" w:type="dxa"/>
+            </w:tcMar>
+          </w:tcPr>
+          <w:p>
+            <w:r>
+              <w:rPr>
+                <w:rFonts w:ascii="Aptos" w:eastAsia="Aptos" w:hAnsi="Aptos" w:cs="Aptos"/>
+                <w:sz w:val="20"/>
+                <w:szCs w:val="20"/>
+              </w:rPr>
+              <w:t xml:space="preserve"/>
+            </w:r>
+          </w:p>
+        </w:tc>
+      </w:tr>
+      <w:tr>
+        <w:trPr>
+          <w:cantSplit/>
+        </w:trPr>
+        <w:tc>
+          <w:tcPr>
+            <w:tcW w:w="300" w:type="pct"/>
+            <w:tcMar>
+              <w:top w:w="30" w:type="dxa"/>
+              <w:left w:w="80" w:type="dxa"/>
+              <w:bottom w:w="30" w:type="dxa"/>
+              <w:right w:w="80" w:type="dxa"/>
+            </w:tcMar>
+          </w:tcPr>
+          <w:p>
+            <w:r>
+              <w:rPr>
+                <w:rFonts w:ascii="Aptos" w:eastAsia="Aptos" w:hAnsi="Aptos" w:cs="Aptos"/>
+                <w:sz w:val="20"/>
+                <w:szCs w:val="20"/>
+              </w:rPr>
+              <w:t xml:space="preserve">49</w:t>
+            </w:r>
+          </w:p>
+        </w:tc>
+        <w:tc>
+          <w:tcPr>
+            <w:tcW w:w="2350" w:type="pct"/>
+            <w:tcMar>
+              <w:top w:w="30" w:type="dxa"/>
+              <w:left w:w="80" w:type="dxa"/>
+              <w:bottom w:w="30" w:type="dxa"/>
+              <w:right w:w="80" w:type="dxa"/>
+            </w:tcMar>
+          </w:tcPr>
+          <w:p>
+            <w:r>
+              <w:rPr>
+                <w:rFonts w:ascii="Aptos" w:eastAsia="Aptos" w:hAnsi="Aptos" w:cs="Aptos"/>
+                <w:sz w:val="20"/>
+                <w:szCs w:val="20"/>
+              </w:rPr>
+              <w:t xml:space="preserve"/>
+            </w:r>
+          </w:p>
+        </w:tc>
+        <w:tc>
+          <w:tcPr>
+            <w:tcW w:w="750" w:type="pct"/>
+            <w:tcMar>
+              <w:top w:w="30" w:type="dxa"/>
+              <w:left w:w="80" w:type="dxa"/>
+              <w:bottom w:w="30" w:type="dxa"/>
+              <w:right w:w="80" w:type="dxa"/>
+            </w:tcMar>
+          </w:tcPr>
+          <w:p>
+            <w:r>
+              <w:rPr>
+                <w:rFonts w:ascii="Aptos" w:eastAsia="Aptos" w:hAnsi="Aptos" w:cs="Aptos"/>
+                <w:sz w:val="20"/>
+                <w:szCs w:val="20"/>
+              </w:rPr>
+              <w:t xml:space="preserve"/>
+            </w:r>
+          </w:p>
+        </w:tc>
+        <w:tc>
+          <w:tcPr>
+            <w:tcW w:w="1600" w:type="pct"/>
+            <w:tcMar>
+              <w:top w:w="30" w:type="dxa"/>
+              <w:left w:w="80" w:type="dxa"/>
+              <w:bottom w:w="30" w:type="dxa"/>
+              <w:right w:w="80" w:type="dxa"/>
+            </w:tcMar>
+          </w:tcPr>
+          <w:p>
+            <w:r>
+              <w:rPr>
+                <w:rFonts w:ascii="Aptos" w:eastAsia="Aptos" w:hAnsi="Aptos" w:cs="Aptos"/>
+                <w:sz w:val="20"/>
+                <w:szCs w:val="20"/>
+              </w:rPr>
+              <w:t xml:space="preserve"/>
+            </w:r>
+          </w:p>
+        </w:tc>
+      </w:tr>
+      <w:tr>
+        <w:trPr>
+          <w:cantSplit/>
+        </w:trPr>
+        <w:tc>
+          <w:tcPr>
+            <w:tcW w:w="300" w:type="pct"/>
+            <w:tcMar>
+              <w:top w:w="30" w:type="dxa"/>
+              <w:left w:w="80" w:type="dxa"/>
+              <w:bottom w:w="30" w:type="dxa"/>
+              <w:right w:w="80" w:type="dxa"/>
+            </w:tcMar>
+          </w:tcPr>
+          <w:p>
+            <w:r>
+              <w:rPr>
+                <w:rFonts w:ascii="Aptos" w:eastAsia="Aptos" w:hAnsi="Aptos" w:cs="Aptos"/>
+                <w:sz w:val="20"/>
+                <w:szCs w:val="20"/>
+              </w:rPr>
+              <w:t xml:space="preserve">50</w:t>
+            </w:r>
+          </w:p>
+        </w:tc>
+        <w:tc>
+          <w:tcPr>
+            <w:tcW w:w="2350" w:type="pct"/>
+            <w:tcMar>
+              <w:top w:w="30" w:type="dxa"/>
+              <w:left w:w="80" w:type="dxa"/>
+              <w:bottom w:w="30" w:type="dxa"/>
+              <w:right w:w="80" w:type="dxa"/>
+            </w:tcMar>
+          </w:tcPr>
+          <w:p>
+            <w:r>
+              <w:rPr>
+                <w:rFonts w:ascii="Aptos" w:eastAsia="Aptos" w:hAnsi="Aptos" w:cs="Aptos"/>
+                <w:sz w:val="20"/>
+                <w:szCs w:val="20"/>
+              </w:rPr>
+              <w:t xml:space="preserve"/>
+            </w:r>
+          </w:p>
+        </w:tc>
+        <w:tc>
+          <w:tcPr>
+            <w:tcW w:w="750" w:type="pct"/>
+            <w:tcMar>
+              <w:top w:w="30" w:type="dxa"/>
+              <w:left w:w="80" w:type="dxa"/>
+              <w:bottom w:w="30" w:type="dxa"/>
+              <w:right w:w="80" w:type="dxa"/>
+            </w:tcMar>
+          </w:tcPr>
+          <w:p>
+            <w:r>
+              <w:rPr>
+                <w:rFonts w:ascii="Aptos" w:eastAsia="Aptos" w:hAnsi="Aptos" w:cs="Aptos"/>
+                <w:sz w:val="20"/>
+                <w:szCs w:val="20"/>
+              </w:rPr>
+              <w:t xml:space="preserve"/>
+            </w:r>
+          </w:p>
+        </w:tc>
+        <w:tc>
+          <w:tcPr>
+            <w:tcW w:w="1600" w:type="pct"/>
+            <w:tcMar>
+              <w:top w:w="30" w:type="dxa"/>
+              <w:left w:w="80" w:type="dxa"/>
+              <w:bottom w:w="30" w:type="dxa"/>
+              <w:right w:w="80" w:type="dxa"/>
+            </w:tcMar>
+          </w:tcPr>
+          <w:p>
+            <w:r>
+              <w:rPr>
+                <w:rFonts w:ascii="Aptos" w:eastAsia="Aptos" w:hAnsi="Aptos" w:cs="Aptos"/>
+                <w:sz w:val="20"/>
+                <w:szCs w:val="20"/>
+              </w:rPr>
+              <w:t xml:space="preserve"/>
+            </w:r>
+          </w:p>
+        </w:tc>
+      </w:tr>
+      <w:tr>
+        <w:trPr>
+          <w:cantSplit/>
+        </w:trPr>
+        <w:tc>
+          <w:tcPr>
+            <w:tcW w:w="300" w:type="pct"/>
+            <w:tcMar>
+              <w:top w:w="30" w:type="dxa"/>
+              <w:left w:w="80" w:type="dxa"/>
+              <w:bottom w:w="30" w:type="dxa"/>
+              <w:right w:w="80" w:type="dxa"/>
+            </w:tcMar>
+          </w:tcPr>
+          <w:p>
+            <w:r>
+              <w:rPr>
+                <w:rFonts w:ascii="Aptos" w:eastAsia="Aptos" w:hAnsi="Aptos" w:cs="Aptos"/>
+                <w:sz w:val="20"/>
+                <w:szCs w:val="20"/>
+              </w:rPr>
+              <w:t xml:space="preserve">51</w:t>
+            </w:r>
+          </w:p>
+        </w:tc>
+        <w:tc>
+          <w:tcPr>
+            <w:tcW w:w="2350" w:type="pct"/>
+            <w:tcMar>
+              <w:top w:w="30" w:type="dxa"/>
+              <w:left w:w="80" w:type="dxa"/>
+              <w:bottom w:w="30" w:type="dxa"/>
+              <w:right w:w="80" w:type="dxa"/>
+            </w:tcMar>
+          </w:tcPr>
+          <w:p>
+            <w:r>
+              <w:rPr>
+                <w:rFonts w:ascii="Aptos" w:eastAsia="Aptos" w:hAnsi="Aptos" w:cs="Aptos"/>
+                <w:sz w:val="20"/>
+                <w:szCs w:val="20"/>
+              </w:rPr>
+              <w:t xml:space="preserve"/>
+            </w:r>
+          </w:p>
+        </w:tc>
+        <w:tc>
+          <w:tcPr>
+            <w:tcW w:w="750" w:type="pct"/>
+            <w:tcMar>
+              <w:top w:w="30" w:type="dxa"/>
+              <w:left w:w="80" w:type="dxa"/>
+              <w:bottom w:w="30" w:type="dxa"/>
+              <w:right w:w="80" w:type="dxa"/>
+            </w:tcMar>
+          </w:tcPr>
+          <w:p>
+            <w:r>
+              <w:rPr>
+                <w:rFonts w:ascii="Aptos" w:eastAsia="Aptos" w:hAnsi="Aptos" w:cs="Aptos"/>
+                <w:sz w:val="20"/>
+                <w:szCs w:val="20"/>
+              </w:rPr>
+              <w:t xml:space="preserve"/>
+            </w:r>
+          </w:p>
+        </w:tc>
+        <w:tc>
+          <w:tcPr>
+            <w:tcW w:w="1600" w:type="pct"/>
+            <w:tcMar>
+              <w:top w:w="30" w:type="dxa"/>
+              <w:left w:w="80" w:type="dxa"/>
+              <w:bottom w:w="30" w:type="dxa"/>
+              <w:right w:w="80" w:type="dxa"/>
+            </w:tcMar>
+          </w:tcPr>
+          <w:p>
+            <w:r>
+              <w:rPr>
+                <w:rFonts w:ascii="Aptos" w:eastAsia="Aptos" w:hAnsi="Aptos" w:cs="Aptos"/>
+                <w:sz w:val="20"/>
+                <w:szCs w:val="20"/>
+              </w:rPr>
+              <w:t xml:space="preserve"/>
+            </w:r>
+          </w:p>
+        </w:tc>
+      </w:tr>
+      <w:tr>
+        <w:trPr>
+          <w:cantSplit/>
+        </w:trPr>
+        <w:tc>
+          <w:tcPr>
+            <w:tcW w:w="300" w:type="pct"/>
+            <w:tcMar>
+              <w:top w:w="30" w:type="dxa"/>
+              <w:left w:w="80" w:type="dxa"/>
+              <w:bottom w:w="30" w:type="dxa"/>
+              <w:right w:w="80" w:type="dxa"/>
+            </w:tcMar>
+          </w:tcPr>
+          <w:p>
+            <w:r>
+              <w:rPr>
+                <w:rFonts w:ascii="Aptos" w:eastAsia="Aptos" w:hAnsi="Aptos" w:cs="Aptos"/>
+                <w:sz w:val="20"/>
+                <w:szCs w:val="20"/>
+              </w:rPr>
+              <w:t xml:space="preserve">52</w:t>
+            </w:r>
+          </w:p>
+        </w:tc>
+        <w:tc>
+          <w:tcPr>
+            <w:tcW w:w="2350" w:type="pct"/>
+            <w:tcMar>
+              <w:top w:w="30" w:type="dxa"/>
+              <w:left w:w="80" w:type="dxa"/>
+              <w:bottom w:w="30" w:type="dxa"/>
+              <w:right w:w="80" w:type="dxa"/>
+            </w:tcMar>
+          </w:tcPr>
+          <w:p>
+            <w:r>
+              <w:rPr>
+                <w:rFonts w:ascii="Aptos" w:eastAsia="Aptos" w:hAnsi="Aptos" w:cs="Aptos"/>
+                <w:sz w:val="20"/>
+                <w:szCs w:val="20"/>
+              </w:rPr>
+              <w:t xml:space="preserve"/>
+            </w:r>
+          </w:p>
+        </w:tc>
+        <w:tc>
+          <w:tcPr>
+            <w:tcW w:w="750" w:type="pct"/>
+            <w:tcMar>
+              <w:top w:w="30" w:type="dxa"/>
+              <w:left w:w="80" w:type="dxa"/>
+              <w:bottom w:w="30" w:type="dxa"/>
+              <w:right w:w="80" w:type="dxa"/>
+            </w:tcMar>
+          </w:tcPr>
+          <w:p>
+            <w:r>
+              <w:rPr>
+                <w:rFonts w:ascii="Aptos" w:eastAsia="Aptos" w:hAnsi="Aptos" w:cs="Aptos"/>
+                <w:sz w:val="20"/>
+                <w:szCs w:val="20"/>
+              </w:rPr>
+              <w:t xml:space="preserve"/>
+            </w:r>
+          </w:p>
+        </w:tc>
+        <w:tc>
+          <w:tcPr>
+            <w:tcW w:w="1600" w:type="pct"/>
+            <w:tcMar>
+              <w:top w:w="30" w:type="dxa"/>
+              <w:left w:w="80" w:type="dxa"/>
+              <w:bottom w:w="30" w:type="dxa"/>
+              <w:right w:w="80" w:type="dxa"/>
+            </w:tcMar>
+          </w:tcPr>
+          <w:p>
+            <w:r>
+              <w:rPr>
+                <w:rFonts w:ascii="Aptos" w:eastAsia="Aptos" w:hAnsi="Aptos" w:cs="Aptos"/>
+                <w:sz w:val="20"/>
+                <w:szCs w:val="20"/>
+              </w:rPr>
+              <w:t xml:space="preserve"/>
+            </w:r>
+          </w:p>
+        </w:tc>
+      </w:tr>
+      <w:tr>
+        <w:trPr>
+          <w:cantSplit/>
+        </w:trPr>
+        <w:tc>
+          <w:tcPr>
+            <w:tcW w:w="300" w:type="pct"/>
+            <w:tcMar>
+              <w:top w:w="30" w:type="dxa"/>
+              <w:left w:w="80" w:type="dxa"/>
+              <w:bottom w:w="30" w:type="dxa"/>
+              <w:right w:w="80" w:type="dxa"/>
+            </w:tcMar>
+          </w:tcPr>
+          <w:p>
+            <w:r>
+              <w:rPr>
+                <w:rFonts w:ascii="Aptos" w:eastAsia="Aptos" w:hAnsi="Aptos" w:cs="Aptos"/>
+                <w:sz w:val="20"/>
+                <w:szCs w:val="20"/>
+              </w:rPr>
+              <w:t xml:space="preserve">53</w:t>
+            </w:r>
+          </w:p>
+        </w:tc>
+        <w:tc>
+          <w:tcPr>
+            <w:tcW w:w="2350" w:type="pct"/>
+            <w:tcMar>
+              <w:top w:w="30" w:type="dxa"/>
+              <w:left w:w="80" w:type="dxa"/>
+              <w:bottom w:w="30" w:type="dxa"/>
+              <w:right w:w="80" w:type="dxa"/>
+            </w:tcMar>
+          </w:tcPr>
+          <w:p>
+            <w:r>
+              <w:rPr>
+                <w:rFonts w:ascii="Aptos" w:eastAsia="Aptos" w:hAnsi="Aptos" w:cs="Aptos"/>
+                <w:sz w:val="20"/>
+                <w:szCs w:val="20"/>
+              </w:rPr>
+              <w:t xml:space="preserve"/>
+            </w:r>
+          </w:p>
+        </w:tc>
+        <w:tc>
+          <w:tcPr>
+            <w:tcW w:w="750" w:type="pct"/>
+            <w:tcMar>
+              <w:top w:w="30" w:type="dxa"/>
+              <w:left w:w="80" w:type="dxa"/>
+              <w:bottom w:w="30" w:type="dxa"/>
+              <w:right w:w="80" w:type="dxa"/>
+            </w:tcMar>
+          </w:tcPr>
+          <w:p>
+            <w:r>
+              <w:rPr>
+                <w:rFonts w:ascii="Aptos" w:eastAsia="Aptos" w:hAnsi="Aptos" w:cs="Aptos"/>
+                <w:sz w:val="20"/>
+                <w:szCs w:val="20"/>
+              </w:rPr>
+              <w:t xml:space="preserve"/>
+            </w:r>
+          </w:p>
+        </w:tc>
+        <w:tc>
+          <w:tcPr>
+            <w:tcW w:w="1600" w:type="pct"/>
+            <w:tcMar>
+              <w:top w:w="30" w:type="dxa"/>
+              <w:left w:w="80" w:type="dxa"/>
+              <w:bottom w:w="30" w:type="dxa"/>
+              <w:right w:w="80" w:type="dxa"/>
+            </w:tcMar>
+          </w:tcPr>
+          <w:p>
+            <w:r>
+              <w:rPr>
+                <w:rFonts w:ascii="Aptos" w:eastAsia="Aptos" w:hAnsi="Aptos" w:cs="Aptos"/>
+                <w:sz w:val="20"/>
+                <w:szCs w:val="20"/>
+              </w:rPr>
+              <w:t xml:space="preserve"/>
+            </w:r>
+          </w:p>
+        </w:tc>
+      </w:tr>
+      <w:tr>
+        <w:trPr>
+          <w:cantSplit/>
+        </w:trPr>
+        <w:tc>
+          <w:tcPr>
+            <w:tcW w:w="300" w:type="pct"/>
+            <w:tcMar>
+              <w:top w:w="30" w:type="dxa"/>
+              <w:left w:w="80" w:type="dxa"/>
+              <w:bottom w:w="30" w:type="dxa"/>
+              <w:right w:w="80" w:type="dxa"/>
+            </w:tcMar>
+          </w:tcPr>
+          <w:p>
+            <w:r>
+              <w:rPr>
+                <w:rFonts w:ascii="Aptos" w:eastAsia="Aptos" w:hAnsi="Aptos" w:cs="Aptos"/>
+                <w:sz w:val="20"/>
+                <w:szCs w:val="20"/>
+              </w:rPr>
+              <w:t xml:space="preserve">54</w:t>
+            </w:r>
+          </w:p>
+        </w:tc>
+        <w:tc>
+          <w:tcPr>
+            <w:tcW w:w="2350" w:type="pct"/>
+            <w:tcMar>
+              <w:top w:w="30" w:type="dxa"/>
+              <w:left w:w="80" w:type="dxa"/>
+              <w:bottom w:w="30" w:type="dxa"/>
+              <w:right w:w="80" w:type="dxa"/>
+            </w:tcMar>
+          </w:tcPr>
+          <w:p>
+            <w:r>
+              <w:rPr>
+                <w:rFonts w:ascii="Aptos" w:eastAsia="Aptos" w:hAnsi="Aptos" w:cs="Aptos"/>
+                <w:sz w:val="20"/>
+                <w:szCs w:val="20"/>
+              </w:rPr>
+              <w:t xml:space="preserve"/>
+            </w:r>
+          </w:p>
+        </w:tc>
+        <w:tc>
+          <w:tcPr>
+            <w:tcW w:w="750" w:type="pct"/>
+            <w:tcMar>
+              <w:top w:w="30" w:type="dxa"/>
+              <w:left w:w="80" w:type="dxa"/>
+              <w:bottom w:w="30" w:type="dxa"/>
+              <w:right w:w="80" w:type="dxa"/>
+            </w:tcMar>
+          </w:tcPr>
+          <w:p>
+            <w:r>
+              <w:rPr>
+                <w:rFonts w:ascii="Aptos" w:eastAsia="Aptos" w:hAnsi="Aptos" w:cs="Aptos"/>
+                <w:sz w:val="20"/>
+                <w:szCs w:val="20"/>
+              </w:rPr>
+              <w:t xml:space="preserve"/>
+            </w:r>
+          </w:p>
+        </w:tc>
+        <w:tc>
+          <w:tcPr>
+            <w:tcW w:w="1600" w:type="pct"/>
+            <w:tcMar>
+              <w:top w:w="30" w:type="dxa"/>
+              <w:left w:w="80" w:type="dxa"/>
+              <w:bottom w:w="30" w:type="dxa"/>
+              <w:right w:w="80" w:type="dxa"/>
+            </w:tcMar>
+          </w:tcPr>
+          <w:p>
+            <w:r>
+              <w:rPr>
+                <w:rFonts w:ascii="Aptos" w:eastAsia="Aptos" w:hAnsi="Aptos" w:cs="Aptos"/>
+                <w:sz w:val="20"/>
+                <w:szCs w:val="20"/>
+              </w:rPr>
+              <w:t xml:space="preserve"/>
+            </w:r>
+          </w:p>
+        </w:tc>
+      </w:tr>
+      <w:tr>
+        <w:trPr>
+          <w:cantSplit/>
+        </w:trPr>
+        <w:tc>
+          <w:tcPr>
+            <w:tcW w:w="300" w:type="pct"/>
+            <w:tcMar>
+              <w:top w:w="30" w:type="dxa"/>
+              <w:left w:w="80" w:type="dxa"/>
+              <w:bottom w:w="30" w:type="dxa"/>
+              <w:right w:w="80" w:type="dxa"/>
+            </w:tcMar>
+          </w:tcPr>
+          <w:p>
+            <w:r>
+              <w:rPr>
+                <w:rFonts w:ascii="Aptos" w:eastAsia="Aptos" w:hAnsi="Aptos" w:cs="Aptos"/>
+                <w:sz w:val="20"/>
+                <w:szCs w:val="20"/>
+              </w:rPr>
+              <w:t xml:space="preserve">55</w:t>
+            </w:r>
+          </w:p>
+        </w:tc>
+        <w:tc>
+          <w:tcPr>
+            <w:tcW w:w="2350" w:type="pct"/>
+            <w:tcMar>
+              <w:top w:w="30" w:type="dxa"/>
+              <w:left w:w="80" w:type="dxa"/>
+              <w:bottom w:w="30" w:type="dxa"/>
+              <w:right w:w="80" w:type="dxa"/>
+            </w:tcMar>
+          </w:tcPr>
+          <w:p>
+            <w:r>
+              <w:rPr>
+                <w:rFonts w:ascii="Aptos" w:eastAsia="Aptos" w:hAnsi="Aptos" w:cs="Aptos"/>
+                <w:sz w:val="20"/>
+                <w:szCs w:val="20"/>
+              </w:rPr>
+              <w:t xml:space="preserve"/>
+            </w:r>
+          </w:p>
+        </w:tc>
+        <w:tc>
+          <w:tcPr>
+            <w:tcW w:w="750" w:type="pct"/>
+            <w:tcMar>
+              <w:top w:w="30" w:type="dxa"/>
+              <w:left w:w="80" w:type="dxa"/>
+              <w:bottom w:w="30" w:type="dxa"/>
+              <w:right w:w="80" w:type="dxa"/>
+            </w:tcMar>
+          </w:tcPr>
+          <w:p>
+            <w:r>
+              <w:rPr>
+                <w:rFonts w:ascii="Aptos" w:eastAsia="Aptos" w:hAnsi="Aptos" w:cs="Aptos"/>
+                <w:sz w:val="20"/>
+                <w:szCs w:val="20"/>
+              </w:rPr>
+              <w:t xml:space="preserve"/>
+            </w:r>
+          </w:p>
+        </w:tc>
+        <w:tc>
+          <w:tcPr>
+            <w:tcW w:w="1600" w:type="pct"/>
+            <w:tcMar>
+              <w:top w:w="30" w:type="dxa"/>
+              <w:left w:w="80" w:type="dxa"/>
+              <w:bottom w:w="30" w:type="dxa"/>
+              <w:right w:w="80" w:type="dxa"/>
+            </w:tcMar>
+          </w:tcPr>
+          <w:p>
+            <w:r>
+              <w:rPr>
+                <w:rFonts w:ascii="Aptos" w:eastAsia="Aptos" w:hAnsi="Aptos" w:cs="Aptos"/>
+                <w:sz w:val="20"/>
+                <w:szCs w:val="20"/>
+              </w:rPr>
+              <w:t xml:space="preserve"/>
+            </w:r>
+          </w:p>
+        </w:tc>
+      </w:tr>
+      <w:tr>
+        <w:trPr>
+          <w:cantSplit/>
+        </w:trPr>
+        <w:tc>
+          <w:tcPr>
+            <w:tcW w:w="300" w:type="pct"/>
+            <w:tcMar>
+              <w:top w:w="30" w:type="dxa"/>
+              <w:left w:w="80" w:type="dxa"/>
+              <w:bottom w:w="30" w:type="dxa"/>
+              <w:right w:w="80" w:type="dxa"/>
+            </w:tcMar>
+          </w:tcPr>
+          <w:p>
+            <w:r>
+              <w:rPr>
+                <w:rFonts w:ascii="Aptos" w:eastAsia="Aptos" w:hAnsi="Aptos" w:cs="Aptos"/>
+                <w:sz w:val="20"/>
+                <w:szCs w:val="20"/>
+              </w:rPr>
+              <w:t xml:space="preserve">56</w:t>
+            </w:r>
+          </w:p>
+        </w:tc>
+        <w:tc>
+          <w:tcPr>
+            <w:tcW w:w="2350" w:type="pct"/>
+            <w:tcMar>
+              <w:top w:w="30" w:type="dxa"/>
+              <w:left w:w="80" w:type="dxa"/>
+              <w:bottom w:w="30" w:type="dxa"/>
+              <w:right w:w="80" w:type="dxa"/>
+            </w:tcMar>
+          </w:tcPr>
+          <w:p>
+            <w:r>
+              <w:rPr>
+                <w:rFonts w:ascii="Aptos" w:eastAsia="Aptos" w:hAnsi="Aptos" w:cs="Aptos"/>
+                <w:sz w:val="20"/>
+                <w:szCs w:val="20"/>
+              </w:rPr>
+              <w:t xml:space="preserve"/>
+            </w:r>
+          </w:p>
+        </w:tc>
+        <w:tc>
+          <w:tcPr>
+            <w:tcW w:w="750" w:type="pct"/>
+            <w:tcMar>
+              <w:top w:w="30" w:type="dxa"/>
+              <w:left w:w="80" w:type="dxa"/>
+              <w:bottom w:w="30" w:type="dxa"/>
+              <w:right w:w="80" w:type="dxa"/>
+            </w:tcMar>
+          </w:tcPr>
+          <w:p>
+            <w:r>
+              <w:rPr>
+                <w:rFonts w:ascii="Aptos" w:eastAsia="Aptos" w:hAnsi="Aptos" w:cs="Aptos"/>
+                <w:sz w:val="20"/>
+                <w:szCs w:val="20"/>
+              </w:rPr>
+              <w:t xml:space="preserve"/>
+            </w:r>
+          </w:p>
+        </w:tc>
+        <w:tc>
+          <w:tcPr>
+            <w:tcW w:w="1600" w:type="pct"/>
+            <w:tcMar>
+              <w:top w:w="30" w:type="dxa"/>
+              <w:left w:w="80" w:type="dxa"/>
+              <w:bottom w:w="30" w:type="dxa"/>
+              <w:right w:w="80" w:type="dxa"/>
+            </w:tcMar>
+          </w:tcPr>
+          <w:p>
+            <w:r>
+              <w:rPr>
+                <w:rFonts w:ascii="Aptos" w:eastAsia="Aptos" w:hAnsi="Aptos" w:cs="Aptos"/>
+                <w:sz w:val="20"/>
+                <w:szCs w:val="20"/>
+              </w:rPr>
+              <w:t xml:space="preserve"/>
+            </w:r>
+          </w:p>
+        </w:tc>
+      </w:tr>
+      <w:tr>
+        <w:trPr>
+          <w:cantSplit/>
+        </w:trPr>
+        <w:tc>
+          <w:tcPr>
+            <w:tcW w:w="300" w:type="pct"/>
+            <w:tcMar>
+              <w:top w:w="30" w:type="dxa"/>
+              <w:left w:w="80" w:type="dxa"/>
+              <w:bottom w:w="30" w:type="dxa"/>
+              <w:right w:w="80" w:type="dxa"/>
+            </w:tcMar>
+          </w:tcPr>
+          <w:p>
+            <w:r>
+              <w:rPr>
+                <w:rFonts w:ascii="Aptos" w:eastAsia="Aptos" w:hAnsi="Aptos" w:cs="Aptos"/>
+                <w:sz w:val="20"/>
+                <w:szCs w:val="20"/>
+              </w:rPr>
+              <w:t xml:space="preserve">57</w:t>
+            </w:r>
+          </w:p>
+        </w:tc>
+        <w:tc>
+          <w:tcPr>
+            <w:tcW w:w="2350" w:type="pct"/>
+            <w:tcMar>
+              <w:top w:w="30" w:type="dxa"/>
+              <w:left w:w="80" w:type="dxa"/>
+              <w:bottom w:w="30" w:type="dxa"/>
+              <w:right w:w="80" w:type="dxa"/>
+            </w:tcMar>
+          </w:tcPr>
+          <w:p>
+            <w:r>
+              <w:rPr>
+                <w:rFonts w:ascii="Aptos" w:eastAsia="Aptos" w:hAnsi="Aptos" w:cs="Aptos"/>
+                <w:sz w:val="20"/>
+                <w:szCs w:val="20"/>
+              </w:rPr>
+              <w:t xml:space="preserve"/>
+            </w:r>
+          </w:p>
+        </w:tc>
+        <w:tc>
+          <w:tcPr>
+            <w:tcW w:w="750" w:type="pct"/>
+            <w:tcMar>
+              <w:top w:w="30" w:type="dxa"/>
+              <w:left w:w="80" w:type="dxa"/>
+              <w:bottom w:w="30" w:type="dxa"/>
+              <w:right w:w="80" w:type="dxa"/>
+            </w:tcMar>
+          </w:tcPr>
+          <w:p>
+            <w:r>
+              <w:rPr>
+                <w:rFonts w:ascii="Aptos" w:eastAsia="Aptos" w:hAnsi="Aptos" w:cs="Aptos"/>
+                <w:sz w:val="20"/>
+                <w:szCs w:val="20"/>
+              </w:rPr>
+              <w:t xml:space="preserve"/>
+            </w:r>
+          </w:p>
+        </w:tc>
+        <w:tc>
+          <w:tcPr>
+            <w:tcW w:w="1600" w:type="pct"/>
+            <w:tcMar>
+              <w:top w:w="30" w:type="dxa"/>
+              <w:left w:w="80" w:type="dxa"/>
+              <w:bottom w:w="30" w:type="dxa"/>
+              <w:right w:w="80" w:type="dxa"/>
+            </w:tcMar>
+          </w:tcPr>
+          <w:p>
+            <w:r>
+              <w:rPr>
+                <w:rFonts w:ascii="Aptos" w:eastAsia="Aptos" w:hAnsi="Aptos" w:cs="Aptos"/>
+                <w:sz w:val="20"/>
+                <w:szCs w:val="20"/>
+              </w:rPr>
+              <w:t xml:space="preserve"/>
+            </w:r>
+          </w:p>
+        </w:tc>
+      </w:tr>
+      <w:tr>
+        <w:trPr>
+          <w:cantSplit/>
+        </w:trPr>
+        <w:tc>
+          <w:tcPr>
+            <w:tcW w:w="300" w:type="pct"/>
+            <w:tcMar>
+              <w:top w:w="30" w:type="dxa"/>
+              <w:left w:w="80" w:type="dxa"/>
+              <w:bottom w:w="30" w:type="dxa"/>
+              <w:right w:w="80" w:type="dxa"/>
+            </w:tcMar>
+          </w:tcPr>
+          <w:p>
+            <w:r>
+              <w:rPr>
+                <w:rFonts w:ascii="Aptos" w:eastAsia="Aptos" w:hAnsi="Aptos" w:cs="Aptos"/>
+                <w:sz w:val="20"/>
+                <w:szCs w:val="20"/>
+              </w:rPr>
+              <w:t xml:space="preserve">58</w:t>
+            </w:r>
+          </w:p>
+        </w:tc>
+        <w:tc>
+          <w:tcPr>
+            <w:tcW w:w="2350" w:type="pct"/>
+            <w:tcMar>
+              <w:top w:w="30" w:type="dxa"/>
+              <w:left w:w="80" w:type="dxa"/>
+              <w:bottom w:w="30" w:type="dxa"/>
+              <w:right w:w="80" w:type="dxa"/>
+            </w:tcMar>
+          </w:tcPr>
+          <w:p>
+            <w:r>
+              <w:rPr>
+                <w:rFonts w:ascii="Aptos" w:eastAsia="Aptos" w:hAnsi="Aptos" w:cs="Aptos"/>
+                <w:sz w:val="20"/>
+                <w:szCs w:val="20"/>
+              </w:rPr>
+              <w:t xml:space="preserve"/>
+            </w:r>
+          </w:p>
+        </w:tc>
+        <w:tc>
+          <w:tcPr>
+            <w:tcW w:w="750" w:type="pct"/>
+            <w:tcMar>
+              <w:top w:w="30" w:type="dxa"/>
+              <w:left w:w="80" w:type="dxa"/>
+              <w:bottom w:w="30" w:type="dxa"/>
+              <w:right w:w="80" w:type="dxa"/>
+            </w:tcMar>
+          </w:tcPr>
+          <w:p>
+            <w:r>
+              <w:rPr>
+                <w:rFonts w:ascii="Aptos" w:eastAsia="Aptos" w:hAnsi="Aptos" w:cs="Aptos"/>
+                <w:sz w:val="20"/>
+                <w:szCs w:val="20"/>
+              </w:rPr>
+              <w:t xml:space="preserve"/>
+            </w:r>
+          </w:p>
+        </w:tc>
+        <w:tc>
+          <w:tcPr>
+            <w:tcW w:w="1600" w:type="pct"/>
+            <w:tcMar>
+              <w:top w:w="30" w:type="dxa"/>
+              <w:left w:w="80" w:type="dxa"/>
+              <w:bottom w:w="30" w:type="dxa"/>
+              <w:right w:w="80" w:type="dxa"/>
+            </w:tcMar>
+          </w:tcPr>
+          <w:p>
+            <w:r>
+              <w:rPr>
+                <w:rFonts w:ascii="Aptos" w:eastAsia="Aptos" w:hAnsi="Aptos" w:cs="Aptos"/>
+                <w:sz w:val="20"/>
+                <w:szCs w:val="20"/>
+              </w:rPr>
+              <w:t xml:space="preserve"/>
+            </w:r>
+          </w:p>
+        </w:tc>
+      </w:tr>
+      <w:tr>
+        <w:trPr>
+          <w:cantSplit/>
+        </w:trPr>
+        <w:tc>
+          <w:tcPr>
+            <w:tcW w:w="300" w:type="pct"/>
+            <w:tcMar>
+              <w:top w:w="30" w:type="dxa"/>
+              <w:left w:w="80" w:type="dxa"/>
+              <w:bottom w:w="30" w:type="dxa"/>
+              <w:right w:w="80" w:type="dxa"/>
+            </w:tcMar>
+          </w:tcPr>
+          <w:p>
+            <w:r>
+              <w:rPr>
+                <w:rFonts w:ascii="Aptos" w:eastAsia="Aptos" w:hAnsi="Aptos" w:cs="Aptos"/>
+                <w:sz w:val="20"/>
+                <w:szCs w:val="20"/>
+              </w:rPr>
+              <w:t xml:space="preserve">59</w:t>
+            </w:r>
+          </w:p>
+        </w:tc>
+        <w:tc>
+          <w:tcPr>
+            <w:tcW w:w="2350" w:type="pct"/>
+            <w:tcMar>
+              <w:top w:w="30" w:type="dxa"/>
+              <w:left w:w="80" w:type="dxa"/>
+              <w:bottom w:w="30" w:type="dxa"/>
+              <w:right w:w="80" w:type="dxa"/>
+            </w:tcMar>
+          </w:tcPr>
+          <w:p>
+            <w:r>
+              <w:rPr>
+                <w:rFonts w:ascii="Aptos" w:eastAsia="Aptos" w:hAnsi="Aptos" w:cs="Aptos"/>
+                <w:sz w:val="20"/>
+                <w:szCs w:val="20"/>
+              </w:rPr>
+              <w:t xml:space="preserve"/>
+            </w:r>
+          </w:p>
+        </w:tc>
+        <w:tc>
+          <w:tcPr>
+            <w:tcW w:w="750" w:type="pct"/>
+            <w:tcMar>
+              <w:top w:w="30" w:type="dxa"/>
+              <w:left w:w="80" w:type="dxa"/>
+              <w:bottom w:w="30" w:type="dxa"/>
+              <w:right w:w="80" w:type="dxa"/>
+            </w:tcMar>
+          </w:tcPr>
+          <w:p>
+            <w:r>
+              <w:rPr>
+                <w:rFonts w:ascii="Aptos" w:eastAsia="Aptos" w:hAnsi="Aptos" w:cs="Aptos"/>
+                <w:sz w:val="20"/>
+                <w:szCs w:val="20"/>
+              </w:rPr>
+              <w:t xml:space="preserve"/>
+            </w:r>
+          </w:p>
+        </w:tc>
+        <w:tc>
+          <w:tcPr>
+            <w:tcW w:w="1600" w:type="pct"/>
+            <w:tcMar>
+              <w:top w:w="30" w:type="dxa"/>
+              <w:left w:w="80" w:type="dxa"/>
+              <w:bottom w:w="30" w:type="dxa"/>
+              <w:right w:w="80" w:type="dxa"/>
+            </w:tcMar>
+          </w:tcPr>
+          <w:p>
+            <w:r>
+              <w:rPr>
+                <w:rFonts w:ascii="Aptos" w:eastAsia="Aptos" w:hAnsi="Aptos" w:cs="Aptos"/>
+                <w:sz w:val="20"/>
+                <w:szCs w:val="20"/>
+              </w:rPr>
+              <w:t xml:space="preserve"/>
+            </w:r>
+          </w:p>
+        </w:tc>
+      </w:tr>
+      <w:tr>
+        <w:trPr>
+          <w:cantSplit/>
+        </w:trPr>
+        <w:tc>
+          <w:tcPr>
+            <w:tcW w:w="300" w:type="pct"/>
+            <w:tcMar>
+              <w:top w:w="30" w:type="dxa"/>
+              <w:left w:w="80" w:type="dxa"/>
+              <w:bottom w:w="30" w:type="dxa"/>
+              <w:right w:w="80" w:type="dxa"/>
+            </w:tcMar>
+          </w:tcPr>
+          <w:p>
+            <w:r>
+              <w:rPr>
+                <w:rFonts w:ascii="Aptos" w:eastAsia="Aptos" w:hAnsi="Aptos" w:cs="Aptos"/>
+                <w:sz w:val="20"/>
+                <w:szCs w:val="20"/>
+              </w:rPr>
+              <w:t xml:space="preserve">60</w:t>
+            </w:r>
+          </w:p>
+        </w:tc>
+        <w:tc>
+          <w:tcPr>
+            <w:tcW w:w="2350" w:type="pct"/>
+            <w:tcMar>
+              <w:top w:w="30" w:type="dxa"/>
+              <w:left w:w="80" w:type="dxa"/>
+              <w:bottom w:w="30" w:type="dxa"/>
+              <w:right w:w="80" w:type="dxa"/>
+            </w:tcMar>
+          </w:tcPr>
+          <w:p>
+            <w:r>
+              <w:rPr>
+                <w:rFonts w:ascii="Aptos" w:eastAsia="Aptos" w:hAnsi="Aptos" w:cs="Aptos"/>
+                <w:sz w:val="20"/>
+                <w:szCs w:val="20"/>
+              </w:rPr>
+              <w:t xml:space="preserve"/>
+            </w:r>
+          </w:p>
+        </w:tc>
+        <w:tc>
+          <w:tcPr>
+            <w:tcW w:w="750" w:type="pct"/>
+            <w:tcMar>
+              <w:top w:w="30" w:type="dxa"/>
+              <w:left w:w="80" w:type="dxa"/>
+              <w:bottom w:w="30" w:type="dxa"/>
+              <w:right w:w="80" w:type="dxa"/>
+            </w:tcMar>
+          </w:tcPr>
+          <w:p>
+            <w:r>
+              <w:rPr>
+                <w:rFonts w:ascii="Aptos" w:eastAsia="Aptos" w:hAnsi="Aptos" w:cs="Aptos"/>
+                <w:sz w:val="20"/>
+                <w:szCs w:val="20"/>
+              </w:rPr>
+              <w:t xml:space="preserve"/>
+            </w:r>
+          </w:p>
+        </w:tc>
+        <w:tc>
+          <w:tcPr>
+            <w:tcW w:w="1600" w:type="pct"/>
+            <w:tcMar>
+              <w:top w:w="30" w:type="dxa"/>
+              <w:left w:w="80" w:type="dxa"/>
+              <w:bottom w:w="30" w:type="dxa"/>
+              <w:right w:w="80" w:type="dxa"/>
+            </w:tcMar>
+          </w:tcPr>
+          <w:p>
+            <w:r>
+              <w:rPr>
+                <w:rFonts w:ascii="Aptos" w:eastAsia="Aptos" w:hAnsi="Aptos" w:cs="Aptos"/>
+                <w:sz w:val="20"/>
+                <w:szCs w:val="20"/>
+              </w:rPr>
+              <w:t xml:space="preserve"/>
+            </w:r>
+          </w:p>
+        </w:tc>
+      </w:tr>
+      <w:tr>
+        <w:trPr>
+          <w:cantSplit/>
+        </w:trPr>
+        <w:tc>
+          <w:tcPr>
+            <w:tcW w:w="300" w:type="pct"/>
+            <w:tcMar>
+              <w:top w:w="30" w:type="dxa"/>
+              <w:left w:w="80" w:type="dxa"/>
+              <w:bottom w:w="30" w:type="dxa"/>
+              <w:right w:w="80" w:type="dxa"/>
+            </w:tcMar>
+          </w:tcPr>
+          <w:p>
+            <w:r>
+              <w:rPr>
+                <w:rFonts w:ascii="Aptos" w:eastAsia="Aptos" w:hAnsi="Aptos" w:cs="Aptos"/>
+                <w:sz w:val="20"/>
+                <w:szCs w:val="20"/>
+              </w:rPr>
+              <w:t xml:space="preserve">61</w:t>
+            </w:r>
+          </w:p>
+        </w:tc>
+        <w:tc>
+          <w:tcPr>
+            <w:tcW w:w="2350" w:type="pct"/>
+            <w:tcMar>
+              <w:top w:w="30" w:type="dxa"/>
+              <w:left w:w="80" w:type="dxa"/>
+              <w:bottom w:w="30" w:type="dxa"/>
+              <w:right w:w="80" w:type="dxa"/>
+            </w:tcMar>
+          </w:tcPr>
+          <w:p>
+            <w:r>
+              <w:rPr>
+                <w:rFonts w:ascii="Aptos" w:eastAsia="Aptos" w:hAnsi="Aptos" w:cs="Aptos"/>
+                <w:sz w:val="20"/>
+                <w:szCs w:val="20"/>
+              </w:rPr>
+              <w:t xml:space="preserve"/>
+            </w:r>
+          </w:p>
+        </w:tc>
+        <w:tc>
+          <w:tcPr>
+            <w:tcW w:w="750" w:type="pct"/>
+            <w:tcMar>
+              <w:top w:w="30" w:type="dxa"/>
+              <w:left w:w="80" w:type="dxa"/>
+              <w:bottom w:w="30" w:type="dxa"/>
+              <w:right w:w="80" w:type="dxa"/>
+            </w:tcMar>
+          </w:tcPr>
+          <w:p>
+            <w:r>
+              <w:rPr>
+                <w:rFonts w:ascii="Aptos" w:eastAsia="Aptos" w:hAnsi="Aptos" w:cs="Aptos"/>
+                <w:sz w:val="20"/>
+                <w:szCs w:val="20"/>
+              </w:rPr>
+              <w:t xml:space="preserve"/>
+            </w:r>
+          </w:p>
+        </w:tc>
+        <w:tc>
+          <w:tcPr>
+            <w:tcW w:w="1600" w:type="pct"/>
+            <w:tcMar>
+              <w:top w:w="30" w:type="dxa"/>
+              <w:left w:w="80" w:type="dxa"/>
+              <w:bottom w:w="30" w:type="dxa"/>
+              <w:right w:w="80" w:type="dxa"/>
+            </w:tcMar>
+          </w:tcPr>
+          <w:p>
+            <w:r>
+              <w:rPr>
+                <w:rFonts w:ascii="Aptos" w:eastAsia="Aptos" w:hAnsi="Aptos" w:cs="Aptos"/>
+                <w:sz w:val="20"/>
+                <w:szCs w:val="20"/>
+              </w:rPr>
+              <w:t xml:space="preserve"/>
+            </w:r>
+          </w:p>
+        </w:tc>
+      </w:tr>
+      <w:tr>
+        <w:trPr>
+          <w:cantSplit/>
+        </w:trPr>
+        <w:tc>
+          <w:tcPr>
+            <w:tcW w:w="300" w:type="pct"/>
+            <w:tcMar>
+              <w:top w:w="30" w:type="dxa"/>
+              <w:left w:w="80" w:type="dxa"/>
+              <w:bottom w:w="30" w:type="dxa"/>
+              <w:right w:w="80" w:type="dxa"/>
+            </w:tcMar>
+          </w:tcPr>
+          <w:p>
+            <w:r>
+              <w:rPr>
+                <w:rFonts w:ascii="Aptos" w:eastAsia="Aptos" w:hAnsi="Aptos" w:cs="Aptos"/>
+                <w:sz w:val="20"/>
+                <w:szCs w:val="20"/>
+              </w:rPr>
+              <w:t xml:space="preserve">62</w:t>
+            </w:r>
+          </w:p>
+        </w:tc>
+        <w:tc>
+          <w:tcPr>
+            <w:tcW w:w="2350" w:type="pct"/>
+            <w:tcMar>
+              <w:top w:w="30" w:type="dxa"/>
+              <w:left w:w="80" w:type="dxa"/>
+              <w:bottom w:w="30" w:type="dxa"/>
+              <w:right w:w="80" w:type="dxa"/>
+            </w:tcMar>
+          </w:tcPr>
+          <w:p>
+            <w:r>
+              <w:rPr>
+                <w:rFonts w:ascii="Aptos" w:eastAsia="Aptos" w:hAnsi="Aptos" w:cs="Aptos"/>
+                <w:sz w:val="20"/>
+                <w:szCs w:val="20"/>
+              </w:rPr>
+              <w:t xml:space="preserve"/>
+            </w:r>
+          </w:p>
+        </w:tc>
+        <w:tc>
+          <w:tcPr>
+            <w:tcW w:w="750" w:type="pct"/>
+            <w:tcMar>
+              <w:top w:w="30" w:type="dxa"/>
+              <w:left w:w="80" w:type="dxa"/>
+              <w:bottom w:w="30" w:type="dxa"/>
+              <w:right w:w="80" w:type="dxa"/>
+            </w:tcMar>
+          </w:tcPr>
+          <w:p>
+            <w:r>
+              <w:rPr>
+                <w:rFonts w:ascii="Aptos" w:eastAsia="Aptos" w:hAnsi="Aptos" w:cs="Aptos"/>
+                <w:sz w:val="20"/>
+                <w:szCs w:val="20"/>
+              </w:rPr>
+              <w:t xml:space="preserve"/>
+            </w:r>
+          </w:p>
+        </w:tc>
+        <w:tc>
+          <w:tcPr>
+            <w:tcW w:w="1600" w:type="pct"/>
+            <w:tcMar>
+              <w:top w:w="30" w:type="dxa"/>
+              <w:left w:w="80" w:type="dxa"/>
+              <w:bottom w:w="30" w:type="dxa"/>
+              <w:right w:w="80" w:type="dxa"/>
+            </w:tcMar>
+          </w:tcPr>
+          <w:p>
+            <w:r>
+              <w:rPr>
+                <w:rFonts w:ascii="Aptos" w:eastAsia="Aptos" w:hAnsi="Aptos" w:cs="Aptos"/>
+                <w:sz w:val="20"/>
+                <w:szCs w:val="20"/>
+              </w:rPr>
+              <w:t xml:space="preserve"/>
+            </w:r>
+          </w:p>
+        </w:tc>
+      </w:tr>
+      <w:tr>
+        <w:trPr>
+          <w:cantSplit/>
+        </w:trPr>
+        <w:tc>
+          <w:tcPr>
+            <w:tcW w:w="300" w:type="pct"/>
+            <w:tcMar>
+              <w:top w:w="30" w:type="dxa"/>
+              <w:left w:w="80" w:type="dxa"/>
+              <w:bottom w:w="30" w:type="dxa"/>
+              <w:right w:w="80" w:type="dxa"/>
+            </w:tcMar>
+          </w:tcPr>
+          <w:p>
+            <w:r>
+              <w:rPr>
+                <w:rFonts w:ascii="Aptos" w:eastAsia="Aptos" w:hAnsi="Aptos" w:cs="Aptos"/>
+                <w:sz w:val="20"/>
+                <w:szCs w:val="20"/>
+              </w:rPr>
+              <w:t xml:space="preserve">63</w:t>
+            </w:r>
+          </w:p>
+        </w:tc>
+        <w:tc>
+          <w:tcPr>
+            <w:tcW w:w="2350" w:type="pct"/>
+            <w:tcMar>
+              <w:top w:w="30" w:type="dxa"/>
+              <w:left w:w="80" w:type="dxa"/>
+              <w:bottom w:w="30" w:type="dxa"/>
+              <w:right w:w="80" w:type="dxa"/>
+            </w:tcMar>
+          </w:tcPr>
+          <w:p>
+            <w:r>
+              <w:rPr>
+                <w:rFonts w:ascii="Aptos" w:eastAsia="Aptos" w:hAnsi="Aptos" w:cs="Aptos"/>
+                <w:sz w:val="20"/>
+                <w:szCs w:val="20"/>
+              </w:rPr>
+              <w:t xml:space="preserve"/>
+            </w:r>
+          </w:p>
+        </w:tc>
+        <w:tc>
+          <w:tcPr>
+            <w:tcW w:w="750" w:type="pct"/>
+            <w:tcMar>
+              <w:top w:w="30" w:type="dxa"/>
+              <w:left w:w="80" w:type="dxa"/>
+              <w:bottom w:w="30" w:type="dxa"/>
+              <w:right w:w="80" w:type="dxa"/>
+            </w:tcMar>
+          </w:tcPr>
+          <w:p>
+            <w:r>
+              <w:rPr>
+                <w:rFonts w:ascii="Aptos" w:eastAsia="Aptos" w:hAnsi="Aptos" w:cs="Aptos"/>
+                <w:sz w:val="20"/>
+                <w:szCs w:val="20"/>
+              </w:rPr>
+              <w:t xml:space="preserve"/>
+            </w:r>
+          </w:p>
+        </w:tc>
+        <w:tc>
+          <w:tcPr>
+            <w:tcW w:w="1600" w:type="pct"/>
+            <w:tcMar>
+              <w:top w:w="30" w:type="dxa"/>
+              <w:left w:w="80" w:type="dxa"/>
+              <w:bottom w:w="30" w:type="dxa"/>
+              <w:right w:w="80" w:type="dxa"/>
+            </w:tcMar>
+          </w:tcPr>
+          <w:p>
+            <w:r>
+              <w:rPr>
+                <w:rFonts w:ascii="Aptos" w:eastAsia="Aptos" w:hAnsi="Aptos" w:cs="Aptos"/>
+                <w:sz w:val="20"/>
+                <w:szCs w:val="20"/>
+              </w:rPr>
+              <w:t xml:space="preserve"/>
+            </w:r>
+          </w:p>
+        </w:tc>
+      </w:tr>
+      <w:tr>
+        <w:trPr>
+          <w:cantSplit/>
+        </w:trPr>
+        <w:tc>
+          <w:tcPr>
+            <w:tcW w:w="300" w:type="pct"/>
+            <w:tcMar>
+              <w:top w:w="30" w:type="dxa"/>
+              <w:left w:w="80" w:type="dxa"/>
+              <w:bottom w:w="30" w:type="dxa"/>
+              <w:right w:w="80" w:type="dxa"/>
+            </w:tcMar>
+          </w:tcPr>
+          <w:p>
+            <w:r>
+              <w:rPr>
+                <w:rFonts w:ascii="Aptos" w:eastAsia="Aptos" w:hAnsi="Aptos" w:cs="Aptos"/>
+                <w:sz w:val="20"/>
+                <w:szCs w:val="20"/>
+              </w:rPr>
+              <w:t xml:space="preserve">64</w:t>
+            </w:r>
+          </w:p>
+        </w:tc>
+        <w:tc>
+          <w:tcPr>
+            <w:tcW w:w="2350" w:type="pct"/>
+            <w:tcMar>
+              <w:top w:w="30" w:type="dxa"/>
+              <w:left w:w="80" w:type="dxa"/>
+              <w:bottom w:w="30" w:type="dxa"/>
+              <w:right w:w="80" w:type="dxa"/>
+            </w:tcMar>
+          </w:tcPr>
+          <w:p>
+            <w:r>
+              <w:rPr>
+                <w:rFonts w:ascii="Aptos" w:eastAsia="Aptos" w:hAnsi="Aptos" w:cs="Aptos"/>
+                <w:sz w:val="20"/>
+                <w:szCs w:val="20"/>
+              </w:rPr>
+              <w:t xml:space="preserve"/>
+            </w:r>
+          </w:p>
+        </w:tc>
+        <w:tc>
+          <w:tcPr>
+            <w:tcW w:w="750" w:type="pct"/>
+            <w:tcMar>
+              <w:top w:w="30" w:type="dxa"/>
+              <w:left w:w="80" w:type="dxa"/>
+              <w:bottom w:w="30" w:type="dxa"/>
+              <w:right w:w="80" w:type="dxa"/>
+            </w:tcMar>
+          </w:tcPr>
+          <w:p>
+            <w:r>
+              <w:rPr>
+                <w:rFonts w:ascii="Aptos" w:eastAsia="Aptos" w:hAnsi="Aptos" w:cs="Aptos"/>
+                <w:sz w:val="20"/>
+                <w:szCs w:val="20"/>
+              </w:rPr>
+              <w:t xml:space="preserve"/>
+            </w:r>
+          </w:p>
+        </w:tc>
+        <w:tc>
+          <w:tcPr>
+            <w:tcW w:w="1600" w:type="pct"/>
+            <w:tcMar>
+              <w:top w:w="30" w:type="dxa"/>
+              <w:left w:w="80" w:type="dxa"/>
+              <w:bottom w:w="30" w:type="dxa"/>
+              <w:right w:w="80" w:type="dxa"/>
+            </w:tcMar>
+          </w:tcPr>
+          <w:p>
+            <w:r>
+              <w:rPr>
+                <w:rFonts w:ascii="Aptos" w:eastAsia="Aptos" w:hAnsi="Aptos" w:cs="Aptos"/>
+                <w:sz w:val="20"/>
+                <w:szCs w:val="20"/>
+              </w:rPr>
+              <w:t xml:space="preserve"/>
+            </w:r>
+          </w:p>
+        </w:tc>
+      </w:tr>
+      <w:tr>
+        <w:trPr>
+          <w:cantSplit/>
+        </w:trPr>
+        <w:tc>
+          <w:tcPr>
+            <w:tcW w:w="300" w:type="pct"/>
+            <w:tcMar>
+              <w:top w:w="30" w:type="dxa"/>
+              <w:left w:w="80" w:type="dxa"/>
+              <w:bottom w:w="30" w:type="dxa"/>
+              <w:right w:w="80" w:type="dxa"/>
+            </w:tcMar>
+          </w:tcPr>
+          <w:p>
+            <w:r>
+              <w:rPr>
+                <w:rFonts w:ascii="Aptos" w:eastAsia="Aptos" w:hAnsi="Aptos" w:cs="Aptos"/>
+                <w:sz w:val="20"/>
+                <w:szCs w:val="20"/>
+              </w:rPr>
+              <w:t xml:space="preserve">65</w:t>
+            </w:r>
+          </w:p>
+        </w:tc>
+        <w:tc>
+          <w:tcPr>
+            <w:tcW w:w="2350" w:type="pct"/>
+            <w:tcMar>
+              <w:top w:w="30" w:type="dxa"/>
+              <w:left w:w="80" w:type="dxa"/>
+              <w:bottom w:w="30" w:type="dxa"/>
+              <w:right w:w="80" w:type="dxa"/>
+            </w:tcMar>
+          </w:tcPr>
+          <w:p>
+            <w:r>
+              <w:rPr>
+                <w:rFonts w:ascii="Aptos" w:eastAsia="Aptos" w:hAnsi="Aptos" w:cs="Aptos"/>
+                <w:sz w:val="20"/>
+                <w:szCs w:val="20"/>
+              </w:rPr>
+              <w:t xml:space="preserve"/>
+            </w:r>
+          </w:p>
+        </w:tc>
+        <w:tc>
+          <w:tcPr>
+            <w:tcW w:w="750" w:type="pct"/>
+            <w:tcMar>
+              <w:top w:w="30" w:type="dxa"/>
+              <w:left w:w="80" w:type="dxa"/>
+              <w:bottom w:w="30" w:type="dxa"/>
+              <w:right w:w="80" w:type="dxa"/>
+            </w:tcMar>
+          </w:tcPr>
+          <w:p>
+            <w:r>
+              <w:rPr>
+                <w:rFonts w:ascii="Aptos" w:eastAsia="Aptos" w:hAnsi="Aptos" w:cs="Aptos"/>
+                <w:sz w:val="20"/>
+                <w:szCs w:val="20"/>
+              </w:rPr>
+              <w:t xml:space="preserve"/>
+            </w:r>
+          </w:p>
+        </w:tc>
+        <w:tc>
+          <w:tcPr>
+            <w:tcW w:w="1600" w:type="pct"/>
+            <w:tcMar>
+              <w:top w:w="30" w:type="dxa"/>
+              <w:left w:w="80" w:type="dxa"/>
+              <w:bottom w:w="30" w:type="dxa"/>
+              <w:right w:w="80" w:type="dxa"/>
+            </w:tcMar>
+          </w:tcPr>
+          <w:p>
+            <w:r>
+              <w:rPr>
+                <w:rFonts w:ascii="Aptos" w:eastAsia="Aptos" w:hAnsi="Aptos" w:cs="Aptos"/>
+                <w:sz w:val="20"/>
+                <w:szCs w:val="20"/>
+              </w:rPr>
+              <w:t xml:space="preserve"/>
+            </w:r>
+          </w:p>
+        </w:tc>
+      </w:tr>
+      <w:tr>
+        <w:trPr>
+          <w:cantSplit/>
+        </w:trPr>
+        <w:tc>
+          <w:tcPr>
+            <w:tcW w:w="300" w:type="pct"/>
+            <w:tcMar>
+              <w:top w:w="30" w:type="dxa"/>
+              <w:left w:w="80" w:type="dxa"/>
+              <w:bottom w:w="30" w:type="dxa"/>
+              <w:right w:w="80" w:type="dxa"/>
+            </w:tcMar>
+          </w:tcPr>
+          <w:p>
+            <w:r>
+              <w:rPr>
+                <w:rFonts w:ascii="Aptos" w:eastAsia="Aptos" w:hAnsi="Aptos" w:cs="Aptos"/>
+                <w:sz w:val="20"/>
+                <w:szCs w:val="20"/>
+              </w:rPr>
+              <w:t xml:space="preserve">66</w:t>
+            </w:r>
+          </w:p>
+        </w:tc>
+        <w:tc>
+          <w:tcPr>
+            <w:tcW w:w="2350" w:type="pct"/>
+            <w:tcMar>
+              <w:top w:w="30" w:type="dxa"/>
+              <w:left w:w="80" w:type="dxa"/>
+              <w:bottom w:w="30" w:type="dxa"/>
+              <w:right w:w="80" w:type="dxa"/>
+            </w:tcMar>
+          </w:tcPr>
+          <w:p>
+            <w:r>
+              <w:rPr>
+                <w:rFonts w:ascii="Aptos" w:eastAsia="Aptos" w:hAnsi="Aptos" w:cs="Aptos"/>
+                <w:sz w:val="20"/>
+                <w:szCs w:val="20"/>
+              </w:rPr>
+              <w:t xml:space="preserve"/>
+            </w:r>
+          </w:p>
+        </w:tc>
+        <w:tc>
+          <w:tcPr>
+            <w:tcW w:w="750" w:type="pct"/>
+            <w:tcMar>
+              <w:top w:w="30" w:type="dxa"/>
+              <w:left w:w="80" w:type="dxa"/>
+              <w:bottom w:w="30" w:type="dxa"/>
+              <w:right w:w="80" w:type="dxa"/>
+            </w:tcMar>
+          </w:tcPr>
+          <w:p>
+            <w:r>
+              <w:rPr>
+                <w:rFonts w:ascii="Aptos" w:eastAsia="Aptos" w:hAnsi="Aptos" w:cs="Aptos"/>
+                <w:sz w:val="20"/>
+                <w:szCs w:val="20"/>
+              </w:rPr>
+              <w:t xml:space="preserve"/>
+            </w:r>
+          </w:p>
+        </w:tc>
+        <w:tc>
+          <w:tcPr>
+            <w:tcW w:w="1600" w:type="pct"/>
+            <w:tcMar>
+              <w:top w:w="30" w:type="dxa"/>
+              <w:left w:w="80" w:type="dxa"/>
+              <w:bottom w:w="30" w:type="dxa"/>
+              <w:right w:w="80" w:type="dxa"/>
+            </w:tcMar>
+          </w:tcPr>
+          <w:p>
+            <w:r>
+              <w:rPr>
+                <w:rFonts w:ascii="Aptos" w:eastAsia="Aptos" w:hAnsi="Aptos" w:cs="Aptos"/>
+                <w:sz w:val="20"/>
+                <w:szCs w:val="20"/>
+              </w:rPr>
+              <w:t xml:space="preserve"/>
+            </w:r>
+          </w:p>
+        </w:tc>
+      </w:tr>
+      <w:tr>
+        <w:trPr>
+          <w:cantSplit/>
+        </w:trPr>
+        <w:tc>
+          <w:tcPr>
+            <w:tcW w:w="300" w:type="pct"/>
+            <w:tcMar>
+              <w:top w:w="30" w:type="dxa"/>
+              <w:left w:w="80" w:type="dxa"/>
+              <w:bottom w:w="30" w:type="dxa"/>
+              <w:right w:w="80" w:type="dxa"/>
+            </w:tcMar>
+          </w:tcPr>
+          <w:p>
+            <w:r>
+              <w:rPr>
+                <w:rFonts w:ascii="Aptos" w:eastAsia="Aptos" w:hAnsi="Aptos" w:cs="Aptos"/>
+                <w:sz w:val="20"/>
+                <w:szCs w:val="20"/>
+              </w:rPr>
+              <w:t xml:space="preserve">67</w:t>
+            </w:r>
+          </w:p>
+        </w:tc>
+        <w:tc>
+          <w:tcPr>
+            <w:tcW w:w="2350" w:type="pct"/>
+            <w:tcMar>
+              <w:top w:w="30" w:type="dxa"/>
+              <w:left w:w="80" w:type="dxa"/>
+              <w:bottom w:w="30" w:type="dxa"/>
+              <w:right w:w="80" w:type="dxa"/>
+            </w:tcMar>
+          </w:tcPr>
+          <w:p>
+            <w:r>
+              <w:rPr>
+                <w:rFonts w:ascii="Aptos" w:eastAsia="Aptos" w:hAnsi="Aptos" w:cs="Aptos"/>
+                <w:sz w:val="20"/>
+                <w:szCs w:val="20"/>
+              </w:rPr>
+              <w:t xml:space="preserve"/>
+            </w:r>
+          </w:p>
+        </w:tc>
+        <w:tc>
+          <w:tcPr>
+            <w:tcW w:w="750" w:type="pct"/>
+            <w:tcMar>
+              <w:top w:w="30" w:type="dxa"/>
+              <w:left w:w="80" w:type="dxa"/>
+              <w:bottom w:w="30" w:type="dxa"/>
+              <w:right w:w="80" w:type="dxa"/>
+            </w:tcMar>
+          </w:tcPr>
+          <w:p>
+            <w:r>
+              <w:rPr>
+                <w:rFonts w:ascii="Aptos" w:eastAsia="Aptos" w:hAnsi="Aptos" w:cs="Aptos"/>
+                <w:sz w:val="20"/>
+                <w:szCs w:val="20"/>
+              </w:rPr>
+              <w:t xml:space="preserve"/>
+            </w:r>
+          </w:p>
+        </w:tc>
+        <w:tc>
+          <w:tcPr>
+            <w:tcW w:w="1600" w:type="pct"/>
+            <w:tcMar>
+              <w:top w:w="30" w:type="dxa"/>
+              <w:left w:w="80" w:type="dxa"/>
+              <w:bottom w:w="30" w:type="dxa"/>
+              <w:right w:w="80" w:type="dxa"/>
+            </w:tcMar>
+          </w:tcPr>
+          <w:p>
+            <w:r>
+              <w:rPr>
+                <w:rFonts w:ascii="Aptos" w:eastAsia="Aptos" w:hAnsi="Aptos" w:cs="Aptos"/>
+                <w:sz w:val="20"/>
+                <w:szCs w:val="20"/>
+              </w:rPr>
+              <w:t xml:space="preserve"/>
+            </w:r>
+          </w:p>
+        </w:tc>
+      </w:tr>
+      <w:tr>
+        <w:trPr>
+          <w:cantSplit/>
+        </w:trPr>
+        <w:tc>
+          <w:tcPr>
+            <w:tcW w:w="300" w:type="pct"/>
+            <w:tcMar>
+              <w:top w:w="30" w:type="dxa"/>
+              <w:left w:w="80" w:type="dxa"/>
+              <w:bottom w:w="30" w:type="dxa"/>
+              <w:right w:w="80" w:type="dxa"/>
+            </w:tcMar>
+          </w:tcPr>
+          <w:p>
+            <w:r>
+              <w:rPr>
+                <w:rFonts w:ascii="Aptos" w:eastAsia="Aptos" w:hAnsi="Aptos" w:cs="Aptos"/>
+                <w:sz w:val="20"/>
+                <w:szCs w:val="20"/>
+              </w:rPr>
+              <w:t xml:space="preserve">68</w:t>
+            </w:r>
+          </w:p>
+        </w:tc>
+        <w:tc>
+          <w:tcPr>
+            <w:tcW w:w="2350" w:type="pct"/>
+            <w:tcMar>
+              <w:top w:w="30" w:type="dxa"/>
+              <w:left w:w="80" w:type="dxa"/>
+              <w:bottom w:w="30" w:type="dxa"/>
+              <w:right w:w="80" w:type="dxa"/>
+            </w:tcMar>
+          </w:tcPr>
+          <w:p>
+            <w:r>
+              <w:rPr>
+                <w:rFonts w:ascii="Aptos" w:eastAsia="Aptos" w:hAnsi="Aptos" w:cs="Aptos"/>
+                <w:sz w:val="20"/>
+                <w:szCs w:val="20"/>
+              </w:rPr>
+              <w:t xml:space="preserve"/>
+            </w:r>
+          </w:p>
+        </w:tc>
+        <w:tc>
+          <w:tcPr>
+            <w:tcW w:w="750" w:type="pct"/>
+            <w:tcMar>
+              <w:top w:w="30" w:type="dxa"/>
+              <w:left w:w="80" w:type="dxa"/>
+              <w:bottom w:w="30" w:type="dxa"/>
+              <w:right w:w="80" w:type="dxa"/>
+            </w:tcMar>
+          </w:tcPr>
+          <w:p>
+            <w:r>
+              <w:rPr>
+                <w:rFonts w:ascii="Aptos" w:eastAsia="Aptos" w:hAnsi="Aptos" w:cs="Aptos"/>
+                <w:sz w:val="20"/>
+                <w:szCs w:val="20"/>
+              </w:rPr>
+              <w:t xml:space="preserve"/>
+            </w:r>
+          </w:p>
+        </w:tc>
+        <w:tc>
+          <w:tcPr>
+            <w:tcW w:w="1600" w:type="pct"/>
+            <w:tcMar>
+              <w:top w:w="30" w:type="dxa"/>
+              <w:left w:w="80" w:type="dxa"/>
+              <w:bottom w:w="30" w:type="dxa"/>
+              <w:right w:w="80" w:type="dxa"/>
+            </w:tcMar>
+          </w:tcPr>
+          <w:p>
+            <w:r>
+              <w:rPr>
+                <w:rFonts w:ascii="Aptos" w:eastAsia="Aptos" w:hAnsi="Aptos" w:cs="Aptos"/>
+                <w:sz w:val="20"/>
+                <w:szCs w:val="20"/>
+              </w:rPr>
+              <w:t xml:space="preserve"/>
+            </w:r>
+          </w:p>
+        </w:tc>
+      </w:tr>
+      <w:tr>
+        <w:trPr>
+          <w:cantSplit/>
+        </w:trPr>
+        <w:tc>
+          <w:tcPr>
+            <w:tcW w:w="300" w:type="pct"/>
+            <w:tcMar>
+              <w:top w:w="30" w:type="dxa"/>
+              <w:left w:w="80" w:type="dxa"/>
+              <w:bottom w:w="30" w:type="dxa"/>
+              <w:right w:w="80" w:type="dxa"/>
+            </w:tcMar>
+          </w:tcPr>
+          <w:p>
+            <w:r>
+              <w:rPr>
+                <w:rFonts w:ascii="Aptos" w:eastAsia="Aptos" w:hAnsi="Aptos" w:cs="Aptos"/>
+                <w:sz w:val="20"/>
+                <w:szCs w:val="20"/>
+              </w:rPr>
+              <w:t xml:space="preserve">69</w:t>
+            </w:r>
+          </w:p>
+        </w:tc>
+        <w:tc>
+          <w:tcPr>
+            <w:tcW w:w="2350" w:type="pct"/>
+            <w:tcMar>
+              <w:top w:w="30" w:type="dxa"/>
+              <w:left w:w="80" w:type="dxa"/>
+              <w:bottom w:w="30" w:type="dxa"/>
+              <w:right w:w="80" w:type="dxa"/>
+            </w:tcMar>
+          </w:tcPr>
+          <w:p>
+            <w:r>
+              <w:rPr>
+                <w:rFonts w:ascii="Aptos" w:eastAsia="Aptos" w:hAnsi="Aptos" w:cs="Aptos"/>
+                <w:sz w:val="20"/>
+                <w:szCs w:val="20"/>
+              </w:rPr>
+              <w:t xml:space="preserve"/>
+            </w:r>
+          </w:p>
+        </w:tc>
+        <w:tc>
+          <w:tcPr>
+            <w:tcW w:w="750" w:type="pct"/>
+            <w:tcMar>
+              <w:top w:w="30" w:type="dxa"/>
+              <w:left w:w="80" w:type="dxa"/>
+              <w:bottom w:w="30" w:type="dxa"/>
+              <w:right w:w="80" w:type="dxa"/>
+            </w:tcMar>
+          </w:tcPr>
+          <w:p>
+            <w:r>
+              <w:rPr>
+                <w:rFonts w:ascii="Aptos" w:eastAsia="Aptos" w:hAnsi="Aptos" w:cs="Aptos"/>
+                <w:sz w:val="20"/>
+                <w:szCs w:val="20"/>
+              </w:rPr>
+              <w:t xml:space="preserve"/>
+            </w:r>
+          </w:p>
+        </w:tc>
+        <w:tc>
+          <w:tcPr>
+            <w:tcW w:w="1600" w:type="pct"/>
+            <w:tcMar>
+              <w:top w:w="30" w:type="dxa"/>
+              <w:left w:w="80" w:type="dxa"/>
+              <w:bottom w:w="30" w:type="dxa"/>
+              <w:right w:w="80" w:type="dxa"/>
+            </w:tcMar>
+          </w:tcPr>
+          <w:p>
+            <w:r>
+              <w:rPr>
+                <w:rFonts w:ascii="Aptos" w:eastAsia="Aptos" w:hAnsi="Aptos" w:cs="Aptos"/>
+                <w:sz w:val="20"/>
+                <w:szCs w:val="20"/>
+              </w:rPr>
+              <w:t xml:space="preserve"/>
+            </w:r>
+          </w:p>
+        </w:tc>
+      </w:tr>
+      <w:tr>
+        <w:trPr>
+          <w:cantSplit/>
+        </w:trPr>
+        <w:tc>
+          <w:tcPr>
+            <w:tcW w:w="300" w:type="pct"/>
+            <w:tcMar>
+              <w:top w:w="30" w:type="dxa"/>
+              <w:left w:w="80" w:type="dxa"/>
+              <w:bottom w:w="30" w:type="dxa"/>
+              <w:right w:w="80" w:type="dxa"/>
+            </w:tcMar>
+          </w:tcPr>
+          <w:p>
+            <w:r>
+              <w:rPr>
+                <w:rFonts w:ascii="Aptos" w:eastAsia="Aptos" w:hAnsi="Aptos" w:cs="Aptos"/>
+                <w:sz w:val="20"/>
+                <w:szCs w:val="20"/>
+              </w:rPr>
+              <w:t xml:space="preserve">70</w:t>
+            </w:r>
+          </w:p>
+        </w:tc>
+        <w:tc>
+          <w:tcPr>
+            <w:tcW w:w="2350" w:type="pct"/>
+            <w:tcMar>
+              <w:top w:w="30" w:type="dxa"/>
+              <w:left w:w="80" w:type="dxa"/>
+              <w:bottom w:w="30" w:type="dxa"/>
+              <w:right w:w="80" w:type="dxa"/>
+            </w:tcMar>
+          </w:tcPr>
+          <w:p>
+            <w:r>
+              <w:rPr>
+                <w:rFonts w:ascii="Aptos" w:eastAsia="Aptos" w:hAnsi="Aptos" w:cs="Aptos"/>
+                <w:sz w:val="20"/>
+                <w:szCs w:val="20"/>
+              </w:rPr>
+              <w:t xml:space="preserve"/>
+            </w:r>
+          </w:p>
+        </w:tc>
+        <w:tc>
+          <w:tcPr>
+            <w:tcW w:w="750" w:type="pct"/>
+            <w:tcMar>
+              <w:top w:w="30" w:type="dxa"/>
+              <w:left w:w="80" w:type="dxa"/>
+              <w:bottom w:w="30" w:type="dxa"/>
+              <w:right w:w="80" w:type="dxa"/>
+            </w:tcMar>
+          </w:tcPr>
+          <w:p>
+            <w:r>
+              <w:rPr>
+                <w:rFonts w:ascii="Aptos" w:eastAsia="Aptos" w:hAnsi="Aptos" w:cs="Aptos"/>
+                <w:sz w:val="20"/>
+                <w:szCs w:val="20"/>
+              </w:rPr>
+              <w:t xml:space="preserve"/>
+            </w:r>
+          </w:p>
+        </w:tc>
+        <w:tc>
+          <w:tcPr>
+            <w:tcW w:w="1600" w:type="pct"/>
+            <w:tcMar>
+              <w:top w:w="30" w:type="dxa"/>
+              <w:left w:w="80" w:type="dxa"/>
+              <w:bottom w:w="30" w:type="dxa"/>
+              <w:right w:w="80" w:type="dxa"/>
+            </w:tcMar>
+          </w:tcPr>
+          <w:p>
+            <w:r>
+              <w:rPr>
+                <w:rFonts w:ascii="Aptos" w:eastAsia="Aptos" w:hAnsi="Aptos" w:cs="Aptos"/>
+                <w:sz w:val="20"/>
+                <w:szCs w:val="20"/>
+              </w:rPr>
+              <w:t xml:space="preserve"/>
+            </w:r>
+          </w:p>
+        </w:tc>
+      </w:tr>
+      <w:tr>
+        <w:trPr>
+          <w:cantSplit/>
+        </w:trPr>
+        <w:tc>
+          <w:tcPr>
+            <w:tcW w:w="300" w:type="pct"/>
+            <w:tcMar>
+              <w:top w:w="30" w:type="dxa"/>
+              <w:left w:w="80" w:type="dxa"/>
+              <w:bottom w:w="30" w:type="dxa"/>
+              <w:right w:w="80" w:type="dxa"/>
+            </w:tcMar>
+          </w:tcPr>
+          <w:p>
+            <w:r>
+              <w:rPr>
+                <w:rFonts w:ascii="Aptos" w:eastAsia="Aptos" w:hAnsi="Aptos" w:cs="Aptos"/>
+                <w:sz w:val="20"/>
+                <w:szCs w:val="20"/>
+              </w:rPr>
+              <w:t xml:space="preserve">71</w:t>
+            </w:r>
+          </w:p>
+        </w:tc>
+        <w:tc>
+          <w:tcPr>
+            <w:tcW w:w="2350" w:type="pct"/>
+            <w:tcMar>
+              <w:top w:w="30" w:type="dxa"/>
+              <w:left w:w="80" w:type="dxa"/>
+              <w:bottom w:w="30" w:type="dxa"/>
+              <w:right w:w="80" w:type="dxa"/>
+            </w:tcMar>
+          </w:tcPr>
+          <w:p>
+            <w:r>
+              <w:rPr>
+                <w:rFonts w:ascii="Aptos" w:eastAsia="Aptos" w:hAnsi="Aptos" w:cs="Aptos"/>
+                <w:sz w:val="20"/>
+                <w:szCs w:val="20"/>
+              </w:rPr>
+              <w:t xml:space="preserve"/>
+            </w:r>
+          </w:p>
+        </w:tc>
+        <w:tc>
+          <w:tcPr>
+            <w:tcW w:w="750" w:type="pct"/>
+            <w:tcMar>
+              <w:top w:w="30" w:type="dxa"/>
+              <w:left w:w="80" w:type="dxa"/>
+              <w:bottom w:w="30" w:type="dxa"/>
+              <w:right w:w="80" w:type="dxa"/>
+            </w:tcMar>
+          </w:tcPr>
+          <w:p>
+            <w:r>
+              <w:rPr>
+                <w:rFonts w:ascii="Aptos" w:eastAsia="Aptos" w:hAnsi="Aptos" w:cs="Aptos"/>
+                <w:sz w:val="20"/>
+                <w:szCs w:val="20"/>
+              </w:rPr>
+              <w:t xml:space="preserve"/>
+            </w:r>
+          </w:p>
+        </w:tc>
+        <w:tc>
+          <w:tcPr>
+            <w:tcW w:w="1600" w:type="pct"/>
+            <w:tcMar>
+              <w:top w:w="30" w:type="dxa"/>
+              <w:left w:w="80" w:type="dxa"/>
+              <w:bottom w:w="30" w:type="dxa"/>
+              <w:right w:w="80" w:type="dxa"/>
+            </w:tcMar>
+          </w:tcPr>
+          <w:p>
+            <w:r>
+              <w:rPr>
+                <w:rFonts w:ascii="Aptos" w:eastAsia="Aptos" w:hAnsi="Aptos" w:cs="Aptos"/>
+                <w:sz w:val="20"/>
+                <w:szCs w:val="20"/>
+              </w:rPr>
+              <w:t xml:space="preserve"/>
+            </w:r>
+          </w:p>
+        </w:tc>
+      </w:tr>
+      <w:tr>
+        <w:trPr>
+          <w:cantSplit/>
+        </w:trPr>
+        <w:tc>
+          <w:tcPr>
+            <w:tcW w:w="300" w:type="pct"/>
+            <w:tcMar>
+              <w:top w:w="30" w:type="dxa"/>
+              <w:left w:w="80" w:type="dxa"/>
+              <w:bottom w:w="30" w:type="dxa"/>
+              <w:right w:w="80" w:type="dxa"/>
+            </w:tcMar>
+          </w:tcPr>
+          <w:p>
+            <w:r>
+              <w:rPr>
+                <w:rFonts w:ascii="Aptos" w:eastAsia="Aptos" w:hAnsi="Aptos" w:cs="Aptos"/>
+                <w:sz w:val="20"/>
+                <w:szCs w:val="20"/>
+              </w:rPr>
+              <w:t xml:space="preserve">72</w:t>
+            </w:r>
+          </w:p>
+        </w:tc>
+        <w:tc>
+          <w:tcPr>
+            <w:tcW w:w="2350" w:type="pct"/>
+            <w:tcMar>
+              <w:top w:w="30" w:type="dxa"/>
+              <w:left w:w="80" w:type="dxa"/>
+              <w:bottom w:w="30" w:type="dxa"/>
+              <w:right w:w="80" w:type="dxa"/>
+            </w:tcMar>
+          </w:tcPr>
+          <w:p>
+            <w:r>
+              <w:rPr>
+                <w:rFonts w:ascii="Aptos" w:eastAsia="Aptos" w:hAnsi="Aptos" w:cs="Aptos"/>
+                <w:sz w:val="20"/>
+                <w:szCs w:val="20"/>
+              </w:rPr>
+              <w:t xml:space="preserve"/>
+            </w:r>
+          </w:p>
+        </w:tc>
+        <w:tc>
+          <w:tcPr>
+            <w:tcW w:w="750" w:type="pct"/>
+            <w:tcMar>
+              <w:top w:w="30" w:type="dxa"/>
+              <w:left w:w="80" w:type="dxa"/>
+              <w:bottom w:w="30" w:type="dxa"/>
+              <w:right w:w="80" w:type="dxa"/>
+            </w:tcMar>
+          </w:tcPr>
+          <w:p>
+            <w:r>
+              <w:rPr>
+                <w:rFonts w:ascii="Aptos" w:eastAsia="Aptos" w:hAnsi="Aptos" w:cs="Aptos"/>
+                <w:sz w:val="20"/>
+                <w:szCs w:val="20"/>
+              </w:rPr>
+              <w:t xml:space="preserve"/>
+            </w:r>
+          </w:p>
+        </w:tc>
+        <w:tc>
+          <w:tcPr>
+            <w:tcW w:w="1600" w:type="pct"/>
+            <w:tcMar>
+              <w:top w:w="30" w:type="dxa"/>
+              <w:left w:w="80" w:type="dxa"/>
+              <w:bottom w:w="30" w:type="dxa"/>
+              <w:right w:w="80" w:type="dxa"/>
+            </w:tcMar>
+          </w:tcPr>
+          <w:p>
+            <w:r>
+              <w:rPr>
+                <w:rFonts w:ascii="Aptos" w:eastAsia="Aptos" w:hAnsi="Aptos" w:cs="Aptos"/>
+                <w:sz w:val="20"/>
+                <w:szCs w:val="20"/>
+              </w:rPr>
+              <w:t xml:space="preserve"/>
+            </w:r>
+          </w:p>
+        </w:tc>
+      </w:tr>
+      <w:tr>
+        <w:trPr>
+          <w:cantSplit/>
+        </w:trPr>
+        <w:tc>
+          <w:tcPr>
+            <w:tcW w:w="300" w:type="pct"/>
+            <w:tcMar>
+              <w:top w:w="30" w:type="dxa"/>
+              <w:left w:w="80" w:type="dxa"/>
+              <w:bottom w:w="30" w:type="dxa"/>
+              <w:right w:w="80" w:type="dxa"/>
+            </w:tcMar>
+          </w:tcPr>
+          <w:p>
+            <w:r>
+              <w:rPr>
+                <w:rFonts w:ascii="Aptos" w:eastAsia="Aptos" w:hAnsi="Aptos" w:cs="Aptos"/>
+                <w:sz w:val="20"/>
+                <w:szCs w:val="20"/>
+              </w:rPr>
+              <w:t xml:space="preserve">73</w:t>
+            </w:r>
+          </w:p>
+        </w:tc>
+        <w:tc>
+          <w:tcPr>
+            <w:tcW w:w="2350" w:type="pct"/>
+            <w:tcMar>
+              <w:top w:w="30" w:type="dxa"/>
+              <w:left w:w="80" w:type="dxa"/>
+              <w:bottom w:w="30" w:type="dxa"/>
+              <w:right w:w="80" w:type="dxa"/>
+            </w:tcMar>
+          </w:tcPr>
+          <w:p>
+            <w:r>
+              <w:rPr>
+                <w:rFonts w:ascii="Aptos" w:eastAsia="Aptos" w:hAnsi="Aptos" w:cs="Aptos"/>
+                <w:sz w:val="20"/>
+                <w:szCs w:val="20"/>
+              </w:rPr>
+              <w:t xml:space="preserve"/>
+            </w:r>
+          </w:p>
+        </w:tc>
+        <w:tc>
+          <w:tcPr>
+            <w:tcW w:w="750" w:type="pct"/>
+            <w:tcMar>
+              <w:top w:w="30" w:type="dxa"/>
+              <w:left w:w="80" w:type="dxa"/>
+              <w:bottom w:w="30" w:type="dxa"/>
+              <w:right w:w="80" w:type="dxa"/>
+            </w:tcMar>
+          </w:tcPr>
+          <w:p>
+            <w:r>
+              <w:rPr>
+                <w:rFonts w:ascii="Aptos" w:eastAsia="Aptos" w:hAnsi="Aptos" w:cs="Aptos"/>
+                <w:sz w:val="20"/>
+                <w:szCs w:val="20"/>
+              </w:rPr>
+              <w:t xml:space="preserve"/>
+            </w:r>
+          </w:p>
+        </w:tc>
+        <w:tc>
+          <w:tcPr>
+            <w:tcW w:w="1600" w:type="pct"/>
+            <w:tcMar>
+              <w:top w:w="30" w:type="dxa"/>
+              <w:left w:w="80" w:type="dxa"/>
+              <w:bottom w:w="30" w:type="dxa"/>
+              <w:right w:w="80" w:type="dxa"/>
+            </w:tcMar>
+          </w:tcPr>
+          <w:p>
+            <w:r>
+              <w:rPr>
+                <w:rFonts w:ascii="Aptos" w:eastAsia="Aptos" w:hAnsi="Aptos" w:cs="Aptos"/>
+                <w:sz w:val="20"/>
+                <w:szCs w:val="20"/>
+              </w:rPr>
+              <w:t xml:space="preserve"/>
+            </w:r>
+          </w:p>
+        </w:tc>
+      </w:tr>
+      <w:tr>
+        <w:trPr>
+          <w:cantSplit/>
+        </w:trPr>
+        <w:tc>
+          <w:tcPr>
+            <w:tcW w:w="300" w:type="pct"/>
+            <w:tcMar>
+              <w:top w:w="30" w:type="dxa"/>
+              <w:left w:w="80" w:type="dxa"/>
+              <w:bottom w:w="30" w:type="dxa"/>
+              <w:right w:w="80" w:type="dxa"/>
+            </w:tcMar>
+          </w:tcPr>
+          <w:p>
+            <w:r>
+              <w:rPr>
+                <w:rFonts w:ascii="Aptos" w:eastAsia="Aptos" w:hAnsi="Aptos" w:cs="Aptos"/>
+                <w:sz w:val="20"/>
+                <w:szCs w:val="20"/>
+              </w:rPr>
+              <w:t xml:space="preserve">74</w:t>
+            </w:r>
+          </w:p>
+        </w:tc>
+        <w:tc>
+          <w:tcPr>
+            <w:tcW w:w="2350" w:type="pct"/>
+            <w:tcMar>
+              <w:top w:w="30" w:type="dxa"/>
+              <w:left w:w="80" w:type="dxa"/>
+              <w:bottom w:w="30" w:type="dxa"/>
+              <w:right w:w="80" w:type="dxa"/>
+            </w:tcMar>
+          </w:tcPr>
+          <w:p>
+            <w:r>
+              <w:rPr>
+                <w:rFonts w:ascii="Aptos" w:eastAsia="Aptos" w:hAnsi="Aptos" w:cs="Aptos"/>
+                <w:sz w:val="20"/>
+                <w:szCs w:val="20"/>
+              </w:rPr>
+              <w:t xml:space="preserve"/>
+            </w:r>
+          </w:p>
+        </w:tc>
+        <w:tc>
+          <w:tcPr>
+            <w:tcW w:w="750" w:type="pct"/>
+            <w:tcMar>
+              <w:top w:w="30" w:type="dxa"/>
+              <w:left w:w="80" w:type="dxa"/>
+              <w:bottom w:w="30" w:type="dxa"/>
+              <w:right w:w="80" w:type="dxa"/>
+            </w:tcMar>
+          </w:tcPr>
+          <w:p>
+            <w:r>
+              <w:rPr>
+                <w:rFonts w:ascii="Aptos" w:eastAsia="Aptos" w:hAnsi="Aptos" w:cs="Aptos"/>
+                <w:sz w:val="20"/>
+                <w:szCs w:val="20"/>
+              </w:rPr>
+              <w:t xml:space="preserve"/>
+            </w:r>
+          </w:p>
+        </w:tc>
+        <w:tc>
+          <w:tcPr>
+            <w:tcW w:w="1600" w:type="pct"/>
+            <w:tcMar>
+              <w:top w:w="30" w:type="dxa"/>
+              <w:left w:w="80" w:type="dxa"/>
+              <w:bottom w:w="30" w:type="dxa"/>
+              <w:right w:w="80" w:type="dxa"/>
+            </w:tcMar>
+          </w:tcPr>
+          <w:p>
+            <w:r>
+              <w:rPr>
+                <w:rFonts w:ascii="Aptos" w:eastAsia="Aptos" w:hAnsi="Aptos" w:cs="Aptos"/>
+                <w:sz w:val="20"/>
+                <w:szCs w:val="20"/>
+              </w:rPr>
+              <w:t xml:space="preserve"/>
+            </w:r>
+          </w:p>
+        </w:tc>
+      </w:tr>
+      <w:tr>
+        <w:trPr>
+          <w:cantSplit/>
+        </w:trPr>
+        <w:tc>
+          <w:tcPr>
+            <w:tcW w:w="300" w:type="pct"/>
+            <w:tcMar>
+              <w:top w:w="30" w:type="dxa"/>
+              <w:left w:w="80" w:type="dxa"/>
+              <w:bottom w:w="30" w:type="dxa"/>
+              <w:right w:w="80" w:type="dxa"/>
+            </w:tcMar>
+          </w:tcPr>
+          <w:p>
+            <w:r>
+              <w:rPr>
+                <w:rFonts w:ascii="Aptos" w:eastAsia="Aptos" w:hAnsi="Aptos" w:cs="Aptos"/>
+                <w:sz w:val="20"/>
+                <w:szCs w:val="20"/>
+              </w:rPr>
+              <w:t xml:space="preserve">75</w:t>
+            </w:r>
+          </w:p>
+        </w:tc>
+        <w:tc>
+          <w:tcPr>
+            <w:tcW w:w="2350" w:type="pct"/>
+            <w:tcMar>
+              <w:top w:w="30" w:type="dxa"/>
+              <w:left w:w="80" w:type="dxa"/>
+              <w:bottom w:w="30" w:type="dxa"/>
+              <w:right w:w="80" w:type="dxa"/>
+            </w:tcMar>
+          </w:tcPr>
+          <w:p>
+            <w:r>
+              <w:rPr>
+                <w:rFonts w:ascii="Aptos" w:eastAsia="Aptos" w:hAnsi="Aptos" w:cs="Aptos"/>
+                <w:sz w:val="20"/>
+                <w:szCs w:val="20"/>
+              </w:rPr>
+              <w:t xml:space="preserve"/>
+            </w:r>
+          </w:p>
+        </w:tc>
+        <w:tc>
+          <w:tcPr>
+            <w:tcW w:w="750" w:type="pct"/>
+            <w:tcMar>
+              <w:top w:w="30" w:type="dxa"/>
+              <w:left w:w="80" w:type="dxa"/>
+              <w:bottom w:w="30" w:type="dxa"/>
+              <w:right w:w="80" w:type="dxa"/>
+            </w:tcMar>
+          </w:tcPr>
+          <w:p>
+            <w:r>
+              <w:rPr>
+                <w:rFonts w:ascii="Aptos" w:eastAsia="Aptos" w:hAnsi="Aptos" w:cs="Aptos"/>
+                <w:sz w:val="20"/>
+                <w:szCs w:val="20"/>
+              </w:rPr>
+              <w:t xml:space="preserve"/>
+            </w:r>
+          </w:p>
+        </w:tc>
+        <w:tc>
+          <w:tcPr>
+            <w:tcW w:w="1600" w:type="pct"/>
+            <w:tcMar>
+              <w:top w:w="30" w:type="dxa"/>
+              <w:left w:w="80" w:type="dxa"/>
+              <w:bottom w:w="30" w:type="dxa"/>
+              <w:right w:w="80" w:type="dxa"/>
+            </w:tcMar>
+          </w:tcPr>
+          <w:p>
+            <w:r>
+              <w:rPr>
+                <w:rFonts w:ascii="Aptos" w:eastAsia="Aptos" w:hAnsi="Aptos" w:cs="Aptos"/>
+                <w:sz w:val="20"/>
+                <w:szCs w:val="20"/>
+              </w:rPr>
+              <w:t xml:space="preserve"/>
+            </w:r>
+          </w:p>
+        </w:tc>
+      </w:tr>
+      <w:tr>
+        <w:trPr>
+          <w:cantSplit/>
+        </w:trPr>
+        <w:tc>
+          <w:tcPr>
+            <w:tcW w:w="300" w:type="pct"/>
+            <w:tcMar>
+              <w:top w:w="30" w:type="dxa"/>
+              <w:left w:w="80" w:type="dxa"/>
+              <w:bottom w:w="30" w:type="dxa"/>
+              <w:right w:w="80" w:type="dxa"/>
+            </w:tcMar>
+          </w:tcPr>
+          <w:p>
+            <w:r>
+              <w:rPr>
+                <w:rFonts w:ascii="Aptos" w:eastAsia="Aptos" w:hAnsi="Aptos" w:cs="Aptos"/>
+                <w:sz w:val="20"/>
+                <w:szCs w:val="20"/>
+              </w:rPr>
+              <w:t xml:space="preserve">76</w:t>
+            </w:r>
+          </w:p>
+        </w:tc>
+        <w:tc>
+          <w:tcPr>
+            <w:tcW w:w="2350" w:type="pct"/>
+            <w:tcMar>
+              <w:top w:w="30" w:type="dxa"/>
+              <w:left w:w="80" w:type="dxa"/>
+              <w:bottom w:w="30" w:type="dxa"/>
+              <w:right w:w="80" w:type="dxa"/>
+            </w:tcMar>
+          </w:tcPr>
+          <w:p>
+            <w:r>
+              <w:rPr>
+                <w:rFonts w:ascii="Aptos" w:eastAsia="Aptos" w:hAnsi="Aptos" w:cs="Aptos"/>
+                <w:sz w:val="20"/>
+                <w:szCs w:val="20"/>
+              </w:rPr>
+              <w:t xml:space="preserve"/>
+            </w:r>
+          </w:p>
+        </w:tc>
+        <w:tc>
+          <w:tcPr>
+            <w:tcW w:w="750" w:type="pct"/>
+            <w:tcMar>
+              <w:top w:w="30" w:type="dxa"/>
+              <w:left w:w="80" w:type="dxa"/>
+              <w:bottom w:w="30" w:type="dxa"/>
+              <w:right w:w="80" w:type="dxa"/>
+            </w:tcMar>
+          </w:tcPr>
+          <w:p>
+            <w:r>
+              <w:rPr>
+                <w:rFonts w:ascii="Aptos" w:eastAsia="Aptos" w:hAnsi="Aptos" w:cs="Aptos"/>
+                <w:sz w:val="20"/>
+                <w:szCs w:val="20"/>
+              </w:rPr>
+              <w:t xml:space="preserve"/>
+            </w:r>
+          </w:p>
+        </w:tc>
+        <w:tc>
+          <w:tcPr>
+            <w:tcW w:w="1600" w:type="pct"/>
+            <w:tcMar>
+              <w:top w:w="30" w:type="dxa"/>
+              <w:left w:w="80" w:type="dxa"/>
+              <w:bottom w:w="30" w:type="dxa"/>
+              <w:right w:w="80" w:type="dxa"/>
+            </w:tcMar>
+          </w:tcPr>
+          <w:p>
+            <w:r>
+              <w:rPr>
+                <w:rFonts w:ascii="Aptos" w:eastAsia="Aptos" w:hAnsi="Aptos" w:cs="Aptos"/>
+                <w:sz w:val="20"/>
+                <w:szCs w:val="20"/>
+              </w:rPr>
+              <w:t xml:space="preserve"/>
+            </w:r>
+          </w:p>
+        </w:tc>
+      </w:tr>
+      <w:tr>
+        <w:trPr>
+          <w:cantSplit/>
+        </w:trPr>
+        <w:tc>
+          <w:tcPr>
+            <w:tcW w:w="300" w:type="pct"/>
+            <w:tcMar>
+              <w:top w:w="30" w:type="dxa"/>
+              <w:left w:w="80" w:type="dxa"/>
+              <w:bottom w:w="30" w:type="dxa"/>
+              <w:right w:w="80" w:type="dxa"/>
+            </w:tcMar>
+          </w:tcPr>
+          <w:p>
+            <w:r>
+              <w:rPr>
+                <w:rFonts w:ascii="Aptos" w:eastAsia="Aptos" w:hAnsi="Aptos" w:cs="Aptos"/>
+                <w:sz w:val="20"/>
+                <w:szCs w:val="20"/>
+              </w:rPr>
+              <w:t xml:space="preserve">77</w:t>
+            </w:r>
+          </w:p>
+        </w:tc>
+        <w:tc>
+          <w:tcPr>
+            <w:tcW w:w="2350" w:type="pct"/>
+            <w:tcMar>
+              <w:top w:w="30" w:type="dxa"/>
+              <w:left w:w="80" w:type="dxa"/>
+              <w:bottom w:w="30" w:type="dxa"/>
+              <w:right w:w="80" w:type="dxa"/>
+            </w:tcMar>
+          </w:tcPr>
+          <w:p>
+            <w:r>
+              <w:rPr>
+                <w:rFonts w:ascii="Aptos" w:eastAsia="Aptos" w:hAnsi="Aptos" w:cs="Aptos"/>
+                <w:sz w:val="20"/>
+                <w:szCs w:val="20"/>
+              </w:rPr>
+              <w:t xml:space="preserve"/>
+            </w:r>
+          </w:p>
+        </w:tc>
+        <w:tc>
+          <w:tcPr>
+            <w:tcW w:w="750" w:type="pct"/>
+            <w:tcMar>
+              <w:top w:w="30" w:type="dxa"/>
+              <w:left w:w="80" w:type="dxa"/>
+              <w:bottom w:w="30" w:type="dxa"/>
+              <w:right w:w="80" w:type="dxa"/>
+            </w:tcMar>
+          </w:tcPr>
+          <w:p>
+            <w:r>
+              <w:rPr>
+                <w:rFonts w:ascii="Aptos" w:eastAsia="Aptos" w:hAnsi="Aptos" w:cs="Aptos"/>
+                <w:sz w:val="20"/>
+                <w:szCs w:val="20"/>
+              </w:rPr>
+              <w:t xml:space="preserve"/>
+            </w:r>
+          </w:p>
+        </w:tc>
+        <w:tc>
+          <w:tcPr>
+            <w:tcW w:w="1600" w:type="pct"/>
+            <w:tcMar>
+              <w:top w:w="30" w:type="dxa"/>
+              <w:left w:w="80" w:type="dxa"/>
+              <w:bottom w:w="30" w:type="dxa"/>
+              <w:right w:w="80" w:type="dxa"/>
+            </w:tcMar>
+          </w:tcPr>
+          <w:p>
+            <w:r>
+              <w:rPr>
+                <w:rFonts w:ascii="Aptos" w:eastAsia="Aptos" w:hAnsi="Aptos" w:cs="Aptos"/>
+                <w:sz w:val="20"/>
+                <w:szCs w:val="20"/>
+              </w:rPr>
+              <w:t xml:space="preserve"/>
+            </w:r>
+          </w:p>
+        </w:tc>
+      </w:tr>
+      <w:tr>
+        <w:trPr>
+          <w:cantSplit/>
+        </w:trPr>
+        <w:tc>
+          <w:tcPr>
+            <w:tcW w:w="300" w:type="pct"/>
+            <w:tcMar>
+              <w:top w:w="30" w:type="dxa"/>
+              <w:left w:w="80" w:type="dxa"/>
+              <w:bottom w:w="30" w:type="dxa"/>
+              <w:right w:w="80" w:type="dxa"/>
+            </w:tcMar>
+          </w:tcPr>
+          <w:p>
+            <w:r>
+              <w:rPr>
+                <w:rFonts w:ascii="Aptos" w:eastAsia="Aptos" w:hAnsi="Aptos" w:cs="Aptos"/>
+                <w:sz w:val="20"/>
+                <w:szCs w:val="20"/>
+              </w:rPr>
+              <w:t xml:space="preserve">78</w:t>
+            </w:r>
+          </w:p>
+        </w:tc>
+        <w:tc>
+          <w:tcPr>
+            <w:tcW w:w="2350" w:type="pct"/>
+            <w:tcMar>
+              <w:top w:w="30" w:type="dxa"/>
+              <w:left w:w="80" w:type="dxa"/>
+              <w:bottom w:w="30" w:type="dxa"/>
+              <w:right w:w="80" w:type="dxa"/>
+            </w:tcMar>
+          </w:tcPr>
+          <w:p>
+            <w:r>
+              <w:rPr>
+                <w:rFonts w:ascii="Aptos" w:eastAsia="Aptos" w:hAnsi="Aptos" w:cs="Aptos"/>
+                <w:sz w:val="20"/>
+                <w:szCs w:val="20"/>
+              </w:rPr>
+              <w:t xml:space="preserve"/>
+            </w:r>
+          </w:p>
+        </w:tc>
+        <w:tc>
+          <w:tcPr>
+            <w:tcW w:w="750" w:type="pct"/>
+            <w:tcMar>
+              <w:top w:w="30" w:type="dxa"/>
+              <w:left w:w="80" w:type="dxa"/>
+              <w:bottom w:w="30" w:type="dxa"/>
+              <w:right w:w="80" w:type="dxa"/>
+            </w:tcMar>
+          </w:tcPr>
+          <w:p>
+            <w:r>
+              <w:rPr>
+                <w:rFonts w:ascii="Aptos" w:eastAsia="Aptos" w:hAnsi="Aptos" w:cs="Aptos"/>
+                <w:sz w:val="20"/>
+                <w:szCs w:val="20"/>
+              </w:rPr>
+              <w:t xml:space="preserve"/>
+            </w:r>
+          </w:p>
+        </w:tc>
+        <w:tc>
+          <w:tcPr>
+            <w:tcW w:w="1600" w:type="pct"/>
+            <w:tcMar>
+              <w:top w:w="30" w:type="dxa"/>
+              <w:left w:w="80" w:type="dxa"/>
+              <w:bottom w:w="30" w:type="dxa"/>
+              <w:right w:w="80" w:type="dxa"/>
+            </w:tcMar>
+          </w:tcPr>
+          <w:p>
+            <w:r>
+              <w:rPr>
+                <w:rFonts w:ascii="Aptos" w:eastAsia="Aptos" w:hAnsi="Aptos" w:cs="Aptos"/>
+                <w:sz w:val="20"/>
+                <w:szCs w:val="20"/>
+              </w:rPr>
+              <w:t xml:space="preserve"/>
+            </w:r>
+          </w:p>
+        </w:tc>
+      </w:tr>
+      <w:tr>
+        <w:trPr>
+          <w:cantSplit/>
+        </w:trPr>
+        <w:tc>
+          <w:tcPr>
+            <w:tcW w:w="300" w:type="pct"/>
+            <w:tcMar>
+              <w:top w:w="30" w:type="dxa"/>
+              <w:left w:w="80" w:type="dxa"/>
+              <w:bottom w:w="30" w:type="dxa"/>
+              <w:right w:w="80" w:type="dxa"/>
+            </w:tcMar>
+          </w:tcPr>
+          <w:p>
+            <w:r>
+              <w:rPr>
+                <w:rFonts w:ascii="Aptos" w:eastAsia="Aptos" w:hAnsi="Aptos" w:cs="Aptos"/>
+                <w:sz w:val="20"/>
+                <w:szCs w:val="20"/>
+              </w:rPr>
+              <w:t xml:space="preserve">79</w:t>
+            </w:r>
+          </w:p>
+        </w:tc>
+        <w:tc>
+          <w:tcPr>
+            <w:tcW w:w="2350" w:type="pct"/>
+            <w:tcMar>
+              <w:top w:w="30" w:type="dxa"/>
+              <w:left w:w="80" w:type="dxa"/>
+              <w:bottom w:w="30" w:type="dxa"/>
+              <w:right w:w="80" w:type="dxa"/>
+            </w:tcMar>
+          </w:tcPr>
+          <w:p>
+            <w:r>
+              <w:rPr>
+                <w:rFonts w:ascii="Aptos" w:eastAsia="Aptos" w:hAnsi="Aptos" w:cs="Aptos"/>
+                <w:sz w:val="20"/>
+                <w:szCs w:val="20"/>
+              </w:rPr>
+              <w:t xml:space="preserve"/>
+            </w:r>
+          </w:p>
+        </w:tc>
+        <w:tc>
+          <w:tcPr>
+            <w:tcW w:w="750" w:type="pct"/>
+            <w:tcMar>
+              <w:top w:w="30" w:type="dxa"/>
+              <w:left w:w="80" w:type="dxa"/>
+              <w:bottom w:w="30" w:type="dxa"/>
+              <w:right w:w="80" w:type="dxa"/>
+            </w:tcMar>
+          </w:tcPr>
+          <w:p>
+            <w:r>
+              <w:rPr>
+                <w:rFonts w:ascii="Aptos" w:eastAsia="Aptos" w:hAnsi="Aptos" w:cs="Aptos"/>
+                <w:sz w:val="20"/>
+                <w:szCs w:val="20"/>
+              </w:rPr>
+              <w:t xml:space="preserve"/>
+            </w:r>
+          </w:p>
+        </w:tc>
+        <w:tc>
+          <w:tcPr>
+            <w:tcW w:w="1600" w:type="pct"/>
+            <w:tcMar>
+              <w:top w:w="30" w:type="dxa"/>
+              <w:left w:w="80" w:type="dxa"/>
+              <w:bottom w:w="30" w:type="dxa"/>
+              <w:right w:w="80" w:type="dxa"/>
+            </w:tcMar>
+          </w:tcPr>
+          <w:p>
+            <w:r>
+              <w:rPr>
+                <w:rFonts w:ascii="Aptos" w:eastAsia="Aptos" w:hAnsi="Aptos" w:cs="Aptos"/>
+                <w:sz w:val="20"/>
+                <w:szCs w:val="20"/>
+              </w:rPr>
+              <w:t xml:space="preserve"/>
+            </w:r>
+          </w:p>
+        </w:tc>
+      </w:tr>
+      <w:tr>
+        <w:trPr>
+          <w:cantSplit/>
+        </w:trPr>
+        <w:tc>
+          <w:tcPr>
+            <w:tcW w:w="300" w:type="pct"/>
+            <w:tcMar>
+              <w:top w:w="30" w:type="dxa"/>
+              <w:left w:w="80" w:type="dxa"/>
+              <w:bottom w:w="30" w:type="dxa"/>
+              <w:right w:w="80" w:type="dxa"/>
+            </w:tcMar>
+          </w:tcPr>
+          <w:p>
+            <w:r>
+              <w:rPr>
+                <w:rFonts w:ascii="Aptos" w:eastAsia="Aptos" w:hAnsi="Aptos" w:cs="Aptos"/>
+                <w:sz w:val="20"/>
+                <w:szCs w:val="20"/>
+              </w:rPr>
+              <w:t xml:space="preserve">80</w:t>
             </w:r>
           </w:p>
         </w:tc>

</xml_diff>

<commit_message>
added results for tests 81 to 120
</commit_message>
<xml_diff>
--- a/Testing.docx
+++ b/Testing.docx
@@ -40768,6 +40768,3714 @@
                 <w:szCs w:val="20"/>
               </w:rPr>
               <w:t xml:space="preserve">80</w:t>
+            </w:r>
+          </w:p>
+        </w:tc>
+        <w:tc>
+          <w:tcPr>
+            <w:tcW w:w="2350" w:type="pct"/>
+            <w:tcMar>
+              <w:top w:w="30" w:type="dxa"/>
+              <w:left w:w="80" w:type="dxa"/>
+              <w:bottom w:w="30" w:type="dxa"/>
+              <w:right w:w="80" w:type="dxa"/>
+            </w:tcMar>
+          </w:tcPr>
+          <w:p>
+            <w:r>
+              <w:rPr>
+                <w:rFonts w:ascii="Aptos" w:eastAsia="Aptos" w:hAnsi="Aptos" w:cs="Aptos"/>
+                <w:sz w:val="20"/>
+                <w:szCs w:val="20"/>
+              </w:rPr>
+              <w:t xml:space="preserve"/>
+            </w:r>
+          </w:p>
+        </w:tc>
+        <w:tc>
+          <w:tcPr>
+            <w:tcW w:w="750" w:type="pct"/>
+            <w:tcMar>
+              <w:top w:w="30" w:type="dxa"/>
+              <w:left w:w="80" w:type="dxa"/>
+              <w:bottom w:w="30" w:type="dxa"/>
+              <w:right w:w="80" w:type="dxa"/>
+            </w:tcMar>
+          </w:tcPr>
+          <w:p>
+            <w:r>
+              <w:rPr>
+                <w:rFonts w:ascii="Aptos" w:eastAsia="Aptos" w:hAnsi="Aptos" w:cs="Aptos"/>
+                <w:sz w:val="20"/>
+                <w:szCs w:val="20"/>
+              </w:rPr>
+              <w:t xml:space="preserve"/>
+            </w:r>
+          </w:p>
+        </w:tc>
+        <w:tc>
+          <w:tcPr>
+            <w:tcW w:w="1600" w:type="pct"/>
+            <w:tcMar>
+              <w:top w:w="30" w:type="dxa"/>
+              <w:left w:w="80" w:type="dxa"/>
+              <w:bottom w:w="30" w:type="dxa"/>
+              <w:right w:w="80" w:type="dxa"/>
+            </w:tcMar>
+          </w:tcPr>
+          <w:p>
+            <w:r>
+              <w:rPr>
+                <w:rFonts w:ascii="Aptos" w:eastAsia="Aptos" w:hAnsi="Aptos" w:cs="Aptos"/>
+                <w:sz w:val="20"/>
+                <w:szCs w:val="20"/>
+              </w:rPr>
+              <w:t xml:space="preserve"/>
+            </w:r>
+          </w:p>
+        </w:tc>
+      </w:tr>
+    </w:tbl>
+    <w:p>
+      <w:r>
+        <w:rPr>
+          <w:rFonts w:ascii="Aptos" w:eastAsia="Aptos" w:hAnsi="Aptos" w:cs="Aptos"/>
+        </w:rPr>
+        <w:t xml:space="preserve"/>
+      </w:r>
+    </w:p>
+    <w:p>
+      <w:pPr>
+        <w:pStyle w:val="Heading3"/>
+      </w:pPr>
+      <w:r>
+        <w:rPr>
+          <w:rFonts w:ascii="Aptos Display" w:eastAsia="Aptos Display" w:hAnsi="Aptos Display" w:cs="Aptos Display"/>
+          <w:b/>
+          <w:bCs/>
+          <w:color w:val="000000"/>
+        </w:rPr>
+        <w:t xml:space="preserve">Results for tests 81 to 120</w:t>
+      </w:r>
+    </w:p>
+    <w:tbl>
+      <w:tblPr>
+        <w:tblW w:w="5000" w:type="pct"/>
+        <w:tblBorders>
+          <w:top w:val="single" w:sz="4" w:space="0" w:color="808080"/>
+          <w:left w:val="single" w:sz="4" w:space="0" w:color="808080"/>
+          <w:bottom w:val="single" w:sz="4" w:space="0" w:color="808080"/>
+          <w:right w:val="single" w:sz="4" w:space="0" w:color="808080"/>
+          <w:insideH w:val="single" w:sz="4" w:space="0" w:color="808080"/>
+          <w:insideV w:val="single" w:sz="4" w:space="0" w:color="808080"/>
+        </w:tblBorders>
+        <w:tblCellMar>
+          <w:left w:w="10" w:type="dxa"/>
+          <w:right w:w="10" w:type="dxa"/>
+        </w:tblCellMar>
+        <w:tblLook w:val="0000" w:firstRow="0" w:lastRow="0" w:firstColumn="0" w:lastColumn="0" w:noHBand="0" w:noVBand="0"/>
+      </w:tblPr>
+      <w:tblGrid>
+        <w:gridCol w:w="561"/>
+        <w:gridCol w:w="4394"/>
+        <w:gridCol w:w="1402"/>
+        <w:gridCol w:w="2992"/>
+      </w:tblGrid>
+      <w:tr>
+        <w:trPr>
+          <w:cantSplit/>
+          <w:tblHeader/>
+        </w:trPr>
+        <w:tc>
+          <w:tcPr>
+            <w:tcW w:w="300" w:type="pct"/>
+            <w:shd w:val="clear" w:color="auto" w:fill="F2CEED" w:themeFill="accent5" w:themeFillTint="33"/>
+            <w:tcMar>
+              <w:top w:w="30" w:type="dxa"/>
+              <w:left w:w="80" w:type="dxa"/>
+              <w:bottom w:w="30" w:type="dxa"/>
+              <w:right w:w="80" w:type="dxa"/>
+            </w:tcMar>
+          </w:tcPr>
+          <w:p>
+            <w:r>
+              <w:rPr>
+                <w:rFonts w:ascii="Aptos" w:eastAsia="Aptos" w:hAnsi="Aptos" w:cs="Aptos"/>
+                <w:b/>
+                <w:bCs/>
+                <w:sz w:val="20"/>
+                <w:szCs w:val="20"/>
+              </w:rPr>
+              <w:t xml:space="preserve">No.</w:t>
+            </w:r>
+          </w:p>
+        </w:tc>
+        <w:tc>
+          <w:tcPr>
+            <w:tcW w:w="2350" w:type="pct"/>
+            <w:shd w:val="clear" w:color="auto" w:fill="F2CEED" w:themeFill="accent5" w:themeFillTint="33"/>
+            <w:tcMar>
+              <w:top w:w="30" w:type="dxa"/>
+              <w:left w:w="80" w:type="dxa"/>
+              <w:bottom w:w="30" w:type="dxa"/>
+              <w:right w:w="80" w:type="dxa"/>
+            </w:tcMar>
+          </w:tcPr>
+          <w:p>
+            <w:r>
+              <w:rPr>
+                <w:rFonts w:ascii="Aptos" w:eastAsia="Aptos" w:hAnsi="Aptos" w:cs="Aptos"/>
+                <w:b/>
+                <w:bCs/>
+                <w:sz w:val="20"/>
+                <w:szCs w:val="20"/>
+              </w:rPr>
+              <w:t xml:space="preserve">Actual Result</w:t>
+            </w:r>
+          </w:p>
+        </w:tc>
+        <w:tc>
+          <w:tcPr>
+            <w:tcW w:w="750" w:type="pct"/>
+            <w:shd w:val="clear" w:color="auto" w:fill="F2CEED" w:themeFill="accent5" w:themeFillTint="33"/>
+            <w:tcMar>
+              <w:top w:w="30" w:type="dxa"/>
+              <w:left w:w="80" w:type="dxa"/>
+              <w:bottom w:w="30" w:type="dxa"/>
+              <w:right w:w="80" w:type="dxa"/>
+            </w:tcMar>
+          </w:tcPr>
+          <w:p>
+            <w:r>
+              <w:rPr>
+                <w:rFonts w:ascii="Aptos" w:eastAsia="Aptos" w:hAnsi="Aptos" w:cs="Aptos"/>
+                <w:b/>
+                <w:bCs/>
+                <w:sz w:val="20"/>
+                <w:szCs w:val="20"/>
+              </w:rPr>
+              <w:t xml:space="preserve">Pass or Fail</w:t>
+            </w:r>
+          </w:p>
+        </w:tc>
+        <w:tc>
+          <w:tcPr>
+            <w:tcW w:w="1600" w:type="pct"/>
+            <w:shd w:val="clear" w:color="auto" w:fill="F2CEED" w:themeFill="accent5" w:themeFillTint="33"/>
+            <w:tcMar>
+              <w:top w:w="30" w:type="dxa"/>
+              <w:left w:w="80" w:type="dxa"/>
+              <w:bottom w:w="30" w:type="dxa"/>
+              <w:right w:w="80" w:type="dxa"/>
+            </w:tcMar>
+          </w:tcPr>
+          <w:p>
+            <w:r>
+              <w:rPr>
+                <w:rFonts w:ascii="Aptos" w:eastAsia="Aptos" w:hAnsi="Aptos" w:cs="Aptos"/>
+                <w:b/>
+                <w:bCs/>
+                <w:sz w:val="20"/>
+                <w:szCs w:val="20"/>
+              </w:rPr>
+              <w:t xml:space="preserve">Evidence</w:t>
+            </w:r>
+          </w:p>
+        </w:tc>
+      </w:tr>
+      <w:tr>
+        <w:trPr>
+          <w:cantSplit/>
+        </w:trPr>
+        <w:tc>
+          <w:tcPr>
+            <w:tcW w:w="300" w:type="pct"/>
+            <w:tcMar>
+              <w:top w:w="30" w:type="dxa"/>
+              <w:left w:w="80" w:type="dxa"/>
+              <w:bottom w:w="30" w:type="dxa"/>
+              <w:right w:w="80" w:type="dxa"/>
+            </w:tcMar>
+          </w:tcPr>
+          <w:p>
+            <w:r>
+              <w:rPr>
+                <w:rFonts w:ascii="Aptos" w:eastAsia="Aptos" w:hAnsi="Aptos" w:cs="Aptos"/>
+                <w:sz w:val="20"/>
+                <w:szCs w:val="20"/>
+              </w:rPr>
+              <w:t xml:space="preserve">81</w:t>
+            </w:r>
+          </w:p>
+        </w:tc>
+        <w:tc>
+          <w:tcPr>
+            <w:tcW w:w="2350" w:type="pct"/>
+            <w:tcMar>
+              <w:top w:w="30" w:type="dxa"/>
+              <w:left w:w="80" w:type="dxa"/>
+              <w:bottom w:w="30" w:type="dxa"/>
+              <w:right w:w="80" w:type="dxa"/>
+            </w:tcMar>
+          </w:tcPr>
+          <w:p>
+            <w:r>
+              <w:rPr>
+                <w:rFonts w:ascii="Aptos" w:eastAsia="Aptos" w:hAnsi="Aptos" w:cs="Aptos"/>
+                <w:sz w:val="20"/>
+                <w:szCs w:val="20"/>
+              </w:rPr>
+              <w:t xml:space="preserve"/>
+            </w:r>
+          </w:p>
+        </w:tc>
+        <w:tc>
+          <w:tcPr>
+            <w:tcW w:w="750" w:type="pct"/>
+            <w:tcMar>
+              <w:top w:w="30" w:type="dxa"/>
+              <w:left w:w="80" w:type="dxa"/>
+              <w:bottom w:w="30" w:type="dxa"/>
+              <w:right w:w="80" w:type="dxa"/>
+            </w:tcMar>
+          </w:tcPr>
+          <w:p>
+            <w:r>
+              <w:rPr>
+                <w:rFonts w:ascii="Aptos" w:eastAsia="Aptos" w:hAnsi="Aptos" w:cs="Aptos"/>
+                <w:sz w:val="20"/>
+                <w:szCs w:val="20"/>
+              </w:rPr>
+              <w:t xml:space="preserve"/>
+            </w:r>
+          </w:p>
+        </w:tc>
+        <w:tc>
+          <w:tcPr>
+            <w:tcW w:w="1600" w:type="pct"/>
+            <w:tcMar>
+              <w:top w:w="30" w:type="dxa"/>
+              <w:left w:w="80" w:type="dxa"/>
+              <w:bottom w:w="30" w:type="dxa"/>
+              <w:right w:w="80" w:type="dxa"/>
+            </w:tcMar>
+          </w:tcPr>
+          <w:p>
+            <w:r>
+              <w:rPr>
+                <w:rFonts w:ascii="Aptos" w:eastAsia="Aptos" w:hAnsi="Aptos" w:cs="Aptos"/>
+                <w:sz w:val="20"/>
+                <w:szCs w:val="20"/>
+              </w:rPr>
+              <w:t xml:space="preserve"/>
+            </w:r>
+          </w:p>
+        </w:tc>
+      </w:tr>
+      <w:tr>
+        <w:trPr>
+          <w:cantSplit/>
+        </w:trPr>
+        <w:tc>
+          <w:tcPr>
+            <w:tcW w:w="300" w:type="pct"/>
+            <w:tcMar>
+              <w:top w:w="30" w:type="dxa"/>
+              <w:left w:w="80" w:type="dxa"/>
+              <w:bottom w:w="30" w:type="dxa"/>
+              <w:right w:w="80" w:type="dxa"/>
+            </w:tcMar>
+          </w:tcPr>
+          <w:p>
+            <w:r>
+              <w:rPr>
+                <w:rFonts w:ascii="Aptos" w:eastAsia="Aptos" w:hAnsi="Aptos" w:cs="Aptos"/>
+                <w:sz w:val="20"/>
+                <w:szCs w:val="20"/>
+              </w:rPr>
+              <w:t xml:space="preserve">82</w:t>
+            </w:r>
+          </w:p>
+        </w:tc>
+        <w:tc>
+          <w:tcPr>
+            <w:tcW w:w="2350" w:type="pct"/>
+            <w:tcMar>
+              <w:top w:w="30" w:type="dxa"/>
+              <w:left w:w="80" w:type="dxa"/>
+              <w:bottom w:w="30" w:type="dxa"/>
+              <w:right w:w="80" w:type="dxa"/>
+            </w:tcMar>
+          </w:tcPr>
+          <w:p>
+            <w:r>
+              <w:rPr>
+                <w:rFonts w:ascii="Aptos" w:eastAsia="Aptos" w:hAnsi="Aptos" w:cs="Aptos"/>
+                <w:sz w:val="20"/>
+                <w:szCs w:val="20"/>
+              </w:rPr>
+              <w:t xml:space="preserve"/>
+            </w:r>
+          </w:p>
+        </w:tc>
+        <w:tc>
+          <w:tcPr>
+            <w:tcW w:w="750" w:type="pct"/>
+            <w:tcMar>
+              <w:top w:w="30" w:type="dxa"/>
+              <w:left w:w="80" w:type="dxa"/>
+              <w:bottom w:w="30" w:type="dxa"/>
+              <w:right w:w="80" w:type="dxa"/>
+            </w:tcMar>
+          </w:tcPr>
+          <w:p>
+            <w:r>
+              <w:rPr>
+                <w:rFonts w:ascii="Aptos" w:eastAsia="Aptos" w:hAnsi="Aptos" w:cs="Aptos"/>
+                <w:sz w:val="20"/>
+                <w:szCs w:val="20"/>
+              </w:rPr>
+              <w:t xml:space="preserve"/>
+            </w:r>
+          </w:p>
+        </w:tc>
+        <w:tc>
+          <w:tcPr>
+            <w:tcW w:w="1600" w:type="pct"/>
+            <w:tcMar>
+              <w:top w:w="30" w:type="dxa"/>
+              <w:left w:w="80" w:type="dxa"/>
+              <w:bottom w:w="30" w:type="dxa"/>
+              <w:right w:w="80" w:type="dxa"/>
+            </w:tcMar>
+          </w:tcPr>
+          <w:p>
+            <w:r>
+              <w:rPr>
+                <w:rFonts w:ascii="Aptos" w:eastAsia="Aptos" w:hAnsi="Aptos" w:cs="Aptos"/>
+                <w:sz w:val="20"/>
+                <w:szCs w:val="20"/>
+              </w:rPr>
+              <w:t xml:space="preserve"/>
+            </w:r>
+          </w:p>
+        </w:tc>
+      </w:tr>
+      <w:tr>
+        <w:trPr>
+          <w:cantSplit/>
+        </w:trPr>
+        <w:tc>
+          <w:tcPr>
+            <w:tcW w:w="300" w:type="pct"/>
+            <w:tcMar>
+              <w:top w:w="30" w:type="dxa"/>
+              <w:left w:w="80" w:type="dxa"/>
+              <w:bottom w:w="30" w:type="dxa"/>
+              <w:right w:w="80" w:type="dxa"/>
+            </w:tcMar>
+          </w:tcPr>
+          <w:p>
+            <w:r>
+              <w:rPr>
+                <w:rFonts w:ascii="Aptos" w:eastAsia="Aptos" w:hAnsi="Aptos" w:cs="Aptos"/>
+                <w:sz w:val="20"/>
+                <w:szCs w:val="20"/>
+              </w:rPr>
+              <w:t xml:space="preserve">83</w:t>
+            </w:r>
+          </w:p>
+        </w:tc>
+        <w:tc>
+          <w:tcPr>
+            <w:tcW w:w="2350" w:type="pct"/>
+            <w:tcMar>
+              <w:top w:w="30" w:type="dxa"/>
+              <w:left w:w="80" w:type="dxa"/>
+              <w:bottom w:w="30" w:type="dxa"/>
+              <w:right w:w="80" w:type="dxa"/>
+            </w:tcMar>
+          </w:tcPr>
+          <w:p>
+            <w:r>
+              <w:rPr>
+                <w:rFonts w:ascii="Aptos" w:eastAsia="Aptos" w:hAnsi="Aptos" w:cs="Aptos"/>
+                <w:sz w:val="20"/>
+                <w:szCs w:val="20"/>
+              </w:rPr>
+              <w:t xml:space="preserve"/>
+            </w:r>
+          </w:p>
+        </w:tc>
+        <w:tc>
+          <w:tcPr>
+            <w:tcW w:w="750" w:type="pct"/>
+            <w:tcMar>
+              <w:top w:w="30" w:type="dxa"/>
+              <w:left w:w="80" w:type="dxa"/>
+              <w:bottom w:w="30" w:type="dxa"/>
+              <w:right w:w="80" w:type="dxa"/>
+            </w:tcMar>
+          </w:tcPr>
+          <w:p>
+            <w:r>
+              <w:rPr>
+                <w:rFonts w:ascii="Aptos" w:eastAsia="Aptos" w:hAnsi="Aptos" w:cs="Aptos"/>
+                <w:sz w:val="20"/>
+                <w:szCs w:val="20"/>
+              </w:rPr>
+              <w:t xml:space="preserve"/>
+            </w:r>
+          </w:p>
+        </w:tc>
+        <w:tc>
+          <w:tcPr>
+            <w:tcW w:w="1600" w:type="pct"/>
+            <w:tcMar>
+              <w:top w:w="30" w:type="dxa"/>
+              <w:left w:w="80" w:type="dxa"/>
+              <w:bottom w:w="30" w:type="dxa"/>
+              <w:right w:w="80" w:type="dxa"/>
+            </w:tcMar>
+          </w:tcPr>
+          <w:p>
+            <w:r>
+              <w:rPr>
+                <w:rFonts w:ascii="Aptos" w:eastAsia="Aptos" w:hAnsi="Aptos" w:cs="Aptos"/>
+                <w:sz w:val="20"/>
+                <w:szCs w:val="20"/>
+              </w:rPr>
+              <w:t xml:space="preserve"/>
+            </w:r>
+          </w:p>
+        </w:tc>
+      </w:tr>
+      <w:tr>
+        <w:trPr>
+          <w:cantSplit/>
+        </w:trPr>
+        <w:tc>
+          <w:tcPr>
+            <w:tcW w:w="300" w:type="pct"/>
+            <w:tcMar>
+              <w:top w:w="30" w:type="dxa"/>
+              <w:left w:w="80" w:type="dxa"/>
+              <w:bottom w:w="30" w:type="dxa"/>
+              <w:right w:w="80" w:type="dxa"/>
+            </w:tcMar>
+          </w:tcPr>
+          <w:p>
+            <w:r>
+              <w:rPr>
+                <w:rFonts w:ascii="Aptos" w:eastAsia="Aptos" w:hAnsi="Aptos" w:cs="Aptos"/>
+                <w:sz w:val="20"/>
+                <w:szCs w:val="20"/>
+              </w:rPr>
+              <w:t xml:space="preserve">84</w:t>
+            </w:r>
+          </w:p>
+        </w:tc>
+        <w:tc>
+          <w:tcPr>
+            <w:tcW w:w="2350" w:type="pct"/>
+            <w:tcMar>
+              <w:top w:w="30" w:type="dxa"/>
+              <w:left w:w="80" w:type="dxa"/>
+              <w:bottom w:w="30" w:type="dxa"/>
+              <w:right w:w="80" w:type="dxa"/>
+            </w:tcMar>
+          </w:tcPr>
+          <w:p>
+            <w:r>
+              <w:rPr>
+                <w:rFonts w:ascii="Aptos" w:eastAsia="Aptos" w:hAnsi="Aptos" w:cs="Aptos"/>
+                <w:sz w:val="20"/>
+                <w:szCs w:val="20"/>
+              </w:rPr>
+              <w:t xml:space="preserve"/>
+            </w:r>
+          </w:p>
+        </w:tc>
+        <w:tc>
+          <w:tcPr>
+            <w:tcW w:w="750" w:type="pct"/>
+            <w:tcMar>
+              <w:top w:w="30" w:type="dxa"/>
+              <w:left w:w="80" w:type="dxa"/>
+              <w:bottom w:w="30" w:type="dxa"/>
+              <w:right w:w="80" w:type="dxa"/>
+            </w:tcMar>
+          </w:tcPr>
+          <w:p>
+            <w:r>
+              <w:rPr>
+                <w:rFonts w:ascii="Aptos" w:eastAsia="Aptos" w:hAnsi="Aptos" w:cs="Aptos"/>
+                <w:sz w:val="20"/>
+                <w:szCs w:val="20"/>
+              </w:rPr>
+              <w:t xml:space="preserve"/>
+            </w:r>
+          </w:p>
+        </w:tc>
+        <w:tc>
+          <w:tcPr>
+            <w:tcW w:w="1600" w:type="pct"/>
+            <w:tcMar>
+              <w:top w:w="30" w:type="dxa"/>
+              <w:left w:w="80" w:type="dxa"/>
+              <w:bottom w:w="30" w:type="dxa"/>
+              <w:right w:w="80" w:type="dxa"/>
+            </w:tcMar>
+          </w:tcPr>
+          <w:p>
+            <w:r>
+              <w:rPr>
+                <w:rFonts w:ascii="Aptos" w:eastAsia="Aptos" w:hAnsi="Aptos" w:cs="Aptos"/>
+                <w:sz w:val="20"/>
+                <w:szCs w:val="20"/>
+              </w:rPr>
+              <w:t xml:space="preserve"/>
+            </w:r>
+          </w:p>
+        </w:tc>
+      </w:tr>
+      <w:tr>
+        <w:trPr>
+          <w:cantSplit/>
+        </w:trPr>
+        <w:tc>
+          <w:tcPr>
+            <w:tcW w:w="300" w:type="pct"/>
+            <w:tcMar>
+              <w:top w:w="30" w:type="dxa"/>
+              <w:left w:w="80" w:type="dxa"/>
+              <w:bottom w:w="30" w:type="dxa"/>
+              <w:right w:w="80" w:type="dxa"/>
+            </w:tcMar>
+          </w:tcPr>
+          <w:p>
+            <w:r>
+              <w:rPr>
+                <w:rFonts w:ascii="Aptos" w:eastAsia="Aptos" w:hAnsi="Aptos" w:cs="Aptos"/>
+                <w:sz w:val="20"/>
+                <w:szCs w:val="20"/>
+              </w:rPr>
+              <w:t xml:space="preserve">85</w:t>
+            </w:r>
+          </w:p>
+        </w:tc>
+        <w:tc>
+          <w:tcPr>
+            <w:tcW w:w="2350" w:type="pct"/>
+            <w:tcMar>
+              <w:top w:w="30" w:type="dxa"/>
+              <w:left w:w="80" w:type="dxa"/>
+              <w:bottom w:w="30" w:type="dxa"/>
+              <w:right w:w="80" w:type="dxa"/>
+            </w:tcMar>
+          </w:tcPr>
+          <w:p>
+            <w:r>
+              <w:rPr>
+                <w:rFonts w:ascii="Aptos" w:eastAsia="Aptos" w:hAnsi="Aptos" w:cs="Aptos"/>
+                <w:sz w:val="20"/>
+                <w:szCs w:val="20"/>
+              </w:rPr>
+              <w:t xml:space="preserve"/>
+            </w:r>
+          </w:p>
+        </w:tc>
+        <w:tc>
+          <w:tcPr>
+            <w:tcW w:w="750" w:type="pct"/>
+            <w:tcMar>
+              <w:top w:w="30" w:type="dxa"/>
+              <w:left w:w="80" w:type="dxa"/>
+              <w:bottom w:w="30" w:type="dxa"/>
+              <w:right w:w="80" w:type="dxa"/>
+            </w:tcMar>
+          </w:tcPr>
+          <w:p>
+            <w:r>
+              <w:rPr>
+                <w:rFonts w:ascii="Aptos" w:eastAsia="Aptos" w:hAnsi="Aptos" w:cs="Aptos"/>
+                <w:sz w:val="20"/>
+                <w:szCs w:val="20"/>
+              </w:rPr>
+              <w:t xml:space="preserve"/>
+            </w:r>
+          </w:p>
+        </w:tc>
+        <w:tc>
+          <w:tcPr>
+            <w:tcW w:w="1600" w:type="pct"/>
+            <w:tcMar>
+              <w:top w:w="30" w:type="dxa"/>
+              <w:left w:w="80" w:type="dxa"/>
+              <w:bottom w:w="30" w:type="dxa"/>
+              <w:right w:w="80" w:type="dxa"/>
+            </w:tcMar>
+          </w:tcPr>
+          <w:p>
+            <w:r>
+              <w:rPr>
+                <w:rFonts w:ascii="Aptos" w:eastAsia="Aptos" w:hAnsi="Aptos" w:cs="Aptos"/>
+                <w:sz w:val="20"/>
+                <w:szCs w:val="20"/>
+              </w:rPr>
+              <w:t xml:space="preserve"/>
+            </w:r>
+          </w:p>
+        </w:tc>
+      </w:tr>
+      <w:tr>
+        <w:trPr>
+          <w:cantSplit/>
+        </w:trPr>
+        <w:tc>
+          <w:tcPr>
+            <w:tcW w:w="300" w:type="pct"/>
+            <w:tcMar>
+              <w:top w:w="30" w:type="dxa"/>
+              <w:left w:w="80" w:type="dxa"/>
+              <w:bottom w:w="30" w:type="dxa"/>
+              <w:right w:w="80" w:type="dxa"/>
+            </w:tcMar>
+          </w:tcPr>
+          <w:p>
+            <w:r>
+              <w:rPr>
+                <w:rFonts w:ascii="Aptos" w:eastAsia="Aptos" w:hAnsi="Aptos" w:cs="Aptos"/>
+                <w:sz w:val="20"/>
+                <w:szCs w:val="20"/>
+              </w:rPr>
+              <w:t xml:space="preserve">86</w:t>
+            </w:r>
+          </w:p>
+        </w:tc>
+        <w:tc>
+          <w:tcPr>
+            <w:tcW w:w="2350" w:type="pct"/>
+            <w:tcMar>
+              <w:top w:w="30" w:type="dxa"/>
+              <w:left w:w="80" w:type="dxa"/>
+              <w:bottom w:w="30" w:type="dxa"/>
+              <w:right w:w="80" w:type="dxa"/>
+            </w:tcMar>
+          </w:tcPr>
+          <w:p>
+            <w:r>
+              <w:rPr>
+                <w:rFonts w:ascii="Aptos" w:eastAsia="Aptos" w:hAnsi="Aptos" w:cs="Aptos"/>
+                <w:sz w:val="20"/>
+                <w:szCs w:val="20"/>
+              </w:rPr>
+              <w:t xml:space="preserve"/>
+            </w:r>
+          </w:p>
+        </w:tc>
+        <w:tc>
+          <w:tcPr>
+            <w:tcW w:w="750" w:type="pct"/>
+            <w:tcMar>
+              <w:top w:w="30" w:type="dxa"/>
+              <w:left w:w="80" w:type="dxa"/>
+              <w:bottom w:w="30" w:type="dxa"/>
+              <w:right w:w="80" w:type="dxa"/>
+            </w:tcMar>
+          </w:tcPr>
+          <w:p>
+            <w:r>
+              <w:rPr>
+                <w:rFonts w:ascii="Aptos" w:eastAsia="Aptos" w:hAnsi="Aptos" w:cs="Aptos"/>
+                <w:sz w:val="20"/>
+                <w:szCs w:val="20"/>
+              </w:rPr>
+              <w:t xml:space="preserve"/>
+            </w:r>
+          </w:p>
+        </w:tc>
+        <w:tc>
+          <w:tcPr>
+            <w:tcW w:w="1600" w:type="pct"/>
+            <w:tcMar>
+              <w:top w:w="30" w:type="dxa"/>
+              <w:left w:w="80" w:type="dxa"/>
+              <w:bottom w:w="30" w:type="dxa"/>
+              <w:right w:w="80" w:type="dxa"/>
+            </w:tcMar>
+          </w:tcPr>
+          <w:p>
+            <w:r>
+              <w:rPr>
+                <w:rFonts w:ascii="Aptos" w:eastAsia="Aptos" w:hAnsi="Aptos" w:cs="Aptos"/>
+                <w:sz w:val="20"/>
+                <w:szCs w:val="20"/>
+              </w:rPr>
+              <w:t xml:space="preserve"/>
+            </w:r>
+          </w:p>
+        </w:tc>
+      </w:tr>
+      <w:tr>
+        <w:trPr>
+          <w:cantSplit/>
+        </w:trPr>
+        <w:tc>
+          <w:tcPr>
+            <w:tcW w:w="300" w:type="pct"/>
+            <w:tcMar>
+              <w:top w:w="30" w:type="dxa"/>
+              <w:left w:w="80" w:type="dxa"/>
+              <w:bottom w:w="30" w:type="dxa"/>
+              <w:right w:w="80" w:type="dxa"/>
+            </w:tcMar>
+          </w:tcPr>
+          <w:p>
+            <w:r>
+              <w:rPr>
+                <w:rFonts w:ascii="Aptos" w:eastAsia="Aptos" w:hAnsi="Aptos" w:cs="Aptos"/>
+                <w:sz w:val="20"/>
+                <w:szCs w:val="20"/>
+              </w:rPr>
+              <w:t xml:space="preserve">87</w:t>
+            </w:r>
+          </w:p>
+        </w:tc>
+        <w:tc>
+          <w:tcPr>
+            <w:tcW w:w="2350" w:type="pct"/>
+            <w:tcMar>
+              <w:top w:w="30" w:type="dxa"/>
+              <w:left w:w="80" w:type="dxa"/>
+              <w:bottom w:w="30" w:type="dxa"/>
+              <w:right w:w="80" w:type="dxa"/>
+            </w:tcMar>
+          </w:tcPr>
+          <w:p>
+            <w:r>
+              <w:rPr>
+                <w:rFonts w:ascii="Aptos" w:eastAsia="Aptos" w:hAnsi="Aptos" w:cs="Aptos"/>
+                <w:sz w:val="20"/>
+                <w:szCs w:val="20"/>
+              </w:rPr>
+              <w:t xml:space="preserve"/>
+            </w:r>
+          </w:p>
+        </w:tc>
+        <w:tc>
+          <w:tcPr>
+            <w:tcW w:w="750" w:type="pct"/>
+            <w:tcMar>
+              <w:top w:w="30" w:type="dxa"/>
+              <w:left w:w="80" w:type="dxa"/>
+              <w:bottom w:w="30" w:type="dxa"/>
+              <w:right w:w="80" w:type="dxa"/>
+            </w:tcMar>
+          </w:tcPr>
+          <w:p>
+            <w:r>
+              <w:rPr>
+                <w:rFonts w:ascii="Aptos" w:eastAsia="Aptos" w:hAnsi="Aptos" w:cs="Aptos"/>
+                <w:sz w:val="20"/>
+                <w:szCs w:val="20"/>
+              </w:rPr>
+              <w:t xml:space="preserve"/>
+            </w:r>
+          </w:p>
+        </w:tc>
+        <w:tc>
+          <w:tcPr>
+            <w:tcW w:w="1600" w:type="pct"/>
+            <w:tcMar>
+              <w:top w:w="30" w:type="dxa"/>
+              <w:left w:w="80" w:type="dxa"/>
+              <w:bottom w:w="30" w:type="dxa"/>
+              <w:right w:w="80" w:type="dxa"/>
+            </w:tcMar>
+          </w:tcPr>
+          <w:p>
+            <w:r>
+              <w:rPr>
+                <w:rFonts w:ascii="Aptos" w:eastAsia="Aptos" w:hAnsi="Aptos" w:cs="Aptos"/>
+                <w:sz w:val="20"/>
+                <w:szCs w:val="20"/>
+              </w:rPr>
+              <w:t xml:space="preserve"/>
+            </w:r>
+          </w:p>
+        </w:tc>
+      </w:tr>
+      <w:tr>
+        <w:trPr>
+          <w:cantSplit/>
+        </w:trPr>
+        <w:tc>
+          <w:tcPr>
+            <w:tcW w:w="300" w:type="pct"/>
+            <w:tcMar>
+              <w:top w:w="30" w:type="dxa"/>
+              <w:left w:w="80" w:type="dxa"/>
+              <w:bottom w:w="30" w:type="dxa"/>
+              <w:right w:w="80" w:type="dxa"/>
+            </w:tcMar>
+          </w:tcPr>
+          <w:p>
+            <w:r>
+              <w:rPr>
+                <w:rFonts w:ascii="Aptos" w:eastAsia="Aptos" w:hAnsi="Aptos" w:cs="Aptos"/>
+                <w:sz w:val="20"/>
+                <w:szCs w:val="20"/>
+              </w:rPr>
+              <w:t xml:space="preserve">88</w:t>
+            </w:r>
+          </w:p>
+        </w:tc>
+        <w:tc>
+          <w:tcPr>
+            <w:tcW w:w="2350" w:type="pct"/>
+            <w:tcMar>
+              <w:top w:w="30" w:type="dxa"/>
+              <w:left w:w="80" w:type="dxa"/>
+              <w:bottom w:w="30" w:type="dxa"/>
+              <w:right w:w="80" w:type="dxa"/>
+            </w:tcMar>
+          </w:tcPr>
+          <w:p>
+            <w:r>
+              <w:rPr>
+                <w:rFonts w:ascii="Aptos" w:eastAsia="Aptos" w:hAnsi="Aptos" w:cs="Aptos"/>
+                <w:sz w:val="20"/>
+                <w:szCs w:val="20"/>
+              </w:rPr>
+              <w:t xml:space="preserve"/>
+            </w:r>
+          </w:p>
+        </w:tc>
+        <w:tc>
+          <w:tcPr>
+            <w:tcW w:w="750" w:type="pct"/>
+            <w:tcMar>
+              <w:top w:w="30" w:type="dxa"/>
+              <w:left w:w="80" w:type="dxa"/>
+              <w:bottom w:w="30" w:type="dxa"/>
+              <w:right w:w="80" w:type="dxa"/>
+            </w:tcMar>
+          </w:tcPr>
+          <w:p>
+            <w:r>
+              <w:rPr>
+                <w:rFonts w:ascii="Aptos" w:eastAsia="Aptos" w:hAnsi="Aptos" w:cs="Aptos"/>
+                <w:sz w:val="20"/>
+                <w:szCs w:val="20"/>
+              </w:rPr>
+              <w:t xml:space="preserve"/>
+            </w:r>
+          </w:p>
+        </w:tc>
+        <w:tc>
+          <w:tcPr>
+            <w:tcW w:w="1600" w:type="pct"/>
+            <w:tcMar>
+              <w:top w:w="30" w:type="dxa"/>
+              <w:left w:w="80" w:type="dxa"/>
+              <w:bottom w:w="30" w:type="dxa"/>
+              <w:right w:w="80" w:type="dxa"/>
+            </w:tcMar>
+          </w:tcPr>
+          <w:p>
+            <w:r>
+              <w:rPr>
+                <w:rFonts w:ascii="Aptos" w:eastAsia="Aptos" w:hAnsi="Aptos" w:cs="Aptos"/>
+                <w:sz w:val="20"/>
+                <w:szCs w:val="20"/>
+              </w:rPr>
+              <w:t xml:space="preserve"/>
+            </w:r>
+          </w:p>
+        </w:tc>
+      </w:tr>
+      <w:tr>
+        <w:trPr>
+          <w:cantSplit/>
+        </w:trPr>
+        <w:tc>
+          <w:tcPr>
+            <w:tcW w:w="300" w:type="pct"/>
+            <w:tcMar>
+              <w:top w:w="30" w:type="dxa"/>
+              <w:left w:w="80" w:type="dxa"/>
+              <w:bottom w:w="30" w:type="dxa"/>
+              <w:right w:w="80" w:type="dxa"/>
+            </w:tcMar>
+          </w:tcPr>
+          <w:p>
+            <w:r>
+              <w:rPr>
+                <w:rFonts w:ascii="Aptos" w:eastAsia="Aptos" w:hAnsi="Aptos" w:cs="Aptos"/>
+                <w:sz w:val="20"/>
+                <w:szCs w:val="20"/>
+              </w:rPr>
+              <w:t xml:space="preserve">89</w:t>
+            </w:r>
+          </w:p>
+        </w:tc>
+        <w:tc>
+          <w:tcPr>
+            <w:tcW w:w="2350" w:type="pct"/>
+            <w:tcMar>
+              <w:top w:w="30" w:type="dxa"/>
+              <w:left w:w="80" w:type="dxa"/>
+              <w:bottom w:w="30" w:type="dxa"/>
+              <w:right w:w="80" w:type="dxa"/>
+            </w:tcMar>
+          </w:tcPr>
+          <w:p>
+            <w:r>
+              <w:rPr>
+                <w:rFonts w:ascii="Aptos" w:eastAsia="Aptos" w:hAnsi="Aptos" w:cs="Aptos"/>
+                <w:sz w:val="20"/>
+                <w:szCs w:val="20"/>
+              </w:rPr>
+              <w:t xml:space="preserve"/>
+            </w:r>
+          </w:p>
+        </w:tc>
+        <w:tc>
+          <w:tcPr>
+            <w:tcW w:w="750" w:type="pct"/>
+            <w:tcMar>
+              <w:top w:w="30" w:type="dxa"/>
+              <w:left w:w="80" w:type="dxa"/>
+              <w:bottom w:w="30" w:type="dxa"/>
+              <w:right w:w="80" w:type="dxa"/>
+            </w:tcMar>
+          </w:tcPr>
+          <w:p>
+            <w:r>
+              <w:rPr>
+                <w:rFonts w:ascii="Aptos" w:eastAsia="Aptos" w:hAnsi="Aptos" w:cs="Aptos"/>
+                <w:sz w:val="20"/>
+                <w:szCs w:val="20"/>
+              </w:rPr>
+              <w:t xml:space="preserve"/>
+            </w:r>
+          </w:p>
+        </w:tc>
+        <w:tc>
+          <w:tcPr>
+            <w:tcW w:w="1600" w:type="pct"/>
+            <w:tcMar>
+              <w:top w:w="30" w:type="dxa"/>
+              <w:left w:w="80" w:type="dxa"/>
+              <w:bottom w:w="30" w:type="dxa"/>
+              <w:right w:w="80" w:type="dxa"/>
+            </w:tcMar>
+          </w:tcPr>
+          <w:p>
+            <w:r>
+              <w:rPr>
+                <w:rFonts w:ascii="Aptos" w:eastAsia="Aptos" w:hAnsi="Aptos" w:cs="Aptos"/>
+                <w:sz w:val="20"/>
+                <w:szCs w:val="20"/>
+              </w:rPr>
+              <w:t xml:space="preserve"/>
+            </w:r>
+          </w:p>
+        </w:tc>
+      </w:tr>
+      <w:tr>
+        <w:trPr>
+          <w:cantSplit/>
+        </w:trPr>
+        <w:tc>
+          <w:tcPr>
+            <w:tcW w:w="300" w:type="pct"/>
+            <w:tcMar>
+              <w:top w:w="30" w:type="dxa"/>
+              <w:left w:w="80" w:type="dxa"/>
+              <w:bottom w:w="30" w:type="dxa"/>
+              <w:right w:w="80" w:type="dxa"/>
+            </w:tcMar>
+          </w:tcPr>
+          <w:p>
+            <w:r>
+              <w:rPr>
+                <w:rFonts w:ascii="Aptos" w:eastAsia="Aptos" w:hAnsi="Aptos" w:cs="Aptos"/>
+                <w:sz w:val="20"/>
+                <w:szCs w:val="20"/>
+              </w:rPr>
+              <w:t xml:space="preserve">90</w:t>
+            </w:r>
+          </w:p>
+        </w:tc>
+        <w:tc>
+          <w:tcPr>
+            <w:tcW w:w="2350" w:type="pct"/>
+            <w:tcMar>
+              <w:top w:w="30" w:type="dxa"/>
+              <w:left w:w="80" w:type="dxa"/>
+              <w:bottom w:w="30" w:type="dxa"/>
+              <w:right w:w="80" w:type="dxa"/>
+            </w:tcMar>
+          </w:tcPr>
+          <w:p>
+            <w:r>
+              <w:rPr>
+                <w:rFonts w:ascii="Aptos" w:eastAsia="Aptos" w:hAnsi="Aptos" w:cs="Aptos"/>
+                <w:sz w:val="20"/>
+                <w:szCs w:val="20"/>
+              </w:rPr>
+              <w:t xml:space="preserve"/>
+            </w:r>
+          </w:p>
+        </w:tc>
+        <w:tc>
+          <w:tcPr>
+            <w:tcW w:w="750" w:type="pct"/>
+            <w:tcMar>
+              <w:top w:w="30" w:type="dxa"/>
+              <w:left w:w="80" w:type="dxa"/>
+              <w:bottom w:w="30" w:type="dxa"/>
+              <w:right w:w="80" w:type="dxa"/>
+            </w:tcMar>
+          </w:tcPr>
+          <w:p>
+            <w:r>
+              <w:rPr>
+                <w:rFonts w:ascii="Aptos" w:eastAsia="Aptos" w:hAnsi="Aptos" w:cs="Aptos"/>
+                <w:sz w:val="20"/>
+                <w:szCs w:val="20"/>
+              </w:rPr>
+              <w:t xml:space="preserve"/>
+            </w:r>
+          </w:p>
+        </w:tc>
+        <w:tc>
+          <w:tcPr>
+            <w:tcW w:w="1600" w:type="pct"/>
+            <w:tcMar>
+              <w:top w:w="30" w:type="dxa"/>
+              <w:left w:w="80" w:type="dxa"/>
+              <w:bottom w:w="30" w:type="dxa"/>
+              <w:right w:w="80" w:type="dxa"/>
+            </w:tcMar>
+          </w:tcPr>
+          <w:p>
+            <w:r>
+              <w:rPr>
+                <w:rFonts w:ascii="Aptos" w:eastAsia="Aptos" w:hAnsi="Aptos" w:cs="Aptos"/>
+                <w:sz w:val="20"/>
+                <w:szCs w:val="20"/>
+              </w:rPr>
+              <w:t xml:space="preserve"/>
+            </w:r>
+          </w:p>
+        </w:tc>
+      </w:tr>
+      <w:tr>
+        <w:trPr>
+          <w:cantSplit/>
+        </w:trPr>
+        <w:tc>
+          <w:tcPr>
+            <w:tcW w:w="300" w:type="pct"/>
+            <w:tcMar>
+              <w:top w:w="30" w:type="dxa"/>
+              <w:left w:w="80" w:type="dxa"/>
+              <w:bottom w:w="30" w:type="dxa"/>
+              <w:right w:w="80" w:type="dxa"/>
+            </w:tcMar>
+          </w:tcPr>
+          <w:p>
+            <w:r>
+              <w:rPr>
+                <w:rFonts w:ascii="Aptos" w:eastAsia="Aptos" w:hAnsi="Aptos" w:cs="Aptos"/>
+                <w:sz w:val="20"/>
+                <w:szCs w:val="20"/>
+              </w:rPr>
+              <w:t xml:space="preserve">91</w:t>
+            </w:r>
+          </w:p>
+        </w:tc>
+        <w:tc>
+          <w:tcPr>
+            <w:tcW w:w="2350" w:type="pct"/>
+            <w:tcMar>
+              <w:top w:w="30" w:type="dxa"/>
+              <w:left w:w="80" w:type="dxa"/>
+              <w:bottom w:w="30" w:type="dxa"/>
+              <w:right w:w="80" w:type="dxa"/>
+            </w:tcMar>
+          </w:tcPr>
+          <w:p>
+            <w:r>
+              <w:rPr>
+                <w:rFonts w:ascii="Aptos" w:eastAsia="Aptos" w:hAnsi="Aptos" w:cs="Aptos"/>
+                <w:sz w:val="20"/>
+                <w:szCs w:val="20"/>
+              </w:rPr>
+              <w:t xml:space="preserve"/>
+            </w:r>
+          </w:p>
+        </w:tc>
+        <w:tc>
+          <w:tcPr>
+            <w:tcW w:w="750" w:type="pct"/>
+            <w:tcMar>
+              <w:top w:w="30" w:type="dxa"/>
+              <w:left w:w="80" w:type="dxa"/>
+              <w:bottom w:w="30" w:type="dxa"/>
+              <w:right w:w="80" w:type="dxa"/>
+            </w:tcMar>
+          </w:tcPr>
+          <w:p>
+            <w:r>
+              <w:rPr>
+                <w:rFonts w:ascii="Aptos" w:eastAsia="Aptos" w:hAnsi="Aptos" w:cs="Aptos"/>
+                <w:sz w:val="20"/>
+                <w:szCs w:val="20"/>
+              </w:rPr>
+              <w:t xml:space="preserve"/>
+            </w:r>
+          </w:p>
+        </w:tc>
+        <w:tc>
+          <w:tcPr>
+            <w:tcW w:w="1600" w:type="pct"/>
+            <w:tcMar>
+              <w:top w:w="30" w:type="dxa"/>
+              <w:left w:w="80" w:type="dxa"/>
+              <w:bottom w:w="30" w:type="dxa"/>
+              <w:right w:w="80" w:type="dxa"/>
+            </w:tcMar>
+          </w:tcPr>
+          <w:p>
+            <w:r>
+              <w:rPr>
+                <w:rFonts w:ascii="Aptos" w:eastAsia="Aptos" w:hAnsi="Aptos" w:cs="Aptos"/>
+                <w:sz w:val="20"/>
+                <w:szCs w:val="20"/>
+              </w:rPr>
+              <w:t xml:space="preserve"/>
+            </w:r>
+          </w:p>
+        </w:tc>
+      </w:tr>
+      <w:tr>
+        <w:trPr>
+          <w:cantSplit/>
+        </w:trPr>
+        <w:tc>
+          <w:tcPr>
+            <w:tcW w:w="300" w:type="pct"/>
+            <w:tcMar>
+              <w:top w:w="30" w:type="dxa"/>
+              <w:left w:w="80" w:type="dxa"/>
+              <w:bottom w:w="30" w:type="dxa"/>
+              <w:right w:w="80" w:type="dxa"/>
+            </w:tcMar>
+          </w:tcPr>
+          <w:p>
+            <w:r>
+              <w:rPr>
+                <w:rFonts w:ascii="Aptos" w:eastAsia="Aptos" w:hAnsi="Aptos" w:cs="Aptos"/>
+                <w:sz w:val="20"/>
+                <w:szCs w:val="20"/>
+              </w:rPr>
+              <w:t xml:space="preserve">92</w:t>
+            </w:r>
+          </w:p>
+        </w:tc>
+        <w:tc>
+          <w:tcPr>
+            <w:tcW w:w="2350" w:type="pct"/>
+            <w:tcMar>
+              <w:top w:w="30" w:type="dxa"/>
+              <w:left w:w="80" w:type="dxa"/>
+              <w:bottom w:w="30" w:type="dxa"/>
+              <w:right w:w="80" w:type="dxa"/>
+            </w:tcMar>
+          </w:tcPr>
+          <w:p>
+            <w:r>
+              <w:rPr>
+                <w:rFonts w:ascii="Aptos" w:eastAsia="Aptos" w:hAnsi="Aptos" w:cs="Aptos"/>
+                <w:sz w:val="20"/>
+                <w:szCs w:val="20"/>
+              </w:rPr>
+              <w:t xml:space="preserve"/>
+            </w:r>
+          </w:p>
+        </w:tc>
+        <w:tc>
+          <w:tcPr>
+            <w:tcW w:w="750" w:type="pct"/>
+            <w:tcMar>
+              <w:top w:w="30" w:type="dxa"/>
+              <w:left w:w="80" w:type="dxa"/>
+              <w:bottom w:w="30" w:type="dxa"/>
+              <w:right w:w="80" w:type="dxa"/>
+            </w:tcMar>
+          </w:tcPr>
+          <w:p>
+            <w:r>
+              <w:rPr>
+                <w:rFonts w:ascii="Aptos" w:eastAsia="Aptos" w:hAnsi="Aptos" w:cs="Aptos"/>
+                <w:sz w:val="20"/>
+                <w:szCs w:val="20"/>
+              </w:rPr>
+              <w:t xml:space="preserve"/>
+            </w:r>
+          </w:p>
+        </w:tc>
+        <w:tc>
+          <w:tcPr>
+            <w:tcW w:w="1600" w:type="pct"/>
+            <w:tcMar>
+              <w:top w:w="30" w:type="dxa"/>
+              <w:left w:w="80" w:type="dxa"/>
+              <w:bottom w:w="30" w:type="dxa"/>
+              <w:right w:w="80" w:type="dxa"/>
+            </w:tcMar>
+          </w:tcPr>
+          <w:p>
+            <w:r>
+              <w:rPr>
+                <w:rFonts w:ascii="Aptos" w:eastAsia="Aptos" w:hAnsi="Aptos" w:cs="Aptos"/>
+                <w:sz w:val="20"/>
+                <w:szCs w:val="20"/>
+              </w:rPr>
+              <w:t xml:space="preserve"/>
+            </w:r>
+          </w:p>
+        </w:tc>
+      </w:tr>
+      <w:tr>
+        <w:trPr>
+          <w:cantSplit/>
+        </w:trPr>
+        <w:tc>
+          <w:tcPr>
+            <w:tcW w:w="300" w:type="pct"/>
+            <w:tcMar>
+              <w:top w:w="30" w:type="dxa"/>
+              <w:left w:w="80" w:type="dxa"/>
+              <w:bottom w:w="30" w:type="dxa"/>
+              <w:right w:w="80" w:type="dxa"/>
+            </w:tcMar>
+          </w:tcPr>
+          <w:p>
+            <w:r>
+              <w:rPr>
+                <w:rFonts w:ascii="Aptos" w:eastAsia="Aptos" w:hAnsi="Aptos" w:cs="Aptos"/>
+                <w:sz w:val="20"/>
+                <w:szCs w:val="20"/>
+              </w:rPr>
+              <w:t xml:space="preserve">93</w:t>
+            </w:r>
+          </w:p>
+        </w:tc>
+        <w:tc>
+          <w:tcPr>
+            <w:tcW w:w="2350" w:type="pct"/>
+            <w:tcMar>
+              <w:top w:w="30" w:type="dxa"/>
+              <w:left w:w="80" w:type="dxa"/>
+              <w:bottom w:w="30" w:type="dxa"/>
+              <w:right w:w="80" w:type="dxa"/>
+            </w:tcMar>
+          </w:tcPr>
+          <w:p>
+            <w:r>
+              <w:rPr>
+                <w:rFonts w:ascii="Aptos" w:eastAsia="Aptos" w:hAnsi="Aptos" w:cs="Aptos"/>
+                <w:sz w:val="20"/>
+                <w:szCs w:val="20"/>
+              </w:rPr>
+              <w:t xml:space="preserve"/>
+            </w:r>
+          </w:p>
+        </w:tc>
+        <w:tc>
+          <w:tcPr>
+            <w:tcW w:w="750" w:type="pct"/>
+            <w:tcMar>
+              <w:top w:w="30" w:type="dxa"/>
+              <w:left w:w="80" w:type="dxa"/>
+              <w:bottom w:w="30" w:type="dxa"/>
+              <w:right w:w="80" w:type="dxa"/>
+            </w:tcMar>
+          </w:tcPr>
+          <w:p>
+            <w:r>
+              <w:rPr>
+                <w:rFonts w:ascii="Aptos" w:eastAsia="Aptos" w:hAnsi="Aptos" w:cs="Aptos"/>
+                <w:sz w:val="20"/>
+                <w:szCs w:val="20"/>
+              </w:rPr>
+              <w:t xml:space="preserve"/>
+            </w:r>
+          </w:p>
+        </w:tc>
+        <w:tc>
+          <w:tcPr>
+            <w:tcW w:w="1600" w:type="pct"/>
+            <w:tcMar>
+              <w:top w:w="30" w:type="dxa"/>
+              <w:left w:w="80" w:type="dxa"/>
+              <w:bottom w:w="30" w:type="dxa"/>
+              <w:right w:w="80" w:type="dxa"/>
+            </w:tcMar>
+          </w:tcPr>
+          <w:p>
+            <w:r>
+              <w:rPr>
+                <w:rFonts w:ascii="Aptos" w:eastAsia="Aptos" w:hAnsi="Aptos" w:cs="Aptos"/>
+                <w:sz w:val="20"/>
+                <w:szCs w:val="20"/>
+              </w:rPr>
+              <w:t xml:space="preserve"/>
+            </w:r>
+          </w:p>
+        </w:tc>
+      </w:tr>
+      <w:tr>
+        <w:trPr>
+          <w:cantSplit/>
+        </w:trPr>
+        <w:tc>
+          <w:tcPr>
+            <w:tcW w:w="300" w:type="pct"/>
+            <w:tcMar>
+              <w:top w:w="30" w:type="dxa"/>
+              <w:left w:w="80" w:type="dxa"/>
+              <w:bottom w:w="30" w:type="dxa"/>
+              <w:right w:w="80" w:type="dxa"/>
+            </w:tcMar>
+          </w:tcPr>
+          <w:p>
+            <w:r>
+              <w:rPr>
+                <w:rFonts w:ascii="Aptos" w:eastAsia="Aptos" w:hAnsi="Aptos" w:cs="Aptos"/>
+                <w:sz w:val="20"/>
+                <w:szCs w:val="20"/>
+              </w:rPr>
+              <w:t xml:space="preserve">94</w:t>
+            </w:r>
+          </w:p>
+        </w:tc>
+        <w:tc>
+          <w:tcPr>
+            <w:tcW w:w="2350" w:type="pct"/>
+            <w:tcMar>
+              <w:top w:w="30" w:type="dxa"/>
+              <w:left w:w="80" w:type="dxa"/>
+              <w:bottom w:w="30" w:type="dxa"/>
+              <w:right w:w="80" w:type="dxa"/>
+            </w:tcMar>
+          </w:tcPr>
+          <w:p>
+            <w:r>
+              <w:rPr>
+                <w:rFonts w:ascii="Aptos" w:eastAsia="Aptos" w:hAnsi="Aptos" w:cs="Aptos"/>
+                <w:sz w:val="20"/>
+                <w:szCs w:val="20"/>
+              </w:rPr>
+              <w:t xml:space="preserve"/>
+            </w:r>
+          </w:p>
+        </w:tc>
+        <w:tc>
+          <w:tcPr>
+            <w:tcW w:w="750" w:type="pct"/>
+            <w:tcMar>
+              <w:top w:w="30" w:type="dxa"/>
+              <w:left w:w="80" w:type="dxa"/>
+              <w:bottom w:w="30" w:type="dxa"/>
+              <w:right w:w="80" w:type="dxa"/>
+            </w:tcMar>
+          </w:tcPr>
+          <w:p>
+            <w:r>
+              <w:rPr>
+                <w:rFonts w:ascii="Aptos" w:eastAsia="Aptos" w:hAnsi="Aptos" w:cs="Aptos"/>
+                <w:sz w:val="20"/>
+                <w:szCs w:val="20"/>
+              </w:rPr>
+              <w:t xml:space="preserve"/>
+            </w:r>
+          </w:p>
+        </w:tc>
+        <w:tc>
+          <w:tcPr>
+            <w:tcW w:w="1600" w:type="pct"/>
+            <w:tcMar>
+              <w:top w:w="30" w:type="dxa"/>
+              <w:left w:w="80" w:type="dxa"/>
+              <w:bottom w:w="30" w:type="dxa"/>
+              <w:right w:w="80" w:type="dxa"/>
+            </w:tcMar>
+          </w:tcPr>
+          <w:p>
+            <w:r>
+              <w:rPr>
+                <w:rFonts w:ascii="Aptos" w:eastAsia="Aptos" w:hAnsi="Aptos" w:cs="Aptos"/>
+                <w:sz w:val="20"/>
+                <w:szCs w:val="20"/>
+              </w:rPr>
+              <w:t xml:space="preserve"/>
+            </w:r>
+          </w:p>
+        </w:tc>
+      </w:tr>
+      <w:tr>
+        <w:trPr>
+          <w:cantSplit/>
+        </w:trPr>
+        <w:tc>
+          <w:tcPr>
+            <w:tcW w:w="300" w:type="pct"/>
+            <w:tcMar>
+              <w:top w:w="30" w:type="dxa"/>
+              <w:left w:w="80" w:type="dxa"/>
+              <w:bottom w:w="30" w:type="dxa"/>
+              <w:right w:w="80" w:type="dxa"/>
+            </w:tcMar>
+          </w:tcPr>
+          <w:p>
+            <w:r>
+              <w:rPr>
+                <w:rFonts w:ascii="Aptos" w:eastAsia="Aptos" w:hAnsi="Aptos" w:cs="Aptos"/>
+                <w:sz w:val="20"/>
+                <w:szCs w:val="20"/>
+              </w:rPr>
+              <w:t xml:space="preserve">95</w:t>
+            </w:r>
+          </w:p>
+        </w:tc>
+        <w:tc>
+          <w:tcPr>
+            <w:tcW w:w="2350" w:type="pct"/>
+            <w:tcMar>
+              <w:top w:w="30" w:type="dxa"/>
+              <w:left w:w="80" w:type="dxa"/>
+              <w:bottom w:w="30" w:type="dxa"/>
+              <w:right w:w="80" w:type="dxa"/>
+            </w:tcMar>
+          </w:tcPr>
+          <w:p>
+            <w:r>
+              <w:rPr>
+                <w:rFonts w:ascii="Aptos" w:eastAsia="Aptos" w:hAnsi="Aptos" w:cs="Aptos"/>
+                <w:sz w:val="20"/>
+                <w:szCs w:val="20"/>
+              </w:rPr>
+              <w:t xml:space="preserve"/>
+            </w:r>
+          </w:p>
+        </w:tc>
+        <w:tc>
+          <w:tcPr>
+            <w:tcW w:w="750" w:type="pct"/>
+            <w:tcMar>
+              <w:top w:w="30" w:type="dxa"/>
+              <w:left w:w="80" w:type="dxa"/>
+              <w:bottom w:w="30" w:type="dxa"/>
+              <w:right w:w="80" w:type="dxa"/>
+            </w:tcMar>
+          </w:tcPr>
+          <w:p>
+            <w:r>
+              <w:rPr>
+                <w:rFonts w:ascii="Aptos" w:eastAsia="Aptos" w:hAnsi="Aptos" w:cs="Aptos"/>
+                <w:sz w:val="20"/>
+                <w:szCs w:val="20"/>
+              </w:rPr>
+              <w:t xml:space="preserve"/>
+            </w:r>
+          </w:p>
+        </w:tc>
+        <w:tc>
+          <w:tcPr>
+            <w:tcW w:w="1600" w:type="pct"/>
+            <w:tcMar>
+              <w:top w:w="30" w:type="dxa"/>
+              <w:left w:w="80" w:type="dxa"/>
+              <w:bottom w:w="30" w:type="dxa"/>
+              <w:right w:w="80" w:type="dxa"/>
+            </w:tcMar>
+          </w:tcPr>
+          <w:p>
+            <w:r>
+              <w:rPr>
+                <w:rFonts w:ascii="Aptos" w:eastAsia="Aptos" w:hAnsi="Aptos" w:cs="Aptos"/>
+                <w:sz w:val="20"/>
+                <w:szCs w:val="20"/>
+              </w:rPr>
+              <w:t xml:space="preserve"/>
+            </w:r>
+          </w:p>
+        </w:tc>
+      </w:tr>
+      <w:tr>
+        <w:trPr>
+          <w:cantSplit/>
+        </w:trPr>
+        <w:tc>
+          <w:tcPr>
+            <w:tcW w:w="300" w:type="pct"/>
+            <w:tcMar>
+              <w:top w:w="30" w:type="dxa"/>
+              <w:left w:w="80" w:type="dxa"/>
+              <w:bottom w:w="30" w:type="dxa"/>
+              <w:right w:w="80" w:type="dxa"/>
+            </w:tcMar>
+          </w:tcPr>
+          <w:p>
+            <w:r>
+              <w:rPr>
+                <w:rFonts w:ascii="Aptos" w:eastAsia="Aptos" w:hAnsi="Aptos" w:cs="Aptos"/>
+                <w:sz w:val="20"/>
+                <w:szCs w:val="20"/>
+              </w:rPr>
+              <w:t xml:space="preserve">96</w:t>
+            </w:r>
+          </w:p>
+        </w:tc>
+        <w:tc>
+          <w:tcPr>
+            <w:tcW w:w="2350" w:type="pct"/>
+            <w:tcMar>
+              <w:top w:w="30" w:type="dxa"/>
+              <w:left w:w="80" w:type="dxa"/>
+              <w:bottom w:w="30" w:type="dxa"/>
+              <w:right w:w="80" w:type="dxa"/>
+            </w:tcMar>
+          </w:tcPr>
+          <w:p>
+            <w:r>
+              <w:rPr>
+                <w:rFonts w:ascii="Aptos" w:eastAsia="Aptos" w:hAnsi="Aptos" w:cs="Aptos"/>
+                <w:sz w:val="20"/>
+                <w:szCs w:val="20"/>
+              </w:rPr>
+              <w:t xml:space="preserve"/>
+            </w:r>
+          </w:p>
+        </w:tc>
+        <w:tc>
+          <w:tcPr>
+            <w:tcW w:w="750" w:type="pct"/>
+            <w:tcMar>
+              <w:top w:w="30" w:type="dxa"/>
+              <w:left w:w="80" w:type="dxa"/>
+              <w:bottom w:w="30" w:type="dxa"/>
+              <w:right w:w="80" w:type="dxa"/>
+            </w:tcMar>
+          </w:tcPr>
+          <w:p>
+            <w:r>
+              <w:rPr>
+                <w:rFonts w:ascii="Aptos" w:eastAsia="Aptos" w:hAnsi="Aptos" w:cs="Aptos"/>
+                <w:sz w:val="20"/>
+                <w:szCs w:val="20"/>
+              </w:rPr>
+              <w:t xml:space="preserve"/>
+            </w:r>
+          </w:p>
+        </w:tc>
+        <w:tc>
+          <w:tcPr>
+            <w:tcW w:w="1600" w:type="pct"/>
+            <w:tcMar>
+              <w:top w:w="30" w:type="dxa"/>
+              <w:left w:w="80" w:type="dxa"/>
+              <w:bottom w:w="30" w:type="dxa"/>
+              <w:right w:w="80" w:type="dxa"/>
+            </w:tcMar>
+          </w:tcPr>
+          <w:p>
+            <w:r>
+              <w:rPr>
+                <w:rFonts w:ascii="Aptos" w:eastAsia="Aptos" w:hAnsi="Aptos" w:cs="Aptos"/>
+                <w:sz w:val="20"/>
+                <w:szCs w:val="20"/>
+              </w:rPr>
+              <w:t xml:space="preserve"/>
+            </w:r>
+          </w:p>
+        </w:tc>
+      </w:tr>
+      <w:tr>
+        <w:trPr>
+          <w:cantSplit/>
+        </w:trPr>
+        <w:tc>
+          <w:tcPr>
+            <w:tcW w:w="300" w:type="pct"/>
+            <w:tcMar>
+              <w:top w:w="30" w:type="dxa"/>
+              <w:left w:w="80" w:type="dxa"/>
+              <w:bottom w:w="30" w:type="dxa"/>
+              <w:right w:w="80" w:type="dxa"/>
+            </w:tcMar>
+          </w:tcPr>
+          <w:p>
+            <w:r>
+              <w:rPr>
+                <w:rFonts w:ascii="Aptos" w:eastAsia="Aptos" w:hAnsi="Aptos" w:cs="Aptos"/>
+                <w:sz w:val="20"/>
+                <w:szCs w:val="20"/>
+              </w:rPr>
+              <w:t xml:space="preserve">97</w:t>
+            </w:r>
+          </w:p>
+        </w:tc>
+        <w:tc>
+          <w:tcPr>
+            <w:tcW w:w="2350" w:type="pct"/>
+            <w:tcMar>
+              <w:top w:w="30" w:type="dxa"/>
+              <w:left w:w="80" w:type="dxa"/>
+              <w:bottom w:w="30" w:type="dxa"/>
+              <w:right w:w="80" w:type="dxa"/>
+            </w:tcMar>
+          </w:tcPr>
+          <w:p>
+            <w:r>
+              <w:rPr>
+                <w:rFonts w:ascii="Aptos" w:eastAsia="Aptos" w:hAnsi="Aptos" w:cs="Aptos"/>
+                <w:sz w:val="20"/>
+                <w:szCs w:val="20"/>
+              </w:rPr>
+              <w:t xml:space="preserve"/>
+            </w:r>
+          </w:p>
+        </w:tc>
+        <w:tc>
+          <w:tcPr>
+            <w:tcW w:w="750" w:type="pct"/>
+            <w:tcMar>
+              <w:top w:w="30" w:type="dxa"/>
+              <w:left w:w="80" w:type="dxa"/>
+              <w:bottom w:w="30" w:type="dxa"/>
+              <w:right w:w="80" w:type="dxa"/>
+            </w:tcMar>
+          </w:tcPr>
+          <w:p>
+            <w:r>
+              <w:rPr>
+                <w:rFonts w:ascii="Aptos" w:eastAsia="Aptos" w:hAnsi="Aptos" w:cs="Aptos"/>
+                <w:sz w:val="20"/>
+                <w:szCs w:val="20"/>
+              </w:rPr>
+              <w:t xml:space="preserve"/>
+            </w:r>
+          </w:p>
+        </w:tc>
+        <w:tc>
+          <w:tcPr>
+            <w:tcW w:w="1600" w:type="pct"/>
+            <w:tcMar>
+              <w:top w:w="30" w:type="dxa"/>
+              <w:left w:w="80" w:type="dxa"/>
+              <w:bottom w:w="30" w:type="dxa"/>
+              <w:right w:w="80" w:type="dxa"/>
+            </w:tcMar>
+          </w:tcPr>
+          <w:p>
+            <w:r>
+              <w:rPr>
+                <w:rFonts w:ascii="Aptos" w:eastAsia="Aptos" w:hAnsi="Aptos" w:cs="Aptos"/>
+                <w:sz w:val="20"/>
+                <w:szCs w:val="20"/>
+              </w:rPr>
+              <w:t xml:space="preserve"/>
+            </w:r>
+          </w:p>
+        </w:tc>
+      </w:tr>
+      <w:tr>
+        <w:trPr>
+          <w:cantSplit/>
+        </w:trPr>
+        <w:tc>
+          <w:tcPr>
+            <w:tcW w:w="300" w:type="pct"/>
+            <w:tcMar>
+              <w:top w:w="30" w:type="dxa"/>
+              <w:left w:w="80" w:type="dxa"/>
+              <w:bottom w:w="30" w:type="dxa"/>
+              <w:right w:w="80" w:type="dxa"/>
+            </w:tcMar>
+          </w:tcPr>
+          <w:p>
+            <w:r>
+              <w:rPr>
+                <w:rFonts w:ascii="Aptos" w:eastAsia="Aptos" w:hAnsi="Aptos" w:cs="Aptos"/>
+                <w:sz w:val="20"/>
+                <w:szCs w:val="20"/>
+              </w:rPr>
+              <w:t xml:space="preserve">98</w:t>
+            </w:r>
+          </w:p>
+        </w:tc>
+        <w:tc>
+          <w:tcPr>
+            <w:tcW w:w="2350" w:type="pct"/>
+            <w:tcMar>
+              <w:top w:w="30" w:type="dxa"/>
+              <w:left w:w="80" w:type="dxa"/>
+              <w:bottom w:w="30" w:type="dxa"/>
+              <w:right w:w="80" w:type="dxa"/>
+            </w:tcMar>
+          </w:tcPr>
+          <w:p>
+            <w:r>
+              <w:rPr>
+                <w:rFonts w:ascii="Aptos" w:eastAsia="Aptos" w:hAnsi="Aptos" w:cs="Aptos"/>
+                <w:sz w:val="20"/>
+                <w:szCs w:val="20"/>
+              </w:rPr>
+              <w:t xml:space="preserve"/>
+            </w:r>
+          </w:p>
+        </w:tc>
+        <w:tc>
+          <w:tcPr>
+            <w:tcW w:w="750" w:type="pct"/>
+            <w:tcMar>
+              <w:top w:w="30" w:type="dxa"/>
+              <w:left w:w="80" w:type="dxa"/>
+              <w:bottom w:w="30" w:type="dxa"/>
+              <w:right w:w="80" w:type="dxa"/>
+            </w:tcMar>
+          </w:tcPr>
+          <w:p>
+            <w:r>
+              <w:rPr>
+                <w:rFonts w:ascii="Aptos" w:eastAsia="Aptos" w:hAnsi="Aptos" w:cs="Aptos"/>
+                <w:sz w:val="20"/>
+                <w:szCs w:val="20"/>
+              </w:rPr>
+              <w:t xml:space="preserve"/>
+            </w:r>
+          </w:p>
+        </w:tc>
+        <w:tc>
+          <w:tcPr>
+            <w:tcW w:w="1600" w:type="pct"/>
+            <w:tcMar>
+              <w:top w:w="30" w:type="dxa"/>
+              <w:left w:w="80" w:type="dxa"/>
+              <w:bottom w:w="30" w:type="dxa"/>
+              <w:right w:w="80" w:type="dxa"/>
+            </w:tcMar>
+          </w:tcPr>
+          <w:p>
+            <w:r>
+              <w:rPr>
+                <w:rFonts w:ascii="Aptos" w:eastAsia="Aptos" w:hAnsi="Aptos" w:cs="Aptos"/>
+                <w:sz w:val="20"/>
+                <w:szCs w:val="20"/>
+              </w:rPr>
+              <w:t xml:space="preserve"/>
+            </w:r>
+          </w:p>
+        </w:tc>
+      </w:tr>
+      <w:tr>
+        <w:trPr>
+          <w:cantSplit/>
+        </w:trPr>
+        <w:tc>
+          <w:tcPr>
+            <w:tcW w:w="300" w:type="pct"/>
+            <w:tcMar>
+              <w:top w:w="30" w:type="dxa"/>
+              <w:left w:w="80" w:type="dxa"/>
+              <w:bottom w:w="30" w:type="dxa"/>
+              <w:right w:w="80" w:type="dxa"/>
+            </w:tcMar>
+          </w:tcPr>
+          <w:p>
+            <w:r>
+              <w:rPr>
+                <w:rFonts w:ascii="Aptos" w:eastAsia="Aptos" w:hAnsi="Aptos" w:cs="Aptos"/>
+                <w:sz w:val="20"/>
+                <w:szCs w:val="20"/>
+              </w:rPr>
+              <w:t xml:space="preserve">99</w:t>
+            </w:r>
+          </w:p>
+        </w:tc>
+        <w:tc>
+          <w:tcPr>
+            <w:tcW w:w="2350" w:type="pct"/>
+            <w:tcMar>
+              <w:top w:w="30" w:type="dxa"/>
+              <w:left w:w="80" w:type="dxa"/>
+              <w:bottom w:w="30" w:type="dxa"/>
+              <w:right w:w="80" w:type="dxa"/>
+            </w:tcMar>
+          </w:tcPr>
+          <w:p>
+            <w:r>
+              <w:rPr>
+                <w:rFonts w:ascii="Aptos" w:eastAsia="Aptos" w:hAnsi="Aptos" w:cs="Aptos"/>
+                <w:sz w:val="20"/>
+                <w:szCs w:val="20"/>
+              </w:rPr>
+              <w:t xml:space="preserve"/>
+            </w:r>
+          </w:p>
+        </w:tc>
+        <w:tc>
+          <w:tcPr>
+            <w:tcW w:w="750" w:type="pct"/>
+            <w:tcMar>
+              <w:top w:w="30" w:type="dxa"/>
+              <w:left w:w="80" w:type="dxa"/>
+              <w:bottom w:w="30" w:type="dxa"/>
+              <w:right w:w="80" w:type="dxa"/>
+            </w:tcMar>
+          </w:tcPr>
+          <w:p>
+            <w:r>
+              <w:rPr>
+                <w:rFonts w:ascii="Aptos" w:eastAsia="Aptos" w:hAnsi="Aptos" w:cs="Aptos"/>
+                <w:sz w:val="20"/>
+                <w:szCs w:val="20"/>
+              </w:rPr>
+              <w:t xml:space="preserve"/>
+            </w:r>
+          </w:p>
+        </w:tc>
+        <w:tc>
+          <w:tcPr>
+            <w:tcW w:w="1600" w:type="pct"/>
+            <w:tcMar>
+              <w:top w:w="30" w:type="dxa"/>
+              <w:left w:w="80" w:type="dxa"/>
+              <w:bottom w:w="30" w:type="dxa"/>
+              <w:right w:w="80" w:type="dxa"/>
+            </w:tcMar>
+          </w:tcPr>
+          <w:p>
+            <w:r>
+              <w:rPr>
+                <w:rFonts w:ascii="Aptos" w:eastAsia="Aptos" w:hAnsi="Aptos" w:cs="Aptos"/>
+                <w:sz w:val="20"/>
+                <w:szCs w:val="20"/>
+              </w:rPr>
+              <w:t xml:space="preserve"/>
+            </w:r>
+          </w:p>
+        </w:tc>
+      </w:tr>
+      <w:tr>
+        <w:trPr>
+          <w:cantSplit/>
+        </w:trPr>
+        <w:tc>
+          <w:tcPr>
+            <w:tcW w:w="300" w:type="pct"/>
+            <w:tcMar>
+              <w:top w:w="30" w:type="dxa"/>
+              <w:left w:w="80" w:type="dxa"/>
+              <w:bottom w:w="30" w:type="dxa"/>
+              <w:right w:w="80" w:type="dxa"/>
+            </w:tcMar>
+          </w:tcPr>
+          <w:p>
+            <w:r>
+              <w:rPr>
+                <w:rFonts w:ascii="Aptos" w:eastAsia="Aptos" w:hAnsi="Aptos" w:cs="Aptos"/>
+                <w:sz w:val="20"/>
+                <w:szCs w:val="20"/>
+              </w:rPr>
+              <w:t xml:space="preserve">100</w:t>
+            </w:r>
+          </w:p>
+        </w:tc>
+        <w:tc>
+          <w:tcPr>
+            <w:tcW w:w="2350" w:type="pct"/>
+            <w:tcMar>
+              <w:top w:w="30" w:type="dxa"/>
+              <w:left w:w="80" w:type="dxa"/>
+              <w:bottom w:w="30" w:type="dxa"/>
+              <w:right w:w="80" w:type="dxa"/>
+            </w:tcMar>
+          </w:tcPr>
+          <w:p>
+            <w:r>
+              <w:rPr>
+                <w:rFonts w:ascii="Aptos" w:eastAsia="Aptos" w:hAnsi="Aptos" w:cs="Aptos"/>
+                <w:sz w:val="20"/>
+                <w:szCs w:val="20"/>
+              </w:rPr>
+              <w:t xml:space="preserve"/>
+            </w:r>
+          </w:p>
+        </w:tc>
+        <w:tc>
+          <w:tcPr>
+            <w:tcW w:w="750" w:type="pct"/>
+            <w:tcMar>
+              <w:top w:w="30" w:type="dxa"/>
+              <w:left w:w="80" w:type="dxa"/>
+              <w:bottom w:w="30" w:type="dxa"/>
+              <w:right w:w="80" w:type="dxa"/>
+            </w:tcMar>
+          </w:tcPr>
+          <w:p>
+            <w:r>
+              <w:rPr>
+                <w:rFonts w:ascii="Aptos" w:eastAsia="Aptos" w:hAnsi="Aptos" w:cs="Aptos"/>
+                <w:sz w:val="20"/>
+                <w:szCs w:val="20"/>
+              </w:rPr>
+              <w:t xml:space="preserve"/>
+            </w:r>
+          </w:p>
+        </w:tc>
+        <w:tc>
+          <w:tcPr>
+            <w:tcW w:w="1600" w:type="pct"/>
+            <w:tcMar>
+              <w:top w:w="30" w:type="dxa"/>
+              <w:left w:w="80" w:type="dxa"/>
+              <w:bottom w:w="30" w:type="dxa"/>
+              <w:right w:w="80" w:type="dxa"/>
+            </w:tcMar>
+          </w:tcPr>
+          <w:p>
+            <w:r>
+              <w:rPr>
+                <w:rFonts w:ascii="Aptos" w:eastAsia="Aptos" w:hAnsi="Aptos" w:cs="Aptos"/>
+                <w:sz w:val="20"/>
+                <w:szCs w:val="20"/>
+              </w:rPr>
+              <w:t xml:space="preserve"/>
+            </w:r>
+          </w:p>
+        </w:tc>
+      </w:tr>
+      <w:tr>
+        <w:trPr>
+          <w:cantSplit/>
+        </w:trPr>
+        <w:tc>
+          <w:tcPr>
+            <w:tcW w:w="300" w:type="pct"/>
+            <w:tcMar>
+              <w:top w:w="30" w:type="dxa"/>
+              <w:left w:w="80" w:type="dxa"/>
+              <w:bottom w:w="30" w:type="dxa"/>
+              <w:right w:w="80" w:type="dxa"/>
+            </w:tcMar>
+          </w:tcPr>
+          <w:p>
+            <w:r>
+              <w:rPr>
+                <w:rFonts w:ascii="Aptos" w:eastAsia="Aptos" w:hAnsi="Aptos" w:cs="Aptos"/>
+                <w:sz w:val="20"/>
+                <w:szCs w:val="20"/>
+              </w:rPr>
+              <w:t xml:space="preserve">101</w:t>
+            </w:r>
+          </w:p>
+        </w:tc>
+        <w:tc>
+          <w:tcPr>
+            <w:tcW w:w="2350" w:type="pct"/>
+            <w:tcMar>
+              <w:top w:w="30" w:type="dxa"/>
+              <w:left w:w="80" w:type="dxa"/>
+              <w:bottom w:w="30" w:type="dxa"/>
+              <w:right w:w="80" w:type="dxa"/>
+            </w:tcMar>
+          </w:tcPr>
+          <w:p>
+            <w:r>
+              <w:rPr>
+                <w:rFonts w:ascii="Aptos" w:eastAsia="Aptos" w:hAnsi="Aptos" w:cs="Aptos"/>
+                <w:sz w:val="20"/>
+                <w:szCs w:val="20"/>
+              </w:rPr>
+              <w:t xml:space="preserve"/>
+            </w:r>
+          </w:p>
+        </w:tc>
+        <w:tc>
+          <w:tcPr>
+            <w:tcW w:w="750" w:type="pct"/>
+            <w:tcMar>
+              <w:top w:w="30" w:type="dxa"/>
+              <w:left w:w="80" w:type="dxa"/>
+              <w:bottom w:w="30" w:type="dxa"/>
+              <w:right w:w="80" w:type="dxa"/>
+            </w:tcMar>
+          </w:tcPr>
+          <w:p>
+            <w:r>
+              <w:rPr>
+                <w:rFonts w:ascii="Aptos" w:eastAsia="Aptos" w:hAnsi="Aptos" w:cs="Aptos"/>
+                <w:sz w:val="20"/>
+                <w:szCs w:val="20"/>
+              </w:rPr>
+              <w:t xml:space="preserve"/>
+            </w:r>
+          </w:p>
+        </w:tc>
+        <w:tc>
+          <w:tcPr>
+            <w:tcW w:w="1600" w:type="pct"/>
+            <w:tcMar>
+              <w:top w:w="30" w:type="dxa"/>
+              <w:left w:w="80" w:type="dxa"/>
+              <w:bottom w:w="30" w:type="dxa"/>
+              <w:right w:w="80" w:type="dxa"/>
+            </w:tcMar>
+          </w:tcPr>
+          <w:p>
+            <w:r>
+              <w:rPr>
+                <w:rFonts w:ascii="Aptos" w:eastAsia="Aptos" w:hAnsi="Aptos" w:cs="Aptos"/>
+                <w:sz w:val="20"/>
+                <w:szCs w:val="20"/>
+              </w:rPr>
+              <w:t xml:space="preserve"/>
+            </w:r>
+          </w:p>
+        </w:tc>
+      </w:tr>
+      <w:tr>
+        <w:trPr>
+          <w:cantSplit/>
+        </w:trPr>
+        <w:tc>
+          <w:tcPr>
+            <w:tcW w:w="300" w:type="pct"/>
+            <w:tcMar>
+              <w:top w:w="30" w:type="dxa"/>
+              <w:left w:w="80" w:type="dxa"/>
+              <w:bottom w:w="30" w:type="dxa"/>
+              <w:right w:w="80" w:type="dxa"/>
+            </w:tcMar>
+          </w:tcPr>
+          <w:p>
+            <w:r>
+              <w:rPr>
+                <w:rFonts w:ascii="Aptos" w:eastAsia="Aptos" w:hAnsi="Aptos" w:cs="Aptos"/>
+                <w:sz w:val="20"/>
+                <w:szCs w:val="20"/>
+              </w:rPr>
+              <w:t xml:space="preserve">102</w:t>
+            </w:r>
+          </w:p>
+        </w:tc>
+        <w:tc>
+          <w:tcPr>
+            <w:tcW w:w="2350" w:type="pct"/>
+            <w:tcMar>
+              <w:top w:w="30" w:type="dxa"/>
+              <w:left w:w="80" w:type="dxa"/>
+              <w:bottom w:w="30" w:type="dxa"/>
+              <w:right w:w="80" w:type="dxa"/>
+            </w:tcMar>
+          </w:tcPr>
+          <w:p>
+            <w:r>
+              <w:rPr>
+                <w:rFonts w:ascii="Aptos" w:eastAsia="Aptos" w:hAnsi="Aptos" w:cs="Aptos"/>
+                <w:sz w:val="20"/>
+                <w:szCs w:val="20"/>
+              </w:rPr>
+              <w:t xml:space="preserve"/>
+            </w:r>
+          </w:p>
+        </w:tc>
+        <w:tc>
+          <w:tcPr>
+            <w:tcW w:w="750" w:type="pct"/>
+            <w:tcMar>
+              <w:top w:w="30" w:type="dxa"/>
+              <w:left w:w="80" w:type="dxa"/>
+              <w:bottom w:w="30" w:type="dxa"/>
+              <w:right w:w="80" w:type="dxa"/>
+            </w:tcMar>
+          </w:tcPr>
+          <w:p>
+            <w:r>
+              <w:rPr>
+                <w:rFonts w:ascii="Aptos" w:eastAsia="Aptos" w:hAnsi="Aptos" w:cs="Aptos"/>
+                <w:sz w:val="20"/>
+                <w:szCs w:val="20"/>
+              </w:rPr>
+              <w:t xml:space="preserve"/>
+            </w:r>
+          </w:p>
+        </w:tc>
+        <w:tc>
+          <w:tcPr>
+            <w:tcW w:w="1600" w:type="pct"/>
+            <w:tcMar>
+              <w:top w:w="30" w:type="dxa"/>
+              <w:left w:w="80" w:type="dxa"/>
+              <w:bottom w:w="30" w:type="dxa"/>
+              <w:right w:w="80" w:type="dxa"/>
+            </w:tcMar>
+          </w:tcPr>
+          <w:p>
+            <w:r>
+              <w:rPr>
+                <w:rFonts w:ascii="Aptos" w:eastAsia="Aptos" w:hAnsi="Aptos" w:cs="Aptos"/>
+                <w:sz w:val="20"/>
+                <w:szCs w:val="20"/>
+              </w:rPr>
+              <w:t xml:space="preserve"/>
+            </w:r>
+          </w:p>
+        </w:tc>
+      </w:tr>
+      <w:tr>
+        <w:trPr>
+          <w:cantSplit/>
+        </w:trPr>
+        <w:tc>
+          <w:tcPr>
+            <w:tcW w:w="300" w:type="pct"/>
+            <w:tcMar>
+              <w:top w:w="30" w:type="dxa"/>
+              <w:left w:w="80" w:type="dxa"/>
+              <w:bottom w:w="30" w:type="dxa"/>
+              <w:right w:w="80" w:type="dxa"/>
+            </w:tcMar>
+          </w:tcPr>
+          <w:p>
+            <w:r>
+              <w:rPr>
+                <w:rFonts w:ascii="Aptos" w:eastAsia="Aptos" w:hAnsi="Aptos" w:cs="Aptos"/>
+                <w:sz w:val="20"/>
+                <w:szCs w:val="20"/>
+              </w:rPr>
+              <w:t xml:space="preserve">103</w:t>
+            </w:r>
+          </w:p>
+        </w:tc>
+        <w:tc>
+          <w:tcPr>
+            <w:tcW w:w="2350" w:type="pct"/>
+            <w:tcMar>
+              <w:top w:w="30" w:type="dxa"/>
+              <w:left w:w="80" w:type="dxa"/>
+              <w:bottom w:w="30" w:type="dxa"/>
+              <w:right w:w="80" w:type="dxa"/>
+            </w:tcMar>
+          </w:tcPr>
+          <w:p>
+            <w:r>
+              <w:rPr>
+                <w:rFonts w:ascii="Aptos" w:eastAsia="Aptos" w:hAnsi="Aptos" w:cs="Aptos"/>
+                <w:sz w:val="20"/>
+                <w:szCs w:val="20"/>
+              </w:rPr>
+              <w:t xml:space="preserve"/>
+            </w:r>
+          </w:p>
+        </w:tc>
+        <w:tc>
+          <w:tcPr>
+            <w:tcW w:w="750" w:type="pct"/>
+            <w:tcMar>
+              <w:top w:w="30" w:type="dxa"/>
+              <w:left w:w="80" w:type="dxa"/>
+              <w:bottom w:w="30" w:type="dxa"/>
+              <w:right w:w="80" w:type="dxa"/>
+            </w:tcMar>
+          </w:tcPr>
+          <w:p>
+            <w:r>
+              <w:rPr>
+                <w:rFonts w:ascii="Aptos" w:eastAsia="Aptos" w:hAnsi="Aptos" w:cs="Aptos"/>
+                <w:sz w:val="20"/>
+                <w:szCs w:val="20"/>
+              </w:rPr>
+              <w:t xml:space="preserve"/>
+            </w:r>
+          </w:p>
+        </w:tc>
+        <w:tc>
+          <w:tcPr>
+            <w:tcW w:w="1600" w:type="pct"/>
+            <w:tcMar>
+              <w:top w:w="30" w:type="dxa"/>
+              <w:left w:w="80" w:type="dxa"/>
+              <w:bottom w:w="30" w:type="dxa"/>
+              <w:right w:w="80" w:type="dxa"/>
+            </w:tcMar>
+          </w:tcPr>
+          <w:p>
+            <w:r>
+              <w:rPr>
+                <w:rFonts w:ascii="Aptos" w:eastAsia="Aptos" w:hAnsi="Aptos" w:cs="Aptos"/>
+                <w:sz w:val="20"/>
+                <w:szCs w:val="20"/>
+              </w:rPr>
+              <w:t xml:space="preserve"/>
+            </w:r>
+          </w:p>
+        </w:tc>
+      </w:tr>
+      <w:tr>
+        <w:trPr>
+          <w:cantSplit/>
+        </w:trPr>
+        <w:tc>
+          <w:tcPr>
+            <w:tcW w:w="300" w:type="pct"/>
+            <w:tcMar>
+              <w:top w:w="30" w:type="dxa"/>
+              <w:left w:w="80" w:type="dxa"/>
+              <w:bottom w:w="30" w:type="dxa"/>
+              <w:right w:w="80" w:type="dxa"/>
+            </w:tcMar>
+          </w:tcPr>
+          <w:p>
+            <w:r>
+              <w:rPr>
+                <w:rFonts w:ascii="Aptos" w:eastAsia="Aptos" w:hAnsi="Aptos" w:cs="Aptos"/>
+                <w:sz w:val="20"/>
+                <w:szCs w:val="20"/>
+              </w:rPr>
+              <w:t xml:space="preserve">104</w:t>
+            </w:r>
+          </w:p>
+        </w:tc>
+        <w:tc>
+          <w:tcPr>
+            <w:tcW w:w="2350" w:type="pct"/>
+            <w:tcMar>
+              <w:top w:w="30" w:type="dxa"/>
+              <w:left w:w="80" w:type="dxa"/>
+              <w:bottom w:w="30" w:type="dxa"/>
+              <w:right w:w="80" w:type="dxa"/>
+            </w:tcMar>
+          </w:tcPr>
+          <w:p>
+            <w:r>
+              <w:rPr>
+                <w:rFonts w:ascii="Aptos" w:eastAsia="Aptos" w:hAnsi="Aptos" w:cs="Aptos"/>
+                <w:sz w:val="20"/>
+                <w:szCs w:val="20"/>
+              </w:rPr>
+              <w:t xml:space="preserve"/>
+            </w:r>
+          </w:p>
+        </w:tc>
+        <w:tc>
+          <w:tcPr>
+            <w:tcW w:w="750" w:type="pct"/>
+            <w:tcMar>
+              <w:top w:w="30" w:type="dxa"/>
+              <w:left w:w="80" w:type="dxa"/>
+              <w:bottom w:w="30" w:type="dxa"/>
+              <w:right w:w="80" w:type="dxa"/>
+            </w:tcMar>
+          </w:tcPr>
+          <w:p>
+            <w:r>
+              <w:rPr>
+                <w:rFonts w:ascii="Aptos" w:eastAsia="Aptos" w:hAnsi="Aptos" w:cs="Aptos"/>
+                <w:sz w:val="20"/>
+                <w:szCs w:val="20"/>
+              </w:rPr>
+              <w:t xml:space="preserve"/>
+            </w:r>
+          </w:p>
+        </w:tc>
+        <w:tc>
+          <w:tcPr>
+            <w:tcW w:w="1600" w:type="pct"/>
+            <w:tcMar>
+              <w:top w:w="30" w:type="dxa"/>
+              <w:left w:w="80" w:type="dxa"/>
+              <w:bottom w:w="30" w:type="dxa"/>
+              <w:right w:w="80" w:type="dxa"/>
+            </w:tcMar>
+          </w:tcPr>
+          <w:p>
+            <w:r>
+              <w:rPr>
+                <w:rFonts w:ascii="Aptos" w:eastAsia="Aptos" w:hAnsi="Aptos" w:cs="Aptos"/>
+                <w:sz w:val="20"/>
+                <w:szCs w:val="20"/>
+              </w:rPr>
+              <w:t xml:space="preserve"/>
+            </w:r>
+          </w:p>
+        </w:tc>
+      </w:tr>
+      <w:tr>
+        <w:trPr>
+          <w:cantSplit/>
+        </w:trPr>
+        <w:tc>
+          <w:tcPr>
+            <w:tcW w:w="300" w:type="pct"/>
+            <w:tcMar>
+              <w:top w:w="30" w:type="dxa"/>
+              <w:left w:w="80" w:type="dxa"/>
+              <w:bottom w:w="30" w:type="dxa"/>
+              <w:right w:w="80" w:type="dxa"/>
+            </w:tcMar>
+          </w:tcPr>
+          <w:p>
+            <w:r>
+              <w:rPr>
+                <w:rFonts w:ascii="Aptos" w:eastAsia="Aptos" w:hAnsi="Aptos" w:cs="Aptos"/>
+                <w:sz w:val="20"/>
+                <w:szCs w:val="20"/>
+              </w:rPr>
+              <w:t xml:space="preserve">105</w:t>
+            </w:r>
+          </w:p>
+        </w:tc>
+        <w:tc>
+          <w:tcPr>
+            <w:tcW w:w="2350" w:type="pct"/>
+            <w:tcMar>
+              <w:top w:w="30" w:type="dxa"/>
+              <w:left w:w="80" w:type="dxa"/>
+              <w:bottom w:w="30" w:type="dxa"/>
+              <w:right w:w="80" w:type="dxa"/>
+            </w:tcMar>
+          </w:tcPr>
+          <w:p>
+            <w:r>
+              <w:rPr>
+                <w:rFonts w:ascii="Aptos" w:eastAsia="Aptos" w:hAnsi="Aptos" w:cs="Aptos"/>
+                <w:sz w:val="20"/>
+                <w:szCs w:val="20"/>
+              </w:rPr>
+              <w:t xml:space="preserve"/>
+            </w:r>
+          </w:p>
+        </w:tc>
+        <w:tc>
+          <w:tcPr>
+            <w:tcW w:w="750" w:type="pct"/>
+            <w:tcMar>
+              <w:top w:w="30" w:type="dxa"/>
+              <w:left w:w="80" w:type="dxa"/>
+              <w:bottom w:w="30" w:type="dxa"/>
+              <w:right w:w="80" w:type="dxa"/>
+            </w:tcMar>
+          </w:tcPr>
+          <w:p>
+            <w:r>
+              <w:rPr>
+                <w:rFonts w:ascii="Aptos" w:eastAsia="Aptos" w:hAnsi="Aptos" w:cs="Aptos"/>
+                <w:sz w:val="20"/>
+                <w:szCs w:val="20"/>
+              </w:rPr>
+              <w:t xml:space="preserve"/>
+            </w:r>
+          </w:p>
+        </w:tc>
+        <w:tc>
+          <w:tcPr>
+            <w:tcW w:w="1600" w:type="pct"/>
+            <w:tcMar>
+              <w:top w:w="30" w:type="dxa"/>
+              <w:left w:w="80" w:type="dxa"/>
+              <w:bottom w:w="30" w:type="dxa"/>
+              <w:right w:w="80" w:type="dxa"/>
+            </w:tcMar>
+          </w:tcPr>
+          <w:p>
+            <w:r>
+              <w:rPr>
+                <w:rFonts w:ascii="Aptos" w:eastAsia="Aptos" w:hAnsi="Aptos" w:cs="Aptos"/>
+                <w:sz w:val="20"/>
+                <w:szCs w:val="20"/>
+              </w:rPr>
+              <w:t xml:space="preserve"/>
+            </w:r>
+          </w:p>
+        </w:tc>
+      </w:tr>
+      <w:tr>
+        <w:trPr>
+          <w:cantSplit/>
+        </w:trPr>
+        <w:tc>
+          <w:tcPr>
+            <w:tcW w:w="300" w:type="pct"/>
+            <w:tcMar>
+              <w:top w:w="30" w:type="dxa"/>
+              <w:left w:w="80" w:type="dxa"/>
+              <w:bottom w:w="30" w:type="dxa"/>
+              <w:right w:w="80" w:type="dxa"/>
+            </w:tcMar>
+          </w:tcPr>
+          <w:p>
+            <w:r>
+              <w:rPr>
+                <w:rFonts w:ascii="Aptos" w:eastAsia="Aptos" w:hAnsi="Aptos" w:cs="Aptos"/>
+                <w:sz w:val="20"/>
+                <w:szCs w:val="20"/>
+              </w:rPr>
+              <w:t xml:space="preserve">106</w:t>
+            </w:r>
+          </w:p>
+        </w:tc>
+        <w:tc>
+          <w:tcPr>
+            <w:tcW w:w="2350" w:type="pct"/>
+            <w:tcMar>
+              <w:top w:w="30" w:type="dxa"/>
+              <w:left w:w="80" w:type="dxa"/>
+              <w:bottom w:w="30" w:type="dxa"/>
+              <w:right w:w="80" w:type="dxa"/>
+            </w:tcMar>
+          </w:tcPr>
+          <w:p>
+            <w:r>
+              <w:rPr>
+                <w:rFonts w:ascii="Aptos" w:eastAsia="Aptos" w:hAnsi="Aptos" w:cs="Aptos"/>
+                <w:sz w:val="20"/>
+                <w:szCs w:val="20"/>
+              </w:rPr>
+              <w:t xml:space="preserve"/>
+            </w:r>
+          </w:p>
+        </w:tc>
+        <w:tc>
+          <w:tcPr>
+            <w:tcW w:w="750" w:type="pct"/>
+            <w:tcMar>
+              <w:top w:w="30" w:type="dxa"/>
+              <w:left w:w="80" w:type="dxa"/>
+              <w:bottom w:w="30" w:type="dxa"/>
+              <w:right w:w="80" w:type="dxa"/>
+            </w:tcMar>
+          </w:tcPr>
+          <w:p>
+            <w:r>
+              <w:rPr>
+                <w:rFonts w:ascii="Aptos" w:eastAsia="Aptos" w:hAnsi="Aptos" w:cs="Aptos"/>
+                <w:sz w:val="20"/>
+                <w:szCs w:val="20"/>
+              </w:rPr>
+              <w:t xml:space="preserve"/>
+            </w:r>
+          </w:p>
+        </w:tc>
+        <w:tc>
+          <w:tcPr>
+            <w:tcW w:w="1600" w:type="pct"/>
+            <w:tcMar>
+              <w:top w:w="30" w:type="dxa"/>
+              <w:left w:w="80" w:type="dxa"/>
+              <w:bottom w:w="30" w:type="dxa"/>
+              <w:right w:w="80" w:type="dxa"/>
+            </w:tcMar>
+          </w:tcPr>
+          <w:p>
+            <w:r>
+              <w:rPr>
+                <w:rFonts w:ascii="Aptos" w:eastAsia="Aptos" w:hAnsi="Aptos" w:cs="Aptos"/>
+                <w:sz w:val="20"/>
+                <w:szCs w:val="20"/>
+              </w:rPr>
+              <w:t xml:space="preserve"/>
+            </w:r>
+          </w:p>
+        </w:tc>
+      </w:tr>
+      <w:tr>
+        <w:trPr>
+          <w:cantSplit/>
+        </w:trPr>
+        <w:tc>
+          <w:tcPr>
+            <w:tcW w:w="300" w:type="pct"/>
+            <w:tcMar>
+              <w:top w:w="30" w:type="dxa"/>
+              <w:left w:w="80" w:type="dxa"/>
+              <w:bottom w:w="30" w:type="dxa"/>
+              <w:right w:w="80" w:type="dxa"/>
+            </w:tcMar>
+          </w:tcPr>
+          <w:p>
+            <w:r>
+              <w:rPr>
+                <w:rFonts w:ascii="Aptos" w:eastAsia="Aptos" w:hAnsi="Aptos" w:cs="Aptos"/>
+                <w:sz w:val="20"/>
+                <w:szCs w:val="20"/>
+              </w:rPr>
+              <w:t xml:space="preserve">107</w:t>
+            </w:r>
+          </w:p>
+        </w:tc>
+        <w:tc>
+          <w:tcPr>
+            <w:tcW w:w="2350" w:type="pct"/>
+            <w:tcMar>
+              <w:top w:w="30" w:type="dxa"/>
+              <w:left w:w="80" w:type="dxa"/>
+              <w:bottom w:w="30" w:type="dxa"/>
+              <w:right w:w="80" w:type="dxa"/>
+            </w:tcMar>
+          </w:tcPr>
+          <w:p>
+            <w:r>
+              <w:rPr>
+                <w:rFonts w:ascii="Aptos" w:eastAsia="Aptos" w:hAnsi="Aptos" w:cs="Aptos"/>
+                <w:sz w:val="20"/>
+                <w:szCs w:val="20"/>
+              </w:rPr>
+              <w:t xml:space="preserve"/>
+            </w:r>
+          </w:p>
+        </w:tc>
+        <w:tc>
+          <w:tcPr>
+            <w:tcW w:w="750" w:type="pct"/>
+            <w:tcMar>
+              <w:top w:w="30" w:type="dxa"/>
+              <w:left w:w="80" w:type="dxa"/>
+              <w:bottom w:w="30" w:type="dxa"/>
+              <w:right w:w="80" w:type="dxa"/>
+            </w:tcMar>
+          </w:tcPr>
+          <w:p>
+            <w:r>
+              <w:rPr>
+                <w:rFonts w:ascii="Aptos" w:eastAsia="Aptos" w:hAnsi="Aptos" w:cs="Aptos"/>
+                <w:sz w:val="20"/>
+                <w:szCs w:val="20"/>
+              </w:rPr>
+              <w:t xml:space="preserve"/>
+            </w:r>
+          </w:p>
+        </w:tc>
+        <w:tc>
+          <w:tcPr>
+            <w:tcW w:w="1600" w:type="pct"/>
+            <w:tcMar>
+              <w:top w:w="30" w:type="dxa"/>
+              <w:left w:w="80" w:type="dxa"/>
+              <w:bottom w:w="30" w:type="dxa"/>
+              <w:right w:w="80" w:type="dxa"/>
+            </w:tcMar>
+          </w:tcPr>
+          <w:p>
+            <w:r>
+              <w:rPr>
+                <w:rFonts w:ascii="Aptos" w:eastAsia="Aptos" w:hAnsi="Aptos" w:cs="Aptos"/>
+                <w:sz w:val="20"/>
+                <w:szCs w:val="20"/>
+              </w:rPr>
+              <w:t xml:space="preserve"/>
+            </w:r>
+          </w:p>
+        </w:tc>
+      </w:tr>
+      <w:tr>
+        <w:trPr>
+          <w:cantSplit/>
+        </w:trPr>
+        <w:tc>
+          <w:tcPr>
+            <w:tcW w:w="300" w:type="pct"/>
+            <w:tcMar>
+              <w:top w:w="30" w:type="dxa"/>
+              <w:left w:w="80" w:type="dxa"/>
+              <w:bottom w:w="30" w:type="dxa"/>
+              <w:right w:w="80" w:type="dxa"/>
+            </w:tcMar>
+          </w:tcPr>
+          <w:p>
+            <w:r>
+              <w:rPr>
+                <w:rFonts w:ascii="Aptos" w:eastAsia="Aptos" w:hAnsi="Aptos" w:cs="Aptos"/>
+                <w:sz w:val="20"/>
+                <w:szCs w:val="20"/>
+              </w:rPr>
+              <w:t xml:space="preserve">108</w:t>
+            </w:r>
+          </w:p>
+        </w:tc>
+        <w:tc>
+          <w:tcPr>
+            <w:tcW w:w="2350" w:type="pct"/>
+            <w:tcMar>
+              <w:top w:w="30" w:type="dxa"/>
+              <w:left w:w="80" w:type="dxa"/>
+              <w:bottom w:w="30" w:type="dxa"/>
+              <w:right w:w="80" w:type="dxa"/>
+            </w:tcMar>
+          </w:tcPr>
+          <w:p>
+            <w:r>
+              <w:rPr>
+                <w:rFonts w:ascii="Aptos" w:eastAsia="Aptos" w:hAnsi="Aptos" w:cs="Aptos"/>
+                <w:sz w:val="20"/>
+                <w:szCs w:val="20"/>
+              </w:rPr>
+              <w:t xml:space="preserve"/>
+            </w:r>
+          </w:p>
+        </w:tc>
+        <w:tc>
+          <w:tcPr>
+            <w:tcW w:w="750" w:type="pct"/>
+            <w:tcMar>
+              <w:top w:w="30" w:type="dxa"/>
+              <w:left w:w="80" w:type="dxa"/>
+              <w:bottom w:w="30" w:type="dxa"/>
+              <w:right w:w="80" w:type="dxa"/>
+            </w:tcMar>
+          </w:tcPr>
+          <w:p>
+            <w:r>
+              <w:rPr>
+                <w:rFonts w:ascii="Aptos" w:eastAsia="Aptos" w:hAnsi="Aptos" w:cs="Aptos"/>
+                <w:sz w:val="20"/>
+                <w:szCs w:val="20"/>
+              </w:rPr>
+              <w:t xml:space="preserve"/>
+            </w:r>
+          </w:p>
+        </w:tc>
+        <w:tc>
+          <w:tcPr>
+            <w:tcW w:w="1600" w:type="pct"/>
+            <w:tcMar>
+              <w:top w:w="30" w:type="dxa"/>
+              <w:left w:w="80" w:type="dxa"/>
+              <w:bottom w:w="30" w:type="dxa"/>
+              <w:right w:w="80" w:type="dxa"/>
+            </w:tcMar>
+          </w:tcPr>
+          <w:p>
+            <w:r>
+              <w:rPr>
+                <w:rFonts w:ascii="Aptos" w:eastAsia="Aptos" w:hAnsi="Aptos" w:cs="Aptos"/>
+                <w:sz w:val="20"/>
+                <w:szCs w:val="20"/>
+              </w:rPr>
+              <w:t xml:space="preserve"/>
+            </w:r>
+          </w:p>
+        </w:tc>
+      </w:tr>
+      <w:tr>
+        <w:trPr>
+          <w:cantSplit/>
+        </w:trPr>
+        <w:tc>
+          <w:tcPr>
+            <w:tcW w:w="300" w:type="pct"/>
+            <w:tcMar>
+              <w:top w:w="30" w:type="dxa"/>
+              <w:left w:w="80" w:type="dxa"/>
+              <w:bottom w:w="30" w:type="dxa"/>
+              <w:right w:w="80" w:type="dxa"/>
+            </w:tcMar>
+          </w:tcPr>
+          <w:p>
+            <w:r>
+              <w:rPr>
+                <w:rFonts w:ascii="Aptos" w:eastAsia="Aptos" w:hAnsi="Aptos" w:cs="Aptos"/>
+                <w:sz w:val="20"/>
+                <w:szCs w:val="20"/>
+              </w:rPr>
+              <w:t xml:space="preserve">109</w:t>
+            </w:r>
+          </w:p>
+        </w:tc>
+        <w:tc>
+          <w:tcPr>
+            <w:tcW w:w="2350" w:type="pct"/>
+            <w:tcMar>
+              <w:top w:w="30" w:type="dxa"/>
+              <w:left w:w="80" w:type="dxa"/>
+              <w:bottom w:w="30" w:type="dxa"/>
+              <w:right w:w="80" w:type="dxa"/>
+            </w:tcMar>
+          </w:tcPr>
+          <w:p>
+            <w:r>
+              <w:rPr>
+                <w:rFonts w:ascii="Aptos" w:eastAsia="Aptos" w:hAnsi="Aptos" w:cs="Aptos"/>
+                <w:sz w:val="20"/>
+                <w:szCs w:val="20"/>
+              </w:rPr>
+              <w:t xml:space="preserve"/>
+            </w:r>
+          </w:p>
+        </w:tc>
+        <w:tc>
+          <w:tcPr>
+            <w:tcW w:w="750" w:type="pct"/>
+            <w:tcMar>
+              <w:top w:w="30" w:type="dxa"/>
+              <w:left w:w="80" w:type="dxa"/>
+              <w:bottom w:w="30" w:type="dxa"/>
+              <w:right w:w="80" w:type="dxa"/>
+            </w:tcMar>
+          </w:tcPr>
+          <w:p>
+            <w:r>
+              <w:rPr>
+                <w:rFonts w:ascii="Aptos" w:eastAsia="Aptos" w:hAnsi="Aptos" w:cs="Aptos"/>
+                <w:sz w:val="20"/>
+                <w:szCs w:val="20"/>
+              </w:rPr>
+              <w:t xml:space="preserve"/>
+            </w:r>
+          </w:p>
+        </w:tc>
+        <w:tc>
+          <w:tcPr>
+            <w:tcW w:w="1600" w:type="pct"/>
+            <w:tcMar>
+              <w:top w:w="30" w:type="dxa"/>
+              <w:left w:w="80" w:type="dxa"/>
+              <w:bottom w:w="30" w:type="dxa"/>
+              <w:right w:w="80" w:type="dxa"/>
+            </w:tcMar>
+          </w:tcPr>
+          <w:p>
+            <w:r>
+              <w:rPr>
+                <w:rFonts w:ascii="Aptos" w:eastAsia="Aptos" w:hAnsi="Aptos" w:cs="Aptos"/>
+                <w:sz w:val="20"/>
+                <w:szCs w:val="20"/>
+              </w:rPr>
+              <w:t xml:space="preserve"/>
+            </w:r>
+          </w:p>
+        </w:tc>
+      </w:tr>
+      <w:tr>
+        <w:trPr>
+          <w:cantSplit/>
+        </w:trPr>
+        <w:tc>
+          <w:tcPr>
+            <w:tcW w:w="300" w:type="pct"/>
+            <w:tcMar>
+              <w:top w:w="30" w:type="dxa"/>
+              <w:left w:w="80" w:type="dxa"/>
+              <w:bottom w:w="30" w:type="dxa"/>
+              <w:right w:w="80" w:type="dxa"/>
+            </w:tcMar>
+          </w:tcPr>
+          <w:p>
+            <w:r>
+              <w:rPr>
+                <w:rFonts w:ascii="Aptos" w:eastAsia="Aptos" w:hAnsi="Aptos" w:cs="Aptos"/>
+                <w:sz w:val="20"/>
+                <w:szCs w:val="20"/>
+              </w:rPr>
+              <w:t xml:space="preserve">110</w:t>
+            </w:r>
+          </w:p>
+        </w:tc>
+        <w:tc>
+          <w:tcPr>
+            <w:tcW w:w="2350" w:type="pct"/>
+            <w:tcMar>
+              <w:top w:w="30" w:type="dxa"/>
+              <w:left w:w="80" w:type="dxa"/>
+              <w:bottom w:w="30" w:type="dxa"/>
+              <w:right w:w="80" w:type="dxa"/>
+            </w:tcMar>
+          </w:tcPr>
+          <w:p>
+            <w:r>
+              <w:rPr>
+                <w:rFonts w:ascii="Aptos" w:eastAsia="Aptos" w:hAnsi="Aptos" w:cs="Aptos"/>
+                <w:sz w:val="20"/>
+                <w:szCs w:val="20"/>
+              </w:rPr>
+              <w:t xml:space="preserve"/>
+            </w:r>
+          </w:p>
+        </w:tc>
+        <w:tc>
+          <w:tcPr>
+            <w:tcW w:w="750" w:type="pct"/>
+            <w:tcMar>
+              <w:top w:w="30" w:type="dxa"/>
+              <w:left w:w="80" w:type="dxa"/>
+              <w:bottom w:w="30" w:type="dxa"/>
+              <w:right w:w="80" w:type="dxa"/>
+            </w:tcMar>
+          </w:tcPr>
+          <w:p>
+            <w:r>
+              <w:rPr>
+                <w:rFonts w:ascii="Aptos" w:eastAsia="Aptos" w:hAnsi="Aptos" w:cs="Aptos"/>
+                <w:sz w:val="20"/>
+                <w:szCs w:val="20"/>
+              </w:rPr>
+              <w:t xml:space="preserve"/>
+            </w:r>
+          </w:p>
+        </w:tc>
+        <w:tc>
+          <w:tcPr>
+            <w:tcW w:w="1600" w:type="pct"/>
+            <w:tcMar>
+              <w:top w:w="30" w:type="dxa"/>
+              <w:left w:w="80" w:type="dxa"/>
+              <w:bottom w:w="30" w:type="dxa"/>
+              <w:right w:w="80" w:type="dxa"/>
+            </w:tcMar>
+          </w:tcPr>
+          <w:p>
+            <w:r>
+              <w:rPr>
+                <w:rFonts w:ascii="Aptos" w:eastAsia="Aptos" w:hAnsi="Aptos" w:cs="Aptos"/>
+                <w:sz w:val="20"/>
+                <w:szCs w:val="20"/>
+              </w:rPr>
+              <w:t xml:space="preserve"/>
+            </w:r>
+          </w:p>
+        </w:tc>
+      </w:tr>
+      <w:tr>
+        <w:trPr>
+          <w:cantSplit/>
+        </w:trPr>
+        <w:tc>
+          <w:tcPr>
+            <w:tcW w:w="300" w:type="pct"/>
+            <w:tcMar>
+              <w:top w:w="30" w:type="dxa"/>
+              <w:left w:w="80" w:type="dxa"/>
+              <w:bottom w:w="30" w:type="dxa"/>
+              <w:right w:w="80" w:type="dxa"/>
+            </w:tcMar>
+          </w:tcPr>
+          <w:p>
+            <w:r>
+              <w:rPr>
+                <w:rFonts w:ascii="Aptos" w:eastAsia="Aptos" w:hAnsi="Aptos" w:cs="Aptos"/>
+                <w:sz w:val="20"/>
+                <w:szCs w:val="20"/>
+              </w:rPr>
+              <w:t xml:space="preserve">111</w:t>
+            </w:r>
+          </w:p>
+        </w:tc>
+        <w:tc>
+          <w:tcPr>
+            <w:tcW w:w="2350" w:type="pct"/>
+            <w:tcMar>
+              <w:top w:w="30" w:type="dxa"/>
+              <w:left w:w="80" w:type="dxa"/>
+              <w:bottom w:w="30" w:type="dxa"/>
+              <w:right w:w="80" w:type="dxa"/>
+            </w:tcMar>
+          </w:tcPr>
+          <w:p>
+            <w:r>
+              <w:rPr>
+                <w:rFonts w:ascii="Aptos" w:eastAsia="Aptos" w:hAnsi="Aptos" w:cs="Aptos"/>
+                <w:sz w:val="20"/>
+                <w:szCs w:val="20"/>
+              </w:rPr>
+              <w:t xml:space="preserve"/>
+            </w:r>
+          </w:p>
+        </w:tc>
+        <w:tc>
+          <w:tcPr>
+            <w:tcW w:w="750" w:type="pct"/>
+            <w:tcMar>
+              <w:top w:w="30" w:type="dxa"/>
+              <w:left w:w="80" w:type="dxa"/>
+              <w:bottom w:w="30" w:type="dxa"/>
+              <w:right w:w="80" w:type="dxa"/>
+            </w:tcMar>
+          </w:tcPr>
+          <w:p>
+            <w:r>
+              <w:rPr>
+                <w:rFonts w:ascii="Aptos" w:eastAsia="Aptos" w:hAnsi="Aptos" w:cs="Aptos"/>
+                <w:sz w:val="20"/>
+                <w:szCs w:val="20"/>
+              </w:rPr>
+              <w:t xml:space="preserve"/>
+            </w:r>
+          </w:p>
+        </w:tc>
+        <w:tc>
+          <w:tcPr>
+            <w:tcW w:w="1600" w:type="pct"/>
+            <w:tcMar>
+              <w:top w:w="30" w:type="dxa"/>
+              <w:left w:w="80" w:type="dxa"/>
+              <w:bottom w:w="30" w:type="dxa"/>
+              <w:right w:w="80" w:type="dxa"/>
+            </w:tcMar>
+          </w:tcPr>
+          <w:p>
+            <w:r>
+              <w:rPr>
+                <w:rFonts w:ascii="Aptos" w:eastAsia="Aptos" w:hAnsi="Aptos" w:cs="Aptos"/>
+                <w:sz w:val="20"/>
+                <w:szCs w:val="20"/>
+              </w:rPr>
+              <w:t xml:space="preserve"/>
+            </w:r>
+          </w:p>
+        </w:tc>
+      </w:tr>
+      <w:tr>
+        <w:trPr>
+          <w:cantSplit/>
+        </w:trPr>
+        <w:tc>
+          <w:tcPr>
+            <w:tcW w:w="300" w:type="pct"/>
+            <w:tcMar>
+              <w:top w:w="30" w:type="dxa"/>
+              <w:left w:w="80" w:type="dxa"/>
+              <w:bottom w:w="30" w:type="dxa"/>
+              <w:right w:w="80" w:type="dxa"/>
+            </w:tcMar>
+          </w:tcPr>
+          <w:p>
+            <w:r>
+              <w:rPr>
+                <w:rFonts w:ascii="Aptos" w:eastAsia="Aptos" w:hAnsi="Aptos" w:cs="Aptos"/>
+                <w:sz w:val="20"/>
+                <w:szCs w:val="20"/>
+              </w:rPr>
+              <w:t xml:space="preserve">112</w:t>
+            </w:r>
+          </w:p>
+        </w:tc>
+        <w:tc>
+          <w:tcPr>
+            <w:tcW w:w="2350" w:type="pct"/>
+            <w:tcMar>
+              <w:top w:w="30" w:type="dxa"/>
+              <w:left w:w="80" w:type="dxa"/>
+              <w:bottom w:w="30" w:type="dxa"/>
+              <w:right w:w="80" w:type="dxa"/>
+            </w:tcMar>
+          </w:tcPr>
+          <w:p>
+            <w:r>
+              <w:rPr>
+                <w:rFonts w:ascii="Aptos" w:eastAsia="Aptos" w:hAnsi="Aptos" w:cs="Aptos"/>
+                <w:sz w:val="20"/>
+                <w:szCs w:val="20"/>
+              </w:rPr>
+              <w:t xml:space="preserve"/>
+            </w:r>
+          </w:p>
+        </w:tc>
+        <w:tc>
+          <w:tcPr>
+            <w:tcW w:w="750" w:type="pct"/>
+            <w:tcMar>
+              <w:top w:w="30" w:type="dxa"/>
+              <w:left w:w="80" w:type="dxa"/>
+              <w:bottom w:w="30" w:type="dxa"/>
+              <w:right w:w="80" w:type="dxa"/>
+            </w:tcMar>
+          </w:tcPr>
+          <w:p>
+            <w:r>
+              <w:rPr>
+                <w:rFonts w:ascii="Aptos" w:eastAsia="Aptos" w:hAnsi="Aptos" w:cs="Aptos"/>
+                <w:sz w:val="20"/>
+                <w:szCs w:val="20"/>
+              </w:rPr>
+              <w:t xml:space="preserve"/>
+            </w:r>
+          </w:p>
+        </w:tc>
+        <w:tc>
+          <w:tcPr>
+            <w:tcW w:w="1600" w:type="pct"/>
+            <w:tcMar>
+              <w:top w:w="30" w:type="dxa"/>
+              <w:left w:w="80" w:type="dxa"/>
+              <w:bottom w:w="30" w:type="dxa"/>
+              <w:right w:w="80" w:type="dxa"/>
+            </w:tcMar>
+          </w:tcPr>
+          <w:p>
+            <w:r>
+              <w:rPr>
+                <w:rFonts w:ascii="Aptos" w:eastAsia="Aptos" w:hAnsi="Aptos" w:cs="Aptos"/>
+                <w:sz w:val="20"/>
+                <w:szCs w:val="20"/>
+              </w:rPr>
+              <w:t xml:space="preserve"/>
+            </w:r>
+          </w:p>
+        </w:tc>
+      </w:tr>
+      <w:tr>
+        <w:trPr>
+          <w:cantSplit/>
+        </w:trPr>
+        <w:tc>
+          <w:tcPr>
+            <w:tcW w:w="300" w:type="pct"/>
+            <w:tcMar>
+              <w:top w:w="30" w:type="dxa"/>
+              <w:left w:w="80" w:type="dxa"/>
+              <w:bottom w:w="30" w:type="dxa"/>
+              <w:right w:w="80" w:type="dxa"/>
+            </w:tcMar>
+          </w:tcPr>
+          <w:p>
+            <w:r>
+              <w:rPr>
+                <w:rFonts w:ascii="Aptos" w:eastAsia="Aptos" w:hAnsi="Aptos" w:cs="Aptos"/>
+                <w:sz w:val="20"/>
+                <w:szCs w:val="20"/>
+              </w:rPr>
+              <w:t xml:space="preserve">113</w:t>
+            </w:r>
+          </w:p>
+        </w:tc>
+        <w:tc>
+          <w:tcPr>
+            <w:tcW w:w="2350" w:type="pct"/>
+            <w:tcMar>
+              <w:top w:w="30" w:type="dxa"/>
+              <w:left w:w="80" w:type="dxa"/>
+              <w:bottom w:w="30" w:type="dxa"/>
+              <w:right w:w="80" w:type="dxa"/>
+            </w:tcMar>
+          </w:tcPr>
+          <w:p>
+            <w:r>
+              <w:rPr>
+                <w:rFonts w:ascii="Aptos" w:eastAsia="Aptos" w:hAnsi="Aptos" w:cs="Aptos"/>
+                <w:sz w:val="20"/>
+                <w:szCs w:val="20"/>
+              </w:rPr>
+              <w:t xml:space="preserve"/>
+            </w:r>
+          </w:p>
+        </w:tc>
+        <w:tc>
+          <w:tcPr>
+            <w:tcW w:w="750" w:type="pct"/>
+            <w:tcMar>
+              <w:top w:w="30" w:type="dxa"/>
+              <w:left w:w="80" w:type="dxa"/>
+              <w:bottom w:w="30" w:type="dxa"/>
+              <w:right w:w="80" w:type="dxa"/>
+            </w:tcMar>
+          </w:tcPr>
+          <w:p>
+            <w:r>
+              <w:rPr>
+                <w:rFonts w:ascii="Aptos" w:eastAsia="Aptos" w:hAnsi="Aptos" w:cs="Aptos"/>
+                <w:sz w:val="20"/>
+                <w:szCs w:val="20"/>
+              </w:rPr>
+              <w:t xml:space="preserve"/>
+            </w:r>
+          </w:p>
+        </w:tc>
+        <w:tc>
+          <w:tcPr>
+            <w:tcW w:w="1600" w:type="pct"/>
+            <w:tcMar>
+              <w:top w:w="30" w:type="dxa"/>
+              <w:left w:w="80" w:type="dxa"/>
+              <w:bottom w:w="30" w:type="dxa"/>
+              <w:right w:w="80" w:type="dxa"/>
+            </w:tcMar>
+          </w:tcPr>
+          <w:p>
+            <w:r>
+              <w:rPr>
+                <w:rFonts w:ascii="Aptos" w:eastAsia="Aptos" w:hAnsi="Aptos" w:cs="Aptos"/>
+                <w:sz w:val="20"/>
+                <w:szCs w:val="20"/>
+              </w:rPr>
+              <w:t xml:space="preserve"/>
+            </w:r>
+          </w:p>
+        </w:tc>
+      </w:tr>
+      <w:tr>
+        <w:trPr>
+          <w:cantSplit/>
+        </w:trPr>
+        <w:tc>
+          <w:tcPr>
+            <w:tcW w:w="300" w:type="pct"/>
+            <w:tcMar>
+              <w:top w:w="30" w:type="dxa"/>
+              <w:left w:w="80" w:type="dxa"/>
+              <w:bottom w:w="30" w:type="dxa"/>
+              <w:right w:w="80" w:type="dxa"/>
+            </w:tcMar>
+          </w:tcPr>
+          <w:p>
+            <w:r>
+              <w:rPr>
+                <w:rFonts w:ascii="Aptos" w:eastAsia="Aptos" w:hAnsi="Aptos" w:cs="Aptos"/>
+                <w:sz w:val="20"/>
+                <w:szCs w:val="20"/>
+              </w:rPr>
+              <w:t xml:space="preserve">114</w:t>
+            </w:r>
+          </w:p>
+        </w:tc>
+        <w:tc>
+          <w:tcPr>
+            <w:tcW w:w="2350" w:type="pct"/>
+            <w:tcMar>
+              <w:top w:w="30" w:type="dxa"/>
+              <w:left w:w="80" w:type="dxa"/>
+              <w:bottom w:w="30" w:type="dxa"/>
+              <w:right w:w="80" w:type="dxa"/>
+            </w:tcMar>
+          </w:tcPr>
+          <w:p>
+            <w:r>
+              <w:rPr>
+                <w:rFonts w:ascii="Aptos" w:eastAsia="Aptos" w:hAnsi="Aptos" w:cs="Aptos"/>
+                <w:sz w:val="20"/>
+                <w:szCs w:val="20"/>
+              </w:rPr>
+              <w:t xml:space="preserve"/>
+            </w:r>
+          </w:p>
+        </w:tc>
+        <w:tc>
+          <w:tcPr>
+            <w:tcW w:w="750" w:type="pct"/>
+            <w:tcMar>
+              <w:top w:w="30" w:type="dxa"/>
+              <w:left w:w="80" w:type="dxa"/>
+              <w:bottom w:w="30" w:type="dxa"/>
+              <w:right w:w="80" w:type="dxa"/>
+            </w:tcMar>
+          </w:tcPr>
+          <w:p>
+            <w:r>
+              <w:rPr>
+                <w:rFonts w:ascii="Aptos" w:eastAsia="Aptos" w:hAnsi="Aptos" w:cs="Aptos"/>
+                <w:sz w:val="20"/>
+                <w:szCs w:val="20"/>
+              </w:rPr>
+              <w:t xml:space="preserve"/>
+            </w:r>
+          </w:p>
+        </w:tc>
+        <w:tc>
+          <w:tcPr>
+            <w:tcW w:w="1600" w:type="pct"/>
+            <w:tcMar>
+              <w:top w:w="30" w:type="dxa"/>
+              <w:left w:w="80" w:type="dxa"/>
+              <w:bottom w:w="30" w:type="dxa"/>
+              <w:right w:w="80" w:type="dxa"/>
+            </w:tcMar>
+          </w:tcPr>
+          <w:p>
+            <w:r>
+              <w:rPr>
+                <w:rFonts w:ascii="Aptos" w:eastAsia="Aptos" w:hAnsi="Aptos" w:cs="Aptos"/>
+                <w:sz w:val="20"/>
+                <w:szCs w:val="20"/>
+              </w:rPr>
+              <w:t xml:space="preserve"/>
+            </w:r>
+          </w:p>
+        </w:tc>
+      </w:tr>
+      <w:tr>
+        <w:trPr>
+          <w:cantSplit/>
+        </w:trPr>
+        <w:tc>
+          <w:tcPr>
+            <w:tcW w:w="300" w:type="pct"/>
+            <w:tcMar>
+              <w:top w:w="30" w:type="dxa"/>
+              <w:left w:w="80" w:type="dxa"/>
+              <w:bottom w:w="30" w:type="dxa"/>
+              <w:right w:w="80" w:type="dxa"/>
+            </w:tcMar>
+          </w:tcPr>
+          <w:p>
+            <w:r>
+              <w:rPr>
+                <w:rFonts w:ascii="Aptos" w:eastAsia="Aptos" w:hAnsi="Aptos" w:cs="Aptos"/>
+                <w:sz w:val="20"/>
+                <w:szCs w:val="20"/>
+              </w:rPr>
+              <w:t xml:space="preserve">115</w:t>
+            </w:r>
+          </w:p>
+        </w:tc>
+        <w:tc>
+          <w:tcPr>
+            <w:tcW w:w="2350" w:type="pct"/>
+            <w:tcMar>
+              <w:top w:w="30" w:type="dxa"/>
+              <w:left w:w="80" w:type="dxa"/>
+              <w:bottom w:w="30" w:type="dxa"/>
+              <w:right w:w="80" w:type="dxa"/>
+            </w:tcMar>
+          </w:tcPr>
+          <w:p>
+            <w:r>
+              <w:rPr>
+                <w:rFonts w:ascii="Aptos" w:eastAsia="Aptos" w:hAnsi="Aptos" w:cs="Aptos"/>
+                <w:sz w:val="20"/>
+                <w:szCs w:val="20"/>
+              </w:rPr>
+              <w:t xml:space="preserve"/>
+            </w:r>
+          </w:p>
+        </w:tc>
+        <w:tc>
+          <w:tcPr>
+            <w:tcW w:w="750" w:type="pct"/>
+            <w:tcMar>
+              <w:top w:w="30" w:type="dxa"/>
+              <w:left w:w="80" w:type="dxa"/>
+              <w:bottom w:w="30" w:type="dxa"/>
+              <w:right w:w="80" w:type="dxa"/>
+            </w:tcMar>
+          </w:tcPr>
+          <w:p>
+            <w:r>
+              <w:rPr>
+                <w:rFonts w:ascii="Aptos" w:eastAsia="Aptos" w:hAnsi="Aptos" w:cs="Aptos"/>
+                <w:sz w:val="20"/>
+                <w:szCs w:val="20"/>
+              </w:rPr>
+              <w:t xml:space="preserve"/>
+            </w:r>
+          </w:p>
+        </w:tc>
+        <w:tc>
+          <w:tcPr>
+            <w:tcW w:w="1600" w:type="pct"/>
+            <w:tcMar>
+              <w:top w:w="30" w:type="dxa"/>
+              <w:left w:w="80" w:type="dxa"/>
+              <w:bottom w:w="30" w:type="dxa"/>
+              <w:right w:w="80" w:type="dxa"/>
+            </w:tcMar>
+          </w:tcPr>
+          <w:p>
+            <w:r>
+              <w:rPr>
+                <w:rFonts w:ascii="Aptos" w:eastAsia="Aptos" w:hAnsi="Aptos" w:cs="Aptos"/>
+                <w:sz w:val="20"/>
+                <w:szCs w:val="20"/>
+              </w:rPr>
+              <w:t xml:space="preserve"/>
+            </w:r>
+          </w:p>
+        </w:tc>
+      </w:tr>
+      <w:tr>
+        <w:trPr>
+          <w:cantSplit/>
+        </w:trPr>
+        <w:tc>
+          <w:tcPr>
+            <w:tcW w:w="300" w:type="pct"/>
+            <w:tcMar>
+              <w:top w:w="30" w:type="dxa"/>
+              <w:left w:w="80" w:type="dxa"/>
+              <w:bottom w:w="30" w:type="dxa"/>
+              <w:right w:w="80" w:type="dxa"/>
+            </w:tcMar>
+          </w:tcPr>
+          <w:p>
+            <w:r>
+              <w:rPr>
+                <w:rFonts w:ascii="Aptos" w:eastAsia="Aptos" w:hAnsi="Aptos" w:cs="Aptos"/>
+                <w:sz w:val="20"/>
+                <w:szCs w:val="20"/>
+              </w:rPr>
+              <w:t xml:space="preserve">116</w:t>
+            </w:r>
+          </w:p>
+        </w:tc>
+        <w:tc>
+          <w:tcPr>
+            <w:tcW w:w="2350" w:type="pct"/>
+            <w:tcMar>
+              <w:top w:w="30" w:type="dxa"/>
+              <w:left w:w="80" w:type="dxa"/>
+              <w:bottom w:w="30" w:type="dxa"/>
+              <w:right w:w="80" w:type="dxa"/>
+            </w:tcMar>
+          </w:tcPr>
+          <w:p>
+            <w:r>
+              <w:rPr>
+                <w:rFonts w:ascii="Aptos" w:eastAsia="Aptos" w:hAnsi="Aptos" w:cs="Aptos"/>
+                <w:sz w:val="20"/>
+                <w:szCs w:val="20"/>
+              </w:rPr>
+              <w:t xml:space="preserve"/>
+            </w:r>
+          </w:p>
+        </w:tc>
+        <w:tc>
+          <w:tcPr>
+            <w:tcW w:w="750" w:type="pct"/>
+            <w:tcMar>
+              <w:top w:w="30" w:type="dxa"/>
+              <w:left w:w="80" w:type="dxa"/>
+              <w:bottom w:w="30" w:type="dxa"/>
+              <w:right w:w="80" w:type="dxa"/>
+            </w:tcMar>
+          </w:tcPr>
+          <w:p>
+            <w:r>
+              <w:rPr>
+                <w:rFonts w:ascii="Aptos" w:eastAsia="Aptos" w:hAnsi="Aptos" w:cs="Aptos"/>
+                <w:sz w:val="20"/>
+                <w:szCs w:val="20"/>
+              </w:rPr>
+              <w:t xml:space="preserve"/>
+            </w:r>
+          </w:p>
+        </w:tc>
+        <w:tc>
+          <w:tcPr>
+            <w:tcW w:w="1600" w:type="pct"/>
+            <w:tcMar>
+              <w:top w:w="30" w:type="dxa"/>
+              <w:left w:w="80" w:type="dxa"/>
+              <w:bottom w:w="30" w:type="dxa"/>
+              <w:right w:w="80" w:type="dxa"/>
+            </w:tcMar>
+          </w:tcPr>
+          <w:p>
+            <w:r>
+              <w:rPr>
+                <w:rFonts w:ascii="Aptos" w:eastAsia="Aptos" w:hAnsi="Aptos" w:cs="Aptos"/>
+                <w:sz w:val="20"/>
+                <w:szCs w:val="20"/>
+              </w:rPr>
+              <w:t xml:space="preserve"/>
+            </w:r>
+          </w:p>
+        </w:tc>
+      </w:tr>
+      <w:tr>
+        <w:trPr>
+          <w:cantSplit/>
+        </w:trPr>
+        <w:tc>
+          <w:tcPr>
+            <w:tcW w:w="300" w:type="pct"/>
+            <w:tcMar>
+              <w:top w:w="30" w:type="dxa"/>
+              <w:left w:w="80" w:type="dxa"/>
+              <w:bottom w:w="30" w:type="dxa"/>
+              <w:right w:w="80" w:type="dxa"/>
+            </w:tcMar>
+          </w:tcPr>
+          <w:p>
+            <w:r>
+              <w:rPr>
+                <w:rFonts w:ascii="Aptos" w:eastAsia="Aptos" w:hAnsi="Aptos" w:cs="Aptos"/>
+                <w:sz w:val="20"/>
+                <w:szCs w:val="20"/>
+              </w:rPr>
+              <w:t xml:space="preserve">117</w:t>
+            </w:r>
+          </w:p>
+        </w:tc>
+        <w:tc>
+          <w:tcPr>
+            <w:tcW w:w="2350" w:type="pct"/>
+            <w:tcMar>
+              <w:top w:w="30" w:type="dxa"/>
+              <w:left w:w="80" w:type="dxa"/>
+              <w:bottom w:w="30" w:type="dxa"/>
+              <w:right w:w="80" w:type="dxa"/>
+            </w:tcMar>
+          </w:tcPr>
+          <w:p>
+            <w:r>
+              <w:rPr>
+                <w:rFonts w:ascii="Aptos" w:eastAsia="Aptos" w:hAnsi="Aptos" w:cs="Aptos"/>
+                <w:sz w:val="20"/>
+                <w:szCs w:val="20"/>
+              </w:rPr>
+              <w:t xml:space="preserve"/>
+            </w:r>
+          </w:p>
+        </w:tc>
+        <w:tc>
+          <w:tcPr>
+            <w:tcW w:w="750" w:type="pct"/>
+            <w:tcMar>
+              <w:top w:w="30" w:type="dxa"/>
+              <w:left w:w="80" w:type="dxa"/>
+              <w:bottom w:w="30" w:type="dxa"/>
+              <w:right w:w="80" w:type="dxa"/>
+            </w:tcMar>
+          </w:tcPr>
+          <w:p>
+            <w:r>
+              <w:rPr>
+                <w:rFonts w:ascii="Aptos" w:eastAsia="Aptos" w:hAnsi="Aptos" w:cs="Aptos"/>
+                <w:sz w:val="20"/>
+                <w:szCs w:val="20"/>
+              </w:rPr>
+              <w:t xml:space="preserve"/>
+            </w:r>
+          </w:p>
+        </w:tc>
+        <w:tc>
+          <w:tcPr>
+            <w:tcW w:w="1600" w:type="pct"/>
+            <w:tcMar>
+              <w:top w:w="30" w:type="dxa"/>
+              <w:left w:w="80" w:type="dxa"/>
+              <w:bottom w:w="30" w:type="dxa"/>
+              <w:right w:w="80" w:type="dxa"/>
+            </w:tcMar>
+          </w:tcPr>
+          <w:p>
+            <w:r>
+              <w:rPr>
+                <w:rFonts w:ascii="Aptos" w:eastAsia="Aptos" w:hAnsi="Aptos" w:cs="Aptos"/>
+                <w:sz w:val="20"/>
+                <w:szCs w:val="20"/>
+              </w:rPr>
+              <w:t xml:space="preserve"/>
+            </w:r>
+          </w:p>
+        </w:tc>
+      </w:tr>
+      <w:tr>
+        <w:trPr>
+          <w:cantSplit/>
+        </w:trPr>
+        <w:tc>
+          <w:tcPr>
+            <w:tcW w:w="300" w:type="pct"/>
+            <w:tcMar>
+              <w:top w:w="30" w:type="dxa"/>
+              <w:left w:w="80" w:type="dxa"/>
+              <w:bottom w:w="30" w:type="dxa"/>
+              <w:right w:w="80" w:type="dxa"/>
+            </w:tcMar>
+          </w:tcPr>
+          <w:p>
+            <w:r>
+              <w:rPr>
+                <w:rFonts w:ascii="Aptos" w:eastAsia="Aptos" w:hAnsi="Aptos" w:cs="Aptos"/>
+                <w:sz w:val="20"/>
+                <w:szCs w:val="20"/>
+              </w:rPr>
+              <w:t xml:space="preserve">118</w:t>
+            </w:r>
+          </w:p>
+        </w:tc>
+        <w:tc>
+          <w:tcPr>
+            <w:tcW w:w="2350" w:type="pct"/>
+            <w:tcMar>
+              <w:top w:w="30" w:type="dxa"/>
+              <w:left w:w="80" w:type="dxa"/>
+              <w:bottom w:w="30" w:type="dxa"/>
+              <w:right w:w="80" w:type="dxa"/>
+            </w:tcMar>
+          </w:tcPr>
+          <w:p>
+            <w:r>
+              <w:rPr>
+                <w:rFonts w:ascii="Aptos" w:eastAsia="Aptos" w:hAnsi="Aptos" w:cs="Aptos"/>
+                <w:sz w:val="20"/>
+                <w:szCs w:val="20"/>
+              </w:rPr>
+              <w:t xml:space="preserve"/>
+            </w:r>
+          </w:p>
+        </w:tc>
+        <w:tc>
+          <w:tcPr>
+            <w:tcW w:w="750" w:type="pct"/>
+            <w:tcMar>
+              <w:top w:w="30" w:type="dxa"/>
+              <w:left w:w="80" w:type="dxa"/>
+              <w:bottom w:w="30" w:type="dxa"/>
+              <w:right w:w="80" w:type="dxa"/>
+            </w:tcMar>
+          </w:tcPr>
+          <w:p>
+            <w:r>
+              <w:rPr>
+                <w:rFonts w:ascii="Aptos" w:eastAsia="Aptos" w:hAnsi="Aptos" w:cs="Aptos"/>
+                <w:sz w:val="20"/>
+                <w:szCs w:val="20"/>
+              </w:rPr>
+              <w:t xml:space="preserve"/>
+            </w:r>
+          </w:p>
+        </w:tc>
+        <w:tc>
+          <w:tcPr>
+            <w:tcW w:w="1600" w:type="pct"/>
+            <w:tcMar>
+              <w:top w:w="30" w:type="dxa"/>
+              <w:left w:w="80" w:type="dxa"/>
+              <w:bottom w:w="30" w:type="dxa"/>
+              <w:right w:w="80" w:type="dxa"/>
+            </w:tcMar>
+          </w:tcPr>
+          <w:p>
+            <w:r>
+              <w:rPr>
+                <w:rFonts w:ascii="Aptos" w:eastAsia="Aptos" w:hAnsi="Aptos" w:cs="Aptos"/>
+                <w:sz w:val="20"/>
+                <w:szCs w:val="20"/>
+              </w:rPr>
+              <w:t xml:space="preserve"/>
+            </w:r>
+          </w:p>
+        </w:tc>
+      </w:tr>
+      <w:tr>
+        <w:trPr>
+          <w:cantSplit/>
+        </w:trPr>
+        <w:tc>
+          <w:tcPr>
+            <w:tcW w:w="300" w:type="pct"/>
+            <w:tcMar>
+              <w:top w:w="30" w:type="dxa"/>
+              <w:left w:w="80" w:type="dxa"/>
+              <w:bottom w:w="30" w:type="dxa"/>
+              <w:right w:w="80" w:type="dxa"/>
+            </w:tcMar>
+          </w:tcPr>
+          <w:p>
+            <w:r>
+              <w:rPr>
+                <w:rFonts w:ascii="Aptos" w:eastAsia="Aptos" w:hAnsi="Aptos" w:cs="Aptos"/>
+                <w:sz w:val="20"/>
+                <w:szCs w:val="20"/>
+              </w:rPr>
+              <w:t xml:space="preserve">119</w:t>
+            </w:r>
+          </w:p>
+        </w:tc>
+        <w:tc>
+          <w:tcPr>
+            <w:tcW w:w="2350" w:type="pct"/>
+            <w:tcMar>
+              <w:top w:w="30" w:type="dxa"/>
+              <w:left w:w="80" w:type="dxa"/>
+              <w:bottom w:w="30" w:type="dxa"/>
+              <w:right w:w="80" w:type="dxa"/>
+            </w:tcMar>
+          </w:tcPr>
+          <w:p>
+            <w:r>
+              <w:rPr>
+                <w:rFonts w:ascii="Aptos" w:eastAsia="Aptos" w:hAnsi="Aptos" w:cs="Aptos"/>
+                <w:sz w:val="20"/>
+                <w:szCs w:val="20"/>
+              </w:rPr>
+              <w:t xml:space="preserve"/>
+            </w:r>
+          </w:p>
+        </w:tc>
+        <w:tc>
+          <w:tcPr>
+            <w:tcW w:w="750" w:type="pct"/>
+            <w:tcMar>
+              <w:top w:w="30" w:type="dxa"/>
+              <w:left w:w="80" w:type="dxa"/>
+              <w:bottom w:w="30" w:type="dxa"/>
+              <w:right w:w="80" w:type="dxa"/>
+            </w:tcMar>
+          </w:tcPr>
+          <w:p>
+            <w:r>
+              <w:rPr>
+                <w:rFonts w:ascii="Aptos" w:eastAsia="Aptos" w:hAnsi="Aptos" w:cs="Aptos"/>
+                <w:sz w:val="20"/>
+                <w:szCs w:val="20"/>
+              </w:rPr>
+              <w:t xml:space="preserve"/>
+            </w:r>
+          </w:p>
+        </w:tc>
+        <w:tc>
+          <w:tcPr>
+            <w:tcW w:w="1600" w:type="pct"/>
+            <w:tcMar>
+              <w:top w:w="30" w:type="dxa"/>
+              <w:left w:w="80" w:type="dxa"/>
+              <w:bottom w:w="30" w:type="dxa"/>
+              <w:right w:w="80" w:type="dxa"/>
+            </w:tcMar>
+          </w:tcPr>
+          <w:p>
+            <w:r>
+              <w:rPr>
+                <w:rFonts w:ascii="Aptos" w:eastAsia="Aptos" w:hAnsi="Aptos" w:cs="Aptos"/>
+                <w:sz w:val="20"/>
+                <w:szCs w:val="20"/>
+              </w:rPr>
+              <w:t xml:space="preserve"/>
+            </w:r>
+          </w:p>
+        </w:tc>
+      </w:tr>
+      <w:tr>
+        <w:trPr>
+          <w:cantSplit/>
+        </w:trPr>
+        <w:tc>
+          <w:tcPr>
+            <w:tcW w:w="300" w:type="pct"/>
+            <w:tcMar>
+              <w:top w:w="30" w:type="dxa"/>
+              <w:left w:w="80" w:type="dxa"/>
+              <w:bottom w:w="30" w:type="dxa"/>
+              <w:right w:w="80" w:type="dxa"/>
+            </w:tcMar>
+          </w:tcPr>
+          <w:p>
+            <w:r>
+              <w:rPr>
+                <w:rFonts w:ascii="Aptos" w:eastAsia="Aptos" w:hAnsi="Aptos" w:cs="Aptos"/>
+                <w:sz w:val="20"/>
+                <w:szCs w:val="20"/>
+              </w:rPr>
+              <w:t xml:space="preserve">120</w:t>
             </w:r>
           </w:p>
         </w:tc>

</xml_diff>

<commit_message>
added results for tests 121 to 160
</commit_message>
<xml_diff>
--- a/Testing.docx
+++ b/Testing.docx
@@ -44476,6 +44476,3714 @@
                 <w:szCs w:val="20"/>
               </w:rPr>
               <w:t xml:space="preserve">120</w:t>
+            </w:r>
+          </w:p>
+        </w:tc>
+        <w:tc>
+          <w:tcPr>
+            <w:tcW w:w="2350" w:type="pct"/>
+            <w:tcMar>
+              <w:top w:w="30" w:type="dxa"/>
+              <w:left w:w="80" w:type="dxa"/>
+              <w:bottom w:w="30" w:type="dxa"/>
+              <w:right w:w="80" w:type="dxa"/>
+            </w:tcMar>
+          </w:tcPr>
+          <w:p>
+            <w:r>
+              <w:rPr>
+                <w:rFonts w:ascii="Aptos" w:eastAsia="Aptos" w:hAnsi="Aptos" w:cs="Aptos"/>
+                <w:sz w:val="20"/>
+                <w:szCs w:val="20"/>
+              </w:rPr>
+              <w:t xml:space="preserve"/>
+            </w:r>
+          </w:p>
+        </w:tc>
+        <w:tc>
+          <w:tcPr>
+            <w:tcW w:w="750" w:type="pct"/>
+            <w:tcMar>
+              <w:top w:w="30" w:type="dxa"/>
+              <w:left w:w="80" w:type="dxa"/>
+              <w:bottom w:w="30" w:type="dxa"/>
+              <w:right w:w="80" w:type="dxa"/>
+            </w:tcMar>
+          </w:tcPr>
+          <w:p>
+            <w:r>
+              <w:rPr>
+                <w:rFonts w:ascii="Aptos" w:eastAsia="Aptos" w:hAnsi="Aptos" w:cs="Aptos"/>
+                <w:sz w:val="20"/>
+                <w:szCs w:val="20"/>
+              </w:rPr>
+              <w:t xml:space="preserve"/>
+            </w:r>
+          </w:p>
+        </w:tc>
+        <w:tc>
+          <w:tcPr>
+            <w:tcW w:w="1600" w:type="pct"/>
+            <w:tcMar>
+              <w:top w:w="30" w:type="dxa"/>
+              <w:left w:w="80" w:type="dxa"/>
+              <w:bottom w:w="30" w:type="dxa"/>
+              <w:right w:w="80" w:type="dxa"/>
+            </w:tcMar>
+          </w:tcPr>
+          <w:p>
+            <w:r>
+              <w:rPr>
+                <w:rFonts w:ascii="Aptos" w:eastAsia="Aptos" w:hAnsi="Aptos" w:cs="Aptos"/>
+                <w:sz w:val="20"/>
+                <w:szCs w:val="20"/>
+              </w:rPr>
+              <w:t xml:space="preserve"/>
+            </w:r>
+          </w:p>
+        </w:tc>
+      </w:tr>
+    </w:tbl>
+    <w:p>
+      <w:r>
+        <w:rPr>
+          <w:rFonts w:ascii="Aptos" w:eastAsia="Aptos" w:hAnsi="Aptos" w:cs="Aptos"/>
+        </w:rPr>
+        <w:t xml:space="preserve"/>
+      </w:r>
+    </w:p>
+    <w:p>
+      <w:pPr>
+        <w:pStyle w:val="Heading3"/>
+      </w:pPr>
+      <w:r>
+        <w:rPr>
+          <w:rFonts w:ascii="Aptos Display" w:eastAsia="Aptos Display" w:hAnsi="Aptos Display" w:cs="Aptos Display"/>
+          <w:b/>
+          <w:bCs/>
+          <w:color w:val="000000"/>
+        </w:rPr>
+        <w:t xml:space="preserve">Results for tests 121 to 160</w:t>
+      </w:r>
+    </w:p>
+    <w:tbl>
+      <w:tblPr>
+        <w:tblW w:w="5000" w:type="pct"/>
+        <w:tblBorders>
+          <w:top w:val="single" w:sz="4" w:space="0" w:color="808080"/>
+          <w:left w:val="single" w:sz="4" w:space="0" w:color="808080"/>
+          <w:bottom w:val="single" w:sz="4" w:space="0" w:color="808080"/>
+          <w:right w:val="single" w:sz="4" w:space="0" w:color="808080"/>
+          <w:insideH w:val="single" w:sz="4" w:space="0" w:color="808080"/>
+          <w:insideV w:val="single" w:sz="4" w:space="0" w:color="808080"/>
+        </w:tblBorders>
+        <w:tblCellMar>
+          <w:left w:w="10" w:type="dxa"/>
+          <w:right w:w="10" w:type="dxa"/>
+        </w:tblCellMar>
+        <w:tblLook w:val="0000" w:firstRow="0" w:lastRow="0" w:firstColumn="0" w:lastColumn="0" w:noHBand="0" w:noVBand="0"/>
+      </w:tblPr>
+      <w:tblGrid>
+        <w:gridCol w:w="561"/>
+        <w:gridCol w:w="4394"/>
+        <w:gridCol w:w="1402"/>
+        <w:gridCol w:w="2992"/>
+      </w:tblGrid>
+      <w:tr>
+        <w:trPr>
+          <w:cantSplit/>
+          <w:tblHeader/>
+        </w:trPr>
+        <w:tc>
+          <w:tcPr>
+            <w:tcW w:w="300" w:type="pct"/>
+            <w:shd w:val="clear" w:color="auto" w:fill="F2CEED" w:themeFill="accent5" w:themeFillTint="33"/>
+            <w:tcMar>
+              <w:top w:w="30" w:type="dxa"/>
+              <w:left w:w="80" w:type="dxa"/>
+              <w:bottom w:w="30" w:type="dxa"/>
+              <w:right w:w="80" w:type="dxa"/>
+            </w:tcMar>
+          </w:tcPr>
+          <w:p>
+            <w:r>
+              <w:rPr>
+                <w:rFonts w:ascii="Aptos" w:eastAsia="Aptos" w:hAnsi="Aptos" w:cs="Aptos"/>
+                <w:b/>
+                <w:bCs/>
+                <w:sz w:val="20"/>
+                <w:szCs w:val="20"/>
+              </w:rPr>
+              <w:t xml:space="preserve">No.</w:t>
+            </w:r>
+          </w:p>
+        </w:tc>
+        <w:tc>
+          <w:tcPr>
+            <w:tcW w:w="2350" w:type="pct"/>
+            <w:shd w:val="clear" w:color="auto" w:fill="F2CEED" w:themeFill="accent5" w:themeFillTint="33"/>
+            <w:tcMar>
+              <w:top w:w="30" w:type="dxa"/>
+              <w:left w:w="80" w:type="dxa"/>
+              <w:bottom w:w="30" w:type="dxa"/>
+              <w:right w:w="80" w:type="dxa"/>
+            </w:tcMar>
+          </w:tcPr>
+          <w:p>
+            <w:r>
+              <w:rPr>
+                <w:rFonts w:ascii="Aptos" w:eastAsia="Aptos" w:hAnsi="Aptos" w:cs="Aptos"/>
+                <w:b/>
+                <w:bCs/>
+                <w:sz w:val="20"/>
+                <w:szCs w:val="20"/>
+              </w:rPr>
+              <w:t xml:space="preserve">Actual Result</w:t>
+            </w:r>
+          </w:p>
+        </w:tc>
+        <w:tc>
+          <w:tcPr>
+            <w:tcW w:w="750" w:type="pct"/>
+            <w:shd w:val="clear" w:color="auto" w:fill="F2CEED" w:themeFill="accent5" w:themeFillTint="33"/>
+            <w:tcMar>
+              <w:top w:w="30" w:type="dxa"/>
+              <w:left w:w="80" w:type="dxa"/>
+              <w:bottom w:w="30" w:type="dxa"/>
+              <w:right w:w="80" w:type="dxa"/>
+            </w:tcMar>
+          </w:tcPr>
+          <w:p>
+            <w:r>
+              <w:rPr>
+                <w:rFonts w:ascii="Aptos" w:eastAsia="Aptos" w:hAnsi="Aptos" w:cs="Aptos"/>
+                <w:b/>
+                <w:bCs/>
+                <w:sz w:val="20"/>
+                <w:szCs w:val="20"/>
+              </w:rPr>
+              <w:t xml:space="preserve">Pass or Fail</w:t>
+            </w:r>
+          </w:p>
+        </w:tc>
+        <w:tc>
+          <w:tcPr>
+            <w:tcW w:w="1600" w:type="pct"/>
+            <w:shd w:val="clear" w:color="auto" w:fill="F2CEED" w:themeFill="accent5" w:themeFillTint="33"/>
+            <w:tcMar>
+              <w:top w:w="30" w:type="dxa"/>
+              <w:left w:w="80" w:type="dxa"/>
+              <w:bottom w:w="30" w:type="dxa"/>
+              <w:right w:w="80" w:type="dxa"/>
+            </w:tcMar>
+          </w:tcPr>
+          <w:p>
+            <w:r>
+              <w:rPr>
+                <w:rFonts w:ascii="Aptos" w:eastAsia="Aptos" w:hAnsi="Aptos" w:cs="Aptos"/>
+                <w:b/>
+                <w:bCs/>
+                <w:sz w:val="20"/>
+                <w:szCs w:val="20"/>
+              </w:rPr>
+              <w:t xml:space="preserve">Evidence</w:t>
+            </w:r>
+          </w:p>
+        </w:tc>
+      </w:tr>
+      <w:tr>
+        <w:trPr>
+          <w:cantSplit/>
+        </w:trPr>
+        <w:tc>
+          <w:tcPr>
+            <w:tcW w:w="300" w:type="pct"/>
+            <w:tcMar>
+              <w:top w:w="30" w:type="dxa"/>
+              <w:left w:w="80" w:type="dxa"/>
+              <w:bottom w:w="30" w:type="dxa"/>
+              <w:right w:w="80" w:type="dxa"/>
+            </w:tcMar>
+          </w:tcPr>
+          <w:p>
+            <w:r>
+              <w:rPr>
+                <w:rFonts w:ascii="Aptos" w:eastAsia="Aptos" w:hAnsi="Aptos" w:cs="Aptos"/>
+                <w:sz w:val="20"/>
+                <w:szCs w:val="20"/>
+              </w:rPr>
+              <w:t xml:space="preserve">121</w:t>
+            </w:r>
+          </w:p>
+        </w:tc>
+        <w:tc>
+          <w:tcPr>
+            <w:tcW w:w="2350" w:type="pct"/>
+            <w:tcMar>
+              <w:top w:w="30" w:type="dxa"/>
+              <w:left w:w="80" w:type="dxa"/>
+              <w:bottom w:w="30" w:type="dxa"/>
+              <w:right w:w="80" w:type="dxa"/>
+            </w:tcMar>
+          </w:tcPr>
+          <w:p>
+            <w:r>
+              <w:rPr>
+                <w:rFonts w:ascii="Aptos" w:eastAsia="Aptos" w:hAnsi="Aptos" w:cs="Aptos"/>
+                <w:sz w:val="20"/>
+                <w:szCs w:val="20"/>
+              </w:rPr>
+              <w:t xml:space="preserve"/>
+            </w:r>
+          </w:p>
+        </w:tc>
+        <w:tc>
+          <w:tcPr>
+            <w:tcW w:w="750" w:type="pct"/>
+            <w:tcMar>
+              <w:top w:w="30" w:type="dxa"/>
+              <w:left w:w="80" w:type="dxa"/>
+              <w:bottom w:w="30" w:type="dxa"/>
+              <w:right w:w="80" w:type="dxa"/>
+            </w:tcMar>
+          </w:tcPr>
+          <w:p>
+            <w:r>
+              <w:rPr>
+                <w:rFonts w:ascii="Aptos" w:eastAsia="Aptos" w:hAnsi="Aptos" w:cs="Aptos"/>
+                <w:sz w:val="20"/>
+                <w:szCs w:val="20"/>
+              </w:rPr>
+              <w:t xml:space="preserve"/>
+            </w:r>
+          </w:p>
+        </w:tc>
+        <w:tc>
+          <w:tcPr>
+            <w:tcW w:w="1600" w:type="pct"/>
+            <w:tcMar>
+              <w:top w:w="30" w:type="dxa"/>
+              <w:left w:w="80" w:type="dxa"/>
+              <w:bottom w:w="30" w:type="dxa"/>
+              <w:right w:w="80" w:type="dxa"/>
+            </w:tcMar>
+          </w:tcPr>
+          <w:p>
+            <w:r>
+              <w:rPr>
+                <w:rFonts w:ascii="Aptos" w:eastAsia="Aptos" w:hAnsi="Aptos" w:cs="Aptos"/>
+                <w:sz w:val="20"/>
+                <w:szCs w:val="20"/>
+              </w:rPr>
+              <w:t xml:space="preserve"/>
+            </w:r>
+          </w:p>
+        </w:tc>
+      </w:tr>
+      <w:tr>
+        <w:trPr>
+          <w:cantSplit/>
+        </w:trPr>
+        <w:tc>
+          <w:tcPr>
+            <w:tcW w:w="300" w:type="pct"/>
+            <w:tcMar>
+              <w:top w:w="30" w:type="dxa"/>
+              <w:left w:w="80" w:type="dxa"/>
+              <w:bottom w:w="30" w:type="dxa"/>
+              <w:right w:w="80" w:type="dxa"/>
+            </w:tcMar>
+          </w:tcPr>
+          <w:p>
+            <w:r>
+              <w:rPr>
+                <w:rFonts w:ascii="Aptos" w:eastAsia="Aptos" w:hAnsi="Aptos" w:cs="Aptos"/>
+                <w:sz w:val="20"/>
+                <w:szCs w:val="20"/>
+              </w:rPr>
+              <w:t xml:space="preserve">122</w:t>
+            </w:r>
+          </w:p>
+        </w:tc>
+        <w:tc>
+          <w:tcPr>
+            <w:tcW w:w="2350" w:type="pct"/>
+            <w:tcMar>
+              <w:top w:w="30" w:type="dxa"/>
+              <w:left w:w="80" w:type="dxa"/>
+              <w:bottom w:w="30" w:type="dxa"/>
+              <w:right w:w="80" w:type="dxa"/>
+            </w:tcMar>
+          </w:tcPr>
+          <w:p>
+            <w:r>
+              <w:rPr>
+                <w:rFonts w:ascii="Aptos" w:eastAsia="Aptos" w:hAnsi="Aptos" w:cs="Aptos"/>
+                <w:sz w:val="20"/>
+                <w:szCs w:val="20"/>
+              </w:rPr>
+              <w:t xml:space="preserve"/>
+            </w:r>
+          </w:p>
+        </w:tc>
+        <w:tc>
+          <w:tcPr>
+            <w:tcW w:w="750" w:type="pct"/>
+            <w:tcMar>
+              <w:top w:w="30" w:type="dxa"/>
+              <w:left w:w="80" w:type="dxa"/>
+              <w:bottom w:w="30" w:type="dxa"/>
+              <w:right w:w="80" w:type="dxa"/>
+            </w:tcMar>
+          </w:tcPr>
+          <w:p>
+            <w:r>
+              <w:rPr>
+                <w:rFonts w:ascii="Aptos" w:eastAsia="Aptos" w:hAnsi="Aptos" w:cs="Aptos"/>
+                <w:sz w:val="20"/>
+                <w:szCs w:val="20"/>
+              </w:rPr>
+              <w:t xml:space="preserve"/>
+            </w:r>
+          </w:p>
+        </w:tc>
+        <w:tc>
+          <w:tcPr>
+            <w:tcW w:w="1600" w:type="pct"/>
+            <w:tcMar>
+              <w:top w:w="30" w:type="dxa"/>
+              <w:left w:w="80" w:type="dxa"/>
+              <w:bottom w:w="30" w:type="dxa"/>
+              <w:right w:w="80" w:type="dxa"/>
+            </w:tcMar>
+          </w:tcPr>
+          <w:p>
+            <w:r>
+              <w:rPr>
+                <w:rFonts w:ascii="Aptos" w:eastAsia="Aptos" w:hAnsi="Aptos" w:cs="Aptos"/>
+                <w:sz w:val="20"/>
+                <w:szCs w:val="20"/>
+              </w:rPr>
+              <w:t xml:space="preserve"/>
+            </w:r>
+          </w:p>
+        </w:tc>
+      </w:tr>
+      <w:tr>
+        <w:trPr>
+          <w:cantSplit/>
+        </w:trPr>
+        <w:tc>
+          <w:tcPr>
+            <w:tcW w:w="300" w:type="pct"/>
+            <w:tcMar>
+              <w:top w:w="30" w:type="dxa"/>
+              <w:left w:w="80" w:type="dxa"/>
+              <w:bottom w:w="30" w:type="dxa"/>
+              <w:right w:w="80" w:type="dxa"/>
+            </w:tcMar>
+          </w:tcPr>
+          <w:p>
+            <w:r>
+              <w:rPr>
+                <w:rFonts w:ascii="Aptos" w:eastAsia="Aptos" w:hAnsi="Aptos" w:cs="Aptos"/>
+                <w:sz w:val="20"/>
+                <w:szCs w:val="20"/>
+              </w:rPr>
+              <w:t xml:space="preserve">123</w:t>
+            </w:r>
+          </w:p>
+        </w:tc>
+        <w:tc>
+          <w:tcPr>
+            <w:tcW w:w="2350" w:type="pct"/>
+            <w:tcMar>
+              <w:top w:w="30" w:type="dxa"/>
+              <w:left w:w="80" w:type="dxa"/>
+              <w:bottom w:w="30" w:type="dxa"/>
+              <w:right w:w="80" w:type="dxa"/>
+            </w:tcMar>
+          </w:tcPr>
+          <w:p>
+            <w:r>
+              <w:rPr>
+                <w:rFonts w:ascii="Aptos" w:eastAsia="Aptos" w:hAnsi="Aptos" w:cs="Aptos"/>
+                <w:sz w:val="20"/>
+                <w:szCs w:val="20"/>
+              </w:rPr>
+              <w:t xml:space="preserve"/>
+            </w:r>
+          </w:p>
+        </w:tc>
+        <w:tc>
+          <w:tcPr>
+            <w:tcW w:w="750" w:type="pct"/>
+            <w:tcMar>
+              <w:top w:w="30" w:type="dxa"/>
+              <w:left w:w="80" w:type="dxa"/>
+              <w:bottom w:w="30" w:type="dxa"/>
+              <w:right w:w="80" w:type="dxa"/>
+            </w:tcMar>
+          </w:tcPr>
+          <w:p>
+            <w:r>
+              <w:rPr>
+                <w:rFonts w:ascii="Aptos" w:eastAsia="Aptos" w:hAnsi="Aptos" w:cs="Aptos"/>
+                <w:sz w:val="20"/>
+                <w:szCs w:val="20"/>
+              </w:rPr>
+              <w:t xml:space="preserve"/>
+            </w:r>
+          </w:p>
+        </w:tc>
+        <w:tc>
+          <w:tcPr>
+            <w:tcW w:w="1600" w:type="pct"/>
+            <w:tcMar>
+              <w:top w:w="30" w:type="dxa"/>
+              <w:left w:w="80" w:type="dxa"/>
+              <w:bottom w:w="30" w:type="dxa"/>
+              <w:right w:w="80" w:type="dxa"/>
+            </w:tcMar>
+          </w:tcPr>
+          <w:p>
+            <w:r>
+              <w:rPr>
+                <w:rFonts w:ascii="Aptos" w:eastAsia="Aptos" w:hAnsi="Aptos" w:cs="Aptos"/>
+                <w:sz w:val="20"/>
+                <w:szCs w:val="20"/>
+              </w:rPr>
+              <w:t xml:space="preserve"/>
+            </w:r>
+          </w:p>
+        </w:tc>
+      </w:tr>
+      <w:tr>
+        <w:trPr>
+          <w:cantSplit/>
+        </w:trPr>
+        <w:tc>
+          <w:tcPr>
+            <w:tcW w:w="300" w:type="pct"/>
+            <w:tcMar>
+              <w:top w:w="30" w:type="dxa"/>
+              <w:left w:w="80" w:type="dxa"/>
+              <w:bottom w:w="30" w:type="dxa"/>
+              <w:right w:w="80" w:type="dxa"/>
+            </w:tcMar>
+          </w:tcPr>
+          <w:p>
+            <w:r>
+              <w:rPr>
+                <w:rFonts w:ascii="Aptos" w:eastAsia="Aptos" w:hAnsi="Aptos" w:cs="Aptos"/>
+                <w:sz w:val="20"/>
+                <w:szCs w:val="20"/>
+              </w:rPr>
+              <w:t xml:space="preserve">124</w:t>
+            </w:r>
+          </w:p>
+        </w:tc>
+        <w:tc>
+          <w:tcPr>
+            <w:tcW w:w="2350" w:type="pct"/>
+            <w:tcMar>
+              <w:top w:w="30" w:type="dxa"/>
+              <w:left w:w="80" w:type="dxa"/>
+              <w:bottom w:w="30" w:type="dxa"/>
+              <w:right w:w="80" w:type="dxa"/>
+            </w:tcMar>
+          </w:tcPr>
+          <w:p>
+            <w:r>
+              <w:rPr>
+                <w:rFonts w:ascii="Aptos" w:eastAsia="Aptos" w:hAnsi="Aptos" w:cs="Aptos"/>
+                <w:sz w:val="20"/>
+                <w:szCs w:val="20"/>
+              </w:rPr>
+              <w:t xml:space="preserve"/>
+            </w:r>
+          </w:p>
+        </w:tc>
+        <w:tc>
+          <w:tcPr>
+            <w:tcW w:w="750" w:type="pct"/>
+            <w:tcMar>
+              <w:top w:w="30" w:type="dxa"/>
+              <w:left w:w="80" w:type="dxa"/>
+              <w:bottom w:w="30" w:type="dxa"/>
+              <w:right w:w="80" w:type="dxa"/>
+            </w:tcMar>
+          </w:tcPr>
+          <w:p>
+            <w:r>
+              <w:rPr>
+                <w:rFonts w:ascii="Aptos" w:eastAsia="Aptos" w:hAnsi="Aptos" w:cs="Aptos"/>
+                <w:sz w:val="20"/>
+                <w:szCs w:val="20"/>
+              </w:rPr>
+              <w:t xml:space="preserve"/>
+            </w:r>
+          </w:p>
+        </w:tc>
+        <w:tc>
+          <w:tcPr>
+            <w:tcW w:w="1600" w:type="pct"/>
+            <w:tcMar>
+              <w:top w:w="30" w:type="dxa"/>
+              <w:left w:w="80" w:type="dxa"/>
+              <w:bottom w:w="30" w:type="dxa"/>
+              <w:right w:w="80" w:type="dxa"/>
+            </w:tcMar>
+          </w:tcPr>
+          <w:p>
+            <w:r>
+              <w:rPr>
+                <w:rFonts w:ascii="Aptos" w:eastAsia="Aptos" w:hAnsi="Aptos" w:cs="Aptos"/>
+                <w:sz w:val="20"/>
+                <w:szCs w:val="20"/>
+              </w:rPr>
+              <w:t xml:space="preserve"/>
+            </w:r>
+          </w:p>
+        </w:tc>
+      </w:tr>
+      <w:tr>
+        <w:trPr>
+          <w:cantSplit/>
+        </w:trPr>
+        <w:tc>
+          <w:tcPr>
+            <w:tcW w:w="300" w:type="pct"/>
+            <w:tcMar>
+              <w:top w:w="30" w:type="dxa"/>
+              <w:left w:w="80" w:type="dxa"/>
+              <w:bottom w:w="30" w:type="dxa"/>
+              <w:right w:w="80" w:type="dxa"/>
+            </w:tcMar>
+          </w:tcPr>
+          <w:p>
+            <w:r>
+              <w:rPr>
+                <w:rFonts w:ascii="Aptos" w:eastAsia="Aptos" w:hAnsi="Aptos" w:cs="Aptos"/>
+                <w:sz w:val="20"/>
+                <w:szCs w:val="20"/>
+              </w:rPr>
+              <w:t xml:space="preserve">125</w:t>
+            </w:r>
+          </w:p>
+        </w:tc>
+        <w:tc>
+          <w:tcPr>
+            <w:tcW w:w="2350" w:type="pct"/>
+            <w:tcMar>
+              <w:top w:w="30" w:type="dxa"/>
+              <w:left w:w="80" w:type="dxa"/>
+              <w:bottom w:w="30" w:type="dxa"/>
+              <w:right w:w="80" w:type="dxa"/>
+            </w:tcMar>
+          </w:tcPr>
+          <w:p>
+            <w:r>
+              <w:rPr>
+                <w:rFonts w:ascii="Aptos" w:eastAsia="Aptos" w:hAnsi="Aptos" w:cs="Aptos"/>
+                <w:sz w:val="20"/>
+                <w:szCs w:val="20"/>
+              </w:rPr>
+              <w:t xml:space="preserve"/>
+            </w:r>
+          </w:p>
+        </w:tc>
+        <w:tc>
+          <w:tcPr>
+            <w:tcW w:w="750" w:type="pct"/>
+            <w:tcMar>
+              <w:top w:w="30" w:type="dxa"/>
+              <w:left w:w="80" w:type="dxa"/>
+              <w:bottom w:w="30" w:type="dxa"/>
+              <w:right w:w="80" w:type="dxa"/>
+            </w:tcMar>
+          </w:tcPr>
+          <w:p>
+            <w:r>
+              <w:rPr>
+                <w:rFonts w:ascii="Aptos" w:eastAsia="Aptos" w:hAnsi="Aptos" w:cs="Aptos"/>
+                <w:sz w:val="20"/>
+                <w:szCs w:val="20"/>
+              </w:rPr>
+              <w:t xml:space="preserve"/>
+            </w:r>
+          </w:p>
+        </w:tc>
+        <w:tc>
+          <w:tcPr>
+            <w:tcW w:w="1600" w:type="pct"/>
+            <w:tcMar>
+              <w:top w:w="30" w:type="dxa"/>
+              <w:left w:w="80" w:type="dxa"/>
+              <w:bottom w:w="30" w:type="dxa"/>
+              <w:right w:w="80" w:type="dxa"/>
+            </w:tcMar>
+          </w:tcPr>
+          <w:p>
+            <w:r>
+              <w:rPr>
+                <w:rFonts w:ascii="Aptos" w:eastAsia="Aptos" w:hAnsi="Aptos" w:cs="Aptos"/>
+                <w:sz w:val="20"/>
+                <w:szCs w:val="20"/>
+              </w:rPr>
+              <w:t xml:space="preserve"/>
+            </w:r>
+          </w:p>
+        </w:tc>
+      </w:tr>
+      <w:tr>
+        <w:trPr>
+          <w:cantSplit/>
+        </w:trPr>
+        <w:tc>
+          <w:tcPr>
+            <w:tcW w:w="300" w:type="pct"/>
+            <w:tcMar>
+              <w:top w:w="30" w:type="dxa"/>
+              <w:left w:w="80" w:type="dxa"/>
+              <w:bottom w:w="30" w:type="dxa"/>
+              <w:right w:w="80" w:type="dxa"/>
+            </w:tcMar>
+          </w:tcPr>
+          <w:p>
+            <w:r>
+              <w:rPr>
+                <w:rFonts w:ascii="Aptos" w:eastAsia="Aptos" w:hAnsi="Aptos" w:cs="Aptos"/>
+                <w:sz w:val="20"/>
+                <w:szCs w:val="20"/>
+              </w:rPr>
+              <w:t xml:space="preserve">126</w:t>
+            </w:r>
+          </w:p>
+        </w:tc>
+        <w:tc>
+          <w:tcPr>
+            <w:tcW w:w="2350" w:type="pct"/>
+            <w:tcMar>
+              <w:top w:w="30" w:type="dxa"/>
+              <w:left w:w="80" w:type="dxa"/>
+              <w:bottom w:w="30" w:type="dxa"/>
+              <w:right w:w="80" w:type="dxa"/>
+            </w:tcMar>
+          </w:tcPr>
+          <w:p>
+            <w:r>
+              <w:rPr>
+                <w:rFonts w:ascii="Aptos" w:eastAsia="Aptos" w:hAnsi="Aptos" w:cs="Aptos"/>
+                <w:sz w:val="20"/>
+                <w:szCs w:val="20"/>
+              </w:rPr>
+              <w:t xml:space="preserve"/>
+            </w:r>
+          </w:p>
+        </w:tc>
+        <w:tc>
+          <w:tcPr>
+            <w:tcW w:w="750" w:type="pct"/>
+            <w:tcMar>
+              <w:top w:w="30" w:type="dxa"/>
+              <w:left w:w="80" w:type="dxa"/>
+              <w:bottom w:w="30" w:type="dxa"/>
+              <w:right w:w="80" w:type="dxa"/>
+            </w:tcMar>
+          </w:tcPr>
+          <w:p>
+            <w:r>
+              <w:rPr>
+                <w:rFonts w:ascii="Aptos" w:eastAsia="Aptos" w:hAnsi="Aptos" w:cs="Aptos"/>
+                <w:sz w:val="20"/>
+                <w:szCs w:val="20"/>
+              </w:rPr>
+              <w:t xml:space="preserve"/>
+            </w:r>
+          </w:p>
+        </w:tc>
+        <w:tc>
+          <w:tcPr>
+            <w:tcW w:w="1600" w:type="pct"/>
+            <w:tcMar>
+              <w:top w:w="30" w:type="dxa"/>
+              <w:left w:w="80" w:type="dxa"/>
+              <w:bottom w:w="30" w:type="dxa"/>
+              <w:right w:w="80" w:type="dxa"/>
+            </w:tcMar>
+          </w:tcPr>
+          <w:p>
+            <w:r>
+              <w:rPr>
+                <w:rFonts w:ascii="Aptos" w:eastAsia="Aptos" w:hAnsi="Aptos" w:cs="Aptos"/>
+                <w:sz w:val="20"/>
+                <w:szCs w:val="20"/>
+              </w:rPr>
+              <w:t xml:space="preserve"/>
+            </w:r>
+          </w:p>
+        </w:tc>
+      </w:tr>
+      <w:tr>
+        <w:trPr>
+          <w:cantSplit/>
+        </w:trPr>
+        <w:tc>
+          <w:tcPr>
+            <w:tcW w:w="300" w:type="pct"/>
+            <w:tcMar>
+              <w:top w:w="30" w:type="dxa"/>
+              <w:left w:w="80" w:type="dxa"/>
+              <w:bottom w:w="30" w:type="dxa"/>
+              <w:right w:w="80" w:type="dxa"/>
+            </w:tcMar>
+          </w:tcPr>
+          <w:p>
+            <w:r>
+              <w:rPr>
+                <w:rFonts w:ascii="Aptos" w:eastAsia="Aptos" w:hAnsi="Aptos" w:cs="Aptos"/>
+                <w:sz w:val="20"/>
+                <w:szCs w:val="20"/>
+              </w:rPr>
+              <w:t xml:space="preserve">127</w:t>
+            </w:r>
+          </w:p>
+        </w:tc>
+        <w:tc>
+          <w:tcPr>
+            <w:tcW w:w="2350" w:type="pct"/>
+            <w:tcMar>
+              <w:top w:w="30" w:type="dxa"/>
+              <w:left w:w="80" w:type="dxa"/>
+              <w:bottom w:w="30" w:type="dxa"/>
+              <w:right w:w="80" w:type="dxa"/>
+            </w:tcMar>
+          </w:tcPr>
+          <w:p>
+            <w:r>
+              <w:rPr>
+                <w:rFonts w:ascii="Aptos" w:eastAsia="Aptos" w:hAnsi="Aptos" w:cs="Aptos"/>
+                <w:sz w:val="20"/>
+                <w:szCs w:val="20"/>
+              </w:rPr>
+              <w:t xml:space="preserve"/>
+            </w:r>
+          </w:p>
+        </w:tc>
+        <w:tc>
+          <w:tcPr>
+            <w:tcW w:w="750" w:type="pct"/>
+            <w:tcMar>
+              <w:top w:w="30" w:type="dxa"/>
+              <w:left w:w="80" w:type="dxa"/>
+              <w:bottom w:w="30" w:type="dxa"/>
+              <w:right w:w="80" w:type="dxa"/>
+            </w:tcMar>
+          </w:tcPr>
+          <w:p>
+            <w:r>
+              <w:rPr>
+                <w:rFonts w:ascii="Aptos" w:eastAsia="Aptos" w:hAnsi="Aptos" w:cs="Aptos"/>
+                <w:sz w:val="20"/>
+                <w:szCs w:val="20"/>
+              </w:rPr>
+              <w:t xml:space="preserve"/>
+            </w:r>
+          </w:p>
+        </w:tc>
+        <w:tc>
+          <w:tcPr>
+            <w:tcW w:w="1600" w:type="pct"/>
+            <w:tcMar>
+              <w:top w:w="30" w:type="dxa"/>
+              <w:left w:w="80" w:type="dxa"/>
+              <w:bottom w:w="30" w:type="dxa"/>
+              <w:right w:w="80" w:type="dxa"/>
+            </w:tcMar>
+          </w:tcPr>
+          <w:p>
+            <w:r>
+              <w:rPr>
+                <w:rFonts w:ascii="Aptos" w:eastAsia="Aptos" w:hAnsi="Aptos" w:cs="Aptos"/>
+                <w:sz w:val="20"/>
+                <w:szCs w:val="20"/>
+              </w:rPr>
+              <w:t xml:space="preserve"/>
+            </w:r>
+          </w:p>
+        </w:tc>
+      </w:tr>
+      <w:tr>
+        <w:trPr>
+          <w:cantSplit/>
+        </w:trPr>
+        <w:tc>
+          <w:tcPr>
+            <w:tcW w:w="300" w:type="pct"/>
+            <w:tcMar>
+              <w:top w:w="30" w:type="dxa"/>
+              <w:left w:w="80" w:type="dxa"/>
+              <w:bottom w:w="30" w:type="dxa"/>
+              <w:right w:w="80" w:type="dxa"/>
+            </w:tcMar>
+          </w:tcPr>
+          <w:p>
+            <w:r>
+              <w:rPr>
+                <w:rFonts w:ascii="Aptos" w:eastAsia="Aptos" w:hAnsi="Aptos" w:cs="Aptos"/>
+                <w:sz w:val="20"/>
+                <w:szCs w:val="20"/>
+              </w:rPr>
+              <w:t xml:space="preserve">128</w:t>
+            </w:r>
+          </w:p>
+        </w:tc>
+        <w:tc>
+          <w:tcPr>
+            <w:tcW w:w="2350" w:type="pct"/>
+            <w:tcMar>
+              <w:top w:w="30" w:type="dxa"/>
+              <w:left w:w="80" w:type="dxa"/>
+              <w:bottom w:w="30" w:type="dxa"/>
+              <w:right w:w="80" w:type="dxa"/>
+            </w:tcMar>
+          </w:tcPr>
+          <w:p>
+            <w:r>
+              <w:rPr>
+                <w:rFonts w:ascii="Aptos" w:eastAsia="Aptos" w:hAnsi="Aptos" w:cs="Aptos"/>
+                <w:sz w:val="20"/>
+                <w:szCs w:val="20"/>
+              </w:rPr>
+              <w:t xml:space="preserve"/>
+            </w:r>
+          </w:p>
+        </w:tc>
+        <w:tc>
+          <w:tcPr>
+            <w:tcW w:w="750" w:type="pct"/>
+            <w:tcMar>
+              <w:top w:w="30" w:type="dxa"/>
+              <w:left w:w="80" w:type="dxa"/>
+              <w:bottom w:w="30" w:type="dxa"/>
+              <w:right w:w="80" w:type="dxa"/>
+            </w:tcMar>
+          </w:tcPr>
+          <w:p>
+            <w:r>
+              <w:rPr>
+                <w:rFonts w:ascii="Aptos" w:eastAsia="Aptos" w:hAnsi="Aptos" w:cs="Aptos"/>
+                <w:sz w:val="20"/>
+                <w:szCs w:val="20"/>
+              </w:rPr>
+              <w:t xml:space="preserve"/>
+            </w:r>
+          </w:p>
+        </w:tc>
+        <w:tc>
+          <w:tcPr>
+            <w:tcW w:w="1600" w:type="pct"/>
+            <w:tcMar>
+              <w:top w:w="30" w:type="dxa"/>
+              <w:left w:w="80" w:type="dxa"/>
+              <w:bottom w:w="30" w:type="dxa"/>
+              <w:right w:w="80" w:type="dxa"/>
+            </w:tcMar>
+          </w:tcPr>
+          <w:p>
+            <w:r>
+              <w:rPr>
+                <w:rFonts w:ascii="Aptos" w:eastAsia="Aptos" w:hAnsi="Aptos" w:cs="Aptos"/>
+                <w:sz w:val="20"/>
+                <w:szCs w:val="20"/>
+              </w:rPr>
+              <w:t xml:space="preserve"/>
+            </w:r>
+          </w:p>
+        </w:tc>
+      </w:tr>
+      <w:tr>
+        <w:trPr>
+          <w:cantSplit/>
+        </w:trPr>
+        <w:tc>
+          <w:tcPr>
+            <w:tcW w:w="300" w:type="pct"/>
+            <w:tcMar>
+              <w:top w:w="30" w:type="dxa"/>
+              <w:left w:w="80" w:type="dxa"/>
+              <w:bottom w:w="30" w:type="dxa"/>
+              <w:right w:w="80" w:type="dxa"/>
+            </w:tcMar>
+          </w:tcPr>
+          <w:p>
+            <w:r>
+              <w:rPr>
+                <w:rFonts w:ascii="Aptos" w:eastAsia="Aptos" w:hAnsi="Aptos" w:cs="Aptos"/>
+                <w:sz w:val="20"/>
+                <w:szCs w:val="20"/>
+              </w:rPr>
+              <w:t xml:space="preserve">129</w:t>
+            </w:r>
+          </w:p>
+        </w:tc>
+        <w:tc>
+          <w:tcPr>
+            <w:tcW w:w="2350" w:type="pct"/>
+            <w:tcMar>
+              <w:top w:w="30" w:type="dxa"/>
+              <w:left w:w="80" w:type="dxa"/>
+              <w:bottom w:w="30" w:type="dxa"/>
+              <w:right w:w="80" w:type="dxa"/>
+            </w:tcMar>
+          </w:tcPr>
+          <w:p>
+            <w:r>
+              <w:rPr>
+                <w:rFonts w:ascii="Aptos" w:eastAsia="Aptos" w:hAnsi="Aptos" w:cs="Aptos"/>
+                <w:sz w:val="20"/>
+                <w:szCs w:val="20"/>
+              </w:rPr>
+              <w:t xml:space="preserve"/>
+            </w:r>
+          </w:p>
+        </w:tc>
+        <w:tc>
+          <w:tcPr>
+            <w:tcW w:w="750" w:type="pct"/>
+            <w:tcMar>
+              <w:top w:w="30" w:type="dxa"/>
+              <w:left w:w="80" w:type="dxa"/>
+              <w:bottom w:w="30" w:type="dxa"/>
+              <w:right w:w="80" w:type="dxa"/>
+            </w:tcMar>
+          </w:tcPr>
+          <w:p>
+            <w:r>
+              <w:rPr>
+                <w:rFonts w:ascii="Aptos" w:eastAsia="Aptos" w:hAnsi="Aptos" w:cs="Aptos"/>
+                <w:sz w:val="20"/>
+                <w:szCs w:val="20"/>
+              </w:rPr>
+              <w:t xml:space="preserve"/>
+            </w:r>
+          </w:p>
+        </w:tc>
+        <w:tc>
+          <w:tcPr>
+            <w:tcW w:w="1600" w:type="pct"/>
+            <w:tcMar>
+              <w:top w:w="30" w:type="dxa"/>
+              <w:left w:w="80" w:type="dxa"/>
+              <w:bottom w:w="30" w:type="dxa"/>
+              <w:right w:w="80" w:type="dxa"/>
+            </w:tcMar>
+          </w:tcPr>
+          <w:p>
+            <w:r>
+              <w:rPr>
+                <w:rFonts w:ascii="Aptos" w:eastAsia="Aptos" w:hAnsi="Aptos" w:cs="Aptos"/>
+                <w:sz w:val="20"/>
+                <w:szCs w:val="20"/>
+              </w:rPr>
+              <w:t xml:space="preserve"/>
+            </w:r>
+          </w:p>
+        </w:tc>
+      </w:tr>
+      <w:tr>
+        <w:trPr>
+          <w:cantSplit/>
+        </w:trPr>
+        <w:tc>
+          <w:tcPr>
+            <w:tcW w:w="300" w:type="pct"/>
+            <w:tcMar>
+              <w:top w:w="30" w:type="dxa"/>
+              <w:left w:w="80" w:type="dxa"/>
+              <w:bottom w:w="30" w:type="dxa"/>
+              <w:right w:w="80" w:type="dxa"/>
+            </w:tcMar>
+          </w:tcPr>
+          <w:p>
+            <w:r>
+              <w:rPr>
+                <w:rFonts w:ascii="Aptos" w:eastAsia="Aptos" w:hAnsi="Aptos" w:cs="Aptos"/>
+                <w:sz w:val="20"/>
+                <w:szCs w:val="20"/>
+              </w:rPr>
+              <w:t xml:space="preserve">130</w:t>
+            </w:r>
+          </w:p>
+        </w:tc>
+        <w:tc>
+          <w:tcPr>
+            <w:tcW w:w="2350" w:type="pct"/>
+            <w:tcMar>
+              <w:top w:w="30" w:type="dxa"/>
+              <w:left w:w="80" w:type="dxa"/>
+              <w:bottom w:w="30" w:type="dxa"/>
+              <w:right w:w="80" w:type="dxa"/>
+            </w:tcMar>
+          </w:tcPr>
+          <w:p>
+            <w:r>
+              <w:rPr>
+                <w:rFonts w:ascii="Aptos" w:eastAsia="Aptos" w:hAnsi="Aptos" w:cs="Aptos"/>
+                <w:sz w:val="20"/>
+                <w:szCs w:val="20"/>
+              </w:rPr>
+              <w:t xml:space="preserve"/>
+            </w:r>
+          </w:p>
+        </w:tc>
+        <w:tc>
+          <w:tcPr>
+            <w:tcW w:w="750" w:type="pct"/>
+            <w:tcMar>
+              <w:top w:w="30" w:type="dxa"/>
+              <w:left w:w="80" w:type="dxa"/>
+              <w:bottom w:w="30" w:type="dxa"/>
+              <w:right w:w="80" w:type="dxa"/>
+            </w:tcMar>
+          </w:tcPr>
+          <w:p>
+            <w:r>
+              <w:rPr>
+                <w:rFonts w:ascii="Aptos" w:eastAsia="Aptos" w:hAnsi="Aptos" w:cs="Aptos"/>
+                <w:sz w:val="20"/>
+                <w:szCs w:val="20"/>
+              </w:rPr>
+              <w:t xml:space="preserve"/>
+            </w:r>
+          </w:p>
+        </w:tc>
+        <w:tc>
+          <w:tcPr>
+            <w:tcW w:w="1600" w:type="pct"/>
+            <w:tcMar>
+              <w:top w:w="30" w:type="dxa"/>
+              <w:left w:w="80" w:type="dxa"/>
+              <w:bottom w:w="30" w:type="dxa"/>
+              <w:right w:w="80" w:type="dxa"/>
+            </w:tcMar>
+          </w:tcPr>
+          <w:p>
+            <w:r>
+              <w:rPr>
+                <w:rFonts w:ascii="Aptos" w:eastAsia="Aptos" w:hAnsi="Aptos" w:cs="Aptos"/>
+                <w:sz w:val="20"/>
+                <w:szCs w:val="20"/>
+              </w:rPr>
+              <w:t xml:space="preserve"/>
+            </w:r>
+          </w:p>
+        </w:tc>
+      </w:tr>
+      <w:tr>
+        <w:trPr>
+          <w:cantSplit/>
+        </w:trPr>
+        <w:tc>
+          <w:tcPr>
+            <w:tcW w:w="300" w:type="pct"/>
+            <w:tcMar>
+              <w:top w:w="30" w:type="dxa"/>
+              <w:left w:w="80" w:type="dxa"/>
+              <w:bottom w:w="30" w:type="dxa"/>
+              <w:right w:w="80" w:type="dxa"/>
+            </w:tcMar>
+          </w:tcPr>
+          <w:p>
+            <w:r>
+              <w:rPr>
+                <w:rFonts w:ascii="Aptos" w:eastAsia="Aptos" w:hAnsi="Aptos" w:cs="Aptos"/>
+                <w:sz w:val="20"/>
+                <w:szCs w:val="20"/>
+              </w:rPr>
+              <w:t xml:space="preserve">131</w:t>
+            </w:r>
+          </w:p>
+        </w:tc>
+        <w:tc>
+          <w:tcPr>
+            <w:tcW w:w="2350" w:type="pct"/>
+            <w:tcMar>
+              <w:top w:w="30" w:type="dxa"/>
+              <w:left w:w="80" w:type="dxa"/>
+              <w:bottom w:w="30" w:type="dxa"/>
+              <w:right w:w="80" w:type="dxa"/>
+            </w:tcMar>
+          </w:tcPr>
+          <w:p>
+            <w:r>
+              <w:rPr>
+                <w:rFonts w:ascii="Aptos" w:eastAsia="Aptos" w:hAnsi="Aptos" w:cs="Aptos"/>
+                <w:sz w:val="20"/>
+                <w:szCs w:val="20"/>
+              </w:rPr>
+              <w:t xml:space="preserve"/>
+            </w:r>
+          </w:p>
+        </w:tc>
+        <w:tc>
+          <w:tcPr>
+            <w:tcW w:w="750" w:type="pct"/>
+            <w:tcMar>
+              <w:top w:w="30" w:type="dxa"/>
+              <w:left w:w="80" w:type="dxa"/>
+              <w:bottom w:w="30" w:type="dxa"/>
+              <w:right w:w="80" w:type="dxa"/>
+            </w:tcMar>
+          </w:tcPr>
+          <w:p>
+            <w:r>
+              <w:rPr>
+                <w:rFonts w:ascii="Aptos" w:eastAsia="Aptos" w:hAnsi="Aptos" w:cs="Aptos"/>
+                <w:sz w:val="20"/>
+                <w:szCs w:val="20"/>
+              </w:rPr>
+              <w:t xml:space="preserve"/>
+            </w:r>
+          </w:p>
+        </w:tc>
+        <w:tc>
+          <w:tcPr>
+            <w:tcW w:w="1600" w:type="pct"/>
+            <w:tcMar>
+              <w:top w:w="30" w:type="dxa"/>
+              <w:left w:w="80" w:type="dxa"/>
+              <w:bottom w:w="30" w:type="dxa"/>
+              <w:right w:w="80" w:type="dxa"/>
+            </w:tcMar>
+          </w:tcPr>
+          <w:p>
+            <w:r>
+              <w:rPr>
+                <w:rFonts w:ascii="Aptos" w:eastAsia="Aptos" w:hAnsi="Aptos" w:cs="Aptos"/>
+                <w:sz w:val="20"/>
+                <w:szCs w:val="20"/>
+              </w:rPr>
+              <w:t xml:space="preserve"/>
+            </w:r>
+          </w:p>
+        </w:tc>
+      </w:tr>
+      <w:tr>
+        <w:trPr>
+          <w:cantSplit/>
+        </w:trPr>
+        <w:tc>
+          <w:tcPr>
+            <w:tcW w:w="300" w:type="pct"/>
+            <w:tcMar>
+              <w:top w:w="30" w:type="dxa"/>
+              <w:left w:w="80" w:type="dxa"/>
+              <w:bottom w:w="30" w:type="dxa"/>
+              <w:right w:w="80" w:type="dxa"/>
+            </w:tcMar>
+          </w:tcPr>
+          <w:p>
+            <w:r>
+              <w:rPr>
+                <w:rFonts w:ascii="Aptos" w:eastAsia="Aptos" w:hAnsi="Aptos" w:cs="Aptos"/>
+                <w:sz w:val="20"/>
+                <w:szCs w:val="20"/>
+              </w:rPr>
+              <w:t xml:space="preserve">132</w:t>
+            </w:r>
+          </w:p>
+        </w:tc>
+        <w:tc>
+          <w:tcPr>
+            <w:tcW w:w="2350" w:type="pct"/>
+            <w:tcMar>
+              <w:top w:w="30" w:type="dxa"/>
+              <w:left w:w="80" w:type="dxa"/>
+              <w:bottom w:w="30" w:type="dxa"/>
+              <w:right w:w="80" w:type="dxa"/>
+            </w:tcMar>
+          </w:tcPr>
+          <w:p>
+            <w:r>
+              <w:rPr>
+                <w:rFonts w:ascii="Aptos" w:eastAsia="Aptos" w:hAnsi="Aptos" w:cs="Aptos"/>
+                <w:sz w:val="20"/>
+                <w:szCs w:val="20"/>
+              </w:rPr>
+              <w:t xml:space="preserve"/>
+            </w:r>
+          </w:p>
+        </w:tc>
+        <w:tc>
+          <w:tcPr>
+            <w:tcW w:w="750" w:type="pct"/>
+            <w:tcMar>
+              <w:top w:w="30" w:type="dxa"/>
+              <w:left w:w="80" w:type="dxa"/>
+              <w:bottom w:w="30" w:type="dxa"/>
+              <w:right w:w="80" w:type="dxa"/>
+            </w:tcMar>
+          </w:tcPr>
+          <w:p>
+            <w:r>
+              <w:rPr>
+                <w:rFonts w:ascii="Aptos" w:eastAsia="Aptos" w:hAnsi="Aptos" w:cs="Aptos"/>
+                <w:sz w:val="20"/>
+                <w:szCs w:val="20"/>
+              </w:rPr>
+              <w:t xml:space="preserve"/>
+            </w:r>
+          </w:p>
+        </w:tc>
+        <w:tc>
+          <w:tcPr>
+            <w:tcW w:w="1600" w:type="pct"/>
+            <w:tcMar>
+              <w:top w:w="30" w:type="dxa"/>
+              <w:left w:w="80" w:type="dxa"/>
+              <w:bottom w:w="30" w:type="dxa"/>
+              <w:right w:w="80" w:type="dxa"/>
+            </w:tcMar>
+          </w:tcPr>
+          <w:p>
+            <w:r>
+              <w:rPr>
+                <w:rFonts w:ascii="Aptos" w:eastAsia="Aptos" w:hAnsi="Aptos" w:cs="Aptos"/>
+                <w:sz w:val="20"/>
+                <w:szCs w:val="20"/>
+              </w:rPr>
+              <w:t xml:space="preserve"/>
+            </w:r>
+          </w:p>
+        </w:tc>
+      </w:tr>
+      <w:tr>
+        <w:trPr>
+          <w:cantSplit/>
+        </w:trPr>
+        <w:tc>
+          <w:tcPr>
+            <w:tcW w:w="300" w:type="pct"/>
+            <w:tcMar>
+              <w:top w:w="30" w:type="dxa"/>
+              <w:left w:w="80" w:type="dxa"/>
+              <w:bottom w:w="30" w:type="dxa"/>
+              <w:right w:w="80" w:type="dxa"/>
+            </w:tcMar>
+          </w:tcPr>
+          <w:p>
+            <w:r>
+              <w:rPr>
+                <w:rFonts w:ascii="Aptos" w:eastAsia="Aptos" w:hAnsi="Aptos" w:cs="Aptos"/>
+                <w:sz w:val="20"/>
+                <w:szCs w:val="20"/>
+              </w:rPr>
+              <w:t xml:space="preserve">133</w:t>
+            </w:r>
+          </w:p>
+        </w:tc>
+        <w:tc>
+          <w:tcPr>
+            <w:tcW w:w="2350" w:type="pct"/>
+            <w:tcMar>
+              <w:top w:w="30" w:type="dxa"/>
+              <w:left w:w="80" w:type="dxa"/>
+              <w:bottom w:w="30" w:type="dxa"/>
+              <w:right w:w="80" w:type="dxa"/>
+            </w:tcMar>
+          </w:tcPr>
+          <w:p>
+            <w:r>
+              <w:rPr>
+                <w:rFonts w:ascii="Aptos" w:eastAsia="Aptos" w:hAnsi="Aptos" w:cs="Aptos"/>
+                <w:sz w:val="20"/>
+                <w:szCs w:val="20"/>
+              </w:rPr>
+              <w:t xml:space="preserve"/>
+            </w:r>
+          </w:p>
+        </w:tc>
+        <w:tc>
+          <w:tcPr>
+            <w:tcW w:w="750" w:type="pct"/>
+            <w:tcMar>
+              <w:top w:w="30" w:type="dxa"/>
+              <w:left w:w="80" w:type="dxa"/>
+              <w:bottom w:w="30" w:type="dxa"/>
+              <w:right w:w="80" w:type="dxa"/>
+            </w:tcMar>
+          </w:tcPr>
+          <w:p>
+            <w:r>
+              <w:rPr>
+                <w:rFonts w:ascii="Aptos" w:eastAsia="Aptos" w:hAnsi="Aptos" w:cs="Aptos"/>
+                <w:sz w:val="20"/>
+                <w:szCs w:val="20"/>
+              </w:rPr>
+              <w:t xml:space="preserve"/>
+            </w:r>
+          </w:p>
+        </w:tc>
+        <w:tc>
+          <w:tcPr>
+            <w:tcW w:w="1600" w:type="pct"/>
+            <w:tcMar>
+              <w:top w:w="30" w:type="dxa"/>
+              <w:left w:w="80" w:type="dxa"/>
+              <w:bottom w:w="30" w:type="dxa"/>
+              <w:right w:w="80" w:type="dxa"/>
+            </w:tcMar>
+          </w:tcPr>
+          <w:p>
+            <w:r>
+              <w:rPr>
+                <w:rFonts w:ascii="Aptos" w:eastAsia="Aptos" w:hAnsi="Aptos" w:cs="Aptos"/>
+                <w:sz w:val="20"/>
+                <w:szCs w:val="20"/>
+              </w:rPr>
+              <w:t xml:space="preserve"/>
+            </w:r>
+          </w:p>
+        </w:tc>
+      </w:tr>
+      <w:tr>
+        <w:trPr>
+          <w:cantSplit/>
+        </w:trPr>
+        <w:tc>
+          <w:tcPr>
+            <w:tcW w:w="300" w:type="pct"/>
+            <w:tcMar>
+              <w:top w:w="30" w:type="dxa"/>
+              <w:left w:w="80" w:type="dxa"/>
+              <w:bottom w:w="30" w:type="dxa"/>
+              <w:right w:w="80" w:type="dxa"/>
+            </w:tcMar>
+          </w:tcPr>
+          <w:p>
+            <w:r>
+              <w:rPr>
+                <w:rFonts w:ascii="Aptos" w:eastAsia="Aptos" w:hAnsi="Aptos" w:cs="Aptos"/>
+                <w:sz w:val="20"/>
+                <w:szCs w:val="20"/>
+              </w:rPr>
+              <w:t xml:space="preserve">134</w:t>
+            </w:r>
+          </w:p>
+        </w:tc>
+        <w:tc>
+          <w:tcPr>
+            <w:tcW w:w="2350" w:type="pct"/>
+            <w:tcMar>
+              <w:top w:w="30" w:type="dxa"/>
+              <w:left w:w="80" w:type="dxa"/>
+              <w:bottom w:w="30" w:type="dxa"/>
+              <w:right w:w="80" w:type="dxa"/>
+            </w:tcMar>
+          </w:tcPr>
+          <w:p>
+            <w:r>
+              <w:rPr>
+                <w:rFonts w:ascii="Aptos" w:eastAsia="Aptos" w:hAnsi="Aptos" w:cs="Aptos"/>
+                <w:sz w:val="20"/>
+                <w:szCs w:val="20"/>
+              </w:rPr>
+              <w:t xml:space="preserve"/>
+            </w:r>
+          </w:p>
+        </w:tc>
+        <w:tc>
+          <w:tcPr>
+            <w:tcW w:w="750" w:type="pct"/>
+            <w:tcMar>
+              <w:top w:w="30" w:type="dxa"/>
+              <w:left w:w="80" w:type="dxa"/>
+              <w:bottom w:w="30" w:type="dxa"/>
+              <w:right w:w="80" w:type="dxa"/>
+            </w:tcMar>
+          </w:tcPr>
+          <w:p>
+            <w:r>
+              <w:rPr>
+                <w:rFonts w:ascii="Aptos" w:eastAsia="Aptos" w:hAnsi="Aptos" w:cs="Aptos"/>
+                <w:sz w:val="20"/>
+                <w:szCs w:val="20"/>
+              </w:rPr>
+              <w:t xml:space="preserve"/>
+            </w:r>
+          </w:p>
+        </w:tc>
+        <w:tc>
+          <w:tcPr>
+            <w:tcW w:w="1600" w:type="pct"/>
+            <w:tcMar>
+              <w:top w:w="30" w:type="dxa"/>
+              <w:left w:w="80" w:type="dxa"/>
+              <w:bottom w:w="30" w:type="dxa"/>
+              <w:right w:w="80" w:type="dxa"/>
+            </w:tcMar>
+          </w:tcPr>
+          <w:p>
+            <w:r>
+              <w:rPr>
+                <w:rFonts w:ascii="Aptos" w:eastAsia="Aptos" w:hAnsi="Aptos" w:cs="Aptos"/>
+                <w:sz w:val="20"/>
+                <w:szCs w:val="20"/>
+              </w:rPr>
+              <w:t xml:space="preserve"/>
+            </w:r>
+          </w:p>
+        </w:tc>
+      </w:tr>
+      <w:tr>
+        <w:trPr>
+          <w:cantSplit/>
+        </w:trPr>
+        <w:tc>
+          <w:tcPr>
+            <w:tcW w:w="300" w:type="pct"/>
+            <w:tcMar>
+              <w:top w:w="30" w:type="dxa"/>
+              <w:left w:w="80" w:type="dxa"/>
+              <w:bottom w:w="30" w:type="dxa"/>
+              <w:right w:w="80" w:type="dxa"/>
+            </w:tcMar>
+          </w:tcPr>
+          <w:p>
+            <w:r>
+              <w:rPr>
+                <w:rFonts w:ascii="Aptos" w:eastAsia="Aptos" w:hAnsi="Aptos" w:cs="Aptos"/>
+                <w:sz w:val="20"/>
+                <w:szCs w:val="20"/>
+              </w:rPr>
+              <w:t xml:space="preserve">135</w:t>
+            </w:r>
+          </w:p>
+        </w:tc>
+        <w:tc>
+          <w:tcPr>
+            <w:tcW w:w="2350" w:type="pct"/>
+            <w:tcMar>
+              <w:top w:w="30" w:type="dxa"/>
+              <w:left w:w="80" w:type="dxa"/>
+              <w:bottom w:w="30" w:type="dxa"/>
+              <w:right w:w="80" w:type="dxa"/>
+            </w:tcMar>
+          </w:tcPr>
+          <w:p>
+            <w:r>
+              <w:rPr>
+                <w:rFonts w:ascii="Aptos" w:eastAsia="Aptos" w:hAnsi="Aptos" w:cs="Aptos"/>
+                <w:sz w:val="20"/>
+                <w:szCs w:val="20"/>
+              </w:rPr>
+              <w:t xml:space="preserve"/>
+            </w:r>
+          </w:p>
+        </w:tc>
+        <w:tc>
+          <w:tcPr>
+            <w:tcW w:w="750" w:type="pct"/>
+            <w:tcMar>
+              <w:top w:w="30" w:type="dxa"/>
+              <w:left w:w="80" w:type="dxa"/>
+              <w:bottom w:w="30" w:type="dxa"/>
+              <w:right w:w="80" w:type="dxa"/>
+            </w:tcMar>
+          </w:tcPr>
+          <w:p>
+            <w:r>
+              <w:rPr>
+                <w:rFonts w:ascii="Aptos" w:eastAsia="Aptos" w:hAnsi="Aptos" w:cs="Aptos"/>
+                <w:sz w:val="20"/>
+                <w:szCs w:val="20"/>
+              </w:rPr>
+              <w:t xml:space="preserve"/>
+            </w:r>
+          </w:p>
+        </w:tc>
+        <w:tc>
+          <w:tcPr>
+            <w:tcW w:w="1600" w:type="pct"/>
+            <w:tcMar>
+              <w:top w:w="30" w:type="dxa"/>
+              <w:left w:w="80" w:type="dxa"/>
+              <w:bottom w:w="30" w:type="dxa"/>
+              <w:right w:w="80" w:type="dxa"/>
+            </w:tcMar>
+          </w:tcPr>
+          <w:p>
+            <w:r>
+              <w:rPr>
+                <w:rFonts w:ascii="Aptos" w:eastAsia="Aptos" w:hAnsi="Aptos" w:cs="Aptos"/>
+                <w:sz w:val="20"/>
+                <w:szCs w:val="20"/>
+              </w:rPr>
+              <w:t xml:space="preserve"/>
+            </w:r>
+          </w:p>
+        </w:tc>
+      </w:tr>
+      <w:tr>
+        <w:trPr>
+          <w:cantSplit/>
+        </w:trPr>
+        <w:tc>
+          <w:tcPr>
+            <w:tcW w:w="300" w:type="pct"/>
+            <w:tcMar>
+              <w:top w:w="30" w:type="dxa"/>
+              <w:left w:w="80" w:type="dxa"/>
+              <w:bottom w:w="30" w:type="dxa"/>
+              <w:right w:w="80" w:type="dxa"/>
+            </w:tcMar>
+          </w:tcPr>
+          <w:p>
+            <w:r>
+              <w:rPr>
+                <w:rFonts w:ascii="Aptos" w:eastAsia="Aptos" w:hAnsi="Aptos" w:cs="Aptos"/>
+                <w:sz w:val="20"/>
+                <w:szCs w:val="20"/>
+              </w:rPr>
+              <w:t xml:space="preserve">136</w:t>
+            </w:r>
+          </w:p>
+        </w:tc>
+        <w:tc>
+          <w:tcPr>
+            <w:tcW w:w="2350" w:type="pct"/>
+            <w:tcMar>
+              <w:top w:w="30" w:type="dxa"/>
+              <w:left w:w="80" w:type="dxa"/>
+              <w:bottom w:w="30" w:type="dxa"/>
+              <w:right w:w="80" w:type="dxa"/>
+            </w:tcMar>
+          </w:tcPr>
+          <w:p>
+            <w:r>
+              <w:rPr>
+                <w:rFonts w:ascii="Aptos" w:eastAsia="Aptos" w:hAnsi="Aptos" w:cs="Aptos"/>
+                <w:sz w:val="20"/>
+                <w:szCs w:val="20"/>
+              </w:rPr>
+              <w:t xml:space="preserve"/>
+            </w:r>
+          </w:p>
+        </w:tc>
+        <w:tc>
+          <w:tcPr>
+            <w:tcW w:w="750" w:type="pct"/>
+            <w:tcMar>
+              <w:top w:w="30" w:type="dxa"/>
+              <w:left w:w="80" w:type="dxa"/>
+              <w:bottom w:w="30" w:type="dxa"/>
+              <w:right w:w="80" w:type="dxa"/>
+            </w:tcMar>
+          </w:tcPr>
+          <w:p>
+            <w:r>
+              <w:rPr>
+                <w:rFonts w:ascii="Aptos" w:eastAsia="Aptos" w:hAnsi="Aptos" w:cs="Aptos"/>
+                <w:sz w:val="20"/>
+                <w:szCs w:val="20"/>
+              </w:rPr>
+              <w:t xml:space="preserve"/>
+            </w:r>
+          </w:p>
+        </w:tc>
+        <w:tc>
+          <w:tcPr>
+            <w:tcW w:w="1600" w:type="pct"/>
+            <w:tcMar>
+              <w:top w:w="30" w:type="dxa"/>
+              <w:left w:w="80" w:type="dxa"/>
+              <w:bottom w:w="30" w:type="dxa"/>
+              <w:right w:w="80" w:type="dxa"/>
+            </w:tcMar>
+          </w:tcPr>
+          <w:p>
+            <w:r>
+              <w:rPr>
+                <w:rFonts w:ascii="Aptos" w:eastAsia="Aptos" w:hAnsi="Aptos" w:cs="Aptos"/>
+                <w:sz w:val="20"/>
+                <w:szCs w:val="20"/>
+              </w:rPr>
+              <w:t xml:space="preserve"/>
+            </w:r>
+          </w:p>
+        </w:tc>
+      </w:tr>
+      <w:tr>
+        <w:trPr>
+          <w:cantSplit/>
+        </w:trPr>
+        <w:tc>
+          <w:tcPr>
+            <w:tcW w:w="300" w:type="pct"/>
+            <w:tcMar>
+              <w:top w:w="30" w:type="dxa"/>
+              <w:left w:w="80" w:type="dxa"/>
+              <w:bottom w:w="30" w:type="dxa"/>
+              <w:right w:w="80" w:type="dxa"/>
+            </w:tcMar>
+          </w:tcPr>
+          <w:p>
+            <w:r>
+              <w:rPr>
+                <w:rFonts w:ascii="Aptos" w:eastAsia="Aptos" w:hAnsi="Aptos" w:cs="Aptos"/>
+                <w:sz w:val="20"/>
+                <w:szCs w:val="20"/>
+              </w:rPr>
+              <w:t xml:space="preserve">137</w:t>
+            </w:r>
+          </w:p>
+        </w:tc>
+        <w:tc>
+          <w:tcPr>
+            <w:tcW w:w="2350" w:type="pct"/>
+            <w:tcMar>
+              <w:top w:w="30" w:type="dxa"/>
+              <w:left w:w="80" w:type="dxa"/>
+              <w:bottom w:w="30" w:type="dxa"/>
+              <w:right w:w="80" w:type="dxa"/>
+            </w:tcMar>
+          </w:tcPr>
+          <w:p>
+            <w:r>
+              <w:rPr>
+                <w:rFonts w:ascii="Aptos" w:eastAsia="Aptos" w:hAnsi="Aptos" w:cs="Aptos"/>
+                <w:sz w:val="20"/>
+                <w:szCs w:val="20"/>
+              </w:rPr>
+              <w:t xml:space="preserve"/>
+            </w:r>
+          </w:p>
+        </w:tc>
+        <w:tc>
+          <w:tcPr>
+            <w:tcW w:w="750" w:type="pct"/>
+            <w:tcMar>
+              <w:top w:w="30" w:type="dxa"/>
+              <w:left w:w="80" w:type="dxa"/>
+              <w:bottom w:w="30" w:type="dxa"/>
+              <w:right w:w="80" w:type="dxa"/>
+            </w:tcMar>
+          </w:tcPr>
+          <w:p>
+            <w:r>
+              <w:rPr>
+                <w:rFonts w:ascii="Aptos" w:eastAsia="Aptos" w:hAnsi="Aptos" w:cs="Aptos"/>
+                <w:sz w:val="20"/>
+                <w:szCs w:val="20"/>
+              </w:rPr>
+              <w:t xml:space="preserve"/>
+            </w:r>
+          </w:p>
+        </w:tc>
+        <w:tc>
+          <w:tcPr>
+            <w:tcW w:w="1600" w:type="pct"/>
+            <w:tcMar>
+              <w:top w:w="30" w:type="dxa"/>
+              <w:left w:w="80" w:type="dxa"/>
+              <w:bottom w:w="30" w:type="dxa"/>
+              <w:right w:w="80" w:type="dxa"/>
+            </w:tcMar>
+          </w:tcPr>
+          <w:p>
+            <w:r>
+              <w:rPr>
+                <w:rFonts w:ascii="Aptos" w:eastAsia="Aptos" w:hAnsi="Aptos" w:cs="Aptos"/>
+                <w:sz w:val="20"/>
+                <w:szCs w:val="20"/>
+              </w:rPr>
+              <w:t xml:space="preserve"/>
+            </w:r>
+          </w:p>
+        </w:tc>
+      </w:tr>
+      <w:tr>
+        <w:trPr>
+          <w:cantSplit/>
+        </w:trPr>
+        <w:tc>
+          <w:tcPr>
+            <w:tcW w:w="300" w:type="pct"/>
+            <w:tcMar>
+              <w:top w:w="30" w:type="dxa"/>
+              <w:left w:w="80" w:type="dxa"/>
+              <w:bottom w:w="30" w:type="dxa"/>
+              <w:right w:w="80" w:type="dxa"/>
+            </w:tcMar>
+          </w:tcPr>
+          <w:p>
+            <w:r>
+              <w:rPr>
+                <w:rFonts w:ascii="Aptos" w:eastAsia="Aptos" w:hAnsi="Aptos" w:cs="Aptos"/>
+                <w:sz w:val="20"/>
+                <w:szCs w:val="20"/>
+              </w:rPr>
+              <w:t xml:space="preserve">138</w:t>
+            </w:r>
+          </w:p>
+        </w:tc>
+        <w:tc>
+          <w:tcPr>
+            <w:tcW w:w="2350" w:type="pct"/>
+            <w:tcMar>
+              <w:top w:w="30" w:type="dxa"/>
+              <w:left w:w="80" w:type="dxa"/>
+              <w:bottom w:w="30" w:type="dxa"/>
+              <w:right w:w="80" w:type="dxa"/>
+            </w:tcMar>
+          </w:tcPr>
+          <w:p>
+            <w:r>
+              <w:rPr>
+                <w:rFonts w:ascii="Aptos" w:eastAsia="Aptos" w:hAnsi="Aptos" w:cs="Aptos"/>
+                <w:sz w:val="20"/>
+                <w:szCs w:val="20"/>
+              </w:rPr>
+              <w:t xml:space="preserve"/>
+            </w:r>
+          </w:p>
+        </w:tc>
+        <w:tc>
+          <w:tcPr>
+            <w:tcW w:w="750" w:type="pct"/>
+            <w:tcMar>
+              <w:top w:w="30" w:type="dxa"/>
+              <w:left w:w="80" w:type="dxa"/>
+              <w:bottom w:w="30" w:type="dxa"/>
+              <w:right w:w="80" w:type="dxa"/>
+            </w:tcMar>
+          </w:tcPr>
+          <w:p>
+            <w:r>
+              <w:rPr>
+                <w:rFonts w:ascii="Aptos" w:eastAsia="Aptos" w:hAnsi="Aptos" w:cs="Aptos"/>
+                <w:sz w:val="20"/>
+                <w:szCs w:val="20"/>
+              </w:rPr>
+              <w:t xml:space="preserve"/>
+            </w:r>
+          </w:p>
+        </w:tc>
+        <w:tc>
+          <w:tcPr>
+            <w:tcW w:w="1600" w:type="pct"/>
+            <w:tcMar>
+              <w:top w:w="30" w:type="dxa"/>
+              <w:left w:w="80" w:type="dxa"/>
+              <w:bottom w:w="30" w:type="dxa"/>
+              <w:right w:w="80" w:type="dxa"/>
+            </w:tcMar>
+          </w:tcPr>
+          <w:p>
+            <w:r>
+              <w:rPr>
+                <w:rFonts w:ascii="Aptos" w:eastAsia="Aptos" w:hAnsi="Aptos" w:cs="Aptos"/>
+                <w:sz w:val="20"/>
+                <w:szCs w:val="20"/>
+              </w:rPr>
+              <w:t xml:space="preserve"/>
+            </w:r>
+          </w:p>
+        </w:tc>
+      </w:tr>
+      <w:tr>
+        <w:trPr>
+          <w:cantSplit/>
+        </w:trPr>
+        <w:tc>
+          <w:tcPr>
+            <w:tcW w:w="300" w:type="pct"/>
+            <w:tcMar>
+              <w:top w:w="30" w:type="dxa"/>
+              <w:left w:w="80" w:type="dxa"/>
+              <w:bottom w:w="30" w:type="dxa"/>
+              <w:right w:w="80" w:type="dxa"/>
+            </w:tcMar>
+          </w:tcPr>
+          <w:p>
+            <w:r>
+              <w:rPr>
+                <w:rFonts w:ascii="Aptos" w:eastAsia="Aptos" w:hAnsi="Aptos" w:cs="Aptos"/>
+                <w:sz w:val="20"/>
+                <w:szCs w:val="20"/>
+              </w:rPr>
+              <w:t xml:space="preserve">139</w:t>
+            </w:r>
+          </w:p>
+        </w:tc>
+        <w:tc>
+          <w:tcPr>
+            <w:tcW w:w="2350" w:type="pct"/>
+            <w:tcMar>
+              <w:top w:w="30" w:type="dxa"/>
+              <w:left w:w="80" w:type="dxa"/>
+              <w:bottom w:w="30" w:type="dxa"/>
+              <w:right w:w="80" w:type="dxa"/>
+            </w:tcMar>
+          </w:tcPr>
+          <w:p>
+            <w:r>
+              <w:rPr>
+                <w:rFonts w:ascii="Aptos" w:eastAsia="Aptos" w:hAnsi="Aptos" w:cs="Aptos"/>
+                <w:sz w:val="20"/>
+                <w:szCs w:val="20"/>
+              </w:rPr>
+              <w:t xml:space="preserve"/>
+            </w:r>
+          </w:p>
+        </w:tc>
+        <w:tc>
+          <w:tcPr>
+            <w:tcW w:w="750" w:type="pct"/>
+            <w:tcMar>
+              <w:top w:w="30" w:type="dxa"/>
+              <w:left w:w="80" w:type="dxa"/>
+              <w:bottom w:w="30" w:type="dxa"/>
+              <w:right w:w="80" w:type="dxa"/>
+            </w:tcMar>
+          </w:tcPr>
+          <w:p>
+            <w:r>
+              <w:rPr>
+                <w:rFonts w:ascii="Aptos" w:eastAsia="Aptos" w:hAnsi="Aptos" w:cs="Aptos"/>
+                <w:sz w:val="20"/>
+                <w:szCs w:val="20"/>
+              </w:rPr>
+              <w:t xml:space="preserve"/>
+            </w:r>
+          </w:p>
+        </w:tc>
+        <w:tc>
+          <w:tcPr>
+            <w:tcW w:w="1600" w:type="pct"/>
+            <w:tcMar>
+              <w:top w:w="30" w:type="dxa"/>
+              <w:left w:w="80" w:type="dxa"/>
+              <w:bottom w:w="30" w:type="dxa"/>
+              <w:right w:w="80" w:type="dxa"/>
+            </w:tcMar>
+          </w:tcPr>
+          <w:p>
+            <w:r>
+              <w:rPr>
+                <w:rFonts w:ascii="Aptos" w:eastAsia="Aptos" w:hAnsi="Aptos" w:cs="Aptos"/>
+                <w:sz w:val="20"/>
+                <w:szCs w:val="20"/>
+              </w:rPr>
+              <w:t xml:space="preserve"/>
+            </w:r>
+          </w:p>
+        </w:tc>
+      </w:tr>
+      <w:tr>
+        <w:trPr>
+          <w:cantSplit/>
+        </w:trPr>
+        <w:tc>
+          <w:tcPr>
+            <w:tcW w:w="300" w:type="pct"/>
+            <w:tcMar>
+              <w:top w:w="30" w:type="dxa"/>
+              <w:left w:w="80" w:type="dxa"/>
+              <w:bottom w:w="30" w:type="dxa"/>
+              <w:right w:w="80" w:type="dxa"/>
+            </w:tcMar>
+          </w:tcPr>
+          <w:p>
+            <w:r>
+              <w:rPr>
+                <w:rFonts w:ascii="Aptos" w:eastAsia="Aptos" w:hAnsi="Aptos" w:cs="Aptos"/>
+                <w:sz w:val="20"/>
+                <w:szCs w:val="20"/>
+              </w:rPr>
+              <w:t xml:space="preserve">140</w:t>
+            </w:r>
+          </w:p>
+        </w:tc>
+        <w:tc>
+          <w:tcPr>
+            <w:tcW w:w="2350" w:type="pct"/>
+            <w:tcMar>
+              <w:top w:w="30" w:type="dxa"/>
+              <w:left w:w="80" w:type="dxa"/>
+              <w:bottom w:w="30" w:type="dxa"/>
+              <w:right w:w="80" w:type="dxa"/>
+            </w:tcMar>
+          </w:tcPr>
+          <w:p>
+            <w:r>
+              <w:rPr>
+                <w:rFonts w:ascii="Aptos" w:eastAsia="Aptos" w:hAnsi="Aptos" w:cs="Aptos"/>
+                <w:sz w:val="20"/>
+                <w:szCs w:val="20"/>
+              </w:rPr>
+              <w:t xml:space="preserve"/>
+            </w:r>
+          </w:p>
+        </w:tc>
+        <w:tc>
+          <w:tcPr>
+            <w:tcW w:w="750" w:type="pct"/>
+            <w:tcMar>
+              <w:top w:w="30" w:type="dxa"/>
+              <w:left w:w="80" w:type="dxa"/>
+              <w:bottom w:w="30" w:type="dxa"/>
+              <w:right w:w="80" w:type="dxa"/>
+            </w:tcMar>
+          </w:tcPr>
+          <w:p>
+            <w:r>
+              <w:rPr>
+                <w:rFonts w:ascii="Aptos" w:eastAsia="Aptos" w:hAnsi="Aptos" w:cs="Aptos"/>
+                <w:sz w:val="20"/>
+                <w:szCs w:val="20"/>
+              </w:rPr>
+              <w:t xml:space="preserve"/>
+            </w:r>
+          </w:p>
+        </w:tc>
+        <w:tc>
+          <w:tcPr>
+            <w:tcW w:w="1600" w:type="pct"/>
+            <w:tcMar>
+              <w:top w:w="30" w:type="dxa"/>
+              <w:left w:w="80" w:type="dxa"/>
+              <w:bottom w:w="30" w:type="dxa"/>
+              <w:right w:w="80" w:type="dxa"/>
+            </w:tcMar>
+          </w:tcPr>
+          <w:p>
+            <w:r>
+              <w:rPr>
+                <w:rFonts w:ascii="Aptos" w:eastAsia="Aptos" w:hAnsi="Aptos" w:cs="Aptos"/>
+                <w:sz w:val="20"/>
+                <w:szCs w:val="20"/>
+              </w:rPr>
+              <w:t xml:space="preserve"/>
+            </w:r>
+          </w:p>
+        </w:tc>
+      </w:tr>
+      <w:tr>
+        <w:trPr>
+          <w:cantSplit/>
+        </w:trPr>
+        <w:tc>
+          <w:tcPr>
+            <w:tcW w:w="300" w:type="pct"/>
+            <w:tcMar>
+              <w:top w:w="30" w:type="dxa"/>
+              <w:left w:w="80" w:type="dxa"/>
+              <w:bottom w:w="30" w:type="dxa"/>
+              <w:right w:w="80" w:type="dxa"/>
+            </w:tcMar>
+          </w:tcPr>
+          <w:p>
+            <w:r>
+              <w:rPr>
+                <w:rFonts w:ascii="Aptos" w:eastAsia="Aptos" w:hAnsi="Aptos" w:cs="Aptos"/>
+                <w:sz w:val="20"/>
+                <w:szCs w:val="20"/>
+              </w:rPr>
+              <w:t xml:space="preserve">141</w:t>
+            </w:r>
+          </w:p>
+        </w:tc>
+        <w:tc>
+          <w:tcPr>
+            <w:tcW w:w="2350" w:type="pct"/>
+            <w:tcMar>
+              <w:top w:w="30" w:type="dxa"/>
+              <w:left w:w="80" w:type="dxa"/>
+              <w:bottom w:w="30" w:type="dxa"/>
+              <w:right w:w="80" w:type="dxa"/>
+            </w:tcMar>
+          </w:tcPr>
+          <w:p>
+            <w:r>
+              <w:rPr>
+                <w:rFonts w:ascii="Aptos" w:eastAsia="Aptos" w:hAnsi="Aptos" w:cs="Aptos"/>
+                <w:sz w:val="20"/>
+                <w:szCs w:val="20"/>
+              </w:rPr>
+              <w:t xml:space="preserve"/>
+            </w:r>
+          </w:p>
+        </w:tc>
+        <w:tc>
+          <w:tcPr>
+            <w:tcW w:w="750" w:type="pct"/>
+            <w:tcMar>
+              <w:top w:w="30" w:type="dxa"/>
+              <w:left w:w="80" w:type="dxa"/>
+              <w:bottom w:w="30" w:type="dxa"/>
+              <w:right w:w="80" w:type="dxa"/>
+            </w:tcMar>
+          </w:tcPr>
+          <w:p>
+            <w:r>
+              <w:rPr>
+                <w:rFonts w:ascii="Aptos" w:eastAsia="Aptos" w:hAnsi="Aptos" w:cs="Aptos"/>
+                <w:sz w:val="20"/>
+                <w:szCs w:val="20"/>
+              </w:rPr>
+              <w:t xml:space="preserve"/>
+            </w:r>
+          </w:p>
+        </w:tc>
+        <w:tc>
+          <w:tcPr>
+            <w:tcW w:w="1600" w:type="pct"/>
+            <w:tcMar>
+              <w:top w:w="30" w:type="dxa"/>
+              <w:left w:w="80" w:type="dxa"/>
+              <w:bottom w:w="30" w:type="dxa"/>
+              <w:right w:w="80" w:type="dxa"/>
+            </w:tcMar>
+          </w:tcPr>
+          <w:p>
+            <w:r>
+              <w:rPr>
+                <w:rFonts w:ascii="Aptos" w:eastAsia="Aptos" w:hAnsi="Aptos" w:cs="Aptos"/>
+                <w:sz w:val="20"/>
+                <w:szCs w:val="20"/>
+              </w:rPr>
+              <w:t xml:space="preserve"/>
+            </w:r>
+          </w:p>
+        </w:tc>
+      </w:tr>
+      <w:tr>
+        <w:trPr>
+          <w:cantSplit/>
+        </w:trPr>
+        <w:tc>
+          <w:tcPr>
+            <w:tcW w:w="300" w:type="pct"/>
+            <w:tcMar>
+              <w:top w:w="30" w:type="dxa"/>
+              <w:left w:w="80" w:type="dxa"/>
+              <w:bottom w:w="30" w:type="dxa"/>
+              <w:right w:w="80" w:type="dxa"/>
+            </w:tcMar>
+          </w:tcPr>
+          <w:p>
+            <w:r>
+              <w:rPr>
+                <w:rFonts w:ascii="Aptos" w:eastAsia="Aptos" w:hAnsi="Aptos" w:cs="Aptos"/>
+                <w:sz w:val="20"/>
+                <w:szCs w:val="20"/>
+              </w:rPr>
+              <w:t xml:space="preserve">142</w:t>
+            </w:r>
+          </w:p>
+        </w:tc>
+        <w:tc>
+          <w:tcPr>
+            <w:tcW w:w="2350" w:type="pct"/>
+            <w:tcMar>
+              <w:top w:w="30" w:type="dxa"/>
+              <w:left w:w="80" w:type="dxa"/>
+              <w:bottom w:w="30" w:type="dxa"/>
+              <w:right w:w="80" w:type="dxa"/>
+            </w:tcMar>
+          </w:tcPr>
+          <w:p>
+            <w:r>
+              <w:rPr>
+                <w:rFonts w:ascii="Aptos" w:eastAsia="Aptos" w:hAnsi="Aptos" w:cs="Aptos"/>
+                <w:sz w:val="20"/>
+                <w:szCs w:val="20"/>
+              </w:rPr>
+              <w:t xml:space="preserve"/>
+            </w:r>
+          </w:p>
+        </w:tc>
+        <w:tc>
+          <w:tcPr>
+            <w:tcW w:w="750" w:type="pct"/>
+            <w:tcMar>
+              <w:top w:w="30" w:type="dxa"/>
+              <w:left w:w="80" w:type="dxa"/>
+              <w:bottom w:w="30" w:type="dxa"/>
+              <w:right w:w="80" w:type="dxa"/>
+            </w:tcMar>
+          </w:tcPr>
+          <w:p>
+            <w:r>
+              <w:rPr>
+                <w:rFonts w:ascii="Aptos" w:eastAsia="Aptos" w:hAnsi="Aptos" w:cs="Aptos"/>
+                <w:sz w:val="20"/>
+                <w:szCs w:val="20"/>
+              </w:rPr>
+              <w:t xml:space="preserve"/>
+            </w:r>
+          </w:p>
+        </w:tc>
+        <w:tc>
+          <w:tcPr>
+            <w:tcW w:w="1600" w:type="pct"/>
+            <w:tcMar>
+              <w:top w:w="30" w:type="dxa"/>
+              <w:left w:w="80" w:type="dxa"/>
+              <w:bottom w:w="30" w:type="dxa"/>
+              <w:right w:w="80" w:type="dxa"/>
+            </w:tcMar>
+          </w:tcPr>
+          <w:p>
+            <w:r>
+              <w:rPr>
+                <w:rFonts w:ascii="Aptos" w:eastAsia="Aptos" w:hAnsi="Aptos" w:cs="Aptos"/>
+                <w:sz w:val="20"/>
+                <w:szCs w:val="20"/>
+              </w:rPr>
+              <w:t xml:space="preserve"/>
+            </w:r>
+          </w:p>
+        </w:tc>
+      </w:tr>
+      <w:tr>
+        <w:trPr>
+          <w:cantSplit/>
+        </w:trPr>
+        <w:tc>
+          <w:tcPr>
+            <w:tcW w:w="300" w:type="pct"/>
+            <w:tcMar>
+              <w:top w:w="30" w:type="dxa"/>
+              <w:left w:w="80" w:type="dxa"/>
+              <w:bottom w:w="30" w:type="dxa"/>
+              <w:right w:w="80" w:type="dxa"/>
+            </w:tcMar>
+          </w:tcPr>
+          <w:p>
+            <w:r>
+              <w:rPr>
+                <w:rFonts w:ascii="Aptos" w:eastAsia="Aptos" w:hAnsi="Aptos" w:cs="Aptos"/>
+                <w:sz w:val="20"/>
+                <w:szCs w:val="20"/>
+              </w:rPr>
+              <w:t xml:space="preserve">143</w:t>
+            </w:r>
+          </w:p>
+        </w:tc>
+        <w:tc>
+          <w:tcPr>
+            <w:tcW w:w="2350" w:type="pct"/>
+            <w:tcMar>
+              <w:top w:w="30" w:type="dxa"/>
+              <w:left w:w="80" w:type="dxa"/>
+              <w:bottom w:w="30" w:type="dxa"/>
+              <w:right w:w="80" w:type="dxa"/>
+            </w:tcMar>
+          </w:tcPr>
+          <w:p>
+            <w:r>
+              <w:rPr>
+                <w:rFonts w:ascii="Aptos" w:eastAsia="Aptos" w:hAnsi="Aptos" w:cs="Aptos"/>
+                <w:sz w:val="20"/>
+                <w:szCs w:val="20"/>
+              </w:rPr>
+              <w:t xml:space="preserve"/>
+            </w:r>
+          </w:p>
+        </w:tc>
+        <w:tc>
+          <w:tcPr>
+            <w:tcW w:w="750" w:type="pct"/>
+            <w:tcMar>
+              <w:top w:w="30" w:type="dxa"/>
+              <w:left w:w="80" w:type="dxa"/>
+              <w:bottom w:w="30" w:type="dxa"/>
+              <w:right w:w="80" w:type="dxa"/>
+            </w:tcMar>
+          </w:tcPr>
+          <w:p>
+            <w:r>
+              <w:rPr>
+                <w:rFonts w:ascii="Aptos" w:eastAsia="Aptos" w:hAnsi="Aptos" w:cs="Aptos"/>
+                <w:sz w:val="20"/>
+                <w:szCs w:val="20"/>
+              </w:rPr>
+              <w:t xml:space="preserve"/>
+            </w:r>
+          </w:p>
+        </w:tc>
+        <w:tc>
+          <w:tcPr>
+            <w:tcW w:w="1600" w:type="pct"/>
+            <w:tcMar>
+              <w:top w:w="30" w:type="dxa"/>
+              <w:left w:w="80" w:type="dxa"/>
+              <w:bottom w:w="30" w:type="dxa"/>
+              <w:right w:w="80" w:type="dxa"/>
+            </w:tcMar>
+          </w:tcPr>
+          <w:p>
+            <w:r>
+              <w:rPr>
+                <w:rFonts w:ascii="Aptos" w:eastAsia="Aptos" w:hAnsi="Aptos" w:cs="Aptos"/>
+                <w:sz w:val="20"/>
+                <w:szCs w:val="20"/>
+              </w:rPr>
+              <w:t xml:space="preserve"/>
+            </w:r>
+          </w:p>
+        </w:tc>
+      </w:tr>
+      <w:tr>
+        <w:trPr>
+          <w:cantSplit/>
+        </w:trPr>
+        <w:tc>
+          <w:tcPr>
+            <w:tcW w:w="300" w:type="pct"/>
+            <w:tcMar>
+              <w:top w:w="30" w:type="dxa"/>
+              <w:left w:w="80" w:type="dxa"/>
+              <w:bottom w:w="30" w:type="dxa"/>
+              <w:right w:w="80" w:type="dxa"/>
+            </w:tcMar>
+          </w:tcPr>
+          <w:p>
+            <w:r>
+              <w:rPr>
+                <w:rFonts w:ascii="Aptos" w:eastAsia="Aptos" w:hAnsi="Aptos" w:cs="Aptos"/>
+                <w:sz w:val="20"/>
+                <w:szCs w:val="20"/>
+              </w:rPr>
+              <w:t xml:space="preserve">144</w:t>
+            </w:r>
+          </w:p>
+        </w:tc>
+        <w:tc>
+          <w:tcPr>
+            <w:tcW w:w="2350" w:type="pct"/>
+            <w:tcMar>
+              <w:top w:w="30" w:type="dxa"/>
+              <w:left w:w="80" w:type="dxa"/>
+              <w:bottom w:w="30" w:type="dxa"/>
+              <w:right w:w="80" w:type="dxa"/>
+            </w:tcMar>
+          </w:tcPr>
+          <w:p>
+            <w:r>
+              <w:rPr>
+                <w:rFonts w:ascii="Aptos" w:eastAsia="Aptos" w:hAnsi="Aptos" w:cs="Aptos"/>
+                <w:sz w:val="20"/>
+                <w:szCs w:val="20"/>
+              </w:rPr>
+              <w:t xml:space="preserve"/>
+            </w:r>
+          </w:p>
+        </w:tc>
+        <w:tc>
+          <w:tcPr>
+            <w:tcW w:w="750" w:type="pct"/>
+            <w:tcMar>
+              <w:top w:w="30" w:type="dxa"/>
+              <w:left w:w="80" w:type="dxa"/>
+              <w:bottom w:w="30" w:type="dxa"/>
+              <w:right w:w="80" w:type="dxa"/>
+            </w:tcMar>
+          </w:tcPr>
+          <w:p>
+            <w:r>
+              <w:rPr>
+                <w:rFonts w:ascii="Aptos" w:eastAsia="Aptos" w:hAnsi="Aptos" w:cs="Aptos"/>
+                <w:sz w:val="20"/>
+                <w:szCs w:val="20"/>
+              </w:rPr>
+              <w:t xml:space="preserve"/>
+            </w:r>
+          </w:p>
+        </w:tc>
+        <w:tc>
+          <w:tcPr>
+            <w:tcW w:w="1600" w:type="pct"/>
+            <w:tcMar>
+              <w:top w:w="30" w:type="dxa"/>
+              <w:left w:w="80" w:type="dxa"/>
+              <w:bottom w:w="30" w:type="dxa"/>
+              <w:right w:w="80" w:type="dxa"/>
+            </w:tcMar>
+          </w:tcPr>
+          <w:p>
+            <w:r>
+              <w:rPr>
+                <w:rFonts w:ascii="Aptos" w:eastAsia="Aptos" w:hAnsi="Aptos" w:cs="Aptos"/>
+                <w:sz w:val="20"/>
+                <w:szCs w:val="20"/>
+              </w:rPr>
+              <w:t xml:space="preserve"/>
+            </w:r>
+          </w:p>
+        </w:tc>
+      </w:tr>
+      <w:tr>
+        <w:trPr>
+          <w:cantSplit/>
+        </w:trPr>
+        <w:tc>
+          <w:tcPr>
+            <w:tcW w:w="300" w:type="pct"/>
+            <w:tcMar>
+              <w:top w:w="30" w:type="dxa"/>
+              <w:left w:w="80" w:type="dxa"/>
+              <w:bottom w:w="30" w:type="dxa"/>
+              <w:right w:w="80" w:type="dxa"/>
+            </w:tcMar>
+          </w:tcPr>
+          <w:p>
+            <w:r>
+              <w:rPr>
+                <w:rFonts w:ascii="Aptos" w:eastAsia="Aptos" w:hAnsi="Aptos" w:cs="Aptos"/>
+                <w:sz w:val="20"/>
+                <w:szCs w:val="20"/>
+              </w:rPr>
+              <w:t xml:space="preserve">145</w:t>
+            </w:r>
+          </w:p>
+        </w:tc>
+        <w:tc>
+          <w:tcPr>
+            <w:tcW w:w="2350" w:type="pct"/>
+            <w:tcMar>
+              <w:top w:w="30" w:type="dxa"/>
+              <w:left w:w="80" w:type="dxa"/>
+              <w:bottom w:w="30" w:type="dxa"/>
+              <w:right w:w="80" w:type="dxa"/>
+            </w:tcMar>
+          </w:tcPr>
+          <w:p>
+            <w:r>
+              <w:rPr>
+                <w:rFonts w:ascii="Aptos" w:eastAsia="Aptos" w:hAnsi="Aptos" w:cs="Aptos"/>
+                <w:sz w:val="20"/>
+                <w:szCs w:val="20"/>
+              </w:rPr>
+              <w:t xml:space="preserve"/>
+            </w:r>
+          </w:p>
+        </w:tc>
+        <w:tc>
+          <w:tcPr>
+            <w:tcW w:w="750" w:type="pct"/>
+            <w:tcMar>
+              <w:top w:w="30" w:type="dxa"/>
+              <w:left w:w="80" w:type="dxa"/>
+              <w:bottom w:w="30" w:type="dxa"/>
+              <w:right w:w="80" w:type="dxa"/>
+            </w:tcMar>
+          </w:tcPr>
+          <w:p>
+            <w:r>
+              <w:rPr>
+                <w:rFonts w:ascii="Aptos" w:eastAsia="Aptos" w:hAnsi="Aptos" w:cs="Aptos"/>
+                <w:sz w:val="20"/>
+                <w:szCs w:val="20"/>
+              </w:rPr>
+              <w:t xml:space="preserve"/>
+            </w:r>
+          </w:p>
+        </w:tc>
+        <w:tc>
+          <w:tcPr>
+            <w:tcW w:w="1600" w:type="pct"/>
+            <w:tcMar>
+              <w:top w:w="30" w:type="dxa"/>
+              <w:left w:w="80" w:type="dxa"/>
+              <w:bottom w:w="30" w:type="dxa"/>
+              <w:right w:w="80" w:type="dxa"/>
+            </w:tcMar>
+          </w:tcPr>
+          <w:p>
+            <w:r>
+              <w:rPr>
+                <w:rFonts w:ascii="Aptos" w:eastAsia="Aptos" w:hAnsi="Aptos" w:cs="Aptos"/>
+                <w:sz w:val="20"/>
+                <w:szCs w:val="20"/>
+              </w:rPr>
+              <w:t xml:space="preserve"/>
+            </w:r>
+          </w:p>
+        </w:tc>
+      </w:tr>
+      <w:tr>
+        <w:trPr>
+          <w:cantSplit/>
+        </w:trPr>
+        <w:tc>
+          <w:tcPr>
+            <w:tcW w:w="300" w:type="pct"/>
+            <w:tcMar>
+              <w:top w:w="30" w:type="dxa"/>
+              <w:left w:w="80" w:type="dxa"/>
+              <w:bottom w:w="30" w:type="dxa"/>
+              <w:right w:w="80" w:type="dxa"/>
+            </w:tcMar>
+          </w:tcPr>
+          <w:p>
+            <w:r>
+              <w:rPr>
+                <w:rFonts w:ascii="Aptos" w:eastAsia="Aptos" w:hAnsi="Aptos" w:cs="Aptos"/>
+                <w:sz w:val="20"/>
+                <w:szCs w:val="20"/>
+              </w:rPr>
+              <w:t xml:space="preserve">146</w:t>
+            </w:r>
+          </w:p>
+        </w:tc>
+        <w:tc>
+          <w:tcPr>
+            <w:tcW w:w="2350" w:type="pct"/>
+            <w:tcMar>
+              <w:top w:w="30" w:type="dxa"/>
+              <w:left w:w="80" w:type="dxa"/>
+              <w:bottom w:w="30" w:type="dxa"/>
+              <w:right w:w="80" w:type="dxa"/>
+            </w:tcMar>
+          </w:tcPr>
+          <w:p>
+            <w:r>
+              <w:rPr>
+                <w:rFonts w:ascii="Aptos" w:eastAsia="Aptos" w:hAnsi="Aptos" w:cs="Aptos"/>
+                <w:sz w:val="20"/>
+                <w:szCs w:val="20"/>
+              </w:rPr>
+              <w:t xml:space="preserve"/>
+            </w:r>
+          </w:p>
+        </w:tc>
+        <w:tc>
+          <w:tcPr>
+            <w:tcW w:w="750" w:type="pct"/>
+            <w:tcMar>
+              <w:top w:w="30" w:type="dxa"/>
+              <w:left w:w="80" w:type="dxa"/>
+              <w:bottom w:w="30" w:type="dxa"/>
+              <w:right w:w="80" w:type="dxa"/>
+            </w:tcMar>
+          </w:tcPr>
+          <w:p>
+            <w:r>
+              <w:rPr>
+                <w:rFonts w:ascii="Aptos" w:eastAsia="Aptos" w:hAnsi="Aptos" w:cs="Aptos"/>
+                <w:sz w:val="20"/>
+                <w:szCs w:val="20"/>
+              </w:rPr>
+              <w:t xml:space="preserve"/>
+            </w:r>
+          </w:p>
+        </w:tc>
+        <w:tc>
+          <w:tcPr>
+            <w:tcW w:w="1600" w:type="pct"/>
+            <w:tcMar>
+              <w:top w:w="30" w:type="dxa"/>
+              <w:left w:w="80" w:type="dxa"/>
+              <w:bottom w:w="30" w:type="dxa"/>
+              <w:right w:w="80" w:type="dxa"/>
+            </w:tcMar>
+          </w:tcPr>
+          <w:p>
+            <w:r>
+              <w:rPr>
+                <w:rFonts w:ascii="Aptos" w:eastAsia="Aptos" w:hAnsi="Aptos" w:cs="Aptos"/>
+                <w:sz w:val="20"/>
+                <w:szCs w:val="20"/>
+              </w:rPr>
+              <w:t xml:space="preserve"/>
+            </w:r>
+          </w:p>
+        </w:tc>
+      </w:tr>
+      <w:tr>
+        <w:trPr>
+          <w:cantSplit/>
+        </w:trPr>
+        <w:tc>
+          <w:tcPr>
+            <w:tcW w:w="300" w:type="pct"/>
+            <w:tcMar>
+              <w:top w:w="30" w:type="dxa"/>
+              <w:left w:w="80" w:type="dxa"/>
+              <w:bottom w:w="30" w:type="dxa"/>
+              <w:right w:w="80" w:type="dxa"/>
+            </w:tcMar>
+          </w:tcPr>
+          <w:p>
+            <w:r>
+              <w:rPr>
+                <w:rFonts w:ascii="Aptos" w:eastAsia="Aptos" w:hAnsi="Aptos" w:cs="Aptos"/>
+                <w:sz w:val="20"/>
+                <w:szCs w:val="20"/>
+              </w:rPr>
+              <w:t xml:space="preserve">147</w:t>
+            </w:r>
+          </w:p>
+        </w:tc>
+        <w:tc>
+          <w:tcPr>
+            <w:tcW w:w="2350" w:type="pct"/>
+            <w:tcMar>
+              <w:top w:w="30" w:type="dxa"/>
+              <w:left w:w="80" w:type="dxa"/>
+              <w:bottom w:w="30" w:type="dxa"/>
+              <w:right w:w="80" w:type="dxa"/>
+            </w:tcMar>
+          </w:tcPr>
+          <w:p>
+            <w:r>
+              <w:rPr>
+                <w:rFonts w:ascii="Aptos" w:eastAsia="Aptos" w:hAnsi="Aptos" w:cs="Aptos"/>
+                <w:sz w:val="20"/>
+                <w:szCs w:val="20"/>
+              </w:rPr>
+              <w:t xml:space="preserve"/>
+            </w:r>
+          </w:p>
+        </w:tc>
+        <w:tc>
+          <w:tcPr>
+            <w:tcW w:w="750" w:type="pct"/>
+            <w:tcMar>
+              <w:top w:w="30" w:type="dxa"/>
+              <w:left w:w="80" w:type="dxa"/>
+              <w:bottom w:w="30" w:type="dxa"/>
+              <w:right w:w="80" w:type="dxa"/>
+            </w:tcMar>
+          </w:tcPr>
+          <w:p>
+            <w:r>
+              <w:rPr>
+                <w:rFonts w:ascii="Aptos" w:eastAsia="Aptos" w:hAnsi="Aptos" w:cs="Aptos"/>
+                <w:sz w:val="20"/>
+                <w:szCs w:val="20"/>
+              </w:rPr>
+              <w:t xml:space="preserve"/>
+            </w:r>
+          </w:p>
+        </w:tc>
+        <w:tc>
+          <w:tcPr>
+            <w:tcW w:w="1600" w:type="pct"/>
+            <w:tcMar>
+              <w:top w:w="30" w:type="dxa"/>
+              <w:left w:w="80" w:type="dxa"/>
+              <w:bottom w:w="30" w:type="dxa"/>
+              <w:right w:w="80" w:type="dxa"/>
+            </w:tcMar>
+          </w:tcPr>
+          <w:p>
+            <w:r>
+              <w:rPr>
+                <w:rFonts w:ascii="Aptos" w:eastAsia="Aptos" w:hAnsi="Aptos" w:cs="Aptos"/>
+                <w:sz w:val="20"/>
+                <w:szCs w:val="20"/>
+              </w:rPr>
+              <w:t xml:space="preserve"/>
+            </w:r>
+          </w:p>
+        </w:tc>
+      </w:tr>
+      <w:tr>
+        <w:trPr>
+          <w:cantSplit/>
+        </w:trPr>
+        <w:tc>
+          <w:tcPr>
+            <w:tcW w:w="300" w:type="pct"/>
+            <w:tcMar>
+              <w:top w:w="30" w:type="dxa"/>
+              <w:left w:w="80" w:type="dxa"/>
+              <w:bottom w:w="30" w:type="dxa"/>
+              <w:right w:w="80" w:type="dxa"/>
+            </w:tcMar>
+          </w:tcPr>
+          <w:p>
+            <w:r>
+              <w:rPr>
+                <w:rFonts w:ascii="Aptos" w:eastAsia="Aptos" w:hAnsi="Aptos" w:cs="Aptos"/>
+                <w:sz w:val="20"/>
+                <w:szCs w:val="20"/>
+              </w:rPr>
+              <w:t xml:space="preserve">148</w:t>
+            </w:r>
+          </w:p>
+        </w:tc>
+        <w:tc>
+          <w:tcPr>
+            <w:tcW w:w="2350" w:type="pct"/>
+            <w:tcMar>
+              <w:top w:w="30" w:type="dxa"/>
+              <w:left w:w="80" w:type="dxa"/>
+              <w:bottom w:w="30" w:type="dxa"/>
+              <w:right w:w="80" w:type="dxa"/>
+            </w:tcMar>
+          </w:tcPr>
+          <w:p>
+            <w:r>
+              <w:rPr>
+                <w:rFonts w:ascii="Aptos" w:eastAsia="Aptos" w:hAnsi="Aptos" w:cs="Aptos"/>
+                <w:sz w:val="20"/>
+                <w:szCs w:val="20"/>
+              </w:rPr>
+              <w:t xml:space="preserve"/>
+            </w:r>
+          </w:p>
+        </w:tc>
+        <w:tc>
+          <w:tcPr>
+            <w:tcW w:w="750" w:type="pct"/>
+            <w:tcMar>
+              <w:top w:w="30" w:type="dxa"/>
+              <w:left w:w="80" w:type="dxa"/>
+              <w:bottom w:w="30" w:type="dxa"/>
+              <w:right w:w="80" w:type="dxa"/>
+            </w:tcMar>
+          </w:tcPr>
+          <w:p>
+            <w:r>
+              <w:rPr>
+                <w:rFonts w:ascii="Aptos" w:eastAsia="Aptos" w:hAnsi="Aptos" w:cs="Aptos"/>
+                <w:sz w:val="20"/>
+                <w:szCs w:val="20"/>
+              </w:rPr>
+              <w:t xml:space="preserve"/>
+            </w:r>
+          </w:p>
+        </w:tc>
+        <w:tc>
+          <w:tcPr>
+            <w:tcW w:w="1600" w:type="pct"/>
+            <w:tcMar>
+              <w:top w:w="30" w:type="dxa"/>
+              <w:left w:w="80" w:type="dxa"/>
+              <w:bottom w:w="30" w:type="dxa"/>
+              <w:right w:w="80" w:type="dxa"/>
+            </w:tcMar>
+          </w:tcPr>
+          <w:p>
+            <w:r>
+              <w:rPr>
+                <w:rFonts w:ascii="Aptos" w:eastAsia="Aptos" w:hAnsi="Aptos" w:cs="Aptos"/>
+                <w:sz w:val="20"/>
+                <w:szCs w:val="20"/>
+              </w:rPr>
+              <w:t xml:space="preserve"/>
+            </w:r>
+          </w:p>
+        </w:tc>
+      </w:tr>
+      <w:tr>
+        <w:trPr>
+          <w:cantSplit/>
+        </w:trPr>
+        <w:tc>
+          <w:tcPr>
+            <w:tcW w:w="300" w:type="pct"/>
+            <w:tcMar>
+              <w:top w:w="30" w:type="dxa"/>
+              <w:left w:w="80" w:type="dxa"/>
+              <w:bottom w:w="30" w:type="dxa"/>
+              <w:right w:w="80" w:type="dxa"/>
+            </w:tcMar>
+          </w:tcPr>
+          <w:p>
+            <w:r>
+              <w:rPr>
+                <w:rFonts w:ascii="Aptos" w:eastAsia="Aptos" w:hAnsi="Aptos" w:cs="Aptos"/>
+                <w:sz w:val="20"/>
+                <w:szCs w:val="20"/>
+              </w:rPr>
+              <w:t xml:space="preserve">149</w:t>
+            </w:r>
+          </w:p>
+        </w:tc>
+        <w:tc>
+          <w:tcPr>
+            <w:tcW w:w="2350" w:type="pct"/>
+            <w:tcMar>
+              <w:top w:w="30" w:type="dxa"/>
+              <w:left w:w="80" w:type="dxa"/>
+              <w:bottom w:w="30" w:type="dxa"/>
+              <w:right w:w="80" w:type="dxa"/>
+            </w:tcMar>
+          </w:tcPr>
+          <w:p>
+            <w:r>
+              <w:rPr>
+                <w:rFonts w:ascii="Aptos" w:eastAsia="Aptos" w:hAnsi="Aptos" w:cs="Aptos"/>
+                <w:sz w:val="20"/>
+                <w:szCs w:val="20"/>
+              </w:rPr>
+              <w:t xml:space="preserve"/>
+            </w:r>
+          </w:p>
+        </w:tc>
+        <w:tc>
+          <w:tcPr>
+            <w:tcW w:w="750" w:type="pct"/>
+            <w:tcMar>
+              <w:top w:w="30" w:type="dxa"/>
+              <w:left w:w="80" w:type="dxa"/>
+              <w:bottom w:w="30" w:type="dxa"/>
+              <w:right w:w="80" w:type="dxa"/>
+            </w:tcMar>
+          </w:tcPr>
+          <w:p>
+            <w:r>
+              <w:rPr>
+                <w:rFonts w:ascii="Aptos" w:eastAsia="Aptos" w:hAnsi="Aptos" w:cs="Aptos"/>
+                <w:sz w:val="20"/>
+                <w:szCs w:val="20"/>
+              </w:rPr>
+              <w:t xml:space="preserve"/>
+            </w:r>
+          </w:p>
+        </w:tc>
+        <w:tc>
+          <w:tcPr>
+            <w:tcW w:w="1600" w:type="pct"/>
+            <w:tcMar>
+              <w:top w:w="30" w:type="dxa"/>
+              <w:left w:w="80" w:type="dxa"/>
+              <w:bottom w:w="30" w:type="dxa"/>
+              <w:right w:w="80" w:type="dxa"/>
+            </w:tcMar>
+          </w:tcPr>
+          <w:p>
+            <w:r>
+              <w:rPr>
+                <w:rFonts w:ascii="Aptos" w:eastAsia="Aptos" w:hAnsi="Aptos" w:cs="Aptos"/>
+                <w:sz w:val="20"/>
+                <w:szCs w:val="20"/>
+              </w:rPr>
+              <w:t xml:space="preserve"/>
+            </w:r>
+          </w:p>
+        </w:tc>
+      </w:tr>
+      <w:tr>
+        <w:trPr>
+          <w:cantSplit/>
+        </w:trPr>
+        <w:tc>
+          <w:tcPr>
+            <w:tcW w:w="300" w:type="pct"/>
+            <w:tcMar>
+              <w:top w:w="30" w:type="dxa"/>
+              <w:left w:w="80" w:type="dxa"/>
+              <w:bottom w:w="30" w:type="dxa"/>
+              <w:right w:w="80" w:type="dxa"/>
+            </w:tcMar>
+          </w:tcPr>
+          <w:p>
+            <w:r>
+              <w:rPr>
+                <w:rFonts w:ascii="Aptos" w:eastAsia="Aptos" w:hAnsi="Aptos" w:cs="Aptos"/>
+                <w:sz w:val="20"/>
+                <w:szCs w:val="20"/>
+              </w:rPr>
+              <w:t xml:space="preserve">150</w:t>
+            </w:r>
+          </w:p>
+        </w:tc>
+        <w:tc>
+          <w:tcPr>
+            <w:tcW w:w="2350" w:type="pct"/>
+            <w:tcMar>
+              <w:top w:w="30" w:type="dxa"/>
+              <w:left w:w="80" w:type="dxa"/>
+              <w:bottom w:w="30" w:type="dxa"/>
+              <w:right w:w="80" w:type="dxa"/>
+            </w:tcMar>
+          </w:tcPr>
+          <w:p>
+            <w:r>
+              <w:rPr>
+                <w:rFonts w:ascii="Aptos" w:eastAsia="Aptos" w:hAnsi="Aptos" w:cs="Aptos"/>
+                <w:sz w:val="20"/>
+                <w:szCs w:val="20"/>
+              </w:rPr>
+              <w:t xml:space="preserve"/>
+            </w:r>
+          </w:p>
+        </w:tc>
+        <w:tc>
+          <w:tcPr>
+            <w:tcW w:w="750" w:type="pct"/>
+            <w:tcMar>
+              <w:top w:w="30" w:type="dxa"/>
+              <w:left w:w="80" w:type="dxa"/>
+              <w:bottom w:w="30" w:type="dxa"/>
+              <w:right w:w="80" w:type="dxa"/>
+            </w:tcMar>
+          </w:tcPr>
+          <w:p>
+            <w:r>
+              <w:rPr>
+                <w:rFonts w:ascii="Aptos" w:eastAsia="Aptos" w:hAnsi="Aptos" w:cs="Aptos"/>
+                <w:sz w:val="20"/>
+                <w:szCs w:val="20"/>
+              </w:rPr>
+              <w:t xml:space="preserve"/>
+            </w:r>
+          </w:p>
+        </w:tc>
+        <w:tc>
+          <w:tcPr>
+            <w:tcW w:w="1600" w:type="pct"/>
+            <w:tcMar>
+              <w:top w:w="30" w:type="dxa"/>
+              <w:left w:w="80" w:type="dxa"/>
+              <w:bottom w:w="30" w:type="dxa"/>
+              <w:right w:w="80" w:type="dxa"/>
+            </w:tcMar>
+          </w:tcPr>
+          <w:p>
+            <w:r>
+              <w:rPr>
+                <w:rFonts w:ascii="Aptos" w:eastAsia="Aptos" w:hAnsi="Aptos" w:cs="Aptos"/>
+                <w:sz w:val="20"/>
+                <w:szCs w:val="20"/>
+              </w:rPr>
+              <w:t xml:space="preserve"/>
+            </w:r>
+          </w:p>
+        </w:tc>
+      </w:tr>
+      <w:tr>
+        <w:trPr>
+          <w:cantSplit/>
+        </w:trPr>
+        <w:tc>
+          <w:tcPr>
+            <w:tcW w:w="300" w:type="pct"/>
+            <w:tcMar>
+              <w:top w:w="30" w:type="dxa"/>
+              <w:left w:w="80" w:type="dxa"/>
+              <w:bottom w:w="30" w:type="dxa"/>
+              <w:right w:w="80" w:type="dxa"/>
+            </w:tcMar>
+          </w:tcPr>
+          <w:p>
+            <w:r>
+              <w:rPr>
+                <w:rFonts w:ascii="Aptos" w:eastAsia="Aptos" w:hAnsi="Aptos" w:cs="Aptos"/>
+                <w:sz w:val="20"/>
+                <w:szCs w:val="20"/>
+              </w:rPr>
+              <w:t xml:space="preserve">151</w:t>
+            </w:r>
+          </w:p>
+        </w:tc>
+        <w:tc>
+          <w:tcPr>
+            <w:tcW w:w="2350" w:type="pct"/>
+            <w:tcMar>
+              <w:top w:w="30" w:type="dxa"/>
+              <w:left w:w="80" w:type="dxa"/>
+              <w:bottom w:w="30" w:type="dxa"/>
+              <w:right w:w="80" w:type="dxa"/>
+            </w:tcMar>
+          </w:tcPr>
+          <w:p>
+            <w:r>
+              <w:rPr>
+                <w:rFonts w:ascii="Aptos" w:eastAsia="Aptos" w:hAnsi="Aptos" w:cs="Aptos"/>
+                <w:sz w:val="20"/>
+                <w:szCs w:val="20"/>
+              </w:rPr>
+              <w:t xml:space="preserve"/>
+            </w:r>
+          </w:p>
+        </w:tc>
+        <w:tc>
+          <w:tcPr>
+            <w:tcW w:w="750" w:type="pct"/>
+            <w:tcMar>
+              <w:top w:w="30" w:type="dxa"/>
+              <w:left w:w="80" w:type="dxa"/>
+              <w:bottom w:w="30" w:type="dxa"/>
+              <w:right w:w="80" w:type="dxa"/>
+            </w:tcMar>
+          </w:tcPr>
+          <w:p>
+            <w:r>
+              <w:rPr>
+                <w:rFonts w:ascii="Aptos" w:eastAsia="Aptos" w:hAnsi="Aptos" w:cs="Aptos"/>
+                <w:sz w:val="20"/>
+                <w:szCs w:val="20"/>
+              </w:rPr>
+              <w:t xml:space="preserve"/>
+            </w:r>
+          </w:p>
+        </w:tc>
+        <w:tc>
+          <w:tcPr>
+            <w:tcW w:w="1600" w:type="pct"/>
+            <w:tcMar>
+              <w:top w:w="30" w:type="dxa"/>
+              <w:left w:w="80" w:type="dxa"/>
+              <w:bottom w:w="30" w:type="dxa"/>
+              <w:right w:w="80" w:type="dxa"/>
+            </w:tcMar>
+          </w:tcPr>
+          <w:p>
+            <w:r>
+              <w:rPr>
+                <w:rFonts w:ascii="Aptos" w:eastAsia="Aptos" w:hAnsi="Aptos" w:cs="Aptos"/>
+                <w:sz w:val="20"/>
+                <w:szCs w:val="20"/>
+              </w:rPr>
+              <w:t xml:space="preserve"/>
+            </w:r>
+          </w:p>
+        </w:tc>
+      </w:tr>
+      <w:tr>
+        <w:trPr>
+          <w:cantSplit/>
+        </w:trPr>
+        <w:tc>
+          <w:tcPr>
+            <w:tcW w:w="300" w:type="pct"/>
+            <w:tcMar>
+              <w:top w:w="30" w:type="dxa"/>
+              <w:left w:w="80" w:type="dxa"/>
+              <w:bottom w:w="30" w:type="dxa"/>
+              <w:right w:w="80" w:type="dxa"/>
+            </w:tcMar>
+          </w:tcPr>
+          <w:p>
+            <w:r>
+              <w:rPr>
+                <w:rFonts w:ascii="Aptos" w:eastAsia="Aptos" w:hAnsi="Aptos" w:cs="Aptos"/>
+                <w:sz w:val="20"/>
+                <w:szCs w:val="20"/>
+              </w:rPr>
+              <w:t xml:space="preserve">152</w:t>
+            </w:r>
+          </w:p>
+        </w:tc>
+        <w:tc>
+          <w:tcPr>
+            <w:tcW w:w="2350" w:type="pct"/>
+            <w:tcMar>
+              <w:top w:w="30" w:type="dxa"/>
+              <w:left w:w="80" w:type="dxa"/>
+              <w:bottom w:w="30" w:type="dxa"/>
+              <w:right w:w="80" w:type="dxa"/>
+            </w:tcMar>
+          </w:tcPr>
+          <w:p>
+            <w:r>
+              <w:rPr>
+                <w:rFonts w:ascii="Aptos" w:eastAsia="Aptos" w:hAnsi="Aptos" w:cs="Aptos"/>
+                <w:sz w:val="20"/>
+                <w:szCs w:val="20"/>
+              </w:rPr>
+              <w:t xml:space="preserve"/>
+            </w:r>
+          </w:p>
+        </w:tc>
+        <w:tc>
+          <w:tcPr>
+            <w:tcW w:w="750" w:type="pct"/>
+            <w:tcMar>
+              <w:top w:w="30" w:type="dxa"/>
+              <w:left w:w="80" w:type="dxa"/>
+              <w:bottom w:w="30" w:type="dxa"/>
+              <w:right w:w="80" w:type="dxa"/>
+            </w:tcMar>
+          </w:tcPr>
+          <w:p>
+            <w:r>
+              <w:rPr>
+                <w:rFonts w:ascii="Aptos" w:eastAsia="Aptos" w:hAnsi="Aptos" w:cs="Aptos"/>
+                <w:sz w:val="20"/>
+                <w:szCs w:val="20"/>
+              </w:rPr>
+              <w:t xml:space="preserve"/>
+            </w:r>
+          </w:p>
+        </w:tc>
+        <w:tc>
+          <w:tcPr>
+            <w:tcW w:w="1600" w:type="pct"/>
+            <w:tcMar>
+              <w:top w:w="30" w:type="dxa"/>
+              <w:left w:w="80" w:type="dxa"/>
+              <w:bottom w:w="30" w:type="dxa"/>
+              <w:right w:w="80" w:type="dxa"/>
+            </w:tcMar>
+          </w:tcPr>
+          <w:p>
+            <w:r>
+              <w:rPr>
+                <w:rFonts w:ascii="Aptos" w:eastAsia="Aptos" w:hAnsi="Aptos" w:cs="Aptos"/>
+                <w:sz w:val="20"/>
+                <w:szCs w:val="20"/>
+              </w:rPr>
+              <w:t xml:space="preserve"/>
+            </w:r>
+          </w:p>
+        </w:tc>
+      </w:tr>
+      <w:tr>
+        <w:trPr>
+          <w:cantSplit/>
+        </w:trPr>
+        <w:tc>
+          <w:tcPr>
+            <w:tcW w:w="300" w:type="pct"/>
+            <w:tcMar>
+              <w:top w:w="30" w:type="dxa"/>
+              <w:left w:w="80" w:type="dxa"/>
+              <w:bottom w:w="30" w:type="dxa"/>
+              <w:right w:w="80" w:type="dxa"/>
+            </w:tcMar>
+          </w:tcPr>
+          <w:p>
+            <w:r>
+              <w:rPr>
+                <w:rFonts w:ascii="Aptos" w:eastAsia="Aptos" w:hAnsi="Aptos" w:cs="Aptos"/>
+                <w:sz w:val="20"/>
+                <w:szCs w:val="20"/>
+              </w:rPr>
+              <w:t xml:space="preserve">153</w:t>
+            </w:r>
+          </w:p>
+        </w:tc>
+        <w:tc>
+          <w:tcPr>
+            <w:tcW w:w="2350" w:type="pct"/>
+            <w:tcMar>
+              <w:top w:w="30" w:type="dxa"/>
+              <w:left w:w="80" w:type="dxa"/>
+              <w:bottom w:w="30" w:type="dxa"/>
+              <w:right w:w="80" w:type="dxa"/>
+            </w:tcMar>
+          </w:tcPr>
+          <w:p>
+            <w:r>
+              <w:rPr>
+                <w:rFonts w:ascii="Aptos" w:eastAsia="Aptos" w:hAnsi="Aptos" w:cs="Aptos"/>
+                <w:sz w:val="20"/>
+                <w:szCs w:val="20"/>
+              </w:rPr>
+              <w:t xml:space="preserve"/>
+            </w:r>
+          </w:p>
+        </w:tc>
+        <w:tc>
+          <w:tcPr>
+            <w:tcW w:w="750" w:type="pct"/>
+            <w:tcMar>
+              <w:top w:w="30" w:type="dxa"/>
+              <w:left w:w="80" w:type="dxa"/>
+              <w:bottom w:w="30" w:type="dxa"/>
+              <w:right w:w="80" w:type="dxa"/>
+            </w:tcMar>
+          </w:tcPr>
+          <w:p>
+            <w:r>
+              <w:rPr>
+                <w:rFonts w:ascii="Aptos" w:eastAsia="Aptos" w:hAnsi="Aptos" w:cs="Aptos"/>
+                <w:sz w:val="20"/>
+                <w:szCs w:val="20"/>
+              </w:rPr>
+              <w:t xml:space="preserve"/>
+            </w:r>
+          </w:p>
+        </w:tc>
+        <w:tc>
+          <w:tcPr>
+            <w:tcW w:w="1600" w:type="pct"/>
+            <w:tcMar>
+              <w:top w:w="30" w:type="dxa"/>
+              <w:left w:w="80" w:type="dxa"/>
+              <w:bottom w:w="30" w:type="dxa"/>
+              <w:right w:w="80" w:type="dxa"/>
+            </w:tcMar>
+          </w:tcPr>
+          <w:p>
+            <w:r>
+              <w:rPr>
+                <w:rFonts w:ascii="Aptos" w:eastAsia="Aptos" w:hAnsi="Aptos" w:cs="Aptos"/>
+                <w:sz w:val="20"/>
+                <w:szCs w:val="20"/>
+              </w:rPr>
+              <w:t xml:space="preserve"/>
+            </w:r>
+          </w:p>
+        </w:tc>
+      </w:tr>
+      <w:tr>
+        <w:trPr>
+          <w:cantSplit/>
+        </w:trPr>
+        <w:tc>
+          <w:tcPr>
+            <w:tcW w:w="300" w:type="pct"/>
+            <w:tcMar>
+              <w:top w:w="30" w:type="dxa"/>
+              <w:left w:w="80" w:type="dxa"/>
+              <w:bottom w:w="30" w:type="dxa"/>
+              <w:right w:w="80" w:type="dxa"/>
+            </w:tcMar>
+          </w:tcPr>
+          <w:p>
+            <w:r>
+              <w:rPr>
+                <w:rFonts w:ascii="Aptos" w:eastAsia="Aptos" w:hAnsi="Aptos" w:cs="Aptos"/>
+                <w:sz w:val="20"/>
+                <w:szCs w:val="20"/>
+              </w:rPr>
+              <w:t xml:space="preserve">154</w:t>
+            </w:r>
+          </w:p>
+        </w:tc>
+        <w:tc>
+          <w:tcPr>
+            <w:tcW w:w="2350" w:type="pct"/>
+            <w:tcMar>
+              <w:top w:w="30" w:type="dxa"/>
+              <w:left w:w="80" w:type="dxa"/>
+              <w:bottom w:w="30" w:type="dxa"/>
+              <w:right w:w="80" w:type="dxa"/>
+            </w:tcMar>
+          </w:tcPr>
+          <w:p>
+            <w:r>
+              <w:rPr>
+                <w:rFonts w:ascii="Aptos" w:eastAsia="Aptos" w:hAnsi="Aptos" w:cs="Aptos"/>
+                <w:sz w:val="20"/>
+                <w:szCs w:val="20"/>
+              </w:rPr>
+              <w:t xml:space="preserve"/>
+            </w:r>
+          </w:p>
+        </w:tc>
+        <w:tc>
+          <w:tcPr>
+            <w:tcW w:w="750" w:type="pct"/>
+            <w:tcMar>
+              <w:top w:w="30" w:type="dxa"/>
+              <w:left w:w="80" w:type="dxa"/>
+              <w:bottom w:w="30" w:type="dxa"/>
+              <w:right w:w="80" w:type="dxa"/>
+            </w:tcMar>
+          </w:tcPr>
+          <w:p>
+            <w:r>
+              <w:rPr>
+                <w:rFonts w:ascii="Aptos" w:eastAsia="Aptos" w:hAnsi="Aptos" w:cs="Aptos"/>
+                <w:sz w:val="20"/>
+                <w:szCs w:val="20"/>
+              </w:rPr>
+              <w:t xml:space="preserve"/>
+            </w:r>
+          </w:p>
+        </w:tc>
+        <w:tc>
+          <w:tcPr>
+            <w:tcW w:w="1600" w:type="pct"/>
+            <w:tcMar>
+              <w:top w:w="30" w:type="dxa"/>
+              <w:left w:w="80" w:type="dxa"/>
+              <w:bottom w:w="30" w:type="dxa"/>
+              <w:right w:w="80" w:type="dxa"/>
+            </w:tcMar>
+          </w:tcPr>
+          <w:p>
+            <w:r>
+              <w:rPr>
+                <w:rFonts w:ascii="Aptos" w:eastAsia="Aptos" w:hAnsi="Aptos" w:cs="Aptos"/>
+                <w:sz w:val="20"/>
+                <w:szCs w:val="20"/>
+              </w:rPr>
+              <w:t xml:space="preserve"/>
+            </w:r>
+          </w:p>
+        </w:tc>
+      </w:tr>
+      <w:tr>
+        <w:trPr>
+          <w:cantSplit/>
+        </w:trPr>
+        <w:tc>
+          <w:tcPr>
+            <w:tcW w:w="300" w:type="pct"/>
+            <w:tcMar>
+              <w:top w:w="30" w:type="dxa"/>
+              <w:left w:w="80" w:type="dxa"/>
+              <w:bottom w:w="30" w:type="dxa"/>
+              <w:right w:w="80" w:type="dxa"/>
+            </w:tcMar>
+          </w:tcPr>
+          <w:p>
+            <w:r>
+              <w:rPr>
+                <w:rFonts w:ascii="Aptos" w:eastAsia="Aptos" w:hAnsi="Aptos" w:cs="Aptos"/>
+                <w:sz w:val="20"/>
+                <w:szCs w:val="20"/>
+              </w:rPr>
+              <w:t xml:space="preserve">155</w:t>
+            </w:r>
+          </w:p>
+        </w:tc>
+        <w:tc>
+          <w:tcPr>
+            <w:tcW w:w="2350" w:type="pct"/>
+            <w:tcMar>
+              <w:top w:w="30" w:type="dxa"/>
+              <w:left w:w="80" w:type="dxa"/>
+              <w:bottom w:w="30" w:type="dxa"/>
+              <w:right w:w="80" w:type="dxa"/>
+            </w:tcMar>
+          </w:tcPr>
+          <w:p>
+            <w:r>
+              <w:rPr>
+                <w:rFonts w:ascii="Aptos" w:eastAsia="Aptos" w:hAnsi="Aptos" w:cs="Aptos"/>
+                <w:sz w:val="20"/>
+                <w:szCs w:val="20"/>
+              </w:rPr>
+              <w:t xml:space="preserve"/>
+            </w:r>
+          </w:p>
+        </w:tc>
+        <w:tc>
+          <w:tcPr>
+            <w:tcW w:w="750" w:type="pct"/>
+            <w:tcMar>
+              <w:top w:w="30" w:type="dxa"/>
+              <w:left w:w="80" w:type="dxa"/>
+              <w:bottom w:w="30" w:type="dxa"/>
+              <w:right w:w="80" w:type="dxa"/>
+            </w:tcMar>
+          </w:tcPr>
+          <w:p>
+            <w:r>
+              <w:rPr>
+                <w:rFonts w:ascii="Aptos" w:eastAsia="Aptos" w:hAnsi="Aptos" w:cs="Aptos"/>
+                <w:sz w:val="20"/>
+                <w:szCs w:val="20"/>
+              </w:rPr>
+              <w:t xml:space="preserve"/>
+            </w:r>
+          </w:p>
+        </w:tc>
+        <w:tc>
+          <w:tcPr>
+            <w:tcW w:w="1600" w:type="pct"/>
+            <w:tcMar>
+              <w:top w:w="30" w:type="dxa"/>
+              <w:left w:w="80" w:type="dxa"/>
+              <w:bottom w:w="30" w:type="dxa"/>
+              <w:right w:w="80" w:type="dxa"/>
+            </w:tcMar>
+          </w:tcPr>
+          <w:p>
+            <w:r>
+              <w:rPr>
+                <w:rFonts w:ascii="Aptos" w:eastAsia="Aptos" w:hAnsi="Aptos" w:cs="Aptos"/>
+                <w:sz w:val="20"/>
+                <w:szCs w:val="20"/>
+              </w:rPr>
+              <w:t xml:space="preserve"/>
+            </w:r>
+          </w:p>
+        </w:tc>
+      </w:tr>
+      <w:tr>
+        <w:trPr>
+          <w:cantSplit/>
+        </w:trPr>
+        <w:tc>
+          <w:tcPr>
+            <w:tcW w:w="300" w:type="pct"/>
+            <w:tcMar>
+              <w:top w:w="30" w:type="dxa"/>
+              <w:left w:w="80" w:type="dxa"/>
+              <w:bottom w:w="30" w:type="dxa"/>
+              <w:right w:w="80" w:type="dxa"/>
+            </w:tcMar>
+          </w:tcPr>
+          <w:p>
+            <w:r>
+              <w:rPr>
+                <w:rFonts w:ascii="Aptos" w:eastAsia="Aptos" w:hAnsi="Aptos" w:cs="Aptos"/>
+                <w:sz w:val="20"/>
+                <w:szCs w:val="20"/>
+              </w:rPr>
+              <w:t xml:space="preserve">156</w:t>
+            </w:r>
+          </w:p>
+        </w:tc>
+        <w:tc>
+          <w:tcPr>
+            <w:tcW w:w="2350" w:type="pct"/>
+            <w:tcMar>
+              <w:top w:w="30" w:type="dxa"/>
+              <w:left w:w="80" w:type="dxa"/>
+              <w:bottom w:w="30" w:type="dxa"/>
+              <w:right w:w="80" w:type="dxa"/>
+            </w:tcMar>
+          </w:tcPr>
+          <w:p>
+            <w:r>
+              <w:rPr>
+                <w:rFonts w:ascii="Aptos" w:eastAsia="Aptos" w:hAnsi="Aptos" w:cs="Aptos"/>
+                <w:sz w:val="20"/>
+                <w:szCs w:val="20"/>
+              </w:rPr>
+              <w:t xml:space="preserve"/>
+            </w:r>
+          </w:p>
+        </w:tc>
+        <w:tc>
+          <w:tcPr>
+            <w:tcW w:w="750" w:type="pct"/>
+            <w:tcMar>
+              <w:top w:w="30" w:type="dxa"/>
+              <w:left w:w="80" w:type="dxa"/>
+              <w:bottom w:w="30" w:type="dxa"/>
+              <w:right w:w="80" w:type="dxa"/>
+            </w:tcMar>
+          </w:tcPr>
+          <w:p>
+            <w:r>
+              <w:rPr>
+                <w:rFonts w:ascii="Aptos" w:eastAsia="Aptos" w:hAnsi="Aptos" w:cs="Aptos"/>
+                <w:sz w:val="20"/>
+                <w:szCs w:val="20"/>
+              </w:rPr>
+              <w:t xml:space="preserve"/>
+            </w:r>
+          </w:p>
+        </w:tc>
+        <w:tc>
+          <w:tcPr>
+            <w:tcW w:w="1600" w:type="pct"/>
+            <w:tcMar>
+              <w:top w:w="30" w:type="dxa"/>
+              <w:left w:w="80" w:type="dxa"/>
+              <w:bottom w:w="30" w:type="dxa"/>
+              <w:right w:w="80" w:type="dxa"/>
+            </w:tcMar>
+          </w:tcPr>
+          <w:p>
+            <w:r>
+              <w:rPr>
+                <w:rFonts w:ascii="Aptos" w:eastAsia="Aptos" w:hAnsi="Aptos" w:cs="Aptos"/>
+                <w:sz w:val="20"/>
+                <w:szCs w:val="20"/>
+              </w:rPr>
+              <w:t xml:space="preserve"/>
+            </w:r>
+          </w:p>
+        </w:tc>
+      </w:tr>
+      <w:tr>
+        <w:trPr>
+          <w:cantSplit/>
+        </w:trPr>
+        <w:tc>
+          <w:tcPr>
+            <w:tcW w:w="300" w:type="pct"/>
+            <w:tcMar>
+              <w:top w:w="30" w:type="dxa"/>
+              <w:left w:w="80" w:type="dxa"/>
+              <w:bottom w:w="30" w:type="dxa"/>
+              <w:right w:w="80" w:type="dxa"/>
+            </w:tcMar>
+          </w:tcPr>
+          <w:p>
+            <w:r>
+              <w:rPr>
+                <w:rFonts w:ascii="Aptos" w:eastAsia="Aptos" w:hAnsi="Aptos" w:cs="Aptos"/>
+                <w:sz w:val="20"/>
+                <w:szCs w:val="20"/>
+              </w:rPr>
+              <w:t xml:space="preserve">157</w:t>
+            </w:r>
+          </w:p>
+        </w:tc>
+        <w:tc>
+          <w:tcPr>
+            <w:tcW w:w="2350" w:type="pct"/>
+            <w:tcMar>
+              <w:top w:w="30" w:type="dxa"/>
+              <w:left w:w="80" w:type="dxa"/>
+              <w:bottom w:w="30" w:type="dxa"/>
+              <w:right w:w="80" w:type="dxa"/>
+            </w:tcMar>
+          </w:tcPr>
+          <w:p>
+            <w:r>
+              <w:rPr>
+                <w:rFonts w:ascii="Aptos" w:eastAsia="Aptos" w:hAnsi="Aptos" w:cs="Aptos"/>
+                <w:sz w:val="20"/>
+                <w:szCs w:val="20"/>
+              </w:rPr>
+              <w:t xml:space="preserve"/>
+            </w:r>
+          </w:p>
+        </w:tc>
+        <w:tc>
+          <w:tcPr>
+            <w:tcW w:w="750" w:type="pct"/>
+            <w:tcMar>
+              <w:top w:w="30" w:type="dxa"/>
+              <w:left w:w="80" w:type="dxa"/>
+              <w:bottom w:w="30" w:type="dxa"/>
+              <w:right w:w="80" w:type="dxa"/>
+            </w:tcMar>
+          </w:tcPr>
+          <w:p>
+            <w:r>
+              <w:rPr>
+                <w:rFonts w:ascii="Aptos" w:eastAsia="Aptos" w:hAnsi="Aptos" w:cs="Aptos"/>
+                <w:sz w:val="20"/>
+                <w:szCs w:val="20"/>
+              </w:rPr>
+              <w:t xml:space="preserve"/>
+            </w:r>
+          </w:p>
+        </w:tc>
+        <w:tc>
+          <w:tcPr>
+            <w:tcW w:w="1600" w:type="pct"/>
+            <w:tcMar>
+              <w:top w:w="30" w:type="dxa"/>
+              <w:left w:w="80" w:type="dxa"/>
+              <w:bottom w:w="30" w:type="dxa"/>
+              <w:right w:w="80" w:type="dxa"/>
+            </w:tcMar>
+          </w:tcPr>
+          <w:p>
+            <w:r>
+              <w:rPr>
+                <w:rFonts w:ascii="Aptos" w:eastAsia="Aptos" w:hAnsi="Aptos" w:cs="Aptos"/>
+                <w:sz w:val="20"/>
+                <w:szCs w:val="20"/>
+              </w:rPr>
+              <w:t xml:space="preserve"/>
+            </w:r>
+          </w:p>
+        </w:tc>
+      </w:tr>
+      <w:tr>
+        <w:trPr>
+          <w:cantSplit/>
+        </w:trPr>
+        <w:tc>
+          <w:tcPr>
+            <w:tcW w:w="300" w:type="pct"/>
+            <w:tcMar>
+              <w:top w:w="30" w:type="dxa"/>
+              <w:left w:w="80" w:type="dxa"/>
+              <w:bottom w:w="30" w:type="dxa"/>
+              <w:right w:w="80" w:type="dxa"/>
+            </w:tcMar>
+          </w:tcPr>
+          <w:p>
+            <w:r>
+              <w:rPr>
+                <w:rFonts w:ascii="Aptos" w:eastAsia="Aptos" w:hAnsi="Aptos" w:cs="Aptos"/>
+                <w:sz w:val="20"/>
+                <w:szCs w:val="20"/>
+              </w:rPr>
+              <w:t xml:space="preserve">158</w:t>
+            </w:r>
+          </w:p>
+        </w:tc>
+        <w:tc>
+          <w:tcPr>
+            <w:tcW w:w="2350" w:type="pct"/>
+            <w:tcMar>
+              <w:top w:w="30" w:type="dxa"/>
+              <w:left w:w="80" w:type="dxa"/>
+              <w:bottom w:w="30" w:type="dxa"/>
+              <w:right w:w="80" w:type="dxa"/>
+            </w:tcMar>
+          </w:tcPr>
+          <w:p>
+            <w:r>
+              <w:rPr>
+                <w:rFonts w:ascii="Aptos" w:eastAsia="Aptos" w:hAnsi="Aptos" w:cs="Aptos"/>
+                <w:sz w:val="20"/>
+                <w:szCs w:val="20"/>
+              </w:rPr>
+              <w:t xml:space="preserve"/>
+            </w:r>
+          </w:p>
+        </w:tc>
+        <w:tc>
+          <w:tcPr>
+            <w:tcW w:w="750" w:type="pct"/>
+            <w:tcMar>
+              <w:top w:w="30" w:type="dxa"/>
+              <w:left w:w="80" w:type="dxa"/>
+              <w:bottom w:w="30" w:type="dxa"/>
+              <w:right w:w="80" w:type="dxa"/>
+            </w:tcMar>
+          </w:tcPr>
+          <w:p>
+            <w:r>
+              <w:rPr>
+                <w:rFonts w:ascii="Aptos" w:eastAsia="Aptos" w:hAnsi="Aptos" w:cs="Aptos"/>
+                <w:sz w:val="20"/>
+                <w:szCs w:val="20"/>
+              </w:rPr>
+              <w:t xml:space="preserve"/>
+            </w:r>
+          </w:p>
+        </w:tc>
+        <w:tc>
+          <w:tcPr>
+            <w:tcW w:w="1600" w:type="pct"/>
+            <w:tcMar>
+              <w:top w:w="30" w:type="dxa"/>
+              <w:left w:w="80" w:type="dxa"/>
+              <w:bottom w:w="30" w:type="dxa"/>
+              <w:right w:w="80" w:type="dxa"/>
+            </w:tcMar>
+          </w:tcPr>
+          <w:p>
+            <w:r>
+              <w:rPr>
+                <w:rFonts w:ascii="Aptos" w:eastAsia="Aptos" w:hAnsi="Aptos" w:cs="Aptos"/>
+                <w:sz w:val="20"/>
+                <w:szCs w:val="20"/>
+              </w:rPr>
+              <w:t xml:space="preserve"/>
+            </w:r>
+          </w:p>
+        </w:tc>
+      </w:tr>
+      <w:tr>
+        <w:trPr>
+          <w:cantSplit/>
+        </w:trPr>
+        <w:tc>
+          <w:tcPr>
+            <w:tcW w:w="300" w:type="pct"/>
+            <w:tcMar>
+              <w:top w:w="30" w:type="dxa"/>
+              <w:left w:w="80" w:type="dxa"/>
+              <w:bottom w:w="30" w:type="dxa"/>
+              <w:right w:w="80" w:type="dxa"/>
+            </w:tcMar>
+          </w:tcPr>
+          <w:p>
+            <w:r>
+              <w:rPr>
+                <w:rFonts w:ascii="Aptos" w:eastAsia="Aptos" w:hAnsi="Aptos" w:cs="Aptos"/>
+                <w:sz w:val="20"/>
+                <w:szCs w:val="20"/>
+              </w:rPr>
+              <w:t xml:space="preserve">159</w:t>
+            </w:r>
+          </w:p>
+        </w:tc>
+        <w:tc>
+          <w:tcPr>
+            <w:tcW w:w="2350" w:type="pct"/>
+            <w:tcMar>
+              <w:top w:w="30" w:type="dxa"/>
+              <w:left w:w="80" w:type="dxa"/>
+              <w:bottom w:w="30" w:type="dxa"/>
+              <w:right w:w="80" w:type="dxa"/>
+            </w:tcMar>
+          </w:tcPr>
+          <w:p>
+            <w:r>
+              <w:rPr>
+                <w:rFonts w:ascii="Aptos" w:eastAsia="Aptos" w:hAnsi="Aptos" w:cs="Aptos"/>
+                <w:sz w:val="20"/>
+                <w:szCs w:val="20"/>
+              </w:rPr>
+              <w:t xml:space="preserve"/>
+            </w:r>
+          </w:p>
+        </w:tc>
+        <w:tc>
+          <w:tcPr>
+            <w:tcW w:w="750" w:type="pct"/>
+            <w:tcMar>
+              <w:top w:w="30" w:type="dxa"/>
+              <w:left w:w="80" w:type="dxa"/>
+              <w:bottom w:w="30" w:type="dxa"/>
+              <w:right w:w="80" w:type="dxa"/>
+            </w:tcMar>
+          </w:tcPr>
+     